<commit_message>
Added more clarification to general expectaions
Working on updating audio datasets to be used in first main figures
</commit_message>
<xml_diff>
--- a/drafts/paRsynth_methods_draft.docx
+++ b/drafts/paRsynth_methods_draft.docx
@@ -3189,28 +3189,169 @@
       <w:r>
         <w:rPr>
           <w:rFonts w:ascii="Arial" w:hAnsi="Arial" w:cs="Arial"/>
-        </w:rPr>
-        <w:t xml:space="preserve">: </w:t>
+          <w:u w:val="single"/>
+        </w:rPr>
+        <w:t>:</w:t>
+      </w:r>
+      <w:r>
+        <w:rPr>
+          <w:rFonts w:ascii="Arial" w:hAnsi="Arial" w:cs="Arial"/>
+        </w:rPr>
+        <w:t xml:space="preserve"> </w:t>
+      </w:r>
+      <w:r>
+        <w:rPr>
+          <w:rFonts w:ascii="Arial" w:hAnsi="Arial" w:cs="Arial"/>
+        </w:rPr>
+        <w:t>To</w:t>
+      </w:r>
+      <w:r>
+        <w:rPr>
+          <w:rFonts w:ascii="Arial" w:hAnsi="Arial" w:cs="Arial"/>
+        </w:rPr>
+        <w:t xml:space="preserve"> assess how well </w:t>
+      </w:r>
+      <w:r>
+        <w:rPr>
+          <w:rFonts w:ascii="Arial" w:hAnsi="Arial" w:cs="Arial"/>
+        </w:rPr>
+        <w:t xml:space="preserve">spectrographic cross-correlation or the edit distance identified </w:t>
+      </w:r>
+      <w:r>
+        <w:rPr>
+          <w:rFonts w:ascii="Arial" w:hAnsi="Arial" w:cs="Arial"/>
+        </w:rPr>
+        <w:t xml:space="preserve">the </w:t>
+      </w:r>
+      <w:r>
+        <w:rPr>
+          <w:rFonts w:ascii="Arial" w:hAnsi="Arial" w:cs="Arial"/>
+        </w:rPr>
+        <w:t xml:space="preserve">encoded </w:t>
+      </w:r>
+      <w:r>
+        <w:rPr>
+          <w:rFonts w:ascii="Arial" w:hAnsi="Arial" w:cs="Arial"/>
+        </w:rPr>
+        <w:t>identity information</w:t>
+      </w:r>
+      <w:r>
+        <w:rPr>
+          <w:rFonts w:ascii="Arial" w:hAnsi="Arial" w:cs="Arial"/>
+        </w:rPr>
+        <w:t>, w</w:t>
+      </w:r>
+      <w:r>
+        <w:rPr>
+          <w:rFonts w:ascii="Arial" w:hAnsi="Arial" w:cs="Arial"/>
+        </w:rPr>
+        <w:t>e</w:t>
+      </w:r>
+      <w:r>
+        <w:rPr>
+          <w:rFonts w:ascii="Arial" w:hAnsi="Arial" w:cs="Arial"/>
+        </w:rPr>
+        <w:t xml:space="preserve"> </w:t>
+      </w:r>
+      <w:r>
+        <w:rPr>
+          <w:rFonts w:ascii="Arial" w:hAnsi="Arial" w:cs="Arial"/>
+        </w:rPr>
+        <w:t xml:space="preserve">calculated </w:t>
       </w:r>
       <w:commentRangeStart w:id="11"/>
       <w:r>
         <w:rPr>
           <w:rFonts w:ascii="Arial" w:hAnsi="Arial" w:cs="Arial"/>
         </w:rPr>
+        <w:t>Cliff’s d</w:t>
+      </w:r>
+      <w:commentRangeEnd w:id="11"/>
+      <w:r>
+        <w:rPr>
+          <w:rStyle w:val="CommentReference"/>
+        </w:rPr>
+        <w:commentReference w:id="11"/>
+      </w:r>
+      <w:r>
+        <w:rPr>
+          <w:rFonts w:ascii="Arial" w:hAnsi="Arial" w:cs="Arial"/>
+        </w:rPr>
+        <w:t xml:space="preserve"> as the effect size between</w:t>
+      </w:r>
+      <w:r>
+        <w:rPr>
+          <w:rFonts w:ascii="Arial" w:hAnsi="Arial" w:cs="Arial"/>
+        </w:rPr>
+        <w:t xml:space="preserve"> </w:t>
+      </w:r>
+      <w:r>
+        <w:rPr>
+          <w:rFonts w:ascii="Arial" w:hAnsi="Arial" w:cs="Arial"/>
+        </w:rPr>
+        <w:t xml:space="preserve">clustering accuracies at each social level. </w:t>
+      </w:r>
+      <w:r>
+        <w:rPr>
+          <w:rFonts w:ascii="Arial" w:hAnsi="Arial" w:cs="Arial"/>
+        </w:rPr>
+        <w:t>For each spectrographic cross-correlation and the edit distance, w</w:t>
+      </w:r>
+      <w:r>
+        <w:rPr>
+          <w:rFonts w:ascii="Arial" w:hAnsi="Arial" w:cs="Arial"/>
+        </w:rPr>
+        <w:t xml:space="preserve">e expected to identify larger effect sizes </w:t>
+      </w:r>
+      <w:r>
+        <w:rPr>
+          <w:rFonts w:ascii="Arial" w:hAnsi="Arial" w:cs="Arial"/>
+        </w:rPr>
+        <w:t xml:space="preserve">when information encoding was higher for one social level than the other, and </w:t>
+      </w:r>
+      <w:r>
+        <w:rPr>
+          <w:rFonts w:ascii="Arial" w:hAnsi="Arial" w:cs="Arial"/>
+        </w:rPr>
+        <w:t xml:space="preserve">when signals were compared amongst fewer individuals or groups (e.g. </w:t>
+      </w:r>
+      <w:r>
+        <w:rPr>
+          <w:rFonts w:ascii="Arial" w:hAnsi="Arial" w:cs="Arial"/>
+        </w:rPr>
+        <w:t>social conditions</w:t>
+      </w:r>
+      <w:r>
+        <w:rPr>
+          <w:rFonts w:ascii="Arial" w:hAnsi="Arial" w:cs="Arial"/>
+        </w:rPr>
+        <w:t xml:space="preserve"> posed fewer </w:t>
+      </w:r>
+      <w:r>
+        <w:rPr>
+          <w:rFonts w:ascii="Arial" w:hAnsi="Arial" w:cs="Arial"/>
+        </w:rPr>
+        <w:t xml:space="preserve">limitations on the uniqueness </w:t>
+      </w:r>
+      <w:r>
+        <w:rPr>
+          <w:rFonts w:ascii="Arial" w:hAnsi="Arial" w:cs="Arial"/>
+        </w:rPr>
+        <w:t xml:space="preserve">of identity information at either social level). </w:t>
+      </w:r>
+      <w:commentRangeStart w:id="12"/>
+      <w:r>
+        <w:rPr>
+          <w:rFonts w:ascii="Arial" w:hAnsi="Arial" w:cs="Arial"/>
+        </w:rPr>
         <w:t>We</w:t>
       </w:r>
-      <w:commentRangeEnd w:id="11"/>
+      <w:commentRangeEnd w:id="12"/>
       <w:r>
         <w:rPr>
           <w:rStyle w:val="CommentReference"/>
         </w:rPr>
-        <w:commentReference w:id="11"/>
-      </w:r>
-      <w:r>
-        <w:rPr>
-          <w:rFonts w:ascii="Arial" w:hAnsi="Arial" w:cs="Arial"/>
-        </w:rPr>
-        <w:t xml:space="preserve"> used the</w:t>
+        <w:commentReference w:id="12"/>
       </w:r>
       <w:r>
         <w:rPr>
@@ -3222,189 +3363,44 @@
         <w:rPr>
           <w:rFonts w:ascii="Arial" w:hAnsi="Arial" w:cs="Arial"/>
         </w:rPr>
-        <w:t>edit distance on the original character strings as a baseline to assess how well the spectrographic cross-correlation pipeline detected the types of information that we originally encoded</w:t>
-      </w:r>
-      <w:r>
-        <w:rPr>
-          <w:rFonts w:ascii="Arial" w:hAnsi="Arial" w:cs="Arial"/>
-        </w:rPr>
-        <w:t xml:space="preserve"> in strings</w:t>
-      </w:r>
-      <w:r>
-        <w:rPr>
-          <w:rFonts w:ascii="Arial" w:hAnsi="Arial" w:cs="Arial"/>
-        </w:rPr>
-        <w:t>.</w:t>
-      </w:r>
-      <w:r>
-        <w:rPr>
-          <w:rFonts w:ascii="Arial" w:hAnsi="Arial" w:cs="Arial"/>
-        </w:rPr>
-        <w:t xml:space="preserve"> </w:t>
-      </w:r>
-      <w:r>
-        <w:rPr>
-          <w:rFonts w:ascii="Arial" w:hAnsi="Arial" w:cs="Arial"/>
-        </w:rPr>
-        <w:t xml:space="preserve">We calculated Cliff’s d as the effect size between </w:t>
-      </w:r>
-      <w:r>
-        <w:rPr>
-          <w:rFonts w:ascii="Arial" w:hAnsi="Arial" w:cs="Arial"/>
-        </w:rPr>
-        <w:t xml:space="preserve">clustering accuracies obtained through the spectrographic cross-correlation or the edit distance pipelines. </w:t>
-      </w:r>
-      <w:r>
-        <w:rPr>
-          <w:rFonts w:ascii="Arial" w:hAnsi="Arial" w:cs="Arial"/>
-        </w:rPr>
-        <w:t xml:space="preserve">We expected to identify clustering accuracies </w:t>
-      </w:r>
-      <w:r>
-        <w:rPr>
-          <w:rFonts w:ascii="Arial" w:hAnsi="Arial" w:cs="Arial"/>
-        </w:rPr>
-        <w:t xml:space="preserve">that were generally lower for spectrographic cross-correlation than the edit distance, since </w:t>
-      </w:r>
-      <w:r>
-        <w:rPr>
-          <w:rFonts w:ascii="Arial" w:hAnsi="Arial" w:cs="Arial"/>
-        </w:rPr>
-        <w:t>spectrographic cross-correlation was performed on strings transformed into synthetic audio files, which may</w:t>
-      </w:r>
-      <w:r>
-        <w:rPr>
-          <w:rFonts w:ascii="Arial" w:hAnsi="Arial" w:cs="Arial"/>
-        </w:rPr>
-        <w:t xml:space="preserve"> have led to losses of </w:t>
-      </w:r>
-      <w:r>
-        <w:rPr>
-          <w:rFonts w:ascii="Arial" w:hAnsi="Arial" w:cs="Arial"/>
-        </w:rPr>
-        <w:t xml:space="preserve">the original </w:t>
-      </w:r>
-      <w:r>
-        <w:rPr>
-          <w:rFonts w:ascii="Arial" w:hAnsi="Arial" w:cs="Arial"/>
-        </w:rPr>
-        <w:t>information</w:t>
-      </w:r>
-      <w:r>
-        <w:rPr>
-          <w:rFonts w:ascii="Arial" w:hAnsi="Arial" w:cs="Arial"/>
-        </w:rPr>
-        <w:t xml:space="preserve"> or added noise</w:t>
-      </w:r>
-      <w:r>
-        <w:rPr>
-          <w:rFonts w:ascii="Arial" w:hAnsi="Arial" w:cs="Arial"/>
-        </w:rPr>
-        <w:t>.</w:t>
-      </w:r>
-      <w:r>
-        <w:rPr>
-          <w:rFonts w:ascii="Arial" w:hAnsi="Arial" w:cs="Arial"/>
-        </w:rPr>
-        <w:t xml:space="preserve"> </w:t>
-      </w:r>
-      <w:r>
-        <w:rPr>
-          <w:rFonts w:ascii="Arial" w:hAnsi="Arial" w:cs="Arial"/>
-        </w:rPr>
-        <w:t>W</w:t>
-      </w:r>
-      <w:r>
-        <w:rPr>
-          <w:rFonts w:ascii="Arial" w:hAnsi="Arial" w:cs="Arial"/>
-        </w:rPr>
-        <w:t xml:space="preserve">e </w:t>
-      </w:r>
-      <w:r>
-        <w:rPr>
-          <w:rFonts w:ascii="Arial" w:hAnsi="Arial" w:cs="Arial"/>
-        </w:rPr>
-        <w:t xml:space="preserve">also </w:t>
-      </w:r>
-      <w:r>
-        <w:rPr>
-          <w:rFonts w:ascii="Arial" w:hAnsi="Arial" w:cs="Arial"/>
-        </w:rPr>
-        <w:t xml:space="preserve">calculated </w:t>
-      </w:r>
-      <w:commentRangeStart w:id="12"/>
-      <w:r>
-        <w:rPr>
-          <w:rFonts w:ascii="Arial" w:hAnsi="Arial" w:cs="Arial"/>
-        </w:rPr>
-        <w:t>Cliff’s d</w:t>
-      </w:r>
-      <w:commentRangeEnd w:id="12"/>
-      <w:r>
-        <w:rPr>
-          <w:rStyle w:val="CommentReference"/>
-        </w:rPr>
-        <w:commentReference w:id="12"/>
-      </w:r>
-      <w:r>
-        <w:rPr>
-          <w:rFonts w:ascii="Arial" w:hAnsi="Arial" w:cs="Arial"/>
-        </w:rPr>
-        <w:t xml:space="preserve"> as the effect size between</w:t>
-      </w:r>
-      <w:r>
-        <w:rPr>
-          <w:rFonts w:ascii="Arial" w:hAnsi="Arial" w:cs="Arial"/>
-        </w:rPr>
-        <w:t xml:space="preserve"> </w:t>
-      </w:r>
-      <w:r>
-        <w:rPr>
-          <w:rFonts w:ascii="Arial" w:hAnsi="Arial" w:cs="Arial"/>
-        </w:rPr>
-        <w:t xml:space="preserve">clustering accuracies at each social level. </w:t>
-      </w:r>
-      <w:r>
-        <w:rPr>
-          <w:rFonts w:ascii="Arial" w:hAnsi="Arial" w:cs="Arial"/>
-        </w:rPr>
-        <w:t xml:space="preserve">We expected to identify larger effect sizes </w:t>
-      </w:r>
-      <w:r>
-        <w:rPr>
-          <w:rFonts w:ascii="Arial" w:hAnsi="Arial" w:cs="Arial"/>
-        </w:rPr>
-        <w:t xml:space="preserve">when information encoding was higher for one social level than the other, and </w:t>
-      </w:r>
-      <w:r>
-        <w:rPr>
-          <w:rFonts w:ascii="Arial" w:hAnsi="Arial" w:cs="Arial"/>
-        </w:rPr>
-        <w:t xml:space="preserve">when signals were compared amongst fewer individuals or groups (e.g. </w:t>
-      </w:r>
-      <w:r>
-        <w:rPr>
-          <w:rFonts w:ascii="Arial" w:hAnsi="Arial" w:cs="Arial"/>
-        </w:rPr>
-        <w:t>social conditions</w:t>
-      </w:r>
-      <w:r>
-        <w:rPr>
-          <w:rFonts w:ascii="Arial" w:hAnsi="Arial" w:cs="Arial"/>
-        </w:rPr>
-        <w:t xml:space="preserve"> posed fewer </w:t>
-      </w:r>
-      <w:r>
-        <w:rPr>
-          <w:rFonts w:ascii="Arial" w:hAnsi="Arial" w:cs="Arial"/>
-        </w:rPr>
-        <w:t xml:space="preserve">limitations on the uniqueness </w:t>
-      </w:r>
-      <w:r>
-        <w:rPr>
-          <w:rFonts w:ascii="Arial" w:hAnsi="Arial" w:cs="Arial"/>
-        </w:rPr>
-        <w:t xml:space="preserve">of identity information at either social level). </w:t>
+        <w:t xml:space="preserve">then </w:t>
+      </w:r>
+      <w:r>
+        <w:rPr>
+          <w:rFonts w:ascii="Arial" w:hAnsi="Arial" w:cs="Arial"/>
+        </w:rPr>
+        <w:t xml:space="preserve">used the edit distance on the original character strings as a baseline to assess how well the spectrographic cross-correlation pipeline detected the types of information that we originally encoded in strings. We calculated Cliff’s d as the effect size between clustering accuracies obtained through the spectrographic cross-correlation or the edit distance pipelines. We expected to identify clustering accuracies that were generally lower for spectrographic cross-correlation than the edit distance, since spectrographic </w:t>
+      </w:r>
+      <w:r>
+        <w:rPr>
+          <w:rFonts w:ascii="Arial" w:hAnsi="Arial" w:cs="Arial"/>
+        </w:rPr>
+        <w:lastRenderedPageBreak/>
+        <w:t>cross-correlation was performed on strings transformed into synthetic audio files, which may have led to losses of the original information or added noise.</w:t>
+      </w:r>
+      <w:r>
+        <w:rPr>
+          <w:rFonts w:ascii="Arial" w:hAnsi="Arial" w:cs="Arial"/>
+        </w:rPr>
+        <w:t xml:space="preserve"> However, we generally expected to identify medium or small effect sizes </w:t>
+      </w:r>
+      <w:r>
+        <w:rPr>
+          <w:rFonts w:ascii="Arial" w:hAnsi="Arial" w:cs="Arial"/>
+        </w:rPr>
+        <w:t xml:space="preserve">for these differences in information detection by each method </w:t>
+      </w:r>
+      <w:r>
+        <w:rPr>
+          <w:rFonts w:ascii="Arial" w:hAnsi="Arial" w:cs="Arial"/>
+        </w:rPr>
+        <w:t xml:space="preserve">that did not outweigh the effect sizes calculated for clustering accuracy </w:t>
+      </w:r>
+      <w:r>
+        <w:rPr>
+          <w:rFonts w:ascii="Arial" w:hAnsi="Arial" w:cs="Arial"/>
+        </w:rPr>
+        <w:t>between different forms of identity information for the same measurement (spectrographic cross-correlation or the edit distance).</w:t>
       </w:r>
     </w:p>
     <w:p>
@@ -3939,7 +3935,14 @@
         <w:rPr>
           <w:rFonts w:ascii="Arial" w:hAnsi="Arial" w:cs="Arial"/>
         </w:rPr>
-        <w:t>Here, we used Paron’s code in a novel way, using it to encode</w:t>
+        <w:t xml:space="preserve">Here, we used Paron’s code in a novel way, using it to </w:t>
+      </w:r>
+      <w:r>
+        <w:rPr>
+          <w:rFonts w:ascii="Arial" w:hAnsi="Arial" w:cs="Arial"/>
+        </w:rPr>
+        <w:lastRenderedPageBreak/>
+        <w:t>encode</w:t>
       </w:r>
       <w:r>
         <w:rPr>
@@ -4010,14 +4013,7 @@
         <w:rPr>
           <w:rFonts w:ascii="Arial" w:hAnsi="Arial" w:cs="Arial"/>
         </w:rPr>
-        <w:t xml:space="preserve">This </w:t>
-      </w:r>
-      <w:r>
-        <w:rPr>
-          <w:rFonts w:ascii="Arial" w:hAnsi="Arial" w:cs="Arial"/>
-        </w:rPr>
-        <w:lastRenderedPageBreak/>
-        <w:t>starting frequency served as a baseline for creating frequency anchors with Par</w:t>
+        <w:t>This starting frequency served as a baseline for creating frequency anchors with Par</w:t>
       </w:r>
       <w:r>
         <w:rPr>
@@ -4529,7 +4525,14 @@
         <w:rPr>
           <w:rFonts w:ascii="Arial" w:hAnsi="Arial" w:cs="Arial"/>
         </w:rPr>
-        <w:t>, and group information was set to a character length of 4 characters. For both datasets, there were 5 groups with 10 individuals per group</w:t>
+        <w:t xml:space="preserve">, and group information was set to a character length of 4 characters. For </w:t>
+      </w:r>
+      <w:r>
+        <w:rPr>
+          <w:rFonts w:ascii="Arial" w:hAnsi="Arial" w:cs="Arial"/>
+        </w:rPr>
+        <w:lastRenderedPageBreak/>
+        <w:t>both datasets, there were 5 groups with 10 individuals per group</w:t>
       </w:r>
       <w:r>
         <w:rPr>
@@ -4637,7 +4640,6 @@
         <w:rPr>
           <w:rFonts w:ascii="Arial" w:hAnsi="Arial" w:cs="Arial"/>
         </w:rPr>
-        <w:lastRenderedPageBreak/>
         <w:t xml:space="preserve">(SPCC; </w:t>
       </w:r>
       <w:r>
@@ -5081,6 +5083,7 @@
         <w:rPr>
           <w:rFonts w:ascii="Arial" w:hAnsi="Arial" w:cs="Arial"/>
         </w:rPr>
+        <w:lastRenderedPageBreak/>
         <w:tab/>
         <w:t>In each condition</w:t>
       </w:r>
@@ -5175,7 +5178,6 @@
         <w:rPr>
           <w:rFonts w:ascii="Arial" w:hAnsi="Arial" w:cs="Arial"/>
         </w:rPr>
-        <w:lastRenderedPageBreak/>
         <w:tab/>
         <w:t>After generating the</w:t>
       </w:r>
@@ -5451,7 +5453,14 @@
         <w:rPr>
           <w:rFonts w:ascii="Arial" w:hAnsi="Arial" w:cs="Arial"/>
         </w:rPr>
-        <w:t xml:space="preserve"> there are calls for vocal communication research to take advantage </w:t>
+        <w:t xml:space="preserve"> there are calls for vocal </w:t>
+      </w:r>
+      <w:r>
+        <w:rPr>
+          <w:rFonts w:ascii="Arial" w:hAnsi="Arial" w:cs="Arial"/>
+        </w:rPr>
+        <w:lastRenderedPageBreak/>
+        <w:t xml:space="preserve">communication research to take advantage </w:t>
       </w:r>
       <w:r>
         <w:rPr>
@@ -5463,14 +5472,7 @@
         <w:rPr>
           <w:rFonts w:ascii="Arial" w:hAnsi="Arial" w:cs="Arial"/>
         </w:rPr>
-        <w:t xml:space="preserve">large-scale quantification methods that are often used in animal movement research (Sainburg &amp; Gentner, 2021). Researchers are already using these datasets in combination with natural ones to determine which analytic tools perform best to assess complexity and animal vocal sequences (Kershenbaum &amp; Garland, 2015) or to validate new methods for calculate and quantify acoustic structure (Keen et al., 2021; Sawant et al., 2022). There are several packages in R that allow researchers to create synthetic vocal signal datasets with biological </w:t>
-      </w:r>
-      <w:r>
-        <w:rPr>
-          <w:rFonts w:ascii="Arial" w:hAnsi="Arial" w:cs="Arial"/>
-        </w:rPr>
-        <w:lastRenderedPageBreak/>
-        <w:t xml:space="preserve">relevance. [sentences about wableR and soundgen]  . An underused function of these packages in animal communication is that they provide researchers with the ability to manipulate information in synthetic signals to specifically study the types of information encoded in a signal, how much information is encoded, and where the information is encoded in a signal.  </w:t>
+        <w:t xml:space="preserve">large-scale quantification methods that are often used in animal movement research (Sainburg &amp; Gentner, 2021). Researchers are already using these datasets in combination with natural ones to determine which analytic tools perform best to assess complexity and animal vocal sequences (Kershenbaum &amp; Garland, 2015) or to validate new methods for calculate and quantify acoustic structure (Keen et al., 2021; Sawant et al., 2022). There are several packages in R that allow researchers to create synthetic vocal signal datasets with biological relevance. [sentences about wableR and soundgen]  . An underused function of these packages in animal communication is that they provide researchers with the ability to manipulate information in synthetic signals to specifically study the types of information encoded in a signal, how much information is encoded, and where the information is encoded in a signal.  </w:t>
       </w:r>
     </w:p>
     <w:p>
@@ -8870,7 +8872,7 @@
       </w:r>
     </w:p>
   </w:comment>
-  <w:comment w:id="11" w:author="Smith Vidaurre, Grace" w:date="2025-02-17T10:39:00Z" w:initials="GSV">
+  <w:comment w:id="11" w:author="Smith Vidaurre, Grace" w:date="2025-02-17T10:35:00Z" w:initials="GSV">
     <w:p>
       <w:r>
         <w:rPr>
@@ -8883,11 +8885,11 @@
           <w:sz w:val="20"/>
           <w:szCs w:val="20"/>
         </w:rPr>
-        <w:t>Integrate as general expected outcomes in the Introduction, and more specific expected outcomes in the Methods (possibly Results)</w:t>
+        <w:t>This is the most likely effect size calculation that we will use, but we still need to test normality and equal variance across the synthetic experiment results</w:t>
       </w:r>
     </w:p>
   </w:comment>
-  <w:comment w:id="12" w:author="Smith Vidaurre, Grace" w:date="2025-02-17T10:35:00Z" w:initials="GSV">
+  <w:comment w:id="12" w:author="Smith Vidaurre, Grace" w:date="2025-02-17T10:39:00Z" w:initials="GSV">
     <w:p>
       <w:r>
         <w:rPr>
@@ -8900,7 +8902,7 @@
           <w:sz w:val="20"/>
           <w:szCs w:val="20"/>
         </w:rPr>
-        <w:t>This is the most likely effect size calculation that we will use, but we still need to test normality and equal variance across the synthetic experiment results</w:t>
+        <w:t>Integrate as general expected outcomes in the Introduction, and more specific expected outcomes in the Methods (possibly Results)</w:t>
       </w:r>
     </w:p>
   </w:comment>
@@ -9482,8 +9484,8 @@
   <w15:commentEx w15:paraId="5E068F38" w15:done="1"/>
   <w15:commentEx w15:paraId="34D31CF0" w15:done="0"/>
   <w15:commentEx w15:paraId="7289E539" w15:done="0"/>
-  <w15:commentEx w15:paraId="1DBA181A" w15:done="0"/>
   <w15:commentEx w15:paraId="71B98670" w15:done="0"/>
+  <w15:commentEx w15:paraId="29F2B57B" w15:done="0"/>
   <w15:commentEx w15:paraId="615200C2" w15:done="0"/>
   <w15:commentEx w15:paraId="3A6A84F8" w15:done="1"/>
   <w15:commentEx w15:paraId="6C803A4A" w15:paraIdParent="3A6A84F8" w15:done="1"/>
@@ -9528,8 +9530,8 @@
   <w16cex:commentExtensible w16cex:durableId="75F284E5" w16cex:dateUtc="2025-02-13T16:11:00Z"/>
   <w16cex:commentExtensible w16cex:durableId="2F96DBF5" w16cex:dateUtc="2024-12-18T19:31:00Z"/>
   <w16cex:commentExtensible w16cex:durableId="6BEE78CA" w16cex:dateUtc="2024-12-20T19:52:00Z"/>
+  <w16cex:commentExtensible w16cex:durableId="1EDD52EA" w16cex:dateUtc="2025-02-17T15:35:00Z"/>
   <w16cex:commentExtensible w16cex:durableId="6C1344B5" w16cex:dateUtc="2025-02-17T15:39:00Z"/>
-  <w16cex:commentExtensible w16cex:durableId="1EDD52EA" w16cex:dateUtc="2025-02-17T15:35:00Z"/>
   <w16cex:commentExtensible w16cex:durableId="7948A830" w16cex:dateUtc="2025-02-13T19:09:00Z"/>
   <w16cex:commentExtensible w16cex:durableId="0B7A3DFC" w16cex:dateUtc="2025-01-24T14:51:00Z">
     <w16cex:extLst>
@@ -9586,8 +9588,8 @@
   <w16cid:commentId w16cid:paraId="5E068F38" w16cid:durableId="75F284E5"/>
   <w16cid:commentId w16cid:paraId="34D31CF0" w16cid:durableId="2F96DBF5"/>
   <w16cid:commentId w16cid:paraId="7289E539" w16cid:durableId="6BEE78CA"/>
-  <w16cid:commentId w16cid:paraId="1DBA181A" w16cid:durableId="6C1344B5"/>
   <w16cid:commentId w16cid:paraId="71B98670" w16cid:durableId="1EDD52EA"/>
+  <w16cid:commentId w16cid:paraId="29F2B57B" w16cid:durableId="6C1344B5"/>
   <w16cid:commentId w16cid:paraId="615200C2" w16cid:durableId="7948A830"/>
   <w16cid:commentId w16cid:paraId="3A6A84F8" w16cid:durableId="0B7A3DFC"/>
   <w16cid:commentId w16cid:paraId="6C803A4A" w16cid:durableId="7F84ABE9"/>

</xml_diff>

<commit_message>
updating draft, working on new results and adding figures
</commit_message>
<xml_diff>
--- a/drafts/paRsynth_methods_draft.docx
+++ b/drafts/paRsynth_methods_draft.docx
@@ -2154,14 +2154,12 @@
         </w:rPr>
         <w:t xml:space="preserve">, </w:t>
       </w:r>
-      <w:ins w:id="10" w:author="Summer Eckhardt" w:date="2025-02-20T16:33:00Z" w16du:dateUtc="2025-02-20T21:33:00Z">
-        <w:r>
-          <w:rPr>
-            <w:rFonts w:ascii="Arial" w:hAnsi="Arial" w:cs="Arial"/>
-          </w:rPr>
-          <w:t xml:space="preserve">and </w:t>
-        </w:r>
-      </w:ins>
+      <w:r>
+        <w:rPr>
+          <w:rFonts w:ascii="Arial" w:hAnsi="Arial" w:cs="Arial"/>
+        </w:rPr>
+        <w:t xml:space="preserve">and </w:t>
+      </w:r>
       <w:r>
         <w:rPr>
           <w:rFonts w:ascii="Arial" w:hAnsi="Arial" w:cs="Arial"/>
@@ -2607,7 +2605,7 @@
         </w:rPr>
         <w:t xml:space="preserve"> when applied to the same datasets</w:t>
       </w:r>
-      <w:commentRangeStart w:id="11"/>
+      <w:commentRangeStart w:id="10"/>
       <w:r>
         <w:rPr>
           <w:rFonts w:ascii="Arial" w:hAnsi="Arial" w:cs="Arial"/>
@@ -2644,12 +2642,12 @@
         </w:rPr>
         <w:fldChar w:fldCharType="end"/>
       </w:r>
-      <w:commentRangeEnd w:id="11"/>
+      <w:commentRangeEnd w:id="10"/>
       <w:r>
         <w:rPr>
           <w:rStyle w:val="CommentReference"/>
         </w:rPr>
-        <w:commentReference w:id="11"/>
+        <w:commentReference w:id="10"/>
       </w:r>
       <w:r>
         <w:rPr>
@@ -3389,12 +3387,92 @@
         </w:rPr>
         <w:t xml:space="preserve">calculated </w:t>
       </w:r>
+      <w:commentRangeStart w:id="11"/>
+      <w:r>
+        <w:rPr>
+          <w:rFonts w:ascii="Arial" w:hAnsi="Arial" w:cs="Arial"/>
+        </w:rPr>
+        <w:t>Cliff’s d</w:t>
+      </w:r>
+      <w:commentRangeEnd w:id="11"/>
+      <w:r>
+        <w:rPr>
+          <w:rStyle w:val="CommentReference"/>
+        </w:rPr>
+        <w:commentReference w:id="11"/>
+      </w:r>
+      <w:r>
+        <w:rPr>
+          <w:rFonts w:ascii="Arial" w:hAnsi="Arial" w:cs="Arial"/>
+        </w:rPr>
+        <w:t xml:space="preserve"> as the effect size between</w:t>
+      </w:r>
+      <w:r>
+        <w:rPr>
+          <w:rFonts w:ascii="Arial" w:hAnsi="Arial" w:cs="Arial"/>
+        </w:rPr>
+        <w:t xml:space="preserve"> </w:t>
+      </w:r>
+      <w:r>
+        <w:rPr>
+          <w:rFonts w:ascii="Arial" w:hAnsi="Arial" w:cs="Arial"/>
+        </w:rPr>
+        <w:t xml:space="preserve">clustering accuracies at each social level. </w:t>
+      </w:r>
+      <w:r>
+        <w:rPr>
+          <w:rFonts w:ascii="Arial" w:hAnsi="Arial" w:cs="Arial"/>
+        </w:rPr>
+        <w:t>For each spectrographic cross-correlation and the edit distance, w</w:t>
+      </w:r>
+      <w:r>
+        <w:rPr>
+          <w:rFonts w:ascii="Arial" w:hAnsi="Arial" w:cs="Arial"/>
+        </w:rPr>
+        <w:t xml:space="preserve">e expected to identify larger effect sizes </w:t>
+      </w:r>
+      <w:r>
+        <w:rPr>
+          <w:rFonts w:ascii="Arial" w:hAnsi="Arial" w:cs="Arial"/>
+        </w:rPr>
+        <w:t xml:space="preserve">when information encoding was higher for one social level than the other, and </w:t>
+      </w:r>
+      <w:r>
+        <w:rPr>
+          <w:rFonts w:ascii="Arial" w:hAnsi="Arial" w:cs="Arial"/>
+        </w:rPr>
+        <w:t xml:space="preserve">when signals were compared amongst fewer individuals or groups (e.g. </w:t>
+      </w:r>
+      <w:r>
+        <w:rPr>
+          <w:rFonts w:ascii="Arial" w:hAnsi="Arial" w:cs="Arial"/>
+        </w:rPr>
+        <w:t>social conditions</w:t>
+      </w:r>
+      <w:r>
+        <w:rPr>
+          <w:rFonts w:ascii="Arial" w:hAnsi="Arial" w:cs="Arial"/>
+        </w:rPr>
+        <w:t xml:space="preserve"> posed fewer </w:t>
+      </w:r>
+      <w:r>
+        <w:rPr>
+          <w:rFonts w:ascii="Arial" w:hAnsi="Arial" w:cs="Arial"/>
+        </w:rPr>
+        <w:t xml:space="preserve">limitations on the uniqueness </w:t>
+      </w:r>
+      <w:r>
+        <w:rPr>
+          <w:rFonts w:ascii="Arial" w:hAnsi="Arial" w:cs="Arial"/>
+        </w:rPr>
+        <w:t xml:space="preserve">of identity information at either social level). </w:t>
+      </w:r>
       <w:commentRangeStart w:id="12"/>
       <w:r>
         <w:rPr>
           <w:rFonts w:ascii="Arial" w:hAnsi="Arial" w:cs="Arial"/>
         </w:rPr>
-        <w:t>Cliff’s d</w:t>
+        <w:t>We</w:t>
       </w:r>
       <w:commentRangeEnd w:id="12"/>
       <w:r>
@@ -3402,86 +3480,6 @@
           <w:rStyle w:val="CommentReference"/>
         </w:rPr>
         <w:commentReference w:id="12"/>
-      </w:r>
-      <w:r>
-        <w:rPr>
-          <w:rFonts w:ascii="Arial" w:hAnsi="Arial" w:cs="Arial"/>
-        </w:rPr>
-        <w:t xml:space="preserve"> as the effect size between</w:t>
-      </w:r>
-      <w:r>
-        <w:rPr>
-          <w:rFonts w:ascii="Arial" w:hAnsi="Arial" w:cs="Arial"/>
-        </w:rPr>
-        <w:t xml:space="preserve"> </w:t>
-      </w:r>
-      <w:r>
-        <w:rPr>
-          <w:rFonts w:ascii="Arial" w:hAnsi="Arial" w:cs="Arial"/>
-        </w:rPr>
-        <w:t xml:space="preserve">clustering accuracies at each social level. </w:t>
-      </w:r>
-      <w:r>
-        <w:rPr>
-          <w:rFonts w:ascii="Arial" w:hAnsi="Arial" w:cs="Arial"/>
-        </w:rPr>
-        <w:t>For each spectrographic cross-correlation and the edit distance, w</w:t>
-      </w:r>
-      <w:r>
-        <w:rPr>
-          <w:rFonts w:ascii="Arial" w:hAnsi="Arial" w:cs="Arial"/>
-        </w:rPr>
-        <w:t xml:space="preserve">e expected to identify larger effect sizes </w:t>
-      </w:r>
-      <w:r>
-        <w:rPr>
-          <w:rFonts w:ascii="Arial" w:hAnsi="Arial" w:cs="Arial"/>
-        </w:rPr>
-        <w:t xml:space="preserve">when information encoding was higher for one social level than the other, and </w:t>
-      </w:r>
-      <w:r>
-        <w:rPr>
-          <w:rFonts w:ascii="Arial" w:hAnsi="Arial" w:cs="Arial"/>
-        </w:rPr>
-        <w:t xml:space="preserve">when signals were compared amongst fewer individuals or groups (e.g. </w:t>
-      </w:r>
-      <w:r>
-        <w:rPr>
-          <w:rFonts w:ascii="Arial" w:hAnsi="Arial" w:cs="Arial"/>
-        </w:rPr>
-        <w:t>social conditions</w:t>
-      </w:r>
-      <w:r>
-        <w:rPr>
-          <w:rFonts w:ascii="Arial" w:hAnsi="Arial" w:cs="Arial"/>
-        </w:rPr>
-        <w:t xml:space="preserve"> posed fewer </w:t>
-      </w:r>
-      <w:r>
-        <w:rPr>
-          <w:rFonts w:ascii="Arial" w:hAnsi="Arial" w:cs="Arial"/>
-        </w:rPr>
-        <w:t xml:space="preserve">limitations on the uniqueness </w:t>
-      </w:r>
-      <w:r>
-        <w:rPr>
-          <w:rFonts w:ascii="Arial" w:hAnsi="Arial" w:cs="Arial"/>
-        </w:rPr>
-        <w:t xml:space="preserve">of identity information at either social level). </w:t>
-      </w:r>
-      <w:commentRangeStart w:id="13"/>
-      <w:r>
-        <w:rPr>
-          <w:rFonts w:ascii="Arial" w:hAnsi="Arial" w:cs="Arial"/>
-        </w:rPr>
-        <w:t>We</w:t>
-      </w:r>
-      <w:commentRangeEnd w:id="13"/>
-      <w:r>
-        <w:rPr>
-          <w:rStyle w:val="CommentReference"/>
-        </w:rPr>
-        <w:commentReference w:id="13"/>
       </w:r>
       <w:r>
         <w:rPr>
@@ -3548,7 +3546,7 @@
           <w:rFonts w:ascii="Arial" w:hAnsi="Arial" w:cs="Arial"/>
         </w:rPr>
       </w:pPr>
-      <w:commentRangeStart w:id="14"/>
+      <w:commentRangeStart w:id="13"/>
       <w:r>
         <w:rPr>
           <w:rFonts w:ascii="Arial" w:hAnsi="Arial" w:cs="Arial"/>
@@ -3557,12 +3555,12 @@
         </w:rPr>
         <w:t>Methods</w:t>
       </w:r>
-      <w:commentRangeEnd w:id="14"/>
+      <w:commentRangeEnd w:id="13"/>
       <w:r>
         <w:rPr>
           <w:rStyle w:val="CommentReference"/>
         </w:rPr>
-        <w:commentReference w:id="14"/>
+        <w:commentReference w:id="13"/>
       </w:r>
       <w:r>
         <w:rPr>
@@ -3688,187 +3686,187 @@
         </w:rPr>
         <w:t xml:space="preserve"> </w:t>
       </w:r>
+      <w:commentRangeStart w:id="14"/>
       <w:commentRangeStart w:id="15"/>
+      <w:r>
+        <w:rPr>
+          <w:rFonts w:ascii="Arial" w:hAnsi="Arial" w:cs="Arial"/>
+        </w:rPr>
+        <w:t>5 components</w:t>
+      </w:r>
+      <w:r>
+        <w:rPr>
+          <w:rFonts w:ascii="Arial" w:hAnsi="Arial" w:cs="Arial"/>
+        </w:rPr>
+        <w:t xml:space="preserve"> (Figure 1)</w:t>
+      </w:r>
+      <w:r>
+        <w:rPr>
+          <w:rFonts w:ascii="Arial" w:hAnsi="Arial" w:cs="Arial"/>
+        </w:rPr>
+        <w:t xml:space="preserve">: </w:t>
+      </w:r>
+      <w:commentRangeEnd w:id="14"/>
+      <w:r>
+        <w:rPr>
+          <w:rStyle w:val="CommentReference"/>
+        </w:rPr>
+        <w:commentReference w:id="14"/>
+      </w:r>
+      <w:commentRangeEnd w:id="15"/>
+      <w:r>
+        <w:rPr>
+          <w:rStyle w:val="CommentReference"/>
+        </w:rPr>
+        <w:commentReference w:id="15"/>
+      </w:r>
+      <w:r>
+        <w:rPr>
+          <w:rFonts w:ascii="Arial" w:hAnsi="Arial" w:cs="Arial"/>
+        </w:rPr>
+        <w:t xml:space="preserve">a global head </w:t>
+      </w:r>
+      <w:r>
+        <w:rPr>
+          <w:rFonts w:ascii="Arial" w:hAnsi="Arial" w:cs="Arial"/>
+        </w:rPr>
+        <w:t xml:space="preserve">(a string of characters shared across all individuals; </w:t>
+      </w:r>
+      <w:r>
+        <w:rPr>
+          <w:rFonts w:ascii="Arial" w:hAnsi="Arial" w:cs="Arial"/>
+        </w:rPr>
+        <w:t>TKTK character length)</w:t>
+      </w:r>
+      <w:r>
+        <w:rPr>
+          <w:rFonts w:ascii="Arial" w:hAnsi="Arial" w:cs="Arial"/>
+        </w:rPr>
+        <w:t>, a section of group information, a section of individual information, another section of group information, and a global tail</w:t>
+      </w:r>
+      <w:r>
+        <w:rPr>
+          <w:rFonts w:ascii="Arial" w:hAnsi="Arial" w:cs="Arial"/>
+        </w:rPr>
+        <w:t xml:space="preserve"> (</w:t>
+      </w:r>
+      <w:r>
+        <w:rPr>
+          <w:rFonts w:ascii="Arial" w:hAnsi="Arial" w:cs="Arial"/>
+        </w:rPr>
+        <w:t xml:space="preserve">a string of characters shared across all individuals; </w:t>
+      </w:r>
+      <w:r>
+        <w:rPr>
+          <w:rFonts w:ascii="Arial" w:hAnsi="Arial" w:cs="Arial"/>
+        </w:rPr>
+        <w:t>TKTK character length)</w:t>
+      </w:r>
+      <w:r>
+        <w:rPr>
+          <w:rFonts w:ascii="Arial" w:hAnsi="Arial" w:cs="Arial"/>
+        </w:rPr>
+        <w:t xml:space="preserve">. </w:t>
+      </w:r>
+      <w:r>
+        <w:rPr>
+          <w:rFonts w:ascii="Arial" w:hAnsi="Arial" w:cs="Arial"/>
+        </w:rPr>
+        <w:t xml:space="preserve">Later versions of our code will allow users to choose where and how much information is encoded in the signal. </w:t>
+      </w:r>
+      <w:r>
+        <w:rPr>
+          <w:rFonts w:ascii="Arial" w:hAnsi="Arial" w:cs="Arial"/>
+        </w:rPr>
+        <w:t xml:space="preserve">We varied </w:t>
+      </w:r>
+      <w:r>
+        <w:rPr>
+          <w:rFonts w:ascii="Arial" w:hAnsi="Arial" w:cs="Arial"/>
+        </w:rPr>
+        <w:t>the character length of</w:t>
+      </w:r>
+      <w:r>
+        <w:rPr>
+          <w:rFonts w:ascii="Arial" w:hAnsi="Arial" w:cs="Arial"/>
+        </w:rPr>
+        <w:t xml:space="preserve"> </w:t>
+      </w:r>
+      <w:r>
+        <w:rPr>
+          <w:rFonts w:ascii="Arial" w:hAnsi="Arial" w:cs="Arial"/>
+        </w:rPr>
+        <w:t xml:space="preserve">the group and individual </w:t>
+      </w:r>
+      <w:r>
+        <w:rPr>
+          <w:rFonts w:ascii="Arial" w:hAnsi="Arial" w:cs="Arial"/>
+        </w:rPr>
+        <w:t>section</w:t>
+      </w:r>
+      <w:r>
+        <w:rPr>
+          <w:rFonts w:ascii="Arial" w:hAnsi="Arial" w:cs="Arial"/>
+        </w:rPr>
+        <w:t xml:space="preserve">s </w:t>
+      </w:r>
+      <w:r>
+        <w:rPr>
+          <w:rFonts w:ascii="Arial" w:hAnsi="Arial" w:cs="Arial"/>
+        </w:rPr>
+        <w:t xml:space="preserve">depending on treatment, discussed </w:t>
+      </w:r>
+      <w:r>
+        <w:rPr>
+          <w:rFonts w:ascii="Arial" w:hAnsi="Arial" w:cs="Arial"/>
+        </w:rPr>
+        <w:t>below. We</w:t>
+      </w:r>
+      <w:r>
+        <w:rPr>
+          <w:rFonts w:ascii="Arial" w:hAnsi="Arial" w:cs="Arial"/>
+        </w:rPr>
+        <w:t xml:space="preserve"> used three unique characters in the string: A, B, and C.</w:t>
+      </w:r>
+      <w:r>
+        <w:rPr>
+          <w:rFonts w:ascii="Arial" w:hAnsi="Arial" w:cs="Arial"/>
+        </w:rPr>
+        <w:t xml:space="preserve"> </w:t>
+      </w:r>
       <w:commentRangeStart w:id="16"/>
       <w:r>
         <w:rPr>
           <w:rFonts w:ascii="Arial" w:hAnsi="Arial" w:cs="Arial"/>
         </w:rPr>
-        <w:t>5 components</w:t>
-      </w:r>
-      <w:r>
-        <w:rPr>
-          <w:rFonts w:ascii="Arial" w:hAnsi="Arial" w:cs="Arial"/>
-        </w:rPr>
-        <w:t xml:space="preserve"> (Figure 1)</w:t>
-      </w:r>
-      <w:r>
-        <w:rPr>
-          <w:rFonts w:ascii="Arial" w:hAnsi="Arial" w:cs="Arial"/>
-        </w:rPr>
-        <w:t xml:space="preserve">: </w:t>
-      </w:r>
-      <w:commentRangeEnd w:id="15"/>
+        <w:t xml:space="preserve">Once character strings were generated, we </w:t>
+      </w:r>
+      <w:proofErr w:type="gramStart"/>
+      <w:r>
+        <w:rPr>
+          <w:rFonts w:ascii="Arial" w:hAnsi="Arial" w:cs="Arial"/>
+        </w:rPr>
+        <w:t>added</w:t>
+      </w:r>
+      <w:proofErr w:type="gramEnd"/>
+      <w:r>
+        <w:rPr>
+          <w:rFonts w:ascii="Arial" w:hAnsi="Arial" w:cs="Arial"/>
+        </w:rPr>
+        <w:t xml:space="preserve"> random variation</w:t>
+      </w:r>
+      <w:r>
+        <w:rPr>
+          <w:rFonts w:ascii="Arial" w:hAnsi="Arial" w:cs="Arial"/>
+        </w:rPr>
+        <w:t xml:space="preserve"> in each call to represent variation within an individual’s call repertoires</w:t>
+      </w:r>
+      <w:commentRangeEnd w:id="16"/>
       <w:r>
         <w:rPr>
           <w:rStyle w:val="CommentReference"/>
         </w:rPr>
-        <w:commentReference w:id="15"/>
-      </w:r>
-      <w:commentRangeEnd w:id="16"/>
-      <w:r>
-        <w:rPr>
-          <w:rStyle w:val="CommentReference"/>
-        </w:rPr>
         <w:commentReference w:id="16"/>
-      </w:r>
-      <w:r>
-        <w:rPr>
-          <w:rFonts w:ascii="Arial" w:hAnsi="Arial" w:cs="Arial"/>
-        </w:rPr>
-        <w:t xml:space="preserve">a global head </w:t>
-      </w:r>
-      <w:r>
-        <w:rPr>
-          <w:rFonts w:ascii="Arial" w:hAnsi="Arial" w:cs="Arial"/>
-        </w:rPr>
-        <w:t xml:space="preserve">(a string of characters shared across all individuals; </w:t>
-      </w:r>
-      <w:r>
-        <w:rPr>
-          <w:rFonts w:ascii="Arial" w:hAnsi="Arial" w:cs="Arial"/>
-        </w:rPr>
-        <w:t>TKTK character length)</w:t>
-      </w:r>
-      <w:r>
-        <w:rPr>
-          <w:rFonts w:ascii="Arial" w:hAnsi="Arial" w:cs="Arial"/>
-        </w:rPr>
-        <w:t>, a section of group information, a section of individual information, another section of group information, and a global tail</w:t>
-      </w:r>
-      <w:r>
-        <w:rPr>
-          <w:rFonts w:ascii="Arial" w:hAnsi="Arial" w:cs="Arial"/>
-        </w:rPr>
-        <w:t xml:space="preserve"> (</w:t>
-      </w:r>
-      <w:r>
-        <w:rPr>
-          <w:rFonts w:ascii="Arial" w:hAnsi="Arial" w:cs="Arial"/>
-        </w:rPr>
-        <w:t xml:space="preserve">a string of characters shared across all individuals; </w:t>
-      </w:r>
-      <w:r>
-        <w:rPr>
-          <w:rFonts w:ascii="Arial" w:hAnsi="Arial" w:cs="Arial"/>
-        </w:rPr>
-        <w:t>TKTK character length)</w:t>
-      </w:r>
-      <w:r>
-        <w:rPr>
-          <w:rFonts w:ascii="Arial" w:hAnsi="Arial" w:cs="Arial"/>
-        </w:rPr>
-        <w:t xml:space="preserve">. </w:t>
-      </w:r>
-      <w:r>
-        <w:rPr>
-          <w:rFonts w:ascii="Arial" w:hAnsi="Arial" w:cs="Arial"/>
-        </w:rPr>
-        <w:t xml:space="preserve">Later versions of our code will allow users to choose where and how much information is encoded in the signal. </w:t>
-      </w:r>
-      <w:r>
-        <w:rPr>
-          <w:rFonts w:ascii="Arial" w:hAnsi="Arial" w:cs="Arial"/>
-        </w:rPr>
-        <w:t xml:space="preserve">We varied </w:t>
-      </w:r>
-      <w:r>
-        <w:rPr>
-          <w:rFonts w:ascii="Arial" w:hAnsi="Arial" w:cs="Arial"/>
-        </w:rPr>
-        <w:t>the character length of</w:t>
-      </w:r>
-      <w:r>
-        <w:rPr>
-          <w:rFonts w:ascii="Arial" w:hAnsi="Arial" w:cs="Arial"/>
-        </w:rPr>
-        <w:t xml:space="preserve"> </w:t>
-      </w:r>
-      <w:r>
-        <w:rPr>
-          <w:rFonts w:ascii="Arial" w:hAnsi="Arial" w:cs="Arial"/>
-        </w:rPr>
-        <w:t xml:space="preserve">the group and individual </w:t>
-      </w:r>
-      <w:r>
-        <w:rPr>
-          <w:rFonts w:ascii="Arial" w:hAnsi="Arial" w:cs="Arial"/>
-        </w:rPr>
-        <w:t>section</w:t>
-      </w:r>
-      <w:r>
-        <w:rPr>
-          <w:rFonts w:ascii="Arial" w:hAnsi="Arial" w:cs="Arial"/>
-        </w:rPr>
-        <w:t xml:space="preserve">s </w:t>
-      </w:r>
-      <w:r>
-        <w:rPr>
-          <w:rFonts w:ascii="Arial" w:hAnsi="Arial" w:cs="Arial"/>
-        </w:rPr>
-        <w:t xml:space="preserve">depending on treatment, discussed </w:t>
-      </w:r>
-      <w:r>
-        <w:rPr>
-          <w:rFonts w:ascii="Arial" w:hAnsi="Arial" w:cs="Arial"/>
-        </w:rPr>
-        <w:t>below. We</w:t>
-      </w:r>
-      <w:r>
-        <w:rPr>
-          <w:rFonts w:ascii="Arial" w:hAnsi="Arial" w:cs="Arial"/>
-        </w:rPr>
-        <w:t xml:space="preserve"> used three unique characters in the string: A, B, and C.</w:t>
-      </w:r>
-      <w:r>
-        <w:rPr>
-          <w:rFonts w:ascii="Arial" w:hAnsi="Arial" w:cs="Arial"/>
-        </w:rPr>
-        <w:t xml:space="preserve"> </w:t>
-      </w:r>
-      <w:commentRangeStart w:id="17"/>
-      <w:r>
-        <w:rPr>
-          <w:rFonts w:ascii="Arial" w:hAnsi="Arial" w:cs="Arial"/>
-        </w:rPr>
-        <w:t xml:space="preserve">Once character strings were generated, we </w:t>
-      </w:r>
-      <w:proofErr w:type="gramStart"/>
-      <w:r>
-        <w:rPr>
-          <w:rFonts w:ascii="Arial" w:hAnsi="Arial" w:cs="Arial"/>
-        </w:rPr>
-        <w:t>added</w:t>
-      </w:r>
-      <w:proofErr w:type="gramEnd"/>
-      <w:r>
-        <w:rPr>
-          <w:rFonts w:ascii="Arial" w:hAnsi="Arial" w:cs="Arial"/>
-        </w:rPr>
-        <w:t xml:space="preserve"> random variation</w:t>
-      </w:r>
-      <w:r>
-        <w:rPr>
-          <w:rFonts w:ascii="Arial" w:hAnsi="Arial" w:cs="Arial"/>
-        </w:rPr>
-        <w:t xml:space="preserve"> in each call to represent variation within an individual’s call repertoires</w:t>
-      </w:r>
-      <w:commentRangeEnd w:id="17"/>
-      <w:r>
-        <w:rPr>
-          <w:rStyle w:val="CommentReference"/>
-        </w:rPr>
-        <w:commentReference w:id="17"/>
       </w:r>
       <w:r>
         <w:rPr>
@@ -4189,8 +4187,8 @@
         </w:rPr>
         <w:t xml:space="preserve">. </w:t>
       </w:r>
+      <w:commentRangeStart w:id="17"/>
       <w:commentRangeStart w:id="18"/>
-      <w:commentRangeStart w:id="19"/>
       <w:r>
         <w:rPr>
           <w:rFonts w:ascii="Arial" w:hAnsi="Arial" w:cs="Arial"/>
@@ -4251,19 +4249,19 @@
         </w:rPr>
         <w:t xml:space="preserve"> would also be 4000Hz. However, if the first Parson’s code was “up”, then the second frequency anchor would be 5000Hz. </w:t>
       </w:r>
+      <w:commentRangeEnd w:id="17"/>
+      <w:r>
+        <w:rPr>
+          <w:rStyle w:val="CommentReference"/>
+        </w:rPr>
+        <w:commentReference w:id="17"/>
+      </w:r>
       <w:commentRangeEnd w:id="18"/>
       <w:r>
         <w:rPr>
           <w:rStyle w:val="CommentReference"/>
         </w:rPr>
         <w:commentReference w:id="18"/>
-      </w:r>
-      <w:commentRangeEnd w:id="19"/>
-      <w:r>
-        <w:rPr>
-          <w:rStyle w:val="CommentReference"/>
-        </w:rPr>
-        <w:commentReference w:id="19"/>
       </w:r>
       <w:r>
         <w:rPr>
@@ -4491,75 +4489,157 @@
         </w:rPr>
         <w:t xml:space="preserve">Using the process described above, we created two synthetic data sets: one that created </w:t>
       </w:r>
+      <w:commentRangeStart w:id="19"/>
       <w:commentRangeStart w:id="20"/>
+      <w:r>
+        <w:rPr>
+          <w:rFonts w:ascii="Arial" w:hAnsi="Arial" w:cs="Arial"/>
+        </w:rPr>
+        <w:t xml:space="preserve">vocalizations </w:t>
+      </w:r>
+      <w:commentRangeEnd w:id="19"/>
+      <w:r>
+        <w:rPr>
+          <w:rStyle w:val="CommentReference"/>
+        </w:rPr>
+        <w:commentReference w:id="19"/>
+      </w:r>
+      <w:commentRangeEnd w:id="20"/>
+      <w:r>
+        <w:rPr>
+          <w:rStyle w:val="CommentReference"/>
+        </w:rPr>
+        <w:commentReference w:id="20"/>
+      </w:r>
+      <w:r>
+        <w:rPr>
+          <w:rFonts w:ascii="Arial" w:hAnsi="Arial" w:cs="Arial"/>
+        </w:rPr>
+        <w:t>with more group membership information than individual information</w:t>
+      </w:r>
+      <w:r>
+        <w:rPr>
+          <w:rFonts w:ascii="Arial" w:hAnsi="Arial" w:cs="Arial"/>
+        </w:rPr>
+        <w:t xml:space="preserve"> encoded</w:t>
+      </w:r>
+      <w:r>
+        <w:rPr>
+          <w:rFonts w:ascii="Arial" w:hAnsi="Arial" w:cs="Arial"/>
+        </w:rPr>
+        <w:t xml:space="preserve"> (Group Member</w:t>
+      </w:r>
+      <w:r>
+        <w:rPr>
+          <w:rFonts w:ascii="Arial" w:hAnsi="Arial" w:cs="Arial"/>
+        </w:rPr>
+        <w:t xml:space="preserve"> Information</w:t>
+      </w:r>
+      <w:r>
+        <w:rPr>
+          <w:rFonts w:ascii="Arial" w:hAnsi="Arial" w:cs="Arial"/>
+        </w:rPr>
+        <w:t xml:space="preserve"> Dataset</w:t>
+      </w:r>
+      <w:r>
+        <w:rPr>
+          <w:rFonts w:ascii="Arial" w:hAnsi="Arial" w:cs="Arial"/>
+        </w:rPr>
+        <w:t xml:space="preserve">: </w:t>
+      </w:r>
+      <w:r>
+        <w:rPr>
+          <w:rFonts w:ascii="Arial" w:hAnsi="Arial" w:cs="Arial"/>
+        </w:rPr>
+        <w:t>henceforth</w:t>
+      </w:r>
+      <w:r>
+        <w:rPr>
+          <w:rFonts w:ascii="Arial" w:hAnsi="Arial" w:cs="Arial"/>
+        </w:rPr>
+        <w:t xml:space="preserve"> the Group</w:t>
+      </w:r>
+      <w:r>
+        <w:rPr>
+          <w:rFonts w:ascii="Arial" w:hAnsi="Arial" w:cs="Arial"/>
+        </w:rPr>
+        <w:t xml:space="preserve"> dataset</w:t>
+      </w:r>
+      <w:r>
+        <w:rPr>
+          <w:rFonts w:ascii="Arial" w:hAnsi="Arial" w:cs="Arial"/>
+        </w:rPr>
+        <w:t xml:space="preserve">), and one that created </w:t>
+      </w:r>
       <w:commentRangeStart w:id="21"/>
       <w:r>
         <w:rPr>
           <w:rFonts w:ascii="Arial" w:hAnsi="Arial" w:cs="Arial"/>
         </w:rPr>
-        <w:t xml:space="preserve">vocalizations </w:t>
-      </w:r>
-      <w:commentRangeEnd w:id="20"/>
+        <w:t xml:space="preserve">character strings </w:t>
+      </w:r>
+      <w:commentRangeEnd w:id="21"/>
       <w:r>
         <w:rPr>
           <w:rStyle w:val="CommentReference"/>
         </w:rPr>
-        <w:commentReference w:id="20"/>
-      </w:r>
-      <w:commentRangeEnd w:id="21"/>
+        <w:commentReference w:id="21"/>
+      </w:r>
+      <w:r>
+        <w:rPr>
+          <w:rFonts w:ascii="Arial" w:hAnsi="Arial" w:cs="Arial"/>
+        </w:rPr>
+        <w:t xml:space="preserve">with more individual information than group membership information </w:t>
+      </w:r>
+      <w:r>
+        <w:rPr>
+          <w:rFonts w:ascii="Arial" w:hAnsi="Arial" w:cs="Arial"/>
+        </w:rPr>
+        <w:t xml:space="preserve">encoded </w:t>
+      </w:r>
+      <w:r>
+        <w:rPr>
+          <w:rFonts w:ascii="Arial" w:hAnsi="Arial" w:cs="Arial"/>
+        </w:rPr>
+        <w:t>(</w:t>
+      </w:r>
+      <w:commentRangeStart w:id="22"/>
+      <w:r>
+        <w:rPr>
+          <w:rFonts w:ascii="Arial" w:hAnsi="Arial" w:cs="Arial"/>
+        </w:rPr>
+        <w:t>Individual</w:t>
+      </w:r>
+      <w:r>
+        <w:rPr>
+          <w:rFonts w:ascii="Arial" w:hAnsi="Arial" w:cs="Arial"/>
+        </w:rPr>
+        <w:t xml:space="preserve"> Information</w:t>
+      </w:r>
+      <w:r>
+        <w:rPr>
+          <w:rFonts w:ascii="Arial" w:hAnsi="Arial" w:cs="Arial"/>
+        </w:rPr>
+        <w:t xml:space="preserve"> Dataset</w:t>
+      </w:r>
+      <w:commentRangeEnd w:id="22"/>
+      <w:r>
+        <w:rPr>
+          <w:rFonts w:ascii="Arial" w:hAnsi="Arial" w:cs="Arial"/>
+        </w:rPr>
+        <w:t xml:space="preserve">; </w:t>
+      </w:r>
       <w:r>
         <w:rPr>
           <w:rStyle w:val="CommentReference"/>
         </w:rPr>
-        <w:commentReference w:id="21"/>
-      </w:r>
-      <w:r>
-        <w:rPr>
-          <w:rFonts w:ascii="Arial" w:hAnsi="Arial" w:cs="Arial"/>
-        </w:rPr>
-        <w:t>with more group membership information than individual information</w:t>
-      </w:r>
-      <w:r>
-        <w:rPr>
-          <w:rFonts w:ascii="Arial" w:hAnsi="Arial" w:cs="Arial"/>
-        </w:rPr>
-        <w:t xml:space="preserve"> encoded</w:t>
-      </w:r>
-      <w:r>
-        <w:rPr>
-          <w:rFonts w:ascii="Arial" w:hAnsi="Arial" w:cs="Arial"/>
-        </w:rPr>
-        <w:t xml:space="preserve"> (Group Member</w:t>
-      </w:r>
-      <w:r>
-        <w:rPr>
-          <w:rFonts w:ascii="Arial" w:hAnsi="Arial" w:cs="Arial"/>
-        </w:rPr>
-        <w:t xml:space="preserve"> Information</w:t>
-      </w:r>
-      <w:r>
-        <w:rPr>
-          <w:rFonts w:ascii="Arial" w:hAnsi="Arial" w:cs="Arial"/>
-        </w:rPr>
-        <w:t xml:space="preserve"> Dataset</w:t>
-      </w:r>
-      <w:r>
-        <w:rPr>
-          <w:rFonts w:ascii="Arial" w:hAnsi="Arial" w:cs="Arial"/>
-        </w:rPr>
-        <w:t xml:space="preserve">: </w:t>
-      </w:r>
-      <w:r>
-        <w:rPr>
-          <w:rFonts w:ascii="Arial" w:hAnsi="Arial" w:cs="Arial"/>
-        </w:rPr>
-        <w:t>henceforth</w:t>
-      </w:r>
-      <w:r>
-        <w:rPr>
-          <w:rFonts w:ascii="Arial" w:hAnsi="Arial" w:cs="Arial"/>
-        </w:rPr>
-        <w:t xml:space="preserve"> the Group</w:t>
+        <w:commentReference w:id="22"/>
+      </w:r>
+      <w:r>
+        <w:rPr>
+          <w:rFonts w:ascii="Arial" w:hAnsi="Arial" w:cs="Arial"/>
+        </w:rPr>
+        <w:t>henceforth the Individual</w:t>
       </w:r>
       <w:r>
         <w:rPr>
@@ -4571,165 +4651,83 @@
         <w:rPr>
           <w:rFonts w:ascii="Arial" w:hAnsi="Arial" w:cs="Arial"/>
         </w:rPr>
-        <w:t xml:space="preserve">), and one that created </w:t>
-      </w:r>
-      <w:commentRangeStart w:id="22"/>
-      <w:r>
-        <w:rPr>
-          <w:rFonts w:ascii="Arial" w:hAnsi="Arial" w:cs="Arial"/>
-        </w:rPr>
-        <w:t xml:space="preserve">character strings </w:t>
-      </w:r>
-      <w:commentRangeEnd w:id="22"/>
+        <w:t xml:space="preserve">). In the </w:t>
+      </w:r>
+      <w:r>
+        <w:rPr>
+          <w:rFonts w:ascii="Arial" w:hAnsi="Arial" w:cs="Arial"/>
+        </w:rPr>
+        <w:t>Group</w:t>
+      </w:r>
+      <w:r>
+        <w:rPr>
+          <w:rFonts w:ascii="Arial" w:hAnsi="Arial" w:cs="Arial"/>
+        </w:rPr>
+        <w:t xml:space="preserve"> Dataset, individual information was set to a character length of 4 characters, and group </w:t>
+      </w:r>
+      <w:r>
+        <w:rPr>
+          <w:rFonts w:ascii="Arial" w:hAnsi="Arial" w:cs="Arial"/>
+        </w:rPr>
+        <w:t xml:space="preserve">member </w:t>
+      </w:r>
+      <w:r>
+        <w:rPr>
+          <w:rFonts w:ascii="Arial" w:hAnsi="Arial" w:cs="Arial"/>
+        </w:rPr>
+        <w:t xml:space="preserve">information was set to </w:t>
+      </w:r>
+      <w:commentRangeStart w:id="23"/>
+      <w:r>
+        <w:rPr>
+          <w:rFonts w:ascii="Arial" w:hAnsi="Arial" w:cs="Arial"/>
+        </w:rPr>
+        <w:t>a character length of 8 character</w:t>
+      </w:r>
+      <w:commentRangeEnd w:id="23"/>
       <w:r>
         <w:rPr>
           <w:rStyle w:val="CommentReference"/>
         </w:rPr>
-        <w:commentReference w:id="22"/>
-      </w:r>
-      <w:r>
-        <w:rPr>
-          <w:rFonts w:ascii="Arial" w:hAnsi="Arial" w:cs="Arial"/>
-        </w:rPr>
-        <w:t xml:space="preserve">with more individual information than group membership information </w:t>
-      </w:r>
-      <w:r>
-        <w:rPr>
-          <w:rFonts w:ascii="Arial" w:hAnsi="Arial" w:cs="Arial"/>
-        </w:rPr>
-        <w:t xml:space="preserve">encoded </w:t>
-      </w:r>
-      <w:r>
-        <w:rPr>
-          <w:rFonts w:ascii="Arial" w:hAnsi="Arial" w:cs="Arial"/>
-        </w:rPr>
-        <w:t>(</w:t>
-      </w:r>
-      <w:commentRangeStart w:id="23"/>
-      <w:r>
-        <w:rPr>
-          <w:rFonts w:ascii="Arial" w:hAnsi="Arial" w:cs="Arial"/>
-        </w:rPr>
-        <w:t>Individual</w:t>
-      </w:r>
-      <w:r>
-        <w:rPr>
-          <w:rFonts w:ascii="Arial" w:hAnsi="Arial" w:cs="Arial"/>
-        </w:rPr>
-        <w:t xml:space="preserve"> Information</w:t>
-      </w:r>
-      <w:r>
-        <w:rPr>
-          <w:rFonts w:ascii="Arial" w:hAnsi="Arial" w:cs="Arial"/>
-        </w:rPr>
-        <w:t xml:space="preserve"> Dataset</w:t>
-      </w:r>
-      <w:commentRangeEnd w:id="23"/>
-      <w:r>
-        <w:rPr>
-          <w:rFonts w:ascii="Arial" w:hAnsi="Arial" w:cs="Arial"/>
-        </w:rPr>
-        <w:t xml:space="preserve">; </w:t>
-      </w:r>
+        <w:commentReference w:id="23"/>
+      </w:r>
+      <w:r>
+        <w:rPr>
+          <w:rFonts w:ascii="Arial" w:hAnsi="Arial" w:cs="Arial"/>
+        </w:rPr>
+        <w:t>.</w:t>
+      </w:r>
+      <w:r>
+        <w:rPr>
+          <w:rFonts w:ascii="Arial" w:hAnsi="Arial" w:cs="Arial"/>
+        </w:rPr>
+        <w:t xml:space="preserve"> In the Individual</w:t>
+      </w:r>
+      <w:r>
+        <w:rPr>
+          <w:rFonts w:ascii="Arial" w:hAnsi="Arial" w:cs="Arial"/>
+        </w:rPr>
+        <w:t xml:space="preserve"> </w:t>
+      </w:r>
+      <w:r>
+        <w:rPr>
+          <w:rFonts w:ascii="Arial" w:hAnsi="Arial" w:cs="Arial"/>
+        </w:rPr>
+        <w:t xml:space="preserve">Dataset, individual information was set to a </w:t>
+      </w:r>
+      <w:commentRangeStart w:id="24"/>
+      <w:r>
+        <w:rPr>
+          <w:rFonts w:ascii="Arial" w:hAnsi="Arial" w:cs="Arial"/>
+        </w:rPr>
+        <w:t>character length of 8 characters</w:t>
+      </w:r>
+      <w:commentRangeEnd w:id="24"/>
       <w:r>
         <w:rPr>
           <w:rStyle w:val="CommentReference"/>
         </w:rPr>
-        <w:commentReference w:id="23"/>
-      </w:r>
-      <w:r>
-        <w:rPr>
-          <w:rFonts w:ascii="Arial" w:hAnsi="Arial" w:cs="Arial"/>
-        </w:rPr>
-        <w:t>henceforth the Individual</w:t>
-      </w:r>
-      <w:r>
-        <w:rPr>
-          <w:rFonts w:ascii="Arial" w:hAnsi="Arial" w:cs="Arial"/>
-        </w:rPr>
-        <w:t xml:space="preserve"> dataset</w:t>
-      </w:r>
-      <w:r>
-        <w:rPr>
-          <w:rFonts w:ascii="Arial" w:hAnsi="Arial" w:cs="Arial"/>
-        </w:rPr>
-        <w:t xml:space="preserve">). In the </w:t>
-      </w:r>
-      <w:r>
-        <w:rPr>
-          <w:rFonts w:ascii="Arial" w:hAnsi="Arial" w:cs="Arial"/>
-        </w:rPr>
-        <w:t>Group</w:t>
-      </w:r>
-      <w:r>
-        <w:rPr>
-          <w:rFonts w:ascii="Arial" w:hAnsi="Arial" w:cs="Arial"/>
-        </w:rPr>
-        <w:t xml:space="preserve"> Dataset, individual information was set to a character length of 4 characters, and group </w:t>
-      </w:r>
-      <w:r>
-        <w:rPr>
-          <w:rFonts w:ascii="Arial" w:hAnsi="Arial" w:cs="Arial"/>
-        </w:rPr>
-        <w:t xml:space="preserve">member </w:t>
-      </w:r>
-      <w:r>
-        <w:rPr>
-          <w:rFonts w:ascii="Arial" w:hAnsi="Arial" w:cs="Arial"/>
-        </w:rPr>
-        <w:t xml:space="preserve">information was set to </w:t>
-      </w:r>
-      <w:commentRangeStart w:id="24"/>
-      <w:r>
-        <w:rPr>
-          <w:rFonts w:ascii="Arial" w:hAnsi="Arial" w:cs="Arial"/>
-        </w:rPr>
-        <w:t>a character length of 8 character</w:t>
-      </w:r>
-      <w:commentRangeEnd w:id="24"/>
-      <w:r>
-        <w:rPr>
-          <w:rStyle w:val="CommentReference"/>
-        </w:rPr>
         <w:commentReference w:id="24"/>
-      </w:r>
-      <w:r>
-        <w:rPr>
-          <w:rFonts w:ascii="Arial" w:hAnsi="Arial" w:cs="Arial"/>
-        </w:rPr>
-        <w:t>.</w:t>
-      </w:r>
-      <w:r>
-        <w:rPr>
-          <w:rFonts w:ascii="Arial" w:hAnsi="Arial" w:cs="Arial"/>
-        </w:rPr>
-        <w:t xml:space="preserve"> In the Individual</w:t>
-      </w:r>
-      <w:r>
-        <w:rPr>
-          <w:rFonts w:ascii="Arial" w:hAnsi="Arial" w:cs="Arial"/>
-        </w:rPr>
-        <w:t xml:space="preserve"> </w:t>
-      </w:r>
-      <w:r>
-        <w:rPr>
-          <w:rFonts w:ascii="Arial" w:hAnsi="Arial" w:cs="Arial"/>
-        </w:rPr>
-        <w:t xml:space="preserve">Dataset, individual information was set to a </w:t>
-      </w:r>
-      <w:commentRangeStart w:id="25"/>
-      <w:r>
-        <w:rPr>
-          <w:rFonts w:ascii="Arial" w:hAnsi="Arial" w:cs="Arial"/>
-        </w:rPr>
-        <w:t>character length of 8 characters</w:t>
-      </w:r>
-      <w:commentRangeEnd w:id="25"/>
-      <w:r>
-        <w:rPr>
-          <w:rStyle w:val="CommentReference"/>
-        </w:rPr>
-        <w:commentReference w:id="25"/>
       </w:r>
       <w:r>
         <w:rPr>
@@ -4795,40 +4793,19 @@
         <w:rPr>
           <w:rFonts w:ascii="Arial" w:hAnsi="Arial" w:cs="Arial"/>
         </w:rPr>
-        <w:t xml:space="preserve">to convert the .wav files to spectrograms. </w:t>
-      </w:r>
-      <w:r>
-        <w:rPr>
-          <w:rFonts w:ascii="Arial" w:hAnsi="Arial" w:cs="Arial"/>
-          <w:highlight w:val="yellow"/>
-        </w:rPr>
-        <w:t>TKTK sentence about seeing these in figure</w:t>
-      </w:r>
-      <w:r>
-        <w:rPr>
-          <w:rFonts w:ascii="Arial" w:hAnsi="Arial" w:cs="Arial"/>
-          <w:highlight w:val="yellow"/>
-        </w:rPr>
-        <w:t>s</w:t>
-      </w:r>
-      <w:r>
-        <w:rPr>
-          <w:rFonts w:ascii="Arial" w:hAnsi="Arial" w:cs="Arial"/>
-          <w:highlight w:val="yellow"/>
+        <w:t>to convert the .wav files to spectrograms</w:t>
+      </w:r>
+      <w:r>
+        <w:rPr>
+          <w:rFonts w:ascii="Arial" w:hAnsi="Arial" w:cs="Arial"/>
+        </w:rPr>
+        <w:t xml:space="preserve"> (see example of calls in Figures 2B and 3B).</w:t>
+      </w:r>
+      <w:r>
+        <w:rPr>
+          <w:rFonts w:ascii="Arial" w:hAnsi="Arial" w:cs="Arial"/>
         </w:rPr>
         <w:t xml:space="preserve"> </w:t>
-      </w:r>
-      <w:r>
-        <w:rPr>
-          <w:rFonts w:ascii="Arial" w:hAnsi="Arial" w:cs="Arial"/>
-        </w:rPr>
-        <w:t>2 and 3</w:t>
-      </w:r>
-      <w:r>
-        <w:rPr>
-          <w:rFonts w:ascii="Arial" w:hAnsi="Arial" w:cs="Arial"/>
-        </w:rPr>
-        <w:t xml:space="preserve">. </w:t>
       </w:r>
       <w:r>
         <w:rPr>
@@ -5120,7 +5097,19 @@
         <w:rPr>
           <w:rFonts w:ascii="Arial" w:hAnsi="Arial" w:cs="Arial"/>
         </w:rPr>
-        <w:t xml:space="preserve">To test how </w:t>
+        <w:t xml:space="preserve">To </w:t>
+      </w:r>
+      <w:r>
+        <w:rPr>
+          <w:rFonts w:ascii="Arial" w:hAnsi="Arial" w:cs="Arial"/>
+        </w:rPr>
+        <w:t>assess</w:t>
+      </w:r>
+      <w:r>
+        <w:rPr>
+          <w:rFonts w:ascii="Arial" w:hAnsi="Arial" w:cs="Arial"/>
+        </w:rPr>
+        <w:t xml:space="preserve"> how </w:t>
       </w:r>
       <w:r>
         <w:rPr>
@@ -5168,139 +5157,100 @@
         <w:rPr>
           <w:rFonts w:ascii="Arial" w:hAnsi="Arial" w:cs="Arial"/>
         </w:rPr>
-        <w:t xml:space="preserve"> we created synthetic </w:t>
-      </w:r>
-      <w:r>
-        <w:rPr>
-          <w:rFonts w:ascii="Arial" w:hAnsi="Arial" w:cs="Arial"/>
-        </w:rPr>
-        <w:t xml:space="preserve">signal datasets that approximated different information encoding outcomes </w:t>
-      </w:r>
-      <w:r>
-        <w:rPr>
-          <w:rFonts w:ascii="Arial" w:hAnsi="Arial" w:cs="Arial"/>
-        </w:rPr>
-        <w:t xml:space="preserve">across </w:t>
-      </w:r>
-      <w:r>
-        <w:rPr>
-          <w:rFonts w:ascii="Arial" w:hAnsi="Arial" w:cs="Arial"/>
-        </w:rPr>
-        <w:t>four</w:t>
-      </w:r>
-      <w:r>
-        <w:rPr>
-          <w:rFonts w:ascii="Arial" w:hAnsi="Arial" w:cs="Arial"/>
-        </w:rPr>
-        <w:t xml:space="preserve"> </w:t>
-      </w:r>
-      <w:r>
-        <w:rPr>
-          <w:rFonts w:ascii="Arial" w:hAnsi="Arial" w:cs="Arial"/>
-        </w:rPr>
-        <w:t xml:space="preserve">different social conditions: </w:t>
-      </w:r>
-      <w:r>
-        <w:rPr>
-          <w:rFonts w:ascii="Arial" w:hAnsi="Arial" w:cs="Arial"/>
-        </w:rPr>
-        <w:t>Sparse</w:t>
-      </w:r>
-      <w:r>
-        <w:rPr>
-          <w:rFonts w:ascii="Arial" w:hAnsi="Arial" w:cs="Arial"/>
-        </w:rPr>
-        <w:t xml:space="preserve"> </w:t>
-      </w:r>
-      <w:r>
-        <w:rPr>
-          <w:rFonts w:ascii="Arial" w:hAnsi="Arial" w:cs="Arial"/>
-        </w:rPr>
-        <w:t xml:space="preserve">(2 groups, 2 individuals per group), </w:t>
-      </w:r>
-      <w:r>
-        <w:rPr>
-          <w:rFonts w:ascii="Arial" w:hAnsi="Arial" w:cs="Arial"/>
-        </w:rPr>
-        <w:t>I</w:t>
-      </w:r>
-      <w:r>
-        <w:rPr>
-          <w:rFonts w:ascii="Arial" w:hAnsi="Arial" w:cs="Arial"/>
-        </w:rPr>
-        <w:t>ntermediate (</w:t>
-      </w:r>
-      <w:r>
-        <w:rPr>
-          <w:rFonts w:ascii="Arial" w:hAnsi="Arial" w:cs="Arial"/>
-        </w:rPr>
-        <w:t>6</w:t>
-      </w:r>
-      <w:r>
-        <w:rPr>
-          <w:rFonts w:ascii="Arial" w:hAnsi="Arial" w:cs="Arial"/>
-        </w:rPr>
-        <w:t xml:space="preserve"> groups, </w:t>
-      </w:r>
-      <w:r>
-        <w:rPr>
-          <w:rFonts w:ascii="Arial" w:hAnsi="Arial" w:cs="Arial"/>
-        </w:rPr>
-        <w:t>6</w:t>
-      </w:r>
-      <w:r>
-        <w:rPr>
-          <w:rFonts w:ascii="Arial" w:hAnsi="Arial" w:cs="Arial"/>
-        </w:rPr>
-        <w:t xml:space="preserve"> individuals per group), </w:t>
-      </w:r>
-      <w:r>
-        <w:rPr>
-          <w:rFonts w:ascii="Arial" w:hAnsi="Arial" w:cs="Arial"/>
-        </w:rPr>
-        <w:t xml:space="preserve">Crowded (10 groups, 10 individuals per group), </w:t>
-      </w:r>
-      <w:r>
-        <w:rPr>
-          <w:rFonts w:ascii="Arial" w:hAnsi="Arial" w:cs="Arial"/>
-        </w:rPr>
-        <w:t xml:space="preserve">and </w:t>
-      </w:r>
-      <w:r>
-        <w:rPr>
-          <w:rFonts w:ascii="Arial" w:hAnsi="Arial" w:cs="Arial"/>
-        </w:rPr>
-        <w:t>D</w:t>
-      </w:r>
-      <w:r>
-        <w:rPr>
-          <w:rFonts w:ascii="Arial" w:hAnsi="Arial" w:cs="Arial"/>
-        </w:rPr>
-        <w:t xml:space="preserve">ense (20 groups, 20 individuals per group). </w:t>
-      </w:r>
-      <w:r>
-        <w:rPr>
-          <w:rFonts w:ascii="Arial" w:hAnsi="Arial" w:cs="Arial"/>
-        </w:rPr>
-        <w:t>We</w:t>
-      </w:r>
-      <w:r>
-        <w:rPr>
-          <w:rFonts w:ascii="Arial" w:hAnsi="Arial" w:cs="Arial"/>
-        </w:rPr>
-        <w:t xml:space="preserve"> kept the number of calls per individual constant at 2. </w:t>
-      </w:r>
-      <w:r>
-        <w:rPr>
-          <w:rFonts w:ascii="Arial" w:hAnsi="Arial" w:cs="Arial"/>
-        </w:rPr>
-        <w:t>These social conditions follow predictions for how many unique vocal signatures can be created at each social level (group or individual)</w:t>
-      </w:r>
-      <w:r>
-        <w:rPr>
-          <w:rFonts w:ascii="Arial" w:hAnsi="Arial" w:cs="Arial"/>
-        </w:rPr>
-        <w:t>, using an information theory perspective. TKTK add more here about the actual numbers</w:t>
+        <w:t xml:space="preserve"> we created </w:t>
+      </w:r>
+      <w:r>
+        <w:rPr>
+          <w:rFonts w:ascii="Arial" w:hAnsi="Arial" w:cs="Arial"/>
+        </w:rPr>
+        <w:t xml:space="preserve">synthetic data sets </w:t>
+      </w:r>
+      <w:r>
+        <w:rPr>
+          <w:rFonts w:ascii="Arial" w:hAnsi="Arial" w:cs="Arial"/>
+        </w:rPr>
+        <w:t xml:space="preserve">across 16 treatments </w:t>
+      </w:r>
+      <w:r>
+        <w:rPr>
+          <w:rFonts w:ascii="Arial" w:hAnsi="Arial" w:cs="Arial"/>
+        </w:rPr>
+        <w:t xml:space="preserve">that varied </w:t>
+      </w:r>
+      <w:r>
+        <w:rPr>
+          <w:rFonts w:ascii="Arial" w:hAnsi="Arial" w:cs="Arial"/>
+        </w:rPr>
+        <w:t xml:space="preserve">over social environment characteristics and information encoding rules. </w:t>
+      </w:r>
+      <w:commentRangeStart w:id="25"/>
+      <w:r>
+        <w:rPr>
+          <w:rFonts w:ascii="Arial" w:hAnsi="Arial" w:cs="Arial"/>
+        </w:rPr>
+        <w:t xml:space="preserve">We varied social environment characteristics represented information signaling changes that happen in socially sparse vs socially dense </w:t>
+      </w:r>
+      <w:r>
+        <w:rPr>
+          <w:rFonts w:ascii="Arial" w:hAnsi="Arial" w:cs="Arial"/>
+        </w:rPr>
+        <w:t>signaling</w:t>
+      </w:r>
+      <w:r>
+        <w:rPr>
+          <w:rFonts w:ascii="Arial" w:hAnsi="Arial" w:cs="Arial"/>
+        </w:rPr>
+        <w:t xml:space="preserve"> environments</w:t>
+      </w:r>
+      <w:commentRangeEnd w:id="25"/>
+      <w:r>
+        <w:rPr>
+          <w:rStyle w:val="CommentReference"/>
+        </w:rPr>
+        <w:commentReference w:id="25"/>
+      </w:r>
+      <w:r>
+        <w:rPr>
+          <w:rFonts w:ascii="Arial" w:hAnsi="Arial" w:cs="Arial"/>
+        </w:rPr>
+        <w:t xml:space="preserve">. </w:t>
+      </w:r>
+      <w:r>
+        <w:rPr>
+          <w:rFonts w:ascii="Arial" w:hAnsi="Arial" w:cs="Arial"/>
+        </w:rPr>
+        <w:t xml:space="preserve">Following information theory, this determines the number of unique signatures that can be created. </w:t>
+      </w:r>
+      <w:r>
+        <w:rPr>
+          <w:rFonts w:ascii="Arial" w:hAnsi="Arial" w:cs="Arial"/>
+        </w:rPr>
+        <w:t>We achieved this by creating four social conditions: 2 groups with 2 individuals per group, 4 groups with 4 individuals per group, 6 groups with 6 individuals per group, and 8 groups with 8 individuals per group</w:t>
+      </w:r>
+      <w:r>
+        <w:rPr>
+          <w:rFonts w:ascii="Arial" w:hAnsi="Arial" w:cs="Arial"/>
+        </w:rPr>
+        <w:t xml:space="preserve">. We also varied the </w:t>
+      </w:r>
+      <w:r>
+        <w:rPr>
+          <w:rFonts w:ascii="Arial" w:hAnsi="Arial" w:cs="Arial"/>
+        </w:rPr>
+        <w:t xml:space="preserve">proportion of group information to individual information encoded in the signal, with four categories: 0 </w:t>
+      </w:r>
+      <w:r>
+        <w:rPr>
+          <w:rFonts w:ascii="Arial" w:hAnsi="Arial" w:cs="Arial"/>
+        </w:rPr>
+        <w:lastRenderedPageBreak/>
+        <w:t>(representing all individual information and no group information), 1/3, 2/3, and 1 (representing all group information and no individual information.</w:t>
+      </w:r>
+      <w:r>
+        <w:rPr>
+          <w:rFonts w:ascii="Arial" w:hAnsi="Arial" w:cs="Arial"/>
+        </w:rPr>
+        <w:t xml:space="preserve"> We iterated over each treatment 10 times, generating 10 unique synthetic datasets per treatment. </w:t>
       </w:r>
     </w:p>
     <w:p>
@@ -5315,71 +5265,28 @@
         <w:rPr>
           <w:rFonts w:ascii="Arial" w:hAnsi="Arial" w:cs="Arial"/>
         </w:rPr>
-        <w:lastRenderedPageBreak/>
         <w:tab/>
-        <w:t>In each condition</w:t>
-      </w:r>
-      <w:r>
-        <w:rPr>
-          <w:rFonts w:ascii="Arial" w:hAnsi="Arial" w:cs="Arial"/>
-        </w:rPr>
-        <w:t>,</w:t>
-      </w:r>
-      <w:r>
-        <w:rPr>
-          <w:rFonts w:ascii="Arial" w:hAnsi="Arial" w:cs="Arial"/>
-        </w:rPr>
-        <w:t xml:space="preserve"> we created </w:t>
-      </w:r>
-      <w:r>
-        <w:rPr>
-          <w:rFonts w:ascii="Arial" w:hAnsi="Arial" w:cs="Arial"/>
-        </w:rPr>
-        <w:t>4</w:t>
-      </w:r>
-      <w:r>
-        <w:rPr>
-          <w:rFonts w:ascii="Arial" w:hAnsi="Arial" w:cs="Arial"/>
-        </w:rPr>
-        <w:t xml:space="preserve"> different </w:t>
+        <w:t>Once these synthetic datasets were created, we used traditional bioacoustics tools to decode information encoded at the group and individual level</w:t>
+      </w:r>
+      <w:r>
+        <w:rPr>
+          <w:rFonts w:ascii="Arial" w:hAnsi="Arial" w:cs="Arial"/>
+        </w:rPr>
+        <w:t xml:space="preserve">. </w:t>
       </w:r>
       <w:proofErr w:type="gramStart"/>
       <w:r>
         <w:rPr>
           <w:rFonts w:ascii="Arial" w:hAnsi="Arial" w:cs="Arial"/>
         </w:rPr>
-        <w:t>datasets</w:t>
+        <w:t>Similar to</w:t>
       </w:r>
       <w:proofErr w:type="gramEnd"/>
       <w:r>
         <w:rPr>
           <w:rFonts w:ascii="Arial" w:hAnsi="Arial" w:cs="Arial"/>
         </w:rPr>
-        <w:t xml:space="preserve"> that varied the proportion of group to individual information encoded in calls</w:t>
-      </w:r>
-      <w:r>
-        <w:rPr>
-          <w:rFonts w:ascii="Arial" w:hAnsi="Arial" w:cs="Arial"/>
-        </w:rPr>
-        <w:t xml:space="preserve">. We kept the total information string length across these datasets constant at 20 characters, only changing the proportion of information that was group or individual information. These datasets represented the following information ratios: </w:t>
-      </w:r>
-      <w:r>
-        <w:rPr>
-          <w:rFonts w:ascii="Arial" w:hAnsi="Arial" w:cs="Arial"/>
-        </w:rPr>
-        <w:t xml:space="preserve">0 – no group information, all individual information, </w:t>
-      </w:r>
-      <w:r>
-        <w:rPr>
-          <w:rFonts w:ascii="Arial" w:hAnsi="Arial" w:cs="Arial"/>
-        </w:rPr>
-        <w:t>1/3, 2/3</w:t>
-      </w:r>
-      <w:r>
-        <w:rPr>
-          <w:rFonts w:ascii="Arial" w:hAnsi="Arial" w:cs="Arial"/>
-        </w:rPr>
-        <w:t>, 1 – all group information, no individual</w:t>
+        <w:t xml:space="preserve"> the datasets above, we performed SPCC</w:t>
       </w:r>
       <w:r>
         <w:rPr>
@@ -5387,29 +5294,45 @@
         </w:rPr>
         <w:t xml:space="preserve">. </w:t>
       </w:r>
-      <w:r>
-        <w:rPr>
-          <w:rFonts w:ascii="Arial" w:hAnsi="Arial" w:cs="Arial"/>
-        </w:rPr>
-        <w:t xml:space="preserve"> </w:t>
-      </w:r>
-      <w:r>
-        <w:rPr>
-          <w:rFonts w:ascii="Arial" w:hAnsi="Arial" w:cs="Arial"/>
-        </w:rPr>
-        <w:t xml:space="preserve">We ran </w:t>
-      </w:r>
-      <w:r>
-        <w:rPr>
-          <w:rFonts w:ascii="Arial" w:hAnsi="Arial" w:cs="Arial"/>
-        </w:rPr>
-        <w:t xml:space="preserve">8 </w:t>
-      </w:r>
-      <w:r>
-        <w:rPr>
-          <w:rFonts w:ascii="Arial" w:hAnsi="Arial" w:cs="Arial"/>
-        </w:rPr>
-        <w:t xml:space="preserve">iterations for each combination of information ratio and social condition. </w:t>
+      <w:commentRangeStart w:id="26"/>
+      <w:r>
+        <w:rPr>
+          <w:rFonts w:ascii="Arial" w:hAnsi="Arial" w:cs="Arial"/>
+        </w:rPr>
+        <w:t>We also calculated the edit distance for the original strings</w:t>
+      </w:r>
+      <w:commentRangeEnd w:id="26"/>
+      <w:r>
+        <w:rPr>
+          <w:rStyle w:val="CommentReference"/>
+        </w:rPr>
+        <w:commentReference w:id="26"/>
+      </w:r>
+      <w:r>
+        <w:rPr>
+          <w:rFonts w:ascii="Arial" w:hAnsi="Arial" w:cs="Arial"/>
+        </w:rPr>
+        <w:t xml:space="preserve">. After these calculations, we performed Multidimensional Scaling on both the SPCC and edit distance matrices, then performed k-means clustering, randomly selecting 1 call per individual per group, to ensure that call exemplars per class matched between social levels. From this, we were able to calculate the accuracy of decoding information via edit distance and SPCC calculations at both the group and individual information level. </w:t>
+      </w:r>
+      <w:commentRangeStart w:id="27"/>
+      <w:r>
+        <w:rPr>
+          <w:rFonts w:ascii="Arial" w:hAnsi="Arial" w:cs="Arial"/>
+        </w:rPr>
+        <w:t>TKTK</w:t>
+      </w:r>
+      <w:commentRangeEnd w:id="27"/>
+      <w:r>
+        <w:rPr>
+          <w:rStyle w:val="CommentReference"/>
+        </w:rPr>
+        <w:commentReference w:id="27"/>
+      </w:r>
+      <w:r>
+        <w:rPr>
+          <w:rFonts w:ascii="Arial" w:hAnsi="Arial" w:cs="Arial"/>
+        </w:rPr>
+        <w:t xml:space="preserve">. </w:t>
       </w:r>
     </w:p>
     <w:p>
@@ -5425,43 +5348,12 @@
           <w:rFonts w:ascii="Arial" w:hAnsi="Arial" w:cs="Arial"/>
         </w:rPr>
         <w:tab/>
-        <w:t>After generating the</w:t>
-      </w:r>
-      <w:r>
-        <w:rPr>
-          <w:rFonts w:ascii="Arial" w:hAnsi="Arial" w:cs="Arial"/>
-        </w:rPr>
-        <w:t>se</w:t>
-      </w:r>
-      <w:r>
-        <w:rPr>
-          <w:rFonts w:ascii="Arial" w:hAnsi="Arial" w:cs="Arial"/>
-        </w:rPr>
-        <w:t xml:space="preserve"> synthetic audio files, we used the </w:t>
-      </w:r>
-      <w:proofErr w:type="spellStart"/>
-      <w:r>
-        <w:rPr>
-          <w:rFonts w:ascii="Arial" w:hAnsi="Arial" w:cs="Arial"/>
-        </w:rPr>
-        <w:t>warbleR</w:t>
-      </w:r>
-      <w:proofErr w:type="spellEnd"/>
-      <w:r>
-        <w:rPr>
-          <w:rFonts w:ascii="Arial" w:hAnsi="Arial" w:cs="Arial"/>
-        </w:rPr>
-        <w:t xml:space="preserve"> package to perform SPCC. </w:t>
-      </w:r>
-      <w:r>
-        <w:rPr>
-          <w:rFonts w:ascii="Arial" w:hAnsi="Arial" w:cs="Arial"/>
-        </w:rPr>
-        <w:t>We used the same SPCC and MDS methods above TKTK. Figure 3?</w:t>
-      </w:r>
-    </w:p>
-    <w:p>
-      <w:pPr>
+        <w:t xml:space="preserve">TKTK paragraph about effect size calculations (motivation and steps). </w:t>
+      </w:r>
+    </w:p>
+    <w:p>
+      <w:pPr>
+        <w:pStyle w:val="NoSpacing"/>
         <w:spacing w:line="360" w:lineRule="auto"/>
         <w:rPr>
           <w:rFonts w:ascii="Arial" w:hAnsi="Arial" w:cs="Arial"/>
@@ -5533,21 +5425,31 @@
         <w:rPr>
           <w:rFonts w:ascii="Arial" w:hAnsi="Arial" w:cs="Arial"/>
         </w:rPr>
-        <w:t xml:space="preserve">For the Group and Individual </w:t>
-      </w:r>
-      <w:proofErr w:type="gramStart"/>
-      <w:r>
-        <w:rPr>
-          <w:rFonts w:ascii="Arial" w:hAnsi="Arial" w:cs="Arial"/>
-        </w:rPr>
-        <w:t>datasets</w:t>
-      </w:r>
-      <w:proofErr w:type="gramEnd"/>
-      <w:r>
-        <w:rPr>
-          <w:rFonts w:ascii="Arial" w:hAnsi="Arial" w:cs="Arial"/>
-        </w:rPr>
-        <w:t xml:space="preserve"> we created spectrographic lexicons and acoustic space plots to visualize the range of synthetic signals created and how they relate to each other in acoustic space at the individual and group level.</w:t>
+        <w:t xml:space="preserve">For the Group and </w:t>
+      </w:r>
+      <w:r>
+        <w:rPr>
+          <w:rFonts w:ascii="Arial" w:hAnsi="Arial" w:cs="Arial"/>
+        </w:rPr>
+        <w:t xml:space="preserve">Individual </w:t>
+      </w:r>
+      <w:r>
+        <w:rPr>
+          <w:rFonts w:ascii="Arial" w:hAnsi="Arial" w:cs="Arial"/>
+        </w:rPr>
+        <w:t>datasets,</w:t>
+      </w:r>
+      <w:r>
+        <w:rPr>
+          <w:rFonts w:ascii="Arial" w:hAnsi="Arial" w:cs="Arial"/>
+        </w:rPr>
+        <w:t xml:space="preserve"> we created </w:t>
+      </w:r>
+      <w:r>
+        <w:rPr>
+          <w:rFonts w:ascii="Arial" w:hAnsi="Arial" w:cs="Arial"/>
+        </w:rPr>
+        <w:t>spectrographic lexicons and acoustic space plots to visualize the range of synthetic signals created and how they relate to each other in acoustic space at the individual and group level.</w:t>
       </w:r>
       <w:r>
         <w:rPr>
@@ -5555,47 +5457,47 @@
         </w:rPr>
         <w:t xml:space="preserve"> </w:t>
       </w:r>
-      <w:commentRangeStart w:id="26"/>
       <w:r>
         <w:rPr>
           <w:rFonts w:ascii="Arial" w:hAnsi="Arial" w:cs="Arial"/>
         </w:rPr>
         <w:t>In the Group dataset, synthetic vocalizations share more similarities within groups and are more different across groups, see</w:t>
       </w:r>
-      <w:ins w:id="27" w:author="Summer Eckhardt" w:date="2025-02-20T16:45:00Z" w16du:dateUtc="2025-02-20T21:45:00Z">
-        <w:r>
-          <w:rPr>
-            <w:rFonts w:ascii="Arial" w:hAnsi="Arial" w:cs="Arial"/>
-          </w:rPr>
-          <w:t>n</w:t>
-        </w:r>
-      </w:ins>
-      <w:r>
-        <w:rPr>
-          <w:rFonts w:ascii="Arial" w:hAnsi="Arial" w:cs="Arial"/>
-        </w:rPr>
-        <w:t xml:space="preserve"> by the lack of overlapping polygons in group level acoustic space plots, and the over</w:t>
-      </w:r>
-      <w:del w:id="28" w:author="Summer Eckhardt" w:date="2025-02-20T16:46:00Z" w16du:dateUtc="2025-02-20T21:46:00Z">
-        <w:r>
-          <w:rPr>
-            <w:rFonts w:ascii="Arial" w:hAnsi="Arial" w:cs="Arial"/>
-          </w:rPr>
-          <w:delText xml:space="preserve"> </w:delText>
-        </w:r>
-      </w:del>
-      <w:r>
-        <w:rPr>
-          <w:rFonts w:ascii="Arial" w:hAnsi="Arial" w:cs="Arial"/>
-        </w:rPr>
-        <w:t>lapping polygons in the individual level acoustic space plots (Figure 2). In the individual information dataset, vocalizations contain more variation within groups, seen by the overlapping polygons in the group level acoustic space plots, and the distance acoustic space regions occupied by individuals in the individual level acoustic space plot (Figure 3)</w:t>
-      </w:r>
-      <w:commentRangeEnd w:id="26"/>
-      <w:r>
-        <w:rPr>
-          <w:rStyle w:val="CommentReference"/>
-        </w:rPr>
-        <w:commentReference w:id="26"/>
+      <w:r>
+        <w:rPr>
+          <w:rFonts w:ascii="Arial" w:hAnsi="Arial" w:cs="Arial"/>
+        </w:rPr>
+        <w:t>n</w:t>
+      </w:r>
+      <w:r>
+        <w:rPr>
+          <w:rFonts w:ascii="Arial" w:hAnsi="Arial" w:cs="Arial"/>
+        </w:rPr>
+        <w:t xml:space="preserve"> by the lack of overlapping polygons in group level acoustic space plots, and the overlapping polygons in the individual level acoustic space plots (Figure 2</w:t>
+      </w:r>
+      <w:r>
+        <w:rPr>
+          <w:rFonts w:ascii="Arial" w:hAnsi="Arial" w:cs="Arial"/>
+        </w:rPr>
+        <w:t>A</w:t>
+      </w:r>
+      <w:r>
+        <w:rPr>
+          <w:rFonts w:ascii="Arial" w:hAnsi="Arial" w:cs="Arial"/>
+        </w:rPr>
+        <w:t>). In the individual information dataset, vocalizations contain more variation within groups, seen by the overlapping polygons in the group level acoustic space plots, and the distance acoustic space regions occupied by individuals in the individual level acoustic space plot (Figure 3</w:t>
+      </w:r>
+      <w:r>
+        <w:rPr>
+          <w:rFonts w:ascii="Arial" w:hAnsi="Arial" w:cs="Arial"/>
+        </w:rPr>
+        <w:t>A</w:t>
+      </w:r>
+      <w:r>
+        <w:rPr>
+          <w:rFonts w:ascii="Arial" w:hAnsi="Arial" w:cs="Arial"/>
+        </w:rPr>
+        <w:t>)</w:t>
       </w:r>
     </w:p>
     <w:p>
@@ -5657,29 +5559,30 @@
           <w:bCs/>
         </w:rPr>
       </w:pPr>
+      <w:commentRangeStart w:id="28"/>
       <w:commentRangeStart w:id="29"/>
-      <w:commentRangeStart w:id="30"/>
       <w:r>
         <w:rPr>
           <w:rFonts w:ascii="Arial" w:hAnsi="Arial" w:cs="Arial"/>
           <w:b/>
           <w:bCs/>
         </w:rPr>
+        <w:lastRenderedPageBreak/>
         <w:t>Discussion</w:t>
       </w:r>
+      <w:commentRangeEnd w:id="28"/>
+      <w:r>
+        <w:rPr>
+          <w:rStyle w:val="CommentReference"/>
+        </w:rPr>
+        <w:commentReference w:id="28"/>
+      </w:r>
       <w:commentRangeEnd w:id="29"/>
       <w:r>
         <w:rPr>
           <w:rStyle w:val="CommentReference"/>
         </w:rPr>
         <w:commentReference w:id="29"/>
-      </w:r>
-      <w:commentRangeEnd w:id="30"/>
-      <w:r>
-        <w:rPr>
-          <w:rStyle w:val="CommentReference"/>
-        </w:rPr>
-        <w:commentReference w:id="30"/>
       </w:r>
       <w:r>
         <w:rPr>
@@ -5713,19 +5616,19 @@
         </w:rPr>
         <w:t xml:space="preserve">Synthetic tools offer a practical solution, by allowing us to control </w:t>
       </w:r>
-      <w:commentRangeStart w:id="31"/>
+      <w:commentRangeStart w:id="30"/>
       <w:r>
         <w:rPr>
           <w:rFonts w:ascii="Arial" w:hAnsi="Arial" w:cs="Arial"/>
         </w:rPr>
         <w:t>these</w:t>
       </w:r>
-      <w:commentRangeEnd w:id="31"/>
+      <w:commentRangeEnd w:id="30"/>
       <w:r>
         <w:rPr>
           <w:rStyle w:val="CommentReference"/>
         </w:rPr>
-        <w:commentReference w:id="31"/>
+        <w:commentReference w:id="30"/>
       </w:r>
       <w:r>
         <w:rPr>
@@ -5755,14 +5658,7 @@
         <w:rPr>
           <w:rFonts w:ascii="Arial" w:hAnsi="Arial" w:cs="Arial"/>
         </w:rPr>
-        <w:t xml:space="preserve"> there are calls for vocal </w:t>
-      </w:r>
-      <w:r>
-        <w:rPr>
-          <w:rFonts w:ascii="Arial" w:hAnsi="Arial" w:cs="Arial"/>
-        </w:rPr>
-        <w:lastRenderedPageBreak/>
-        <w:t xml:space="preserve">communication research to take advantage </w:t>
+        <w:t xml:space="preserve"> there are calls for vocal communication research to take advantage </w:t>
       </w:r>
       <w:r>
         <w:rPr>
@@ -5866,7 +5762,7 @@
           <w:szCs w:val="18"/>
         </w:rPr>
       </w:pPr>
-      <w:commentRangeStart w:id="32"/>
+      <w:commentRangeStart w:id="31"/>
       <w:r>
         <w:rPr>
           <w:rFonts w:ascii="Arial" w:hAnsi="Arial" w:cs="Arial"/>
@@ -5877,12 +5773,12 @@
         </w:rPr>
         <w:t>Discussion points:</w:t>
       </w:r>
-      <w:commentRangeEnd w:id="32"/>
+      <w:commentRangeEnd w:id="31"/>
       <w:r>
         <w:rPr>
           <w:rStyle w:val="CommentReference"/>
         </w:rPr>
-        <w:commentReference w:id="32"/>
+        <w:commentReference w:id="31"/>
       </w:r>
     </w:p>
     <w:p>
@@ -7943,6 +7839,7 @@
     </w:p>
     <w:p>
       <w:pPr>
+        <w:jc w:val="center"/>
         <w:rPr>
           <w:rFonts w:ascii="Arial" w:hAnsi="Arial" w:cs="Arial"/>
           <w:b/>
@@ -7955,17 +7852,9 @@
         </w:rPr>
         <w:lastRenderedPageBreak/>
         <w:drawing>
-          <wp:anchor distT="0" distB="0" distL="114300" distR="114300" simplePos="0" relativeHeight="251662336" behindDoc="0" locked="0" layoutInCell="1" allowOverlap="1" wp14:anchorId="09C0A3D8" wp14:editId="4CBA3320">
-            <wp:simplePos x="0" y="0"/>
-            <wp:positionH relativeFrom="column">
-              <wp:posOffset>13335</wp:posOffset>
-            </wp:positionH>
-            <wp:positionV relativeFrom="paragraph">
-              <wp:posOffset>0</wp:posOffset>
-            </wp:positionV>
+          <wp:inline distT="0" distB="0" distL="0" distR="0" wp14:anchorId="09C0A3D8" wp14:editId="44A5604F">
             <wp:extent cx="2908300" cy="1847850"/>
             <wp:effectExtent l="0" t="0" r="6350" b="0"/>
-            <wp:wrapTopAndBottom/>
             <wp:docPr id="1028415082" name="Picture 3" descr="A black background with a black square&#10;&#10;AI-generated content may be incorrect."/>
             <wp:cNvGraphicFramePr>
               <a:graphicFrameLocks xmlns:a="http://schemas.openxmlformats.org/drawingml/2006/main" noChangeAspect="1"/>
@@ -8008,7 +7897,7 @@
                 </pic:pic>
               </a:graphicData>
             </a:graphic>
-          </wp:anchor>
+          </wp:inline>
         </w:drawing>
       </w:r>
     </w:p>
@@ -8021,9 +7910,15 @@
           <w:bCs/>
         </w:rPr>
       </w:pPr>
-      <w:commentRangeStart w:id="33"/>
-      <w:commentRangeStart w:id="34"/>
-      <w:commentRangeStart w:id="35"/>
+    </w:p>
+    <w:p>
+      <w:pPr>
+        <w:spacing w:line="360" w:lineRule="auto"/>
+        <w:rPr>
+          <w:rFonts w:ascii="Arial Nova Light" w:hAnsi="Arial Nova Light" w:cs="Arial"/>
+        </w:rPr>
+      </w:pPr>
+      <w:commentRangeStart w:id="32"/>
       <w:r>
         <w:rPr>
           <w:rFonts w:ascii="Arial Nova Light" w:hAnsi="Arial Nova Light" w:cs="Arial"/>
@@ -8032,15 +7927,12 @@
         </w:rPr>
         <w:t xml:space="preserve">Figure </w:t>
       </w:r>
-      <w:commentRangeEnd w:id="33"/>
+      <w:commentRangeEnd w:id="32"/>
       <w:r>
         <w:rPr>
           <w:rStyle w:val="CommentReference"/>
-          <w:rFonts w:ascii="Arial Nova Light" w:hAnsi="Arial Nova Light"/>
-          <w:sz w:val="24"/>
-          <w:szCs w:val="24"/>
-        </w:rPr>
-        <w:commentReference w:id="33"/>
+        </w:rPr>
+        <w:commentReference w:id="32"/>
       </w:r>
       <w:r>
         <w:rPr>
@@ -8048,7 +7940,150 @@
           <w:b/>
           <w:bCs/>
         </w:rPr>
-        <w:t>1</w:t>
+        <w:t xml:space="preserve">1: </w:t>
+      </w:r>
+      <w:r>
+        <w:rPr>
+          <w:rFonts w:ascii="Arial Nova Light" w:hAnsi="Arial Nova Light" w:cs="Arial"/>
+        </w:rPr>
+        <w:t xml:space="preserve">Example character string created in </w:t>
+      </w:r>
+      <w:proofErr w:type="spellStart"/>
+      <w:r>
+        <w:rPr>
+          <w:rFonts w:ascii="Arial Nova Light" w:hAnsi="Arial Nova Light" w:cs="Arial"/>
+        </w:rPr>
+        <w:t>paRsynth’s</w:t>
+      </w:r>
+      <w:proofErr w:type="spellEnd"/>
+      <w:r>
+        <w:rPr>
+          <w:rFonts w:ascii="Arial Nova Light" w:hAnsi="Arial Nova Light" w:cs="Arial"/>
+        </w:rPr>
+        <w:t xml:space="preserve"> generate strings code. The string consists of (1) a global head, (2) group information, (3) individual information, (4) random variation, (5) group information, and (6) a global tail.</w:t>
+      </w:r>
+    </w:p>
+    <w:p>
+      <w:pPr>
+        <w:spacing w:line="360" w:lineRule="auto"/>
+        <w:rPr>
+          <w:rFonts w:ascii="Arial Nova Light" w:hAnsi="Arial Nova Light" w:cs="Arial"/>
+        </w:rPr>
+      </w:pPr>
+    </w:p>
+    <w:p>
+      <w:pPr>
+        <w:rPr>
+          <w:rFonts w:ascii="Arial Nova Light" w:hAnsi="Arial Nova Light" w:cs="Arial"/>
+        </w:rPr>
+      </w:pPr>
+      <w:r>
+        <w:rPr>
+          <w:rFonts w:ascii="Arial Nova Light" w:hAnsi="Arial Nova Light" w:cs="Arial"/>
+        </w:rPr>
+        <w:br w:type="page"/>
+      </w:r>
+    </w:p>
+    <w:p>
+      <w:pPr>
+        <w:spacing w:line="360" w:lineRule="auto"/>
+        <w:jc w:val="center"/>
+        <w:rPr>
+          <w:rFonts w:ascii="Arial Nova Light" w:hAnsi="Arial Nova Light" w:cs="Arial"/>
+        </w:rPr>
+      </w:pPr>
+      <w:r>
+        <w:rPr>
+          <w:rFonts w:ascii="Arial Nova Light" w:hAnsi="Arial Nova Light" w:cs="Arial"/>
+          <w:noProof/>
+        </w:rPr>
+        <w:lastRenderedPageBreak/>
+        <w:drawing>
+          <wp:inline distT="0" distB="0" distL="0" distR="0" wp14:anchorId="06D2C277" wp14:editId="4FD1D03A">
+            <wp:extent cx="5814060" cy="5676900"/>
+            <wp:effectExtent l="0" t="0" r="0" b="0"/>
+            <wp:docPr id="380798738" name="Picture 1"/>
+            <wp:cNvGraphicFramePr>
+              <a:graphicFrameLocks xmlns:a="http://schemas.openxmlformats.org/drawingml/2006/main" noChangeAspect="1"/>
+            </wp:cNvGraphicFramePr>
+            <a:graphic xmlns:a="http://schemas.openxmlformats.org/drawingml/2006/main">
+              <a:graphicData uri="http://schemas.openxmlformats.org/drawingml/2006/picture">
+                <pic:pic xmlns:pic="http://schemas.openxmlformats.org/drawingml/2006/picture">
+                  <pic:nvPicPr>
+                    <pic:cNvPr id="0" name="Picture 1"/>
+                    <pic:cNvPicPr>
+                      <a:picLocks noChangeAspect="1" noChangeArrowheads="1"/>
+                    </pic:cNvPicPr>
+                  </pic:nvPicPr>
+                  <pic:blipFill rotWithShape="1">
+                    <a:blip r:embed="rId14">
+                      <a:extLst>
+                        <a:ext uri="{28A0092B-C50C-407E-A947-70E740481C1C}">
+                          <a14:useLocalDpi xmlns:a14="http://schemas.microsoft.com/office/drawing/2010/main" val="0"/>
+                        </a:ext>
+                      </a:extLst>
+                    </a:blip>
+                    <a:srcRect b="31018"/>
+                    <a:stretch/>
+                  </pic:blipFill>
+                  <pic:spPr bwMode="auto">
+                    <a:xfrm>
+                      <a:off x="0" y="0"/>
+                      <a:ext cx="5814060" cy="5676900"/>
+                    </a:xfrm>
+                    <a:prstGeom prst="rect">
+                      <a:avLst/>
+                    </a:prstGeom>
+                    <a:noFill/>
+                    <a:ln>
+                      <a:noFill/>
+                    </a:ln>
+                    <a:extLst>
+                      <a:ext uri="{53640926-AAD7-44D8-BBD7-CCE9431645EC}">
+                        <a14:shadowObscured xmlns:a14="http://schemas.microsoft.com/office/drawing/2010/main"/>
+                      </a:ext>
+                    </a:extLst>
+                  </pic:spPr>
+                </pic:pic>
+              </a:graphicData>
+            </a:graphic>
+          </wp:inline>
+        </w:drawing>
+      </w:r>
+    </w:p>
+    <w:p>
+      <w:pPr>
+        <w:spacing w:line="360" w:lineRule="auto"/>
+        <w:rPr>
+          <w:rFonts w:ascii="Arial Nova Light" w:hAnsi="Arial Nova Light" w:cs="Arial"/>
+        </w:rPr>
+      </w:pPr>
+      <w:commentRangeStart w:id="33"/>
+      <w:r>
+        <w:rPr>
+          <w:rFonts w:ascii="Arial Nova Light" w:hAnsi="Arial Nova Light" w:cs="Arial"/>
+        </w:rPr>
+        <w:t xml:space="preserve">Figure </w:t>
+      </w:r>
+      <w:commentRangeEnd w:id="33"/>
+      <w:r>
+        <w:rPr>
+          <w:rStyle w:val="CommentReference"/>
+        </w:rPr>
+        <w:commentReference w:id="33"/>
+      </w:r>
+      <w:r>
+        <w:rPr>
+          <w:rFonts w:ascii="Arial Nova Light" w:hAnsi="Arial Nova Light" w:cs="Arial"/>
+        </w:rPr>
+        <w:t>2: Group Information Dataset (</w:t>
+      </w:r>
+      <w:commentRangeStart w:id="34"/>
+      <w:r>
+        <w:rPr>
+          <w:rFonts w:ascii="Arial Nova Light" w:hAnsi="Arial Nova Light" w:cs="Arial"/>
+        </w:rPr>
+        <w:t>A</w:t>
       </w:r>
       <w:commentRangeEnd w:id="34"/>
       <w:r>
@@ -8057,6 +8092,114 @@
         </w:rPr>
         <w:commentReference w:id="34"/>
       </w:r>
+      <w:r>
+        <w:rPr>
+          <w:rFonts w:ascii="Arial Nova Light" w:hAnsi="Arial Nova Light" w:cs="Arial"/>
+        </w:rPr>
+        <w:t xml:space="preserve">) Acoustic space plots with polygons drawn to original number of groups or original number of individuals. (B) Lexicon with example calls from two individuals form two example groups. </w:t>
+      </w:r>
+    </w:p>
+    <w:p>
+      <w:pPr>
+        <w:rPr>
+          <w:rFonts w:ascii="Arial Nova Light" w:hAnsi="Arial Nova Light" w:cs="Arial"/>
+        </w:rPr>
+      </w:pPr>
+      <w:r>
+        <w:rPr>
+          <w:rFonts w:ascii="Arial Nova Light" w:hAnsi="Arial Nova Light" w:cs="Arial"/>
+        </w:rPr>
+        <w:br w:type="page"/>
+      </w:r>
+    </w:p>
+    <w:p>
+      <w:pPr>
+        <w:spacing w:line="360" w:lineRule="auto"/>
+        <w:rPr>
+          <w:rFonts w:ascii="Arial Nova Light" w:hAnsi="Arial Nova Light" w:cs="Arial"/>
+        </w:rPr>
+      </w:pPr>
+    </w:p>
+    <w:p>
+      <w:pPr>
+        <w:spacing w:line="360" w:lineRule="auto"/>
+        <w:jc w:val="center"/>
+        <w:rPr>
+          <w:rFonts w:ascii="Arial Nova Light" w:hAnsi="Arial Nova Light" w:cs="Arial"/>
+        </w:rPr>
+      </w:pPr>
+      <w:r>
+        <w:rPr>
+          <w:rFonts w:ascii="Arial Nova Light" w:hAnsi="Arial Nova Light" w:cs="Arial"/>
+          <w:noProof/>
+        </w:rPr>
+        <w:drawing>
+          <wp:inline distT="0" distB="0" distL="0" distR="0" wp14:anchorId="258F480E" wp14:editId="752B0A0D">
+            <wp:extent cx="5814060" cy="5699760"/>
+            <wp:effectExtent l="0" t="0" r="0" b="0"/>
+            <wp:docPr id="1580689133" name="Picture 2"/>
+            <wp:cNvGraphicFramePr>
+              <a:graphicFrameLocks xmlns:a="http://schemas.openxmlformats.org/drawingml/2006/main" noChangeAspect="1"/>
+            </wp:cNvGraphicFramePr>
+            <a:graphic xmlns:a="http://schemas.openxmlformats.org/drawingml/2006/main">
+              <a:graphicData uri="http://schemas.openxmlformats.org/drawingml/2006/picture">
+                <pic:pic xmlns:pic="http://schemas.openxmlformats.org/drawingml/2006/picture">
+                  <pic:nvPicPr>
+                    <pic:cNvPr id="0" name="Picture 2"/>
+                    <pic:cNvPicPr>
+                      <a:picLocks noChangeAspect="1" noChangeArrowheads="1"/>
+                    </pic:cNvPicPr>
+                  </pic:nvPicPr>
+                  <pic:blipFill rotWithShape="1">
+                    <a:blip r:embed="rId15">
+                      <a:extLst>
+                        <a:ext uri="{28A0092B-C50C-407E-A947-70E740481C1C}">
+                          <a14:useLocalDpi xmlns:a14="http://schemas.microsoft.com/office/drawing/2010/main" val="0"/>
+                        </a:ext>
+                      </a:extLst>
+                    </a:blip>
+                    <a:srcRect b="30741"/>
+                    <a:stretch/>
+                  </pic:blipFill>
+                  <pic:spPr bwMode="auto">
+                    <a:xfrm>
+                      <a:off x="0" y="0"/>
+                      <a:ext cx="5814060" cy="5699760"/>
+                    </a:xfrm>
+                    <a:prstGeom prst="rect">
+                      <a:avLst/>
+                    </a:prstGeom>
+                    <a:noFill/>
+                    <a:ln>
+                      <a:noFill/>
+                    </a:ln>
+                    <a:extLst>
+                      <a:ext uri="{53640926-AAD7-44D8-BBD7-CCE9431645EC}">
+                        <a14:shadowObscured xmlns:a14="http://schemas.microsoft.com/office/drawing/2010/main"/>
+                      </a:ext>
+                    </a:extLst>
+                  </pic:spPr>
+                </pic:pic>
+              </a:graphicData>
+            </a:graphic>
+          </wp:inline>
+        </w:drawing>
+      </w:r>
+    </w:p>
+    <w:p>
+      <w:pPr>
+        <w:spacing w:line="360" w:lineRule="auto"/>
+        <w:rPr>
+          <w:rFonts w:ascii="Arial Nova Light" w:hAnsi="Arial Nova Light" w:cs="Arial"/>
+        </w:rPr>
+      </w:pPr>
+      <w:commentRangeStart w:id="35"/>
+      <w:r>
+        <w:rPr>
+          <w:rFonts w:ascii="Arial Nova Light" w:hAnsi="Arial Nova Light" w:cs="Arial"/>
+        </w:rPr>
+        <w:t xml:space="preserve">Figure </w:t>
+      </w:r>
       <w:commentRangeEnd w:id="35"/>
       <w:r>
         <w:rPr>
@@ -8065,73 +8208,269 @@
         <w:commentReference w:id="35"/>
       </w:r>
       <w:r>
+        <w:rPr>
+          <w:rFonts w:ascii="Arial Nova Light" w:hAnsi="Arial Nova Light" w:cs="Arial"/>
+        </w:rPr>
+        <w:t>3:</w:t>
+      </w:r>
+      <w:r>
+        <w:rPr>
+          <w:rFonts w:ascii="Arial Nova Light" w:hAnsi="Arial Nova Light" w:cs="Arial"/>
+        </w:rPr>
+        <w:t xml:space="preserve"> </w:t>
+      </w:r>
+      <w:r>
+        <w:rPr>
+          <w:rFonts w:ascii="Arial Nova Light" w:hAnsi="Arial Nova Light" w:cs="Arial"/>
+        </w:rPr>
+        <w:t>Individual</w:t>
+      </w:r>
+      <w:r>
+        <w:rPr>
+          <w:rFonts w:ascii="Arial Nova Light" w:hAnsi="Arial Nova Light" w:cs="Arial"/>
+        </w:rPr>
+        <w:t xml:space="preserve"> Information Dataset (</w:t>
+      </w:r>
+      <w:commentRangeStart w:id="36"/>
+      <w:r>
+        <w:rPr>
+          <w:rFonts w:ascii="Arial Nova Light" w:hAnsi="Arial Nova Light" w:cs="Arial"/>
+        </w:rPr>
+        <w:t>A</w:t>
+      </w:r>
+      <w:commentRangeEnd w:id="36"/>
+      <w:r>
+        <w:rPr>
+          <w:rStyle w:val="CommentReference"/>
+        </w:rPr>
+        <w:commentReference w:id="36"/>
+      </w:r>
+      <w:r>
+        <w:rPr>
+          <w:rFonts w:ascii="Arial Nova Light" w:hAnsi="Arial Nova Light" w:cs="Arial"/>
+        </w:rPr>
+        <w:t>) Acoustic space plots with polygons drawn to original number of groups or original number of individuals. (B) Lexicon with example calls from two individuals form two example groups.</w:t>
+      </w:r>
+    </w:p>
+    <w:p>
+      <w:pPr>
+        <w:spacing w:line="360" w:lineRule="auto"/>
         <w:rPr>
           <w:rFonts w:ascii="Arial Nova Light" w:hAnsi="Arial Nova Light" w:cs="Arial"/>
           <w:b/>
           <w:bCs/>
         </w:rPr>
-        <w:t xml:space="preserve">: </w:t>
-      </w:r>
-      <w:r>
-        <w:rPr>
-          <w:rFonts w:ascii="Arial Nova Light" w:hAnsi="Arial Nova Light" w:cs="Arial"/>
-        </w:rPr>
-        <w:t xml:space="preserve">Example character string created in </w:t>
-      </w:r>
-      <w:proofErr w:type="spellStart"/>
-      <w:r>
-        <w:rPr>
-          <w:rFonts w:ascii="Arial Nova Light" w:hAnsi="Arial Nova Light" w:cs="Arial"/>
-        </w:rPr>
-        <w:t>paRsynth’s</w:t>
-      </w:r>
-      <w:proofErr w:type="spellEnd"/>
-      <w:r>
-        <w:rPr>
-          <w:rFonts w:ascii="Arial Nova Light" w:hAnsi="Arial Nova Light" w:cs="Arial"/>
-        </w:rPr>
-        <w:t xml:space="preserve"> generate strings code. The string consists of (1) a global head, (2) group information, (3) individual information, (4) random variation, (5) group information, and (6) a global tai</w:t>
-      </w:r>
-      <w:commentRangeStart w:id="36"/>
-      <w:commentRangeStart w:id="37"/>
-      <w:commentRangeStart w:id="38"/>
-      <w:r>
-        <w:rPr>
-          <w:rFonts w:ascii="Arial Nova Light" w:hAnsi="Arial Nova Light" w:cs="Arial"/>
-        </w:rPr>
-        <w:t>l.</w:t>
-      </w:r>
-      <w:commentRangeEnd w:id="36"/>
-      <w:r>
-        <w:rPr>
-          <w:rStyle w:val="CommentReference"/>
-          <w:rFonts w:ascii="Arial Nova Light" w:hAnsi="Arial Nova Light"/>
-          <w:sz w:val="24"/>
-          <w:szCs w:val="24"/>
-        </w:rPr>
-        <w:commentReference w:id="36"/>
-      </w:r>
-      <w:commentRangeEnd w:id="37"/>
-      <w:r>
-        <w:rPr>
-          <w:rStyle w:val="CommentReference"/>
-          <w:sz w:val="24"/>
-          <w:szCs w:val="24"/>
-        </w:rPr>
-        <w:commentReference w:id="37"/>
-      </w:r>
-      <w:commentRangeEnd w:id="38"/>
-      <w:r>
-        <w:rPr>
-          <w:rStyle w:val="CommentReference"/>
-        </w:rPr>
-        <w:commentReference w:id="38"/>
-      </w:r>
-      <w:r>
+      </w:pPr>
+    </w:p>
+    <w:p>
+      <w:pPr>
         <w:rPr>
           <w:rFonts w:ascii="Arial Nova Light" w:hAnsi="Arial Nova Light" w:cs="Arial"/>
           <w:b/>
           <w:bCs/>
+        </w:rPr>
+      </w:pPr>
+      <w:r>
+        <w:rPr>
+          <w:rFonts w:ascii="Arial Nova Light" w:hAnsi="Arial Nova Light" w:cs="Arial"/>
+          <w:b/>
+          <w:bCs/>
+        </w:rPr>
+        <w:br w:type="page"/>
+      </w:r>
+    </w:p>
+    <w:p>
+      <w:pPr>
+        <w:spacing w:line="360" w:lineRule="auto"/>
+        <w:rPr>
+          <w:rFonts w:ascii="Arial Nova Light" w:hAnsi="Arial Nova Light" w:cs="Arial"/>
+          <w:b/>
+          <w:bCs/>
+        </w:rPr>
+      </w:pPr>
+      <w:r>
+        <w:rPr>
+          <w:rFonts w:ascii="Arial Nova Light" w:hAnsi="Arial Nova Light" w:cs="Arial"/>
+          <w:b/>
+          <w:bCs/>
+          <w:noProof/>
+        </w:rPr>
+        <w:lastRenderedPageBreak/>
+        <w:drawing>
+          <wp:inline distT="0" distB="0" distL="0" distR="0" wp14:anchorId="14573582" wp14:editId="34441144">
+            <wp:extent cx="5937250" cy="5937250"/>
+            <wp:effectExtent l="0" t="0" r="6350" b="6350"/>
+            <wp:docPr id="2109733042" name="Picture 4"/>
+            <wp:cNvGraphicFramePr>
+              <a:graphicFrameLocks xmlns:a="http://schemas.openxmlformats.org/drawingml/2006/main" noChangeAspect="1"/>
+            </wp:cNvGraphicFramePr>
+            <a:graphic xmlns:a="http://schemas.openxmlformats.org/drawingml/2006/main">
+              <a:graphicData uri="http://schemas.openxmlformats.org/drawingml/2006/picture">
+                <pic:pic xmlns:pic="http://schemas.openxmlformats.org/drawingml/2006/picture">
+                  <pic:nvPicPr>
+                    <pic:cNvPr id="0" name="Picture 6"/>
+                    <pic:cNvPicPr>
+                      <a:picLocks noChangeAspect="1" noChangeArrowheads="1"/>
+                    </pic:cNvPicPr>
+                  </pic:nvPicPr>
+                  <pic:blipFill>
+                    <a:blip r:embed="rId16" cstate="print">
+                      <a:extLst>
+                        <a:ext uri="{28A0092B-C50C-407E-A947-70E740481C1C}">
+                          <a14:useLocalDpi xmlns:a14="http://schemas.microsoft.com/office/drawing/2010/main" val="0"/>
+                        </a:ext>
+                      </a:extLst>
+                    </a:blip>
+                    <a:srcRect/>
+                    <a:stretch>
+                      <a:fillRect/>
+                    </a:stretch>
+                  </pic:blipFill>
+                  <pic:spPr bwMode="auto">
+                    <a:xfrm>
+                      <a:off x="0" y="0"/>
+                      <a:ext cx="5937250" cy="5937250"/>
+                    </a:xfrm>
+                    <a:prstGeom prst="rect">
+                      <a:avLst/>
+                    </a:prstGeom>
+                    <a:noFill/>
+                    <a:ln>
+                      <a:noFill/>
+                    </a:ln>
+                  </pic:spPr>
+                </pic:pic>
+              </a:graphicData>
+            </a:graphic>
+          </wp:inline>
+        </w:drawing>
+      </w:r>
+      <w:r>
+        <w:rPr>
+          <w:rFonts w:ascii="Arial Nova Light" w:hAnsi="Arial Nova Light" w:cs="Arial"/>
+          <w:b/>
+          <w:bCs/>
+        </w:rPr>
+        <w:t>Figure 4:</w:t>
+      </w:r>
+    </w:p>
+    <w:p>
+      <w:pPr>
+        <w:rPr>
+          <w:rFonts w:ascii="Arial Nova Light" w:hAnsi="Arial Nova Light" w:cs="Arial"/>
+        </w:rPr>
+      </w:pPr>
+      <w:r>
+        <w:rPr>
+          <w:rFonts w:ascii="Arial Nova Light" w:hAnsi="Arial Nova Light" w:cs="Arial"/>
+          <w:b/>
+          <w:bCs/>
+        </w:rPr>
+        <w:br w:type="page"/>
+      </w:r>
+      <w:r>
+        <w:rPr>
+          <w:rFonts w:ascii="Arial Nova Light" w:hAnsi="Arial Nova Light" w:cs="Arial"/>
+          <w:b/>
+          <w:bCs/>
+          <w:noProof/>
+        </w:rPr>
+        <w:lastRenderedPageBreak/>
+        <w:drawing>
+          <wp:inline distT="0" distB="0" distL="0" distR="0" wp14:anchorId="47CBDB63" wp14:editId="05F8C902">
+            <wp:extent cx="5937250" cy="5937250"/>
+            <wp:effectExtent l="0" t="0" r="6350" b="6350"/>
+            <wp:docPr id="694573787" name="Picture 6"/>
+            <wp:cNvGraphicFramePr>
+              <a:graphicFrameLocks xmlns:a="http://schemas.openxmlformats.org/drawingml/2006/main" noChangeAspect="1"/>
+            </wp:cNvGraphicFramePr>
+            <a:graphic xmlns:a="http://schemas.openxmlformats.org/drawingml/2006/main">
+              <a:graphicData uri="http://schemas.openxmlformats.org/drawingml/2006/picture">
+                <pic:pic xmlns:pic="http://schemas.openxmlformats.org/drawingml/2006/picture">
+                  <pic:nvPicPr>
+                    <pic:cNvPr id="0" name="Picture 8"/>
+                    <pic:cNvPicPr>
+                      <a:picLocks noChangeAspect="1" noChangeArrowheads="1"/>
+                    </pic:cNvPicPr>
+                  </pic:nvPicPr>
+                  <pic:blipFill>
+                    <a:blip r:embed="rId17" cstate="print">
+                      <a:extLst>
+                        <a:ext uri="{28A0092B-C50C-407E-A947-70E740481C1C}">
+                          <a14:useLocalDpi xmlns:a14="http://schemas.microsoft.com/office/drawing/2010/main" val="0"/>
+                        </a:ext>
+                      </a:extLst>
+                    </a:blip>
+                    <a:srcRect/>
+                    <a:stretch>
+                      <a:fillRect/>
+                    </a:stretch>
+                  </pic:blipFill>
+                  <pic:spPr bwMode="auto">
+                    <a:xfrm>
+                      <a:off x="0" y="0"/>
+                      <a:ext cx="5937250" cy="5937250"/>
+                    </a:xfrm>
+                    <a:prstGeom prst="rect">
+                      <a:avLst/>
+                    </a:prstGeom>
+                    <a:noFill/>
+                    <a:ln>
+                      <a:noFill/>
+                    </a:ln>
+                  </pic:spPr>
+                </pic:pic>
+              </a:graphicData>
+            </a:graphic>
+          </wp:inline>
+        </w:drawing>
+      </w:r>
+      <w:r>
+        <w:rPr>
+          <w:rFonts w:ascii="Arial Nova Light" w:hAnsi="Arial Nova Light" w:cs="Arial"/>
+          <w:b/>
+          <w:bCs/>
+        </w:rPr>
+        <w:t>F</w:t>
+      </w:r>
+      <w:r>
+        <w:rPr>
+          <w:rFonts w:ascii="Arial Nova Light" w:hAnsi="Arial Nova Light" w:cs="Arial"/>
+          <w:b/>
+          <w:bCs/>
+        </w:rPr>
+        <w:t>igure 5:</w:t>
+      </w:r>
+      <w:r>
+        <w:rPr>
+          <w:rFonts w:ascii="Arial Nova Light" w:hAnsi="Arial Nova Light" w:cs="Arial"/>
+          <w:b/>
+          <w:bCs/>
+        </w:rPr>
+        <w:t xml:space="preserve"> </w:t>
+      </w:r>
+      <w:r>
+        <w:rPr>
+          <w:rFonts w:ascii="Arial Nova Light" w:hAnsi="Arial Nova Light" w:cs="Arial"/>
+        </w:rPr>
+        <w:t xml:space="preserve">hatched lines represent </w:t>
+      </w:r>
+      <w:r>
+        <w:rPr>
+          <w:rFonts w:ascii="Arial Nova Light" w:hAnsi="Arial Nova Light" w:cs="Arial"/>
+        </w:rPr>
+        <w:t>large effect size threshold</w:t>
+      </w:r>
+    </w:p>
+    <w:p>
+      <w:pPr>
+        <w:rPr>
+          <w:rFonts w:ascii="Arial Nova Light" w:hAnsi="Arial Nova Light" w:cs="Arial"/>
+        </w:rPr>
+      </w:pPr>
+      <w:r>
+        <w:rPr>
+          <w:rFonts w:ascii="Arial Nova Light" w:hAnsi="Arial Nova Light" w:cs="Arial"/>
         </w:rPr>
         <w:br w:type="page"/>
       </w:r>
@@ -8178,7 +8517,7 @@
                     </pic:cNvPicPr>
                   </pic:nvPicPr>
                   <pic:blipFill>
-                    <a:blip r:embed="rId14">
+                    <a:blip r:embed="rId18">
                       <a:extLst>
                         <a:ext uri="{28A0092B-C50C-407E-A947-70E740481C1C}">
                           <a14:useLocalDpi xmlns:a14="http://schemas.microsoft.com/office/drawing/2010/main" val="0"/>
@@ -8221,229 +8560,423 @@
         <w:spacing w:line="360" w:lineRule="auto"/>
         <w:rPr>
           <w:rFonts w:ascii="Arial" w:hAnsi="Arial" w:cs="Arial"/>
-          <w:sz w:val="20"/>
-          <w:szCs w:val="20"/>
-        </w:rPr>
-      </w:pPr>
-      <w:commentRangeStart w:id="39"/>
-      <w:commentRangeEnd w:id="39"/>
+        </w:rPr>
+      </w:pPr>
+      <w:commentRangeStart w:id="37"/>
+      <w:commentRangeEnd w:id="37"/>
       <w:r>
         <w:rPr>
           <w:rStyle w:val="CommentReference"/>
         </w:rPr>
-        <w:commentReference w:id="39"/>
+        <w:commentReference w:id="37"/>
       </w:r>
       <w:r>
         <w:rPr>
           <w:rFonts w:ascii="Arial" w:hAnsi="Arial" w:cs="Arial"/>
           <w:b/>
           <w:bCs/>
-          <w:sz w:val="20"/>
-          <w:szCs w:val="20"/>
-        </w:rPr>
-        <w:t>Supplemental Figures:</w:t>
-      </w:r>
-      <w:r>
-        <w:rPr>
-          <w:rFonts w:ascii="Arial" w:hAnsi="Arial" w:cs="Arial"/>
-          <w:sz w:val="20"/>
-          <w:szCs w:val="20"/>
-        </w:rPr>
-        <w:t xml:space="preserve"> Acoustic space plots representing all simulated individuals with different levels of encoded information: </w:t>
+        </w:rPr>
+        <w:t>Supplemental Figure</w:t>
       </w:r>
       <w:r>
         <w:rPr>
           <w:rFonts w:ascii="Arial" w:hAnsi="Arial" w:cs="Arial"/>
           <w:b/>
           <w:bCs/>
-          <w:sz w:val="20"/>
-          <w:szCs w:val="20"/>
-        </w:rPr>
-        <w:t xml:space="preserve">(A) </w:t>
-      </w:r>
-      <w:r>
-        <w:rPr>
-          <w:rFonts w:ascii="Arial" w:hAnsi="Arial" w:cs="Arial"/>
-          <w:sz w:val="20"/>
-          <w:szCs w:val="20"/>
-        </w:rPr>
-        <w:t xml:space="preserve">more group membership information encoded in the calls with polygons drawn by group identity, </w:t>
+        </w:rPr>
+        <w:t xml:space="preserve"> 1</w:t>
       </w:r>
       <w:r>
         <w:rPr>
           <w:rFonts w:ascii="Arial" w:hAnsi="Arial" w:cs="Arial"/>
           <w:b/>
           <w:bCs/>
-          <w:sz w:val="20"/>
-          <w:szCs w:val="20"/>
-        </w:rPr>
-        <w:t xml:space="preserve">(B) </w:t>
-      </w:r>
-      <w:r>
-        <w:rPr>
-          <w:rFonts w:ascii="Arial" w:hAnsi="Arial" w:cs="Arial"/>
-          <w:sz w:val="20"/>
-          <w:szCs w:val="20"/>
-        </w:rPr>
-        <w:t xml:space="preserve">more group membership information encoded in the calls with polygons drawn by individual identity, </w:t>
+        </w:rPr>
+        <w:t>:</w:t>
+      </w:r>
+      <w:r>
+        <w:rPr>
+          <w:rFonts w:ascii="Arial" w:hAnsi="Arial" w:cs="Arial"/>
+        </w:rPr>
+        <w:t xml:space="preserve"> Acoustic space plots representing all simulated individuals with different levels of encoded information: </w:t>
       </w:r>
       <w:r>
         <w:rPr>
           <w:rFonts w:ascii="Arial" w:hAnsi="Arial" w:cs="Arial"/>
           <w:b/>
           <w:bCs/>
-          <w:sz w:val="20"/>
-          <w:szCs w:val="20"/>
-        </w:rPr>
-        <w:t xml:space="preserve">(C) </w:t>
-      </w:r>
-      <w:r>
-        <w:rPr>
-          <w:rFonts w:ascii="Arial" w:hAnsi="Arial" w:cs="Arial"/>
-          <w:sz w:val="20"/>
-          <w:szCs w:val="20"/>
-        </w:rPr>
-        <w:t xml:space="preserve">more individual information encoded in the calls with polygons drawn by group identity, and </w:t>
+        </w:rPr>
+        <w:t xml:space="preserve">(A) </w:t>
+      </w:r>
+      <w:r>
+        <w:rPr>
+          <w:rFonts w:ascii="Arial" w:hAnsi="Arial" w:cs="Arial"/>
+        </w:rPr>
+        <w:t xml:space="preserve">more group membership information encoded in the calls with polygons drawn by group identity, </w:t>
       </w:r>
       <w:r>
         <w:rPr>
           <w:rFonts w:ascii="Arial" w:hAnsi="Arial" w:cs="Arial"/>
           <w:b/>
           <w:bCs/>
-          <w:sz w:val="20"/>
-          <w:szCs w:val="20"/>
-        </w:rPr>
-        <w:t xml:space="preserve">(D) </w:t>
-      </w:r>
-      <w:r>
-        <w:rPr>
-          <w:rFonts w:ascii="Arial" w:hAnsi="Arial" w:cs="Arial"/>
-          <w:sz w:val="20"/>
-          <w:szCs w:val="20"/>
-        </w:rPr>
-        <w:t xml:space="preserve">more individual information encoded in the calls with polygons drawn by individual identity. Colors represent group </w:t>
-      </w:r>
-      <w:proofErr w:type="gramStart"/>
-      <w:r>
-        <w:rPr>
-          <w:rFonts w:ascii="Arial" w:hAnsi="Arial" w:cs="Arial"/>
-          <w:sz w:val="20"/>
-          <w:szCs w:val="20"/>
-        </w:rPr>
-        <w:t>identity,</w:t>
-      </w:r>
-      <w:proofErr w:type="gramEnd"/>
-      <w:r>
-        <w:rPr>
-          <w:rFonts w:ascii="Arial" w:hAnsi="Arial" w:cs="Arial"/>
-          <w:sz w:val="20"/>
-          <w:szCs w:val="20"/>
-        </w:rPr>
-        <w:t xml:space="preserve"> shapes represent different individuals.</w:t>
-      </w:r>
-    </w:p>
-    <w:p>
-      <w:pPr>
-        <w:spacing w:line="360" w:lineRule="auto"/>
-        <w:rPr>
-          <w:rFonts w:ascii="Arial" w:hAnsi="Arial" w:cs="Arial"/>
-        </w:rPr>
-      </w:pPr>
-    </w:p>
-    <w:p>
-      <w:pPr>
-        <w:rPr>
-          <w:rFonts w:ascii="Arial" w:hAnsi="Arial" w:cs="Arial"/>
-        </w:rPr>
-      </w:pPr>
-      <w:r>
-        <w:rPr>
-          <w:rFonts w:ascii="Arial" w:hAnsi="Arial" w:cs="Arial"/>
-        </w:rPr>
-        <w:t>Zombie text for supplement</w:t>
-      </w:r>
-      <w:r>
-        <w:rPr>
-          <w:rFonts w:ascii="Arial" w:hAnsi="Arial" w:cs="Arial"/>
-        </w:rPr>
-        <w:t>al figs:</w:t>
-      </w:r>
-    </w:p>
-    <w:p>
-      <w:pPr>
-        <w:spacing w:line="360" w:lineRule="auto"/>
-        <w:rPr>
-          <w:rFonts w:ascii="Arial" w:hAnsi="Arial" w:cs="Arial"/>
-        </w:rPr>
-      </w:pPr>
-      <w:r>
-        <w:rPr>
-          <w:rFonts w:ascii="Arial" w:hAnsi="Arial" w:cs="Arial"/>
-        </w:rPr>
-        <w:t>With the synthetic signals where more group information was encoded, there is clustering of individuals by group identity within acoustic space (</w:t>
-      </w:r>
-      <w:r>
-        <w:rPr>
-          <w:rFonts w:ascii="Arial" w:hAnsi="Arial" w:cs="Arial"/>
-        </w:rPr>
-        <w:t>Figure 2A</w:t>
-      </w:r>
-      <w:r>
-        <w:rPr>
-          <w:rFonts w:ascii="Arial" w:hAnsi="Arial" w:cs="Arial"/>
-        </w:rPr>
-        <w:t>). This suggests that individuals are being categorized back to their group identity when running traditional bioacoustics analyses on our synthetically generated calls. Inversely, with the synthetic signals where more individual identity information was encoded, there are patterns of clustering by individual identity within acoustic space (</w:t>
-      </w:r>
-      <w:r>
-        <w:rPr>
-          <w:rFonts w:ascii="Arial" w:hAnsi="Arial" w:cs="Arial"/>
-        </w:rPr>
-        <w:t>Figure 2D</w:t>
-      </w:r>
-      <w:r>
-        <w:rPr>
-          <w:rFonts w:ascii="Arial" w:hAnsi="Arial" w:cs="Arial"/>
-        </w:rPr>
-        <w:t xml:space="preserve">). </w:t>
-      </w:r>
-      <w:commentRangeStart w:id="40"/>
-      <w:r>
-        <w:rPr>
-          <w:rFonts w:ascii="Arial" w:hAnsi="Arial" w:cs="Arial"/>
-        </w:rPr>
-        <w:t>This suggests that individuals are being categorized in distinct individual clusters when running traditional bioacoustics analyses on our synthetically generated calls.</w:t>
-      </w:r>
-      <w:commentRangeEnd w:id="40"/>
-      <w:r>
-        <w:rPr>
-          <w:rStyle w:val="CommentReference"/>
-        </w:rPr>
-        <w:commentReference w:id="40"/>
-      </w:r>
-    </w:p>
-    <w:p>
-      <w:pPr>
-        <w:rPr>
-          <w:rFonts w:ascii="Arial" w:hAnsi="Arial" w:cs="Arial"/>
-        </w:rPr>
-      </w:pPr>
-    </w:p>
-    <w:p>
-      <w:pPr>
+        </w:rPr>
+        <w:t xml:space="preserve">(B) </w:t>
+      </w:r>
+      <w:r>
+        <w:rPr>
+          <w:rFonts w:ascii="Arial" w:hAnsi="Arial" w:cs="Arial"/>
+        </w:rPr>
+        <w:t xml:space="preserve">more group membership information encoded in the calls with polygons drawn by individual identity, </w:t>
+      </w:r>
+      <w:r>
         <w:rPr>
           <w:rFonts w:ascii="Arial" w:hAnsi="Arial" w:cs="Arial"/>
           <w:b/>
           <w:bCs/>
         </w:rPr>
-      </w:pPr>
+        <w:t xml:space="preserve">(C) </w:t>
+      </w:r>
+      <w:r>
+        <w:rPr>
+          <w:rFonts w:ascii="Arial" w:hAnsi="Arial" w:cs="Arial"/>
+        </w:rPr>
+        <w:t xml:space="preserve">more individual information encoded in the calls with polygons drawn by group identity, and </w:t>
+      </w:r>
       <w:r>
         <w:rPr>
           <w:rFonts w:ascii="Arial" w:hAnsi="Arial" w:cs="Arial"/>
           <w:b/>
           <w:bCs/>
         </w:rPr>
-        <w:t>Zombie Text</w:t>
-      </w:r>
+        <w:t xml:space="preserve">(D) </w:t>
+      </w:r>
+      <w:r>
+        <w:rPr>
+          <w:rFonts w:ascii="Arial" w:hAnsi="Arial" w:cs="Arial"/>
+        </w:rPr>
+        <w:t xml:space="preserve">more individual information encoded in the calls with polygons drawn by individual identity. Colors represent group </w:t>
+      </w:r>
+      <w:proofErr w:type="gramStart"/>
+      <w:r>
+        <w:rPr>
+          <w:rFonts w:ascii="Arial" w:hAnsi="Arial" w:cs="Arial"/>
+        </w:rPr>
+        <w:t>identity,</w:t>
+      </w:r>
+      <w:proofErr w:type="gramEnd"/>
+      <w:r>
+        <w:rPr>
+          <w:rFonts w:ascii="Arial" w:hAnsi="Arial" w:cs="Arial"/>
+        </w:rPr>
+        <w:t xml:space="preserve"> shapes represent different individuals.</w:t>
+      </w:r>
+    </w:p>
+    <w:p>
+      <w:pPr>
+        <w:spacing w:line="360" w:lineRule="auto"/>
+        <w:rPr>
+          <w:rFonts w:ascii="Arial" w:hAnsi="Arial" w:cs="Arial"/>
+        </w:rPr>
+      </w:pPr>
+    </w:p>
+    <w:p>
+      <w:pPr>
+        <w:spacing w:line="360" w:lineRule="auto"/>
+        <w:rPr>
+          <w:rFonts w:ascii="Arial" w:hAnsi="Arial" w:cs="Arial"/>
+        </w:rPr>
+      </w:pPr>
+      <w:r>
+        <w:rPr>
+          <w:rFonts w:ascii="Arial" w:hAnsi="Arial" w:cs="Arial"/>
+        </w:rPr>
+        <w:br w:type="page"/>
+      </w:r>
+    </w:p>
+    <w:p>
+      <w:pPr>
+        <w:spacing w:line="360" w:lineRule="auto"/>
+        <w:rPr>
+          <w:rFonts w:ascii="Arial" w:hAnsi="Arial" w:cs="Arial"/>
+        </w:rPr>
+      </w:pPr>
+      <w:r>
+        <w:rPr>
+          <w:rFonts w:ascii="Arial" w:hAnsi="Arial" w:cs="Arial"/>
+          <w:noProof/>
+        </w:rPr>
+        <w:lastRenderedPageBreak/>
+        <w:drawing>
+          <wp:inline distT="0" distB="0" distL="0" distR="0" wp14:anchorId="0606346E" wp14:editId="2BD4C215">
+            <wp:extent cx="5943600" cy="5943600"/>
+            <wp:effectExtent l="0" t="0" r="0" b="0"/>
+            <wp:docPr id="1617445812" name="Picture 12"/>
+            <wp:cNvGraphicFramePr>
+              <a:graphicFrameLocks xmlns:a="http://schemas.openxmlformats.org/drawingml/2006/main" noChangeAspect="1"/>
+            </wp:cNvGraphicFramePr>
+            <a:graphic xmlns:a="http://schemas.openxmlformats.org/drawingml/2006/main">
+              <a:graphicData uri="http://schemas.openxmlformats.org/drawingml/2006/picture">
+                <pic:pic xmlns:pic="http://schemas.openxmlformats.org/drawingml/2006/picture">
+                  <pic:nvPicPr>
+                    <pic:cNvPr id="0" name="Picture 14"/>
+                    <pic:cNvPicPr>
+                      <a:picLocks noChangeAspect="1" noChangeArrowheads="1"/>
+                    </pic:cNvPicPr>
+                  </pic:nvPicPr>
+                  <pic:blipFill>
+                    <a:blip r:embed="rId19" cstate="print">
+                      <a:extLst>
+                        <a:ext uri="{28A0092B-C50C-407E-A947-70E740481C1C}">
+                          <a14:useLocalDpi xmlns:a14="http://schemas.microsoft.com/office/drawing/2010/main" val="0"/>
+                        </a:ext>
+                      </a:extLst>
+                    </a:blip>
+                    <a:srcRect/>
+                    <a:stretch>
+                      <a:fillRect/>
+                    </a:stretch>
+                  </pic:blipFill>
+                  <pic:spPr bwMode="auto">
+                    <a:xfrm>
+                      <a:off x="0" y="0"/>
+                      <a:ext cx="5943600" cy="5943600"/>
+                    </a:xfrm>
+                    <a:prstGeom prst="rect">
+                      <a:avLst/>
+                    </a:prstGeom>
+                    <a:noFill/>
+                    <a:ln>
+                      <a:noFill/>
+                    </a:ln>
+                  </pic:spPr>
+                </pic:pic>
+              </a:graphicData>
+            </a:graphic>
+          </wp:inline>
+        </w:drawing>
+      </w:r>
+      <w:r>
+        <w:rPr>
+          <w:rFonts w:ascii="Arial" w:hAnsi="Arial" w:cs="Arial"/>
+        </w:rPr>
+        <w:t>Supplemental figure 2</w:t>
+      </w:r>
+      <w:r>
+        <w:rPr>
+          <w:rFonts w:ascii="Arial" w:hAnsi="Arial" w:cs="Arial"/>
+        </w:rPr>
+        <w:t>: orange = group, blue = individual</w:t>
+      </w:r>
+    </w:p>
+    <w:p>
+      <w:pPr>
+        <w:rPr>
+          <w:rFonts w:ascii="Arial" w:hAnsi="Arial" w:cs="Arial"/>
+        </w:rPr>
+      </w:pPr>
+      <w:r>
+        <w:rPr>
+          <w:rFonts w:ascii="Arial" w:hAnsi="Arial" w:cs="Arial"/>
+        </w:rPr>
+        <w:br w:type="page"/>
+      </w:r>
+    </w:p>
+    <w:p>
+      <w:pPr>
+        <w:spacing w:line="360" w:lineRule="auto"/>
+        <w:rPr>
+          <w:rFonts w:ascii="Arial" w:hAnsi="Arial" w:cs="Arial"/>
+        </w:rPr>
+      </w:pPr>
+      <w:r>
+        <w:rPr>
+          <w:rFonts w:ascii="Arial" w:hAnsi="Arial" w:cs="Arial"/>
+          <w:noProof/>
+        </w:rPr>
+        <w:lastRenderedPageBreak/>
+        <w:drawing>
+          <wp:inline distT="0" distB="0" distL="0" distR="0" wp14:anchorId="5283C7FD" wp14:editId="16829D2F">
+            <wp:extent cx="5943600" cy="5943600"/>
+            <wp:effectExtent l="0" t="0" r="0" b="0"/>
+            <wp:docPr id="1580461420" name="Picture 13"/>
+            <wp:cNvGraphicFramePr>
+              <a:graphicFrameLocks xmlns:a="http://schemas.openxmlformats.org/drawingml/2006/main" noChangeAspect="1"/>
+            </wp:cNvGraphicFramePr>
+            <a:graphic xmlns:a="http://schemas.openxmlformats.org/drawingml/2006/main">
+              <a:graphicData uri="http://schemas.openxmlformats.org/drawingml/2006/picture">
+                <pic:pic xmlns:pic="http://schemas.openxmlformats.org/drawingml/2006/picture">
+                  <pic:nvPicPr>
+                    <pic:cNvPr id="0" name="Picture 15"/>
+                    <pic:cNvPicPr>
+                      <a:picLocks noChangeAspect="1" noChangeArrowheads="1"/>
+                    </pic:cNvPicPr>
+                  </pic:nvPicPr>
+                  <pic:blipFill>
+                    <a:blip r:embed="rId20" cstate="print">
+                      <a:extLst>
+                        <a:ext uri="{28A0092B-C50C-407E-A947-70E740481C1C}">
+                          <a14:useLocalDpi xmlns:a14="http://schemas.microsoft.com/office/drawing/2010/main" val="0"/>
+                        </a:ext>
+                      </a:extLst>
+                    </a:blip>
+                    <a:srcRect/>
+                    <a:stretch>
+                      <a:fillRect/>
+                    </a:stretch>
+                  </pic:blipFill>
+                  <pic:spPr bwMode="auto">
+                    <a:xfrm>
+                      <a:off x="0" y="0"/>
+                      <a:ext cx="5943600" cy="5943600"/>
+                    </a:xfrm>
+                    <a:prstGeom prst="rect">
+                      <a:avLst/>
+                    </a:prstGeom>
+                    <a:noFill/>
+                    <a:ln>
+                      <a:noFill/>
+                    </a:ln>
+                  </pic:spPr>
+                </pic:pic>
+              </a:graphicData>
+            </a:graphic>
+          </wp:inline>
+        </w:drawing>
+      </w:r>
+    </w:p>
+    <w:p>
+      <w:pPr>
+        <w:spacing w:line="360" w:lineRule="auto"/>
+        <w:rPr>
+          <w:rFonts w:ascii="Arial" w:hAnsi="Arial" w:cs="Arial"/>
+        </w:rPr>
+      </w:pPr>
+      <w:r>
+        <w:rPr>
+          <w:rFonts w:ascii="Arial" w:hAnsi="Arial" w:cs="Arial"/>
+        </w:rPr>
+        <w:t>Supplemental figure 3</w:t>
+      </w:r>
+      <w:proofErr w:type="gramStart"/>
+      <w:r>
+        <w:rPr>
+          <w:rFonts w:ascii="Arial" w:hAnsi="Arial" w:cs="Arial"/>
+        </w:rPr>
+        <w:t xml:space="preserve">: </w:t>
+      </w:r>
+      <w:r>
+        <w:rPr>
+          <w:rFonts w:ascii="Arial" w:hAnsi="Arial" w:cs="Arial"/>
+        </w:rPr>
+        <w:t>:</w:t>
+      </w:r>
+      <w:proofErr w:type="gramEnd"/>
+      <w:r>
+        <w:rPr>
+          <w:rFonts w:ascii="Arial" w:hAnsi="Arial" w:cs="Arial"/>
+        </w:rPr>
+        <w:t xml:space="preserve"> orange = group, blue = individual</w:t>
+      </w:r>
+    </w:p>
+    <w:p>
+      <w:pPr>
+        <w:spacing w:line="360" w:lineRule="auto"/>
+        <w:rPr>
+          <w:rFonts w:ascii="Arial" w:hAnsi="Arial" w:cs="Arial"/>
+        </w:rPr>
+      </w:pPr>
+    </w:p>
+    <w:p>
+      <w:pPr>
+        <w:rPr>
+          <w:rFonts w:ascii="Arial" w:hAnsi="Arial" w:cs="Arial"/>
+        </w:rPr>
+      </w:pPr>
+      <w:r>
+        <w:rPr>
+          <w:rFonts w:ascii="Arial" w:hAnsi="Arial" w:cs="Arial"/>
+        </w:rPr>
+        <w:br w:type="page"/>
+      </w:r>
+    </w:p>
+    <w:p>
+      <w:pPr>
+        <w:rPr>
+          <w:rFonts w:ascii="Arial" w:hAnsi="Arial" w:cs="Arial"/>
+        </w:rPr>
+      </w:pPr>
+      <w:r>
+        <w:rPr>
+          <w:rFonts w:ascii="Arial" w:hAnsi="Arial" w:cs="Arial"/>
+        </w:rPr>
+        <w:lastRenderedPageBreak/>
+        <w:t>Zombie text for supplement</w:t>
+      </w:r>
+      <w:r>
+        <w:rPr>
+          <w:rFonts w:ascii="Arial" w:hAnsi="Arial" w:cs="Arial"/>
+        </w:rPr>
+        <w:t>al figs:</w:t>
+      </w:r>
+    </w:p>
+    <w:p>
+      <w:pPr>
+        <w:spacing w:line="360" w:lineRule="auto"/>
+        <w:rPr>
+          <w:rFonts w:ascii="Arial" w:hAnsi="Arial" w:cs="Arial"/>
+        </w:rPr>
+      </w:pPr>
+      <w:r>
+        <w:rPr>
+          <w:rFonts w:ascii="Arial" w:hAnsi="Arial" w:cs="Arial"/>
+        </w:rPr>
+        <w:t>With the synthetic signals where more group information was encoded, there is clustering of individuals by group identity within acoustic space (</w:t>
+      </w:r>
+      <w:r>
+        <w:rPr>
+          <w:rFonts w:ascii="Arial" w:hAnsi="Arial" w:cs="Arial"/>
+        </w:rPr>
+        <w:t>Figure 2A</w:t>
+      </w:r>
+      <w:r>
+        <w:rPr>
+          <w:rFonts w:ascii="Arial" w:hAnsi="Arial" w:cs="Arial"/>
+        </w:rPr>
+        <w:t>). This suggests that individuals are being categorized back to their group identity when running traditional bioacoustics analyses on our synthetically generated calls. Inversely, with the synthetic signals where more individual identity information was encoded, there are patterns of clustering by individual identity within acoustic space (</w:t>
+      </w:r>
+      <w:r>
+        <w:rPr>
+          <w:rFonts w:ascii="Arial" w:hAnsi="Arial" w:cs="Arial"/>
+        </w:rPr>
+        <w:t>Figure 2D</w:t>
+      </w:r>
+      <w:r>
+        <w:rPr>
+          <w:rFonts w:ascii="Arial" w:hAnsi="Arial" w:cs="Arial"/>
+        </w:rPr>
+        <w:t xml:space="preserve">). </w:t>
+      </w:r>
+      <w:commentRangeStart w:id="38"/>
+      <w:r>
+        <w:rPr>
+          <w:rFonts w:ascii="Arial" w:hAnsi="Arial" w:cs="Arial"/>
+        </w:rPr>
+        <w:t>This suggests that individuals are being categorized in distinct individual clusters when running traditional bioacoustics analyses on our synthetically generated calls.</w:t>
+      </w:r>
+      <w:commentRangeEnd w:id="38"/>
+      <w:r>
+        <w:rPr>
+          <w:rStyle w:val="CommentReference"/>
+        </w:rPr>
+        <w:commentReference w:id="38"/>
+      </w:r>
+    </w:p>
+    <w:p>
+      <w:pPr>
+        <w:rPr>
+          <w:rFonts w:ascii="Arial" w:hAnsi="Arial" w:cs="Arial"/>
+        </w:rPr>
+      </w:pPr>
     </w:p>
     <w:p>
       <w:pPr>
@@ -8453,16 +8986,33 @@
           <w:bCs/>
         </w:rPr>
       </w:pPr>
-    </w:p>
-    <w:p>
-      <w:pPr>
+      <w:r>
         <w:rPr>
           <w:rFonts w:ascii="Arial" w:hAnsi="Arial" w:cs="Arial"/>
           <w:b/>
           <w:bCs/>
         </w:rPr>
-      </w:pPr>
-      <w:commentRangeStart w:id="41"/>
+        <w:t>Zombie Text</w:t>
+      </w:r>
+    </w:p>
+    <w:p>
+      <w:pPr>
+        <w:rPr>
+          <w:rFonts w:ascii="Arial" w:hAnsi="Arial" w:cs="Arial"/>
+          <w:b/>
+          <w:bCs/>
+        </w:rPr>
+      </w:pPr>
+    </w:p>
+    <w:p>
+      <w:pPr>
+        <w:rPr>
+          <w:rFonts w:ascii="Arial" w:hAnsi="Arial" w:cs="Arial"/>
+          <w:b/>
+          <w:bCs/>
+        </w:rPr>
+      </w:pPr>
+      <w:commentRangeStart w:id="39"/>
       <w:r>
         <w:rPr>
           <w:rFonts w:ascii="Arial" w:hAnsi="Arial" w:cs="Arial"/>
@@ -8513,12 +9063,12 @@
         </w:rPr>
         <w:t xml:space="preserve"> therefore may not be assessing the full scope of how information can be encoded across a range of species.</w:t>
       </w:r>
-      <w:commentRangeEnd w:id="41"/>
+      <w:commentRangeEnd w:id="39"/>
       <w:r>
         <w:rPr>
           <w:rStyle w:val="CommentReference"/>
         </w:rPr>
-        <w:commentReference w:id="41"/>
+        <w:commentReference w:id="39"/>
       </w:r>
     </w:p>
     <w:p>
@@ -8543,15 +9093,29 @@
         </w:rPr>
         <w:t xml:space="preserve">Several computationally intensive tools have emerged to assess the degree or types of information encoded in </w:t>
       </w:r>
+      <w:commentRangeStart w:id="40"/>
+      <w:commentRangeStart w:id="41"/>
       <w:commentRangeStart w:id="42"/>
-      <w:commentRangeStart w:id="43"/>
-      <w:commentRangeStart w:id="44"/>
       <w:r>
         <w:rPr>
           <w:rFonts w:ascii="Arial" w:hAnsi="Arial" w:cs="Arial"/>
         </w:rPr>
         <w:t>signals</w:t>
       </w:r>
+      <w:commentRangeEnd w:id="40"/>
+      <w:r>
+        <w:rPr>
+          <w:rStyle w:val="CommentReference"/>
+        </w:rPr>
+        <w:commentReference w:id="40"/>
+      </w:r>
+      <w:commentRangeEnd w:id="41"/>
+      <w:r>
+        <w:rPr>
+          <w:rStyle w:val="CommentReference"/>
+        </w:rPr>
+        <w:commentReference w:id="41"/>
+      </w:r>
       <w:commentRangeEnd w:id="42"/>
       <w:r>
         <w:rPr>
@@ -8559,20 +9123,6 @@
         </w:rPr>
         <w:commentReference w:id="42"/>
       </w:r>
-      <w:commentRangeEnd w:id="43"/>
-      <w:r>
-        <w:rPr>
-          <w:rStyle w:val="CommentReference"/>
-        </w:rPr>
-        <w:commentReference w:id="43"/>
-      </w:r>
-      <w:commentRangeEnd w:id="44"/>
-      <w:r>
-        <w:rPr>
-          <w:rStyle w:val="CommentReference"/>
-        </w:rPr>
-        <w:commentReference w:id="44"/>
-      </w:r>
       <w:r>
         <w:rPr>
           <w:rFonts w:ascii="Arial" w:hAnsi="Arial" w:cs="Arial"/>
@@ -8817,7 +9367,14 @@
         <w:rPr>
           <w:rFonts w:ascii="Arial" w:hAnsi="Arial" w:cs="Arial"/>
         </w:rPr>
-        <w:t>(Coppinger et al., 2019; Freeberg, 2006; Selman &amp; Freeberg, 2024)</w:t>
+        <w:t xml:space="preserve">(Coppinger et al., 2019; </w:t>
+      </w:r>
+      <w:r>
+        <w:rPr>
+          <w:rFonts w:ascii="Arial" w:hAnsi="Arial" w:cs="Arial"/>
+        </w:rPr>
+        <w:lastRenderedPageBreak/>
+        <w:t>Freeberg, 2006; Selman &amp; Freeberg, 2024)</w:t>
       </w:r>
       <w:r>
         <w:rPr>
@@ -9005,7 +9562,6 @@
         <w:rPr>
           <w:rFonts w:ascii="Arial" w:hAnsi="Arial" w:cs="Arial"/>
         </w:rPr>
-        <w:lastRenderedPageBreak/>
         <w:t>Analysis questions: How similar are an individual’s calls to its own calls, compared to calls of other individuals? And the same for groups</w:t>
       </w:r>
     </w:p>
@@ -9122,7 +9678,7 @@
       </w:pPr>
     </w:p>
     <w:sectPr>
-      <w:footerReference w:type="default" r:id="rId15"/>
+      <w:footerReference w:type="default" r:id="rId21"/>
       <w:pgSz w:w="12240" w:h="15840"/>
       <w:pgMar w:top="1440" w:right="1440" w:bottom="1440" w:left="1440" w:header="720" w:footer="720" w:gutter="0"/>
       <w:lnNumType w:countBy="1" w:restart="continuous"/>
@@ -9424,7 +9980,7 @@
       </w:r>
     </w:p>
   </w:comment>
-  <w:comment w:id="11" w:author="Coppinger, Brittany" w:date="2024-12-20T14:52:00Z" w:initials="BC">
+  <w:comment w:id="10" w:author="Coppinger, Brittany" w:date="2024-12-20T14:52:00Z" w:initials="BC">
     <w:p>
       <w:pPr>
         <w:pStyle w:val="CommentText"/>
@@ -9440,7 +9996,7 @@
       </w:r>
     </w:p>
   </w:comment>
-  <w:comment w:id="12" w:author="Smith Vidaurre, Grace" w:date="2025-02-17T10:35:00Z" w:initials="GSV">
+  <w:comment w:id="11" w:author="Smith Vidaurre, Grace" w:date="2025-02-17T10:35:00Z" w:initials="GSV">
     <w:p>
       <w:r>
         <w:rPr>
@@ -9457,7 +10013,7 @@
       </w:r>
     </w:p>
   </w:comment>
-  <w:comment w:id="13" w:author="Smith Vidaurre, Grace" w:date="2025-02-17T10:39:00Z" w:initials="GSV">
+  <w:comment w:id="12" w:author="Smith Vidaurre, Grace" w:date="2025-02-17T10:39:00Z" w:initials="GSV">
     <w:p>
       <w:r>
         <w:rPr>
@@ -9474,7 +10030,7 @@
       </w:r>
     </w:p>
   </w:comment>
-  <w:comment w:id="14" w:author="Coppinger, Brittany" w:date="2025-02-13T14:09:00Z" w:initials="BC">
+  <w:comment w:id="13" w:author="Coppinger, Brittany" w:date="2025-02-13T14:09:00Z" w:initials="BC">
     <w:p>
       <w:pPr>
         <w:pStyle w:val="CommentText"/>
@@ -9490,7 +10046,7 @@
       </w:r>
     </w:p>
   </w:comment>
-  <w:comment w:id="15" w:author="Summer Eckhardt" w:date="2025-01-24T09:51:00Z" w:initials="SE">
+  <w:comment w:id="14" w:author="Summer Eckhardt" w:date="2025-01-24T09:51:00Z" w:initials="SE">
     <w:p>
       <w:pPr>
         <w:pStyle w:val="CommentText"/>
@@ -9506,7 +10062,7 @@
       </w:r>
     </w:p>
   </w:comment>
-  <w:comment w:id="16" w:author="Summer Eckhardt" w:date="2025-01-27T10:41:00Z" w:initials="SE">
+  <w:comment w:id="15" w:author="Summer Eckhardt" w:date="2025-01-27T10:41:00Z" w:initials="SE">
     <w:p>
       <w:pPr>
         <w:pStyle w:val="CommentText"/>
@@ -9522,7 +10078,7 @@
       </w:r>
     </w:p>
   </w:comment>
-  <w:comment w:id="17" w:author="Summer Eckhardt" w:date="2025-01-24T10:02:00Z" w:initials="SE">
+  <w:comment w:id="16" w:author="Summer Eckhardt" w:date="2025-01-24T10:02:00Z" w:initials="SE">
     <w:p>
       <w:pPr>
         <w:pStyle w:val="CommentText"/>
@@ -9538,7 +10094,7 @@
       </w:r>
     </w:p>
   </w:comment>
-  <w:comment w:id="18" w:author="Samman, Raneem" w:date="2025-01-13T15:07:00Z" w:initials="RS">
+  <w:comment w:id="17" w:author="Samman, Raneem" w:date="2025-01-13T15:07:00Z" w:initials="RS">
     <w:p>
       <w:r>
         <w:rPr>
@@ -9556,7 +10112,7 @@
       </w:r>
     </w:p>
   </w:comment>
-  <w:comment w:id="19" w:author="Coppinger, Brittany" w:date="2025-01-15T13:17:00Z" w:initials="BC">
+  <w:comment w:id="18" w:author="Coppinger, Brittany" w:date="2025-01-15T13:17:00Z" w:initials="BC">
     <w:p>
       <w:pPr>
         <w:pStyle w:val="CommentText"/>
@@ -9583,7 +10139,7 @@
       </w:r>
     </w:p>
   </w:comment>
-  <w:comment w:id="20" w:author="Coppinger, Brittany" w:date="2025-01-07T15:07:00Z" w:initials="BC">
+  <w:comment w:id="19" w:author="Coppinger, Brittany" w:date="2025-01-07T15:07:00Z" w:initials="BC">
     <w:p>
       <w:pPr>
         <w:pStyle w:val="CommentText"/>
@@ -9599,7 +10155,7 @@
       </w:r>
     </w:p>
   </w:comment>
-  <w:comment w:id="21" w:author="Samman, Raneem" w:date="2025-01-13T15:08:00Z" w:initials="RS">
+  <w:comment w:id="20" w:author="Samman, Raneem" w:date="2025-01-13T15:08:00Z" w:initials="RS">
     <w:p>
       <w:r>
         <w:rPr>
@@ -9617,7 +10173,7 @@
       </w:r>
     </w:p>
   </w:comment>
-  <w:comment w:id="22" w:author="Samman, Raneem" w:date="2025-01-13T15:10:00Z" w:initials="RS">
+  <w:comment w:id="21" w:author="Samman, Raneem" w:date="2025-01-13T15:10:00Z" w:initials="RS">
     <w:p>
       <w:r>
         <w:rPr>
@@ -9635,7 +10191,7 @@
       </w:r>
     </w:p>
   </w:comment>
-  <w:comment w:id="23" w:author="Coppinger, Brittany" w:date="2025-01-07T15:01:00Z" w:initials="BC">
+  <w:comment w:id="22" w:author="Coppinger, Brittany" w:date="2025-01-07T15:01:00Z" w:initials="BC">
     <w:p>
       <w:pPr>
         <w:pStyle w:val="CommentText"/>
@@ -9651,7 +10207,7 @@
       </w:r>
     </w:p>
   </w:comment>
-  <w:comment w:id="24" w:author="Coppinger, Brittany" w:date="2025-01-07T15:08:00Z" w:initials="BC">
+  <w:comment w:id="23" w:author="Coppinger, Brittany" w:date="2025-01-07T15:08:00Z" w:initials="BC">
     <w:p>
       <w:pPr>
         <w:pStyle w:val="CommentText"/>
@@ -9667,7 +10223,7 @@
       </w:r>
     </w:p>
   </w:comment>
-  <w:comment w:id="25" w:author="Coppinger, Brittany" w:date="2025-01-07T15:12:00Z" w:initials="BC">
+  <w:comment w:id="24" w:author="Coppinger, Brittany" w:date="2025-01-07T15:12:00Z" w:initials="BC">
     <w:p>
       <w:pPr>
         <w:pStyle w:val="CommentText"/>
@@ -9683,7 +10239,7 @@
       </w:r>
     </w:p>
   </w:comment>
-  <w:comment w:id="26" w:author="Coppinger, Brittany" w:date="2025-02-13T13:55:00Z" w:initials="BC">
+  <w:comment w:id="25" w:author="Coppinger, Brittany" w:date="2025-04-03T14:53:00Z" w:initials="BC">
     <w:p>
       <w:pPr>
         <w:pStyle w:val="CommentText"/>
@@ -9695,11 +10251,11 @@
         <w:annotationRef/>
       </w:r>
       <w:r>
-        <w:t>Draft text - need to update when graphs are more finalized. Also check about how other people write about space plots (like sturdy paper)</w:t>
+        <w:t>This is super awkward, I need to think of a better way to say this. Probably include something about information theory</w:t>
       </w:r>
     </w:p>
   </w:comment>
-  <w:comment w:id="29" w:author="Coppinger, Brittany" w:date="2025-01-09T10:23:00Z" w:initials="BC">
+  <w:comment w:id="26" w:author="Coppinger, Brittany" w:date="2025-04-03T15:34:00Z" w:initials="BC">
     <w:p>
       <w:pPr>
         <w:pStyle w:val="CommentText"/>
@@ -9711,6 +10267,38 @@
         <w:annotationRef/>
       </w:r>
       <w:r>
+        <w:t>Need more detail here, but I am unsure what we did</w:t>
+      </w:r>
+    </w:p>
+  </w:comment>
+  <w:comment w:id="27" w:author="Coppinger, Brittany" w:date="2025-04-03T15:48:00Z" w:initials="BC">
+    <w:p>
+      <w:pPr>
+        <w:pStyle w:val="CommentText"/>
+      </w:pPr>
+      <w:r>
+        <w:rPr>
+          <w:rStyle w:val="CommentReference"/>
+        </w:rPr>
+        <w:annotationRef/>
+      </w:r>
+      <w:r>
+        <w:t>Grace, are you able to add a quick sentence or two summarizing how to did these calculations?</w:t>
+      </w:r>
+    </w:p>
+  </w:comment>
+  <w:comment w:id="28" w:author="Coppinger, Brittany" w:date="2025-01-09T10:23:00Z" w:initials="BC">
+    <w:p>
+      <w:pPr>
+        <w:pStyle w:val="CommentText"/>
+      </w:pPr>
+      <w:r>
+        <w:rPr>
+          <w:rStyle w:val="CommentReference"/>
+        </w:rPr>
+        <w:annotationRef/>
+      </w:r>
+      <w:r>
         <w:t xml:space="preserve">Make reference to the fact that we are using a very simple generative model to encode diversity of information in signals. </w:t>
       </w:r>
     </w:p>
@@ -9767,7 +10355,7 @@
       </w:pPr>
     </w:p>
   </w:comment>
-  <w:comment w:id="30" w:author="Coppinger, Brittany" w:date="2025-02-13T13:56:00Z" w:initials="BC">
+  <w:comment w:id="29" w:author="Coppinger, Brittany" w:date="2025-02-13T13:56:00Z" w:initials="BC">
     <w:p>
       <w:pPr>
         <w:pStyle w:val="CommentText"/>
@@ -9783,7 +10371,7 @@
       </w:r>
     </w:p>
   </w:comment>
-  <w:comment w:id="31" w:author="Summer Eckhardt" w:date="2025-01-24T10:16:00Z" w:initials="SE">
+  <w:comment w:id="30" w:author="Summer Eckhardt" w:date="2025-01-24T10:16:00Z" w:initials="SE">
     <w:p>
       <w:pPr>
         <w:pStyle w:val="CommentText"/>
@@ -9799,7 +10387,7 @@
       </w:r>
     </w:p>
   </w:comment>
-  <w:comment w:id="32" w:author="Summer Eckhardt" w:date="2025-01-29T09:35:00Z" w:initials="SE">
+  <w:comment w:id="31" w:author="Summer Eckhardt" w:date="2025-01-29T09:35:00Z" w:initials="SE">
     <w:p>
       <w:pPr>
         <w:pStyle w:val="CommentText"/>
@@ -9815,7 +10403,7 @@
       </w:r>
     </w:p>
   </w:comment>
-  <w:comment w:id="33" w:author="Coppinger, Brittany" w:date="2025-02-13T14:16:00Z" w:initials="BC">
+  <w:comment w:id="32" w:author="Coppinger, Brittany" w:date="2025-04-03T12:03:00Z" w:initials="BC">
     <w:p>
       <w:pPr>
         <w:pStyle w:val="CommentText"/>
@@ -9827,11 +10415,11 @@
         <w:annotationRef/>
       </w:r>
       <w:r>
-        <w:t xml:space="preserve">Summer, I moved the figures how here for submission style formatting - this is slightly dependent on what journal you submit to and who the senior author is, but typical formatting is that figures go after the references. For the image, I always do “in-line with text” because there is less of a chance for the figure to get out of place at the text moves around during the drafting process. Also, each figure down here should be on its own page. Reviews seem to like it like this, or at least this is the accepted format most places ☺️ </w:t>
+        <w:t>This needs to be updated to include individual variation?</w:t>
       </w:r>
     </w:p>
   </w:comment>
-  <w:comment w:id="34" w:author="Coppinger, Brittany" w:date="2025-02-13T14:28:00Z" w:initials="BC">
+  <w:comment w:id="33" w:author="Coppinger, Brittany" w:date="2025-04-03T14:24:00Z" w:initials="BC">
     <w:p>
       <w:pPr>
         <w:pStyle w:val="CommentText"/>
@@ -9843,11 +10431,11 @@
         <w:annotationRef/>
       </w:r>
       <w:r>
-        <w:t xml:space="preserve">From summer (sorry comment didn’t copy): This represents the default string length / composition for code in paRsynth’s ‘generate strings’ R code. </w:t>
+        <w:t>Figure caption needs work</w:t>
       </w:r>
     </w:p>
   </w:comment>
-  <w:comment w:id="35" w:author="Coppinger, Brittany" w:date="2025-02-13T14:29:00Z" w:initials="BC">
+  <w:comment w:id="34" w:author="Coppinger, Brittany" w:date="2025-04-03T14:29:00Z" w:initials="BC">
     <w:p>
       <w:pPr>
         <w:pStyle w:val="CommentText"/>
@@ -9859,11 +10447,11 @@
         <w:annotationRef/>
       </w:r>
       <w:r>
-        <w:t>I think we changed string length in the generate synthetic datasets code, and I think it is 36 now? Currently we aren’t using the function in paRsynth in the code for generating the datasets for figures because they weren’t integrating</w:t>
+        <w:t>TKTK need to fix so box labels read “NMI Group and NMI individual, and axes are labeled “Multidimensional Scaling Dimension 1” and 2</w:t>
       </w:r>
     </w:p>
   </w:comment>
-  <w:comment w:id="36" w:author="Summer Eckhardt" w:date="2025-02-13T13:03:00Z" w:initials="SE">
+  <w:comment w:id="35" w:author="Coppinger, Brittany" w:date="2025-04-03T14:26:00Z" w:initials="BC">
     <w:p>
       <w:pPr>
         <w:pStyle w:val="CommentText"/>
@@ -9875,11 +10463,11 @@
         <w:annotationRef/>
       </w:r>
       <w:r>
-        <w:t>Also, I cannot figure out how to get this image centered?? Need to ask about this</w:t>
+        <w:t>Figure caption needs work</w:t>
       </w:r>
     </w:p>
   </w:comment>
-  <w:comment w:id="37" w:author="Coppinger, Brittany" w:date="2025-02-13T14:25:00Z" w:initials="BC">
+  <w:comment w:id="36" w:author="Coppinger, Brittany" w:date="2025-04-03T14:29:00Z" w:initials="BC">
     <w:p>
       <w:pPr>
         <w:pStyle w:val="CommentText"/>
@@ -9891,11 +10479,11 @@
         <w:annotationRef/>
       </w:r>
       <w:r>
-        <w:t>Ah - click on the image, go to “Picture Format” at the top, then “position” (next to Alt Text and Wrap Text),. Click in-line with text (this puts the image on its own line). Now go back to “home” and click center, like you would for regular text!</w:t>
+        <w:t>TKTK need to fix so box labels read “NMI Group and NMI individual, and axes are labeled “Multidimensional Scaling Dimension 1” and 2</w:t>
       </w:r>
     </w:p>
   </w:comment>
-  <w:comment w:id="38" w:author="Summer Eckhardt" w:date="2025-02-20T16:49:00Z" w:initials="SE">
+  <w:comment w:id="37" w:author="Summer Eckhardt" w:date="2025-02-04T18:49:00Z" w:initials="SE">
     <w:p>
       <w:pPr>
         <w:pStyle w:val="CommentText"/>
@@ -9907,11 +10495,11 @@
         <w:annotationRef/>
       </w:r>
       <w:r>
-        <w:t>This is brilliant, thank you so much!</w:t>
+        <w:t>Need to add legend</w:t>
       </w:r>
     </w:p>
   </w:comment>
-  <w:comment w:id="39" w:author="Summer Eckhardt" w:date="2025-02-04T18:49:00Z" w:initials="SE">
+  <w:comment w:id="38" w:author="Summer Eckhardt" w:date="2025-02-04T19:02:00Z" w:initials="SE">
     <w:p>
       <w:pPr>
         <w:pStyle w:val="CommentText"/>
@@ -9923,27 +10511,11 @@
         <w:annotationRef/>
       </w:r>
       <w:r>
-        <w:t>Need to add legend</w:t>
+        <w:t>Are these last few sentences repetitive?</w:t>
       </w:r>
     </w:p>
   </w:comment>
-  <w:comment w:id="40" w:author="Summer Eckhardt" w:date="2025-02-04T19:02:00Z" w:initials="SE">
-    <w:p>
-      <w:pPr>
-        <w:pStyle w:val="CommentText"/>
-      </w:pPr>
-      <w:r>
-        <w:rPr>
-          <w:rStyle w:val="CommentReference"/>
-        </w:rPr>
-        <w:annotationRef/>
-      </w:r>
-      <w:r>
-        <w:t>Are these last few sentences repetitive?</w:t>
-      </w:r>
-    </w:p>
-  </w:comment>
-  <w:comment w:id="41" w:author="Smith Vidaurre, Grace" w:date="2024-12-18T15:30:00Z" w:initials="GSV">
+  <w:comment w:id="39" w:author="Smith Vidaurre, Grace" w:date="2024-12-18T15:30:00Z" w:initials="GSV">
     <w:p>
       <w:r>
         <w:rPr>
@@ -9960,7 +10532,7 @@
       </w:r>
     </w:p>
   </w:comment>
-  <w:comment w:id="42" w:author="Smith Vidaurre, Grace" w:date="2024-12-16T09:35:00Z" w:initials="GSV">
+  <w:comment w:id="40" w:author="Smith Vidaurre, Grace" w:date="2024-12-16T09:35:00Z" w:initials="GSV">
     <w:p>
       <w:r>
         <w:rPr>
@@ -9977,7 +10549,7 @@
       </w:r>
     </w:p>
   </w:comment>
-  <w:comment w:id="43" w:author="Smith Vidaurre, Grace" w:date="2024-12-16T09:41:00Z" w:initials="GSV">
+  <w:comment w:id="41" w:author="Smith Vidaurre, Grace" w:date="2024-12-16T09:41:00Z" w:initials="GSV">
     <w:p>
       <w:r>
         <w:rPr>
@@ -9994,7 +10566,7 @@
       </w:r>
     </w:p>
   </w:comment>
-  <w:comment w:id="44" w:author="Coppinger, Brittany" w:date="2024-12-16T14:51:00Z" w:initials="BC">
+  <w:comment w:id="42" w:author="Coppinger, Brittany" w:date="2024-12-16T14:51:00Z" w:initials="BC">
     <w:p>
       <w:pPr>
         <w:pStyle w:val="CommentText"/>
@@ -10082,17 +10654,18 @@
   <w15:commentEx w15:paraId="46FF90E6" w15:done="0"/>
   <w15:commentEx w15:paraId="60909739" w15:done="0"/>
   <w15:commentEx w15:paraId="4FE2CCE9" w15:done="0"/>
-  <w15:commentEx w15:paraId="4C055D5C" w15:done="0"/>
+  <w15:commentEx w15:paraId="060720E0" w15:done="0"/>
+  <w15:commentEx w15:paraId="06CBE9B8" w15:done="0"/>
+  <w15:commentEx w15:paraId="0DF6B60F" w15:done="0"/>
   <w15:commentEx w15:paraId="5D37FF45" w15:done="0"/>
   <w15:commentEx w15:paraId="22E6BA3E" w15:done="0"/>
   <w15:commentEx w15:paraId="738EB2C9" w15:done="0"/>
   <w15:commentEx w15:paraId="53D7E1DB" w15:done="0"/>
-  <w15:commentEx w15:paraId="7620E29A" w15:done="0"/>
-  <w15:commentEx w15:paraId="63F9BBE5" w15:done="0"/>
-  <w15:commentEx w15:paraId="13D3F523" w15:paraIdParent="63F9BBE5" w15:done="0"/>
-  <w15:commentEx w15:paraId="04688121" w15:done="0"/>
-  <w15:commentEx w15:paraId="12FEE62D" w15:paraIdParent="04688121" w15:done="0"/>
-  <w15:commentEx w15:paraId="529C0E7A" w15:paraIdParent="04688121" w15:done="0"/>
+  <w15:commentEx w15:paraId="1B55B29D" w15:done="0"/>
+  <w15:commentEx w15:paraId="4AFB1DD7" w15:done="0"/>
+  <w15:commentEx w15:paraId="264B5009" w15:done="0"/>
+  <w15:commentEx w15:paraId="54E6E6C1" w15:done="0"/>
+  <w15:commentEx w15:paraId="44F3D7C7" w15:done="0"/>
   <w15:commentEx w15:paraId="51FFEBBF" w15:done="1"/>
   <w15:commentEx w15:paraId="46432439" w15:done="0"/>
   <w15:commentEx w15:paraId="16D76844" w15:done="0"/>
@@ -10141,17 +10714,18 @@
   <w16cex:commentExtensible w16cex:durableId="5021AB04" w16cex:dateUtc="2025-01-07T20:01:00Z"/>
   <w16cex:commentExtensible w16cex:durableId="728A9CD2" w16cex:dateUtc="2025-01-07T20:08:00Z"/>
   <w16cex:commentExtensible w16cex:durableId="152580F2" w16cex:dateUtc="2025-01-07T20:12:00Z"/>
-  <w16cex:commentExtensible w16cex:durableId="7D3CFC36" w16cex:dateUtc="2025-02-13T18:55:00Z"/>
+  <w16cex:commentExtensible w16cex:durableId="4DA2C7C2" w16cex:dateUtc="2025-04-03T18:53:00Z"/>
+  <w16cex:commentExtensible w16cex:durableId="58E17D70" w16cex:dateUtc="2025-04-03T19:34:00Z"/>
+  <w16cex:commentExtensible w16cex:durableId="06891B55" w16cex:dateUtc="2025-04-03T19:48:00Z"/>
   <w16cex:commentExtensible w16cex:durableId="73EE58F5" w16cex:dateUtc="2025-01-09T15:23:00Z"/>
   <w16cex:commentExtensible w16cex:durableId="64405618" w16cex:dateUtc="2025-02-13T18:56:00Z"/>
   <w16cex:commentExtensible w16cex:durableId="37A2E34E" w16cex:dateUtc="2025-01-24T15:16:00Z"/>
   <w16cex:commentExtensible w16cex:durableId="69881C75" w16cex:dateUtc="2025-01-29T14:35:00Z"/>
-  <w16cex:commentExtensible w16cex:durableId="3B1AE945" w16cex:dateUtc="2025-02-13T19:16:00Z"/>
-  <w16cex:commentExtensible w16cex:durableId="581E7B59" w16cex:dateUtc="2025-02-13T19:28:00Z"/>
-  <w16cex:commentExtensible w16cex:durableId="4899B301" w16cex:dateUtc="2025-02-13T19:29:00Z"/>
-  <w16cex:commentExtensible w16cex:durableId="08FF4B06" w16cex:dateUtc="2025-02-13T18:03:00Z"/>
-  <w16cex:commentExtensible w16cex:durableId="79D4BC88" w16cex:dateUtc="2025-02-13T19:25:00Z"/>
-  <w16cex:commentExtensible w16cex:durableId="0BDF4BAE" w16cex:dateUtc="2025-02-20T21:49:00Z"/>
+  <w16cex:commentExtensible w16cex:durableId="4486E4C7" w16cex:dateUtc="2025-04-03T16:03:00Z"/>
+  <w16cex:commentExtensible w16cex:durableId="715210B5" w16cex:dateUtc="2025-04-03T18:24:00Z"/>
+  <w16cex:commentExtensible w16cex:durableId="54309322" w16cex:dateUtc="2025-04-03T18:29:00Z"/>
+  <w16cex:commentExtensible w16cex:durableId="6DFC5180" w16cex:dateUtc="2025-04-03T18:26:00Z"/>
+  <w16cex:commentExtensible w16cex:durableId="548BA73E" w16cex:dateUtc="2025-04-03T18:29:00Z"/>
   <w16cex:commentExtensible w16cex:durableId="4FBEF316" w16cex:dateUtc="2025-02-04T23:49:00Z"/>
   <w16cex:commentExtensible w16cex:durableId="7E8AE7A5" w16cex:dateUtc="2025-02-05T00:02:00Z"/>
   <w16cex:commentExtensible w16cex:durableId="7658D5BD" w16cex:dateUtc="2024-12-18T20:30:00Z"/>
@@ -10188,17 +10762,18 @@
   <w16cid:commentId w16cid:paraId="46FF90E6" w16cid:durableId="5021AB04"/>
   <w16cid:commentId w16cid:paraId="60909739" w16cid:durableId="728A9CD2"/>
   <w16cid:commentId w16cid:paraId="4FE2CCE9" w16cid:durableId="152580F2"/>
-  <w16cid:commentId w16cid:paraId="4C055D5C" w16cid:durableId="7D3CFC36"/>
+  <w16cid:commentId w16cid:paraId="060720E0" w16cid:durableId="4DA2C7C2"/>
+  <w16cid:commentId w16cid:paraId="06CBE9B8" w16cid:durableId="58E17D70"/>
+  <w16cid:commentId w16cid:paraId="0DF6B60F" w16cid:durableId="06891B55"/>
   <w16cid:commentId w16cid:paraId="5D37FF45" w16cid:durableId="73EE58F5"/>
   <w16cid:commentId w16cid:paraId="22E6BA3E" w16cid:durableId="64405618"/>
   <w16cid:commentId w16cid:paraId="738EB2C9" w16cid:durableId="37A2E34E"/>
   <w16cid:commentId w16cid:paraId="53D7E1DB" w16cid:durableId="69881C75"/>
-  <w16cid:commentId w16cid:paraId="7620E29A" w16cid:durableId="3B1AE945"/>
-  <w16cid:commentId w16cid:paraId="63F9BBE5" w16cid:durableId="581E7B59"/>
-  <w16cid:commentId w16cid:paraId="13D3F523" w16cid:durableId="4899B301"/>
-  <w16cid:commentId w16cid:paraId="04688121" w16cid:durableId="08FF4B06"/>
-  <w16cid:commentId w16cid:paraId="12FEE62D" w16cid:durableId="79D4BC88"/>
-  <w16cid:commentId w16cid:paraId="529C0E7A" w16cid:durableId="0BDF4BAE"/>
+  <w16cid:commentId w16cid:paraId="1B55B29D" w16cid:durableId="4486E4C7"/>
+  <w16cid:commentId w16cid:paraId="4AFB1DD7" w16cid:durableId="715210B5"/>
+  <w16cid:commentId w16cid:paraId="264B5009" w16cid:durableId="54309322"/>
+  <w16cid:commentId w16cid:paraId="54E6E6C1" w16cid:durableId="6DFC5180"/>
+  <w16cid:commentId w16cid:paraId="44F3D7C7" w16cid:durableId="548BA73E"/>
   <w16cid:commentId w16cid:paraId="51FFEBBF" w16cid:durableId="4FBEF316"/>
   <w16cid:commentId w16cid:paraId="46432439" w16cid:durableId="7E8AE7A5"/>
   <w16cid:commentId w16cid:paraId="16D76844" w16cid:durableId="7658D5BD"/>

</xml_diff>

<commit_message>
Updated figures 4 and 5 with lightweight PNGs
</commit_message>
<xml_diff>
--- a/drafts/paRsynth_methods_draft.docx
+++ b/drafts/paRsynth_methods_draft.docx
@@ -316,13 +316,7 @@
           <w:rPr>
             <w:rFonts w:ascii="Arial" w:hAnsi="Arial" w:cs="Arial"/>
           </w:rPr>
-          <w:t>Leveraging</w:t>
-        </w:r>
-        <w:r>
-          <w:rPr>
-            <w:rFonts w:ascii="Arial" w:hAnsi="Arial" w:cs="Arial"/>
-          </w:rPr>
-          <w:t xml:space="preserve"> synthetic vocal</w:t>
+          <w:t>Leveraging synthetic vocal</w:t>
         </w:r>
       </w:ins>
       <w:ins w:id="35" w:author="Smith Vidaurre, Grace" w:date="2025-05-27T21:06:00Z" w16du:dateUtc="2025-05-28T01:06:00Z">
@@ -785,7 +779,25 @@
           <w:sz w:val="24"/>
           <w:szCs w:val="24"/>
         </w:rPr>
-        <w:t>, Northhampton, MA, USA</w:t>
+        <w:t xml:space="preserve">, </w:t>
+      </w:r>
+      <w:proofErr w:type="spellStart"/>
+      <w:r>
+        <w:rPr>
+          <w:rFonts w:ascii="Arial" w:hAnsi="Arial" w:cs="Arial"/>
+          <w:sz w:val="24"/>
+          <w:szCs w:val="24"/>
+        </w:rPr>
+        <w:t>Northhampton</w:t>
+      </w:r>
+      <w:proofErr w:type="spellEnd"/>
+      <w:r>
+        <w:rPr>
+          <w:rFonts w:ascii="Arial" w:hAnsi="Arial" w:cs="Arial"/>
+          <w:sz w:val="24"/>
+          <w:szCs w:val="24"/>
+        </w:rPr>
+        <w:t>, MA, USA</w:t>
       </w:r>
     </w:p>
     <w:p>
@@ -836,7 +848,25 @@
           <w:sz w:val="24"/>
           <w:szCs w:val="24"/>
         </w:rPr>
-        <w:t>, Northhampton, MA, USA</w:t>
+        <w:t xml:space="preserve">, </w:t>
+      </w:r>
+      <w:proofErr w:type="spellStart"/>
+      <w:r>
+        <w:rPr>
+          <w:rFonts w:ascii="Arial" w:hAnsi="Arial" w:cs="Arial"/>
+          <w:sz w:val="24"/>
+          <w:szCs w:val="24"/>
+        </w:rPr>
+        <w:t>Northhampton</w:t>
+      </w:r>
+      <w:proofErr w:type="spellEnd"/>
+      <w:r>
+        <w:rPr>
+          <w:rFonts w:ascii="Arial" w:hAnsi="Arial" w:cs="Arial"/>
+          <w:sz w:val="24"/>
+          <w:szCs w:val="24"/>
+        </w:rPr>
+        <w:t>, MA, USA</w:t>
       </w:r>
     </w:p>
     <w:p>
@@ -2761,13 +2791,23 @@
           </w:rPr>
           <w:t>. Monk parakeets (</w:t>
         </w:r>
+        <w:proofErr w:type="spellStart"/>
         <w:r>
           <w:rPr>
             <w:rFonts w:ascii="Arial" w:hAnsi="Arial" w:cs="Arial"/>
             <w:i/>
             <w:iCs/>
           </w:rPr>
-          <w:t>Myiopsitta monachus</w:t>
+          <w:t>Myiopsitta</w:t>
+        </w:r>
+        <w:proofErr w:type="spellEnd"/>
+        <w:r>
+          <w:rPr>
+            <w:rFonts w:ascii="Arial" w:hAnsi="Arial" w:cs="Arial"/>
+            <w:i/>
+            <w:iCs/>
+          </w:rPr>
+          <w:t xml:space="preserve"> monachus</w:t>
         </w:r>
         <w:r>
           <w:rPr>
@@ -4086,7 +4126,21 @@
           <w:rPr>
             <w:rFonts w:ascii="Arial" w:hAnsi="Arial" w:cs="Arial"/>
           </w:rPr>
-          <w:t>with the soundgen R package</w:t>
+          <w:t xml:space="preserve">with the </w:t>
+        </w:r>
+        <w:proofErr w:type="spellStart"/>
+        <w:r>
+          <w:rPr>
+            <w:rFonts w:ascii="Arial" w:hAnsi="Arial" w:cs="Arial"/>
+          </w:rPr>
+          <w:t>soundgen</w:t>
+        </w:r>
+        <w:proofErr w:type="spellEnd"/>
+        <w:r>
+          <w:rPr>
+            <w:rFonts w:ascii="Arial" w:hAnsi="Arial" w:cs="Arial"/>
+          </w:rPr>
+          <w:t xml:space="preserve"> R package</w:t>
         </w:r>
       </w:ins>
       <w:ins w:id="266" w:author="Smith Vidaurre, Grace" w:date="2025-05-22T14:38:00Z" w16du:dateUtc="2025-05-22T18:38:00Z">
@@ -4147,9 +4201,17 @@
           <w:rPr>
             <w:rFonts w:ascii="Arial" w:hAnsi="Arial" w:cs="Arial"/>
           </w:rPr>
-          <w:t xml:space="preserve"> available in the new R package paRsynth</w:t>
+          <w:t xml:space="preserve"> available in the new R package </w:t>
+        </w:r>
+        <w:proofErr w:type="spellStart"/>
+        <w:r>
+          <w:rPr>
+            <w:rFonts w:ascii="Arial" w:hAnsi="Arial" w:cs="Arial"/>
+          </w:rPr>
+          <w:t>paRsynth</w:t>
         </w:r>
       </w:ins>
+      <w:proofErr w:type="spellEnd"/>
       <w:ins w:id="273" w:author="Smith Vidaurre, Grace" w:date="2025-05-22T14:43:00Z" w16du:dateUtc="2025-05-22T18:43:00Z">
         <w:r>
           <w:rPr>
@@ -7026,7 +7088,25 @@
           <w:sz w:val="22"/>
           <w:szCs w:val="22"/>
         </w:rPr>
-        <w:t xml:space="preserve">: Group Information Dataset . </w:t>
+        <w:t xml:space="preserve">: Group Information </w:t>
+      </w:r>
+      <w:proofErr w:type="gramStart"/>
+      <w:r>
+        <w:rPr>
+          <w:rFonts w:ascii="Arial" w:hAnsi="Arial" w:cs="Arial"/>
+          <w:sz w:val="22"/>
+          <w:szCs w:val="22"/>
+        </w:rPr>
+        <w:t>Dataset .</w:t>
+      </w:r>
+      <w:proofErr w:type="gramEnd"/>
+      <w:r>
+        <w:rPr>
+          <w:rFonts w:ascii="Arial" w:hAnsi="Arial" w:cs="Arial"/>
+          <w:sz w:val="22"/>
+          <w:szCs w:val="22"/>
+        </w:rPr>
+        <w:t xml:space="preserve"> </w:t>
       </w:r>
       <w:r>
         <w:rPr>
@@ -7187,7 +7267,21 @@
           <w:rFonts w:ascii="Arial" w:hAnsi="Arial" w:cs="Arial"/>
         </w:rPr>
         <w:lastRenderedPageBreak/>
-        <w:t xml:space="preserve">encode complex information that may be similar to how animals encode information in complex multilevel societies. </w:t>
+        <w:t xml:space="preserve">encode complex information that may be </w:t>
+      </w:r>
+      <w:proofErr w:type="gramStart"/>
+      <w:r>
+        <w:rPr>
+          <w:rFonts w:ascii="Arial" w:hAnsi="Arial" w:cs="Arial"/>
+        </w:rPr>
+        <w:t>similar to</w:t>
+      </w:r>
+      <w:proofErr w:type="gramEnd"/>
+      <w:r>
+        <w:rPr>
+          <w:rFonts w:ascii="Arial" w:hAnsi="Arial" w:cs="Arial"/>
+        </w:rPr>
+        <w:t xml:space="preserve"> how animals encode information in complex multilevel societies. </w:t>
       </w:r>
     </w:p>
     <w:p>
@@ -7244,7 +7338,35 @@
         <w:rPr>
           <w:rFonts w:ascii="Arial" w:hAnsi="Arial" w:cs="Arial"/>
         </w:rPr>
-        <w:t xml:space="preserve">. Animals are known to use frequency modulation patterns to communicate social information (TKTK CITE). Our package, paRsynth, takes computationally efficient characters strings and turns them into biologically relevant frequency-based signals. Therefore, we are able to generate information encoding at various levels of complexity in a biologically realistic way, combining synthetic information theory and traditional bioacoustics analysis tools. </w:t>
+        <w:t xml:space="preserve">. Animals are known to use frequency modulation patterns to communicate social information (TKTK CITE). Our package, </w:t>
+      </w:r>
+      <w:proofErr w:type="spellStart"/>
+      <w:r>
+        <w:rPr>
+          <w:rFonts w:ascii="Arial" w:hAnsi="Arial" w:cs="Arial"/>
+        </w:rPr>
+        <w:t>paRsynth</w:t>
+      </w:r>
+      <w:proofErr w:type="spellEnd"/>
+      <w:r>
+        <w:rPr>
+          <w:rFonts w:ascii="Arial" w:hAnsi="Arial" w:cs="Arial"/>
+        </w:rPr>
+        <w:t xml:space="preserve">, takes computationally efficient characters strings and turns them into biologically relevant frequency-based signals. Therefore, we </w:t>
+      </w:r>
+      <w:proofErr w:type="gramStart"/>
+      <w:r>
+        <w:rPr>
+          <w:rFonts w:ascii="Arial" w:hAnsi="Arial" w:cs="Arial"/>
+        </w:rPr>
+        <w:t>are able to</w:t>
+      </w:r>
+      <w:proofErr w:type="gramEnd"/>
+      <w:r>
+        <w:rPr>
+          <w:rFonts w:ascii="Arial" w:hAnsi="Arial" w:cs="Arial"/>
+        </w:rPr>
+        <w:t xml:space="preserve"> generate information encoding at various levels of complexity in a biologically realistic way, combining synthetic information theory and traditional bioacoustics analysis tools. </w:t>
       </w:r>
     </w:p>
     <w:p>
@@ -7355,7 +7477,21 @@
         <w:rPr>
           <w:rFonts w:ascii="Arial" w:hAnsi="Arial" w:cs="Arial"/>
         </w:rPr>
-        <w:t>Combining paRsynth with agent-based modeling</w:t>
+        <w:t xml:space="preserve">Combining </w:t>
+      </w:r>
+      <w:proofErr w:type="spellStart"/>
+      <w:r>
+        <w:rPr>
+          <w:rFonts w:ascii="Arial" w:hAnsi="Arial" w:cs="Arial"/>
+        </w:rPr>
+        <w:t>paRsynth</w:t>
+      </w:r>
+      <w:proofErr w:type="spellEnd"/>
+      <w:r>
+        <w:rPr>
+          <w:rFonts w:ascii="Arial" w:hAnsi="Arial" w:cs="Arial"/>
+        </w:rPr>
+        <w:t xml:space="preserve"> with agent-based modeling</w:t>
       </w:r>
       <w:r>
         <w:rPr>
@@ -7508,7 +7644,21 @@
         <w:rPr>
           <w:rFonts w:ascii="Arial" w:hAnsi="Arial" w:cs="Arial"/>
         </w:rPr>
-        <w:t xml:space="preserve">Finally, accuracy patters for edit distance measurements were similar to those for SPCC measurements. </w:t>
+        <w:t xml:space="preserve">Finally, accuracy patters for edit distance measurements were </w:t>
+      </w:r>
+      <w:proofErr w:type="gramStart"/>
+      <w:r>
+        <w:rPr>
+          <w:rFonts w:ascii="Arial" w:hAnsi="Arial" w:cs="Arial"/>
+        </w:rPr>
+        <w:t>similar to</w:t>
+      </w:r>
+      <w:proofErr w:type="gramEnd"/>
+      <w:r>
+        <w:rPr>
+          <w:rFonts w:ascii="Arial" w:hAnsi="Arial" w:cs="Arial"/>
+        </w:rPr>
+        <w:t xml:space="preserve"> those for SPCC measurements. </w:t>
       </w:r>
     </w:p>
     <w:p>
@@ -7533,9 +7683,9 @@
         </w:rPr>
         <w:lastRenderedPageBreak/>
         <w:drawing>
-          <wp:inline distT="0" distB="0" distL="0" distR="0" wp14:anchorId="7E081CA4" wp14:editId="09DE7E95">
-            <wp:extent cx="5937250" cy="5149850"/>
-            <wp:effectExtent l="0" t="0" r="6350" b="0"/>
+          <wp:inline distT="0" distB="0" distL="0" distR="0" wp14:anchorId="7E081CA4" wp14:editId="5FF1D1B6">
+            <wp:extent cx="5937250" cy="5145616"/>
+            <wp:effectExtent l="0" t="0" r="0" b="0"/>
             <wp:docPr id="782938263" name="Picture 4"/>
             <wp:cNvGraphicFramePr>
               <a:graphicFrameLocks xmlns:a="http://schemas.openxmlformats.org/drawingml/2006/main" noChangeAspect="1"/>
@@ -7544,7 +7694,7 @@
               <a:graphicData uri="http://schemas.openxmlformats.org/drawingml/2006/picture">
                 <pic:pic xmlns:pic="http://schemas.openxmlformats.org/drawingml/2006/picture">
                   <pic:nvPicPr>
-                    <pic:cNvPr id="0" name="Picture 4"/>
+                    <pic:cNvPr id="782938263" name="Picture 4"/>
                     <pic:cNvPicPr>
                       <a:picLocks noChangeAspect="1" noChangeArrowheads="1"/>
                     </pic:cNvPicPr>
@@ -7557,7 +7707,6 @@
                         </a:ext>
                       </a:extLst>
                     </a:blip>
-                    <a:srcRect/>
                     <a:stretch>
                       <a:fillRect/>
                     </a:stretch>
@@ -7565,7 +7714,7 @@
                   <pic:spPr bwMode="auto">
                     <a:xfrm>
                       <a:off x="0" y="0"/>
-                      <a:ext cx="5937250" cy="5149850"/>
+                      <a:ext cx="5937250" cy="5145616"/>
                     </a:xfrm>
                     <a:prstGeom prst="rect">
                       <a:avLst/>
@@ -7655,7 +7804,21 @@
         <w:rPr>
           <w:rFonts w:ascii="Arial" w:hAnsi="Arial" w:cs="Arial"/>
         </w:rPr>
-        <w:t>To quanitatively determine the social level (group or individual) with the most vocal information that was originally encoded, w</w:t>
+        <w:t xml:space="preserve">To </w:t>
+      </w:r>
+      <w:proofErr w:type="spellStart"/>
+      <w:r>
+        <w:rPr>
+          <w:rFonts w:ascii="Arial" w:hAnsi="Arial" w:cs="Arial"/>
+        </w:rPr>
+        <w:t>quanitatively</w:t>
+      </w:r>
+      <w:proofErr w:type="spellEnd"/>
+      <w:r>
+        <w:rPr>
+          <w:rFonts w:ascii="Arial" w:hAnsi="Arial" w:cs="Arial"/>
+        </w:rPr>
+        <w:t xml:space="preserve"> determine the social level (group or individual) with the most vocal information that was originally encoded, w</w:t>
       </w:r>
       <w:r>
         <w:rPr>
@@ -15902,9 +16065,9 @@
         </w:rPr>
         <w:lastRenderedPageBreak/>
         <w:drawing>
-          <wp:inline distT="0" distB="0" distL="0" distR="0" wp14:anchorId="5533CDDE" wp14:editId="31DA7438">
-            <wp:extent cx="5937250" cy="5149850"/>
-            <wp:effectExtent l="0" t="0" r="6350" b="0"/>
+          <wp:inline distT="0" distB="0" distL="0" distR="0" wp14:anchorId="5533CDDE" wp14:editId="5F20D14C">
+            <wp:extent cx="5937250" cy="5145616"/>
+            <wp:effectExtent l="0" t="0" r="0" b="0"/>
             <wp:docPr id="978950095" name="Picture 5"/>
             <wp:cNvGraphicFramePr>
               <a:graphicFrameLocks xmlns:a="http://schemas.openxmlformats.org/drawingml/2006/main" noChangeAspect="1"/>
@@ -15913,7 +16076,7 @@
               <a:graphicData uri="http://schemas.openxmlformats.org/drawingml/2006/picture">
                 <pic:pic xmlns:pic="http://schemas.openxmlformats.org/drawingml/2006/picture">
                   <pic:nvPicPr>
-                    <pic:cNvPr id="0" name="Picture 5"/>
+                    <pic:cNvPr id="978950095" name="Picture 5"/>
                     <pic:cNvPicPr>
                       <a:picLocks noChangeAspect="1" noChangeArrowheads="1"/>
                     </pic:cNvPicPr>
@@ -15926,7 +16089,6 @@
                         </a:ext>
                       </a:extLst>
                     </a:blip>
-                    <a:srcRect/>
                     <a:stretch>
                       <a:fillRect/>
                     </a:stretch>
@@ -15934,7 +16096,7 @@
                   <pic:spPr bwMode="auto">
                     <a:xfrm>
                       <a:off x="0" y="0"/>
-                      <a:ext cx="5937250" cy="5149850"/>
+                      <a:ext cx="5937250" cy="5145616"/>
                     </a:xfrm>
                     <a:prstGeom prst="rect">
                       <a:avLst/>
@@ -16049,14 +16211,36 @@
           <w:rFonts w:ascii="Arial" w:hAnsi="Arial" w:cs="Arial"/>
         </w:rPr>
         <w:lastRenderedPageBreak/>
-        <w:t xml:space="preserve">Our package, paRsynth, is a new synthetic tool for studying information encoding in animal communication. </w:t>
-      </w:r>
-      <w:r>
-        <w:rPr>
-          <w:rFonts w:ascii="Arial" w:hAnsi="Arial" w:cs="Arial"/>
-        </w:rPr>
-        <w:t>Synthetic tools offer a practical solutions</w:t>
-      </w:r>
+        <w:t xml:space="preserve">Our package, </w:t>
+      </w:r>
+      <w:proofErr w:type="spellStart"/>
+      <w:r>
+        <w:rPr>
+          <w:rFonts w:ascii="Arial" w:hAnsi="Arial" w:cs="Arial"/>
+        </w:rPr>
+        <w:t>paRsynth</w:t>
+      </w:r>
+      <w:proofErr w:type="spellEnd"/>
+      <w:r>
+        <w:rPr>
+          <w:rFonts w:ascii="Arial" w:hAnsi="Arial" w:cs="Arial"/>
+        </w:rPr>
+        <w:t xml:space="preserve">, is a new synthetic tool for studying information encoding in animal communication. </w:t>
+      </w:r>
+      <w:r>
+        <w:rPr>
+          <w:rFonts w:ascii="Arial" w:hAnsi="Arial" w:cs="Arial"/>
+        </w:rPr>
+        <w:t xml:space="preserve">Synthetic tools offer a </w:t>
+      </w:r>
+      <w:proofErr w:type="gramStart"/>
+      <w:r>
+        <w:rPr>
+          <w:rFonts w:ascii="Arial" w:hAnsi="Arial" w:cs="Arial"/>
+        </w:rPr>
+        <w:t>practical solutions</w:t>
+      </w:r>
+      <w:proofErr w:type="gramEnd"/>
       <w:r>
         <w:rPr>
           <w:rFonts w:ascii="Arial" w:hAnsi="Arial" w:cs="Arial"/>
@@ -16253,7 +16437,35 @@
         <w:rPr>
           <w:rFonts w:ascii="Arial" w:hAnsi="Arial" w:cs="Arial"/>
         </w:rPr>
-        <w:t>sentences about wableR and soundgen]</w:t>
+        <w:t xml:space="preserve">sentences about </w:t>
+      </w:r>
+      <w:proofErr w:type="spellStart"/>
+      <w:r>
+        <w:rPr>
+          <w:rFonts w:ascii="Arial" w:hAnsi="Arial" w:cs="Arial"/>
+        </w:rPr>
+        <w:t>wableR</w:t>
+      </w:r>
+      <w:proofErr w:type="spellEnd"/>
+      <w:r>
+        <w:rPr>
+          <w:rFonts w:ascii="Arial" w:hAnsi="Arial" w:cs="Arial"/>
+        </w:rPr>
+        <w:t xml:space="preserve"> and </w:t>
+      </w:r>
+      <w:proofErr w:type="spellStart"/>
+      <w:r>
+        <w:rPr>
+          <w:rFonts w:ascii="Arial" w:hAnsi="Arial" w:cs="Arial"/>
+        </w:rPr>
+        <w:t>soundgen</w:t>
+      </w:r>
+      <w:proofErr w:type="spellEnd"/>
+      <w:r>
+        <w:rPr>
+          <w:rFonts w:ascii="Arial" w:hAnsi="Arial" w:cs="Arial"/>
+        </w:rPr>
+        <w:t>]</w:t>
       </w:r>
       <w:r>
         <w:rPr>
@@ -16476,7 +16688,21 @@
         <w:rPr>
           <w:rFonts w:ascii="Arial" w:hAnsi="Arial" w:cs="Arial"/>
         </w:rPr>
-        <w:t xml:space="preserve"> not only allow us to perform simulation based research of </w:t>
+        <w:t xml:space="preserve"> not only allow us to perform </w:t>
+      </w:r>
+      <w:proofErr w:type="gramStart"/>
+      <w:r>
+        <w:rPr>
+          <w:rFonts w:ascii="Arial" w:hAnsi="Arial" w:cs="Arial"/>
+        </w:rPr>
+        <w:t>simulation based</w:t>
+      </w:r>
+      <w:proofErr w:type="gramEnd"/>
+      <w:r>
+        <w:rPr>
+          <w:rFonts w:ascii="Arial" w:hAnsi="Arial" w:cs="Arial"/>
+        </w:rPr>
+        <w:t xml:space="preserve"> research of </w:t>
       </w:r>
       <w:r>
         <w:rPr>
@@ -16662,7 +16888,21 @@
           <w:rFonts w:ascii="Arial" w:hAnsi="Arial" w:cs="Arial"/>
         </w:rPr>
         <w:tab/>
-        <w:t xml:space="preserve">Next, we sonified characters strings to synthetic vocalizations by using Parson’s code. Parson’s code summarizes the information in a tune or signal while reducing over its global characteristics </w:t>
+        <w:t xml:space="preserve">Next, we </w:t>
+      </w:r>
+      <w:proofErr w:type="spellStart"/>
+      <w:r>
+        <w:rPr>
+          <w:rFonts w:ascii="Arial" w:hAnsi="Arial" w:cs="Arial"/>
+        </w:rPr>
+        <w:t>sonified</w:t>
+      </w:r>
+      <w:proofErr w:type="spellEnd"/>
+      <w:r>
+        <w:rPr>
+          <w:rFonts w:ascii="Arial" w:hAnsi="Arial" w:cs="Arial"/>
+        </w:rPr>
+        <w:t xml:space="preserve"> characters strings to synthetic vocalizations by using Parson’s code. Parson’s code summarizes the information in a tune or signal while reducing over its global characteristics </w:t>
       </w:r>
       <w:r>
         <w:rPr>
@@ -16698,14 +16938,42 @@
         <w:rPr>
           <w:rFonts w:ascii="Arial" w:hAnsi="Arial" w:cs="Arial"/>
         </w:rPr>
-        <w:t xml:space="preserve">. We used 1-Parsons encoding, which reduces the </w:t>
+        <w:t>. We used 1-</w:t>
+      </w:r>
+      <w:proofErr w:type="gramStart"/>
+      <w:r>
+        <w:rPr>
+          <w:rFonts w:ascii="Arial" w:hAnsi="Arial" w:cs="Arial"/>
+        </w:rPr>
+        <w:t>Parsons</w:t>
+      </w:r>
+      <w:proofErr w:type="gramEnd"/>
+      <w:r>
+        <w:rPr>
+          <w:rFonts w:ascii="Arial" w:hAnsi="Arial" w:cs="Arial"/>
+        </w:rPr>
+        <w:t xml:space="preserve"> encoding, which reduces the </w:t>
       </w:r>
       <w:r>
         <w:rPr>
           <w:rFonts w:ascii="Arial" w:hAnsi="Arial" w:cs="Arial"/>
         </w:rPr>
         <w:lastRenderedPageBreak/>
-        <w:t xml:space="preserve">frequences profile of a signal to a “trit” of information by noting the direction of frequency change (up, down, or constant) in a series of subsamples from the original signal, known as Parsons segments. Parsons code is often used in the retrieval and study of music </w:t>
+        <w:t>frequences profile of a signal to a “</w:t>
+      </w:r>
+      <w:proofErr w:type="spellStart"/>
+      <w:r>
+        <w:rPr>
+          <w:rFonts w:ascii="Arial" w:hAnsi="Arial" w:cs="Arial"/>
+        </w:rPr>
+        <w:t>trit</w:t>
+      </w:r>
+      <w:proofErr w:type="spellEnd"/>
+      <w:r>
+        <w:rPr>
+          <w:rFonts w:ascii="Arial" w:hAnsi="Arial" w:cs="Arial"/>
+        </w:rPr>
+        <w:t xml:space="preserve">” of information by noting the direction of frequency change (up, down, or constant) in a series of subsamples from the original signal, known as Parsons segments. Parsons code is often used in the retrieval and study of music </w:t>
       </w:r>
       <w:r>
         <w:rPr>
@@ -16820,7 +17088,21 @@
         <w:rPr>
           <w:rFonts w:ascii="Arial" w:hAnsi="Arial" w:cs="Arial"/>
         </w:rPr>
-        <w:t xml:space="preserve">Frequency shifts were kept constant at TKTK (I think 1000Hz). The starting frequency anchor was also used as a final frequency anchor in a vocalization subcomponent. Then, using the frequency anchors in each synthetic vocalization to guide frequency modulation patterns, we generated synthetic audio signals using the Soundgen package in R (CITE). The resulting synthetic vocalization files were saved as .wav files.  </w:t>
+        <w:t xml:space="preserve">Frequency shifts were kept constant at TKTK (I think 1000Hz). The starting frequency anchor was also used as a final frequency anchor in a vocalization subcomponent. Then, using the frequency anchors in each synthetic vocalization to guide frequency modulation patterns, we generated synthetic audio signals using the </w:t>
+      </w:r>
+      <w:proofErr w:type="spellStart"/>
+      <w:r>
+        <w:rPr>
+          <w:rFonts w:ascii="Arial" w:hAnsi="Arial" w:cs="Arial"/>
+        </w:rPr>
+        <w:t>Soundgen</w:t>
+      </w:r>
+      <w:proofErr w:type="spellEnd"/>
+      <w:r>
+        <w:rPr>
+          <w:rFonts w:ascii="Arial" w:hAnsi="Arial" w:cs="Arial"/>
+        </w:rPr>
+        <w:t xml:space="preserve"> package in R (CITE). The resulting synthetic vocalization files were saved as .wav files.  </w:t>
       </w:r>
     </w:p>
     <w:p>
@@ -16836,7 +17118,21 @@
           <w:rFonts w:ascii="Arial" w:hAnsi="Arial" w:cs="Arial"/>
         </w:rPr>
         <w:lastRenderedPageBreak/>
-        <w:t>We used R to generate strings and synthetic audio signals, using the paRsynth package (code found TKTK here).</w:t>
+        <w:t xml:space="preserve">We used R to generate strings and synthetic audio signals, using the </w:t>
+      </w:r>
+      <w:proofErr w:type="spellStart"/>
+      <w:r>
+        <w:rPr>
+          <w:rFonts w:ascii="Arial" w:hAnsi="Arial" w:cs="Arial"/>
+        </w:rPr>
+        <w:t>paRsynth</w:t>
+      </w:r>
+      <w:proofErr w:type="spellEnd"/>
+      <w:r>
+        <w:rPr>
+          <w:rFonts w:ascii="Arial" w:hAnsi="Arial" w:cs="Arial"/>
+        </w:rPr>
+        <w:t xml:space="preserve"> package (code found TKTK here).</w:t>
       </w:r>
     </w:p>
     <w:p>
@@ -17102,7 +17398,21 @@
         <w:rPr>
           <w:rFonts w:ascii="Arial" w:hAnsi="Arial" w:cs="Arial"/>
         </w:rPr>
-        <w:t xml:space="preserve">After generating synthetic signals for these datasets, we used the soundgen package (TKTK citation) to convert the .wav files to spectrograms (see example of calls in Figures 2B and 3B). To validate that the group and individual information we specified in the character strings could be recovered from the generated frequency signals, we performed spectrographic cross-correlation on each dataset (SPCC; </w:t>
+        <w:t xml:space="preserve">After generating synthetic signals for these datasets, we used the </w:t>
+      </w:r>
+      <w:proofErr w:type="spellStart"/>
+      <w:r>
+        <w:rPr>
+          <w:rFonts w:ascii="Arial" w:hAnsi="Arial" w:cs="Arial"/>
+        </w:rPr>
+        <w:t>soundgen</w:t>
+      </w:r>
+      <w:proofErr w:type="spellEnd"/>
+      <w:r>
+        <w:rPr>
+          <w:rFonts w:ascii="Arial" w:hAnsi="Arial" w:cs="Arial"/>
+        </w:rPr>
+        <w:t xml:space="preserve"> package (TKTK citation) to convert the .wav files to spectrograms (see example of calls in Figures 2B and 3B). To validate that the group and individual information we specified in the character strings could be recovered from the generated frequency signals, we performed spectrographic cross-correlation on each dataset (SPCC; </w:t>
       </w:r>
       <w:r>
         <w:rPr>
@@ -17138,7 +17448,21 @@
         <w:rPr>
           <w:rFonts w:ascii="Arial" w:hAnsi="Arial" w:cs="Arial"/>
         </w:rPr>
-        <w:t xml:space="preserve">) using the warbleR package. We performed SPCC with a Hanning window, a window length of 512 samples, and a window overlap of 90 samples. We used a Pearson’s correlation method and a bandpass filter of 0 to 20 kHz. </w:t>
+        <w:t xml:space="preserve">) using the </w:t>
+      </w:r>
+      <w:proofErr w:type="spellStart"/>
+      <w:r>
+        <w:rPr>
+          <w:rFonts w:ascii="Arial" w:hAnsi="Arial" w:cs="Arial"/>
+        </w:rPr>
+        <w:t>warbleR</w:t>
+      </w:r>
+      <w:proofErr w:type="spellEnd"/>
+      <w:r>
+        <w:rPr>
+          <w:rFonts w:ascii="Arial" w:hAnsi="Arial" w:cs="Arial"/>
+        </w:rPr>
+        <w:t xml:space="preserve"> package. We performed SPCC with a Hanning window, a window length of 512 samples, and a window overlap of 90 samples. We used a Pearson’s correlation method and a bandpass filter of 0 to 20 kHz. </w:t>
       </w:r>
     </w:p>
     <w:p>
@@ -17338,7 +17662,21 @@
           <w:rFonts w:ascii="Arial" w:hAnsi="Arial" w:cs="Arial"/>
         </w:rPr>
         <w:tab/>
-        <w:t xml:space="preserve">Once these synthetic datasets were created, we used traditional bioacoustics tools to decode information encoded at the group and individual level. Similar to the datasets above, we performed SPCC. We also calculated the edit distance for the original strings. After these calculations, we performed Multidimensional Scaling on both the SPCC and edit distance matrices, then performed k-means clustering, randomly selecting 1 call per individual per group, to ensure that call exemplars per class matched between social levels. From this, we were able to calculate the accuracy of detecting information at the group and individual levels from vocalizations represented as character strings (edit distance pipeline) or synthetic audio files (tradition </w:t>
+        <w:t xml:space="preserve">Once these synthetic datasets were created, we used traditional bioacoustics tools to decode information encoded at the group and individual level. </w:t>
+      </w:r>
+      <w:proofErr w:type="gramStart"/>
+      <w:r>
+        <w:rPr>
+          <w:rFonts w:ascii="Arial" w:hAnsi="Arial" w:cs="Arial"/>
+        </w:rPr>
+        <w:t>Similar to</w:t>
+      </w:r>
+      <w:proofErr w:type="gramEnd"/>
+      <w:r>
+        <w:rPr>
+          <w:rFonts w:ascii="Arial" w:hAnsi="Arial" w:cs="Arial"/>
+        </w:rPr>
+        <w:t xml:space="preserve"> the datasets above, we performed SPCC. We also calculated the edit distance for the original strings. After these calculations, we performed Multidimensional Scaling on both the SPCC and edit distance matrices, then performed k-means clustering, randomly selecting 1 call per individual per group, to ensure that call exemplars per class matched between social levels. From this, we were able to calculate the accuracy of detecting information at the group and individual levels from vocalizations represented as character strings (edit distance pipeline) or synthetic audio files (tradition </w:t>
       </w:r>
       <w:r>
         <w:rPr>
@@ -18618,7 +18956,21 @@
         <w:rPr>
           <w:rFonts w:ascii="Arial" w:hAnsi="Arial" w:cs="Arial"/>
         </w:rPr>
-        <w:t>more individual information encoded in the calls with polygons drawn by individual identity. Colors represent group identity, shapes represent different individuals.</w:t>
+        <w:t xml:space="preserve">more individual information encoded in the calls with polygons drawn by individual identity. Colors represent group </w:t>
+      </w:r>
+      <w:proofErr w:type="gramStart"/>
+      <w:r>
+        <w:rPr>
+          <w:rFonts w:ascii="Arial" w:hAnsi="Arial" w:cs="Arial"/>
+        </w:rPr>
+        <w:t>identity,</w:t>
+      </w:r>
+      <w:proofErr w:type="gramEnd"/>
+      <w:r>
+        <w:rPr>
+          <w:rFonts w:ascii="Arial" w:hAnsi="Arial" w:cs="Arial"/>
+        </w:rPr>
+        <w:t xml:space="preserve"> shapes represent different individuals.</w:t>
       </w:r>
     </w:p>
     <w:p>
@@ -18808,11 +19160,19 @@
         </w:rPr>
         <w:t>Supplemental figure 3</w:t>
       </w:r>
-      <w:r>
-        <w:rPr>
-          <w:rFonts w:ascii="Arial" w:hAnsi="Arial" w:cs="Arial"/>
-        </w:rPr>
-        <w:t>: : orange = group, blue = individual</w:t>
+      <w:proofErr w:type="gramStart"/>
+      <w:r>
+        <w:rPr>
+          <w:rFonts w:ascii="Arial" w:hAnsi="Arial" w:cs="Arial"/>
+        </w:rPr>
+        <w:t>: :</w:t>
+      </w:r>
+      <w:proofErr w:type="gramEnd"/>
+      <w:r>
+        <w:rPr>
+          <w:rFonts w:ascii="Arial" w:hAnsi="Arial" w:cs="Arial"/>
+        </w:rPr>
+        <w:t xml:space="preserve"> orange = group, blue = individual</w:t>
       </w:r>
     </w:p>
     <w:p>
@@ -19203,7 +19563,23 @@
             <w:rFonts w:ascii="Arial" w:hAnsi="Arial" w:cs="Arial"/>
             <w:highlight w:val="yellow"/>
           </w:rPr>
-          <w:t>MacDougall-Shackletons?</w:t>
+          <w:t>MacDougall-</w:t>
+        </w:r>
+        <w:proofErr w:type="spellStart"/>
+        <w:r>
+          <w:rPr>
+            <w:rFonts w:ascii="Arial" w:hAnsi="Arial" w:cs="Arial"/>
+            <w:highlight w:val="yellow"/>
+          </w:rPr>
+          <w:t>Shackletons</w:t>
+        </w:r>
+        <w:proofErr w:type="spellEnd"/>
+        <w:r>
+          <w:rPr>
+            <w:rFonts w:ascii="Arial" w:hAnsi="Arial" w:cs="Arial"/>
+            <w:highlight w:val="yellow"/>
+          </w:rPr>
+          <w:t>?</w:t>
         </w:r>
         <w:r>
           <w:rPr>
@@ -19652,14 +20028,36 @@
         <w:rPr>
           <w:rFonts w:ascii="Arial" w:hAnsi="Arial" w:cs="Arial"/>
         </w:rPr>
-        <w:t xml:space="preserve">Second, out ability to detect the dynamics of information encoding during real time social interactions is limited by our ability to capture the totality of an individual’s or groups signal produced during these interactions. We may be over sampling from vocal learning species whose social interaction and signal production are easy to observe and </w:t>
-      </w:r>
+        <w:t xml:space="preserve">Second, </w:t>
+      </w:r>
+      <w:proofErr w:type="spellStart"/>
+      <w:r>
+        <w:rPr>
+          <w:rFonts w:ascii="Arial" w:hAnsi="Arial" w:cs="Arial"/>
+        </w:rPr>
+        <w:t>out</w:t>
+      </w:r>
+      <w:proofErr w:type="spellEnd"/>
+      <w:r>
+        <w:rPr>
+          <w:rFonts w:ascii="Arial" w:hAnsi="Arial" w:cs="Arial"/>
+        </w:rPr>
+        <w:t xml:space="preserve"> ability to detect the dynamics of information encoding during real time social interactions is limited by our ability to capture the totality of an individual’s or groups signal produced during these interactions. We may be over sampling from vocal learning species whose social interaction and signal production are easy to observe and </w:t>
+      </w:r>
+      <w:proofErr w:type="gramStart"/>
       <w:r>
         <w:rPr>
           <w:rFonts w:ascii="Arial" w:hAnsi="Arial" w:cs="Arial"/>
         </w:rPr>
         <w:lastRenderedPageBreak/>
-        <w:t>measure, and therefore may not be assessing the full scope of how information can be encoded across a range of species.</w:t>
+        <w:t>measure, and</w:t>
+      </w:r>
+      <w:proofErr w:type="gramEnd"/>
+      <w:r>
+        <w:rPr>
+          <w:rFonts w:ascii="Arial" w:hAnsi="Arial" w:cs="Arial"/>
+        </w:rPr>
+        <w:t xml:space="preserve"> therefore may not be assessing the full scope of how information can be encoded across a range of species.</w:t>
       </w:r>
       <w:commentRangeEnd w:id="379"/>
       <w:r>
@@ -20054,11 +20452,19 @@
           <w:rFonts w:ascii="Arial" w:hAnsi="Arial" w:cs="Arial"/>
         </w:rPr>
       </w:pPr>
-      <w:r>
-        <w:rPr>
-          <w:rFonts w:ascii="Arial" w:hAnsi="Arial" w:cs="Arial"/>
-        </w:rPr>
-        <w:t xml:space="preserve">paRsynth Part 2: validating types of analysis </w:t>
+      <w:proofErr w:type="spellStart"/>
+      <w:r>
+        <w:rPr>
+          <w:rFonts w:ascii="Arial" w:hAnsi="Arial" w:cs="Arial"/>
+        </w:rPr>
+        <w:t>paRsynth</w:t>
+      </w:r>
+      <w:proofErr w:type="spellEnd"/>
+      <w:r>
+        <w:rPr>
+          <w:rFonts w:ascii="Arial" w:hAnsi="Arial" w:cs="Arial"/>
+        </w:rPr>
+        <w:t xml:space="preserve"> Part 2: validating types of analysis </w:t>
       </w:r>
     </w:p>
     <w:p>
@@ -20169,7 +20575,21 @@
         <w:rPr>
           <w:rFonts w:ascii="Arial" w:hAnsi="Arial" w:cs="Arial"/>
         </w:rPr>
-        <w:t>These models allow us to address the statistical significance of the degree or magnitude of convergence (which we originally encoded using paRsynth). The inferential statistics layer to validate that the information we originally encoded can be recovered</w:t>
+        <w:t xml:space="preserve">These models allow us to address the statistical significance of the degree or magnitude of convergence (which we originally encoded using </w:t>
+      </w:r>
+      <w:proofErr w:type="spellStart"/>
+      <w:r>
+        <w:rPr>
+          <w:rFonts w:ascii="Arial" w:hAnsi="Arial" w:cs="Arial"/>
+        </w:rPr>
+        <w:t>paRsynth</w:t>
+      </w:r>
+      <w:proofErr w:type="spellEnd"/>
+      <w:r>
+        <w:rPr>
+          <w:rFonts w:ascii="Arial" w:hAnsi="Arial" w:cs="Arial"/>
+        </w:rPr>
+        <w:t>). The inferential statistics layer to validate that the information we originally encoded can be recovered</w:t>
       </w:r>
     </w:p>
     <w:p>
@@ -20190,7 +20610,21 @@
         <w:rPr>
           <w:rFonts w:ascii="Arial" w:hAnsi="Arial" w:cs="Arial"/>
         </w:rPr>
-        <w:t>A receiver standpoint on information recovery, in which we simulated signaler information encoding. Does the variation that we encoded actually matter???</w:t>
+        <w:t xml:space="preserve">A receiver standpoint on information recovery, in which we simulated signaler information encoding. Does the variation that we encoded </w:t>
+      </w:r>
+      <w:proofErr w:type="gramStart"/>
+      <w:r>
+        <w:rPr>
+          <w:rFonts w:ascii="Arial" w:hAnsi="Arial" w:cs="Arial"/>
+        </w:rPr>
+        <w:t>actually matter</w:t>
+      </w:r>
+      <w:proofErr w:type="gramEnd"/>
+      <w:r>
+        <w:rPr>
+          <w:rFonts w:ascii="Arial" w:hAnsi="Arial" w:cs="Arial"/>
+        </w:rPr>
+        <w:t>???</w:t>
       </w:r>
     </w:p>
     <w:p>
@@ -20211,7 +20645,21 @@
         <w:rPr>
           <w:rFonts w:ascii="Arial" w:hAnsi="Arial" w:cs="Arial"/>
         </w:rPr>
-        <w:t>Because we have repeated sampling at both social levels with known individuals, we can actually model variation in convergence within and between categories (individuals, groups) at each social level</w:t>
+        <w:t xml:space="preserve">Because we have repeated sampling at both social levels with known individuals, we can </w:t>
+      </w:r>
+      <w:proofErr w:type="gramStart"/>
+      <w:r>
+        <w:rPr>
+          <w:rFonts w:ascii="Arial" w:hAnsi="Arial" w:cs="Arial"/>
+        </w:rPr>
+        <w:t>actually model</w:t>
+      </w:r>
+      <w:proofErr w:type="gramEnd"/>
+      <w:r>
+        <w:rPr>
+          <w:rFonts w:ascii="Arial" w:hAnsi="Arial" w:cs="Arial"/>
+        </w:rPr>
+        <w:t xml:space="preserve"> variation in convergence within and between categories (individuals, groups) at each social level</w:t>
       </w:r>
     </w:p>
     <w:p>

</xml_diff>

<commit_message>
Word still too slow: removed all image files
</commit_message>
<xml_diff>
--- a/drafts/paRsynth_methods_draft.docx
+++ b/drafts/paRsynth_methods_draft.docx
@@ -4272,7 +4272,6 @@
             <w:rPr>
               <w:rFonts w:ascii="Arial" w:hAnsi="Arial" w:cs="Arial"/>
             </w:rPr>
-            <w:lastRenderedPageBreak/>
             <w:delText xml:space="preserve">Social recognition has long been hypothesized to favor the evolution of vocal learning </w:delText>
           </w:r>
           <w:r>
@@ -5988,59 +5987,61 @@
           <w:bCs/>
         </w:rPr>
       </w:pPr>
-      <w:r>
-        <w:rPr>
-          <w:noProof/>
-        </w:rPr>
-        <w:drawing>
-          <wp:inline distT="0" distB="0" distL="0" distR="0" wp14:anchorId="6825EFDE" wp14:editId="1270183A">
-            <wp:extent cx="2908300" cy="1847850"/>
-            <wp:effectExtent l="0" t="0" r="6350" b="0"/>
-            <wp:docPr id="403471561" name="Picture 3" descr="A black background with a black square&#10;&#10;AI-generated content may be incorrect."/>
-            <wp:cNvGraphicFramePr>
-              <a:graphicFrameLocks xmlns:a="http://schemas.openxmlformats.org/drawingml/2006/main" noChangeAspect="1"/>
-            </wp:cNvGraphicFramePr>
-            <a:graphic xmlns:a="http://schemas.openxmlformats.org/drawingml/2006/main">
-              <a:graphicData uri="http://schemas.openxmlformats.org/drawingml/2006/picture">
-                <pic:pic xmlns:pic="http://schemas.openxmlformats.org/drawingml/2006/picture">
-                  <pic:nvPicPr>
-                    <pic:cNvPr id="1028415082" name="Picture 3" descr="A black background with a black square&#10;&#10;AI-generated content may be incorrect."/>
-                    <pic:cNvPicPr>
-                      <a:picLocks noChangeAspect="1" noChangeArrowheads="1"/>
-                    </pic:cNvPicPr>
-                  </pic:nvPicPr>
-                  <pic:blipFill>
-                    <a:blip r:embed="rId13">
-                      <a:extLst>
-                        <a:ext uri="{28A0092B-C50C-407E-A947-70E740481C1C}">
-                          <a14:useLocalDpi xmlns:a14="http://schemas.microsoft.com/office/drawing/2010/main" val="0"/>
-                        </a:ext>
-                      </a:extLst>
-                    </a:blip>
-                    <a:srcRect/>
-                    <a:stretch>
-                      <a:fillRect/>
-                    </a:stretch>
-                  </pic:blipFill>
-                  <pic:spPr bwMode="auto">
-                    <a:xfrm>
-                      <a:off x="0" y="0"/>
-                      <a:ext cx="2908300" cy="1847850"/>
-                    </a:xfrm>
-                    <a:prstGeom prst="rect">
-                      <a:avLst/>
-                    </a:prstGeom>
-                    <a:noFill/>
-                    <a:ln>
+      <w:del w:id="313" w:author="Smith Vidaurre, Grace" w:date="2025-05-27T21:14:00Z" w16du:dateUtc="2025-05-28T01:14:00Z">
+        <w:r>
+          <w:rPr>
+            <w:noProof/>
+          </w:rPr>
+          <w:drawing>
+            <wp:inline distT="0" distB="0" distL="0" distR="0" wp14:anchorId="6825EFDE" wp14:editId="5FA73F77">
+              <wp:extent cx="2908300" cy="1847850"/>
+              <wp:effectExtent l="0" t="0" r="6350" b="0"/>
+              <wp:docPr id="403471561" name="Picture 3" descr="A black background with a black square&#10;&#10;AI-generated content may be incorrect."/>
+              <wp:cNvGraphicFramePr>
+                <a:graphicFrameLocks xmlns:a="http://schemas.openxmlformats.org/drawingml/2006/main" noChangeAspect="1"/>
+              </wp:cNvGraphicFramePr>
+              <a:graphic xmlns:a="http://schemas.openxmlformats.org/drawingml/2006/main">
+                <a:graphicData uri="http://schemas.openxmlformats.org/drawingml/2006/picture">
+                  <pic:pic xmlns:pic="http://schemas.openxmlformats.org/drawingml/2006/picture">
+                    <pic:nvPicPr>
+                      <pic:cNvPr id="1028415082" name="Picture 3" descr="A black background with a black square&#10;&#10;AI-generated content may be incorrect."/>
+                      <pic:cNvPicPr>
+                        <a:picLocks noChangeAspect="1" noChangeArrowheads="1"/>
+                      </pic:cNvPicPr>
+                    </pic:nvPicPr>
+                    <pic:blipFill>
+                      <a:blip r:embed="rId13">
+                        <a:extLst>
+                          <a:ext uri="{28A0092B-C50C-407E-A947-70E740481C1C}">
+                            <a14:useLocalDpi xmlns:a14="http://schemas.microsoft.com/office/drawing/2010/main" val="0"/>
+                          </a:ext>
+                        </a:extLst>
+                      </a:blip>
+                      <a:srcRect/>
+                      <a:stretch>
+                        <a:fillRect/>
+                      </a:stretch>
+                    </pic:blipFill>
+                    <pic:spPr bwMode="auto">
+                      <a:xfrm>
+                        <a:off x="0" y="0"/>
+                        <a:ext cx="2908300" cy="1847850"/>
+                      </a:xfrm>
+                      <a:prstGeom prst="rect">
+                        <a:avLst/>
+                      </a:prstGeom>
                       <a:noFill/>
-                    </a:ln>
-                  </pic:spPr>
-                </pic:pic>
-              </a:graphicData>
-            </a:graphic>
-          </wp:inline>
-        </w:drawing>
-      </w:r>
+                      <a:ln>
+                        <a:noFill/>
+                      </a:ln>
+                    </pic:spPr>
+                  </pic:pic>
+                </a:graphicData>
+              </a:graphic>
+            </wp:inline>
+          </w:drawing>
+        </w:r>
+      </w:del>
     </w:p>
     <w:p>
       <w:pPr>
@@ -6061,8 +6062,8 @@
           <w:szCs w:val="22"/>
         </w:rPr>
       </w:pPr>
-      <w:commentRangeStart w:id="313"/>
       <w:commentRangeStart w:id="314"/>
+      <w:commentRangeStart w:id="315"/>
       <w:r>
         <w:rPr>
           <w:rFonts w:ascii="Arial" w:hAnsi="Arial" w:cs="Arial"/>
@@ -6073,19 +6074,19 @@
         </w:rPr>
         <w:t xml:space="preserve">Figure </w:t>
       </w:r>
-      <w:commentRangeEnd w:id="313"/>
+      <w:commentRangeEnd w:id="314"/>
       <w:r>
         <w:rPr>
           <w:rStyle w:val="CommentReference"/>
         </w:rPr>
-        <w:commentReference w:id="313"/>
-      </w:r>
-      <w:commentRangeEnd w:id="314"/>
+        <w:commentReference w:id="314"/>
+      </w:r>
+      <w:commentRangeEnd w:id="315"/>
       <w:r>
         <w:rPr>
           <w:rStyle w:val="CommentReference"/>
         </w:rPr>
-        <w:commentReference w:id="314"/>
+        <w:commentReference w:id="315"/>
       </w:r>
       <w:r>
         <w:rPr>
@@ -6105,7 +6106,7 @@
         </w:rPr>
         <w:t xml:space="preserve">Example character string </w:t>
       </w:r>
-      <w:del w:id="315" w:author="Smith Vidaurre, Grace" w:date="2025-05-22T14:50:00Z" w16du:dateUtc="2025-05-22T18:50:00Z">
+      <w:del w:id="316" w:author="Smith Vidaurre, Grace" w:date="2025-05-22T14:50:00Z" w16du:dateUtc="2025-05-22T18:50:00Z">
         <w:r>
           <w:rPr>
             <w:rFonts w:ascii="Arial" w:hAnsi="Arial" w:cs="Arial"/>
@@ -6115,7 +6116,7 @@
           <w:delText>created in paRsynth’s generate strings code</w:delText>
         </w:r>
       </w:del>
-      <w:ins w:id="316" w:author="Smith Vidaurre, Grace" w:date="2025-05-22T14:50:00Z" w16du:dateUtc="2025-05-22T18:50:00Z">
+      <w:ins w:id="317" w:author="Smith Vidaurre, Grace" w:date="2025-05-22T14:50:00Z" w16du:dateUtc="2025-05-22T18:50:00Z">
         <w:r>
           <w:rPr>
             <w:rFonts w:ascii="Arial" w:hAnsi="Arial" w:cs="Arial"/>
@@ -6125,7 +6126,7 @@
           <w:t>generated using our pipelin</w:t>
         </w:r>
       </w:ins>
-      <w:ins w:id="317" w:author="Smith Vidaurre, Grace" w:date="2025-05-22T14:51:00Z" w16du:dateUtc="2025-05-22T18:51:00Z">
+      <w:ins w:id="318" w:author="Smith Vidaurre, Grace" w:date="2025-05-22T14:51:00Z" w16du:dateUtc="2025-05-22T18:51:00Z">
         <w:r>
           <w:rPr>
             <w:rFonts w:ascii="Arial" w:hAnsi="Arial" w:cs="Arial"/>
@@ -6141,26 +6142,43 @@
           <w:sz w:val="22"/>
           <w:szCs w:val="22"/>
         </w:rPr>
-        <w:t>. The string consists of (1) a global head</w:t>
-      </w:r>
-      <w:ins w:id="318" w:author="Smith Vidaurre, Grace" w:date="2025-05-22T14:51:00Z" w16du:dateUtc="2025-05-22T18:51:00Z">
+        <w:t xml:space="preserve">. The string consists of (1) a global head, (2) </w:t>
+      </w:r>
+      <w:ins w:id="319" w:author="Smith Vidaurre, Grace" w:date="2025-05-22T15:15:00Z" w16du:dateUtc="2025-05-22T19:15:00Z">
         <w:r>
           <w:rPr>
             <w:rFonts w:ascii="Arial" w:hAnsi="Arial" w:cs="Arial"/>
             <w:sz w:val="22"/>
             <w:szCs w:val="22"/>
           </w:rPr>
-          <w:t xml:space="preserve"> shared across </w:t>
+          <w:t xml:space="preserve">first half of </w:t>
         </w:r>
       </w:ins>
-      <w:ins w:id="319" w:author="Smith Vidaurre, Grace" w:date="2025-05-22T14:52:00Z" w16du:dateUtc="2025-05-22T18:52:00Z">
+      <w:r>
+        <w:rPr>
+          <w:rFonts w:ascii="Arial" w:hAnsi="Arial" w:cs="Arial"/>
+          <w:sz w:val="22"/>
+          <w:szCs w:val="22"/>
+        </w:rPr>
+        <w:t xml:space="preserve">group information, (3) individual information, (4) random variation, </w:t>
+      </w:r>
+      <w:r>
+        <w:rPr>
+          <w:rFonts w:ascii="Arial" w:hAnsi="Arial" w:cs="Arial"/>
+          <w:sz w:val="22"/>
+          <w:szCs w:val="22"/>
+        </w:rPr>
+        <w:lastRenderedPageBreak/>
+        <w:t xml:space="preserve">(5) </w:t>
+      </w:r>
+      <w:ins w:id="320" w:author="Smith Vidaurre, Grace" w:date="2025-05-27T21:07:00Z" w16du:dateUtc="2025-05-28T01:07:00Z">
         <w:r>
           <w:rPr>
             <w:rFonts w:ascii="Arial" w:hAnsi="Arial" w:cs="Arial"/>
             <w:sz w:val="22"/>
             <w:szCs w:val="22"/>
           </w:rPr>
-          <w:t>calls in the dataset</w:t>
+          <w:t xml:space="preserve">second half of </w:t>
         </w:r>
       </w:ins>
       <w:r>
@@ -6169,16 +6187,36 @@
           <w:sz w:val="22"/>
           <w:szCs w:val="22"/>
         </w:rPr>
-        <w:t xml:space="preserve">, (2) </w:t>
-      </w:r>
-      <w:ins w:id="320" w:author="Smith Vidaurre, Grace" w:date="2025-05-22T15:15:00Z" w16du:dateUtc="2025-05-22T19:15:00Z">
+        <w:t>group information, and (6) a global tail</w:t>
+      </w:r>
+      <w:ins w:id="321" w:author="Smith Vidaurre, Grace" w:date="2025-05-27T21:12:00Z" w16du:dateUtc="2025-05-28T01:12:00Z">
         <w:r>
           <w:rPr>
             <w:rFonts w:ascii="Arial" w:hAnsi="Arial" w:cs="Arial"/>
             <w:sz w:val="22"/>
             <w:szCs w:val="22"/>
           </w:rPr>
-          <w:t xml:space="preserve">first half of </w:t>
+          <w:t xml:space="preserve">. The global string </w:t>
+        </w:r>
+      </w:ins>
+      <w:ins w:id="322" w:author="Smith Vidaurre, Grace" w:date="2025-05-27T21:13:00Z" w16du:dateUtc="2025-05-28T01:13:00Z">
+        <w:r>
+          <w:rPr>
+            <w:rFonts w:ascii="Arial" w:hAnsi="Arial" w:cs="Arial"/>
+            <w:sz w:val="22"/>
+            <w:szCs w:val="22"/>
+          </w:rPr>
+          <w:t xml:space="preserve">sections are </w:t>
+        </w:r>
+      </w:ins>
+      <w:ins w:id="323" w:author="Smith Vidaurre, Grace" w:date="2025-05-22T14:52:00Z" w16du:dateUtc="2025-05-22T18:52:00Z">
+        <w:r>
+          <w:rPr>
+            <w:rFonts w:ascii="Arial" w:hAnsi="Arial" w:cs="Arial"/>
+            <w:sz w:val="22"/>
+            <w:szCs w:val="22"/>
+          </w:rPr>
+          <w:t>shared across calls in the dataset</w:t>
         </w:r>
       </w:ins>
       <w:r>
@@ -6187,869 +6225,832 @@
           <w:sz w:val="22"/>
           <w:szCs w:val="22"/>
         </w:rPr>
-        <w:t xml:space="preserve">group information, (3) individual information, (4) random variation, (5) </w:t>
-      </w:r>
-      <w:ins w:id="321" w:author="Smith Vidaurre, Grace" w:date="2025-05-27T21:07:00Z" w16du:dateUtc="2025-05-28T01:07:00Z">
-        <w:r>
-          <w:rPr>
-            <w:rFonts w:ascii="Arial" w:hAnsi="Arial" w:cs="Arial"/>
-            <w:sz w:val="22"/>
-            <w:szCs w:val="22"/>
-          </w:rPr>
-          <w:t xml:space="preserve">second half of </w:t>
+        <w:t>.</w:t>
+      </w:r>
+    </w:p>
+    <w:p>
+      <w:pPr>
+        <w:spacing w:line="480" w:lineRule="auto"/>
+        <w:ind w:firstLine="720"/>
+        <w:rPr>
+          <w:ins w:id="324" w:author="Smith Vidaurre, Grace" w:date="2025-05-22T14:44:00Z" w16du:dateUtc="2025-05-22T18:44:00Z"/>
+          <w:rFonts w:ascii="Arial" w:hAnsi="Arial" w:cs="Arial"/>
+        </w:rPr>
+      </w:pPr>
+    </w:p>
+    <w:p>
+      <w:pPr>
+        <w:spacing w:line="480" w:lineRule="auto"/>
+        <w:ind w:firstLine="720"/>
+        <w:rPr>
+          <w:ins w:id="325" w:author="Smith Vidaurre, Grace" w:date="2025-05-22T14:44:00Z" w16du:dateUtc="2025-05-22T18:44:00Z"/>
+          <w:rFonts w:ascii="Arial" w:hAnsi="Arial" w:cs="Arial"/>
+        </w:rPr>
+      </w:pPr>
+      <w:ins w:id="326" w:author="Smith Vidaurre, Grace" w:date="2025-05-22T14:44:00Z" w16du:dateUtc="2025-05-22T18:44:00Z">
+        <w:r>
+          <w:rPr>
+            <w:rFonts w:ascii="Arial" w:hAnsi="Arial" w:cs="Arial"/>
+          </w:rPr>
+          <w:t>To validate our pipeline, we</w:t>
         </w:r>
       </w:ins>
-      <w:r>
+    </w:p>
+    <w:p>
+      <w:pPr>
+        <w:spacing w:line="480" w:lineRule="auto"/>
+        <w:rPr>
+          <w:ins w:id="327" w:author="Smith Vidaurre, Grace" w:date="2025-05-22T14:44:00Z" w16du:dateUtc="2025-05-22T18:44:00Z"/>
+          <w:rFonts w:ascii="Arial" w:hAnsi="Arial" w:cs="Arial"/>
+        </w:rPr>
+      </w:pPr>
+      <w:ins w:id="328" w:author="Smith Vidaurre, Grace" w:date="2025-05-22T14:44:00Z" w16du:dateUtc="2025-05-22T18:44:00Z">
+        <w:r>
+          <w:rPr>
+            <w:rFonts w:ascii="Arial" w:hAnsi="Arial" w:cs="Arial"/>
+          </w:rPr>
+          <w:tab/>
+        </w:r>
+      </w:ins>
+    </w:p>
+    <w:p>
+      <w:pPr>
+        <w:spacing w:line="480" w:lineRule="auto"/>
+        <w:rPr>
+          <w:ins w:id="329" w:author="Smith Vidaurre, Grace" w:date="2025-05-22T14:44:00Z" w16du:dateUtc="2025-05-22T18:44:00Z"/>
+          <w:rFonts w:ascii="Arial" w:hAnsi="Arial" w:cs="Arial"/>
+        </w:rPr>
+      </w:pPr>
+      <w:ins w:id="330" w:author="Smith Vidaurre, Grace" w:date="2025-05-22T14:44:00Z" w16du:dateUtc="2025-05-22T18:44:00Z">
+        <w:r>
+          <w:rPr>
+            <w:rFonts w:ascii="Arial" w:hAnsi="Arial" w:cs="Arial"/>
+          </w:rPr>
+          <w:t>Here, we endeavored to create datasets of synthetic vocalizations with known information encoded at multiple social levels to (</w:t>
+        </w:r>
+        <w:commentRangeStart w:id="331"/>
+        <w:r>
+          <w:rPr>
+            <w:rFonts w:ascii="Arial" w:hAnsi="Arial" w:cs="Arial"/>
+          </w:rPr>
+          <w:t>1) develop a pipeline of synthetic signal creation that allows for the manipulation of various social and information encoding conditions and (2) assess the accuracy of two traditional bioacoustics pipelines for detecting information across different social levels</w:t>
+        </w:r>
+        <w:commentRangeEnd w:id="331"/>
+        <w:r>
+          <w:rPr>
+            <w:rStyle w:val="CommentReference"/>
+          </w:rPr>
+          <w:commentReference w:id="331"/>
+        </w:r>
+        <w:r>
+          <w:rPr>
+            <w:rFonts w:ascii="Arial" w:hAnsi="Arial" w:cs="Arial"/>
+          </w:rPr>
+          <w:t xml:space="preserve">. </w:t>
+        </w:r>
+      </w:ins>
+    </w:p>
+    <w:p>
+      <w:pPr>
+        <w:spacing w:line="480" w:lineRule="auto"/>
+        <w:ind w:firstLine="720"/>
+        <w:rPr>
+          <w:ins w:id="332" w:author="Smith Vidaurre, Grace" w:date="2025-05-22T14:44:00Z" w16du:dateUtc="2025-05-22T18:44:00Z"/>
+          <w:rFonts w:ascii="Arial" w:hAnsi="Arial" w:cs="Arial"/>
+        </w:rPr>
+      </w:pPr>
+    </w:p>
+    <w:p>
+      <w:pPr>
+        <w:spacing w:line="480" w:lineRule="auto"/>
+        <w:ind w:firstLine="720"/>
+        <w:rPr>
+          <w:ins w:id="333" w:author="Smith Vidaurre, Grace" w:date="2025-05-22T14:44:00Z" w16du:dateUtc="2025-05-22T18:44:00Z"/>
+          <w:rFonts w:ascii="Arial" w:hAnsi="Arial" w:cs="Arial"/>
+        </w:rPr>
+      </w:pPr>
+    </w:p>
+    <w:p>
+      <w:pPr>
+        <w:spacing w:line="480" w:lineRule="auto"/>
+        <w:ind w:firstLine="720"/>
+        <w:rPr>
+          <w:ins w:id="334" w:author="Smith Vidaurre, Grace" w:date="2025-05-22T14:44:00Z" w16du:dateUtc="2025-05-22T18:44:00Z"/>
+          <w:rFonts w:ascii="Arial" w:hAnsi="Arial" w:cs="Arial"/>
+        </w:rPr>
+      </w:pPr>
+    </w:p>
+    <w:p>
+      <w:pPr>
+        <w:spacing w:line="480" w:lineRule="auto"/>
+        <w:ind w:firstLine="720"/>
+        <w:rPr>
+          <w:rFonts w:ascii="Arial" w:hAnsi="Arial" w:cs="Arial"/>
+        </w:rPr>
+      </w:pPr>
+    </w:p>
+    <w:p>
+      <w:pPr>
+        <w:spacing w:line="480" w:lineRule="auto"/>
+        <w:ind w:firstLine="720"/>
+        <w:rPr>
+          <w:rFonts w:ascii="Arial" w:hAnsi="Arial" w:cs="Arial"/>
+        </w:rPr>
+      </w:pPr>
+      <w:r>
+        <w:rPr>
+          <w:rFonts w:ascii="Arial" w:hAnsi="Arial" w:cs="Arial"/>
+        </w:rPr>
+        <w:t>To validate this new methodology, and to test the flexibility of using synthetic vocalizations to study learned information encoding, w</w:t>
+      </w:r>
+      <w:r>
+        <w:rPr>
+          <w:rFonts w:ascii="Arial" w:hAnsi="Arial" w:cs="Arial"/>
+        </w:rPr>
+        <w:t xml:space="preserve">e performed </w:t>
+      </w:r>
+      <w:r>
+        <w:rPr>
+          <w:rFonts w:ascii="Arial" w:hAnsi="Arial" w:cs="Arial"/>
+        </w:rPr>
+        <w:t xml:space="preserve">computational </w:t>
+      </w:r>
+      <w:r>
+        <w:rPr>
+          <w:rFonts w:ascii="Arial" w:hAnsi="Arial" w:cs="Arial"/>
+        </w:rPr>
+        <w:t xml:space="preserve">experiments to assess how well a Gaussian mixture modeling clustering pipeline that relied on spectrographic cross-correlation, a traditional bioacoustics tool to quantify acoustic similarity, </w:t>
+      </w:r>
+      <w:r>
+        <w:rPr>
+          <w:rFonts w:ascii="Arial" w:hAnsi="Arial" w:cs="Arial"/>
+        </w:rPr>
+        <w:t xml:space="preserve">or the Levenstein or edit distance, </w:t>
+      </w:r>
+      <w:r>
+        <w:rPr>
+          <w:rFonts w:ascii="Arial" w:hAnsi="Arial" w:cs="Arial"/>
+        </w:rPr>
+        <w:t>could detect varying amounts of identity information encoded over two social levels</w:t>
+      </w:r>
+      <w:r>
+        <w:rPr>
+          <w:rFonts w:ascii="Arial" w:hAnsi="Arial" w:cs="Arial"/>
+        </w:rPr>
+        <w:t xml:space="preserve"> (group</w:t>
+      </w:r>
+      <w:r>
+        <w:rPr>
+          <w:rFonts w:ascii="Arial" w:hAnsi="Arial" w:cs="Arial"/>
+        </w:rPr>
+        <w:t>-specific</w:t>
+      </w:r>
+      <w:r>
+        <w:rPr>
+          <w:rFonts w:ascii="Arial" w:hAnsi="Arial" w:cs="Arial"/>
+        </w:rPr>
+        <w:t xml:space="preserve"> and individual </w:t>
+      </w:r>
+      <w:r>
+        <w:rPr>
+          <w:rFonts w:ascii="Arial" w:hAnsi="Arial" w:cs="Arial"/>
+        </w:rPr>
+        <w:t xml:space="preserve">identity </w:t>
+      </w:r>
+      <w:r>
+        <w:rPr>
+          <w:rFonts w:ascii="Arial" w:hAnsi="Arial" w:cs="Arial"/>
+        </w:rPr>
+        <w:t>information)</w:t>
+      </w:r>
+      <w:r>
+        <w:rPr>
+          <w:rFonts w:ascii="Arial" w:hAnsi="Arial" w:cs="Arial"/>
+        </w:rPr>
+        <w:t>,</w:t>
+      </w:r>
+      <w:r>
+        <w:rPr>
+          <w:rFonts w:ascii="Arial" w:hAnsi="Arial" w:cs="Arial"/>
+        </w:rPr>
+        <w:t xml:space="preserve"> as well as over social conditions expected to influence the uniqueness of identity information.</w:t>
+      </w:r>
+      <w:r>
+        <w:rPr>
+          <w:rFonts w:ascii="Arial" w:hAnsi="Arial" w:cs="Arial"/>
+        </w:rPr>
+        <w:t xml:space="preserve"> </w:t>
+      </w:r>
+      <w:r>
+        <w:rPr>
+          <w:rFonts w:ascii="Arial" w:hAnsi="Arial" w:cs="Arial"/>
+        </w:rPr>
+        <w:t>To</w:t>
+      </w:r>
+      <w:r>
+        <w:rPr>
+          <w:rFonts w:ascii="Arial" w:hAnsi="Arial" w:cs="Arial"/>
+        </w:rPr>
+        <w:t xml:space="preserve"> assess how well </w:t>
+      </w:r>
+      <w:r>
+        <w:rPr>
+          <w:rFonts w:ascii="Arial" w:hAnsi="Arial" w:cs="Arial"/>
+        </w:rPr>
+        <w:t xml:space="preserve">spectrographic cross-correlation or the edit distance identified </w:t>
+      </w:r>
+      <w:r>
+        <w:rPr>
+          <w:rFonts w:ascii="Arial" w:hAnsi="Arial" w:cs="Arial"/>
+        </w:rPr>
+        <w:t xml:space="preserve">the </w:t>
+      </w:r>
+      <w:r>
+        <w:rPr>
+          <w:rFonts w:ascii="Arial" w:hAnsi="Arial" w:cs="Arial"/>
+        </w:rPr>
+        <w:t xml:space="preserve">encoded </w:t>
+      </w:r>
+      <w:r>
+        <w:rPr>
+          <w:rFonts w:ascii="Arial" w:hAnsi="Arial" w:cs="Arial"/>
+        </w:rPr>
+        <w:t>identity information</w:t>
+      </w:r>
+      <w:r>
+        <w:rPr>
+          <w:rFonts w:ascii="Arial" w:hAnsi="Arial" w:cs="Arial"/>
+        </w:rPr>
+        <w:t>, w</w:t>
+      </w:r>
+      <w:r>
+        <w:rPr>
+          <w:rFonts w:ascii="Arial" w:hAnsi="Arial" w:cs="Arial"/>
+        </w:rPr>
+        <w:t>e</w:t>
+      </w:r>
+      <w:r>
+        <w:rPr>
+          <w:rFonts w:ascii="Arial" w:hAnsi="Arial" w:cs="Arial"/>
+        </w:rPr>
+        <w:t xml:space="preserve"> </w:t>
+      </w:r>
+      <w:r>
+        <w:rPr>
+          <w:rFonts w:ascii="Arial" w:hAnsi="Arial" w:cs="Arial"/>
+        </w:rPr>
+        <w:t>calculated Cliff’s d</w:t>
+      </w:r>
+      <w:r>
+        <w:rPr>
+          <w:rFonts w:ascii="Arial" w:hAnsi="Arial" w:cs="Arial"/>
+        </w:rPr>
+        <w:t>elta</w:t>
+      </w:r>
+      <w:r>
+        <w:rPr>
+          <w:rFonts w:ascii="Arial" w:hAnsi="Arial" w:cs="Arial"/>
+        </w:rPr>
+        <w:t xml:space="preserve"> as the effect size between</w:t>
+      </w:r>
+      <w:r>
+        <w:rPr>
+          <w:rFonts w:ascii="Arial" w:hAnsi="Arial" w:cs="Arial"/>
+        </w:rPr>
+        <w:t xml:space="preserve"> </w:t>
+      </w:r>
+      <w:r>
+        <w:rPr>
+          <w:rFonts w:ascii="Arial" w:hAnsi="Arial" w:cs="Arial"/>
+        </w:rPr>
+        <w:t xml:space="preserve">clustering accuracies at each social level. </w:t>
+      </w:r>
+      <w:r>
+        <w:rPr>
+          <w:rFonts w:ascii="Arial" w:hAnsi="Arial" w:cs="Arial"/>
+        </w:rPr>
+        <w:t xml:space="preserve">For each spectrographic </w:t>
+      </w:r>
+      <w:r>
+        <w:rPr>
+          <w:rFonts w:ascii="Arial" w:hAnsi="Arial" w:cs="Arial"/>
+        </w:rPr>
+        <w:lastRenderedPageBreak/>
+        <w:t>cross-correlation and the edit distance, w</w:t>
+      </w:r>
+      <w:r>
+        <w:rPr>
+          <w:rFonts w:ascii="Arial" w:hAnsi="Arial" w:cs="Arial"/>
+        </w:rPr>
+        <w:t xml:space="preserve">e expected to identify larger effect sizes </w:t>
+      </w:r>
+      <w:r>
+        <w:rPr>
+          <w:rFonts w:ascii="Arial" w:hAnsi="Arial" w:cs="Arial"/>
+        </w:rPr>
+        <w:t xml:space="preserve">when information encoding was higher for one social level than the other, and </w:t>
+      </w:r>
+      <w:r>
+        <w:rPr>
+          <w:rFonts w:ascii="Arial" w:hAnsi="Arial" w:cs="Arial"/>
+        </w:rPr>
+        <w:t xml:space="preserve">when signals were compared amongst fewer individuals or groups (e.g. </w:t>
+      </w:r>
+      <w:r>
+        <w:rPr>
+          <w:rFonts w:ascii="Arial" w:hAnsi="Arial" w:cs="Arial"/>
+        </w:rPr>
+        <w:t>social conditions</w:t>
+      </w:r>
+      <w:r>
+        <w:rPr>
+          <w:rFonts w:ascii="Arial" w:hAnsi="Arial" w:cs="Arial"/>
+        </w:rPr>
+        <w:t xml:space="preserve"> posed fewer </w:t>
+      </w:r>
+      <w:r>
+        <w:rPr>
+          <w:rFonts w:ascii="Arial" w:hAnsi="Arial" w:cs="Arial"/>
+        </w:rPr>
+        <w:t xml:space="preserve">limitations on the uniqueness </w:t>
+      </w:r>
+      <w:r>
+        <w:rPr>
+          <w:rFonts w:ascii="Arial" w:hAnsi="Arial" w:cs="Arial"/>
+        </w:rPr>
+        <w:t>of identity information at either social level)</w:t>
+      </w:r>
+      <w:r>
+        <w:rPr>
+          <w:rFonts w:ascii="Arial" w:hAnsi="Arial" w:cs="Arial"/>
+        </w:rPr>
+        <w:t xml:space="preserve">. </w:t>
+      </w:r>
+      <w:commentRangeStart w:id="335"/>
+      <w:r>
+        <w:rPr>
+          <w:rFonts w:ascii="Arial" w:hAnsi="Arial" w:cs="Arial"/>
+        </w:rPr>
+        <w:t>We expected to identify clustering accuracies that were generally lower for spectrographic cross-correlation than the edit distance, since spectrographic cross-correlation was performed on strings transformed into synthetic audio files, which may have led to losses of the original information or added noise</w:t>
+      </w:r>
+      <w:commentRangeEnd w:id="335"/>
+      <w:r>
+        <w:rPr>
+          <w:rStyle w:val="CommentReference"/>
+        </w:rPr>
+        <w:commentReference w:id="335"/>
+      </w:r>
+      <w:r>
+        <w:rPr>
+          <w:rFonts w:ascii="Arial" w:hAnsi="Arial" w:cs="Arial"/>
+        </w:rPr>
+        <w:t>.</w:t>
+      </w:r>
+      <w:r>
+        <w:rPr>
+          <w:rFonts w:ascii="Arial" w:hAnsi="Arial" w:cs="Arial"/>
+        </w:rPr>
+        <w:t xml:space="preserve"> However, we generally expected to identify medium or small effect sizes </w:t>
+      </w:r>
+      <w:r>
+        <w:rPr>
+          <w:rFonts w:ascii="Arial" w:hAnsi="Arial" w:cs="Arial"/>
+        </w:rPr>
+        <w:t xml:space="preserve">for these differences in information detection by each method </w:t>
+      </w:r>
+      <w:r>
+        <w:rPr>
+          <w:rFonts w:ascii="Arial" w:hAnsi="Arial" w:cs="Arial"/>
+        </w:rPr>
+        <w:t xml:space="preserve">that did not outweigh the effect sizes calculated for clustering accuracy </w:t>
+      </w:r>
+      <w:r>
+        <w:rPr>
+          <w:rFonts w:ascii="Arial" w:hAnsi="Arial" w:cs="Arial"/>
+        </w:rPr>
+        <w:t>between different forms of identity information for the same measurement (spectrographic cross-correlation or the edit distance).</w:t>
+      </w:r>
+    </w:p>
+    <w:p>
+      <w:pPr>
+        <w:spacing w:line="480" w:lineRule="auto"/>
+        <w:rPr>
+          <w:rFonts w:ascii="Arial" w:hAnsi="Arial" w:cs="Arial"/>
+        </w:rPr>
+      </w:pPr>
+    </w:p>
+    <w:p>
+      <w:pPr>
+        <w:spacing w:line="480" w:lineRule="auto"/>
+        <w:rPr>
+          <w:rFonts w:ascii="Arial" w:hAnsi="Arial" w:cs="Arial"/>
+          <w:b/>
+          <w:bCs/>
+        </w:rPr>
+      </w:pPr>
+      <w:commentRangeStart w:id="336"/>
+      <w:r>
+        <w:rPr>
+          <w:rFonts w:ascii="Arial" w:hAnsi="Arial" w:cs="Arial"/>
+          <w:b/>
+          <w:bCs/>
+        </w:rPr>
+        <w:t>Results</w:t>
+      </w:r>
+      <w:commentRangeEnd w:id="336"/>
+      <w:r>
+        <w:rPr>
+          <w:rStyle w:val="CommentReference"/>
+        </w:rPr>
+        <w:commentReference w:id="336"/>
+      </w:r>
+      <w:r>
+        <w:rPr>
+          <w:rFonts w:ascii="Arial" w:hAnsi="Arial" w:cs="Arial"/>
+          <w:b/>
+          <w:bCs/>
+        </w:rPr>
+        <w:t xml:space="preserve"> and </w:t>
+      </w:r>
+      <w:commentRangeStart w:id="337"/>
+      <w:r>
+        <w:rPr>
+          <w:rFonts w:ascii="Arial" w:hAnsi="Arial" w:cs="Arial"/>
+          <w:b/>
+          <w:bCs/>
+        </w:rPr>
+        <w:t>Discussion</w:t>
+      </w:r>
+      <w:commentRangeEnd w:id="337"/>
+      <w:r>
+        <w:rPr>
+          <w:rStyle w:val="CommentReference"/>
+        </w:rPr>
+        <w:commentReference w:id="337"/>
+      </w:r>
+      <w:r>
+        <w:rPr>
+          <w:rFonts w:ascii="Arial" w:hAnsi="Arial" w:cs="Arial"/>
+          <w:b/>
+          <w:bCs/>
+        </w:rPr>
+        <w:t>:</w:t>
+      </w:r>
+    </w:p>
+    <w:p>
+      <w:pPr>
+        <w:spacing w:line="480" w:lineRule="auto"/>
+        <w:rPr>
+          <w:rFonts w:ascii="Arial" w:hAnsi="Arial" w:cs="Arial"/>
+          <w:i/>
+          <w:iCs/>
+        </w:rPr>
+      </w:pPr>
+      <w:r>
+        <w:rPr>
+          <w:rFonts w:ascii="Arial" w:hAnsi="Arial" w:cs="Arial"/>
+          <w:i/>
+          <w:iCs/>
+        </w:rPr>
+        <w:t xml:space="preserve">Visualizing </w:t>
+      </w:r>
+      <w:r>
+        <w:rPr>
+          <w:rFonts w:ascii="Arial" w:hAnsi="Arial" w:cs="Arial"/>
+          <w:i/>
+          <w:iCs/>
+        </w:rPr>
+        <w:t>Synthetic Group and Information Datasets</w:t>
+      </w:r>
+    </w:p>
+    <w:p>
+      <w:pPr>
+        <w:spacing w:line="480" w:lineRule="auto"/>
+        <w:ind w:firstLine="720"/>
+        <w:rPr>
+          <w:rFonts w:ascii="Arial" w:hAnsi="Arial" w:cs="Arial"/>
+        </w:rPr>
+      </w:pPr>
+      <w:r>
+        <w:rPr>
+          <w:rFonts w:ascii="Arial" w:hAnsi="Arial" w:cs="Arial"/>
+        </w:rPr>
+        <w:t xml:space="preserve">We created two synthetic data sets: one that created </w:t>
+      </w:r>
+      <w:commentRangeStart w:id="338"/>
+      <w:commentRangeStart w:id="339"/>
+      <w:r>
+        <w:rPr>
+          <w:rFonts w:ascii="Arial" w:hAnsi="Arial" w:cs="Arial"/>
+        </w:rPr>
+        <w:t xml:space="preserve">vocalizations </w:t>
+      </w:r>
+      <w:commentRangeEnd w:id="338"/>
+      <w:r>
+        <w:rPr>
+          <w:rStyle w:val="CommentReference"/>
+        </w:rPr>
+        <w:commentReference w:id="338"/>
+      </w:r>
+      <w:commentRangeEnd w:id="339"/>
+      <w:r>
+        <w:rPr>
+          <w:rStyle w:val="CommentReference"/>
+        </w:rPr>
+        <w:commentReference w:id="339"/>
+      </w:r>
+      <w:r>
+        <w:rPr>
+          <w:rFonts w:ascii="Arial" w:hAnsi="Arial" w:cs="Arial"/>
+        </w:rPr>
+        <w:t xml:space="preserve">with more group </w:t>
+      </w:r>
+      <w:r>
+        <w:rPr>
+          <w:rFonts w:ascii="Arial" w:hAnsi="Arial" w:cs="Arial"/>
+        </w:rPr>
+        <w:t>specific</w:t>
+      </w:r>
+      <w:r>
+        <w:rPr>
+          <w:rFonts w:ascii="Arial" w:hAnsi="Arial" w:cs="Arial"/>
+        </w:rPr>
+        <w:t xml:space="preserve"> information than individual </w:t>
+      </w:r>
+      <w:r>
+        <w:rPr>
+          <w:rFonts w:ascii="Arial" w:hAnsi="Arial" w:cs="Arial"/>
+        </w:rPr>
+        <w:t xml:space="preserve">identity </w:t>
+      </w:r>
+      <w:r>
+        <w:rPr>
+          <w:rFonts w:ascii="Arial" w:hAnsi="Arial" w:cs="Arial"/>
+        </w:rPr>
+        <w:t xml:space="preserve">information encoded (henceforth the </w:t>
+      </w:r>
+      <w:r>
+        <w:rPr>
+          <w:rFonts w:ascii="Arial" w:hAnsi="Arial" w:cs="Arial"/>
+        </w:rPr>
+        <w:t>g</w:t>
+      </w:r>
+      <w:r>
+        <w:rPr>
+          <w:rFonts w:ascii="Arial" w:hAnsi="Arial" w:cs="Arial"/>
+        </w:rPr>
+        <w:t>roup</w:t>
+      </w:r>
+      <w:r>
+        <w:rPr>
+          <w:rFonts w:ascii="Arial" w:hAnsi="Arial" w:cs="Arial"/>
+        </w:rPr>
+        <w:t xml:space="preserve"> specific</w:t>
+      </w:r>
+      <w:r>
+        <w:rPr>
+          <w:rFonts w:ascii="Arial" w:hAnsi="Arial" w:cs="Arial"/>
+        </w:rPr>
+        <w:t xml:space="preserve"> dataset), and one that created </w:t>
+      </w:r>
+      <w:commentRangeStart w:id="340"/>
+      <w:r>
+        <w:rPr>
+          <w:rFonts w:ascii="Arial" w:hAnsi="Arial" w:cs="Arial"/>
+        </w:rPr>
+        <w:t xml:space="preserve">character strings </w:t>
+      </w:r>
+      <w:commentRangeEnd w:id="340"/>
+      <w:r>
+        <w:rPr>
+          <w:rStyle w:val="CommentReference"/>
+        </w:rPr>
+        <w:commentReference w:id="340"/>
+      </w:r>
+      <w:r>
+        <w:rPr>
+          <w:rFonts w:ascii="Arial" w:hAnsi="Arial" w:cs="Arial"/>
+        </w:rPr>
+        <w:t xml:space="preserve">with more individual </w:t>
+      </w:r>
+      <w:r>
+        <w:rPr>
+          <w:rFonts w:ascii="Arial" w:hAnsi="Arial" w:cs="Arial"/>
+        </w:rPr>
+        <w:t xml:space="preserve">identity </w:t>
+      </w:r>
+      <w:r>
+        <w:rPr>
+          <w:rFonts w:ascii="Arial" w:hAnsi="Arial" w:cs="Arial"/>
+        </w:rPr>
+        <w:t>information than group</w:t>
+      </w:r>
+      <w:r>
+        <w:rPr>
+          <w:rFonts w:ascii="Arial" w:hAnsi="Arial" w:cs="Arial"/>
+        </w:rPr>
+        <w:t xml:space="preserve"> specific </w:t>
+      </w:r>
+      <w:r>
+        <w:rPr>
+          <w:rFonts w:ascii="Arial" w:hAnsi="Arial" w:cs="Arial"/>
+        </w:rPr>
+        <w:t>information encoded (</w:t>
+      </w:r>
+      <w:r>
+        <w:rPr>
+          <w:rFonts w:ascii="Arial" w:hAnsi="Arial" w:cs="Arial"/>
+        </w:rPr>
+        <w:t>individual identity d</w:t>
+      </w:r>
+      <w:r>
+        <w:rPr>
+          <w:rFonts w:ascii="Arial" w:hAnsi="Arial" w:cs="Arial"/>
+        </w:rPr>
+        <w:t>ataset; henceforth the Individual dataset).</w:t>
+      </w:r>
+      <w:r>
+        <w:rPr>
+          <w:rFonts w:ascii="Arial" w:hAnsi="Arial" w:cs="Arial"/>
+        </w:rPr>
+        <w:t xml:space="preserve"> </w:t>
+      </w:r>
+      <w:r>
+        <w:rPr>
+          <w:rFonts w:ascii="Arial" w:hAnsi="Arial" w:cs="Arial"/>
+        </w:rPr>
+        <w:t>W</w:t>
+      </w:r>
+      <w:r>
+        <w:rPr>
+          <w:rFonts w:ascii="Arial" w:hAnsi="Arial" w:cs="Arial"/>
+        </w:rPr>
+        <w:t>e</w:t>
+      </w:r>
+      <w:r>
+        <w:rPr>
+          <w:rFonts w:ascii="Arial" w:hAnsi="Arial" w:cs="Arial"/>
+        </w:rPr>
+        <w:t xml:space="preserve"> then</w:t>
+      </w:r>
+      <w:r>
+        <w:rPr>
+          <w:rFonts w:ascii="Arial" w:hAnsi="Arial" w:cs="Arial"/>
+        </w:rPr>
+        <w:t xml:space="preserve"> created spectrographic lexicons and acoustic space plots to visualize </w:t>
+      </w:r>
+      <w:r>
+        <w:rPr>
+          <w:rFonts w:ascii="Arial" w:hAnsi="Arial" w:cs="Arial"/>
+        </w:rPr>
+        <w:t xml:space="preserve">a selected subset of </w:t>
+      </w:r>
+      <w:r>
+        <w:rPr>
+          <w:rFonts w:ascii="Arial" w:hAnsi="Arial" w:cs="Arial"/>
+        </w:rPr>
+        <w:t xml:space="preserve">the range of synthetic signals created and how they relate to each other in acoustic space </w:t>
+      </w:r>
+      <w:r>
+        <w:rPr>
+          <w:rFonts w:ascii="Arial" w:hAnsi="Arial" w:cs="Arial"/>
+        </w:rPr>
+        <w:t>when clustering back to the original individual or group</w:t>
+      </w:r>
+      <w:r>
+        <w:rPr>
+          <w:rFonts w:ascii="Arial" w:hAnsi="Arial" w:cs="Arial"/>
+        </w:rPr>
+        <w:t>.</w:t>
+      </w:r>
+    </w:p>
+    <w:p>
+      <w:pPr>
+        <w:spacing w:line="480" w:lineRule="auto"/>
+        <w:ind w:firstLine="720"/>
+        <w:rPr>
+          <w:rFonts w:ascii="Arial" w:hAnsi="Arial" w:cs="Arial"/>
+        </w:rPr>
+      </w:pPr>
+      <w:r>
+        <w:rPr>
+          <w:rFonts w:ascii="Arial" w:hAnsi="Arial" w:cs="Arial"/>
+        </w:rPr>
+        <w:lastRenderedPageBreak/>
+        <w:t>Synthetic vocalizations from the group specific dataset (figure 2) share more similarities within groups and are more different across groups, as seen by the lack of overlapping polygons in the group level acoustic space plots for SPCC and edit distance (figure 2</w:t>
+      </w:r>
+      <w:r>
+        <w:rPr>
+          <w:rFonts w:ascii="Arial" w:hAnsi="Arial" w:cs="Arial"/>
+        </w:rPr>
+        <w:t>B</w:t>
+      </w:r>
+      <w:r>
+        <w:rPr>
+          <w:rFonts w:ascii="Arial" w:hAnsi="Arial" w:cs="Arial"/>
+        </w:rPr>
+        <w:t xml:space="preserve"> and 2</w:t>
+      </w:r>
+      <w:r>
+        <w:rPr>
+          <w:rFonts w:ascii="Arial" w:hAnsi="Arial" w:cs="Arial"/>
+        </w:rPr>
+        <w:t>C</w:t>
+      </w:r>
+      <w:r>
+        <w:rPr>
+          <w:rFonts w:ascii="Arial" w:hAnsi="Arial" w:cs="Arial"/>
+        </w:rPr>
+        <w:t>). Synthetic vocalizations in the individual identity dataset contain more variation within groups, but strong individual signatures within individual (figure 3), as see</w:t>
+      </w:r>
+      <w:r>
+        <w:rPr>
+          <w:rFonts w:ascii="Arial" w:hAnsi="Arial" w:cs="Arial"/>
+        </w:rPr>
+        <w:t>n by the non-overlapping individual polygons in the acoustic space plots for SPCC and edit distance (figure 3B and 3C). TKTK sentence about viewing all polygons in supplemental materials</w:t>
+      </w:r>
+    </w:p>
+    <w:p>
+      <w:pPr>
+        <w:spacing w:line="480" w:lineRule="auto"/>
+        <w:ind w:firstLine="720"/>
+        <w:rPr>
+          <w:rFonts w:ascii="Arial Nova Light" w:hAnsi="Arial Nova Light" w:cs="Arial"/>
+        </w:rPr>
+      </w:pPr>
+      <w:r>
+        <w:rPr>
+          <w:rFonts w:ascii="Arial" w:hAnsi="Arial" w:cs="Arial"/>
+        </w:rPr>
+        <w:t xml:space="preserve"> </w:t>
+      </w:r>
+      <w:del w:id="341" w:author="Smith Vidaurre, Grace" w:date="2025-05-27T21:14:00Z" w16du:dateUtc="2025-05-28T01:14:00Z">
+        <w:r>
+          <w:rPr>
+            <w:rFonts w:ascii="Arial Nova Light" w:hAnsi="Arial Nova Light" w:cs="Arial"/>
+            <w:noProof/>
+          </w:rPr>
+          <w:drawing>
+            <wp:inline distT="0" distB="0" distL="0" distR="0" wp14:anchorId="505504E1" wp14:editId="1DB4512B">
+              <wp:extent cx="5937250" cy="5149850"/>
+              <wp:effectExtent l="0" t="0" r="6350" b="0"/>
+              <wp:docPr id="1262552988" name="Picture 2"/>
+              <wp:cNvGraphicFramePr>
+                <a:graphicFrameLocks xmlns:a="http://schemas.openxmlformats.org/drawingml/2006/main" noChangeAspect="1"/>
+              </wp:cNvGraphicFramePr>
+              <a:graphic xmlns:a="http://schemas.openxmlformats.org/drawingml/2006/main">
+                <a:graphicData uri="http://schemas.openxmlformats.org/drawingml/2006/picture">
+                  <pic:pic xmlns:pic="http://schemas.openxmlformats.org/drawingml/2006/picture">
+                    <pic:nvPicPr>
+                      <pic:cNvPr id="0" name="Picture 2"/>
+                      <pic:cNvPicPr>
+                        <a:picLocks noChangeAspect="1" noChangeArrowheads="1"/>
+                      </pic:cNvPicPr>
+                    </pic:nvPicPr>
+                    <pic:blipFill>
+                      <a:blip r:embed="rId14">
+                        <a:extLst>
+                          <a:ext uri="{28A0092B-C50C-407E-A947-70E740481C1C}">
+                            <a14:useLocalDpi xmlns:a14="http://schemas.microsoft.com/office/drawing/2010/main" val="0"/>
+                          </a:ext>
+                        </a:extLst>
+                      </a:blip>
+                      <a:srcRect/>
+                      <a:stretch>
+                        <a:fillRect/>
+                      </a:stretch>
+                    </pic:blipFill>
+                    <pic:spPr bwMode="auto">
+                      <a:xfrm>
+                        <a:off x="0" y="0"/>
+                        <a:ext cx="5937250" cy="5149850"/>
+                      </a:xfrm>
+                      <a:prstGeom prst="rect">
+                        <a:avLst/>
+                      </a:prstGeom>
+                      <a:noFill/>
+                      <a:ln>
+                        <a:noFill/>
+                      </a:ln>
+                    </pic:spPr>
+                  </pic:pic>
+                </a:graphicData>
+              </a:graphic>
+            </wp:inline>
+          </w:drawing>
+        </w:r>
+      </w:del>
+    </w:p>
+    <w:p>
+      <w:pPr>
+        <w:spacing w:line="480" w:lineRule="auto"/>
         <w:rPr>
           <w:rFonts w:ascii="Arial" w:hAnsi="Arial" w:cs="Arial"/>
           <w:sz w:val="22"/>
           <w:szCs w:val="22"/>
         </w:rPr>
-        <w:t>group information, and (6) a global tail</w:t>
-      </w:r>
-      <w:ins w:id="322" w:author="Smith Vidaurre, Grace" w:date="2025-05-22T14:52:00Z" w16du:dateUtc="2025-05-22T18:52:00Z">
-        <w:r>
-          <w:rPr>
-            <w:rFonts w:ascii="Arial" w:hAnsi="Arial" w:cs="Arial"/>
-            <w:sz w:val="22"/>
-            <w:szCs w:val="22"/>
-          </w:rPr>
-          <w:t xml:space="preserve"> </w:t>
-        </w:r>
-        <w:r>
-          <w:rPr>
-            <w:rFonts w:ascii="Arial" w:hAnsi="Arial" w:cs="Arial"/>
-            <w:sz w:val="22"/>
-            <w:szCs w:val="22"/>
-          </w:rPr>
-          <w:t>shared across calls in the dataset</w:t>
-        </w:r>
-      </w:ins>
-      <w:r>
-        <w:rPr>
-          <w:rFonts w:ascii="Arial" w:hAnsi="Arial" w:cs="Arial"/>
-          <w:sz w:val="22"/>
-          <w:szCs w:val="22"/>
-        </w:rPr>
-        <w:t>.</w:t>
-      </w:r>
-    </w:p>
-    <w:p>
-      <w:pPr>
-        <w:spacing w:line="480" w:lineRule="auto"/>
-        <w:ind w:firstLine="720"/>
-        <w:rPr>
-          <w:ins w:id="323" w:author="Smith Vidaurre, Grace" w:date="2025-05-22T14:44:00Z" w16du:dateUtc="2025-05-22T18:44:00Z"/>
-          <w:rFonts w:ascii="Arial" w:hAnsi="Arial" w:cs="Arial"/>
-        </w:rPr>
-      </w:pPr>
-    </w:p>
-    <w:p>
-      <w:pPr>
-        <w:spacing w:line="480" w:lineRule="auto"/>
-        <w:ind w:firstLine="720"/>
-        <w:rPr>
-          <w:ins w:id="324" w:author="Smith Vidaurre, Grace" w:date="2025-05-22T14:44:00Z" w16du:dateUtc="2025-05-22T18:44:00Z"/>
-          <w:rFonts w:ascii="Arial" w:hAnsi="Arial" w:cs="Arial"/>
-        </w:rPr>
-      </w:pPr>
-      <w:ins w:id="325" w:author="Smith Vidaurre, Grace" w:date="2025-05-22T14:44:00Z" w16du:dateUtc="2025-05-22T18:44:00Z">
-        <w:r>
-          <w:rPr>
-            <w:rFonts w:ascii="Arial" w:hAnsi="Arial" w:cs="Arial"/>
-          </w:rPr>
-          <w:t>To validate our pipeline, we</w:t>
-        </w:r>
-      </w:ins>
-    </w:p>
-    <w:p>
-      <w:pPr>
-        <w:spacing w:line="480" w:lineRule="auto"/>
-        <w:rPr>
-          <w:ins w:id="326" w:author="Smith Vidaurre, Grace" w:date="2025-05-22T14:44:00Z" w16du:dateUtc="2025-05-22T18:44:00Z"/>
-          <w:rFonts w:ascii="Arial" w:hAnsi="Arial" w:cs="Arial"/>
-        </w:rPr>
-      </w:pPr>
-      <w:ins w:id="327" w:author="Smith Vidaurre, Grace" w:date="2025-05-22T14:44:00Z" w16du:dateUtc="2025-05-22T18:44:00Z">
-        <w:r>
-          <w:rPr>
-            <w:rFonts w:ascii="Arial" w:hAnsi="Arial" w:cs="Arial"/>
-          </w:rPr>
-          <w:tab/>
-        </w:r>
-      </w:ins>
-    </w:p>
-    <w:p>
-      <w:pPr>
-        <w:spacing w:line="480" w:lineRule="auto"/>
-        <w:rPr>
-          <w:ins w:id="328" w:author="Smith Vidaurre, Grace" w:date="2025-05-22T14:44:00Z" w16du:dateUtc="2025-05-22T18:44:00Z"/>
-          <w:rFonts w:ascii="Arial" w:hAnsi="Arial" w:cs="Arial"/>
-        </w:rPr>
-      </w:pPr>
-      <w:ins w:id="329" w:author="Smith Vidaurre, Grace" w:date="2025-05-22T14:44:00Z" w16du:dateUtc="2025-05-22T18:44:00Z">
-        <w:r>
-          <w:rPr>
-            <w:rFonts w:ascii="Arial" w:hAnsi="Arial" w:cs="Arial"/>
-          </w:rPr>
-          <w:t>Here, we endeavored to create datasets of synthetic vocalizations with known information encoded at multiple social levels to (</w:t>
-        </w:r>
-        <w:commentRangeStart w:id="330"/>
-        <w:r>
-          <w:rPr>
-            <w:rFonts w:ascii="Arial" w:hAnsi="Arial" w:cs="Arial"/>
-          </w:rPr>
-          <w:t>1) develop a pipeline of synthetic signal creation that allows for the manipulation of various social and information encoding conditions and (2) assess the accuracy of two traditional bioacoustics pipelines for detecting information across different social levels</w:t>
-        </w:r>
-        <w:commentRangeEnd w:id="330"/>
-        <w:r>
-          <w:rPr>
-            <w:rStyle w:val="CommentReference"/>
-          </w:rPr>
-          <w:commentReference w:id="330"/>
-        </w:r>
-        <w:r>
-          <w:rPr>
-            <w:rFonts w:ascii="Arial" w:hAnsi="Arial" w:cs="Arial"/>
-          </w:rPr>
-          <w:t xml:space="preserve">. </w:t>
-        </w:r>
-      </w:ins>
-    </w:p>
-    <w:p>
-      <w:pPr>
-        <w:spacing w:line="480" w:lineRule="auto"/>
-        <w:ind w:firstLine="720"/>
-        <w:rPr>
-          <w:ins w:id="331" w:author="Smith Vidaurre, Grace" w:date="2025-05-22T14:44:00Z" w16du:dateUtc="2025-05-22T18:44:00Z"/>
-          <w:rFonts w:ascii="Arial" w:hAnsi="Arial" w:cs="Arial"/>
-        </w:rPr>
-      </w:pPr>
-    </w:p>
-    <w:p>
-      <w:pPr>
-        <w:spacing w:line="480" w:lineRule="auto"/>
-        <w:ind w:firstLine="720"/>
-        <w:rPr>
-          <w:ins w:id="332" w:author="Smith Vidaurre, Grace" w:date="2025-05-22T14:44:00Z" w16du:dateUtc="2025-05-22T18:44:00Z"/>
-          <w:rFonts w:ascii="Arial" w:hAnsi="Arial" w:cs="Arial"/>
-        </w:rPr>
-      </w:pPr>
-    </w:p>
-    <w:p>
-      <w:pPr>
-        <w:spacing w:line="480" w:lineRule="auto"/>
-        <w:ind w:firstLine="720"/>
-        <w:rPr>
-          <w:ins w:id="333" w:author="Smith Vidaurre, Grace" w:date="2025-05-22T14:44:00Z" w16du:dateUtc="2025-05-22T18:44:00Z"/>
-          <w:rFonts w:ascii="Arial" w:hAnsi="Arial" w:cs="Arial"/>
-        </w:rPr>
-      </w:pPr>
-    </w:p>
-    <w:p>
-      <w:pPr>
-        <w:spacing w:line="480" w:lineRule="auto"/>
-        <w:ind w:firstLine="720"/>
-        <w:rPr>
-          <w:rFonts w:ascii="Arial" w:hAnsi="Arial" w:cs="Arial"/>
-        </w:rPr>
-      </w:pPr>
-    </w:p>
-    <w:p>
-      <w:pPr>
-        <w:spacing w:line="480" w:lineRule="auto"/>
-        <w:ind w:firstLine="720"/>
-        <w:rPr>
-          <w:rFonts w:ascii="Arial" w:hAnsi="Arial" w:cs="Arial"/>
-        </w:rPr>
-      </w:pPr>
-      <w:r>
-        <w:rPr>
-          <w:rFonts w:ascii="Arial" w:hAnsi="Arial" w:cs="Arial"/>
-        </w:rPr>
-        <w:lastRenderedPageBreak/>
-        <w:t>To validate this new methodology, and to test the flexibility of using synthetic vocalizations to study learned information encoding, w</w:t>
-      </w:r>
-      <w:r>
-        <w:rPr>
-          <w:rFonts w:ascii="Arial" w:hAnsi="Arial" w:cs="Arial"/>
-        </w:rPr>
-        <w:t xml:space="preserve">e performed </w:t>
-      </w:r>
-      <w:r>
-        <w:rPr>
-          <w:rFonts w:ascii="Arial" w:hAnsi="Arial" w:cs="Arial"/>
-        </w:rPr>
-        <w:t xml:space="preserve">computational </w:t>
-      </w:r>
-      <w:r>
-        <w:rPr>
-          <w:rFonts w:ascii="Arial" w:hAnsi="Arial" w:cs="Arial"/>
-        </w:rPr>
-        <w:t xml:space="preserve">experiments to assess how well a Gaussian mixture modeling clustering pipeline that relied on spectrographic cross-correlation, a traditional bioacoustics tool to quantify acoustic similarity, </w:t>
-      </w:r>
-      <w:r>
-        <w:rPr>
-          <w:rFonts w:ascii="Arial" w:hAnsi="Arial" w:cs="Arial"/>
-        </w:rPr>
-        <w:t xml:space="preserve">or the Levenstein or edit distance, </w:t>
-      </w:r>
-      <w:r>
-        <w:rPr>
-          <w:rFonts w:ascii="Arial" w:hAnsi="Arial" w:cs="Arial"/>
-        </w:rPr>
-        <w:t>could detect varying amounts of identity information encoded over two social levels</w:t>
-      </w:r>
-      <w:r>
-        <w:rPr>
-          <w:rFonts w:ascii="Arial" w:hAnsi="Arial" w:cs="Arial"/>
-        </w:rPr>
-        <w:t xml:space="preserve"> (group</w:t>
-      </w:r>
-      <w:r>
-        <w:rPr>
-          <w:rFonts w:ascii="Arial" w:hAnsi="Arial" w:cs="Arial"/>
-        </w:rPr>
-        <w:t>-specific</w:t>
-      </w:r>
-      <w:r>
-        <w:rPr>
-          <w:rFonts w:ascii="Arial" w:hAnsi="Arial" w:cs="Arial"/>
-        </w:rPr>
-        <w:t xml:space="preserve"> and individual </w:t>
-      </w:r>
-      <w:r>
-        <w:rPr>
-          <w:rFonts w:ascii="Arial" w:hAnsi="Arial" w:cs="Arial"/>
-        </w:rPr>
-        <w:t xml:space="preserve">identity </w:t>
-      </w:r>
-      <w:r>
-        <w:rPr>
-          <w:rFonts w:ascii="Arial" w:hAnsi="Arial" w:cs="Arial"/>
-        </w:rPr>
-        <w:t>information)</w:t>
-      </w:r>
-      <w:r>
-        <w:rPr>
-          <w:rFonts w:ascii="Arial" w:hAnsi="Arial" w:cs="Arial"/>
-        </w:rPr>
-        <w:t>,</w:t>
-      </w:r>
-      <w:r>
-        <w:rPr>
-          <w:rFonts w:ascii="Arial" w:hAnsi="Arial" w:cs="Arial"/>
-        </w:rPr>
-        <w:t xml:space="preserve"> as well as over social conditions expected to influence the uniqueness of identity information.</w:t>
-      </w:r>
-      <w:r>
-        <w:rPr>
-          <w:rFonts w:ascii="Arial" w:hAnsi="Arial" w:cs="Arial"/>
-        </w:rPr>
-        <w:t xml:space="preserve"> </w:t>
-      </w:r>
-      <w:r>
-        <w:rPr>
-          <w:rFonts w:ascii="Arial" w:hAnsi="Arial" w:cs="Arial"/>
-        </w:rPr>
-        <w:t>To</w:t>
-      </w:r>
-      <w:r>
-        <w:rPr>
-          <w:rFonts w:ascii="Arial" w:hAnsi="Arial" w:cs="Arial"/>
-        </w:rPr>
-        <w:t xml:space="preserve"> assess how well </w:t>
-      </w:r>
-      <w:r>
-        <w:rPr>
-          <w:rFonts w:ascii="Arial" w:hAnsi="Arial" w:cs="Arial"/>
-        </w:rPr>
-        <w:t xml:space="preserve">spectrographic cross-correlation or the edit distance identified </w:t>
-      </w:r>
-      <w:r>
-        <w:rPr>
-          <w:rFonts w:ascii="Arial" w:hAnsi="Arial" w:cs="Arial"/>
-        </w:rPr>
-        <w:t xml:space="preserve">the </w:t>
-      </w:r>
-      <w:r>
-        <w:rPr>
-          <w:rFonts w:ascii="Arial" w:hAnsi="Arial" w:cs="Arial"/>
-        </w:rPr>
-        <w:t xml:space="preserve">encoded </w:t>
-      </w:r>
-      <w:r>
-        <w:rPr>
-          <w:rFonts w:ascii="Arial" w:hAnsi="Arial" w:cs="Arial"/>
-        </w:rPr>
-        <w:t>identity information</w:t>
-      </w:r>
-      <w:r>
-        <w:rPr>
-          <w:rFonts w:ascii="Arial" w:hAnsi="Arial" w:cs="Arial"/>
-        </w:rPr>
-        <w:t>, w</w:t>
-      </w:r>
-      <w:r>
-        <w:rPr>
-          <w:rFonts w:ascii="Arial" w:hAnsi="Arial" w:cs="Arial"/>
-        </w:rPr>
-        <w:t>e</w:t>
-      </w:r>
-      <w:r>
-        <w:rPr>
-          <w:rFonts w:ascii="Arial" w:hAnsi="Arial" w:cs="Arial"/>
-        </w:rPr>
-        <w:t xml:space="preserve"> </w:t>
-      </w:r>
-      <w:r>
-        <w:rPr>
-          <w:rFonts w:ascii="Arial" w:hAnsi="Arial" w:cs="Arial"/>
-        </w:rPr>
-        <w:t>calculated Cliff’s d</w:t>
-      </w:r>
-      <w:r>
-        <w:rPr>
-          <w:rFonts w:ascii="Arial" w:hAnsi="Arial" w:cs="Arial"/>
-        </w:rPr>
-        <w:t>elta</w:t>
-      </w:r>
-      <w:r>
-        <w:rPr>
-          <w:rFonts w:ascii="Arial" w:hAnsi="Arial" w:cs="Arial"/>
-        </w:rPr>
-        <w:t xml:space="preserve"> as the effect size between</w:t>
-      </w:r>
-      <w:r>
-        <w:rPr>
-          <w:rFonts w:ascii="Arial" w:hAnsi="Arial" w:cs="Arial"/>
-        </w:rPr>
-        <w:t xml:space="preserve"> </w:t>
-      </w:r>
-      <w:r>
-        <w:rPr>
-          <w:rFonts w:ascii="Arial" w:hAnsi="Arial" w:cs="Arial"/>
-        </w:rPr>
-        <w:t xml:space="preserve">clustering accuracies at each social level. </w:t>
-      </w:r>
-      <w:r>
-        <w:rPr>
-          <w:rFonts w:ascii="Arial" w:hAnsi="Arial" w:cs="Arial"/>
-        </w:rPr>
-        <w:t>For each spectrographic cross-correlation and the edit distance, w</w:t>
-      </w:r>
-      <w:r>
-        <w:rPr>
-          <w:rFonts w:ascii="Arial" w:hAnsi="Arial" w:cs="Arial"/>
-        </w:rPr>
-        <w:t xml:space="preserve">e expected to identify larger effect sizes </w:t>
-      </w:r>
-      <w:r>
-        <w:rPr>
-          <w:rFonts w:ascii="Arial" w:hAnsi="Arial" w:cs="Arial"/>
-        </w:rPr>
-        <w:t xml:space="preserve">when information encoding was higher for one social level than the other, and </w:t>
-      </w:r>
-      <w:r>
-        <w:rPr>
-          <w:rFonts w:ascii="Arial" w:hAnsi="Arial" w:cs="Arial"/>
-        </w:rPr>
-        <w:t xml:space="preserve">when signals were compared amongst fewer individuals or groups (e.g. </w:t>
-      </w:r>
-      <w:r>
-        <w:rPr>
-          <w:rFonts w:ascii="Arial" w:hAnsi="Arial" w:cs="Arial"/>
-        </w:rPr>
-        <w:t>social conditions</w:t>
-      </w:r>
-      <w:r>
-        <w:rPr>
-          <w:rFonts w:ascii="Arial" w:hAnsi="Arial" w:cs="Arial"/>
-        </w:rPr>
-        <w:t xml:space="preserve"> posed fewer </w:t>
-      </w:r>
-      <w:r>
-        <w:rPr>
-          <w:rFonts w:ascii="Arial" w:hAnsi="Arial" w:cs="Arial"/>
-        </w:rPr>
-        <w:t xml:space="preserve">limitations on the uniqueness </w:t>
-      </w:r>
-      <w:r>
-        <w:rPr>
-          <w:rFonts w:ascii="Arial" w:hAnsi="Arial" w:cs="Arial"/>
-        </w:rPr>
-        <w:t>of identity information at either social level)</w:t>
-      </w:r>
-      <w:r>
-        <w:rPr>
-          <w:rFonts w:ascii="Arial" w:hAnsi="Arial" w:cs="Arial"/>
-        </w:rPr>
-        <w:t xml:space="preserve">. </w:t>
-      </w:r>
-      <w:commentRangeStart w:id="334"/>
-      <w:r>
-        <w:rPr>
-          <w:rFonts w:ascii="Arial" w:hAnsi="Arial" w:cs="Arial"/>
-        </w:rPr>
-        <w:t>We expected to identify clustering accuracies that were generally lower for spectrographic cross-correlation than the edit distance, since spectrographic cross-correlation was performed on strings transformed into synthetic audio files, which may have led to losses of the original information or added noise</w:t>
-      </w:r>
-      <w:commentRangeEnd w:id="334"/>
-      <w:r>
-        <w:rPr>
-          <w:rStyle w:val="CommentReference"/>
-        </w:rPr>
-        <w:commentReference w:id="334"/>
-      </w:r>
-      <w:r>
-        <w:rPr>
-          <w:rFonts w:ascii="Arial" w:hAnsi="Arial" w:cs="Arial"/>
-        </w:rPr>
-        <w:t>.</w:t>
-      </w:r>
-      <w:r>
-        <w:rPr>
-          <w:rFonts w:ascii="Arial" w:hAnsi="Arial" w:cs="Arial"/>
-        </w:rPr>
-        <w:t xml:space="preserve"> However, we generally expected to identify medium or small effect sizes </w:t>
-      </w:r>
-      <w:r>
-        <w:rPr>
-          <w:rFonts w:ascii="Arial" w:hAnsi="Arial" w:cs="Arial"/>
-        </w:rPr>
-        <w:t xml:space="preserve">for these differences in information detection by each method </w:t>
-      </w:r>
-      <w:r>
-        <w:rPr>
-          <w:rFonts w:ascii="Arial" w:hAnsi="Arial" w:cs="Arial"/>
-        </w:rPr>
-        <w:t xml:space="preserve">that did not outweigh the effect sizes calculated for clustering accuracy </w:t>
-      </w:r>
-      <w:r>
-        <w:rPr>
-          <w:rFonts w:ascii="Arial" w:hAnsi="Arial" w:cs="Arial"/>
-        </w:rPr>
-        <w:t>between different forms of identity information for the same measurement (spectrographic cross-correlation or the edit distance).</w:t>
-      </w:r>
-    </w:p>
-    <w:p>
-      <w:pPr>
-        <w:spacing w:line="480" w:lineRule="auto"/>
-        <w:rPr>
-          <w:rFonts w:ascii="Arial" w:hAnsi="Arial" w:cs="Arial"/>
-        </w:rPr>
-      </w:pPr>
-    </w:p>
-    <w:p>
-      <w:pPr>
-        <w:spacing w:line="480" w:lineRule="auto"/>
-        <w:rPr>
-          <w:rFonts w:ascii="Arial" w:hAnsi="Arial" w:cs="Arial"/>
-          <w:b/>
-          <w:bCs/>
-        </w:rPr>
-      </w:pPr>
-      <w:commentRangeStart w:id="335"/>
-      <w:r>
-        <w:rPr>
-          <w:rFonts w:ascii="Arial" w:hAnsi="Arial" w:cs="Arial"/>
-          <w:b/>
-          <w:bCs/>
-        </w:rPr>
-        <w:lastRenderedPageBreak/>
-        <w:t>Results</w:t>
-      </w:r>
-      <w:commentRangeEnd w:id="335"/>
-      <w:r>
-        <w:rPr>
-          <w:rStyle w:val="CommentReference"/>
-        </w:rPr>
-        <w:commentReference w:id="335"/>
-      </w:r>
-      <w:r>
-        <w:rPr>
-          <w:rFonts w:ascii="Arial" w:hAnsi="Arial" w:cs="Arial"/>
-          <w:b/>
-          <w:bCs/>
-        </w:rPr>
-        <w:t xml:space="preserve"> and </w:t>
-      </w:r>
-      <w:commentRangeStart w:id="336"/>
-      <w:r>
-        <w:rPr>
-          <w:rFonts w:ascii="Arial" w:hAnsi="Arial" w:cs="Arial"/>
-          <w:b/>
-          <w:bCs/>
-        </w:rPr>
-        <w:t>Discussion</w:t>
-      </w:r>
-      <w:commentRangeEnd w:id="336"/>
-      <w:r>
-        <w:rPr>
-          <w:rStyle w:val="CommentReference"/>
-        </w:rPr>
-        <w:commentReference w:id="336"/>
-      </w:r>
-      <w:r>
-        <w:rPr>
-          <w:rFonts w:ascii="Arial" w:hAnsi="Arial" w:cs="Arial"/>
-          <w:b/>
-          <w:bCs/>
-        </w:rPr>
-        <w:t>:</w:t>
-      </w:r>
-    </w:p>
-    <w:p>
-      <w:pPr>
-        <w:spacing w:line="480" w:lineRule="auto"/>
-        <w:rPr>
-          <w:rFonts w:ascii="Arial" w:hAnsi="Arial" w:cs="Arial"/>
-          <w:i/>
-          <w:iCs/>
-        </w:rPr>
-      </w:pPr>
-      <w:r>
-        <w:rPr>
-          <w:rFonts w:ascii="Arial" w:hAnsi="Arial" w:cs="Arial"/>
-          <w:i/>
-          <w:iCs/>
-        </w:rPr>
-        <w:t xml:space="preserve">Visualizing </w:t>
-      </w:r>
-      <w:r>
-        <w:rPr>
-          <w:rFonts w:ascii="Arial" w:hAnsi="Arial" w:cs="Arial"/>
-          <w:i/>
-          <w:iCs/>
-        </w:rPr>
-        <w:t>Synthetic Group and Information Datasets</w:t>
-      </w:r>
-    </w:p>
-    <w:p>
-      <w:pPr>
-        <w:spacing w:line="480" w:lineRule="auto"/>
-        <w:ind w:firstLine="720"/>
-        <w:rPr>
-          <w:rFonts w:ascii="Arial" w:hAnsi="Arial" w:cs="Arial"/>
-        </w:rPr>
-      </w:pPr>
-      <w:r>
-        <w:rPr>
-          <w:rFonts w:ascii="Arial" w:hAnsi="Arial" w:cs="Arial"/>
-        </w:rPr>
-        <w:t xml:space="preserve">We created two synthetic data sets: one that created </w:t>
-      </w:r>
-      <w:commentRangeStart w:id="337"/>
-      <w:commentRangeStart w:id="338"/>
-      <w:r>
-        <w:rPr>
-          <w:rFonts w:ascii="Arial" w:hAnsi="Arial" w:cs="Arial"/>
-        </w:rPr>
-        <w:t xml:space="preserve">vocalizations </w:t>
-      </w:r>
-      <w:commentRangeEnd w:id="337"/>
-      <w:r>
-        <w:rPr>
-          <w:rStyle w:val="CommentReference"/>
-        </w:rPr>
-        <w:commentReference w:id="337"/>
-      </w:r>
-      <w:commentRangeEnd w:id="338"/>
-      <w:r>
-        <w:rPr>
-          <w:rStyle w:val="CommentReference"/>
-        </w:rPr>
-        <w:commentReference w:id="338"/>
-      </w:r>
-      <w:r>
-        <w:rPr>
-          <w:rFonts w:ascii="Arial" w:hAnsi="Arial" w:cs="Arial"/>
-        </w:rPr>
-        <w:t xml:space="preserve">with more group </w:t>
-      </w:r>
-      <w:r>
-        <w:rPr>
-          <w:rFonts w:ascii="Arial" w:hAnsi="Arial" w:cs="Arial"/>
-        </w:rPr>
-        <w:t>specific</w:t>
-      </w:r>
-      <w:r>
-        <w:rPr>
-          <w:rFonts w:ascii="Arial" w:hAnsi="Arial" w:cs="Arial"/>
-        </w:rPr>
-        <w:t xml:space="preserve"> information than individual </w:t>
-      </w:r>
-      <w:r>
-        <w:rPr>
-          <w:rFonts w:ascii="Arial" w:hAnsi="Arial" w:cs="Arial"/>
-        </w:rPr>
-        <w:t xml:space="preserve">identity </w:t>
-      </w:r>
-      <w:r>
-        <w:rPr>
-          <w:rFonts w:ascii="Arial" w:hAnsi="Arial" w:cs="Arial"/>
-        </w:rPr>
-        <w:t xml:space="preserve">information encoded (henceforth the </w:t>
-      </w:r>
-      <w:r>
-        <w:rPr>
-          <w:rFonts w:ascii="Arial" w:hAnsi="Arial" w:cs="Arial"/>
-        </w:rPr>
-        <w:t>g</w:t>
-      </w:r>
-      <w:r>
-        <w:rPr>
-          <w:rFonts w:ascii="Arial" w:hAnsi="Arial" w:cs="Arial"/>
-        </w:rPr>
-        <w:t>roup</w:t>
-      </w:r>
-      <w:r>
-        <w:rPr>
-          <w:rFonts w:ascii="Arial" w:hAnsi="Arial" w:cs="Arial"/>
-        </w:rPr>
-        <w:t xml:space="preserve"> specific</w:t>
-      </w:r>
-      <w:r>
-        <w:rPr>
-          <w:rFonts w:ascii="Arial" w:hAnsi="Arial" w:cs="Arial"/>
-        </w:rPr>
-        <w:t xml:space="preserve"> dataset), and one that created </w:t>
-      </w:r>
-      <w:commentRangeStart w:id="339"/>
-      <w:r>
-        <w:rPr>
-          <w:rFonts w:ascii="Arial" w:hAnsi="Arial" w:cs="Arial"/>
-        </w:rPr>
-        <w:t xml:space="preserve">character strings </w:t>
-      </w:r>
-      <w:commentRangeEnd w:id="339"/>
-      <w:r>
-        <w:rPr>
-          <w:rStyle w:val="CommentReference"/>
-        </w:rPr>
-        <w:commentReference w:id="339"/>
-      </w:r>
-      <w:r>
-        <w:rPr>
-          <w:rFonts w:ascii="Arial" w:hAnsi="Arial" w:cs="Arial"/>
-        </w:rPr>
-        <w:t xml:space="preserve">with more individual </w:t>
-      </w:r>
-      <w:r>
-        <w:rPr>
-          <w:rFonts w:ascii="Arial" w:hAnsi="Arial" w:cs="Arial"/>
-        </w:rPr>
-        <w:t xml:space="preserve">identity </w:t>
-      </w:r>
-      <w:r>
-        <w:rPr>
-          <w:rFonts w:ascii="Arial" w:hAnsi="Arial" w:cs="Arial"/>
-        </w:rPr>
-        <w:t>information than group</w:t>
-      </w:r>
-      <w:r>
-        <w:rPr>
-          <w:rFonts w:ascii="Arial" w:hAnsi="Arial" w:cs="Arial"/>
-        </w:rPr>
-        <w:t xml:space="preserve"> specific </w:t>
-      </w:r>
-      <w:r>
-        <w:rPr>
-          <w:rFonts w:ascii="Arial" w:hAnsi="Arial" w:cs="Arial"/>
-        </w:rPr>
-        <w:t>information encoded (</w:t>
-      </w:r>
-      <w:r>
-        <w:rPr>
-          <w:rFonts w:ascii="Arial" w:hAnsi="Arial" w:cs="Arial"/>
-        </w:rPr>
-        <w:t>individual identity d</w:t>
-      </w:r>
-      <w:r>
-        <w:rPr>
-          <w:rFonts w:ascii="Arial" w:hAnsi="Arial" w:cs="Arial"/>
-        </w:rPr>
-        <w:t>ataset; henceforth the Individual dataset).</w:t>
-      </w:r>
-      <w:r>
-        <w:rPr>
-          <w:rFonts w:ascii="Arial" w:hAnsi="Arial" w:cs="Arial"/>
-        </w:rPr>
-        <w:t xml:space="preserve"> </w:t>
-      </w:r>
-      <w:r>
-        <w:rPr>
-          <w:rFonts w:ascii="Arial" w:hAnsi="Arial" w:cs="Arial"/>
-        </w:rPr>
-        <w:t>W</w:t>
-      </w:r>
-      <w:r>
-        <w:rPr>
-          <w:rFonts w:ascii="Arial" w:hAnsi="Arial" w:cs="Arial"/>
-        </w:rPr>
-        <w:t>e</w:t>
-      </w:r>
-      <w:r>
-        <w:rPr>
-          <w:rFonts w:ascii="Arial" w:hAnsi="Arial" w:cs="Arial"/>
-        </w:rPr>
-        <w:t xml:space="preserve"> then</w:t>
-      </w:r>
-      <w:r>
-        <w:rPr>
-          <w:rFonts w:ascii="Arial" w:hAnsi="Arial" w:cs="Arial"/>
-        </w:rPr>
-        <w:t xml:space="preserve"> created spectrographic lexicons and acoustic space plots to visualize </w:t>
-      </w:r>
-      <w:r>
-        <w:rPr>
-          <w:rFonts w:ascii="Arial" w:hAnsi="Arial" w:cs="Arial"/>
-        </w:rPr>
-        <w:t xml:space="preserve">a selected subset of </w:t>
-      </w:r>
-      <w:r>
-        <w:rPr>
-          <w:rFonts w:ascii="Arial" w:hAnsi="Arial" w:cs="Arial"/>
-        </w:rPr>
-        <w:t xml:space="preserve">the range of synthetic signals created and how they relate to each other in acoustic space </w:t>
-      </w:r>
-      <w:r>
-        <w:rPr>
-          <w:rFonts w:ascii="Arial" w:hAnsi="Arial" w:cs="Arial"/>
-        </w:rPr>
-        <w:t>when clustering back to the original individual or group</w:t>
-      </w:r>
-      <w:r>
-        <w:rPr>
-          <w:rFonts w:ascii="Arial" w:hAnsi="Arial" w:cs="Arial"/>
-        </w:rPr>
-        <w:t>.</w:t>
-      </w:r>
-    </w:p>
-    <w:p>
-      <w:pPr>
-        <w:spacing w:line="480" w:lineRule="auto"/>
-        <w:ind w:firstLine="720"/>
-        <w:rPr>
-          <w:rFonts w:ascii="Arial" w:hAnsi="Arial" w:cs="Arial"/>
-        </w:rPr>
-      </w:pPr>
-      <w:r>
-        <w:rPr>
-          <w:rFonts w:ascii="Arial" w:hAnsi="Arial" w:cs="Arial"/>
-        </w:rPr>
-        <w:t>Synthetic vocalizations from the group specific dataset (figure 2) share more similarities within groups and are more different across groups, as seen by the lack of overlapping polygons in the group level acoustic space plots for SPCC and edit distance (figure 2</w:t>
-      </w:r>
-      <w:r>
-        <w:rPr>
-          <w:rFonts w:ascii="Arial" w:hAnsi="Arial" w:cs="Arial"/>
-        </w:rPr>
-        <w:t>B</w:t>
-      </w:r>
-      <w:r>
-        <w:rPr>
-          <w:rFonts w:ascii="Arial" w:hAnsi="Arial" w:cs="Arial"/>
-        </w:rPr>
-        <w:t xml:space="preserve"> and 2</w:t>
-      </w:r>
-      <w:r>
-        <w:rPr>
-          <w:rFonts w:ascii="Arial" w:hAnsi="Arial" w:cs="Arial"/>
-        </w:rPr>
-        <w:t>C</w:t>
-      </w:r>
-      <w:r>
-        <w:rPr>
-          <w:rFonts w:ascii="Arial" w:hAnsi="Arial" w:cs="Arial"/>
-        </w:rPr>
-        <w:t>). Synthetic vocalizations in the individual identity dataset contain more variation within groups, but strong individual signatures within individual (figure 3), as see</w:t>
-      </w:r>
-      <w:r>
-        <w:rPr>
-          <w:rFonts w:ascii="Arial" w:hAnsi="Arial" w:cs="Arial"/>
-        </w:rPr>
-        <w:t>n by the non-overlapping individual polygons in the acoustic space plots for SPCC and edit distance (figure 3B and 3C). TKTK sentence about viewing all polygons in supplemental materials</w:t>
-      </w:r>
-    </w:p>
-    <w:p>
-      <w:pPr>
-        <w:spacing w:line="480" w:lineRule="auto"/>
-        <w:ind w:firstLine="720"/>
-        <w:rPr>
-          <w:rFonts w:ascii="Arial Nova Light" w:hAnsi="Arial Nova Light" w:cs="Arial"/>
-        </w:rPr>
-      </w:pPr>
-      <w:r>
-        <w:rPr>
-          <w:rFonts w:ascii="Arial" w:hAnsi="Arial" w:cs="Arial"/>
-        </w:rPr>
-        <w:lastRenderedPageBreak/>
-        <w:t xml:space="preserve"> </w:t>
-      </w:r>
-      <w:r>
-        <w:rPr>
-          <w:rFonts w:ascii="Arial Nova Light" w:hAnsi="Arial Nova Light" w:cs="Arial"/>
-          <w:noProof/>
-        </w:rPr>
-        <w:drawing>
-          <wp:inline distT="0" distB="0" distL="0" distR="0" wp14:anchorId="505504E1" wp14:editId="2AA9CBC2">
-            <wp:extent cx="5937250" cy="5149850"/>
-            <wp:effectExtent l="0" t="0" r="6350" b="0"/>
-            <wp:docPr id="1262552988" name="Picture 2"/>
-            <wp:cNvGraphicFramePr>
-              <a:graphicFrameLocks xmlns:a="http://schemas.openxmlformats.org/drawingml/2006/main" noChangeAspect="1"/>
-            </wp:cNvGraphicFramePr>
-            <a:graphic xmlns:a="http://schemas.openxmlformats.org/drawingml/2006/main">
-              <a:graphicData uri="http://schemas.openxmlformats.org/drawingml/2006/picture">
-                <pic:pic xmlns:pic="http://schemas.openxmlformats.org/drawingml/2006/picture">
-                  <pic:nvPicPr>
-                    <pic:cNvPr id="0" name="Picture 2"/>
-                    <pic:cNvPicPr>
-                      <a:picLocks noChangeAspect="1" noChangeArrowheads="1"/>
-                    </pic:cNvPicPr>
-                  </pic:nvPicPr>
-                  <pic:blipFill>
-                    <a:blip r:embed="rId14">
-                      <a:extLst>
-                        <a:ext uri="{28A0092B-C50C-407E-A947-70E740481C1C}">
-                          <a14:useLocalDpi xmlns:a14="http://schemas.microsoft.com/office/drawing/2010/main" val="0"/>
-                        </a:ext>
-                      </a:extLst>
-                    </a:blip>
-                    <a:srcRect/>
-                    <a:stretch>
-                      <a:fillRect/>
-                    </a:stretch>
-                  </pic:blipFill>
-                  <pic:spPr bwMode="auto">
-                    <a:xfrm>
-                      <a:off x="0" y="0"/>
-                      <a:ext cx="5937250" cy="5149850"/>
-                    </a:xfrm>
-                    <a:prstGeom prst="rect">
-                      <a:avLst/>
-                    </a:prstGeom>
-                    <a:noFill/>
-                    <a:ln>
-                      <a:noFill/>
-                    </a:ln>
-                  </pic:spPr>
-                </pic:pic>
-              </a:graphicData>
-            </a:graphic>
-          </wp:inline>
-        </w:drawing>
-      </w:r>
-    </w:p>
-    <w:p>
-      <w:pPr>
-        <w:spacing w:line="480" w:lineRule="auto"/>
-        <w:rPr>
-          <w:rFonts w:ascii="Arial" w:hAnsi="Arial" w:cs="Arial"/>
-          <w:sz w:val="22"/>
-          <w:szCs w:val="22"/>
-        </w:rPr>
-      </w:pPr>
-      <w:commentRangeStart w:id="340"/>
+      </w:pPr>
+      <w:commentRangeStart w:id="342"/>
       <w:r>
         <w:rPr>
           <w:rFonts w:ascii="Arial" w:hAnsi="Arial" w:cs="Arial"/>
@@ -7060,7 +7061,7 @@
         </w:rPr>
         <w:t xml:space="preserve">Figure </w:t>
       </w:r>
-      <w:commentRangeEnd w:id="340"/>
+      <w:commentRangeEnd w:id="342"/>
       <w:r>
         <w:rPr>
           <w:rStyle w:val="CommentReference"/>
@@ -7070,7 +7071,7 @@
           <w:sz w:val="22"/>
           <w:szCs w:val="22"/>
         </w:rPr>
-        <w:commentReference w:id="340"/>
+        <w:commentReference w:id="342"/>
       </w:r>
       <w:r>
         <w:rPr>
@@ -7125,61 +7126,62 @@
           <w:rFonts w:ascii="Arial Nova Light" w:hAnsi="Arial Nova Light" w:cs="Arial"/>
         </w:rPr>
       </w:pPr>
-      <w:r>
-        <w:rPr>
-          <w:rFonts w:ascii="Arial Nova Light" w:hAnsi="Arial Nova Light" w:cs="Arial"/>
-          <w:noProof/>
-        </w:rPr>
-        <w:lastRenderedPageBreak/>
-        <w:drawing>
-          <wp:inline distT="0" distB="0" distL="0" distR="0" wp14:anchorId="2986E17D" wp14:editId="72C2546A">
-            <wp:extent cx="5937250" cy="5149850"/>
-            <wp:effectExtent l="0" t="0" r="6350" b="0"/>
-            <wp:docPr id="1032993135" name="Picture 3"/>
-            <wp:cNvGraphicFramePr>
-              <a:graphicFrameLocks xmlns:a="http://schemas.openxmlformats.org/drawingml/2006/main" noChangeAspect="1"/>
-            </wp:cNvGraphicFramePr>
-            <a:graphic xmlns:a="http://schemas.openxmlformats.org/drawingml/2006/main">
-              <a:graphicData uri="http://schemas.openxmlformats.org/drawingml/2006/picture">
-                <pic:pic xmlns:pic="http://schemas.openxmlformats.org/drawingml/2006/picture">
-                  <pic:nvPicPr>
-                    <pic:cNvPr id="0" name="Picture 3"/>
-                    <pic:cNvPicPr>
-                      <a:picLocks noChangeAspect="1" noChangeArrowheads="1"/>
-                    </pic:cNvPicPr>
-                  </pic:nvPicPr>
-                  <pic:blipFill>
-                    <a:blip r:embed="rId15">
-                      <a:extLst>
-                        <a:ext uri="{28A0092B-C50C-407E-A947-70E740481C1C}">
-                          <a14:useLocalDpi xmlns:a14="http://schemas.microsoft.com/office/drawing/2010/main" val="0"/>
-                        </a:ext>
-                      </a:extLst>
-                    </a:blip>
-                    <a:srcRect/>
-                    <a:stretch>
-                      <a:fillRect/>
-                    </a:stretch>
-                  </pic:blipFill>
-                  <pic:spPr bwMode="auto">
-                    <a:xfrm>
-                      <a:off x="0" y="0"/>
-                      <a:ext cx="5937250" cy="5149850"/>
-                    </a:xfrm>
-                    <a:prstGeom prst="rect">
-                      <a:avLst/>
-                    </a:prstGeom>
-                    <a:noFill/>
-                    <a:ln>
+      <w:del w:id="343" w:author="Smith Vidaurre, Grace" w:date="2025-05-27T21:14:00Z" w16du:dateUtc="2025-05-28T01:14:00Z">
+        <w:r>
+          <w:rPr>
+            <w:rFonts w:ascii="Arial Nova Light" w:hAnsi="Arial Nova Light" w:cs="Arial"/>
+            <w:noProof/>
+          </w:rPr>
+          <w:drawing>
+            <wp:inline distT="0" distB="0" distL="0" distR="0" wp14:anchorId="2986E17D" wp14:editId="15E7FD49">
+              <wp:extent cx="5937250" cy="5149850"/>
+              <wp:effectExtent l="0" t="0" r="6350" b="0"/>
+              <wp:docPr id="1032993135" name="Picture 3"/>
+              <wp:cNvGraphicFramePr>
+                <a:graphicFrameLocks xmlns:a="http://schemas.openxmlformats.org/drawingml/2006/main" noChangeAspect="1"/>
+              </wp:cNvGraphicFramePr>
+              <a:graphic xmlns:a="http://schemas.openxmlformats.org/drawingml/2006/main">
+                <a:graphicData uri="http://schemas.openxmlformats.org/drawingml/2006/picture">
+                  <pic:pic xmlns:pic="http://schemas.openxmlformats.org/drawingml/2006/picture">
+                    <pic:nvPicPr>
+                      <pic:cNvPr id="0" name="Picture 3"/>
+                      <pic:cNvPicPr>
+                        <a:picLocks noChangeAspect="1" noChangeArrowheads="1"/>
+                      </pic:cNvPicPr>
+                    </pic:nvPicPr>
+                    <pic:blipFill>
+                      <a:blip r:embed="rId15">
+                        <a:extLst>
+                          <a:ext uri="{28A0092B-C50C-407E-A947-70E740481C1C}">
+                            <a14:useLocalDpi xmlns:a14="http://schemas.microsoft.com/office/drawing/2010/main" val="0"/>
+                          </a:ext>
+                        </a:extLst>
+                      </a:blip>
+                      <a:srcRect/>
+                      <a:stretch>
+                        <a:fillRect/>
+                      </a:stretch>
+                    </pic:blipFill>
+                    <pic:spPr bwMode="auto">
+                      <a:xfrm>
+                        <a:off x="0" y="0"/>
+                        <a:ext cx="5937250" cy="5149850"/>
+                      </a:xfrm>
+                      <a:prstGeom prst="rect">
+                        <a:avLst/>
+                      </a:prstGeom>
                       <a:noFill/>
-                    </a:ln>
-                  </pic:spPr>
-                </pic:pic>
-              </a:graphicData>
-            </a:graphic>
-          </wp:inline>
-        </w:drawing>
-      </w:r>
+                      <a:ln>
+                        <a:noFill/>
+                      </a:ln>
+                    </pic:spPr>
+                  </pic:pic>
+                </a:graphicData>
+              </a:graphic>
+            </wp:inline>
+          </w:drawing>
+        </w:r>
+      </w:del>
     </w:p>
     <w:p>
       <w:pPr>
@@ -7190,7 +7192,7 @@
           <w:szCs w:val="22"/>
         </w:rPr>
       </w:pPr>
-      <w:commentRangeStart w:id="341"/>
+      <w:commentRangeStart w:id="344"/>
       <w:r>
         <w:rPr>
           <w:rFonts w:ascii="Arial" w:hAnsi="Arial" w:cs="Arial"/>
@@ -7201,7 +7203,7 @@
         </w:rPr>
         <w:t xml:space="preserve">Figure </w:t>
       </w:r>
-      <w:commentRangeEnd w:id="341"/>
+      <w:commentRangeEnd w:id="344"/>
       <w:r>
         <w:rPr>
           <w:rStyle w:val="CommentReference"/>
@@ -7211,7 +7213,7 @@
           <w:sz w:val="22"/>
           <w:szCs w:val="22"/>
         </w:rPr>
-        <w:commentReference w:id="341"/>
+        <w:commentReference w:id="344"/>
       </w:r>
       <w:r>
         <w:rPr>
@@ -7260,14 +7262,7 @@
           <w:rFonts w:ascii="Arial" w:hAnsi="Arial" w:cs="Arial"/>
         </w:rPr>
         <w:tab/>
-        <w:t xml:space="preserve">These results confirm that our pipeline of generating synthetic signals via the creation of character strings then using Parson’s code to convert these strings into frequency modulated signals allows us to encode information at multiple social levels in the same signal. Using character strings to encode information in synthetic signals is a computationally efficient way to represent animal vocalizations in simulation-based research. This approach allows us to generate representations of vocalizations that </w:t>
-      </w:r>
-      <w:r>
-        <w:rPr>
-          <w:rFonts w:ascii="Arial" w:hAnsi="Arial" w:cs="Arial"/>
-        </w:rPr>
-        <w:lastRenderedPageBreak/>
-        <w:t xml:space="preserve">encode complex information that may be </w:t>
+        <w:t xml:space="preserve">These results confirm that our pipeline of generating synthetic signals via the creation of character strings then using Parson’s code to convert these strings into frequency modulated signals allows us to encode information at multiple social levels in the same signal. Using character strings to encode information in synthetic signals is a computationally efficient way to represent animal vocalizations in simulation-based research. This approach allows us to generate representations of vocalizations that encode complex information that may be </w:t>
       </w:r>
       <w:proofErr w:type="gramStart"/>
       <w:r>
@@ -7338,7 +7333,14 @@
         <w:rPr>
           <w:rFonts w:ascii="Arial" w:hAnsi="Arial" w:cs="Arial"/>
         </w:rPr>
-        <w:t xml:space="preserve">. Animals are known to use frequency modulation patterns to communicate social information (TKTK CITE). Our package, </w:t>
+        <w:t xml:space="preserve">. Animals are known to </w:t>
+      </w:r>
+      <w:r>
+        <w:rPr>
+          <w:rFonts w:ascii="Arial" w:hAnsi="Arial" w:cs="Arial"/>
+        </w:rPr>
+        <w:lastRenderedPageBreak/>
+        <w:t xml:space="preserve">use frequency modulation patterns to communicate social information (TKTK CITE). Our package, </w:t>
       </w:r>
       <w:proofErr w:type="spellStart"/>
       <w:r>
@@ -7544,7 +7546,6 @@
           <w:i/>
           <w:iCs/>
         </w:rPr>
-        <w:lastRenderedPageBreak/>
         <w:t xml:space="preserve">Accuracy of Information Encoding and Recovery  </w:t>
       </w:r>
     </w:p>
@@ -7596,7 +7597,14 @@
         <w:rPr>
           <w:rFonts w:ascii="Arial" w:hAnsi="Arial" w:cs="Arial"/>
         </w:rPr>
-        <w:t xml:space="preserve"> of original clusters of information. </w:t>
+        <w:t xml:space="preserve"> of original clusters </w:t>
+      </w:r>
+      <w:r>
+        <w:rPr>
+          <w:rFonts w:ascii="Arial" w:hAnsi="Arial" w:cs="Arial"/>
+        </w:rPr>
+        <w:lastRenderedPageBreak/>
+        <w:t xml:space="preserve">of information. </w:t>
       </w:r>
       <w:r>
         <w:rPr>
@@ -7672,64 +7680,65 @@
           <w:szCs w:val="22"/>
         </w:rPr>
       </w:pPr>
-      <w:r>
-        <w:rPr>
-          <w:rFonts w:ascii="Arial" w:hAnsi="Arial" w:cs="Arial"/>
-          <w:b/>
-          <w:bCs/>
-          <w:noProof/>
-          <w:sz w:val="22"/>
-          <w:szCs w:val="22"/>
-        </w:rPr>
-        <w:lastRenderedPageBreak/>
-        <w:drawing>
-          <wp:inline distT="0" distB="0" distL="0" distR="0" wp14:anchorId="7E081CA4" wp14:editId="5FF1D1B6">
-            <wp:extent cx="5937250" cy="5145616"/>
-            <wp:effectExtent l="0" t="0" r="0" b="0"/>
-            <wp:docPr id="782938263" name="Picture 4"/>
-            <wp:cNvGraphicFramePr>
-              <a:graphicFrameLocks xmlns:a="http://schemas.openxmlformats.org/drawingml/2006/main" noChangeAspect="1"/>
-            </wp:cNvGraphicFramePr>
-            <a:graphic xmlns:a="http://schemas.openxmlformats.org/drawingml/2006/main">
-              <a:graphicData uri="http://schemas.openxmlformats.org/drawingml/2006/picture">
-                <pic:pic xmlns:pic="http://schemas.openxmlformats.org/drawingml/2006/picture">
-                  <pic:nvPicPr>
-                    <pic:cNvPr id="782938263" name="Picture 4"/>
-                    <pic:cNvPicPr>
-                      <a:picLocks noChangeAspect="1" noChangeArrowheads="1"/>
-                    </pic:cNvPicPr>
-                  </pic:nvPicPr>
-                  <pic:blipFill>
-                    <a:blip r:embed="rId16">
-                      <a:extLst>
-                        <a:ext uri="{28A0092B-C50C-407E-A947-70E740481C1C}">
-                          <a14:useLocalDpi xmlns:a14="http://schemas.microsoft.com/office/drawing/2010/main" val="0"/>
-                        </a:ext>
-                      </a:extLst>
-                    </a:blip>
-                    <a:stretch>
-                      <a:fillRect/>
-                    </a:stretch>
-                  </pic:blipFill>
-                  <pic:spPr bwMode="auto">
-                    <a:xfrm>
-                      <a:off x="0" y="0"/>
-                      <a:ext cx="5937250" cy="5145616"/>
-                    </a:xfrm>
-                    <a:prstGeom prst="rect">
-                      <a:avLst/>
-                    </a:prstGeom>
-                    <a:noFill/>
-                    <a:ln>
+      <w:del w:id="345" w:author="Smith Vidaurre, Grace" w:date="2025-05-27T21:15:00Z" w16du:dateUtc="2025-05-28T01:15:00Z">
+        <w:r>
+          <w:rPr>
+            <w:rFonts w:ascii="Arial" w:hAnsi="Arial" w:cs="Arial"/>
+            <w:b/>
+            <w:bCs/>
+            <w:noProof/>
+            <w:sz w:val="22"/>
+            <w:szCs w:val="22"/>
+          </w:rPr>
+          <w:drawing>
+            <wp:inline distT="0" distB="0" distL="0" distR="0" wp14:anchorId="7E081CA4" wp14:editId="6E95EBBD">
+              <wp:extent cx="5937250" cy="5145616"/>
+              <wp:effectExtent l="0" t="0" r="0" b="0"/>
+              <wp:docPr id="782938263" name="Picture 4"/>
+              <wp:cNvGraphicFramePr>
+                <a:graphicFrameLocks xmlns:a="http://schemas.openxmlformats.org/drawingml/2006/main" noChangeAspect="1"/>
+              </wp:cNvGraphicFramePr>
+              <a:graphic xmlns:a="http://schemas.openxmlformats.org/drawingml/2006/main">
+                <a:graphicData uri="http://schemas.openxmlformats.org/drawingml/2006/picture">
+                  <pic:pic xmlns:pic="http://schemas.openxmlformats.org/drawingml/2006/picture">
+                    <pic:nvPicPr>
+                      <pic:cNvPr id="782938263" name="Picture 4"/>
+                      <pic:cNvPicPr>
+                        <a:picLocks noChangeAspect="1" noChangeArrowheads="1"/>
+                      </pic:cNvPicPr>
+                    </pic:nvPicPr>
+                    <pic:blipFill>
+                      <a:blip r:embed="rId16">
+                        <a:extLst>
+                          <a:ext uri="{28A0092B-C50C-407E-A947-70E740481C1C}">
+                            <a14:useLocalDpi xmlns:a14="http://schemas.microsoft.com/office/drawing/2010/main" val="0"/>
+                          </a:ext>
+                        </a:extLst>
+                      </a:blip>
+                      <a:stretch>
+                        <a:fillRect/>
+                      </a:stretch>
+                    </pic:blipFill>
+                    <pic:spPr bwMode="auto">
+                      <a:xfrm>
+                        <a:off x="0" y="0"/>
+                        <a:ext cx="5937250" cy="5145616"/>
+                      </a:xfrm>
+                      <a:prstGeom prst="rect">
+                        <a:avLst/>
+                      </a:prstGeom>
                       <a:noFill/>
-                    </a:ln>
-                  </pic:spPr>
-                </pic:pic>
-              </a:graphicData>
-            </a:graphic>
-          </wp:inline>
-        </w:drawing>
-      </w:r>
+                      <a:ln>
+                        <a:noFill/>
+                      </a:ln>
+                    </pic:spPr>
+                  </pic:pic>
+                </a:graphicData>
+              </a:graphic>
+            </wp:inline>
+          </w:drawing>
+        </w:r>
+      </w:del>
     </w:p>
     <w:p>
       <w:pPr>
@@ -7742,7 +7751,7 @@
           <w:szCs w:val="22"/>
         </w:rPr>
       </w:pPr>
-      <w:commentRangeStart w:id="342"/>
+      <w:commentRangeStart w:id="346"/>
       <w:r>
         <w:rPr>
           <w:rFonts w:ascii="Arial" w:hAnsi="Arial" w:cs="Arial"/>
@@ -7753,7 +7762,7 @@
         </w:rPr>
         <w:t xml:space="preserve">Figure </w:t>
       </w:r>
-      <w:commentRangeEnd w:id="342"/>
+      <w:commentRangeEnd w:id="346"/>
       <w:r>
         <w:rPr>
           <w:rStyle w:val="CommentReference"/>
@@ -7761,7 +7770,7 @@
           <w:sz w:val="22"/>
           <w:szCs w:val="22"/>
         </w:rPr>
-        <w:commentReference w:id="342"/>
+        <w:commentReference w:id="346"/>
       </w:r>
       <w:r>
         <w:rPr>
@@ -7854,20 +7863,20 @@
         <w:rPr>
           <w:rFonts w:ascii="Arial" w:hAnsi="Arial" w:cs="Arial"/>
         </w:rPr>
-        <w:t xml:space="preserve">We used the group level accuracy scores as our comparison group, meaning that a positive effect size value indicates group level information detection was </w:t>
+        <w:t xml:space="preserve">We used the group level accuracy scores as our comparison group, meaning that a positive effect size value indicates group level information detection was more accuracy, while negative means individual level information detect was more accurate. </w:t>
+      </w:r>
+      <w:r>
+        <w:rPr>
+          <w:rFonts w:ascii="Arial" w:hAnsi="Arial" w:cs="Arial"/>
+        </w:rPr>
+        <w:t xml:space="preserve">For both edit distance and SPCC calculations, we found large effect size differences between group and individual level accuracy measurements at the extremes </w:t>
       </w:r>
       <w:r>
         <w:rPr>
           <w:rFonts w:ascii="Arial" w:hAnsi="Arial" w:cs="Arial"/>
         </w:rPr>
         <w:lastRenderedPageBreak/>
-        <w:t xml:space="preserve">more accuracy, while negative means individual level information detect was more accurate. </w:t>
-      </w:r>
-      <w:r>
-        <w:rPr>
-          <w:rFonts w:ascii="Arial" w:hAnsi="Arial" w:cs="Arial"/>
-        </w:rPr>
-        <w:t xml:space="preserve">For both edit distance and SPCC calculations, we found large effect size differences between group and individual level accuracy measurements at the extremes of the information proportion treatments. When there was no group information encoded, we detected negative effects sizes, suggesting the distribution of group level accuracy was </w:t>
+        <w:t xml:space="preserve">of the information proportion treatments. When there was no group information encoded, we detected negative effects sizes, suggesting the distribution of group level accuracy was </w:t>
       </w:r>
       <w:r>
         <w:rPr>
@@ -7907,27 +7916,27 @@
           <w:rFonts w:ascii="Arial" w:hAnsi="Arial" w:cs="Arial"/>
         </w:rPr>
       </w:pPr>
-      <w:commentRangeStart w:id="343"/>
-      <w:commentRangeStart w:id="344"/>
+      <w:commentRangeStart w:id="347"/>
+      <w:commentRangeStart w:id="348"/>
       <w:r>
         <w:rPr>
           <w:rFonts w:ascii="Arial" w:hAnsi="Arial" w:cs="Arial"/>
         </w:rPr>
         <w:t xml:space="preserve">Table </w:t>
       </w:r>
-      <w:commentRangeEnd w:id="343"/>
+      <w:commentRangeEnd w:id="347"/>
       <w:r>
         <w:rPr>
           <w:rStyle w:val="CommentReference"/>
         </w:rPr>
-        <w:commentReference w:id="343"/>
-      </w:r>
-      <w:commentRangeEnd w:id="344"/>
+        <w:commentReference w:id="347"/>
+      </w:r>
+      <w:commentRangeEnd w:id="348"/>
       <w:r>
         <w:rPr>
           <w:rStyle w:val="CommentReference"/>
         </w:rPr>
-        <w:commentReference w:id="344"/>
+        <w:commentReference w:id="348"/>
       </w:r>
       <w:r>
         <w:rPr>
@@ -11919,7 +11928,6 @@
                 <w:szCs w:val="22"/>
                 <w14:ligatures w14:val="none"/>
               </w:rPr>
-              <w:lastRenderedPageBreak/>
               <w:t>8</w:t>
             </w:r>
           </w:p>
@@ -12682,6 +12690,7 @@
                 <w:szCs w:val="22"/>
                 <w14:ligatures w14:val="none"/>
               </w:rPr>
+              <w:lastRenderedPageBreak/>
               <w:t>4</w:t>
             </w:r>
           </w:p>
@@ -16054,75 +16063,76 @@
           <w:szCs w:val="22"/>
         </w:rPr>
       </w:pPr>
-      <w:r>
-        <w:rPr>
-          <w:rFonts w:ascii="Arial" w:hAnsi="Arial" w:cs="Arial"/>
-          <w:b/>
-          <w:bCs/>
-          <w:noProof/>
+      <w:del w:id="349" w:author="Smith Vidaurre, Grace" w:date="2025-05-27T21:15:00Z" w16du:dateUtc="2025-05-28T01:15:00Z">
+        <w:r>
+          <w:rPr>
+            <w:rFonts w:ascii="Arial" w:hAnsi="Arial" w:cs="Arial"/>
+            <w:b/>
+            <w:bCs/>
+            <w:noProof/>
+            <w:sz w:val="22"/>
+            <w:szCs w:val="22"/>
+          </w:rPr>
+          <w:drawing>
+            <wp:inline distT="0" distB="0" distL="0" distR="0" wp14:anchorId="5533CDDE" wp14:editId="25BF5BBA">
+              <wp:extent cx="5937250" cy="5145616"/>
+              <wp:effectExtent l="0" t="0" r="0" b="0"/>
+              <wp:docPr id="978950095" name="Picture 5"/>
+              <wp:cNvGraphicFramePr>
+                <a:graphicFrameLocks xmlns:a="http://schemas.openxmlformats.org/drawingml/2006/main" noChangeAspect="1"/>
+              </wp:cNvGraphicFramePr>
+              <a:graphic xmlns:a="http://schemas.openxmlformats.org/drawingml/2006/main">
+                <a:graphicData uri="http://schemas.openxmlformats.org/drawingml/2006/picture">
+                  <pic:pic xmlns:pic="http://schemas.openxmlformats.org/drawingml/2006/picture">
+                    <pic:nvPicPr>
+                      <pic:cNvPr id="978950095" name="Picture 5"/>
+                      <pic:cNvPicPr>
+                        <a:picLocks noChangeAspect="1" noChangeArrowheads="1"/>
+                      </pic:cNvPicPr>
+                    </pic:nvPicPr>
+                    <pic:blipFill>
+                      <a:blip r:embed="rId17">
+                        <a:extLst>
+                          <a:ext uri="{28A0092B-C50C-407E-A947-70E740481C1C}">
+                            <a14:useLocalDpi xmlns:a14="http://schemas.microsoft.com/office/drawing/2010/main" val="0"/>
+                          </a:ext>
+                        </a:extLst>
+                      </a:blip>
+                      <a:stretch>
+                        <a:fillRect/>
+                      </a:stretch>
+                    </pic:blipFill>
+                    <pic:spPr bwMode="auto">
+                      <a:xfrm>
+                        <a:off x="0" y="0"/>
+                        <a:ext cx="5937250" cy="5145616"/>
+                      </a:xfrm>
+                      <a:prstGeom prst="rect">
+                        <a:avLst/>
+                      </a:prstGeom>
+                      <a:noFill/>
+                      <a:ln>
+                        <a:noFill/>
+                      </a:ln>
+                    </pic:spPr>
+                  </pic:pic>
+                </a:graphicData>
+              </a:graphic>
+            </wp:inline>
+          </w:drawing>
+        </w:r>
+      </w:del>
+    </w:p>
+    <w:p>
+      <w:pPr>
+        <w:spacing w:line="480" w:lineRule="auto"/>
+        <w:rPr>
+          <w:rFonts w:ascii="Arial" w:hAnsi="Arial" w:cs="Arial"/>
           <w:sz w:val="22"/>
           <w:szCs w:val="22"/>
         </w:rPr>
-        <w:lastRenderedPageBreak/>
-        <w:drawing>
-          <wp:inline distT="0" distB="0" distL="0" distR="0" wp14:anchorId="5533CDDE" wp14:editId="5F20D14C">
-            <wp:extent cx="5937250" cy="5145616"/>
-            <wp:effectExtent l="0" t="0" r="0" b="0"/>
-            <wp:docPr id="978950095" name="Picture 5"/>
-            <wp:cNvGraphicFramePr>
-              <a:graphicFrameLocks xmlns:a="http://schemas.openxmlformats.org/drawingml/2006/main" noChangeAspect="1"/>
-            </wp:cNvGraphicFramePr>
-            <a:graphic xmlns:a="http://schemas.openxmlformats.org/drawingml/2006/main">
-              <a:graphicData uri="http://schemas.openxmlformats.org/drawingml/2006/picture">
-                <pic:pic xmlns:pic="http://schemas.openxmlformats.org/drawingml/2006/picture">
-                  <pic:nvPicPr>
-                    <pic:cNvPr id="978950095" name="Picture 5"/>
-                    <pic:cNvPicPr>
-                      <a:picLocks noChangeAspect="1" noChangeArrowheads="1"/>
-                    </pic:cNvPicPr>
-                  </pic:nvPicPr>
-                  <pic:blipFill>
-                    <a:blip r:embed="rId17">
-                      <a:extLst>
-                        <a:ext uri="{28A0092B-C50C-407E-A947-70E740481C1C}">
-                          <a14:useLocalDpi xmlns:a14="http://schemas.microsoft.com/office/drawing/2010/main" val="0"/>
-                        </a:ext>
-                      </a:extLst>
-                    </a:blip>
-                    <a:stretch>
-                      <a:fillRect/>
-                    </a:stretch>
-                  </pic:blipFill>
-                  <pic:spPr bwMode="auto">
-                    <a:xfrm>
-                      <a:off x="0" y="0"/>
-                      <a:ext cx="5937250" cy="5145616"/>
-                    </a:xfrm>
-                    <a:prstGeom prst="rect">
-                      <a:avLst/>
-                    </a:prstGeom>
-                    <a:noFill/>
-                    <a:ln>
-                      <a:noFill/>
-                    </a:ln>
-                  </pic:spPr>
-                </pic:pic>
-              </a:graphicData>
-            </a:graphic>
-          </wp:inline>
-        </w:drawing>
-      </w:r>
-    </w:p>
-    <w:p>
-      <w:pPr>
-        <w:spacing w:line="480" w:lineRule="auto"/>
-        <w:rPr>
-          <w:rFonts w:ascii="Arial" w:hAnsi="Arial" w:cs="Arial"/>
-          <w:sz w:val="22"/>
-          <w:szCs w:val="22"/>
-        </w:rPr>
-      </w:pPr>
-      <w:commentRangeStart w:id="345"/>
+      </w:pPr>
+      <w:commentRangeStart w:id="350"/>
       <w:r>
         <w:rPr>
           <w:rFonts w:ascii="Arial" w:hAnsi="Arial" w:cs="Arial"/>
@@ -16133,7 +16143,7 @@
         </w:rPr>
         <w:t xml:space="preserve">Figure </w:t>
       </w:r>
-      <w:commentRangeEnd w:id="345"/>
+      <w:commentRangeEnd w:id="350"/>
       <w:r>
         <w:rPr>
           <w:rStyle w:val="CommentReference"/>
@@ -16141,7 +16151,7 @@
           <w:sz w:val="22"/>
           <w:szCs w:val="22"/>
         </w:rPr>
-        <w:commentReference w:id="345"/>
+        <w:commentReference w:id="350"/>
       </w:r>
       <w:r>
         <w:rPr>
@@ -16210,72 +16220,78 @@
         <w:rPr>
           <w:rFonts w:ascii="Arial" w:hAnsi="Arial" w:cs="Arial"/>
         </w:rPr>
+        <w:t xml:space="preserve">Our package, </w:t>
+      </w:r>
+      <w:proofErr w:type="spellStart"/>
+      <w:r>
+        <w:rPr>
+          <w:rFonts w:ascii="Arial" w:hAnsi="Arial" w:cs="Arial"/>
+        </w:rPr>
+        <w:t>paRsynth</w:t>
+      </w:r>
+      <w:proofErr w:type="spellEnd"/>
+      <w:r>
+        <w:rPr>
+          <w:rFonts w:ascii="Arial" w:hAnsi="Arial" w:cs="Arial"/>
+        </w:rPr>
+        <w:t xml:space="preserve">, is a new synthetic tool for studying information encoding in animal communication. </w:t>
+      </w:r>
+      <w:r>
+        <w:rPr>
+          <w:rFonts w:ascii="Arial" w:hAnsi="Arial" w:cs="Arial"/>
+        </w:rPr>
+        <w:t xml:space="preserve">Synthetic tools offer a </w:t>
+      </w:r>
+      <w:proofErr w:type="gramStart"/>
+      <w:r>
+        <w:rPr>
+          <w:rFonts w:ascii="Arial" w:hAnsi="Arial" w:cs="Arial"/>
+        </w:rPr>
+        <w:t>practical solutions</w:t>
+      </w:r>
+      <w:proofErr w:type="gramEnd"/>
+      <w:r>
+        <w:rPr>
+          <w:rFonts w:ascii="Arial" w:hAnsi="Arial" w:cs="Arial"/>
+        </w:rPr>
+        <w:t xml:space="preserve"> to limitations in animal communication research imposed by naturalistic data collection</w:t>
+      </w:r>
+      <w:r>
+        <w:rPr>
+          <w:rFonts w:ascii="Arial" w:hAnsi="Arial" w:cs="Arial"/>
+        </w:rPr>
+        <w:t>, while still providing datasets that mimic biologic</w:t>
+      </w:r>
+      <w:r>
+        <w:rPr>
+          <w:rFonts w:ascii="Arial" w:hAnsi="Arial" w:cs="Arial"/>
+        </w:rPr>
+        <w:t>al</w:t>
+      </w:r>
+      <w:r>
+        <w:rPr>
+          <w:rFonts w:ascii="Arial" w:hAnsi="Arial" w:cs="Arial"/>
+        </w:rPr>
+        <w:t xml:space="preserve"> ones. Currently</w:t>
+      </w:r>
+      <w:r>
+        <w:rPr>
+          <w:rFonts w:ascii="Arial" w:hAnsi="Arial" w:cs="Arial"/>
+        </w:rPr>
+        <w:t>,</w:t>
+      </w:r>
+      <w:r>
+        <w:rPr>
+          <w:rFonts w:ascii="Arial" w:hAnsi="Arial" w:cs="Arial"/>
+        </w:rPr>
+        <w:t xml:space="preserve"> there are calls for vocal </w:t>
+      </w:r>
+      <w:r>
+        <w:rPr>
+          <w:rFonts w:ascii="Arial" w:hAnsi="Arial" w:cs="Arial"/>
+        </w:rPr>
         <w:lastRenderedPageBreak/>
-        <w:t xml:space="preserve">Our package, </w:t>
-      </w:r>
-      <w:proofErr w:type="spellStart"/>
-      <w:r>
-        <w:rPr>
-          <w:rFonts w:ascii="Arial" w:hAnsi="Arial" w:cs="Arial"/>
-        </w:rPr>
-        <w:t>paRsynth</w:t>
-      </w:r>
-      <w:proofErr w:type="spellEnd"/>
-      <w:r>
-        <w:rPr>
-          <w:rFonts w:ascii="Arial" w:hAnsi="Arial" w:cs="Arial"/>
-        </w:rPr>
-        <w:t xml:space="preserve">, is a new synthetic tool for studying information encoding in animal communication. </w:t>
-      </w:r>
-      <w:r>
-        <w:rPr>
-          <w:rFonts w:ascii="Arial" w:hAnsi="Arial" w:cs="Arial"/>
-        </w:rPr>
-        <w:t xml:space="preserve">Synthetic tools offer a </w:t>
-      </w:r>
-      <w:proofErr w:type="gramStart"/>
-      <w:r>
-        <w:rPr>
-          <w:rFonts w:ascii="Arial" w:hAnsi="Arial" w:cs="Arial"/>
-        </w:rPr>
-        <w:t>practical solutions</w:t>
-      </w:r>
-      <w:proofErr w:type="gramEnd"/>
-      <w:r>
-        <w:rPr>
-          <w:rFonts w:ascii="Arial" w:hAnsi="Arial" w:cs="Arial"/>
-        </w:rPr>
-        <w:t xml:space="preserve"> to limitations in animal communication research imposed by naturalistic data collection</w:t>
-      </w:r>
-      <w:r>
-        <w:rPr>
-          <w:rFonts w:ascii="Arial" w:hAnsi="Arial" w:cs="Arial"/>
-        </w:rPr>
-        <w:t>, while still providing datasets that mimic biologic</w:t>
-      </w:r>
-      <w:r>
-        <w:rPr>
-          <w:rFonts w:ascii="Arial" w:hAnsi="Arial" w:cs="Arial"/>
-        </w:rPr>
-        <w:t>al</w:t>
-      </w:r>
-      <w:r>
-        <w:rPr>
-          <w:rFonts w:ascii="Arial" w:hAnsi="Arial" w:cs="Arial"/>
-        </w:rPr>
-        <w:t xml:space="preserve"> ones. Currently</w:t>
-      </w:r>
-      <w:r>
-        <w:rPr>
-          <w:rFonts w:ascii="Arial" w:hAnsi="Arial" w:cs="Arial"/>
-        </w:rPr>
-        <w:t>,</w:t>
-      </w:r>
-      <w:r>
-        <w:rPr>
-          <w:rFonts w:ascii="Arial" w:hAnsi="Arial" w:cs="Arial"/>
-        </w:rPr>
-        <w:t xml:space="preserve"> there are calls for vocal communication research to take advantage </w:t>
+        <w:t xml:space="preserve">communication research to take advantage </w:t>
       </w:r>
       <w:r>
         <w:rPr>
@@ -16663,14 +16679,7 @@
         <w:rPr>
           <w:rFonts w:ascii="Arial" w:hAnsi="Arial" w:cs="Arial"/>
         </w:rPr>
-        <w:t xml:space="preserve"> </w:t>
-      </w:r>
-      <w:r>
-        <w:rPr>
-          <w:rFonts w:ascii="Arial" w:hAnsi="Arial" w:cs="Arial"/>
-        </w:rPr>
-        <w:lastRenderedPageBreak/>
-        <w:t>research</w:t>
+        <w:t xml:space="preserve"> research</w:t>
       </w:r>
       <w:r>
         <w:rPr>
@@ -16744,7 +16753,7 @@
           <w:rFonts w:ascii="Arial" w:hAnsi="Arial" w:cs="Arial"/>
         </w:rPr>
       </w:pPr>
-      <w:commentRangeStart w:id="346"/>
+      <w:commentRangeStart w:id="351"/>
       <w:r>
         <w:rPr>
           <w:rFonts w:ascii="Arial" w:hAnsi="Arial" w:cs="Arial"/>
@@ -16753,7 +16762,7 @@
         </w:rPr>
         <w:t xml:space="preserve">Materials and </w:t>
       </w:r>
-      <w:commentRangeStart w:id="347"/>
+      <w:commentRangeStart w:id="352"/>
       <w:r>
         <w:rPr>
           <w:rFonts w:ascii="Arial" w:hAnsi="Arial" w:cs="Arial"/>
@@ -16762,12 +16771,12 @@
         </w:rPr>
         <w:t>Methods</w:t>
       </w:r>
-      <w:commentRangeEnd w:id="347"/>
+      <w:commentRangeEnd w:id="352"/>
       <w:r>
         <w:rPr>
           <w:rStyle w:val="CommentReference"/>
         </w:rPr>
-        <w:commentReference w:id="347"/>
+        <w:commentReference w:id="352"/>
       </w:r>
       <w:r>
         <w:rPr>
@@ -16775,12 +16784,12 @@
         </w:rPr>
         <w:t>:</w:t>
       </w:r>
-      <w:commentRangeEnd w:id="346"/>
+      <w:commentRangeEnd w:id="351"/>
       <w:r>
         <w:rPr>
           <w:rStyle w:val="CommentReference"/>
         </w:rPr>
-        <w:commentReference w:id="346"/>
+        <w:commentReference w:id="351"/>
       </w:r>
     </w:p>
     <w:p>
@@ -16827,27 +16836,27 @@
         </w:rPr>
         <w:t xml:space="preserve"> </w:t>
       </w:r>
-      <w:commentRangeStart w:id="348"/>
-      <w:commentRangeStart w:id="349"/>
+      <w:commentRangeStart w:id="353"/>
+      <w:commentRangeStart w:id="354"/>
       <w:r>
         <w:rPr>
           <w:rFonts w:ascii="Arial" w:hAnsi="Arial" w:cs="Arial"/>
         </w:rPr>
         <w:t xml:space="preserve">5 components (Figure 1): </w:t>
       </w:r>
-      <w:commentRangeEnd w:id="348"/>
+      <w:commentRangeEnd w:id="353"/>
       <w:r>
         <w:rPr>
           <w:rStyle w:val="CommentReference"/>
         </w:rPr>
-        <w:commentReference w:id="348"/>
-      </w:r>
-      <w:commentRangeEnd w:id="349"/>
+        <w:commentReference w:id="353"/>
+      </w:r>
+      <w:commentRangeEnd w:id="354"/>
       <w:r>
         <w:rPr>
           <w:rStyle w:val="CommentReference"/>
         </w:rPr>
-        <w:commentReference w:id="349"/>
+        <w:commentReference w:id="354"/>
       </w:r>
       <w:r>
         <w:rPr>
@@ -16855,19 +16864,19 @@
         </w:rPr>
         <w:t xml:space="preserve">a global head (a string of characters shared across all individuals; TKTK character length), a section of group information, a section of individual information, another section of group information, and a global tail (a string of characters shared across all individuals; TKTK character length). Later versions of our code will allow users to choose where and how much information is encoded in the signal. We varied the character length of the group and individual sections depending on treatment, discussed below. We used three unique characters in the string: A, B, and C. </w:t>
       </w:r>
-      <w:commentRangeStart w:id="350"/>
+      <w:commentRangeStart w:id="355"/>
       <w:r>
         <w:rPr>
           <w:rFonts w:ascii="Arial" w:hAnsi="Arial" w:cs="Arial"/>
         </w:rPr>
         <w:t>Once character strings were generated, we added random variation in each call to represent variation within an individual’s call repertoires</w:t>
       </w:r>
-      <w:commentRangeEnd w:id="350"/>
+      <w:commentRangeEnd w:id="355"/>
       <w:r>
         <w:rPr>
           <w:rStyle w:val="CommentReference"/>
         </w:rPr>
-        <w:commentReference w:id="350"/>
+        <w:commentReference w:id="355"/>
       </w:r>
       <w:r>
         <w:rPr>
@@ -16952,64 +16961,64 @@
         <w:rPr>
           <w:rFonts w:ascii="Arial" w:hAnsi="Arial" w:cs="Arial"/>
         </w:rPr>
-        <w:t xml:space="preserve"> encoding, which reduces the </w:t>
+        <w:t xml:space="preserve"> encoding, which reduces the frequences profile of a signal to a “</w:t>
+      </w:r>
+      <w:proofErr w:type="spellStart"/>
+      <w:r>
+        <w:rPr>
+          <w:rFonts w:ascii="Arial" w:hAnsi="Arial" w:cs="Arial"/>
+        </w:rPr>
+        <w:t>trit</w:t>
+      </w:r>
+      <w:proofErr w:type="spellEnd"/>
+      <w:r>
+        <w:rPr>
+          <w:rFonts w:ascii="Arial" w:hAnsi="Arial" w:cs="Arial"/>
+        </w:rPr>
+        <w:t xml:space="preserve">” of information by noting the direction of frequency change (up, down, or constant) in a series of subsamples from the original signal, known as Parsons segments. Parsons code is often used in the retrieval and study of music </w:t>
+      </w:r>
+      <w:r>
+        <w:rPr>
+          <w:rFonts w:ascii="Arial" w:hAnsi="Arial" w:cs="Arial"/>
+        </w:rPr>
+        <w:fldChar w:fldCharType="begin"/>
+      </w:r>
+      <w:r>
+        <w:rPr>
+          <w:rFonts w:ascii="Arial" w:hAnsi="Arial" w:cs="Arial"/>
+        </w:rPr>
+        <w:instrText xml:space="preserve"> ADDIN ZOTERO_ITEM CSL_CITATION {"citationID":"8E9FupMd","properties":{"formattedCitation":"(41)","plainCitation":"(41)","noteIndex":0},"citationItems":[{"id":601,"uris":["http://zotero.org/groups/5786507/items/IJTC2XE2"],"itemData":{"id":601,"type":"article-journal","container-title":"Annual review of information science and technology","issue":"1","page":"295-340","title":"Music information retrieval","volume":"37","author":[{"family":"Downie","given":"J.S."}],"issued":{"date-parts":[["2003"]]}}}],"schema":"https://github.com/citation-style-language/schema/raw/master/csl-citation.json"} </w:instrText>
+      </w:r>
+      <w:r>
+        <w:rPr>
+          <w:rFonts w:ascii="Arial" w:hAnsi="Arial" w:cs="Arial"/>
+        </w:rPr>
+        <w:fldChar w:fldCharType="separate"/>
+      </w:r>
+      <w:r>
+        <w:rPr>
+          <w:rFonts w:ascii="Arial" w:hAnsi="Arial" w:cs="Arial"/>
+        </w:rPr>
+        <w:t>(41)</w:t>
+      </w:r>
+      <w:r>
+        <w:rPr>
+          <w:rFonts w:ascii="Arial" w:hAnsi="Arial" w:cs="Arial"/>
+        </w:rPr>
+        <w:fldChar w:fldCharType="end"/>
+      </w:r>
+      <w:r>
+        <w:rPr>
+          <w:rFonts w:ascii="Arial" w:hAnsi="Arial" w:cs="Arial"/>
+        </w:rPr>
+        <w:t xml:space="preserve">, however researchers have used a Parsons code metric to decode </w:t>
       </w:r>
       <w:r>
         <w:rPr>
           <w:rFonts w:ascii="Arial" w:hAnsi="Arial" w:cs="Arial"/>
         </w:rPr>
         <w:lastRenderedPageBreak/>
-        <w:t>frequences profile of a signal to a “</w:t>
-      </w:r>
-      <w:proofErr w:type="spellStart"/>
-      <w:r>
-        <w:rPr>
-          <w:rFonts w:ascii="Arial" w:hAnsi="Arial" w:cs="Arial"/>
-        </w:rPr>
-        <w:t>trit</w:t>
-      </w:r>
-      <w:proofErr w:type="spellEnd"/>
-      <w:r>
-        <w:rPr>
-          <w:rFonts w:ascii="Arial" w:hAnsi="Arial" w:cs="Arial"/>
-        </w:rPr>
-        <w:t xml:space="preserve">” of information by noting the direction of frequency change (up, down, or constant) in a series of subsamples from the original signal, known as Parsons segments. Parsons code is often used in the retrieval and study of music </w:t>
-      </w:r>
-      <w:r>
-        <w:rPr>
-          <w:rFonts w:ascii="Arial" w:hAnsi="Arial" w:cs="Arial"/>
-        </w:rPr>
-        <w:fldChar w:fldCharType="begin"/>
-      </w:r>
-      <w:r>
-        <w:rPr>
-          <w:rFonts w:ascii="Arial" w:hAnsi="Arial" w:cs="Arial"/>
-        </w:rPr>
-        <w:instrText xml:space="preserve"> ADDIN ZOTERO_ITEM CSL_CITATION {"citationID":"8E9FupMd","properties":{"formattedCitation":"(41)","plainCitation":"(41)","noteIndex":0},"citationItems":[{"id":601,"uris":["http://zotero.org/groups/5786507/items/IJTC2XE2"],"itemData":{"id":601,"type":"article-journal","container-title":"Annual review of information science and technology","issue":"1","page":"295-340","title":"Music information retrieval","volume":"37","author":[{"family":"Downie","given":"J.S."}],"issued":{"date-parts":[["2003"]]}}}],"schema":"https://github.com/citation-style-language/schema/raw/master/csl-citation.json"} </w:instrText>
-      </w:r>
-      <w:r>
-        <w:rPr>
-          <w:rFonts w:ascii="Arial" w:hAnsi="Arial" w:cs="Arial"/>
-        </w:rPr>
-        <w:fldChar w:fldCharType="separate"/>
-      </w:r>
-      <w:r>
-        <w:rPr>
-          <w:rFonts w:ascii="Arial" w:hAnsi="Arial" w:cs="Arial"/>
-        </w:rPr>
-        <w:t>(41)</w:t>
-      </w:r>
-      <w:r>
-        <w:rPr>
-          <w:rFonts w:ascii="Arial" w:hAnsi="Arial" w:cs="Arial"/>
-        </w:rPr>
-        <w:fldChar w:fldCharType="end"/>
-      </w:r>
-      <w:r>
-        <w:rPr>
-          <w:rFonts w:ascii="Arial" w:hAnsi="Arial" w:cs="Arial"/>
-        </w:rPr>
-        <w:t xml:space="preserve">, however researchers have used a Parsons code metric to decode information in frequency-based animal signals with great success </w:t>
+        <w:t xml:space="preserve">information in frequency-based animal signals with great success </w:t>
       </w:r>
       <w:r>
         <w:rPr>
@@ -17062,27 +17071,27 @@
         </w:rPr>
         <w:t xml:space="preserve">Once strings were in Parson’s code, we converted each section of the vocalization into frequency anchors, measured in Hz. Each subcomponent of synthetic vocalization started at a randomly selected frequency between (TKTK range). </w:t>
       </w:r>
-      <w:commentRangeStart w:id="351"/>
-      <w:commentRangeStart w:id="352"/>
+      <w:commentRangeStart w:id="356"/>
+      <w:commentRangeStart w:id="357"/>
       <w:r>
         <w:rPr>
           <w:rFonts w:ascii="Arial" w:hAnsi="Arial" w:cs="Arial"/>
         </w:rPr>
         <w:t xml:space="preserve">This starting frequency served as a baseline for creating frequency anchors with Parson’s code, which determined if the next frequency anchor was greater than, less than, or the same as the frequency anchor before it. For example, if a synthetic vocalization started at 4000Hz and the first Parson’s code value is “constant”, then the next frequency anchor would also be 4000Hz. However, if the first Parson’s code was “up”, then the second frequency anchor would be 5000Hz. </w:t>
       </w:r>
-      <w:commentRangeEnd w:id="351"/>
+      <w:commentRangeEnd w:id="356"/>
       <w:r>
         <w:rPr>
           <w:rStyle w:val="CommentReference"/>
         </w:rPr>
-        <w:commentReference w:id="351"/>
-      </w:r>
-      <w:commentRangeEnd w:id="352"/>
+        <w:commentReference w:id="356"/>
+      </w:r>
+      <w:commentRangeEnd w:id="357"/>
       <w:r>
         <w:rPr>
           <w:rStyle w:val="CommentReference"/>
         </w:rPr>
-        <w:commentReference w:id="352"/>
+        <w:commentReference w:id="357"/>
       </w:r>
       <w:r>
         <w:rPr>
@@ -17117,7 +17126,6 @@
         <w:rPr>
           <w:rFonts w:ascii="Arial" w:hAnsi="Arial" w:cs="Arial"/>
         </w:rPr>
-        <w:lastRenderedPageBreak/>
         <w:t xml:space="preserve">We used R to generate strings and synthetic audio signals, using the </w:t>
       </w:r>
       <w:proofErr w:type="spellStart"/>
@@ -17173,29 +17181,30 @@
         <w:rPr>
           <w:rFonts w:ascii="Arial" w:hAnsi="Arial" w:cs="Arial"/>
         </w:rPr>
+        <w:lastRenderedPageBreak/>
         <w:t xml:space="preserve">Using the process described above, we created two synthetic data sets: one that created </w:t>
       </w:r>
-      <w:commentRangeStart w:id="353"/>
-      <w:commentRangeStart w:id="354"/>
+      <w:commentRangeStart w:id="358"/>
+      <w:commentRangeStart w:id="359"/>
       <w:r>
         <w:rPr>
           <w:rFonts w:ascii="Arial" w:hAnsi="Arial" w:cs="Arial"/>
         </w:rPr>
         <w:t xml:space="preserve">vocalizations </w:t>
       </w:r>
-      <w:commentRangeEnd w:id="353"/>
+      <w:commentRangeEnd w:id="358"/>
       <w:r>
         <w:rPr>
           <w:rStyle w:val="CommentReference"/>
         </w:rPr>
-        <w:commentReference w:id="353"/>
-      </w:r>
-      <w:commentRangeEnd w:id="354"/>
+        <w:commentReference w:id="358"/>
+      </w:r>
+      <w:commentRangeEnd w:id="359"/>
       <w:r>
         <w:rPr>
           <w:rStyle w:val="CommentReference"/>
         </w:rPr>
-        <w:commentReference w:id="354"/>
+        <w:commentReference w:id="359"/>
       </w:r>
       <w:r>
         <w:rPr>
@@ -17263,19 +17272,19 @@
         </w:rPr>
         <w:t xml:space="preserve"> dataset), and one that created </w:t>
       </w:r>
-      <w:commentRangeStart w:id="355"/>
+      <w:commentRangeStart w:id="360"/>
       <w:r>
         <w:rPr>
           <w:rFonts w:ascii="Arial" w:hAnsi="Arial" w:cs="Arial"/>
         </w:rPr>
         <w:t xml:space="preserve">character strings </w:t>
       </w:r>
-      <w:commentRangeEnd w:id="355"/>
+      <w:commentRangeEnd w:id="360"/>
       <w:r>
         <w:rPr>
           <w:rStyle w:val="CommentReference"/>
         </w:rPr>
-        <w:commentReference w:id="355"/>
+        <w:commentReference w:id="360"/>
       </w:r>
       <w:r>
         <w:rPr>
@@ -17295,13 +17304,13 @@
         </w:rPr>
         <w:t xml:space="preserve">; </w:t>
       </w:r>
-      <w:commentRangeStart w:id="356"/>
-      <w:commentRangeEnd w:id="356"/>
+      <w:commentRangeStart w:id="361"/>
+      <w:commentRangeEnd w:id="361"/>
       <w:r>
         <w:rPr>
           <w:rStyle w:val="CommentReference"/>
         </w:rPr>
-        <w:commentReference w:id="356"/>
+        <w:commentReference w:id="361"/>
       </w:r>
       <w:r>
         <w:rPr>
@@ -17333,19 +17342,19 @@
         </w:rPr>
         <w:t xml:space="preserve">, individual information was set to a character length of 4 characters, and group member information was set to </w:t>
       </w:r>
-      <w:commentRangeStart w:id="357"/>
+      <w:commentRangeStart w:id="362"/>
       <w:r>
         <w:rPr>
           <w:rFonts w:ascii="Arial" w:hAnsi="Arial" w:cs="Arial"/>
         </w:rPr>
         <w:t>a character length of 8 character</w:t>
       </w:r>
-      <w:commentRangeEnd w:id="357"/>
+      <w:commentRangeEnd w:id="362"/>
       <w:r>
         <w:rPr>
           <w:rStyle w:val="CommentReference"/>
         </w:rPr>
-        <w:commentReference w:id="357"/>
+        <w:commentReference w:id="362"/>
       </w:r>
       <w:r>
         <w:rPr>
@@ -17365,19 +17374,19 @@
         </w:rPr>
         <w:t xml:space="preserve">, individual information was set to a </w:t>
       </w:r>
-      <w:commentRangeStart w:id="358"/>
+      <w:commentRangeStart w:id="363"/>
       <w:r>
         <w:rPr>
           <w:rFonts w:ascii="Arial" w:hAnsi="Arial" w:cs="Arial"/>
         </w:rPr>
         <w:t>character length of 8 characters</w:t>
       </w:r>
-      <w:commentRangeEnd w:id="358"/>
+      <w:commentRangeEnd w:id="363"/>
       <w:r>
         <w:rPr>
           <w:rStyle w:val="CommentReference"/>
         </w:rPr>
-        <w:commentReference w:id="358"/>
+        <w:commentReference w:id="363"/>
       </w:r>
       <w:r>
         <w:rPr>
@@ -17477,8 +17486,14 @@
         <w:rPr>
           <w:rFonts w:ascii="Arial" w:hAnsi="Arial" w:cs="Arial"/>
         </w:rPr>
+        <w:t xml:space="preserve">To assess hierarchical mapping patterns of our two datasets, we used non-metric multidimensional scaling (MDS) to reduce the dimensionality of the SPCC matrix for each dataset. We performed MDS over 15 dimensions so that the stress of the model was TKTK (less than 5). From these results, we two generated low-dimensional </w:t>
+      </w:r>
+      <w:r>
+        <w:rPr>
+          <w:rFonts w:ascii="Arial" w:hAnsi="Arial" w:cs="Arial"/>
+        </w:rPr>
         <w:lastRenderedPageBreak/>
-        <w:t xml:space="preserve">To assess hierarchical mapping patterns of our two datasets, we used non-metric multidimensional scaling (MDS) to reduce the dimensionality of the SPCC matrix for each dataset. We performed MDS over 15 dimensions so that the stress of the model was TKTK (less than 5). From these results, we two generated low-dimensional acoustic space plots for each dataset, one visualizing the acoustic space between groups and one visualizing the acoustic space between individuals. In doing this for each dataset, we can compare how well the </w:t>
+        <w:t xml:space="preserve">acoustic space plots for each dataset, one visualizing the acoustic space between groups and one visualizing the acoustic space between individuals. In doing this for each dataset, we can compare how well the </w:t>
       </w:r>
       <w:r>
         <w:rPr>
@@ -17621,32 +17636,25 @@
         </w:rPr>
         <w:t xml:space="preserve">synthetic data sets across 16 treatments that varied over social environment characteristics and information encoding rules. </w:t>
       </w:r>
-      <w:commentRangeStart w:id="359"/>
+      <w:commentRangeStart w:id="364"/>
       <w:r>
         <w:rPr>
           <w:rFonts w:ascii="Arial" w:hAnsi="Arial" w:cs="Arial"/>
         </w:rPr>
         <w:t>We varied social environment characteristics represented information signaling changes that happen in socially sparse vs socially dense signaling environments</w:t>
       </w:r>
-      <w:commentRangeEnd w:id="359"/>
+      <w:commentRangeEnd w:id="364"/>
       <w:r>
         <w:rPr>
           <w:rStyle w:val="CommentReference"/>
         </w:rPr>
-        <w:commentReference w:id="359"/>
-      </w:r>
-      <w:r>
-        <w:rPr>
-          <w:rFonts w:ascii="Arial" w:hAnsi="Arial" w:cs="Arial"/>
-        </w:rPr>
-        <w:t xml:space="preserve">. We achieved this by creating four social conditions: 2 groups with 2 individuals per group, 4 groups with 4 individuals per group, 6 groups with 6 individuals per group, and 8 groups with 8 individuals per group. We also varied the proportion of group information to individual information encoded in the signal, with four categories: 0 (representing all individual information and no group information), 1/3, 2/3, and 1 (representing all group </w:t>
-      </w:r>
-      <w:r>
-        <w:rPr>
-          <w:rFonts w:ascii="Arial" w:hAnsi="Arial" w:cs="Arial"/>
-        </w:rPr>
-        <w:lastRenderedPageBreak/>
-        <w:t xml:space="preserve">information and no individual information. We iterated over each treatment 10 times, generating 10 unique synthetic datasets per treatment. </w:t>
+        <w:commentReference w:id="364"/>
+      </w:r>
+      <w:r>
+        <w:rPr>
+          <w:rFonts w:ascii="Arial" w:hAnsi="Arial" w:cs="Arial"/>
+        </w:rPr>
+        <w:t xml:space="preserve">. We achieved this by creating four social conditions: 2 groups with 2 individuals per group, 4 groups with 4 individuals per group, 6 groups with 6 individuals per group, and 8 groups with 8 individuals per group. We also varied the proportion of group information to individual information encoded in the signal, with four categories: 0 (representing all individual information and no group information), 1/3, 2/3, and 1 (representing all group information and no individual information. We iterated over each treatment 10 times, generating 10 unique synthetic datasets per treatment. </w:t>
       </w:r>
     </w:p>
     <w:p>
@@ -17676,7 +17684,14 @@
         <w:rPr>
           <w:rFonts w:ascii="Arial" w:hAnsi="Arial" w:cs="Arial"/>
         </w:rPr>
-        <w:t xml:space="preserve"> the datasets above, we performed SPCC. We also calculated the edit distance for the original strings. After these calculations, we performed Multidimensional Scaling on both the SPCC and edit distance matrices, then performed k-means clustering, randomly selecting 1 call per individual per group, to ensure that call exemplars per class matched between social levels. From this, we were able to calculate the accuracy of detecting information at the group and individual levels from vocalizations represented as character strings (edit distance pipeline) or synthetic audio files (tradition </w:t>
+        <w:t xml:space="preserve"> the datasets above, we performed SPCC. We also calculated the edit distance for the </w:t>
+      </w:r>
+      <w:r>
+        <w:rPr>
+          <w:rFonts w:ascii="Arial" w:hAnsi="Arial" w:cs="Arial"/>
+        </w:rPr>
+        <w:lastRenderedPageBreak/>
+        <w:t xml:space="preserve">original strings. After these calculations, we performed Multidimensional Scaling on both the SPCC and edit distance matrices, then performed k-means clustering, randomly selecting 1 call per individual per group, to ensure that call exemplars per class matched between social levels. From this, we were able to calculate the accuracy of detecting information at the group and individual levels from vocalizations represented as character strings (edit distance pipeline) or synthetic audio files (tradition </w:t>
       </w:r>
       <w:r>
         <w:rPr>
@@ -18788,74 +18803,76 @@
           <w:szCs w:val="20"/>
         </w:rPr>
       </w:pPr>
-      <w:r>
-        <w:rPr>
-          <w:noProof/>
-        </w:rPr>
-        <w:lastRenderedPageBreak/>
-        <w:drawing>
-          <wp:anchor distT="0" distB="0" distL="114300" distR="114300" simplePos="0" relativeHeight="251660288" behindDoc="0" locked="0" layoutInCell="1" allowOverlap="1" wp14:anchorId="05714678" wp14:editId="54D8D536">
-            <wp:simplePos x="0" y="0"/>
-            <wp:positionH relativeFrom="page">
-              <wp:align>right</wp:align>
-            </wp:positionH>
-            <wp:positionV relativeFrom="paragraph">
-              <wp:posOffset>123825</wp:posOffset>
-            </wp:positionV>
-            <wp:extent cx="7146290" cy="4019550"/>
-            <wp:effectExtent l="0" t="0" r="0" b="0"/>
-            <wp:wrapTopAndBottom/>
-            <wp:docPr id="1250913601" name="Picture 1" descr="A screenshot of a graph&#10;&#10;AI-generated content may be incorrect."/>
-            <wp:cNvGraphicFramePr>
-              <a:graphicFrameLocks xmlns:a="http://schemas.openxmlformats.org/drawingml/2006/main" noChangeAspect="1"/>
-            </wp:cNvGraphicFramePr>
-            <a:graphic xmlns:a="http://schemas.openxmlformats.org/drawingml/2006/main">
-              <a:graphicData uri="http://schemas.openxmlformats.org/drawingml/2006/picture">
-                <pic:pic xmlns:pic="http://schemas.openxmlformats.org/drawingml/2006/picture">
-                  <pic:nvPicPr>
-                    <pic:cNvPr id="1915005499" name="Picture 1" descr="A screenshot of a graph&#10;&#10;AI-generated content may be incorrect."/>
-                    <pic:cNvPicPr>
-                      <a:picLocks noChangeAspect="1" noChangeArrowheads="1"/>
-                    </pic:cNvPicPr>
-                  </pic:nvPicPr>
-                  <pic:blipFill>
-                    <a:blip r:embed="rId18">
-                      <a:extLst>
-                        <a:ext uri="{28A0092B-C50C-407E-A947-70E740481C1C}">
-                          <a14:useLocalDpi xmlns:a14="http://schemas.microsoft.com/office/drawing/2010/main" val="0"/>
-                        </a:ext>
-                      </a:extLst>
-                    </a:blip>
-                    <a:srcRect/>
-                    <a:stretch>
-                      <a:fillRect/>
-                    </a:stretch>
-                  </pic:blipFill>
-                  <pic:spPr bwMode="auto">
-                    <a:xfrm>
-                      <a:off x="0" y="0"/>
-                      <a:ext cx="7146290" cy="4019550"/>
-                    </a:xfrm>
-                    <a:prstGeom prst="rect">
-                      <a:avLst/>
-                    </a:prstGeom>
-                    <a:noFill/>
-                    <a:ln>
+      <w:del w:id="365" w:author="Smith Vidaurre, Grace" w:date="2025-05-27T21:15:00Z" w16du:dateUtc="2025-05-28T01:15:00Z">
+        <w:r>
+          <w:rPr>
+            <w:noProof/>
+          </w:rPr>
+          <w:lastRenderedPageBreak/>
+          <w:drawing>
+            <wp:anchor distT="0" distB="0" distL="114300" distR="114300" simplePos="0" relativeHeight="251660288" behindDoc="0" locked="0" layoutInCell="1" allowOverlap="1" wp14:anchorId="05714678" wp14:editId="207EA9E8">
+              <wp:simplePos x="0" y="0"/>
+              <wp:positionH relativeFrom="page">
+                <wp:align>right</wp:align>
+              </wp:positionH>
+              <wp:positionV relativeFrom="paragraph">
+                <wp:posOffset>123825</wp:posOffset>
+              </wp:positionV>
+              <wp:extent cx="7146290" cy="4019550"/>
+              <wp:effectExtent l="0" t="0" r="0" b="0"/>
+              <wp:wrapTopAndBottom/>
+              <wp:docPr id="1250913601" name="Picture 1" descr="A screenshot of a graph&#10;&#10;AI-generated content may be incorrect."/>
+              <wp:cNvGraphicFramePr>
+                <a:graphicFrameLocks xmlns:a="http://schemas.openxmlformats.org/drawingml/2006/main" noChangeAspect="1"/>
+              </wp:cNvGraphicFramePr>
+              <a:graphic xmlns:a="http://schemas.openxmlformats.org/drawingml/2006/main">
+                <a:graphicData uri="http://schemas.openxmlformats.org/drawingml/2006/picture">
+                  <pic:pic xmlns:pic="http://schemas.openxmlformats.org/drawingml/2006/picture">
+                    <pic:nvPicPr>
+                      <pic:cNvPr id="1915005499" name="Picture 1" descr="A screenshot of a graph&#10;&#10;AI-generated content may be incorrect."/>
+                      <pic:cNvPicPr>
+                        <a:picLocks noChangeAspect="1" noChangeArrowheads="1"/>
+                      </pic:cNvPicPr>
+                    </pic:nvPicPr>
+                    <pic:blipFill>
+                      <a:blip r:embed="rId18">
+                        <a:extLst>
+                          <a:ext uri="{28A0092B-C50C-407E-A947-70E740481C1C}">
+                            <a14:useLocalDpi xmlns:a14="http://schemas.microsoft.com/office/drawing/2010/main" val="0"/>
+                          </a:ext>
+                        </a:extLst>
+                      </a:blip>
+                      <a:srcRect/>
+                      <a:stretch>
+                        <a:fillRect/>
+                      </a:stretch>
+                    </pic:blipFill>
+                    <pic:spPr bwMode="auto">
+                      <a:xfrm>
+                        <a:off x="0" y="0"/>
+                        <a:ext cx="7146290" cy="4019550"/>
+                      </a:xfrm>
+                      <a:prstGeom prst="rect">
+                        <a:avLst/>
+                      </a:prstGeom>
                       <a:noFill/>
-                    </a:ln>
-                  </pic:spPr>
-                </pic:pic>
-              </a:graphicData>
-            </a:graphic>
-            <wp14:sizeRelH relativeFrom="margin">
-              <wp14:pctWidth>0</wp14:pctWidth>
-            </wp14:sizeRelH>
-            <wp14:sizeRelV relativeFrom="margin">
-              <wp14:pctHeight>0</wp14:pctHeight>
-            </wp14:sizeRelV>
-          </wp:anchor>
-        </w:drawing>
-      </w:r>
+                      <a:ln>
+                        <a:noFill/>
+                      </a:ln>
+                    </pic:spPr>
+                  </pic:pic>
+                </a:graphicData>
+              </a:graphic>
+              <wp14:sizeRelH relativeFrom="margin">
+                <wp14:pctWidth>0</wp14:pctWidth>
+              </wp14:sizeRelH>
+              <wp14:sizeRelV relativeFrom="margin">
+                <wp14:pctHeight>0</wp14:pctHeight>
+              </wp14:sizeRelV>
+            </wp:anchor>
+          </w:drawing>
+        </w:r>
+      </w:del>
     </w:p>
     <w:p>
       <w:pPr>
@@ -18864,13 +18881,13 @@
           <w:rFonts w:ascii="Arial" w:hAnsi="Arial" w:cs="Arial"/>
         </w:rPr>
       </w:pPr>
-      <w:commentRangeStart w:id="360"/>
-      <w:commentRangeEnd w:id="360"/>
+      <w:commentRangeStart w:id="366"/>
+      <w:commentRangeEnd w:id="366"/>
       <w:r>
         <w:rPr>
           <w:rStyle w:val="CommentReference"/>
         </w:rPr>
-        <w:commentReference w:id="360"/>
+        <w:commentReference w:id="366"/>
       </w:r>
       <w:r>
         <w:rPr>
@@ -19002,61 +19019,63 @@
           <w:rFonts w:ascii="Arial" w:hAnsi="Arial" w:cs="Arial"/>
         </w:rPr>
       </w:pPr>
-      <w:r>
-        <w:rPr>
-          <w:rFonts w:ascii="Arial" w:hAnsi="Arial" w:cs="Arial"/>
-          <w:noProof/>
-        </w:rPr>
-        <w:lastRenderedPageBreak/>
-        <w:drawing>
-          <wp:inline distT="0" distB="0" distL="0" distR="0" wp14:anchorId="0606346E" wp14:editId="2BD4C215">
-            <wp:extent cx="5943600" cy="5943600"/>
-            <wp:effectExtent l="0" t="0" r="0" b="0"/>
-            <wp:docPr id="1617445812" name="Picture 12"/>
-            <wp:cNvGraphicFramePr>
-              <a:graphicFrameLocks xmlns:a="http://schemas.openxmlformats.org/drawingml/2006/main" noChangeAspect="1"/>
-            </wp:cNvGraphicFramePr>
-            <a:graphic xmlns:a="http://schemas.openxmlformats.org/drawingml/2006/main">
-              <a:graphicData uri="http://schemas.openxmlformats.org/drawingml/2006/picture">
-                <pic:pic xmlns:pic="http://schemas.openxmlformats.org/drawingml/2006/picture">
-                  <pic:nvPicPr>
-                    <pic:cNvPr id="0" name="Picture 14"/>
-                    <pic:cNvPicPr>
-                      <a:picLocks noChangeAspect="1" noChangeArrowheads="1"/>
-                    </pic:cNvPicPr>
-                  </pic:nvPicPr>
-                  <pic:blipFill>
-                    <a:blip r:embed="rId19" cstate="print">
-                      <a:extLst>
-                        <a:ext uri="{28A0092B-C50C-407E-A947-70E740481C1C}">
-                          <a14:useLocalDpi xmlns:a14="http://schemas.microsoft.com/office/drawing/2010/main" val="0"/>
-                        </a:ext>
-                      </a:extLst>
-                    </a:blip>
-                    <a:srcRect/>
-                    <a:stretch>
-                      <a:fillRect/>
-                    </a:stretch>
-                  </pic:blipFill>
-                  <pic:spPr bwMode="auto">
-                    <a:xfrm>
-                      <a:off x="0" y="0"/>
-                      <a:ext cx="5943600" cy="5943600"/>
-                    </a:xfrm>
-                    <a:prstGeom prst="rect">
-                      <a:avLst/>
-                    </a:prstGeom>
-                    <a:noFill/>
-                    <a:ln>
+      <w:del w:id="367" w:author="Smith Vidaurre, Grace" w:date="2025-05-27T21:15:00Z" w16du:dateUtc="2025-05-28T01:15:00Z">
+        <w:r>
+          <w:rPr>
+            <w:rFonts w:ascii="Arial" w:hAnsi="Arial" w:cs="Arial"/>
+            <w:noProof/>
+          </w:rPr>
+          <w:lastRenderedPageBreak/>
+          <w:drawing>
+            <wp:inline distT="0" distB="0" distL="0" distR="0" wp14:anchorId="0606346E" wp14:editId="0AA928E8">
+              <wp:extent cx="5943600" cy="5943600"/>
+              <wp:effectExtent l="0" t="0" r="0" b="0"/>
+              <wp:docPr id="1617445812" name="Picture 12"/>
+              <wp:cNvGraphicFramePr>
+                <a:graphicFrameLocks xmlns:a="http://schemas.openxmlformats.org/drawingml/2006/main" noChangeAspect="1"/>
+              </wp:cNvGraphicFramePr>
+              <a:graphic xmlns:a="http://schemas.openxmlformats.org/drawingml/2006/main">
+                <a:graphicData uri="http://schemas.openxmlformats.org/drawingml/2006/picture">
+                  <pic:pic xmlns:pic="http://schemas.openxmlformats.org/drawingml/2006/picture">
+                    <pic:nvPicPr>
+                      <pic:cNvPr id="0" name="Picture 14"/>
+                      <pic:cNvPicPr>
+                        <a:picLocks noChangeAspect="1" noChangeArrowheads="1"/>
+                      </pic:cNvPicPr>
+                    </pic:nvPicPr>
+                    <pic:blipFill>
+                      <a:blip r:embed="rId19" cstate="print">
+                        <a:extLst>
+                          <a:ext uri="{28A0092B-C50C-407E-A947-70E740481C1C}">
+                            <a14:useLocalDpi xmlns:a14="http://schemas.microsoft.com/office/drawing/2010/main" val="0"/>
+                          </a:ext>
+                        </a:extLst>
+                      </a:blip>
+                      <a:srcRect/>
+                      <a:stretch>
+                        <a:fillRect/>
+                      </a:stretch>
+                    </pic:blipFill>
+                    <pic:spPr bwMode="auto">
+                      <a:xfrm>
+                        <a:off x="0" y="0"/>
+                        <a:ext cx="5943600" cy="5943600"/>
+                      </a:xfrm>
+                      <a:prstGeom prst="rect">
+                        <a:avLst/>
+                      </a:prstGeom>
                       <a:noFill/>
-                    </a:ln>
-                  </pic:spPr>
-                </pic:pic>
-              </a:graphicData>
-            </a:graphic>
-          </wp:inline>
-        </w:drawing>
-      </w:r>
+                      <a:ln>
+                        <a:noFill/>
+                      </a:ln>
+                    </pic:spPr>
+                  </pic:pic>
+                </a:graphicData>
+              </a:graphic>
+            </wp:inline>
+          </w:drawing>
+        </w:r>
+      </w:del>
       <w:r>
         <w:rPr>
           <w:rFonts w:ascii="Arial" w:hAnsi="Arial" w:cs="Arial"/>
@@ -19091,61 +19110,63 @@
           <w:rFonts w:ascii="Arial" w:hAnsi="Arial" w:cs="Arial"/>
         </w:rPr>
       </w:pPr>
-      <w:r>
-        <w:rPr>
-          <w:rFonts w:ascii="Arial" w:hAnsi="Arial" w:cs="Arial"/>
-          <w:noProof/>
-        </w:rPr>
-        <w:lastRenderedPageBreak/>
-        <w:drawing>
-          <wp:inline distT="0" distB="0" distL="0" distR="0" wp14:anchorId="5283C7FD" wp14:editId="16829D2F">
-            <wp:extent cx="5943600" cy="5943600"/>
-            <wp:effectExtent l="0" t="0" r="0" b="0"/>
-            <wp:docPr id="1580461420" name="Picture 13"/>
-            <wp:cNvGraphicFramePr>
-              <a:graphicFrameLocks xmlns:a="http://schemas.openxmlformats.org/drawingml/2006/main" noChangeAspect="1"/>
-            </wp:cNvGraphicFramePr>
-            <a:graphic xmlns:a="http://schemas.openxmlformats.org/drawingml/2006/main">
-              <a:graphicData uri="http://schemas.openxmlformats.org/drawingml/2006/picture">
-                <pic:pic xmlns:pic="http://schemas.openxmlformats.org/drawingml/2006/picture">
-                  <pic:nvPicPr>
-                    <pic:cNvPr id="0" name="Picture 15"/>
-                    <pic:cNvPicPr>
-                      <a:picLocks noChangeAspect="1" noChangeArrowheads="1"/>
-                    </pic:cNvPicPr>
-                  </pic:nvPicPr>
-                  <pic:blipFill>
-                    <a:blip r:embed="rId20" cstate="print">
-                      <a:extLst>
-                        <a:ext uri="{28A0092B-C50C-407E-A947-70E740481C1C}">
-                          <a14:useLocalDpi xmlns:a14="http://schemas.microsoft.com/office/drawing/2010/main" val="0"/>
-                        </a:ext>
-                      </a:extLst>
-                    </a:blip>
-                    <a:srcRect/>
-                    <a:stretch>
-                      <a:fillRect/>
-                    </a:stretch>
-                  </pic:blipFill>
-                  <pic:spPr bwMode="auto">
-                    <a:xfrm>
-                      <a:off x="0" y="0"/>
-                      <a:ext cx="5943600" cy="5943600"/>
-                    </a:xfrm>
-                    <a:prstGeom prst="rect">
-                      <a:avLst/>
-                    </a:prstGeom>
-                    <a:noFill/>
-                    <a:ln>
+      <w:del w:id="368" w:author="Smith Vidaurre, Grace" w:date="2025-05-27T21:15:00Z" w16du:dateUtc="2025-05-28T01:15:00Z">
+        <w:r>
+          <w:rPr>
+            <w:rFonts w:ascii="Arial" w:hAnsi="Arial" w:cs="Arial"/>
+            <w:noProof/>
+          </w:rPr>
+          <w:lastRenderedPageBreak/>
+          <w:drawing>
+            <wp:inline distT="0" distB="0" distL="0" distR="0" wp14:anchorId="5283C7FD" wp14:editId="6CC88926">
+              <wp:extent cx="5943600" cy="5943600"/>
+              <wp:effectExtent l="0" t="0" r="0" b="0"/>
+              <wp:docPr id="1580461420" name="Picture 13"/>
+              <wp:cNvGraphicFramePr>
+                <a:graphicFrameLocks xmlns:a="http://schemas.openxmlformats.org/drawingml/2006/main" noChangeAspect="1"/>
+              </wp:cNvGraphicFramePr>
+              <a:graphic xmlns:a="http://schemas.openxmlformats.org/drawingml/2006/main">
+                <a:graphicData uri="http://schemas.openxmlformats.org/drawingml/2006/picture">
+                  <pic:pic xmlns:pic="http://schemas.openxmlformats.org/drawingml/2006/picture">
+                    <pic:nvPicPr>
+                      <pic:cNvPr id="0" name="Picture 15"/>
+                      <pic:cNvPicPr>
+                        <a:picLocks noChangeAspect="1" noChangeArrowheads="1"/>
+                      </pic:cNvPicPr>
+                    </pic:nvPicPr>
+                    <pic:blipFill>
+                      <a:blip r:embed="rId20" cstate="print">
+                        <a:extLst>
+                          <a:ext uri="{28A0092B-C50C-407E-A947-70E740481C1C}">
+                            <a14:useLocalDpi xmlns:a14="http://schemas.microsoft.com/office/drawing/2010/main" val="0"/>
+                          </a:ext>
+                        </a:extLst>
+                      </a:blip>
+                      <a:srcRect/>
+                      <a:stretch>
+                        <a:fillRect/>
+                      </a:stretch>
+                    </pic:blipFill>
+                    <pic:spPr bwMode="auto">
+                      <a:xfrm>
+                        <a:off x="0" y="0"/>
+                        <a:ext cx="5943600" cy="5943600"/>
+                      </a:xfrm>
+                      <a:prstGeom prst="rect">
+                        <a:avLst/>
+                      </a:prstGeom>
                       <a:noFill/>
-                    </a:ln>
-                  </pic:spPr>
-                </pic:pic>
-              </a:graphicData>
-            </a:graphic>
-          </wp:inline>
-        </w:drawing>
-      </w:r>
+                      <a:ln>
+                        <a:noFill/>
+                      </a:ln>
+                    </pic:spPr>
+                  </pic:pic>
+                </a:graphicData>
+              </a:graphic>
+            </wp:inline>
+          </w:drawing>
+        </w:r>
+      </w:del>
     </w:p>
     <w:p>
       <w:pPr>
@@ -19254,32 +19275,32 @@
         </w:rPr>
         <w:t xml:space="preserve">). </w:t>
       </w:r>
-      <w:commentRangeStart w:id="361"/>
+      <w:commentRangeStart w:id="369"/>
       <w:r>
         <w:rPr>
           <w:rFonts w:ascii="Arial" w:hAnsi="Arial" w:cs="Arial"/>
         </w:rPr>
         <w:t>This suggests that individuals are being categorized in distinct individual clusters when running traditional bioacoustics analyses on our synthetically generated calls.</w:t>
       </w:r>
-      <w:commentRangeEnd w:id="361"/>
+      <w:commentRangeEnd w:id="369"/>
       <w:r>
         <w:rPr>
           <w:rStyle w:val="CommentReference"/>
         </w:rPr>
-        <w:commentReference w:id="361"/>
-      </w:r>
-    </w:p>
-    <w:p>
-      <w:pPr>
-        <w:rPr>
-          <w:rFonts w:ascii="Arial" w:hAnsi="Arial" w:cs="Arial"/>
-        </w:rPr>
-      </w:pPr>
-    </w:p>
-    <w:p>
-      <w:pPr>
-        <w:rPr>
-          <w:ins w:id="362" w:author="Smith Vidaurre, Grace" w:date="2025-05-22T14:24:00Z" w16du:dateUtc="2025-05-22T18:24:00Z"/>
+        <w:commentReference w:id="369"/>
+      </w:r>
+    </w:p>
+    <w:p>
+      <w:pPr>
+        <w:rPr>
+          <w:rFonts w:ascii="Arial" w:hAnsi="Arial" w:cs="Arial"/>
+        </w:rPr>
+      </w:pPr>
+    </w:p>
+    <w:p>
+      <w:pPr>
+        <w:rPr>
+          <w:ins w:id="370" w:author="Smith Vidaurre, Grace" w:date="2025-05-22T14:24:00Z" w16du:dateUtc="2025-05-22T18:24:00Z"/>
           <w:rFonts w:ascii="Arial" w:hAnsi="Arial" w:cs="Arial"/>
           <w:b/>
           <w:bCs/>
@@ -19297,7 +19318,7 @@
     <w:p>
       <w:pPr>
         <w:rPr>
-          <w:ins w:id="363" w:author="Smith Vidaurre, Grace" w:date="2025-05-22T14:24:00Z" w16du:dateUtc="2025-05-22T18:24:00Z"/>
+          <w:ins w:id="371" w:author="Smith Vidaurre, Grace" w:date="2025-05-22T14:24:00Z" w16du:dateUtc="2025-05-22T18:24:00Z"/>
           <w:rFonts w:ascii="Arial" w:hAnsi="Arial" w:cs="Arial"/>
           <w:b/>
           <w:bCs/>
@@ -19309,12 +19330,12 @@
         <w:spacing w:line="480" w:lineRule="auto"/>
         <w:ind w:firstLine="720"/>
         <w:rPr>
-          <w:ins w:id="364" w:author="Smith Vidaurre, Grace" w:date="2025-05-22T14:25:00Z" w16du:dateUtc="2025-05-22T18:25:00Z"/>
-          <w:rFonts w:ascii="Arial" w:hAnsi="Arial" w:cs="Arial"/>
-        </w:rPr>
-      </w:pPr>
-      <w:moveToRangeStart w:id="365" w:author="Smith Vidaurre, Grace" w:date="2025-05-22T14:24:00Z" w:name="move198816303"/>
-      <w:moveTo w:id="366" w:author="Smith Vidaurre, Grace" w:date="2025-05-22T14:24:00Z" w16du:dateUtc="2025-05-22T18:24:00Z">
+          <w:ins w:id="372" w:author="Smith Vidaurre, Grace" w:date="2025-05-22T14:25:00Z" w16du:dateUtc="2025-05-22T18:25:00Z"/>
+          <w:rFonts w:ascii="Arial" w:hAnsi="Arial" w:cs="Arial"/>
+        </w:rPr>
+      </w:pPr>
+      <w:moveToRangeStart w:id="373" w:author="Smith Vidaurre, Grace" w:date="2025-05-22T14:24:00Z" w:name="move198816303"/>
+      <w:moveTo w:id="374" w:author="Smith Vidaurre, Grace" w:date="2025-05-22T14:24:00Z" w16du:dateUtc="2025-05-22T18:24:00Z">
         <w:r>
           <w:rPr>
             <w:rFonts w:ascii="Arial" w:hAnsi="Arial" w:cs="Arial"/>
@@ -19357,19 +19378,19 @@
           </w:rPr>
           <w:t xml:space="preserve">, therefore, to study to evolution of vocal learning, we must understand how vocal learners encode and perceive information in learned vocal signals. Studies of the diversity of information encoding across vocal learning taxa could lead to new insights into how vocal learning originated and continues to </w:t>
         </w:r>
-        <w:commentRangeStart w:id="367"/>
+        <w:commentRangeStart w:id="375"/>
         <w:r>
           <w:rPr>
             <w:rFonts w:ascii="Arial" w:hAnsi="Arial" w:cs="Arial"/>
           </w:rPr>
           <w:t>evolve</w:t>
         </w:r>
-        <w:commentRangeEnd w:id="367"/>
+        <w:commentRangeEnd w:id="375"/>
         <w:r>
           <w:rPr>
             <w:rStyle w:val="CommentReference"/>
           </w:rPr>
-          <w:commentReference w:id="367"/>
+          <w:commentReference w:id="375"/>
         </w:r>
         <w:r>
           <w:rPr>
@@ -19384,7 +19405,7 @@
         <w:spacing w:line="480" w:lineRule="auto"/>
         <w:ind w:firstLine="720"/>
         <w:rPr>
-          <w:ins w:id="368" w:author="Smith Vidaurre, Grace" w:date="2025-05-22T14:25:00Z" w16du:dateUtc="2025-05-22T18:25:00Z"/>
+          <w:ins w:id="376" w:author="Smith Vidaurre, Grace" w:date="2025-05-22T14:25:00Z" w16du:dateUtc="2025-05-22T18:25:00Z"/>
           <w:rFonts w:ascii="Arial" w:hAnsi="Arial" w:cs="Arial"/>
         </w:rPr>
       </w:pPr>
@@ -19394,12 +19415,12 @@
         <w:spacing w:line="480" w:lineRule="auto"/>
         <w:ind w:firstLine="720"/>
         <w:rPr>
-          <w:ins w:id="369" w:author="Smith Vidaurre, Grace" w:date="2025-05-22T14:34:00Z" w16du:dateUtc="2025-05-22T18:34:00Z"/>
-          <w:rFonts w:ascii="Arial" w:hAnsi="Arial" w:cs="Arial"/>
-        </w:rPr>
-      </w:pPr>
-      <w:commentRangeStart w:id="370"/>
-      <w:ins w:id="371" w:author="Smith Vidaurre, Grace" w:date="2025-05-22T14:25:00Z" w16du:dateUtc="2025-05-22T18:25:00Z">
+          <w:ins w:id="377" w:author="Smith Vidaurre, Grace" w:date="2025-05-22T14:34:00Z" w16du:dateUtc="2025-05-22T18:34:00Z"/>
+          <w:rFonts w:ascii="Arial" w:hAnsi="Arial" w:cs="Arial"/>
+        </w:rPr>
+      </w:pPr>
+      <w:commentRangeStart w:id="378"/>
+      <w:ins w:id="379" w:author="Smith Vidaurre, Grace" w:date="2025-05-22T14:25:00Z" w16du:dateUtc="2025-05-22T18:25:00Z">
         <w:r>
           <w:rPr>
             <w:rFonts w:ascii="Arial" w:hAnsi="Arial" w:cs="Arial"/>
@@ -19802,12 +19823,12 @@
           </w:rPr>
           <w:t xml:space="preserve">. </w:t>
         </w:r>
-        <w:commentRangeEnd w:id="370"/>
+        <w:commentRangeEnd w:id="378"/>
         <w:r>
           <w:rPr>
             <w:rStyle w:val="CommentReference"/>
           </w:rPr>
-          <w:commentReference w:id="370"/>
+          <w:commentReference w:id="378"/>
         </w:r>
       </w:ins>
     </w:p>
@@ -19816,7 +19837,7 @@
         <w:spacing w:line="480" w:lineRule="auto"/>
         <w:ind w:firstLine="720"/>
         <w:rPr>
-          <w:ins w:id="372" w:author="Smith Vidaurre, Grace" w:date="2025-05-22T14:34:00Z" w16du:dateUtc="2025-05-22T18:34:00Z"/>
+          <w:ins w:id="380" w:author="Smith Vidaurre, Grace" w:date="2025-05-22T14:34:00Z" w16du:dateUtc="2025-05-22T18:34:00Z"/>
           <w:rFonts w:ascii="Arial" w:hAnsi="Arial" w:cs="Arial"/>
         </w:rPr>
       </w:pPr>
@@ -19826,11 +19847,11 @@
         <w:spacing w:line="480" w:lineRule="auto"/>
         <w:ind w:firstLine="720"/>
         <w:rPr>
-          <w:ins w:id="373" w:author="Smith Vidaurre, Grace" w:date="2025-05-22T14:34:00Z" w16du:dateUtc="2025-05-22T18:34:00Z"/>
-          <w:rFonts w:ascii="Arial" w:hAnsi="Arial" w:cs="Arial"/>
-        </w:rPr>
-      </w:pPr>
-      <w:ins w:id="374" w:author="Smith Vidaurre, Grace" w:date="2025-05-22T14:34:00Z" w16du:dateUtc="2025-05-22T18:34:00Z">
+          <w:ins w:id="381" w:author="Smith Vidaurre, Grace" w:date="2025-05-22T14:34:00Z" w16du:dateUtc="2025-05-22T18:34:00Z"/>
+          <w:rFonts w:ascii="Arial" w:hAnsi="Arial" w:cs="Arial"/>
+        </w:rPr>
+      </w:pPr>
+      <w:ins w:id="382" w:author="Smith Vidaurre, Grace" w:date="2025-05-22T14:34:00Z" w16du:dateUtc="2025-05-22T18:34:00Z">
         <w:r>
           <w:rPr>
             <w:rFonts w:ascii="Arial" w:hAnsi="Arial" w:cs="Arial"/>
@@ -19873,19 +19894,19 @@
           </w:rPr>
           <w:t>(</w:t>
         </w:r>
-        <w:commentRangeStart w:id="375"/>
+        <w:commentRangeStart w:id="383"/>
         <w:r>
           <w:rPr>
             <w:rFonts w:ascii="Arial" w:hAnsi="Arial" w:cs="Arial"/>
           </w:rPr>
           <w:t>CITE</w:t>
         </w:r>
-        <w:commentRangeEnd w:id="375"/>
+        <w:commentRangeEnd w:id="383"/>
         <w:r>
           <w:rPr>
             <w:rStyle w:val="CommentReference"/>
           </w:rPr>
-          <w:commentReference w:id="375"/>
+          <w:commentReference w:id="383"/>
         </w:r>
         <w:r>
           <w:rPr>
@@ -19937,7 +19958,7 @@
         <w:spacing w:line="480" w:lineRule="auto"/>
         <w:ind w:firstLine="720"/>
         <w:rPr>
-          <w:ins w:id="376" w:author="Smith Vidaurre, Grace" w:date="2025-05-22T14:35:00Z" w16du:dateUtc="2025-05-22T18:35:00Z"/>
+          <w:ins w:id="384" w:author="Smith Vidaurre, Grace" w:date="2025-05-22T14:35:00Z" w16du:dateUtc="2025-05-22T18:35:00Z"/>
           <w:rFonts w:ascii="Arial" w:hAnsi="Arial" w:cs="Arial"/>
         </w:rPr>
       </w:pPr>
@@ -19947,11 +19968,11 @@
         <w:spacing w:line="480" w:lineRule="auto"/>
         <w:ind w:firstLine="720"/>
         <w:rPr>
-          <w:moveTo w:id="377" w:author="Smith Vidaurre, Grace" w:date="2025-05-22T14:24:00Z" w16du:dateUtc="2025-05-22T18:24:00Z"/>
-          <w:rFonts w:ascii="Arial" w:hAnsi="Arial" w:cs="Arial"/>
-        </w:rPr>
-      </w:pPr>
-      <w:ins w:id="378" w:author="Smith Vidaurre, Grace" w:date="2025-05-22T14:35:00Z" w16du:dateUtc="2025-05-22T18:35:00Z">
+          <w:moveTo w:id="385" w:author="Smith Vidaurre, Grace" w:date="2025-05-22T14:24:00Z" w16du:dateUtc="2025-05-22T18:24:00Z"/>
+          <w:rFonts w:ascii="Arial" w:hAnsi="Arial" w:cs="Arial"/>
+        </w:rPr>
+      </w:pPr>
+      <w:ins w:id="386" w:author="Smith Vidaurre, Grace" w:date="2025-05-22T14:35:00Z" w16du:dateUtc="2025-05-22T18:35:00Z">
         <w:r>
           <w:rPr>
             <w:rFonts w:ascii="Arial" w:hAnsi="Arial" w:cs="Arial"/>
@@ -19996,7 +20017,7 @@
         </w:r>
       </w:ins>
     </w:p>
-    <w:moveToRangeEnd w:id="365"/>
+    <w:moveToRangeEnd w:id="373"/>
     <w:p>
       <w:pPr>
         <w:rPr>
@@ -20023,7 +20044,7 @@
           <w:bCs/>
         </w:rPr>
       </w:pPr>
-      <w:commentRangeStart w:id="379"/>
+      <w:commentRangeStart w:id="387"/>
       <w:r>
         <w:rPr>
           <w:rFonts w:ascii="Arial" w:hAnsi="Arial" w:cs="Arial"/>
@@ -20059,12 +20080,12 @@
         </w:rPr>
         <w:t xml:space="preserve"> therefore may not be assessing the full scope of how information can be encoded across a range of species.</w:t>
       </w:r>
-      <w:commentRangeEnd w:id="379"/>
+      <w:commentRangeEnd w:id="387"/>
       <w:r>
         <w:rPr>
           <w:rStyle w:val="CommentReference"/>
         </w:rPr>
-        <w:commentReference w:id="379"/>
+        <w:commentReference w:id="387"/>
       </w:r>
     </w:p>
     <w:p>
@@ -20089,35 +20110,35 @@
         </w:rPr>
         <w:t xml:space="preserve">Several computationally intensive tools have emerged to assess the degree or types of information encoded in </w:t>
       </w:r>
-      <w:commentRangeStart w:id="380"/>
-      <w:commentRangeStart w:id="381"/>
-      <w:commentRangeStart w:id="382"/>
+      <w:commentRangeStart w:id="388"/>
+      <w:commentRangeStart w:id="389"/>
+      <w:commentRangeStart w:id="390"/>
       <w:r>
         <w:rPr>
           <w:rFonts w:ascii="Arial" w:hAnsi="Arial" w:cs="Arial"/>
         </w:rPr>
         <w:t>signals</w:t>
       </w:r>
-      <w:commentRangeEnd w:id="380"/>
+      <w:commentRangeEnd w:id="388"/>
       <w:r>
         <w:rPr>
           <w:rStyle w:val="CommentReference"/>
         </w:rPr>
-        <w:commentReference w:id="380"/>
-      </w:r>
-      <w:commentRangeEnd w:id="381"/>
+        <w:commentReference w:id="388"/>
+      </w:r>
+      <w:commentRangeEnd w:id="389"/>
       <w:r>
         <w:rPr>
           <w:rStyle w:val="CommentReference"/>
         </w:rPr>
-        <w:commentReference w:id="381"/>
-      </w:r>
-      <w:commentRangeEnd w:id="382"/>
+        <w:commentReference w:id="389"/>
+      </w:r>
+      <w:commentRangeEnd w:id="390"/>
       <w:r>
         <w:rPr>
           <w:rStyle w:val="CommentReference"/>
         </w:rPr>
-        <w:commentReference w:id="382"/>
+        <w:commentReference w:id="390"/>
       </w:r>
       <w:r>
         <w:rPr>
@@ -21384,7 +21405,7 @@
       </w:r>
     </w:p>
   </w:comment>
-  <w:comment w:id="313" w:author="Coppinger, Brittany" w:date="2025-04-10T14:49:00Z" w:initials="BC">
+  <w:comment w:id="314" w:author="Coppinger, Brittany" w:date="2025-04-10T14:49:00Z" w:initials="BC">
     <w:p>
       <w:pPr>
         <w:pStyle w:val="CommentText"/>
@@ -21400,7 +21421,7 @@
       </w:r>
     </w:p>
   </w:comment>
-  <w:comment w:id="314" w:author="Coppinger, Brittany" w:date="2025-04-10T14:50:00Z" w:initials="BC">
+  <w:comment w:id="315" w:author="Coppinger, Brittany" w:date="2025-04-10T14:50:00Z" w:initials="BC">
     <w:p>
       <w:pPr>
         <w:pStyle w:val="CommentText"/>
@@ -21416,7 +21437,7 @@
       </w:r>
     </w:p>
   </w:comment>
-  <w:comment w:id="330" w:author="Coppinger, Brittany" w:date="2025-04-10T16:19:00Z" w:initials="BC">
+  <w:comment w:id="331" w:author="Coppinger, Brittany" w:date="2025-04-10T16:19:00Z" w:initials="BC">
     <w:p>
       <w:pPr>
         <w:pStyle w:val="CommentText"/>
@@ -21432,7 +21453,7 @@
       </w:r>
     </w:p>
   </w:comment>
-  <w:comment w:id="334" w:author="Coppinger, Brittany" w:date="2025-04-10T14:31:00Z" w:initials="BC">
+  <w:comment w:id="335" w:author="Coppinger, Brittany" w:date="2025-04-10T14:31:00Z" w:initials="BC">
     <w:p>
       <w:pPr>
         <w:pStyle w:val="CommentText"/>
@@ -21448,7 +21469,7 @@
       </w:r>
     </w:p>
   </w:comment>
-  <w:comment w:id="335" w:author="Coppinger, Brittany" w:date="2025-04-09T13:29:00Z" w:initials="BC">
+  <w:comment w:id="336" w:author="Coppinger, Brittany" w:date="2025-04-09T13:29:00Z" w:initials="BC">
     <w:p>
       <w:pPr>
         <w:pStyle w:val="CommentText"/>
@@ -21464,7 +21485,7 @@
       </w:r>
     </w:p>
   </w:comment>
-  <w:comment w:id="336" w:author="Coppinger, Brittany" w:date="2025-04-10T16:25:00Z" w:initials="BC">
+  <w:comment w:id="337" w:author="Coppinger, Brittany" w:date="2025-04-10T16:25:00Z" w:initials="BC">
     <w:p>
       <w:pPr>
         <w:pStyle w:val="CommentText"/>
@@ -21480,7 +21501,7 @@
       </w:r>
     </w:p>
   </w:comment>
-  <w:comment w:id="337" w:author="Coppinger, Brittany" w:date="2025-01-07T15:07:00Z" w:initials="BC">
+  <w:comment w:id="338" w:author="Coppinger, Brittany" w:date="2025-01-07T15:07:00Z" w:initials="BC">
     <w:p>
       <w:pPr>
         <w:pStyle w:val="CommentText"/>
@@ -21496,7 +21517,7 @@
       </w:r>
     </w:p>
   </w:comment>
-  <w:comment w:id="338" w:author="Samman, Raneem" w:date="2025-01-13T15:08:00Z" w:initials="RS">
+  <w:comment w:id="339" w:author="Samman, Raneem" w:date="2025-01-13T15:08:00Z" w:initials="RS">
     <w:p>
       <w:r>
         <w:rPr>
@@ -21514,7 +21535,7 @@
       </w:r>
     </w:p>
   </w:comment>
-  <w:comment w:id="339" w:author="Samman, Raneem" w:date="2025-01-13T15:10:00Z" w:initials="RS">
+  <w:comment w:id="340" w:author="Samman, Raneem" w:date="2025-01-13T15:10:00Z" w:initials="RS">
     <w:p>
       <w:r>
         <w:rPr>
@@ -21532,7 +21553,7 @@
       </w:r>
     </w:p>
   </w:comment>
-  <w:comment w:id="340" w:author="Coppinger, Brittany" w:date="2025-04-03T14:24:00Z" w:initials="BC">
+  <w:comment w:id="342" w:author="Coppinger, Brittany" w:date="2025-04-03T14:24:00Z" w:initials="BC">
     <w:p>
       <w:pPr>
         <w:pStyle w:val="CommentText"/>
@@ -21548,7 +21569,7 @@
       </w:r>
     </w:p>
   </w:comment>
-  <w:comment w:id="341" w:author="Coppinger, Brittany" w:date="2025-04-03T14:26:00Z" w:initials="BC">
+  <w:comment w:id="344" w:author="Coppinger, Brittany" w:date="2025-04-03T14:26:00Z" w:initials="BC">
     <w:p>
       <w:pPr>
         <w:pStyle w:val="CommentText"/>
@@ -21564,7 +21585,7 @@
       </w:r>
     </w:p>
   </w:comment>
-  <w:comment w:id="342" w:author="Coppinger, Brittany" w:date="2025-04-04T10:17:00Z" w:initials="BC">
+  <w:comment w:id="346" w:author="Coppinger, Brittany" w:date="2025-04-04T10:17:00Z" w:initials="BC">
     <w:p>
       <w:pPr>
         <w:pStyle w:val="CommentText"/>
@@ -21580,7 +21601,7 @@
       </w:r>
     </w:p>
   </w:comment>
-  <w:comment w:id="343" w:author="Coppinger, Brittany" w:date="2025-04-10T16:02:00Z" w:initials="BC">
+  <w:comment w:id="347" w:author="Coppinger, Brittany" w:date="2025-04-10T16:02:00Z" w:initials="BC">
     <w:p>
       <w:pPr>
         <w:pStyle w:val="CommentText"/>
@@ -21596,7 +21617,7 @@
       </w:r>
     </w:p>
   </w:comment>
-  <w:comment w:id="344" w:author="Coppinger, Brittany" w:date="2025-05-14T12:12:00Z" w:initials="BC">
+  <w:comment w:id="348" w:author="Coppinger, Brittany" w:date="2025-05-14T12:12:00Z" w:initials="BC">
     <w:p>
       <w:pPr>
         <w:pStyle w:val="CommentText"/>
@@ -21612,7 +21633,7 @@
       </w:r>
     </w:p>
   </w:comment>
-  <w:comment w:id="345" w:author="Coppinger, Brittany" w:date="2025-04-04T10:18:00Z" w:initials="BC">
+  <w:comment w:id="350" w:author="Coppinger, Brittany" w:date="2025-04-04T10:18:00Z" w:initials="BC">
     <w:p>
       <w:pPr>
         <w:pStyle w:val="CommentText"/>
@@ -21628,7 +21649,7 @@
       </w:r>
     </w:p>
   </w:comment>
-  <w:comment w:id="347" w:author="Coppinger, Brittany" w:date="2025-02-13T14:09:00Z" w:initials="BC">
+  <w:comment w:id="352" w:author="Coppinger, Brittany" w:date="2025-02-13T14:09:00Z" w:initials="BC">
     <w:p>
       <w:pPr>
         <w:pStyle w:val="CommentText"/>
@@ -21644,7 +21665,7 @@
       </w:r>
     </w:p>
   </w:comment>
-  <w:comment w:id="346" w:author="Coppinger, Brittany" w:date="2025-04-04T12:58:00Z" w:initials="BC">
+  <w:comment w:id="351" w:author="Coppinger, Brittany" w:date="2025-04-04T12:58:00Z" w:initials="BC">
     <w:p>
       <w:pPr>
         <w:pStyle w:val="CommentText"/>
@@ -21660,7 +21681,7 @@
       </w:r>
     </w:p>
   </w:comment>
-  <w:comment w:id="348" w:author="Summer Eckhardt" w:date="2025-01-24T09:51:00Z" w:initials="SE">
+  <w:comment w:id="353" w:author="Summer Eckhardt" w:date="2025-01-24T09:51:00Z" w:initials="SE">
     <w:p>
       <w:pPr>
         <w:pStyle w:val="CommentText"/>
@@ -21676,7 +21697,7 @@
       </w:r>
     </w:p>
   </w:comment>
-  <w:comment w:id="349" w:author="Summer Eckhardt" w:date="2025-01-27T10:41:00Z" w:initials="SE">
+  <w:comment w:id="354" w:author="Summer Eckhardt" w:date="2025-01-27T10:41:00Z" w:initials="SE">
     <w:p>
       <w:pPr>
         <w:pStyle w:val="CommentText"/>
@@ -21692,7 +21713,7 @@
       </w:r>
     </w:p>
   </w:comment>
-  <w:comment w:id="350" w:author="Summer Eckhardt" w:date="2025-01-24T10:02:00Z" w:initials="SE">
+  <w:comment w:id="355" w:author="Summer Eckhardt" w:date="2025-01-24T10:02:00Z" w:initials="SE">
     <w:p>
       <w:pPr>
         <w:pStyle w:val="CommentText"/>
@@ -21708,7 +21729,7 @@
       </w:r>
     </w:p>
   </w:comment>
-  <w:comment w:id="351" w:author="Samman, Raneem" w:date="2025-01-13T15:07:00Z" w:initials="RS">
+  <w:comment w:id="356" w:author="Samman, Raneem" w:date="2025-01-13T15:07:00Z" w:initials="RS">
     <w:p>
       <w:r>
         <w:rPr>
@@ -21726,7 +21747,7 @@
       </w:r>
     </w:p>
   </w:comment>
-  <w:comment w:id="352" w:author="Coppinger, Brittany" w:date="2025-01-15T13:17:00Z" w:initials="BC">
+  <w:comment w:id="357" w:author="Coppinger, Brittany" w:date="2025-01-15T13:17:00Z" w:initials="BC">
     <w:p>
       <w:pPr>
         <w:pStyle w:val="CommentText"/>
@@ -21753,7 +21774,7 @@
       </w:r>
     </w:p>
   </w:comment>
-  <w:comment w:id="353" w:author="Coppinger, Brittany" w:date="2025-01-07T15:07:00Z" w:initials="BC">
+  <w:comment w:id="358" w:author="Coppinger, Brittany" w:date="2025-01-07T15:07:00Z" w:initials="BC">
     <w:p>
       <w:pPr>
         <w:pStyle w:val="CommentText"/>
@@ -21769,7 +21790,7 @@
       </w:r>
     </w:p>
   </w:comment>
-  <w:comment w:id="354" w:author="Samman, Raneem" w:date="2025-01-13T15:08:00Z" w:initials="RS">
+  <w:comment w:id="359" w:author="Samman, Raneem" w:date="2025-01-13T15:08:00Z" w:initials="RS">
     <w:p>
       <w:r>
         <w:rPr>
@@ -21787,7 +21808,7 @@
       </w:r>
     </w:p>
   </w:comment>
-  <w:comment w:id="355" w:author="Samman, Raneem" w:date="2025-01-13T15:10:00Z" w:initials="RS">
+  <w:comment w:id="360" w:author="Samman, Raneem" w:date="2025-01-13T15:10:00Z" w:initials="RS">
     <w:p>
       <w:r>
         <w:rPr>
@@ -21805,7 +21826,7 @@
       </w:r>
     </w:p>
   </w:comment>
-  <w:comment w:id="356" w:author="Coppinger, Brittany" w:date="2025-01-07T15:01:00Z" w:initials="BC">
+  <w:comment w:id="361" w:author="Coppinger, Brittany" w:date="2025-01-07T15:01:00Z" w:initials="BC">
     <w:p>
       <w:pPr>
         <w:pStyle w:val="CommentText"/>
@@ -21821,7 +21842,7 @@
       </w:r>
     </w:p>
   </w:comment>
-  <w:comment w:id="357" w:author="Coppinger, Brittany" w:date="2025-01-07T15:08:00Z" w:initials="BC">
+  <w:comment w:id="362" w:author="Coppinger, Brittany" w:date="2025-01-07T15:08:00Z" w:initials="BC">
     <w:p>
       <w:pPr>
         <w:pStyle w:val="CommentText"/>
@@ -21837,7 +21858,7 @@
       </w:r>
     </w:p>
   </w:comment>
-  <w:comment w:id="358" w:author="Coppinger, Brittany" w:date="2025-01-07T15:12:00Z" w:initials="BC">
+  <w:comment w:id="363" w:author="Coppinger, Brittany" w:date="2025-01-07T15:12:00Z" w:initials="BC">
     <w:p>
       <w:pPr>
         <w:pStyle w:val="CommentText"/>
@@ -21853,7 +21874,7 @@
       </w:r>
     </w:p>
   </w:comment>
-  <w:comment w:id="359" w:author="Coppinger, Brittany" w:date="2025-04-03T14:53:00Z" w:initials="BC">
+  <w:comment w:id="364" w:author="Coppinger, Brittany" w:date="2025-04-03T14:53:00Z" w:initials="BC">
     <w:p>
       <w:pPr>
         <w:pStyle w:val="CommentText"/>
@@ -21869,7 +21890,7 @@
       </w:r>
     </w:p>
   </w:comment>
-  <w:comment w:id="360" w:author="Summer Eckhardt" w:date="2025-02-04T18:49:00Z" w:initials="SE">
+  <w:comment w:id="366" w:author="Summer Eckhardt" w:date="2025-02-04T18:49:00Z" w:initials="SE">
     <w:p>
       <w:pPr>
         <w:pStyle w:val="CommentText"/>
@@ -21885,7 +21906,7 @@
       </w:r>
     </w:p>
   </w:comment>
-  <w:comment w:id="361" w:author="Summer Eckhardt" w:date="2025-02-04T19:02:00Z" w:initials="SE">
+  <w:comment w:id="369" w:author="Summer Eckhardt" w:date="2025-02-04T19:02:00Z" w:initials="SE">
     <w:p>
       <w:pPr>
         <w:pStyle w:val="CommentText"/>
@@ -21901,7 +21922,7 @@
       </w:r>
     </w:p>
   </w:comment>
-  <w:comment w:id="367" w:author="Smith Vidaurre, Grace" w:date="2025-05-22T13:33:00Z" w:initials="GSV">
+  <w:comment w:id="375" w:author="Smith Vidaurre, Grace" w:date="2025-05-22T13:33:00Z" w:initials="GSV">
     <w:p>
       <w:r>
         <w:rPr>
@@ -21918,7 +21939,7 @@
       </w:r>
     </w:p>
   </w:comment>
-  <w:comment w:id="370" w:author="Smith Vidaurre, Grace" w:date="2025-05-22T13:23:00Z" w:initials="GSV">
+  <w:comment w:id="378" w:author="Smith Vidaurre, Grace" w:date="2025-05-22T13:23:00Z" w:initials="GSV">
     <w:p>
       <w:r>
         <w:rPr>
@@ -21935,7 +21956,7 @@
       </w:r>
     </w:p>
   </w:comment>
-  <w:comment w:id="375" w:author="Smith Vidaurre, Grace" w:date="2024-12-18T14:31:00Z" w:initials="GSV">
+  <w:comment w:id="383" w:author="Smith Vidaurre, Grace" w:date="2024-12-18T14:31:00Z" w:initials="GSV">
     <w:p>
       <w:r>
         <w:rPr>
@@ -21952,7 +21973,7 @@
       </w:r>
     </w:p>
   </w:comment>
-  <w:comment w:id="379" w:author="Smith Vidaurre, Grace" w:date="2024-12-18T15:30:00Z" w:initials="GSV">
+  <w:comment w:id="387" w:author="Smith Vidaurre, Grace" w:date="2024-12-18T15:30:00Z" w:initials="GSV">
     <w:p>
       <w:r>
         <w:rPr>
@@ -21969,7 +21990,7 @@
       </w:r>
     </w:p>
   </w:comment>
-  <w:comment w:id="380" w:author="Smith Vidaurre, Grace" w:date="2024-12-16T09:35:00Z" w:initials="GSV">
+  <w:comment w:id="388" w:author="Smith Vidaurre, Grace" w:date="2024-12-16T09:35:00Z" w:initials="GSV">
     <w:p>
       <w:r>
         <w:rPr>
@@ -21986,7 +22007,7 @@
       </w:r>
     </w:p>
   </w:comment>
-  <w:comment w:id="381" w:author="Smith Vidaurre, Grace" w:date="2024-12-16T09:41:00Z" w:initials="GSV">
+  <w:comment w:id="389" w:author="Smith Vidaurre, Grace" w:date="2024-12-16T09:41:00Z" w:initials="GSV">
     <w:p>
       <w:r>
         <w:rPr>
@@ -22003,7 +22024,7 @@
       </w:r>
     </w:p>
   </w:comment>
-  <w:comment w:id="382" w:author="Coppinger, Brittany" w:date="2024-12-16T14:51:00Z" w:initials="BC">
+  <w:comment w:id="390" w:author="Coppinger, Brittany" w:date="2024-12-16T14:51:00Z" w:initials="BC">
     <w:p>
       <w:pPr>
         <w:pStyle w:val="CommentText"/>

</xml_diff>

<commit_message>
Restructuring Discussion: still in progress
Continue on line 443
</commit_message>
<xml_diff>
--- a/drafts/paRsynth_methods_draft.docx
+++ b/drafts/paRsynth_methods_draft.docx
@@ -923,25 +923,7 @@
           <w:sz w:val="24"/>
           <w:szCs w:val="24"/>
         </w:rPr>
-        <w:t xml:space="preserve">, </w:t>
-      </w:r>
-      <w:proofErr w:type="spellStart"/>
-      <w:r>
-        <w:rPr>
-          <w:rFonts w:ascii="Arial" w:hAnsi="Arial" w:cs="Arial"/>
-          <w:sz w:val="24"/>
-          <w:szCs w:val="24"/>
-        </w:rPr>
-        <w:t>Northhampton</w:t>
-      </w:r>
-      <w:proofErr w:type="spellEnd"/>
-      <w:r>
-        <w:rPr>
-          <w:rFonts w:ascii="Arial" w:hAnsi="Arial" w:cs="Arial"/>
-          <w:sz w:val="24"/>
-          <w:szCs w:val="24"/>
-        </w:rPr>
-        <w:t>, MA, USA</w:t>
+        <w:t>, Northhampton, MA, USA</w:t>
       </w:r>
     </w:p>
     <w:p>
@@ -992,25 +974,7 @@
           <w:sz w:val="24"/>
           <w:szCs w:val="24"/>
         </w:rPr>
-        <w:t xml:space="preserve">, </w:t>
-      </w:r>
-      <w:proofErr w:type="spellStart"/>
-      <w:r>
-        <w:rPr>
-          <w:rFonts w:ascii="Arial" w:hAnsi="Arial" w:cs="Arial"/>
-          <w:sz w:val="24"/>
-          <w:szCs w:val="24"/>
-        </w:rPr>
-        <w:t>Northhampton</w:t>
-      </w:r>
-      <w:proofErr w:type="spellEnd"/>
-      <w:r>
-        <w:rPr>
-          <w:rFonts w:ascii="Arial" w:hAnsi="Arial" w:cs="Arial"/>
-          <w:sz w:val="24"/>
-          <w:szCs w:val="24"/>
-        </w:rPr>
-        <w:t>, MA, USA</w:t>
+        <w:t>, Northhampton, MA, USA</w:t>
       </w:r>
     </w:p>
     <w:p>
@@ -2477,23 +2441,13 @@
         </w:rPr>
         <w:t>. Monk parakeets (</w:t>
       </w:r>
-      <w:proofErr w:type="spellStart"/>
       <w:r>
         <w:rPr>
           <w:rFonts w:ascii="Arial" w:hAnsi="Arial" w:cs="Arial"/>
           <w:i/>
           <w:iCs/>
         </w:rPr>
-        <w:t>Myiopsitta</w:t>
-      </w:r>
-      <w:proofErr w:type="spellEnd"/>
-      <w:r>
-        <w:rPr>
-          <w:rFonts w:ascii="Arial" w:hAnsi="Arial" w:cs="Arial"/>
-          <w:i/>
-          <w:iCs/>
-        </w:rPr>
-        <w:t xml:space="preserve"> monachus</w:t>
+        <w:t>Myiopsitta monachus</w:t>
       </w:r>
       <w:r>
         <w:rPr>
@@ -3324,21 +3278,7 @@
         <w:rPr>
           <w:rFonts w:ascii="Arial" w:hAnsi="Arial" w:cs="Arial"/>
         </w:rPr>
-        <w:t xml:space="preserve"> converted to frequency modulation patterns using musical notation called </w:t>
-      </w:r>
-      <w:proofErr w:type="gramStart"/>
-      <w:r>
-        <w:rPr>
-          <w:rFonts w:ascii="Arial" w:hAnsi="Arial" w:cs="Arial"/>
-        </w:rPr>
-        <w:t>Parsons</w:t>
-      </w:r>
-      <w:proofErr w:type="gramEnd"/>
-      <w:r>
-        <w:rPr>
-          <w:rFonts w:ascii="Arial" w:hAnsi="Arial" w:cs="Arial"/>
-        </w:rPr>
-        <w:t xml:space="preserve"> code</w:t>
+        <w:t xml:space="preserve"> converted to frequency modulation patterns using musical notation called Parsons code</w:t>
       </w:r>
       <w:r>
         <w:rPr>
@@ -3350,16 +3290,20 @@
         <w:rPr>
           <w:rFonts w:ascii="Arial" w:hAnsi="Arial" w:cs="Arial"/>
         </w:rPr>
-        <w:t xml:space="preserve">then </w:t>
-      </w:r>
-      <w:proofErr w:type="spellStart"/>
-      <w:r>
-        <w:rPr>
-          <w:rFonts w:ascii="Arial" w:hAnsi="Arial" w:cs="Arial"/>
-        </w:rPr>
-        <w:t>sonified</w:t>
-      </w:r>
-      <w:proofErr w:type="spellEnd"/>
+        <w:t xml:space="preserve">then sonified </w:t>
+      </w:r>
+      <w:r>
+        <w:rPr>
+          <w:rFonts w:ascii="Arial" w:hAnsi="Arial" w:cs="Arial"/>
+        </w:rPr>
+        <w:t>character strings</w:t>
+      </w:r>
+      <w:r>
+        <w:rPr>
+          <w:rFonts w:ascii="Arial" w:hAnsi="Arial" w:cs="Arial"/>
+        </w:rPr>
+        <w:t>,</w:t>
+      </w:r>
       <w:r>
         <w:rPr>
           <w:rFonts w:ascii="Arial" w:hAnsi="Arial" w:cs="Arial"/>
@@ -3370,24 +3314,6 @@
         <w:rPr>
           <w:rFonts w:ascii="Arial" w:hAnsi="Arial" w:cs="Arial"/>
         </w:rPr>
-        <w:t>character strings</w:t>
-      </w:r>
-      <w:r>
-        <w:rPr>
-          <w:rFonts w:ascii="Arial" w:hAnsi="Arial" w:cs="Arial"/>
-        </w:rPr>
-        <w:t>,</w:t>
-      </w:r>
-      <w:r>
-        <w:rPr>
-          <w:rFonts w:ascii="Arial" w:hAnsi="Arial" w:cs="Arial"/>
-        </w:rPr>
-        <w:t xml:space="preserve"> </w:t>
-      </w:r>
-      <w:r>
-        <w:rPr>
-          <w:rFonts w:ascii="Arial" w:hAnsi="Arial" w:cs="Arial"/>
-        </w:rPr>
         <w:t xml:space="preserve">to </w:t>
       </w:r>
       <w:r>
@@ -3406,21 +3332,7 @@
         <w:rPr>
           <w:rFonts w:ascii="Arial" w:hAnsi="Arial" w:cs="Arial"/>
         </w:rPr>
-        <w:t xml:space="preserve">with the </w:t>
-      </w:r>
-      <w:proofErr w:type="spellStart"/>
-      <w:r>
-        <w:rPr>
-          <w:rFonts w:ascii="Arial" w:hAnsi="Arial" w:cs="Arial"/>
-        </w:rPr>
-        <w:t>soundgen</w:t>
-      </w:r>
-      <w:proofErr w:type="spellEnd"/>
-      <w:r>
-        <w:rPr>
-          <w:rFonts w:ascii="Arial" w:hAnsi="Arial" w:cs="Arial"/>
-        </w:rPr>
-        <w:t xml:space="preserve"> R package</w:t>
+        <w:t>with the soundgen R package</w:t>
       </w:r>
       <w:r>
         <w:rPr>
@@ -4267,21 +4179,7 @@
         <w:rPr>
           <w:rFonts w:ascii="Arial" w:hAnsi="Arial" w:cs="Arial"/>
         </w:rPr>
-        <w:t xml:space="preserve"> and </w:t>
-      </w:r>
-      <w:proofErr w:type="gramStart"/>
-      <w:r>
-        <w:rPr>
-          <w:rFonts w:ascii="Arial" w:hAnsi="Arial" w:cs="Arial"/>
-        </w:rPr>
-        <w:t>individually-specific</w:t>
-      </w:r>
-      <w:proofErr w:type="gramEnd"/>
-      <w:r>
-        <w:rPr>
-          <w:rFonts w:ascii="Arial" w:hAnsi="Arial" w:cs="Arial"/>
-        </w:rPr>
-        <w:t xml:space="preserve"> information</w:t>
+        <w:t xml:space="preserve"> and individually-specific information</w:t>
       </w:r>
       <w:r>
         <w:rPr>
@@ -4293,21 +4191,7 @@
         <w:rPr>
           <w:rFonts w:ascii="Arial" w:hAnsi="Arial" w:cs="Arial"/>
         </w:rPr>
-        <w:t xml:space="preserve"> we converted characters to </w:t>
-      </w:r>
-      <w:proofErr w:type="gramStart"/>
-      <w:r>
-        <w:rPr>
-          <w:rFonts w:ascii="Arial" w:hAnsi="Arial" w:cs="Arial"/>
-        </w:rPr>
-        <w:t>Parsons</w:t>
-      </w:r>
-      <w:proofErr w:type="gramEnd"/>
-      <w:r>
-        <w:rPr>
-          <w:rFonts w:ascii="Arial" w:hAnsi="Arial" w:cs="Arial"/>
-        </w:rPr>
-        <w:t xml:space="preserve"> code, </w:t>
+        <w:t xml:space="preserve"> we converted characters to Parsons code, </w:t>
       </w:r>
       <w:r>
         <w:rPr>
@@ -4344,21 +4228,7 @@
         <w:rPr>
           <w:rFonts w:ascii="Arial" w:hAnsi="Arial" w:cs="Arial"/>
         </w:rPr>
-        <w:t xml:space="preserve"> we used </w:t>
-      </w:r>
-      <w:proofErr w:type="gramStart"/>
-      <w:r>
-        <w:rPr>
-          <w:rFonts w:ascii="Arial" w:hAnsi="Arial" w:cs="Arial"/>
-        </w:rPr>
-        <w:t>Parsons</w:t>
-      </w:r>
-      <w:proofErr w:type="gramEnd"/>
-      <w:r>
-        <w:rPr>
-          <w:rFonts w:ascii="Arial" w:hAnsi="Arial" w:cs="Arial"/>
-        </w:rPr>
-        <w:t xml:space="preserve"> code to</w:t>
+        <w:t xml:space="preserve"> we used Parsons code to</w:t>
       </w:r>
       <w:r>
         <w:rPr>
@@ -4370,21 +4240,7 @@
         <w:rPr>
           <w:rFonts w:ascii="Arial" w:hAnsi="Arial" w:cs="Arial"/>
         </w:rPr>
-        <w:t xml:space="preserve">. Fourth, we </w:t>
-      </w:r>
-      <w:proofErr w:type="spellStart"/>
-      <w:r>
-        <w:rPr>
-          <w:rFonts w:ascii="Arial" w:hAnsi="Arial" w:cs="Arial"/>
-        </w:rPr>
-        <w:t>sonified</w:t>
-      </w:r>
-      <w:proofErr w:type="spellEnd"/>
-      <w:r>
-        <w:rPr>
-          <w:rFonts w:ascii="Arial" w:hAnsi="Arial" w:cs="Arial"/>
-        </w:rPr>
-        <w:t xml:space="preserve"> </w:t>
+        <w:t xml:space="preserve">. Fourth, we sonified </w:t>
       </w:r>
       <w:r>
         <w:rPr>
@@ -4392,33 +4248,11 @@
         </w:rPr>
         <w:t xml:space="preserve">character strings with </w:t>
       </w:r>
-      <w:proofErr w:type="spellStart"/>
-      <w:r>
-        <w:rPr>
-          <w:rFonts w:ascii="Arial" w:hAnsi="Arial" w:cs="Arial"/>
-        </w:rPr>
-        <w:t>with</w:t>
-      </w:r>
-      <w:proofErr w:type="spellEnd"/>
-      <w:r>
-        <w:rPr>
-          <w:rFonts w:ascii="Arial" w:hAnsi="Arial" w:cs="Arial"/>
-        </w:rPr>
-        <w:t xml:space="preserve"> the </w:t>
-      </w:r>
-      <w:proofErr w:type="spellStart"/>
-      <w:r>
-        <w:rPr>
-          <w:rFonts w:ascii="Arial" w:hAnsi="Arial" w:cs="Arial"/>
-        </w:rPr>
-        <w:t>soundgen</w:t>
-      </w:r>
-      <w:proofErr w:type="spellEnd"/>
-      <w:r>
-        <w:rPr>
-          <w:rFonts w:ascii="Arial" w:hAnsi="Arial" w:cs="Arial"/>
-        </w:rPr>
-        <w:t xml:space="preserve"> R package</w:t>
+      <w:r>
+        <w:rPr>
+          <w:rFonts w:ascii="Arial" w:hAnsi="Arial" w:cs="Arial"/>
+        </w:rPr>
+        <w:t>with the soundgen R package</w:t>
       </w:r>
       <w:r>
         <w:rPr>
@@ -4565,21 +4399,7 @@
         <w:rPr>
           <w:rFonts w:ascii="Arial" w:hAnsi="Arial" w:cs="Arial"/>
         </w:rPr>
-        <w:t xml:space="preserve">identity information could be stochastically similar amongst classes at either social level </w:t>
-      </w:r>
-      <w:proofErr w:type="gramStart"/>
-      <w:r>
-        <w:rPr>
-          <w:rFonts w:ascii="Arial" w:hAnsi="Arial" w:cs="Arial"/>
-        </w:rPr>
-        <w:t>and</w:t>
-      </w:r>
-      <w:proofErr w:type="gramEnd"/>
-      <w:r>
-        <w:rPr>
-          <w:rFonts w:ascii="Arial" w:hAnsi="Arial" w:cs="Arial"/>
-        </w:rPr>
-        <w:t xml:space="preserve"> the likelihood of such stochastic similarity would increase with the number of classes the given social level.</w:t>
+        <w:t>identity information could be stochastically similar amongst classes at either social level and the likelihood of such stochastic similarity would increase with the number of classes the given social level.</w:t>
       </w:r>
       <w:r>
         <w:rPr>
@@ -5573,21 +5393,7 @@
         <w:rPr>
           <w:rFonts w:ascii="Arial" w:hAnsi="Arial" w:cs="Arial"/>
         </w:rPr>
-        <w:t xml:space="preserve">Convex hull polygons outlining the area in acoustic space for </w:t>
-      </w:r>
-      <w:proofErr w:type="gramStart"/>
-      <w:r>
-        <w:rPr>
-          <w:rFonts w:ascii="Arial" w:hAnsi="Arial" w:cs="Arial"/>
-        </w:rPr>
-        <w:t>each individual</w:t>
-      </w:r>
-      <w:proofErr w:type="gramEnd"/>
-      <w:r>
-        <w:rPr>
-          <w:rFonts w:ascii="Arial" w:hAnsi="Arial" w:cs="Arial"/>
-        </w:rPr>
-        <w:t xml:space="preserve"> </w:t>
+        <w:t xml:space="preserve">Convex hull polygons outlining the area in acoustic space for each individual </w:t>
       </w:r>
       <w:r>
         <w:rPr>
@@ -5964,25 +5770,7 @@
           <w:sz w:val="22"/>
           <w:szCs w:val="22"/>
         </w:rPr>
-        <w:t xml:space="preserve">: Group Information </w:t>
-      </w:r>
-      <w:proofErr w:type="gramStart"/>
-      <w:r>
-        <w:rPr>
-          <w:rFonts w:ascii="Arial" w:hAnsi="Arial" w:cs="Arial"/>
-          <w:sz w:val="22"/>
-          <w:szCs w:val="22"/>
-        </w:rPr>
-        <w:t>Dataset .</w:t>
-      </w:r>
-      <w:proofErr w:type="gramEnd"/>
-      <w:r>
-        <w:rPr>
-          <w:rFonts w:ascii="Arial" w:hAnsi="Arial" w:cs="Arial"/>
-          <w:sz w:val="22"/>
-          <w:szCs w:val="22"/>
-        </w:rPr>
-        <w:t xml:space="preserve"> </w:t>
+        <w:t xml:space="preserve">: Group Information Dataset . </w:t>
       </w:r>
       <w:r>
         <w:rPr>
@@ -6232,21 +6020,7 @@
         <w:rPr>
           <w:rFonts w:ascii="Arial" w:hAnsi="Arial" w:cs="Arial"/>
         </w:rPr>
-        <w:t xml:space="preserve">used </w:t>
-      </w:r>
-      <w:proofErr w:type="gramStart"/>
-      <w:r>
-        <w:rPr>
-          <w:rFonts w:ascii="Arial" w:hAnsi="Arial" w:cs="Arial"/>
-        </w:rPr>
-        <w:t>edit</w:t>
-      </w:r>
-      <w:proofErr w:type="gramEnd"/>
-      <w:r>
-        <w:rPr>
-          <w:rFonts w:ascii="Arial" w:hAnsi="Arial" w:cs="Arial"/>
-        </w:rPr>
-        <w:t xml:space="preserve"> distance and </w:t>
+        <w:t xml:space="preserve">used edit distance and </w:t>
       </w:r>
       <w:r>
         <w:rPr>
@@ -6388,21 +6162,7 @@
         <w:rPr>
           <w:rFonts w:ascii="Arial" w:hAnsi="Arial" w:cs="Arial"/>
         </w:rPr>
-        <w:t xml:space="preserve">as well as the size of signal datasets, as a proxy of </w:t>
-      </w:r>
-      <w:proofErr w:type="gramStart"/>
-      <w:r>
-        <w:rPr>
-          <w:rFonts w:ascii="Arial" w:hAnsi="Arial" w:cs="Arial"/>
-        </w:rPr>
-        <w:t>more or less crowded</w:t>
-      </w:r>
-      <w:proofErr w:type="gramEnd"/>
-      <w:r>
-        <w:rPr>
-          <w:rFonts w:ascii="Arial" w:hAnsi="Arial" w:cs="Arial"/>
-        </w:rPr>
-        <w:t xml:space="preserve"> signaling environments.</w:t>
+        <w:t>as well as the size of signal datasets, as a proxy of more or less crowded signaling environments.</w:t>
       </w:r>
       <w:r>
         <w:rPr>
@@ -6760,21 +6520,7 @@
         <w:rPr>
           <w:rFonts w:ascii="Arial" w:hAnsi="Arial" w:cs="Arial"/>
         </w:rPr>
-        <w:t xml:space="preserve"> random chance levels for a given </w:t>
-      </w:r>
-      <w:proofErr w:type="gramStart"/>
-      <w:r>
-        <w:rPr>
-          <w:rFonts w:ascii="Arial" w:hAnsi="Arial" w:cs="Arial"/>
-        </w:rPr>
-        <w:t>dataset, and</w:t>
-      </w:r>
-      <w:proofErr w:type="gramEnd"/>
-      <w:r>
-        <w:rPr>
-          <w:rFonts w:ascii="Arial" w:hAnsi="Arial" w:cs="Arial"/>
-        </w:rPr>
-        <w:t xml:space="preserve"> therefore </w:t>
+        <w:t xml:space="preserve"> random chance levels for a given dataset, and therefore </w:t>
       </w:r>
       <w:r>
         <w:rPr>
@@ -16650,21 +16396,7 @@
           <w:rPr>
             <w:rFonts w:ascii="Arial" w:hAnsi="Arial" w:cs="Arial"/>
           </w:rPr>
-          <w:t xml:space="preserve">in audio representations of these </w:t>
-        </w:r>
-        <w:proofErr w:type="spellStart"/>
-        <w:r>
-          <w:rPr>
-            <w:rFonts w:ascii="Arial" w:hAnsi="Arial" w:cs="Arial"/>
-          </w:rPr>
-          <w:t xml:space="preserve">synthetic </w:t>
-        </w:r>
-        <w:proofErr w:type="spellEnd"/>
-        <w:r>
-          <w:rPr>
-            <w:rFonts w:ascii="Arial" w:hAnsi="Arial" w:cs="Arial"/>
-          </w:rPr>
-          <w:t xml:space="preserve">vocalizations. However, </w:t>
+          <w:t xml:space="preserve">in audio representations of these synthetic vocalizations. However, </w:t>
         </w:r>
         <w:r>
           <w:rPr>
@@ -16709,32 +16441,70 @@
     <w:p>
       <w:pPr>
         <w:spacing w:line="480" w:lineRule="auto"/>
-        <w:rPr>
-          <w:ins w:id="218" w:author="Smith Vidaurre, Grace" w:date="2025-06-04T11:05:00Z" w16du:dateUtc="2025-06-04T15:05:00Z"/>
-          <w:rFonts w:ascii="Arial" w:hAnsi="Arial" w:cs="Arial"/>
-        </w:rPr>
-      </w:pPr>
-    </w:p>
-    <w:p>
-      <w:pPr>
-        <w:spacing w:line="480" w:lineRule="auto"/>
-        <w:rPr>
-          <w:ins w:id="219" w:author="Smith Vidaurre, Grace" w:date="2025-06-04T11:09:00Z" w16du:dateUtc="2025-06-04T15:09:00Z"/>
-          <w:rFonts w:ascii="Arial" w:hAnsi="Arial" w:cs="Arial"/>
-        </w:rPr>
-      </w:pPr>
-      <w:ins w:id="220" w:author="Smith Vidaurre, Grace" w:date="2025-06-04T11:05:00Z" w16du:dateUtc="2025-06-04T15:05:00Z">
-        <w:r>
-          <w:rPr>
-            <w:rFonts w:ascii="Arial" w:hAnsi="Arial" w:cs="Arial"/>
-          </w:rPr>
-          <w:t xml:space="preserve">First, a summary of the vocal identity signal generation pipeline. </w:t>
-        </w:r>
-        <w:r>
-          <w:rPr>
-            <w:rFonts w:ascii="Arial" w:hAnsi="Arial" w:cs="Arial"/>
-          </w:rPr>
-          <w:t>Our pipeline for generating vocal identity signals is available as an R package on GitHub (</w:t>
+        <w:ind w:firstLine="720"/>
+        <w:rPr>
+          <w:ins w:id="218" w:author="Smith Vidaurre, Grace" w:date="2025-06-04T12:38:00Z" w16du:dateUtc="2025-06-04T16:38:00Z"/>
+          <w:rFonts w:ascii="Arial" w:hAnsi="Arial" w:cs="Arial"/>
+        </w:rPr>
+      </w:pPr>
+      <w:ins w:id="219" w:author="Smith Vidaurre, Grace" w:date="2025-06-04T11:05:00Z" w16du:dateUtc="2025-06-04T15:05:00Z">
+        <w:r>
+          <w:rPr>
+            <w:rFonts w:ascii="Arial" w:hAnsi="Arial" w:cs="Arial"/>
+          </w:rPr>
+          <w:t xml:space="preserve">First, </w:t>
+        </w:r>
+      </w:ins>
+      <w:ins w:id="220" w:author="Smith Vidaurre, Grace" w:date="2025-06-04T12:38:00Z" w16du:dateUtc="2025-06-04T16:38:00Z">
+        <w:r>
+          <w:rPr>
+            <w:rFonts w:ascii="Arial" w:hAnsi="Arial" w:cs="Arial"/>
+          </w:rPr>
+          <w:t>we developed a new pipeline for creating synthetic vocalizations in which we can co</w:t>
+        </w:r>
+      </w:ins>
+      <w:ins w:id="221" w:author="Smith Vidaurre, Grace" w:date="2025-06-04T12:39:00Z" w16du:dateUtc="2025-06-04T16:39:00Z">
+        <w:r>
+          <w:rPr>
+            <w:rFonts w:ascii="Arial" w:hAnsi="Arial" w:cs="Arial"/>
+          </w:rPr>
+          <w:t>ntrol the amount of identity information encoded across two social levels.</w:t>
+        </w:r>
+      </w:ins>
+      <w:ins w:id="222" w:author="Smith Vidaurre, Grace" w:date="2025-06-04T12:40:00Z" w16du:dateUtc="2025-06-04T16:40:00Z">
+        <w:r>
+          <w:rPr>
+            <w:rFonts w:ascii="Arial" w:hAnsi="Arial" w:cs="Arial"/>
+          </w:rPr>
+          <w:t xml:space="preserve"> </w:t>
+        </w:r>
+      </w:ins>
+      <w:ins w:id="223" w:author="Smith Vidaurre, Grace" w:date="2025-06-04T12:49:00Z" w16du:dateUtc="2025-06-04T16:49:00Z">
+        <w:r>
+          <w:rPr>
+            <w:rFonts w:ascii="Arial" w:hAnsi="Arial" w:cs="Arial"/>
+          </w:rPr>
+          <w:t xml:space="preserve">This </w:t>
+        </w:r>
+      </w:ins>
+      <w:ins w:id="224" w:author="Smith Vidaurre, Grace" w:date="2025-06-04T12:40:00Z" w16du:dateUtc="2025-06-04T16:40:00Z">
+        <w:r>
+          <w:rPr>
+            <w:rFonts w:ascii="Arial" w:hAnsi="Arial" w:cs="Arial"/>
+          </w:rPr>
+          <w:t xml:space="preserve">pipeline for generating </w:t>
+        </w:r>
+        <w:r>
+          <w:rPr>
+            <w:rFonts w:ascii="Arial" w:hAnsi="Arial" w:cs="Arial"/>
+          </w:rPr>
+          <w:t xml:space="preserve">synthetic </w:t>
+        </w:r>
+        <w:r>
+          <w:rPr>
+            <w:rFonts w:ascii="Arial" w:hAnsi="Arial" w:cs="Arial"/>
+          </w:rPr>
+          <w:t>vocal identity signals is available as an R package on GitHub (</w:t>
         </w:r>
         <w:r>
           <w:rPr>
@@ -16773,45 +16543,161 @@
           </w:rPr>
           <w:t>).</w:t>
         </w:r>
+        <w:r>
+          <w:rPr>
+            <w:rFonts w:ascii="Arial" w:hAnsi="Arial" w:cs="Arial"/>
+          </w:rPr>
+          <w:t xml:space="preserve"> Our development and testing of this tool adds to a </w:t>
+        </w:r>
       </w:ins>
-    </w:p>
-    <w:p>
-      <w:pPr>
-        <w:spacing w:line="480" w:lineRule="auto"/>
-        <w:rPr>
-          <w:ins w:id="221" w:author="Smith Vidaurre, Grace" w:date="2025-06-04T11:09:00Z" w16du:dateUtc="2025-06-04T15:09:00Z"/>
-          <w:rFonts w:ascii="Arial" w:hAnsi="Arial" w:cs="Arial"/>
-        </w:rPr>
-      </w:pPr>
-    </w:p>
-    <w:p>
-      <w:pPr>
-        <w:spacing w:line="480" w:lineRule="auto"/>
-        <w:rPr>
-          <w:ins w:id="222" w:author="Smith Vidaurre, Grace" w:date="2025-06-04T11:09:00Z" w16du:dateUtc="2025-06-04T15:09:00Z"/>
-          <w:rFonts w:ascii="Arial" w:hAnsi="Arial" w:cs="Arial"/>
-        </w:rPr>
-      </w:pPr>
-      <w:ins w:id="223" w:author="Smith Vidaurre, Grace" w:date="2025-06-04T11:09:00Z" w16du:dateUtc="2025-06-04T15:09:00Z">
-        <w:r>
-          <w:rPr>
-            <w:rFonts w:ascii="Arial" w:hAnsi="Arial" w:cs="Arial"/>
-          </w:rPr>
-          <w:t xml:space="preserve">These results confirm that our pipeline of generating synthetic signals via the creation of character strings then using Parson’s code to convert these strings into frequency modulated signals allows us to encode information at multiple social levels in the same signal. Using character strings to encode information in synthetic signals is a computationally efficient way to represent animal vocalizations in simulation-based research. This approach allows us to generate representations of vocalizations that encode complex information that may be </w:t>
-        </w:r>
-        <w:proofErr w:type="gramStart"/>
-        <w:r>
-          <w:rPr>
-            <w:rFonts w:ascii="Arial" w:hAnsi="Arial" w:cs="Arial"/>
-          </w:rPr>
-          <w:t>similar to</w:t>
-        </w:r>
-        <w:proofErr w:type="gramEnd"/>
-        <w:r>
-          <w:rPr>
-            <w:rFonts w:ascii="Arial" w:hAnsi="Arial" w:cs="Arial"/>
-          </w:rPr>
-          <w:t xml:space="preserve"> how animals encode information in complex multilevel societies. </w:t>
+      <w:ins w:id="225" w:author="Smith Vidaurre, Grace" w:date="2025-06-04T12:41:00Z" w16du:dateUtc="2025-06-04T16:41:00Z">
+        <w:r>
+          <w:rPr>
+            <w:rFonts w:ascii="Arial" w:hAnsi="Arial" w:cs="Arial"/>
+          </w:rPr>
+          <w:t xml:space="preserve">literature leveraging </w:t>
+        </w:r>
+      </w:ins>
+      <w:ins w:id="226" w:author="Smith Vidaurre, Grace" w:date="2025-06-04T12:39:00Z" w16du:dateUtc="2025-06-04T16:39:00Z">
+        <w:r>
+          <w:rPr>
+            <w:rFonts w:ascii="Arial" w:hAnsi="Arial" w:cs="Arial"/>
+          </w:rPr>
+          <w:t xml:space="preserve">synthetic vocalizations </w:t>
+        </w:r>
+      </w:ins>
+      <w:ins w:id="227" w:author="Smith Vidaurre, Grace" w:date="2025-06-04T12:42:00Z" w16du:dateUtc="2025-06-04T16:42:00Z">
+        <w:r>
+          <w:rPr>
+            <w:rFonts w:ascii="Arial" w:hAnsi="Arial" w:cs="Arial"/>
+          </w:rPr>
+          <w:t xml:space="preserve">to </w:t>
+        </w:r>
+      </w:ins>
+      <w:ins w:id="228" w:author="Smith Vidaurre, Grace" w:date="2025-06-04T12:41:00Z" w16du:dateUtc="2025-06-04T16:41:00Z">
+        <w:r>
+          <w:rPr>
+            <w:rFonts w:ascii="Arial" w:hAnsi="Arial" w:cs="Arial"/>
+          </w:rPr>
+          <w:t>disseminat</w:t>
+        </w:r>
+      </w:ins>
+      <w:ins w:id="229" w:author="Smith Vidaurre, Grace" w:date="2025-06-04T12:42:00Z" w16du:dateUtc="2025-06-04T16:42:00Z">
+        <w:r>
+          <w:rPr>
+            <w:rFonts w:ascii="Arial" w:hAnsi="Arial" w:cs="Arial"/>
+          </w:rPr>
+          <w:t>e</w:t>
+        </w:r>
+      </w:ins>
+      <w:ins w:id="230" w:author="Smith Vidaurre, Grace" w:date="2025-06-04T12:41:00Z" w16du:dateUtc="2025-06-04T16:41:00Z">
+        <w:r>
+          <w:rPr>
+            <w:rFonts w:ascii="Arial" w:hAnsi="Arial" w:cs="Arial"/>
+          </w:rPr>
+          <w:t xml:space="preserve"> new </w:t>
+        </w:r>
+      </w:ins>
+      <w:ins w:id="231" w:author="Smith Vidaurre, Grace" w:date="2025-06-04T12:39:00Z" w16du:dateUtc="2025-06-04T16:39:00Z">
+        <w:r>
+          <w:rPr>
+            <w:rFonts w:ascii="Arial" w:hAnsi="Arial" w:cs="Arial"/>
+          </w:rPr>
+          <w:t xml:space="preserve">computational bioacoustics pipelines </w:t>
+        </w:r>
+      </w:ins>
+      <w:ins w:id="232" w:author="Smith Vidaurre, Grace" w:date="2025-06-04T12:42:00Z" w16du:dateUtc="2025-06-04T16:42:00Z">
+        <w:r>
+          <w:rPr>
+            <w:rFonts w:ascii="Arial" w:hAnsi="Arial" w:cs="Arial"/>
+          </w:rPr>
+          <w:t xml:space="preserve">(CITE), </w:t>
+        </w:r>
+        <w:r>
+          <w:rPr>
+            <w:rFonts w:ascii="Arial" w:hAnsi="Arial" w:cs="Arial"/>
+          </w:rPr>
+          <w:t xml:space="preserve">or validate biological inferences returned by such pipelines (CITE). </w:t>
+        </w:r>
+        <w:r>
+          <w:rPr>
+            <w:rFonts w:ascii="Arial" w:hAnsi="Arial" w:cs="Arial"/>
+          </w:rPr>
+          <w:t xml:space="preserve">In addition, our tool facilitates generating </w:t>
+        </w:r>
+      </w:ins>
+      <w:ins w:id="233" w:author="Smith Vidaurre, Grace" w:date="2025-06-04T12:43:00Z" w16du:dateUtc="2025-06-04T16:43:00Z">
+        <w:r>
+          <w:rPr>
+            <w:rFonts w:ascii="Arial" w:hAnsi="Arial" w:cs="Arial"/>
+          </w:rPr>
+          <w:t xml:space="preserve">synthetic </w:t>
+        </w:r>
+      </w:ins>
+      <w:ins w:id="234" w:author="Smith Vidaurre, Grace" w:date="2025-06-04T12:42:00Z" w16du:dateUtc="2025-06-04T16:42:00Z">
+        <w:r>
+          <w:rPr>
+            <w:rFonts w:ascii="Arial" w:hAnsi="Arial" w:cs="Arial"/>
+          </w:rPr>
+          <w:t>vocal</w:t>
+        </w:r>
+      </w:ins>
+      <w:ins w:id="235" w:author="Smith Vidaurre, Grace" w:date="2025-06-04T12:43:00Z" w16du:dateUtc="2025-06-04T16:43:00Z">
+        <w:r>
+          <w:rPr>
+            <w:rFonts w:ascii="Arial" w:hAnsi="Arial" w:cs="Arial"/>
+          </w:rPr>
+          <w:t>ization</w:t>
+        </w:r>
+      </w:ins>
+      <w:ins w:id="236" w:author="Smith Vidaurre, Grace" w:date="2025-06-04T12:42:00Z" w16du:dateUtc="2025-06-04T16:42:00Z">
+        <w:r>
+          <w:rPr>
+            <w:rFonts w:ascii="Arial" w:hAnsi="Arial" w:cs="Arial"/>
+          </w:rPr>
+          <w:t>s that can be</w:t>
+        </w:r>
+      </w:ins>
+      <w:ins w:id="237" w:author="Smith Vidaurre, Grace" w:date="2025-06-04T12:43:00Z" w16du:dateUtc="2025-06-04T16:43:00Z">
+        <w:r>
+          <w:rPr>
+            <w:rFonts w:ascii="Arial" w:hAnsi="Arial" w:cs="Arial"/>
+          </w:rPr>
+          <w:t xml:space="preserve"> used in empirical experiments, which is an approach that has been </w:t>
+        </w:r>
+      </w:ins>
+      <w:ins w:id="238" w:author="Smith Vidaurre, Grace" w:date="2025-06-04T12:44:00Z" w16du:dateUtc="2025-06-04T16:44:00Z">
+        <w:r>
+          <w:rPr>
+            <w:rFonts w:ascii="Arial" w:hAnsi="Arial" w:cs="Arial"/>
+          </w:rPr>
+          <w:t>successfully</w:t>
+        </w:r>
+        <w:r>
+          <w:rPr>
+            <w:rFonts w:ascii="Arial" w:hAnsi="Arial" w:cs="Arial"/>
+          </w:rPr>
+          <w:t xml:space="preserve"> </w:t>
+        </w:r>
+      </w:ins>
+      <w:ins w:id="239" w:author="Smith Vidaurre, Grace" w:date="2025-06-04T12:43:00Z" w16du:dateUtc="2025-06-04T16:43:00Z">
+        <w:r>
+          <w:rPr>
+            <w:rFonts w:ascii="Arial" w:hAnsi="Arial" w:cs="Arial"/>
+          </w:rPr>
+          <w:t xml:space="preserve">used </w:t>
+        </w:r>
+        <w:r>
+          <w:rPr>
+            <w:rFonts w:ascii="Arial" w:hAnsi="Arial" w:cs="Arial"/>
+          </w:rPr>
+          <w:t xml:space="preserve">to make discoveries about the types of information that receivers can </w:t>
+        </w:r>
+        <w:r>
+          <w:rPr>
+            <w:rFonts w:ascii="Arial" w:hAnsi="Arial" w:cs="Arial"/>
+          </w:rPr>
+          <w:t>perceive in vocal signals (CITE).</w:t>
         </w:r>
       </w:ins>
     </w:p>
@@ -16820,539 +16706,756 @@
         <w:spacing w:line="480" w:lineRule="auto"/>
         <w:ind w:firstLine="720"/>
         <w:rPr>
-          <w:ins w:id="224" w:author="Smith Vidaurre, Grace" w:date="2025-06-04T11:09:00Z" w16du:dateUtc="2025-06-04T15:09:00Z"/>
-          <w:rFonts w:ascii="Arial" w:hAnsi="Arial" w:cs="Arial"/>
-        </w:rPr>
-      </w:pPr>
-      <w:ins w:id="225" w:author="Smith Vidaurre, Grace" w:date="2025-06-04T11:09:00Z" w16du:dateUtc="2025-06-04T15:09:00Z">
-        <w:r>
-          <w:rPr>
-            <w:rFonts w:ascii="Arial" w:hAnsi="Arial" w:cs="Arial"/>
-          </w:rPr>
-          <w:t xml:space="preserve">Until now, Parson’s code has been used to decode information that already exists in animal signals </w:t>
-        </w:r>
-        <w:r>
-          <w:rPr>
-            <w:rFonts w:ascii="Arial" w:hAnsi="Arial" w:cs="Arial"/>
-          </w:rPr>
-          <w:fldChar w:fldCharType="begin"/>
-        </w:r>
-        <w:r>
-          <w:rPr>
-            <w:rFonts w:ascii="Arial" w:hAnsi="Arial" w:cs="Arial"/>
-          </w:rPr>
-          <w:instrText xml:space="preserve"> ADDIN ZOTERO_ITEM CSL_CITATION {"citationID":"xScb71RV","properties":{"formattedCitation":"(36)","plainCitation":"(36)","noteIndex":0},"citationItems":[{"id":599,"uris":["http://zotero.org/groups/5786507/items/MUGYAV6U"],"itemData":{"id":599,"type":"article-journal","abstract":"Bottlenose dolphins (Tursiops truncatus) produce many vocalisations, including whistles that are unique to the individual producing them. Such “signature whistles” play a role in individual recognition and maintaining group integrity. Previous work has shown that humans can successfully group the spectrographic representations of signature whistles according to the individual dolphins that produced them. However, attempts at using mathematical algorithms to perform a similar task have been less successful. A greater understanding of the encoding of identity information in signature whistles is important for assessing similarity of whistles and thus social influences on the development of these learned calls. We re-examined 400 signature whistles from 20 individual dolphins used in a previous study, and tested the performance of new mathematical algorithms. We compared the measure used in the original study (correlation matrix of evenly sampled frequency measurements) to one used in several previous studies (similarity matrix of time-warped whistles), and to a new algorithm based on the Parsons code, used in music retrieval databases. The Parsons code records the direction of frequency change at each time step, and is effective at capturing human perception of music. We analysed similarity matrices from each of these three techniques, as well as a random control, by unsupervised clustering using three separate techniques: k-means clustering, hierarchical clustering, and an adaptive resonance theory neural network. For each of the three clustering techniques, a seven-level Parsons algorithm provided better clustering than the correlation and dynamic time warping algorithms, and was closer to the near-perfect visual categorisations of human judges. Thus, the Parsons code captures much of the individual identity information present in signature whistles, and may prove useful in studies requiring quantification of whistle similarity.","container-title":"PLOS ONE","DOI":"10.1371/journal.pone.0077671","ISSN":"1932-6203","issue":"10","journalAbbreviation":"PLOS ONE","language":"en","note":"publisher: Public Library of Science","page":"e77671","source":"PLoS Journals","title":"The Encoding of Individual Identity in Dolphin Signature Whistles: How Much Information Is Needed?","title-short":"The Encoding of Individual Identity in Dolphin Signature Whistles","volume":"8","author":[{"family":"Kershenbaum","given":"Arik"},{"family":"Sayigh","given":"Laela S."},{"family":"Janik","given":"Vincent M."}],"issued":{"date-parts":[["2013",10,23]]}}}],"schema":"https://github.com/citation-style-language/schema/raw/master/csl-citation.json"} </w:instrText>
-        </w:r>
-        <w:r>
-          <w:rPr>
-            <w:rFonts w:ascii="Arial" w:hAnsi="Arial" w:cs="Arial"/>
-          </w:rPr>
-          <w:fldChar w:fldCharType="separate"/>
-        </w:r>
-        <w:r>
-          <w:rPr>
-            <w:rFonts w:ascii="Arial" w:hAnsi="Arial" w:cs="Arial"/>
-          </w:rPr>
-          <w:t>(36)</w:t>
-        </w:r>
-        <w:r>
-          <w:rPr>
-            <w:rFonts w:ascii="Arial" w:hAnsi="Arial" w:cs="Arial"/>
-          </w:rPr>
-          <w:fldChar w:fldCharType="end"/>
-        </w:r>
-        <w:r>
-          <w:rPr>
-            <w:rFonts w:ascii="Arial" w:hAnsi="Arial" w:cs="Arial"/>
-          </w:rPr>
-          <w:t xml:space="preserve">, however, we’ve demonstrated the power of using Parson’s code to encode information rather than to decode information. Animals are known to use frequency modulation patterns to communicate social information (CITE). Our package, </w:t>
-        </w:r>
-        <w:proofErr w:type="spellStart"/>
-        <w:r>
-          <w:rPr>
-            <w:rFonts w:ascii="Arial" w:hAnsi="Arial" w:cs="Arial"/>
-          </w:rPr>
-          <w:t>paRsynth</w:t>
-        </w:r>
-        <w:proofErr w:type="spellEnd"/>
-        <w:r>
-          <w:rPr>
-            <w:rFonts w:ascii="Arial" w:hAnsi="Arial" w:cs="Arial"/>
-          </w:rPr>
-          <w:t xml:space="preserve">, takes computationally efficient characters strings and turns them into biologically relevant frequency-based signals. Therefore, we </w:t>
-        </w:r>
-        <w:proofErr w:type="gramStart"/>
-        <w:r>
-          <w:rPr>
-            <w:rFonts w:ascii="Arial" w:hAnsi="Arial" w:cs="Arial"/>
-          </w:rPr>
-          <w:t>are able to</w:t>
-        </w:r>
-        <w:proofErr w:type="gramEnd"/>
-        <w:r>
-          <w:rPr>
-            <w:rFonts w:ascii="Arial" w:hAnsi="Arial" w:cs="Arial"/>
-          </w:rPr>
-          <w:t xml:space="preserve"> generate </w:t>
+          <w:ins w:id="240" w:author="Smith Vidaurre, Grace" w:date="2025-06-04T12:50:00Z" w16du:dateUtc="2025-06-04T16:50:00Z"/>
+          <w:rFonts w:ascii="Arial" w:hAnsi="Arial" w:cs="Arial"/>
+        </w:rPr>
+      </w:pPr>
+      <w:ins w:id="241" w:author="Smith Vidaurre, Grace" w:date="2025-06-04T12:50:00Z" w16du:dateUtc="2025-06-04T16:50:00Z">
+        <w:r>
+          <w:rPr>
+            <w:rFonts w:ascii="Arial" w:hAnsi="Arial" w:cs="Arial"/>
+          </w:rPr>
+          <w:t xml:space="preserve">Our pipeline to </w:t>
+        </w:r>
+      </w:ins>
+      <w:ins w:id="242" w:author="Smith Vidaurre, Grace" w:date="2025-06-04T12:38:00Z" w16du:dateUtc="2025-06-04T16:38:00Z">
+        <w:r>
+          <w:rPr>
+            <w:rFonts w:ascii="Arial" w:hAnsi="Arial" w:cs="Arial"/>
+          </w:rPr>
+          <w:t>generat</w:t>
+        </w:r>
+      </w:ins>
+      <w:ins w:id="243" w:author="Smith Vidaurre, Grace" w:date="2025-06-04T12:50:00Z" w16du:dateUtc="2025-06-04T16:50:00Z">
+        <w:r>
+          <w:rPr>
+            <w:rFonts w:ascii="Arial" w:hAnsi="Arial" w:cs="Arial"/>
+          </w:rPr>
+          <w:t>e</w:t>
+        </w:r>
+      </w:ins>
+      <w:ins w:id="244" w:author="Smith Vidaurre, Grace" w:date="2025-06-04T12:38:00Z" w16du:dateUtc="2025-06-04T16:38:00Z">
+        <w:r>
+          <w:rPr>
+            <w:rFonts w:ascii="Arial" w:hAnsi="Arial" w:cs="Arial"/>
+          </w:rPr>
+          <w:t xml:space="preserve"> synthetic </w:t>
+        </w:r>
+      </w:ins>
+      <w:ins w:id="245" w:author="Smith Vidaurre, Grace" w:date="2025-06-04T12:50:00Z" w16du:dateUtc="2025-06-04T16:50:00Z">
+        <w:r>
+          <w:rPr>
+            <w:rFonts w:ascii="Arial" w:hAnsi="Arial" w:cs="Arial"/>
+          </w:rPr>
+          <w:t>vocal identity signals</w:t>
+        </w:r>
+      </w:ins>
+      <w:ins w:id="246" w:author="Smith Vidaurre, Grace" w:date="2025-06-04T12:38:00Z" w16du:dateUtc="2025-06-04T16:38:00Z">
+        <w:r>
+          <w:rPr>
+            <w:rFonts w:ascii="Arial" w:hAnsi="Arial" w:cs="Arial"/>
+          </w:rPr>
+          <w:t xml:space="preserve"> </w:t>
+        </w:r>
+      </w:ins>
+      <w:ins w:id="247" w:author="Smith Vidaurre, Grace" w:date="2025-06-04T12:50:00Z" w16du:dateUtc="2025-06-04T16:50:00Z">
+        <w:r>
+          <w:rPr>
+            <w:rFonts w:ascii="Arial" w:hAnsi="Arial" w:cs="Arial"/>
+          </w:rPr>
+          <w:t xml:space="preserve">begins with </w:t>
+        </w:r>
+      </w:ins>
+      <w:ins w:id="248" w:author="Smith Vidaurre, Grace" w:date="2025-06-04T12:38:00Z" w16du:dateUtc="2025-06-04T16:38:00Z">
+        <w:r>
+          <w:rPr>
+            <w:rFonts w:ascii="Arial" w:hAnsi="Arial" w:cs="Arial"/>
+          </w:rPr>
+          <w:t>the</w:t>
+        </w:r>
+      </w:ins>
+      <w:ins w:id="249" w:author="Smith Vidaurre, Grace" w:date="2025-06-04T12:50:00Z" w16du:dateUtc="2025-06-04T16:50:00Z">
+        <w:r>
+          <w:rPr>
+            <w:rFonts w:ascii="Arial" w:hAnsi="Arial" w:cs="Arial"/>
+          </w:rPr>
+          <w:t xml:space="preserve"> random generation</w:t>
+        </w:r>
+      </w:ins>
+      <w:ins w:id="250" w:author="Smith Vidaurre, Grace" w:date="2025-06-04T12:38:00Z" w16du:dateUtc="2025-06-04T16:38:00Z">
+        <w:r>
+          <w:rPr>
+            <w:rFonts w:ascii="Arial" w:hAnsi="Arial" w:cs="Arial"/>
+          </w:rPr>
+          <w:t xml:space="preserve"> of character strings </w:t>
+        </w:r>
+      </w:ins>
+      <w:ins w:id="251" w:author="Smith Vidaurre, Grace" w:date="2025-06-04T12:51:00Z" w16du:dateUtc="2025-06-04T16:51:00Z">
+        <w:r>
+          <w:rPr>
+            <w:rFonts w:ascii="Arial" w:hAnsi="Arial" w:cs="Arial"/>
+          </w:rPr>
+          <w:t xml:space="preserve">are shared or different between classes at different social levels. </w:t>
+        </w:r>
+        <w:r>
+          <w:rPr>
+            <w:rFonts w:ascii="Arial" w:hAnsi="Arial" w:cs="Arial"/>
+          </w:rPr>
+          <w:t xml:space="preserve">We can also control how much information is encoded at one social level relative to another. </w:t>
+        </w:r>
+        <w:r>
+          <w:rPr>
+            <w:rFonts w:ascii="Arial" w:hAnsi="Arial" w:cs="Arial"/>
+          </w:rPr>
+          <w:t>For instance,</w:t>
+        </w:r>
+        <w:r>
+          <w:rPr>
+            <w:rFonts w:ascii="Arial" w:hAnsi="Arial" w:cs="Arial"/>
+          </w:rPr>
+          <w:t xml:space="preserve"> to generate individually distinctive vocalizations, we can </w:t>
+        </w:r>
+      </w:ins>
+      <w:ins w:id="252" w:author="Smith Vidaurre, Grace" w:date="2025-06-04T12:52:00Z" w16du:dateUtc="2025-06-04T16:52:00Z">
+        <w:r>
+          <w:rPr>
+            <w:rFonts w:ascii="Arial" w:hAnsi="Arial" w:cs="Arial"/>
+          </w:rPr>
+          <w:t xml:space="preserve">randomly create strings shared across calls produced by the same individual, </w:t>
+        </w:r>
+      </w:ins>
+      <w:ins w:id="253" w:author="Smith Vidaurre, Grace" w:date="2025-06-04T12:53:00Z" w16du:dateUtc="2025-06-04T16:53:00Z">
+        <w:r>
+          <w:rPr>
+            <w:rFonts w:ascii="Arial" w:hAnsi="Arial" w:cs="Arial"/>
+          </w:rPr>
+          <w:t>but which vary among individuals within a group</w:t>
+        </w:r>
+        <w:r>
+          <w:rPr>
+            <w:rFonts w:ascii="Arial" w:hAnsi="Arial" w:cs="Arial"/>
+          </w:rPr>
+          <w:t xml:space="preserve">, and which are longer than </w:t>
+        </w:r>
+        <w:r>
+          <w:rPr>
+            <w:rFonts w:ascii="Arial" w:hAnsi="Arial" w:cs="Arial"/>
+          </w:rPr>
+          <w:t xml:space="preserve">strings produced at the group level. </w:t>
+        </w:r>
+        <w:r>
+          <w:rPr>
+            <w:rFonts w:ascii="Arial" w:hAnsi="Arial" w:cs="Arial"/>
+          </w:rPr>
+          <w:t xml:space="preserve">Next, to </w:t>
+        </w:r>
+        <w:r>
+          <w:rPr>
+            <w:rFonts w:ascii="Arial" w:hAnsi="Arial" w:cs="Arial"/>
+          </w:rPr>
+          <w:t>transform</w:t>
+        </w:r>
+        <w:r>
+          <w:rPr>
+            <w:rFonts w:ascii="Arial" w:hAnsi="Arial" w:cs="Arial"/>
+          </w:rPr>
+          <w:t xml:space="preserve"> character strings</w:t>
+        </w:r>
+      </w:ins>
+      <w:ins w:id="254" w:author="Smith Vidaurre, Grace" w:date="2025-06-04T12:54:00Z" w16du:dateUtc="2025-06-04T16:54:00Z">
+        <w:r>
+          <w:rPr>
+            <w:rFonts w:ascii="Arial" w:hAnsi="Arial" w:cs="Arial"/>
+          </w:rPr>
+          <w:t xml:space="preserve"> representing vocal identity signals into audio files</w:t>
+        </w:r>
+        <w:r>
+          <w:rPr>
+            <w:rFonts w:ascii="Arial" w:hAnsi="Arial" w:cs="Arial"/>
+          </w:rPr>
+          <w:t xml:space="preserve"> containing synthetic vocalizations</w:t>
+        </w:r>
+        <w:r>
+          <w:rPr>
+            <w:rFonts w:ascii="Arial" w:hAnsi="Arial" w:cs="Arial"/>
+          </w:rPr>
+          <w:t>,</w:t>
+        </w:r>
+        <w:r>
+          <w:rPr>
+            <w:rFonts w:ascii="Arial" w:hAnsi="Arial" w:cs="Arial"/>
+          </w:rPr>
+          <w:t xml:space="preserve"> we use</w:t>
+        </w:r>
+        <w:r>
+          <w:rPr>
+            <w:rFonts w:ascii="Arial" w:hAnsi="Arial" w:cs="Arial"/>
+          </w:rPr>
+          <w:t xml:space="preserve"> a musical </w:t>
         </w:r>
         <w:r>
           <w:rPr>
             <w:rFonts w:ascii="Arial" w:hAnsi="Arial" w:cs="Arial"/>
           </w:rPr>
           <w:lastRenderedPageBreak/>
-          <w:t xml:space="preserve">information encoding at various levels of complexity in a biologically realistic way, combining synthetic information theory and traditional bioacoustics analysis tools. </w:t>
+          <w:t xml:space="preserve">notation called </w:t>
+        </w:r>
+        <w:r>
+          <w:rPr>
+            <w:rFonts w:ascii="Arial" w:hAnsi="Arial" w:cs="Arial"/>
+          </w:rPr>
+          <w:t>Parson’s code</w:t>
+        </w:r>
+        <w:r>
+          <w:rPr>
+            <w:rFonts w:ascii="Arial" w:hAnsi="Arial" w:cs="Arial"/>
+          </w:rPr>
+          <w:t xml:space="preserve"> to map unique character</w:t>
         </w:r>
       </w:ins>
-    </w:p>
-    <w:p>
-      <w:pPr>
-        <w:spacing w:line="480" w:lineRule="auto"/>
-        <w:rPr>
-          <w:ins w:id="226" w:author="Smith Vidaurre, Grace" w:date="2025-06-04T11:09:00Z" w16du:dateUtc="2025-06-04T15:09:00Z"/>
-          <w:rFonts w:ascii="Arial" w:hAnsi="Arial" w:cs="Arial"/>
-        </w:rPr>
-      </w:pPr>
+      <w:ins w:id="255" w:author="Smith Vidaurre, Grace" w:date="2025-06-04T12:55:00Z" w16du:dateUtc="2025-06-04T16:55:00Z">
+        <w:r>
+          <w:rPr>
+            <w:rFonts w:ascii="Arial" w:hAnsi="Arial" w:cs="Arial"/>
+          </w:rPr>
+          <w:t>s across strings onto directional changes</w:t>
+        </w:r>
+        <w:r>
+          <w:rPr>
+            <w:rFonts w:ascii="Arial" w:hAnsi="Arial" w:cs="Arial"/>
+          </w:rPr>
+          <w:t xml:space="preserve"> in frequency. </w:t>
+        </w:r>
+        <w:r>
+          <w:rPr>
+            <w:rFonts w:ascii="Arial" w:hAnsi="Arial" w:cs="Arial"/>
+          </w:rPr>
+          <w:t>TKTK</w:t>
+        </w:r>
+      </w:ins>
     </w:p>
     <w:p>
       <w:pPr>
         <w:spacing w:line="480" w:lineRule="auto"/>
         <w:ind w:firstLine="720"/>
         <w:rPr>
-          <w:ins w:id="227" w:author="Smith Vidaurre, Grace" w:date="2025-06-04T11:09:00Z" w16du:dateUtc="2025-06-04T15:09:00Z"/>
-          <w:rFonts w:ascii="Arial" w:hAnsi="Arial" w:cs="Arial"/>
-        </w:rPr>
-      </w:pPr>
-      <w:ins w:id="228" w:author="Smith Vidaurre, Grace" w:date="2025-06-04T11:09:00Z" w16du:dateUtc="2025-06-04T15:09:00Z">
-        <w:r>
-          <w:rPr>
-            <w:rFonts w:ascii="Arial" w:hAnsi="Arial" w:cs="Arial"/>
-          </w:rPr>
-          <w:t xml:space="preserve">Our package, </w:t>
-        </w:r>
-        <w:proofErr w:type="spellStart"/>
-        <w:r>
-          <w:rPr>
-            <w:rFonts w:ascii="Arial" w:hAnsi="Arial" w:cs="Arial"/>
-          </w:rPr>
-          <w:t>paRsynth</w:t>
-        </w:r>
-        <w:proofErr w:type="spellEnd"/>
-        <w:r>
-          <w:rPr>
-            <w:rFonts w:ascii="Arial" w:hAnsi="Arial" w:cs="Arial"/>
-          </w:rPr>
-          <w:t xml:space="preserve">, is a new synthetic tool for studying information encoding in animal communication. </w:t>
-        </w:r>
-        <w:r>
-          <w:rPr>
-            <w:rFonts w:ascii="Arial" w:hAnsi="Arial" w:cs="Arial"/>
-          </w:rPr>
-          <w:t xml:space="preserve">Synthetic tools offer a </w:t>
-        </w:r>
-        <w:proofErr w:type="gramStart"/>
-        <w:r>
-          <w:rPr>
-            <w:rFonts w:ascii="Arial" w:hAnsi="Arial" w:cs="Arial"/>
-          </w:rPr>
-          <w:t>practical solutions</w:t>
-        </w:r>
-        <w:proofErr w:type="gramEnd"/>
-        <w:r>
-          <w:rPr>
-            <w:rFonts w:ascii="Arial" w:hAnsi="Arial" w:cs="Arial"/>
-          </w:rPr>
-          <w:t xml:space="preserve"> to limitations in animal communication research imposed by naturalistic data collection</w:t>
-        </w:r>
-        <w:r>
-          <w:rPr>
-            <w:rFonts w:ascii="Arial" w:hAnsi="Arial" w:cs="Arial"/>
-          </w:rPr>
-          <w:t>, while still providing datasets that mimic biologic</w:t>
-        </w:r>
-        <w:r>
-          <w:rPr>
-            <w:rFonts w:ascii="Arial" w:hAnsi="Arial" w:cs="Arial"/>
-          </w:rPr>
-          <w:t>al</w:t>
-        </w:r>
-        <w:r>
-          <w:rPr>
-            <w:rFonts w:ascii="Arial" w:hAnsi="Arial" w:cs="Arial"/>
-          </w:rPr>
-          <w:t xml:space="preserve"> ones. Currently</w:t>
-        </w:r>
-        <w:r>
-          <w:rPr>
-            <w:rFonts w:ascii="Arial" w:hAnsi="Arial" w:cs="Arial"/>
-          </w:rPr>
-          <w:t>,</w:t>
-        </w:r>
-        <w:r>
-          <w:rPr>
-            <w:rFonts w:ascii="Arial" w:hAnsi="Arial" w:cs="Arial"/>
-          </w:rPr>
-          <w:t xml:space="preserve"> there are calls for vocal communication research to take advantage </w:t>
-        </w:r>
-        <w:r>
-          <w:rPr>
-            <w:rFonts w:ascii="Arial" w:hAnsi="Arial" w:cs="Arial"/>
-          </w:rPr>
-          <w:t xml:space="preserve">of </w:t>
-        </w:r>
-        <w:r>
-          <w:rPr>
-            <w:rFonts w:ascii="Arial" w:hAnsi="Arial" w:cs="Arial"/>
-          </w:rPr>
-          <w:t>large-scale quantification methods that are often used in animal movement research</w:t>
-        </w:r>
-        <w:r>
-          <w:rPr>
-            <w:rFonts w:ascii="Arial" w:hAnsi="Arial" w:cs="Arial"/>
-          </w:rPr>
-          <w:t xml:space="preserve"> </w:t>
-        </w:r>
-        <w:r>
-          <w:rPr>
-            <w:rFonts w:ascii="Arial" w:hAnsi="Arial" w:cs="Arial"/>
-          </w:rPr>
-          <w:fldChar w:fldCharType="begin"/>
-        </w:r>
-        <w:r>
-          <w:rPr>
-            <w:rFonts w:ascii="Arial" w:hAnsi="Arial" w:cs="Arial"/>
-          </w:rPr>
-          <w:instrText xml:space="preserve"> ADDIN ZOTERO_ITEM CSL_CITATION {"citationID":"vvuVQ4qs","properties":{"formattedCitation":"(37)","plainCitation":"(37)","noteIndex":0},"citationItems":[{"id":561,"uris":["http://zotero.org/groups/5786507/items/94ZV9WNS"],"itemData":{"id":561,"type":"article-journal","abstract":"&lt;p&gt;Recently developed methods in computational neuroethology have enabled increasingly detailed and comprehensive quantification of animal movements and behavioral kinematics. Vocal communication behavior is well poised for application of similar large-scale quantification methods in the service of physiological and ethological studies. This review describes emerging techniques that can be applied to acoustic and vocal communication signals with the goal of enabling study beyond a small number of model species. We review a range of modern computational methods for bioacoustics, signal processing, and brain-behavior mapping. Along with a discussion of recent advances and techniques, we include challenges and broader goals in establishing a framework for the computational neuroethology of vocal communication.&lt;/p&gt;","container-title":"Frontiers in Behavioral Neuroscience","DOI":"10.3389/fnbeh.2021.811737","ISSN":"1662-5153","journalAbbreviation":"Front. Behav. Neurosci.","language":"English","note":"publisher: Frontiers","source":"Frontiers","title":"Toward a Computational Neuroethology of Vocal Communication: From Bioacoustics to Neurophysiology, Emerging Tools and Future Directions","title-short":"Toward a Computational Neuroethology of Vocal Communication","URL":"https://www.frontiersin.org/journals/behavioral-neuroscience/articles/10.3389/fnbeh.2021.811737/full","volume":"15","author":[{"family":"Sainburg","given":"Tim"},{"family":"Gentner","given":"Timothy Q."}],"accessed":{"date-parts":[["2024",12,17]]},"issued":{"date-parts":[["2021",12,20]]}}}],"schema":"https://github.com/citation-style-language/schema/raw/master/csl-citation.json"} </w:instrText>
-        </w:r>
-        <w:r>
-          <w:rPr>
-            <w:rFonts w:ascii="Arial" w:hAnsi="Arial" w:cs="Arial"/>
-          </w:rPr>
-          <w:fldChar w:fldCharType="separate"/>
-        </w:r>
-        <w:r>
-          <w:rPr>
-            <w:rFonts w:ascii="Arial" w:hAnsi="Arial" w:cs="Arial"/>
-          </w:rPr>
-          <w:t>(37)</w:t>
-        </w:r>
-        <w:r>
-          <w:rPr>
-            <w:rFonts w:ascii="Arial" w:hAnsi="Arial" w:cs="Arial"/>
-          </w:rPr>
-          <w:fldChar w:fldCharType="end"/>
-        </w:r>
-        <w:r>
-          <w:rPr>
-            <w:rFonts w:ascii="Arial" w:hAnsi="Arial" w:cs="Arial"/>
-          </w:rPr>
-          <w:t>. Researchers are already using these datasets in combination with natural ones to determine which analytic tools perform best to assess complexity and animal vocal sequences</w:t>
-        </w:r>
-        <w:r>
-          <w:rPr>
-            <w:rFonts w:ascii="Arial" w:hAnsi="Arial" w:cs="Arial"/>
-          </w:rPr>
-          <w:t xml:space="preserve"> </w:t>
-        </w:r>
-        <w:r>
-          <w:rPr>
-            <w:rFonts w:ascii="Arial" w:hAnsi="Arial" w:cs="Arial"/>
-          </w:rPr>
-          <w:fldChar w:fldCharType="begin"/>
-        </w:r>
-        <w:r>
-          <w:rPr>
-            <w:rFonts w:ascii="Arial" w:hAnsi="Arial" w:cs="Arial"/>
-          </w:rPr>
-          <w:instrText xml:space="preserve"> ADDIN ZOTERO_ITEM CSL_CITATION {"citationID":"hl2pTnSp","properties":{"formattedCitation":"(22)","plainCitation":"(22)","noteIndex":0},"citationItems":[{"id":544,"uris":["http://zotero.org/groups/5786507/items/WJJ2WCSZ"],"itemData":{"id":544,"type":"article-journal","abstract":"Many animals communicate using sequences of discrete acoustic elements which can be complex, vary in their degree of stereotypy, and are potentially open-ended. Variation in sequences can provide important ecological, behavioural or evolutionary information about the structure and connectivity of populations, mechanisms for vocal cultural evolution and the underlying drivers responsible for these processes. Various mathematical techniques have been used to form a realistic approximation of sequence similarity for such tasks. Here, we use both simulated and empirical data sets from animal vocal sequences (rock hyrax, Procavia capensis; humpback whale, Megaptera novaeangliae; bottlenose dolphin, Tursiops truncatus; and Carolina chickadee, Poecile carolinensis) to test which of eight sequence analysis metrics are more likely to reconstruct the information encoded in the sequences, and to test the fidelity of estimation of model parameters, when the sequences are assumed to conform to particular statistical models. Results from the simulated data indicated that multiple metrics were equally successful in reconstructing the information encoded in the sequences of simulated individuals (Markov chains, n-gram models, repeat distribution and edit distance) and data generated by different stochastic processes (entropy rate and n-grams). However, the string edit (Levenshtein) distance performed consistently and significantly better than all other tested metrics (including entropy, Markov chains, n-grams, mutual information) for all empirical data sets, despite being less commonly used in the field of animal acoustic communication. The Levenshtein distance metric provides a robust analytical approach that should be considered in the comparison of animal acoustic sequences in preference to other commonly employed techniques (such as Markov chains, hidden Markov models or Shannon entropy). The recent discovery that non-Markovian vocal sequences may be more common in animal communication than previously thought provides a rich area for future research that requires non-Markovian-based analysis techniques to investigate animal grammars and potentially the origin of human language.","container-title":"Methods in Ecology and Evolution","DOI":"10.1111/2041-210X.12433","ISSN":"2041-210X","issue":"12","language":"en","license":"© 2015 The Authors. Methods in Ecology and Evolution © 2015 British Ecological Society","note":"_eprint: https://onlinelibrary.wiley.com/doi/pdf/10.1111/2041-210X.12433","page":"1452-1461","source":"Wiley Online Library","title":"Quantifying similarity in animal vocal sequences: which metric performs best?","title-short":"Quantifying similarity in animal vocal sequences","volume":"6","author":[{"family":"Kershenbaum","given":"Arik"},{"family":"Garland","given":"Ellen C."}],"issued":{"date-parts":[["2015"]]}}}],"schema":"https://github.com/citation-style-language/schema/raw/master/csl-citation.json"} </w:instrText>
-        </w:r>
-        <w:r>
-          <w:rPr>
-            <w:rFonts w:ascii="Arial" w:hAnsi="Arial" w:cs="Arial"/>
-          </w:rPr>
-          <w:fldChar w:fldCharType="separate"/>
-        </w:r>
-        <w:r>
-          <w:rPr>
-            <w:rFonts w:ascii="Arial" w:hAnsi="Arial" w:cs="Arial"/>
-          </w:rPr>
-          <w:t>(22)</w:t>
-        </w:r>
-        <w:r>
-          <w:rPr>
-            <w:rFonts w:ascii="Arial" w:hAnsi="Arial" w:cs="Arial"/>
-          </w:rPr>
-          <w:fldChar w:fldCharType="end"/>
-        </w:r>
-        <w:r>
-          <w:rPr>
-            <w:rFonts w:ascii="Arial" w:hAnsi="Arial" w:cs="Arial"/>
-          </w:rPr>
-          <w:t xml:space="preserve"> or to validate new methods for calculating and quantify</w:t>
-        </w:r>
-        <w:r>
-          <w:rPr>
-            <w:rFonts w:ascii="Arial" w:hAnsi="Arial" w:cs="Arial"/>
-          </w:rPr>
-          <w:t>ing</w:t>
-        </w:r>
-        <w:r>
-          <w:rPr>
-            <w:rFonts w:ascii="Arial" w:hAnsi="Arial" w:cs="Arial"/>
-          </w:rPr>
-          <w:t xml:space="preserve"> acoustic structure</w:t>
-        </w:r>
-        <w:r>
-          <w:rPr>
-            <w:rFonts w:ascii="Arial" w:hAnsi="Arial" w:cs="Arial"/>
-          </w:rPr>
-          <w:t xml:space="preserve"> </w:t>
-        </w:r>
-        <w:r>
-          <w:rPr>
-            <w:rFonts w:ascii="Arial" w:hAnsi="Arial" w:cs="Arial"/>
-          </w:rPr>
-          <w:fldChar w:fldCharType="begin"/>
-        </w:r>
-        <w:r>
-          <w:rPr>
-            <w:rFonts w:ascii="Arial" w:hAnsi="Arial" w:cs="Arial"/>
-          </w:rPr>
-          <w:instrText xml:space="preserve"> ADDIN ZOTERO_ITEM CSL_CITATION {"citationID":"R4IaNV2R","properties":{"formattedCitation":"(38,39)","plainCitation":"(38,39)","noteIndex":0},"citationItems":[{"id":558,"uris":["http://zotero.org/groups/5786507/items/ZECAX5J9"],"itemData":{"id":558,"type":"article-journal","abstract":"Assessing diversity of discretely varying behaviour is a classical ethological problem. In particular, the challenge of calculating an individuals’ or species’ vocal repertoire size is often an important step in ecological and behavioural studies, but a reproducible and broadly applicable method for accomplishing this task is not currently available. We offer a generalizable method to automate the calculation and quantification of acoustic diversity using an unsupervised random forest framework. We tested our method using natural and synthetic datasets of known repertoire sizes that exhibit standardized variation in common acoustic features as well as in recording quality. We tested two approaches to estimate acoustic diversity using the output from unsupervised random forest analyses: (a) cluster analysis to estimate the number of discrete acoustic signals (e.g. repertoire size) and (b) an estimation of acoustic area in acoustic feature space, as a proxy for repertoire size. We find that our unsupervised analyses classify acoustic structure with high accuracy. Specifically, both approaches accurately estimate element diversity when repertoire size is small to intermediate (5–20 unique elements). However, for larger datasets (20–100 unique elements), we find that calculating the size of the area occupied in acoustic space is a more reliable proxy for estimating repertoire size. We conclude that our implementation of unsupervised random forest analysis offers a generalizable tool that researchers can apply to classify acoustic structure of diverse datasets. Additionally, output from these analyses can be used to compare the distribution and diversity of signals in acoustic space, creating opportunities to quantify and compare the amount of acoustic variation among individuals, populations or species in a standardized way. We provide R code and examples to aid researchers interested in using these techniques.","container-title":"Methods in Ecology and Evolution","DOI":"10.1111/2041-210X.13599","ISSN":"2041-210X","issue":"7","language":"en","license":"© 2021 British Ecological Society","note":"_eprint: https://onlinelibrary.wiley.com/doi/pdf/10.1111/2041-210X.13599","page":"1213-1225","source":"Wiley Online Library","title":"A machine learning approach for classifying and quantifying acoustic diversity","volume":"12","author":[{"family":"Keen","given":"Sara C."},{"family":"Odom","given":"Karan J."},{"family":"Webster","given":"Michael S."},{"family":"Kohn","given":"Gregory M."},{"family":"Wright","given":"Timothy F."},{"family":"Araya-Salas","given":"Marcelo"}],"issued":{"date-parts":[["2021"]]}}},{"id":563,"uris":["http://zotero.org/groups/5786507/items/F9NHL8ST"],"itemData":{"id":563,"type":"article-journal","abstract":"Birdsong is an important signal in mate attraction and territorial defence. Quantifying the complexity of these songs can shed light on individual fitness, sexual selection and behaviour. Several techniques have been used to quantify song complexity and be broadly categorized into measures of sequential variations and measures of diversity. However, these methods are unable to account for important acoustic features like the frequency bandwidth and the variety in the spectro-temporal shape of notes which are an integral part of these vocal signals. This study proposes a new complexity method that considers intra-song note variability and calculates a weighted index for birdsongs using spectral cross-correlation. We first compared previously described methods to understand their advantages and limitations based on the factors that would affect the complexity of songs. We then developed a new method, Note Variability Index (NVI), which incorporates the spectral features of notes to quantify complexity. This method alleviates the need for manual classification of notes that can be error-prone. We used spectrogram cross-correlation to compare notes within a song and used the output values to quantify song complexity. To evaluate the efficacy of the new method, we generated synthetic songs to caricature extremes in song complexity and compared selected conventional complexity methods along with the NVI. We provide case-specific limitations of these methods. Additionally, to examine the efficacy of this new method in real-world scenarios, we used natural birdsongs from multiple species across the globe with varying song structures to compare conventional methods with NVI. To our knowledge, NVI is the only song complexity method that captures the variation of spectro-temporal shapes of the notes in songs where the conventional methods fail to distinguish between similar song structures with different note types. Furthermore, as NVI does not need a manual classification of notes, it can be easily implemented for any type of birdsong with existing sound analysis software; it is quick, avoids the possible subjectivity in note classification and can be automated for large datasets.","container-title":"Methods in Ecology and Evolution","DOI":"10.1111/2041-210X.13765","ISSN":"2041-210X","issue":"2","language":"en","license":"© 2021 British Ecological Society","note":"_eprint: https://onlinelibrary.wiley.com/doi/pdf/10.1111/2041-210X.13765","page":"459-472","source":"Wiley Online Library","title":"Spectrogram cross-correlation can be used to measure the complexity of bird vocalizations","volume":"13","author":[{"family":"Sawant","given":"Suyash"},{"family":"Arvind","given":"Chiti"},{"family":"Joshi","given":"Viral"},{"family":"Robin","given":"V. V."}],"issued":{"date-parts":[["2022"]]}}}],"schema":"https://github.com/citation-style-language/schema/raw/master/csl-citation.json"} </w:instrText>
-        </w:r>
-        <w:r>
-          <w:rPr>
-            <w:rFonts w:ascii="Arial" w:hAnsi="Arial" w:cs="Arial"/>
-          </w:rPr>
-          <w:fldChar w:fldCharType="separate"/>
-        </w:r>
-        <w:r>
-          <w:rPr>
-            <w:rFonts w:ascii="Arial" w:hAnsi="Arial" w:cs="Arial"/>
-          </w:rPr>
-          <w:t>(38,39)</w:t>
-        </w:r>
-        <w:r>
-          <w:rPr>
-            <w:rFonts w:ascii="Arial" w:hAnsi="Arial" w:cs="Arial"/>
-          </w:rPr>
-          <w:fldChar w:fldCharType="end"/>
-        </w:r>
-        <w:r>
-          <w:rPr>
-            <w:rFonts w:ascii="Arial" w:hAnsi="Arial" w:cs="Arial"/>
-          </w:rPr>
-          <w:t>. There are several packages in R that allow researchers to create synthetic vocal signal datasets with biological relevance. [</w:t>
-        </w:r>
-        <w:r>
-          <w:rPr>
-            <w:rFonts w:ascii="Arial" w:hAnsi="Arial" w:cs="Arial"/>
-          </w:rPr>
-          <w:t xml:space="preserve">TKTK </w:t>
-        </w:r>
-        <w:r>
-          <w:rPr>
-            <w:rFonts w:ascii="Arial" w:hAnsi="Arial" w:cs="Arial"/>
-          </w:rPr>
-          <w:t xml:space="preserve">sentences about </w:t>
-        </w:r>
-        <w:proofErr w:type="spellStart"/>
-        <w:r>
-          <w:rPr>
-            <w:rFonts w:ascii="Arial" w:hAnsi="Arial" w:cs="Arial"/>
-          </w:rPr>
-          <w:t>wableR</w:t>
-        </w:r>
-        <w:proofErr w:type="spellEnd"/>
-        <w:r>
-          <w:rPr>
-            <w:rFonts w:ascii="Arial" w:hAnsi="Arial" w:cs="Arial"/>
-          </w:rPr>
-          <w:t xml:space="preserve"> and </w:t>
-        </w:r>
-        <w:proofErr w:type="spellStart"/>
-        <w:r>
-          <w:rPr>
-            <w:rFonts w:ascii="Arial" w:hAnsi="Arial" w:cs="Arial"/>
-          </w:rPr>
-          <w:t>soundgen</w:t>
-        </w:r>
-        <w:proofErr w:type="spellEnd"/>
-        <w:r>
-          <w:rPr>
-            <w:rFonts w:ascii="Arial" w:hAnsi="Arial" w:cs="Arial"/>
-          </w:rPr>
-          <w:t>]</w:t>
-        </w:r>
-        <w:r>
-          <w:rPr>
-            <w:rFonts w:ascii="Arial" w:hAnsi="Arial" w:cs="Arial"/>
-          </w:rPr>
-          <w:t>.</w:t>
-        </w:r>
-        <w:r>
-          <w:rPr>
-            <w:rFonts w:ascii="Arial" w:hAnsi="Arial" w:cs="Arial"/>
-          </w:rPr>
-          <w:t xml:space="preserve"> An underused function of these packages in animal communication is that they provide researchers with the ability to manipulate information in synthetic signals to specifically study the types of information encoded in a signal, how much information is encoded, and where the information is encoded in a signal.  </w:t>
-        </w:r>
-      </w:ins>
-    </w:p>
-    <w:p>
-      <w:pPr>
-        <w:spacing w:line="480" w:lineRule="auto"/>
-        <w:rPr>
-          <w:ins w:id="229" w:author="Smith Vidaurre, Grace" w:date="2025-06-04T11:05:00Z" w16du:dateUtc="2025-06-04T15:05:00Z"/>
-          <w:rFonts w:ascii="Arial" w:hAnsi="Arial" w:cs="Arial"/>
-        </w:rPr>
-      </w:pPr>
-    </w:p>
-    <w:p>
-      <w:pPr>
-        <w:spacing w:line="480" w:lineRule="auto"/>
-        <w:rPr>
-          <w:ins w:id="230" w:author="Smith Vidaurre, Grace" w:date="2025-06-04T11:05:00Z" w16du:dateUtc="2025-06-04T15:05:00Z"/>
-          <w:rFonts w:ascii="Arial" w:hAnsi="Arial" w:cs="Arial"/>
-        </w:rPr>
-      </w:pPr>
-    </w:p>
-    <w:p>
-      <w:pPr>
-        <w:spacing w:line="480" w:lineRule="auto"/>
-        <w:rPr>
-          <w:ins w:id="231" w:author="Smith Vidaurre, Grace" w:date="2025-06-04T11:09:00Z" w16du:dateUtc="2025-06-04T15:09:00Z"/>
-          <w:rFonts w:ascii="Arial" w:hAnsi="Arial" w:cs="Arial"/>
-        </w:rPr>
-      </w:pPr>
-      <w:ins w:id="232" w:author="Smith Vidaurre, Grace" w:date="2025-06-04T11:05:00Z" w16du:dateUtc="2025-06-04T15:05:00Z">
-        <w:r>
-          <w:rPr>
-            <w:rFonts w:ascii="Arial" w:hAnsi="Arial" w:cs="Arial"/>
-          </w:rPr>
-          <w:t>Second, a summary of the synthetic experiments.</w:t>
-        </w:r>
-      </w:ins>
-    </w:p>
-    <w:p>
-      <w:pPr>
-        <w:spacing w:line="480" w:lineRule="auto"/>
-        <w:rPr>
-          <w:ins w:id="233" w:author="Smith Vidaurre, Grace" w:date="2025-06-04T11:09:00Z" w16du:dateUtc="2025-06-04T15:09:00Z"/>
-          <w:rFonts w:ascii="Arial" w:hAnsi="Arial" w:cs="Arial"/>
-        </w:rPr>
-      </w:pPr>
-    </w:p>
-    <w:p>
-      <w:pPr>
-        <w:pStyle w:val="NoSpacing"/>
+          <w:ins w:id="256" w:author="Smith Vidaurre, Grace" w:date="2025-06-04T12:50:00Z" w16du:dateUtc="2025-06-04T16:50:00Z"/>
+          <w:rFonts w:ascii="Arial" w:hAnsi="Arial" w:cs="Arial"/>
+        </w:rPr>
+      </w:pPr>
+    </w:p>
+    <w:p>
+      <w:pPr>
         <w:spacing w:line="480" w:lineRule="auto"/>
         <w:ind w:firstLine="720"/>
         <w:rPr>
-          <w:ins w:id="234" w:author="Smith Vidaurre, Grace" w:date="2025-06-04T11:09:00Z" w16du:dateUtc="2025-06-04T15:09:00Z"/>
-          <w:rFonts w:ascii="Arial" w:hAnsi="Arial" w:cs="Arial"/>
-        </w:rPr>
-      </w:pPr>
-      <w:ins w:id="235" w:author="Smith Vidaurre, Grace" w:date="2025-06-04T11:09:00Z" w16du:dateUtc="2025-06-04T15:09:00Z">
-        <w:r>
-          <w:rPr>
-            <w:rFonts w:ascii="Arial" w:hAnsi="Arial" w:cs="Arial"/>
-          </w:rPr>
-          <w:lastRenderedPageBreak/>
-          <w:t>In social environments that have more individuals or groups (i.e., more classes of each social level) signal distinctiveness is harder to maintain, since the number of unique possible signals is bounded. This likely explains why accuracy of information encoding was higher when signals were generated from fewer numbers of original classes.</w:t>
-        </w:r>
-      </w:ins>
-    </w:p>
-    <w:p>
-      <w:pPr>
-        <w:pStyle w:val="NoSpacing"/>
-        <w:spacing w:line="480" w:lineRule="auto"/>
-        <w:ind w:firstLine="720"/>
-        <w:rPr>
-          <w:ins w:id="236" w:author="Smith Vidaurre, Grace" w:date="2025-06-04T11:09:00Z" w16du:dateUtc="2025-06-04T15:09:00Z"/>
-          <w:rFonts w:ascii="Arial" w:hAnsi="Arial" w:cs="Arial"/>
-        </w:rPr>
-      </w:pPr>
-      <w:ins w:id="237" w:author="Smith Vidaurre, Grace" w:date="2025-06-04T11:09:00Z" w16du:dateUtc="2025-06-04T15:09:00Z">
-        <w:r>
-          <w:rPr>
-            <w:rFonts w:ascii="Arial" w:hAnsi="Arial" w:cs="Arial"/>
-          </w:rPr>
-          <w:t xml:space="preserve">As discussed above, the likely reason for this is that when information proportions between group and individual information are roughly equal, datasets are more likely to generate calls that overlap in their signatures. </w:t>
-        </w:r>
-      </w:ins>
-    </w:p>
-    <w:p>
-      <w:pPr>
-        <w:spacing w:line="480" w:lineRule="auto"/>
-        <w:ind w:firstLine="720"/>
-        <w:rPr>
-          <w:ins w:id="238" w:author="Smith Vidaurre, Grace" w:date="2025-06-04T11:05:00Z" w16du:dateUtc="2025-06-04T15:05:00Z"/>
-          <w:rFonts w:ascii="Arial" w:hAnsi="Arial" w:cs="Arial"/>
-        </w:rPr>
-        <w:pPrChange w:id="239" w:author="Smith Vidaurre, Grace" w:date="2025-06-04T11:10:00Z" w16du:dateUtc="2025-06-04T15:10:00Z">
+          <w:ins w:id="257" w:author="Smith Vidaurre, Grace" w:date="2025-06-04T12:38:00Z" w16du:dateUtc="2025-06-04T16:38:00Z"/>
+          <w:rFonts w:ascii="Arial" w:hAnsi="Arial" w:cs="Arial"/>
+        </w:rPr>
+        <w:pPrChange w:id="258" w:author="Smith Vidaurre, Grace" w:date="2025-06-04T12:50:00Z" w16du:dateUtc="2025-06-04T16:50:00Z">
           <w:pPr>
             <w:spacing w:line="480" w:lineRule="auto"/>
           </w:pPr>
         </w:pPrChange>
       </w:pPr>
-      <w:ins w:id="240" w:author="Smith Vidaurre, Grace" w:date="2025-06-04T11:09:00Z" w16du:dateUtc="2025-06-04T15:09:00Z">
-        <w:r>
-          <w:rPr>
-            <w:rFonts w:ascii="Arial" w:hAnsi="Arial" w:cs="Arial"/>
-          </w:rPr>
-          <w:tab/>
+      <w:ins w:id="259" w:author="Smith Vidaurre, Grace" w:date="2025-06-04T12:38:00Z" w16du:dateUtc="2025-06-04T16:38:00Z">
+        <w:r>
+          <w:rPr>
+            <w:rFonts w:ascii="Arial" w:hAnsi="Arial" w:cs="Arial"/>
+          </w:rPr>
+          <w:t xml:space="preserve">then using Parson’s code to convert these strings into frequency modulated signals allows us to encode information at multiple social levels in the same signal. Using character strings to encode information in synthetic signals is a computationally efficient way to represent animal vocalizations in simulation-based research. This approach allows us to generate representations of vocalizations that encode complex information that may be similar to how animals encode information in complex multilevel societies. </w:t>
         </w:r>
       </w:ins>
-    </w:p>
-    <w:p>
-      <w:pPr>
-        <w:spacing w:line="480" w:lineRule="auto"/>
-        <w:rPr>
-          <w:ins w:id="241" w:author="Smith Vidaurre, Grace" w:date="2025-06-04T11:09:00Z" w16du:dateUtc="2025-06-04T15:09:00Z"/>
-          <w:rFonts w:ascii="Arial" w:hAnsi="Arial" w:cs="Arial"/>
-        </w:rPr>
-      </w:pPr>
-      <w:ins w:id="242" w:author="Smith Vidaurre, Grace" w:date="2025-06-04T11:05:00Z" w16du:dateUtc="2025-06-04T15:05:00Z">
-        <w:r>
-          <w:rPr>
-            <w:rFonts w:ascii="Arial" w:hAnsi="Arial" w:cs="Arial"/>
-          </w:rPr>
-          <w:t xml:space="preserve">Third, a summary </w:t>
-        </w:r>
-      </w:ins>
-      <w:ins w:id="243" w:author="Smith Vidaurre, Grace" w:date="2025-06-04T11:06:00Z" w16du:dateUtc="2025-06-04T15:06:00Z">
-        <w:r>
-          <w:rPr>
-            <w:rFonts w:ascii="Arial" w:hAnsi="Arial" w:cs="Arial"/>
-          </w:rPr>
-          <w:t xml:space="preserve">linking our results back to the stochastic generation </w:t>
-        </w:r>
-        <w:r>
-          <w:rPr>
-            <w:rFonts w:ascii="Arial" w:hAnsi="Arial" w:cs="Arial"/>
-          </w:rPr>
-          <w:t>of strings and setting up vague next steps.</w:t>
-        </w:r>
-      </w:ins>
-    </w:p>
-    <w:p>
-      <w:pPr>
-        <w:spacing w:line="480" w:lineRule="auto"/>
-        <w:rPr>
-          <w:ins w:id="244" w:author="Smith Vidaurre, Grace" w:date="2025-06-04T11:09:00Z" w16du:dateUtc="2025-06-04T15:09:00Z"/>
-          <w:rFonts w:ascii="Arial" w:hAnsi="Arial" w:cs="Arial"/>
-        </w:rPr>
-      </w:pPr>
     </w:p>
     <w:p>
       <w:pPr>
         <w:spacing w:line="480" w:lineRule="auto"/>
         <w:ind w:firstLine="720"/>
         <w:rPr>
-          <w:ins w:id="245" w:author="Smith Vidaurre, Grace" w:date="2025-06-04T11:09:00Z" w16du:dateUtc="2025-06-04T15:09:00Z"/>
-          <w:rFonts w:ascii="Arial" w:hAnsi="Arial" w:cs="Arial"/>
-        </w:rPr>
-      </w:pPr>
-      <w:ins w:id="246" w:author="Smith Vidaurre, Grace" w:date="2025-06-04T11:09:00Z" w16du:dateUtc="2025-06-04T15:09:00Z">
+          <w:ins w:id="260" w:author="Smith Vidaurre, Grace" w:date="2025-06-04T12:38:00Z" w16du:dateUtc="2025-06-04T16:38:00Z"/>
+          <w:rFonts w:ascii="Arial" w:hAnsi="Arial" w:cs="Arial"/>
+        </w:rPr>
+      </w:pPr>
+      <w:ins w:id="261" w:author="Smith Vidaurre, Grace" w:date="2025-06-04T12:38:00Z" w16du:dateUtc="2025-06-04T16:38:00Z">
+        <w:r>
+          <w:rPr>
+            <w:rFonts w:ascii="Arial" w:hAnsi="Arial" w:cs="Arial"/>
+          </w:rPr>
+          <w:t xml:space="preserve">Until now, Parson’s code has been used to decode information that already exists in animal signals </w:t>
+        </w:r>
+        <w:r>
+          <w:rPr>
+            <w:rFonts w:ascii="Arial" w:hAnsi="Arial" w:cs="Arial"/>
+          </w:rPr>
+          <w:fldChar w:fldCharType="begin"/>
+        </w:r>
+        <w:r>
+          <w:rPr>
+            <w:rFonts w:ascii="Arial" w:hAnsi="Arial" w:cs="Arial"/>
+          </w:rPr>
+          <w:instrText xml:space="preserve"> ADDIN ZOTERO_ITEM CSL_CITATION {"citationID":"xScb71RV","properties":{"formattedCitation":"(36)","plainCitation":"(36)","noteIndex":0},"citationItems":[{"id":599,"uris":["http://zotero.org/groups/5786507/items/MUGYAV6U"],"itemData":{"id":599,"type":"article-journal","abstract":"Bottlenose dolphins (Tursiops truncatus) produce many vocalisations, including whistles that are unique to the individual producing them. Such “signature whistles” play a role in individual recognition and maintaining group integrity. Previous work has shown that humans can successfully group the spectrographic representations of signature whistles according to the individual dolphins that produced them. However, attempts at using mathematical algorithms to perform a similar task have been less successful. A greater understanding of the encoding of identity information in signature whistles is important for assessing similarity of whistles and thus social influences on the development of these learned calls. We re-examined 400 signature whistles from 20 individual dolphins used in a previous study, and tested the performance of new mathematical algorithms. We compared the measure used in the original study (correlation matrix of evenly sampled frequency measurements) to one used in several previous studies (similarity matrix of time-warped whistles), and to a new algorithm based on the Parsons code, used in music retrieval databases. The Parsons code records the direction of frequency change at each time step, and is effective at capturing human perception of music. We analysed similarity matrices from each of these three techniques, as well as a random control, by unsupervised clustering using three separate techniques: k-means clustering, hierarchical clustering, and an adaptive resonance theory neural network. For each of the three clustering techniques, a seven-level Parsons algorithm provided better clustering than the correlation and dynamic time warping algorithms, and was closer to the near-perfect visual categorisations of human judges. Thus, the Parsons code captures much of the individual identity information present in signature whistles, and may prove useful in studies requiring quantification of whistle similarity.","container-title":"PLOS ONE","DOI":"10.1371/journal.pone.0077671","ISSN":"1932-6203","issue":"10","journalAbbreviation":"PLOS ONE","language":"en","note":"publisher: Public Library of Science","page":"e77671","source":"PLoS Journals","title":"The Encoding of Individual Identity in Dolphin Signature Whistles: How Much Information Is Needed?","title-short":"The Encoding of Individual Identity in Dolphin Signature Whistles","volume":"8","author":[{"family":"Kershenbaum","given":"Arik"},{"family":"Sayigh","given":"Laela S."},{"family":"Janik","given":"Vincent M."}],"issued":{"date-parts":[["2013",10,23]]}}}],"schema":"https://github.com/citation-style-language/schema/raw/master/csl-citation.json"} </w:instrText>
+        </w:r>
+        <w:r>
+          <w:rPr>
+            <w:rFonts w:ascii="Arial" w:hAnsi="Arial" w:cs="Arial"/>
+          </w:rPr>
+          <w:fldChar w:fldCharType="separate"/>
+        </w:r>
+        <w:r>
+          <w:rPr>
+            <w:rFonts w:ascii="Arial" w:hAnsi="Arial" w:cs="Arial"/>
+          </w:rPr>
+          <w:t>(36)</w:t>
+        </w:r>
+        <w:r>
+          <w:rPr>
+            <w:rFonts w:ascii="Arial" w:hAnsi="Arial" w:cs="Arial"/>
+          </w:rPr>
+          <w:fldChar w:fldCharType="end"/>
+        </w:r>
+        <w:r>
+          <w:rPr>
+            <w:rFonts w:ascii="Arial" w:hAnsi="Arial" w:cs="Arial"/>
+          </w:rPr>
+          <w:t xml:space="preserve">, however, we’ve demonstrated the power of using Parson’s code to encode information rather than to decode information. Animals are known to use frequency modulation patterns to communicate social information (CITE). Our package, paRsynth, takes computationally efficient characters strings and turns them into biologically relevant frequency-based signals. Therefore, we are able to generate information encoding at various levels of complexity in a biologically realistic way, combining synthetic information theory and traditional bioacoustics analysis tools. </w:t>
+        </w:r>
+      </w:ins>
+    </w:p>
+    <w:p>
+      <w:pPr>
+        <w:spacing w:line="480" w:lineRule="auto"/>
+        <w:ind w:firstLine="720"/>
+        <w:rPr>
+          <w:ins w:id="262" w:author="Smith Vidaurre, Grace" w:date="2025-06-04T12:38:00Z" w16du:dateUtc="2025-06-04T16:38:00Z"/>
+          <w:rFonts w:ascii="Arial" w:hAnsi="Arial" w:cs="Arial"/>
+        </w:rPr>
+      </w:pPr>
+    </w:p>
+    <w:p>
+      <w:pPr>
+        <w:spacing w:line="480" w:lineRule="auto"/>
+        <w:ind w:firstLine="720"/>
+        <w:rPr>
+          <w:ins w:id="263" w:author="Smith Vidaurre, Grace" w:date="2025-06-04T12:38:00Z" w16du:dateUtc="2025-06-04T16:38:00Z"/>
+          <w:rFonts w:ascii="Arial" w:hAnsi="Arial" w:cs="Arial"/>
+        </w:rPr>
+      </w:pPr>
+    </w:p>
+    <w:p>
+      <w:pPr>
+        <w:spacing w:line="480" w:lineRule="auto"/>
+        <w:rPr>
+          <w:ins w:id="264" w:author="Smith Vidaurre, Grace" w:date="2025-06-04T11:09:00Z" w16du:dateUtc="2025-06-04T15:09:00Z"/>
+          <w:rFonts w:ascii="Arial" w:hAnsi="Arial" w:cs="Arial"/>
+        </w:rPr>
+      </w:pPr>
+    </w:p>
+    <w:p>
+      <w:pPr>
+        <w:spacing w:line="480" w:lineRule="auto"/>
+        <w:rPr>
+          <w:ins w:id="265" w:author="Smith Vidaurre, Grace" w:date="2025-06-04T11:09:00Z" w16du:dateUtc="2025-06-04T15:09:00Z"/>
+          <w:rFonts w:ascii="Arial" w:hAnsi="Arial" w:cs="Arial"/>
+        </w:rPr>
+      </w:pPr>
+    </w:p>
+    <w:p>
+      <w:pPr>
+        <w:spacing w:line="480" w:lineRule="auto"/>
+        <w:ind w:firstLine="720"/>
+        <w:rPr>
+          <w:ins w:id="266" w:author="Smith Vidaurre, Grace" w:date="2025-06-04T11:09:00Z" w16du:dateUtc="2025-06-04T15:09:00Z"/>
+          <w:rFonts w:ascii="Arial" w:hAnsi="Arial" w:cs="Arial"/>
+        </w:rPr>
+      </w:pPr>
+      <w:ins w:id="267" w:author="Smith Vidaurre, Grace" w:date="2025-06-04T11:09:00Z" w16du:dateUtc="2025-06-04T15:09:00Z">
+        <w:r>
+          <w:rPr>
+            <w:rFonts w:ascii="Arial" w:hAnsi="Arial" w:cs="Arial"/>
+          </w:rPr>
+          <w:lastRenderedPageBreak/>
+          <w:t xml:space="preserve">Our package, paRsynth, is a new synthetic tool for studying information encoding in animal communication. </w:t>
+        </w:r>
+        <w:r>
+          <w:rPr>
+            <w:rFonts w:ascii="Arial" w:hAnsi="Arial" w:cs="Arial"/>
+          </w:rPr>
+          <w:t>Synthetic tools offer a practical solutions</w:t>
+        </w:r>
+        <w:r>
+          <w:rPr>
+            <w:rFonts w:ascii="Arial" w:hAnsi="Arial" w:cs="Arial"/>
+          </w:rPr>
+          <w:t xml:space="preserve"> to limitations in animal communication research imposed by naturalistic data collection</w:t>
+        </w:r>
+        <w:r>
+          <w:rPr>
+            <w:rFonts w:ascii="Arial" w:hAnsi="Arial" w:cs="Arial"/>
+          </w:rPr>
+          <w:t>, while still providing datasets that mimic biologic</w:t>
+        </w:r>
+        <w:r>
+          <w:rPr>
+            <w:rFonts w:ascii="Arial" w:hAnsi="Arial" w:cs="Arial"/>
+          </w:rPr>
+          <w:t>al</w:t>
+        </w:r>
+        <w:r>
+          <w:rPr>
+            <w:rFonts w:ascii="Arial" w:hAnsi="Arial" w:cs="Arial"/>
+          </w:rPr>
+          <w:t xml:space="preserve"> ones. Currently</w:t>
+        </w:r>
+        <w:r>
+          <w:rPr>
+            <w:rFonts w:ascii="Arial" w:hAnsi="Arial" w:cs="Arial"/>
+          </w:rPr>
+          <w:t>,</w:t>
+        </w:r>
+        <w:r>
+          <w:rPr>
+            <w:rFonts w:ascii="Arial" w:hAnsi="Arial" w:cs="Arial"/>
+          </w:rPr>
+          <w:t xml:space="preserve"> there are calls for vocal communication research to take advantage </w:t>
+        </w:r>
+        <w:r>
+          <w:rPr>
+            <w:rFonts w:ascii="Arial" w:hAnsi="Arial" w:cs="Arial"/>
+          </w:rPr>
+          <w:t xml:space="preserve">of </w:t>
+        </w:r>
+        <w:r>
+          <w:rPr>
+            <w:rFonts w:ascii="Arial" w:hAnsi="Arial" w:cs="Arial"/>
+          </w:rPr>
+          <w:t>large-scale quantification methods that are often used in animal movement research</w:t>
+        </w:r>
+        <w:r>
+          <w:rPr>
+            <w:rFonts w:ascii="Arial" w:hAnsi="Arial" w:cs="Arial"/>
+          </w:rPr>
+          <w:t xml:space="preserve"> </w:t>
+        </w:r>
+        <w:r>
+          <w:rPr>
+            <w:rFonts w:ascii="Arial" w:hAnsi="Arial" w:cs="Arial"/>
+          </w:rPr>
+          <w:fldChar w:fldCharType="begin"/>
+        </w:r>
+        <w:r>
+          <w:rPr>
+            <w:rFonts w:ascii="Arial" w:hAnsi="Arial" w:cs="Arial"/>
+          </w:rPr>
+          <w:instrText xml:space="preserve"> ADDIN ZOTERO_ITEM CSL_CITATION {"citationID":"vvuVQ4qs","properties":{"formattedCitation":"(37)","plainCitation":"(37)","noteIndex":0},"citationItems":[{"id":561,"uris":["http://zotero.org/groups/5786507/items/94ZV9WNS"],"itemData":{"id":561,"type":"article-journal","abstract":"&lt;p&gt;Recently developed methods in computational neuroethology have enabled increasingly detailed and comprehensive quantification of animal movements and behavioral kinematics. Vocal communication behavior is well poised for application of similar large-scale quantification methods in the service of physiological and ethological studies. This review describes emerging techniques that can be applied to acoustic and vocal communication signals with the goal of enabling study beyond a small number of model species. We review a range of modern computational methods for bioacoustics, signal processing, and brain-behavior mapping. Along with a discussion of recent advances and techniques, we include challenges and broader goals in establishing a framework for the computational neuroethology of vocal communication.&lt;/p&gt;","container-title":"Frontiers in Behavioral Neuroscience","DOI":"10.3389/fnbeh.2021.811737","ISSN":"1662-5153","journalAbbreviation":"Front. Behav. Neurosci.","language":"English","note":"publisher: Frontiers","source":"Frontiers","title":"Toward a Computational Neuroethology of Vocal Communication: From Bioacoustics to Neurophysiology, Emerging Tools and Future Directions","title-short":"Toward a Computational Neuroethology of Vocal Communication","URL":"https://www.frontiersin.org/journals/behavioral-neuroscience/articles/10.3389/fnbeh.2021.811737/full","volume":"15","author":[{"family":"Sainburg","given":"Tim"},{"family":"Gentner","given":"Timothy Q."}],"accessed":{"date-parts":[["2024",12,17]]},"issued":{"date-parts":[["2021",12,20]]}}}],"schema":"https://github.com/citation-style-language/schema/raw/master/csl-citation.json"} </w:instrText>
+        </w:r>
+        <w:r>
+          <w:rPr>
+            <w:rFonts w:ascii="Arial" w:hAnsi="Arial" w:cs="Arial"/>
+          </w:rPr>
+          <w:fldChar w:fldCharType="separate"/>
+        </w:r>
+        <w:r>
+          <w:rPr>
+            <w:rFonts w:ascii="Arial" w:hAnsi="Arial" w:cs="Arial"/>
+          </w:rPr>
+          <w:t>(37)</w:t>
+        </w:r>
+        <w:r>
+          <w:rPr>
+            <w:rFonts w:ascii="Arial" w:hAnsi="Arial" w:cs="Arial"/>
+          </w:rPr>
+          <w:fldChar w:fldCharType="end"/>
+        </w:r>
+        <w:r>
+          <w:rPr>
+            <w:rFonts w:ascii="Arial" w:hAnsi="Arial" w:cs="Arial"/>
+          </w:rPr>
+          <w:t>. Researchers are already using these datasets in combination with natural ones to determine which analytic tools perform best to assess complexity and animal vocal sequences</w:t>
+        </w:r>
+        <w:r>
+          <w:rPr>
+            <w:rFonts w:ascii="Arial" w:hAnsi="Arial" w:cs="Arial"/>
+          </w:rPr>
+          <w:t xml:space="preserve"> </w:t>
+        </w:r>
+        <w:r>
+          <w:rPr>
+            <w:rFonts w:ascii="Arial" w:hAnsi="Arial" w:cs="Arial"/>
+          </w:rPr>
+          <w:fldChar w:fldCharType="begin"/>
+        </w:r>
+        <w:r>
+          <w:rPr>
+            <w:rFonts w:ascii="Arial" w:hAnsi="Arial" w:cs="Arial"/>
+          </w:rPr>
+          <w:instrText xml:space="preserve"> ADDIN ZOTERO_ITEM CSL_CITATION {"citationID":"hl2pTnSp","properties":{"formattedCitation":"(22)","plainCitation":"(22)","noteIndex":0},"citationItems":[{"id":544,"uris":["http://zotero.org/groups/5786507/items/WJJ2WCSZ"],"itemData":{"id":544,"type":"article-journal","abstract":"Many animals communicate using sequences of discrete acoustic elements which can be complex, vary in their degree of stereotypy, and are potentially open-ended. Variation in sequences can provide important ecological, behavioural or evolutionary information about the structure and connectivity of populations, mechanisms for vocal cultural evolution and the underlying drivers responsible for these processes. Various mathematical techniques have been used to form a realistic approximation of sequence similarity for such tasks. Here, we use both simulated and empirical data sets from animal vocal sequences (rock hyrax, Procavia capensis; humpback whale, Megaptera novaeangliae; bottlenose dolphin, Tursiops truncatus; and Carolina chickadee, Poecile carolinensis) to test which of eight sequence analysis metrics are more likely to reconstruct the information encoded in the sequences, and to test the fidelity of estimation of model parameters, when the sequences are assumed to conform to particular statistical models. Results from the simulated data indicated that multiple metrics were equally successful in reconstructing the information encoded in the sequences of simulated individuals (Markov chains, n-gram models, repeat distribution and edit distance) and data generated by different stochastic processes (entropy rate and n-grams). However, the string edit (Levenshtein) distance performed consistently and significantly better than all other tested metrics (including entropy, Markov chains, n-grams, mutual information) for all empirical data sets, despite being less commonly used in the field of animal acoustic communication. The Levenshtein distance metric provides a robust analytical approach that should be considered in the comparison of animal acoustic sequences in preference to other commonly employed techniques (such as Markov chains, hidden Markov models or Shannon entropy). The recent discovery that non-Markovian vocal sequences may be more common in animal communication than previously thought provides a rich area for future research that requires non-Markovian-based analysis techniques to investigate animal grammars and potentially the origin of human language.","container-title":"Methods in Ecology and Evolution","DOI":"10.1111/2041-210X.12433","ISSN":"2041-210X","issue":"12","language":"en","license":"© 2015 The Authors. Methods in Ecology and Evolution © 2015 British Ecological Society","note":"_eprint: https://onlinelibrary.wiley.com/doi/pdf/10.1111/2041-210X.12433","page":"1452-1461","source":"Wiley Online Library","title":"Quantifying similarity in animal vocal sequences: which metric performs best?","title-short":"Quantifying similarity in animal vocal sequences","volume":"6","author":[{"family":"Kershenbaum","given":"Arik"},{"family":"Garland","given":"Ellen C."}],"issued":{"date-parts":[["2015"]]}}}],"schema":"https://github.com/citation-style-language/schema/raw/master/csl-citation.json"} </w:instrText>
+        </w:r>
+        <w:r>
+          <w:rPr>
+            <w:rFonts w:ascii="Arial" w:hAnsi="Arial" w:cs="Arial"/>
+          </w:rPr>
+          <w:fldChar w:fldCharType="separate"/>
+        </w:r>
+        <w:r>
+          <w:rPr>
+            <w:rFonts w:ascii="Arial" w:hAnsi="Arial" w:cs="Arial"/>
+          </w:rPr>
+          <w:t>(22)</w:t>
+        </w:r>
+        <w:r>
+          <w:rPr>
+            <w:rFonts w:ascii="Arial" w:hAnsi="Arial" w:cs="Arial"/>
+          </w:rPr>
+          <w:fldChar w:fldCharType="end"/>
+        </w:r>
+        <w:r>
+          <w:rPr>
+            <w:rFonts w:ascii="Arial" w:hAnsi="Arial" w:cs="Arial"/>
+          </w:rPr>
+          <w:t xml:space="preserve"> or to validate new methods for calculating and quantify</w:t>
+        </w:r>
+        <w:r>
+          <w:rPr>
+            <w:rFonts w:ascii="Arial" w:hAnsi="Arial" w:cs="Arial"/>
+          </w:rPr>
+          <w:t>ing</w:t>
+        </w:r>
+        <w:r>
+          <w:rPr>
+            <w:rFonts w:ascii="Arial" w:hAnsi="Arial" w:cs="Arial"/>
+          </w:rPr>
+          <w:t xml:space="preserve"> acoustic structure</w:t>
+        </w:r>
+        <w:r>
+          <w:rPr>
+            <w:rFonts w:ascii="Arial" w:hAnsi="Arial" w:cs="Arial"/>
+          </w:rPr>
+          <w:t xml:space="preserve"> </w:t>
+        </w:r>
+        <w:r>
+          <w:rPr>
+            <w:rFonts w:ascii="Arial" w:hAnsi="Arial" w:cs="Arial"/>
+          </w:rPr>
+          <w:fldChar w:fldCharType="begin"/>
+        </w:r>
+        <w:r>
+          <w:rPr>
+            <w:rFonts w:ascii="Arial" w:hAnsi="Arial" w:cs="Arial"/>
+          </w:rPr>
+          <w:instrText xml:space="preserve"> ADDIN ZOTERO_ITEM CSL_CITATION {"citationID":"R4IaNV2R","properties":{"formattedCitation":"(38,39)","plainCitation":"(38,39)","noteIndex":0},"citationItems":[{"id":558,"uris":["http://zotero.org/groups/5786507/items/ZECAX5J9"],"itemData":{"id":558,"type":"article-journal","abstract":"Assessing diversity of discretely varying behaviour is a classical ethological problem. In particular, the challenge of calculating an individuals’ or species’ vocal repertoire size is often an important step in ecological and behavioural studies, but a reproducible and broadly applicable method for accomplishing this task is not currently available. We offer a generalizable method to automate the calculation and quantification of acoustic diversity using an unsupervised random forest framework. We tested our method using natural and synthetic datasets of known repertoire sizes that exhibit standardized variation in common acoustic features as well as in recording quality. We tested two approaches to estimate acoustic diversity using the output from unsupervised random forest analyses: (a) cluster analysis to estimate the number of discrete acoustic signals (e.g. repertoire size) and (b) an estimation of acoustic area in acoustic feature space, as a proxy for repertoire size. We find that our unsupervised analyses classify acoustic structure with high accuracy. Specifically, both approaches accurately estimate element diversity when repertoire size is small to intermediate (5–20 unique elements). However, for larger datasets (20–100 unique elements), we find that calculating the size of the area occupied in acoustic space is a more reliable proxy for estimating repertoire size. We conclude that our implementation of unsupervised random forest analysis offers a generalizable tool that researchers can apply to classify acoustic structure of diverse datasets. Additionally, output from these analyses can be used to compare the distribution and diversity of signals in acoustic space, creating opportunities to quantify and compare the amount of acoustic variation among individuals, populations or species in a standardized way. We provide R code and examples to aid researchers interested in using these techniques.","container-title":"Methods in Ecology and Evolution","DOI":"10.1111/2041-210X.13599","ISSN":"2041-210X","issue":"7","language":"en","license":"© 2021 British Ecological Society","note":"_eprint: https://onlinelibrary.wiley.com/doi/pdf/10.1111/2041-210X.13599","page":"1213-1225","source":"Wiley Online Library","title":"A machine learning approach for classifying and quantifying acoustic diversity","volume":"12","author":[{"family":"Keen","given":"Sara C."},{"family":"Odom","given":"Karan J."},{"family":"Webster","given":"Michael S."},{"family":"Kohn","given":"Gregory M."},{"family":"Wright","given":"Timothy F."},{"family":"Araya-Salas","given":"Marcelo"}],"issued":{"date-parts":[["2021"]]}}},{"id":563,"uris":["http://zotero.org/groups/5786507/items/F9NHL8ST"],"itemData":{"id":563,"type":"article-journal","abstract":"Birdsong is an important signal in mate attraction and territorial defence. Quantifying the complexity of these songs can shed light on individual fitness, sexual selection and behaviour. Several techniques have been used to quantify song complexity and be broadly categorized into measures of sequential variations and measures of diversity. However, these methods are unable to account for important acoustic features like the frequency bandwidth and the variety in the spectro-temporal shape of notes which are an integral part of these vocal signals. This study proposes a new complexity method that considers intra-song note variability and calculates a weighted index for birdsongs using spectral cross-correlation. We first compared previously described methods to understand their advantages and limitations based on the factors that would affect the complexity of songs. We then developed a new method, Note Variability Index (NVI), which incorporates the spectral features of notes to quantify complexity. This method alleviates the need for manual classification of notes that can be error-prone. We used spectrogram cross-correlation to compare notes within a song and used the output values to quantify song complexity. To evaluate the efficacy of the new method, we generated synthetic songs to caricature extremes in song complexity and compared selected conventional complexity methods along with the NVI. We provide case-specific limitations of these methods. Additionally, to examine the efficacy of this new method in real-world scenarios, we used natural birdsongs from multiple species across the globe with varying song structures to compare conventional methods with NVI. To our knowledge, NVI is the only song complexity method that captures the variation of spectro-temporal shapes of the notes in songs where the conventional methods fail to distinguish between similar song structures with different note types. Furthermore, as NVI does not need a manual classification of notes, it can be easily implemented for any type of birdsong with existing sound analysis software; it is quick, avoids the possible subjectivity in note classification and can be automated for large datasets.","container-title":"Methods in Ecology and Evolution","DOI":"10.1111/2041-210X.13765","ISSN":"2041-210X","issue":"2","language":"en","license":"© 2021 British Ecological Society","note":"_eprint: https://onlinelibrary.wiley.com/doi/pdf/10.1111/2041-210X.13765","page":"459-472","source":"Wiley Online Library","title":"Spectrogram cross-correlation can be used to measure the complexity of bird vocalizations","volume":"13","author":[{"family":"Sawant","given":"Suyash"},{"family":"Arvind","given":"Chiti"},{"family":"Joshi","given":"Viral"},{"family":"Robin","given":"V. V."}],"issued":{"date-parts":[["2022"]]}}}],"schema":"https://github.com/citation-style-language/schema/raw/master/csl-citation.json"} </w:instrText>
+        </w:r>
+        <w:r>
+          <w:rPr>
+            <w:rFonts w:ascii="Arial" w:hAnsi="Arial" w:cs="Arial"/>
+          </w:rPr>
+          <w:fldChar w:fldCharType="separate"/>
+        </w:r>
+        <w:r>
+          <w:rPr>
+            <w:rFonts w:ascii="Arial" w:hAnsi="Arial" w:cs="Arial"/>
+          </w:rPr>
+          <w:t>(38,39)</w:t>
+        </w:r>
+        <w:r>
+          <w:rPr>
+            <w:rFonts w:ascii="Arial" w:hAnsi="Arial" w:cs="Arial"/>
+          </w:rPr>
+          <w:fldChar w:fldCharType="end"/>
+        </w:r>
+        <w:r>
+          <w:rPr>
+            <w:rFonts w:ascii="Arial" w:hAnsi="Arial" w:cs="Arial"/>
+          </w:rPr>
+          <w:t>. There are several packages in R that allow researchers to create synthetic vocal signal datasets with biological relevance. [</w:t>
+        </w:r>
+        <w:r>
+          <w:rPr>
+            <w:rFonts w:ascii="Arial" w:hAnsi="Arial" w:cs="Arial"/>
+          </w:rPr>
+          <w:t xml:space="preserve">TKTK </w:t>
+        </w:r>
+        <w:r>
+          <w:rPr>
+            <w:rFonts w:ascii="Arial" w:hAnsi="Arial" w:cs="Arial"/>
+          </w:rPr>
+          <w:t>sentences about wableR and soundgen]</w:t>
+        </w:r>
+        <w:r>
+          <w:rPr>
+            <w:rFonts w:ascii="Arial" w:hAnsi="Arial" w:cs="Arial"/>
+          </w:rPr>
+          <w:t>.</w:t>
+        </w:r>
+        <w:r>
+          <w:rPr>
+            <w:rFonts w:ascii="Arial" w:hAnsi="Arial" w:cs="Arial"/>
+          </w:rPr>
+          <w:t xml:space="preserve"> An underused function of these packages in animal communication is that they provide researchers with the ability to manipulate information in synthetic signals to specifically study the types of information encoded in a signal, how much information is encoded, and where the information is encoded in a signal.  </w:t>
+        </w:r>
+      </w:ins>
+    </w:p>
+    <w:p>
+      <w:pPr>
+        <w:spacing w:line="480" w:lineRule="auto"/>
+        <w:rPr>
+          <w:ins w:id="268" w:author="Smith Vidaurre, Grace" w:date="2025-06-04T11:05:00Z" w16du:dateUtc="2025-06-04T15:05:00Z"/>
+          <w:rFonts w:ascii="Arial" w:hAnsi="Arial" w:cs="Arial"/>
+        </w:rPr>
+      </w:pPr>
+    </w:p>
+    <w:p>
+      <w:pPr>
+        <w:spacing w:line="480" w:lineRule="auto"/>
+        <w:rPr>
+          <w:ins w:id="269" w:author="Smith Vidaurre, Grace" w:date="2025-06-04T11:05:00Z" w16du:dateUtc="2025-06-04T15:05:00Z"/>
+          <w:rFonts w:ascii="Arial" w:hAnsi="Arial" w:cs="Arial"/>
+        </w:rPr>
+      </w:pPr>
+    </w:p>
+    <w:p>
+      <w:pPr>
+        <w:spacing w:line="480" w:lineRule="auto"/>
+        <w:rPr>
+          <w:ins w:id="270" w:author="Smith Vidaurre, Grace" w:date="2025-06-04T11:09:00Z" w16du:dateUtc="2025-06-04T15:09:00Z"/>
+          <w:rFonts w:ascii="Arial" w:hAnsi="Arial" w:cs="Arial"/>
+        </w:rPr>
+      </w:pPr>
+      <w:ins w:id="271" w:author="Smith Vidaurre, Grace" w:date="2025-06-04T11:05:00Z" w16du:dateUtc="2025-06-04T15:05:00Z">
+        <w:r>
+          <w:rPr>
+            <w:rFonts w:ascii="Arial" w:hAnsi="Arial" w:cs="Arial"/>
+          </w:rPr>
+          <w:t>Second, a summary of the synthetic experiments.</w:t>
+        </w:r>
+      </w:ins>
+    </w:p>
+    <w:p>
+      <w:pPr>
+        <w:spacing w:line="480" w:lineRule="auto"/>
+        <w:rPr>
+          <w:ins w:id="272" w:author="Smith Vidaurre, Grace" w:date="2025-06-04T11:09:00Z" w16du:dateUtc="2025-06-04T15:09:00Z"/>
+          <w:rFonts w:ascii="Arial" w:hAnsi="Arial" w:cs="Arial"/>
+        </w:rPr>
+      </w:pPr>
+    </w:p>
+    <w:p>
+      <w:pPr>
+        <w:pStyle w:val="NoSpacing"/>
+        <w:spacing w:line="480" w:lineRule="auto"/>
+        <w:ind w:firstLine="720"/>
+        <w:rPr>
+          <w:ins w:id="273" w:author="Smith Vidaurre, Grace" w:date="2025-06-04T11:09:00Z" w16du:dateUtc="2025-06-04T15:09:00Z"/>
+          <w:rFonts w:ascii="Arial" w:hAnsi="Arial" w:cs="Arial"/>
+        </w:rPr>
+      </w:pPr>
+      <w:ins w:id="274" w:author="Smith Vidaurre, Grace" w:date="2025-06-04T11:09:00Z" w16du:dateUtc="2025-06-04T15:09:00Z">
+        <w:r>
+          <w:rPr>
+            <w:rFonts w:ascii="Arial" w:hAnsi="Arial" w:cs="Arial"/>
+          </w:rPr>
+          <w:t xml:space="preserve">In social environments that have more individuals or groups (i.e., more classes of each social level) signal distinctiveness is harder to maintain, since the number of unique possible signals is bounded. This likely explains why accuracy of information </w:t>
+        </w:r>
+        <w:r>
+          <w:rPr>
+            <w:rFonts w:ascii="Arial" w:hAnsi="Arial" w:cs="Arial"/>
+          </w:rPr>
+          <w:lastRenderedPageBreak/>
+          <w:t>encoding was higher when signals were generated from fewer numbers of original classes.</w:t>
+        </w:r>
+      </w:ins>
+    </w:p>
+    <w:p>
+      <w:pPr>
+        <w:pStyle w:val="NoSpacing"/>
+        <w:spacing w:line="480" w:lineRule="auto"/>
+        <w:ind w:firstLine="720"/>
+        <w:rPr>
+          <w:ins w:id="275" w:author="Smith Vidaurre, Grace" w:date="2025-06-04T11:09:00Z" w16du:dateUtc="2025-06-04T15:09:00Z"/>
+          <w:rFonts w:ascii="Arial" w:hAnsi="Arial" w:cs="Arial"/>
+        </w:rPr>
+      </w:pPr>
+      <w:ins w:id="276" w:author="Smith Vidaurre, Grace" w:date="2025-06-04T11:09:00Z" w16du:dateUtc="2025-06-04T15:09:00Z">
+        <w:r>
+          <w:rPr>
+            <w:rFonts w:ascii="Arial" w:hAnsi="Arial" w:cs="Arial"/>
+          </w:rPr>
+          <w:t xml:space="preserve">As discussed above, the likely reason for this is that when information proportions between group and individual information are roughly equal, datasets are more likely to generate calls that overlap in their signatures. </w:t>
+        </w:r>
+      </w:ins>
+    </w:p>
+    <w:p>
+      <w:pPr>
+        <w:spacing w:line="480" w:lineRule="auto"/>
+        <w:ind w:firstLine="720"/>
+        <w:rPr>
+          <w:ins w:id="277" w:author="Smith Vidaurre, Grace" w:date="2025-06-04T11:05:00Z" w16du:dateUtc="2025-06-04T15:05:00Z"/>
+          <w:rFonts w:ascii="Arial" w:hAnsi="Arial" w:cs="Arial"/>
+        </w:rPr>
+        <w:pPrChange w:id="278" w:author="Smith Vidaurre, Grace" w:date="2025-06-04T11:10:00Z" w16du:dateUtc="2025-06-04T15:10:00Z">
+          <w:pPr>
+            <w:spacing w:line="480" w:lineRule="auto"/>
+          </w:pPr>
+        </w:pPrChange>
+      </w:pPr>
+      <w:ins w:id="279" w:author="Smith Vidaurre, Grace" w:date="2025-06-04T11:09:00Z" w16du:dateUtc="2025-06-04T15:09:00Z">
+        <w:r>
+          <w:rPr>
+            <w:rFonts w:ascii="Arial" w:hAnsi="Arial" w:cs="Arial"/>
+          </w:rPr>
+          <w:tab/>
+        </w:r>
+      </w:ins>
+    </w:p>
+    <w:p>
+      <w:pPr>
+        <w:spacing w:line="480" w:lineRule="auto"/>
+        <w:rPr>
+          <w:ins w:id="280" w:author="Smith Vidaurre, Grace" w:date="2025-06-04T11:09:00Z" w16du:dateUtc="2025-06-04T15:09:00Z"/>
+          <w:rFonts w:ascii="Arial" w:hAnsi="Arial" w:cs="Arial"/>
+        </w:rPr>
+      </w:pPr>
+      <w:ins w:id="281" w:author="Smith Vidaurre, Grace" w:date="2025-06-04T11:05:00Z" w16du:dateUtc="2025-06-04T15:05:00Z">
+        <w:r>
+          <w:rPr>
+            <w:rFonts w:ascii="Arial" w:hAnsi="Arial" w:cs="Arial"/>
+          </w:rPr>
+          <w:t xml:space="preserve">Third, a summary </w:t>
+        </w:r>
+      </w:ins>
+      <w:ins w:id="282" w:author="Smith Vidaurre, Grace" w:date="2025-06-04T11:06:00Z" w16du:dateUtc="2025-06-04T15:06:00Z">
+        <w:r>
+          <w:rPr>
+            <w:rFonts w:ascii="Arial" w:hAnsi="Arial" w:cs="Arial"/>
+          </w:rPr>
+          <w:t xml:space="preserve">linking our results back to the stochastic generation </w:t>
+        </w:r>
+        <w:r>
+          <w:rPr>
+            <w:rFonts w:ascii="Arial" w:hAnsi="Arial" w:cs="Arial"/>
+          </w:rPr>
+          <w:t>of strings and setting up vague next steps.</w:t>
+        </w:r>
+      </w:ins>
+    </w:p>
+    <w:p>
+      <w:pPr>
+        <w:spacing w:line="480" w:lineRule="auto"/>
+        <w:rPr>
+          <w:ins w:id="283" w:author="Smith Vidaurre, Grace" w:date="2025-06-04T11:09:00Z" w16du:dateUtc="2025-06-04T15:09:00Z"/>
+          <w:rFonts w:ascii="Arial" w:hAnsi="Arial" w:cs="Arial"/>
+        </w:rPr>
+      </w:pPr>
+    </w:p>
+    <w:p>
+      <w:pPr>
+        <w:spacing w:line="480" w:lineRule="auto"/>
+        <w:ind w:firstLine="720"/>
+        <w:rPr>
+          <w:ins w:id="284" w:author="Smith Vidaurre, Grace" w:date="2025-06-04T11:09:00Z" w16du:dateUtc="2025-06-04T15:09:00Z"/>
+          <w:rFonts w:ascii="Arial" w:hAnsi="Arial" w:cs="Arial"/>
+        </w:rPr>
+      </w:pPr>
+      <w:ins w:id="285" w:author="Smith Vidaurre, Grace" w:date="2025-06-04T11:09:00Z" w16du:dateUtc="2025-06-04T15:09:00Z">
         <w:r>
           <w:rPr>
             <w:rFonts w:ascii="Arial" w:hAnsi="Arial" w:cs="Arial"/>
@@ -17423,28 +17526,49 @@
           <w:rPr>
             <w:rFonts w:ascii="Arial" w:hAnsi="Arial" w:cs="Arial"/>
           </w:rPr>
-          <w:t xml:space="preserve">. Combining </w:t>
-        </w:r>
-        <w:proofErr w:type="spellStart"/>
-        <w:r>
-          <w:rPr>
-            <w:rFonts w:ascii="Arial" w:hAnsi="Arial" w:cs="Arial"/>
-          </w:rPr>
-          <w:t>paRsynth</w:t>
-        </w:r>
-        <w:proofErr w:type="spellEnd"/>
-        <w:r>
-          <w:rPr>
-            <w:rFonts w:ascii="Arial" w:hAnsi="Arial" w:cs="Arial"/>
-          </w:rPr>
-          <w:t xml:space="preserve"> with agent-based modeling (TKTK maybe cite here or expand on ABM? Don’t want to give too much away though) may be a computationally efficient way to use synthetic vocalization datasets to test how social </w:t>
-        </w:r>
+          <w:t>. Combining paRsynth with agent-based modeling (TKTK maybe cite here or expand on ABM? Don’t want to give too much away though) may be a computationally efficient way to use synthetic vocalization datasets to test how social interactions and vocal learning change the information encoded in signals. Future research will combine these approaches to investigate such questions.</w:t>
+        </w:r>
+      </w:ins>
+    </w:p>
+    <w:p>
+      <w:pPr>
+        <w:spacing w:line="480" w:lineRule="auto"/>
+        <w:rPr>
+          <w:ins w:id="286" w:author="Smith Vidaurre, Grace" w:date="2025-06-04T11:06:00Z" w16du:dateUtc="2025-06-04T15:06:00Z"/>
+          <w:rFonts w:ascii="Arial" w:hAnsi="Arial" w:cs="Arial"/>
+        </w:rPr>
+      </w:pPr>
+    </w:p>
+    <w:p>
+      <w:pPr>
+        <w:spacing w:line="480" w:lineRule="auto"/>
+        <w:rPr>
+          <w:ins w:id="287" w:author="Smith Vidaurre, Grace" w:date="2025-06-04T11:06:00Z" w16du:dateUtc="2025-06-04T15:06:00Z"/>
+          <w:rFonts w:ascii="Arial" w:hAnsi="Arial" w:cs="Arial"/>
+        </w:rPr>
+      </w:pPr>
+    </w:p>
+    <w:p>
+      <w:pPr>
+        <w:spacing w:line="480" w:lineRule="auto"/>
+        <w:rPr>
+          <w:ins w:id="288" w:author="Smith Vidaurre, Grace" w:date="2025-06-04T11:10:00Z" w16du:dateUtc="2025-06-04T15:10:00Z"/>
+          <w:rFonts w:ascii="Arial" w:hAnsi="Arial" w:cs="Arial"/>
+        </w:rPr>
+      </w:pPr>
+      <w:ins w:id="289" w:author="Smith Vidaurre, Grace" w:date="2025-06-04T11:06:00Z" w16du:dateUtc="2025-06-04T15:06:00Z">
         <w:r>
           <w:rPr>
             <w:rFonts w:ascii="Arial" w:hAnsi="Arial" w:cs="Arial"/>
           </w:rPr>
           <w:lastRenderedPageBreak/>
-          <w:t>interactions and vocal learning change the information encoded in signals. Future research will combine these approaches to investigate such questions.</w:t>
+          <w:t xml:space="preserve">Fourth, </w:t>
+        </w:r>
+        <w:r>
+          <w:rPr>
+            <w:rFonts w:ascii="Arial" w:hAnsi="Arial" w:cs="Arial"/>
+          </w:rPr>
+          <w:t>2-3 sentences max about the broader contributions of this work and potential future applications.</w:t>
         </w:r>
       </w:ins>
     </w:p>
@@ -17452,7 +17576,7 @@
       <w:pPr>
         <w:spacing w:line="480" w:lineRule="auto"/>
         <w:rPr>
-          <w:ins w:id="247" w:author="Smith Vidaurre, Grace" w:date="2025-06-04T11:06:00Z" w16du:dateUtc="2025-06-04T15:06:00Z"/>
+          <w:ins w:id="290" w:author="Smith Vidaurre, Grace" w:date="2025-06-04T11:10:00Z" w16du:dateUtc="2025-06-04T15:10:00Z"/>
           <w:rFonts w:ascii="Arial" w:hAnsi="Arial" w:cs="Arial"/>
         </w:rPr>
       </w:pPr>
@@ -17461,90 +17585,35 @@
       <w:pPr>
         <w:spacing w:line="480" w:lineRule="auto"/>
         <w:rPr>
-          <w:ins w:id="248" w:author="Smith Vidaurre, Grace" w:date="2025-06-04T11:06:00Z" w16du:dateUtc="2025-06-04T15:06:00Z"/>
-          <w:rFonts w:ascii="Arial" w:hAnsi="Arial" w:cs="Arial"/>
-        </w:rPr>
-      </w:pPr>
+          <w:ins w:id="291" w:author="Smith Vidaurre, Grace" w:date="2025-06-04T11:10:00Z" w16du:dateUtc="2025-06-04T15:10:00Z"/>
+          <w:rFonts w:ascii="Arial" w:hAnsi="Arial" w:cs="Arial"/>
+        </w:rPr>
+      </w:pPr>
+      <w:ins w:id="292" w:author="Smith Vidaurre, Grace" w:date="2025-06-04T11:10:00Z" w16du:dateUtc="2025-06-04T15:10:00Z">
+        <w:r>
+          <w:rPr>
+            <w:rFonts w:ascii="Arial" w:hAnsi="Arial" w:cs="Arial"/>
+          </w:rPr>
+          <w:t>In summary, we developed a new pipeline for encoding information in biologically relevant acoustic structures of synthetic vocalizations. This pipeline begins with encoding information in character strings, then uses parson code to turn character strings into frequency modulation patterns, allowing us to create synthetic vocalization signals. Importantly, this pipeline creates synthetic vocalizations that can be represented as strings for computational efficiency is sim research while also producing synthetic audio file representation of the same signals for traditional bioacoustics analyses, situating its impact at the interface of computation and communication research. These generative tools not only allow us to perform simulation based research of multilevel information encoding in complex social environments but also this set of functions can be used as a tool to generate synthetic vocal identity signals for experimental work on social recognition</w:t>
+        </w:r>
+      </w:ins>
     </w:p>
     <w:p>
       <w:pPr>
         <w:spacing w:line="480" w:lineRule="auto"/>
         <w:rPr>
-          <w:ins w:id="249" w:author="Smith Vidaurre, Grace" w:date="2025-06-04T11:10:00Z" w16du:dateUtc="2025-06-04T15:10:00Z"/>
-          <w:rFonts w:ascii="Arial" w:hAnsi="Arial" w:cs="Arial"/>
-        </w:rPr>
-      </w:pPr>
-      <w:ins w:id="250" w:author="Smith Vidaurre, Grace" w:date="2025-06-04T11:06:00Z" w16du:dateUtc="2025-06-04T15:06:00Z">
-        <w:r>
-          <w:rPr>
-            <w:rFonts w:ascii="Arial" w:hAnsi="Arial" w:cs="Arial"/>
-          </w:rPr>
-          <w:t xml:space="preserve">Fourth, </w:t>
-        </w:r>
-        <w:r>
-          <w:rPr>
-            <w:rFonts w:ascii="Arial" w:hAnsi="Arial" w:cs="Arial"/>
-          </w:rPr>
-          <w:t>2-3 sentences max about the broader contributions of this work and potential future applications.</w:t>
-        </w:r>
-      </w:ins>
-    </w:p>
-    <w:p>
-      <w:pPr>
-        <w:spacing w:line="480" w:lineRule="auto"/>
-        <w:rPr>
-          <w:ins w:id="251" w:author="Smith Vidaurre, Grace" w:date="2025-06-04T11:10:00Z" w16du:dateUtc="2025-06-04T15:10:00Z"/>
-          <w:rFonts w:ascii="Arial" w:hAnsi="Arial" w:cs="Arial"/>
-        </w:rPr>
-      </w:pPr>
-    </w:p>
-    <w:p>
-      <w:pPr>
-        <w:spacing w:line="480" w:lineRule="auto"/>
-        <w:rPr>
-          <w:ins w:id="252" w:author="Smith Vidaurre, Grace" w:date="2025-06-04T11:10:00Z" w16du:dateUtc="2025-06-04T15:10:00Z"/>
-          <w:rFonts w:ascii="Arial" w:hAnsi="Arial" w:cs="Arial"/>
-        </w:rPr>
-      </w:pPr>
-      <w:ins w:id="253" w:author="Smith Vidaurre, Grace" w:date="2025-06-04T11:10:00Z" w16du:dateUtc="2025-06-04T15:10:00Z">
-        <w:r>
-          <w:rPr>
-            <w:rFonts w:ascii="Arial" w:hAnsi="Arial" w:cs="Arial"/>
-          </w:rPr>
-          <w:t xml:space="preserve">In summary, we developed a new pipeline for encoding information in biologically relevant acoustic structures of synthetic vocalizations. This pipeline begins with encoding information in character strings, then uses parson code to turn character strings into frequency modulation patterns, allowing us to create synthetic vocalization signals. Importantly, this pipeline creates synthetic vocalizations that can be represented as strings for computational efficiency is sim research while also producing synthetic audio file representation of the same signals for traditional bioacoustics analyses, situating its impact at the interface of computation and communication research. These generative tools not only allow us to perform </w:t>
-        </w:r>
-        <w:proofErr w:type="gramStart"/>
-        <w:r>
-          <w:rPr>
-            <w:rFonts w:ascii="Arial" w:hAnsi="Arial" w:cs="Arial"/>
-          </w:rPr>
-          <w:t>simulation based</w:t>
-        </w:r>
-        <w:proofErr w:type="gramEnd"/>
-        <w:r>
-          <w:rPr>
-            <w:rFonts w:ascii="Arial" w:hAnsi="Arial" w:cs="Arial"/>
-          </w:rPr>
-          <w:t xml:space="preserve"> research of multilevel information encoding in complex social environments but also this set of functions can be used as a tool to generate synthetic vocal identity signals for experimental work on social recognition</w:t>
-        </w:r>
-      </w:ins>
-    </w:p>
-    <w:p>
-      <w:pPr>
-        <w:spacing w:line="480" w:lineRule="auto"/>
-        <w:rPr>
-          <w:ins w:id="254" w:author="Smith Vidaurre, Grace" w:date="2025-05-28T19:43:00Z" w16du:dateUtc="2025-05-28T23:43:00Z"/>
-          <w:rFonts w:ascii="Arial" w:hAnsi="Arial" w:cs="Arial"/>
-          <w:rPrChange w:id="255" w:author="Smith Vidaurre, Grace" w:date="2025-06-04T11:10:00Z" w16du:dateUtc="2025-06-04T15:10:00Z">
+          <w:ins w:id="293" w:author="Smith Vidaurre, Grace" w:date="2025-05-28T19:43:00Z" w16du:dateUtc="2025-05-28T23:43:00Z"/>
+          <w:rFonts w:ascii="Arial" w:hAnsi="Arial" w:cs="Arial"/>
+          <w:rPrChange w:id="294" w:author="Smith Vidaurre, Grace" w:date="2025-06-04T11:10:00Z" w16du:dateUtc="2025-06-04T15:10:00Z">
             <w:rPr>
-              <w:ins w:id="256" w:author="Smith Vidaurre, Grace" w:date="2025-05-28T19:43:00Z" w16du:dateUtc="2025-05-28T23:43:00Z"/>
+              <w:ins w:id="295" w:author="Smith Vidaurre, Grace" w:date="2025-05-28T19:43:00Z" w16du:dateUtc="2025-05-28T23:43:00Z"/>
               <w:rFonts w:ascii="Arial" w:hAnsi="Arial" w:cs="Arial"/>
               <w:b/>
               <w:bCs/>
             </w:rPr>
           </w:rPrChange>
         </w:rPr>
-        <w:pPrChange w:id="257" w:author="Smith Vidaurre, Grace" w:date="2025-06-04T11:10:00Z" w16du:dateUtc="2025-06-04T15:10:00Z">
+        <w:pPrChange w:id="296" w:author="Smith Vidaurre, Grace" w:date="2025-06-04T11:10:00Z" w16du:dateUtc="2025-06-04T15:10:00Z">
           <w:pPr>
             <w:pStyle w:val="NoSpacing"/>
             <w:spacing w:line="480" w:lineRule="auto"/>
@@ -17557,11 +17626,11 @@
         <w:spacing w:line="480" w:lineRule="auto"/>
         <w:ind w:firstLine="720"/>
         <w:rPr>
-          <w:ins w:id="258" w:author="Smith Vidaurre, Grace" w:date="2025-05-28T19:43:00Z" w16du:dateUtc="2025-05-28T23:43:00Z"/>
-          <w:rFonts w:ascii="Arial" w:hAnsi="Arial" w:cs="Arial"/>
-        </w:rPr>
-      </w:pPr>
-      <w:ins w:id="259" w:author="Smith Vidaurre, Grace" w:date="2025-05-28T19:43:00Z" w16du:dateUtc="2025-05-28T23:43:00Z">
+          <w:ins w:id="297" w:author="Smith Vidaurre, Grace" w:date="2025-05-28T19:43:00Z" w16du:dateUtc="2025-05-28T23:43:00Z"/>
+          <w:rFonts w:ascii="Arial" w:hAnsi="Arial" w:cs="Arial"/>
+        </w:rPr>
+      </w:pPr>
+      <w:ins w:id="298" w:author="Smith Vidaurre, Grace" w:date="2025-05-28T19:43:00Z" w16du:dateUtc="2025-05-28T23:43:00Z">
         <w:r>
           <w:rPr>
             <w:rFonts w:ascii="Arial" w:hAnsi="Arial" w:cs="Arial"/>
@@ -17596,7 +17665,7 @@
           <w:rFonts w:ascii="Arial" w:hAnsi="Arial" w:cs="Arial"/>
         </w:rPr>
       </w:pPr>
-      <w:commentRangeStart w:id="260"/>
+      <w:commentRangeStart w:id="299"/>
       <w:r>
         <w:rPr>
           <w:rFonts w:ascii="Arial" w:hAnsi="Arial" w:cs="Arial"/>
@@ -17605,7 +17674,7 @@
         </w:rPr>
         <w:t xml:space="preserve">Materials and </w:t>
       </w:r>
-      <w:commentRangeStart w:id="261"/>
+      <w:commentRangeStart w:id="300"/>
       <w:r>
         <w:rPr>
           <w:rFonts w:ascii="Arial" w:hAnsi="Arial" w:cs="Arial"/>
@@ -17614,12 +17683,12 @@
         </w:rPr>
         <w:t>Methods</w:t>
       </w:r>
-      <w:commentRangeEnd w:id="261"/>
+      <w:commentRangeEnd w:id="300"/>
       <w:r>
         <w:rPr>
           <w:rStyle w:val="CommentReference"/>
         </w:rPr>
-        <w:commentReference w:id="261"/>
+        <w:commentReference w:id="300"/>
       </w:r>
       <w:r>
         <w:rPr>
@@ -17627,12 +17696,12 @@
         </w:rPr>
         <w:t>:</w:t>
       </w:r>
-      <w:commentRangeEnd w:id="260"/>
+      <w:commentRangeEnd w:id="299"/>
       <w:r>
         <w:rPr>
           <w:rStyle w:val="CommentReference"/>
         </w:rPr>
-        <w:commentReference w:id="260"/>
+        <w:commentReference w:id="299"/>
       </w:r>
     </w:p>
     <w:p>
@@ -17664,6 +17733,7 @@
         <w:rPr>
           <w:rFonts w:ascii="Arial" w:hAnsi="Arial" w:cs="Arial"/>
         </w:rPr>
+        <w:lastRenderedPageBreak/>
         <w:tab/>
         <w:t xml:space="preserve">First, using R (TKTK citation), we generated character strings to represent synthetic vocal identity signals. Using character strings to represent vocal information is computationally efficient for many purposes, including simulations, like agent-based modeling. Character strings </w:t>
       </w:r>
@@ -17679,27 +17749,27 @@
         </w:rPr>
         <w:t xml:space="preserve"> </w:t>
       </w:r>
-      <w:commentRangeStart w:id="262"/>
-      <w:commentRangeStart w:id="263"/>
+      <w:commentRangeStart w:id="301"/>
+      <w:commentRangeStart w:id="302"/>
       <w:r>
         <w:rPr>
           <w:rFonts w:ascii="Arial" w:hAnsi="Arial" w:cs="Arial"/>
         </w:rPr>
         <w:t xml:space="preserve">5 components (Figure 1): </w:t>
       </w:r>
-      <w:commentRangeEnd w:id="262"/>
+      <w:commentRangeEnd w:id="301"/>
       <w:r>
         <w:rPr>
           <w:rStyle w:val="CommentReference"/>
         </w:rPr>
-        <w:commentReference w:id="262"/>
-      </w:r>
-      <w:commentRangeEnd w:id="263"/>
+        <w:commentReference w:id="301"/>
+      </w:r>
+      <w:commentRangeEnd w:id="302"/>
       <w:r>
         <w:rPr>
           <w:rStyle w:val="CommentReference"/>
         </w:rPr>
-        <w:commentReference w:id="263"/>
+        <w:commentReference w:id="302"/>
       </w:r>
       <w:r>
         <w:rPr>
@@ -17707,19 +17777,19 @@
         </w:rPr>
         <w:t xml:space="preserve">a global head (a string of characters shared across all individuals; TKTK character length), a section of group information, a section of individual information, another section of group information, and a global tail (a string of characters shared across all individuals; TKTK character length). Later versions of our code will allow users to choose where and how much information is encoded in the signal. We varied the character length of the group and individual sections depending on treatment, discussed below. We used three unique characters in the string: A, B, and C. </w:t>
       </w:r>
-      <w:commentRangeStart w:id="264"/>
+      <w:commentRangeStart w:id="303"/>
       <w:r>
         <w:rPr>
           <w:rFonts w:ascii="Arial" w:hAnsi="Arial" w:cs="Arial"/>
         </w:rPr>
         <w:t>Once character strings were generated, we added random variation in each call to represent variation within an individual’s call repertoires</w:t>
       </w:r>
-      <w:commentRangeEnd w:id="264"/>
+      <w:commentRangeEnd w:id="303"/>
       <w:r>
         <w:rPr>
           <w:rStyle w:val="CommentReference"/>
         </w:rPr>
-        <w:commentReference w:id="264"/>
+        <w:commentReference w:id="303"/>
       </w:r>
       <w:r>
         <w:rPr>
@@ -17740,21 +17810,7 @@
           <w:rFonts w:ascii="Arial" w:hAnsi="Arial" w:cs="Arial"/>
         </w:rPr>
         <w:tab/>
-        <w:t xml:space="preserve">Next, we </w:t>
-      </w:r>
-      <w:proofErr w:type="spellStart"/>
-      <w:r>
-        <w:rPr>
-          <w:rFonts w:ascii="Arial" w:hAnsi="Arial" w:cs="Arial"/>
-        </w:rPr>
-        <w:t>sonified</w:t>
-      </w:r>
-      <w:proofErr w:type="spellEnd"/>
-      <w:r>
-        <w:rPr>
-          <w:rFonts w:ascii="Arial" w:hAnsi="Arial" w:cs="Arial"/>
-        </w:rPr>
-        <w:t xml:space="preserve"> characters strings to synthetic vocalizations by using Parson’s code. Parson’s code summarizes the information in a tune or signal while reducing over its global characteristics </w:t>
+        <w:t xml:space="preserve">Next, we sonified characters strings to synthetic vocalizations by using Parson’s code. Parson’s code summarizes the information in a tune or signal while reducing over its global characteristics </w:t>
       </w:r>
       <w:r>
         <w:rPr>
@@ -17790,100 +17846,86 @@
         <w:rPr>
           <w:rFonts w:ascii="Arial" w:hAnsi="Arial" w:cs="Arial"/>
         </w:rPr>
-        <w:t>. We used 1-Parsons encoding, which reduces the frequences profile of a signal to a “</w:t>
-      </w:r>
-      <w:proofErr w:type="spellStart"/>
-      <w:r>
-        <w:rPr>
-          <w:rFonts w:ascii="Arial" w:hAnsi="Arial" w:cs="Arial"/>
-        </w:rPr>
-        <w:t>trit</w:t>
-      </w:r>
-      <w:proofErr w:type="spellEnd"/>
-      <w:r>
-        <w:rPr>
-          <w:rFonts w:ascii="Arial" w:hAnsi="Arial" w:cs="Arial"/>
-        </w:rPr>
-        <w:t xml:space="preserve">” of information by noting the direction of frequency change (up, down, or constant) in a series of subsamples from the original signal, known as Parsons segments. Parsons code is often used in the retrieval and study of </w:t>
+        <w:t xml:space="preserve">. We used 1-Parsons encoding, which reduces the frequences profile of a signal to a “trit” of information by noting the direction of frequency change (up, down, or constant) in a series of subsamples from the original signal, known as Parsons segments. Parsons code is often used in the retrieval and study of music </w:t>
+      </w:r>
+      <w:r>
+        <w:rPr>
+          <w:rFonts w:ascii="Arial" w:hAnsi="Arial" w:cs="Arial"/>
+        </w:rPr>
+        <w:fldChar w:fldCharType="begin"/>
+      </w:r>
+      <w:r>
+        <w:rPr>
+          <w:rFonts w:ascii="Arial" w:hAnsi="Arial" w:cs="Arial"/>
+        </w:rPr>
+        <w:instrText xml:space="preserve"> ADDIN ZOTERO_ITEM CSL_CITATION {"citationID":"8E9FupMd","properties":{"formattedCitation":"(41)","plainCitation":"(41)","noteIndex":0},"citationItems":[{"id":601,"uris":["http://zotero.org/groups/5786507/items/IJTC2XE2"],"itemData":{"id":601,"type":"article-journal","container-title":"Annual review of information science and technology","issue":"1","page":"295-340","title":"Music information retrieval","volume":"37","author":[{"family":"Downie","given":"J.S."}],"issued":{"date-parts":[["2003"]]}}}],"schema":"https://github.com/citation-style-language/schema/raw/master/csl-citation.json"} </w:instrText>
+      </w:r>
+      <w:r>
+        <w:rPr>
+          <w:rFonts w:ascii="Arial" w:hAnsi="Arial" w:cs="Arial"/>
+        </w:rPr>
+        <w:fldChar w:fldCharType="separate"/>
+      </w:r>
+      <w:r>
+        <w:rPr>
+          <w:rFonts w:ascii="Arial" w:hAnsi="Arial" w:cs="Arial"/>
+        </w:rPr>
+        <w:t>(41)</w:t>
+      </w:r>
+      <w:r>
+        <w:rPr>
+          <w:rFonts w:ascii="Arial" w:hAnsi="Arial" w:cs="Arial"/>
+        </w:rPr>
+        <w:fldChar w:fldCharType="end"/>
+      </w:r>
+      <w:r>
+        <w:rPr>
+          <w:rFonts w:ascii="Arial" w:hAnsi="Arial" w:cs="Arial"/>
+        </w:rPr>
+        <w:t xml:space="preserve">, however researchers have used a Parsons code metric to decode information in frequency-based animal signals with great success </w:t>
+      </w:r>
+      <w:r>
+        <w:rPr>
+          <w:rFonts w:ascii="Arial" w:hAnsi="Arial" w:cs="Arial"/>
+        </w:rPr>
+        <w:fldChar w:fldCharType="begin"/>
+      </w:r>
+      <w:r>
+        <w:rPr>
+          <w:rFonts w:ascii="Arial" w:hAnsi="Arial" w:cs="Arial"/>
+        </w:rPr>
+        <w:instrText xml:space="preserve"> ADDIN ZOTERO_ITEM CSL_CITATION {"citationID":"r3ZuczO0","properties":{"formattedCitation":"(36)","plainCitation":"(36)","noteIndex":0},"citationItems":[{"id":599,"uris":["http://zotero.org/groups/5786507/items/MUGYAV6U"],"itemData":{"id":599,"type":"article-journal","abstract":"Bottlenose dolphins (Tursiops truncatus) produce many vocalisations, including whistles that are unique to the individual producing them. Such “signature whistles” play a role in individual recognition and maintaining group integrity. Previous work has shown that humans can successfully group the spectrographic representations of signature whistles according to the individual dolphins that produced them. However, attempts at using mathematical algorithms to perform a similar task have been less successful. A greater understanding of the encoding of identity information in signature whistles is important for assessing similarity of whistles and thus social influences on the development of these learned calls. We re-examined 400 signature whistles from 20 individual dolphins used in a previous study, and tested the performance of new mathematical algorithms. We compared the measure used in the original study (correlation matrix of evenly sampled frequency measurements) to one used in several previous studies (similarity matrix of time-warped whistles), and to a new algorithm based on the Parsons code, used in music retrieval databases. The Parsons code records the direction of frequency change at each time step, and is effective at capturing human perception of music. We analysed similarity matrices from each of these three techniques, as well as a random control, by unsupervised clustering using three separate techniques: k-means clustering, hierarchical clustering, and an adaptive resonance theory neural network. For each of the three clustering techniques, a seven-level Parsons algorithm provided better clustering than the correlation and dynamic time warping algorithms, and was closer to the near-perfect visual categorisations of human judges. Thus, the Parsons code captures much of the individual identity information present in signature whistles, and may prove useful in studies requiring quantification of whistle similarity.","container-title":"PLOS ONE","DOI":"10.1371/journal.pone.0077671","ISSN":"1932-6203","issue":"10","journalAbbreviation":"PLOS ONE","language":"en","note":"publisher: Public Library of Science","page":"e77671","source":"PLoS Journals","title":"The Encoding of Individual Identity in Dolphin Signature Whistles: How Much Information Is Needed?","title-short":"The Encoding of Individual Identity in Dolphin Signature Whistles","volume":"8","author":[{"family":"Kershenbaum","given":"Arik"},{"family":"Sayigh","given":"Laela S."},{"family":"Janik","given":"Vincent M."}],"issued":{"date-parts":[["2013",10,23]]}}}],"schema":"https://github.com/citation-style-language/schema/raw/master/csl-citation.json"} </w:instrText>
+      </w:r>
+      <w:r>
+        <w:rPr>
+          <w:rFonts w:ascii="Arial" w:hAnsi="Arial" w:cs="Arial"/>
+        </w:rPr>
+        <w:fldChar w:fldCharType="separate"/>
+      </w:r>
+      <w:r>
+        <w:rPr>
+          <w:rFonts w:ascii="Arial" w:hAnsi="Arial" w:cs="Arial"/>
+        </w:rPr>
+        <w:t>(36)</w:t>
+      </w:r>
+      <w:r>
+        <w:rPr>
+          <w:rFonts w:ascii="Arial" w:hAnsi="Arial" w:cs="Arial"/>
+        </w:rPr>
+        <w:fldChar w:fldCharType="end"/>
+      </w:r>
+      <w:r>
+        <w:rPr>
+          <w:rFonts w:ascii="Arial" w:hAnsi="Arial" w:cs="Arial"/>
+        </w:rPr>
+        <w:t xml:space="preserve">. Here, we used Paron’s code in a novel way, using it to encode information in a signal rather than to </w:t>
       </w:r>
       <w:r>
         <w:rPr>
           <w:rFonts w:ascii="Arial" w:hAnsi="Arial" w:cs="Arial"/>
         </w:rPr>
         <w:lastRenderedPageBreak/>
-        <w:t xml:space="preserve">music </w:t>
-      </w:r>
-      <w:r>
-        <w:rPr>
-          <w:rFonts w:ascii="Arial" w:hAnsi="Arial" w:cs="Arial"/>
-        </w:rPr>
-        <w:fldChar w:fldCharType="begin"/>
-      </w:r>
-      <w:r>
-        <w:rPr>
-          <w:rFonts w:ascii="Arial" w:hAnsi="Arial" w:cs="Arial"/>
-        </w:rPr>
-        <w:instrText xml:space="preserve"> ADDIN ZOTERO_ITEM CSL_CITATION {"citationID":"8E9FupMd","properties":{"formattedCitation":"(41)","plainCitation":"(41)","noteIndex":0},"citationItems":[{"id":601,"uris":["http://zotero.org/groups/5786507/items/IJTC2XE2"],"itemData":{"id":601,"type":"article-journal","container-title":"Annual review of information science and technology","issue":"1","page":"295-340","title":"Music information retrieval","volume":"37","author":[{"family":"Downie","given":"J.S."}],"issued":{"date-parts":[["2003"]]}}}],"schema":"https://github.com/citation-style-language/schema/raw/master/csl-citation.json"} </w:instrText>
-      </w:r>
-      <w:r>
-        <w:rPr>
-          <w:rFonts w:ascii="Arial" w:hAnsi="Arial" w:cs="Arial"/>
-        </w:rPr>
-        <w:fldChar w:fldCharType="separate"/>
-      </w:r>
-      <w:r>
-        <w:rPr>
-          <w:rFonts w:ascii="Arial" w:hAnsi="Arial" w:cs="Arial"/>
-        </w:rPr>
-        <w:t>(41)</w:t>
-      </w:r>
-      <w:r>
-        <w:rPr>
-          <w:rFonts w:ascii="Arial" w:hAnsi="Arial" w:cs="Arial"/>
-        </w:rPr>
-        <w:fldChar w:fldCharType="end"/>
-      </w:r>
-      <w:r>
-        <w:rPr>
-          <w:rFonts w:ascii="Arial" w:hAnsi="Arial" w:cs="Arial"/>
-        </w:rPr>
-        <w:t xml:space="preserve">, however researchers have used a Parsons code metric to decode information in frequency-based animal signals with great success </w:t>
-      </w:r>
-      <w:r>
-        <w:rPr>
-          <w:rFonts w:ascii="Arial" w:hAnsi="Arial" w:cs="Arial"/>
-        </w:rPr>
-        <w:fldChar w:fldCharType="begin"/>
-      </w:r>
-      <w:r>
-        <w:rPr>
-          <w:rFonts w:ascii="Arial" w:hAnsi="Arial" w:cs="Arial"/>
-        </w:rPr>
-        <w:instrText xml:space="preserve"> ADDIN ZOTERO_ITEM CSL_CITATION {"citationID":"r3ZuczO0","properties":{"formattedCitation":"(36)","plainCitation":"(36)","noteIndex":0},"citationItems":[{"id":599,"uris":["http://zotero.org/groups/5786507/items/MUGYAV6U"],"itemData":{"id":599,"type":"article-journal","abstract":"Bottlenose dolphins (Tursiops truncatus) produce many vocalisations, including whistles that are unique to the individual producing them. Such “signature whistles” play a role in individual recognition and maintaining group integrity. Previous work has shown that humans can successfully group the spectrographic representations of signature whistles according to the individual dolphins that produced them. However, attempts at using mathematical algorithms to perform a similar task have been less successful. A greater understanding of the encoding of identity information in signature whistles is important for assessing similarity of whistles and thus social influences on the development of these learned calls. We re-examined 400 signature whistles from 20 individual dolphins used in a previous study, and tested the performance of new mathematical algorithms. We compared the measure used in the original study (correlation matrix of evenly sampled frequency measurements) to one used in several previous studies (similarity matrix of time-warped whistles), and to a new algorithm based on the Parsons code, used in music retrieval databases. The Parsons code records the direction of frequency change at each time step, and is effective at capturing human perception of music. We analysed similarity matrices from each of these three techniques, as well as a random control, by unsupervised clustering using three separate techniques: k-means clustering, hierarchical clustering, and an adaptive resonance theory neural network. For each of the three clustering techniques, a seven-level Parsons algorithm provided better clustering than the correlation and dynamic time warping algorithms, and was closer to the near-perfect visual categorisations of human judges. Thus, the Parsons code captures much of the individual identity information present in signature whistles, and may prove useful in studies requiring quantification of whistle similarity.","container-title":"PLOS ONE","DOI":"10.1371/journal.pone.0077671","ISSN":"1932-6203","issue":"10","journalAbbreviation":"PLOS ONE","language":"en","note":"publisher: Public Library of Science","page":"e77671","source":"PLoS Journals","title":"The Encoding of Individual Identity in Dolphin Signature Whistles: How Much Information Is Needed?","title-short":"The Encoding of Individual Identity in Dolphin Signature Whistles","volume":"8","author":[{"family":"Kershenbaum","given":"Arik"},{"family":"Sayigh","given":"Laela S."},{"family":"Janik","given":"Vincent M."}],"issued":{"date-parts":[["2013",10,23]]}}}],"schema":"https://github.com/citation-style-language/schema/raw/master/csl-citation.json"} </w:instrText>
-      </w:r>
-      <w:r>
-        <w:rPr>
-          <w:rFonts w:ascii="Arial" w:hAnsi="Arial" w:cs="Arial"/>
-        </w:rPr>
-        <w:fldChar w:fldCharType="separate"/>
-      </w:r>
-      <w:r>
-        <w:rPr>
-          <w:rFonts w:ascii="Arial" w:hAnsi="Arial" w:cs="Arial"/>
-        </w:rPr>
-        <w:t>(36)</w:t>
-      </w:r>
-      <w:r>
-        <w:rPr>
-          <w:rFonts w:ascii="Arial" w:hAnsi="Arial" w:cs="Arial"/>
-        </w:rPr>
-        <w:fldChar w:fldCharType="end"/>
-      </w:r>
-      <w:r>
-        <w:rPr>
-          <w:rFonts w:ascii="Arial" w:hAnsi="Arial" w:cs="Arial"/>
-        </w:rPr>
-        <w:t xml:space="preserve">. Here, we used Paron’s code in a novel way, using it to encode information in a signal rather than to decode information. Each unique character mapped onto a direction, such that A was converted into “up”, B into “down”, and C into “constant”. </w:t>
+        <w:t xml:space="preserve">decode information. Each unique character mapped onto a direction, such that A was converted into “up”, B into “down”, and C into “constant”. </w:t>
       </w:r>
     </w:p>
     <w:p>
@@ -17900,47 +17942,33 @@
         </w:rPr>
         <w:t xml:space="preserve">Once strings were in Parson’s code, we converted each section of the vocalization into frequency anchors, measured in Hz. Each subcomponent of synthetic vocalization started at a randomly selected frequency between (TKTK range). </w:t>
       </w:r>
-      <w:commentRangeStart w:id="265"/>
-      <w:commentRangeStart w:id="266"/>
+      <w:commentRangeStart w:id="304"/>
+      <w:commentRangeStart w:id="305"/>
       <w:r>
         <w:rPr>
           <w:rFonts w:ascii="Arial" w:hAnsi="Arial" w:cs="Arial"/>
         </w:rPr>
         <w:t xml:space="preserve">This starting frequency served as a baseline for creating frequency anchors with Parson’s code, which determined if the next frequency anchor was greater than, less than, or the same as the frequency anchor before it. For example, if a synthetic vocalization started at 4000Hz and the first Parson’s code value is “constant”, then the next frequency anchor would also be 4000Hz. However, if the first Parson’s code was “up”, then the second frequency anchor would be 5000Hz. </w:t>
       </w:r>
-      <w:commentRangeEnd w:id="265"/>
+      <w:commentRangeEnd w:id="304"/>
       <w:r>
         <w:rPr>
           <w:rStyle w:val="CommentReference"/>
         </w:rPr>
-        <w:commentReference w:id="265"/>
-      </w:r>
-      <w:commentRangeEnd w:id="266"/>
+        <w:commentReference w:id="304"/>
+      </w:r>
+      <w:commentRangeEnd w:id="305"/>
       <w:r>
         <w:rPr>
           <w:rStyle w:val="CommentReference"/>
         </w:rPr>
-        <w:commentReference w:id="266"/>
-      </w:r>
-      <w:r>
-        <w:rPr>
-          <w:rFonts w:ascii="Arial" w:hAnsi="Arial" w:cs="Arial"/>
-        </w:rPr>
-        <w:t xml:space="preserve">Frequency shifts were kept constant at TKTK (I think 1000Hz). The starting frequency anchor was also used as a final frequency anchor in a vocalization subcomponent. Then, using the frequency anchors in each synthetic vocalization to guide frequency modulation patterns, we generated synthetic audio signals using the </w:t>
-      </w:r>
-      <w:proofErr w:type="spellStart"/>
-      <w:r>
-        <w:rPr>
-          <w:rFonts w:ascii="Arial" w:hAnsi="Arial" w:cs="Arial"/>
-        </w:rPr>
-        <w:t>Soundgen</w:t>
-      </w:r>
-      <w:proofErr w:type="spellEnd"/>
-      <w:r>
-        <w:rPr>
-          <w:rFonts w:ascii="Arial" w:hAnsi="Arial" w:cs="Arial"/>
-        </w:rPr>
-        <w:t xml:space="preserve"> package in R (CITE). The resulting synthetic vocalization files were saved as .wav files.  </w:t>
+        <w:commentReference w:id="305"/>
+      </w:r>
+      <w:r>
+        <w:rPr>
+          <w:rFonts w:ascii="Arial" w:hAnsi="Arial" w:cs="Arial"/>
+        </w:rPr>
+        <w:t xml:space="preserve">Frequency shifts were kept constant at TKTK (I think 1000Hz). The starting frequency anchor was also used as a final frequency anchor in a vocalization subcomponent. Then, using the frequency anchors in each synthetic vocalization to guide frequency modulation patterns, we generated synthetic audio signals using the Soundgen package in R (CITE). The resulting synthetic vocalization files were saved as .wav files.  </w:t>
       </w:r>
     </w:p>
     <w:p>
@@ -17955,21 +17983,7 @@
         <w:rPr>
           <w:rFonts w:ascii="Arial" w:hAnsi="Arial" w:cs="Arial"/>
         </w:rPr>
-        <w:t xml:space="preserve">We used R to generate strings and synthetic audio signals, using the </w:t>
-      </w:r>
-      <w:proofErr w:type="spellStart"/>
-      <w:r>
-        <w:rPr>
-          <w:rFonts w:ascii="Arial" w:hAnsi="Arial" w:cs="Arial"/>
-        </w:rPr>
-        <w:t>paRsynth</w:t>
-      </w:r>
-      <w:proofErr w:type="spellEnd"/>
-      <w:r>
-        <w:rPr>
-          <w:rFonts w:ascii="Arial" w:hAnsi="Arial" w:cs="Arial"/>
-        </w:rPr>
-        <w:t xml:space="preserve"> package (code found TKTK here).</w:t>
+        <w:t>We used R to generate strings and synthetic audio signals, using the paRsynth package (code found TKTK here).</w:t>
       </w:r>
     </w:p>
     <w:p>
@@ -18010,212 +18024,218 @@
         <w:rPr>
           <w:rFonts w:ascii="Arial" w:hAnsi="Arial" w:cs="Arial"/>
         </w:rPr>
+        <w:t xml:space="preserve">Using the process described above, we created two synthetic data sets: one that created </w:t>
+      </w:r>
+      <w:commentRangeStart w:id="306"/>
+      <w:commentRangeStart w:id="307"/>
+      <w:r>
+        <w:rPr>
+          <w:rFonts w:ascii="Arial" w:hAnsi="Arial" w:cs="Arial"/>
+        </w:rPr>
+        <w:t xml:space="preserve">vocalizations </w:t>
+      </w:r>
+      <w:commentRangeEnd w:id="306"/>
+      <w:r>
+        <w:rPr>
+          <w:rStyle w:val="CommentReference"/>
+        </w:rPr>
+        <w:commentReference w:id="306"/>
+      </w:r>
+      <w:commentRangeEnd w:id="307"/>
+      <w:r>
+        <w:rPr>
+          <w:rStyle w:val="CommentReference"/>
+        </w:rPr>
+        <w:commentReference w:id="307"/>
+      </w:r>
+      <w:r>
+        <w:rPr>
+          <w:rFonts w:ascii="Arial" w:hAnsi="Arial" w:cs="Arial"/>
+        </w:rPr>
+        <w:t>with more group membership information than individual information encoded (</w:t>
+      </w:r>
+      <w:r>
+        <w:rPr>
+          <w:rFonts w:ascii="Arial" w:hAnsi="Arial" w:cs="Arial"/>
+        </w:rPr>
+        <w:t>g</w:t>
+      </w:r>
+      <w:r>
+        <w:rPr>
+          <w:rFonts w:ascii="Arial" w:hAnsi="Arial" w:cs="Arial"/>
+        </w:rPr>
+        <w:t xml:space="preserve">roup </w:t>
+      </w:r>
+      <w:r>
+        <w:rPr>
+          <w:rFonts w:ascii="Arial" w:hAnsi="Arial" w:cs="Arial"/>
+        </w:rPr>
+        <w:t>specific</w:t>
+      </w:r>
+      <w:r>
+        <w:rPr>
+          <w:rFonts w:ascii="Arial" w:hAnsi="Arial" w:cs="Arial"/>
+        </w:rPr>
+        <w:t xml:space="preserve"> </w:t>
+      </w:r>
+      <w:r>
+        <w:rPr>
+          <w:rFonts w:ascii="Arial" w:hAnsi="Arial" w:cs="Arial"/>
+        </w:rPr>
+        <w:t>i</w:t>
+      </w:r>
+      <w:r>
+        <w:rPr>
+          <w:rFonts w:ascii="Arial" w:hAnsi="Arial" w:cs="Arial"/>
+        </w:rPr>
+        <w:t xml:space="preserve">nformation </w:t>
+      </w:r>
+      <w:r>
+        <w:rPr>
+          <w:rFonts w:ascii="Arial" w:hAnsi="Arial" w:cs="Arial"/>
+        </w:rPr>
+        <w:t>d</w:t>
+      </w:r>
+      <w:r>
+        <w:rPr>
+          <w:rFonts w:ascii="Arial" w:hAnsi="Arial" w:cs="Arial"/>
+        </w:rPr>
+        <w:t xml:space="preserve">ataset: henceforth the </w:t>
+      </w:r>
+      <w:r>
+        <w:rPr>
+          <w:rFonts w:ascii="Arial" w:hAnsi="Arial" w:cs="Arial"/>
+        </w:rPr>
+        <w:t>group specific</w:t>
+      </w:r>
+      <w:r>
+        <w:rPr>
+          <w:rFonts w:ascii="Arial" w:hAnsi="Arial" w:cs="Arial"/>
+        </w:rPr>
+        <w:t xml:space="preserve"> </w:t>
+      </w:r>
+      <w:r>
+        <w:rPr>
+          <w:rFonts w:ascii="Arial" w:hAnsi="Arial" w:cs="Arial"/>
+        </w:rPr>
         <w:lastRenderedPageBreak/>
-        <w:t xml:space="preserve">Using the process described above, we created two synthetic data sets: one that created </w:t>
-      </w:r>
-      <w:commentRangeStart w:id="267"/>
-      <w:commentRangeStart w:id="268"/>
-      <w:r>
-        <w:rPr>
-          <w:rFonts w:ascii="Arial" w:hAnsi="Arial" w:cs="Arial"/>
-        </w:rPr>
-        <w:t xml:space="preserve">vocalizations </w:t>
-      </w:r>
-      <w:commentRangeEnd w:id="267"/>
+        <w:t xml:space="preserve">dataset), and one that created </w:t>
+      </w:r>
+      <w:commentRangeStart w:id="308"/>
+      <w:r>
+        <w:rPr>
+          <w:rFonts w:ascii="Arial" w:hAnsi="Arial" w:cs="Arial"/>
+        </w:rPr>
+        <w:t xml:space="preserve">character strings </w:t>
+      </w:r>
+      <w:commentRangeEnd w:id="308"/>
       <w:r>
         <w:rPr>
           <w:rStyle w:val="CommentReference"/>
         </w:rPr>
-        <w:commentReference w:id="267"/>
-      </w:r>
-      <w:commentRangeEnd w:id="268"/>
+        <w:commentReference w:id="308"/>
+      </w:r>
+      <w:r>
+        <w:rPr>
+          <w:rFonts w:ascii="Arial" w:hAnsi="Arial" w:cs="Arial"/>
+        </w:rPr>
+        <w:t>with more individual information than group membership information encoded (</w:t>
+      </w:r>
+      <w:r>
+        <w:rPr>
+          <w:rFonts w:ascii="Arial" w:hAnsi="Arial" w:cs="Arial"/>
+        </w:rPr>
+        <w:t>individual identity information dataset</w:t>
+      </w:r>
+      <w:r>
+        <w:rPr>
+          <w:rFonts w:ascii="Arial" w:hAnsi="Arial" w:cs="Arial"/>
+        </w:rPr>
+        <w:t xml:space="preserve">; </w:t>
+      </w:r>
+      <w:commentRangeStart w:id="309"/>
+      <w:commentRangeEnd w:id="309"/>
       <w:r>
         <w:rPr>
           <w:rStyle w:val="CommentReference"/>
         </w:rPr>
-        <w:commentReference w:id="268"/>
-      </w:r>
-      <w:r>
-        <w:rPr>
-          <w:rFonts w:ascii="Arial" w:hAnsi="Arial" w:cs="Arial"/>
-        </w:rPr>
-        <w:t>with more group membership information than individual information encoded (</w:t>
-      </w:r>
-      <w:r>
-        <w:rPr>
-          <w:rFonts w:ascii="Arial" w:hAnsi="Arial" w:cs="Arial"/>
-        </w:rPr>
-        <w:t>g</w:t>
-      </w:r>
-      <w:r>
-        <w:rPr>
-          <w:rFonts w:ascii="Arial" w:hAnsi="Arial" w:cs="Arial"/>
-        </w:rPr>
-        <w:t xml:space="preserve">roup </w:t>
-      </w:r>
-      <w:r>
-        <w:rPr>
-          <w:rFonts w:ascii="Arial" w:hAnsi="Arial" w:cs="Arial"/>
-        </w:rPr>
-        <w:t>specific</w:t>
-      </w:r>
-      <w:r>
-        <w:rPr>
-          <w:rFonts w:ascii="Arial" w:hAnsi="Arial" w:cs="Arial"/>
-        </w:rPr>
-        <w:t xml:space="preserve"> </w:t>
-      </w:r>
-      <w:r>
-        <w:rPr>
-          <w:rFonts w:ascii="Arial" w:hAnsi="Arial" w:cs="Arial"/>
-        </w:rPr>
-        <w:t>i</w:t>
-      </w:r>
-      <w:r>
-        <w:rPr>
-          <w:rFonts w:ascii="Arial" w:hAnsi="Arial" w:cs="Arial"/>
-        </w:rPr>
-        <w:t xml:space="preserve">nformation </w:t>
-      </w:r>
-      <w:r>
-        <w:rPr>
-          <w:rFonts w:ascii="Arial" w:hAnsi="Arial" w:cs="Arial"/>
-        </w:rPr>
-        <w:t>d</w:t>
-      </w:r>
-      <w:r>
-        <w:rPr>
-          <w:rFonts w:ascii="Arial" w:hAnsi="Arial" w:cs="Arial"/>
-        </w:rPr>
-        <w:t xml:space="preserve">ataset: henceforth the </w:t>
-      </w:r>
-      <w:r>
-        <w:rPr>
-          <w:rFonts w:ascii="Arial" w:hAnsi="Arial" w:cs="Arial"/>
-        </w:rPr>
-        <w:t>group specific</w:t>
-      </w:r>
-      <w:r>
-        <w:rPr>
-          <w:rFonts w:ascii="Arial" w:hAnsi="Arial" w:cs="Arial"/>
-        </w:rPr>
-        <w:t xml:space="preserve"> dataset), and one that created </w:t>
-      </w:r>
-      <w:commentRangeStart w:id="269"/>
-      <w:r>
-        <w:rPr>
-          <w:rFonts w:ascii="Arial" w:hAnsi="Arial" w:cs="Arial"/>
-        </w:rPr>
-        <w:t xml:space="preserve">character strings </w:t>
-      </w:r>
-      <w:commentRangeEnd w:id="269"/>
+        <w:commentReference w:id="309"/>
+      </w:r>
+      <w:r>
+        <w:rPr>
+          <w:rFonts w:ascii="Arial" w:hAnsi="Arial" w:cs="Arial"/>
+        </w:rPr>
+        <w:t xml:space="preserve">henceforth the </w:t>
+      </w:r>
+      <w:r>
+        <w:rPr>
+          <w:rFonts w:ascii="Arial" w:hAnsi="Arial" w:cs="Arial"/>
+        </w:rPr>
+        <w:t>individual identity</w:t>
+      </w:r>
+      <w:r>
+        <w:rPr>
+          <w:rFonts w:ascii="Arial" w:hAnsi="Arial" w:cs="Arial"/>
+        </w:rPr>
+        <w:t xml:space="preserve"> dataset). In the </w:t>
+      </w:r>
+      <w:r>
+        <w:rPr>
+          <w:rFonts w:ascii="Arial" w:hAnsi="Arial" w:cs="Arial"/>
+        </w:rPr>
+        <w:t>group specific dataset</w:t>
+      </w:r>
+      <w:r>
+        <w:rPr>
+          <w:rFonts w:ascii="Arial" w:hAnsi="Arial" w:cs="Arial"/>
+        </w:rPr>
+        <w:t xml:space="preserve">, individual information was set to a character length of 4 characters, and group member information was set to </w:t>
+      </w:r>
+      <w:commentRangeStart w:id="310"/>
+      <w:r>
+        <w:rPr>
+          <w:rFonts w:ascii="Arial" w:hAnsi="Arial" w:cs="Arial"/>
+        </w:rPr>
+        <w:t>a character length of 8 character</w:t>
+      </w:r>
+      <w:commentRangeEnd w:id="310"/>
       <w:r>
         <w:rPr>
           <w:rStyle w:val="CommentReference"/>
         </w:rPr>
-        <w:commentReference w:id="269"/>
-      </w:r>
-      <w:r>
-        <w:rPr>
-          <w:rFonts w:ascii="Arial" w:hAnsi="Arial" w:cs="Arial"/>
-        </w:rPr>
-        <w:t>with more individual information than group membership information encoded (</w:t>
-      </w:r>
-      <w:r>
-        <w:rPr>
-          <w:rFonts w:ascii="Arial" w:hAnsi="Arial" w:cs="Arial"/>
-        </w:rPr>
-        <w:t>individual identity information dataset</w:t>
-      </w:r>
-      <w:r>
-        <w:rPr>
-          <w:rFonts w:ascii="Arial" w:hAnsi="Arial" w:cs="Arial"/>
-        </w:rPr>
-        <w:t xml:space="preserve">; </w:t>
-      </w:r>
-      <w:commentRangeStart w:id="270"/>
-      <w:commentRangeEnd w:id="270"/>
+        <w:commentReference w:id="310"/>
+      </w:r>
+      <w:r>
+        <w:rPr>
+          <w:rFonts w:ascii="Arial" w:hAnsi="Arial" w:cs="Arial"/>
+        </w:rPr>
+        <w:t xml:space="preserve">. In the </w:t>
+      </w:r>
+      <w:r>
+        <w:rPr>
+          <w:rFonts w:ascii="Arial" w:hAnsi="Arial" w:cs="Arial"/>
+        </w:rPr>
+        <w:t>individual identity dataset</w:t>
+      </w:r>
+      <w:r>
+        <w:rPr>
+          <w:rFonts w:ascii="Arial" w:hAnsi="Arial" w:cs="Arial"/>
+        </w:rPr>
+        <w:t xml:space="preserve">, individual information was set to a </w:t>
+      </w:r>
+      <w:commentRangeStart w:id="311"/>
+      <w:r>
+        <w:rPr>
+          <w:rFonts w:ascii="Arial" w:hAnsi="Arial" w:cs="Arial"/>
+        </w:rPr>
+        <w:t>character length of 8 characters</w:t>
+      </w:r>
+      <w:commentRangeEnd w:id="311"/>
       <w:r>
         <w:rPr>
           <w:rStyle w:val="CommentReference"/>
         </w:rPr>
-        <w:commentReference w:id="270"/>
-      </w:r>
-      <w:r>
-        <w:rPr>
-          <w:rFonts w:ascii="Arial" w:hAnsi="Arial" w:cs="Arial"/>
-        </w:rPr>
-        <w:t xml:space="preserve">henceforth the </w:t>
-      </w:r>
-      <w:r>
-        <w:rPr>
-          <w:rFonts w:ascii="Arial" w:hAnsi="Arial" w:cs="Arial"/>
-        </w:rPr>
-        <w:t>individual identity</w:t>
-      </w:r>
-      <w:r>
-        <w:rPr>
-          <w:rFonts w:ascii="Arial" w:hAnsi="Arial" w:cs="Arial"/>
-        </w:rPr>
-        <w:t xml:space="preserve"> dataset). In the </w:t>
-      </w:r>
-      <w:r>
-        <w:rPr>
-          <w:rFonts w:ascii="Arial" w:hAnsi="Arial" w:cs="Arial"/>
-        </w:rPr>
-        <w:t>group specific dataset</w:t>
-      </w:r>
-      <w:r>
-        <w:rPr>
-          <w:rFonts w:ascii="Arial" w:hAnsi="Arial" w:cs="Arial"/>
-        </w:rPr>
-        <w:t xml:space="preserve">, individual information was set to a character length of 4 characters, and group member information was set to </w:t>
-      </w:r>
-      <w:commentRangeStart w:id="271"/>
-      <w:r>
-        <w:rPr>
-          <w:rFonts w:ascii="Arial" w:hAnsi="Arial" w:cs="Arial"/>
-        </w:rPr>
-        <w:t>a character length of 8 character</w:t>
-      </w:r>
-      <w:commentRangeEnd w:id="271"/>
-      <w:r>
-        <w:rPr>
-          <w:rStyle w:val="CommentReference"/>
-        </w:rPr>
-        <w:commentReference w:id="271"/>
-      </w:r>
-      <w:r>
-        <w:rPr>
-          <w:rFonts w:ascii="Arial" w:hAnsi="Arial" w:cs="Arial"/>
-        </w:rPr>
-        <w:t xml:space="preserve">. In the </w:t>
-      </w:r>
-      <w:r>
-        <w:rPr>
-          <w:rFonts w:ascii="Arial" w:hAnsi="Arial" w:cs="Arial"/>
-        </w:rPr>
-        <w:t>individual identity dataset</w:t>
-      </w:r>
-      <w:r>
-        <w:rPr>
-          <w:rFonts w:ascii="Arial" w:hAnsi="Arial" w:cs="Arial"/>
-        </w:rPr>
-        <w:t xml:space="preserve">, individual information was set to a </w:t>
-      </w:r>
-      <w:commentRangeStart w:id="272"/>
-      <w:r>
-        <w:rPr>
-          <w:rFonts w:ascii="Arial" w:hAnsi="Arial" w:cs="Arial"/>
-        </w:rPr>
-        <w:t>character length of 8 characters</w:t>
-      </w:r>
-      <w:commentRangeEnd w:id="272"/>
-      <w:r>
-        <w:rPr>
-          <w:rStyle w:val="CommentReference"/>
-        </w:rPr>
-        <w:commentReference w:id="272"/>
+        <w:commentReference w:id="311"/>
       </w:r>
       <w:r>
         <w:rPr>
@@ -18236,21 +18256,7 @@
         <w:rPr>
           <w:rFonts w:ascii="Arial" w:hAnsi="Arial" w:cs="Arial"/>
         </w:rPr>
-        <w:t xml:space="preserve">After generating synthetic signals for these datasets, we used the </w:t>
-      </w:r>
-      <w:proofErr w:type="spellStart"/>
-      <w:r>
-        <w:rPr>
-          <w:rFonts w:ascii="Arial" w:hAnsi="Arial" w:cs="Arial"/>
-        </w:rPr>
-        <w:t>soundgen</w:t>
-      </w:r>
-      <w:proofErr w:type="spellEnd"/>
-      <w:r>
-        <w:rPr>
-          <w:rFonts w:ascii="Arial" w:hAnsi="Arial" w:cs="Arial"/>
-        </w:rPr>
-        <w:t xml:space="preserve"> package (TKTK citation) to convert the .wav files to spectrograms (see example of calls in Figures 2B and 3B). To validate that the group and individual information we specified in the character strings could be recovered from the generated frequency signals, we performed spectrographic cross-correlation on each dataset (SPCC; </w:t>
+        <w:t xml:space="preserve">After generating synthetic signals for these datasets, we used the soundgen package (TKTK citation) to convert the .wav files to spectrograms (see example of calls in Figures 2B and 3B). To validate that the group and individual information we specified in the character strings could be recovered from the generated frequency signals, we performed spectrographic cross-correlation on each dataset (SPCC; </w:t>
       </w:r>
       <w:r>
         <w:rPr>
@@ -18286,21 +18292,7 @@
         <w:rPr>
           <w:rFonts w:ascii="Arial" w:hAnsi="Arial" w:cs="Arial"/>
         </w:rPr>
-        <w:t xml:space="preserve">) using the </w:t>
-      </w:r>
-      <w:proofErr w:type="spellStart"/>
-      <w:r>
-        <w:rPr>
-          <w:rFonts w:ascii="Arial" w:hAnsi="Arial" w:cs="Arial"/>
-        </w:rPr>
-        <w:t>warbleR</w:t>
-      </w:r>
-      <w:proofErr w:type="spellEnd"/>
-      <w:r>
-        <w:rPr>
-          <w:rFonts w:ascii="Arial" w:hAnsi="Arial" w:cs="Arial"/>
-        </w:rPr>
-        <w:t xml:space="preserve"> package. We performed SPCC with a Hanning window, a window length of 512 samples, and a window overlap of 90 samples. We used a Pearson’s correlation method and a bandpass filter of 0 to 20 kHz. </w:t>
+        <w:t xml:space="preserve">) using the warbleR package. We performed SPCC with a Hanning window, a window length of 512 samples, and a window overlap of 90 samples. We used a Pearson’s correlation method and a bandpass filter of 0 to 20 kHz. </w:t>
       </w:r>
     </w:p>
     <w:p>
@@ -18315,26 +18307,26 @@
         <w:rPr>
           <w:rFonts w:ascii="Arial" w:hAnsi="Arial" w:cs="Arial"/>
         </w:rPr>
-        <w:t xml:space="preserve">To assess hierarchical mapping patterns of our two datasets, we used non-metric multidimensional scaling (MDS) to reduce the dimensionality of the SPCC matrix for each dataset. We performed MDS over 15 dimensions so that the stress of the model was TKTK (less than 5). From these results, we two generated low-dimensional </w:t>
+        <w:t xml:space="preserve">To assess hierarchical mapping patterns of our two datasets, we used non-metric multidimensional scaling (MDS) to reduce the dimensionality of the SPCC matrix for each dataset. We performed MDS over 15 dimensions so that the stress of the model was TKTK (less than 5). From these results, we two generated low-dimensional acoustic space plots for each dataset, one visualizing the acoustic space between groups and one visualizing the acoustic space between individuals. In doing this for each dataset, we can compare how well the </w:t>
+      </w:r>
+      <w:r>
+        <w:rPr>
+          <w:rFonts w:ascii="Arial" w:hAnsi="Arial" w:cs="Arial"/>
+        </w:rPr>
+        <w:t>group specific</w:t>
+      </w:r>
+      <w:r>
+        <w:rPr>
+          <w:rFonts w:ascii="Arial" w:hAnsi="Arial" w:cs="Arial"/>
+        </w:rPr>
+        <w:t xml:space="preserve"> dataset encodes information </w:t>
       </w:r>
       <w:r>
         <w:rPr>
           <w:rFonts w:ascii="Arial" w:hAnsi="Arial" w:cs="Arial"/>
         </w:rPr>
         <w:lastRenderedPageBreak/>
-        <w:t xml:space="preserve">acoustic space plots for each dataset, one visualizing the acoustic space between groups and one visualizing the acoustic space between individuals. In doing this for each dataset, we can compare how well the </w:t>
-      </w:r>
-      <w:r>
-        <w:rPr>
-          <w:rFonts w:ascii="Arial" w:hAnsi="Arial" w:cs="Arial"/>
-        </w:rPr>
-        <w:t>group specific</w:t>
-      </w:r>
-      <w:r>
-        <w:rPr>
-          <w:rFonts w:ascii="Arial" w:hAnsi="Arial" w:cs="Arial"/>
-        </w:rPr>
-        <w:t xml:space="preserve"> dataset encodes information at the group level compared to the individual level and vice versa for the </w:t>
+        <w:t xml:space="preserve">at the group level compared to the individual level and vice versa for the </w:t>
       </w:r>
       <w:r>
         <w:rPr>
@@ -18465,19 +18457,19 @@
         </w:rPr>
         <w:t xml:space="preserve">synthetic data sets across 16 treatments that varied over social environment characteristics and information encoding rules. </w:t>
       </w:r>
-      <w:commentRangeStart w:id="273"/>
+      <w:commentRangeStart w:id="312"/>
       <w:r>
         <w:rPr>
           <w:rFonts w:ascii="Arial" w:hAnsi="Arial" w:cs="Arial"/>
         </w:rPr>
         <w:t>We varied social environment characteristics represented information signaling changes that happen in socially sparse vs socially dense signaling environments</w:t>
       </w:r>
-      <w:commentRangeEnd w:id="273"/>
+      <w:commentRangeEnd w:id="312"/>
       <w:r>
         <w:rPr>
           <w:rStyle w:val="CommentReference"/>
         </w:rPr>
-        <w:commentReference w:id="273"/>
+        <w:commentReference w:id="312"/>
       </w:r>
       <w:r>
         <w:rPr>
@@ -18499,28 +18491,14 @@
           <w:rFonts w:ascii="Arial" w:hAnsi="Arial" w:cs="Arial"/>
         </w:rPr>
         <w:tab/>
-        <w:t xml:space="preserve">Once these synthetic datasets were created, we used traditional bioacoustics tools to decode information encoded at the group and individual level. </w:t>
-      </w:r>
-      <w:proofErr w:type="gramStart"/>
-      <w:r>
-        <w:rPr>
-          <w:rFonts w:ascii="Arial" w:hAnsi="Arial" w:cs="Arial"/>
-        </w:rPr>
-        <w:t>Similar to</w:t>
-      </w:r>
-      <w:proofErr w:type="gramEnd"/>
-      <w:r>
-        <w:rPr>
-          <w:rFonts w:ascii="Arial" w:hAnsi="Arial" w:cs="Arial"/>
-        </w:rPr>
-        <w:t xml:space="preserve"> the datasets above, we performed SPCC. We also calculated the edit distance for the </w:t>
+        <w:t xml:space="preserve">Once these synthetic datasets were created, we used traditional bioacoustics tools to decode information encoded at the group and individual level. Similar to the datasets above, we performed SPCC. We also calculated the edit distance for the original strings. After these calculations, we performed Multidimensional Scaling on both the SPCC and edit distance matrices, then performed k-means clustering, randomly selecting 1 call per individual per group, to ensure that call exemplars per class </w:t>
       </w:r>
       <w:r>
         <w:rPr>
           <w:rFonts w:ascii="Arial" w:hAnsi="Arial" w:cs="Arial"/>
         </w:rPr>
         <w:lastRenderedPageBreak/>
-        <w:t xml:space="preserve">original strings. After these calculations, we performed Multidimensional Scaling on both the SPCC and edit distance matrices, then performed k-means clustering, randomly selecting 1 call per individual per group, to ensure that call exemplars per class matched between social levels. From this, we were able to calculate the accuracy of detecting information at the group and individual levels from vocalizations represented as character strings (edit distance pipeline) or synthetic audio files (tradition </w:t>
+        <w:t xml:space="preserve">matched between social levels. From this, we were able to calculate the accuracy of detecting information at the group and individual levels from vocalizations represented as character strings (edit distance pipeline) or synthetic audio files (tradition </w:t>
       </w:r>
       <w:r>
         <w:rPr>
@@ -18552,7 +18530,7 @@
         <w:pStyle w:val="NoSpacing"/>
         <w:spacing w:line="480" w:lineRule="auto"/>
         <w:rPr>
-          <w:ins w:id="274" w:author="Smith Vidaurre, Grace" w:date="2025-05-28T19:06:00Z" w16du:dateUtc="2025-05-28T23:06:00Z"/>
+          <w:ins w:id="313" w:author="Smith Vidaurre, Grace" w:date="2025-05-28T19:06:00Z" w16du:dateUtc="2025-05-28T23:06:00Z"/>
           <w:rFonts w:ascii="Arial" w:hAnsi="Arial" w:cs="Arial"/>
         </w:rPr>
       </w:pPr>
@@ -18575,7 +18553,7 @@
         <w:pStyle w:val="NoSpacing"/>
         <w:spacing w:line="480" w:lineRule="auto"/>
         <w:rPr>
-          <w:ins w:id="275" w:author="Smith Vidaurre, Grace" w:date="2025-05-28T19:06:00Z" w16du:dateUtc="2025-05-28T23:06:00Z"/>
+          <w:ins w:id="314" w:author="Smith Vidaurre, Grace" w:date="2025-05-28T19:06:00Z" w16du:dateUtc="2025-05-28T23:06:00Z"/>
           <w:rFonts w:ascii="Arial" w:hAnsi="Arial" w:cs="Arial"/>
         </w:rPr>
       </w:pPr>
@@ -18585,54 +18563,46 @@
         <w:spacing w:line="480" w:lineRule="auto"/>
         <w:ind w:firstLine="720"/>
         <w:rPr>
-          <w:ins w:id="276" w:author="Smith Vidaurre, Grace" w:date="2025-05-28T19:06:00Z" w16du:dateUtc="2025-05-28T23:06:00Z"/>
-          <w:rFonts w:ascii="Arial" w:hAnsi="Arial" w:cs="Arial"/>
-        </w:rPr>
-      </w:pPr>
-      <w:proofErr w:type="gramStart"/>
-      <w:ins w:id="277" w:author="Smith Vidaurre, Grace" w:date="2025-05-28T19:06:00Z" w16du:dateUtc="2025-05-28T23:06:00Z">
-        <w:r>
-          <w:rPr>
-            <w:rFonts w:ascii="Arial" w:hAnsi="Arial" w:cs="Arial"/>
-          </w:rPr>
-          <w:t>TKTK</w:t>
-        </w:r>
-        <w:proofErr w:type="gramEnd"/>
-        <w:r>
-          <w:rPr>
-            <w:rFonts w:ascii="Arial" w:hAnsi="Arial" w:cs="Arial"/>
-          </w:rPr>
-          <w:t xml:space="preserve"> integrate </w:t>
-        </w:r>
-        <w:commentRangeStart w:id="278"/>
-        <w:commentRangeStart w:id="279"/>
-        <w:commentRangeStart w:id="280"/>
+          <w:ins w:id="315" w:author="Smith Vidaurre, Grace" w:date="2025-05-28T19:06:00Z" w16du:dateUtc="2025-05-28T23:06:00Z"/>
+          <w:rFonts w:ascii="Arial" w:hAnsi="Arial" w:cs="Arial"/>
+        </w:rPr>
+      </w:pPr>
+      <w:ins w:id="316" w:author="Smith Vidaurre, Grace" w:date="2025-05-28T19:06:00Z" w16du:dateUtc="2025-05-28T23:06:00Z">
+        <w:r>
+          <w:rPr>
+            <w:rFonts w:ascii="Arial" w:hAnsi="Arial" w:cs="Arial"/>
+          </w:rPr>
+          <w:t xml:space="preserve">TKTK integrate </w:t>
+        </w:r>
+        <w:commentRangeStart w:id="317"/>
+        <w:commentRangeStart w:id="318"/>
+        <w:commentRangeStart w:id="319"/>
         <w:r>
           <w:rPr>
             <w:rFonts w:ascii="Arial" w:hAnsi="Arial" w:cs="Arial"/>
           </w:rPr>
           <w:t>We expected to identify clustering accuracies that were generally lower for spectrographic cross-correlation than the edit distance, since spectrographic cross-correlation was performed on strings transformed into synthetic audio files, which may have led to losses of the original information or added noise</w:t>
         </w:r>
-        <w:commentRangeEnd w:id="278"/>
+        <w:commentRangeEnd w:id="317"/>
         <w:r>
           <w:rPr>
             <w:rStyle w:val="CommentReference"/>
           </w:rPr>
-          <w:commentReference w:id="278"/>
-        </w:r>
-        <w:commentRangeEnd w:id="279"/>
+          <w:commentReference w:id="317"/>
+        </w:r>
+        <w:commentRangeEnd w:id="318"/>
         <w:r>
           <w:rPr>
             <w:rStyle w:val="CommentReference"/>
           </w:rPr>
-          <w:commentReference w:id="279"/>
-        </w:r>
-        <w:commentRangeEnd w:id="280"/>
+          <w:commentReference w:id="318"/>
+        </w:r>
+        <w:commentRangeEnd w:id="319"/>
         <w:r>
           <w:rPr>
             <w:rStyle w:val="CommentReference"/>
           </w:rPr>
-          <w:commentReference w:id="280"/>
+          <w:commentReference w:id="319"/>
         </w:r>
         <w:r>
           <w:rPr>
@@ -18711,6 +18681,7 @@
           <w:b/>
           <w:bCs/>
         </w:rPr>
+        <w:lastRenderedPageBreak/>
         <w:br w:type="page"/>
       </w:r>
     </w:p>
@@ -19714,7 +19685,7 @@
           <w:szCs w:val="20"/>
         </w:rPr>
       </w:pPr>
-      <w:del w:id="281" w:author="Smith Vidaurre, Grace" w:date="2025-05-27T21:15:00Z" w16du:dateUtc="2025-05-28T01:15:00Z">
+      <w:del w:id="320" w:author="Smith Vidaurre, Grace" w:date="2025-05-27T21:15:00Z" w16du:dateUtc="2025-05-28T01:15:00Z">
         <w:r>
           <w:rPr>
             <w:noProof/>
@@ -19792,13 +19763,13 @@
           <w:rFonts w:ascii="Arial" w:hAnsi="Arial" w:cs="Arial"/>
         </w:rPr>
       </w:pPr>
-      <w:commentRangeStart w:id="282"/>
-      <w:commentRangeEnd w:id="282"/>
+      <w:commentRangeStart w:id="321"/>
+      <w:commentRangeEnd w:id="321"/>
       <w:r>
         <w:rPr>
           <w:rStyle w:val="CommentReference"/>
         </w:rPr>
-        <w:commentReference w:id="282"/>
+        <w:commentReference w:id="321"/>
       </w:r>
       <w:r>
         <w:rPr>
@@ -19884,21 +19855,7 @@
         <w:rPr>
           <w:rFonts w:ascii="Arial" w:hAnsi="Arial" w:cs="Arial"/>
         </w:rPr>
-        <w:t xml:space="preserve">more individual information encoded in the calls with polygons drawn by individual identity. Colors represent group </w:t>
-      </w:r>
-      <w:proofErr w:type="gramStart"/>
-      <w:r>
-        <w:rPr>
-          <w:rFonts w:ascii="Arial" w:hAnsi="Arial" w:cs="Arial"/>
-        </w:rPr>
-        <w:t>identity,</w:t>
-      </w:r>
-      <w:proofErr w:type="gramEnd"/>
-      <w:r>
-        <w:rPr>
-          <w:rFonts w:ascii="Arial" w:hAnsi="Arial" w:cs="Arial"/>
-        </w:rPr>
-        <w:t xml:space="preserve"> shapes represent different individuals.</w:t>
+        <w:t>more individual information encoded in the calls with polygons drawn by individual identity. Colors represent group identity, shapes represent different individuals.</w:t>
       </w:r>
     </w:p>
     <w:p>
@@ -19930,7 +19887,7 @@
           <w:rFonts w:ascii="Arial" w:hAnsi="Arial" w:cs="Arial"/>
         </w:rPr>
       </w:pPr>
-      <w:del w:id="283" w:author="Smith Vidaurre, Grace" w:date="2025-05-27T21:15:00Z" w16du:dateUtc="2025-05-28T01:15:00Z">
+      <w:del w:id="322" w:author="Smith Vidaurre, Grace" w:date="2025-05-27T21:15:00Z" w16du:dateUtc="2025-05-28T01:15:00Z">
         <w:r>
           <w:rPr>
             <w:rFonts w:ascii="Arial" w:hAnsi="Arial" w:cs="Arial"/>
@@ -20021,7 +19978,7 @@
           <w:rFonts w:ascii="Arial" w:hAnsi="Arial" w:cs="Arial"/>
         </w:rPr>
       </w:pPr>
-      <w:del w:id="284" w:author="Smith Vidaurre, Grace" w:date="2025-05-27T21:15:00Z" w16du:dateUtc="2025-05-28T01:15:00Z">
+      <w:del w:id="323" w:author="Smith Vidaurre, Grace" w:date="2025-05-27T21:15:00Z" w16du:dateUtc="2025-05-28T01:15:00Z">
         <w:r>
           <w:rPr>
             <w:rFonts w:ascii="Arial" w:hAnsi="Arial" w:cs="Arial"/>
@@ -20092,19 +20049,11 @@
         </w:rPr>
         <w:t>Supplemental figure 3</w:t>
       </w:r>
-      <w:proofErr w:type="gramStart"/>
-      <w:r>
-        <w:rPr>
-          <w:rFonts w:ascii="Arial" w:hAnsi="Arial" w:cs="Arial"/>
-        </w:rPr>
-        <w:t>: :</w:t>
-      </w:r>
-      <w:proofErr w:type="gramEnd"/>
-      <w:r>
-        <w:rPr>
-          <w:rFonts w:ascii="Arial" w:hAnsi="Arial" w:cs="Arial"/>
-        </w:rPr>
-        <w:t xml:space="preserve"> orange = group, blue = individual</w:t>
+      <w:r>
+        <w:rPr>
+          <w:rFonts w:ascii="Arial" w:hAnsi="Arial" w:cs="Arial"/>
+        </w:rPr>
+        <w:t>: : orange = group, blue = individual</w:t>
       </w:r>
     </w:p>
     <w:p>
@@ -20186,32 +20135,32 @@
         </w:rPr>
         <w:t xml:space="preserve">). </w:t>
       </w:r>
-      <w:commentRangeStart w:id="285"/>
+      <w:commentRangeStart w:id="324"/>
       <w:r>
         <w:rPr>
           <w:rFonts w:ascii="Arial" w:hAnsi="Arial" w:cs="Arial"/>
         </w:rPr>
         <w:t>This suggests that individuals are being categorized in distinct individual clusters when running traditional bioacoustics analyses on our synthetically generated calls.</w:t>
       </w:r>
-      <w:commentRangeEnd w:id="285"/>
+      <w:commentRangeEnd w:id="324"/>
       <w:r>
         <w:rPr>
           <w:rStyle w:val="CommentReference"/>
         </w:rPr>
-        <w:commentReference w:id="285"/>
-      </w:r>
-    </w:p>
-    <w:p>
-      <w:pPr>
-        <w:rPr>
-          <w:rFonts w:ascii="Arial" w:hAnsi="Arial" w:cs="Arial"/>
-        </w:rPr>
-      </w:pPr>
-    </w:p>
-    <w:p>
-      <w:pPr>
-        <w:rPr>
-          <w:ins w:id="286" w:author="Smith Vidaurre, Grace" w:date="2025-05-22T14:24:00Z" w16du:dateUtc="2025-05-22T18:24:00Z"/>
+        <w:commentReference w:id="324"/>
+      </w:r>
+    </w:p>
+    <w:p>
+      <w:pPr>
+        <w:rPr>
+          <w:rFonts w:ascii="Arial" w:hAnsi="Arial" w:cs="Arial"/>
+        </w:rPr>
+      </w:pPr>
+    </w:p>
+    <w:p>
+      <w:pPr>
+        <w:rPr>
+          <w:ins w:id="325" w:author="Smith Vidaurre, Grace" w:date="2025-05-22T14:24:00Z" w16du:dateUtc="2025-05-22T18:24:00Z"/>
           <w:rFonts w:ascii="Arial" w:hAnsi="Arial" w:cs="Arial"/>
           <w:b/>
           <w:bCs/>
@@ -20229,7 +20178,7 @@
     <w:p>
       <w:pPr>
         <w:rPr>
-          <w:ins w:id="287" w:author="Smith Vidaurre, Grace" w:date="2025-05-22T14:24:00Z" w16du:dateUtc="2025-05-22T18:24:00Z"/>
+          <w:ins w:id="326" w:author="Smith Vidaurre, Grace" w:date="2025-05-22T14:24:00Z" w16du:dateUtc="2025-05-22T18:24:00Z"/>
           <w:rFonts w:ascii="Arial" w:hAnsi="Arial" w:cs="Arial"/>
           <w:b/>
           <w:bCs/>
@@ -20241,7 +20190,7 @@
         <w:spacing w:line="480" w:lineRule="auto"/>
         <w:ind w:firstLine="720"/>
         <w:rPr>
-          <w:ins w:id="288" w:author="Smith Vidaurre, Grace" w:date="2025-05-22T14:25:00Z" w16du:dateUtc="2025-05-22T18:25:00Z"/>
+          <w:ins w:id="327" w:author="Smith Vidaurre, Grace" w:date="2025-05-22T14:25:00Z" w16du:dateUtc="2025-05-22T18:25:00Z"/>
           <w:rFonts w:ascii="Arial" w:hAnsi="Arial" w:cs="Arial"/>
         </w:rPr>
       </w:pPr>
@@ -20287,19 +20236,19 @@
         </w:rPr>
         <w:t xml:space="preserve">, therefore, to study to evolution of vocal learning, we must understand how vocal learners encode and perceive information in learned vocal signals. Studies of the diversity of information encoding across vocal learning taxa could lead to new insights into how vocal learning originated and continues to </w:t>
       </w:r>
-      <w:commentRangeStart w:id="289"/>
+      <w:commentRangeStart w:id="328"/>
       <w:r>
         <w:rPr>
           <w:rFonts w:ascii="Arial" w:hAnsi="Arial" w:cs="Arial"/>
         </w:rPr>
         <w:t>evolve</w:t>
       </w:r>
-      <w:commentRangeEnd w:id="289"/>
+      <w:commentRangeEnd w:id="328"/>
       <w:r>
         <w:rPr>
           <w:rStyle w:val="CommentReference"/>
         </w:rPr>
-        <w:commentReference w:id="289"/>
+        <w:commentReference w:id="328"/>
       </w:r>
       <w:r>
         <w:rPr>
@@ -20313,7 +20262,7 @@
         <w:spacing w:line="480" w:lineRule="auto"/>
         <w:ind w:firstLine="720"/>
         <w:rPr>
-          <w:ins w:id="290" w:author="Smith Vidaurre, Grace" w:date="2025-05-22T14:25:00Z" w16du:dateUtc="2025-05-22T18:25:00Z"/>
+          <w:ins w:id="329" w:author="Smith Vidaurre, Grace" w:date="2025-05-22T14:25:00Z" w16du:dateUtc="2025-05-22T18:25:00Z"/>
           <w:rFonts w:ascii="Arial" w:hAnsi="Arial" w:cs="Arial"/>
         </w:rPr>
       </w:pPr>
@@ -20323,12 +20272,12 @@
         <w:spacing w:line="480" w:lineRule="auto"/>
         <w:ind w:firstLine="720"/>
         <w:rPr>
-          <w:ins w:id="291" w:author="Smith Vidaurre, Grace" w:date="2025-05-22T14:34:00Z" w16du:dateUtc="2025-05-22T18:34:00Z"/>
-          <w:rFonts w:ascii="Arial" w:hAnsi="Arial" w:cs="Arial"/>
-        </w:rPr>
-      </w:pPr>
-      <w:commentRangeStart w:id="292"/>
-      <w:ins w:id="293" w:author="Smith Vidaurre, Grace" w:date="2025-05-22T14:25:00Z" w16du:dateUtc="2025-05-22T18:25:00Z">
+          <w:ins w:id="330" w:author="Smith Vidaurre, Grace" w:date="2025-05-22T14:34:00Z" w16du:dateUtc="2025-05-22T18:34:00Z"/>
+          <w:rFonts w:ascii="Arial" w:hAnsi="Arial" w:cs="Arial"/>
+        </w:rPr>
+      </w:pPr>
+      <w:commentRangeStart w:id="331"/>
+      <w:ins w:id="332" w:author="Smith Vidaurre, Grace" w:date="2025-05-22T14:25:00Z" w16du:dateUtc="2025-05-22T18:25:00Z">
         <w:r>
           <w:rPr>
             <w:rFonts w:ascii="Arial" w:hAnsi="Arial" w:cs="Arial"/>
@@ -20492,23 +20441,7 @@
             <w:rFonts w:ascii="Arial" w:hAnsi="Arial" w:cs="Arial"/>
             <w:highlight w:val="yellow"/>
           </w:rPr>
-          <w:t>MacDougall-</w:t>
-        </w:r>
-        <w:proofErr w:type="spellStart"/>
-        <w:r>
-          <w:rPr>
-            <w:rFonts w:ascii="Arial" w:hAnsi="Arial" w:cs="Arial"/>
-            <w:highlight w:val="yellow"/>
-          </w:rPr>
-          <w:t>Shackletons</w:t>
-        </w:r>
-        <w:proofErr w:type="spellEnd"/>
-        <w:r>
-          <w:rPr>
-            <w:rFonts w:ascii="Arial" w:hAnsi="Arial" w:cs="Arial"/>
-            <w:highlight w:val="yellow"/>
-          </w:rPr>
-          <w:t>?</w:t>
+          <w:t>MacDougall-Shackletons?</w:t>
         </w:r>
         <w:r>
           <w:rPr>
@@ -20731,12 +20664,12 @@
           </w:rPr>
           <w:t xml:space="preserve">. </w:t>
         </w:r>
-        <w:commentRangeEnd w:id="292"/>
+        <w:commentRangeEnd w:id="331"/>
         <w:r>
           <w:rPr>
             <w:rStyle w:val="CommentReference"/>
           </w:rPr>
-          <w:commentReference w:id="292"/>
+          <w:commentReference w:id="331"/>
         </w:r>
       </w:ins>
     </w:p>
@@ -20745,7 +20678,7 @@
         <w:spacing w:line="480" w:lineRule="auto"/>
         <w:ind w:firstLine="720"/>
         <w:rPr>
-          <w:ins w:id="294" w:author="Smith Vidaurre, Grace" w:date="2025-05-22T14:34:00Z" w16du:dateUtc="2025-05-22T18:34:00Z"/>
+          <w:ins w:id="333" w:author="Smith Vidaurre, Grace" w:date="2025-05-22T14:34:00Z" w16du:dateUtc="2025-05-22T18:34:00Z"/>
           <w:rFonts w:ascii="Arial" w:hAnsi="Arial" w:cs="Arial"/>
         </w:rPr>
       </w:pPr>
@@ -20755,11 +20688,11 @@
         <w:spacing w:line="480" w:lineRule="auto"/>
         <w:ind w:firstLine="720"/>
         <w:rPr>
-          <w:ins w:id="295" w:author="Smith Vidaurre, Grace" w:date="2025-05-22T14:34:00Z" w16du:dateUtc="2025-05-22T18:34:00Z"/>
-          <w:rFonts w:ascii="Arial" w:hAnsi="Arial" w:cs="Arial"/>
-        </w:rPr>
-      </w:pPr>
-      <w:ins w:id="296" w:author="Smith Vidaurre, Grace" w:date="2025-05-22T14:34:00Z" w16du:dateUtc="2025-05-22T18:34:00Z">
+          <w:ins w:id="334" w:author="Smith Vidaurre, Grace" w:date="2025-05-22T14:34:00Z" w16du:dateUtc="2025-05-22T18:34:00Z"/>
+          <w:rFonts w:ascii="Arial" w:hAnsi="Arial" w:cs="Arial"/>
+        </w:rPr>
+      </w:pPr>
+      <w:ins w:id="335" w:author="Smith Vidaurre, Grace" w:date="2025-05-22T14:34:00Z" w16du:dateUtc="2025-05-22T18:34:00Z">
         <w:r>
           <w:rPr>
             <w:rFonts w:ascii="Arial" w:hAnsi="Arial" w:cs="Arial"/>
@@ -20802,19 +20735,19 @@
           </w:rPr>
           <w:t>(</w:t>
         </w:r>
-        <w:commentRangeStart w:id="297"/>
+        <w:commentRangeStart w:id="336"/>
         <w:r>
           <w:rPr>
             <w:rFonts w:ascii="Arial" w:hAnsi="Arial" w:cs="Arial"/>
           </w:rPr>
           <w:t>CITE</w:t>
         </w:r>
-        <w:commentRangeEnd w:id="297"/>
+        <w:commentRangeEnd w:id="336"/>
         <w:r>
           <w:rPr>
             <w:rStyle w:val="CommentReference"/>
           </w:rPr>
-          <w:commentReference w:id="297"/>
+          <w:commentReference w:id="336"/>
         </w:r>
         <w:r>
           <w:rPr>
@@ -20866,7 +20799,7 @@
         <w:spacing w:line="480" w:lineRule="auto"/>
         <w:ind w:firstLine="720"/>
         <w:rPr>
-          <w:ins w:id="298" w:author="Smith Vidaurre, Grace" w:date="2025-05-22T14:35:00Z" w16du:dateUtc="2025-05-22T18:35:00Z"/>
+          <w:ins w:id="337" w:author="Smith Vidaurre, Grace" w:date="2025-05-22T14:35:00Z" w16du:dateUtc="2025-05-22T18:35:00Z"/>
           <w:rFonts w:ascii="Arial" w:hAnsi="Arial" w:cs="Arial"/>
         </w:rPr>
       </w:pPr>
@@ -20879,7 +20812,7 @@
           <w:rFonts w:ascii="Arial" w:hAnsi="Arial" w:cs="Arial"/>
         </w:rPr>
       </w:pPr>
-      <w:ins w:id="299" w:author="Smith Vidaurre, Grace" w:date="2025-05-22T14:35:00Z" w16du:dateUtc="2025-05-22T18:35:00Z">
+      <w:ins w:id="338" w:author="Smith Vidaurre, Grace" w:date="2025-05-22T14:35:00Z" w16du:dateUtc="2025-05-22T18:35:00Z">
         <w:r>
           <w:rPr>
             <w:rFonts w:ascii="Arial" w:hAnsi="Arial" w:cs="Arial"/>
@@ -20950,48 +20883,26 @@
           <w:bCs/>
         </w:rPr>
       </w:pPr>
-      <w:commentRangeStart w:id="300"/>
-      <w:r>
-        <w:rPr>
-          <w:rFonts w:ascii="Arial" w:hAnsi="Arial" w:cs="Arial"/>
-        </w:rPr>
-        <w:t xml:space="preserve">Second, </w:t>
-      </w:r>
-      <w:proofErr w:type="spellStart"/>
-      <w:r>
-        <w:rPr>
-          <w:rFonts w:ascii="Arial" w:hAnsi="Arial" w:cs="Arial"/>
-        </w:rPr>
-        <w:t>out</w:t>
-      </w:r>
-      <w:proofErr w:type="spellEnd"/>
-      <w:r>
-        <w:rPr>
-          <w:rFonts w:ascii="Arial" w:hAnsi="Arial" w:cs="Arial"/>
-        </w:rPr>
-        <w:t xml:space="preserve"> ability to detect the dynamics of information encoding during real time social interactions is limited by our ability to capture the totality of an individual’s or groups signal produced during these interactions. We may be over sampling from vocal learning species whose social interaction and signal production are easy to observe and </w:t>
-      </w:r>
-      <w:proofErr w:type="gramStart"/>
+      <w:commentRangeStart w:id="339"/>
+      <w:r>
+        <w:rPr>
+          <w:rFonts w:ascii="Arial" w:hAnsi="Arial" w:cs="Arial"/>
+        </w:rPr>
+        <w:t xml:space="preserve">Second, out ability to detect the dynamics of information encoding during real time social interactions is limited by our ability to capture the totality of an individual’s or groups signal produced during these interactions. We may be over sampling from vocal learning species whose social interaction and signal production are easy to observe and </w:t>
+      </w:r>
       <w:r>
         <w:rPr>
           <w:rFonts w:ascii="Arial" w:hAnsi="Arial" w:cs="Arial"/>
         </w:rPr>
         <w:lastRenderedPageBreak/>
-        <w:t>measure, and</w:t>
-      </w:r>
-      <w:proofErr w:type="gramEnd"/>
-      <w:r>
-        <w:rPr>
-          <w:rFonts w:ascii="Arial" w:hAnsi="Arial" w:cs="Arial"/>
-        </w:rPr>
-        <w:t xml:space="preserve"> therefore may not be assessing the full scope of how information can be encoded across a range of species.</w:t>
-      </w:r>
-      <w:commentRangeEnd w:id="300"/>
+        <w:t>measure, and therefore may not be assessing the full scope of how information can be encoded across a range of species.</w:t>
+      </w:r>
+      <w:commentRangeEnd w:id="339"/>
       <w:r>
         <w:rPr>
           <w:rStyle w:val="CommentReference"/>
         </w:rPr>
-        <w:commentReference w:id="300"/>
+        <w:commentReference w:id="339"/>
       </w:r>
     </w:p>
     <w:p>
@@ -21016,35 +20927,35 @@
         </w:rPr>
         <w:t xml:space="preserve">Several computationally intensive tools have emerged to assess the degree or types of information encoded in </w:t>
       </w:r>
-      <w:commentRangeStart w:id="301"/>
-      <w:commentRangeStart w:id="302"/>
-      <w:commentRangeStart w:id="303"/>
+      <w:commentRangeStart w:id="340"/>
+      <w:commentRangeStart w:id="341"/>
+      <w:commentRangeStart w:id="342"/>
       <w:r>
         <w:rPr>
           <w:rFonts w:ascii="Arial" w:hAnsi="Arial" w:cs="Arial"/>
         </w:rPr>
         <w:t>signals</w:t>
       </w:r>
-      <w:commentRangeEnd w:id="301"/>
+      <w:commentRangeEnd w:id="340"/>
       <w:r>
         <w:rPr>
           <w:rStyle w:val="CommentReference"/>
         </w:rPr>
-        <w:commentReference w:id="301"/>
-      </w:r>
-      <w:commentRangeEnd w:id="302"/>
+        <w:commentReference w:id="340"/>
+      </w:r>
+      <w:commentRangeEnd w:id="341"/>
       <w:r>
         <w:rPr>
           <w:rStyle w:val="CommentReference"/>
         </w:rPr>
-        <w:commentReference w:id="302"/>
-      </w:r>
-      <w:commentRangeEnd w:id="303"/>
+        <w:commentReference w:id="341"/>
+      </w:r>
+      <w:commentRangeEnd w:id="342"/>
       <w:r>
         <w:rPr>
           <w:rStyle w:val="CommentReference"/>
         </w:rPr>
-        <w:commentReference w:id="303"/>
+        <w:commentReference w:id="342"/>
       </w:r>
       <w:r>
         <w:rPr>
@@ -21379,19 +21290,11 @@
           <w:rFonts w:ascii="Arial" w:hAnsi="Arial" w:cs="Arial"/>
         </w:rPr>
       </w:pPr>
-      <w:proofErr w:type="spellStart"/>
-      <w:r>
-        <w:rPr>
-          <w:rFonts w:ascii="Arial" w:hAnsi="Arial" w:cs="Arial"/>
-        </w:rPr>
-        <w:t>paRsynth</w:t>
-      </w:r>
-      <w:proofErr w:type="spellEnd"/>
-      <w:r>
-        <w:rPr>
-          <w:rFonts w:ascii="Arial" w:hAnsi="Arial" w:cs="Arial"/>
-        </w:rPr>
-        <w:t xml:space="preserve"> Part 2: validating types of analysis </w:t>
+      <w:r>
+        <w:rPr>
+          <w:rFonts w:ascii="Arial" w:hAnsi="Arial" w:cs="Arial"/>
+        </w:rPr>
+        <w:t xml:space="preserve">paRsynth Part 2: validating types of analysis </w:t>
       </w:r>
     </w:p>
     <w:p>
@@ -21502,21 +21405,7 @@
         <w:rPr>
           <w:rFonts w:ascii="Arial" w:hAnsi="Arial" w:cs="Arial"/>
         </w:rPr>
-        <w:t xml:space="preserve">These models allow us to address the statistical significance of the degree or magnitude of convergence (which we originally encoded using </w:t>
-      </w:r>
-      <w:proofErr w:type="spellStart"/>
-      <w:r>
-        <w:rPr>
-          <w:rFonts w:ascii="Arial" w:hAnsi="Arial" w:cs="Arial"/>
-        </w:rPr>
-        <w:t>paRsynth</w:t>
-      </w:r>
-      <w:proofErr w:type="spellEnd"/>
-      <w:r>
-        <w:rPr>
-          <w:rFonts w:ascii="Arial" w:hAnsi="Arial" w:cs="Arial"/>
-        </w:rPr>
-        <w:t>). The inferential statistics layer to validate that the information we originally encoded can be recovered</w:t>
+        <w:t>These models allow us to address the statistical significance of the degree or magnitude of convergence (which we originally encoded using paRsynth). The inferential statistics layer to validate that the information we originally encoded can be recovered</w:t>
       </w:r>
     </w:p>
     <w:p>
@@ -21537,21 +21426,7 @@
         <w:rPr>
           <w:rFonts w:ascii="Arial" w:hAnsi="Arial" w:cs="Arial"/>
         </w:rPr>
-        <w:t xml:space="preserve">A receiver standpoint on information recovery, in which we simulated signaler information encoding. Does the variation that we encoded </w:t>
-      </w:r>
-      <w:proofErr w:type="gramStart"/>
-      <w:r>
-        <w:rPr>
-          <w:rFonts w:ascii="Arial" w:hAnsi="Arial" w:cs="Arial"/>
-        </w:rPr>
-        <w:t>actually matter</w:t>
-      </w:r>
-      <w:proofErr w:type="gramEnd"/>
-      <w:r>
-        <w:rPr>
-          <w:rFonts w:ascii="Arial" w:hAnsi="Arial" w:cs="Arial"/>
-        </w:rPr>
-        <w:t>???</w:t>
+        <w:t>A receiver standpoint on information recovery, in which we simulated signaler information encoding. Does the variation that we encoded actually matter???</w:t>
       </w:r>
     </w:p>
     <w:p>
@@ -21572,21 +21447,7 @@
         <w:rPr>
           <w:rFonts w:ascii="Arial" w:hAnsi="Arial" w:cs="Arial"/>
         </w:rPr>
-        <w:t xml:space="preserve">Because we have repeated sampling at both social levels with known individuals, we can </w:t>
-      </w:r>
-      <w:proofErr w:type="gramStart"/>
-      <w:r>
-        <w:rPr>
-          <w:rFonts w:ascii="Arial" w:hAnsi="Arial" w:cs="Arial"/>
-        </w:rPr>
-        <w:t>actually model</w:t>
-      </w:r>
-      <w:proofErr w:type="gramEnd"/>
-      <w:r>
-        <w:rPr>
-          <w:rFonts w:ascii="Arial" w:hAnsi="Arial" w:cs="Arial"/>
-        </w:rPr>
-        <w:t xml:space="preserve"> variation in convergence within and between categories (individuals, groups) at each social level</w:t>
+        <w:t>Because we have repeated sampling at both social levels with known individuals, we can actually model variation in convergence within and between categories (individuals, groups) at each social level</w:t>
       </w:r>
     </w:p>
     <w:p>
@@ -22370,7 +22231,7 @@
       </w:r>
     </w:p>
   </w:comment>
-  <w:comment w:id="261" w:author="Coppinger, Brittany" w:date="2025-02-13T14:09:00Z" w:initials="BC">
+  <w:comment w:id="300" w:author="Coppinger, Brittany" w:date="2025-02-13T14:09:00Z" w:initials="BC">
     <w:p>
       <w:pPr>
         <w:pStyle w:val="CommentText"/>
@@ -22386,7 +22247,7 @@
       </w:r>
     </w:p>
   </w:comment>
-  <w:comment w:id="260" w:author="Coppinger, Brittany" w:date="2025-04-04T12:58:00Z" w:initials="BC">
+  <w:comment w:id="299" w:author="Coppinger, Brittany" w:date="2025-04-04T12:58:00Z" w:initials="BC">
     <w:p>
       <w:pPr>
         <w:pStyle w:val="CommentText"/>
@@ -22402,7 +22263,7 @@
       </w:r>
     </w:p>
   </w:comment>
-  <w:comment w:id="262" w:author="Summer Eckhardt" w:date="2025-01-24T09:51:00Z" w:initials="SE">
+  <w:comment w:id="301" w:author="Summer Eckhardt" w:date="2025-01-24T09:51:00Z" w:initials="SE">
     <w:p>
       <w:pPr>
         <w:pStyle w:val="CommentText"/>
@@ -22418,7 +22279,7 @@
       </w:r>
     </w:p>
   </w:comment>
-  <w:comment w:id="263" w:author="Summer Eckhardt" w:date="2025-01-27T10:41:00Z" w:initials="SE">
+  <w:comment w:id="302" w:author="Summer Eckhardt" w:date="2025-01-27T10:41:00Z" w:initials="SE">
     <w:p>
       <w:pPr>
         <w:pStyle w:val="CommentText"/>
@@ -22434,7 +22295,7 @@
       </w:r>
     </w:p>
   </w:comment>
-  <w:comment w:id="264" w:author="Summer Eckhardt" w:date="2025-01-24T10:02:00Z" w:initials="SE">
+  <w:comment w:id="303" w:author="Summer Eckhardt" w:date="2025-01-24T10:02:00Z" w:initials="SE">
     <w:p>
       <w:pPr>
         <w:pStyle w:val="CommentText"/>
@@ -22450,7 +22311,7 @@
       </w:r>
     </w:p>
   </w:comment>
-  <w:comment w:id="265" w:author="Samman, Raneem" w:date="2025-01-13T15:07:00Z" w:initials="RS">
+  <w:comment w:id="304" w:author="Samman, Raneem" w:date="2025-01-13T15:07:00Z" w:initials="RS">
     <w:p>
       <w:r>
         <w:rPr>
@@ -22468,7 +22329,7 @@
       </w:r>
     </w:p>
   </w:comment>
-  <w:comment w:id="266" w:author="Coppinger, Brittany" w:date="2025-01-15T13:17:00Z" w:initials="BC">
+  <w:comment w:id="305" w:author="Coppinger, Brittany" w:date="2025-01-15T13:17:00Z" w:initials="BC">
     <w:p>
       <w:pPr>
         <w:pStyle w:val="CommentText"/>
@@ -22495,7 +22356,7 @@
       </w:r>
     </w:p>
   </w:comment>
-  <w:comment w:id="267" w:author="Coppinger, Brittany" w:date="2025-01-07T15:07:00Z" w:initials="BC">
+  <w:comment w:id="306" w:author="Coppinger, Brittany" w:date="2025-01-07T15:07:00Z" w:initials="BC">
     <w:p>
       <w:pPr>
         <w:pStyle w:val="CommentText"/>
@@ -22511,7 +22372,7 @@
       </w:r>
     </w:p>
   </w:comment>
-  <w:comment w:id="268" w:author="Samman, Raneem" w:date="2025-01-13T15:08:00Z" w:initials="RS">
+  <w:comment w:id="307" w:author="Samman, Raneem" w:date="2025-01-13T15:08:00Z" w:initials="RS">
     <w:p>
       <w:r>
         <w:rPr>
@@ -22529,7 +22390,7 @@
       </w:r>
     </w:p>
   </w:comment>
-  <w:comment w:id="269" w:author="Samman, Raneem" w:date="2025-01-13T15:10:00Z" w:initials="RS">
+  <w:comment w:id="308" w:author="Samman, Raneem" w:date="2025-01-13T15:10:00Z" w:initials="RS">
     <w:p>
       <w:r>
         <w:rPr>
@@ -22547,7 +22408,7 @@
       </w:r>
     </w:p>
   </w:comment>
-  <w:comment w:id="270" w:author="Coppinger, Brittany" w:date="2025-01-07T15:01:00Z" w:initials="BC">
+  <w:comment w:id="309" w:author="Coppinger, Brittany" w:date="2025-01-07T15:01:00Z" w:initials="BC">
     <w:p>
       <w:pPr>
         <w:pStyle w:val="CommentText"/>
@@ -22563,7 +22424,7 @@
       </w:r>
     </w:p>
   </w:comment>
-  <w:comment w:id="271" w:author="Coppinger, Brittany" w:date="2025-01-07T15:08:00Z" w:initials="BC">
+  <w:comment w:id="310" w:author="Coppinger, Brittany" w:date="2025-01-07T15:08:00Z" w:initials="BC">
     <w:p>
       <w:pPr>
         <w:pStyle w:val="CommentText"/>
@@ -22579,7 +22440,7 @@
       </w:r>
     </w:p>
   </w:comment>
-  <w:comment w:id="272" w:author="Coppinger, Brittany" w:date="2025-01-07T15:12:00Z" w:initials="BC">
+  <w:comment w:id="311" w:author="Coppinger, Brittany" w:date="2025-01-07T15:12:00Z" w:initials="BC">
     <w:p>
       <w:pPr>
         <w:pStyle w:val="CommentText"/>
@@ -22595,7 +22456,7 @@
       </w:r>
     </w:p>
   </w:comment>
-  <w:comment w:id="273" w:author="Coppinger, Brittany" w:date="2025-04-03T14:53:00Z" w:initials="BC">
+  <w:comment w:id="312" w:author="Coppinger, Brittany" w:date="2025-04-03T14:53:00Z" w:initials="BC">
     <w:p>
       <w:pPr>
         <w:pStyle w:val="CommentText"/>
@@ -22611,7 +22472,7 @@
       </w:r>
     </w:p>
   </w:comment>
-  <w:comment w:id="278" w:author="Coppinger, Brittany" w:date="2025-04-10T14:31:00Z" w:initials="BC">
+  <w:comment w:id="317" w:author="Coppinger, Brittany" w:date="2025-04-10T14:31:00Z" w:initials="BC">
     <w:p>
       <w:pPr>
         <w:pStyle w:val="CommentText"/>
@@ -22627,7 +22488,7 @@
       </w:r>
     </w:p>
   </w:comment>
-  <w:comment w:id="279" w:author="Smith Vidaurre, Grace" w:date="2025-05-28T18:58:00Z" w:initials="GSV">
+  <w:comment w:id="318" w:author="Smith Vidaurre, Grace" w:date="2025-05-28T18:58:00Z" w:initials="GSV">
     <w:p>
       <w:r>
         <w:rPr>
@@ -22644,7 +22505,7 @@
       </w:r>
     </w:p>
   </w:comment>
-  <w:comment w:id="280" w:author="Smith Vidaurre, Grace" w:date="2025-05-28T19:00:00Z" w:initials="GSV">
+  <w:comment w:id="319" w:author="Smith Vidaurre, Grace" w:date="2025-05-28T19:00:00Z" w:initials="GSV">
     <w:p>
       <w:r>
         <w:rPr>
@@ -22661,7 +22522,7 @@
       </w:r>
     </w:p>
   </w:comment>
-  <w:comment w:id="282" w:author="Summer Eckhardt" w:date="2025-02-04T18:49:00Z" w:initials="SE">
+  <w:comment w:id="321" w:author="Summer Eckhardt" w:date="2025-02-04T18:49:00Z" w:initials="SE">
     <w:p>
       <w:pPr>
         <w:pStyle w:val="CommentText"/>
@@ -22677,7 +22538,7 @@
       </w:r>
     </w:p>
   </w:comment>
-  <w:comment w:id="285" w:author="Summer Eckhardt" w:date="2025-02-04T19:02:00Z" w:initials="SE">
+  <w:comment w:id="324" w:author="Summer Eckhardt" w:date="2025-02-04T19:02:00Z" w:initials="SE">
     <w:p>
       <w:pPr>
         <w:pStyle w:val="CommentText"/>
@@ -22693,7 +22554,7 @@
       </w:r>
     </w:p>
   </w:comment>
-  <w:comment w:id="289" w:author="Smith Vidaurre, Grace" w:date="2025-05-22T13:33:00Z" w:initials="GSV">
+  <w:comment w:id="328" w:author="Smith Vidaurre, Grace" w:date="2025-05-22T13:33:00Z" w:initials="GSV">
     <w:p>
       <w:r>
         <w:rPr>
@@ -22710,7 +22571,7 @@
       </w:r>
     </w:p>
   </w:comment>
-  <w:comment w:id="292" w:author="Smith Vidaurre, Grace" w:date="2025-05-22T13:23:00Z" w:initials="GSV">
+  <w:comment w:id="331" w:author="Smith Vidaurre, Grace" w:date="2025-05-22T13:23:00Z" w:initials="GSV">
     <w:p>
       <w:r>
         <w:rPr>
@@ -22727,7 +22588,7 @@
       </w:r>
     </w:p>
   </w:comment>
-  <w:comment w:id="297" w:author="Smith Vidaurre, Grace" w:date="2024-12-18T14:31:00Z" w:initials="GSV">
+  <w:comment w:id="336" w:author="Smith Vidaurre, Grace" w:date="2024-12-18T14:31:00Z" w:initials="GSV">
     <w:p>
       <w:r>
         <w:rPr>
@@ -22744,7 +22605,7 @@
       </w:r>
     </w:p>
   </w:comment>
-  <w:comment w:id="300" w:author="Smith Vidaurre, Grace" w:date="2024-12-18T15:30:00Z" w:initials="GSV">
+  <w:comment w:id="339" w:author="Smith Vidaurre, Grace" w:date="2024-12-18T15:30:00Z" w:initials="GSV">
     <w:p>
       <w:r>
         <w:rPr>
@@ -22761,7 +22622,7 @@
       </w:r>
     </w:p>
   </w:comment>
-  <w:comment w:id="301" w:author="Smith Vidaurre, Grace" w:date="2024-12-16T09:35:00Z" w:initials="GSV">
+  <w:comment w:id="340" w:author="Smith Vidaurre, Grace" w:date="2024-12-16T09:35:00Z" w:initials="GSV">
     <w:p>
       <w:r>
         <w:rPr>
@@ -22778,7 +22639,7 @@
       </w:r>
     </w:p>
   </w:comment>
-  <w:comment w:id="302" w:author="Smith Vidaurre, Grace" w:date="2024-12-16T09:41:00Z" w:initials="GSV">
+  <w:comment w:id="341" w:author="Smith Vidaurre, Grace" w:date="2024-12-16T09:41:00Z" w:initials="GSV">
     <w:p>
       <w:r>
         <w:rPr>
@@ -22795,7 +22656,7 @@
       </w:r>
     </w:p>
   </w:comment>
-  <w:comment w:id="303" w:author="Coppinger, Brittany" w:date="2024-12-16T14:51:00Z" w:initials="BC">
+  <w:comment w:id="342" w:author="Coppinger, Brittany" w:date="2024-12-16T14:51:00Z" w:initials="BC">
     <w:p>
       <w:pPr>
         <w:pStyle w:val="CommentText"/>

</xml_diff>

<commit_message>
Discussion restructuring: accepted changes
</commit_message>
<xml_diff>
--- a/drafts/paRsynth_methods_draft.docx
+++ b/drafts/paRsynth_methods_draft.docx
@@ -17683,10 +17683,6 @@
         <w:pStyle w:val="NoSpacing"/>
         <w:spacing w:line="480" w:lineRule="auto"/>
         <w:ind w:firstLine="720"/>
-        <w:rPr>
-          <w:del w:id="145" w:author="Smith Vidaurre, Grace" w:date="2025-06-05T15:45:00Z" w16du:dateUtc="2025-06-05T19:45:00Z"/>
-          <w:rFonts w:ascii="Arial" w:hAnsi="Arial" w:cs="Arial"/>
-        </w:rPr>
       </w:pPr>
       <w:r>
         <w:rPr>
@@ -17981,28 +17977,18 @@
         </w:rPr>
         <w:t xml:space="preserve">the </w:t>
       </w:r>
-      <w:del w:id="146" w:author="Smith Vidaurre, Grace" w:date="2025-06-05T15:35:00Z" w16du:dateUtc="2025-06-05T19:35:00Z">
-        <w:r>
-          <w:rPr>
-            <w:rFonts w:ascii="Arial" w:hAnsi="Arial" w:cs="Arial"/>
-          </w:rPr>
-          <w:delText xml:space="preserve">locations </w:delText>
-        </w:r>
-      </w:del>
-      <w:ins w:id="147" w:author="Smith Vidaurre, Grace" w:date="2025-06-05T15:35:00Z" w16du:dateUtc="2025-06-05T19:35:00Z">
-        <w:r>
-          <w:rPr>
-            <w:rFonts w:ascii="Arial" w:hAnsi="Arial" w:cs="Arial"/>
-          </w:rPr>
-          <w:t>placement</w:t>
-        </w:r>
-        <w:r>
-          <w:rPr>
-            <w:rFonts w:ascii="Arial" w:hAnsi="Arial" w:cs="Arial"/>
-          </w:rPr>
-          <w:t xml:space="preserve"> </w:t>
-        </w:r>
-      </w:ins>
+      <w:r>
+        <w:rPr>
+          <w:rFonts w:ascii="Arial" w:hAnsi="Arial" w:cs="Arial"/>
+        </w:rPr>
+        <w:t>placement</w:t>
+      </w:r>
+      <w:r>
+        <w:rPr>
+          <w:rFonts w:ascii="Arial" w:hAnsi="Arial" w:cs="Arial"/>
+        </w:rPr>
+        <w:t xml:space="preserve"> </w:t>
+      </w:r>
       <w:r>
         <w:rPr>
           <w:rFonts w:ascii="Arial" w:hAnsi="Arial" w:cs="Arial"/>
@@ -18020,1556 +18006,1406 @@
           <w:rFonts w:ascii="Arial" w:hAnsi="Arial" w:cs="Arial"/>
         </w:rPr>
         <w:t>random variation and identity information in the original character strings.</w:t>
+      </w:r>
+    </w:p>
+    <w:p>
+      <w:pPr>
+        <w:spacing w:line="480" w:lineRule="auto"/>
+        <w:ind w:firstLine="720"/>
+        <w:rPr>
+          <w:rFonts w:ascii="Arial" w:hAnsi="Arial" w:cs="Arial"/>
+        </w:rPr>
+      </w:pPr>
+      <w:r>
+        <w:rPr>
+          <w:rFonts w:ascii="Arial" w:hAnsi="Arial" w:cs="Arial"/>
+        </w:rPr>
+        <w:t xml:space="preserve">In summary, we developed a new </w:t>
+      </w:r>
+      <w:r>
+        <w:rPr>
+          <w:rFonts w:ascii="Arial" w:hAnsi="Arial" w:cs="Arial"/>
+        </w:rPr>
+        <w:t>tool to generate synthetic vocal identity signals</w:t>
+      </w:r>
+      <w:r>
+        <w:rPr>
+          <w:rFonts w:ascii="Arial" w:hAnsi="Arial" w:cs="Arial"/>
+        </w:rPr>
+        <w:t xml:space="preserve"> </w:t>
+      </w:r>
+      <w:r>
+        <w:rPr>
+          <w:rFonts w:ascii="Arial" w:hAnsi="Arial" w:cs="Arial"/>
+        </w:rPr>
+        <w:t>with</w:t>
+      </w:r>
+      <w:r>
+        <w:rPr>
+          <w:rFonts w:ascii="Arial" w:hAnsi="Arial" w:cs="Arial"/>
+        </w:rPr>
+        <w:t xml:space="preserve"> identity information</w:t>
+      </w:r>
+      <w:r>
+        <w:rPr>
+          <w:rFonts w:ascii="Arial" w:hAnsi="Arial" w:cs="Arial"/>
+        </w:rPr>
+        <w:t xml:space="preserve"> that can be encoded</w:t>
+      </w:r>
+      <w:r>
+        <w:rPr>
+          <w:rFonts w:ascii="Arial" w:hAnsi="Arial" w:cs="Arial"/>
+        </w:rPr>
+        <w:t xml:space="preserve"> over two social levels in frequency modulation patterns, an</w:t>
+      </w:r>
+      <w:r>
+        <w:rPr>
+          <w:rFonts w:ascii="Arial" w:hAnsi="Arial" w:cs="Arial"/>
+        </w:rPr>
+        <w:t xml:space="preserve"> acoustic structure</w:t>
+      </w:r>
+      <w:r>
+        <w:rPr>
+          <w:rFonts w:ascii="Arial" w:hAnsi="Arial" w:cs="Arial"/>
+        </w:rPr>
+        <w:t xml:space="preserve"> that animals </w:t>
+      </w:r>
+      <w:r>
+        <w:rPr>
+          <w:rFonts w:ascii="Arial" w:hAnsi="Arial" w:cs="Arial"/>
+        </w:rPr>
+        <w:t xml:space="preserve">are known to </w:t>
+      </w:r>
+      <w:r>
+        <w:rPr>
+          <w:rFonts w:ascii="Arial" w:hAnsi="Arial" w:cs="Arial"/>
+        </w:rPr>
+        <w:t>use for encoding identity information</w:t>
+      </w:r>
+      <w:r>
+        <w:rPr>
+          <w:rFonts w:ascii="Arial" w:hAnsi="Arial" w:cs="Arial"/>
+        </w:rPr>
+        <w:t xml:space="preserve"> across social levels</w:t>
+      </w:r>
+      <w:r>
+        <w:rPr>
+          <w:rFonts w:ascii="Arial" w:hAnsi="Arial" w:cs="Arial"/>
+        </w:rPr>
+        <w:t xml:space="preserve"> (CITE)</w:t>
+      </w:r>
+      <w:r>
+        <w:rPr>
+          <w:rFonts w:ascii="Arial" w:hAnsi="Arial" w:cs="Arial"/>
+        </w:rPr>
+        <w:t>. We also</w:t>
+      </w:r>
+      <w:r>
+        <w:rPr>
+          <w:rFonts w:ascii="Arial" w:hAnsi="Arial" w:cs="Arial"/>
+        </w:rPr>
+        <w:t xml:space="preserve"> performed simulation experiments to test how well computational bioacoustics pipelines could detect </w:t>
+      </w:r>
+      <w:r>
+        <w:rPr>
+          <w:rFonts w:ascii="Arial" w:hAnsi="Arial" w:cs="Arial"/>
+        </w:rPr>
+        <w:t xml:space="preserve">the </w:t>
+      </w:r>
+      <w:r>
+        <w:rPr>
+          <w:rFonts w:ascii="Arial" w:hAnsi="Arial" w:cs="Arial"/>
+        </w:rPr>
+        <w:lastRenderedPageBreak/>
+        <w:t xml:space="preserve">identity </w:t>
+      </w:r>
+      <w:r>
+        <w:rPr>
+          <w:rFonts w:ascii="Arial" w:hAnsi="Arial" w:cs="Arial"/>
+        </w:rPr>
+        <w:t>information we originally encoded</w:t>
+      </w:r>
+      <w:r>
+        <w:rPr>
+          <w:rFonts w:ascii="Arial" w:hAnsi="Arial" w:cs="Arial"/>
+        </w:rPr>
+        <w:t xml:space="preserve"> in frequency modulation patterns</w:t>
+      </w:r>
+      <w:r>
+        <w:rPr>
+          <w:rFonts w:ascii="Arial" w:hAnsi="Arial" w:cs="Arial"/>
+        </w:rPr>
+        <w:t>.</w:t>
+      </w:r>
+      <w:r>
+        <w:rPr>
+          <w:rFonts w:ascii="Arial" w:hAnsi="Arial" w:cs="Arial"/>
+        </w:rPr>
+        <w:t xml:space="preserve"> Our new </w:t>
+      </w:r>
+      <w:r>
+        <w:rPr>
+          <w:rFonts w:ascii="Arial" w:hAnsi="Arial" w:cs="Arial"/>
+        </w:rPr>
+        <w:t xml:space="preserve">pipeline </w:t>
+      </w:r>
+      <w:r>
+        <w:rPr>
+          <w:rFonts w:ascii="Arial" w:hAnsi="Arial" w:cs="Arial"/>
+        </w:rPr>
+        <w:t xml:space="preserve">is available as an R package </w:t>
+      </w:r>
+      <w:r>
+        <w:rPr>
+          <w:rFonts w:ascii="Arial" w:hAnsi="Arial" w:cs="Arial"/>
+        </w:rPr>
+        <w:t xml:space="preserve">and </w:t>
+      </w:r>
+      <w:r>
+        <w:rPr>
+          <w:rFonts w:ascii="Arial" w:hAnsi="Arial" w:cs="Arial"/>
+        </w:rPr>
+        <w:t>creates synthetic vocalizations that can be represented as strings for computational efficiency</w:t>
+      </w:r>
+      <w:r>
+        <w:rPr>
+          <w:rFonts w:ascii="Arial" w:hAnsi="Arial" w:cs="Arial"/>
+        </w:rPr>
+        <w:t>,</w:t>
+      </w:r>
+      <w:r>
+        <w:rPr>
+          <w:rFonts w:ascii="Arial" w:hAnsi="Arial" w:cs="Arial"/>
+        </w:rPr>
+        <w:t xml:space="preserve"> while also producing </w:t>
+      </w:r>
+      <w:r>
+        <w:rPr>
+          <w:rFonts w:ascii="Arial" w:hAnsi="Arial" w:cs="Arial"/>
+        </w:rPr>
+        <w:t xml:space="preserve">audio files of </w:t>
+      </w:r>
+      <w:r>
+        <w:rPr>
+          <w:rFonts w:ascii="Arial" w:hAnsi="Arial" w:cs="Arial"/>
+        </w:rPr>
+        <w:t xml:space="preserve">synthetic </w:t>
+      </w:r>
+      <w:r>
+        <w:rPr>
+          <w:rFonts w:ascii="Arial" w:hAnsi="Arial" w:cs="Arial"/>
+        </w:rPr>
+        <w:t>vocalizations</w:t>
+      </w:r>
+      <w:r>
+        <w:rPr>
+          <w:rFonts w:ascii="Arial" w:hAnsi="Arial" w:cs="Arial"/>
+        </w:rPr>
+        <w:t xml:space="preserve"> that can be analyzed with</w:t>
+      </w:r>
+      <w:r>
+        <w:rPr>
+          <w:rFonts w:ascii="Arial" w:hAnsi="Arial" w:cs="Arial"/>
+        </w:rPr>
+        <w:t xml:space="preserve"> analytical tools in </w:t>
+      </w:r>
+      <w:r>
+        <w:rPr>
+          <w:rFonts w:ascii="Arial" w:hAnsi="Arial" w:cs="Arial"/>
+        </w:rPr>
+        <w:t xml:space="preserve">bioacoustics, situating its impact at the interface of </w:t>
+      </w:r>
+      <w:r>
+        <w:rPr>
+          <w:rFonts w:ascii="Arial" w:hAnsi="Arial" w:cs="Arial"/>
+        </w:rPr>
+        <w:t>simulated</w:t>
+      </w:r>
+      <w:r>
+        <w:rPr>
+          <w:rFonts w:ascii="Arial" w:hAnsi="Arial" w:cs="Arial"/>
+        </w:rPr>
+        <w:t xml:space="preserve"> and </w:t>
+      </w:r>
+      <w:r>
+        <w:rPr>
+          <w:rFonts w:ascii="Arial" w:hAnsi="Arial" w:cs="Arial"/>
+        </w:rPr>
+        <w:t xml:space="preserve">empirical research in animal </w:t>
+      </w:r>
+      <w:r>
+        <w:rPr>
+          <w:rFonts w:ascii="Arial" w:hAnsi="Arial" w:cs="Arial"/>
+        </w:rPr>
+        <w:t xml:space="preserve">communication. </w:t>
+      </w:r>
+      <w:r>
+        <w:rPr>
+          <w:rFonts w:ascii="Arial" w:hAnsi="Arial" w:cs="Arial"/>
+        </w:rPr>
+        <w:t xml:space="preserve">Our </w:t>
+      </w:r>
+      <w:r>
+        <w:rPr>
+          <w:rFonts w:ascii="Arial" w:hAnsi="Arial" w:cs="Arial"/>
+        </w:rPr>
+        <w:t xml:space="preserve">approach to encoding identity information simulates </w:t>
+      </w:r>
+      <w:r>
+        <w:rPr>
+          <w:rFonts w:ascii="Arial" w:hAnsi="Arial" w:cs="Arial"/>
+        </w:rPr>
+        <w:t>how</w:t>
+      </w:r>
+      <w:r>
+        <w:rPr>
+          <w:rFonts w:ascii="Arial" w:hAnsi="Arial" w:cs="Arial"/>
+        </w:rPr>
+        <w:t xml:space="preserve"> animals can transmit identity information</w:t>
+      </w:r>
+      <w:r>
+        <w:rPr>
+          <w:rFonts w:ascii="Arial" w:hAnsi="Arial" w:cs="Arial"/>
+        </w:rPr>
+        <w:t xml:space="preserve"> through vocal signals</w:t>
+      </w:r>
+      <w:r>
+        <w:rPr>
+          <w:rFonts w:ascii="Arial" w:hAnsi="Arial" w:cs="Arial"/>
+        </w:rPr>
+        <w:t xml:space="preserve"> </w:t>
+      </w:r>
+      <w:r>
+        <w:rPr>
+          <w:rFonts w:ascii="Arial" w:hAnsi="Arial" w:cs="Arial"/>
+        </w:rPr>
+        <w:t>in</w:t>
+      </w:r>
+      <w:r>
+        <w:rPr>
+          <w:rFonts w:ascii="Arial" w:hAnsi="Arial" w:cs="Arial"/>
+        </w:rPr>
+        <w:t xml:space="preserve"> </w:t>
+      </w:r>
+      <w:r>
+        <w:rPr>
+          <w:rFonts w:ascii="Arial" w:hAnsi="Arial" w:cs="Arial"/>
+        </w:rPr>
+        <w:t>complex multilevel</w:t>
+      </w:r>
+      <w:r>
+        <w:rPr>
+          <w:rFonts w:ascii="Arial" w:hAnsi="Arial" w:cs="Arial"/>
+        </w:rPr>
+        <w:t xml:space="preserve"> societie</w:t>
+      </w:r>
+      <w:r>
+        <w:rPr>
+          <w:rFonts w:ascii="Arial" w:hAnsi="Arial" w:cs="Arial"/>
+        </w:rPr>
+        <w:t>s</w:t>
+      </w:r>
+      <w:r>
+        <w:rPr>
+          <w:rFonts w:ascii="Arial" w:hAnsi="Arial" w:cs="Arial"/>
+        </w:rPr>
+        <w:t xml:space="preserve">. Our tool </w:t>
+      </w:r>
+      <w:r>
+        <w:rPr>
+          <w:rFonts w:ascii="Arial" w:hAnsi="Arial" w:cs="Arial"/>
+        </w:rPr>
+        <w:t>can benefit</w:t>
+      </w:r>
+      <w:r>
+        <w:rPr>
+          <w:rFonts w:ascii="Arial" w:hAnsi="Arial" w:cs="Arial"/>
+        </w:rPr>
+        <w:t xml:space="preserve"> future </w:t>
+      </w:r>
+      <w:r>
+        <w:rPr>
+          <w:rFonts w:ascii="Arial" w:hAnsi="Arial" w:cs="Arial"/>
+        </w:rPr>
+        <w:t xml:space="preserve">simulation-based and empirical </w:t>
+      </w:r>
+      <w:r>
+        <w:rPr>
+          <w:rFonts w:ascii="Arial" w:hAnsi="Arial" w:cs="Arial"/>
+        </w:rPr>
+        <w:t xml:space="preserve">research </w:t>
+      </w:r>
+      <w:r>
+        <w:rPr>
+          <w:rFonts w:ascii="Arial" w:hAnsi="Arial" w:cs="Arial"/>
+        </w:rPr>
+        <w:t xml:space="preserve">that </w:t>
+      </w:r>
+      <w:r>
+        <w:rPr>
+          <w:rFonts w:ascii="Arial" w:hAnsi="Arial" w:cs="Arial"/>
+        </w:rPr>
+        <w:t>requires</w:t>
+      </w:r>
+      <w:r>
+        <w:rPr>
+          <w:rFonts w:ascii="Arial" w:hAnsi="Arial" w:cs="Arial"/>
+        </w:rPr>
+        <w:t xml:space="preserve"> </w:t>
+      </w:r>
+      <w:r>
+        <w:rPr>
+          <w:rFonts w:ascii="Arial" w:hAnsi="Arial" w:cs="Arial"/>
+        </w:rPr>
+        <w:t xml:space="preserve">controlling the types and amounts of identity information encoded in synthetic </w:t>
+      </w:r>
+      <w:r>
+        <w:rPr>
+          <w:rFonts w:ascii="Arial" w:hAnsi="Arial" w:cs="Arial"/>
+        </w:rPr>
+        <w:t>voca</w:t>
+      </w:r>
+      <w:r>
+        <w:rPr>
+          <w:rFonts w:ascii="Arial" w:hAnsi="Arial" w:cs="Arial"/>
+        </w:rPr>
+        <w:t>lizations</w:t>
+      </w:r>
+      <w:r>
+        <w:rPr>
+          <w:rFonts w:ascii="Arial" w:hAnsi="Arial" w:cs="Arial"/>
+        </w:rPr>
+        <w:t>.</w:t>
       </w:r>
     </w:p>
     <w:p>
       <w:pPr>
         <w:pStyle w:val="NoSpacing"/>
         <w:spacing w:line="480" w:lineRule="auto"/>
-        <w:ind w:firstLine="720"/>
-        <w:rPr>
-          <w:ins w:id="148" w:author="Smith Vidaurre, Grace" w:date="2025-06-04T11:10:00Z" w16du:dateUtc="2025-06-04T15:10:00Z"/>
-        </w:rPr>
-        <w:pPrChange w:id="149" w:author="Smith Vidaurre, Grace" w:date="2025-06-05T15:45:00Z" w16du:dateUtc="2025-06-05T19:45:00Z">
-          <w:pPr>
-            <w:spacing w:line="480" w:lineRule="auto"/>
-          </w:pPr>
-        </w:pPrChange>
-      </w:pPr>
+        <w:rPr>
+          <w:del w:id="145" w:author="Smith Vidaurre, Grace" w:date="2025-06-05T15:45:00Z" w16du:dateUtc="2025-06-05T19:45:00Z"/>
+          <w:rFonts w:ascii="Arial" w:hAnsi="Arial" w:cs="Arial"/>
+          <w:b/>
+          <w:bCs/>
+        </w:rPr>
+      </w:pPr>
+    </w:p>
+    <w:p>
+      <w:pPr>
+        <w:spacing w:line="480" w:lineRule="auto"/>
+        <w:rPr>
+          <w:rFonts w:ascii="Arial" w:hAnsi="Arial" w:cs="Arial"/>
+        </w:rPr>
+      </w:pPr>
+    </w:p>
+    <w:p>
+      <w:pPr>
+        <w:spacing w:line="480" w:lineRule="auto"/>
+        <w:rPr>
+          <w:rFonts w:ascii="Arial" w:hAnsi="Arial" w:cs="Arial"/>
+        </w:rPr>
+      </w:pPr>
+      <w:commentRangeStart w:id="146"/>
+      <w:r>
+        <w:rPr>
+          <w:rFonts w:ascii="Arial" w:hAnsi="Arial" w:cs="Arial"/>
+          <w:b/>
+          <w:bCs/>
+        </w:rPr>
+        <w:t xml:space="preserve">Materials and </w:t>
+      </w:r>
+      <w:commentRangeStart w:id="147"/>
+      <w:r>
+        <w:rPr>
+          <w:rFonts w:ascii="Arial" w:hAnsi="Arial" w:cs="Arial"/>
+          <w:b/>
+          <w:bCs/>
+        </w:rPr>
+        <w:t>Methods</w:t>
+      </w:r>
+      <w:commentRangeEnd w:id="147"/>
+      <w:r>
+        <w:rPr>
+          <w:rStyle w:val="CommentReference"/>
+        </w:rPr>
+        <w:commentReference w:id="147"/>
+      </w:r>
+      <w:r>
+        <w:rPr>
+          <w:rFonts w:ascii="Arial" w:hAnsi="Arial" w:cs="Arial"/>
+        </w:rPr>
+        <w:t>:</w:t>
+      </w:r>
+      <w:commentRangeEnd w:id="146"/>
+      <w:r>
+        <w:rPr>
+          <w:rStyle w:val="CommentReference"/>
+        </w:rPr>
+        <w:commentReference w:id="146"/>
+      </w:r>
+    </w:p>
+    <w:p>
+      <w:pPr>
+        <w:spacing w:line="480" w:lineRule="auto"/>
+        <w:rPr>
+          <w:rFonts w:ascii="Arial" w:hAnsi="Arial" w:cs="Arial"/>
+          <w:i/>
+          <w:iCs/>
+        </w:rPr>
+      </w:pPr>
+      <w:r>
+        <w:rPr>
+          <w:rFonts w:ascii="Arial" w:hAnsi="Arial" w:cs="Arial"/>
+          <w:i/>
+          <w:iCs/>
+        </w:rPr>
+        <w:t>Encoding Group and Individual Identity Information in Signals</w:t>
+      </w:r>
+    </w:p>
+    <w:p>
+      <w:pPr>
+        <w:spacing w:line="480" w:lineRule="auto"/>
+        <w:rPr>
+          <w:rFonts w:ascii="Arial" w:hAnsi="Arial" w:cs="Arial"/>
+        </w:rPr>
+      </w:pPr>
+      <w:r>
+        <w:rPr>
+          <w:rFonts w:ascii="Arial" w:hAnsi="Arial" w:cs="Arial"/>
+        </w:rPr>
+        <w:tab/>
+        <w:t xml:space="preserve">First, using R (TKTK citation), we generated character strings to represent synthetic vocal identity signals. Using character strings to represent vocal information is computationally efficient for many purposes, including simulations, like agent-based modeling. Character strings </w:t>
+      </w:r>
+      <w:r>
+        <w:rPr>
+          <w:rFonts w:ascii="Arial" w:hAnsi="Arial" w:cs="Arial"/>
+        </w:rPr>
+        <w:t>comprise</w:t>
+      </w:r>
+      <w:r>
+        <w:rPr>
+          <w:rFonts w:ascii="Arial" w:hAnsi="Arial" w:cs="Arial"/>
+        </w:rPr>
+        <w:t xml:space="preserve"> </w:t>
+      </w:r>
+      <w:commentRangeStart w:id="148"/>
+      <w:commentRangeStart w:id="149"/>
+      <w:r>
+        <w:rPr>
+          <w:rFonts w:ascii="Arial" w:hAnsi="Arial" w:cs="Arial"/>
+        </w:rPr>
+        <w:t xml:space="preserve">5 components (Figure 1): </w:t>
+      </w:r>
+      <w:commentRangeEnd w:id="148"/>
+      <w:r>
+        <w:rPr>
+          <w:rStyle w:val="CommentReference"/>
+        </w:rPr>
+        <w:commentReference w:id="148"/>
+      </w:r>
+      <w:commentRangeEnd w:id="149"/>
+      <w:r>
+        <w:rPr>
+          <w:rStyle w:val="CommentReference"/>
+        </w:rPr>
+        <w:commentReference w:id="149"/>
+      </w:r>
+      <w:r>
+        <w:rPr>
+          <w:rFonts w:ascii="Arial" w:hAnsi="Arial" w:cs="Arial"/>
+        </w:rPr>
+        <w:t xml:space="preserve">a global head (a string of characters shared across all individuals; TKTK character length), a section of group information, a section of individual information, another section of group information, and a global tail (a string of characters shared across all individuals; TKTK character length). Later versions of our code will allow users to choose where and how much information is encoded in the signal. We varied the character length of the group and individual sections depending on treatment, discussed below. We used three unique </w:t>
+      </w:r>
+      <w:r>
+        <w:rPr>
+          <w:rFonts w:ascii="Arial" w:hAnsi="Arial" w:cs="Arial"/>
+        </w:rPr>
+        <w:lastRenderedPageBreak/>
+        <w:t xml:space="preserve">characters in the string: A, B, and C. </w:t>
+      </w:r>
+      <w:commentRangeStart w:id="150"/>
+      <w:r>
+        <w:rPr>
+          <w:rFonts w:ascii="Arial" w:hAnsi="Arial" w:cs="Arial"/>
+        </w:rPr>
+        <w:t>Once character strings were generated, we added random variation in each call to represent variation within an individual’s call repertoires</w:t>
+      </w:r>
+      <w:commentRangeEnd w:id="150"/>
+      <w:r>
+        <w:rPr>
+          <w:rStyle w:val="CommentReference"/>
+        </w:rPr>
+        <w:commentReference w:id="150"/>
+      </w:r>
+      <w:r>
+        <w:rPr>
+          <w:rFonts w:ascii="Arial" w:hAnsi="Arial" w:cs="Arial"/>
+        </w:rPr>
+        <w:t xml:space="preserve">. Total string length remained constant across individuals (36 characters). </w:t>
+      </w:r>
+    </w:p>
+    <w:p>
+      <w:pPr>
+        <w:spacing w:line="480" w:lineRule="auto"/>
+        <w:rPr>
+          <w:rFonts w:ascii="Arial" w:hAnsi="Arial" w:cs="Arial"/>
+        </w:rPr>
+      </w:pPr>
+      <w:r>
+        <w:rPr>
+          <w:rFonts w:ascii="Arial" w:hAnsi="Arial" w:cs="Arial"/>
+        </w:rPr>
+        <w:tab/>
+        <w:t xml:space="preserve">Next, we </w:t>
+      </w:r>
+      <w:proofErr w:type="spellStart"/>
+      <w:r>
+        <w:rPr>
+          <w:rFonts w:ascii="Arial" w:hAnsi="Arial" w:cs="Arial"/>
+        </w:rPr>
+        <w:t>sonified</w:t>
+      </w:r>
+      <w:proofErr w:type="spellEnd"/>
+      <w:r>
+        <w:rPr>
+          <w:rFonts w:ascii="Arial" w:hAnsi="Arial" w:cs="Arial"/>
+        </w:rPr>
+        <w:t xml:space="preserve"> characters strings to synthetic vocalizations by using Parson’s code. Parson’s code summarizes the information in a tune or signal while reducing over its global characteristics </w:t>
+      </w:r>
+      <w:r>
+        <w:rPr>
+          <w:rFonts w:ascii="Arial" w:hAnsi="Arial" w:cs="Arial"/>
+        </w:rPr>
+        <w:fldChar w:fldCharType="begin"/>
+      </w:r>
+      <w:r>
+        <w:rPr>
+          <w:rFonts w:ascii="Arial" w:hAnsi="Arial" w:cs="Arial"/>
+        </w:rPr>
+        <w:instrText xml:space="preserve"> ADDIN ZOTERO_ITEM CSL_CITATION {"citationID":"Uqyq1MIF","properties":{"formattedCitation":"(40)","plainCitation":"(40)","noteIndex":0},"citationItems":[{"id":598,"uris":["http://zotero.org/groups/5786507/items/ZVXRPGHR"],"itemData":{"id":598,"type":"book","abstract":"288 p. : 24 cm","ISBN":"978-0-904747-00-3","language":"eng","number-of-pages":"298","publisher":"Cambridge, Eng. : S. Brown","source":"Internet Archive","title":"The directory of tunes and musical themes","URL":"http://archive.org/details/directoryoftunes0000pars","author":[{"family":"Parsons","given":"Denys"}],"contributor":[{"literal":"Internet Archive"}],"accessed":{"date-parts":[["2024",12,20]]},"issued":{"date-parts":[["1975"]]}}}],"schema":"https://github.com/citation-style-language/schema/raw/master/csl-citation.json"} </w:instrText>
+      </w:r>
+      <w:r>
+        <w:rPr>
+          <w:rFonts w:ascii="Arial" w:hAnsi="Arial" w:cs="Arial"/>
+        </w:rPr>
+        <w:fldChar w:fldCharType="separate"/>
+      </w:r>
+      <w:r>
+        <w:rPr>
+          <w:rFonts w:ascii="Arial" w:hAnsi="Arial" w:cs="Arial"/>
+        </w:rPr>
+        <w:t>(40)</w:t>
+      </w:r>
+      <w:r>
+        <w:rPr>
+          <w:rFonts w:ascii="Arial" w:hAnsi="Arial" w:cs="Arial"/>
+        </w:rPr>
+        <w:fldChar w:fldCharType="end"/>
+      </w:r>
+      <w:r>
+        <w:rPr>
+          <w:rFonts w:ascii="Arial" w:hAnsi="Arial" w:cs="Arial"/>
+        </w:rPr>
+        <w:t>. We used 1-Parsons encoding, which reduces the frequences profile of a signal to a “</w:t>
+      </w:r>
+      <w:proofErr w:type="spellStart"/>
+      <w:r>
+        <w:rPr>
+          <w:rFonts w:ascii="Arial" w:hAnsi="Arial" w:cs="Arial"/>
+        </w:rPr>
+        <w:t>trit</w:t>
+      </w:r>
+      <w:proofErr w:type="spellEnd"/>
+      <w:r>
+        <w:rPr>
+          <w:rFonts w:ascii="Arial" w:hAnsi="Arial" w:cs="Arial"/>
+        </w:rPr>
+        <w:t xml:space="preserve">” of information by noting the direction of frequency change (up, down, or constant) in a series of subsamples from the original signal, known as Parsons segments. Parsons code is often used in the retrieval and study of music </w:t>
+      </w:r>
+      <w:r>
+        <w:rPr>
+          <w:rFonts w:ascii="Arial" w:hAnsi="Arial" w:cs="Arial"/>
+        </w:rPr>
+        <w:fldChar w:fldCharType="begin"/>
+      </w:r>
+      <w:r>
+        <w:rPr>
+          <w:rFonts w:ascii="Arial" w:hAnsi="Arial" w:cs="Arial"/>
+        </w:rPr>
+        <w:instrText xml:space="preserve"> ADDIN ZOTERO_ITEM CSL_CITATION {"citationID":"8E9FupMd","properties":{"formattedCitation":"(41)","plainCitation":"(41)","noteIndex":0},"citationItems":[{"id":601,"uris":["http://zotero.org/groups/5786507/items/IJTC2XE2"],"itemData":{"id":601,"type":"article-journal","container-title":"Annual review of information science and technology","issue":"1","page":"295-340","title":"Music information retrieval","volume":"37","author":[{"family":"Downie","given":"J.S."}],"issued":{"date-parts":[["2003"]]}}}],"schema":"https://github.com/citation-style-language/schema/raw/master/csl-citation.json"} </w:instrText>
+      </w:r>
+      <w:r>
+        <w:rPr>
+          <w:rFonts w:ascii="Arial" w:hAnsi="Arial" w:cs="Arial"/>
+        </w:rPr>
+        <w:fldChar w:fldCharType="separate"/>
+      </w:r>
+      <w:r>
+        <w:rPr>
+          <w:rFonts w:ascii="Arial" w:hAnsi="Arial" w:cs="Arial"/>
+        </w:rPr>
+        <w:t>(41)</w:t>
+      </w:r>
+      <w:r>
+        <w:rPr>
+          <w:rFonts w:ascii="Arial" w:hAnsi="Arial" w:cs="Arial"/>
+        </w:rPr>
+        <w:fldChar w:fldCharType="end"/>
+      </w:r>
+      <w:r>
+        <w:rPr>
+          <w:rFonts w:ascii="Arial" w:hAnsi="Arial" w:cs="Arial"/>
+        </w:rPr>
+        <w:t xml:space="preserve">, however researchers have used a Parsons code metric to decode information in frequency-based animal signals with great success </w:t>
+      </w:r>
+      <w:r>
+        <w:rPr>
+          <w:rFonts w:ascii="Arial" w:hAnsi="Arial" w:cs="Arial"/>
+        </w:rPr>
+        <w:fldChar w:fldCharType="begin"/>
+      </w:r>
+      <w:r>
+        <w:rPr>
+          <w:rFonts w:ascii="Arial" w:hAnsi="Arial" w:cs="Arial"/>
+        </w:rPr>
+        <w:instrText xml:space="preserve"> ADDIN ZOTERO_ITEM CSL_CITATION {"citationID":"r3ZuczO0","properties":{"formattedCitation":"(36)","plainCitation":"(36)","noteIndex":0},"citationItems":[{"id":599,"uris":["http://zotero.org/groups/5786507/items/MUGYAV6U"],"itemData":{"id":599,"type":"article-journal","abstract":"Bottlenose dolphins (Tursiops truncatus) produce many vocalisations, including whistles that are unique to the individual producing them. Such “signature whistles” play a role in individual recognition and maintaining group integrity. Previous work has shown that humans can successfully group the spectrographic representations of signature whistles according to the individual dolphins that produced them. However, attempts at using mathematical algorithms to perform a similar task have been less successful. A greater understanding of the encoding of identity information in signature whistles is important for assessing similarity of whistles and thus social influences on the development of these learned calls. We re-examined 400 signature whistles from 20 individual dolphins used in a previous study, and tested the performance of new mathematical algorithms. We compared the measure used in the original study (correlation matrix of evenly sampled frequency measurements) to one used in several previous studies (similarity matrix of time-warped whistles), and to a new algorithm based on the Parsons code, used in music retrieval databases. The Parsons code records the direction of frequency change at each time step, and is effective at capturing human perception of music. We analysed similarity matrices from each of these three techniques, as well as a random control, by unsupervised clustering using three separate techniques: k-means clustering, hierarchical clustering, and an adaptive resonance theory neural network. For each of the three clustering techniques, a seven-level Parsons algorithm provided better clustering than the correlation and dynamic time warping algorithms, and was closer to the near-perfect visual categorisations of human judges. Thus, the Parsons code captures much of the individual identity information present in signature whistles, and may prove useful in studies requiring quantification of whistle similarity.","container-title":"PLOS ONE","DOI":"10.1371/journal.pone.0077671","ISSN":"1932-6203","issue":"10","journalAbbreviation":"PLOS ONE","language":"en","note":"publisher: Public Library of Science","page":"e77671","source":"PLoS Journals","title":"The Encoding of Individual Identity in Dolphin Signature Whistles: How Much Information Is Needed?","title-short":"The Encoding of Individual Identity in Dolphin Signature Whistles","volume":"8","author":[{"family":"Kershenbaum","given":"Arik"},{"family":"Sayigh","given":"Laela S."},{"family":"Janik","given":"Vincent M."}],"issued":{"date-parts":[["2013",10,23]]}}}],"schema":"https://github.com/citation-style-language/schema/raw/master/csl-citation.json"} </w:instrText>
+      </w:r>
+      <w:r>
+        <w:rPr>
+          <w:rFonts w:ascii="Arial" w:hAnsi="Arial" w:cs="Arial"/>
+        </w:rPr>
+        <w:fldChar w:fldCharType="separate"/>
+      </w:r>
+      <w:r>
+        <w:rPr>
+          <w:rFonts w:ascii="Arial" w:hAnsi="Arial" w:cs="Arial"/>
+        </w:rPr>
+        <w:t>(36)</w:t>
+      </w:r>
+      <w:r>
+        <w:rPr>
+          <w:rFonts w:ascii="Arial" w:hAnsi="Arial" w:cs="Arial"/>
+        </w:rPr>
+        <w:fldChar w:fldCharType="end"/>
+      </w:r>
+      <w:r>
+        <w:rPr>
+          <w:rFonts w:ascii="Arial" w:hAnsi="Arial" w:cs="Arial"/>
+        </w:rPr>
+        <w:t xml:space="preserve">. Here, we used Paron’s code in a novel way, using it to encode information in a signal rather than to decode information. Each unique character mapped onto a direction, such that A was converted into “up”, B into “down”, and C into “constant”. </w:t>
+      </w:r>
     </w:p>
     <w:p>
       <w:pPr>
         <w:spacing w:line="480" w:lineRule="auto"/>
         <w:ind w:firstLine="720"/>
         <w:rPr>
-          <w:ins w:id="150" w:author="Smith Vidaurre, Grace" w:date="2025-06-05T15:39:00Z" w16du:dateUtc="2025-06-05T19:39:00Z"/>
-          <w:rFonts w:ascii="Arial" w:hAnsi="Arial" w:cs="Arial"/>
-        </w:rPr>
-      </w:pPr>
-      <w:ins w:id="151" w:author="Smith Vidaurre, Grace" w:date="2025-06-04T11:10:00Z" w16du:dateUtc="2025-06-04T15:10:00Z">
-        <w:r>
-          <w:rPr>
-            <w:rFonts w:ascii="Arial" w:hAnsi="Arial" w:cs="Arial"/>
-          </w:rPr>
-          <w:t xml:space="preserve">In summary, we developed a new </w:t>
-        </w:r>
-      </w:ins>
-      <w:ins w:id="152" w:author="Smith Vidaurre, Grace" w:date="2025-06-05T10:58:00Z" w16du:dateUtc="2025-06-05T14:58:00Z">
-        <w:r>
-          <w:rPr>
-            <w:rFonts w:ascii="Arial" w:hAnsi="Arial" w:cs="Arial"/>
-          </w:rPr>
-          <w:t>tool to generate synthetic vocal identity signals</w:t>
-        </w:r>
-      </w:ins>
-      <w:ins w:id="153" w:author="Smith Vidaurre, Grace" w:date="2025-06-05T10:59:00Z" w16du:dateUtc="2025-06-05T14:59:00Z">
-        <w:r>
-          <w:rPr>
-            <w:rFonts w:ascii="Arial" w:hAnsi="Arial" w:cs="Arial"/>
-          </w:rPr>
-          <w:t xml:space="preserve"> </w:t>
-        </w:r>
-      </w:ins>
-      <w:ins w:id="154" w:author="Smith Vidaurre, Grace" w:date="2025-06-05T15:47:00Z" w16du:dateUtc="2025-06-05T19:47:00Z">
-        <w:r>
-          <w:rPr>
-            <w:rFonts w:ascii="Arial" w:hAnsi="Arial" w:cs="Arial"/>
-          </w:rPr>
-          <w:t>with</w:t>
-        </w:r>
-      </w:ins>
-      <w:ins w:id="155" w:author="Smith Vidaurre, Grace" w:date="2025-06-05T10:59:00Z" w16du:dateUtc="2025-06-05T14:59:00Z">
-        <w:r>
-          <w:rPr>
-            <w:rFonts w:ascii="Arial" w:hAnsi="Arial" w:cs="Arial"/>
-          </w:rPr>
-          <w:t xml:space="preserve"> identity information</w:t>
-        </w:r>
-      </w:ins>
-      <w:ins w:id="156" w:author="Smith Vidaurre, Grace" w:date="2025-06-05T15:47:00Z" w16du:dateUtc="2025-06-05T19:47:00Z">
-        <w:r>
-          <w:rPr>
-            <w:rFonts w:ascii="Arial" w:hAnsi="Arial" w:cs="Arial"/>
-          </w:rPr>
-          <w:t xml:space="preserve"> that can be encoded</w:t>
-        </w:r>
-      </w:ins>
-      <w:ins w:id="157" w:author="Smith Vidaurre, Grace" w:date="2025-06-05T10:59:00Z" w16du:dateUtc="2025-06-05T14:59:00Z">
-        <w:r>
-          <w:rPr>
-            <w:rFonts w:ascii="Arial" w:hAnsi="Arial" w:cs="Arial"/>
-          </w:rPr>
-          <w:t xml:space="preserve"> over two social levels in frequency modulation patterns, an</w:t>
-        </w:r>
-        <w:r>
-          <w:rPr>
-            <w:rFonts w:ascii="Arial" w:hAnsi="Arial" w:cs="Arial"/>
-          </w:rPr>
-          <w:t xml:space="preserve"> acoustic structure</w:t>
-        </w:r>
-        <w:r>
-          <w:rPr>
-            <w:rFonts w:ascii="Arial" w:hAnsi="Arial" w:cs="Arial"/>
-          </w:rPr>
-          <w:t xml:space="preserve"> that animals </w:t>
-        </w:r>
-      </w:ins>
-      <w:ins w:id="158" w:author="Smith Vidaurre, Grace" w:date="2025-06-05T15:48:00Z" w16du:dateUtc="2025-06-05T19:48:00Z">
-        <w:r>
-          <w:rPr>
-            <w:rFonts w:ascii="Arial" w:hAnsi="Arial" w:cs="Arial"/>
-          </w:rPr>
-          <w:t xml:space="preserve">are known to </w:t>
-        </w:r>
-      </w:ins>
-      <w:ins w:id="159" w:author="Smith Vidaurre, Grace" w:date="2025-06-05T10:59:00Z" w16du:dateUtc="2025-06-05T14:59:00Z">
-        <w:r>
-          <w:rPr>
-            <w:rFonts w:ascii="Arial" w:hAnsi="Arial" w:cs="Arial"/>
-          </w:rPr>
-          <w:t>use for encoding identity information</w:t>
-        </w:r>
-        <w:r>
-          <w:rPr>
-            <w:rFonts w:ascii="Arial" w:hAnsi="Arial" w:cs="Arial"/>
-          </w:rPr>
-          <w:t xml:space="preserve"> across social levels</w:t>
-        </w:r>
-      </w:ins>
-      <w:ins w:id="160" w:author="Smith Vidaurre, Grace" w:date="2025-06-05T15:48:00Z" w16du:dateUtc="2025-06-05T19:48:00Z">
-        <w:r>
-          <w:rPr>
-            <w:rFonts w:ascii="Arial" w:hAnsi="Arial" w:cs="Arial"/>
-          </w:rPr>
-          <w:t xml:space="preserve"> (CITE)</w:t>
-        </w:r>
-      </w:ins>
-      <w:ins w:id="161" w:author="Smith Vidaurre, Grace" w:date="2025-06-05T10:58:00Z" w16du:dateUtc="2025-06-05T14:58:00Z">
-        <w:r>
-          <w:rPr>
-            <w:rFonts w:ascii="Arial" w:hAnsi="Arial" w:cs="Arial"/>
-          </w:rPr>
-          <w:t>. We</w:t>
-        </w:r>
-      </w:ins>
-      <w:ins w:id="162" w:author="Smith Vidaurre, Grace" w:date="2025-06-05T10:59:00Z" w16du:dateUtc="2025-06-05T14:59:00Z">
-        <w:r>
-          <w:rPr>
-            <w:rFonts w:ascii="Arial" w:hAnsi="Arial" w:cs="Arial"/>
-          </w:rPr>
-          <w:t xml:space="preserve"> also</w:t>
-        </w:r>
-      </w:ins>
-      <w:ins w:id="163" w:author="Smith Vidaurre, Grace" w:date="2025-06-05T10:58:00Z" w16du:dateUtc="2025-06-05T14:58:00Z">
-        <w:r>
-          <w:rPr>
-            <w:rFonts w:ascii="Arial" w:hAnsi="Arial" w:cs="Arial"/>
-          </w:rPr>
-          <w:t xml:space="preserve"> performed simulation experiments to test how well computational bioacoustics pipelines could detect </w:t>
-        </w:r>
-      </w:ins>
-      <w:ins w:id="164" w:author="Smith Vidaurre, Grace" w:date="2025-06-05T15:35:00Z" w16du:dateUtc="2025-06-05T19:35:00Z">
-        <w:r>
-          <w:rPr>
-            <w:rFonts w:ascii="Arial" w:hAnsi="Arial" w:cs="Arial"/>
-          </w:rPr>
-          <w:t xml:space="preserve">the </w:t>
-        </w:r>
-        <w:r>
-          <w:rPr>
-            <w:rFonts w:ascii="Arial" w:hAnsi="Arial" w:cs="Arial"/>
-          </w:rPr>
-          <w:lastRenderedPageBreak/>
-          <w:t>identit</w:t>
-        </w:r>
-      </w:ins>
-      <w:ins w:id="165" w:author="Smith Vidaurre, Grace" w:date="2025-06-05T15:36:00Z" w16du:dateUtc="2025-06-05T19:36:00Z">
-        <w:r>
-          <w:rPr>
-            <w:rFonts w:ascii="Arial" w:hAnsi="Arial" w:cs="Arial"/>
-          </w:rPr>
-          <w:t xml:space="preserve">y </w:t>
-        </w:r>
-      </w:ins>
-      <w:ins w:id="166" w:author="Smith Vidaurre, Grace" w:date="2025-06-05T10:58:00Z" w16du:dateUtc="2025-06-05T14:58:00Z">
-        <w:r>
-          <w:rPr>
-            <w:rFonts w:ascii="Arial" w:hAnsi="Arial" w:cs="Arial"/>
-          </w:rPr>
-          <w:t>information we originally encoded</w:t>
-        </w:r>
-      </w:ins>
-      <w:ins w:id="167" w:author="Smith Vidaurre, Grace" w:date="2025-06-05T15:36:00Z" w16du:dateUtc="2025-06-05T19:36:00Z">
-        <w:r>
-          <w:rPr>
-            <w:rFonts w:ascii="Arial" w:hAnsi="Arial" w:cs="Arial"/>
-          </w:rPr>
-          <w:t xml:space="preserve"> in frequency modulation patterns</w:t>
-        </w:r>
-      </w:ins>
-      <w:ins w:id="168" w:author="Smith Vidaurre, Grace" w:date="2025-06-05T10:58:00Z" w16du:dateUtc="2025-06-05T14:58:00Z">
-        <w:r>
-          <w:rPr>
-            <w:rFonts w:ascii="Arial" w:hAnsi="Arial" w:cs="Arial"/>
-          </w:rPr>
-          <w:t>.</w:t>
-        </w:r>
-      </w:ins>
-      <w:ins w:id="169" w:author="Smith Vidaurre, Grace" w:date="2025-06-05T11:00:00Z" w16du:dateUtc="2025-06-05T15:00:00Z">
-        <w:r>
-          <w:rPr>
-            <w:rFonts w:ascii="Arial" w:hAnsi="Arial" w:cs="Arial"/>
-          </w:rPr>
-          <w:t xml:space="preserve"> Our new </w:t>
-        </w:r>
-      </w:ins>
-      <w:ins w:id="170" w:author="Smith Vidaurre, Grace" w:date="2025-06-04T11:10:00Z" w16du:dateUtc="2025-06-04T15:10:00Z">
-        <w:r>
-          <w:rPr>
-            <w:rFonts w:ascii="Arial" w:hAnsi="Arial" w:cs="Arial"/>
-          </w:rPr>
-          <w:t xml:space="preserve">pipeline </w:t>
-        </w:r>
-      </w:ins>
-      <w:ins w:id="171" w:author="Smith Vidaurre, Grace" w:date="2025-06-05T11:00:00Z" w16du:dateUtc="2025-06-05T15:00:00Z">
-        <w:r>
-          <w:rPr>
-            <w:rFonts w:ascii="Arial" w:hAnsi="Arial" w:cs="Arial"/>
-          </w:rPr>
-          <w:t xml:space="preserve">is available as an R package </w:t>
-        </w:r>
-      </w:ins>
-      <w:ins w:id="172" w:author="Smith Vidaurre, Grace" w:date="2025-06-05T15:36:00Z" w16du:dateUtc="2025-06-05T19:36:00Z">
-        <w:r>
-          <w:rPr>
-            <w:rFonts w:ascii="Arial" w:hAnsi="Arial" w:cs="Arial"/>
-          </w:rPr>
-          <w:t xml:space="preserve">and </w:t>
-        </w:r>
-      </w:ins>
-      <w:ins w:id="173" w:author="Smith Vidaurre, Grace" w:date="2025-06-04T11:10:00Z" w16du:dateUtc="2025-06-04T15:10:00Z">
-        <w:r>
-          <w:rPr>
-            <w:rFonts w:ascii="Arial" w:hAnsi="Arial" w:cs="Arial"/>
-          </w:rPr>
-          <w:t>creates synthetic vocalizations that can be represented as strings for computational efficiency</w:t>
-        </w:r>
-      </w:ins>
-      <w:ins w:id="174" w:author="Smith Vidaurre, Grace" w:date="2025-06-05T15:36:00Z" w16du:dateUtc="2025-06-05T19:36:00Z">
-        <w:r>
-          <w:rPr>
-            <w:rFonts w:ascii="Arial" w:hAnsi="Arial" w:cs="Arial"/>
-          </w:rPr>
-          <w:t>,</w:t>
-        </w:r>
-      </w:ins>
-      <w:ins w:id="175" w:author="Smith Vidaurre, Grace" w:date="2025-06-04T11:10:00Z" w16du:dateUtc="2025-06-04T15:10:00Z">
-        <w:r>
-          <w:rPr>
-            <w:rFonts w:ascii="Arial" w:hAnsi="Arial" w:cs="Arial"/>
-          </w:rPr>
-          <w:t xml:space="preserve"> while also producing </w:t>
-        </w:r>
-      </w:ins>
-      <w:ins w:id="176" w:author="Smith Vidaurre, Grace" w:date="2025-06-05T15:48:00Z" w16du:dateUtc="2025-06-05T19:48:00Z">
-        <w:r>
-          <w:rPr>
-            <w:rFonts w:ascii="Arial" w:hAnsi="Arial" w:cs="Arial"/>
-          </w:rPr>
-          <w:t xml:space="preserve">audio files of </w:t>
-        </w:r>
-      </w:ins>
-      <w:ins w:id="177" w:author="Smith Vidaurre, Grace" w:date="2025-06-04T11:10:00Z" w16du:dateUtc="2025-06-04T15:10:00Z">
-        <w:r>
-          <w:rPr>
-            <w:rFonts w:ascii="Arial" w:hAnsi="Arial" w:cs="Arial"/>
-          </w:rPr>
-          <w:t xml:space="preserve">synthetic </w:t>
-        </w:r>
-      </w:ins>
-      <w:ins w:id="178" w:author="Smith Vidaurre, Grace" w:date="2025-06-05T15:36:00Z" w16du:dateUtc="2025-06-05T19:36:00Z">
-        <w:r>
-          <w:rPr>
-            <w:rFonts w:ascii="Arial" w:hAnsi="Arial" w:cs="Arial"/>
-          </w:rPr>
-          <w:t>vocalizations</w:t>
-        </w:r>
-      </w:ins>
-      <w:ins w:id="179" w:author="Smith Vidaurre, Grace" w:date="2025-06-05T15:38:00Z" w16du:dateUtc="2025-06-05T19:38:00Z">
-        <w:r>
-          <w:rPr>
-            <w:rFonts w:ascii="Arial" w:hAnsi="Arial" w:cs="Arial"/>
-          </w:rPr>
-          <w:t xml:space="preserve"> that can be analyzed with</w:t>
-        </w:r>
-      </w:ins>
-      <w:ins w:id="180" w:author="Smith Vidaurre, Grace" w:date="2025-06-05T15:39:00Z" w16du:dateUtc="2025-06-05T19:39:00Z">
-        <w:r>
-          <w:rPr>
-            <w:rFonts w:ascii="Arial" w:hAnsi="Arial" w:cs="Arial"/>
-          </w:rPr>
-          <w:t xml:space="preserve"> analytical tools in </w:t>
-        </w:r>
-      </w:ins>
-      <w:ins w:id="181" w:author="Smith Vidaurre, Grace" w:date="2025-06-04T11:10:00Z" w16du:dateUtc="2025-06-04T15:10:00Z">
-        <w:r>
-          <w:rPr>
-            <w:rFonts w:ascii="Arial" w:hAnsi="Arial" w:cs="Arial"/>
-          </w:rPr>
-          <w:t xml:space="preserve">bioacoustics, situating its impact at the interface of </w:t>
-        </w:r>
-      </w:ins>
-      <w:ins w:id="182" w:author="Smith Vidaurre, Grace" w:date="2025-06-05T15:39:00Z" w16du:dateUtc="2025-06-05T19:39:00Z">
-        <w:r>
-          <w:rPr>
-            <w:rFonts w:ascii="Arial" w:hAnsi="Arial" w:cs="Arial"/>
-          </w:rPr>
-          <w:t>simulated</w:t>
-        </w:r>
-      </w:ins>
-      <w:ins w:id="183" w:author="Smith Vidaurre, Grace" w:date="2025-06-04T11:10:00Z" w16du:dateUtc="2025-06-04T15:10:00Z">
-        <w:r>
-          <w:rPr>
-            <w:rFonts w:ascii="Arial" w:hAnsi="Arial" w:cs="Arial"/>
-          </w:rPr>
-          <w:t xml:space="preserve"> and </w:t>
-        </w:r>
-      </w:ins>
-      <w:ins w:id="184" w:author="Smith Vidaurre, Grace" w:date="2025-06-05T15:39:00Z" w16du:dateUtc="2025-06-05T19:39:00Z">
-        <w:r>
-          <w:rPr>
-            <w:rFonts w:ascii="Arial" w:hAnsi="Arial" w:cs="Arial"/>
-          </w:rPr>
-          <w:t xml:space="preserve">empirical research in animal </w:t>
-        </w:r>
-      </w:ins>
-      <w:ins w:id="185" w:author="Smith Vidaurre, Grace" w:date="2025-06-04T11:10:00Z" w16du:dateUtc="2025-06-04T15:10:00Z">
-        <w:r>
-          <w:rPr>
-            <w:rFonts w:ascii="Arial" w:hAnsi="Arial" w:cs="Arial"/>
-          </w:rPr>
-          <w:t xml:space="preserve">communication. </w:t>
-        </w:r>
-      </w:ins>
-      <w:ins w:id="186" w:author="Smith Vidaurre, Grace" w:date="2025-06-05T15:40:00Z" w16du:dateUtc="2025-06-05T19:40:00Z">
-        <w:r>
-          <w:rPr>
-            <w:rFonts w:ascii="Arial" w:hAnsi="Arial" w:cs="Arial"/>
-          </w:rPr>
-          <w:t xml:space="preserve">Our </w:t>
-        </w:r>
-        <w:r>
-          <w:rPr>
-            <w:rFonts w:ascii="Arial" w:hAnsi="Arial" w:cs="Arial"/>
-          </w:rPr>
-          <w:t xml:space="preserve">approach to encoding identity information simulates </w:t>
-        </w:r>
-      </w:ins>
-      <w:ins w:id="187" w:author="Smith Vidaurre, Grace" w:date="2025-06-05T15:41:00Z" w16du:dateUtc="2025-06-05T19:41:00Z">
-        <w:r>
-          <w:rPr>
-            <w:rFonts w:ascii="Arial" w:hAnsi="Arial" w:cs="Arial"/>
-          </w:rPr>
-          <w:t>how</w:t>
-        </w:r>
-      </w:ins>
-      <w:ins w:id="188" w:author="Smith Vidaurre, Grace" w:date="2025-06-05T15:40:00Z" w16du:dateUtc="2025-06-05T19:40:00Z">
-        <w:r>
-          <w:rPr>
-            <w:rFonts w:ascii="Arial" w:hAnsi="Arial" w:cs="Arial"/>
-          </w:rPr>
-          <w:t xml:space="preserve"> animals can transmit identity inform</w:t>
-        </w:r>
-      </w:ins>
-      <w:ins w:id="189" w:author="Smith Vidaurre, Grace" w:date="2025-06-05T15:41:00Z" w16du:dateUtc="2025-06-05T19:41:00Z">
-        <w:r>
-          <w:rPr>
-            <w:rFonts w:ascii="Arial" w:hAnsi="Arial" w:cs="Arial"/>
-          </w:rPr>
-          <w:t>ation</w:t>
-        </w:r>
-      </w:ins>
-      <w:ins w:id="190" w:author="Smith Vidaurre, Grace" w:date="2025-06-05T15:42:00Z" w16du:dateUtc="2025-06-05T19:42:00Z">
-        <w:r>
-          <w:rPr>
-            <w:rFonts w:ascii="Arial" w:hAnsi="Arial" w:cs="Arial"/>
-          </w:rPr>
-          <w:t xml:space="preserve"> through vocal signals</w:t>
-        </w:r>
-      </w:ins>
-      <w:ins w:id="191" w:author="Smith Vidaurre, Grace" w:date="2025-06-05T15:41:00Z" w16du:dateUtc="2025-06-05T19:41:00Z">
-        <w:r>
-          <w:rPr>
-            <w:rFonts w:ascii="Arial" w:hAnsi="Arial" w:cs="Arial"/>
-          </w:rPr>
-          <w:t xml:space="preserve"> </w:t>
-        </w:r>
-      </w:ins>
-      <w:ins w:id="192" w:author="Smith Vidaurre, Grace" w:date="2025-06-05T15:42:00Z" w16du:dateUtc="2025-06-05T19:42:00Z">
-        <w:r>
-          <w:rPr>
-            <w:rFonts w:ascii="Arial" w:hAnsi="Arial" w:cs="Arial"/>
-          </w:rPr>
-          <w:t>in</w:t>
-        </w:r>
-      </w:ins>
-      <w:ins w:id="193" w:author="Smith Vidaurre, Grace" w:date="2025-06-05T15:41:00Z" w16du:dateUtc="2025-06-05T19:41:00Z">
-        <w:r>
-          <w:rPr>
-            <w:rFonts w:ascii="Arial" w:hAnsi="Arial" w:cs="Arial"/>
-          </w:rPr>
-          <w:t xml:space="preserve"> </w:t>
-        </w:r>
-      </w:ins>
-      <w:ins w:id="194" w:author="Smith Vidaurre, Grace" w:date="2025-06-05T15:40:00Z" w16du:dateUtc="2025-06-05T19:40:00Z">
-        <w:r>
-          <w:rPr>
-            <w:rFonts w:ascii="Arial" w:hAnsi="Arial" w:cs="Arial"/>
-          </w:rPr>
-          <w:t>complex multilevel</w:t>
-        </w:r>
-      </w:ins>
-      <w:ins w:id="195" w:author="Smith Vidaurre, Grace" w:date="2025-06-05T15:41:00Z" w16du:dateUtc="2025-06-05T19:41:00Z">
-        <w:r>
-          <w:rPr>
-            <w:rFonts w:ascii="Arial" w:hAnsi="Arial" w:cs="Arial"/>
-          </w:rPr>
-          <w:t xml:space="preserve"> societie</w:t>
-        </w:r>
-      </w:ins>
-      <w:ins w:id="196" w:author="Smith Vidaurre, Grace" w:date="2025-06-05T15:43:00Z" w16du:dateUtc="2025-06-05T19:43:00Z">
-        <w:r>
-          <w:rPr>
-            <w:rFonts w:ascii="Arial" w:hAnsi="Arial" w:cs="Arial"/>
-          </w:rPr>
-          <w:t>s</w:t>
-        </w:r>
-      </w:ins>
-      <w:ins w:id="197" w:author="Smith Vidaurre, Grace" w:date="2025-06-05T15:42:00Z" w16du:dateUtc="2025-06-05T19:42:00Z">
-        <w:r>
-          <w:rPr>
-            <w:rFonts w:ascii="Arial" w:hAnsi="Arial" w:cs="Arial"/>
-          </w:rPr>
-          <w:t xml:space="preserve">. Our tool </w:t>
-        </w:r>
-      </w:ins>
-      <w:ins w:id="198" w:author="Smith Vidaurre, Grace" w:date="2025-06-05T15:43:00Z" w16du:dateUtc="2025-06-05T19:43:00Z">
-        <w:r>
-          <w:rPr>
-            <w:rFonts w:ascii="Arial" w:hAnsi="Arial" w:cs="Arial"/>
-          </w:rPr>
-          <w:t>can benefit</w:t>
-        </w:r>
-      </w:ins>
-      <w:ins w:id="199" w:author="Smith Vidaurre, Grace" w:date="2025-06-05T15:42:00Z" w16du:dateUtc="2025-06-05T19:42:00Z">
-        <w:r>
-          <w:rPr>
-            <w:rFonts w:ascii="Arial" w:hAnsi="Arial" w:cs="Arial"/>
-          </w:rPr>
-          <w:t xml:space="preserve"> future </w:t>
-        </w:r>
-      </w:ins>
-      <w:ins w:id="200" w:author="Smith Vidaurre, Grace" w:date="2025-06-05T15:44:00Z" w16du:dateUtc="2025-06-05T19:44:00Z">
-        <w:r>
-          <w:rPr>
-            <w:rFonts w:ascii="Arial" w:hAnsi="Arial" w:cs="Arial"/>
-          </w:rPr>
-          <w:t xml:space="preserve">simulation-based and empirical </w:t>
-        </w:r>
-      </w:ins>
-      <w:ins w:id="201" w:author="Smith Vidaurre, Grace" w:date="2025-06-05T15:42:00Z" w16du:dateUtc="2025-06-05T19:42:00Z">
-        <w:r>
-          <w:rPr>
-            <w:rFonts w:ascii="Arial" w:hAnsi="Arial" w:cs="Arial"/>
-          </w:rPr>
-          <w:t xml:space="preserve">research </w:t>
-        </w:r>
-      </w:ins>
-      <w:ins w:id="202" w:author="Smith Vidaurre, Grace" w:date="2025-06-05T15:43:00Z" w16du:dateUtc="2025-06-05T19:43:00Z">
-        <w:r>
-          <w:rPr>
-            <w:rFonts w:ascii="Arial" w:hAnsi="Arial" w:cs="Arial"/>
-          </w:rPr>
-          <w:t xml:space="preserve">that </w:t>
-        </w:r>
-      </w:ins>
-      <w:ins w:id="203" w:author="Smith Vidaurre, Grace" w:date="2025-06-05T15:44:00Z" w16du:dateUtc="2025-06-05T19:44:00Z">
-        <w:r>
-          <w:rPr>
-            <w:rFonts w:ascii="Arial" w:hAnsi="Arial" w:cs="Arial"/>
-          </w:rPr>
-          <w:t>requires</w:t>
-        </w:r>
-      </w:ins>
-      <w:ins w:id="204" w:author="Smith Vidaurre, Grace" w:date="2025-06-05T15:43:00Z" w16du:dateUtc="2025-06-05T19:43:00Z">
-        <w:r>
-          <w:rPr>
-            <w:rFonts w:ascii="Arial" w:hAnsi="Arial" w:cs="Arial"/>
-          </w:rPr>
-          <w:t xml:space="preserve"> </w:t>
-        </w:r>
-      </w:ins>
-      <w:ins w:id="205" w:author="Smith Vidaurre, Grace" w:date="2025-06-05T15:44:00Z" w16du:dateUtc="2025-06-05T19:44:00Z">
-        <w:r>
-          <w:rPr>
-            <w:rFonts w:ascii="Arial" w:hAnsi="Arial" w:cs="Arial"/>
-          </w:rPr>
-          <w:t xml:space="preserve">controlling the types and amounts of identity information encoded in synthetic </w:t>
-        </w:r>
-      </w:ins>
-      <w:ins w:id="206" w:author="Smith Vidaurre, Grace" w:date="2025-06-05T15:43:00Z" w16du:dateUtc="2025-06-05T19:43:00Z">
-        <w:r>
-          <w:rPr>
-            <w:rFonts w:ascii="Arial" w:hAnsi="Arial" w:cs="Arial"/>
-          </w:rPr>
-          <w:t>voca</w:t>
-        </w:r>
-      </w:ins>
-      <w:ins w:id="207" w:author="Smith Vidaurre, Grace" w:date="2025-06-05T15:44:00Z" w16du:dateUtc="2025-06-05T19:44:00Z">
-        <w:r>
-          <w:rPr>
-            <w:rFonts w:ascii="Arial" w:hAnsi="Arial" w:cs="Arial"/>
-          </w:rPr>
-          <w:t>lizations</w:t>
-        </w:r>
-      </w:ins>
-      <w:ins w:id="208" w:author="Smith Vidaurre, Grace" w:date="2025-06-05T15:40:00Z" w16du:dateUtc="2025-06-05T19:40:00Z">
-        <w:r>
-          <w:rPr>
-            <w:rFonts w:ascii="Arial" w:hAnsi="Arial" w:cs="Arial"/>
-          </w:rPr>
-          <w:t>.</w:t>
-        </w:r>
-      </w:ins>
+          <w:rFonts w:ascii="Arial" w:hAnsi="Arial" w:cs="Arial"/>
+        </w:rPr>
+      </w:pPr>
+      <w:r>
+        <w:rPr>
+          <w:rFonts w:ascii="Arial" w:hAnsi="Arial" w:cs="Arial"/>
+        </w:rPr>
+        <w:t xml:space="preserve">Once strings were in Parson’s code, we converted each section of the vocalization into frequency anchors, measured in Hz. Each subcomponent of synthetic vocalization started at a randomly selected frequency between (TKTK range). </w:t>
+      </w:r>
+      <w:commentRangeStart w:id="151"/>
+      <w:commentRangeStart w:id="152"/>
+      <w:r>
+        <w:rPr>
+          <w:rFonts w:ascii="Arial" w:hAnsi="Arial" w:cs="Arial"/>
+        </w:rPr>
+        <w:t xml:space="preserve">This starting frequency served as a baseline for creating frequency anchors with Parson’s code, which determined if the next frequency anchor was greater than, less than, or the same as the frequency anchor before it. For example, if a synthetic vocalization started at 4000Hz and the first Parson’s code value is “constant”, then the next frequency anchor would also be 4000Hz. However, if the first Parson’s code was “up”, then the second frequency anchor would be 5000Hz. </w:t>
+      </w:r>
+      <w:commentRangeEnd w:id="151"/>
+      <w:r>
+        <w:rPr>
+          <w:rStyle w:val="CommentReference"/>
+        </w:rPr>
+        <w:commentReference w:id="151"/>
+      </w:r>
+      <w:commentRangeEnd w:id="152"/>
+      <w:r>
+        <w:rPr>
+          <w:rStyle w:val="CommentReference"/>
+        </w:rPr>
+        <w:commentReference w:id="152"/>
+      </w:r>
+      <w:r>
+        <w:rPr>
+          <w:rFonts w:ascii="Arial" w:hAnsi="Arial" w:cs="Arial"/>
+        </w:rPr>
+        <w:t xml:space="preserve">Frequency shifts were kept constant at </w:t>
+      </w:r>
+      <w:r>
+        <w:rPr>
+          <w:rFonts w:ascii="Arial" w:hAnsi="Arial" w:cs="Arial"/>
+        </w:rPr>
+        <w:lastRenderedPageBreak/>
+        <w:t xml:space="preserve">TKTK (I think 1000Hz). The starting frequency anchor was also used as a final frequency anchor in a vocalization subcomponent. Then, using the frequency anchors in each synthetic vocalization to guide frequency modulation patterns, we generated synthetic audio signals using the </w:t>
+      </w:r>
+      <w:proofErr w:type="spellStart"/>
+      <w:r>
+        <w:rPr>
+          <w:rFonts w:ascii="Arial" w:hAnsi="Arial" w:cs="Arial"/>
+        </w:rPr>
+        <w:t>Soundgen</w:t>
+      </w:r>
+      <w:proofErr w:type="spellEnd"/>
+      <w:r>
+        <w:rPr>
+          <w:rFonts w:ascii="Arial" w:hAnsi="Arial" w:cs="Arial"/>
+        </w:rPr>
+        <w:t xml:space="preserve"> package in R (CITE). The resulting synthetic vocalization files were saved as .wav files.  </w:t>
+      </w:r>
+    </w:p>
+    <w:p>
+      <w:pPr>
+        <w:spacing w:line="480" w:lineRule="auto"/>
+        <w:ind w:firstLine="720"/>
+        <w:rPr>
+          <w:rFonts w:ascii="Arial" w:hAnsi="Arial" w:cs="Arial"/>
+        </w:rPr>
+      </w:pPr>
+      <w:r>
+        <w:rPr>
+          <w:rFonts w:ascii="Arial" w:hAnsi="Arial" w:cs="Arial"/>
+        </w:rPr>
+        <w:t xml:space="preserve">We used R to generate strings and synthetic audio signals, using the </w:t>
+      </w:r>
+      <w:proofErr w:type="spellStart"/>
+      <w:r>
+        <w:rPr>
+          <w:rFonts w:ascii="Arial" w:hAnsi="Arial" w:cs="Arial"/>
+        </w:rPr>
+        <w:t>paRsynth</w:t>
+      </w:r>
+      <w:proofErr w:type="spellEnd"/>
+      <w:r>
+        <w:rPr>
+          <w:rFonts w:ascii="Arial" w:hAnsi="Arial" w:cs="Arial"/>
+        </w:rPr>
+        <w:t xml:space="preserve"> package (code found TKTK here).</w:t>
+      </w:r>
+    </w:p>
+    <w:p>
+      <w:pPr>
+        <w:spacing w:line="480" w:lineRule="auto"/>
+        <w:rPr>
+          <w:rFonts w:ascii="Arial" w:hAnsi="Arial" w:cs="Arial"/>
+        </w:rPr>
+      </w:pPr>
+    </w:p>
+    <w:p>
+      <w:pPr>
+        <w:spacing w:line="480" w:lineRule="auto"/>
+        <w:rPr>
+          <w:rFonts w:ascii="Arial" w:hAnsi="Arial" w:cs="Arial"/>
+          <w:i/>
+          <w:iCs/>
+        </w:rPr>
+      </w:pPr>
+      <w:r>
+        <w:rPr>
+          <w:rFonts w:ascii="Arial" w:hAnsi="Arial" w:cs="Arial"/>
+          <w:i/>
+          <w:iCs/>
+        </w:rPr>
+        <w:t>Detecting Synthetic Group and Individual Information in Synthetic Datasets</w:t>
+      </w:r>
+    </w:p>
+    <w:p>
+      <w:pPr>
+        <w:spacing w:line="480" w:lineRule="auto"/>
+        <w:ind w:firstLine="720"/>
+        <w:rPr>
+          <w:rFonts w:ascii="Arial" w:hAnsi="Arial" w:cs="Arial"/>
+        </w:rPr>
+      </w:pPr>
+      <w:r>
+        <w:rPr>
+          <w:rFonts w:ascii="Arial" w:hAnsi="Arial" w:cs="Arial"/>
+        </w:rPr>
+        <w:t xml:space="preserve">Using the process described above, we created two synthetic data sets: one that created </w:t>
+      </w:r>
+      <w:commentRangeStart w:id="153"/>
+      <w:commentRangeStart w:id="154"/>
+      <w:r>
+        <w:rPr>
+          <w:rFonts w:ascii="Arial" w:hAnsi="Arial" w:cs="Arial"/>
+        </w:rPr>
+        <w:t xml:space="preserve">vocalizations </w:t>
+      </w:r>
+      <w:commentRangeEnd w:id="153"/>
+      <w:r>
+        <w:rPr>
+          <w:rStyle w:val="CommentReference"/>
+        </w:rPr>
+        <w:commentReference w:id="153"/>
+      </w:r>
+      <w:commentRangeEnd w:id="154"/>
+      <w:r>
+        <w:rPr>
+          <w:rStyle w:val="CommentReference"/>
+        </w:rPr>
+        <w:commentReference w:id="154"/>
+      </w:r>
+      <w:r>
+        <w:rPr>
+          <w:rFonts w:ascii="Arial" w:hAnsi="Arial" w:cs="Arial"/>
+        </w:rPr>
+        <w:t>with more group membership information than individual information encoded (</w:t>
+      </w:r>
+      <w:r>
+        <w:rPr>
+          <w:rFonts w:ascii="Arial" w:hAnsi="Arial" w:cs="Arial"/>
+        </w:rPr>
+        <w:t>g</w:t>
+      </w:r>
+      <w:r>
+        <w:rPr>
+          <w:rFonts w:ascii="Arial" w:hAnsi="Arial" w:cs="Arial"/>
+        </w:rPr>
+        <w:t xml:space="preserve">roup </w:t>
+      </w:r>
+      <w:r>
+        <w:rPr>
+          <w:rFonts w:ascii="Arial" w:hAnsi="Arial" w:cs="Arial"/>
+        </w:rPr>
+        <w:t>specific</w:t>
+      </w:r>
+      <w:r>
+        <w:rPr>
+          <w:rFonts w:ascii="Arial" w:hAnsi="Arial" w:cs="Arial"/>
+        </w:rPr>
+        <w:t xml:space="preserve"> </w:t>
+      </w:r>
+      <w:r>
+        <w:rPr>
+          <w:rFonts w:ascii="Arial" w:hAnsi="Arial" w:cs="Arial"/>
+        </w:rPr>
+        <w:t>i</w:t>
+      </w:r>
+      <w:r>
+        <w:rPr>
+          <w:rFonts w:ascii="Arial" w:hAnsi="Arial" w:cs="Arial"/>
+        </w:rPr>
+        <w:t xml:space="preserve">nformation </w:t>
+      </w:r>
+      <w:r>
+        <w:rPr>
+          <w:rFonts w:ascii="Arial" w:hAnsi="Arial" w:cs="Arial"/>
+        </w:rPr>
+        <w:t>d</w:t>
+      </w:r>
+      <w:r>
+        <w:rPr>
+          <w:rFonts w:ascii="Arial" w:hAnsi="Arial" w:cs="Arial"/>
+        </w:rPr>
+        <w:t xml:space="preserve">ataset: henceforth the </w:t>
+      </w:r>
+      <w:r>
+        <w:rPr>
+          <w:rFonts w:ascii="Arial" w:hAnsi="Arial" w:cs="Arial"/>
+        </w:rPr>
+        <w:t>group specific</w:t>
+      </w:r>
+      <w:r>
+        <w:rPr>
+          <w:rFonts w:ascii="Arial" w:hAnsi="Arial" w:cs="Arial"/>
+        </w:rPr>
+        <w:t xml:space="preserve"> dataset), and one that created </w:t>
+      </w:r>
+      <w:commentRangeStart w:id="155"/>
+      <w:r>
+        <w:rPr>
+          <w:rFonts w:ascii="Arial" w:hAnsi="Arial" w:cs="Arial"/>
+        </w:rPr>
+        <w:t xml:space="preserve">character strings </w:t>
+      </w:r>
+      <w:commentRangeEnd w:id="155"/>
+      <w:r>
+        <w:rPr>
+          <w:rStyle w:val="CommentReference"/>
+        </w:rPr>
+        <w:commentReference w:id="155"/>
+      </w:r>
+      <w:r>
+        <w:rPr>
+          <w:rFonts w:ascii="Arial" w:hAnsi="Arial" w:cs="Arial"/>
+        </w:rPr>
+        <w:t>with more individual information than group membership information encoded (</w:t>
+      </w:r>
+      <w:r>
+        <w:rPr>
+          <w:rFonts w:ascii="Arial" w:hAnsi="Arial" w:cs="Arial"/>
+        </w:rPr>
+        <w:t>individual identity information dataset</w:t>
+      </w:r>
+      <w:r>
+        <w:rPr>
+          <w:rFonts w:ascii="Arial" w:hAnsi="Arial" w:cs="Arial"/>
+        </w:rPr>
+        <w:t xml:space="preserve">; </w:t>
+      </w:r>
+      <w:commentRangeStart w:id="156"/>
+      <w:commentRangeEnd w:id="156"/>
+      <w:r>
+        <w:rPr>
+          <w:rStyle w:val="CommentReference"/>
+        </w:rPr>
+        <w:commentReference w:id="156"/>
+      </w:r>
+      <w:r>
+        <w:rPr>
+          <w:rFonts w:ascii="Arial" w:hAnsi="Arial" w:cs="Arial"/>
+        </w:rPr>
+        <w:t xml:space="preserve">henceforth the </w:t>
+      </w:r>
+      <w:r>
+        <w:rPr>
+          <w:rFonts w:ascii="Arial" w:hAnsi="Arial" w:cs="Arial"/>
+        </w:rPr>
+        <w:t>individual identity</w:t>
+      </w:r>
+      <w:r>
+        <w:rPr>
+          <w:rFonts w:ascii="Arial" w:hAnsi="Arial" w:cs="Arial"/>
+        </w:rPr>
+        <w:t xml:space="preserve"> dataset). In the </w:t>
+      </w:r>
+      <w:r>
+        <w:rPr>
+          <w:rFonts w:ascii="Arial" w:hAnsi="Arial" w:cs="Arial"/>
+        </w:rPr>
+        <w:t>group specific dataset</w:t>
+      </w:r>
+      <w:r>
+        <w:rPr>
+          <w:rFonts w:ascii="Arial" w:hAnsi="Arial" w:cs="Arial"/>
+        </w:rPr>
+        <w:t xml:space="preserve">, individual information was set to a character length of 4 characters, and group member information was set to </w:t>
+      </w:r>
+      <w:commentRangeStart w:id="157"/>
+      <w:r>
+        <w:rPr>
+          <w:rFonts w:ascii="Arial" w:hAnsi="Arial" w:cs="Arial"/>
+        </w:rPr>
+        <w:t>a character length of 8 character</w:t>
+      </w:r>
+      <w:commentRangeEnd w:id="157"/>
+      <w:r>
+        <w:rPr>
+          <w:rStyle w:val="CommentReference"/>
+        </w:rPr>
+        <w:commentReference w:id="157"/>
+      </w:r>
+      <w:r>
+        <w:rPr>
+          <w:rFonts w:ascii="Arial" w:hAnsi="Arial" w:cs="Arial"/>
+        </w:rPr>
+        <w:t xml:space="preserve">. In the </w:t>
+      </w:r>
+      <w:r>
+        <w:rPr>
+          <w:rFonts w:ascii="Arial" w:hAnsi="Arial" w:cs="Arial"/>
+        </w:rPr>
+        <w:t>individual identity dataset</w:t>
+      </w:r>
+      <w:r>
+        <w:rPr>
+          <w:rFonts w:ascii="Arial" w:hAnsi="Arial" w:cs="Arial"/>
+        </w:rPr>
+        <w:t xml:space="preserve">, individual information was set to a </w:t>
+      </w:r>
+      <w:commentRangeStart w:id="158"/>
+      <w:r>
+        <w:rPr>
+          <w:rFonts w:ascii="Arial" w:hAnsi="Arial" w:cs="Arial"/>
+        </w:rPr>
+        <w:t>character length of 8 characters</w:t>
+      </w:r>
+      <w:commentRangeEnd w:id="158"/>
+      <w:r>
+        <w:rPr>
+          <w:rStyle w:val="CommentReference"/>
+        </w:rPr>
+        <w:commentReference w:id="158"/>
+      </w:r>
+      <w:r>
+        <w:rPr>
+          <w:rFonts w:ascii="Arial" w:hAnsi="Arial" w:cs="Arial"/>
+        </w:rPr>
+        <w:t xml:space="preserve">, and group information was set to a character length of 4 characters. For both datasets, there were 5 groups with 10 individuals per group, with 5 unique calls generated per individual. </w:t>
+      </w:r>
+    </w:p>
+    <w:p>
+      <w:pPr>
+        <w:spacing w:line="480" w:lineRule="auto"/>
+        <w:ind w:firstLine="720"/>
+        <w:rPr>
+          <w:rFonts w:ascii="Arial" w:hAnsi="Arial" w:cs="Arial"/>
+        </w:rPr>
+      </w:pPr>
+      <w:r>
+        <w:rPr>
+          <w:rFonts w:ascii="Arial" w:hAnsi="Arial" w:cs="Arial"/>
+        </w:rPr>
+        <w:t xml:space="preserve">After generating synthetic signals for these datasets, we used the </w:t>
+      </w:r>
+      <w:proofErr w:type="spellStart"/>
+      <w:r>
+        <w:rPr>
+          <w:rFonts w:ascii="Arial" w:hAnsi="Arial" w:cs="Arial"/>
+        </w:rPr>
+        <w:t>soundgen</w:t>
+      </w:r>
+      <w:proofErr w:type="spellEnd"/>
+      <w:r>
+        <w:rPr>
+          <w:rFonts w:ascii="Arial" w:hAnsi="Arial" w:cs="Arial"/>
+        </w:rPr>
+        <w:t xml:space="preserve"> package (TKTK citation) to convert the .wav files to spectrograms (see example of calls in Figures 2B and 3B). To validate that the group and individual information we specified </w:t>
+      </w:r>
+      <w:r>
+        <w:rPr>
+          <w:rFonts w:ascii="Arial" w:hAnsi="Arial" w:cs="Arial"/>
+        </w:rPr>
+        <w:lastRenderedPageBreak/>
+        <w:t xml:space="preserve">in the character strings could be recovered from the generated frequency signals, we performed spectrographic cross-correlation on each dataset (SPCC; </w:t>
+      </w:r>
+      <w:r>
+        <w:rPr>
+          <w:rFonts w:ascii="Arial" w:hAnsi="Arial" w:cs="Arial"/>
+        </w:rPr>
+        <w:fldChar w:fldCharType="begin"/>
+      </w:r>
+      <w:r>
+        <w:rPr>
+          <w:rFonts w:ascii="Arial" w:hAnsi="Arial" w:cs="Arial"/>
+        </w:rPr>
+        <w:instrText xml:space="preserve"> ADDIN ZOTERO_ITEM CSL_CITATION {"citationID":"2alP2xFJ","properties":{"formattedCitation":"(Clark et al., 1987)","plainCitation":"(Clark et al., 1987)","dontUpdate":true,"noteIndex":0},"citationItems":[{"id":606,"uris":["http://zotero.org/groups/5786507/items/GR5UUI5P"],"itemData":{"id":606,"type":"article-journal","abstract":"Sound spectrograms have been a traditional method for comparing animal vocalizations and demonstrating their similarities or differences, but quantification of the comparative process has been difficult. This lack of quantification has hindered progress in documenting the timing and degree of song development in song birds. With this in mind, computer-based methods for sound comparison and sound averaging were developed. These methods utilize a numerical representation of a sound's frequency-time structure to compute a similarity value between any two sounds and an average sound spectrogram for a set of sounds. These analytical techniques were applied to an analysis of song notes of the swamp sparrow (Melospiza georgiana). The results demonstrate the usefulness of the methods and reveal new details in the description of the swamp sparrow's set of species-universal note types and in the decrease of note variability during the course of developmental transitions from subsong, through plastic song to song crystallization.","container-title":"Ethology","DOI":"10.1111/j.1439-0310.1987.tb00676.x","ISSN":"1439-0310","issue":"2","language":"en","license":"1987 Blackwell Verlag GmbH","note":"_eprint: https://onlinelibrary.wiley.com/doi/pdf/10.1111/j.1439-0310.1987.tb00676.x","page":"101-115","source":"Wiley Online Library","title":"Quantitative Analysis of Animal Vocal Phonology: an Application to Swamp Sparrow Song","title-short":"Quantitative Analysis of Animal Vocal Phonology","volume":"76","author":[{"family":"Clark","given":"Christopher W."},{"family":"Marler","given":"Peter"},{"family":"Beeman","given":"Kim"}],"issued":{"date-parts":[["1987"]]}}}],"schema":"https://github.com/citation-style-language/schema/raw/master/csl-citation.json"} </w:instrText>
+      </w:r>
+      <w:r>
+        <w:rPr>
+          <w:rFonts w:ascii="Arial" w:hAnsi="Arial" w:cs="Arial"/>
+        </w:rPr>
+        <w:fldChar w:fldCharType="separate"/>
+      </w:r>
+      <w:r>
+        <w:rPr>
+          <w:rFonts w:ascii="Arial" w:hAnsi="Arial" w:cs="Arial"/>
+        </w:rPr>
+        <w:t>Clark et al., 1987</w:t>
+      </w:r>
+      <w:r>
+        <w:rPr>
+          <w:rFonts w:ascii="Arial" w:hAnsi="Arial" w:cs="Arial"/>
+        </w:rPr>
+        <w:fldChar w:fldCharType="end"/>
+      </w:r>
+      <w:r>
+        <w:rPr>
+          <w:rFonts w:ascii="Arial" w:hAnsi="Arial" w:cs="Arial"/>
+        </w:rPr>
+        <w:t xml:space="preserve">) using the </w:t>
+      </w:r>
+      <w:proofErr w:type="spellStart"/>
+      <w:r>
+        <w:rPr>
+          <w:rFonts w:ascii="Arial" w:hAnsi="Arial" w:cs="Arial"/>
+        </w:rPr>
+        <w:t>warbleR</w:t>
+      </w:r>
+      <w:proofErr w:type="spellEnd"/>
+      <w:r>
+        <w:rPr>
+          <w:rFonts w:ascii="Arial" w:hAnsi="Arial" w:cs="Arial"/>
+        </w:rPr>
+        <w:t xml:space="preserve"> package. We performed SPCC with a Hanning window, a window length of 512 samples, and a window overlap of 90 samples. We used a Pearson’s correlation method and a bandpass filter of 0 to 20 kHz. </w:t>
+      </w:r>
+    </w:p>
+    <w:p>
+      <w:pPr>
+        <w:spacing w:line="480" w:lineRule="auto"/>
+        <w:ind w:firstLine="720"/>
+        <w:rPr>
+          <w:rFonts w:ascii="Arial" w:hAnsi="Arial" w:cs="Arial"/>
+        </w:rPr>
+      </w:pPr>
+      <w:r>
+        <w:rPr>
+          <w:rFonts w:ascii="Arial" w:hAnsi="Arial" w:cs="Arial"/>
+        </w:rPr>
+        <w:t xml:space="preserve">To assess hierarchical mapping patterns of our two datasets, we used non-metric multidimensional scaling (MDS) to reduce the dimensionality of the SPCC matrix for each dataset. We performed MDS over 15 dimensions so that the stress of the model was TKTK (less than 5). From these results, we two generated low-dimensional acoustic space plots for each dataset, one visualizing the acoustic space between groups and one visualizing the acoustic space between individuals. In doing this for each dataset, we can compare how well the </w:t>
+      </w:r>
+      <w:r>
+        <w:rPr>
+          <w:rFonts w:ascii="Arial" w:hAnsi="Arial" w:cs="Arial"/>
+        </w:rPr>
+        <w:t>group specific</w:t>
+      </w:r>
+      <w:r>
+        <w:rPr>
+          <w:rFonts w:ascii="Arial" w:hAnsi="Arial" w:cs="Arial"/>
+        </w:rPr>
+        <w:t xml:space="preserve"> dataset encodes information at the group level compared to the individual level and vice versa for the </w:t>
+      </w:r>
+      <w:r>
+        <w:rPr>
+          <w:rFonts w:ascii="Arial" w:hAnsi="Arial" w:cs="Arial"/>
+        </w:rPr>
+        <w:t>individual identity dataset</w:t>
+      </w:r>
+      <w:r>
+        <w:rPr>
+          <w:rFonts w:ascii="Arial" w:hAnsi="Arial" w:cs="Arial"/>
+        </w:rPr>
+        <w:t xml:space="preserve">. </w:t>
+      </w:r>
+    </w:p>
+    <w:p>
+      <w:pPr>
+        <w:spacing w:line="480" w:lineRule="auto"/>
+        <w:rPr>
+          <w:rFonts w:ascii="Arial" w:hAnsi="Arial" w:cs="Arial"/>
+          <w:i/>
+          <w:iCs/>
+        </w:rPr>
+      </w:pPr>
+    </w:p>
+    <w:p>
+      <w:pPr>
+        <w:spacing w:line="480" w:lineRule="auto"/>
+        <w:rPr>
+          <w:rFonts w:ascii="Arial" w:hAnsi="Arial" w:cs="Arial"/>
+          <w:i/>
+          <w:iCs/>
+        </w:rPr>
+      </w:pPr>
+      <w:r>
+        <w:rPr>
+          <w:rFonts w:ascii="Arial" w:hAnsi="Arial" w:cs="Arial"/>
+          <w:i/>
+          <w:iCs/>
+        </w:rPr>
+        <w:t xml:space="preserve">Synthetic Experiments to Assess Accuracy of Information Encoding and Decoding Across a Range of Social </w:t>
+      </w:r>
+      <w:r>
+        <w:rPr>
+          <w:rFonts w:ascii="Arial" w:hAnsi="Arial" w:cs="Arial"/>
+          <w:i/>
+          <w:iCs/>
+        </w:rPr>
+        <w:t xml:space="preserve">Conditions </w:t>
+      </w:r>
     </w:p>
     <w:p>
       <w:pPr>
         <w:pStyle w:val="NoSpacing"/>
         <w:spacing w:line="480" w:lineRule="auto"/>
         <w:rPr>
-          <w:del w:id="209" w:author="Smith Vidaurre, Grace" w:date="2025-06-05T15:45:00Z" w16du:dateUtc="2025-06-05T19:45:00Z"/>
-          <w:rFonts w:ascii="Arial" w:hAnsi="Arial" w:cs="Arial"/>
-          <w:b/>
-          <w:bCs/>
-        </w:rPr>
-      </w:pPr>
-    </w:p>
-    <w:p>
-      <w:pPr>
+          <w:rFonts w:ascii="Arial" w:hAnsi="Arial" w:cs="Arial"/>
+        </w:rPr>
+      </w:pPr>
+      <w:r>
+        <w:rPr>
+          <w:rFonts w:ascii="Arial" w:hAnsi="Arial" w:cs="Arial"/>
+        </w:rPr>
+        <w:tab/>
+      </w:r>
+      <w:r>
+        <w:rPr>
+          <w:rFonts w:ascii="Arial" w:hAnsi="Arial" w:cs="Arial"/>
+        </w:rPr>
+        <w:t xml:space="preserve"> </w:t>
+      </w:r>
+      <w:r>
+        <w:rPr>
+          <w:rFonts w:ascii="Arial" w:hAnsi="Arial" w:cs="Arial"/>
+        </w:rPr>
+        <w:t xml:space="preserve">To </w:t>
+      </w:r>
+      <w:r>
+        <w:rPr>
+          <w:rFonts w:ascii="Arial" w:hAnsi="Arial" w:cs="Arial"/>
+        </w:rPr>
+        <w:t>assess</w:t>
+      </w:r>
+      <w:r>
+        <w:rPr>
+          <w:rFonts w:ascii="Arial" w:hAnsi="Arial" w:cs="Arial"/>
+        </w:rPr>
+        <w:t xml:space="preserve"> how </w:t>
+      </w:r>
+      <w:r>
+        <w:rPr>
+          <w:rFonts w:ascii="Arial" w:hAnsi="Arial" w:cs="Arial"/>
+        </w:rPr>
+        <w:t>accurately</w:t>
+      </w:r>
+      <w:r>
+        <w:rPr>
+          <w:rFonts w:ascii="Arial" w:hAnsi="Arial" w:cs="Arial"/>
+        </w:rPr>
+        <w:t xml:space="preserve"> </w:t>
+      </w:r>
+      <w:r>
+        <w:rPr>
+          <w:rFonts w:ascii="Arial" w:hAnsi="Arial" w:cs="Arial"/>
+        </w:rPr>
+        <w:t xml:space="preserve">varying amounts of group and individual </w:t>
+      </w:r>
+      <w:r>
+        <w:rPr>
+          <w:rFonts w:ascii="Arial" w:hAnsi="Arial" w:cs="Arial"/>
+        </w:rPr>
+        <w:t xml:space="preserve">information could be recovered </w:t>
+      </w:r>
+      <w:r>
+        <w:rPr>
+          <w:rFonts w:ascii="Arial" w:hAnsi="Arial" w:cs="Arial"/>
+        </w:rPr>
+        <w:t>from synthetic signals,</w:t>
+      </w:r>
+      <w:r>
+        <w:rPr>
+          <w:rFonts w:ascii="Arial" w:hAnsi="Arial" w:cs="Arial"/>
+        </w:rPr>
+        <w:t xml:space="preserve"> we created </w:t>
+      </w:r>
+      <w:r>
+        <w:rPr>
+          <w:rFonts w:ascii="Arial" w:hAnsi="Arial" w:cs="Arial"/>
+        </w:rPr>
+        <w:t xml:space="preserve">synthetic data sets across 16 treatments that varied over social environment characteristics and information encoding rules. </w:t>
+      </w:r>
+      <w:commentRangeStart w:id="159"/>
+      <w:r>
+        <w:rPr>
+          <w:rFonts w:ascii="Arial" w:hAnsi="Arial" w:cs="Arial"/>
+        </w:rPr>
+        <w:t>We varied social environment characteristics represented information signaling changes that happen in socially sparse vs socially dense signaling environments</w:t>
+      </w:r>
+      <w:commentRangeEnd w:id="159"/>
+      <w:r>
+        <w:rPr>
+          <w:rStyle w:val="CommentReference"/>
+        </w:rPr>
+        <w:commentReference w:id="159"/>
+      </w:r>
+      <w:r>
+        <w:rPr>
+          <w:rFonts w:ascii="Arial" w:hAnsi="Arial" w:cs="Arial"/>
+        </w:rPr>
+        <w:t xml:space="preserve">. We achieved this by creating four social conditions: 2 groups with 2 individuals per group, 4 </w:t>
+      </w:r>
+      <w:r>
+        <w:rPr>
+          <w:rFonts w:ascii="Arial" w:hAnsi="Arial" w:cs="Arial"/>
+        </w:rPr>
+        <w:lastRenderedPageBreak/>
+        <w:t xml:space="preserve">groups with 4 individuals per group, 6 groups with 6 individuals per group, and 8 groups with 8 individuals per group. We also varied the proportion of group information to individual information encoded in the signal, with four categories: 0 (representing all individual information and no group information), 1/3, 2/3, and 1 (representing all group information and no individual information. We iterated over each treatment 10 times, generating 10 unique synthetic datasets per treatment. </w:t>
+      </w:r>
+    </w:p>
+    <w:p>
+      <w:pPr>
+        <w:pStyle w:val="NoSpacing"/>
         <w:spacing w:line="480" w:lineRule="auto"/>
         <w:rPr>
           <w:rFonts w:ascii="Arial" w:hAnsi="Arial" w:cs="Arial"/>
         </w:rPr>
       </w:pPr>
-    </w:p>
-    <w:p>
-      <w:pPr>
+      <w:r>
+        <w:rPr>
+          <w:rFonts w:ascii="Arial" w:hAnsi="Arial" w:cs="Arial"/>
+        </w:rPr>
+        <w:tab/>
+        <w:t xml:space="preserve">Once these synthetic datasets were created, we used traditional bioacoustics tools to decode information encoded at the group and individual level. </w:t>
+      </w:r>
+      <w:proofErr w:type="gramStart"/>
+      <w:r>
+        <w:rPr>
+          <w:rFonts w:ascii="Arial" w:hAnsi="Arial" w:cs="Arial"/>
+        </w:rPr>
+        <w:t>Similar to</w:t>
+      </w:r>
+      <w:proofErr w:type="gramEnd"/>
+      <w:r>
+        <w:rPr>
+          <w:rFonts w:ascii="Arial" w:hAnsi="Arial" w:cs="Arial"/>
+        </w:rPr>
+        <w:t xml:space="preserve"> the datasets above, we performed SPCC. We also calculated the edit distance for the original strings. After these calculations, we performed Multidimensional Scaling on both the SPCC and edit distance matrices, then performed k-means clustering, randomly selecting 1 call per individual per group, to ensure that call exemplars per class matched between social levels. From this, we were able to calculate the accuracy of detecting information at the group and individual levels from vocalizations represented as character strings (edit distance pipeline) or synthetic audio files (tradition </w:t>
+      </w:r>
+      <w:r>
+        <w:rPr>
+          <w:rFonts w:ascii="Arial" w:hAnsi="Arial" w:cs="Arial"/>
+        </w:rPr>
+        <w:t>bioacoustics</w:t>
+      </w:r>
+      <w:r>
+        <w:rPr>
+          <w:rFonts w:ascii="Arial" w:hAnsi="Arial" w:cs="Arial"/>
+        </w:rPr>
+        <w:t xml:space="preserve"> </w:t>
+      </w:r>
+      <w:r>
+        <w:rPr>
+          <w:rFonts w:ascii="Arial" w:hAnsi="Arial" w:cs="Arial"/>
+        </w:rPr>
+        <w:t>pipeline</w:t>
+      </w:r>
+      <w:r>
+        <w:rPr>
+          <w:rFonts w:ascii="Arial" w:hAnsi="Arial" w:cs="Arial"/>
+        </w:rPr>
+        <w:t xml:space="preserve"> SPCC). Edit distance is a baseline for information detection because the strings are the original place where information was encoded at either social level. We can then compare the SPCC accuracy to edit distance, to assess how well we can detect the information originally encoded from the audio file representation.  </w:t>
+      </w:r>
+    </w:p>
+    <w:p>
+      <w:pPr>
+        <w:pStyle w:val="NoSpacing"/>
         <w:spacing w:line="480" w:lineRule="auto"/>
         <w:rPr>
-          <w:rFonts w:ascii="Arial" w:hAnsi="Arial" w:cs="Arial"/>
-        </w:rPr>
-      </w:pPr>
-      <w:commentRangeStart w:id="210"/>
-      <w:r>
-        <w:rPr>
-          <w:rFonts w:ascii="Arial" w:hAnsi="Arial" w:cs="Arial"/>
-          <w:b/>
-          <w:bCs/>
-        </w:rPr>
-        <w:t xml:space="preserve">Materials and </w:t>
-      </w:r>
-      <w:commentRangeStart w:id="211"/>
-      <w:r>
-        <w:rPr>
-          <w:rFonts w:ascii="Arial" w:hAnsi="Arial" w:cs="Arial"/>
-          <w:b/>
-          <w:bCs/>
-        </w:rPr>
-        <w:t>Methods</w:t>
-      </w:r>
-      <w:commentRangeEnd w:id="211"/>
-      <w:r>
-        <w:rPr>
-          <w:rStyle w:val="CommentReference"/>
-        </w:rPr>
-        <w:commentReference w:id="211"/>
-      </w:r>
-      <w:r>
-        <w:rPr>
-          <w:rFonts w:ascii="Arial" w:hAnsi="Arial" w:cs="Arial"/>
-        </w:rPr>
-        <w:t>:</w:t>
-      </w:r>
-      <w:commentRangeEnd w:id="210"/>
-      <w:r>
-        <w:rPr>
-          <w:rStyle w:val="CommentReference"/>
-        </w:rPr>
-        <w:commentReference w:id="210"/>
-      </w:r>
-    </w:p>
-    <w:p>
-      <w:pPr>
+          <w:ins w:id="160" w:author="Smith Vidaurre, Grace" w:date="2025-05-28T19:06:00Z" w16du:dateUtc="2025-05-28T23:06:00Z"/>
+          <w:rFonts w:ascii="Arial" w:hAnsi="Arial" w:cs="Arial"/>
+        </w:rPr>
+      </w:pPr>
+      <w:r>
+        <w:rPr>
+          <w:rFonts w:ascii="Arial" w:hAnsi="Arial" w:cs="Arial"/>
+        </w:rPr>
+        <w:tab/>
+        <w:t>TKTK paragraph about effect size calculations</w:t>
+      </w:r>
+      <w:r>
+        <w:rPr>
+          <w:rFonts w:ascii="Arial" w:hAnsi="Arial" w:cs="Arial"/>
+        </w:rPr>
+        <w:t xml:space="preserve">. Include package information in R. Make sure to address the warnings in the code output and the density plots (supplemental) that address these. </w:t>
+      </w:r>
+    </w:p>
+    <w:p>
+      <w:pPr>
+        <w:pStyle w:val="NoSpacing"/>
         <w:spacing w:line="480" w:lineRule="auto"/>
         <w:rPr>
-          <w:rFonts w:ascii="Arial" w:hAnsi="Arial" w:cs="Arial"/>
-          <w:i/>
-          <w:iCs/>
-        </w:rPr>
-      </w:pPr>
-      <w:r>
-        <w:rPr>
-          <w:rFonts w:ascii="Arial" w:hAnsi="Arial" w:cs="Arial"/>
-          <w:i/>
-          <w:iCs/>
-        </w:rPr>
-        <w:t>Encoding Group and Individual Identity Information in Signals</w:t>
-      </w:r>
-    </w:p>
-    <w:p>
-      <w:pPr>
-        <w:spacing w:line="480" w:lineRule="auto"/>
-        <w:rPr>
-          <w:rFonts w:ascii="Arial" w:hAnsi="Arial" w:cs="Arial"/>
-        </w:rPr>
-      </w:pPr>
-      <w:r>
-        <w:rPr>
-          <w:rFonts w:ascii="Arial" w:hAnsi="Arial" w:cs="Arial"/>
-        </w:rPr>
-        <w:tab/>
-        <w:t xml:space="preserve">First, using R (TKTK citation), we generated character strings to represent synthetic vocal identity signals. Using character strings to represent vocal information is computationally efficient for many purposes, including simulations, like agent-based modeling. Character strings </w:t>
-      </w:r>
-      <w:r>
-        <w:rPr>
-          <w:rFonts w:ascii="Arial" w:hAnsi="Arial" w:cs="Arial"/>
-        </w:rPr>
-        <w:t>comprise</w:t>
-      </w:r>
-      <w:r>
-        <w:rPr>
-          <w:rFonts w:ascii="Arial" w:hAnsi="Arial" w:cs="Arial"/>
-        </w:rPr>
-        <w:t xml:space="preserve"> </w:t>
-      </w:r>
-      <w:commentRangeStart w:id="212"/>
-      <w:commentRangeStart w:id="213"/>
-      <w:r>
-        <w:rPr>
-          <w:rFonts w:ascii="Arial" w:hAnsi="Arial" w:cs="Arial"/>
-        </w:rPr>
-        <w:t xml:space="preserve">5 components (Figure 1): </w:t>
-      </w:r>
-      <w:commentRangeEnd w:id="212"/>
-      <w:r>
-        <w:rPr>
-          <w:rStyle w:val="CommentReference"/>
-        </w:rPr>
-        <w:commentReference w:id="212"/>
-      </w:r>
-      <w:commentRangeEnd w:id="213"/>
-      <w:r>
-        <w:rPr>
-          <w:rStyle w:val="CommentReference"/>
-        </w:rPr>
-        <w:commentReference w:id="213"/>
-      </w:r>
-      <w:r>
-        <w:rPr>
-          <w:rFonts w:ascii="Arial" w:hAnsi="Arial" w:cs="Arial"/>
-        </w:rPr>
-        <w:t xml:space="preserve">a global head (a string of characters shared across all individuals; TKTK character length), a section of group information, a section of individual information, another section of group information, and a global tail (a string of characters shared across all individuals; TKTK character length). Later versions of our code will allow users to choose where and how much information is encoded in the signal. We varied the character length of the group and individual sections depending on treatment, discussed below. We used three unique </w:t>
-      </w:r>
-      <w:r>
-        <w:rPr>
-          <w:rFonts w:ascii="Arial" w:hAnsi="Arial" w:cs="Arial"/>
-        </w:rPr>
-        <w:lastRenderedPageBreak/>
-        <w:t xml:space="preserve">characters in the string: A, B, and C. </w:t>
-      </w:r>
-      <w:commentRangeStart w:id="214"/>
-      <w:r>
-        <w:rPr>
-          <w:rFonts w:ascii="Arial" w:hAnsi="Arial" w:cs="Arial"/>
-        </w:rPr>
-        <w:t>Once character strings were generated, we added random variation in each call to represent variation within an individual’s call repertoires</w:t>
-      </w:r>
-      <w:commentRangeEnd w:id="214"/>
-      <w:r>
-        <w:rPr>
-          <w:rStyle w:val="CommentReference"/>
-        </w:rPr>
-        <w:commentReference w:id="214"/>
-      </w:r>
-      <w:r>
-        <w:rPr>
-          <w:rFonts w:ascii="Arial" w:hAnsi="Arial" w:cs="Arial"/>
-        </w:rPr>
-        <w:t xml:space="preserve">. Total string length remained constant across individuals (36 characters). </w:t>
-      </w:r>
-    </w:p>
-    <w:p>
-      <w:pPr>
-        <w:spacing w:line="480" w:lineRule="auto"/>
-        <w:rPr>
-          <w:rFonts w:ascii="Arial" w:hAnsi="Arial" w:cs="Arial"/>
-        </w:rPr>
-      </w:pPr>
-      <w:r>
-        <w:rPr>
-          <w:rFonts w:ascii="Arial" w:hAnsi="Arial" w:cs="Arial"/>
-        </w:rPr>
-        <w:tab/>
-        <w:t xml:space="preserve">Next, we </w:t>
-      </w:r>
-      <w:proofErr w:type="spellStart"/>
-      <w:r>
-        <w:rPr>
-          <w:rFonts w:ascii="Arial" w:hAnsi="Arial" w:cs="Arial"/>
-        </w:rPr>
-        <w:t>sonified</w:t>
-      </w:r>
-      <w:proofErr w:type="spellEnd"/>
-      <w:r>
-        <w:rPr>
-          <w:rFonts w:ascii="Arial" w:hAnsi="Arial" w:cs="Arial"/>
-        </w:rPr>
-        <w:t xml:space="preserve"> characters strings to synthetic vocalizations by using Parson’s code. Parson’s code summarizes the information in a tune or signal while reducing over its global characteristics </w:t>
-      </w:r>
-      <w:r>
-        <w:rPr>
-          <w:rFonts w:ascii="Arial" w:hAnsi="Arial" w:cs="Arial"/>
-        </w:rPr>
-        <w:fldChar w:fldCharType="begin"/>
-      </w:r>
-      <w:r>
-        <w:rPr>
-          <w:rFonts w:ascii="Arial" w:hAnsi="Arial" w:cs="Arial"/>
-        </w:rPr>
-        <w:instrText xml:space="preserve"> ADDIN ZOTERO_ITEM CSL_CITATION {"citationID":"Uqyq1MIF","properties":{"formattedCitation":"(40)","plainCitation":"(40)","noteIndex":0},"citationItems":[{"id":598,"uris":["http://zotero.org/groups/5786507/items/ZVXRPGHR"],"itemData":{"id":598,"type":"book","abstract":"288 p. : 24 cm","ISBN":"978-0-904747-00-3","language":"eng","number-of-pages":"298","publisher":"Cambridge, Eng. : S. Brown","source":"Internet Archive","title":"The directory of tunes and musical themes","URL":"http://archive.org/details/directoryoftunes0000pars","author":[{"family":"Parsons","given":"Denys"}],"contributor":[{"literal":"Internet Archive"}],"accessed":{"date-parts":[["2024",12,20]]},"issued":{"date-parts":[["1975"]]}}}],"schema":"https://github.com/citation-style-language/schema/raw/master/csl-citation.json"} </w:instrText>
-      </w:r>
-      <w:r>
-        <w:rPr>
-          <w:rFonts w:ascii="Arial" w:hAnsi="Arial" w:cs="Arial"/>
-        </w:rPr>
-        <w:fldChar w:fldCharType="separate"/>
-      </w:r>
-      <w:r>
-        <w:rPr>
-          <w:rFonts w:ascii="Arial" w:hAnsi="Arial" w:cs="Arial"/>
-        </w:rPr>
-        <w:t>(40)</w:t>
-      </w:r>
-      <w:r>
-        <w:rPr>
-          <w:rFonts w:ascii="Arial" w:hAnsi="Arial" w:cs="Arial"/>
-        </w:rPr>
-        <w:fldChar w:fldCharType="end"/>
-      </w:r>
-      <w:r>
-        <w:rPr>
-          <w:rFonts w:ascii="Arial" w:hAnsi="Arial" w:cs="Arial"/>
-        </w:rPr>
-        <w:t>. We used 1-Parsons encoding, which reduces the frequences profile of a signal to a “</w:t>
-      </w:r>
-      <w:proofErr w:type="spellStart"/>
-      <w:r>
-        <w:rPr>
-          <w:rFonts w:ascii="Arial" w:hAnsi="Arial" w:cs="Arial"/>
-        </w:rPr>
-        <w:t>trit</w:t>
-      </w:r>
-      <w:proofErr w:type="spellEnd"/>
-      <w:r>
-        <w:rPr>
-          <w:rFonts w:ascii="Arial" w:hAnsi="Arial" w:cs="Arial"/>
-        </w:rPr>
-        <w:t xml:space="preserve">” of information by noting the direction of frequency change (up, down, or constant) in a series of subsamples from the original signal, known as Parsons segments. Parsons code is often used in the retrieval and study of music </w:t>
-      </w:r>
-      <w:r>
-        <w:rPr>
-          <w:rFonts w:ascii="Arial" w:hAnsi="Arial" w:cs="Arial"/>
-        </w:rPr>
-        <w:fldChar w:fldCharType="begin"/>
-      </w:r>
-      <w:r>
-        <w:rPr>
-          <w:rFonts w:ascii="Arial" w:hAnsi="Arial" w:cs="Arial"/>
-        </w:rPr>
-        <w:instrText xml:space="preserve"> ADDIN ZOTERO_ITEM CSL_CITATION {"citationID":"8E9FupMd","properties":{"formattedCitation":"(41)","plainCitation":"(41)","noteIndex":0},"citationItems":[{"id":601,"uris":["http://zotero.org/groups/5786507/items/IJTC2XE2"],"itemData":{"id":601,"type":"article-journal","container-title":"Annual review of information science and technology","issue":"1","page":"295-340","title":"Music information retrieval","volume":"37","author":[{"family":"Downie","given":"J.S."}],"issued":{"date-parts":[["2003"]]}}}],"schema":"https://github.com/citation-style-language/schema/raw/master/csl-citation.json"} </w:instrText>
-      </w:r>
-      <w:r>
-        <w:rPr>
-          <w:rFonts w:ascii="Arial" w:hAnsi="Arial" w:cs="Arial"/>
-        </w:rPr>
-        <w:fldChar w:fldCharType="separate"/>
-      </w:r>
-      <w:r>
-        <w:rPr>
-          <w:rFonts w:ascii="Arial" w:hAnsi="Arial" w:cs="Arial"/>
-        </w:rPr>
-        <w:t>(41)</w:t>
-      </w:r>
-      <w:r>
-        <w:rPr>
-          <w:rFonts w:ascii="Arial" w:hAnsi="Arial" w:cs="Arial"/>
-        </w:rPr>
-        <w:fldChar w:fldCharType="end"/>
-      </w:r>
-      <w:r>
-        <w:rPr>
-          <w:rFonts w:ascii="Arial" w:hAnsi="Arial" w:cs="Arial"/>
-        </w:rPr>
-        <w:t xml:space="preserve">, however researchers have used a Parsons code metric to decode information in frequency-based animal signals with great success </w:t>
-      </w:r>
-      <w:r>
-        <w:rPr>
-          <w:rFonts w:ascii="Arial" w:hAnsi="Arial" w:cs="Arial"/>
-        </w:rPr>
-        <w:fldChar w:fldCharType="begin"/>
-      </w:r>
-      <w:r>
-        <w:rPr>
-          <w:rFonts w:ascii="Arial" w:hAnsi="Arial" w:cs="Arial"/>
-        </w:rPr>
-        <w:instrText xml:space="preserve"> ADDIN ZOTERO_ITEM CSL_CITATION {"citationID":"r3ZuczO0","properties":{"formattedCitation":"(36)","plainCitation":"(36)","noteIndex":0},"citationItems":[{"id":599,"uris":["http://zotero.org/groups/5786507/items/MUGYAV6U"],"itemData":{"id":599,"type":"article-journal","abstract":"Bottlenose dolphins (Tursiops truncatus) produce many vocalisations, including whistles that are unique to the individual producing them. Such “signature whistles” play a role in individual recognition and maintaining group integrity. Previous work has shown that humans can successfully group the spectrographic representations of signature whistles according to the individual dolphins that produced them. However, attempts at using mathematical algorithms to perform a similar task have been less successful. A greater understanding of the encoding of identity information in signature whistles is important for assessing similarity of whistles and thus social influences on the development of these learned calls. We re-examined 400 signature whistles from 20 individual dolphins used in a previous study, and tested the performance of new mathematical algorithms. We compared the measure used in the original study (correlation matrix of evenly sampled frequency measurements) to one used in several previous studies (similarity matrix of time-warped whistles), and to a new algorithm based on the Parsons code, used in music retrieval databases. The Parsons code records the direction of frequency change at each time step, and is effective at capturing human perception of music. We analysed similarity matrices from each of these three techniques, as well as a random control, by unsupervised clustering using three separate techniques: k-means clustering, hierarchical clustering, and an adaptive resonance theory neural network. For each of the three clustering techniques, a seven-level Parsons algorithm provided better clustering than the correlation and dynamic time warping algorithms, and was closer to the near-perfect visual categorisations of human judges. Thus, the Parsons code captures much of the individual identity information present in signature whistles, and may prove useful in studies requiring quantification of whistle similarity.","container-title":"PLOS ONE","DOI":"10.1371/journal.pone.0077671","ISSN":"1932-6203","issue":"10","journalAbbreviation":"PLOS ONE","language":"en","note":"publisher: Public Library of Science","page":"e77671","source":"PLoS Journals","title":"The Encoding of Individual Identity in Dolphin Signature Whistles: How Much Information Is Needed?","title-short":"The Encoding of Individual Identity in Dolphin Signature Whistles","volume":"8","author":[{"family":"Kershenbaum","given":"Arik"},{"family":"Sayigh","given":"Laela S."},{"family":"Janik","given":"Vincent M."}],"issued":{"date-parts":[["2013",10,23]]}}}],"schema":"https://github.com/citation-style-language/schema/raw/master/csl-citation.json"} </w:instrText>
-      </w:r>
-      <w:r>
-        <w:rPr>
-          <w:rFonts w:ascii="Arial" w:hAnsi="Arial" w:cs="Arial"/>
-        </w:rPr>
-        <w:fldChar w:fldCharType="separate"/>
-      </w:r>
-      <w:r>
-        <w:rPr>
-          <w:rFonts w:ascii="Arial" w:hAnsi="Arial" w:cs="Arial"/>
-        </w:rPr>
-        <w:t>(36)</w:t>
-      </w:r>
-      <w:r>
-        <w:rPr>
-          <w:rFonts w:ascii="Arial" w:hAnsi="Arial" w:cs="Arial"/>
-        </w:rPr>
-        <w:fldChar w:fldCharType="end"/>
-      </w:r>
-      <w:r>
-        <w:rPr>
-          <w:rFonts w:ascii="Arial" w:hAnsi="Arial" w:cs="Arial"/>
-        </w:rPr>
-        <w:t xml:space="preserve">. Here, we used Paron’s code in a novel way, using it to encode information in a signal rather than to decode information. Each unique character mapped onto a direction, such that A was converted into “up”, B into “down”, and C into “constant”. </w:t>
-      </w:r>
+          <w:ins w:id="161" w:author="Smith Vidaurre, Grace" w:date="2025-05-28T19:06:00Z" w16du:dateUtc="2025-05-28T23:06:00Z"/>
+          <w:rFonts w:ascii="Arial" w:hAnsi="Arial" w:cs="Arial"/>
+        </w:rPr>
+      </w:pPr>
     </w:p>
     <w:p>
       <w:pPr>
         <w:spacing w:line="480" w:lineRule="auto"/>
         <w:ind w:firstLine="720"/>
         <w:rPr>
-          <w:rFonts w:ascii="Arial" w:hAnsi="Arial" w:cs="Arial"/>
-        </w:rPr>
-      </w:pPr>
-      <w:r>
-        <w:rPr>
-          <w:rFonts w:ascii="Arial" w:hAnsi="Arial" w:cs="Arial"/>
-        </w:rPr>
-        <w:t xml:space="preserve">Once strings were in Parson’s code, we converted each section of the vocalization into frequency anchors, measured in Hz. Each subcomponent of synthetic vocalization started at a randomly selected frequency between (TKTK range). </w:t>
-      </w:r>
-      <w:commentRangeStart w:id="215"/>
-      <w:commentRangeStart w:id="216"/>
-      <w:r>
-        <w:rPr>
-          <w:rFonts w:ascii="Arial" w:hAnsi="Arial" w:cs="Arial"/>
-        </w:rPr>
-        <w:t xml:space="preserve">This starting frequency served as a baseline for creating frequency anchors with Parson’s code, which determined if the next frequency anchor was greater than, less than, or the same as the frequency anchor before it. For example, if a synthetic vocalization started at 4000Hz and the first Parson’s code value is “constant”, then the next frequency anchor would also be 4000Hz. However, if the first Parson’s code was “up”, then the second frequency anchor would be 5000Hz. </w:t>
-      </w:r>
-      <w:commentRangeEnd w:id="215"/>
-      <w:r>
-        <w:rPr>
-          <w:rStyle w:val="CommentReference"/>
-        </w:rPr>
-        <w:commentReference w:id="215"/>
-      </w:r>
-      <w:commentRangeEnd w:id="216"/>
-      <w:r>
-        <w:rPr>
-          <w:rStyle w:val="CommentReference"/>
-        </w:rPr>
-        <w:commentReference w:id="216"/>
-      </w:r>
-      <w:r>
-        <w:rPr>
-          <w:rFonts w:ascii="Arial" w:hAnsi="Arial" w:cs="Arial"/>
-        </w:rPr>
-        <w:t xml:space="preserve">Frequency shifts were kept constant at </w:t>
-      </w:r>
-      <w:r>
-        <w:rPr>
-          <w:rFonts w:ascii="Arial" w:hAnsi="Arial" w:cs="Arial"/>
-        </w:rPr>
-        <w:lastRenderedPageBreak/>
-        <w:t xml:space="preserve">TKTK (I think 1000Hz). The starting frequency anchor was also used as a final frequency anchor in a vocalization subcomponent. Then, using the frequency anchors in each synthetic vocalization to guide frequency modulation patterns, we generated synthetic audio signals using the </w:t>
-      </w:r>
-      <w:proofErr w:type="spellStart"/>
-      <w:r>
-        <w:rPr>
-          <w:rFonts w:ascii="Arial" w:hAnsi="Arial" w:cs="Arial"/>
-        </w:rPr>
-        <w:t>Soundgen</w:t>
-      </w:r>
-      <w:proofErr w:type="spellEnd"/>
-      <w:r>
-        <w:rPr>
-          <w:rFonts w:ascii="Arial" w:hAnsi="Arial" w:cs="Arial"/>
-        </w:rPr>
-        <w:t xml:space="preserve"> package in R (CITE). The resulting synthetic vocalization files were saved as .wav files.  </w:t>
-      </w:r>
-    </w:p>
-    <w:p>
-      <w:pPr>
-        <w:spacing w:line="480" w:lineRule="auto"/>
-        <w:ind w:firstLine="720"/>
-        <w:rPr>
-          <w:rFonts w:ascii="Arial" w:hAnsi="Arial" w:cs="Arial"/>
-        </w:rPr>
-      </w:pPr>
-      <w:r>
-        <w:rPr>
-          <w:rFonts w:ascii="Arial" w:hAnsi="Arial" w:cs="Arial"/>
-        </w:rPr>
-        <w:t xml:space="preserve">We used R to generate strings and synthetic audio signals, using the </w:t>
-      </w:r>
-      <w:proofErr w:type="spellStart"/>
-      <w:r>
-        <w:rPr>
-          <w:rFonts w:ascii="Arial" w:hAnsi="Arial" w:cs="Arial"/>
-        </w:rPr>
-        <w:t>paRsynth</w:t>
-      </w:r>
-      <w:proofErr w:type="spellEnd"/>
-      <w:r>
-        <w:rPr>
-          <w:rFonts w:ascii="Arial" w:hAnsi="Arial" w:cs="Arial"/>
-        </w:rPr>
-        <w:t xml:space="preserve"> package (code found TKTK here).</w:t>
-      </w:r>
-    </w:p>
-    <w:p>
-      <w:pPr>
-        <w:spacing w:line="480" w:lineRule="auto"/>
-        <w:rPr>
-          <w:rFonts w:ascii="Arial" w:hAnsi="Arial" w:cs="Arial"/>
-        </w:rPr>
-      </w:pPr>
-    </w:p>
-    <w:p>
-      <w:pPr>
-        <w:spacing w:line="480" w:lineRule="auto"/>
-        <w:rPr>
-          <w:rFonts w:ascii="Arial" w:hAnsi="Arial" w:cs="Arial"/>
-          <w:i/>
-          <w:iCs/>
-        </w:rPr>
-      </w:pPr>
-      <w:r>
-        <w:rPr>
-          <w:rFonts w:ascii="Arial" w:hAnsi="Arial" w:cs="Arial"/>
-          <w:i/>
-          <w:iCs/>
-        </w:rPr>
-        <w:t>Detecting Synthetic Group and Individual Information in Synthetic Datasets</w:t>
-      </w:r>
-    </w:p>
-    <w:p>
-      <w:pPr>
-        <w:spacing w:line="480" w:lineRule="auto"/>
-        <w:ind w:firstLine="720"/>
-        <w:rPr>
-          <w:rFonts w:ascii="Arial" w:hAnsi="Arial" w:cs="Arial"/>
-        </w:rPr>
-      </w:pPr>
-      <w:r>
-        <w:rPr>
-          <w:rFonts w:ascii="Arial" w:hAnsi="Arial" w:cs="Arial"/>
-        </w:rPr>
-        <w:t xml:space="preserve">Using the process described above, we created two synthetic data sets: one that created </w:t>
-      </w:r>
-      <w:commentRangeStart w:id="217"/>
-      <w:commentRangeStart w:id="218"/>
-      <w:r>
-        <w:rPr>
-          <w:rFonts w:ascii="Arial" w:hAnsi="Arial" w:cs="Arial"/>
-        </w:rPr>
-        <w:t xml:space="preserve">vocalizations </w:t>
-      </w:r>
-      <w:commentRangeEnd w:id="217"/>
-      <w:r>
-        <w:rPr>
-          <w:rStyle w:val="CommentReference"/>
-        </w:rPr>
-        <w:commentReference w:id="217"/>
-      </w:r>
-      <w:commentRangeEnd w:id="218"/>
-      <w:r>
-        <w:rPr>
-          <w:rStyle w:val="CommentReference"/>
-        </w:rPr>
-        <w:commentReference w:id="218"/>
-      </w:r>
-      <w:r>
-        <w:rPr>
-          <w:rFonts w:ascii="Arial" w:hAnsi="Arial" w:cs="Arial"/>
-        </w:rPr>
-        <w:t>with more group membership information than individual information encoded (</w:t>
-      </w:r>
-      <w:r>
-        <w:rPr>
-          <w:rFonts w:ascii="Arial" w:hAnsi="Arial" w:cs="Arial"/>
-        </w:rPr>
-        <w:t>g</w:t>
-      </w:r>
-      <w:r>
-        <w:rPr>
-          <w:rFonts w:ascii="Arial" w:hAnsi="Arial" w:cs="Arial"/>
-        </w:rPr>
-        <w:t xml:space="preserve">roup </w:t>
-      </w:r>
-      <w:r>
-        <w:rPr>
-          <w:rFonts w:ascii="Arial" w:hAnsi="Arial" w:cs="Arial"/>
-        </w:rPr>
-        <w:t>specific</w:t>
-      </w:r>
-      <w:r>
-        <w:rPr>
-          <w:rFonts w:ascii="Arial" w:hAnsi="Arial" w:cs="Arial"/>
-        </w:rPr>
-        <w:t xml:space="preserve"> </w:t>
-      </w:r>
-      <w:r>
-        <w:rPr>
-          <w:rFonts w:ascii="Arial" w:hAnsi="Arial" w:cs="Arial"/>
-        </w:rPr>
-        <w:t>i</w:t>
-      </w:r>
-      <w:r>
-        <w:rPr>
-          <w:rFonts w:ascii="Arial" w:hAnsi="Arial" w:cs="Arial"/>
-        </w:rPr>
-        <w:t xml:space="preserve">nformation </w:t>
-      </w:r>
-      <w:r>
-        <w:rPr>
-          <w:rFonts w:ascii="Arial" w:hAnsi="Arial" w:cs="Arial"/>
-        </w:rPr>
-        <w:t>d</w:t>
-      </w:r>
-      <w:r>
-        <w:rPr>
-          <w:rFonts w:ascii="Arial" w:hAnsi="Arial" w:cs="Arial"/>
-        </w:rPr>
-        <w:t xml:space="preserve">ataset: henceforth the </w:t>
-      </w:r>
-      <w:r>
-        <w:rPr>
-          <w:rFonts w:ascii="Arial" w:hAnsi="Arial" w:cs="Arial"/>
-        </w:rPr>
-        <w:t>group specific</w:t>
-      </w:r>
-      <w:r>
-        <w:rPr>
-          <w:rFonts w:ascii="Arial" w:hAnsi="Arial" w:cs="Arial"/>
-        </w:rPr>
-        <w:t xml:space="preserve"> dataset), and one that created </w:t>
-      </w:r>
-      <w:commentRangeStart w:id="219"/>
-      <w:r>
-        <w:rPr>
-          <w:rFonts w:ascii="Arial" w:hAnsi="Arial" w:cs="Arial"/>
-        </w:rPr>
-        <w:t xml:space="preserve">character strings </w:t>
-      </w:r>
-      <w:commentRangeEnd w:id="219"/>
-      <w:r>
-        <w:rPr>
-          <w:rStyle w:val="CommentReference"/>
-        </w:rPr>
-        <w:commentReference w:id="219"/>
-      </w:r>
-      <w:r>
-        <w:rPr>
-          <w:rFonts w:ascii="Arial" w:hAnsi="Arial" w:cs="Arial"/>
-        </w:rPr>
-        <w:t>with more individual information than group membership information encoded (</w:t>
-      </w:r>
-      <w:r>
-        <w:rPr>
-          <w:rFonts w:ascii="Arial" w:hAnsi="Arial" w:cs="Arial"/>
-        </w:rPr>
-        <w:t>individual identity information dataset</w:t>
-      </w:r>
-      <w:r>
-        <w:rPr>
-          <w:rFonts w:ascii="Arial" w:hAnsi="Arial" w:cs="Arial"/>
-        </w:rPr>
-        <w:t xml:space="preserve">; </w:t>
-      </w:r>
-      <w:commentRangeStart w:id="220"/>
-      <w:commentRangeEnd w:id="220"/>
-      <w:r>
-        <w:rPr>
-          <w:rStyle w:val="CommentReference"/>
-        </w:rPr>
-        <w:commentReference w:id="220"/>
-      </w:r>
-      <w:r>
-        <w:rPr>
-          <w:rFonts w:ascii="Arial" w:hAnsi="Arial" w:cs="Arial"/>
-        </w:rPr>
-        <w:t xml:space="preserve">henceforth the </w:t>
-      </w:r>
-      <w:r>
-        <w:rPr>
-          <w:rFonts w:ascii="Arial" w:hAnsi="Arial" w:cs="Arial"/>
-        </w:rPr>
-        <w:t>individual identity</w:t>
-      </w:r>
-      <w:r>
-        <w:rPr>
-          <w:rFonts w:ascii="Arial" w:hAnsi="Arial" w:cs="Arial"/>
-        </w:rPr>
-        <w:t xml:space="preserve"> dataset). In the </w:t>
-      </w:r>
-      <w:r>
-        <w:rPr>
-          <w:rFonts w:ascii="Arial" w:hAnsi="Arial" w:cs="Arial"/>
-        </w:rPr>
-        <w:t>group specific dataset</w:t>
-      </w:r>
-      <w:r>
-        <w:rPr>
-          <w:rFonts w:ascii="Arial" w:hAnsi="Arial" w:cs="Arial"/>
-        </w:rPr>
-        <w:t xml:space="preserve">, individual information was set to a character length of 4 characters, and group member information was set to </w:t>
-      </w:r>
-      <w:commentRangeStart w:id="221"/>
-      <w:r>
-        <w:rPr>
-          <w:rFonts w:ascii="Arial" w:hAnsi="Arial" w:cs="Arial"/>
-        </w:rPr>
-        <w:t>a character length of 8 character</w:t>
-      </w:r>
-      <w:commentRangeEnd w:id="221"/>
-      <w:r>
-        <w:rPr>
-          <w:rStyle w:val="CommentReference"/>
-        </w:rPr>
-        <w:commentReference w:id="221"/>
-      </w:r>
-      <w:r>
-        <w:rPr>
-          <w:rFonts w:ascii="Arial" w:hAnsi="Arial" w:cs="Arial"/>
-        </w:rPr>
-        <w:t xml:space="preserve">. In the </w:t>
-      </w:r>
-      <w:r>
-        <w:rPr>
-          <w:rFonts w:ascii="Arial" w:hAnsi="Arial" w:cs="Arial"/>
-        </w:rPr>
-        <w:t>individual identity dataset</w:t>
-      </w:r>
-      <w:r>
-        <w:rPr>
-          <w:rFonts w:ascii="Arial" w:hAnsi="Arial" w:cs="Arial"/>
-        </w:rPr>
-        <w:t xml:space="preserve">, individual information was set to a </w:t>
-      </w:r>
-      <w:commentRangeStart w:id="222"/>
-      <w:r>
-        <w:rPr>
-          <w:rFonts w:ascii="Arial" w:hAnsi="Arial" w:cs="Arial"/>
-        </w:rPr>
-        <w:t>character length of 8 characters</w:t>
-      </w:r>
-      <w:commentRangeEnd w:id="222"/>
-      <w:r>
-        <w:rPr>
-          <w:rStyle w:val="CommentReference"/>
-        </w:rPr>
-        <w:commentReference w:id="222"/>
-      </w:r>
-      <w:r>
-        <w:rPr>
-          <w:rFonts w:ascii="Arial" w:hAnsi="Arial" w:cs="Arial"/>
-        </w:rPr>
-        <w:t xml:space="preserve">, and group information was set to a character length of 4 characters. For both datasets, there were 5 groups with 10 individuals per group, with 5 unique calls generated per individual. </w:t>
-      </w:r>
-    </w:p>
-    <w:p>
-      <w:pPr>
-        <w:spacing w:line="480" w:lineRule="auto"/>
-        <w:ind w:firstLine="720"/>
-        <w:rPr>
-          <w:rFonts w:ascii="Arial" w:hAnsi="Arial" w:cs="Arial"/>
-        </w:rPr>
-      </w:pPr>
-      <w:r>
-        <w:rPr>
-          <w:rFonts w:ascii="Arial" w:hAnsi="Arial" w:cs="Arial"/>
-        </w:rPr>
-        <w:t xml:space="preserve">After generating synthetic signals for these datasets, we used the </w:t>
-      </w:r>
-      <w:proofErr w:type="spellStart"/>
-      <w:r>
-        <w:rPr>
-          <w:rFonts w:ascii="Arial" w:hAnsi="Arial" w:cs="Arial"/>
-        </w:rPr>
-        <w:t>soundgen</w:t>
-      </w:r>
-      <w:proofErr w:type="spellEnd"/>
-      <w:r>
-        <w:rPr>
-          <w:rFonts w:ascii="Arial" w:hAnsi="Arial" w:cs="Arial"/>
-        </w:rPr>
-        <w:t xml:space="preserve"> package (TKTK citation) to convert the .wav files to spectrograms (see example of calls in Figures 2B and 3B). To validate that the group and individual information we specified </w:t>
-      </w:r>
-      <w:r>
-        <w:rPr>
-          <w:rFonts w:ascii="Arial" w:hAnsi="Arial" w:cs="Arial"/>
-        </w:rPr>
-        <w:lastRenderedPageBreak/>
-        <w:t xml:space="preserve">in the character strings could be recovered from the generated frequency signals, we performed spectrographic cross-correlation on each dataset (SPCC; </w:t>
-      </w:r>
-      <w:r>
-        <w:rPr>
-          <w:rFonts w:ascii="Arial" w:hAnsi="Arial" w:cs="Arial"/>
-        </w:rPr>
-        <w:fldChar w:fldCharType="begin"/>
-      </w:r>
-      <w:r>
-        <w:rPr>
-          <w:rFonts w:ascii="Arial" w:hAnsi="Arial" w:cs="Arial"/>
-        </w:rPr>
-        <w:instrText xml:space="preserve"> ADDIN ZOTERO_ITEM CSL_CITATION {"citationID":"2alP2xFJ","properties":{"formattedCitation":"(Clark et al., 1987)","plainCitation":"(Clark et al., 1987)","dontUpdate":true,"noteIndex":0},"citationItems":[{"id":606,"uris":["http://zotero.org/groups/5786507/items/GR5UUI5P"],"itemData":{"id":606,"type":"article-journal","abstract":"Sound spectrograms have been a traditional method for comparing animal vocalizations and demonstrating their similarities or differences, but quantification of the comparative process has been difficult. This lack of quantification has hindered progress in documenting the timing and degree of song development in song birds. With this in mind, computer-based methods for sound comparison and sound averaging were developed. These methods utilize a numerical representation of a sound's frequency-time structure to compute a similarity value between any two sounds and an average sound spectrogram for a set of sounds. These analytical techniques were applied to an analysis of song notes of the swamp sparrow (Melospiza georgiana). The results demonstrate the usefulness of the methods and reveal new details in the description of the swamp sparrow's set of species-universal note types and in the decrease of note variability during the course of developmental transitions from subsong, through plastic song to song crystallization.","container-title":"Ethology","DOI":"10.1111/j.1439-0310.1987.tb00676.x","ISSN":"1439-0310","issue":"2","language":"en","license":"1987 Blackwell Verlag GmbH","note":"_eprint: https://onlinelibrary.wiley.com/doi/pdf/10.1111/j.1439-0310.1987.tb00676.x","page":"101-115","source":"Wiley Online Library","title":"Quantitative Analysis of Animal Vocal Phonology: an Application to Swamp Sparrow Song","title-short":"Quantitative Analysis of Animal Vocal Phonology","volume":"76","author":[{"family":"Clark","given":"Christopher W."},{"family":"Marler","given":"Peter"},{"family":"Beeman","given":"Kim"}],"issued":{"date-parts":[["1987"]]}}}],"schema":"https://github.com/citation-style-language/schema/raw/master/csl-citation.json"} </w:instrText>
-      </w:r>
-      <w:r>
-        <w:rPr>
-          <w:rFonts w:ascii="Arial" w:hAnsi="Arial" w:cs="Arial"/>
-        </w:rPr>
-        <w:fldChar w:fldCharType="separate"/>
-      </w:r>
-      <w:r>
-        <w:rPr>
-          <w:rFonts w:ascii="Arial" w:hAnsi="Arial" w:cs="Arial"/>
-        </w:rPr>
-        <w:t>Clark et al., 1987</w:t>
-      </w:r>
-      <w:r>
-        <w:rPr>
-          <w:rFonts w:ascii="Arial" w:hAnsi="Arial" w:cs="Arial"/>
-        </w:rPr>
-        <w:fldChar w:fldCharType="end"/>
-      </w:r>
-      <w:r>
-        <w:rPr>
-          <w:rFonts w:ascii="Arial" w:hAnsi="Arial" w:cs="Arial"/>
-        </w:rPr>
-        <w:t xml:space="preserve">) using the </w:t>
-      </w:r>
-      <w:proofErr w:type="spellStart"/>
-      <w:r>
-        <w:rPr>
-          <w:rFonts w:ascii="Arial" w:hAnsi="Arial" w:cs="Arial"/>
-        </w:rPr>
-        <w:t>warbleR</w:t>
-      </w:r>
-      <w:proofErr w:type="spellEnd"/>
-      <w:r>
-        <w:rPr>
-          <w:rFonts w:ascii="Arial" w:hAnsi="Arial" w:cs="Arial"/>
-        </w:rPr>
-        <w:t xml:space="preserve"> package. We performed SPCC with a Hanning window, a window length of 512 samples, and a window overlap of 90 samples. We used a Pearson’s correlation method and a bandpass filter of 0 to 20 kHz. </w:t>
-      </w:r>
-    </w:p>
-    <w:p>
-      <w:pPr>
-        <w:spacing w:line="480" w:lineRule="auto"/>
-        <w:ind w:firstLine="720"/>
-        <w:rPr>
-          <w:rFonts w:ascii="Arial" w:hAnsi="Arial" w:cs="Arial"/>
-        </w:rPr>
-      </w:pPr>
-      <w:r>
-        <w:rPr>
-          <w:rFonts w:ascii="Arial" w:hAnsi="Arial" w:cs="Arial"/>
-        </w:rPr>
-        <w:t xml:space="preserve">To assess hierarchical mapping patterns of our two datasets, we used non-metric multidimensional scaling (MDS) to reduce the dimensionality of the SPCC matrix for each dataset. We performed MDS over 15 dimensions so that the stress of the model was TKTK (less than 5). From these results, we two generated low-dimensional acoustic space plots for each dataset, one visualizing the acoustic space between groups and one visualizing the acoustic space between individuals. In doing this for each dataset, we can compare how well the </w:t>
-      </w:r>
-      <w:r>
-        <w:rPr>
-          <w:rFonts w:ascii="Arial" w:hAnsi="Arial" w:cs="Arial"/>
-        </w:rPr>
-        <w:t>group specific</w:t>
-      </w:r>
-      <w:r>
-        <w:rPr>
-          <w:rFonts w:ascii="Arial" w:hAnsi="Arial" w:cs="Arial"/>
-        </w:rPr>
-        <w:t xml:space="preserve"> dataset encodes information at the group level compared to the individual level and vice versa for the </w:t>
-      </w:r>
-      <w:r>
-        <w:rPr>
-          <w:rFonts w:ascii="Arial" w:hAnsi="Arial" w:cs="Arial"/>
-        </w:rPr>
-        <w:t>individual identity dataset</w:t>
-      </w:r>
-      <w:r>
-        <w:rPr>
-          <w:rFonts w:ascii="Arial" w:hAnsi="Arial" w:cs="Arial"/>
-        </w:rPr>
-        <w:t xml:space="preserve">. </w:t>
-      </w:r>
-    </w:p>
-    <w:p>
-      <w:pPr>
-        <w:spacing w:line="480" w:lineRule="auto"/>
-        <w:rPr>
-          <w:rFonts w:ascii="Arial" w:hAnsi="Arial" w:cs="Arial"/>
-          <w:i/>
-          <w:iCs/>
-        </w:rPr>
-      </w:pPr>
-    </w:p>
-    <w:p>
-      <w:pPr>
-        <w:spacing w:line="480" w:lineRule="auto"/>
-        <w:rPr>
-          <w:rFonts w:ascii="Arial" w:hAnsi="Arial" w:cs="Arial"/>
-          <w:i/>
-          <w:iCs/>
-        </w:rPr>
-      </w:pPr>
-      <w:r>
-        <w:rPr>
-          <w:rFonts w:ascii="Arial" w:hAnsi="Arial" w:cs="Arial"/>
-          <w:i/>
-          <w:iCs/>
-        </w:rPr>
-        <w:t xml:space="preserve">Synthetic Experiments to Assess Accuracy of Information Encoding and Decoding Across a Range of Social </w:t>
-      </w:r>
-      <w:r>
-        <w:rPr>
-          <w:rFonts w:ascii="Arial" w:hAnsi="Arial" w:cs="Arial"/>
-          <w:i/>
-          <w:iCs/>
-        </w:rPr>
-        <w:t xml:space="preserve">Conditions </w:t>
-      </w:r>
-    </w:p>
-    <w:p>
-      <w:pPr>
-        <w:pStyle w:val="NoSpacing"/>
-        <w:spacing w:line="480" w:lineRule="auto"/>
-        <w:rPr>
-          <w:rFonts w:ascii="Arial" w:hAnsi="Arial" w:cs="Arial"/>
-        </w:rPr>
-      </w:pPr>
-      <w:r>
-        <w:rPr>
-          <w:rFonts w:ascii="Arial" w:hAnsi="Arial" w:cs="Arial"/>
-        </w:rPr>
-        <w:tab/>
-      </w:r>
-      <w:r>
-        <w:rPr>
-          <w:rFonts w:ascii="Arial" w:hAnsi="Arial" w:cs="Arial"/>
-        </w:rPr>
-        <w:t xml:space="preserve"> </w:t>
-      </w:r>
-      <w:r>
-        <w:rPr>
-          <w:rFonts w:ascii="Arial" w:hAnsi="Arial" w:cs="Arial"/>
-        </w:rPr>
-        <w:t xml:space="preserve">To </w:t>
-      </w:r>
-      <w:r>
-        <w:rPr>
-          <w:rFonts w:ascii="Arial" w:hAnsi="Arial" w:cs="Arial"/>
-        </w:rPr>
-        <w:t>assess</w:t>
-      </w:r>
-      <w:r>
-        <w:rPr>
-          <w:rFonts w:ascii="Arial" w:hAnsi="Arial" w:cs="Arial"/>
-        </w:rPr>
-        <w:t xml:space="preserve"> how </w:t>
-      </w:r>
-      <w:r>
-        <w:rPr>
-          <w:rFonts w:ascii="Arial" w:hAnsi="Arial" w:cs="Arial"/>
-        </w:rPr>
-        <w:t>accurately</w:t>
-      </w:r>
-      <w:r>
-        <w:rPr>
-          <w:rFonts w:ascii="Arial" w:hAnsi="Arial" w:cs="Arial"/>
-        </w:rPr>
-        <w:t xml:space="preserve"> </w:t>
-      </w:r>
-      <w:r>
-        <w:rPr>
-          <w:rFonts w:ascii="Arial" w:hAnsi="Arial" w:cs="Arial"/>
-        </w:rPr>
-        <w:t xml:space="preserve">varying amounts of group and individual </w:t>
-      </w:r>
-      <w:r>
-        <w:rPr>
-          <w:rFonts w:ascii="Arial" w:hAnsi="Arial" w:cs="Arial"/>
-        </w:rPr>
-        <w:t xml:space="preserve">information could be recovered </w:t>
-      </w:r>
-      <w:r>
-        <w:rPr>
-          <w:rFonts w:ascii="Arial" w:hAnsi="Arial" w:cs="Arial"/>
-        </w:rPr>
-        <w:t>from synthetic signals,</w:t>
-      </w:r>
-      <w:r>
-        <w:rPr>
-          <w:rFonts w:ascii="Arial" w:hAnsi="Arial" w:cs="Arial"/>
-        </w:rPr>
-        <w:t xml:space="preserve"> we created </w:t>
-      </w:r>
-      <w:r>
-        <w:rPr>
-          <w:rFonts w:ascii="Arial" w:hAnsi="Arial" w:cs="Arial"/>
-        </w:rPr>
-        <w:t xml:space="preserve">synthetic data sets across 16 treatments that varied over social environment characteristics and information encoding rules. </w:t>
-      </w:r>
-      <w:commentRangeStart w:id="223"/>
-      <w:r>
-        <w:rPr>
-          <w:rFonts w:ascii="Arial" w:hAnsi="Arial" w:cs="Arial"/>
-        </w:rPr>
-        <w:t>We varied social environment characteristics represented information signaling changes that happen in socially sparse vs socially dense signaling environments</w:t>
-      </w:r>
-      <w:commentRangeEnd w:id="223"/>
-      <w:r>
-        <w:rPr>
-          <w:rStyle w:val="CommentReference"/>
-        </w:rPr>
-        <w:commentReference w:id="223"/>
-      </w:r>
-      <w:r>
-        <w:rPr>
-          <w:rFonts w:ascii="Arial" w:hAnsi="Arial" w:cs="Arial"/>
-        </w:rPr>
-        <w:t xml:space="preserve">. We achieved this by creating four social conditions: 2 groups with 2 individuals per group, 4 </w:t>
-      </w:r>
-      <w:r>
-        <w:rPr>
-          <w:rFonts w:ascii="Arial" w:hAnsi="Arial" w:cs="Arial"/>
-        </w:rPr>
-        <w:lastRenderedPageBreak/>
-        <w:t xml:space="preserve">groups with 4 individuals per group, 6 groups with 6 individuals per group, and 8 groups with 8 individuals per group. We also varied the proportion of group information to individual information encoded in the signal, with four categories: 0 (representing all individual information and no group information), 1/3, 2/3, and 1 (representing all group information and no individual information. We iterated over each treatment 10 times, generating 10 unique synthetic datasets per treatment. </w:t>
-      </w:r>
-    </w:p>
-    <w:p>
-      <w:pPr>
-        <w:pStyle w:val="NoSpacing"/>
-        <w:spacing w:line="480" w:lineRule="auto"/>
-        <w:rPr>
-          <w:rFonts w:ascii="Arial" w:hAnsi="Arial" w:cs="Arial"/>
-        </w:rPr>
-      </w:pPr>
-      <w:r>
-        <w:rPr>
-          <w:rFonts w:ascii="Arial" w:hAnsi="Arial" w:cs="Arial"/>
-        </w:rPr>
-        <w:tab/>
-        <w:t xml:space="preserve">Once these synthetic datasets were created, we used traditional bioacoustics tools to decode information encoded at the group and individual level. </w:t>
-      </w:r>
+          <w:ins w:id="162" w:author="Smith Vidaurre, Grace" w:date="2025-05-28T19:06:00Z" w16du:dateUtc="2025-05-28T23:06:00Z"/>
+          <w:rFonts w:ascii="Arial" w:hAnsi="Arial" w:cs="Arial"/>
+        </w:rPr>
+      </w:pPr>
       <w:proofErr w:type="gramStart"/>
-      <w:r>
-        <w:rPr>
-          <w:rFonts w:ascii="Arial" w:hAnsi="Arial" w:cs="Arial"/>
-        </w:rPr>
-        <w:t>Similar to</w:t>
-      </w:r>
-      <w:proofErr w:type="gramEnd"/>
-      <w:r>
-        <w:rPr>
-          <w:rFonts w:ascii="Arial" w:hAnsi="Arial" w:cs="Arial"/>
-        </w:rPr>
-        <w:t xml:space="preserve"> the datasets above, we performed SPCC. We also calculated the edit distance for the original strings. After these calculations, we performed Multidimensional Scaling on both the SPCC and edit distance matrices, then performed k-means clustering, randomly selecting 1 call per individual per group, to ensure that call exemplars per class matched between social levels. From this, we were able to calculate the accuracy of detecting information at the group and individual levels from vocalizations represented as character strings (edit distance pipeline) or synthetic audio files (tradition </w:t>
-      </w:r>
-      <w:r>
-        <w:rPr>
-          <w:rFonts w:ascii="Arial" w:hAnsi="Arial" w:cs="Arial"/>
-        </w:rPr>
-        <w:t>bioacoustics</w:t>
-      </w:r>
-      <w:r>
-        <w:rPr>
-          <w:rFonts w:ascii="Arial" w:hAnsi="Arial" w:cs="Arial"/>
-        </w:rPr>
-        <w:t xml:space="preserve"> </w:t>
-      </w:r>
-      <w:r>
-        <w:rPr>
-          <w:rFonts w:ascii="Arial" w:hAnsi="Arial" w:cs="Arial"/>
-        </w:rPr>
-        <w:t>pipeline</w:t>
-      </w:r>
-      <w:r>
-        <w:rPr>
-          <w:rFonts w:ascii="Arial" w:hAnsi="Arial" w:cs="Arial"/>
-        </w:rPr>
-        <w:t xml:space="preserve"> SPCC). Edit distance is a baseline for information detection because the strings are the original place where information was encoded at either social level. We can then compare the SPCC accuracy to edit distance, to assess how well we can detect the information originally encoded from the audio file representation.  </w:t>
-      </w:r>
-    </w:p>
-    <w:p>
-      <w:pPr>
-        <w:pStyle w:val="NoSpacing"/>
-        <w:spacing w:line="480" w:lineRule="auto"/>
-        <w:rPr>
-          <w:ins w:id="224" w:author="Smith Vidaurre, Grace" w:date="2025-05-28T19:06:00Z" w16du:dateUtc="2025-05-28T23:06:00Z"/>
-          <w:rFonts w:ascii="Arial" w:hAnsi="Arial" w:cs="Arial"/>
-        </w:rPr>
-      </w:pPr>
-      <w:r>
-        <w:rPr>
-          <w:rFonts w:ascii="Arial" w:hAnsi="Arial" w:cs="Arial"/>
-        </w:rPr>
-        <w:tab/>
-        <w:t>TKTK paragraph about effect size calculations</w:t>
-      </w:r>
-      <w:r>
-        <w:rPr>
-          <w:rFonts w:ascii="Arial" w:hAnsi="Arial" w:cs="Arial"/>
-        </w:rPr>
-        <w:t xml:space="preserve">. Include package information in R. Make sure to address the warnings in the code output and the density plots (supplemental) that address these. </w:t>
-      </w:r>
-    </w:p>
-    <w:p>
-      <w:pPr>
-        <w:pStyle w:val="NoSpacing"/>
-        <w:spacing w:line="480" w:lineRule="auto"/>
-        <w:rPr>
-          <w:ins w:id="225" w:author="Smith Vidaurre, Grace" w:date="2025-05-28T19:06:00Z" w16du:dateUtc="2025-05-28T23:06:00Z"/>
-          <w:rFonts w:ascii="Arial" w:hAnsi="Arial" w:cs="Arial"/>
-        </w:rPr>
-      </w:pPr>
-    </w:p>
-    <w:p>
-      <w:pPr>
-        <w:spacing w:line="480" w:lineRule="auto"/>
-        <w:ind w:firstLine="720"/>
-        <w:rPr>
-          <w:ins w:id="226" w:author="Smith Vidaurre, Grace" w:date="2025-05-28T19:06:00Z" w16du:dateUtc="2025-05-28T23:06:00Z"/>
-          <w:rFonts w:ascii="Arial" w:hAnsi="Arial" w:cs="Arial"/>
-        </w:rPr>
-      </w:pPr>
-      <w:proofErr w:type="gramStart"/>
-      <w:ins w:id="227" w:author="Smith Vidaurre, Grace" w:date="2025-05-28T19:06:00Z" w16du:dateUtc="2025-05-28T23:06:00Z">
+      <w:ins w:id="163" w:author="Smith Vidaurre, Grace" w:date="2025-05-28T19:06:00Z" w16du:dateUtc="2025-05-28T23:06:00Z">
         <w:r>
           <w:rPr>
             <w:rFonts w:ascii="Arial" w:hAnsi="Arial" w:cs="Arial"/>
@@ -19584,35 +19420,35 @@
           </w:rPr>
           <w:t xml:space="preserve"> integrate </w:t>
         </w:r>
-        <w:commentRangeStart w:id="228"/>
-        <w:commentRangeStart w:id="229"/>
-        <w:commentRangeStart w:id="230"/>
+        <w:commentRangeStart w:id="164"/>
+        <w:commentRangeStart w:id="165"/>
+        <w:commentRangeStart w:id="166"/>
         <w:r>
           <w:rPr>
             <w:rFonts w:ascii="Arial" w:hAnsi="Arial" w:cs="Arial"/>
           </w:rPr>
           <w:t>We expected to identify clustering accuracies that were generally lower for spectrographic cross-correlation than the edit distance, since spectrographic cross-correlation was performed on strings transformed into synthetic audio files, which may have led to losses of the original information or added noise</w:t>
         </w:r>
-        <w:commentRangeEnd w:id="228"/>
+        <w:commentRangeEnd w:id="164"/>
         <w:r>
           <w:rPr>
             <w:rStyle w:val="CommentReference"/>
           </w:rPr>
-          <w:commentReference w:id="228"/>
+          <w:commentReference w:id="164"/>
         </w:r>
-        <w:commentRangeEnd w:id="229"/>
+        <w:commentRangeEnd w:id="165"/>
         <w:r>
           <w:rPr>
             <w:rStyle w:val="CommentReference"/>
           </w:rPr>
-          <w:commentReference w:id="229"/>
+          <w:commentReference w:id="165"/>
         </w:r>
-        <w:commentRangeEnd w:id="230"/>
+        <w:commentRangeEnd w:id="166"/>
         <w:r>
           <w:rPr>
             <w:rStyle w:val="CommentReference"/>
           </w:rPr>
-          <w:commentReference w:id="230"/>
+          <w:commentReference w:id="166"/>
         </w:r>
         <w:r>
           <w:rPr>
@@ -21557,7 +21393,7 @@
           <w:szCs w:val="20"/>
         </w:rPr>
       </w:pPr>
-      <w:del w:id="231" w:author="Smith Vidaurre, Grace" w:date="2025-05-27T21:15:00Z" w16du:dateUtc="2025-05-28T01:15:00Z">
+      <w:del w:id="167" w:author="Smith Vidaurre, Grace" w:date="2025-05-27T21:15:00Z" w16du:dateUtc="2025-05-28T01:15:00Z">
         <w:r>
           <w:rPr>
             <w:noProof/>
@@ -21635,13 +21471,13 @@
           <w:rFonts w:ascii="Arial" w:hAnsi="Arial" w:cs="Arial"/>
         </w:rPr>
       </w:pPr>
-      <w:commentRangeStart w:id="232"/>
-      <w:commentRangeEnd w:id="232"/>
+      <w:commentRangeStart w:id="168"/>
+      <w:commentRangeEnd w:id="168"/>
       <w:r>
         <w:rPr>
           <w:rStyle w:val="CommentReference"/>
         </w:rPr>
-        <w:commentReference w:id="232"/>
+        <w:commentReference w:id="168"/>
       </w:r>
       <w:r>
         <w:rPr>
@@ -21773,7 +21609,7 @@
           <w:rFonts w:ascii="Arial" w:hAnsi="Arial" w:cs="Arial"/>
         </w:rPr>
       </w:pPr>
-      <w:del w:id="233" w:author="Smith Vidaurre, Grace" w:date="2025-05-27T21:15:00Z" w16du:dateUtc="2025-05-28T01:15:00Z">
+      <w:del w:id="169" w:author="Smith Vidaurre, Grace" w:date="2025-05-27T21:15:00Z" w16du:dateUtc="2025-05-28T01:15:00Z">
         <w:r>
           <w:rPr>
             <w:rFonts w:ascii="Arial" w:hAnsi="Arial" w:cs="Arial"/>
@@ -21864,7 +21700,7 @@
           <w:rFonts w:ascii="Arial" w:hAnsi="Arial" w:cs="Arial"/>
         </w:rPr>
       </w:pPr>
-      <w:del w:id="234" w:author="Smith Vidaurre, Grace" w:date="2025-05-27T21:15:00Z" w16du:dateUtc="2025-05-28T01:15:00Z">
+      <w:del w:id="170" w:author="Smith Vidaurre, Grace" w:date="2025-05-27T21:15:00Z" w16du:dateUtc="2025-05-28T01:15:00Z">
         <w:r>
           <w:rPr>
             <w:rFonts w:ascii="Arial" w:hAnsi="Arial" w:cs="Arial"/>
@@ -22029,32 +21865,32 @@
         </w:rPr>
         <w:t xml:space="preserve">). </w:t>
       </w:r>
-      <w:commentRangeStart w:id="235"/>
+      <w:commentRangeStart w:id="171"/>
       <w:r>
         <w:rPr>
           <w:rFonts w:ascii="Arial" w:hAnsi="Arial" w:cs="Arial"/>
         </w:rPr>
         <w:t>This suggests that individuals are being categorized in distinct individual clusters when running traditional bioacoustics analyses on our synthetically generated calls.</w:t>
       </w:r>
-      <w:commentRangeEnd w:id="235"/>
+      <w:commentRangeEnd w:id="171"/>
       <w:r>
         <w:rPr>
           <w:rStyle w:val="CommentReference"/>
         </w:rPr>
-        <w:commentReference w:id="235"/>
-      </w:r>
-    </w:p>
-    <w:p>
-      <w:pPr>
-        <w:rPr>
-          <w:rFonts w:ascii="Arial" w:hAnsi="Arial" w:cs="Arial"/>
-        </w:rPr>
-      </w:pPr>
-    </w:p>
-    <w:p>
-      <w:pPr>
-        <w:rPr>
-          <w:ins w:id="236" w:author="Smith Vidaurre, Grace" w:date="2025-05-22T14:24:00Z" w16du:dateUtc="2025-05-22T18:24:00Z"/>
+        <w:commentReference w:id="171"/>
+      </w:r>
+    </w:p>
+    <w:p>
+      <w:pPr>
+        <w:rPr>
+          <w:rFonts w:ascii="Arial" w:hAnsi="Arial" w:cs="Arial"/>
+        </w:rPr>
+      </w:pPr>
+    </w:p>
+    <w:p>
+      <w:pPr>
+        <w:rPr>
+          <w:ins w:id="172" w:author="Smith Vidaurre, Grace" w:date="2025-05-22T14:24:00Z" w16du:dateUtc="2025-05-22T18:24:00Z"/>
           <w:rFonts w:ascii="Arial" w:hAnsi="Arial" w:cs="Arial"/>
           <w:b/>
           <w:bCs/>
@@ -22072,7 +21908,7 @@
     <w:p>
       <w:pPr>
         <w:rPr>
-          <w:ins w:id="237" w:author="Smith Vidaurre, Grace" w:date="2025-05-22T14:24:00Z" w16du:dateUtc="2025-05-22T18:24:00Z"/>
+          <w:ins w:id="173" w:author="Smith Vidaurre, Grace" w:date="2025-05-22T14:24:00Z" w16du:dateUtc="2025-05-22T18:24:00Z"/>
           <w:rFonts w:ascii="Arial" w:hAnsi="Arial" w:cs="Arial"/>
           <w:b/>
           <w:bCs/>
@@ -22084,7 +21920,7 @@
         <w:spacing w:line="480" w:lineRule="auto"/>
         <w:ind w:firstLine="720"/>
         <w:rPr>
-          <w:ins w:id="238" w:author="Smith Vidaurre, Grace" w:date="2025-05-22T14:25:00Z" w16du:dateUtc="2025-05-22T18:25:00Z"/>
+          <w:ins w:id="174" w:author="Smith Vidaurre, Grace" w:date="2025-05-22T14:25:00Z" w16du:dateUtc="2025-05-22T18:25:00Z"/>
           <w:rFonts w:ascii="Arial" w:hAnsi="Arial" w:cs="Arial"/>
         </w:rPr>
       </w:pPr>
@@ -22130,19 +21966,19 @@
         </w:rPr>
         <w:t xml:space="preserve">, therefore, to study to evolution of vocal learning, we must understand how vocal learners encode and perceive information in learned vocal signals. Studies of the diversity of information encoding across vocal learning taxa could lead to new insights into how vocal learning originated and continues to </w:t>
       </w:r>
-      <w:commentRangeStart w:id="239"/>
+      <w:commentRangeStart w:id="175"/>
       <w:r>
         <w:rPr>
           <w:rFonts w:ascii="Arial" w:hAnsi="Arial" w:cs="Arial"/>
         </w:rPr>
         <w:t>evolve</w:t>
       </w:r>
-      <w:commentRangeEnd w:id="239"/>
+      <w:commentRangeEnd w:id="175"/>
       <w:r>
         <w:rPr>
           <w:rStyle w:val="CommentReference"/>
         </w:rPr>
-        <w:commentReference w:id="239"/>
+        <w:commentReference w:id="175"/>
       </w:r>
       <w:r>
         <w:rPr>
@@ -22156,7 +21992,7 @@
         <w:spacing w:line="480" w:lineRule="auto"/>
         <w:ind w:firstLine="720"/>
         <w:rPr>
-          <w:ins w:id="240" w:author="Smith Vidaurre, Grace" w:date="2025-05-22T14:25:00Z" w16du:dateUtc="2025-05-22T18:25:00Z"/>
+          <w:ins w:id="176" w:author="Smith Vidaurre, Grace" w:date="2025-05-22T14:25:00Z" w16du:dateUtc="2025-05-22T18:25:00Z"/>
           <w:rFonts w:ascii="Arial" w:hAnsi="Arial" w:cs="Arial"/>
         </w:rPr>
       </w:pPr>
@@ -22166,12 +22002,12 @@
         <w:spacing w:line="480" w:lineRule="auto"/>
         <w:ind w:firstLine="720"/>
         <w:rPr>
-          <w:ins w:id="241" w:author="Smith Vidaurre, Grace" w:date="2025-05-22T14:34:00Z" w16du:dateUtc="2025-05-22T18:34:00Z"/>
-          <w:rFonts w:ascii="Arial" w:hAnsi="Arial" w:cs="Arial"/>
-        </w:rPr>
-      </w:pPr>
-      <w:commentRangeStart w:id="242"/>
-      <w:ins w:id="243" w:author="Smith Vidaurre, Grace" w:date="2025-05-22T14:25:00Z" w16du:dateUtc="2025-05-22T18:25:00Z">
+          <w:ins w:id="177" w:author="Smith Vidaurre, Grace" w:date="2025-05-22T14:34:00Z" w16du:dateUtc="2025-05-22T18:34:00Z"/>
+          <w:rFonts w:ascii="Arial" w:hAnsi="Arial" w:cs="Arial"/>
+        </w:rPr>
+      </w:pPr>
+      <w:commentRangeStart w:id="178"/>
+      <w:ins w:id="179" w:author="Smith Vidaurre, Grace" w:date="2025-05-22T14:25:00Z" w16du:dateUtc="2025-05-22T18:25:00Z">
         <w:r>
           <w:rPr>
             <w:rFonts w:ascii="Arial" w:hAnsi="Arial" w:cs="Arial"/>
@@ -22574,12 +22410,12 @@
           </w:rPr>
           <w:t xml:space="preserve">. </w:t>
         </w:r>
-        <w:commentRangeEnd w:id="242"/>
+        <w:commentRangeEnd w:id="178"/>
         <w:r>
           <w:rPr>
             <w:rStyle w:val="CommentReference"/>
           </w:rPr>
-          <w:commentReference w:id="242"/>
+          <w:commentReference w:id="178"/>
         </w:r>
       </w:ins>
     </w:p>
@@ -22588,7 +22424,7 @@
         <w:spacing w:line="480" w:lineRule="auto"/>
         <w:ind w:firstLine="720"/>
         <w:rPr>
-          <w:ins w:id="244" w:author="Smith Vidaurre, Grace" w:date="2025-05-22T14:34:00Z" w16du:dateUtc="2025-05-22T18:34:00Z"/>
+          <w:ins w:id="180" w:author="Smith Vidaurre, Grace" w:date="2025-05-22T14:34:00Z" w16du:dateUtc="2025-05-22T18:34:00Z"/>
           <w:rFonts w:ascii="Arial" w:hAnsi="Arial" w:cs="Arial"/>
         </w:rPr>
       </w:pPr>
@@ -22598,11 +22434,11 @@
         <w:spacing w:line="480" w:lineRule="auto"/>
         <w:ind w:firstLine="720"/>
         <w:rPr>
-          <w:ins w:id="245" w:author="Smith Vidaurre, Grace" w:date="2025-05-22T14:34:00Z" w16du:dateUtc="2025-05-22T18:34:00Z"/>
-          <w:rFonts w:ascii="Arial" w:hAnsi="Arial" w:cs="Arial"/>
-        </w:rPr>
-      </w:pPr>
-      <w:ins w:id="246" w:author="Smith Vidaurre, Grace" w:date="2025-05-22T14:34:00Z" w16du:dateUtc="2025-05-22T18:34:00Z">
+          <w:ins w:id="181" w:author="Smith Vidaurre, Grace" w:date="2025-05-22T14:34:00Z" w16du:dateUtc="2025-05-22T18:34:00Z"/>
+          <w:rFonts w:ascii="Arial" w:hAnsi="Arial" w:cs="Arial"/>
+        </w:rPr>
+      </w:pPr>
+      <w:ins w:id="182" w:author="Smith Vidaurre, Grace" w:date="2025-05-22T14:34:00Z" w16du:dateUtc="2025-05-22T18:34:00Z">
         <w:r>
           <w:rPr>
             <w:rFonts w:ascii="Arial" w:hAnsi="Arial" w:cs="Arial"/>
@@ -22645,19 +22481,19 @@
           </w:rPr>
           <w:t>(</w:t>
         </w:r>
-        <w:commentRangeStart w:id="247"/>
+        <w:commentRangeStart w:id="183"/>
         <w:r>
           <w:rPr>
             <w:rFonts w:ascii="Arial" w:hAnsi="Arial" w:cs="Arial"/>
           </w:rPr>
           <w:t>CITE</w:t>
         </w:r>
-        <w:commentRangeEnd w:id="247"/>
+        <w:commentRangeEnd w:id="183"/>
         <w:r>
           <w:rPr>
             <w:rStyle w:val="CommentReference"/>
           </w:rPr>
-          <w:commentReference w:id="247"/>
+          <w:commentReference w:id="183"/>
         </w:r>
         <w:r>
           <w:rPr>
@@ -22709,7 +22545,7 @@
         <w:spacing w:line="480" w:lineRule="auto"/>
         <w:ind w:firstLine="720"/>
         <w:rPr>
-          <w:ins w:id="248" w:author="Smith Vidaurre, Grace" w:date="2025-05-22T14:35:00Z" w16du:dateUtc="2025-05-22T18:35:00Z"/>
+          <w:ins w:id="184" w:author="Smith Vidaurre, Grace" w:date="2025-05-22T14:35:00Z" w16du:dateUtc="2025-05-22T18:35:00Z"/>
           <w:rFonts w:ascii="Arial" w:hAnsi="Arial" w:cs="Arial"/>
         </w:rPr>
       </w:pPr>
@@ -22719,11 +22555,11 @@
         <w:spacing w:line="480" w:lineRule="auto"/>
         <w:ind w:firstLine="720"/>
         <w:rPr>
-          <w:ins w:id="249" w:author="Smith Vidaurre, Grace" w:date="2025-06-05T09:40:00Z" w16du:dateUtc="2025-06-05T13:40:00Z"/>
-          <w:rFonts w:ascii="Arial" w:hAnsi="Arial" w:cs="Arial"/>
-        </w:rPr>
-      </w:pPr>
-      <w:ins w:id="250" w:author="Smith Vidaurre, Grace" w:date="2025-05-22T14:35:00Z" w16du:dateUtc="2025-05-22T18:35:00Z">
+          <w:ins w:id="185" w:author="Smith Vidaurre, Grace" w:date="2025-06-05T09:40:00Z" w16du:dateUtc="2025-06-05T13:40:00Z"/>
+          <w:rFonts w:ascii="Arial" w:hAnsi="Arial" w:cs="Arial"/>
+        </w:rPr>
+      </w:pPr>
+      <w:ins w:id="186" w:author="Smith Vidaurre, Grace" w:date="2025-05-22T14:35:00Z" w16du:dateUtc="2025-05-22T18:35:00Z">
         <w:r>
           <w:rPr>
             <w:rFonts w:ascii="Arial" w:hAnsi="Arial" w:cs="Arial"/>
@@ -22773,7 +22609,7 @@
         <w:spacing w:line="480" w:lineRule="auto"/>
         <w:ind w:firstLine="720"/>
         <w:rPr>
-          <w:ins w:id="251" w:author="Smith Vidaurre, Grace" w:date="2025-06-05T09:40:00Z" w16du:dateUtc="2025-06-05T13:40:00Z"/>
+          <w:ins w:id="187" w:author="Smith Vidaurre, Grace" w:date="2025-06-05T09:40:00Z" w16du:dateUtc="2025-06-05T13:40:00Z"/>
           <w:rFonts w:ascii="Arial" w:hAnsi="Arial" w:cs="Arial"/>
         </w:rPr>
       </w:pPr>
@@ -22783,11 +22619,11 @@
         <w:spacing w:line="480" w:lineRule="auto"/>
         <w:ind w:firstLine="720"/>
         <w:rPr>
-          <w:ins w:id="252" w:author="Smith Vidaurre, Grace" w:date="2025-06-05T09:40:00Z" w16du:dateUtc="2025-06-05T13:40:00Z"/>
-          <w:rFonts w:ascii="Arial" w:hAnsi="Arial" w:cs="Arial"/>
-        </w:rPr>
-      </w:pPr>
-      <w:ins w:id="253" w:author="Smith Vidaurre, Grace" w:date="2025-06-05T09:40:00Z" w16du:dateUtc="2025-06-05T13:40:00Z">
+          <w:ins w:id="188" w:author="Smith Vidaurre, Grace" w:date="2025-06-05T09:40:00Z" w16du:dateUtc="2025-06-05T13:40:00Z"/>
+          <w:rFonts w:ascii="Arial" w:hAnsi="Arial" w:cs="Arial"/>
+        </w:rPr>
+      </w:pPr>
+      <w:ins w:id="189" w:author="Smith Vidaurre, Grace" w:date="2025-06-05T09:40:00Z" w16du:dateUtc="2025-06-05T13:40:00Z">
         <w:r>
           <w:rPr>
             <w:rFonts w:ascii="Arial" w:hAnsi="Arial" w:cs="Arial"/>
@@ -22866,7 +22702,7 @@
           <w:bCs/>
         </w:rPr>
       </w:pPr>
-      <w:commentRangeStart w:id="254"/>
+      <w:commentRangeStart w:id="190"/>
       <w:r>
         <w:rPr>
           <w:rFonts w:ascii="Arial" w:hAnsi="Arial" w:cs="Arial"/>
@@ -22901,12 +22737,12 @@
         </w:rPr>
         <w:t xml:space="preserve"> therefore may not be assessing the full scope of how information can be encoded across a range of species.</w:t>
       </w:r>
-      <w:commentRangeEnd w:id="254"/>
+      <w:commentRangeEnd w:id="190"/>
       <w:r>
         <w:rPr>
           <w:rStyle w:val="CommentReference"/>
         </w:rPr>
-        <w:commentReference w:id="254"/>
+        <w:commentReference w:id="190"/>
       </w:r>
     </w:p>
     <w:p>
@@ -22922,7 +22758,7 @@
       <w:pPr>
         <w:spacing w:line="360" w:lineRule="auto"/>
         <w:rPr>
-          <w:ins w:id="255" w:author="Smith Vidaurre, Grace" w:date="2025-06-05T09:32:00Z" w16du:dateUtc="2025-06-05T13:32:00Z"/>
+          <w:ins w:id="191" w:author="Smith Vidaurre, Grace" w:date="2025-06-05T09:32:00Z" w16du:dateUtc="2025-06-05T13:32:00Z"/>
           <w:rFonts w:ascii="Arial" w:hAnsi="Arial" w:cs="Arial"/>
         </w:rPr>
       </w:pPr>
@@ -22932,35 +22768,35 @@
         </w:rPr>
         <w:t xml:space="preserve">Several computationally intensive tools have emerged to assess the degree or types of information encoded in </w:t>
       </w:r>
-      <w:commentRangeStart w:id="256"/>
-      <w:commentRangeStart w:id="257"/>
-      <w:commentRangeStart w:id="258"/>
+      <w:commentRangeStart w:id="192"/>
+      <w:commentRangeStart w:id="193"/>
+      <w:commentRangeStart w:id="194"/>
       <w:r>
         <w:rPr>
           <w:rFonts w:ascii="Arial" w:hAnsi="Arial" w:cs="Arial"/>
         </w:rPr>
         <w:t>signals</w:t>
       </w:r>
-      <w:commentRangeEnd w:id="256"/>
+      <w:commentRangeEnd w:id="192"/>
       <w:r>
         <w:rPr>
           <w:rStyle w:val="CommentReference"/>
         </w:rPr>
-        <w:commentReference w:id="256"/>
-      </w:r>
-      <w:commentRangeEnd w:id="257"/>
+        <w:commentReference w:id="192"/>
+      </w:r>
+      <w:commentRangeEnd w:id="193"/>
       <w:r>
         <w:rPr>
           <w:rStyle w:val="CommentReference"/>
         </w:rPr>
-        <w:commentReference w:id="257"/>
-      </w:r>
-      <w:commentRangeEnd w:id="258"/>
+        <w:commentReference w:id="193"/>
+      </w:r>
+      <w:commentRangeEnd w:id="194"/>
       <w:r>
         <w:rPr>
           <w:rStyle w:val="CommentReference"/>
         </w:rPr>
-        <w:commentReference w:id="258"/>
+        <w:commentReference w:id="194"/>
       </w:r>
       <w:r>
         <w:rPr>
@@ -23264,7 +23100,7 @@
       <w:pPr>
         <w:spacing w:line="360" w:lineRule="auto"/>
         <w:rPr>
-          <w:ins w:id="259" w:author="Smith Vidaurre, Grace" w:date="2025-06-05T09:32:00Z" w16du:dateUtc="2025-06-05T13:32:00Z"/>
+          <w:ins w:id="195" w:author="Smith Vidaurre, Grace" w:date="2025-06-05T09:32:00Z" w16du:dateUtc="2025-06-05T13:32:00Z"/>
           <w:rFonts w:ascii="Arial" w:hAnsi="Arial" w:cs="Arial"/>
         </w:rPr>
       </w:pPr>
@@ -23274,11 +23110,11 @@
         <w:spacing w:line="480" w:lineRule="auto"/>
         <w:ind w:firstLine="720"/>
         <w:rPr>
-          <w:ins w:id="260" w:author="Smith Vidaurre, Grace" w:date="2025-06-05T09:32:00Z" w16du:dateUtc="2025-06-05T13:32:00Z"/>
-          <w:rFonts w:ascii="Arial" w:hAnsi="Arial" w:cs="Arial"/>
-        </w:rPr>
-      </w:pPr>
-      <w:ins w:id="261" w:author="Smith Vidaurre, Grace" w:date="2025-06-05T09:32:00Z" w16du:dateUtc="2025-06-05T13:32:00Z">
+          <w:ins w:id="196" w:author="Smith Vidaurre, Grace" w:date="2025-06-05T09:32:00Z" w16du:dateUtc="2025-06-05T13:32:00Z"/>
+          <w:rFonts w:ascii="Arial" w:hAnsi="Arial" w:cs="Arial"/>
+        </w:rPr>
+      </w:pPr>
+      <w:ins w:id="197" w:author="Smith Vidaurre, Grace" w:date="2025-06-05T09:32:00Z" w16du:dateUtc="2025-06-05T13:32:00Z">
         <w:r>
           <w:rPr>
             <w:rFonts w:ascii="Arial" w:hAnsi="Arial" w:cs="Arial"/>
@@ -24388,7 +24224,7 @@
       </w:r>
     </w:p>
   </w:comment>
-  <w:comment w:id="211" w:author="Coppinger, Brittany" w:date="2025-02-13T14:09:00Z" w:initials="BC">
+  <w:comment w:id="147" w:author="Coppinger, Brittany" w:date="2025-02-13T14:09:00Z" w:initials="BC">
     <w:p>
       <w:pPr>
         <w:pStyle w:val="CommentText"/>
@@ -24404,7 +24240,7 @@
       </w:r>
     </w:p>
   </w:comment>
-  <w:comment w:id="210" w:author="Coppinger, Brittany" w:date="2025-04-04T12:58:00Z" w:initials="BC">
+  <w:comment w:id="146" w:author="Coppinger, Brittany" w:date="2025-04-04T12:58:00Z" w:initials="BC">
     <w:p>
       <w:pPr>
         <w:pStyle w:val="CommentText"/>
@@ -24420,7 +24256,7 @@
       </w:r>
     </w:p>
   </w:comment>
-  <w:comment w:id="212" w:author="Summer Eckhardt" w:date="2025-01-24T09:51:00Z" w:initials="SE">
+  <w:comment w:id="148" w:author="Summer Eckhardt" w:date="2025-01-24T09:51:00Z" w:initials="SE">
     <w:p>
       <w:pPr>
         <w:pStyle w:val="CommentText"/>
@@ -24436,7 +24272,7 @@
       </w:r>
     </w:p>
   </w:comment>
-  <w:comment w:id="213" w:author="Summer Eckhardt" w:date="2025-01-27T10:41:00Z" w:initials="SE">
+  <w:comment w:id="149" w:author="Summer Eckhardt" w:date="2025-01-27T10:41:00Z" w:initials="SE">
     <w:p>
       <w:pPr>
         <w:pStyle w:val="CommentText"/>
@@ -24452,7 +24288,7 @@
       </w:r>
     </w:p>
   </w:comment>
-  <w:comment w:id="214" w:author="Summer Eckhardt" w:date="2025-01-24T10:02:00Z" w:initials="SE">
+  <w:comment w:id="150" w:author="Summer Eckhardt" w:date="2025-01-24T10:02:00Z" w:initials="SE">
     <w:p>
       <w:pPr>
         <w:pStyle w:val="CommentText"/>
@@ -24468,7 +24304,7 @@
       </w:r>
     </w:p>
   </w:comment>
-  <w:comment w:id="215" w:author="Samman, Raneem" w:date="2025-01-13T15:07:00Z" w:initials="RS">
+  <w:comment w:id="151" w:author="Samman, Raneem" w:date="2025-01-13T15:07:00Z" w:initials="RS">
     <w:p>
       <w:r>
         <w:rPr>
@@ -24486,7 +24322,7 @@
       </w:r>
     </w:p>
   </w:comment>
-  <w:comment w:id="216" w:author="Coppinger, Brittany" w:date="2025-01-15T13:17:00Z" w:initials="BC">
+  <w:comment w:id="152" w:author="Coppinger, Brittany" w:date="2025-01-15T13:17:00Z" w:initials="BC">
     <w:p>
       <w:pPr>
         <w:pStyle w:val="CommentText"/>
@@ -24513,7 +24349,7 @@
       </w:r>
     </w:p>
   </w:comment>
-  <w:comment w:id="217" w:author="Coppinger, Brittany" w:date="2025-01-07T15:07:00Z" w:initials="BC">
+  <w:comment w:id="153" w:author="Coppinger, Brittany" w:date="2025-01-07T15:07:00Z" w:initials="BC">
     <w:p>
       <w:pPr>
         <w:pStyle w:val="CommentText"/>
@@ -24529,7 +24365,7 @@
       </w:r>
     </w:p>
   </w:comment>
-  <w:comment w:id="218" w:author="Samman, Raneem" w:date="2025-01-13T15:08:00Z" w:initials="RS">
+  <w:comment w:id="154" w:author="Samman, Raneem" w:date="2025-01-13T15:08:00Z" w:initials="RS">
     <w:p>
       <w:r>
         <w:rPr>
@@ -24547,7 +24383,7 @@
       </w:r>
     </w:p>
   </w:comment>
-  <w:comment w:id="219" w:author="Samman, Raneem" w:date="2025-01-13T15:10:00Z" w:initials="RS">
+  <w:comment w:id="155" w:author="Samman, Raneem" w:date="2025-01-13T15:10:00Z" w:initials="RS">
     <w:p>
       <w:r>
         <w:rPr>
@@ -24565,7 +24401,7 @@
       </w:r>
     </w:p>
   </w:comment>
-  <w:comment w:id="220" w:author="Coppinger, Brittany" w:date="2025-01-07T15:01:00Z" w:initials="BC">
+  <w:comment w:id="156" w:author="Coppinger, Brittany" w:date="2025-01-07T15:01:00Z" w:initials="BC">
     <w:p>
       <w:pPr>
         <w:pStyle w:val="CommentText"/>
@@ -24581,7 +24417,7 @@
       </w:r>
     </w:p>
   </w:comment>
-  <w:comment w:id="221" w:author="Coppinger, Brittany" w:date="2025-01-07T15:08:00Z" w:initials="BC">
+  <w:comment w:id="157" w:author="Coppinger, Brittany" w:date="2025-01-07T15:08:00Z" w:initials="BC">
     <w:p>
       <w:pPr>
         <w:pStyle w:val="CommentText"/>
@@ -24597,7 +24433,7 @@
       </w:r>
     </w:p>
   </w:comment>
-  <w:comment w:id="222" w:author="Coppinger, Brittany" w:date="2025-01-07T15:12:00Z" w:initials="BC">
+  <w:comment w:id="158" w:author="Coppinger, Brittany" w:date="2025-01-07T15:12:00Z" w:initials="BC">
     <w:p>
       <w:pPr>
         <w:pStyle w:val="CommentText"/>
@@ -24613,7 +24449,7 @@
       </w:r>
     </w:p>
   </w:comment>
-  <w:comment w:id="223" w:author="Coppinger, Brittany" w:date="2025-04-03T14:53:00Z" w:initials="BC">
+  <w:comment w:id="159" w:author="Coppinger, Brittany" w:date="2025-04-03T14:53:00Z" w:initials="BC">
     <w:p>
       <w:pPr>
         <w:pStyle w:val="CommentText"/>
@@ -24629,7 +24465,7 @@
       </w:r>
     </w:p>
   </w:comment>
-  <w:comment w:id="228" w:author="Coppinger, Brittany" w:date="2025-04-10T14:31:00Z" w:initials="BC">
+  <w:comment w:id="164" w:author="Coppinger, Brittany" w:date="2025-04-10T14:31:00Z" w:initials="BC">
     <w:p>
       <w:pPr>
         <w:pStyle w:val="CommentText"/>
@@ -24645,7 +24481,7 @@
       </w:r>
     </w:p>
   </w:comment>
-  <w:comment w:id="229" w:author="Smith Vidaurre, Grace" w:date="2025-05-28T18:58:00Z" w:initials="GSV">
+  <w:comment w:id="165" w:author="Smith Vidaurre, Grace" w:date="2025-05-28T18:58:00Z" w:initials="GSV">
     <w:p>
       <w:r>
         <w:rPr>
@@ -24662,7 +24498,7 @@
       </w:r>
     </w:p>
   </w:comment>
-  <w:comment w:id="230" w:author="Smith Vidaurre, Grace" w:date="2025-05-28T19:00:00Z" w:initials="GSV">
+  <w:comment w:id="166" w:author="Smith Vidaurre, Grace" w:date="2025-05-28T19:00:00Z" w:initials="GSV">
     <w:p>
       <w:r>
         <w:rPr>
@@ -24679,7 +24515,7 @@
       </w:r>
     </w:p>
   </w:comment>
-  <w:comment w:id="232" w:author="Summer Eckhardt" w:date="2025-02-04T18:49:00Z" w:initials="SE">
+  <w:comment w:id="168" w:author="Summer Eckhardt" w:date="2025-02-04T18:49:00Z" w:initials="SE">
     <w:p>
       <w:pPr>
         <w:pStyle w:val="CommentText"/>
@@ -24695,7 +24531,7 @@
       </w:r>
     </w:p>
   </w:comment>
-  <w:comment w:id="235" w:author="Summer Eckhardt" w:date="2025-02-04T19:02:00Z" w:initials="SE">
+  <w:comment w:id="171" w:author="Summer Eckhardt" w:date="2025-02-04T19:02:00Z" w:initials="SE">
     <w:p>
       <w:pPr>
         <w:pStyle w:val="CommentText"/>
@@ -24711,7 +24547,7 @@
       </w:r>
     </w:p>
   </w:comment>
-  <w:comment w:id="239" w:author="Smith Vidaurre, Grace" w:date="2025-05-22T13:33:00Z" w:initials="GSV">
+  <w:comment w:id="175" w:author="Smith Vidaurre, Grace" w:date="2025-05-22T13:33:00Z" w:initials="GSV">
     <w:p>
       <w:r>
         <w:rPr>
@@ -24728,7 +24564,7 @@
       </w:r>
     </w:p>
   </w:comment>
-  <w:comment w:id="242" w:author="Smith Vidaurre, Grace" w:date="2025-05-22T13:23:00Z" w:initials="GSV">
+  <w:comment w:id="178" w:author="Smith Vidaurre, Grace" w:date="2025-05-22T13:23:00Z" w:initials="GSV">
     <w:p>
       <w:r>
         <w:rPr>
@@ -24745,7 +24581,7 @@
       </w:r>
     </w:p>
   </w:comment>
-  <w:comment w:id="247" w:author="Smith Vidaurre, Grace" w:date="2024-12-18T14:31:00Z" w:initials="GSV">
+  <w:comment w:id="183" w:author="Smith Vidaurre, Grace" w:date="2024-12-18T14:31:00Z" w:initials="GSV">
     <w:p>
       <w:r>
         <w:rPr>
@@ -24762,7 +24598,7 @@
       </w:r>
     </w:p>
   </w:comment>
-  <w:comment w:id="254" w:author="Smith Vidaurre, Grace" w:date="2024-12-18T15:30:00Z" w:initials="GSV">
+  <w:comment w:id="190" w:author="Smith Vidaurre, Grace" w:date="2024-12-18T15:30:00Z" w:initials="GSV">
     <w:p>
       <w:r>
         <w:rPr>
@@ -24779,7 +24615,7 @@
       </w:r>
     </w:p>
   </w:comment>
-  <w:comment w:id="256" w:author="Smith Vidaurre, Grace" w:date="2024-12-16T09:35:00Z" w:initials="GSV">
+  <w:comment w:id="192" w:author="Smith Vidaurre, Grace" w:date="2024-12-16T09:35:00Z" w:initials="GSV">
     <w:p>
       <w:r>
         <w:rPr>
@@ -24796,7 +24632,7 @@
       </w:r>
     </w:p>
   </w:comment>
-  <w:comment w:id="257" w:author="Smith Vidaurre, Grace" w:date="2024-12-16T09:41:00Z" w:initials="GSV">
+  <w:comment w:id="193" w:author="Smith Vidaurre, Grace" w:date="2024-12-16T09:41:00Z" w:initials="GSV">
     <w:p>
       <w:r>
         <w:rPr>
@@ -24813,7 +24649,7 @@
       </w:r>
     </w:p>
   </w:comment>
-  <w:comment w:id="258" w:author="Coppinger, Brittany" w:date="2024-12-16T14:51:00Z" w:initials="BC">
+  <w:comment w:id="194" w:author="Coppinger, Brittany" w:date="2024-12-16T14:51:00Z" w:initials="BC">
     <w:p>
       <w:pPr>
         <w:pStyle w:val="CommentText"/>

</xml_diff>

<commit_message>
Restructuring Methods: In progress, finished first section
</commit_message>
<xml_diff>
--- a/drafts/paRsynth_methods_draft.docx
+++ b/drafts/paRsynth_methods_draft.docx
@@ -19315,7 +19315,7 @@
         <w:spacing w:line="480" w:lineRule="auto"/>
         <w:ind w:firstLine="720"/>
         <w:rPr>
-          <w:ins w:id="210" w:author="Smith Vidaurre, Grace" w:date="2025-06-09T12:30:00Z" w16du:dateUtc="2025-06-09T16:30:00Z"/>
+          <w:ins w:id="210" w:author="Smith Vidaurre, Grace" w:date="2025-06-09T14:03:00Z" w16du:dateUtc="2025-06-09T18:03:00Z"/>
           <w:rFonts w:ascii="Arial" w:hAnsi="Arial" w:cs="Arial"/>
         </w:rPr>
       </w:pPr>
@@ -19422,7 +19422,7 @@
           <w:rPr>
             <w:rFonts w:ascii="Arial" w:hAnsi="Arial" w:cs="Arial"/>
           </w:rPr>
-          <w:t>frequency value of 4 kHz to serve as the starting frequency value for each timeseries</w:t>
+          <w:t>value of 4 kHz to serve as the starting frequency value for each timeseries</w:t>
         </w:r>
       </w:ins>
       <w:ins w:id="219" w:author="Smith Vidaurre, Grace" w:date="2025-06-09T12:32:00Z" w16du:dateUtc="2025-06-09T16:32:00Z">
@@ -19433,766 +19433,2304 @@
           <w:t xml:space="preserve">. </w:t>
         </w:r>
       </w:ins>
-      <w:r>
-        <w:rPr>
-          <w:rFonts w:ascii="Arial" w:hAnsi="Arial" w:cs="Arial"/>
-        </w:rPr>
-        <w:t xml:space="preserve">converted each section of the vocalization into frequency anchors, measured in Hz. Each subcomponent of synthetic vocalization started at a randomly selected frequency between (TKTK range). </w:t>
-      </w:r>
-      <w:commentRangeStart w:id="220"/>
-      <w:commentRangeStart w:id="221"/>
-      <w:r>
-        <w:rPr>
-          <w:rFonts w:ascii="Arial" w:hAnsi="Arial" w:cs="Arial"/>
-        </w:rPr>
-        <w:t xml:space="preserve">This starting frequency served as a baseline for creating frequency anchors with Parson’s code, which determined if the next frequency anchor was greater than, less than, or the same as the frequency anchor </w:t>
+      <w:ins w:id="220" w:author="Smith Vidaurre, Grace" w:date="2025-06-09T13:58:00Z" w16du:dateUtc="2025-06-09T17:58:00Z">
+        <w:r>
+          <w:rPr>
+            <w:rFonts w:ascii="Arial" w:hAnsi="Arial" w:cs="Arial"/>
+          </w:rPr>
+          <w:t>Given this starting frequency, we</w:t>
+        </w:r>
+      </w:ins>
+      <w:ins w:id="221" w:author="Smith Vidaurre, Grace" w:date="2025-06-09T14:00:00Z" w16du:dateUtc="2025-06-09T18:00:00Z">
+        <w:r>
+          <w:rPr>
+            <w:rFonts w:ascii="Arial" w:hAnsi="Arial" w:cs="Arial"/>
+          </w:rPr>
+          <w:t xml:space="preserve"> created a timeseries of frequency values </w:t>
+        </w:r>
+        <w:r>
+          <w:rPr>
+            <w:rFonts w:ascii="Arial" w:hAnsi="Arial" w:cs="Arial"/>
+          </w:rPr>
+          <w:t xml:space="preserve">in which </w:t>
+        </w:r>
+      </w:ins>
+      <w:ins w:id="222" w:author="Smith Vidaurre, Grace" w:date="2025-06-09T14:01:00Z" w16du:dateUtc="2025-06-09T18:01:00Z">
+        <w:r>
+          <w:rPr>
+            <w:rFonts w:ascii="Arial" w:hAnsi="Arial" w:cs="Arial"/>
+          </w:rPr>
+          <w:t xml:space="preserve">the following value either shifted up or down in frequency by </w:t>
+        </w:r>
+        <w:r>
+          <w:rPr>
+            <w:rFonts w:ascii="Arial" w:hAnsi="Arial" w:cs="Arial"/>
+          </w:rPr>
+          <w:t>1 kHz</w:t>
+        </w:r>
+        <w:r>
+          <w:rPr>
+            <w:rFonts w:ascii="Arial" w:hAnsi="Arial" w:cs="Arial"/>
+          </w:rPr>
+          <w:t>, or remained constant with respect to the value that came before.</w:t>
+        </w:r>
+      </w:ins>
+      <w:del w:id="223" w:author="Smith Vidaurre, Grace" w:date="2025-06-09T14:01:00Z" w16du:dateUtc="2025-06-09T18:01:00Z">
+        <w:r>
+          <w:rPr>
+            <w:rFonts w:ascii="Arial" w:hAnsi="Arial" w:cs="Arial"/>
+          </w:rPr>
+          <w:delText xml:space="preserve">converted each section of the vocalization into frequency anchors, measured in Hz. Each subcomponent of synthetic vocalization started at a randomly selected frequency between (TKTK range). </w:delText>
+        </w:r>
+        <w:commentRangeStart w:id="224"/>
+        <w:commentRangeStart w:id="225"/>
+        <w:r>
+          <w:rPr>
+            <w:rFonts w:ascii="Arial" w:hAnsi="Arial" w:cs="Arial"/>
+          </w:rPr>
+          <w:delText>This starting frequency served as a baseline for creating frequency anchors with Parson’s code, which determined if the next frequency anchor was greater than, less than, or the same as the frequency anchor before it</w:delText>
+        </w:r>
+      </w:del>
+      <w:ins w:id="226" w:author="Smith Vidaurre, Grace" w:date="2025-06-09T14:01:00Z" w16du:dateUtc="2025-06-09T18:01:00Z">
+        <w:r>
+          <w:rPr>
+            <w:rFonts w:ascii="Arial" w:hAnsi="Arial" w:cs="Arial"/>
+          </w:rPr>
+          <w:t xml:space="preserve"> </w:t>
+        </w:r>
+      </w:ins>
+      <w:del w:id="227" w:author="Smith Vidaurre, Grace" w:date="2025-06-09T14:01:00Z" w16du:dateUtc="2025-06-09T18:01:00Z">
+        <w:r>
+          <w:rPr>
+            <w:rFonts w:ascii="Arial" w:hAnsi="Arial" w:cs="Arial"/>
+          </w:rPr>
+          <w:delText>.</w:delText>
+        </w:r>
+      </w:del>
+      <w:r>
+        <w:rPr>
+          <w:rFonts w:ascii="Arial" w:hAnsi="Arial" w:cs="Arial"/>
+        </w:rPr>
+        <w:t xml:space="preserve"> For example, </w:t>
+      </w:r>
+      <w:ins w:id="228" w:author="Smith Vidaurre, Grace" w:date="2025-06-09T14:02:00Z" w16du:dateUtc="2025-06-09T18:02:00Z">
+        <w:r>
+          <w:rPr>
+            <w:rFonts w:ascii="Arial" w:hAnsi="Arial" w:cs="Arial"/>
+          </w:rPr>
+          <w:t>when</w:t>
+        </w:r>
+      </w:ins>
+      <w:del w:id="229" w:author="Smith Vidaurre, Grace" w:date="2025-06-09T14:02:00Z" w16du:dateUtc="2025-06-09T18:02:00Z">
+        <w:r>
+          <w:rPr>
+            <w:rFonts w:ascii="Arial" w:hAnsi="Arial" w:cs="Arial"/>
+          </w:rPr>
+          <w:delText>if</w:delText>
+        </w:r>
+      </w:del>
+      <w:r>
+        <w:rPr>
+          <w:rFonts w:ascii="Arial" w:hAnsi="Arial" w:cs="Arial"/>
+        </w:rPr>
+        <w:t xml:space="preserve"> a synthetic vocalization started at 4</w:t>
+      </w:r>
+      <w:ins w:id="230" w:author="Smith Vidaurre, Grace" w:date="2025-06-09T14:02:00Z" w16du:dateUtc="2025-06-09T18:02:00Z">
+        <w:r>
+          <w:rPr>
+            <w:rFonts w:ascii="Arial" w:hAnsi="Arial" w:cs="Arial"/>
+          </w:rPr>
+          <w:t xml:space="preserve"> k</w:t>
+        </w:r>
+      </w:ins>
+      <w:del w:id="231" w:author="Smith Vidaurre, Grace" w:date="2025-06-09T14:02:00Z" w16du:dateUtc="2025-06-09T18:02:00Z">
+        <w:r>
+          <w:rPr>
+            <w:rFonts w:ascii="Arial" w:hAnsi="Arial" w:cs="Arial"/>
+          </w:rPr>
+          <w:delText>000</w:delText>
+        </w:r>
+      </w:del>
+      <w:r>
+        <w:rPr>
+          <w:rFonts w:ascii="Arial" w:hAnsi="Arial" w:cs="Arial"/>
+        </w:rPr>
+        <w:t xml:space="preserve">Hz and the first Parson’s code value </w:t>
+      </w:r>
+      <w:ins w:id="232" w:author="Smith Vidaurre, Grace" w:date="2025-06-09T14:02:00Z" w16du:dateUtc="2025-06-09T18:02:00Z">
+        <w:r>
+          <w:rPr>
+            <w:rFonts w:ascii="Arial" w:hAnsi="Arial" w:cs="Arial"/>
+          </w:rPr>
+          <w:t>wa</w:t>
+        </w:r>
+      </w:ins>
+      <w:del w:id="233" w:author="Smith Vidaurre, Grace" w:date="2025-06-09T14:02:00Z" w16du:dateUtc="2025-06-09T18:02:00Z">
+        <w:r>
+          <w:rPr>
+            <w:rFonts w:ascii="Arial" w:hAnsi="Arial" w:cs="Arial"/>
+          </w:rPr>
+          <w:delText>i</w:delText>
+        </w:r>
+      </w:del>
+      <w:r>
+        <w:rPr>
+          <w:rFonts w:ascii="Arial" w:hAnsi="Arial" w:cs="Arial"/>
+        </w:rPr>
+        <w:t>s “</w:t>
+      </w:r>
+      <w:del w:id="234" w:author="Smith Vidaurre, Grace" w:date="2025-06-09T14:02:00Z" w16du:dateUtc="2025-06-09T18:02:00Z">
+        <w:r>
+          <w:rPr>
+            <w:rFonts w:ascii="Arial" w:hAnsi="Arial" w:cs="Arial"/>
+          </w:rPr>
+          <w:delText>constant</w:delText>
+        </w:r>
+      </w:del>
+      <w:ins w:id="235" w:author="Smith Vidaurre, Grace" w:date="2025-06-09T14:02:00Z" w16du:dateUtc="2025-06-09T18:02:00Z">
+        <w:r>
+          <w:rPr>
+            <w:rFonts w:ascii="Arial" w:hAnsi="Arial" w:cs="Arial"/>
+          </w:rPr>
+          <w:t>up</w:t>
+        </w:r>
+      </w:ins>
+      <w:r>
+        <w:rPr>
+          <w:rFonts w:ascii="Arial" w:hAnsi="Arial" w:cs="Arial"/>
+        </w:rPr>
+        <w:t xml:space="preserve">”, then the next frequency </w:t>
+      </w:r>
+      <w:del w:id="236" w:author="Smith Vidaurre, Grace" w:date="2025-06-09T14:02:00Z" w16du:dateUtc="2025-06-09T18:02:00Z">
+        <w:r>
+          <w:rPr>
+            <w:rFonts w:ascii="Arial" w:hAnsi="Arial" w:cs="Arial"/>
+          </w:rPr>
+          <w:delText xml:space="preserve">anchor </w:delText>
+        </w:r>
+      </w:del>
+      <w:ins w:id="237" w:author="Smith Vidaurre, Grace" w:date="2025-06-09T14:02:00Z" w16du:dateUtc="2025-06-09T18:02:00Z">
+        <w:r>
+          <w:rPr>
+            <w:rFonts w:ascii="Arial" w:hAnsi="Arial" w:cs="Arial"/>
+          </w:rPr>
+          <w:t xml:space="preserve">value in the timeseries </w:t>
+        </w:r>
+      </w:ins>
+      <w:r>
+        <w:rPr>
+          <w:rFonts w:ascii="Arial" w:hAnsi="Arial" w:cs="Arial"/>
+        </w:rPr>
+        <w:t>would</w:t>
+      </w:r>
+      <w:del w:id="238" w:author="Smith Vidaurre, Grace" w:date="2025-06-09T14:02:00Z" w16du:dateUtc="2025-06-09T18:02:00Z">
+        <w:r>
+          <w:rPr>
+            <w:rFonts w:ascii="Arial" w:hAnsi="Arial" w:cs="Arial"/>
+          </w:rPr>
+          <w:delText xml:space="preserve"> also</w:delText>
+        </w:r>
+      </w:del>
+      <w:r>
+        <w:rPr>
+          <w:rFonts w:ascii="Arial" w:hAnsi="Arial" w:cs="Arial"/>
+        </w:rPr>
+        <w:t xml:space="preserve"> be </w:t>
+      </w:r>
+      <w:ins w:id="239" w:author="Smith Vidaurre, Grace" w:date="2025-06-09T14:02:00Z" w16du:dateUtc="2025-06-09T18:02:00Z">
+        <w:r>
+          <w:rPr>
+            <w:rFonts w:ascii="Arial" w:hAnsi="Arial" w:cs="Arial"/>
+          </w:rPr>
+          <w:t>5</w:t>
+        </w:r>
+      </w:ins>
+      <w:del w:id="240" w:author="Smith Vidaurre, Grace" w:date="2025-06-09T14:02:00Z" w16du:dateUtc="2025-06-09T18:02:00Z">
+        <w:r>
+          <w:rPr>
+            <w:rFonts w:ascii="Arial" w:hAnsi="Arial" w:cs="Arial"/>
+          </w:rPr>
+          <w:delText>4</w:delText>
+        </w:r>
+      </w:del>
+      <w:ins w:id="241" w:author="Smith Vidaurre, Grace" w:date="2025-06-09T14:02:00Z" w16du:dateUtc="2025-06-09T18:02:00Z">
+        <w:r>
+          <w:rPr>
+            <w:rFonts w:ascii="Arial" w:hAnsi="Arial" w:cs="Arial"/>
+          </w:rPr>
+          <w:t xml:space="preserve"> k</w:t>
+        </w:r>
+      </w:ins>
+      <w:del w:id="242" w:author="Smith Vidaurre, Grace" w:date="2025-06-09T14:02:00Z" w16du:dateUtc="2025-06-09T18:02:00Z">
+        <w:r>
+          <w:rPr>
+            <w:rFonts w:ascii="Arial" w:hAnsi="Arial" w:cs="Arial"/>
+          </w:rPr>
+          <w:delText>000</w:delText>
+        </w:r>
+      </w:del>
+      <w:r>
+        <w:rPr>
+          <w:rFonts w:ascii="Arial" w:hAnsi="Arial" w:cs="Arial"/>
+        </w:rPr>
+        <w:t xml:space="preserve">Hz. However, if the first Parson’s code </w:t>
       </w:r>
       <w:r>
         <w:rPr>
           <w:rFonts w:ascii="Arial" w:hAnsi="Arial" w:cs="Arial"/>
         </w:rPr>
         <w:lastRenderedPageBreak/>
-        <w:t xml:space="preserve">before it. For example, if a synthetic vocalization started at 4000Hz and the first Parson’s code value is “constant”, then the next frequency anchor would also be 4000Hz. However, if the first Parson’s code was “up”, then the second frequency anchor would be 5000Hz. </w:t>
-      </w:r>
-      <w:commentRangeEnd w:id="220"/>
-      <w:r>
-        <w:rPr>
-          <w:rStyle w:val="CommentReference"/>
-        </w:rPr>
-        <w:commentReference w:id="220"/>
-      </w:r>
-      <w:commentRangeEnd w:id="221"/>
-      <w:r>
-        <w:rPr>
-          <w:rStyle w:val="CommentReference"/>
-        </w:rPr>
-        <w:commentReference w:id="221"/>
-      </w:r>
-      <w:r>
-        <w:rPr>
-          <w:rFonts w:ascii="Arial" w:hAnsi="Arial" w:cs="Arial"/>
-        </w:rPr>
-        <w:t xml:space="preserve">Frequency shifts were kept constant at TKTK (I think 1000Hz). The starting frequency anchor was also used as a final frequency anchor in a vocalization subcomponent. Then, using the frequency anchors in each synthetic vocalization to guide frequency modulation patterns, we generated synthetic audio signals using the Soundgen package in R (CITE). The resulting synthetic vocalization files were saved as .wav files.  </w:t>
-      </w:r>
+        <w:t>was “</w:t>
+      </w:r>
+      <w:ins w:id="243" w:author="Smith Vidaurre, Grace" w:date="2025-06-09T14:02:00Z" w16du:dateUtc="2025-06-09T18:02:00Z">
+        <w:r>
+          <w:rPr>
+            <w:rFonts w:ascii="Arial" w:hAnsi="Arial" w:cs="Arial"/>
+          </w:rPr>
+          <w:t>constant</w:t>
+        </w:r>
+      </w:ins>
+      <w:del w:id="244" w:author="Smith Vidaurre, Grace" w:date="2025-06-09T14:02:00Z" w16du:dateUtc="2025-06-09T18:02:00Z">
+        <w:r>
+          <w:rPr>
+            <w:rFonts w:ascii="Arial" w:hAnsi="Arial" w:cs="Arial"/>
+          </w:rPr>
+          <w:delText>up</w:delText>
+        </w:r>
+      </w:del>
+      <w:r>
+        <w:rPr>
+          <w:rFonts w:ascii="Arial" w:hAnsi="Arial" w:cs="Arial"/>
+        </w:rPr>
+        <w:t xml:space="preserve">”, then the second frequency </w:t>
+      </w:r>
+      <w:del w:id="245" w:author="Smith Vidaurre, Grace" w:date="2025-06-09T14:02:00Z" w16du:dateUtc="2025-06-09T18:02:00Z">
+        <w:r>
+          <w:rPr>
+            <w:rFonts w:ascii="Arial" w:hAnsi="Arial" w:cs="Arial"/>
+          </w:rPr>
+          <w:delText xml:space="preserve">anchor </w:delText>
+        </w:r>
+      </w:del>
+      <w:ins w:id="246" w:author="Smith Vidaurre, Grace" w:date="2025-06-09T14:02:00Z" w16du:dateUtc="2025-06-09T18:02:00Z">
+        <w:r>
+          <w:rPr>
+            <w:rFonts w:ascii="Arial" w:hAnsi="Arial" w:cs="Arial"/>
+          </w:rPr>
+          <w:t>value</w:t>
+        </w:r>
+        <w:r>
+          <w:rPr>
+            <w:rFonts w:ascii="Arial" w:hAnsi="Arial" w:cs="Arial"/>
+          </w:rPr>
+          <w:t xml:space="preserve"> </w:t>
+        </w:r>
+      </w:ins>
+      <w:r>
+        <w:rPr>
+          <w:rFonts w:ascii="Arial" w:hAnsi="Arial" w:cs="Arial"/>
+        </w:rPr>
+        <w:t xml:space="preserve">would be </w:t>
+      </w:r>
+      <w:ins w:id="247" w:author="Smith Vidaurre, Grace" w:date="2025-06-09T14:02:00Z" w16du:dateUtc="2025-06-09T18:02:00Z">
+        <w:r>
+          <w:rPr>
+            <w:rFonts w:ascii="Arial" w:hAnsi="Arial" w:cs="Arial"/>
+          </w:rPr>
+          <w:t>4</w:t>
+        </w:r>
+      </w:ins>
+      <w:del w:id="248" w:author="Smith Vidaurre, Grace" w:date="2025-06-09T14:02:00Z" w16du:dateUtc="2025-06-09T18:02:00Z">
+        <w:r>
+          <w:rPr>
+            <w:rFonts w:ascii="Arial" w:hAnsi="Arial" w:cs="Arial"/>
+          </w:rPr>
+          <w:delText>5</w:delText>
+        </w:r>
+      </w:del>
+      <w:ins w:id="249" w:author="Smith Vidaurre, Grace" w:date="2025-06-09T14:02:00Z" w16du:dateUtc="2025-06-09T18:02:00Z">
+        <w:r>
+          <w:rPr>
+            <w:rFonts w:ascii="Arial" w:hAnsi="Arial" w:cs="Arial"/>
+          </w:rPr>
+          <w:t xml:space="preserve"> k</w:t>
+        </w:r>
+      </w:ins>
+      <w:del w:id="250" w:author="Smith Vidaurre, Grace" w:date="2025-06-09T14:02:00Z" w16du:dateUtc="2025-06-09T18:02:00Z">
+        <w:r>
+          <w:rPr>
+            <w:rFonts w:ascii="Arial" w:hAnsi="Arial" w:cs="Arial"/>
+          </w:rPr>
+          <w:delText>000</w:delText>
+        </w:r>
+      </w:del>
+      <w:r>
+        <w:rPr>
+          <w:rFonts w:ascii="Arial" w:hAnsi="Arial" w:cs="Arial"/>
+        </w:rPr>
+        <w:t xml:space="preserve">Hz. </w:t>
+      </w:r>
+      <w:commentRangeEnd w:id="224"/>
+      <w:ins w:id="251" w:author="Smith Vidaurre, Grace" w:date="2025-06-09T14:03:00Z" w16du:dateUtc="2025-06-09T18:03:00Z">
+        <w:r>
+          <w:rPr>
+            <w:rFonts w:ascii="Arial" w:hAnsi="Arial" w:cs="Arial"/>
+          </w:rPr>
+          <w:t>In this step of our pipeline, it is possible to vary the starting frequency value as well as the frequency shift. We</w:t>
+        </w:r>
+        <w:r>
+          <w:rPr>
+            <w:rFonts w:ascii="Arial" w:hAnsi="Arial" w:cs="Arial"/>
+          </w:rPr>
+          <w:t xml:space="preserve"> also</w:t>
+        </w:r>
+        <w:r>
+          <w:rPr>
+            <w:rFonts w:ascii="Arial" w:hAnsi="Arial" w:cs="Arial"/>
+          </w:rPr>
+          <w:t xml:space="preserve"> included two modes of generating frequency timeseries</w:t>
+        </w:r>
+      </w:ins>
+      <w:ins w:id="252" w:author="Smith Vidaurre, Grace" w:date="2025-06-09T14:04:00Z" w16du:dateUtc="2025-06-09T18:04:00Z">
+        <w:r>
+          <w:rPr>
+            <w:rFonts w:ascii="Arial" w:hAnsi="Arial" w:cs="Arial"/>
+          </w:rPr>
+          <w:t xml:space="preserve">, in which the first </w:t>
+        </w:r>
+        <w:r>
+          <w:rPr>
+            <w:rFonts w:ascii="Arial" w:hAnsi="Arial" w:cs="Arial"/>
+          </w:rPr>
+          <w:t xml:space="preserve">and default </w:t>
+        </w:r>
+        <w:r>
+          <w:rPr>
+            <w:rFonts w:ascii="Arial" w:hAnsi="Arial" w:cs="Arial"/>
+          </w:rPr>
+          <w:t>option generates</w:t>
+        </w:r>
+        <w:r>
+          <w:rPr>
+            <w:rFonts w:ascii="Arial" w:hAnsi="Arial" w:cs="Arial"/>
+          </w:rPr>
+          <w:t xml:space="preserve"> frequency values as a continuous trajectory, and the second</w:t>
+        </w:r>
+      </w:ins>
+      <w:ins w:id="253" w:author="Smith Vidaurre, Grace" w:date="2025-06-09T14:05:00Z" w16du:dateUtc="2025-06-09T18:05:00Z">
+        <w:r>
+          <w:rPr>
+            <w:rFonts w:ascii="Arial" w:hAnsi="Arial" w:cs="Arial"/>
+          </w:rPr>
+          <w:t xml:space="preserve"> </w:t>
+        </w:r>
+        <w:r>
+          <w:rPr>
+            <w:rFonts w:ascii="Arial" w:hAnsi="Arial" w:cs="Arial"/>
+          </w:rPr>
+          <w:t>option resets frequency values back to the starting frequency at the start of each subsection</w:t>
+        </w:r>
+        <w:r>
+          <w:rPr>
+            <w:rFonts w:ascii="Arial" w:hAnsi="Arial" w:cs="Arial"/>
+          </w:rPr>
+          <w:t xml:space="preserve"> of the original string</w:t>
+        </w:r>
+        <w:r>
+          <w:rPr>
+            <w:rFonts w:ascii="Arial" w:hAnsi="Arial" w:cs="Arial"/>
+          </w:rPr>
+          <w:t>.</w:t>
+        </w:r>
+      </w:ins>
+      <w:ins w:id="254" w:author="Smith Vidaurre, Grace" w:date="2025-06-09T14:04:00Z" w16du:dateUtc="2025-06-09T18:04:00Z">
+        <w:r>
+          <w:rPr>
+            <w:rFonts w:ascii="Arial" w:hAnsi="Arial" w:cs="Arial"/>
+          </w:rPr>
+          <w:t xml:space="preserve"> </w:t>
+        </w:r>
+        <w:r>
+          <w:rPr>
+            <w:rFonts w:ascii="Arial" w:hAnsi="Arial" w:cs="Arial"/>
+          </w:rPr>
+          <w:t xml:space="preserve"> </w:t>
+        </w:r>
+      </w:ins>
+      <w:ins w:id="255" w:author="Smith Vidaurre, Grace" w:date="2025-06-09T14:03:00Z" w16du:dateUtc="2025-06-09T18:03:00Z">
+        <w:r>
+          <w:rPr>
+            <w:rFonts w:ascii="Arial" w:hAnsi="Arial" w:cs="Arial"/>
+          </w:rPr>
+          <w:t xml:space="preserve"> </w:t>
+        </w:r>
+      </w:ins>
+      <w:del w:id="256" w:author="Smith Vidaurre, Grace" w:date="2025-06-09T14:03:00Z" w16du:dateUtc="2025-06-09T18:03:00Z">
+        <w:r>
+          <w:rPr>
+            <w:rStyle w:val="CommentReference"/>
+          </w:rPr>
+          <w:commentReference w:id="224"/>
+        </w:r>
+        <w:commentRangeEnd w:id="225"/>
+        <w:r>
+          <w:rPr>
+            <w:rStyle w:val="CommentReference"/>
+          </w:rPr>
+          <w:commentReference w:id="225"/>
+        </w:r>
+      </w:del>
     </w:p>
     <w:p>
       <w:pPr>
         <w:spacing w:line="480" w:lineRule="auto"/>
         <w:ind w:firstLine="720"/>
         <w:rPr>
-          <w:ins w:id="222" w:author="Smith Vidaurre, Grace" w:date="2025-06-09T12:30:00Z" w16du:dateUtc="2025-06-09T16:30:00Z"/>
-          <w:rFonts w:ascii="Arial" w:hAnsi="Arial" w:cs="Arial"/>
-        </w:rPr>
-      </w:pPr>
-      <w:ins w:id="223" w:author="Smith Vidaurre, Grace" w:date="2025-06-09T12:32:00Z" w16du:dateUtc="2025-06-09T16:32:00Z">
-        <w:r>
-          <w:rPr>
-            <w:rFonts w:ascii="Arial" w:hAnsi="Arial" w:cs="Arial"/>
-          </w:rPr>
-          <w:t xml:space="preserve">TKTK continuous trajectory versus </w:t>
-        </w:r>
-        <w:r>
-          <w:rPr>
-            <w:rFonts w:ascii="Arial" w:hAnsi="Arial" w:cs="Arial"/>
-          </w:rPr>
-          <w:t>sec</w:t>
+          <w:del w:id="257" w:author="Smith Vidaurre, Grace" w:date="2025-06-09T14:29:00Z" w16du:dateUtc="2025-06-09T18:29:00Z"/>
+          <w:rFonts w:ascii="Arial" w:hAnsi="Arial" w:cs="Arial"/>
+        </w:rPr>
+        <w:pPrChange w:id="258" w:author="Smith Vidaurre, Grace" w:date="2025-06-09T14:33:00Z" w16du:dateUtc="2025-06-09T18:33:00Z">
+          <w:pPr>
+            <w:spacing w:line="480" w:lineRule="auto"/>
+            <w:ind w:firstLine="720"/>
+          </w:pPr>
+        </w:pPrChange>
+      </w:pPr>
+      <w:del w:id="259" w:author="Smith Vidaurre, Grace" w:date="2025-06-09T14:03:00Z" w16du:dateUtc="2025-06-09T18:03:00Z">
+        <w:r>
+          <w:rPr>
+            <w:rFonts w:ascii="Arial" w:hAnsi="Arial" w:cs="Arial"/>
+          </w:rPr>
+          <w:delText xml:space="preserve">Frequency shifts were kept constant at TKTK (I think 1000Hz). The starting frequency anchor was also used as a final frequency anchor in a vocalization subcomponent. </w:delText>
+        </w:r>
+      </w:del>
+      <w:r>
+        <w:rPr>
+          <w:rFonts w:ascii="Arial" w:hAnsi="Arial" w:cs="Arial"/>
+        </w:rPr>
+        <w:t>The</w:t>
+      </w:r>
+      <w:ins w:id="260" w:author="Smith Vidaurre, Grace" w:date="2025-06-09T14:05:00Z" w16du:dateUtc="2025-06-09T18:05:00Z">
+        <w:r>
+          <w:rPr>
+            <w:rFonts w:ascii="Arial" w:hAnsi="Arial" w:cs="Arial"/>
+          </w:rPr>
+          <w:t xml:space="preserve"> fourth and final step in our pipeline</w:t>
         </w:r>
       </w:ins>
-      <w:ins w:id="224" w:author="Smith Vidaurre, Grace" w:date="2025-06-09T12:33:00Z" w16du:dateUtc="2025-06-09T16:33:00Z">
-        <w:r>
-          <w:rPr>
-            <w:rFonts w:ascii="Arial" w:hAnsi="Arial" w:cs="Arial"/>
-          </w:rPr>
-          <w:t>tion transition</w:t>
+      <w:del w:id="261" w:author="Smith Vidaurre, Grace" w:date="2025-06-09T14:05:00Z" w16du:dateUtc="2025-06-09T18:05:00Z">
+        <w:r>
+          <w:rPr>
+            <w:rFonts w:ascii="Arial" w:hAnsi="Arial" w:cs="Arial"/>
+          </w:rPr>
+          <w:delText>n</w:delText>
+        </w:r>
+      </w:del>
+      <w:ins w:id="262" w:author="Smith Vidaurre, Grace" w:date="2025-06-09T14:05:00Z" w16du:dateUtc="2025-06-09T18:05:00Z">
+        <w:r>
+          <w:rPr>
+            <w:rFonts w:ascii="Arial" w:hAnsi="Arial" w:cs="Arial"/>
+          </w:rPr>
+          <w:t xml:space="preserve"> was</w:t>
         </w:r>
       </w:ins>
+      <w:del w:id="263" w:author="Smith Vidaurre, Grace" w:date="2025-06-09T14:05:00Z" w16du:dateUtc="2025-06-09T18:05:00Z">
+        <w:r>
+          <w:rPr>
+            <w:rFonts w:ascii="Arial" w:hAnsi="Arial" w:cs="Arial"/>
+          </w:rPr>
+          <w:delText>,</w:delText>
+        </w:r>
+      </w:del>
+      <w:r>
+        <w:rPr>
+          <w:rFonts w:ascii="Arial" w:hAnsi="Arial" w:cs="Arial"/>
+        </w:rPr>
+        <w:t xml:space="preserve"> </w:t>
+      </w:r>
+      <w:ins w:id="264" w:author="Smith Vidaurre, Grace" w:date="2025-06-09T14:05:00Z" w16du:dateUtc="2025-06-09T18:05:00Z">
+        <w:r>
+          <w:rPr>
+            <w:rFonts w:ascii="Arial" w:hAnsi="Arial" w:cs="Arial"/>
+          </w:rPr>
+          <w:t xml:space="preserve">to </w:t>
+        </w:r>
+      </w:ins>
+      <w:r>
+        <w:rPr>
+          <w:rFonts w:ascii="Arial" w:hAnsi="Arial" w:cs="Arial"/>
+        </w:rPr>
+        <w:t>us</w:t>
+      </w:r>
+      <w:ins w:id="265" w:author="Smith Vidaurre, Grace" w:date="2025-06-09T14:05:00Z" w16du:dateUtc="2025-06-09T18:05:00Z">
+        <w:r>
+          <w:rPr>
+            <w:rFonts w:ascii="Arial" w:hAnsi="Arial" w:cs="Arial"/>
+          </w:rPr>
+          <w:t>e</w:t>
+        </w:r>
+      </w:ins>
+      <w:del w:id="266" w:author="Smith Vidaurre, Grace" w:date="2025-06-09T14:05:00Z" w16du:dateUtc="2025-06-09T18:05:00Z">
+        <w:r>
+          <w:rPr>
+            <w:rFonts w:ascii="Arial" w:hAnsi="Arial" w:cs="Arial"/>
+          </w:rPr>
+          <w:delText>ing</w:delText>
+        </w:r>
+      </w:del>
+      <w:r>
+        <w:rPr>
+          <w:rFonts w:ascii="Arial" w:hAnsi="Arial" w:cs="Arial"/>
+        </w:rPr>
+        <w:t xml:space="preserve"> the frequency </w:t>
+      </w:r>
+      <w:ins w:id="267" w:author="Smith Vidaurre, Grace" w:date="2025-06-09T14:05:00Z" w16du:dateUtc="2025-06-09T18:05:00Z">
+        <w:r>
+          <w:rPr>
+            <w:rFonts w:ascii="Arial" w:hAnsi="Arial" w:cs="Arial"/>
+          </w:rPr>
+          <w:t>timeseries as “</w:t>
+        </w:r>
+      </w:ins>
+      <w:r>
+        <w:rPr>
+          <w:rFonts w:ascii="Arial" w:hAnsi="Arial" w:cs="Arial"/>
+        </w:rPr>
+        <w:t>anchors</w:t>
+      </w:r>
+      <w:ins w:id="268" w:author="Smith Vidaurre, Grace" w:date="2025-06-09T14:05:00Z" w16du:dateUtc="2025-06-09T18:05:00Z">
+        <w:r>
+          <w:rPr>
+            <w:rFonts w:ascii="Arial" w:hAnsi="Arial" w:cs="Arial"/>
+          </w:rPr>
+          <w:t>”</w:t>
+        </w:r>
+      </w:ins>
+      <w:r>
+        <w:rPr>
+          <w:rFonts w:ascii="Arial" w:hAnsi="Arial" w:cs="Arial"/>
+        </w:rPr>
+        <w:t xml:space="preserve"> </w:t>
+      </w:r>
+      <w:ins w:id="269" w:author="Smith Vidaurre, Grace" w:date="2025-06-09T14:06:00Z" w16du:dateUtc="2025-06-09T18:06:00Z">
+        <w:r>
+          <w:rPr>
+            <w:rFonts w:ascii="Arial" w:hAnsi="Arial" w:cs="Arial"/>
+          </w:rPr>
+          <w:t xml:space="preserve">to guide </w:t>
+        </w:r>
+        <w:r>
+          <w:rPr>
+            <w:rFonts w:ascii="Arial" w:hAnsi="Arial" w:cs="Arial"/>
+          </w:rPr>
+          <w:t xml:space="preserve">the generation of </w:t>
+        </w:r>
+        <w:r>
+          <w:rPr>
+            <w:rFonts w:ascii="Arial" w:hAnsi="Arial" w:cs="Arial"/>
+          </w:rPr>
+          <w:t>frequency modulation patterns</w:t>
+        </w:r>
+        <w:r>
+          <w:rPr>
+            <w:rFonts w:ascii="Arial" w:hAnsi="Arial" w:cs="Arial"/>
+          </w:rPr>
+          <w:t xml:space="preserve"> </w:t>
+        </w:r>
+      </w:ins>
+      <w:r>
+        <w:rPr>
+          <w:rFonts w:ascii="Arial" w:hAnsi="Arial" w:cs="Arial"/>
+        </w:rPr>
+        <w:t>in</w:t>
+      </w:r>
+      <w:ins w:id="270" w:author="Smith Vidaurre, Grace" w:date="2025-06-09T14:06:00Z" w16du:dateUtc="2025-06-09T18:06:00Z">
+        <w:r>
+          <w:rPr>
+            <w:rFonts w:ascii="Arial" w:hAnsi="Arial" w:cs="Arial"/>
+          </w:rPr>
+          <w:t xml:space="preserve"> synthetic vocalizations </w:t>
+        </w:r>
+      </w:ins>
+      <w:ins w:id="271" w:author="Smith Vidaurre, Grace" w:date="2025-06-09T14:08:00Z" w16du:dateUtc="2025-06-09T18:08:00Z">
+        <w:r>
+          <w:rPr>
+            <w:rFonts w:ascii="Arial" w:hAnsi="Arial" w:cs="Arial"/>
+          </w:rPr>
+          <w:t xml:space="preserve">with </w:t>
+        </w:r>
+      </w:ins>
+      <w:del w:id="272" w:author="Smith Vidaurre, Grace" w:date="2025-06-09T14:06:00Z" w16du:dateUtc="2025-06-09T18:06:00Z">
+        <w:r>
+          <w:rPr>
+            <w:rFonts w:ascii="Arial" w:hAnsi="Arial" w:cs="Arial"/>
+          </w:rPr>
+          <w:delText xml:space="preserve"> each synthetic vocalization to guide frequency modulation patterns, we generated synthetic audio signals using</w:delText>
+        </w:r>
+      </w:del>
+      <w:del w:id="273" w:author="Smith Vidaurre, Grace" w:date="2025-06-09T14:08:00Z" w16du:dateUtc="2025-06-09T18:08:00Z">
+        <w:r>
+          <w:rPr>
+            <w:rFonts w:ascii="Arial" w:hAnsi="Arial" w:cs="Arial"/>
+          </w:rPr>
+          <w:delText xml:space="preserve"> </w:delText>
+        </w:r>
+      </w:del>
+      <w:r>
+        <w:rPr>
+          <w:rFonts w:ascii="Arial" w:hAnsi="Arial" w:cs="Arial"/>
+        </w:rPr>
+        <w:t xml:space="preserve">the </w:t>
+      </w:r>
+      <w:ins w:id="274" w:author="Smith Vidaurre, Grace" w:date="2025-06-09T14:06:00Z" w16du:dateUtc="2025-06-09T18:06:00Z">
+        <w:r>
+          <w:rPr>
+            <w:rFonts w:ascii="Arial" w:hAnsi="Arial" w:cs="Arial"/>
+          </w:rPr>
+          <w:t>s</w:t>
+        </w:r>
+      </w:ins>
+      <w:del w:id="275" w:author="Smith Vidaurre, Grace" w:date="2025-06-09T14:06:00Z" w16du:dateUtc="2025-06-09T18:06:00Z">
+        <w:r>
+          <w:rPr>
+            <w:rFonts w:ascii="Arial" w:hAnsi="Arial" w:cs="Arial"/>
+          </w:rPr>
+          <w:delText>S</w:delText>
+        </w:r>
+      </w:del>
+      <w:r>
+        <w:rPr>
+          <w:rFonts w:ascii="Arial" w:hAnsi="Arial" w:cs="Arial"/>
+        </w:rPr>
+        <w:t xml:space="preserve">oundgen </w:t>
+      </w:r>
+      <w:ins w:id="276" w:author="Smith Vidaurre, Grace" w:date="2025-06-09T14:06:00Z" w16du:dateUtc="2025-06-09T18:06:00Z">
+        <w:r>
+          <w:rPr>
+            <w:rFonts w:ascii="Arial" w:hAnsi="Arial" w:cs="Arial"/>
+          </w:rPr>
+          <w:t xml:space="preserve">R </w:t>
+        </w:r>
+      </w:ins>
+      <w:r>
+        <w:rPr>
+          <w:rFonts w:ascii="Arial" w:hAnsi="Arial" w:cs="Arial"/>
+        </w:rPr>
+        <w:t>package</w:t>
+      </w:r>
+      <w:ins w:id="277" w:author="Smith Vidaurre, Grace" w:date="2025-06-09T14:13:00Z" w16du:dateUtc="2025-06-09T18:13:00Z">
+        <w:r>
+          <w:rPr>
+            <w:rFonts w:ascii="Arial" w:hAnsi="Arial" w:cs="Arial"/>
+          </w:rPr>
+          <w:t xml:space="preserve"> version 2.7.1</w:t>
+        </w:r>
+      </w:ins>
+      <w:del w:id="278" w:author="Smith Vidaurre, Grace" w:date="2025-06-09T14:06:00Z" w16du:dateUtc="2025-06-09T18:06:00Z">
+        <w:r>
+          <w:rPr>
+            <w:rFonts w:ascii="Arial" w:hAnsi="Arial" w:cs="Arial"/>
+          </w:rPr>
+          <w:delText xml:space="preserve"> in R</w:delText>
+        </w:r>
+      </w:del>
+      <w:r>
+        <w:rPr>
+          <w:rFonts w:ascii="Arial" w:hAnsi="Arial" w:cs="Arial"/>
+        </w:rPr>
+        <w:t xml:space="preserve"> (CITE</w:t>
+      </w:r>
+      <w:ins w:id="279" w:author="Smith Vidaurre, Grace" w:date="2025-06-09T14:09:00Z" w16du:dateUtc="2025-06-09T18:09:00Z">
+        <w:r>
+          <w:rPr>
+            <w:rFonts w:ascii="Arial" w:hAnsi="Arial" w:cs="Arial"/>
+          </w:rPr>
+          <w:t xml:space="preserve"> original Anikin paper</w:t>
+        </w:r>
+      </w:ins>
+      <w:r>
+        <w:rPr>
+          <w:rFonts w:ascii="Arial" w:hAnsi="Arial" w:cs="Arial"/>
+        </w:rPr>
+        <w:t xml:space="preserve">). </w:t>
+      </w:r>
+      <w:ins w:id="280" w:author="Smith Vidaurre, Grace" w:date="2025-06-09T14:09:00Z" w16du:dateUtc="2025-06-09T18:09:00Z">
+        <w:r>
+          <w:rPr>
+            <w:rFonts w:ascii="Arial" w:hAnsi="Arial" w:cs="Arial"/>
+          </w:rPr>
+          <w:t>H</w:t>
+        </w:r>
+      </w:ins>
+      <w:ins w:id="281" w:author="Smith Vidaurre, Grace" w:date="2025-06-09T14:10:00Z" w16du:dateUtc="2025-06-09T18:10:00Z">
+        <w:r>
+          <w:rPr>
+            <w:rFonts w:ascii="Arial" w:hAnsi="Arial" w:cs="Arial"/>
+          </w:rPr>
+          <w:t>ere, we developed a function that relies on the soundgen() function from the soundgen package</w:t>
+        </w:r>
+        <w:r>
+          <w:rPr>
+            <w:rFonts w:ascii="Arial" w:hAnsi="Arial" w:cs="Arial"/>
+          </w:rPr>
+          <w:t xml:space="preserve"> in order to generate synthetic audio files with customized names</w:t>
+        </w:r>
+      </w:ins>
+      <w:ins w:id="282" w:author="Smith Vidaurre, Grace" w:date="2025-06-09T14:11:00Z" w16du:dateUtc="2025-06-09T18:11:00Z">
+        <w:r>
+          <w:rPr>
+            <w:rFonts w:ascii="Arial" w:hAnsi="Arial" w:cs="Arial"/>
+          </w:rPr>
+          <w:t>.</w:t>
+        </w:r>
+        <w:r>
+          <w:rPr>
+            <w:rFonts w:ascii="Arial" w:hAnsi="Arial" w:cs="Arial"/>
+          </w:rPr>
+          <w:t xml:space="preserve"> In this function, we also focused on </w:t>
+        </w:r>
+        <w:r>
+          <w:rPr>
+            <w:rFonts w:ascii="Arial" w:hAnsi="Arial" w:cs="Arial"/>
+          </w:rPr>
+          <w:t xml:space="preserve">a particular subset of arguments to control sound generation </w:t>
+        </w:r>
+      </w:ins>
+      <w:ins w:id="283" w:author="Smith Vidaurre, Grace" w:date="2025-06-09T14:12:00Z" w16du:dateUtc="2025-06-09T18:12:00Z">
+        <w:r>
+          <w:rPr>
+            <w:rFonts w:ascii="Arial" w:hAnsi="Arial" w:cs="Arial"/>
+          </w:rPr>
+          <w:t xml:space="preserve">in ways that helped us create frequency modulated vocal identity signals </w:t>
+        </w:r>
+      </w:ins>
+      <w:ins w:id="284" w:author="Smith Vidaurre, Grace" w:date="2025-06-09T14:11:00Z" w16du:dateUtc="2025-06-09T18:11:00Z">
+        <w:r>
+          <w:rPr>
+            <w:rFonts w:ascii="Arial" w:hAnsi="Arial" w:cs="Arial"/>
+          </w:rPr>
+          <w:t xml:space="preserve">with </w:t>
+        </w:r>
+      </w:ins>
+      <w:ins w:id="285" w:author="Smith Vidaurre, Grace" w:date="2025-06-09T14:12:00Z" w16du:dateUtc="2025-06-09T18:12:00Z">
+        <w:r>
+          <w:rPr>
+            <w:rFonts w:ascii="Arial" w:hAnsi="Arial" w:cs="Arial"/>
+          </w:rPr>
+          <w:t>soundgen.</w:t>
+        </w:r>
+        <w:r>
+          <w:rPr>
+            <w:rFonts w:ascii="Arial" w:hAnsi="Arial" w:cs="Arial"/>
+          </w:rPr>
+          <w:t xml:space="preserve"> First, we </w:t>
+        </w:r>
+        <w:r>
+          <w:rPr>
+            <w:rFonts w:ascii="Arial" w:hAnsi="Arial" w:cs="Arial"/>
+          </w:rPr>
+          <w:t>fed the frequency timeseries to the argument pitch so that soundgen would</w:t>
+        </w:r>
+      </w:ins>
+      <w:ins w:id="286" w:author="Smith Vidaurre, Grace" w:date="2025-06-09T14:13:00Z" w16du:dateUtc="2025-06-09T18:13:00Z">
+        <w:r>
+          <w:rPr>
+            <w:rFonts w:ascii="Arial" w:hAnsi="Arial" w:cs="Arial"/>
+          </w:rPr>
+          <w:t xml:space="preserve"> use these values as “anchors” to guide frequency modulation. In this version of our pipeline, we do not specify timestamps for each frequency value in the timeseries</w:t>
+        </w:r>
+      </w:ins>
+      <w:ins w:id="287" w:author="Smith Vidaurre, Grace" w:date="2025-06-09T14:14:00Z" w16du:dateUtc="2025-06-09T18:14:00Z">
+        <w:r>
+          <w:rPr>
+            <w:rFonts w:ascii="Arial" w:hAnsi="Arial" w:cs="Arial"/>
+          </w:rPr>
+          <w:t>. B</w:t>
+        </w:r>
+      </w:ins>
+      <w:ins w:id="288" w:author="Smith Vidaurre, Grace" w:date="2025-06-09T14:13:00Z" w16du:dateUtc="2025-06-09T18:13:00Z">
+        <w:r>
+          <w:rPr>
+            <w:rFonts w:ascii="Arial" w:hAnsi="Arial" w:cs="Arial"/>
+          </w:rPr>
+          <w:t xml:space="preserve">y default, </w:t>
+        </w:r>
+      </w:ins>
+      <w:ins w:id="289" w:author="Smith Vidaurre, Grace" w:date="2025-06-09T14:14:00Z" w16du:dateUtc="2025-06-09T18:14:00Z">
+        <w:r>
+          <w:rPr>
+            <w:rFonts w:ascii="Arial" w:hAnsi="Arial" w:cs="Arial"/>
+          </w:rPr>
+          <w:t>soundgen version 2.7.1</w:t>
+        </w:r>
+      </w:ins>
+      <w:ins w:id="290" w:author="Smith Vidaurre, Grace" w:date="2025-06-09T14:13:00Z" w16du:dateUtc="2025-06-09T18:13:00Z">
+        <w:r>
+          <w:rPr>
+            <w:rFonts w:ascii="Arial" w:hAnsi="Arial" w:cs="Arial"/>
+          </w:rPr>
+          <w:t xml:space="preserve"> </w:t>
+        </w:r>
+      </w:ins>
+      <w:ins w:id="291" w:author="Smith Vidaurre, Grace" w:date="2025-06-09T14:14:00Z" w16du:dateUtc="2025-06-09T18:14:00Z">
+        <w:r>
+          <w:rPr>
+            <w:rFonts w:ascii="Arial" w:hAnsi="Arial" w:cs="Arial"/>
+          </w:rPr>
+          <w:t xml:space="preserve">considered </w:t>
+        </w:r>
+      </w:ins>
+      <w:ins w:id="292" w:author="Smith Vidaurre, Grace" w:date="2025-06-09T14:13:00Z" w16du:dateUtc="2025-06-09T18:13:00Z">
+        <w:r>
+          <w:rPr>
+            <w:rFonts w:ascii="Arial" w:hAnsi="Arial" w:cs="Arial"/>
+          </w:rPr>
+          <w:t xml:space="preserve">frequency values </w:t>
+        </w:r>
+      </w:ins>
+      <w:ins w:id="293" w:author="Smith Vidaurre, Grace" w:date="2025-06-09T14:14:00Z" w16du:dateUtc="2025-06-09T18:14:00Z">
+        <w:r>
+          <w:rPr>
+            <w:rFonts w:ascii="Arial" w:hAnsi="Arial" w:cs="Arial"/>
+          </w:rPr>
+          <w:t>to be evenly split across</w:t>
+        </w:r>
+      </w:ins>
+      <w:ins w:id="294" w:author="Smith Vidaurre, Grace" w:date="2025-06-09T14:15:00Z" w16du:dateUtc="2025-06-09T18:15:00Z">
+        <w:r>
+          <w:rPr>
+            <w:rFonts w:ascii="Arial" w:hAnsi="Arial" w:cs="Arial"/>
+          </w:rPr>
+          <w:t xml:space="preserve"> the duration of each audio file</w:t>
+        </w:r>
+        <w:r>
+          <w:rPr>
+            <w:rFonts w:ascii="Arial" w:hAnsi="Arial" w:cs="Arial"/>
+          </w:rPr>
+          <w:t xml:space="preserve">, which we specified using the argument sylLen. </w:t>
+        </w:r>
+        <w:r>
+          <w:rPr>
+            <w:rFonts w:ascii="Arial" w:hAnsi="Arial" w:cs="Arial"/>
+          </w:rPr>
+          <w:t xml:space="preserve">We controlled the pitch and audio file sampling rates using the arguments pitchSamplingRate and samplingRate, respectively. We also specified the </w:t>
+        </w:r>
+      </w:ins>
+      <w:ins w:id="295" w:author="Smith Vidaurre, Grace" w:date="2025-06-09T14:16:00Z" w16du:dateUtc="2025-06-09T18:16:00Z">
+        <w:r>
+          <w:rPr>
+            <w:rFonts w:ascii="Arial" w:hAnsi="Arial" w:cs="Arial"/>
+          </w:rPr>
+          <w:t>lowest and highest frequency values</w:t>
+        </w:r>
+        <w:r>
+          <w:rPr>
+            <w:rFonts w:ascii="Arial" w:hAnsi="Arial" w:cs="Arial"/>
+          </w:rPr>
+          <w:t xml:space="preserve"> with pitchFloor and pitchCeiling. </w:t>
+        </w:r>
+        <w:r>
+          <w:rPr>
+            <w:rFonts w:ascii="Arial" w:hAnsi="Arial" w:cs="Arial"/>
+          </w:rPr>
+          <w:t>To generate smoother frequency modulation patterns that better approximated animal vocalizations, we used</w:t>
+        </w:r>
+        <w:r>
+          <w:rPr>
+            <w:rFonts w:ascii="Arial" w:hAnsi="Arial" w:cs="Arial"/>
+          </w:rPr>
+          <w:t xml:space="preserve"> </w:t>
+        </w:r>
+      </w:ins>
+      <w:ins w:id="296" w:author="Smith Vidaurre, Grace" w:date="2025-06-09T14:17:00Z" w16du:dateUtc="2025-06-09T18:17:00Z">
+        <w:r>
+          <w:rPr>
+            <w:rFonts w:ascii="Arial" w:hAnsi="Arial" w:cs="Arial"/>
+          </w:rPr>
+          <w:t xml:space="preserve">Loess </w:t>
+        </w:r>
+      </w:ins>
+      <w:ins w:id="297" w:author="Smith Vidaurre, Grace" w:date="2025-06-09T14:18:00Z" w16du:dateUtc="2025-06-09T18:18:00Z">
+        <w:r>
+          <w:rPr>
+            <w:rFonts w:ascii="Arial" w:hAnsi="Arial" w:cs="Arial"/>
+          </w:rPr>
+          <w:t xml:space="preserve">or local polynomial regression </w:t>
+        </w:r>
+      </w:ins>
+      <w:ins w:id="298" w:author="Smith Vidaurre, Grace" w:date="2025-06-09T14:17:00Z" w16du:dateUtc="2025-06-09T18:17:00Z">
+        <w:r>
+          <w:rPr>
+            <w:rFonts w:ascii="Arial" w:hAnsi="Arial" w:cs="Arial"/>
+          </w:rPr>
+          <w:t>interpolation</w:t>
+        </w:r>
+        <w:r>
+          <w:rPr>
+            <w:rFonts w:ascii="Arial" w:hAnsi="Arial" w:cs="Arial"/>
+          </w:rPr>
+          <w:t xml:space="preserve"> with a</w:t>
+        </w:r>
+      </w:ins>
+      <w:ins w:id="299" w:author="Smith Vidaurre, Grace" w:date="2025-06-09T14:18:00Z" w16du:dateUtc="2025-06-09T18:18:00Z">
+        <w:r>
+          <w:rPr>
+            <w:rFonts w:ascii="Arial" w:hAnsi="Arial" w:cs="Arial"/>
+          </w:rPr>
+          <w:t xml:space="preserve"> “strong” amount of </w:t>
+        </w:r>
+        <w:r>
+          <w:rPr>
+            <w:rFonts w:ascii="Arial" w:hAnsi="Arial" w:cs="Arial"/>
+          </w:rPr>
+          <w:lastRenderedPageBreak/>
+          <w:t>smoothing</w:t>
+        </w:r>
+      </w:ins>
+      <w:ins w:id="300" w:author="Smith Vidaurre, Grace" w:date="2025-06-09T14:17:00Z" w16du:dateUtc="2025-06-09T18:17:00Z">
+        <w:r>
+          <w:rPr>
+            <w:rFonts w:ascii="Arial" w:hAnsi="Arial" w:cs="Arial"/>
+          </w:rPr>
+          <w:t xml:space="preserve"> </w:t>
+        </w:r>
+      </w:ins>
+      <w:ins w:id="301" w:author="Smith Vidaurre, Grace" w:date="2025-06-09T14:18:00Z" w16du:dateUtc="2025-06-09T18:18:00Z">
+        <w:r>
+          <w:rPr>
+            <w:rFonts w:ascii="Arial" w:hAnsi="Arial" w:cs="Arial"/>
+          </w:rPr>
+          <w:t>(</w:t>
+        </w:r>
+      </w:ins>
+      <w:ins w:id="302" w:author="Smith Vidaurre, Grace" w:date="2025-06-09T14:17:00Z" w16du:dateUtc="2025-06-09T18:17:00Z">
+        <w:r>
+          <w:rPr>
+            <w:rFonts w:ascii="Arial" w:hAnsi="Arial" w:cs="Arial"/>
+          </w:rPr>
+          <w:t>span of 1</w:t>
+        </w:r>
+      </w:ins>
+      <w:ins w:id="303" w:author="Smith Vidaurre, Grace" w:date="2025-06-09T14:19:00Z" w16du:dateUtc="2025-06-09T18:19:00Z">
+        <w:r>
+          <w:rPr>
+            <w:rFonts w:ascii="Arial" w:hAnsi="Arial" w:cs="Arial"/>
+          </w:rPr>
+          <w:t>). We</w:t>
+        </w:r>
+      </w:ins>
+      <w:ins w:id="304" w:author="Smith Vidaurre, Grace" w:date="2025-06-09T14:17:00Z" w16du:dateUtc="2025-06-09T18:17:00Z">
+        <w:r>
+          <w:rPr>
+            <w:rFonts w:ascii="Arial" w:hAnsi="Arial" w:cs="Arial"/>
+          </w:rPr>
+          <w:t xml:space="preserve"> </w:t>
+        </w:r>
+      </w:ins>
+      <w:ins w:id="305" w:author="Smith Vidaurre, Grace" w:date="2025-06-09T14:19:00Z" w16du:dateUtc="2025-06-09T18:19:00Z">
+        <w:r>
+          <w:rPr>
+            <w:rFonts w:ascii="Arial" w:hAnsi="Arial" w:cs="Arial"/>
+          </w:rPr>
+          <w:t>turned off options for transitions between frequency anchors that were too close together (discontThresh and jumpThresh), since we were using evenly spaced anchors.</w:t>
+        </w:r>
+      </w:ins>
+      <w:ins w:id="306" w:author="Smith Vidaurre, Grace" w:date="2025-06-09T14:20:00Z" w16du:dateUtc="2025-06-09T18:20:00Z">
+        <w:r>
+          <w:rPr>
+            <w:rFonts w:ascii="Arial" w:hAnsi="Arial" w:cs="Arial"/>
+          </w:rPr>
+          <w:t xml:space="preserve"> We also allowed for up to 5 harmonics in synthetic vocalizations by setting </w:t>
+        </w:r>
+      </w:ins>
+      <w:ins w:id="307" w:author="Smith Vidaurre, Grace" w:date="2025-06-09T14:21:00Z" w16du:dateUtc="2025-06-09T18:21:00Z">
+        <w:r>
+          <w:rPr>
+            <w:rFonts w:ascii="Arial" w:hAnsi="Arial" w:cs="Arial"/>
+          </w:rPr>
+          <w:t xml:space="preserve">5 default amplitude values to the argument rolloffExact. </w:t>
+        </w:r>
+        <w:r>
+          <w:rPr>
+            <w:rFonts w:ascii="Arial" w:hAnsi="Arial" w:cs="Arial"/>
+          </w:rPr>
+          <w:t xml:space="preserve">For our purposes, we wanted to encode identity information in </w:t>
+        </w:r>
+        <w:r>
+          <w:rPr>
+            <w:rFonts w:ascii="Arial" w:hAnsi="Arial" w:cs="Arial"/>
+          </w:rPr>
+          <w:t xml:space="preserve">frequency modulation patterns only, so we turned off formant generation </w:t>
+        </w:r>
+      </w:ins>
+      <w:ins w:id="308" w:author="Smith Vidaurre, Grace" w:date="2025-06-09T14:22:00Z" w16du:dateUtc="2025-06-09T18:22:00Z">
+        <w:r>
+          <w:rPr>
+            <w:rFonts w:ascii="Arial" w:hAnsi="Arial" w:cs="Arial"/>
+          </w:rPr>
+          <w:t xml:space="preserve">specific to different vocal tract lengths by setting default values of NA to the formants and vocalTract arguments. </w:t>
+        </w:r>
+        <w:r>
+          <w:rPr>
+            <w:rFonts w:ascii="Arial" w:hAnsi="Arial" w:cs="Arial"/>
+          </w:rPr>
+          <w:t xml:space="preserve">We also set the default value for soundgen’s hyperparameter for </w:t>
+        </w:r>
+      </w:ins>
+      <w:ins w:id="309" w:author="Smith Vidaurre, Grace" w:date="2025-06-09T14:23:00Z" w16du:dateUtc="2025-06-09T18:23:00Z">
+        <w:r>
+          <w:rPr>
+            <w:rFonts w:ascii="Arial" w:hAnsi="Arial" w:cs="Arial"/>
+          </w:rPr>
+          <w:t xml:space="preserve">varying stochasticity in sound generation to 0, such that the default in our pipeline would </w:t>
+        </w:r>
+        <w:r>
+          <w:rPr>
+            <w:rFonts w:ascii="Arial" w:hAnsi="Arial" w:cs="Arial"/>
+          </w:rPr>
+          <w:t>include no stochasticity of sound generation from soundgen itself</w:t>
+        </w:r>
+        <w:r>
+          <w:rPr>
+            <w:rFonts w:ascii="Arial" w:hAnsi="Arial" w:cs="Arial"/>
+          </w:rPr>
+          <w:t>, although higher values could be specified to turn this stoch</w:t>
+        </w:r>
+      </w:ins>
+      <w:ins w:id="310" w:author="Smith Vidaurre, Grace" w:date="2025-06-09T14:24:00Z" w16du:dateUtc="2025-06-09T18:24:00Z">
+        <w:r>
+          <w:rPr>
+            <w:rFonts w:ascii="Arial" w:hAnsi="Arial" w:cs="Arial"/>
+          </w:rPr>
+          <w:t>a</w:t>
+        </w:r>
+      </w:ins>
+      <w:ins w:id="311" w:author="Smith Vidaurre, Grace" w:date="2025-06-09T14:23:00Z" w16du:dateUtc="2025-06-09T18:23:00Z">
+        <w:r>
+          <w:rPr>
+            <w:rFonts w:ascii="Arial" w:hAnsi="Arial" w:cs="Arial"/>
+          </w:rPr>
+          <w:t>sticity back on</w:t>
+        </w:r>
+        <w:r>
+          <w:rPr>
+            <w:rFonts w:ascii="Arial" w:hAnsi="Arial" w:cs="Arial"/>
+          </w:rPr>
+          <w:t>.</w:t>
+        </w:r>
+      </w:ins>
+      <w:ins w:id="312" w:author="Smith Vidaurre, Grace" w:date="2025-06-09T14:24:00Z" w16du:dateUtc="2025-06-09T18:24:00Z">
+        <w:r>
+          <w:rPr>
+            <w:rFonts w:ascii="Arial" w:hAnsi="Arial" w:cs="Arial"/>
+          </w:rPr>
+          <w:t xml:space="preserve"> We used </w:t>
+        </w:r>
+        <w:r>
+          <w:rPr>
+            <w:rFonts w:ascii="Arial" w:hAnsi="Arial" w:cs="Arial"/>
+          </w:rPr>
+          <w:t>300 ms, the</w:t>
+        </w:r>
+        <w:r>
+          <w:rPr>
+            <w:rFonts w:ascii="Arial" w:hAnsi="Arial" w:cs="Arial"/>
+          </w:rPr>
+          <w:t xml:space="preserve"> default value</w:t>
+        </w:r>
+        <w:r>
+          <w:rPr>
+            <w:rFonts w:ascii="Arial" w:hAnsi="Arial" w:cs="Arial"/>
+          </w:rPr>
+          <w:t xml:space="preserve"> in soundgen, </w:t>
+        </w:r>
+        <w:r>
+          <w:rPr>
+            <w:rFonts w:ascii="Arial" w:hAnsi="Arial" w:cs="Arial"/>
+          </w:rPr>
+          <w:t xml:space="preserve">to specify the minimum </w:t>
+        </w:r>
+      </w:ins>
+      <w:ins w:id="313" w:author="Smith Vidaurre, Grace" w:date="2025-06-09T14:25:00Z" w16du:dateUtc="2025-06-09T18:25:00Z">
+        <w:r>
+          <w:rPr>
+            <w:rFonts w:ascii="Arial" w:hAnsi="Arial" w:cs="Arial"/>
+          </w:rPr>
+          <w:t>signal epoch duration for formant locking or static subharmonics, in the case that formants were turned on.</w:t>
+        </w:r>
+      </w:ins>
+      <w:ins w:id="314" w:author="Smith Vidaurre, Grace" w:date="2025-06-09T14:26:00Z" w16du:dateUtc="2025-06-09T18:26:00Z">
+        <w:r>
+          <w:rPr>
+            <w:rFonts w:ascii="Arial" w:hAnsi="Arial" w:cs="Arial"/>
+          </w:rPr>
+          <w:t xml:space="preserve"> We set the vibrato frequency</w:t>
+        </w:r>
+      </w:ins>
+      <w:ins w:id="315" w:author="Smith Vidaurre, Grace" w:date="2025-06-09T14:27:00Z" w16du:dateUtc="2025-06-09T18:27:00Z">
+        <w:r>
+          <w:rPr>
+            <w:rFonts w:ascii="Arial" w:hAnsi="Arial" w:cs="Arial"/>
+          </w:rPr>
+          <w:t xml:space="preserve"> </w:t>
+        </w:r>
+      </w:ins>
+      <w:ins w:id="316" w:author="Smith Vidaurre, Grace" w:date="2025-06-09T14:26:00Z" w16du:dateUtc="2025-06-09T18:26:00Z">
+        <w:r>
+          <w:rPr>
+            <w:rFonts w:ascii="Arial" w:hAnsi="Arial" w:cs="Arial"/>
+          </w:rPr>
+          <w:t>in Hz, to 1, which was lower than the default of 5</w:t>
+        </w:r>
+      </w:ins>
+      <w:ins w:id="317" w:author="Smith Vidaurre, Grace" w:date="2025-06-09T14:27:00Z" w16du:dateUtc="2025-06-09T18:27:00Z">
+        <w:r>
+          <w:rPr>
+            <w:rFonts w:ascii="Arial" w:hAnsi="Arial" w:cs="Arial"/>
+          </w:rPr>
+          <w:t xml:space="preserve">, to minimize the amount of </w:t>
+        </w:r>
+        <w:r>
+          <w:rPr>
+            <w:rFonts w:ascii="Arial" w:hAnsi="Arial" w:cs="Arial"/>
+          </w:rPr>
+          <w:t>regular pitch modulation</w:t>
+        </w:r>
+        <w:r>
+          <w:rPr>
+            <w:rFonts w:ascii="Arial" w:hAnsi="Arial" w:cs="Arial"/>
+          </w:rPr>
+          <w:t xml:space="preserve"> across each vocalization</w:t>
+        </w:r>
+      </w:ins>
+      <w:ins w:id="318" w:author="Smith Vidaurre, Grace" w:date="2025-06-09T14:26:00Z" w16du:dateUtc="2025-06-09T18:26:00Z">
+        <w:r>
+          <w:rPr>
+            <w:rFonts w:ascii="Arial" w:hAnsi="Arial" w:cs="Arial"/>
+          </w:rPr>
+          <w:t>.</w:t>
+        </w:r>
+      </w:ins>
+      <w:ins w:id="319" w:author="Smith Vidaurre, Grace" w:date="2025-06-09T14:27:00Z" w16du:dateUtc="2025-06-09T18:27:00Z">
+        <w:r>
+          <w:rPr>
+            <w:rFonts w:ascii="Arial" w:hAnsi="Arial" w:cs="Arial"/>
+          </w:rPr>
+          <w:t xml:space="preserve"> </w:t>
+        </w:r>
+      </w:ins>
+      <w:ins w:id="320" w:author="Smith Vidaurre, Grace" w:date="2025-06-09T14:28:00Z" w16du:dateUtc="2025-06-09T18:28:00Z">
+        <w:r>
+          <w:rPr>
+            <w:rFonts w:ascii="Arial" w:hAnsi="Arial" w:cs="Arial"/>
+          </w:rPr>
+          <w:t>We wrote out function so that all of these arguments can be provided the range of values specified by soundge</w:t>
+        </w:r>
+      </w:ins>
+      <w:ins w:id="321" w:author="Smith Vidaurre, Grace" w:date="2025-06-09T14:29:00Z" w16du:dateUtc="2025-06-09T18:29:00Z">
+        <w:r>
+          <w:rPr>
+            <w:rFonts w:ascii="Arial" w:hAnsi="Arial" w:cs="Arial"/>
+          </w:rPr>
+          <w:t xml:space="preserve">n, and with minimal code development by others, it is possible to add other soundgen arguments for greater flexibility. </w:t>
+        </w:r>
+      </w:ins>
+      <w:ins w:id="322" w:author="Smith Vidaurre, Grace" w:date="2025-06-09T14:27:00Z" w16du:dateUtc="2025-06-09T18:27:00Z">
+        <w:r>
+          <w:rPr>
+            <w:rFonts w:ascii="Arial" w:hAnsi="Arial" w:cs="Arial"/>
+          </w:rPr>
+          <w:t xml:space="preserve">The synthetic vocalizations produced using these original arguments from the </w:t>
+        </w:r>
+      </w:ins>
+      <w:ins w:id="323" w:author="Smith Vidaurre, Grace" w:date="2025-06-09T14:28:00Z" w16du:dateUtc="2025-06-09T18:28:00Z">
+        <w:r>
+          <w:rPr>
+            <w:rFonts w:ascii="Arial" w:hAnsi="Arial" w:cs="Arial"/>
+          </w:rPr>
+          <w:t>soundgen package were written out as audio files</w:t>
+        </w:r>
+      </w:ins>
+      <w:ins w:id="324" w:author="Smith Vidaurre, Grace" w:date="2025-06-09T14:29:00Z" w16du:dateUtc="2025-06-09T18:29:00Z">
+        <w:r>
+          <w:rPr>
+            <w:rFonts w:ascii="Arial" w:hAnsi="Arial" w:cs="Arial"/>
+          </w:rPr>
+          <w:t xml:space="preserve"> in .wav format</w:t>
+        </w:r>
+      </w:ins>
+      <w:ins w:id="325" w:author="Smith Vidaurre, Grace" w:date="2025-06-09T14:28:00Z" w16du:dateUtc="2025-06-09T18:28:00Z">
+        <w:r>
+          <w:rPr>
+            <w:rFonts w:ascii="Arial" w:hAnsi="Arial" w:cs="Arial"/>
+          </w:rPr>
+          <w:t xml:space="preserve"> that could then be used in downstream bioacoustics analyses. </w:t>
+        </w:r>
+      </w:ins>
+      <w:del w:id="326" w:author="Smith Vidaurre, Grace" w:date="2025-06-09T14:29:00Z" w16du:dateUtc="2025-06-09T18:29:00Z">
+        <w:r>
+          <w:rPr>
+            <w:rFonts w:ascii="Arial" w:hAnsi="Arial" w:cs="Arial"/>
+          </w:rPr>
+          <w:delText xml:space="preserve">The resulting synthetic vocalization files were saved as .wav files.  </w:delText>
+        </w:r>
+      </w:del>
     </w:p>
     <w:p>
       <w:pPr>
         <w:spacing w:line="480" w:lineRule="auto"/>
         <w:ind w:firstLine="720"/>
         <w:rPr>
-          <w:rFonts w:ascii="Arial" w:hAnsi="Arial" w:cs="Arial"/>
-        </w:rPr>
-      </w:pPr>
-      <w:ins w:id="225" w:author="Smith Vidaurre, Grace" w:date="2025-06-09T12:30:00Z" w16du:dateUtc="2025-06-09T16:30:00Z">
-        <w:r>
-          <w:rPr>
-            <w:rFonts w:ascii="Arial" w:hAnsi="Arial" w:cs="Arial"/>
-          </w:rPr>
-          <w:t>Our choice of starting frequency and frequency steps generated synthetic vocalizations below the ultrasonic range and within the frequency range of human hearing (</w:t>
+          <w:del w:id="327" w:author="Smith Vidaurre, Grace" w:date="2025-06-09T12:00:00Z" w16du:dateUtc="2025-06-09T16:00:00Z"/>
+          <w:rFonts w:ascii="Arial" w:hAnsi="Arial" w:cs="Arial"/>
+        </w:rPr>
+        <w:pPrChange w:id="328" w:author="Smith Vidaurre, Grace" w:date="2025-06-09T14:33:00Z" w16du:dateUtc="2025-06-09T18:33:00Z">
+          <w:pPr>
+            <w:spacing w:line="480" w:lineRule="auto"/>
+            <w:ind w:firstLine="720"/>
+          </w:pPr>
+        </w:pPrChange>
+      </w:pPr>
+      <w:ins w:id="329" w:author="Smith Vidaurre, Grace" w:date="2025-06-09T14:29:00Z" w16du:dateUtc="2025-06-09T18:29:00Z">
+        <w:r>
+          <w:rPr>
+            <w:rFonts w:ascii="Arial" w:hAnsi="Arial" w:cs="Arial"/>
+          </w:rPr>
+          <w:t>Our choice</w:t>
+        </w:r>
+        <w:r>
+          <w:rPr>
+            <w:rFonts w:ascii="Arial" w:hAnsi="Arial" w:cs="Arial"/>
+          </w:rPr>
+          <w:t>s</w:t>
+        </w:r>
+        <w:r>
+          <w:rPr>
+            <w:rFonts w:ascii="Arial" w:hAnsi="Arial" w:cs="Arial"/>
+          </w:rPr>
+          <w:t xml:space="preserve"> of </w:t>
         </w:r>
       </w:ins>
-      <w:ins w:id="226" w:author="Smith Vidaurre, Grace" w:date="2025-06-09T12:31:00Z" w16du:dateUtc="2025-06-09T16:31:00Z">
-        <w:r>
-          <w:rPr>
-            <w:rFonts w:ascii="Arial" w:hAnsi="Arial" w:cs="Arial"/>
-          </w:rPr>
-          <w:t xml:space="preserve">similar to the frequency ranges of avian vocalizations). </w:t>
+      <w:ins w:id="330" w:author="Smith Vidaurre, Grace" w:date="2025-06-09T14:30:00Z" w16du:dateUtc="2025-06-09T18:30:00Z">
+        <w:r>
+          <w:rPr>
+            <w:rFonts w:ascii="Arial" w:hAnsi="Arial" w:cs="Arial"/>
+          </w:rPr>
+          <w:t xml:space="preserve">default </w:t>
         </w:r>
       </w:ins>
+      <w:ins w:id="331" w:author="Smith Vidaurre, Grace" w:date="2025-06-09T14:29:00Z" w16du:dateUtc="2025-06-09T18:29:00Z">
+        <w:r>
+          <w:rPr>
+            <w:rFonts w:ascii="Arial" w:hAnsi="Arial" w:cs="Arial"/>
+          </w:rPr>
+          <w:t>starting frequency and frequency steps generated synthetic vocalizations below the ultrasonic range and within the frequency range of human hearing</w:t>
+        </w:r>
+      </w:ins>
+      <w:ins w:id="332" w:author="Smith Vidaurre, Grace" w:date="2025-06-09T14:30:00Z" w16du:dateUtc="2025-06-09T18:30:00Z">
+        <w:r>
+          <w:rPr>
+            <w:rFonts w:ascii="Arial" w:hAnsi="Arial" w:cs="Arial"/>
+          </w:rPr>
+          <w:t xml:space="preserve">, </w:t>
+        </w:r>
+      </w:ins>
+      <w:ins w:id="333" w:author="Smith Vidaurre, Grace" w:date="2025-06-09T14:29:00Z" w16du:dateUtc="2025-06-09T18:29:00Z">
+        <w:r>
+          <w:rPr>
+            <w:rFonts w:ascii="Arial" w:hAnsi="Arial" w:cs="Arial"/>
+          </w:rPr>
+          <w:t xml:space="preserve">similar to the frequency ranges of avian vocalizations. </w:t>
+        </w:r>
+      </w:ins>
+      <w:del w:id="334" w:author="Smith Vidaurre, Grace" w:date="2025-06-09T12:00:00Z" w16du:dateUtc="2025-06-09T16:00:00Z">
+        <w:r>
+          <w:rPr>
+            <w:rFonts w:ascii="Arial" w:hAnsi="Arial" w:cs="Arial"/>
+          </w:rPr>
+          <w:delText>We used R to generate strings and synthetic audio signals, using the paRsynth package (code found TKTK here).</w:delText>
+        </w:r>
+      </w:del>
     </w:p>
     <w:p>
       <w:pPr>
         <w:spacing w:line="480" w:lineRule="auto"/>
         <w:ind w:firstLine="720"/>
         <w:rPr>
-          <w:ins w:id="227" w:author="Smith Vidaurre, Grace" w:date="2025-06-09T12:00:00Z" w16du:dateUtc="2025-06-09T16:00:00Z"/>
-          <w:rFonts w:ascii="Arial" w:hAnsi="Arial" w:cs="Arial"/>
-        </w:rPr>
-        <w:pPrChange w:id="228" w:author="Smith Vidaurre, Grace" w:date="2025-06-09T12:00:00Z" w16du:dateUtc="2025-06-09T16:00:00Z">
+          <w:rFonts w:ascii="Arial" w:hAnsi="Arial" w:cs="Arial"/>
+        </w:rPr>
+        <w:pPrChange w:id="335" w:author="Smith Vidaurre, Grace" w:date="2025-06-09T14:33:00Z" w16du:dateUtc="2025-06-09T18:33:00Z">
           <w:pPr>
             <w:spacing w:line="480" w:lineRule="auto"/>
           </w:pPr>
         </w:pPrChange>
       </w:pPr>
-      <w:ins w:id="229" w:author="Smith Vidaurre, Grace" w:date="2025-06-09T12:00:00Z" w16du:dateUtc="2025-06-09T16:00:00Z">
-        <w:r>
-          <w:rPr>
-            <w:rFonts w:ascii="Arial" w:hAnsi="Arial" w:cs="Arial"/>
-          </w:rPr>
-          <w:t>TKTK what can be changed in this version of the package, and which changes are coming next.</w:t>
+    </w:p>
+    <w:p>
+      <w:pPr>
+        <w:spacing w:line="480" w:lineRule="auto"/>
+        <w:rPr>
+          <w:ins w:id="336" w:author="Smith Vidaurre, Grace" w:date="2025-06-09T14:30:00Z" w16du:dateUtc="2025-06-09T18:30:00Z"/>
+          <w:rFonts w:ascii="Arial" w:hAnsi="Arial" w:cs="Arial"/>
+          <w:i/>
+          <w:iCs/>
+        </w:rPr>
+      </w:pPr>
+    </w:p>
+    <w:p>
+      <w:pPr>
+        <w:spacing w:line="480" w:lineRule="auto"/>
+        <w:rPr>
+          <w:rFonts w:ascii="Arial" w:hAnsi="Arial" w:cs="Arial"/>
+          <w:i/>
+          <w:iCs/>
+        </w:rPr>
+      </w:pPr>
+      <w:ins w:id="337" w:author="Smith Vidaurre, Grace" w:date="2025-06-09T11:45:00Z" w16du:dateUtc="2025-06-09T15:45:00Z">
+        <w:r>
+          <w:rPr>
+            <w:rFonts w:ascii="Arial" w:hAnsi="Arial" w:cs="Arial"/>
+            <w:i/>
+            <w:iCs/>
+          </w:rPr>
+          <w:t>Example datasets</w:t>
+        </w:r>
+      </w:ins>
+      <w:ins w:id="338" w:author="Smith Vidaurre, Grace" w:date="2025-06-09T14:31:00Z" w16du:dateUtc="2025-06-09T18:31:00Z">
+        <w:r>
+          <w:rPr>
+            <w:rFonts w:ascii="Arial" w:hAnsi="Arial" w:cs="Arial"/>
+            <w:i/>
+            <w:iCs/>
+          </w:rPr>
+          <w:t xml:space="preserve"> with multi-level identity information</w:t>
+        </w:r>
+      </w:ins>
+      <w:del w:id="339" w:author="Smith Vidaurre, Grace" w:date="2025-06-09T14:31:00Z" w16du:dateUtc="2025-06-09T18:31:00Z">
+        <w:r>
+          <w:rPr>
+            <w:rFonts w:ascii="Arial" w:hAnsi="Arial" w:cs="Arial"/>
+            <w:i/>
+            <w:iCs/>
+          </w:rPr>
+          <w:delText>Detecting Synthetic Group and Individual Information in Synthetic Datasets</w:delText>
+        </w:r>
+      </w:del>
+    </w:p>
+    <w:p>
+      <w:pPr>
+        <w:spacing w:line="480" w:lineRule="auto"/>
+        <w:rPr>
+          <w:rFonts w:ascii="Arial" w:hAnsi="Arial" w:cs="Arial"/>
+        </w:rPr>
+        <w:pPrChange w:id="340" w:author="Smith Vidaurre, Grace" w:date="2025-06-09T14:31:00Z" w16du:dateUtc="2025-06-09T18:31:00Z">
+          <w:pPr>
+            <w:spacing w:line="480" w:lineRule="auto"/>
+            <w:ind w:firstLine="720"/>
+          </w:pPr>
+        </w:pPrChange>
+      </w:pPr>
+      <w:r>
+        <w:rPr>
+          <w:rFonts w:ascii="Arial" w:hAnsi="Arial" w:cs="Arial"/>
+        </w:rPr>
+        <w:t>Using the p</w:t>
+      </w:r>
+      <w:ins w:id="341" w:author="Smith Vidaurre, Grace" w:date="2025-06-09T14:32:00Z" w16du:dateUtc="2025-06-09T18:32:00Z">
+        <w:r>
+          <w:rPr>
+            <w:rFonts w:ascii="Arial" w:hAnsi="Arial" w:cs="Arial"/>
+          </w:rPr>
+          <w:t>ipeline</w:t>
+        </w:r>
+      </w:ins>
+      <w:del w:id="342" w:author="Smith Vidaurre, Grace" w:date="2025-06-09T14:32:00Z" w16du:dateUtc="2025-06-09T18:32:00Z">
+        <w:r>
+          <w:rPr>
+            <w:rFonts w:ascii="Arial" w:hAnsi="Arial" w:cs="Arial"/>
+          </w:rPr>
+          <w:delText>rocess</w:delText>
+        </w:r>
+      </w:del>
+      <w:r>
+        <w:rPr>
+          <w:rFonts w:ascii="Arial" w:hAnsi="Arial" w:cs="Arial"/>
+        </w:rPr>
+        <w:t xml:space="preserve"> described above, we created two </w:t>
+      </w:r>
+      <w:del w:id="343" w:author="Smith Vidaurre, Grace" w:date="2025-06-09T14:32:00Z" w16du:dateUtc="2025-06-09T18:32:00Z">
+        <w:r>
+          <w:rPr>
+            <w:rFonts w:ascii="Arial" w:hAnsi="Arial" w:cs="Arial"/>
+          </w:rPr>
+          <w:delText xml:space="preserve">synthetic </w:delText>
+        </w:r>
+      </w:del>
+      <w:ins w:id="344" w:author="Smith Vidaurre, Grace" w:date="2025-06-09T14:32:00Z" w16du:dateUtc="2025-06-09T18:32:00Z">
+        <w:r>
+          <w:rPr>
+            <w:rFonts w:ascii="Arial" w:hAnsi="Arial" w:cs="Arial"/>
+          </w:rPr>
+          <w:t>example</w:t>
+        </w:r>
+        <w:r>
+          <w:rPr>
+            <w:rFonts w:ascii="Arial" w:hAnsi="Arial" w:cs="Arial"/>
+          </w:rPr>
+          <w:t xml:space="preserve"> </w:t>
+        </w:r>
+      </w:ins>
+      <w:r>
+        <w:rPr>
+          <w:rFonts w:ascii="Arial" w:hAnsi="Arial" w:cs="Arial"/>
+        </w:rPr>
+        <w:t>data</w:t>
+      </w:r>
+      <w:del w:id="345" w:author="Smith Vidaurre, Grace" w:date="2025-06-09T14:32:00Z" w16du:dateUtc="2025-06-09T18:32:00Z">
+        <w:r>
+          <w:rPr>
+            <w:rFonts w:ascii="Arial" w:hAnsi="Arial" w:cs="Arial"/>
+          </w:rPr>
+          <w:delText xml:space="preserve"> </w:delText>
+        </w:r>
+      </w:del>
+      <w:r>
+        <w:rPr>
+          <w:rFonts w:ascii="Arial" w:hAnsi="Arial" w:cs="Arial"/>
+        </w:rPr>
+        <w:t xml:space="preserve">sets: </w:t>
+      </w:r>
+      <w:ins w:id="346" w:author="Smith Vidaurre, Grace" w:date="2025-06-09T14:33:00Z" w16du:dateUtc="2025-06-09T18:33:00Z">
+        <w:r>
+          <w:rPr>
+            <w:rFonts w:ascii="Arial" w:hAnsi="Arial" w:cs="Arial"/>
+          </w:rPr>
+          <w:t xml:space="preserve">(1) </w:t>
+        </w:r>
+      </w:ins>
+      <w:del w:id="347" w:author="Smith Vidaurre, Grace" w:date="2025-06-09T14:33:00Z" w16du:dateUtc="2025-06-09T18:33:00Z">
+        <w:r>
+          <w:rPr>
+            <w:rFonts w:ascii="Arial" w:hAnsi="Arial" w:cs="Arial"/>
+          </w:rPr>
+          <w:delText xml:space="preserve">one </w:delText>
+        </w:r>
+      </w:del>
+      <w:del w:id="348" w:author="Smith Vidaurre, Grace" w:date="2025-06-09T14:32:00Z" w16du:dateUtc="2025-06-09T18:32:00Z">
+        <w:r>
+          <w:rPr>
+            <w:rFonts w:ascii="Arial" w:hAnsi="Arial" w:cs="Arial"/>
+          </w:rPr>
+          <w:delText xml:space="preserve">that created </w:delText>
+        </w:r>
+        <w:commentRangeStart w:id="349"/>
+        <w:commentRangeStart w:id="350"/>
+        <w:r>
+          <w:rPr>
+            <w:rFonts w:ascii="Arial" w:hAnsi="Arial" w:cs="Arial"/>
+          </w:rPr>
+          <w:delText xml:space="preserve">vocalizations </w:delText>
+        </w:r>
+        <w:commentRangeEnd w:id="349"/>
+        <w:r>
+          <w:rPr>
+            <w:rStyle w:val="CommentReference"/>
+          </w:rPr>
+          <w:commentReference w:id="349"/>
+        </w:r>
+        <w:commentRangeEnd w:id="350"/>
+        <w:r>
+          <w:rPr>
+            <w:rStyle w:val="CommentReference"/>
+          </w:rPr>
+          <w:commentReference w:id="350"/>
+        </w:r>
+      </w:del>
+      <w:del w:id="351" w:author="Smith Vidaurre, Grace" w:date="2025-06-09T14:33:00Z" w16du:dateUtc="2025-06-09T18:33:00Z">
+        <w:r>
+          <w:rPr>
+            <w:rFonts w:ascii="Arial" w:hAnsi="Arial" w:cs="Arial"/>
+          </w:rPr>
+          <w:delText xml:space="preserve">with </w:delText>
+        </w:r>
+      </w:del>
+      <w:r>
+        <w:rPr>
+          <w:rFonts w:ascii="Arial" w:hAnsi="Arial" w:cs="Arial"/>
+        </w:rPr>
+        <w:t xml:space="preserve">more group membership information than individual </w:t>
+      </w:r>
+      <w:ins w:id="352" w:author="Smith Vidaurre, Grace" w:date="2025-06-09T14:32:00Z" w16du:dateUtc="2025-06-09T18:32:00Z">
+        <w:r>
+          <w:rPr>
+            <w:rFonts w:ascii="Arial" w:hAnsi="Arial" w:cs="Arial"/>
+          </w:rPr>
+          <w:t xml:space="preserve">identity </w:t>
+        </w:r>
+      </w:ins>
+      <w:r>
+        <w:rPr>
+          <w:rFonts w:ascii="Arial" w:hAnsi="Arial" w:cs="Arial"/>
+        </w:rPr>
+        <w:t>information</w:t>
+      </w:r>
+      <w:ins w:id="353" w:author="Smith Vidaurre, Grace" w:date="2025-06-09T14:33:00Z" w16du:dateUtc="2025-06-09T18:33:00Z">
+        <w:r>
+          <w:rPr>
+            <w:rFonts w:ascii="Arial" w:hAnsi="Arial" w:cs="Arial"/>
+          </w:rPr>
+          <w:t xml:space="preserve"> </w:t>
+        </w:r>
+      </w:ins>
+      <w:del w:id="354" w:author="Smith Vidaurre, Grace" w:date="2025-06-09T14:33:00Z" w16du:dateUtc="2025-06-09T18:33:00Z">
+        <w:r>
+          <w:rPr>
+            <w:rFonts w:ascii="Arial" w:hAnsi="Arial" w:cs="Arial"/>
+          </w:rPr>
+          <w:delText xml:space="preserve"> encoded </w:delText>
+        </w:r>
+      </w:del>
+      <w:r>
+        <w:rPr>
+          <w:rFonts w:ascii="Arial" w:hAnsi="Arial" w:cs="Arial"/>
+        </w:rPr>
+        <w:t>(</w:t>
+      </w:r>
+      <w:del w:id="355" w:author="Smith Vidaurre, Grace" w:date="2025-06-09T14:32:00Z" w16du:dateUtc="2025-06-09T18:32:00Z">
+        <w:r>
+          <w:rPr>
+            <w:rFonts w:ascii="Arial" w:hAnsi="Arial" w:cs="Arial"/>
+          </w:rPr>
+          <w:delText>g</w:delText>
+        </w:r>
+        <w:r>
+          <w:rPr>
+            <w:rFonts w:ascii="Arial" w:hAnsi="Arial" w:cs="Arial"/>
+          </w:rPr>
+          <w:delText xml:space="preserve">roup </w:delText>
+        </w:r>
+        <w:r>
+          <w:rPr>
+            <w:rFonts w:ascii="Arial" w:hAnsi="Arial" w:cs="Arial"/>
+          </w:rPr>
+          <w:delText>specific</w:delText>
+        </w:r>
+        <w:r>
+          <w:rPr>
+            <w:rFonts w:ascii="Arial" w:hAnsi="Arial" w:cs="Arial"/>
+          </w:rPr>
+          <w:delText xml:space="preserve"> </w:delText>
+        </w:r>
+        <w:r>
+          <w:rPr>
+            <w:rFonts w:ascii="Arial" w:hAnsi="Arial" w:cs="Arial"/>
+          </w:rPr>
+          <w:delText>i</w:delText>
+        </w:r>
+        <w:r>
+          <w:rPr>
+            <w:rFonts w:ascii="Arial" w:hAnsi="Arial" w:cs="Arial"/>
+          </w:rPr>
+          <w:delText xml:space="preserve">nformation </w:delText>
+        </w:r>
+        <w:r>
+          <w:rPr>
+            <w:rFonts w:ascii="Arial" w:hAnsi="Arial" w:cs="Arial"/>
+          </w:rPr>
+          <w:delText>d</w:delText>
+        </w:r>
+        <w:r>
+          <w:rPr>
+            <w:rFonts w:ascii="Arial" w:hAnsi="Arial" w:cs="Arial"/>
+          </w:rPr>
+          <w:delText xml:space="preserve">ataset: henceforth </w:delText>
+        </w:r>
+      </w:del>
+      <w:r>
+        <w:rPr>
+          <w:rFonts w:ascii="Arial" w:hAnsi="Arial" w:cs="Arial"/>
+        </w:rPr>
+        <w:t xml:space="preserve">the </w:t>
+      </w:r>
+      <w:r>
+        <w:rPr>
+          <w:rFonts w:ascii="Arial" w:hAnsi="Arial" w:cs="Arial"/>
+        </w:rPr>
+        <w:t>group</w:t>
+      </w:r>
+      <w:ins w:id="356" w:author="Smith Vidaurre, Grace" w:date="2025-06-09T14:32:00Z" w16du:dateUtc="2025-06-09T18:32:00Z">
+        <w:r>
+          <w:rPr>
+            <w:rFonts w:ascii="Arial" w:hAnsi="Arial" w:cs="Arial"/>
+          </w:rPr>
+          <w:t>-</w:t>
+        </w:r>
+      </w:ins>
+      <w:del w:id="357" w:author="Smith Vidaurre, Grace" w:date="2025-06-09T14:32:00Z" w16du:dateUtc="2025-06-09T18:32:00Z">
+        <w:r>
+          <w:rPr>
+            <w:rFonts w:ascii="Arial" w:hAnsi="Arial" w:cs="Arial"/>
+          </w:rPr>
+          <w:delText xml:space="preserve"> </w:delText>
+        </w:r>
+      </w:del>
+      <w:r>
+        <w:rPr>
+          <w:rFonts w:ascii="Arial" w:hAnsi="Arial" w:cs="Arial"/>
+        </w:rPr>
+        <w:t>specific</w:t>
+      </w:r>
+      <w:r>
+        <w:rPr>
+          <w:rFonts w:ascii="Arial" w:hAnsi="Arial" w:cs="Arial"/>
+        </w:rPr>
+        <w:t xml:space="preserve"> dataset), and </w:t>
+      </w:r>
+      <w:ins w:id="358" w:author="Smith Vidaurre, Grace" w:date="2025-06-09T14:33:00Z" w16du:dateUtc="2025-06-09T18:33:00Z">
+        <w:r>
+          <w:rPr>
+            <w:rFonts w:ascii="Arial" w:hAnsi="Arial" w:cs="Arial"/>
+          </w:rPr>
+          <w:t xml:space="preserve">(2) </w:t>
+        </w:r>
+      </w:ins>
+      <w:del w:id="359" w:author="Smith Vidaurre, Grace" w:date="2025-06-09T14:33:00Z" w16du:dateUtc="2025-06-09T18:33:00Z">
+        <w:r>
+          <w:rPr>
+            <w:rFonts w:ascii="Arial" w:hAnsi="Arial" w:cs="Arial"/>
+          </w:rPr>
+          <w:delText xml:space="preserve">one </w:delText>
+        </w:r>
+      </w:del>
+      <w:del w:id="360" w:author="Smith Vidaurre, Grace" w:date="2025-06-09T14:32:00Z" w16du:dateUtc="2025-06-09T18:32:00Z">
+        <w:r>
+          <w:rPr>
+            <w:rFonts w:ascii="Arial" w:hAnsi="Arial" w:cs="Arial"/>
+          </w:rPr>
+          <w:delText xml:space="preserve">that created </w:delText>
+        </w:r>
+        <w:commentRangeStart w:id="361"/>
+        <w:r>
+          <w:rPr>
+            <w:rFonts w:ascii="Arial" w:hAnsi="Arial" w:cs="Arial"/>
+          </w:rPr>
+          <w:delText xml:space="preserve">character strings </w:delText>
+        </w:r>
+        <w:commentRangeEnd w:id="361"/>
+        <w:r>
+          <w:rPr>
+            <w:rStyle w:val="CommentReference"/>
+          </w:rPr>
+          <w:commentReference w:id="361"/>
+        </w:r>
+      </w:del>
+      <w:del w:id="362" w:author="Smith Vidaurre, Grace" w:date="2025-06-09T14:33:00Z" w16du:dateUtc="2025-06-09T18:33:00Z">
+        <w:r>
+          <w:rPr>
+            <w:rFonts w:ascii="Arial" w:hAnsi="Arial" w:cs="Arial"/>
+          </w:rPr>
+          <w:delText xml:space="preserve">with </w:delText>
+        </w:r>
+      </w:del>
+      <w:r>
+        <w:rPr>
+          <w:rFonts w:ascii="Arial" w:hAnsi="Arial" w:cs="Arial"/>
+        </w:rPr>
+        <w:t xml:space="preserve">more individual </w:t>
+      </w:r>
+      <w:ins w:id="363" w:author="Smith Vidaurre, Grace" w:date="2025-06-09T14:32:00Z" w16du:dateUtc="2025-06-09T18:32:00Z">
+        <w:r>
+          <w:rPr>
+            <w:rFonts w:ascii="Arial" w:hAnsi="Arial" w:cs="Arial"/>
+          </w:rPr>
+          <w:t xml:space="preserve">identity </w:t>
+        </w:r>
+      </w:ins>
+      <w:del w:id="364" w:author="Smith Vidaurre, Grace" w:date="2025-06-09T14:33:00Z" w16du:dateUtc="2025-06-09T18:33:00Z">
+        <w:r>
+          <w:rPr>
+            <w:rFonts w:ascii="Arial" w:hAnsi="Arial" w:cs="Arial"/>
+          </w:rPr>
+          <w:delText xml:space="preserve">information </w:delText>
+        </w:r>
+      </w:del>
+      <w:r>
+        <w:rPr>
+          <w:rFonts w:ascii="Arial" w:hAnsi="Arial" w:cs="Arial"/>
+        </w:rPr>
+        <w:t>than group membership information</w:t>
+      </w:r>
+      <w:del w:id="365" w:author="Smith Vidaurre, Grace" w:date="2025-06-09T14:32:00Z" w16du:dateUtc="2025-06-09T18:32:00Z">
+        <w:r>
+          <w:rPr>
+            <w:rFonts w:ascii="Arial" w:hAnsi="Arial" w:cs="Arial"/>
+          </w:rPr>
+          <w:delText xml:space="preserve"> encoded</w:delText>
+        </w:r>
+      </w:del>
+      <w:r>
+        <w:rPr>
+          <w:rFonts w:ascii="Arial" w:hAnsi="Arial" w:cs="Arial"/>
+        </w:rPr>
+        <w:t xml:space="preserve"> (</w:t>
+      </w:r>
+      <w:r>
+        <w:rPr>
+          <w:rFonts w:ascii="Arial" w:hAnsi="Arial" w:cs="Arial"/>
+        </w:rPr>
+        <w:t>individual</w:t>
+      </w:r>
+      <w:ins w:id="366" w:author="Smith Vidaurre, Grace" w:date="2025-06-09T14:32:00Z" w16du:dateUtc="2025-06-09T18:32:00Z">
+        <w:r>
+          <w:rPr>
+            <w:rFonts w:ascii="Arial" w:hAnsi="Arial" w:cs="Arial"/>
+          </w:rPr>
+          <w:t>ly distinctive</w:t>
+        </w:r>
+      </w:ins>
+      <w:r>
+        <w:rPr>
+          <w:rFonts w:ascii="Arial" w:hAnsi="Arial" w:cs="Arial"/>
+        </w:rPr>
+        <w:t xml:space="preserve"> </w:t>
+      </w:r>
+      <w:del w:id="367" w:author="Smith Vidaurre, Grace" w:date="2025-06-09T14:32:00Z" w16du:dateUtc="2025-06-09T18:32:00Z">
+        <w:r>
+          <w:rPr>
+            <w:rFonts w:ascii="Arial" w:hAnsi="Arial" w:cs="Arial"/>
+          </w:rPr>
+          <w:delText xml:space="preserve">identity information </w:delText>
+        </w:r>
+      </w:del>
+      <w:r>
+        <w:rPr>
+          <w:rFonts w:ascii="Arial" w:hAnsi="Arial" w:cs="Arial"/>
+        </w:rPr>
+        <w:t>dataset</w:t>
+      </w:r>
+      <w:ins w:id="368" w:author="Smith Vidaurre, Grace" w:date="2025-06-09T14:33:00Z" w16du:dateUtc="2025-06-09T18:33:00Z">
+        <w:r>
+          <w:rPr>
+            <w:rFonts w:ascii="Arial" w:hAnsi="Arial" w:cs="Arial"/>
+          </w:rPr>
+          <w:t>)</w:t>
+        </w:r>
+      </w:ins>
+      <w:del w:id="369" w:author="Smith Vidaurre, Grace" w:date="2025-06-09T14:33:00Z" w16du:dateUtc="2025-06-09T18:33:00Z">
+        <w:r>
+          <w:rPr>
+            <w:rFonts w:ascii="Arial" w:hAnsi="Arial" w:cs="Arial"/>
+          </w:rPr>
+          <w:delText xml:space="preserve">; </w:delText>
+        </w:r>
+        <w:commentRangeStart w:id="370"/>
+        <w:commentRangeEnd w:id="370"/>
+        <w:r>
+          <w:rPr>
+            <w:rStyle w:val="CommentReference"/>
+          </w:rPr>
+          <w:commentReference w:id="370"/>
+        </w:r>
+        <w:r>
+          <w:rPr>
+            <w:rFonts w:ascii="Arial" w:hAnsi="Arial" w:cs="Arial"/>
+          </w:rPr>
+          <w:delText xml:space="preserve">henceforth the </w:delText>
+        </w:r>
+        <w:r>
+          <w:rPr>
+            <w:rFonts w:ascii="Arial" w:hAnsi="Arial" w:cs="Arial"/>
+          </w:rPr>
+          <w:delText>individual identity</w:delText>
+        </w:r>
+        <w:r>
+          <w:rPr>
+            <w:rFonts w:ascii="Arial" w:hAnsi="Arial" w:cs="Arial"/>
+          </w:rPr>
+          <w:delText xml:space="preserve"> dataset)</w:delText>
+        </w:r>
+      </w:del>
+      <w:r>
+        <w:rPr>
+          <w:rFonts w:ascii="Arial" w:hAnsi="Arial" w:cs="Arial"/>
+        </w:rPr>
+        <w:t xml:space="preserve">. In the </w:t>
+      </w:r>
+      <w:r>
+        <w:rPr>
+          <w:rFonts w:ascii="Arial" w:hAnsi="Arial" w:cs="Arial"/>
+        </w:rPr>
+        <w:t>group specific dataset</w:t>
+      </w:r>
+      <w:r>
+        <w:rPr>
+          <w:rFonts w:ascii="Arial" w:hAnsi="Arial" w:cs="Arial"/>
+        </w:rPr>
+        <w:t xml:space="preserve">, individual information was set to a character length of 4 characters, and group member information was set to </w:t>
+      </w:r>
+      <w:commentRangeStart w:id="371"/>
+      <w:r>
+        <w:rPr>
+          <w:rFonts w:ascii="Arial" w:hAnsi="Arial" w:cs="Arial"/>
+        </w:rPr>
+        <w:t>a character length of 8 character</w:t>
+      </w:r>
+      <w:commentRangeEnd w:id="371"/>
+      <w:r>
+        <w:rPr>
+          <w:rStyle w:val="CommentReference"/>
+        </w:rPr>
+        <w:commentReference w:id="371"/>
+      </w:r>
+      <w:r>
+        <w:rPr>
+          <w:rFonts w:ascii="Arial" w:hAnsi="Arial" w:cs="Arial"/>
+        </w:rPr>
+        <w:t xml:space="preserve">. In the </w:t>
+      </w:r>
+      <w:r>
+        <w:rPr>
+          <w:rFonts w:ascii="Arial" w:hAnsi="Arial" w:cs="Arial"/>
+        </w:rPr>
+        <w:t>individual identity dataset</w:t>
+      </w:r>
+      <w:r>
+        <w:rPr>
+          <w:rFonts w:ascii="Arial" w:hAnsi="Arial" w:cs="Arial"/>
+        </w:rPr>
+        <w:t xml:space="preserve">, individual information was set to a </w:t>
+      </w:r>
+      <w:commentRangeStart w:id="372"/>
+      <w:r>
+        <w:rPr>
+          <w:rFonts w:ascii="Arial" w:hAnsi="Arial" w:cs="Arial"/>
+        </w:rPr>
+        <w:t>character length of 8 characters</w:t>
+      </w:r>
+      <w:commentRangeEnd w:id="372"/>
+      <w:r>
+        <w:rPr>
+          <w:rStyle w:val="CommentReference"/>
+        </w:rPr>
+        <w:commentReference w:id="372"/>
+      </w:r>
+      <w:r>
+        <w:rPr>
+          <w:rFonts w:ascii="Arial" w:hAnsi="Arial" w:cs="Arial"/>
+        </w:rPr>
+        <w:t xml:space="preserve">, and group information was set to a character length of 4 characters. For both datasets, there were 5 groups with 10 individuals per group, with 5 unique calls generated per individual. </w:t>
+      </w:r>
+    </w:p>
+    <w:p>
+      <w:pPr>
+        <w:spacing w:line="480" w:lineRule="auto"/>
+        <w:ind w:firstLine="720"/>
+        <w:rPr>
+          <w:rFonts w:ascii="Arial" w:hAnsi="Arial" w:cs="Arial"/>
+        </w:rPr>
+      </w:pPr>
+      <w:r>
+        <w:rPr>
+          <w:rFonts w:ascii="Arial" w:hAnsi="Arial" w:cs="Arial"/>
+        </w:rPr>
+        <w:t xml:space="preserve">After generating synthetic signals for these datasets, we used the soundgen package (TKTK citation) to convert the .wav files to spectrograms (see example of calls in Figures 2B and 3B). To validate that the group and individual information we specified in the character strings could be recovered from the generated frequency signals, we performed spectrographic cross-correlation on each dataset (SPCC; </w:t>
+      </w:r>
+      <w:r>
+        <w:rPr>
+          <w:rFonts w:ascii="Arial" w:hAnsi="Arial" w:cs="Arial"/>
+        </w:rPr>
+        <w:fldChar w:fldCharType="begin"/>
+      </w:r>
+      <w:r>
+        <w:rPr>
+          <w:rFonts w:ascii="Arial" w:hAnsi="Arial" w:cs="Arial"/>
+        </w:rPr>
+        <w:instrText xml:space="preserve"> ADDIN ZOTERO_ITEM CSL_CITATION {"citationID":"2alP2xFJ","properties":{"formattedCitation":"(Clark et al., 1987)","plainCitation":"(Clark et al., 1987)","dontUpdate":true,"noteIndex":0},"citationItems":[{"id":606,"uris":["http://zotero.org/groups/5786507/items/GR5UUI5P"],"itemData":{"id":606,"type":"article-journal","abstract":"Sound spectrograms have been a traditional method for comparing animal vocalizations and demonstrating their similarities or differences, but quantification of the comparative process has been difficult. This lack of quantification has hindered progress in documenting the timing and degree of song development in song birds. With this in mind, computer-based methods for sound comparison and sound averaging were developed. These methods utilize a numerical representation of a sound's frequency-time structure to compute a similarity value between any two sounds and an average sound spectrogram for a set of sounds. These analytical techniques were applied to an analysis of song notes of the swamp sparrow (Melospiza georgiana). The results demonstrate the usefulness of the methods and reveal new details in the description of the swamp sparrow's set of species-universal note types and in the decrease of note variability during the course of developmental transitions from subsong, through plastic song to song crystallization.","container-title":"Ethology","DOI":"10.1111/j.1439-0310.1987.tb00676.x","ISSN":"1439-0310","issue":"2","language":"en","license":"1987 Blackwell Verlag GmbH","note":"_eprint: https://onlinelibrary.wiley.com/doi/pdf/10.1111/j.1439-0310.1987.tb00676.x","page":"101-115","source":"Wiley Online Library","title":"Quantitative Analysis of Animal Vocal Phonology: an Application to Swamp Sparrow Song","title-short":"Quantitative Analysis of Animal Vocal Phonology","volume":"76","author":[{"family":"Clark","given":"Christopher W."},{"family":"Marler","given":"Peter"},{"family":"Beeman","given":"Kim"}],"issued":{"date-parts":[["1987"]]}}}],"schema":"https://github.com/citation-style-language/schema/raw/master/csl-citation.json"} </w:instrText>
+      </w:r>
+      <w:r>
+        <w:rPr>
+          <w:rFonts w:ascii="Arial" w:hAnsi="Arial" w:cs="Arial"/>
+        </w:rPr>
+        <w:fldChar w:fldCharType="separate"/>
+      </w:r>
+      <w:r>
+        <w:rPr>
+          <w:rFonts w:ascii="Arial" w:hAnsi="Arial" w:cs="Arial"/>
+        </w:rPr>
+        <w:t>Clark et al., 1987</w:t>
+      </w:r>
+      <w:r>
+        <w:rPr>
+          <w:rFonts w:ascii="Arial" w:hAnsi="Arial" w:cs="Arial"/>
+        </w:rPr>
+        <w:fldChar w:fldCharType="end"/>
+      </w:r>
+      <w:r>
+        <w:rPr>
+          <w:rFonts w:ascii="Arial" w:hAnsi="Arial" w:cs="Arial"/>
+        </w:rPr>
+        <w:t xml:space="preserve">) using the warbleR package. We performed SPCC with a Hanning window, a window length of 512 samples, and a window overlap of 90 samples. We used a Pearson’s correlation method and a bandpass filter of 0 to 20 kHz. </w:t>
+      </w:r>
+    </w:p>
+    <w:p>
+      <w:pPr>
+        <w:spacing w:line="480" w:lineRule="auto"/>
+        <w:ind w:firstLine="720"/>
+        <w:rPr>
+          <w:ins w:id="373" w:author="Smith Vidaurre, Grace" w:date="2025-06-09T14:31:00Z" w16du:dateUtc="2025-06-09T18:31:00Z"/>
+          <w:rFonts w:ascii="Arial" w:hAnsi="Arial" w:cs="Arial"/>
+        </w:rPr>
+      </w:pPr>
+      <w:r>
+        <w:rPr>
+          <w:rFonts w:ascii="Arial" w:hAnsi="Arial" w:cs="Arial"/>
+        </w:rPr>
+        <w:t xml:space="preserve">To assess hierarchical mapping patterns of our two datasets, we used non-metric multidimensional scaling (MDS) to reduce the dimensionality of the SPCC matrix for each dataset. We performed MDS over 15 dimensions so that the stress of the model was TKTK (less than 5). From these results, we two generated low-dimensional </w:t>
+      </w:r>
+      <w:r>
+        <w:rPr>
+          <w:rFonts w:ascii="Arial" w:hAnsi="Arial" w:cs="Arial"/>
+        </w:rPr>
+        <w:lastRenderedPageBreak/>
+        <w:t xml:space="preserve">acoustic space plots for each dataset, one visualizing the acoustic space between groups and one visualizing the acoustic space between individuals. In doing this for each dataset, we can compare how well the </w:t>
+      </w:r>
+      <w:r>
+        <w:rPr>
+          <w:rFonts w:ascii="Arial" w:hAnsi="Arial" w:cs="Arial"/>
+        </w:rPr>
+        <w:t>group specific</w:t>
+      </w:r>
+      <w:r>
+        <w:rPr>
+          <w:rFonts w:ascii="Arial" w:hAnsi="Arial" w:cs="Arial"/>
+        </w:rPr>
+        <w:t xml:space="preserve"> dataset encodes information at the group level compared to the individual level and vice versa for the </w:t>
+      </w:r>
+      <w:r>
+        <w:rPr>
+          <w:rFonts w:ascii="Arial" w:hAnsi="Arial" w:cs="Arial"/>
+        </w:rPr>
+        <w:t>individual identity dataset</w:t>
+      </w:r>
+      <w:r>
+        <w:rPr>
+          <w:rFonts w:ascii="Arial" w:hAnsi="Arial" w:cs="Arial"/>
+        </w:rPr>
+        <w:t>.</w:t>
+      </w:r>
+      <w:del w:id="374" w:author="Smith Vidaurre, Grace" w:date="2025-06-09T14:31:00Z" w16du:dateUtc="2025-06-09T18:31:00Z">
+        <w:r>
+          <w:rPr>
+            <w:rFonts w:ascii="Arial" w:hAnsi="Arial" w:cs="Arial"/>
+          </w:rPr>
+          <w:delText xml:space="preserve"> </w:delText>
+        </w:r>
+      </w:del>
+    </w:p>
+    <w:p>
+      <w:pPr>
+        <w:spacing w:line="480" w:lineRule="auto"/>
+        <w:ind w:firstLine="720"/>
+        <w:rPr>
+          <w:ins w:id="375" w:author="Smith Vidaurre, Grace" w:date="2025-06-09T14:31:00Z" w16du:dateUtc="2025-06-09T18:31:00Z"/>
+          <w:rFonts w:ascii="Arial" w:hAnsi="Arial" w:cs="Arial"/>
+        </w:rPr>
+      </w:pPr>
+    </w:p>
+    <w:p>
+      <w:pPr>
+        <w:spacing w:line="480" w:lineRule="auto"/>
+        <w:ind w:firstLine="720"/>
+        <w:rPr>
+          <w:rFonts w:ascii="Arial" w:hAnsi="Arial" w:cs="Arial"/>
+        </w:rPr>
+      </w:pPr>
+      <w:ins w:id="376" w:author="Smith Vidaurre, Grace" w:date="2025-06-09T14:31:00Z" w16du:dateUtc="2025-06-09T18:31:00Z">
+        <w:r>
+          <w:rPr>
+            <w:rFonts w:ascii="Arial" w:hAnsi="Arial" w:cs="Arial"/>
+          </w:rPr>
+          <w:t xml:space="preserve">TKTK </w:t>
+        </w:r>
+        <w:r>
+          <w:rPr>
+            <w:rFonts w:ascii="Arial" w:hAnsi="Arial" w:cs="Arial"/>
+            <w:i/>
+            <w:iCs/>
+          </w:rPr>
+          <w:t>encoding spectrograms, acoustic space plots</w:t>
         </w:r>
       </w:ins>
     </w:p>
     <w:p>
       <w:pPr>
         <w:spacing w:line="480" w:lineRule="auto"/>
-        <w:ind w:firstLine="720"/>
-        <w:rPr>
-          <w:del w:id="230" w:author="Smith Vidaurre, Grace" w:date="2025-06-09T12:00:00Z" w16du:dateUtc="2025-06-09T16:00:00Z"/>
-          <w:rFonts w:ascii="Arial" w:hAnsi="Arial" w:cs="Arial"/>
-        </w:rPr>
-      </w:pPr>
-      <w:del w:id="231" w:author="Smith Vidaurre, Grace" w:date="2025-06-09T12:00:00Z" w16du:dateUtc="2025-06-09T16:00:00Z">
-        <w:r>
-          <w:rPr>
-            <w:rFonts w:ascii="Arial" w:hAnsi="Arial" w:cs="Arial"/>
-          </w:rPr>
-          <w:delText>We used R to generate strings and synthetic audio signals, using the paRsynth package (code found TKTK here).</w:delText>
-        </w:r>
-      </w:del>
+        <w:rPr>
+          <w:rFonts w:ascii="Arial" w:hAnsi="Arial" w:cs="Arial"/>
+          <w:i/>
+          <w:iCs/>
+        </w:rPr>
+      </w:pPr>
     </w:p>
     <w:p>
       <w:pPr>
         <w:spacing w:line="480" w:lineRule="auto"/>
         <w:rPr>
           <w:rFonts w:ascii="Arial" w:hAnsi="Arial" w:cs="Arial"/>
-        </w:rPr>
-      </w:pPr>
+          <w:i/>
+          <w:iCs/>
+        </w:rPr>
+      </w:pPr>
+      <w:r>
+        <w:rPr>
+          <w:rFonts w:ascii="Arial" w:hAnsi="Arial" w:cs="Arial"/>
+          <w:i/>
+          <w:iCs/>
+        </w:rPr>
+        <w:t xml:space="preserve">Synthetic Experiments to Assess Accuracy of Information Encoding and Decoding Across a Range of Social </w:t>
+      </w:r>
+      <w:r>
+        <w:rPr>
+          <w:rFonts w:ascii="Arial" w:hAnsi="Arial" w:cs="Arial"/>
+          <w:i/>
+          <w:iCs/>
+        </w:rPr>
+        <w:t xml:space="preserve">Conditions </w:t>
+      </w:r>
     </w:p>
     <w:p>
       <w:pPr>
+        <w:pStyle w:val="NoSpacing"/>
         <w:spacing w:line="480" w:lineRule="auto"/>
         <w:rPr>
           <w:rFonts w:ascii="Arial" w:hAnsi="Arial" w:cs="Arial"/>
-          <w:i/>
-          <w:iCs/>
-        </w:rPr>
-      </w:pPr>
-      <w:ins w:id="232" w:author="Smith Vidaurre, Grace" w:date="2025-06-09T11:45:00Z" w16du:dateUtc="2025-06-09T15:45:00Z">
-        <w:r>
-          <w:rPr>
-            <w:rFonts w:ascii="Arial" w:hAnsi="Arial" w:cs="Arial"/>
-            <w:i/>
-            <w:iCs/>
-          </w:rPr>
-          <w:t xml:space="preserve">Example datasets, spectrograms, acoustic space plots. </w:t>
-        </w:r>
-      </w:ins>
-      <w:r>
-        <w:rPr>
-          <w:rFonts w:ascii="Arial" w:hAnsi="Arial" w:cs="Arial"/>
-          <w:i/>
-          <w:iCs/>
-        </w:rPr>
-        <w:t>Detecting Synthetic Group and Individual Information in Synthetic Datasets</w:t>
+        </w:rPr>
+      </w:pPr>
+      <w:r>
+        <w:rPr>
+          <w:rFonts w:ascii="Arial" w:hAnsi="Arial" w:cs="Arial"/>
+        </w:rPr>
+        <w:tab/>
+      </w:r>
+      <w:r>
+        <w:rPr>
+          <w:rFonts w:ascii="Arial" w:hAnsi="Arial" w:cs="Arial"/>
+        </w:rPr>
+        <w:t xml:space="preserve"> </w:t>
+      </w:r>
+      <w:r>
+        <w:rPr>
+          <w:rFonts w:ascii="Arial" w:hAnsi="Arial" w:cs="Arial"/>
+        </w:rPr>
+        <w:t xml:space="preserve">To </w:t>
+      </w:r>
+      <w:r>
+        <w:rPr>
+          <w:rFonts w:ascii="Arial" w:hAnsi="Arial" w:cs="Arial"/>
+        </w:rPr>
+        <w:t>assess</w:t>
+      </w:r>
+      <w:r>
+        <w:rPr>
+          <w:rFonts w:ascii="Arial" w:hAnsi="Arial" w:cs="Arial"/>
+        </w:rPr>
+        <w:t xml:space="preserve"> how </w:t>
+      </w:r>
+      <w:r>
+        <w:rPr>
+          <w:rFonts w:ascii="Arial" w:hAnsi="Arial" w:cs="Arial"/>
+        </w:rPr>
+        <w:t>accurately</w:t>
+      </w:r>
+      <w:r>
+        <w:rPr>
+          <w:rFonts w:ascii="Arial" w:hAnsi="Arial" w:cs="Arial"/>
+        </w:rPr>
+        <w:t xml:space="preserve"> </w:t>
+      </w:r>
+      <w:r>
+        <w:rPr>
+          <w:rFonts w:ascii="Arial" w:hAnsi="Arial" w:cs="Arial"/>
+        </w:rPr>
+        <w:t xml:space="preserve">varying amounts of group and individual </w:t>
+      </w:r>
+      <w:r>
+        <w:rPr>
+          <w:rFonts w:ascii="Arial" w:hAnsi="Arial" w:cs="Arial"/>
+        </w:rPr>
+        <w:t xml:space="preserve">information could be recovered </w:t>
+      </w:r>
+      <w:r>
+        <w:rPr>
+          <w:rFonts w:ascii="Arial" w:hAnsi="Arial" w:cs="Arial"/>
+        </w:rPr>
+        <w:t>from synthetic signals,</w:t>
+      </w:r>
+      <w:r>
+        <w:rPr>
+          <w:rFonts w:ascii="Arial" w:hAnsi="Arial" w:cs="Arial"/>
+        </w:rPr>
+        <w:t xml:space="preserve"> we created </w:t>
+      </w:r>
+      <w:r>
+        <w:rPr>
+          <w:rFonts w:ascii="Arial" w:hAnsi="Arial" w:cs="Arial"/>
+        </w:rPr>
+        <w:t xml:space="preserve">synthetic data sets across 16 treatments that varied over social environment characteristics and information encoding rules. </w:t>
+      </w:r>
+      <w:commentRangeStart w:id="377"/>
+      <w:r>
+        <w:rPr>
+          <w:rFonts w:ascii="Arial" w:hAnsi="Arial" w:cs="Arial"/>
+        </w:rPr>
+        <w:t>We varied social environment characteristics represented information signaling changes that happen in socially sparse vs socially dense signaling environments</w:t>
+      </w:r>
+      <w:commentRangeEnd w:id="377"/>
+      <w:r>
+        <w:rPr>
+          <w:rStyle w:val="CommentReference"/>
+        </w:rPr>
+        <w:commentReference w:id="377"/>
+      </w:r>
+      <w:r>
+        <w:rPr>
+          <w:rFonts w:ascii="Arial" w:hAnsi="Arial" w:cs="Arial"/>
+        </w:rPr>
+        <w:t xml:space="preserve">. We achieved this by creating four social conditions: 2 groups with 2 individuals per group, 4 groups with 4 individuals per group, 6 groups with 6 individuals per group, and 8 groups with 8 individuals per group. We also varied the proportion of group information to individual information encoded in the signal, with four categories: 0 (representing all individual information and no group information), 1/3, 2/3, and 1 (representing all group information and no individual information. We iterated over each treatment 10 times, generating 10 unique synthetic datasets per treatment. </w:t>
       </w:r>
     </w:p>
     <w:p>
       <w:pPr>
+        <w:pStyle w:val="NoSpacing"/>
+        <w:spacing w:line="480" w:lineRule="auto"/>
+        <w:rPr>
+          <w:rFonts w:ascii="Arial" w:hAnsi="Arial" w:cs="Arial"/>
+        </w:rPr>
+      </w:pPr>
+      <w:r>
+        <w:rPr>
+          <w:rFonts w:ascii="Arial" w:hAnsi="Arial" w:cs="Arial"/>
+        </w:rPr>
+        <w:lastRenderedPageBreak/>
+        <w:tab/>
+        <w:t xml:space="preserve">Once these synthetic datasets were created, we used traditional bioacoustics tools to decode information encoded at the group and individual level. Similar to the datasets above, we performed SPCC. We also calculated the edit distance for the original strings. After these calculations, we performed Multidimensional Scaling on both the SPCC and edit distance matrices, then performed k-means clustering, randomly selecting 1 call per individual per group, to ensure that call exemplars per class matched between social levels. From this, we were able to calculate the accuracy of detecting information at the group and individual levels from vocalizations represented as character strings (edit distance pipeline) or synthetic audio files (tradition </w:t>
+      </w:r>
+      <w:r>
+        <w:rPr>
+          <w:rFonts w:ascii="Arial" w:hAnsi="Arial" w:cs="Arial"/>
+        </w:rPr>
+        <w:t>bioacoustics</w:t>
+      </w:r>
+      <w:r>
+        <w:rPr>
+          <w:rFonts w:ascii="Arial" w:hAnsi="Arial" w:cs="Arial"/>
+        </w:rPr>
+        <w:t xml:space="preserve"> </w:t>
+      </w:r>
+      <w:r>
+        <w:rPr>
+          <w:rFonts w:ascii="Arial" w:hAnsi="Arial" w:cs="Arial"/>
+        </w:rPr>
+        <w:t>pipeline</w:t>
+      </w:r>
+      <w:r>
+        <w:rPr>
+          <w:rFonts w:ascii="Arial" w:hAnsi="Arial" w:cs="Arial"/>
+        </w:rPr>
+        <w:t xml:space="preserve"> SPCC). Edit distance is a baseline for information detection because the strings are the original place where information was encoded at either social level. We can then compare the SPCC accuracy to edit distance, to assess how well we can detect the information originally encoded from the audio file representation.  </w:t>
+      </w:r>
+    </w:p>
+    <w:p>
+      <w:pPr>
+        <w:pStyle w:val="NoSpacing"/>
+        <w:spacing w:line="480" w:lineRule="auto"/>
+        <w:rPr>
+          <w:ins w:id="378" w:author="Smith Vidaurre, Grace" w:date="2025-05-28T19:06:00Z" w16du:dateUtc="2025-05-28T23:06:00Z"/>
+          <w:rFonts w:ascii="Arial" w:hAnsi="Arial" w:cs="Arial"/>
+        </w:rPr>
+      </w:pPr>
+      <w:r>
+        <w:rPr>
+          <w:rFonts w:ascii="Arial" w:hAnsi="Arial" w:cs="Arial"/>
+        </w:rPr>
+        <w:tab/>
+        <w:t>TKTK paragraph about effect size calculations</w:t>
+      </w:r>
+      <w:r>
+        <w:rPr>
+          <w:rFonts w:ascii="Arial" w:hAnsi="Arial" w:cs="Arial"/>
+        </w:rPr>
+        <w:t xml:space="preserve">. Include package information in R. Make sure to address the warnings in the code output and the density plots (supplemental) that address these. </w:t>
+      </w:r>
+    </w:p>
+    <w:p>
+      <w:pPr>
+        <w:pStyle w:val="NoSpacing"/>
+        <w:spacing w:line="480" w:lineRule="auto"/>
+        <w:rPr>
+          <w:ins w:id="379" w:author="Smith Vidaurre, Grace" w:date="2025-05-28T19:06:00Z" w16du:dateUtc="2025-05-28T23:06:00Z"/>
+          <w:rFonts w:ascii="Arial" w:hAnsi="Arial" w:cs="Arial"/>
+        </w:rPr>
+      </w:pPr>
+    </w:p>
+    <w:p>
+      <w:pPr>
         <w:spacing w:line="480" w:lineRule="auto"/>
         <w:ind w:firstLine="720"/>
         <w:rPr>
-          <w:rFonts w:ascii="Arial" w:hAnsi="Arial" w:cs="Arial"/>
-        </w:rPr>
-      </w:pPr>
-      <w:r>
-        <w:rPr>
-          <w:rFonts w:ascii="Arial" w:hAnsi="Arial" w:cs="Arial"/>
-        </w:rPr>
-        <w:t xml:space="preserve">Using the process described above, we created two synthetic data sets: one that created </w:t>
-      </w:r>
-      <w:commentRangeStart w:id="233"/>
-      <w:commentRangeStart w:id="234"/>
-      <w:r>
-        <w:rPr>
-          <w:rFonts w:ascii="Arial" w:hAnsi="Arial" w:cs="Arial"/>
-        </w:rPr>
-        <w:t xml:space="preserve">vocalizations </w:t>
-      </w:r>
-      <w:commentRangeEnd w:id="233"/>
-      <w:r>
-        <w:rPr>
-          <w:rStyle w:val="CommentReference"/>
-        </w:rPr>
-        <w:commentReference w:id="233"/>
-      </w:r>
-      <w:commentRangeEnd w:id="234"/>
-      <w:r>
-        <w:rPr>
-          <w:rStyle w:val="CommentReference"/>
-        </w:rPr>
-        <w:commentReference w:id="234"/>
-      </w:r>
-      <w:r>
-        <w:rPr>
-          <w:rFonts w:ascii="Arial" w:hAnsi="Arial" w:cs="Arial"/>
-        </w:rPr>
-        <w:t>with more group membership information than individual information encoded (</w:t>
-      </w:r>
-      <w:r>
-        <w:rPr>
-          <w:rFonts w:ascii="Arial" w:hAnsi="Arial" w:cs="Arial"/>
-        </w:rPr>
-        <w:t>g</w:t>
-      </w:r>
-      <w:r>
-        <w:rPr>
-          <w:rFonts w:ascii="Arial" w:hAnsi="Arial" w:cs="Arial"/>
-        </w:rPr>
-        <w:t xml:space="preserve">roup </w:t>
-      </w:r>
-      <w:r>
-        <w:rPr>
-          <w:rFonts w:ascii="Arial" w:hAnsi="Arial" w:cs="Arial"/>
-        </w:rPr>
-        <w:t>specific</w:t>
-      </w:r>
-      <w:r>
-        <w:rPr>
-          <w:rFonts w:ascii="Arial" w:hAnsi="Arial" w:cs="Arial"/>
-        </w:rPr>
-        <w:t xml:space="preserve"> </w:t>
-      </w:r>
-      <w:r>
-        <w:rPr>
-          <w:rFonts w:ascii="Arial" w:hAnsi="Arial" w:cs="Arial"/>
-        </w:rPr>
-        <w:t>i</w:t>
-      </w:r>
-      <w:r>
-        <w:rPr>
-          <w:rFonts w:ascii="Arial" w:hAnsi="Arial" w:cs="Arial"/>
-        </w:rPr>
-        <w:t xml:space="preserve">nformation </w:t>
-      </w:r>
-      <w:r>
-        <w:rPr>
-          <w:rFonts w:ascii="Arial" w:hAnsi="Arial" w:cs="Arial"/>
-        </w:rPr>
-        <w:t>d</w:t>
-      </w:r>
-      <w:r>
-        <w:rPr>
-          <w:rFonts w:ascii="Arial" w:hAnsi="Arial" w:cs="Arial"/>
-        </w:rPr>
-        <w:t xml:space="preserve">ataset: henceforth the </w:t>
-      </w:r>
-      <w:r>
-        <w:rPr>
-          <w:rFonts w:ascii="Arial" w:hAnsi="Arial" w:cs="Arial"/>
-        </w:rPr>
-        <w:t>group specific</w:t>
-      </w:r>
-      <w:r>
-        <w:rPr>
-          <w:rFonts w:ascii="Arial" w:hAnsi="Arial" w:cs="Arial"/>
-        </w:rPr>
-        <w:t xml:space="preserve"> dataset), and one that created </w:t>
-      </w:r>
-      <w:commentRangeStart w:id="235"/>
-      <w:r>
-        <w:rPr>
-          <w:rFonts w:ascii="Arial" w:hAnsi="Arial" w:cs="Arial"/>
-        </w:rPr>
-        <w:t xml:space="preserve">character strings </w:t>
-      </w:r>
-      <w:commentRangeEnd w:id="235"/>
-      <w:r>
-        <w:rPr>
-          <w:rStyle w:val="CommentReference"/>
-        </w:rPr>
-        <w:commentReference w:id="235"/>
-      </w:r>
-      <w:r>
-        <w:rPr>
-          <w:rFonts w:ascii="Arial" w:hAnsi="Arial" w:cs="Arial"/>
-        </w:rPr>
-        <w:t>with more individual information than group membership information encoded (</w:t>
-      </w:r>
-      <w:r>
-        <w:rPr>
-          <w:rFonts w:ascii="Arial" w:hAnsi="Arial" w:cs="Arial"/>
-        </w:rPr>
-        <w:t>individual identity information dataset</w:t>
-      </w:r>
-      <w:r>
-        <w:rPr>
-          <w:rFonts w:ascii="Arial" w:hAnsi="Arial" w:cs="Arial"/>
-        </w:rPr>
-        <w:t xml:space="preserve">; </w:t>
-      </w:r>
-      <w:commentRangeStart w:id="236"/>
-      <w:commentRangeEnd w:id="236"/>
-      <w:r>
-        <w:rPr>
-          <w:rStyle w:val="CommentReference"/>
-        </w:rPr>
-        <w:lastRenderedPageBreak/>
-        <w:commentReference w:id="236"/>
-      </w:r>
-      <w:r>
-        <w:rPr>
-          <w:rFonts w:ascii="Arial" w:hAnsi="Arial" w:cs="Arial"/>
-        </w:rPr>
-        <w:t xml:space="preserve">henceforth the </w:t>
-      </w:r>
-      <w:r>
-        <w:rPr>
-          <w:rFonts w:ascii="Arial" w:hAnsi="Arial" w:cs="Arial"/>
-        </w:rPr>
-        <w:t>individual identity</w:t>
-      </w:r>
-      <w:r>
-        <w:rPr>
-          <w:rFonts w:ascii="Arial" w:hAnsi="Arial" w:cs="Arial"/>
-        </w:rPr>
-        <w:t xml:space="preserve"> dataset). In the </w:t>
-      </w:r>
-      <w:r>
-        <w:rPr>
-          <w:rFonts w:ascii="Arial" w:hAnsi="Arial" w:cs="Arial"/>
-        </w:rPr>
-        <w:t>group specific dataset</w:t>
-      </w:r>
-      <w:r>
-        <w:rPr>
-          <w:rFonts w:ascii="Arial" w:hAnsi="Arial" w:cs="Arial"/>
-        </w:rPr>
-        <w:t xml:space="preserve">, individual information was set to a character length of 4 characters, and group member information was set to </w:t>
-      </w:r>
-      <w:commentRangeStart w:id="237"/>
-      <w:r>
-        <w:rPr>
-          <w:rFonts w:ascii="Arial" w:hAnsi="Arial" w:cs="Arial"/>
-        </w:rPr>
-        <w:t>a character length of 8 character</w:t>
-      </w:r>
-      <w:commentRangeEnd w:id="237"/>
-      <w:r>
-        <w:rPr>
-          <w:rStyle w:val="CommentReference"/>
-        </w:rPr>
-        <w:commentReference w:id="237"/>
-      </w:r>
-      <w:r>
-        <w:rPr>
-          <w:rFonts w:ascii="Arial" w:hAnsi="Arial" w:cs="Arial"/>
-        </w:rPr>
-        <w:t xml:space="preserve">. In the </w:t>
-      </w:r>
-      <w:r>
-        <w:rPr>
-          <w:rFonts w:ascii="Arial" w:hAnsi="Arial" w:cs="Arial"/>
-        </w:rPr>
-        <w:t>individual identity dataset</w:t>
-      </w:r>
-      <w:r>
-        <w:rPr>
-          <w:rFonts w:ascii="Arial" w:hAnsi="Arial" w:cs="Arial"/>
-        </w:rPr>
-        <w:t xml:space="preserve">, individual information was set to a </w:t>
-      </w:r>
-      <w:commentRangeStart w:id="238"/>
-      <w:r>
-        <w:rPr>
-          <w:rFonts w:ascii="Arial" w:hAnsi="Arial" w:cs="Arial"/>
-        </w:rPr>
-        <w:t>character length of 8 characters</w:t>
-      </w:r>
-      <w:commentRangeEnd w:id="238"/>
-      <w:r>
-        <w:rPr>
-          <w:rStyle w:val="CommentReference"/>
-        </w:rPr>
-        <w:commentReference w:id="238"/>
-      </w:r>
-      <w:r>
-        <w:rPr>
-          <w:rFonts w:ascii="Arial" w:hAnsi="Arial" w:cs="Arial"/>
-        </w:rPr>
-        <w:t xml:space="preserve">, and group information was set to a character length of 4 characters. For both datasets, there were 5 groups with 10 individuals per group, with 5 unique calls generated per individual. </w:t>
-      </w:r>
-    </w:p>
-    <w:p>
-      <w:pPr>
-        <w:spacing w:line="480" w:lineRule="auto"/>
-        <w:ind w:firstLine="720"/>
-        <w:rPr>
-          <w:rFonts w:ascii="Arial" w:hAnsi="Arial" w:cs="Arial"/>
-        </w:rPr>
-      </w:pPr>
-      <w:r>
-        <w:rPr>
-          <w:rFonts w:ascii="Arial" w:hAnsi="Arial" w:cs="Arial"/>
-        </w:rPr>
-        <w:t xml:space="preserve">After generating synthetic signals for these datasets, we used the soundgen package (TKTK citation) to convert the .wav files to spectrograms (see example of calls in Figures 2B and 3B). To validate that the group and individual information we specified in the character strings could be recovered from the generated frequency signals, we performed spectrographic cross-correlation on each dataset (SPCC; </w:t>
-      </w:r>
-      <w:r>
-        <w:rPr>
-          <w:rFonts w:ascii="Arial" w:hAnsi="Arial" w:cs="Arial"/>
-        </w:rPr>
-        <w:fldChar w:fldCharType="begin"/>
-      </w:r>
-      <w:r>
-        <w:rPr>
-          <w:rFonts w:ascii="Arial" w:hAnsi="Arial" w:cs="Arial"/>
-        </w:rPr>
-        <w:instrText xml:space="preserve"> ADDIN ZOTERO_ITEM CSL_CITATION {"citationID":"2alP2xFJ","properties":{"formattedCitation":"(Clark et al., 1987)","plainCitation":"(Clark et al., 1987)","dontUpdate":true,"noteIndex":0},"citationItems":[{"id":606,"uris":["http://zotero.org/groups/5786507/items/GR5UUI5P"],"itemData":{"id":606,"type":"article-journal","abstract":"Sound spectrograms have been a traditional method for comparing animal vocalizations and demonstrating their similarities or differences, but quantification of the comparative process has been difficult. This lack of quantification has hindered progress in documenting the timing and degree of song development in song birds. With this in mind, computer-based methods for sound comparison and sound averaging were developed. These methods utilize a numerical representation of a sound's frequency-time structure to compute a similarity value between any two sounds and an average sound spectrogram for a set of sounds. These analytical techniques were applied to an analysis of song notes of the swamp sparrow (Melospiza georgiana). The results demonstrate the usefulness of the methods and reveal new details in the description of the swamp sparrow's set of species-universal note types and in the decrease of note variability during the course of developmental transitions from subsong, through plastic song to song crystallization.","container-title":"Ethology","DOI":"10.1111/j.1439-0310.1987.tb00676.x","ISSN":"1439-0310","issue":"2","language":"en","license":"1987 Blackwell Verlag GmbH","note":"_eprint: https://onlinelibrary.wiley.com/doi/pdf/10.1111/j.1439-0310.1987.tb00676.x","page":"101-115","source":"Wiley Online Library","title":"Quantitative Analysis of Animal Vocal Phonology: an Application to Swamp Sparrow Song","title-short":"Quantitative Analysis of Animal Vocal Phonology","volume":"76","author":[{"family":"Clark","given":"Christopher W."},{"family":"Marler","given":"Peter"},{"family":"Beeman","given":"Kim"}],"issued":{"date-parts":[["1987"]]}}}],"schema":"https://github.com/citation-style-language/schema/raw/master/csl-citation.json"} </w:instrText>
-      </w:r>
-      <w:r>
-        <w:rPr>
-          <w:rFonts w:ascii="Arial" w:hAnsi="Arial" w:cs="Arial"/>
-        </w:rPr>
-        <w:fldChar w:fldCharType="separate"/>
-      </w:r>
-      <w:r>
-        <w:rPr>
-          <w:rFonts w:ascii="Arial" w:hAnsi="Arial" w:cs="Arial"/>
-        </w:rPr>
-        <w:t>Clark et al., 1987</w:t>
-      </w:r>
-      <w:r>
-        <w:rPr>
-          <w:rFonts w:ascii="Arial" w:hAnsi="Arial" w:cs="Arial"/>
-        </w:rPr>
-        <w:fldChar w:fldCharType="end"/>
-      </w:r>
-      <w:r>
-        <w:rPr>
-          <w:rFonts w:ascii="Arial" w:hAnsi="Arial" w:cs="Arial"/>
-        </w:rPr>
-        <w:t xml:space="preserve">) using the warbleR package. We performed SPCC with a Hanning window, a window length of 512 samples, and a window overlap of 90 samples. We used a Pearson’s correlation method and a bandpass filter of 0 to 20 kHz. </w:t>
-      </w:r>
-    </w:p>
-    <w:p>
-      <w:pPr>
-        <w:spacing w:line="480" w:lineRule="auto"/>
-        <w:ind w:firstLine="720"/>
-        <w:rPr>
-          <w:rFonts w:ascii="Arial" w:hAnsi="Arial" w:cs="Arial"/>
-        </w:rPr>
-      </w:pPr>
-      <w:r>
-        <w:rPr>
-          <w:rFonts w:ascii="Arial" w:hAnsi="Arial" w:cs="Arial"/>
-        </w:rPr>
-        <w:t xml:space="preserve">To assess hierarchical mapping patterns of our two datasets, we used non-metric multidimensional scaling (MDS) to reduce the dimensionality of the SPCC matrix for each dataset. We performed MDS over 15 dimensions so that the stress of the model was TKTK (less than 5). From these results, we two generated low-dimensional acoustic space plots for each dataset, one visualizing the acoustic space between groups and one visualizing the acoustic space between individuals. In doing this for each dataset, we can compare how well the </w:t>
-      </w:r>
-      <w:r>
-        <w:rPr>
-          <w:rFonts w:ascii="Arial" w:hAnsi="Arial" w:cs="Arial"/>
-        </w:rPr>
-        <w:t>group specific</w:t>
-      </w:r>
-      <w:r>
-        <w:rPr>
-          <w:rFonts w:ascii="Arial" w:hAnsi="Arial" w:cs="Arial"/>
-        </w:rPr>
-        <w:t xml:space="preserve"> dataset encodes information at the group level compared to the individual level and vice versa for the </w:t>
-      </w:r>
-      <w:r>
-        <w:rPr>
-          <w:rFonts w:ascii="Arial" w:hAnsi="Arial" w:cs="Arial"/>
-        </w:rPr>
-        <w:t>individual identity dataset</w:t>
-      </w:r>
-      <w:r>
-        <w:rPr>
-          <w:rFonts w:ascii="Arial" w:hAnsi="Arial" w:cs="Arial"/>
-        </w:rPr>
-        <w:t xml:space="preserve">. </w:t>
-      </w:r>
-    </w:p>
-    <w:p>
-      <w:pPr>
-        <w:spacing w:line="480" w:lineRule="auto"/>
-        <w:rPr>
-          <w:rFonts w:ascii="Arial" w:hAnsi="Arial" w:cs="Arial"/>
-          <w:i/>
-          <w:iCs/>
-        </w:rPr>
-      </w:pPr>
-    </w:p>
-    <w:p>
-      <w:pPr>
-        <w:spacing w:line="480" w:lineRule="auto"/>
-        <w:rPr>
-          <w:rFonts w:ascii="Arial" w:hAnsi="Arial" w:cs="Arial"/>
-          <w:i/>
-          <w:iCs/>
-        </w:rPr>
-      </w:pPr>
-      <w:r>
-        <w:rPr>
-          <w:rFonts w:ascii="Arial" w:hAnsi="Arial" w:cs="Arial"/>
-          <w:i/>
-          <w:iCs/>
-        </w:rPr>
-        <w:t xml:space="preserve">Synthetic Experiments to Assess Accuracy of Information Encoding and Decoding Across a Range of Social </w:t>
-      </w:r>
-      <w:r>
-        <w:rPr>
-          <w:rFonts w:ascii="Arial" w:hAnsi="Arial" w:cs="Arial"/>
-          <w:i/>
-          <w:iCs/>
-        </w:rPr>
-        <w:t xml:space="preserve">Conditions </w:t>
-      </w:r>
-    </w:p>
-    <w:p>
-      <w:pPr>
-        <w:pStyle w:val="NoSpacing"/>
-        <w:spacing w:line="480" w:lineRule="auto"/>
-        <w:rPr>
-          <w:rFonts w:ascii="Arial" w:hAnsi="Arial" w:cs="Arial"/>
-        </w:rPr>
-      </w:pPr>
-      <w:r>
-        <w:rPr>
-          <w:rFonts w:ascii="Arial" w:hAnsi="Arial" w:cs="Arial"/>
-        </w:rPr>
-        <w:tab/>
-      </w:r>
-      <w:r>
-        <w:rPr>
-          <w:rFonts w:ascii="Arial" w:hAnsi="Arial" w:cs="Arial"/>
-        </w:rPr>
-        <w:t xml:space="preserve"> </w:t>
-      </w:r>
-      <w:r>
-        <w:rPr>
-          <w:rFonts w:ascii="Arial" w:hAnsi="Arial" w:cs="Arial"/>
-        </w:rPr>
-        <w:t xml:space="preserve">To </w:t>
-      </w:r>
-      <w:r>
-        <w:rPr>
-          <w:rFonts w:ascii="Arial" w:hAnsi="Arial" w:cs="Arial"/>
-        </w:rPr>
-        <w:t>assess</w:t>
-      </w:r>
-      <w:r>
-        <w:rPr>
-          <w:rFonts w:ascii="Arial" w:hAnsi="Arial" w:cs="Arial"/>
-        </w:rPr>
-        <w:t xml:space="preserve"> how </w:t>
-      </w:r>
-      <w:r>
-        <w:rPr>
-          <w:rFonts w:ascii="Arial" w:hAnsi="Arial" w:cs="Arial"/>
-        </w:rPr>
-        <w:t>accurately</w:t>
-      </w:r>
-      <w:r>
-        <w:rPr>
-          <w:rFonts w:ascii="Arial" w:hAnsi="Arial" w:cs="Arial"/>
-        </w:rPr>
-        <w:t xml:space="preserve"> </w:t>
-      </w:r>
-      <w:r>
-        <w:rPr>
-          <w:rFonts w:ascii="Arial" w:hAnsi="Arial" w:cs="Arial"/>
-        </w:rPr>
-        <w:t xml:space="preserve">varying amounts of group and individual </w:t>
-      </w:r>
-      <w:r>
-        <w:rPr>
-          <w:rFonts w:ascii="Arial" w:hAnsi="Arial" w:cs="Arial"/>
-        </w:rPr>
-        <w:t xml:space="preserve">information could be recovered </w:t>
-      </w:r>
-      <w:r>
-        <w:rPr>
-          <w:rFonts w:ascii="Arial" w:hAnsi="Arial" w:cs="Arial"/>
-        </w:rPr>
-        <w:t>from synthetic signals,</w:t>
-      </w:r>
-      <w:r>
-        <w:rPr>
-          <w:rFonts w:ascii="Arial" w:hAnsi="Arial" w:cs="Arial"/>
-        </w:rPr>
-        <w:t xml:space="preserve"> we created </w:t>
-      </w:r>
-      <w:r>
-        <w:rPr>
-          <w:rFonts w:ascii="Arial" w:hAnsi="Arial" w:cs="Arial"/>
-        </w:rPr>
-        <w:t xml:space="preserve">synthetic data sets across 16 treatments that varied over social environment characteristics and information encoding rules. </w:t>
-      </w:r>
-      <w:commentRangeStart w:id="239"/>
-      <w:r>
-        <w:rPr>
-          <w:rFonts w:ascii="Arial" w:hAnsi="Arial" w:cs="Arial"/>
-        </w:rPr>
-        <w:t>We varied social environment characteristics represented information signaling changes that happen in socially sparse vs socially dense signaling environments</w:t>
-      </w:r>
-      <w:commentRangeEnd w:id="239"/>
-      <w:r>
-        <w:rPr>
-          <w:rStyle w:val="CommentReference"/>
-        </w:rPr>
-        <w:commentReference w:id="239"/>
-      </w:r>
-      <w:r>
-        <w:rPr>
-          <w:rFonts w:ascii="Arial" w:hAnsi="Arial" w:cs="Arial"/>
-        </w:rPr>
-        <w:t xml:space="preserve">. We achieved this by creating four social conditions: 2 groups with 2 individuals per group, 4 groups with 4 individuals per group, 6 groups with 6 individuals per group, and 8 groups with 8 individuals per group. We also varied the proportion of group information to individual information encoded in the signal, with four categories: 0 (representing all individual information and no group information), 1/3, 2/3, and 1 (representing all group information and no individual information. We iterated over each treatment 10 times, generating 10 unique synthetic datasets per treatment. </w:t>
-      </w:r>
-    </w:p>
-    <w:p>
-      <w:pPr>
-        <w:pStyle w:val="NoSpacing"/>
-        <w:spacing w:line="480" w:lineRule="auto"/>
-        <w:rPr>
-          <w:rFonts w:ascii="Arial" w:hAnsi="Arial" w:cs="Arial"/>
-        </w:rPr>
-      </w:pPr>
-      <w:r>
-        <w:rPr>
-          <w:rFonts w:ascii="Arial" w:hAnsi="Arial" w:cs="Arial"/>
-        </w:rPr>
-        <w:tab/>
-        <w:t xml:space="preserve">Once these synthetic datasets were created, we used traditional bioacoustics tools to decode information encoded at the group and individual level. Similar to the datasets above, we performed SPCC. We also calculated the edit distance for the original strings. After these calculations, we performed Multidimensional Scaling on both the SPCC and edit distance matrices, then performed k-means clustering, randomly selecting 1 call per individual per group, to ensure that call exemplars per class matched between social levels. From this, we were able to calculate the accuracy of detecting information at the group and individual levels from vocalizations represented </w:t>
-      </w:r>
-      <w:r>
-        <w:rPr>
-          <w:rFonts w:ascii="Arial" w:hAnsi="Arial" w:cs="Arial"/>
-        </w:rPr>
-        <w:lastRenderedPageBreak/>
-        <w:t xml:space="preserve">as character strings (edit distance pipeline) or synthetic audio files (tradition </w:t>
-      </w:r>
-      <w:r>
-        <w:rPr>
-          <w:rFonts w:ascii="Arial" w:hAnsi="Arial" w:cs="Arial"/>
-        </w:rPr>
-        <w:t>bioacoustics</w:t>
-      </w:r>
-      <w:r>
-        <w:rPr>
-          <w:rFonts w:ascii="Arial" w:hAnsi="Arial" w:cs="Arial"/>
-        </w:rPr>
-        <w:t xml:space="preserve"> </w:t>
-      </w:r>
-      <w:r>
-        <w:rPr>
-          <w:rFonts w:ascii="Arial" w:hAnsi="Arial" w:cs="Arial"/>
-        </w:rPr>
-        <w:t>pipeline</w:t>
-      </w:r>
-      <w:r>
-        <w:rPr>
-          <w:rFonts w:ascii="Arial" w:hAnsi="Arial" w:cs="Arial"/>
-        </w:rPr>
-        <w:t xml:space="preserve"> SPCC). Edit distance is a baseline for information detection because the strings are the original place where information was encoded at either social level. We can then compare the SPCC accuracy to edit distance, to assess how well we can detect the information originally encoded from the audio file representation.  </w:t>
-      </w:r>
-    </w:p>
-    <w:p>
-      <w:pPr>
-        <w:pStyle w:val="NoSpacing"/>
-        <w:spacing w:line="480" w:lineRule="auto"/>
-        <w:rPr>
-          <w:ins w:id="240" w:author="Smith Vidaurre, Grace" w:date="2025-05-28T19:06:00Z" w16du:dateUtc="2025-05-28T23:06:00Z"/>
-          <w:rFonts w:ascii="Arial" w:hAnsi="Arial" w:cs="Arial"/>
-        </w:rPr>
-      </w:pPr>
-      <w:r>
-        <w:rPr>
-          <w:rFonts w:ascii="Arial" w:hAnsi="Arial" w:cs="Arial"/>
-        </w:rPr>
-        <w:tab/>
-        <w:t>TKTK paragraph about effect size calculations</w:t>
-      </w:r>
-      <w:r>
-        <w:rPr>
-          <w:rFonts w:ascii="Arial" w:hAnsi="Arial" w:cs="Arial"/>
-        </w:rPr>
-        <w:t xml:space="preserve">. Include package information in R. Make sure to address the warnings in the code output and the density plots (supplemental) that address these. </w:t>
-      </w:r>
-    </w:p>
-    <w:p>
-      <w:pPr>
-        <w:pStyle w:val="NoSpacing"/>
-        <w:spacing w:line="480" w:lineRule="auto"/>
-        <w:rPr>
-          <w:ins w:id="241" w:author="Smith Vidaurre, Grace" w:date="2025-05-28T19:06:00Z" w16du:dateUtc="2025-05-28T23:06:00Z"/>
-          <w:rFonts w:ascii="Arial" w:hAnsi="Arial" w:cs="Arial"/>
-        </w:rPr>
-      </w:pPr>
-    </w:p>
-    <w:p>
-      <w:pPr>
-        <w:spacing w:line="480" w:lineRule="auto"/>
-        <w:ind w:firstLine="720"/>
-        <w:rPr>
-          <w:ins w:id="242" w:author="Smith Vidaurre, Grace" w:date="2025-05-28T19:06:00Z" w16du:dateUtc="2025-05-28T23:06:00Z"/>
-          <w:rFonts w:ascii="Arial" w:hAnsi="Arial" w:cs="Arial"/>
-        </w:rPr>
-      </w:pPr>
-      <w:ins w:id="243" w:author="Smith Vidaurre, Grace" w:date="2025-05-28T19:06:00Z" w16du:dateUtc="2025-05-28T23:06:00Z">
+          <w:ins w:id="380" w:author="Smith Vidaurre, Grace" w:date="2025-05-28T19:06:00Z" w16du:dateUtc="2025-05-28T23:06:00Z"/>
+          <w:rFonts w:ascii="Arial" w:hAnsi="Arial" w:cs="Arial"/>
+        </w:rPr>
+      </w:pPr>
+      <w:ins w:id="381" w:author="Smith Vidaurre, Grace" w:date="2025-05-28T19:06:00Z" w16du:dateUtc="2025-05-28T23:06:00Z">
         <w:r>
           <w:rPr>
             <w:rFonts w:ascii="Arial" w:hAnsi="Arial" w:cs="Arial"/>
           </w:rPr>
           <w:t xml:space="preserve">TKTK integrate </w:t>
         </w:r>
-        <w:commentRangeStart w:id="244"/>
-        <w:commentRangeStart w:id="245"/>
-        <w:commentRangeStart w:id="246"/>
+        <w:commentRangeStart w:id="382"/>
+        <w:commentRangeStart w:id="383"/>
+        <w:commentRangeStart w:id="384"/>
         <w:r>
           <w:rPr>
             <w:rFonts w:ascii="Arial" w:hAnsi="Arial" w:cs="Arial"/>
           </w:rPr>
           <w:t>We expected to identify clustering accuracies that were generally lower for spectrographic cross-correlation than the edit distance, since spectrographic cross-correlation was performed on strings transformed into synthetic audio files, which may have led to losses of the original information or added noise</w:t>
         </w:r>
-        <w:commentRangeEnd w:id="244"/>
+        <w:commentRangeEnd w:id="382"/>
         <w:r>
           <w:rPr>
             <w:rStyle w:val="CommentReference"/>
           </w:rPr>
-          <w:commentReference w:id="244"/>
-        </w:r>
-        <w:commentRangeEnd w:id="245"/>
+          <w:commentReference w:id="382"/>
+        </w:r>
+        <w:commentRangeEnd w:id="383"/>
         <w:r>
           <w:rPr>
             <w:rStyle w:val="CommentReference"/>
           </w:rPr>
-          <w:commentReference w:id="245"/>
-        </w:r>
-        <w:commentRangeEnd w:id="246"/>
+          <w:commentReference w:id="383"/>
+        </w:r>
+        <w:commentRangeEnd w:id="384"/>
         <w:r>
           <w:rPr>
             <w:rStyle w:val="CommentReference"/>
           </w:rPr>
-          <w:commentReference w:id="246"/>
-        </w:r>
-        <w:r>
-          <w:rPr>
-            <w:rFonts w:ascii="Arial" w:hAnsi="Arial" w:cs="Arial"/>
-          </w:rPr>
-          <w:t>. However, we generally expected to identify medium or small effect sizes for these differences in information detection by each method that did not outweigh the effect sizes calculated for clustering accuracy between different forms of identity information for the same measurement (spectrographic cross-correlation or the edit distance).</w:t>
+          <w:commentReference w:id="384"/>
+        </w:r>
+        <w:r>
+          <w:rPr>
+            <w:rFonts w:ascii="Arial" w:hAnsi="Arial" w:cs="Arial"/>
+          </w:rPr>
+          <w:t xml:space="preserve">. However, we generally expected to identify medium or small effect sizes for these differences in information detection by each method that did not outweigh the effect sizes calculated </w:t>
+        </w:r>
+        <w:r>
+          <w:rPr>
+            <w:rFonts w:ascii="Arial" w:hAnsi="Arial" w:cs="Arial"/>
+          </w:rPr>
+          <w:lastRenderedPageBreak/>
+          <w:t>for clustering accuracy between different forms of identity information for the same measurement (spectrographic cross-correlation or the edit distance).</w:t>
         </w:r>
       </w:ins>
     </w:p>
@@ -21268,7 +22806,7 @@
           <w:szCs w:val="20"/>
         </w:rPr>
       </w:pPr>
-      <w:del w:id="247" w:author="Smith Vidaurre, Grace" w:date="2025-05-27T21:15:00Z" w16du:dateUtc="2025-05-28T01:15:00Z">
+      <w:del w:id="385" w:author="Smith Vidaurre, Grace" w:date="2025-05-27T21:15:00Z" w16du:dateUtc="2025-05-28T01:15:00Z">
         <w:r>
           <w:rPr>
             <w:noProof/>
@@ -21346,13 +22884,13 @@
           <w:rFonts w:ascii="Arial" w:hAnsi="Arial" w:cs="Arial"/>
         </w:rPr>
       </w:pPr>
-      <w:commentRangeStart w:id="248"/>
-      <w:commentRangeEnd w:id="248"/>
+      <w:commentRangeStart w:id="386"/>
+      <w:commentRangeEnd w:id="386"/>
       <w:r>
         <w:rPr>
           <w:rStyle w:val="CommentReference"/>
         </w:rPr>
-        <w:commentReference w:id="248"/>
+        <w:commentReference w:id="386"/>
       </w:r>
       <w:r>
         <w:rPr>
@@ -21470,7 +23008,7 @@
           <w:rFonts w:ascii="Arial" w:hAnsi="Arial" w:cs="Arial"/>
         </w:rPr>
       </w:pPr>
-      <w:del w:id="249" w:author="Smith Vidaurre, Grace" w:date="2025-05-27T21:15:00Z" w16du:dateUtc="2025-05-28T01:15:00Z">
+      <w:del w:id="387" w:author="Smith Vidaurre, Grace" w:date="2025-05-27T21:15:00Z" w16du:dateUtc="2025-05-28T01:15:00Z">
         <w:r>
           <w:rPr>
             <w:rFonts w:ascii="Arial" w:hAnsi="Arial" w:cs="Arial"/>
@@ -21561,7 +23099,7 @@
           <w:rFonts w:ascii="Arial" w:hAnsi="Arial" w:cs="Arial"/>
         </w:rPr>
       </w:pPr>
-      <w:del w:id="250" w:author="Smith Vidaurre, Grace" w:date="2025-05-27T21:15:00Z" w16du:dateUtc="2025-05-28T01:15:00Z">
+      <w:del w:id="388" w:author="Smith Vidaurre, Grace" w:date="2025-05-27T21:15:00Z" w16du:dateUtc="2025-05-28T01:15:00Z">
         <w:r>
           <w:rPr>
             <w:rFonts w:ascii="Arial" w:hAnsi="Arial" w:cs="Arial"/>
@@ -21718,19 +23256,19 @@
         </w:rPr>
         <w:t xml:space="preserve">). </w:t>
       </w:r>
-      <w:commentRangeStart w:id="251"/>
+      <w:commentRangeStart w:id="389"/>
       <w:r>
         <w:rPr>
           <w:rFonts w:ascii="Arial" w:hAnsi="Arial" w:cs="Arial"/>
         </w:rPr>
         <w:t>This suggests that individuals are being categorized in distinct individual clusters when running traditional bioacoustics analyses on our synthetically generated calls.</w:t>
       </w:r>
-      <w:commentRangeEnd w:id="251"/>
+      <w:commentRangeEnd w:id="389"/>
       <w:r>
         <w:rPr>
           <w:rStyle w:val="CommentReference"/>
         </w:rPr>
-        <w:commentReference w:id="251"/>
+        <w:commentReference w:id="389"/>
       </w:r>
     </w:p>
     <w:p>
@@ -21743,7 +23281,7 @@
     <w:p>
       <w:pPr>
         <w:rPr>
-          <w:ins w:id="252" w:author="Smith Vidaurre, Grace" w:date="2025-05-22T14:24:00Z" w16du:dateUtc="2025-05-22T18:24:00Z"/>
+          <w:ins w:id="390" w:author="Smith Vidaurre, Grace" w:date="2025-05-22T14:24:00Z" w16du:dateUtc="2025-05-22T18:24:00Z"/>
           <w:rFonts w:ascii="Arial" w:hAnsi="Arial" w:cs="Arial"/>
           <w:b/>
           <w:bCs/>
@@ -21761,7 +23299,7 @@
     <w:p>
       <w:pPr>
         <w:rPr>
-          <w:ins w:id="253" w:author="Smith Vidaurre, Grace" w:date="2025-05-22T14:24:00Z" w16du:dateUtc="2025-05-22T18:24:00Z"/>
+          <w:ins w:id="391" w:author="Smith Vidaurre, Grace" w:date="2025-05-22T14:24:00Z" w16du:dateUtc="2025-05-22T18:24:00Z"/>
           <w:rFonts w:ascii="Arial" w:hAnsi="Arial" w:cs="Arial"/>
           <w:b/>
           <w:bCs/>
@@ -21773,7 +23311,7 @@
         <w:spacing w:line="480" w:lineRule="auto"/>
         <w:ind w:firstLine="720"/>
         <w:rPr>
-          <w:ins w:id="254" w:author="Smith Vidaurre, Grace" w:date="2025-05-22T14:25:00Z" w16du:dateUtc="2025-05-22T18:25:00Z"/>
+          <w:ins w:id="392" w:author="Smith Vidaurre, Grace" w:date="2025-05-22T14:25:00Z" w16du:dateUtc="2025-05-22T18:25:00Z"/>
           <w:rFonts w:ascii="Arial" w:hAnsi="Arial" w:cs="Arial"/>
         </w:rPr>
       </w:pPr>
@@ -21819,19 +23357,19 @@
         </w:rPr>
         <w:t xml:space="preserve">, therefore, to study to evolution of vocal learning, we must understand how vocal learners encode and perceive information in learned vocal signals. Studies of the diversity of information encoding across vocal learning taxa could lead to new insights into how vocal learning originated and continues to </w:t>
       </w:r>
-      <w:commentRangeStart w:id="255"/>
+      <w:commentRangeStart w:id="393"/>
       <w:r>
         <w:rPr>
           <w:rFonts w:ascii="Arial" w:hAnsi="Arial" w:cs="Arial"/>
         </w:rPr>
         <w:t>evolve</w:t>
       </w:r>
-      <w:commentRangeEnd w:id="255"/>
+      <w:commentRangeEnd w:id="393"/>
       <w:r>
         <w:rPr>
           <w:rStyle w:val="CommentReference"/>
         </w:rPr>
-        <w:commentReference w:id="255"/>
+        <w:commentReference w:id="393"/>
       </w:r>
       <w:r>
         <w:rPr>
@@ -21845,7 +23383,7 @@
         <w:spacing w:line="480" w:lineRule="auto"/>
         <w:ind w:firstLine="720"/>
         <w:rPr>
-          <w:ins w:id="256" w:author="Smith Vidaurre, Grace" w:date="2025-05-22T14:25:00Z" w16du:dateUtc="2025-05-22T18:25:00Z"/>
+          <w:ins w:id="394" w:author="Smith Vidaurre, Grace" w:date="2025-05-22T14:25:00Z" w16du:dateUtc="2025-05-22T18:25:00Z"/>
           <w:rFonts w:ascii="Arial" w:hAnsi="Arial" w:cs="Arial"/>
         </w:rPr>
       </w:pPr>
@@ -21855,12 +23393,12 @@
         <w:spacing w:line="480" w:lineRule="auto"/>
         <w:ind w:firstLine="720"/>
         <w:rPr>
-          <w:ins w:id="257" w:author="Smith Vidaurre, Grace" w:date="2025-05-22T14:34:00Z" w16du:dateUtc="2025-05-22T18:34:00Z"/>
-          <w:rFonts w:ascii="Arial" w:hAnsi="Arial" w:cs="Arial"/>
-        </w:rPr>
-      </w:pPr>
-      <w:commentRangeStart w:id="258"/>
-      <w:ins w:id="259" w:author="Smith Vidaurre, Grace" w:date="2025-05-22T14:25:00Z" w16du:dateUtc="2025-05-22T18:25:00Z">
+          <w:ins w:id="395" w:author="Smith Vidaurre, Grace" w:date="2025-05-22T14:34:00Z" w16du:dateUtc="2025-05-22T18:34:00Z"/>
+          <w:rFonts w:ascii="Arial" w:hAnsi="Arial" w:cs="Arial"/>
+        </w:rPr>
+      </w:pPr>
+      <w:commentRangeStart w:id="396"/>
+      <w:ins w:id="397" w:author="Smith Vidaurre, Grace" w:date="2025-05-22T14:25:00Z" w16du:dateUtc="2025-05-22T18:25:00Z">
         <w:r>
           <w:rPr>
             <w:rFonts w:ascii="Arial" w:hAnsi="Arial" w:cs="Arial"/>
@@ -22247,12 +23785,12 @@
           </w:rPr>
           <w:t xml:space="preserve">. </w:t>
         </w:r>
-        <w:commentRangeEnd w:id="258"/>
+        <w:commentRangeEnd w:id="396"/>
         <w:r>
           <w:rPr>
             <w:rStyle w:val="CommentReference"/>
           </w:rPr>
-          <w:commentReference w:id="258"/>
+          <w:commentReference w:id="396"/>
         </w:r>
       </w:ins>
     </w:p>
@@ -22261,7 +23799,7 @@
         <w:spacing w:line="480" w:lineRule="auto"/>
         <w:ind w:firstLine="720"/>
         <w:rPr>
-          <w:ins w:id="260" w:author="Smith Vidaurre, Grace" w:date="2025-05-22T14:34:00Z" w16du:dateUtc="2025-05-22T18:34:00Z"/>
+          <w:ins w:id="398" w:author="Smith Vidaurre, Grace" w:date="2025-05-22T14:34:00Z" w16du:dateUtc="2025-05-22T18:34:00Z"/>
           <w:rFonts w:ascii="Arial" w:hAnsi="Arial" w:cs="Arial"/>
         </w:rPr>
       </w:pPr>
@@ -22271,11 +23809,11 @@
         <w:spacing w:line="480" w:lineRule="auto"/>
         <w:ind w:firstLine="720"/>
         <w:rPr>
-          <w:ins w:id="261" w:author="Smith Vidaurre, Grace" w:date="2025-05-22T14:34:00Z" w16du:dateUtc="2025-05-22T18:34:00Z"/>
-          <w:rFonts w:ascii="Arial" w:hAnsi="Arial" w:cs="Arial"/>
-        </w:rPr>
-      </w:pPr>
-      <w:ins w:id="262" w:author="Smith Vidaurre, Grace" w:date="2025-05-22T14:34:00Z" w16du:dateUtc="2025-05-22T18:34:00Z">
+          <w:ins w:id="399" w:author="Smith Vidaurre, Grace" w:date="2025-05-22T14:34:00Z" w16du:dateUtc="2025-05-22T18:34:00Z"/>
+          <w:rFonts w:ascii="Arial" w:hAnsi="Arial" w:cs="Arial"/>
+        </w:rPr>
+      </w:pPr>
+      <w:ins w:id="400" w:author="Smith Vidaurre, Grace" w:date="2025-05-22T14:34:00Z" w16du:dateUtc="2025-05-22T18:34:00Z">
         <w:r>
           <w:rPr>
             <w:rFonts w:ascii="Arial" w:hAnsi="Arial" w:cs="Arial"/>
@@ -22318,19 +23856,19 @@
           </w:rPr>
           <w:t>(</w:t>
         </w:r>
-        <w:commentRangeStart w:id="263"/>
+        <w:commentRangeStart w:id="401"/>
         <w:r>
           <w:rPr>
             <w:rFonts w:ascii="Arial" w:hAnsi="Arial" w:cs="Arial"/>
           </w:rPr>
           <w:t>CITE</w:t>
         </w:r>
-        <w:commentRangeEnd w:id="263"/>
+        <w:commentRangeEnd w:id="401"/>
         <w:r>
           <w:rPr>
             <w:rStyle w:val="CommentReference"/>
           </w:rPr>
-          <w:commentReference w:id="263"/>
+          <w:commentReference w:id="401"/>
         </w:r>
         <w:r>
           <w:rPr>
@@ -22382,7 +23920,7 @@
         <w:spacing w:line="480" w:lineRule="auto"/>
         <w:ind w:firstLine="720"/>
         <w:rPr>
-          <w:ins w:id="264" w:author="Smith Vidaurre, Grace" w:date="2025-05-22T14:35:00Z" w16du:dateUtc="2025-05-22T18:35:00Z"/>
+          <w:ins w:id="402" w:author="Smith Vidaurre, Grace" w:date="2025-05-22T14:35:00Z" w16du:dateUtc="2025-05-22T18:35:00Z"/>
           <w:rFonts w:ascii="Arial" w:hAnsi="Arial" w:cs="Arial"/>
         </w:rPr>
       </w:pPr>
@@ -22392,11 +23930,11 @@
         <w:spacing w:line="480" w:lineRule="auto"/>
         <w:ind w:firstLine="720"/>
         <w:rPr>
-          <w:ins w:id="265" w:author="Smith Vidaurre, Grace" w:date="2025-06-05T09:40:00Z" w16du:dateUtc="2025-06-05T13:40:00Z"/>
-          <w:rFonts w:ascii="Arial" w:hAnsi="Arial" w:cs="Arial"/>
-        </w:rPr>
-      </w:pPr>
-      <w:ins w:id="266" w:author="Smith Vidaurre, Grace" w:date="2025-05-22T14:35:00Z" w16du:dateUtc="2025-05-22T18:35:00Z">
+          <w:ins w:id="403" w:author="Smith Vidaurre, Grace" w:date="2025-06-05T09:40:00Z" w16du:dateUtc="2025-06-05T13:40:00Z"/>
+          <w:rFonts w:ascii="Arial" w:hAnsi="Arial" w:cs="Arial"/>
+        </w:rPr>
+      </w:pPr>
+      <w:ins w:id="404" w:author="Smith Vidaurre, Grace" w:date="2025-05-22T14:35:00Z" w16du:dateUtc="2025-05-22T18:35:00Z">
         <w:r>
           <w:rPr>
             <w:rFonts w:ascii="Arial" w:hAnsi="Arial" w:cs="Arial"/>
@@ -22446,7 +23984,7 @@
         <w:spacing w:line="480" w:lineRule="auto"/>
         <w:ind w:firstLine="720"/>
         <w:rPr>
-          <w:ins w:id="267" w:author="Smith Vidaurre, Grace" w:date="2025-06-05T09:40:00Z" w16du:dateUtc="2025-06-05T13:40:00Z"/>
+          <w:ins w:id="405" w:author="Smith Vidaurre, Grace" w:date="2025-06-05T09:40:00Z" w16du:dateUtc="2025-06-05T13:40:00Z"/>
           <w:rFonts w:ascii="Arial" w:hAnsi="Arial" w:cs="Arial"/>
         </w:rPr>
       </w:pPr>
@@ -22456,11 +23994,11 @@
         <w:spacing w:line="480" w:lineRule="auto"/>
         <w:ind w:firstLine="720"/>
         <w:rPr>
-          <w:ins w:id="268" w:author="Smith Vidaurre, Grace" w:date="2025-06-05T09:40:00Z" w16du:dateUtc="2025-06-05T13:40:00Z"/>
-          <w:rFonts w:ascii="Arial" w:hAnsi="Arial" w:cs="Arial"/>
-        </w:rPr>
-      </w:pPr>
-      <w:ins w:id="269" w:author="Smith Vidaurre, Grace" w:date="2025-06-05T09:40:00Z" w16du:dateUtc="2025-06-05T13:40:00Z">
+          <w:ins w:id="406" w:author="Smith Vidaurre, Grace" w:date="2025-06-05T09:40:00Z" w16du:dateUtc="2025-06-05T13:40:00Z"/>
+          <w:rFonts w:ascii="Arial" w:hAnsi="Arial" w:cs="Arial"/>
+        </w:rPr>
+      </w:pPr>
+      <w:ins w:id="407" w:author="Smith Vidaurre, Grace" w:date="2025-06-05T09:40:00Z" w16du:dateUtc="2025-06-05T13:40:00Z">
         <w:r>
           <w:rPr>
             <w:rFonts w:ascii="Arial" w:hAnsi="Arial" w:cs="Arial"/>
@@ -22511,19 +24049,19 @@
           <w:bCs/>
         </w:rPr>
       </w:pPr>
-      <w:commentRangeStart w:id="270"/>
+      <w:commentRangeStart w:id="408"/>
       <w:r>
         <w:rPr>
           <w:rFonts w:ascii="Arial" w:hAnsi="Arial" w:cs="Arial"/>
         </w:rPr>
         <w:t>Second, out ability to detect the dynamics of information encoding during real time social interactions is limited by our ability to capture the totality of an individual’s or groups signal produced during these interactions. We may be over sampling from vocal learning species whose social interaction and signal production are easy to observe and measure, and therefore may not be assessing the full scope of how information can be encoded across a range of species.</w:t>
       </w:r>
-      <w:commentRangeEnd w:id="270"/>
+      <w:commentRangeEnd w:id="408"/>
       <w:r>
         <w:rPr>
           <w:rStyle w:val="CommentReference"/>
         </w:rPr>
-        <w:commentReference w:id="270"/>
+        <w:commentReference w:id="408"/>
       </w:r>
     </w:p>
     <w:p>
@@ -22539,7 +24077,7 @@
       <w:pPr>
         <w:spacing w:line="360" w:lineRule="auto"/>
         <w:rPr>
-          <w:ins w:id="271" w:author="Smith Vidaurre, Grace" w:date="2025-06-05T09:32:00Z" w16du:dateUtc="2025-06-05T13:32:00Z"/>
+          <w:ins w:id="409" w:author="Smith Vidaurre, Grace" w:date="2025-06-05T09:32:00Z" w16du:dateUtc="2025-06-05T13:32:00Z"/>
           <w:rFonts w:ascii="Arial" w:hAnsi="Arial" w:cs="Arial"/>
         </w:rPr>
       </w:pPr>
@@ -22549,35 +24087,35 @@
         </w:rPr>
         <w:t xml:space="preserve">Several computationally intensive tools have emerged to assess the degree or types of information encoded in </w:t>
       </w:r>
-      <w:commentRangeStart w:id="272"/>
-      <w:commentRangeStart w:id="273"/>
-      <w:commentRangeStart w:id="274"/>
+      <w:commentRangeStart w:id="410"/>
+      <w:commentRangeStart w:id="411"/>
+      <w:commentRangeStart w:id="412"/>
       <w:r>
         <w:rPr>
           <w:rFonts w:ascii="Arial" w:hAnsi="Arial" w:cs="Arial"/>
         </w:rPr>
         <w:t>signals</w:t>
       </w:r>
-      <w:commentRangeEnd w:id="272"/>
+      <w:commentRangeEnd w:id="410"/>
       <w:r>
         <w:rPr>
           <w:rStyle w:val="CommentReference"/>
         </w:rPr>
-        <w:commentReference w:id="272"/>
-      </w:r>
-      <w:commentRangeEnd w:id="273"/>
+        <w:commentReference w:id="410"/>
+      </w:r>
+      <w:commentRangeEnd w:id="411"/>
       <w:r>
         <w:rPr>
           <w:rStyle w:val="CommentReference"/>
         </w:rPr>
-        <w:commentReference w:id="273"/>
-      </w:r>
-      <w:commentRangeEnd w:id="274"/>
+        <w:commentReference w:id="411"/>
+      </w:r>
+      <w:commentRangeEnd w:id="412"/>
       <w:r>
         <w:rPr>
           <w:rStyle w:val="CommentReference"/>
         </w:rPr>
-        <w:commentReference w:id="274"/>
+        <w:commentReference w:id="412"/>
       </w:r>
       <w:r>
         <w:rPr>
@@ -22881,7 +24419,7 @@
       <w:pPr>
         <w:spacing w:line="360" w:lineRule="auto"/>
         <w:rPr>
-          <w:ins w:id="275" w:author="Smith Vidaurre, Grace" w:date="2025-06-05T09:32:00Z" w16du:dateUtc="2025-06-05T13:32:00Z"/>
+          <w:ins w:id="413" w:author="Smith Vidaurre, Grace" w:date="2025-06-05T09:32:00Z" w16du:dateUtc="2025-06-05T13:32:00Z"/>
           <w:rFonts w:ascii="Arial" w:hAnsi="Arial" w:cs="Arial"/>
         </w:rPr>
       </w:pPr>
@@ -22891,11 +24429,11 @@
         <w:spacing w:line="480" w:lineRule="auto"/>
         <w:ind w:firstLine="720"/>
         <w:rPr>
-          <w:ins w:id="276" w:author="Smith Vidaurre, Grace" w:date="2025-06-05T09:32:00Z" w16du:dateUtc="2025-06-05T13:32:00Z"/>
-          <w:rFonts w:ascii="Arial" w:hAnsi="Arial" w:cs="Arial"/>
-        </w:rPr>
-      </w:pPr>
-      <w:ins w:id="277" w:author="Smith Vidaurre, Grace" w:date="2025-06-05T09:32:00Z" w16du:dateUtc="2025-06-05T13:32:00Z">
+          <w:ins w:id="414" w:author="Smith Vidaurre, Grace" w:date="2025-06-05T09:32:00Z" w16du:dateUtc="2025-06-05T13:32:00Z"/>
+          <w:rFonts w:ascii="Arial" w:hAnsi="Arial" w:cs="Arial"/>
+        </w:rPr>
+      </w:pPr>
+      <w:ins w:id="415" w:author="Smith Vidaurre, Grace" w:date="2025-06-05T09:32:00Z" w16du:dateUtc="2025-06-05T13:32:00Z">
         <w:r>
           <w:rPr>
             <w:rFonts w:ascii="Arial" w:hAnsi="Arial" w:cs="Arial"/>
@@ -23816,7 +25354,7 @@
       </w:r>
     </w:p>
   </w:comment>
-  <w:comment w:id="220" w:author="Samman, Raneem" w:date="2025-01-13T15:07:00Z" w:initials="RS">
+  <w:comment w:id="224" w:author="Samman, Raneem" w:date="2025-01-13T15:07:00Z" w:initials="RS">
     <w:p>
       <w:r>
         <w:rPr>
@@ -23834,7 +25372,7 @@
       </w:r>
     </w:p>
   </w:comment>
-  <w:comment w:id="221" w:author="Coppinger, Brittany" w:date="2025-01-15T13:17:00Z" w:initials="BC">
+  <w:comment w:id="225" w:author="Coppinger, Brittany" w:date="2025-01-15T13:17:00Z" w:initials="BC">
     <w:p>
       <w:pPr>
         <w:pStyle w:val="CommentText"/>
@@ -23861,7 +25399,7 @@
       </w:r>
     </w:p>
   </w:comment>
-  <w:comment w:id="233" w:author="Coppinger, Brittany" w:date="2025-01-07T15:07:00Z" w:initials="BC">
+  <w:comment w:id="349" w:author="Coppinger, Brittany" w:date="2025-01-07T15:07:00Z" w:initials="BC">
     <w:p>
       <w:pPr>
         <w:pStyle w:val="CommentText"/>
@@ -23877,7 +25415,7 @@
       </w:r>
     </w:p>
   </w:comment>
-  <w:comment w:id="234" w:author="Samman, Raneem" w:date="2025-01-13T15:08:00Z" w:initials="RS">
+  <w:comment w:id="350" w:author="Samman, Raneem" w:date="2025-01-13T15:08:00Z" w:initials="RS">
     <w:p>
       <w:r>
         <w:rPr>
@@ -23895,7 +25433,7 @@
       </w:r>
     </w:p>
   </w:comment>
-  <w:comment w:id="235" w:author="Samman, Raneem" w:date="2025-01-13T15:10:00Z" w:initials="RS">
+  <w:comment w:id="361" w:author="Samman, Raneem" w:date="2025-01-13T15:10:00Z" w:initials="RS">
     <w:p>
       <w:r>
         <w:rPr>
@@ -23913,7 +25451,7 @@
       </w:r>
     </w:p>
   </w:comment>
-  <w:comment w:id="236" w:author="Coppinger, Brittany" w:date="2025-01-07T15:01:00Z" w:initials="BC">
+  <w:comment w:id="370" w:author="Coppinger, Brittany" w:date="2025-01-07T15:01:00Z" w:initials="BC">
     <w:p>
       <w:pPr>
         <w:pStyle w:val="CommentText"/>
@@ -23929,7 +25467,7 @@
       </w:r>
     </w:p>
   </w:comment>
-  <w:comment w:id="237" w:author="Coppinger, Brittany" w:date="2025-01-07T15:08:00Z" w:initials="BC">
+  <w:comment w:id="371" w:author="Coppinger, Brittany" w:date="2025-01-07T15:08:00Z" w:initials="BC">
     <w:p>
       <w:pPr>
         <w:pStyle w:val="CommentText"/>
@@ -23945,7 +25483,7 @@
       </w:r>
     </w:p>
   </w:comment>
-  <w:comment w:id="238" w:author="Coppinger, Brittany" w:date="2025-01-07T15:12:00Z" w:initials="BC">
+  <w:comment w:id="372" w:author="Coppinger, Brittany" w:date="2025-01-07T15:12:00Z" w:initials="BC">
     <w:p>
       <w:pPr>
         <w:pStyle w:val="CommentText"/>
@@ -23961,7 +25499,7 @@
       </w:r>
     </w:p>
   </w:comment>
-  <w:comment w:id="239" w:author="Coppinger, Brittany" w:date="2025-04-03T14:53:00Z" w:initials="BC">
+  <w:comment w:id="377" w:author="Coppinger, Brittany" w:date="2025-04-03T14:53:00Z" w:initials="BC">
     <w:p>
       <w:pPr>
         <w:pStyle w:val="CommentText"/>
@@ -23977,7 +25515,7 @@
       </w:r>
     </w:p>
   </w:comment>
-  <w:comment w:id="244" w:author="Coppinger, Brittany" w:date="2025-04-10T14:31:00Z" w:initials="BC">
+  <w:comment w:id="382" w:author="Coppinger, Brittany" w:date="2025-04-10T14:31:00Z" w:initials="BC">
     <w:p>
       <w:pPr>
         <w:pStyle w:val="CommentText"/>
@@ -23993,7 +25531,7 @@
       </w:r>
     </w:p>
   </w:comment>
-  <w:comment w:id="245" w:author="Smith Vidaurre, Grace" w:date="2025-05-28T18:58:00Z" w:initials="GSV">
+  <w:comment w:id="383" w:author="Smith Vidaurre, Grace" w:date="2025-05-28T18:58:00Z" w:initials="GSV">
     <w:p>
       <w:r>
         <w:rPr>
@@ -24010,7 +25548,7 @@
       </w:r>
     </w:p>
   </w:comment>
-  <w:comment w:id="246" w:author="Smith Vidaurre, Grace" w:date="2025-05-28T19:00:00Z" w:initials="GSV">
+  <w:comment w:id="384" w:author="Smith Vidaurre, Grace" w:date="2025-05-28T19:00:00Z" w:initials="GSV">
     <w:p>
       <w:r>
         <w:rPr>
@@ -24027,7 +25565,7 @@
       </w:r>
     </w:p>
   </w:comment>
-  <w:comment w:id="248" w:author="Summer Eckhardt" w:date="2025-02-04T18:49:00Z" w:initials="SE">
+  <w:comment w:id="386" w:author="Summer Eckhardt" w:date="2025-02-04T18:49:00Z" w:initials="SE">
     <w:p>
       <w:pPr>
         <w:pStyle w:val="CommentText"/>
@@ -24043,7 +25581,7 @@
       </w:r>
     </w:p>
   </w:comment>
-  <w:comment w:id="251" w:author="Summer Eckhardt" w:date="2025-02-04T19:02:00Z" w:initials="SE">
+  <w:comment w:id="389" w:author="Summer Eckhardt" w:date="2025-02-04T19:02:00Z" w:initials="SE">
     <w:p>
       <w:pPr>
         <w:pStyle w:val="CommentText"/>
@@ -24059,7 +25597,7 @@
       </w:r>
     </w:p>
   </w:comment>
-  <w:comment w:id="255" w:author="Smith Vidaurre, Grace" w:date="2025-05-22T13:33:00Z" w:initials="GSV">
+  <w:comment w:id="393" w:author="Smith Vidaurre, Grace" w:date="2025-05-22T13:33:00Z" w:initials="GSV">
     <w:p>
       <w:r>
         <w:rPr>
@@ -24076,7 +25614,7 @@
       </w:r>
     </w:p>
   </w:comment>
-  <w:comment w:id="258" w:author="Smith Vidaurre, Grace" w:date="2025-05-22T13:23:00Z" w:initials="GSV">
+  <w:comment w:id="396" w:author="Smith Vidaurre, Grace" w:date="2025-05-22T13:23:00Z" w:initials="GSV">
     <w:p>
       <w:r>
         <w:rPr>
@@ -24093,7 +25631,7 @@
       </w:r>
     </w:p>
   </w:comment>
-  <w:comment w:id="263" w:author="Smith Vidaurre, Grace" w:date="2024-12-18T14:31:00Z" w:initials="GSV">
+  <w:comment w:id="401" w:author="Smith Vidaurre, Grace" w:date="2024-12-18T14:31:00Z" w:initials="GSV">
     <w:p>
       <w:r>
         <w:rPr>
@@ -24110,7 +25648,7 @@
       </w:r>
     </w:p>
   </w:comment>
-  <w:comment w:id="270" w:author="Smith Vidaurre, Grace" w:date="2024-12-18T15:30:00Z" w:initials="GSV">
+  <w:comment w:id="408" w:author="Smith Vidaurre, Grace" w:date="2024-12-18T15:30:00Z" w:initials="GSV">
     <w:p>
       <w:r>
         <w:rPr>
@@ -24127,7 +25665,7 @@
       </w:r>
     </w:p>
   </w:comment>
-  <w:comment w:id="272" w:author="Smith Vidaurre, Grace" w:date="2024-12-16T09:35:00Z" w:initials="GSV">
+  <w:comment w:id="410" w:author="Smith Vidaurre, Grace" w:date="2024-12-16T09:35:00Z" w:initials="GSV">
     <w:p>
       <w:r>
         <w:rPr>
@@ -24144,7 +25682,7 @@
       </w:r>
     </w:p>
   </w:comment>
-  <w:comment w:id="273" w:author="Smith Vidaurre, Grace" w:date="2024-12-16T09:41:00Z" w:initials="GSV">
+  <w:comment w:id="411" w:author="Smith Vidaurre, Grace" w:date="2024-12-16T09:41:00Z" w:initials="GSV">
     <w:p>
       <w:r>
         <w:rPr>
@@ -24161,7 +25699,7 @@
       </w:r>
     </w:p>
   </w:comment>
-  <w:comment w:id="274" w:author="Coppinger, Brittany" w:date="2024-12-16T14:51:00Z" w:initials="BC">
+  <w:comment w:id="412" w:author="Coppinger, Brittany" w:date="2024-12-16T14:51:00Z" w:initials="BC">
     <w:p>
       <w:pPr>
         <w:pStyle w:val="CommentText"/>
@@ -24265,9 +25803,9 @@
   <w15:commentEx w15:paraId="7C2E490A" w15:done="0"/>
   <w15:commentEx w15:paraId="16B4FD0C" w15:done="1"/>
   <w15:commentEx w15:paraId="385C64F1" w15:paraIdParent="16B4FD0C" w15:done="1"/>
-  <w15:commentEx w15:paraId="4B993223" w15:done="0"/>
-  <w15:commentEx w15:paraId="4F255895" w15:done="0"/>
-  <w15:commentEx w15:paraId="0F084039" w15:paraIdParent="4F255895" w15:done="0"/>
+  <w15:commentEx w15:paraId="4B993223" w15:done="1"/>
+  <w15:commentEx w15:paraId="4F255895" w15:done="1"/>
+  <w15:commentEx w15:paraId="0F084039" w15:paraIdParent="4F255895" w15:done="1"/>
   <w15:commentEx w15:paraId="4A9493FD" w15:done="1"/>
   <w15:commentEx w15:paraId="40FE1D1D" w15:paraIdParent="4A9493FD" w15:done="1"/>
   <w15:commentEx w15:paraId="6FAFB0F5" w15:done="1"/>

</xml_diff>

<commit_message>
Restructuring Methods: in progress, second section
</commit_message>
<xml_diff>
--- a/drafts/paRsynth_methods_draft.docx
+++ b/drafts/paRsynth_methods_draft.docx
@@ -20821,609 +20821,1268 @@
       <w:pPr>
         <w:spacing w:line="480" w:lineRule="auto"/>
         <w:rPr>
-          <w:rFonts w:ascii="Arial" w:hAnsi="Arial" w:cs="Arial"/>
-        </w:rPr>
-        <w:pPrChange w:id="340" w:author="Smith Vidaurre, Grace" w:date="2025-06-09T14:31:00Z" w16du:dateUtc="2025-06-09T18:31:00Z">
+          <w:ins w:id="340" w:author="Smith Vidaurre, Grace" w:date="2025-06-09T15:02:00Z" w16du:dateUtc="2025-06-09T19:02:00Z"/>
+          <w:rFonts w:ascii="Arial" w:hAnsi="Arial" w:cs="Arial"/>
+        </w:rPr>
+      </w:pPr>
+      <w:del w:id="341" w:author="Smith Vidaurre, Grace" w:date="2025-06-09T14:43:00Z" w16du:dateUtc="2025-06-09T18:43:00Z">
+        <w:r>
+          <w:rPr>
+            <w:rFonts w:ascii="Arial" w:hAnsi="Arial" w:cs="Arial"/>
+          </w:rPr>
+          <w:delText>Using the p</w:delText>
+        </w:r>
+      </w:del>
+      <w:del w:id="342" w:author="Smith Vidaurre, Grace" w:date="2025-06-09T14:32:00Z" w16du:dateUtc="2025-06-09T18:32:00Z">
+        <w:r>
+          <w:rPr>
+            <w:rFonts w:ascii="Arial" w:hAnsi="Arial" w:cs="Arial"/>
+          </w:rPr>
+          <w:delText>rocess</w:delText>
+        </w:r>
+      </w:del>
+      <w:del w:id="343" w:author="Smith Vidaurre, Grace" w:date="2025-06-09T14:43:00Z" w16du:dateUtc="2025-06-09T18:43:00Z">
+        <w:r>
+          <w:rPr>
+            <w:rFonts w:ascii="Arial" w:hAnsi="Arial" w:cs="Arial"/>
+          </w:rPr>
+          <w:delText xml:space="preserve"> described above, we </w:delText>
+        </w:r>
+      </w:del>
+      <w:ins w:id="344" w:author="Smith Vidaurre, Grace" w:date="2025-06-09T14:43:00Z" w16du:dateUtc="2025-06-09T18:43:00Z">
+        <w:r>
+          <w:rPr>
+            <w:rFonts w:ascii="Arial" w:hAnsi="Arial" w:cs="Arial"/>
+          </w:rPr>
+          <w:t xml:space="preserve">We </w:t>
+        </w:r>
+      </w:ins>
+      <w:r>
+        <w:rPr>
+          <w:rFonts w:ascii="Arial" w:hAnsi="Arial" w:cs="Arial"/>
+        </w:rPr>
+        <w:t xml:space="preserve">created two </w:t>
+      </w:r>
+      <w:del w:id="345" w:author="Smith Vidaurre, Grace" w:date="2025-06-09T14:32:00Z" w16du:dateUtc="2025-06-09T18:32:00Z">
+        <w:r>
+          <w:rPr>
+            <w:rFonts w:ascii="Arial" w:hAnsi="Arial" w:cs="Arial"/>
+          </w:rPr>
+          <w:delText xml:space="preserve">synthetic </w:delText>
+        </w:r>
+      </w:del>
+      <w:ins w:id="346" w:author="Smith Vidaurre, Grace" w:date="2025-06-09T14:32:00Z" w16du:dateUtc="2025-06-09T18:32:00Z">
+        <w:r>
+          <w:rPr>
+            <w:rFonts w:ascii="Arial" w:hAnsi="Arial" w:cs="Arial"/>
+          </w:rPr>
+          <w:t>example</w:t>
+        </w:r>
+        <w:r>
+          <w:rPr>
+            <w:rFonts w:ascii="Arial" w:hAnsi="Arial" w:cs="Arial"/>
+          </w:rPr>
+          <w:t xml:space="preserve"> </w:t>
+        </w:r>
+      </w:ins>
+      <w:r>
+        <w:rPr>
+          <w:rFonts w:ascii="Arial" w:hAnsi="Arial" w:cs="Arial"/>
+        </w:rPr>
+        <w:t>data</w:t>
+      </w:r>
+      <w:del w:id="347" w:author="Smith Vidaurre, Grace" w:date="2025-06-09T14:32:00Z" w16du:dateUtc="2025-06-09T18:32:00Z">
+        <w:r>
+          <w:rPr>
+            <w:rFonts w:ascii="Arial" w:hAnsi="Arial" w:cs="Arial"/>
+          </w:rPr>
+          <w:delText xml:space="preserve"> </w:delText>
+        </w:r>
+      </w:del>
+      <w:r>
+        <w:rPr>
+          <w:rFonts w:ascii="Arial" w:hAnsi="Arial" w:cs="Arial"/>
+        </w:rPr>
+        <w:t>sets</w:t>
+      </w:r>
+      <w:ins w:id="348" w:author="Smith Vidaurre, Grace" w:date="2025-06-09T14:43:00Z" w16du:dateUtc="2025-06-09T18:43:00Z">
+        <w:r>
+          <w:rPr>
+            <w:rFonts w:ascii="Arial" w:hAnsi="Arial" w:cs="Arial"/>
+          </w:rPr>
+          <w:t xml:space="preserve"> to highlight </w:t>
+        </w:r>
+        <w:r>
+          <w:rPr>
+            <w:rFonts w:ascii="Arial" w:hAnsi="Arial" w:cs="Arial"/>
+          </w:rPr>
+          <w:t>the pipeline described above</w:t>
+        </w:r>
+      </w:ins>
+      <w:r>
+        <w:rPr>
+          <w:rFonts w:ascii="Arial" w:hAnsi="Arial" w:cs="Arial"/>
+        </w:rPr>
+        <w:t xml:space="preserve">: </w:t>
+      </w:r>
+      <w:ins w:id="349" w:author="Smith Vidaurre, Grace" w:date="2025-06-09T14:33:00Z" w16du:dateUtc="2025-06-09T18:33:00Z">
+        <w:r>
+          <w:rPr>
+            <w:rFonts w:ascii="Arial" w:hAnsi="Arial" w:cs="Arial"/>
+          </w:rPr>
+          <w:t xml:space="preserve">(1) </w:t>
+        </w:r>
+      </w:ins>
+      <w:del w:id="350" w:author="Smith Vidaurre, Grace" w:date="2025-06-09T14:33:00Z" w16du:dateUtc="2025-06-09T18:33:00Z">
+        <w:r>
+          <w:rPr>
+            <w:rFonts w:ascii="Arial" w:hAnsi="Arial" w:cs="Arial"/>
+          </w:rPr>
+          <w:delText xml:space="preserve">one </w:delText>
+        </w:r>
+      </w:del>
+      <w:del w:id="351" w:author="Smith Vidaurre, Grace" w:date="2025-06-09T14:32:00Z" w16du:dateUtc="2025-06-09T18:32:00Z">
+        <w:r>
+          <w:rPr>
+            <w:rFonts w:ascii="Arial" w:hAnsi="Arial" w:cs="Arial"/>
+          </w:rPr>
+          <w:delText xml:space="preserve">that created </w:delText>
+        </w:r>
+        <w:commentRangeStart w:id="352"/>
+        <w:commentRangeStart w:id="353"/>
+        <w:r>
+          <w:rPr>
+            <w:rFonts w:ascii="Arial" w:hAnsi="Arial" w:cs="Arial"/>
+          </w:rPr>
+          <w:delText xml:space="preserve">vocalizations </w:delText>
+        </w:r>
+        <w:commentRangeEnd w:id="352"/>
+        <w:r>
+          <w:rPr>
+            <w:rStyle w:val="CommentReference"/>
+          </w:rPr>
+          <w:commentReference w:id="352"/>
+        </w:r>
+        <w:commentRangeEnd w:id="353"/>
+        <w:r>
+          <w:rPr>
+            <w:rStyle w:val="CommentReference"/>
+          </w:rPr>
+          <w:commentReference w:id="353"/>
+        </w:r>
+      </w:del>
+      <w:del w:id="354" w:author="Smith Vidaurre, Grace" w:date="2025-06-09T14:33:00Z" w16du:dateUtc="2025-06-09T18:33:00Z">
+        <w:r>
+          <w:rPr>
+            <w:rFonts w:ascii="Arial" w:hAnsi="Arial" w:cs="Arial"/>
+          </w:rPr>
+          <w:delText xml:space="preserve">with </w:delText>
+        </w:r>
+      </w:del>
+      <w:r>
+        <w:rPr>
+          <w:rFonts w:ascii="Arial" w:hAnsi="Arial" w:cs="Arial"/>
+        </w:rPr>
+        <w:t xml:space="preserve">more group membership information than individual </w:t>
+      </w:r>
+      <w:ins w:id="355" w:author="Smith Vidaurre, Grace" w:date="2025-06-09T14:32:00Z" w16du:dateUtc="2025-06-09T18:32:00Z">
+        <w:r>
+          <w:rPr>
+            <w:rFonts w:ascii="Arial" w:hAnsi="Arial" w:cs="Arial"/>
+          </w:rPr>
+          <w:t xml:space="preserve">identity </w:t>
+        </w:r>
+      </w:ins>
+      <w:r>
+        <w:rPr>
+          <w:rFonts w:ascii="Arial" w:hAnsi="Arial" w:cs="Arial"/>
+        </w:rPr>
+        <w:t>information</w:t>
+      </w:r>
+      <w:ins w:id="356" w:author="Smith Vidaurre, Grace" w:date="2025-06-09T14:33:00Z" w16du:dateUtc="2025-06-09T18:33:00Z">
+        <w:r>
+          <w:rPr>
+            <w:rFonts w:ascii="Arial" w:hAnsi="Arial" w:cs="Arial"/>
+          </w:rPr>
+          <w:t xml:space="preserve"> </w:t>
+        </w:r>
+      </w:ins>
+      <w:del w:id="357" w:author="Smith Vidaurre, Grace" w:date="2025-06-09T14:33:00Z" w16du:dateUtc="2025-06-09T18:33:00Z">
+        <w:r>
+          <w:rPr>
+            <w:rFonts w:ascii="Arial" w:hAnsi="Arial" w:cs="Arial"/>
+          </w:rPr>
+          <w:delText xml:space="preserve"> encoded </w:delText>
+        </w:r>
+      </w:del>
+      <w:r>
+        <w:rPr>
+          <w:rFonts w:ascii="Arial" w:hAnsi="Arial" w:cs="Arial"/>
+        </w:rPr>
+        <w:t>(</w:t>
+      </w:r>
+      <w:del w:id="358" w:author="Smith Vidaurre, Grace" w:date="2025-06-09T14:32:00Z" w16du:dateUtc="2025-06-09T18:32:00Z">
+        <w:r>
+          <w:rPr>
+            <w:rFonts w:ascii="Arial" w:hAnsi="Arial" w:cs="Arial"/>
+          </w:rPr>
+          <w:delText>g</w:delText>
+        </w:r>
+        <w:r>
+          <w:rPr>
+            <w:rFonts w:ascii="Arial" w:hAnsi="Arial" w:cs="Arial"/>
+          </w:rPr>
+          <w:delText xml:space="preserve">roup </w:delText>
+        </w:r>
+        <w:r>
+          <w:rPr>
+            <w:rFonts w:ascii="Arial" w:hAnsi="Arial" w:cs="Arial"/>
+          </w:rPr>
+          <w:delText>specific</w:delText>
+        </w:r>
+        <w:r>
+          <w:rPr>
+            <w:rFonts w:ascii="Arial" w:hAnsi="Arial" w:cs="Arial"/>
+          </w:rPr>
+          <w:delText xml:space="preserve"> </w:delText>
+        </w:r>
+        <w:r>
+          <w:rPr>
+            <w:rFonts w:ascii="Arial" w:hAnsi="Arial" w:cs="Arial"/>
+          </w:rPr>
+          <w:delText>i</w:delText>
+        </w:r>
+        <w:r>
+          <w:rPr>
+            <w:rFonts w:ascii="Arial" w:hAnsi="Arial" w:cs="Arial"/>
+          </w:rPr>
+          <w:delText xml:space="preserve">nformation </w:delText>
+        </w:r>
+        <w:r>
+          <w:rPr>
+            <w:rFonts w:ascii="Arial" w:hAnsi="Arial" w:cs="Arial"/>
+          </w:rPr>
+          <w:delText>d</w:delText>
+        </w:r>
+        <w:r>
+          <w:rPr>
+            <w:rFonts w:ascii="Arial" w:hAnsi="Arial" w:cs="Arial"/>
+          </w:rPr>
+          <w:delText xml:space="preserve">ataset: henceforth </w:delText>
+        </w:r>
+      </w:del>
+      <w:r>
+        <w:rPr>
+          <w:rFonts w:ascii="Arial" w:hAnsi="Arial" w:cs="Arial"/>
+        </w:rPr>
+        <w:t xml:space="preserve">the </w:t>
+      </w:r>
+      <w:r>
+        <w:rPr>
+          <w:rFonts w:ascii="Arial" w:hAnsi="Arial" w:cs="Arial"/>
+        </w:rPr>
+        <w:t>group</w:t>
+      </w:r>
+      <w:ins w:id="359" w:author="Smith Vidaurre, Grace" w:date="2025-06-09T14:32:00Z" w16du:dateUtc="2025-06-09T18:32:00Z">
+        <w:r>
+          <w:rPr>
+            <w:rFonts w:ascii="Arial" w:hAnsi="Arial" w:cs="Arial"/>
+          </w:rPr>
+          <w:t>-</w:t>
+        </w:r>
+      </w:ins>
+      <w:del w:id="360" w:author="Smith Vidaurre, Grace" w:date="2025-06-09T14:32:00Z" w16du:dateUtc="2025-06-09T18:32:00Z">
+        <w:r>
+          <w:rPr>
+            <w:rFonts w:ascii="Arial" w:hAnsi="Arial" w:cs="Arial"/>
+          </w:rPr>
+          <w:delText xml:space="preserve"> </w:delText>
+        </w:r>
+      </w:del>
+      <w:r>
+        <w:rPr>
+          <w:rFonts w:ascii="Arial" w:hAnsi="Arial" w:cs="Arial"/>
+        </w:rPr>
+        <w:t>specific</w:t>
+      </w:r>
+      <w:r>
+        <w:rPr>
+          <w:rFonts w:ascii="Arial" w:hAnsi="Arial" w:cs="Arial"/>
+        </w:rPr>
+        <w:t xml:space="preserve"> dataset), and </w:t>
+      </w:r>
+      <w:ins w:id="361" w:author="Smith Vidaurre, Grace" w:date="2025-06-09T14:33:00Z" w16du:dateUtc="2025-06-09T18:33:00Z">
+        <w:r>
+          <w:rPr>
+            <w:rFonts w:ascii="Arial" w:hAnsi="Arial" w:cs="Arial"/>
+          </w:rPr>
+          <w:t xml:space="preserve">(2) </w:t>
+        </w:r>
+      </w:ins>
+      <w:del w:id="362" w:author="Smith Vidaurre, Grace" w:date="2025-06-09T14:33:00Z" w16du:dateUtc="2025-06-09T18:33:00Z">
+        <w:r>
+          <w:rPr>
+            <w:rFonts w:ascii="Arial" w:hAnsi="Arial" w:cs="Arial"/>
+          </w:rPr>
+          <w:delText xml:space="preserve">one </w:delText>
+        </w:r>
+      </w:del>
+      <w:del w:id="363" w:author="Smith Vidaurre, Grace" w:date="2025-06-09T14:32:00Z" w16du:dateUtc="2025-06-09T18:32:00Z">
+        <w:r>
+          <w:rPr>
+            <w:rFonts w:ascii="Arial" w:hAnsi="Arial" w:cs="Arial"/>
+          </w:rPr>
+          <w:delText xml:space="preserve">that created </w:delText>
+        </w:r>
+        <w:commentRangeStart w:id="364"/>
+        <w:r>
+          <w:rPr>
+            <w:rFonts w:ascii="Arial" w:hAnsi="Arial" w:cs="Arial"/>
+          </w:rPr>
+          <w:delText xml:space="preserve">character strings </w:delText>
+        </w:r>
+        <w:commentRangeEnd w:id="364"/>
+        <w:r>
+          <w:rPr>
+            <w:rStyle w:val="CommentReference"/>
+          </w:rPr>
+          <w:commentReference w:id="364"/>
+        </w:r>
+      </w:del>
+      <w:del w:id="365" w:author="Smith Vidaurre, Grace" w:date="2025-06-09T14:33:00Z" w16du:dateUtc="2025-06-09T18:33:00Z">
+        <w:r>
+          <w:rPr>
+            <w:rFonts w:ascii="Arial" w:hAnsi="Arial" w:cs="Arial"/>
+          </w:rPr>
+          <w:delText xml:space="preserve">with </w:delText>
+        </w:r>
+      </w:del>
+      <w:r>
+        <w:rPr>
+          <w:rFonts w:ascii="Arial" w:hAnsi="Arial" w:cs="Arial"/>
+        </w:rPr>
+        <w:t xml:space="preserve">more individual </w:t>
+      </w:r>
+      <w:ins w:id="366" w:author="Smith Vidaurre, Grace" w:date="2025-06-09T14:32:00Z" w16du:dateUtc="2025-06-09T18:32:00Z">
+        <w:r>
+          <w:rPr>
+            <w:rFonts w:ascii="Arial" w:hAnsi="Arial" w:cs="Arial"/>
+          </w:rPr>
+          <w:t xml:space="preserve">identity </w:t>
+        </w:r>
+      </w:ins>
+      <w:del w:id="367" w:author="Smith Vidaurre, Grace" w:date="2025-06-09T14:33:00Z" w16du:dateUtc="2025-06-09T18:33:00Z">
+        <w:r>
+          <w:rPr>
+            <w:rFonts w:ascii="Arial" w:hAnsi="Arial" w:cs="Arial"/>
+          </w:rPr>
+          <w:delText xml:space="preserve">information </w:delText>
+        </w:r>
+      </w:del>
+      <w:r>
+        <w:rPr>
+          <w:rFonts w:ascii="Arial" w:hAnsi="Arial" w:cs="Arial"/>
+        </w:rPr>
+        <w:t>than group membership information</w:t>
+      </w:r>
+      <w:del w:id="368" w:author="Smith Vidaurre, Grace" w:date="2025-06-09T14:32:00Z" w16du:dateUtc="2025-06-09T18:32:00Z">
+        <w:r>
+          <w:rPr>
+            <w:rFonts w:ascii="Arial" w:hAnsi="Arial" w:cs="Arial"/>
+          </w:rPr>
+          <w:delText xml:space="preserve"> encoded</w:delText>
+        </w:r>
+      </w:del>
+      <w:r>
+        <w:rPr>
+          <w:rFonts w:ascii="Arial" w:hAnsi="Arial" w:cs="Arial"/>
+        </w:rPr>
+        <w:t xml:space="preserve"> (</w:t>
+      </w:r>
+      <w:r>
+        <w:rPr>
+          <w:rFonts w:ascii="Arial" w:hAnsi="Arial" w:cs="Arial"/>
+        </w:rPr>
+        <w:t>individual</w:t>
+      </w:r>
+      <w:ins w:id="369" w:author="Smith Vidaurre, Grace" w:date="2025-06-09T14:32:00Z" w16du:dateUtc="2025-06-09T18:32:00Z">
+        <w:r>
+          <w:rPr>
+            <w:rFonts w:ascii="Arial" w:hAnsi="Arial" w:cs="Arial"/>
+          </w:rPr>
+          <w:t>ly distinctive</w:t>
+        </w:r>
+      </w:ins>
+      <w:r>
+        <w:rPr>
+          <w:rFonts w:ascii="Arial" w:hAnsi="Arial" w:cs="Arial"/>
+        </w:rPr>
+        <w:t xml:space="preserve"> </w:t>
+      </w:r>
+      <w:del w:id="370" w:author="Smith Vidaurre, Grace" w:date="2025-06-09T14:32:00Z" w16du:dateUtc="2025-06-09T18:32:00Z">
+        <w:r>
+          <w:rPr>
+            <w:rFonts w:ascii="Arial" w:hAnsi="Arial" w:cs="Arial"/>
+          </w:rPr>
+          <w:delText xml:space="preserve">identity information </w:delText>
+        </w:r>
+      </w:del>
+      <w:r>
+        <w:rPr>
+          <w:rFonts w:ascii="Arial" w:hAnsi="Arial" w:cs="Arial"/>
+        </w:rPr>
+        <w:t>dataset</w:t>
+      </w:r>
+      <w:ins w:id="371" w:author="Smith Vidaurre, Grace" w:date="2025-06-09T14:33:00Z" w16du:dateUtc="2025-06-09T18:33:00Z">
+        <w:r>
+          <w:rPr>
+            <w:rFonts w:ascii="Arial" w:hAnsi="Arial" w:cs="Arial"/>
+          </w:rPr>
+          <w:t>)</w:t>
+        </w:r>
+      </w:ins>
+      <w:del w:id="372" w:author="Smith Vidaurre, Grace" w:date="2025-06-09T14:33:00Z" w16du:dateUtc="2025-06-09T18:33:00Z">
+        <w:r>
+          <w:rPr>
+            <w:rFonts w:ascii="Arial" w:hAnsi="Arial" w:cs="Arial"/>
+          </w:rPr>
+          <w:delText xml:space="preserve">; </w:delText>
+        </w:r>
+        <w:commentRangeStart w:id="373"/>
+        <w:commentRangeEnd w:id="373"/>
+        <w:r>
+          <w:rPr>
+            <w:rStyle w:val="CommentReference"/>
+          </w:rPr>
+          <w:commentReference w:id="373"/>
+        </w:r>
+        <w:r>
+          <w:rPr>
+            <w:rFonts w:ascii="Arial" w:hAnsi="Arial" w:cs="Arial"/>
+          </w:rPr>
+          <w:delText xml:space="preserve">henceforth the </w:delText>
+        </w:r>
+        <w:r>
+          <w:rPr>
+            <w:rFonts w:ascii="Arial" w:hAnsi="Arial" w:cs="Arial"/>
+          </w:rPr>
+          <w:delText>individual identity</w:delText>
+        </w:r>
+        <w:r>
+          <w:rPr>
+            <w:rFonts w:ascii="Arial" w:hAnsi="Arial" w:cs="Arial"/>
+          </w:rPr>
+          <w:delText xml:space="preserve"> dataset)</w:delText>
+        </w:r>
+      </w:del>
+      <w:r>
+        <w:rPr>
+          <w:rFonts w:ascii="Arial" w:hAnsi="Arial" w:cs="Arial"/>
+        </w:rPr>
+        <w:t>.</w:t>
+      </w:r>
+      <w:ins w:id="374" w:author="Smith Vidaurre, Grace" w:date="2025-06-09T14:43:00Z" w16du:dateUtc="2025-06-09T18:43:00Z">
+        <w:r>
+          <w:rPr>
+            <w:rFonts w:ascii="Arial" w:hAnsi="Arial" w:cs="Arial"/>
+          </w:rPr>
+          <w:t xml:space="preserve"> Across both datasets, we used a</w:t>
+        </w:r>
+      </w:ins>
+      <w:ins w:id="375" w:author="Smith Vidaurre, Grace" w:date="2025-06-09T14:44:00Z" w16du:dateUtc="2025-06-09T18:44:00Z">
+        <w:r>
+          <w:rPr>
+            <w:rFonts w:ascii="Arial" w:hAnsi="Arial" w:cs="Arial"/>
+          </w:rPr>
+          <w:t xml:space="preserve">n overall </w:t>
+        </w:r>
+      </w:ins>
+      <w:ins w:id="376" w:author="Smith Vidaurre, Grace" w:date="2025-06-09T14:43:00Z" w16du:dateUtc="2025-06-09T18:43:00Z">
+        <w:r>
+          <w:rPr>
+            <w:rFonts w:ascii="Arial" w:hAnsi="Arial" w:cs="Arial"/>
+          </w:rPr>
+          <w:t xml:space="preserve">string length of </w:t>
+        </w:r>
+        <w:r>
+          <w:rPr>
+            <w:rFonts w:ascii="Arial" w:hAnsi="Arial" w:cs="Arial"/>
+          </w:rPr>
+          <w:t>1</w:t>
+        </w:r>
+      </w:ins>
+      <w:ins w:id="377" w:author="Smith Vidaurre, Grace" w:date="2025-06-09T14:44:00Z" w16du:dateUtc="2025-06-09T18:44:00Z">
+        <w:r>
+          <w:rPr>
+            <w:rFonts w:ascii="Arial" w:hAnsi="Arial" w:cs="Arial"/>
+          </w:rPr>
+          <w:t>6 characters,</w:t>
+        </w:r>
+        <w:r>
+          <w:rPr>
+            <w:rFonts w:ascii="Arial" w:hAnsi="Arial" w:cs="Arial"/>
+          </w:rPr>
+          <w:t xml:space="preserve"> in which we allocated 4 characters each to the global head and tail sections, and </w:t>
+        </w:r>
+        <w:r>
+          <w:rPr>
+            <w:rFonts w:ascii="Arial" w:hAnsi="Arial" w:cs="Arial"/>
+          </w:rPr>
+          <w:t xml:space="preserve">2 characters to random variation to simulate variation within an individual. </w:t>
+        </w:r>
+      </w:ins>
+      <w:ins w:id="378" w:author="Smith Vidaurre, Grace" w:date="2025-06-09T14:45:00Z" w16du:dateUtc="2025-06-09T18:45:00Z">
+        <w:r>
+          <w:rPr>
+            <w:rFonts w:ascii="Arial" w:hAnsi="Arial" w:cs="Arial"/>
+          </w:rPr>
+          <w:t xml:space="preserve">Over the remaining </w:t>
+        </w:r>
+        <w:r>
+          <w:rPr>
+            <w:rFonts w:ascii="Arial" w:hAnsi="Arial" w:cs="Arial"/>
+          </w:rPr>
+          <w:t xml:space="preserve">6 characters, we assigned 4 characters to group information and 2 to individual information to create the group-specific dataset and then reversed these numbers </w:t>
+        </w:r>
+      </w:ins>
+      <w:ins w:id="379" w:author="Smith Vidaurre, Grace" w:date="2025-06-09T14:47:00Z" w16du:dateUtc="2025-06-09T18:47:00Z">
+        <w:r>
+          <w:rPr>
+            <w:rFonts w:ascii="Arial" w:hAnsi="Arial" w:cs="Arial"/>
+          </w:rPr>
+          <w:t xml:space="preserve">to create the individually distinctive dataset </w:t>
+        </w:r>
+      </w:ins>
+      <w:ins w:id="380" w:author="Smith Vidaurre, Grace" w:date="2025-06-09T14:45:00Z" w16du:dateUtc="2025-06-09T18:45:00Z">
+        <w:r>
+          <w:rPr>
+            <w:rFonts w:ascii="Arial" w:hAnsi="Arial" w:cs="Arial"/>
+          </w:rPr>
+          <w:t>(</w:t>
+        </w:r>
+      </w:ins>
+      <w:ins w:id="381" w:author="Smith Vidaurre, Grace" w:date="2025-06-09T14:48:00Z" w16du:dateUtc="2025-06-09T18:48:00Z">
+        <w:r>
+          <w:rPr>
+            <w:rFonts w:ascii="Arial" w:hAnsi="Arial" w:cs="Arial"/>
+          </w:rPr>
+          <w:t xml:space="preserve">2 characters for group information, and 4 for individual information). </w:t>
+        </w:r>
+        <w:r>
+          <w:rPr>
+            <w:rFonts w:ascii="Arial" w:hAnsi="Arial" w:cs="Arial"/>
+          </w:rPr>
+          <w:t xml:space="preserve">We controlled the size of the resulting signal datasets </w:t>
+        </w:r>
+      </w:ins>
+      <w:ins w:id="382" w:author="Smith Vidaurre, Grace" w:date="2025-06-09T14:49:00Z" w16du:dateUtc="2025-06-09T18:49:00Z">
+        <w:r>
+          <w:rPr>
+            <w:rFonts w:ascii="Arial" w:hAnsi="Arial" w:cs="Arial"/>
+          </w:rPr>
+          <w:t xml:space="preserve">such that each dataset contained </w:t>
+        </w:r>
+        <w:r>
+          <w:rPr>
+            <w:rFonts w:ascii="Arial" w:hAnsi="Arial" w:cs="Arial"/>
+          </w:rPr>
+          <w:t xml:space="preserve">5 groups, 10 individuals per group, and 5 calls per individual, for a total of </w:t>
+        </w:r>
+        <w:r>
+          <w:rPr>
+            <w:rFonts w:ascii="Arial" w:hAnsi="Arial" w:cs="Arial"/>
+          </w:rPr>
+          <w:t xml:space="preserve">250 strings per dataset. </w:t>
+        </w:r>
+      </w:ins>
+      <w:ins w:id="383" w:author="Smith Vidaurre, Grace" w:date="2025-06-09T14:50:00Z" w16du:dateUtc="2025-06-09T18:50:00Z">
+        <w:r>
+          <w:rPr>
+            <w:rFonts w:ascii="Arial" w:hAnsi="Arial" w:cs="Arial"/>
+          </w:rPr>
+          <w:t>As noted above, given that our string generation was a random generation process, we ex</w:t>
+        </w:r>
+      </w:ins>
+      <w:ins w:id="384" w:author="Smith Vidaurre, Grace" w:date="2025-06-09T14:51:00Z" w16du:dateUtc="2025-06-09T18:51:00Z">
+        <w:r>
+          <w:rPr>
+            <w:rFonts w:ascii="Arial" w:hAnsi="Arial" w:cs="Arial"/>
+          </w:rPr>
+          <w:t xml:space="preserve">pected that </w:t>
+        </w:r>
+        <w:r>
+          <w:rPr>
+            <w:rFonts w:ascii="Arial" w:hAnsi="Arial" w:cs="Arial"/>
+          </w:rPr>
+          <w:t xml:space="preserve">strings would overlap in similarity, particularly for larger datasets. </w:t>
+        </w:r>
+        <w:r>
+          <w:rPr>
+            <w:rFonts w:ascii="Arial" w:hAnsi="Arial" w:cs="Arial"/>
+          </w:rPr>
+          <w:t xml:space="preserve">For example, in </w:t>
+        </w:r>
+      </w:ins>
+      <w:ins w:id="385" w:author="Smith Vidaurre, Grace" w:date="2025-06-09T14:52:00Z" w16du:dateUtc="2025-06-09T18:52:00Z">
+        <w:r>
+          <w:rPr>
+            <w:rFonts w:ascii="Arial" w:hAnsi="Arial" w:cs="Arial"/>
+          </w:rPr>
+          <w:t>the group-specific dataset,</w:t>
+        </w:r>
+        <w:r>
+          <w:rPr>
+            <w:rFonts w:ascii="Arial" w:hAnsi="Arial" w:cs="Arial"/>
+          </w:rPr>
+          <w:t xml:space="preserve"> 63% of </w:t>
+        </w:r>
+        <w:r>
+          <w:rPr>
+            <w:rFonts w:ascii="Arial" w:hAnsi="Arial" w:cs="Arial"/>
+          </w:rPr>
+          <w:t xml:space="preserve">the dataset was composed of completely unique </w:t>
+        </w:r>
+        <w:r>
+          <w:rPr>
+            <w:rFonts w:ascii="Arial" w:hAnsi="Arial" w:cs="Arial"/>
+          </w:rPr>
+          <w:t>strings</w:t>
+        </w:r>
+        <w:r>
+          <w:rPr>
+            <w:rFonts w:ascii="Arial" w:hAnsi="Arial" w:cs="Arial"/>
+          </w:rPr>
+          <w:t>.</w:t>
+        </w:r>
+      </w:ins>
+      <w:ins w:id="386" w:author="Smith Vidaurre, Grace" w:date="2025-06-09T14:54:00Z" w16du:dateUtc="2025-06-09T18:54:00Z">
+        <w:r>
+          <w:rPr>
+            <w:rFonts w:ascii="Arial" w:hAnsi="Arial" w:cs="Arial"/>
+          </w:rPr>
+          <w:t xml:space="preserve"> </w:t>
+        </w:r>
+      </w:ins>
+    </w:p>
+    <w:p>
+      <w:pPr>
+        <w:spacing w:line="480" w:lineRule="auto"/>
+        <w:ind w:firstLine="720"/>
+        <w:rPr>
+          <w:ins w:id="387" w:author="Smith Vidaurre, Grace" w:date="2025-06-09T14:56:00Z" w16du:dateUtc="2025-06-09T18:56:00Z"/>
+          <w:rFonts w:ascii="Arial" w:hAnsi="Arial" w:cs="Arial"/>
+        </w:rPr>
+        <w:pPrChange w:id="388" w:author="Smith Vidaurre, Grace" w:date="2025-06-09T15:02:00Z" w16du:dateUtc="2025-06-09T19:02:00Z">
+          <w:pPr>
+            <w:spacing w:line="480" w:lineRule="auto"/>
+          </w:pPr>
+        </w:pPrChange>
+      </w:pPr>
+      <w:ins w:id="389" w:author="Smith Vidaurre, Grace" w:date="2025-06-09T15:06:00Z" w16du:dateUtc="2025-06-09T19:06:00Z">
+        <w:r>
+          <w:rPr>
+            <w:rFonts w:ascii="Arial" w:hAnsi="Arial" w:cs="Arial"/>
+          </w:rPr>
+          <w:t>To</w:t>
+        </w:r>
+      </w:ins>
+      <w:ins w:id="390" w:author="Smith Vidaurre, Grace" w:date="2025-06-09T15:02:00Z" w16du:dateUtc="2025-06-09T19:02:00Z">
+        <w:r>
+          <w:rPr>
+            <w:rFonts w:ascii="Arial" w:hAnsi="Arial" w:cs="Arial"/>
+          </w:rPr>
+          <w:t xml:space="preserve"> </w:t>
+        </w:r>
+      </w:ins>
+      <w:ins w:id="391" w:author="Smith Vidaurre, Grace" w:date="2025-06-09T14:54:00Z" w16du:dateUtc="2025-06-09T18:54:00Z">
+        <w:r>
+          <w:rPr>
+            <w:rFonts w:ascii="Arial" w:hAnsi="Arial" w:cs="Arial"/>
+          </w:rPr>
+          <w:t>sonif</w:t>
+        </w:r>
+      </w:ins>
+      <w:ins w:id="392" w:author="Smith Vidaurre, Grace" w:date="2025-06-09T15:06:00Z" w16du:dateUtc="2025-06-09T19:06:00Z">
+        <w:r>
+          <w:rPr>
+            <w:rFonts w:ascii="Arial" w:hAnsi="Arial" w:cs="Arial"/>
+          </w:rPr>
+          <w:t>y</w:t>
+        </w:r>
+      </w:ins>
+      <w:ins w:id="393" w:author="Smith Vidaurre, Grace" w:date="2025-06-09T14:54:00Z" w16du:dateUtc="2025-06-09T18:54:00Z">
+        <w:r>
+          <w:rPr>
+            <w:rFonts w:ascii="Arial" w:hAnsi="Arial" w:cs="Arial"/>
+          </w:rPr>
+          <w:t xml:space="preserve"> the 500 strings across both datasets</w:t>
+        </w:r>
+      </w:ins>
+      <w:ins w:id="394" w:author="Smith Vidaurre, Grace" w:date="2025-06-09T15:06:00Z" w16du:dateUtc="2025-06-09T19:06:00Z">
+        <w:r>
+          <w:rPr>
+            <w:rFonts w:ascii="Arial" w:hAnsi="Arial" w:cs="Arial"/>
+          </w:rPr>
+          <w:t>, w</w:t>
+        </w:r>
+      </w:ins>
+      <w:ins w:id="395" w:author="Smith Vidaurre, Grace" w:date="2025-06-09T15:03:00Z" w16du:dateUtc="2025-06-09T19:03:00Z">
+        <w:r>
+          <w:rPr>
+            <w:rFonts w:ascii="Arial" w:hAnsi="Arial" w:cs="Arial"/>
+          </w:rPr>
+          <w:t>e used 1-</w:t>
+        </w:r>
+        <w:r>
+          <w:rPr>
+            <w:rFonts w:ascii="Arial" w:hAnsi="Arial" w:cs="Arial"/>
+          </w:rPr>
+          <w:t>Parsons encoding, and a starting frequency value of 4 kHz, a frequency shift value of 1 kHz to create frequency timeseries as a continuous trajectory for each origin</w:t>
+        </w:r>
+      </w:ins>
+      <w:ins w:id="396" w:author="Smith Vidaurre, Grace" w:date="2025-06-09T15:04:00Z" w16du:dateUtc="2025-06-09T19:04:00Z">
+        <w:r>
+          <w:rPr>
+            <w:rFonts w:ascii="Arial" w:hAnsi="Arial" w:cs="Arial"/>
+          </w:rPr>
+          <w:t>al string.</w:t>
+        </w:r>
+      </w:ins>
+      <w:ins w:id="397" w:author="Smith Vidaurre, Grace" w:date="2025-06-09T15:02:00Z" w16du:dateUtc="2025-06-09T19:02:00Z">
+        <w:r>
+          <w:rPr>
+            <w:rFonts w:ascii="Arial" w:hAnsi="Arial" w:cs="Arial"/>
+          </w:rPr>
+          <w:t xml:space="preserve"> </w:t>
+        </w:r>
+      </w:ins>
+      <w:ins w:id="398" w:author="Smith Vidaurre, Grace" w:date="2025-06-09T15:04:00Z" w16du:dateUtc="2025-06-09T19:04:00Z">
+        <w:r>
+          <w:rPr>
+            <w:rFonts w:ascii="Arial" w:hAnsi="Arial" w:cs="Arial"/>
+          </w:rPr>
+          <w:t xml:space="preserve">To create synthetic vocalizations, we used the soundgen package to </w:t>
+        </w:r>
+        <w:r>
+          <w:rPr>
+            <w:rFonts w:ascii="Arial" w:hAnsi="Arial" w:cs="Arial"/>
+          </w:rPr>
+          <w:t xml:space="preserve">create an audio file for each </w:t>
+        </w:r>
+        <w:r>
+          <w:rPr>
+            <w:rFonts w:ascii="Arial" w:hAnsi="Arial" w:cs="Arial"/>
+          </w:rPr>
+          <w:t xml:space="preserve">original string, </w:t>
+        </w:r>
+        <w:r>
+          <w:rPr>
+            <w:rFonts w:ascii="Arial" w:hAnsi="Arial" w:cs="Arial"/>
+          </w:rPr>
+          <w:t>with about 200 ms duration, audio file and</w:t>
+        </w:r>
+      </w:ins>
+      <w:ins w:id="399" w:author="Smith Vidaurre, Grace" w:date="2025-06-09T15:05:00Z" w16du:dateUtc="2025-06-09T19:05:00Z">
+        <w:r>
+          <w:rPr>
+            <w:rFonts w:ascii="Arial" w:hAnsi="Arial" w:cs="Arial"/>
+          </w:rPr>
+          <w:t xml:space="preserve"> pitch </w:t>
+        </w:r>
+      </w:ins>
+      <w:ins w:id="400" w:author="Smith Vidaurre, Grace" w:date="2025-06-09T15:04:00Z" w16du:dateUtc="2025-06-09T19:04:00Z">
+        <w:r>
+          <w:rPr>
+            <w:rFonts w:ascii="Arial" w:hAnsi="Arial" w:cs="Arial"/>
+          </w:rPr>
+          <w:t>sampling rate</w:t>
+        </w:r>
+      </w:ins>
+      <w:ins w:id="401" w:author="Smith Vidaurre, Grace" w:date="2025-06-09T15:05:00Z" w16du:dateUtc="2025-06-09T19:05:00Z">
+        <w:r>
+          <w:rPr>
+            <w:rFonts w:ascii="Arial" w:hAnsi="Arial" w:cs="Arial"/>
+          </w:rPr>
+          <w:t>s of 44.1 kHz,</w:t>
+        </w:r>
+        <w:r>
+          <w:rPr>
+            <w:rFonts w:ascii="Arial" w:hAnsi="Arial" w:cs="Arial"/>
+          </w:rPr>
+          <w:t xml:space="preserve"> a single frequency contour</w:t>
+        </w:r>
+        <w:r>
+          <w:rPr>
+            <w:rFonts w:ascii="Arial" w:hAnsi="Arial" w:cs="Arial"/>
+          </w:rPr>
+          <w:t xml:space="preserve"> (no harmonics), the default soundgen stochasticity in sound </w:t>
+        </w:r>
+        <w:r>
+          <w:rPr>
+            <w:rFonts w:ascii="Arial" w:hAnsi="Arial" w:cs="Arial"/>
+          </w:rPr>
+          <w:lastRenderedPageBreak/>
+          <w:t>generation (temperature of 0.025)</w:t>
+        </w:r>
+      </w:ins>
+      <w:ins w:id="402" w:author="Smith Vidaurre, Grace" w:date="2025-06-09T15:06:00Z" w16du:dateUtc="2025-06-09T19:06:00Z">
+        <w:r>
+          <w:rPr>
+            <w:rFonts w:ascii="Arial" w:hAnsi="Arial" w:cs="Arial"/>
+          </w:rPr>
+          <w:t xml:space="preserve">, and all other default </w:t>
+        </w:r>
+        <w:r>
+          <w:rPr>
+            <w:rFonts w:ascii="Arial" w:hAnsi="Arial" w:cs="Arial"/>
+          </w:rPr>
+          <w:t>settings used in this step of our pipeline (see above)</w:t>
+        </w:r>
+      </w:ins>
+      <w:ins w:id="403" w:author="Smith Vidaurre, Grace" w:date="2025-06-09T15:04:00Z" w16du:dateUtc="2025-06-09T19:04:00Z">
+        <w:r>
+          <w:rPr>
+            <w:rFonts w:ascii="Arial" w:hAnsi="Arial" w:cs="Arial"/>
+          </w:rPr>
+          <w:t xml:space="preserve">. </w:t>
+        </w:r>
+      </w:ins>
+      <w:ins w:id="404" w:author="Smith Vidaurre, Grace" w:date="2025-06-09T15:02:00Z" w16du:dateUtc="2025-06-09T19:02:00Z">
+        <w:r>
+          <w:rPr>
+            <w:rFonts w:ascii="Arial" w:hAnsi="Arial" w:cs="Arial"/>
+          </w:rPr>
+          <w:t xml:space="preserve">We </w:t>
+        </w:r>
+      </w:ins>
+      <w:ins w:id="405" w:author="Smith Vidaurre, Grace" w:date="2025-06-09T14:54:00Z" w16du:dateUtc="2025-06-09T18:54:00Z">
+        <w:r>
+          <w:rPr>
+            <w:rFonts w:ascii="Arial" w:hAnsi="Arial" w:cs="Arial"/>
+          </w:rPr>
+          <w:t xml:space="preserve">then used </w:t>
+        </w:r>
+      </w:ins>
+      <w:ins w:id="406" w:author="Smith Vidaurre, Grace" w:date="2025-06-09T14:56:00Z" w16du:dateUtc="2025-06-09T18:56:00Z">
+        <w:r>
+          <w:rPr>
+            <w:rFonts w:ascii="Arial" w:hAnsi="Arial" w:cs="Arial"/>
+          </w:rPr>
+          <w:t>an analytical pipeline described below</w:t>
+        </w:r>
+      </w:ins>
+      <w:ins w:id="407" w:author="Smith Vidaurre, Grace" w:date="2025-06-09T14:54:00Z" w16du:dateUtc="2025-06-09T18:54:00Z">
+        <w:r>
+          <w:rPr>
+            <w:rFonts w:ascii="Arial" w:hAnsi="Arial" w:cs="Arial"/>
+          </w:rPr>
+          <w:t xml:space="preserve"> to </w:t>
+        </w:r>
+        <w:r>
+          <w:rPr>
+            <w:rFonts w:ascii="Arial" w:hAnsi="Arial" w:cs="Arial"/>
+          </w:rPr>
+          <w:t>assess</w:t>
+        </w:r>
+        <w:r>
+          <w:rPr>
+            <w:rFonts w:ascii="Arial" w:hAnsi="Arial" w:cs="Arial"/>
+          </w:rPr>
+          <w:t xml:space="preserve"> patterns of variation </w:t>
+        </w:r>
+      </w:ins>
+      <w:ins w:id="408" w:author="Smith Vidaurre, Grace" w:date="2025-06-09T14:55:00Z" w16du:dateUtc="2025-06-09T18:55:00Z">
+        <w:r>
+          <w:rPr>
+            <w:rFonts w:ascii="Arial" w:hAnsi="Arial" w:cs="Arial"/>
+          </w:rPr>
+          <w:t xml:space="preserve">across the group and individual levels </w:t>
+        </w:r>
+      </w:ins>
+      <w:ins w:id="409" w:author="Smith Vidaurre, Grace" w:date="2025-06-09T14:54:00Z" w16du:dateUtc="2025-06-09T18:54:00Z">
+        <w:r>
+          <w:rPr>
+            <w:rFonts w:ascii="Arial" w:hAnsi="Arial" w:cs="Arial"/>
+          </w:rPr>
+          <w:t>both datasets.</w:t>
+        </w:r>
+      </w:ins>
+      <w:ins w:id="410" w:author="Smith Vidaurre, Grace" w:date="2025-06-09T14:55:00Z" w16du:dateUtc="2025-06-09T18:55:00Z">
+        <w:r>
+          <w:rPr>
+            <w:rFonts w:ascii="Arial" w:hAnsi="Arial" w:cs="Arial"/>
+          </w:rPr>
+          <w:t xml:space="preserve"> </w:t>
+        </w:r>
+      </w:ins>
+    </w:p>
+    <w:p>
+      <w:pPr>
+        <w:spacing w:line="480" w:lineRule="auto"/>
+        <w:rPr>
+          <w:ins w:id="411" w:author="Smith Vidaurre, Grace" w:date="2025-06-09T14:58:00Z" w16du:dateUtc="2025-06-09T18:58:00Z"/>
+          <w:rFonts w:ascii="Arial" w:hAnsi="Arial" w:cs="Arial"/>
+        </w:rPr>
+      </w:pPr>
+      <w:ins w:id="412" w:author="Smith Vidaurre, Grace" w:date="2025-06-09T14:56:00Z" w16du:dateUtc="2025-06-09T18:56:00Z">
+        <w:r>
+          <w:rPr>
+            <w:rFonts w:ascii="Arial" w:hAnsi="Arial" w:cs="Arial"/>
+          </w:rPr>
+          <w:tab/>
+        </w:r>
+      </w:ins>
+      <w:ins w:id="413" w:author="Smith Vidaurre, Grace" w:date="2025-06-09T14:57:00Z" w16du:dateUtc="2025-06-09T18:57:00Z">
+        <w:r>
+          <w:rPr>
+            <w:rFonts w:ascii="Arial" w:hAnsi="Arial" w:cs="Arial"/>
+          </w:rPr>
+          <w:t xml:space="preserve">To highlight how we used our pipeline to encode identity information over two social levels in frequency-modulated synthetic vocalizations, we </w:t>
+        </w:r>
+        <w:r>
+          <w:rPr>
+            <w:rFonts w:ascii="Arial" w:hAnsi="Arial" w:cs="Arial"/>
+          </w:rPr>
+          <w:t>generated spectrograms</w:t>
+        </w:r>
+      </w:ins>
+      <w:ins w:id="414" w:author="Smith Vidaurre, Grace" w:date="2025-06-09T14:58:00Z" w16du:dateUtc="2025-06-09T18:58:00Z">
+        <w:r>
+          <w:rPr>
+            <w:rFonts w:ascii="Arial" w:hAnsi="Arial" w:cs="Arial"/>
+          </w:rPr>
+          <w:t xml:space="preserve"> from audio files, </w:t>
+        </w:r>
+      </w:ins>
+      <w:ins w:id="415" w:author="Smith Vidaurre, Grace" w:date="2025-06-09T14:59:00Z" w16du:dateUtc="2025-06-09T18:59:00Z">
+        <w:r>
+          <w:rPr>
+            <w:rFonts w:ascii="Arial" w:hAnsi="Arial" w:cs="Arial"/>
+          </w:rPr>
+          <w:t>as well as</w:t>
+        </w:r>
+      </w:ins>
+      <w:ins w:id="416" w:author="Smith Vidaurre, Grace" w:date="2025-06-09T14:58:00Z" w16du:dateUtc="2025-06-09T18:58:00Z">
+        <w:r>
+          <w:rPr>
+            <w:rFonts w:ascii="Arial" w:hAnsi="Arial" w:cs="Arial"/>
+          </w:rPr>
+          <w:t xml:space="preserve"> low-dimensional </w:t>
+        </w:r>
+        <w:r>
+          <w:rPr>
+            <w:rFonts w:ascii="Arial" w:hAnsi="Arial" w:cs="Arial"/>
+          </w:rPr>
+          <w:t xml:space="preserve">for the string and audio representations of the </w:t>
+        </w:r>
+      </w:ins>
+      <w:ins w:id="417" w:author="Smith Vidaurre, Grace" w:date="2025-06-09T14:59:00Z" w16du:dateUtc="2025-06-09T18:59:00Z">
+        <w:r>
+          <w:rPr>
+            <w:rFonts w:ascii="Arial" w:hAnsi="Arial" w:cs="Arial"/>
+          </w:rPr>
+          <w:t>example</w:t>
+        </w:r>
+      </w:ins>
+      <w:ins w:id="418" w:author="Smith Vidaurre, Grace" w:date="2025-06-09T14:58:00Z" w16du:dateUtc="2025-06-09T18:58:00Z">
+        <w:r>
+          <w:rPr>
+            <w:rFonts w:ascii="Arial" w:hAnsi="Arial" w:cs="Arial"/>
+          </w:rPr>
+          <w:t xml:space="preserve"> datasets.</w:t>
+        </w:r>
+      </w:ins>
+      <w:ins w:id="419" w:author="Smith Vidaurre, Grace" w:date="2025-06-09T14:59:00Z" w16du:dateUtc="2025-06-09T18:59:00Z">
+        <w:r>
+          <w:rPr>
+            <w:rFonts w:ascii="Arial" w:hAnsi="Arial" w:cs="Arial"/>
+          </w:rPr>
+          <w:t xml:space="preserve"> We used the </w:t>
+        </w:r>
+        <w:r>
+          <w:rPr>
+            <w:rFonts w:ascii="Arial" w:hAnsi="Arial" w:cs="Arial"/>
+          </w:rPr>
+          <w:t xml:space="preserve">warbleR package (CITE) to generate spectrograms for first visual checks, and then we used the seewave package (CITE) to build final spectrograms </w:t>
+        </w:r>
+      </w:ins>
+      <w:ins w:id="420" w:author="Smith Vidaurre, Grace" w:date="2025-06-09T15:01:00Z" w16du:dateUtc="2025-06-09T19:01:00Z">
+        <w:r>
+          <w:rPr>
+            <w:rFonts w:ascii="Arial" w:hAnsi="Arial" w:cs="Arial"/>
+          </w:rPr>
+          <w:t xml:space="preserve">with a window length of 512 samples, </w:t>
+        </w:r>
+        <w:r>
+          <w:rPr>
+            <w:rFonts w:ascii="Arial" w:hAnsi="Arial" w:cs="Arial"/>
+          </w:rPr>
+          <w:t xml:space="preserve">an </w:t>
+        </w:r>
+        <w:r>
+          <w:rPr>
+            <w:rFonts w:ascii="Arial" w:hAnsi="Arial" w:cs="Arial"/>
+          </w:rPr>
+          <w:t>overlap</w:t>
+        </w:r>
+        <w:r>
+          <w:rPr>
+            <w:rFonts w:ascii="Arial" w:hAnsi="Arial" w:cs="Arial"/>
+          </w:rPr>
+          <w:t xml:space="preserve"> between consecutive</w:t>
+        </w:r>
+        <w:r>
+          <w:rPr>
+            <w:rFonts w:ascii="Arial" w:hAnsi="Arial" w:cs="Arial"/>
+          </w:rPr>
+          <w:t xml:space="preserve"> </w:t>
+        </w:r>
+        <w:r>
+          <w:rPr>
+            <w:rFonts w:ascii="Arial" w:hAnsi="Arial" w:cs="Arial"/>
+          </w:rPr>
+          <w:t xml:space="preserve">windows </w:t>
+        </w:r>
+        <w:r>
+          <w:rPr>
+            <w:rFonts w:ascii="Arial" w:hAnsi="Arial" w:cs="Arial"/>
+          </w:rPr>
+          <w:t>of 90%</w:t>
+        </w:r>
+        <w:r>
+          <w:rPr>
+            <w:rFonts w:ascii="Arial" w:hAnsi="Arial" w:cs="Arial"/>
+          </w:rPr>
+          <w:t xml:space="preserve">, </w:t>
+        </w:r>
+      </w:ins>
+      <w:ins w:id="421" w:author="Smith Vidaurre, Grace" w:date="2025-06-09T15:02:00Z" w16du:dateUtc="2025-06-09T19:02:00Z">
+        <w:r>
+          <w:rPr>
+            <w:rFonts w:ascii="Arial" w:hAnsi="Arial" w:cs="Arial"/>
+          </w:rPr>
+          <w:t>and a Hanning window.</w:t>
+        </w:r>
+      </w:ins>
+    </w:p>
+    <w:p>
+      <w:pPr>
+        <w:spacing w:line="480" w:lineRule="auto"/>
+        <w:rPr>
+          <w:ins w:id="422" w:author="Smith Vidaurre, Grace" w:date="2025-06-09T14:58:00Z" w16du:dateUtc="2025-06-09T18:58:00Z"/>
+          <w:rFonts w:ascii="Arial" w:hAnsi="Arial" w:cs="Arial"/>
+        </w:rPr>
+      </w:pPr>
+    </w:p>
+    <w:p>
+      <w:pPr>
+        <w:spacing w:line="480" w:lineRule="auto"/>
+        <w:rPr>
+          <w:ins w:id="423" w:author="Smith Vidaurre, Grace" w:date="2025-06-09T14:56:00Z" w16du:dateUtc="2025-06-09T18:56:00Z"/>
+          <w:rFonts w:ascii="Arial" w:hAnsi="Arial" w:cs="Arial"/>
+        </w:rPr>
+      </w:pPr>
+      <w:ins w:id="424" w:author="Smith Vidaurre, Grace" w:date="2025-06-09T15:06:00Z" w16du:dateUtc="2025-06-09T19:06:00Z">
+        <w:r>
+          <w:rPr>
+            <w:rFonts w:ascii="Arial" w:hAnsi="Arial" w:cs="Arial"/>
+          </w:rPr>
+          <w:t xml:space="preserve">TKTK </w:t>
+        </w:r>
+      </w:ins>
+      <w:ins w:id="425" w:author="Smith Vidaurre, Grace" w:date="2025-06-09T14:58:00Z" w16du:dateUtc="2025-06-09T18:58:00Z">
+        <w:r>
+          <w:rPr>
+            <w:rFonts w:ascii="Arial" w:hAnsi="Arial" w:cs="Arial"/>
+          </w:rPr>
+          <w:t xml:space="preserve">We also built low-dimensional trait spaces </w:t>
+        </w:r>
+      </w:ins>
+    </w:p>
+    <w:p>
+      <w:pPr>
+        <w:spacing w:line="480" w:lineRule="auto"/>
+        <w:rPr>
+          <w:ins w:id="426" w:author="Smith Vidaurre, Grace" w:date="2025-06-09T14:56:00Z" w16du:dateUtc="2025-06-09T18:56:00Z"/>
+          <w:rFonts w:ascii="Arial" w:hAnsi="Arial" w:cs="Arial"/>
+        </w:rPr>
+      </w:pPr>
+    </w:p>
+    <w:p>
+      <w:pPr>
+        <w:spacing w:line="480" w:lineRule="auto"/>
+        <w:rPr>
+          <w:ins w:id="427" w:author="Smith Vidaurre, Grace" w:date="2025-06-09T14:56:00Z" w16du:dateUtc="2025-06-09T18:56:00Z"/>
+          <w:rFonts w:ascii="Arial" w:hAnsi="Arial" w:cs="Arial"/>
+        </w:rPr>
+      </w:pPr>
+      <w:ins w:id="428" w:author="Smith Vidaurre, Grace" w:date="2025-06-09T14:56:00Z" w16du:dateUtc="2025-06-09T18:56:00Z">
+        <w:r>
+          <w:rPr>
+            <w:rFonts w:ascii="Arial" w:hAnsi="Arial" w:cs="Arial"/>
+          </w:rPr>
+          <w:t xml:space="preserve">TKTK </w:t>
+        </w:r>
+      </w:ins>
+      <w:ins w:id="429" w:author="Smith Vidaurre, Grace" w:date="2025-06-09T14:55:00Z" w16du:dateUtc="2025-06-09T18:55:00Z">
+        <w:r>
+          <w:rPr>
+            <w:rFonts w:ascii="Arial" w:hAnsi="Arial" w:cs="Arial"/>
+          </w:rPr>
+          <w:t>In these dataset</w:t>
+        </w:r>
+      </w:ins>
+      <w:ins w:id="430" w:author="Smith Vidaurre, Grace" w:date="2025-06-09T14:56:00Z" w16du:dateUtc="2025-06-09T18:56:00Z">
+        <w:r>
+          <w:rPr>
+            <w:rFonts w:ascii="Arial" w:hAnsi="Arial" w:cs="Arial"/>
+          </w:rPr>
+          <w:t>s</w:t>
+        </w:r>
+      </w:ins>
+      <w:ins w:id="431" w:author="Smith Vidaurre, Grace" w:date="2025-06-09T14:55:00Z" w16du:dateUtc="2025-06-09T18:55:00Z">
+        <w:r>
+          <w:rPr>
+            <w:rFonts w:ascii="Arial" w:hAnsi="Arial" w:cs="Arial"/>
+          </w:rPr>
+          <w:t>, we expected to identify overdispersion amongst groups when groups displayed distinctive information</w:t>
+        </w:r>
+      </w:ins>
+      <w:ins w:id="432" w:author="Smith Vidaurre, Grace" w:date="2025-06-09T14:56:00Z" w16du:dateUtc="2025-06-09T18:56:00Z">
+        <w:r>
+          <w:rPr>
+            <w:rFonts w:ascii="Arial" w:hAnsi="Arial" w:cs="Arial"/>
+          </w:rPr>
+          <w:t>, but overdispersion amongst individuals within groups when individuals displayed distinctive information.</w:t>
+        </w:r>
+      </w:ins>
+      <w:del w:id="433" w:author="Smith Vidaurre, Grace" w:date="2025-06-09T14:43:00Z" w16du:dateUtc="2025-06-09T18:43:00Z">
+        <w:r>
+          <w:rPr>
+            <w:rFonts w:ascii="Arial" w:hAnsi="Arial" w:cs="Arial"/>
+          </w:rPr>
+          <w:delText xml:space="preserve"> </w:delText>
+        </w:r>
+      </w:del>
+    </w:p>
+    <w:p>
+      <w:pPr>
+        <w:spacing w:line="480" w:lineRule="auto"/>
+        <w:rPr>
+          <w:ins w:id="434" w:author="Smith Vidaurre, Grace" w:date="2025-06-09T14:43:00Z" w16du:dateUtc="2025-06-09T18:43:00Z"/>
+          <w:rFonts w:ascii="Arial" w:hAnsi="Arial" w:cs="Arial"/>
+        </w:rPr>
+      </w:pPr>
+      <w:ins w:id="435" w:author="Smith Vidaurre, Grace" w:date="2025-06-09T14:56:00Z" w16du:dateUtc="2025-06-09T18:56:00Z">
+        <w:r>
+          <w:rPr>
+            <w:rFonts w:ascii="Arial" w:hAnsi="Arial" w:cs="Arial"/>
+          </w:rPr>
+          <w:tab/>
+        </w:r>
+      </w:ins>
+    </w:p>
+    <w:p>
+      <w:pPr>
+        <w:spacing w:line="480" w:lineRule="auto"/>
+        <w:rPr>
+          <w:ins w:id="436" w:author="Smith Vidaurre, Grace" w:date="2025-06-09T14:43:00Z" w16du:dateUtc="2025-06-09T18:43:00Z"/>
+          <w:rFonts w:ascii="Arial" w:hAnsi="Arial" w:cs="Arial"/>
+        </w:rPr>
+      </w:pPr>
+      <w:ins w:id="437" w:author="Smith Vidaurre, Grace" w:date="2025-06-09T14:54:00Z" w16du:dateUtc="2025-06-09T18:54:00Z">
+        <w:r>
+          <w:rPr>
+            <w:rFonts w:ascii="Arial" w:hAnsi="Arial" w:cs="Arial"/>
+          </w:rPr>
+          <w:tab/>
+        </w:r>
+      </w:ins>
+    </w:p>
+    <w:p>
+      <w:pPr>
+        <w:spacing w:line="480" w:lineRule="auto"/>
+        <w:rPr>
+          <w:del w:id="438" w:author="Smith Vidaurre, Grace" w:date="2025-06-09T14:53:00Z" w16du:dateUtc="2025-06-09T18:53:00Z"/>
+          <w:rFonts w:ascii="Arial" w:hAnsi="Arial" w:cs="Arial"/>
+        </w:rPr>
+        <w:pPrChange w:id="439" w:author="Smith Vidaurre, Grace" w:date="2025-06-09T14:31:00Z" w16du:dateUtc="2025-06-09T18:31:00Z">
           <w:pPr>
             <w:spacing w:line="480" w:lineRule="auto"/>
             <w:ind w:firstLine="720"/>
           </w:pPr>
         </w:pPrChange>
       </w:pPr>
-      <w:r>
-        <w:rPr>
-          <w:rFonts w:ascii="Arial" w:hAnsi="Arial" w:cs="Arial"/>
-        </w:rPr>
-        <w:t>Using the p</w:t>
-      </w:r>
-      <w:ins w:id="341" w:author="Smith Vidaurre, Grace" w:date="2025-06-09T14:32:00Z" w16du:dateUtc="2025-06-09T18:32:00Z">
-        <w:r>
-          <w:rPr>
-            <w:rFonts w:ascii="Arial" w:hAnsi="Arial" w:cs="Arial"/>
-          </w:rPr>
-          <w:t>ipeline</w:t>
-        </w:r>
-      </w:ins>
-      <w:del w:id="342" w:author="Smith Vidaurre, Grace" w:date="2025-06-09T14:32:00Z" w16du:dateUtc="2025-06-09T18:32:00Z">
-        <w:r>
-          <w:rPr>
-            <w:rFonts w:ascii="Arial" w:hAnsi="Arial" w:cs="Arial"/>
-          </w:rPr>
-          <w:delText>rocess</w:delText>
-        </w:r>
-      </w:del>
-      <w:r>
-        <w:rPr>
-          <w:rFonts w:ascii="Arial" w:hAnsi="Arial" w:cs="Arial"/>
-        </w:rPr>
-        <w:t xml:space="preserve"> described above, we created two </w:t>
-      </w:r>
-      <w:del w:id="343" w:author="Smith Vidaurre, Grace" w:date="2025-06-09T14:32:00Z" w16du:dateUtc="2025-06-09T18:32:00Z">
-        <w:r>
-          <w:rPr>
-            <w:rFonts w:ascii="Arial" w:hAnsi="Arial" w:cs="Arial"/>
-          </w:rPr>
-          <w:delText xml:space="preserve">synthetic </w:delText>
-        </w:r>
-      </w:del>
-      <w:ins w:id="344" w:author="Smith Vidaurre, Grace" w:date="2025-06-09T14:32:00Z" w16du:dateUtc="2025-06-09T18:32:00Z">
-        <w:r>
-          <w:rPr>
-            <w:rFonts w:ascii="Arial" w:hAnsi="Arial" w:cs="Arial"/>
-          </w:rPr>
-          <w:t>example</w:t>
-        </w:r>
-        <w:r>
-          <w:rPr>
-            <w:rFonts w:ascii="Arial" w:hAnsi="Arial" w:cs="Arial"/>
-          </w:rPr>
-          <w:t xml:space="preserve"> </w:t>
-        </w:r>
-      </w:ins>
-      <w:r>
-        <w:rPr>
-          <w:rFonts w:ascii="Arial" w:hAnsi="Arial" w:cs="Arial"/>
-        </w:rPr>
-        <w:t>data</w:t>
-      </w:r>
-      <w:del w:id="345" w:author="Smith Vidaurre, Grace" w:date="2025-06-09T14:32:00Z" w16du:dateUtc="2025-06-09T18:32:00Z">
-        <w:r>
-          <w:rPr>
-            <w:rFonts w:ascii="Arial" w:hAnsi="Arial" w:cs="Arial"/>
-          </w:rPr>
-          <w:delText xml:space="preserve"> </w:delText>
-        </w:r>
-      </w:del>
-      <w:r>
-        <w:rPr>
-          <w:rFonts w:ascii="Arial" w:hAnsi="Arial" w:cs="Arial"/>
-        </w:rPr>
-        <w:t xml:space="preserve">sets: </w:t>
-      </w:r>
-      <w:ins w:id="346" w:author="Smith Vidaurre, Grace" w:date="2025-06-09T14:33:00Z" w16du:dateUtc="2025-06-09T18:33:00Z">
-        <w:r>
-          <w:rPr>
-            <w:rFonts w:ascii="Arial" w:hAnsi="Arial" w:cs="Arial"/>
-          </w:rPr>
-          <w:t xml:space="preserve">(1) </w:t>
-        </w:r>
-      </w:ins>
-      <w:del w:id="347" w:author="Smith Vidaurre, Grace" w:date="2025-06-09T14:33:00Z" w16du:dateUtc="2025-06-09T18:33:00Z">
-        <w:r>
-          <w:rPr>
-            <w:rFonts w:ascii="Arial" w:hAnsi="Arial" w:cs="Arial"/>
-          </w:rPr>
-          <w:delText xml:space="preserve">one </w:delText>
-        </w:r>
-      </w:del>
-      <w:del w:id="348" w:author="Smith Vidaurre, Grace" w:date="2025-06-09T14:32:00Z" w16du:dateUtc="2025-06-09T18:32:00Z">
-        <w:r>
-          <w:rPr>
-            <w:rFonts w:ascii="Arial" w:hAnsi="Arial" w:cs="Arial"/>
-          </w:rPr>
-          <w:delText xml:space="preserve">that created </w:delText>
-        </w:r>
-        <w:commentRangeStart w:id="349"/>
-        <w:commentRangeStart w:id="350"/>
-        <w:r>
-          <w:rPr>
-            <w:rFonts w:ascii="Arial" w:hAnsi="Arial" w:cs="Arial"/>
-          </w:rPr>
-          <w:delText xml:space="preserve">vocalizations </w:delText>
-        </w:r>
-        <w:commentRangeEnd w:id="349"/>
+      <w:del w:id="440" w:author="Smith Vidaurre, Grace" w:date="2025-06-09T14:53:00Z" w16du:dateUtc="2025-06-09T18:53:00Z">
+        <w:r>
+          <w:rPr>
+            <w:rFonts w:ascii="Arial" w:hAnsi="Arial" w:cs="Arial"/>
+          </w:rPr>
+          <w:delText xml:space="preserve">In the </w:delText>
+        </w:r>
+        <w:r>
+          <w:rPr>
+            <w:rFonts w:ascii="Arial" w:hAnsi="Arial" w:cs="Arial"/>
+          </w:rPr>
+          <w:delText>group specific dataset</w:delText>
+        </w:r>
+        <w:r>
+          <w:rPr>
+            <w:rFonts w:ascii="Arial" w:hAnsi="Arial" w:cs="Arial"/>
+          </w:rPr>
+          <w:delText xml:space="preserve">, individual information was set to a character length of 4 characters, and group member information was set to </w:delText>
+        </w:r>
+        <w:commentRangeStart w:id="441"/>
+        <w:r>
+          <w:rPr>
+            <w:rFonts w:ascii="Arial" w:hAnsi="Arial" w:cs="Arial"/>
+          </w:rPr>
+          <w:delText>a character length of 8 character</w:delText>
+        </w:r>
+        <w:commentRangeEnd w:id="441"/>
         <w:r>
           <w:rPr>
             <w:rStyle w:val="CommentReference"/>
           </w:rPr>
-          <w:commentReference w:id="349"/>
-        </w:r>
-        <w:commentRangeEnd w:id="350"/>
+          <w:commentReference w:id="441"/>
+        </w:r>
+        <w:r>
+          <w:rPr>
+            <w:rFonts w:ascii="Arial" w:hAnsi="Arial" w:cs="Arial"/>
+          </w:rPr>
+          <w:delText xml:space="preserve">. In the </w:delText>
+        </w:r>
+        <w:r>
+          <w:rPr>
+            <w:rFonts w:ascii="Arial" w:hAnsi="Arial" w:cs="Arial"/>
+          </w:rPr>
+          <w:delText>individual identity dataset</w:delText>
+        </w:r>
+        <w:r>
+          <w:rPr>
+            <w:rFonts w:ascii="Arial" w:hAnsi="Arial" w:cs="Arial"/>
+          </w:rPr>
+          <w:delText xml:space="preserve">, individual information was set to a </w:delText>
+        </w:r>
+        <w:commentRangeStart w:id="442"/>
+        <w:r>
+          <w:rPr>
+            <w:rFonts w:ascii="Arial" w:hAnsi="Arial" w:cs="Arial"/>
+          </w:rPr>
+          <w:delText>character length of 8 characters</w:delText>
+        </w:r>
+        <w:commentRangeEnd w:id="442"/>
         <w:r>
           <w:rPr>
             <w:rStyle w:val="CommentReference"/>
           </w:rPr>
-          <w:commentReference w:id="350"/>
-        </w:r>
-      </w:del>
-      <w:del w:id="351" w:author="Smith Vidaurre, Grace" w:date="2025-06-09T14:33:00Z" w16du:dateUtc="2025-06-09T18:33:00Z">
-        <w:r>
-          <w:rPr>
-            <w:rFonts w:ascii="Arial" w:hAnsi="Arial" w:cs="Arial"/>
-          </w:rPr>
-          <w:delText xml:space="preserve">with </w:delText>
-        </w:r>
-      </w:del>
-      <w:r>
-        <w:rPr>
-          <w:rFonts w:ascii="Arial" w:hAnsi="Arial" w:cs="Arial"/>
-        </w:rPr>
-        <w:t xml:space="preserve">more group membership information than individual </w:t>
-      </w:r>
-      <w:ins w:id="352" w:author="Smith Vidaurre, Grace" w:date="2025-06-09T14:32:00Z" w16du:dateUtc="2025-06-09T18:32:00Z">
-        <w:r>
-          <w:rPr>
-            <w:rFonts w:ascii="Arial" w:hAnsi="Arial" w:cs="Arial"/>
-          </w:rPr>
-          <w:t xml:space="preserve">identity </w:t>
-        </w:r>
-      </w:ins>
-      <w:r>
-        <w:rPr>
-          <w:rFonts w:ascii="Arial" w:hAnsi="Arial" w:cs="Arial"/>
-        </w:rPr>
-        <w:t>information</w:t>
-      </w:r>
-      <w:ins w:id="353" w:author="Smith Vidaurre, Grace" w:date="2025-06-09T14:33:00Z" w16du:dateUtc="2025-06-09T18:33:00Z">
-        <w:r>
-          <w:rPr>
-            <w:rFonts w:ascii="Arial" w:hAnsi="Arial" w:cs="Arial"/>
-          </w:rPr>
-          <w:t xml:space="preserve"> </w:t>
-        </w:r>
-      </w:ins>
-      <w:del w:id="354" w:author="Smith Vidaurre, Grace" w:date="2025-06-09T14:33:00Z" w16du:dateUtc="2025-06-09T18:33:00Z">
-        <w:r>
-          <w:rPr>
-            <w:rFonts w:ascii="Arial" w:hAnsi="Arial" w:cs="Arial"/>
-          </w:rPr>
-          <w:delText xml:space="preserve"> encoded </w:delText>
-        </w:r>
-      </w:del>
-      <w:r>
-        <w:rPr>
-          <w:rFonts w:ascii="Arial" w:hAnsi="Arial" w:cs="Arial"/>
-        </w:rPr>
-        <w:t>(</w:t>
-      </w:r>
-      <w:del w:id="355" w:author="Smith Vidaurre, Grace" w:date="2025-06-09T14:32:00Z" w16du:dateUtc="2025-06-09T18:32:00Z">
-        <w:r>
-          <w:rPr>
-            <w:rFonts w:ascii="Arial" w:hAnsi="Arial" w:cs="Arial"/>
-          </w:rPr>
-          <w:delText>g</w:delText>
-        </w:r>
-        <w:r>
-          <w:rPr>
-            <w:rFonts w:ascii="Arial" w:hAnsi="Arial" w:cs="Arial"/>
-          </w:rPr>
-          <w:delText xml:space="preserve">roup </w:delText>
-        </w:r>
-        <w:r>
-          <w:rPr>
-            <w:rFonts w:ascii="Arial" w:hAnsi="Arial" w:cs="Arial"/>
-          </w:rPr>
-          <w:delText>specific</w:delText>
-        </w:r>
-        <w:r>
-          <w:rPr>
-            <w:rFonts w:ascii="Arial" w:hAnsi="Arial" w:cs="Arial"/>
-          </w:rPr>
-          <w:delText xml:space="preserve"> </w:delText>
-        </w:r>
-        <w:r>
-          <w:rPr>
-            <w:rFonts w:ascii="Arial" w:hAnsi="Arial" w:cs="Arial"/>
-          </w:rPr>
-          <w:delText>i</w:delText>
-        </w:r>
-        <w:r>
-          <w:rPr>
-            <w:rFonts w:ascii="Arial" w:hAnsi="Arial" w:cs="Arial"/>
-          </w:rPr>
-          <w:delText xml:space="preserve">nformation </w:delText>
-        </w:r>
-        <w:r>
-          <w:rPr>
-            <w:rFonts w:ascii="Arial" w:hAnsi="Arial" w:cs="Arial"/>
-          </w:rPr>
-          <w:delText>d</w:delText>
-        </w:r>
-        <w:r>
-          <w:rPr>
-            <w:rFonts w:ascii="Arial" w:hAnsi="Arial" w:cs="Arial"/>
-          </w:rPr>
-          <w:delText xml:space="preserve">ataset: henceforth </w:delText>
-        </w:r>
-      </w:del>
-      <w:r>
-        <w:rPr>
-          <w:rFonts w:ascii="Arial" w:hAnsi="Arial" w:cs="Arial"/>
-        </w:rPr>
-        <w:t xml:space="preserve">the </w:t>
-      </w:r>
-      <w:r>
-        <w:rPr>
-          <w:rFonts w:ascii="Arial" w:hAnsi="Arial" w:cs="Arial"/>
-        </w:rPr>
-        <w:t>group</w:t>
-      </w:r>
-      <w:ins w:id="356" w:author="Smith Vidaurre, Grace" w:date="2025-06-09T14:32:00Z" w16du:dateUtc="2025-06-09T18:32:00Z">
-        <w:r>
-          <w:rPr>
-            <w:rFonts w:ascii="Arial" w:hAnsi="Arial" w:cs="Arial"/>
-          </w:rPr>
-          <w:t>-</w:t>
-        </w:r>
-      </w:ins>
-      <w:del w:id="357" w:author="Smith Vidaurre, Grace" w:date="2025-06-09T14:32:00Z" w16du:dateUtc="2025-06-09T18:32:00Z">
-        <w:r>
-          <w:rPr>
-            <w:rFonts w:ascii="Arial" w:hAnsi="Arial" w:cs="Arial"/>
-          </w:rPr>
-          <w:delText xml:space="preserve"> </w:delText>
-        </w:r>
-      </w:del>
-      <w:r>
-        <w:rPr>
-          <w:rFonts w:ascii="Arial" w:hAnsi="Arial" w:cs="Arial"/>
-        </w:rPr>
-        <w:t>specific</w:t>
-      </w:r>
-      <w:r>
-        <w:rPr>
-          <w:rFonts w:ascii="Arial" w:hAnsi="Arial" w:cs="Arial"/>
-        </w:rPr>
-        <w:t xml:space="preserve"> dataset), and </w:t>
-      </w:r>
-      <w:ins w:id="358" w:author="Smith Vidaurre, Grace" w:date="2025-06-09T14:33:00Z" w16du:dateUtc="2025-06-09T18:33:00Z">
-        <w:r>
-          <w:rPr>
-            <w:rFonts w:ascii="Arial" w:hAnsi="Arial" w:cs="Arial"/>
-          </w:rPr>
-          <w:t xml:space="preserve">(2) </w:t>
-        </w:r>
-      </w:ins>
-      <w:del w:id="359" w:author="Smith Vidaurre, Grace" w:date="2025-06-09T14:33:00Z" w16du:dateUtc="2025-06-09T18:33:00Z">
-        <w:r>
-          <w:rPr>
-            <w:rFonts w:ascii="Arial" w:hAnsi="Arial" w:cs="Arial"/>
-          </w:rPr>
-          <w:delText xml:space="preserve">one </w:delText>
-        </w:r>
-      </w:del>
-      <w:del w:id="360" w:author="Smith Vidaurre, Grace" w:date="2025-06-09T14:32:00Z" w16du:dateUtc="2025-06-09T18:32:00Z">
-        <w:r>
-          <w:rPr>
-            <w:rFonts w:ascii="Arial" w:hAnsi="Arial" w:cs="Arial"/>
-          </w:rPr>
-          <w:delText xml:space="preserve">that created </w:delText>
-        </w:r>
-        <w:commentRangeStart w:id="361"/>
-        <w:r>
-          <w:rPr>
-            <w:rFonts w:ascii="Arial" w:hAnsi="Arial" w:cs="Arial"/>
-          </w:rPr>
-          <w:delText xml:space="preserve">character strings </w:delText>
-        </w:r>
-        <w:commentRangeEnd w:id="361"/>
-        <w:r>
-          <w:rPr>
-            <w:rStyle w:val="CommentReference"/>
-          </w:rPr>
-          <w:commentReference w:id="361"/>
-        </w:r>
-      </w:del>
-      <w:del w:id="362" w:author="Smith Vidaurre, Grace" w:date="2025-06-09T14:33:00Z" w16du:dateUtc="2025-06-09T18:33:00Z">
-        <w:r>
-          <w:rPr>
-            <w:rFonts w:ascii="Arial" w:hAnsi="Arial" w:cs="Arial"/>
-          </w:rPr>
-          <w:delText xml:space="preserve">with </w:delText>
-        </w:r>
-      </w:del>
-      <w:r>
-        <w:rPr>
-          <w:rFonts w:ascii="Arial" w:hAnsi="Arial" w:cs="Arial"/>
-        </w:rPr>
-        <w:t xml:space="preserve">more individual </w:t>
-      </w:r>
-      <w:ins w:id="363" w:author="Smith Vidaurre, Grace" w:date="2025-06-09T14:32:00Z" w16du:dateUtc="2025-06-09T18:32:00Z">
-        <w:r>
-          <w:rPr>
-            <w:rFonts w:ascii="Arial" w:hAnsi="Arial" w:cs="Arial"/>
-          </w:rPr>
-          <w:t xml:space="preserve">identity </w:t>
-        </w:r>
-      </w:ins>
-      <w:del w:id="364" w:author="Smith Vidaurre, Grace" w:date="2025-06-09T14:33:00Z" w16du:dateUtc="2025-06-09T18:33:00Z">
-        <w:r>
-          <w:rPr>
-            <w:rFonts w:ascii="Arial" w:hAnsi="Arial" w:cs="Arial"/>
-          </w:rPr>
-          <w:delText xml:space="preserve">information </w:delText>
-        </w:r>
-      </w:del>
-      <w:r>
-        <w:rPr>
-          <w:rFonts w:ascii="Arial" w:hAnsi="Arial" w:cs="Arial"/>
-        </w:rPr>
-        <w:t>than group membership information</w:t>
-      </w:r>
-      <w:del w:id="365" w:author="Smith Vidaurre, Grace" w:date="2025-06-09T14:32:00Z" w16du:dateUtc="2025-06-09T18:32:00Z">
-        <w:r>
-          <w:rPr>
-            <w:rFonts w:ascii="Arial" w:hAnsi="Arial" w:cs="Arial"/>
-          </w:rPr>
-          <w:delText xml:space="preserve"> encoded</w:delText>
-        </w:r>
-      </w:del>
-      <w:r>
-        <w:rPr>
-          <w:rFonts w:ascii="Arial" w:hAnsi="Arial" w:cs="Arial"/>
-        </w:rPr>
-        <w:t xml:space="preserve"> (</w:t>
-      </w:r>
-      <w:r>
-        <w:rPr>
-          <w:rFonts w:ascii="Arial" w:hAnsi="Arial" w:cs="Arial"/>
-        </w:rPr>
-        <w:t>individual</w:t>
-      </w:r>
-      <w:ins w:id="366" w:author="Smith Vidaurre, Grace" w:date="2025-06-09T14:32:00Z" w16du:dateUtc="2025-06-09T18:32:00Z">
-        <w:r>
-          <w:rPr>
-            <w:rFonts w:ascii="Arial" w:hAnsi="Arial" w:cs="Arial"/>
-          </w:rPr>
-          <w:t>ly distinctive</w:t>
-        </w:r>
-      </w:ins>
-      <w:r>
-        <w:rPr>
-          <w:rFonts w:ascii="Arial" w:hAnsi="Arial" w:cs="Arial"/>
-        </w:rPr>
-        <w:t xml:space="preserve"> </w:t>
-      </w:r>
-      <w:del w:id="367" w:author="Smith Vidaurre, Grace" w:date="2025-06-09T14:32:00Z" w16du:dateUtc="2025-06-09T18:32:00Z">
-        <w:r>
-          <w:rPr>
-            <w:rFonts w:ascii="Arial" w:hAnsi="Arial" w:cs="Arial"/>
-          </w:rPr>
-          <w:delText xml:space="preserve">identity information </w:delText>
-        </w:r>
-      </w:del>
-      <w:r>
-        <w:rPr>
-          <w:rFonts w:ascii="Arial" w:hAnsi="Arial" w:cs="Arial"/>
-        </w:rPr>
-        <w:t>dataset</w:t>
-      </w:r>
-      <w:ins w:id="368" w:author="Smith Vidaurre, Grace" w:date="2025-06-09T14:33:00Z" w16du:dateUtc="2025-06-09T18:33:00Z">
-        <w:r>
-          <w:rPr>
-            <w:rFonts w:ascii="Arial" w:hAnsi="Arial" w:cs="Arial"/>
-          </w:rPr>
-          <w:t>)</w:t>
-        </w:r>
-      </w:ins>
-      <w:del w:id="369" w:author="Smith Vidaurre, Grace" w:date="2025-06-09T14:33:00Z" w16du:dateUtc="2025-06-09T18:33:00Z">
-        <w:r>
-          <w:rPr>
-            <w:rFonts w:ascii="Arial" w:hAnsi="Arial" w:cs="Arial"/>
-          </w:rPr>
-          <w:delText xml:space="preserve">; </w:delText>
-        </w:r>
-        <w:commentRangeStart w:id="370"/>
-        <w:commentRangeEnd w:id="370"/>
-        <w:r>
-          <w:rPr>
-            <w:rStyle w:val="CommentReference"/>
-          </w:rPr>
-          <w:commentReference w:id="370"/>
-        </w:r>
-        <w:r>
-          <w:rPr>
-            <w:rFonts w:ascii="Arial" w:hAnsi="Arial" w:cs="Arial"/>
-          </w:rPr>
-          <w:delText xml:space="preserve">henceforth the </w:delText>
-        </w:r>
-        <w:r>
-          <w:rPr>
-            <w:rFonts w:ascii="Arial" w:hAnsi="Arial" w:cs="Arial"/>
-          </w:rPr>
-          <w:delText>individual identity</w:delText>
-        </w:r>
-        <w:r>
-          <w:rPr>
-            <w:rFonts w:ascii="Arial" w:hAnsi="Arial" w:cs="Arial"/>
-          </w:rPr>
-          <w:delText xml:space="preserve"> dataset)</w:delText>
-        </w:r>
-      </w:del>
-      <w:r>
-        <w:rPr>
-          <w:rFonts w:ascii="Arial" w:hAnsi="Arial" w:cs="Arial"/>
-        </w:rPr>
-        <w:t xml:space="preserve">. In the </w:t>
-      </w:r>
-      <w:r>
-        <w:rPr>
-          <w:rFonts w:ascii="Arial" w:hAnsi="Arial" w:cs="Arial"/>
-        </w:rPr>
-        <w:t>group specific dataset</w:t>
-      </w:r>
-      <w:r>
-        <w:rPr>
-          <w:rFonts w:ascii="Arial" w:hAnsi="Arial" w:cs="Arial"/>
-        </w:rPr>
-        <w:t xml:space="preserve">, individual information was set to a character length of 4 characters, and group member information was set to </w:t>
-      </w:r>
-      <w:commentRangeStart w:id="371"/>
-      <w:r>
-        <w:rPr>
-          <w:rFonts w:ascii="Arial" w:hAnsi="Arial" w:cs="Arial"/>
-        </w:rPr>
-        <w:t>a character length of 8 character</w:t>
-      </w:r>
-      <w:commentRangeEnd w:id="371"/>
-      <w:r>
-        <w:rPr>
-          <w:rStyle w:val="CommentReference"/>
-        </w:rPr>
-        <w:commentReference w:id="371"/>
-      </w:r>
-      <w:r>
-        <w:rPr>
-          <w:rFonts w:ascii="Arial" w:hAnsi="Arial" w:cs="Arial"/>
-        </w:rPr>
-        <w:t xml:space="preserve">. In the </w:t>
-      </w:r>
-      <w:r>
-        <w:rPr>
-          <w:rFonts w:ascii="Arial" w:hAnsi="Arial" w:cs="Arial"/>
-        </w:rPr>
-        <w:t>individual identity dataset</w:t>
-      </w:r>
-      <w:r>
-        <w:rPr>
-          <w:rFonts w:ascii="Arial" w:hAnsi="Arial" w:cs="Arial"/>
-        </w:rPr>
-        <w:t xml:space="preserve">, individual information was set to a </w:t>
-      </w:r>
-      <w:commentRangeStart w:id="372"/>
-      <w:r>
-        <w:rPr>
-          <w:rFonts w:ascii="Arial" w:hAnsi="Arial" w:cs="Arial"/>
-        </w:rPr>
-        <w:t>character length of 8 characters</w:t>
-      </w:r>
-      <w:commentRangeEnd w:id="372"/>
-      <w:r>
-        <w:rPr>
-          <w:rStyle w:val="CommentReference"/>
-        </w:rPr>
-        <w:commentReference w:id="372"/>
-      </w:r>
-      <w:r>
-        <w:rPr>
-          <w:rFonts w:ascii="Arial" w:hAnsi="Arial" w:cs="Arial"/>
-        </w:rPr>
-        <w:t xml:space="preserve">, and group information was set to a character length of 4 characters. For both datasets, there were 5 groups with 10 individuals per group, with 5 unique calls generated per individual. </w:t>
-      </w:r>
-    </w:p>
-    <w:p>
-      <w:pPr>
-        <w:spacing w:line="480" w:lineRule="auto"/>
-        <w:ind w:firstLine="720"/>
-        <w:rPr>
-          <w:rFonts w:ascii="Arial" w:hAnsi="Arial" w:cs="Arial"/>
-        </w:rPr>
-      </w:pPr>
-      <w:r>
-        <w:rPr>
-          <w:rFonts w:ascii="Arial" w:hAnsi="Arial" w:cs="Arial"/>
-        </w:rPr>
-        <w:t xml:space="preserve">After generating synthetic signals for these datasets, we used the soundgen package (TKTK citation) to convert the .wav files to spectrograms (see example of calls in Figures 2B and 3B). To validate that the group and individual information we specified in the character strings could be recovered from the generated frequency signals, we performed spectrographic cross-correlation on each dataset (SPCC; </w:t>
-      </w:r>
-      <w:r>
-        <w:rPr>
-          <w:rFonts w:ascii="Arial" w:hAnsi="Arial" w:cs="Arial"/>
-        </w:rPr>
-        <w:fldChar w:fldCharType="begin"/>
-      </w:r>
-      <w:r>
-        <w:rPr>
-          <w:rFonts w:ascii="Arial" w:hAnsi="Arial" w:cs="Arial"/>
-        </w:rPr>
-        <w:instrText xml:space="preserve"> ADDIN ZOTERO_ITEM CSL_CITATION {"citationID":"2alP2xFJ","properties":{"formattedCitation":"(Clark et al., 1987)","plainCitation":"(Clark et al., 1987)","dontUpdate":true,"noteIndex":0},"citationItems":[{"id":606,"uris":["http://zotero.org/groups/5786507/items/GR5UUI5P"],"itemData":{"id":606,"type":"article-journal","abstract":"Sound spectrograms have been a traditional method for comparing animal vocalizations and demonstrating their similarities or differences, but quantification of the comparative process has been difficult. This lack of quantification has hindered progress in documenting the timing and degree of song development in song birds. With this in mind, computer-based methods for sound comparison and sound averaging were developed. These methods utilize a numerical representation of a sound's frequency-time structure to compute a similarity value between any two sounds and an average sound spectrogram for a set of sounds. These analytical techniques were applied to an analysis of song notes of the swamp sparrow (Melospiza georgiana). The results demonstrate the usefulness of the methods and reveal new details in the description of the swamp sparrow's set of species-universal note types and in the decrease of note variability during the course of developmental transitions from subsong, through plastic song to song crystallization.","container-title":"Ethology","DOI":"10.1111/j.1439-0310.1987.tb00676.x","ISSN":"1439-0310","issue":"2","language":"en","license":"1987 Blackwell Verlag GmbH","note":"_eprint: https://onlinelibrary.wiley.com/doi/pdf/10.1111/j.1439-0310.1987.tb00676.x","page":"101-115","source":"Wiley Online Library","title":"Quantitative Analysis of Animal Vocal Phonology: an Application to Swamp Sparrow Song","title-short":"Quantitative Analysis of Animal Vocal Phonology","volume":"76","author":[{"family":"Clark","given":"Christopher W."},{"family":"Marler","given":"Peter"},{"family":"Beeman","given":"Kim"}],"issued":{"date-parts":[["1987"]]}}}],"schema":"https://github.com/citation-style-language/schema/raw/master/csl-citation.json"} </w:instrText>
-      </w:r>
-      <w:r>
-        <w:rPr>
-          <w:rFonts w:ascii="Arial" w:hAnsi="Arial" w:cs="Arial"/>
-        </w:rPr>
-        <w:fldChar w:fldCharType="separate"/>
-      </w:r>
-      <w:r>
-        <w:rPr>
-          <w:rFonts w:ascii="Arial" w:hAnsi="Arial" w:cs="Arial"/>
-        </w:rPr>
-        <w:t>Clark et al., 1987</w:t>
-      </w:r>
-      <w:r>
-        <w:rPr>
-          <w:rFonts w:ascii="Arial" w:hAnsi="Arial" w:cs="Arial"/>
-        </w:rPr>
-        <w:fldChar w:fldCharType="end"/>
-      </w:r>
-      <w:r>
-        <w:rPr>
-          <w:rFonts w:ascii="Arial" w:hAnsi="Arial" w:cs="Arial"/>
-        </w:rPr>
-        <w:t xml:space="preserve">) using the warbleR package. We performed SPCC with a Hanning window, a window length of 512 samples, and a window overlap of 90 samples. We used a Pearson’s correlation method and a bandpass filter of 0 to 20 kHz. </w:t>
-      </w:r>
-    </w:p>
-    <w:p>
-      <w:pPr>
-        <w:spacing w:line="480" w:lineRule="auto"/>
-        <w:ind w:firstLine="720"/>
-        <w:rPr>
-          <w:ins w:id="373" w:author="Smith Vidaurre, Grace" w:date="2025-06-09T14:31:00Z" w16du:dateUtc="2025-06-09T18:31:00Z"/>
-          <w:rFonts w:ascii="Arial" w:hAnsi="Arial" w:cs="Arial"/>
-        </w:rPr>
-      </w:pPr>
-      <w:r>
-        <w:rPr>
-          <w:rFonts w:ascii="Arial" w:hAnsi="Arial" w:cs="Arial"/>
-        </w:rPr>
-        <w:t xml:space="preserve">To assess hierarchical mapping patterns of our two datasets, we used non-metric multidimensional scaling (MDS) to reduce the dimensionality of the SPCC matrix for each dataset. We performed MDS over 15 dimensions so that the stress of the model was TKTK (less than 5). From these results, we two generated low-dimensional </w:t>
-      </w:r>
-      <w:r>
-        <w:rPr>
-          <w:rFonts w:ascii="Arial" w:hAnsi="Arial" w:cs="Arial"/>
-        </w:rPr>
-        <w:lastRenderedPageBreak/>
-        <w:t xml:space="preserve">acoustic space plots for each dataset, one visualizing the acoustic space between groups and one visualizing the acoustic space between individuals. In doing this for each dataset, we can compare how well the </w:t>
-      </w:r>
-      <w:r>
-        <w:rPr>
-          <w:rFonts w:ascii="Arial" w:hAnsi="Arial" w:cs="Arial"/>
-        </w:rPr>
-        <w:t>group specific</w:t>
-      </w:r>
-      <w:r>
-        <w:rPr>
-          <w:rFonts w:ascii="Arial" w:hAnsi="Arial" w:cs="Arial"/>
-        </w:rPr>
-        <w:t xml:space="preserve"> dataset encodes information at the group level compared to the individual level and vice versa for the </w:t>
-      </w:r>
-      <w:r>
-        <w:rPr>
-          <w:rFonts w:ascii="Arial" w:hAnsi="Arial" w:cs="Arial"/>
-        </w:rPr>
-        <w:t>individual identity dataset</w:t>
-      </w:r>
-      <w:r>
-        <w:rPr>
-          <w:rFonts w:ascii="Arial" w:hAnsi="Arial" w:cs="Arial"/>
-        </w:rPr>
-        <w:t>.</w:t>
-      </w:r>
-      <w:del w:id="374" w:author="Smith Vidaurre, Grace" w:date="2025-06-09T14:31:00Z" w16du:dateUtc="2025-06-09T18:31:00Z">
-        <w:r>
-          <w:rPr>
-            <w:rFonts w:ascii="Arial" w:hAnsi="Arial" w:cs="Arial"/>
-          </w:rPr>
-          <w:delText xml:space="preserve"> </w:delText>
+          <w:commentReference w:id="442"/>
+        </w:r>
+        <w:r>
+          <w:rPr>
+            <w:rFonts w:ascii="Arial" w:hAnsi="Arial" w:cs="Arial"/>
+          </w:rPr>
+          <w:delText xml:space="preserve">, and group information was set to a character length of 4 characters. For both datasets, there were 5 groups with 10 individuals per group, with 5 unique calls generated per individual. </w:delText>
         </w:r>
       </w:del>
     </w:p>
@@ -21432,20 +22091,126 @@
         <w:spacing w:line="480" w:lineRule="auto"/>
         <w:ind w:firstLine="720"/>
         <w:rPr>
-          <w:ins w:id="375" w:author="Smith Vidaurre, Grace" w:date="2025-06-09T14:31:00Z" w16du:dateUtc="2025-06-09T18:31:00Z"/>
-          <w:rFonts w:ascii="Arial" w:hAnsi="Arial" w:cs="Arial"/>
-        </w:rPr>
-      </w:pPr>
+          <w:rFonts w:ascii="Arial" w:hAnsi="Arial" w:cs="Arial"/>
+        </w:rPr>
+      </w:pPr>
+      <w:r>
+        <w:rPr>
+          <w:rFonts w:ascii="Arial" w:hAnsi="Arial" w:cs="Arial"/>
+        </w:rPr>
+        <w:t xml:space="preserve">After generating synthetic signals for these datasets, we used the soundgen package (TKTK citation) to convert the .wav files to spectrograms (see example of calls in Figures 2B and 3B). To validate that the group and individual information we specified in the character strings could be recovered from the generated frequency signals, we performed spectrographic cross-correlation on each dataset (SPCC; </w:t>
+      </w:r>
+      <w:r>
+        <w:rPr>
+          <w:rFonts w:ascii="Arial" w:hAnsi="Arial" w:cs="Arial"/>
+        </w:rPr>
+        <w:fldChar w:fldCharType="begin"/>
+      </w:r>
+      <w:r>
+        <w:rPr>
+          <w:rFonts w:ascii="Arial" w:hAnsi="Arial" w:cs="Arial"/>
+        </w:rPr>
+        <w:instrText xml:space="preserve"> ADDIN ZOTERO_ITEM CSL_CITATION {"citationID":"2alP2xFJ","properties":{"formattedCitation":"(Clark et al., 1987)","plainCitation":"(Clark et al., 1987)","dontUpdate":true,"noteIndex":0},"citationItems":[{"id":606,"uris":["http://zotero.org/groups/5786507/items/GR5UUI5P"],"itemData":{"id":606,"type":"article-journal","abstract":"Sound spectrograms have been a traditional method for comparing animal vocalizations and demonstrating their similarities or differences, but quantification of the comparative process has been difficult. This lack of quantification has hindered progress in documenting the timing and degree of song development in song birds. With this in mind, computer-based methods for sound comparison and sound averaging were developed. These methods utilize a numerical representation of a sound's frequency-time structure to compute a similarity value between any two sounds and an average sound spectrogram for a set of sounds. These analytical techniques were applied to an analysis of song notes of the swamp sparrow (Melospiza georgiana). The results demonstrate the usefulness of the methods and reveal new details in the description of the swamp sparrow's set of species-universal note types and in the decrease of note variability during the course of developmental transitions from subsong, through plastic song to song crystallization.","container-title":"Ethology","DOI":"10.1111/j.1439-0310.1987.tb00676.x","ISSN":"1439-0310","issue":"2","language":"en","license":"1987 Blackwell Verlag GmbH","note":"_eprint: https://onlinelibrary.wiley.com/doi/pdf/10.1111/j.1439-0310.1987.tb00676.x","page":"101-115","source":"Wiley Online Library","title":"Quantitative Analysis of Animal Vocal Phonology: an Application to Swamp Sparrow Song","title-short":"Quantitative Analysis of Animal Vocal Phonology","volume":"76","author":[{"family":"Clark","given":"Christopher W."},{"family":"Marler","given":"Peter"},{"family":"Beeman","given":"Kim"}],"issued":{"date-parts":[["1987"]]}}}],"schema":"https://github.com/citation-style-language/schema/raw/master/csl-citation.json"} </w:instrText>
+      </w:r>
+      <w:r>
+        <w:rPr>
+          <w:rFonts w:ascii="Arial" w:hAnsi="Arial" w:cs="Arial"/>
+        </w:rPr>
+        <w:fldChar w:fldCharType="separate"/>
+      </w:r>
+      <w:r>
+        <w:rPr>
+          <w:rFonts w:ascii="Arial" w:hAnsi="Arial" w:cs="Arial"/>
+        </w:rPr>
+        <w:t>Clark et al., 1987</w:t>
+      </w:r>
+      <w:r>
+        <w:rPr>
+          <w:rFonts w:ascii="Arial" w:hAnsi="Arial" w:cs="Arial"/>
+        </w:rPr>
+        <w:fldChar w:fldCharType="end"/>
+      </w:r>
+      <w:r>
+        <w:rPr>
+          <w:rFonts w:ascii="Arial" w:hAnsi="Arial" w:cs="Arial"/>
+        </w:rPr>
+        <w:t xml:space="preserve">) </w:t>
+      </w:r>
+      <w:r>
+        <w:rPr>
+          <w:rFonts w:ascii="Arial" w:hAnsi="Arial" w:cs="Arial"/>
+        </w:rPr>
+        <w:lastRenderedPageBreak/>
+        <w:t xml:space="preserve">using the warbleR package. We performed SPCC with a Hanning window, a window length of 512 samples, and a window overlap of 90 samples. We used a Pearson’s correlation method and a bandpass filter of 0 to 20 kHz. </w:t>
+      </w:r>
     </w:p>
     <w:p>
       <w:pPr>
         <w:spacing w:line="480" w:lineRule="auto"/>
         <w:ind w:firstLine="720"/>
         <w:rPr>
-          <w:rFonts w:ascii="Arial" w:hAnsi="Arial" w:cs="Arial"/>
-        </w:rPr>
-      </w:pPr>
-      <w:ins w:id="376" w:author="Smith Vidaurre, Grace" w:date="2025-06-09T14:31:00Z" w16du:dateUtc="2025-06-09T18:31:00Z">
+          <w:ins w:id="443" w:author="Smith Vidaurre, Grace" w:date="2025-06-09T14:31:00Z" w16du:dateUtc="2025-06-09T18:31:00Z"/>
+          <w:rFonts w:ascii="Arial" w:hAnsi="Arial" w:cs="Arial"/>
+        </w:rPr>
+      </w:pPr>
+      <w:r>
+        <w:rPr>
+          <w:rFonts w:ascii="Arial" w:hAnsi="Arial" w:cs="Arial"/>
+        </w:rPr>
+        <w:t xml:space="preserve">To assess hierarchical mapping patterns of our two datasets, we used non-metric multidimensional scaling (MDS) to reduce the dimensionality of the SPCC matrix for each dataset. We performed MDS over 15 dimensions so that the stress of the model was TKTK (less than 5). From these results, we two generated low-dimensional acoustic space plots for each dataset, one visualizing the acoustic space between groups and one visualizing the acoustic space between individuals. In doing this for each dataset, we can compare how well the </w:t>
+      </w:r>
+      <w:r>
+        <w:rPr>
+          <w:rFonts w:ascii="Arial" w:hAnsi="Arial" w:cs="Arial"/>
+        </w:rPr>
+        <w:t>group specific</w:t>
+      </w:r>
+      <w:r>
+        <w:rPr>
+          <w:rFonts w:ascii="Arial" w:hAnsi="Arial" w:cs="Arial"/>
+        </w:rPr>
+        <w:t xml:space="preserve"> dataset encodes information at the group level compared to the individual level and vice versa for the </w:t>
+      </w:r>
+      <w:r>
+        <w:rPr>
+          <w:rFonts w:ascii="Arial" w:hAnsi="Arial" w:cs="Arial"/>
+        </w:rPr>
+        <w:t>individual identity dataset</w:t>
+      </w:r>
+      <w:r>
+        <w:rPr>
+          <w:rFonts w:ascii="Arial" w:hAnsi="Arial" w:cs="Arial"/>
+        </w:rPr>
+        <w:t>.</w:t>
+      </w:r>
+      <w:del w:id="444" w:author="Smith Vidaurre, Grace" w:date="2025-06-09T14:31:00Z" w16du:dateUtc="2025-06-09T18:31:00Z">
+        <w:r>
+          <w:rPr>
+            <w:rFonts w:ascii="Arial" w:hAnsi="Arial" w:cs="Arial"/>
+          </w:rPr>
+          <w:delText xml:space="preserve"> </w:delText>
+        </w:r>
+      </w:del>
+    </w:p>
+    <w:p>
+      <w:pPr>
+        <w:spacing w:line="480" w:lineRule="auto"/>
+        <w:ind w:firstLine="720"/>
+        <w:rPr>
+          <w:ins w:id="445" w:author="Smith Vidaurre, Grace" w:date="2025-06-09T14:31:00Z" w16du:dateUtc="2025-06-09T18:31:00Z"/>
+          <w:rFonts w:ascii="Arial" w:hAnsi="Arial" w:cs="Arial"/>
+        </w:rPr>
+      </w:pPr>
+    </w:p>
+    <w:p>
+      <w:pPr>
+        <w:spacing w:line="480" w:lineRule="auto"/>
+        <w:ind w:firstLine="720"/>
+        <w:rPr>
+          <w:rFonts w:ascii="Arial" w:hAnsi="Arial" w:cs="Arial"/>
+        </w:rPr>
+      </w:pPr>
+      <w:ins w:id="446" w:author="Smith Vidaurre, Grace" w:date="2025-06-09T14:31:00Z" w16du:dateUtc="2025-06-09T18:31:00Z">
         <w:r>
           <w:rPr>
             <w:rFonts w:ascii="Arial" w:hAnsi="Arial" w:cs="Arial"/>
@@ -21578,25 +22343,32 @@
         </w:rPr>
         <w:t xml:space="preserve">synthetic data sets across 16 treatments that varied over social environment characteristics and information encoding rules. </w:t>
       </w:r>
-      <w:commentRangeStart w:id="377"/>
+      <w:commentRangeStart w:id="447"/>
       <w:r>
         <w:rPr>
           <w:rFonts w:ascii="Arial" w:hAnsi="Arial" w:cs="Arial"/>
         </w:rPr>
         <w:t>We varied social environment characteristics represented information signaling changes that happen in socially sparse vs socially dense signaling environments</w:t>
       </w:r>
-      <w:commentRangeEnd w:id="377"/>
+      <w:commentRangeEnd w:id="447"/>
       <w:r>
         <w:rPr>
           <w:rStyle w:val="CommentReference"/>
         </w:rPr>
-        <w:commentReference w:id="377"/>
-      </w:r>
-      <w:r>
-        <w:rPr>
-          <w:rFonts w:ascii="Arial" w:hAnsi="Arial" w:cs="Arial"/>
-        </w:rPr>
-        <w:t xml:space="preserve">. We achieved this by creating four social conditions: 2 groups with 2 individuals per group, 4 groups with 4 individuals per group, 6 groups with 6 individuals per group, and 8 groups with 8 individuals per group. We also varied the proportion of group information to individual information encoded in the signal, with four categories: 0 (representing all individual information and no group information), 1/3, 2/3, and 1 (representing all group information and no individual information. We iterated over each treatment 10 times, generating 10 unique synthetic datasets per treatment. </w:t>
+        <w:commentReference w:id="447"/>
+      </w:r>
+      <w:r>
+        <w:rPr>
+          <w:rFonts w:ascii="Arial" w:hAnsi="Arial" w:cs="Arial"/>
+        </w:rPr>
+        <w:t xml:space="preserve">. We achieved this by creating four social conditions: 2 groups with 2 individuals per group, 4 </w:t>
+      </w:r>
+      <w:r>
+        <w:rPr>
+          <w:rFonts w:ascii="Arial" w:hAnsi="Arial" w:cs="Arial"/>
+        </w:rPr>
+        <w:lastRenderedPageBreak/>
+        <w:t xml:space="preserve">groups with 4 individuals per group, 6 groups with 6 individuals per group, and 8 groups with 8 individuals per group. We also varied the proportion of group information to individual information encoded in the signal, with four categories: 0 (representing all individual information and no group information), 1/3, 2/3, and 1 (representing all group information and no individual information. We iterated over each treatment 10 times, generating 10 unique synthetic datasets per treatment. </w:t>
       </w:r>
     </w:p>
     <w:p>
@@ -21611,7 +22383,6 @@
         <w:rPr>
           <w:rFonts w:ascii="Arial" w:hAnsi="Arial" w:cs="Arial"/>
         </w:rPr>
-        <w:lastRenderedPageBreak/>
         <w:tab/>
         <w:t xml:space="preserve">Once these synthetic datasets were created, we used traditional bioacoustics tools to decode information encoded at the group and individual level. Similar to the datasets above, we performed SPCC. We also calculated the edit distance for the original strings. After these calculations, we performed Multidimensional Scaling on both the SPCC and edit distance matrices, then performed k-means clustering, randomly selecting 1 call per individual per group, to ensure that call exemplars per class matched between social levels. From this, we were able to calculate the accuracy of detecting information at the group and individual levels from vocalizations represented as character strings (edit distance pipeline) or synthetic audio files (tradition </w:t>
       </w:r>
@@ -21645,7 +22416,7 @@
         <w:pStyle w:val="NoSpacing"/>
         <w:spacing w:line="480" w:lineRule="auto"/>
         <w:rPr>
-          <w:ins w:id="378" w:author="Smith Vidaurre, Grace" w:date="2025-05-28T19:06:00Z" w16du:dateUtc="2025-05-28T23:06:00Z"/>
+          <w:ins w:id="448" w:author="Smith Vidaurre, Grace" w:date="2025-05-28T19:06:00Z" w16du:dateUtc="2025-05-28T23:06:00Z"/>
           <w:rFonts w:ascii="Arial" w:hAnsi="Arial" w:cs="Arial"/>
         </w:rPr>
       </w:pPr>
@@ -21668,7 +22439,7 @@
         <w:pStyle w:val="NoSpacing"/>
         <w:spacing w:line="480" w:lineRule="auto"/>
         <w:rPr>
-          <w:ins w:id="379" w:author="Smith Vidaurre, Grace" w:date="2025-05-28T19:06:00Z" w16du:dateUtc="2025-05-28T23:06:00Z"/>
+          <w:ins w:id="449" w:author="Smith Vidaurre, Grace" w:date="2025-05-28T19:06:00Z" w16du:dateUtc="2025-05-28T23:06:00Z"/>
           <w:rFonts w:ascii="Arial" w:hAnsi="Arial" w:cs="Arial"/>
         </w:rPr>
       </w:pPr>
@@ -21678,59 +22449,53 @@
         <w:spacing w:line="480" w:lineRule="auto"/>
         <w:ind w:firstLine="720"/>
         <w:rPr>
-          <w:ins w:id="380" w:author="Smith Vidaurre, Grace" w:date="2025-05-28T19:06:00Z" w16du:dateUtc="2025-05-28T23:06:00Z"/>
-          <w:rFonts w:ascii="Arial" w:hAnsi="Arial" w:cs="Arial"/>
-        </w:rPr>
-      </w:pPr>
-      <w:ins w:id="381" w:author="Smith Vidaurre, Grace" w:date="2025-05-28T19:06:00Z" w16du:dateUtc="2025-05-28T23:06:00Z">
-        <w:r>
-          <w:rPr>
-            <w:rFonts w:ascii="Arial" w:hAnsi="Arial" w:cs="Arial"/>
-          </w:rPr>
+          <w:ins w:id="450" w:author="Smith Vidaurre, Grace" w:date="2025-05-28T19:06:00Z" w16du:dateUtc="2025-05-28T23:06:00Z"/>
+          <w:rFonts w:ascii="Arial" w:hAnsi="Arial" w:cs="Arial"/>
+        </w:rPr>
+      </w:pPr>
+      <w:ins w:id="451" w:author="Smith Vidaurre, Grace" w:date="2025-05-28T19:06:00Z" w16du:dateUtc="2025-05-28T23:06:00Z">
+        <w:r>
+          <w:rPr>
+            <w:rFonts w:ascii="Arial" w:hAnsi="Arial" w:cs="Arial"/>
+          </w:rPr>
+          <w:lastRenderedPageBreak/>
           <w:t xml:space="preserve">TKTK integrate </w:t>
         </w:r>
-        <w:commentRangeStart w:id="382"/>
-        <w:commentRangeStart w:id="383"/>
-        <w:commentRangeStart w:id="384"/>
+        <w:commentRangeStart w:id="452"/>
+        <w:commentRangeStart w:id="453"/>
+        <w:commentRangeStart w:id="454"/>
         <w:r>
           <w:rPr>
             <w:rFonts w:ascii="Arial" w:hAnsi="Arial" w:cs="Arial"/>
           </w:rPr>
           <w:t>We expected to identify clustering accuracies that were generally lower for spectrographic cross-correlation than the edit distance, since spectrographic cross-correlation was performed on strings transformed into synthetic audio files, which may have led to losses of the original information or added noise</w:t>
         </w:r>
-        <w:commentRangeEnd w:id="382"/>
+        <w:commentRangeEnd w:id="452"/>
         <w:r>
           <w:rPr>
             <w:rStyle w:val="CommentReference"/>
           </w:rPr>
-          <w:commentReference w:id="382"/>
-        </w:r>
-        <w:commentRangeEnd w:id="383"/>
+          <w:commentReference w:id="452"/>
+        </w:r>
+        <w:commentRangeEnd w:id="453"/>
         <w:r>
           <w:rPr>
             <w:rStyle w:val="CommentReference"/>
           </w:rPr>
-          <w:commentReference w:id="383"/>
-        </w:r>
-        <w:commentRangeEnd w:id="384"/>
+          <w:commentReference w:id="453"/>
+        </w:r>
+        <w:commentRangeEnd w:id="454"/>
         <w:r>
           <w:rPr>
             <w:rStyle w:val="CommentReference"/>
           </w:rPr>
-          <w:commentReference w:id="384"/>
-        </w:r>
-        <w:r>
-          <w:rPr>
-            <w:rFonts w:ascii="Arial" w:hAnsi="Arial" w:cs="Arial"/>
-          </w:rPr>
-          <w:t xml:space="preserve">. However, we generally expected to identify medium or small effect sizes for these differences in information detection by each method that did not outweigh the effect sizes calculated </w:t>
-        </w:r>
-        <w:r>
-          <w:rPr>
-            <w:rFonts w:ascii="Arial" w:hAnsi="Arial" w:cs="Arial"/>
-          </w:rPr>
-          <w:lastRenderedPageBreak/>
-          <w:t>for clustering accuracy between different forms of identity information for the same measurement (spectrographic cross-correlation or the edit distance).</w:t>
+          <w:commentReference w:id="454"/>
+        </w:r>
+        <w:r>
+          <w:rPr>
+            <w:rFonts w:ascii="Arial" w:hAnsi="Arial" w:cs="Arial"/>
+          </w:rPr>
+          <w:t>. However, we generally expected to identify medium or small effect sizes for these differences in information detection by each method that did not outweigh the effect sizes calculated for clustering accuracy between different forms of identity information for the same measurement (spectrographic cross-correlation or the edit distance).</w:t>
         </w:r>
       </w:ins>
     </w:p>
@@ -22806,7 +23571,7 @@
           <w:szCs w:val="20"/>
         </w:rPr>
       </w:pPr>
-      <w:del w:id="385" w:author="Smith Vidaurre, Grace" w:date="2025-05-27T21:15:00Z" w16du:dateUtc="2025-05-28T01:15:00Z">
+      <w:del w:id="455" w:author="Smith Vidaurre, Grace" w:date="2025-05-27T21:15:00Z" w16du:dateUtc="2025-05-28T01:15:00Z">
         <w:r>
           <w:rPr>
             <w:noProof/>
@@ -22884,13 +23649,13 @@
           <w:rFonts w:ascii="Arial" w:hAnsi="Arial" w:cs="Arial"/>
         </w:rPr>
       </w:pPr>
-      <w:commentRangeStart w:id="386"/>
-      <w:commentRangeEnd w:id="386"/>
+      <w:commentRangeStart w:id="456"/>
+      <w:commentRangeEnd w:id="456"/>
       <w:r>
         <w:rPr>
           <w:rStyle w:val="CommentReference"/>
         </w:rPr>
-        <w:commentReference w:id="386"/>
+        <w:commentReference w:id="456"/>
       </w:r>
       <w:r>
         <w:rPr>
@@ -23008,7 +23773,7 @@
           <w:rFonts w:ascii="Arial" w:hAnsi="Arial" w:cs="Arial"/>
         </w:rPr>
       </w:pPr>
-      <w:del w:id="387" w:author="Smith Vidaurre, Grace" w:date="2025-05-27T21:15:00Z" w16du:dateUtc="2025-05-28T01:15:00Z">
+      <w:del w:id="457" w:author="Smith Vidaurre, Grace" w:date="2025-05-27T21:15:00Z" w16du:dateUtc="2025-05-28T01:15:00Z">
         <w:r>
           <w:rPr>
             <w:rFonts w:ascii="Arial" w:hAnsi="Arial" w:cs="Arial"/>
@@ -23099,7 +23864,7 @@
           <w:rFonts w:ascii="Arial" w:hAnsi="Arial" w:cs="Arial"/>
         </w:rPr>
       </w:pPr>
-      <w:del w:id="388" w:author="Smith Vidaurre, Grace" w:date="2025-05-27T21:15:00Z" w16du:dateUtc="2025-05-28T01:15:00Z">
+      <w:del w:id="458" w:author="Smith Vidaurre, Grace" w:date="2025-05-27T21:15:00Z" w16du:dateUtc="2025-05-28T01:15:00Z">
         <w:r>
           <w:rPr>
             <w:rFonts w:ascii="Arial" w:hAnsi="Arial" w:cs="Arial"/>
@@ -23256,19 +24021,19 @@
         </w:rPr>
         <w:t xml:space="preserve">). </w:t>
       </w:r>
-      <w:commentRangeStart w:id="389"/>
+      <w:commentRangeStart w:id="459"/>
       <w:r>
         <w:rPr>
           <w:rFonts w:ascii="Arial" w:hAnsi="Arial" w:cs="Arial"/>
         </w:rPr>
         <w:t>This suggests that individuals are being categorized in distinct individual clusters when running traditional bioacoustics analyses on our synthetically generated calls.</w:t>
       </w:r>
-      <w:commentRangeEnd w:id="389"/>
+      <w:commentRangeEnd w:id="459"/>
       <w:r>
         <w:rPr>
           <w:rStyle w:val="CommentReference"/>
         </w:rPr>
-        <w:commentReference w:id="389"/>
+        <w:commentReference w:id="459"/>
       </w:r>
     </w:p>
     <w:p>
@@ -23281,7 +24046,7 @@
     <w:p>
       <w:pPr>
         <w:rPr>
-          <w:ins w:id="390" w:author="Smith Vidaurre, Grace" w:date="2025-05-22T14:24:00Z" w16du:dateUtc="2025-05-22T18:24:00Z"/>
+          <w:ins w:id="460" w:author="Smith Vidaurre, Grace" w:date="2025-05-22T14:24:00Z" w16du:dateUtc="2025-05-22T18:24:00Z"/>
           <w:rFonts w:ascii="Arial" w:hAnsi="Arial" w:cs="Arial"/>
           <w:b/>
           <w:bCs/>
@@ -23299,7 +24064,7 @@
     <w:p>
       <w:pPr>
         <w:rPr>
-          <w:ins w:id="391" w:author="Smith Vidaurre, Grace" w:date="2025-05-22T14:24:00Z" w16du:dateUtc="2025-05-22T18:24:00Z"/>
+          <w:ins w:id="461" w:author="Smith Vidaurre, Grace" w:date="2025-05-22T14:24:00Z" w16du:dateUtc="2025-05-22T18:24:00Z"/>
           <w:rFonts w:ascii="Arial" w:hAnsi="Arial" w:cs="Arial"/>
           <w:b/>
           <w:bCs/>
@@ -23311,7 +24076,7 @@
         <w:spacing w:line="480" w:lineRule="auto"/>
         <w:ind w:firstLine="720"/>
         <w:rPr>
-          <w:ins w:id="392" w:author="Smith Vidaurre, Grace" w:date="2025-05-22T14:25:00Z" w16du:dateUtc="2025-05-22T18:25:00Z"/>
+          <w:ins w:id="462" w:author="Smith Vidaurre, Grace" w:date="2025-05-22T14:25:00Z" w16du:dateUtc="2025-05-22T18:25:00Z"/>
           <w:rFonts w:ascii="Arial" w:hAnsi="Arial" w:cs="Arial"/>
         </w:rPr>
       </w:pPr>
@@ -23357,19 +24122,19 @@
         </w:rPr>
         <w:t xml:space="preserve">, therefore, to study to evolution of vocal learning, we must understand how vocal learners encode and perceive information in learned vocal signals. Studies of the diversity of information encoding across vocal learning taxa could lead to new insights into how vocal learning originated and continues to </w:t>
       </w:r>
-      <w:commentRangeStart w:id="393"/>
+      <w:commentRangeStart w:id="463"/>
       <w:r>
         <w:rPr>
           <w:rFonts w:ascii="Arial" w:hAnsi="Arial" w:cs="Arial"/>
         </w:rPr>
         <w:t>evolve</w:t>
       </w:r>
-      <w:commentRangeEnd w:id="393"/>
+      <w:commentRangeEnd w:id="463"/>
       <w:r>
         <w:rPr>
           <w:rStyle w:val="CommentReference"/>
         </w:rPr>
-        <w:commentReference w:id="393"/>
+        <w:commentReference w:id="463"/>
       </w:r>
       <w:r>
         <w:rPr>
@@ -23383,7 +24148,7 @@
         <w:spacing w:line="480" w:lineRule="auto"/>
         <w:ind w:firstLine="720"/>
         <w:rPr>
-          <w:ins w:id="394" w:author="Smith Vidaurre, Grace" w:date="2025-05-22T14:25:00Z" w16du:dateUtc="2025-05-22T18:25:00Z"/>
+          <w:ins w:id="464" w:author="Smith Vidaurre, Grace" w:date="2025-05-22T14:25:00Z" w16du:dateUtc="2025-05-22T18:25:00Z"/>
           <w:rFonts w:ascii="Arial" w:hAnsi="Arial" w:cs="Arial"/>
         </w:rPr>
       </w:pPr>
@@ -23393,12 +24158,12 @@
         <w:spacing w:line="480" w:lineRule="auto"/>
         <w:ind w:firstLine="720"/>
         <w:rPr>
-          <w:ins w:id="395" w:author="Smith Vidaurre, Grace" w:date="2025-05-22T14:34:00Z" w16du:dateUtc="2025-05-22T18:34:00Z"/>
-          <w:rFonts w:ascii="Arial" w:hAnsi="Arial" w:cs="Arial"/>
-        </w:rPr>
-      </w:pPr>
-      <w:commentRangeStart w:id="396"/>
-      <w:ins w:id="397" w:author="Smith Vidaurre, Grace" w:date="2025-05-22T14:25:00Z" w16du:dateUtc="2025-05-22T18:25:00Z">
+          <w:ins w:id="465" w:author="Smith Vidaurre, Grace" w:date="2025-05-22T14:34:00Z" w16du:dateUtc="2025-05-22T18:34:00Z"/>
+          <w:rFonts w:ascii="Arial" w:hAnsi="Arial" w:cs="Arial"/>
+        </w:rPr>
+      </w:pPr>
+      <w:commentRangeStart w:id="466"/>
+      <w:ins w:id="467" w:author="Smith Vidaurre, Grace" w:date="2025-05-22T14:25:00Z" w16du:dateUtc="2025-05-22T18:25:00Z">
         <w:r>
           <w:rPr>
             <w:rFonts w:ascii="Arial" w:hAnsi="Arial" w:cs="Arial"/>
@@ -23785,12 +24550,12 @@
           </w:rPr>
           <w:t xml:space="preserve">. </w:t>
         </w:r>
-        <w:commentRangeEnd w:id="396"/>
+        <w:commentRangeEnd w:id="466"/>
         <w:r>
           <w:rPr>
             <w:rStyle w:val="CommentReference"/>
           </w:rPr>
-          <w:commentReference w:id="396"/>
+          <w:commentReference w:id="466"/>
         </w:r>
       </w:ins>
     </w:p>
@@ -23799,7 +24564,7 @@
         <w:spacing w:line="480" w:lineRule="auto"/>
         <w:ind w:firstLine="720"/>
         <w:rPr>
-          <w:ins w:id="398" w:author="Smith Vidaurre, Grace" w:date="2025-05-22T14:34:00Z" w16du:dateUtc="2025-05-22T18:34:00Z"/>
+          <w:ins w:id="468" w:author="Smith Vidaurre, Grace" w:date="2025-05-22T14:34:00Z" w16du:dateUtc="2025-05-22T18:34:00Z"/>
           <w:rFonts w:ascii="Arial" w:hAnsi="Arial" w:cs="Arial"/>
         </w:rPr>
       </w:pPr>
@@ -23809,11 +24574,11 @@
         <w:spacing w:line="480" w:lineRule="auto"/>
         <w:ind w:firstLine="720"/>
         <w:rPr>
-          <w:ins w:id="399" w:author="Smith Vidaurre, Grace" w:date="2025-05-22T14:34:00Z" w16du:dateUtc="2025-05-22T18:34:00Z"/>
-          <w:rFonts w:ascii="Arial" w:hAnsi="Arial" w:cs="Arial"/>
-        </w:rPr>
-      </w:pPr>
-      <w:ins w:id="400" w:author="Smith Vidaurre, Grace" w:date="2025-05-22T14:34:00Z" w16du:dateUtc="2025-05-22T18:34:00Z">
+          <w:ins w:id="469" w:author="Smith Vidaurre, Grace" w:date="2025-05-22T14:34:00Z" w16du:dateUtc="2025-05-22T18:34:00Z"/>
+          <w:rFonts w:ascii="Arial" w:hAnsi="Arial" w:cs="Arial"/>
+        </w:rPr>
+      </w:pPr>
+      <w:ins w:id="470" w:author="Smith Vidaurre, Grace" w:date="2025-05-22T14:34:00Z" w16du:dateUtc="2025-05-22T18:34:00Z">
         <w:r>
           <w:rPr>
             <w:rFonts w:ascii="Arial" w:hAnsi="Arial" w:cs="Arial"/>
@@ -23856,19 +24621,19 @@
           </w:rPr>
           <w:t>(</w:t>
         </w:r>
-        <w:commentRangeStart w:id="401"/>
+        <w:commentRangeStart w:id="471"/>
         <w:r>
           <w:rPr>
             <w:rFonts w:ascii="Arial" w:hAnsi="Arial" w:cs="Arial"/>
           </w:rPr>
           <w:t>CITE</w:t>
         </w:r>
-        <w:commentRangeEnd w:id="401"/>
+        <w:commentRangeEnd w:id="471"/>
         <w:r>
           <w:rPr>
             <w:rStyle w:val="CommentReference"/>
           </w:rPr>
-          <w:commentReference w:id="401"/>
+          <w:commentReference w:id="471"/>
         </w:r>
         <w:r>
           <w:rPr>
@@ -23920,7 +24685,7 @@
         <w:spacing w:line="480" w:lineRule="auto"/>
         <w:ind w:firstLine="720"/>
         <w:rPr>
-          <w:ins w:id="402" w:author="Smith Vidaurre, Grace" w:date="2025-05-22T14:35:00Z" w16du:dateUtc="2025-05-22T18:35:00Z"/>
+          <w:ins w:id="472" w:author="Smith Vidaurre, Grace" w:date="2025-05-22T14:35:00Z" w16du:dateUtc="2025-05-22T18:35:00Z"/>
           <w:rFonts w:ascii="Arial" w:hAnsi="Arial" w:cs="Arial"/>
         </w:rPr>
       </w:pPr>
@@ -23930,11 +24695,11 @@
         <w:spacing w:line="480" w:lineRule="auto"/>
         <w:ind w:firstLine="720"/>
         <w:rPr>
-          <w:ins w:id="403" w:author="Smith Vidaurre, Grace" w:date="2025-06-05T09:40:00Z" w16du:dateUtc="2025-06-05T13:40:00Z"/>
-          <w:rFonts w:ascii="Arial" w:hAnsi="Arial" w:cs="Arial"/>
-        </w:rPr>
-      </w:pPr>
-      <w:ins w:id="404" w:author="Smith Vidaurre, Grace" w:date="2025-05-22T14:35:00Z" w16du:dateUtc="2025-05-22T18:35:00Z">
+          <w:ins w:id="473" w:author="Smith Vidaurre, Grace" w:date="2025-06-05T09:40:00Z" w16du:dateUtc="2025-06-05T13:40:00Z"/>
+          <w:rFonts w:ascii="Arial" w:hAnsi="Arial" w:cs="Arial"/>
+        </w:rPr>
+      </w:pPr>
+      <w:ins w:id="474" w:author="Smith Vidaurre, Grace" w:date="2025-05-22T14:35:00Z" w16du:dateUtc="2025-05-22T18:35:00Z">
         <w:r>
           <w:rPr>
             <w:rFonts w:ascii="Arial" w:hAnsi="Arial" w:cs="Arial"/>
@@ -23984,7 +24749,7 @@
         <w:spacing w:line="480" w:lineRule="auto"/>
         <w:ind w:firstLine="720"/>
         <w:rPr>
-          <w:ins w:id="405" w:author="Smith Vidaurre, Grace" w:date="2025-06-05T09:40:00Z" w16du:dateUtc="2025-06-05T13:40:00Z"/>
+          <w:ins w:id="475" w:author="Smith Vidaurre, Grace" w:date="2025-06-05T09:40:00Z" w16du:dateUtc="2025-06-05T13:40:00Z"/>
           <w:rFonts w:ascii="Arial" w:hAnsi="Arial" w:cs="Arial"/>
         </w:rPr>
       </w:pPr>
@@ -23994,11 +24759,11 @@
         <w:spacing w:line="480" w:lineRule="auto"/>
         <w:ind w:firstLine="720"/>
         <w:rPr>
-          <w:ins w:id="406" w:author="Smith Vidaurre, Grace" w:date="2025-06-05T09:40:00Z" w16du:dateUtc="2025-06-05T13:40:00Z"/>
-          <w:rFonts w:ascii="Arial" w:hAnsi="Arial" w:cs="Arial"/>
-        </w:rPr>
-      </w:pPr>
-      <w:ins w:id="407" w:author="Smith Vidaurre, Grace" w:date="2025-06-05T09:40:00Z" w16du:dateUtc="2025-06-05T13:40:00Z">
+          <w:ins w:id="476" w:author="Smith Vidaurre, Grace" w:date="2025-06-05T09:40:00Z" w16du:dateUtc="2025-06-05T13:40:00Z"/>
+          <w:rFonts w:ascii="Arial" w:hAnsi="Arial" w:cs="Arial"/>
+        </w:rPr>
+      </w:pPr>
+      <w:ins w:id="477" w:author="Smith Vidaurre, Grace" w:date="2025-06-05T09:40:00Z" w16du:dateUtc="2025-06-05T13:40:00Z">
         <w:r>
           <w:rPr>
             <w:rFonts w:ascii="Arial" w:hAnsi="Arial" w:cs="Arial"/>
@@ -24049,19 +24814,19 @@
           <w:bCs/>
         </w:rPr>
       </w:pPr>
-      <w:commentRangeStart w:id="408"/>
+      <w:commentRangeStart w:id="478"/>
       <w:r>
         <w:rPr>
           <w:rFonts w:ascii="Arial" w:hAnsi="Arial" w:cs="Arial"/>
         </w:rPr>
         <w:t>Second, out ability to detect the dynamics of information encoding during real time social interactions is limited by our ability to capture the totality of an individual’s or groups signal produced during these interactions. We may be over sampling from vocal learning species whose social interaction and signal production are easy to observe and measure, and therefore may not be assessing the full scope of how information can be encoded across a range of species.</w:t>
       </w:r>
-      <w:commentRangeEnd w:id="408"/>
+      <w:commentRangeEnd w:id="478"/>
       <w:r>
         <w:rPr>
           <w:rStyle w:val="CommentReference"/>
         </w:rPr>
-        <w:commentReference w:id="408"/>
+        <w:commentReference w:id="478"/>
       </w:r>
     </w:p>
     <w:p>
@@ -24077,7 +24842,7 @@
       <w:pPr>
         <w:spacing w:line="360" w:lineRule="auto"/>
         <w:rPr>
-          <w:ins w:id="409" w:author="Smith Vidaurre, Grace" w:date="2025-06-05T09:32:00Z" w16du:dateUtc="2025-06-05T13:32:00Z"/>
+          <w:ins w:id="479" w:author="Smith Vidaurre, Grace" w:date="2025-06-05T09:32:00Z" w16du:dateUtc="2025-06-05T13:32:00Z"/>
           <w:rFonts w:ascii="Arial" w:hAnsi="Arial" w:cs="Arial"/>
         </w:rPr>
       </w:pPr>
@@ -24087,35 +24852,35 @@
         </w:rPr>
         <w:t xml:space="preserve">Several computationally intensive tools have emerged to assess the degree or types of information encoded in </w:t>
       </w:r>
-      <w:commentRangeStart w:id="410"/>
-      <w:commentRangeStart w:id="411"/>
-      <w:commentRangeStart w:id="412"/>
+      <w:commentRangeStart w:id="480"/>
+      <w:commentRangeStart w:id="481"/>
+      <w:commentRangeStart w:id="482"/>
       <w:r>
         <w:rPr>
           <w:rFonts w:ascii="Arial" w:hAnsi="Arial" w:cs="Arial"/>
         </w:rPr>
         <w:t>signals</w:t>
       </w:r>
-      <w:commentRangeEnd w:id="410"/>
+      <w:commentRangeEnd w:id="480"/>
       <w:r>
         <w:rPr>
           <w:rStyle w:val="CommentReference"/>
         </w:rPr>
-        <w:commentReference w:id="410"/>
-      </w:r>
-      <w:commentRangeEnd w:id="411"/>
+        <w:commentReference w:id="480"/>
+      </w:r>
+      <w:commentRangeEnd w:id="481"/>
       <w:r>
         <w:rPr>
           <w:rStyle w:val="CommentReference"/>
         </w:rPr>
-        <w:commentReference w:id="411"/>
-      </w:r>
-      <w:commentRangeEnd w:id="412"/>
+        <w:commentReference w:id="481"/>
+      </w:r>
+      <w:commentRangeEnd w:id="482"/>
       <w:r>
         <w:rPr>
           <w:rStyle w:val="CommentReference"/>
         </w:rPr>
-        <w:commentReference w:id="412"/>
+        <w:commentReference w:id="482"/>
       </w:r>
       <w:r>
         <w:rPr>
@@ -24419,7 +25184,7 @@
       <w:pPr>
         <w:spacing w:line="360" w:lineRule="auto"/>
         <w:rPr>
-          <w:ins w:id="413" w:author="Smith Vidaurre, Grace" w:date="2025-06-05T09:32:00Z" w16du:dateUtc="2025-06-05T13:32:00Z"/>
+          <w:ins w:id="483" w:author="Smith Vidaurre, Grace" w:date="2025-06-05T09:32:00Z" w16du:dateUtc="2025-06-05T13:32:00Z"/>
           <w:rFonts w:ascii="Arial" w:hAnsi="Arial" w:cs="Arial"/>
         </w:rPr>
       </w:pPr>
@@ -24429,11 +25194,11 @@
         <w:spacing w:line="480" w:lineRule="auto"/>
         <w:ind w:firstLine="720"/>
         <w:rPr>
-          <w:ins w:id="414" w:author="Smith Vidaurre, Grace" w:date="2025-06-05T09:32:00Z" w16du:dateUtc="2025-06-05T13:32:00Z"/>
-          <w:rFonts w:ascii="Arial" w:hAnsi="Arial" w:cs="Arial"/>
-        </w:rPr>
-      </w:pPr>
-      <w:ins w:id="415" w:author="Smith Vidaurre, Grace" w:date="2025-06-05T09:32:00Z" w16du:dateUtc="2025-06-05T13:32:00Z">
+          <w:ins w:id="484" w:author="Smith Vidaurre, Grace" w:date="2025-06-05T09:32:00Z" w16du:dateUtc="2025-06-05T13:32:00Z"/>
+          <w:rFonts w:ascii="Arial" w:hAnsi="Arial" w:cs="Arial"/>
+        </w:rPr>
+      </w:pPr>
+      <w:ins w:id="485" w:author="Smith Vidaurre, Grace" w:date="2025-06-05T09:32:00Z" w16du:dateUtc="2025-06-05T13:32:00Z">
         <w:r>
           <w:rPr>
             <w:rFonts w:ascii="Arial" w:hAnsi="Arial" w:cs="Arial"/>
@@ -25399,7 +26164,7 @@
       </w:r>
     </w:p>
   </w:comment>
-  <w:comment w:id="349" w:author="Coppinger, Brittany" w:date="2025-01-07T15:07:00Z" w:initials="BC">
+  <w:comment w:id="352" w:author="Coppinger, Brittany" w:date="2025-01-07T15:07:00Z" w:initials="BC">
     <w:p>
       <w:pPr>
         <w:pStyle w:val="CommentText"/>
@@ -25415,7 +26180,7 @@
       </w:r>
     </w:p>
   </w:comment>
-  <w:comment w:id="350" w:author="Samman, Raneem" w:date="2025-01-13T15:08:00Z" w:initials="RS">
+  <w:comment w:id="353" w:author="Samman, Raneem" w:date="2025-01-13T15:08:00Z" w:initials="RS">
     <w:p>
       <w:r>
         <w:rPr>
@@ -25433,7 +26198,7 @@
       </w:r>
     </w:p>
   </w:comment>
-  <w:comment w:id="361" w:author="Samman, Raneem" w:date="2025-01-13T15:10:00Z" w:initials="RS">
+  <w:comment w:id="364" w:author="Samman, Raneem" w:date="2025-01-13T15:10:00Z" w:initials="RS">
     <w:p>
       <w:r>
         <w:rPr>
@@ -25451,7 +26216,7 @@
       </w:r>
     </w:p>
   </w:comment>
-  <w:comment w:id="370" w:author="Coppinger, Brittany" w:date="2025-01-07T15:01:00Z" w:initials="BC">
+  <w:comment w:id="373" w:author="Coppinger, Brittany" w:date="2025-01-07T15:01:00Z" w:initials="BC">
     <w:p>
       <w:pPr>
         <w:pStyle w:val="CommentText"/>
@@ -25467,7 +26232,7 @@
       </w:r>
     </w:p>
   </w:comment>
-  <w:comment w:id="371" w:author="Coppinger, Brittany" w:date="2025-01-07T15:08:00Z" w:initials="BC">
+  <w:comment w:id="441" w:author="Coppinger, Brittany" w:date="2025-01-07T15:08:00Z" w:initials="BC">
     <w:p>
       <w:pPr>
         <w:pStyle w:val="CommentText"/>
@@ -25483,7 +26248,7 @@
       </w:r>
     </w:p>
   </w:comment>
-  <w:comment w:id="372" w:author="Coppinger, Brittany" w:date="2025-01-07T15:12:00Z" w:initials="BC">
+  <w:comment w:id="442" w:author="Coppinger, Brittany" w:date="2025-01-07T15:12:00Z" w:initials="BC">
     <w:p>
       <w:pPr>
         <w:pStyle w:val="CommentText"/>
@@ -25499,7 +26264,7 @@
       </w:r>
     </w:p>
   </w:comment>
-  <w:comment w:id="377" w:author="Coppinger, Brittany" w:date="2025-04-03T14:53:00Z" w:initials="BC">
+  <w:comment w:id="447" w:author="Coppinger, Brittany" w:date="2025-04-03T14:53:00Z" w:initials="BC">
     <w:p>
       <w:pPr>
         <w:pStyle w:val="CommentText"/>
@@ -25515,7 +26280,7 @@
       </w:r>
     </w:p>
   </w:comment>
-  <w:comment w:id="382" w:author="Coppinger, Brittany" w:date="2025-04-10T14:31:00Z" w:initials="BC">
+  <w:comment w:id="452" w:author="Coppinger, Brittany" w:date="2025-04-10T14:31:00Z" w:initials="BC">
     <w:p>
       <w:pPr>
         <w:pStyle w:val="CommentText"/>
@@ -25531,7 +26296,7 @@
       </w:r>
     </w:p>
   </w:comment>
-  <w:comment w:id="383" w:author="Smith Vidaurre, Grace" w:date="2025-05-28T18:58:00Z" w:initials="GSV">
+  <w:comment w:id="453" w:author="Smith Vidaurre, Grace" w:date="2025-05-28T18:58:00Z" w:initials="GSV">
     <w:p>
       <w:r>
         <w:rPr>
@@ -25548,7 +26313,7 @@
       </w:r>
     </w:p>
   </w:comment>
-  <w:comment w:id="384" w:author="Smith Vidaurre, Grace" w:date="2025-05-28T19:00:00Z" w:initials="GSV">
+  <w:comment w:id="454" w:author="Smith Vidaurre, Grace" w:date="2025-05-28T19:00:00Z" w:initials="GSV">
     <w:p>
       <w:r>
         <w:rPr>
@@ -25565,7 +26330,7 @@
       </w:r>
     </w:p>
   </w:comment>
-  <w:comment w:id="386" w:author="Summer Eckhardt" w:date="2025-02-04T18:49:00Z" w:initials="SE">
+  <w:comment w:id="456" w:author="Summer Eckhardt" w:date="2025-02-04T18:49:00Z" w:initials="SE">
     <w:p>
       <w:pPr>
         <w:pStyle w:val="CommentText"/>
@@ -25581,7 +26346,7 @@
       </w:r>
     </w:p>
   </w:comment>
-  <w:comment w:id="389" w:author="Summer Eckhardt" w:date="2025-02-04T19:02:00Z" w:initials="SE">
+  <w:comment w:id="459" w:author="Summer Eckhardt" w:date="2025-02-04T19:02:00Z" w:initials="SE">
     <w:p>
       <w:pPr>
         <w:pStyle w:val="CommentText"/>
@@ -25597,7 +26362,7 @@
       </w:r>
     </w:p>
   </w:comment>
-  <w:comment w:id="393" w:author="Smith Vidaurre, Grace" w:date="2025-05-22T13:33:00Z" w:initials="GSV">
+  <w:comment w:id="463" w:author="Smith Vidaurre, Grace" w:date="2025-05-22T13:33:00Z" w:initials="GSV">
     <w:p>
       <w:r>
         <w:rPr>
@@ -25614,7 +26379,7 @@
       </w:r>
     </w:p>
   </w:comment>
-  <w:comment w:id="396" w:author="Smith Vidaurre, Grace" w:date="2025-05-22T13:23:00Z" w:initials="GSV">
+  <w:comment w:id="466" w:author="Smith Vidaurre, Grace" w:date="2025-05-22T13:23:00Z" w:initials="GSV">
     <w:p>
       <w:r>
         <w:rPr>
@@ -25631,7 +26396,7 @@
       </w:r>
     </w:p>
   </w:comment>
-  <w:comment w:id="401" w:author="Smith Vidaurre, Grace" w:date="2024-12-18T14:31:00Z" w:initials="GSV">
+  <w:comment w:id="471" w:author="Smith Vidaurre, Grace" w:date="2024-12-18T14:31:00Z" w:initials="GSV">
     <w:p>
       <w:r>
         <w:rPr>
@@ -25648,7 +26413,7 @@
       </w:r>
     </w:p>
   </w:comment>
-  <w:comment w:id="408" w:author="Smith Vidaurre, Grace" w:date="2024-12-18T15:30:00Z" w:initials="GSV">
+  <w:comment w:id="478" w:author="Smith Vidaurre, Grace" w:date="2024-12-18T15:30:00Z" w:initials="GSV">
     <w:p>
       <w:r>
         <w:rPr>
@@ -25665,7 +26430,7 @@
       </w:r>
     </w:p>
   </w:comment>
-  <w:comment w:id="410" w:author="Smith Vidaurre, Grace" w:date="2024-12-16T09:35:00Z" w:initials="GSV">
+  <w:comment w:id="480" w:author="Smith Vidaurre, Grace" w:date="2024-12-16T09:35:00Z" w:initials="GSV">
     <w:p>
       <w:r>
         <w:rPr>
@@ -25682,7 +26447,7 @@
       </w:r>
     </w:p>
   </w:comment>
-  <w:comment w:id="411" w:author="Smith Vidaurre, Grace" w:date="2024-12-16T09:41:00Z" w:initials="GSV">
+  <w:comment w:id="481" w:author="Smith Vidaurre, Grace" w:date="2024-12-16T09:41:00Z" w:initials="GSV">
     <w:p>
       <w:r>
         <w:rPr>
@@ -25699,7 +26464,7 @@
       </w:r>
     </w:p>
   </w:comment>
-  <w:comment w:id="412" w:author="Coppinger, Brittany" w:date="2024-12-16T14:51:00Z" w:initials="BC">
+  <w:comment w:id="482" w:author="Coppinger, Brittany" w:date="2024-12-16T14:51:00Z" w:initials="BC">
     <w:p>
       <w:pPr>
         <w:pStyle w:val="CommentText"/>
@@ -25809,9 +26574,9 @@
   <w15:commentEx w15:paraId="4A9493FD" w15:done="1"/>
   <w15:commentEx w15:paraId="40FE1D1D" w15:paraIdParent="4A9493FD" w15:done="1"/>
   <w15:commentEx w15:paraId="6FAFB0F5" w15:done="1"/>
-  <w15:commentEx w15:paraId="42249586" w15:done="0"/>
-  <w15:commentEx w15:paraId="10890C86" w15:done="0"/>
-  <w15:commentEx w15:paraId="74B23829" w15:done="0"/>
+  <w15:commentEx w15:paraId="42249586" w15:done="1"/>
+  <w15:commentEx w15:paraId="10890C86" w15:done="1"/>
+  <w15:commentEx w15:paraId="74B23829" w15:done="1"/>
   <w15:commentEx w15:paraId="742161AC" w15:done="0"/>
   <w15:commentEx w15:paraId="18E81EC9" w15:done="0"/>
   <w15:commentEx w15:paraId="1BF1C2B0" w15:paraIdParent="18E81EC9" w15:done="0"/>

</xml_diff>

<commit_message>
Restructuring Methods: in progress
</commit_message>
<xml_diff>
--- a/drafts/paRsynth_methods_draft.docx
+++ b/drafts/paRsynth_methods_draft.docx
@@ -20814,6 +20814,7 @@
         <w:pStyle w:val="NoSpacing"/>
         <w:spacing w:line="480" w:lineRule="auto"/>
         <w:rPr>
+          <w:ins w:id="83" w:author="Smith Vidaurre, Grace" w:date="2025-06-16T16:54:00Z" w16du:dateUtc="2025-06-16T20:54:00Z"/>
           <w:rFonts w:ascii="Arial" w:hAnsi="Arial" w:cs="Arial"/>
         </w:rPr>
       </w:pPr>
@@ -20847,200 +20848,423 @@
         </w:rPr>
         <w:t xml:space="preserve"> how </w:t>
       </w:r>
-      <w:r>
-        <w:rPr>
-          <w:rFonts w:ascii="Arial" w:hAnsi="Arial" w:cs="Arial"/>
-        </w:rPr>
-        <w:t>accurately</w:t>
-      </w:r>
-      <w:r>
-        <w:rPr>
-          <w:rFonts w:ascii="Arial" w:hAnsi="Arial" w:cs="Arial"/>
-        </w:rPr>
-        <w:t xml:space="preserve"> </w:t>
-      </w:r>
-      <w:r>
-        <w:rPr>
-          <w:rFonts w:ascii="Arial" w:hAnsi="Arial" w:cs="Arial"/>
-        </w:rPr>
-        <w:t xml:space="preserve">varying amounts of group and individual </w:t>
-      </w:r>
-      <w:r>
-        <w:rPr>
-          <w:rFonts w:ascii="Arial" w:hAnsi="Arial" w:cs="Arial"/>
-        </w:rPr>
-        <w:t xml:space="preserve">information could be recovered </w:t>
-      </w:r>
-      <w:r>
-        <w:rPr>
-          <w:rFonts w:ascii="Arial" w:hAnsi="Arial" w:cs="Arial"/>
-        </w:rPr>
-        <w:t>from synthetic signals,</w:t>
-      </w:r>
-      <w:r>
-        <w:rPr>
-          <w:rFonts w:ascii="Arial" w:hAnsi="Arial" w:cs="Arial"/>
-        </w:rPr>
-        <w:t xml:space="preserve"> we created </w:t>
-      </w:r>
-      <w:r>
-        <w:rPr>
-          <w:rFonts w:ascii="Arial" w:hAnsi="Arial" w:cs="Arial"/>
-        </w:rPr>
-        <w:t xml:space="preserve">synthetic data sets across 16 treatments that varied over social environment characteristics and information encoding rules. </w:t>
-      </w:r>
-      <w:commentRangeStart w:id="83"/>
-      <w:r>
-        <w:rPr>
-          <w:rFonts w:ascii="Arial" w:hAnsi="Arial" w:cs="Arial"/>
-        </w:rPr>
-        <w:t>We varied social environment characteristics represented information signaling changes that happen in socially sparse vs socially dense signaling environments</w:t>
-      </w:r>
-      <w:commentRangeEnd w:id="83"/>
-      <w:r>
-        <w:rPr>
-          <w:rStyle w:val="CommentReference"/>
-        </w:rPr>
-        <w:commentReference w:id="83"/>
-      </w:r>
-      <w:r>
-        <w:rPr>
-          <w:rFonts w:ascii="Arial" w:hAnsi="Arial" w:cs="Arial"/>
-        </w:rPr>
-        <w:t xml:space="preserve">. We achieved this by creating four social conditions: 2 groups with 2 individuals per group, 4 groups with 4 individuals per group, 6 groups with 6 individuals per group, and 8 groups with 8 individuals per group. We also varied the proportion of group information to individual information encoded in the signal, with four categories: 0 (representing all individual information and no group information), 1/3, 2/3, and 1 (representing all group information and no individual information. We iterated over each treatment 10 times, generating 10 unique synthetic datasets per treatment. </w:t>
-      </w:r>
-    </w:p>
-    <w:p>
-      <w:pPr>
-        <w:pStyle w:val="NoSpacing"/>
-        <w:spacing w:line="480" w:lineRule="auto"/>
-        <w:rPr>
-          <w:rFonts w:ascii="Arial" w:hAnsi="Arial" w:cs="Arial"/>
-        </w:rPr>
-      </w:pPr>
-      <w:r>
-        <w:rPr>
-          <w:rFonts w:ascii="Arial" w:hAnsi="Arial" w:cs="Arial"/>
-        </w:rPr>
-        <w:tab/>
-        <w:t xml:space="preserve">Once these synthetic datasets were created, we used traditional bioacoustics tools to decode information encoded at the group and individual level. Similar to the datasets above, we performed SPCC. We also calculated the edit distance for the original strings. After these calculations, we performed Multidimensional Scaling on both </w:t>
-      </w:r>
-      <w:r>
-        <w:rPr>
-          <w:rFonts w:ascii="Arial" w:hAnsi="Arial" w:cs="Arial"/>
-        </w:rPr>
-        <w:lastRenderedPageBreak/>
-        <w:t xml:space="preserve">the SPCC and edit distance matrices, then performed k-means clustering, randomly selecting 1 call per individual per group, to ensure that call exemplars per class matched between social levels. From this, we were able to calculate the accuracy of detecting information at the group and individual levels from vocalizations represented as character strings (edit distance pipeline) or synthetic audio files (tradition </w:t>
-      </w:r>
-      <w:r>
-        <w:rPr>
-          <w:rFonts w:ascii="Arial" w:hAnsi="Arial" w:cs="Arial"/>
-        </w:rPr>
-        <w:t>bioacoustics</w:t>
-      </w:r>
-      <w:r>
-        <w:rPr>
-          <w:rFonts w:ascii="Arial" w:hAnsi="Arial" w:cs="Arial"/>
-        </w:rPr>
-        <w:t xml:space="preserve"> </w:t>
-      </w:r>
-      <w:r>
-        <w:rPr>
-          <w:rFonts w:ascii="Arial" w:hAnsi="Arial" w:cs="Arial"/>
-        </w:rPr>
-        <w:t>pipeline</w:t>
-      </w:r>
-      <w:r>
-        <w:rPr>
-          <w:rFonts w:ascii="Arial" w:hAnsi="Arial" w:cs="Arial"/>
-        </w:rPr>
-        <w:t xml:space="preserve"> SPCC). Edit distance is a baseline for information detection because the strings are the original place where information was encoded at either social level. We can then compare the SPCC accuracy to edit distance, to assess how well we can detect the information originally encoded from the audio file representation.  </w:t>
-      </w:r>
-    </w:p>
-    <w:p>
-      <w:pPr>
-        <w:pStyle w:val="NoSpacing"/>
-        <w:spacing w:line="480" w:lineRule="auto"/>
-        <w:rPr>
-          <w:ins w:id="84" w:author="Smith Vidaurre, Grace" w:date="2025-05-28T19:06:00Z" w16du:dateUtc="2025-05-28T23:06:00Z"/>
-          <w:rFonts w:ascii="Arial" w:hAnsi="Arial" w:cs="Arial"/>
-        </w:rPr>
-      </w:pPr>
-      <w:r>
-        <w:rPr>
-          <w:rFonts w:ascii="Arial" w:hAnsi="Arial" w:cs="Arial"/>
-        </w:rPr>
-        <w:tab/>
-        <w:t>TKTK paragraph about effect size calculations</w:t>
-      </w:r>
-      <w:r>
-        <w:rPr>
-          <w:rFonts w:ascii="Arial" w:hAnsi="Arial" w:cs="Arial"/>
-        </w:rPr>
-        <w:t xml:space="preserve">. Include package information in R. Make sure to address the warnings in the code output and the density plots (supplemental) that address these. </w:t>
-      </w:r>
-    </w:p>
-    <w:p>
-      <w:pPr>
-        <w:pStyle w:val="NoSpacing"/>
-        <w:spacing w:line="480" w:lineRule="auto"/>
-        <w:rPr>
-          <w:ins w:id="85" w:author="Smith Vidaurre, Grace" w:date="2025-05-28T19:06:00Z" w16du:dateUtc="2025-05-28T23:06:00Z"/>
-          <w:rFonts w:ascii="Arial" w:hAnsi="Arial" w:cs="Arial"/>
-        </w:rPr>
-      </w:pPr>
-    </w:p>
-    <w:p>
-      <w:pPr>
-        <w:spacing w:line="480" w:lineRule="auto"/>
-        <w:ind w:firstLine="720"/>
-        <w:rPr>
-          <w:ins w:id="86" w:author="Smith Vidaurre, Grace" w:date="2025-05-28T19:06:00Z" w16du:dateUtc="2025-05-28T23:06:00Z"/>
-          <w:rFonts w:ascii="Arial" w:hAnsi="Arial" w:cs="Arial"/>
-        </w:rPr>
-      </w:pPr>
-      <w:ins w:id="87" w:author="Smith Vidaurre, Grace" w:date="2025-05-28T19:06:00Z" w16du:dateUtc="2025-05-28T23:06:00Z">
-        <w:r>
-          <w:rPr>
-            <w:rFonts w:ascii="Arial" w:hAnsi="Arial" w:cs="Arial"/>
-          </w:rPr>
-          <w:t xml:space="preserve">TKTK integrate </w:t>
-        </w:r>
-        <w:commentRangeStart w:id="88"/>
-        <w:commentRangeStart w:id="89"/>
-        <w:commentRangeStart w:id="90"/>
-        <w:r>
-          <w:rPr>
-            <w:rFonts w:ascii="Arial" w:hAnsi="Arial" w:cs="Arial"/>
-          </w:rPr>
-          <w:t>We expected to identify clustering accuracies that were generally lower for spectrographic cross-correlation than the edit distance, since spectrographic cross-correlation was performed on strings transformed into synthetic audio files, which may have led to losses of the original information or added noise</w:t>
-        </w:r>
-        <w:commentRangeEnd w:id="88"/>
-        <w:r>
-          <w:rPr>
-            <w:rStyle w:val="CommentReference"/>
-          </w:rPr>
-          <w:commentReference w:id="88"/>
-        </w:r>
-        <w:commentRangeEnd w:id="89"/>
-        <w:r>
-          <w:rPr>
-            <w:rStyle w:val="CommentReference"/>
-          </w:rPr>
-          <w:commentReference w:id="89"/>
-        </w:r>
-        <w:commentRangeEnd w:id="90"/>
-        <w:r>
-          <w:rPr>
-            <w:rStyle w:val="CommentReference"/>
-          </w:rPr>
-          <w:commentReference w:id="90"/>
-        </w:r>
-        <w:r>
-          <w:rPr>
-            <w:rFonts w:ascii="Arial" w:hAnsi="Arial" w:cs="Arial"/>
-          </w:rPr>
-          <w:t>. However, we generally expected to identify medium or small effect sizes for these differences in information detection by each method that did not outweigh the effect sizes calculated for clustering accuracy between different forms of identity information for the same measurement (spectrographic cross-correlation or the edit distance).</w:t>
+      <w:ins w:id="84" w:author="Smith Vidaurre, Grace" w:date="2025-06-16T16:35:00Z" w16du:dateUtc="2025-06-16T20:35:00Z">
+        <w:r>
+          <w:rPr>
+            <w:rFonts w:ascii="Arial" w:hAnsi="Arial" w:cs="Arial"/>
+          </w:rPr>
+          <w:t>well we could detect identity in</w:t>
+        </w:r>
+      </w:ins>
+      <w:ins w:id="85" w:author="Smith Vidaurre, Grace" w:date="2025-06-16T16:36:00Z" w16du:dateUtc="2025-06-16T20:36:00Z">
+        <w:r>
+          <w:rPr>
+            <w:rFonts w:ascii="Arial" w:hAnsi="Arial" w:cs="Arial"/>
+          </w:rPr>
+          <w:t xml:space="preserve">formation in the synthetic vocal identity signals, we </w:t>
+        </w:r>
+        <w:r>
+          <w:rPr>
+            <w:rFonts w:ascii="Arial" w:hAnsi="Arial" w:cs="Arial"/>
+          </w:rPr>
+          <w:t xml:space="preserve">ran </w:t>
+        </w:r>
+        <w:r>
+          <w:rPr>
+            <w:rFonts w:ascii="Arial" w:hAnsi="Arial" w:cs="Arial"/>
+          </w:rPr>
+          <w:t xml:space="preserve">simulation experiments over </w:t>
+        </w:r>
+        <w:r>
+          <w:rPr>
+            <w:rFonts w:ascii="Arial" w:hAnsi="Arial" w:cs="Arial"/>
+          </w:rPr>
+          <w:t xml:space="preserve">varying </w:t>
+        </w:r>
+      </w:ins>
+      <w:ins w:id="86" w:author="Smith Vidaurre, Grace" w:date="2025-06-16T16:37:00Z" w16du:dateUtc="2025-06-16T20:37:00Z">
+        <w:r>
+          <w:rPr>
+            <w:rFonts w:ascii="Arial" w:hAnsi="Arial" w:cs="Arial"/>
+          </w:rPr>
+          <w:t xml:space="preserve">proportions of identity </w:t>
+        </w:r>
+        <w:r>
+          <w:rPr>
+            <w:rFonts w:ascii="Arial" w:hAnsi="Arial" w:cs="Arial"/>
+          </w:rPr>
+          <w:t>information encod</w:t>
+        </w:r>
+        <w:r>
+          <w:rPr>
+            <w:rFonts w:ascii="Arial" w:hAnsi="Arial" w:cs="Arial"/>
+          </w:rPr>
+          <w:t>ed at the individual and group levels, as well as over varying sizes of</w:t>
+        </w:r>
+        <w:r>
+          <w:rPr>
+            <w:rFonts w:ascii="Arial" w:hAnsi="Arial" w:cs="Arial"/>
+          </w:rPr>
+          <w:t xml:space="preserve"> signal </w:t>
+        </w:r>
+      </w:ins>
+      <w:ins w:id="87" w:author="Smith Vidaurre, Grace" w:date="2025-06-16T16:38:00Z" w16du:dateUtc="2025-06-16T20:38:00Z">
+        <w:r>
+          <w:rPr>
+            <w:rFonts w:ascii="Arial" w:hAnsi="Arial" w:cs="Arial"/>
+          </w:rPr>
+          <w:t>datasets</w:t>
+        </w:r>
+      </w:ins>
+      <w:ins w:id="88" w:author="Smith Vidaurre, Grace" w:date="2025-06-16T16:37:00Z" w16du:dateUtc="2025-06-16T20:37:00Z">
+        <w:r>
+          <w:rPr>
+            <w:rFonts w:ascii="Arial" w:hAnsi="Arial" w:cs="Arial"/>
+          </w:rPr>
+          <w:t>.</w:t>
+        </w:r>
+      </w:ins>
+      <w:ins w:id="89" w:author="Smith Vidaurre, Grace" w:date="2025-06-16T16:38:00Z" w16du:dateUtc="2025-06-16T20:38:00Z">
+        <w:r>
+          <w:rPr>
+            <w:rFonts w:ascii="Arial" w:hAnsi="Arial" w:cs="Arial"/>
+          </w:rPr>
+          <w:t xml:space="preserve"> We designed </w:t>
+        </w:r>
+      </w:ins>
+      <w:ins w:id="90" w:author="Smith Vidaurre, Grace" w:date="2025-06-16T16:42:00Z" w16du:dateUtc="2025-06-16T20:42:00Z">
+        <w:r>
+          <w:rPr>
+            <w:rFonts w:ascii="Arial" w:hAnsi="Arial" w:cs="Arial"/>
+          </w:rPr>
+          <w:t>our</w:t>
+        </w:r>
+      </w:ins>
+      <w:ins w:id="91" w:author="Smith Vidaurre, Grace" w:date="2025-06-16T16:38:00Z" w16du:dateUtc="2025-06-16T20:38:00Z">
+        <w:r>
+          <w:rPr>
+            <w:rFonts w:ascii="Arial" w:hAnsi="Arial" w:cs="Arial"/>
+          </w:rPr>
+          <w:t xml:space="preserve"> simulation experiments to manipulate the relative proportions of information encoding and signal dataset sizes because we expected both</w:t>
+        </w:r>
+      </w:ins>
+      <w:ins w:id="92" w:author="Smith Vidaurre, Grace" w:date="2025-06-16T16:39:00Z" w16du:dateUtc="2025-06-16T20:39:00Z">
+        <w:r>
+          <w:rPr>
+            <w:rFonts w:ascii="Arial" w:hAnsi="Arial" w:cs="Arial"/>
+          </w:rPr>
+          <w:t xml:space="preserve"> </w:t>
+        </w:r>
+      </w:ins>
+      <w:ins w:id="93" w:author="Smith Vidaurre, Grace" w:date="2025-06-16T16:38:00Z" w16du:dateUtc="2025-06-16T20:38:00Z">
+        <w:r>
+          <w:rPr>
+            <w:rFonts w:ascii="Arial" w:hAnsi="Arial" w:cs="Arial"/>
+          </w:rPr>
+          <w:t xml:space="preserve">parameters to impact </w:t>
+        </w:r>
+        <w:r>
+          <w:rPr>
+            <w:rFonts w:ascii="Arial" w:hAnsi="Arial" w:cs="Arial"/>
+          </w:rPr>
+          <w:t>our detection of identity information in the</w:t>
+        </w:r>
+      </w:ins>
+      <w:ins w:id="94" w:author="Smith Vidaurre, Grace" w:date="2025-06-16T16:39:00Z" w16du:dateUtc="2025-06-16T20:39:00Z">
+        <w:r>
+          <w:rPr>
+            <w:rFonts w:ascii="Arial" w:hAnsi="Arial" w:cs="Arial"/>
+          </w:rPr>
+          <w:t xml:space="preserve"> synthetic vocalizations using traditional bioacoustics analyses. </w:t>
+        </w:r>
+      </w:ins>
+      <w:ins w:id="95" w:author="Smith Vidaurre, Grace" w:date="2025-06-16T16:42:00Z" w16du:dateUtc="2025-06-16T20:42:00Z">
+        <w:r>
+          <w:rPr>
+            <w:rFonts w:ascii="Arial" w:hAnsi="Arial" w:cs="Arial"/>
+          </w:rPr>
+          <w:t xml:space="preserve">We expected </w:t>
+        </w:r>
+        <w:r>
+          <w:rPr>
+            <w:rFonts w:ascii="Arial" w:hAnsi="Arial" w:cs="Arial"/>
+          </w:rPr>
+          <w:t>the hig</w:t>
+        </w:r>
+      </w:ins>
+      <w:ins w:id="96" w:author="Smith Vidaurre, Grace" w:date="2025-06-16T16:43:00Z" w16du:dateUtc="2025-06-16T20:43:00Z">
+        <w:r>
+          <w:rPr>
+            <w:rFonts w:ascii="Arial" w:hAnsi="Arial" w:cs="Arial"/>
+          </w:rPr>
+          <w:t>hest accuracies of information detection at the social level</w:t>
+        </w:r>
+        <w:r>
+          <w:rPr>
+            <w:rFonts w:ascii="Arial" w:hAnsi="Arial" w:cs="Arial"/>
+          </w:rPr>
+          <w:t xml:space="preserve"> at which we had originally encoded more information, and we also expected </w:t>
+        </w:r>
+        <w:r>
+          <w:rPr>
+            <w:rFonts w:ascii="Arial" w:hAnsi="Arial" w:cs="Arial"/>
+          </w:rPr>
+          <w:t xml:space="preserve">it would be more difficult to detect </w:t>
+        </w:r>
+        <w:r>
+          <w:rPr>
+            <w:rFonts w:ascii="Arial" w:hAnsi="Arial" w:cs="Arial"/>
+          </w:rPr>
+          <w:t xml:space="preserve">information with high accuracy when </w:t>
+        </w:r>
+        <w:r>
+          <w:rPr>
+            <w:rFonts w:ascii="Arial" w:hAnsi="Arial" w:cs="Arial"/>
+          </w:rPr>
+          <w:t xml:space="preserve">we </w:t>
+        </w:r>
+      </w:ins>
+      <w:ins w:id="97" w:author="Smith Vidaurre, Grace" w:date="2025-06-16T16:44:00Z" w16du:dateUtc="2025-06-16T20:44:00Z">
+        <w:r>
+          <w:rPr>
+            <w:rFonts w:ascii="Arial" w:hAnsi="Arial" w:cs="Arial"/>
+          </w:rPr>
+          <w:t>had originally encoded information at both the group and individual levels.</w:t>
+        </w:r>
+        <w:r>
+          <w:rPr>
+            <w:rFonts w:ascii="Arial" w:hAnsi="Arial" w:cs="Arial"/>
+          </w:rPr>
+          <w:t xml:space="preserve"> </w:t>
+        </w:r>
+      </w:ins>
+      <w:ins w:id="98" w:author="Smith Vidaurre, Grace" w:date="2025-06-16T16:55:00Z" w16du:dateUtc="2025-06-16T20:55:00Z">
+        <w:r>
+          <w:rPr>
+            <w:rFonts w:ascii="Arial" w:hAnsi="Arial" w:cs="Arial"/>
+          </w:rPr>
+          <w:t>In our experiments, w</w:t>
+        </w:r>
+        <w:r>
+          <w:rPr>
+            <w:rFonts w:ascii="Arial" w:hAnsi="Arial" w:cs="Arial"/>
+          </w:rPr>
+          <w:t xml:space="preserve">e varied the </w:t>
+        </w:r>
+        <w:r>
+          <w:rPr>
+            <w:rFonts w:ascii="Arial" w:hAnsi="Arial" w:cs="Arial"/>
+          </w:rPr>
+          <w:t xml:space="preserve">relative </w:t>
+        </w:r>
+        <w:r>
+          <w:rPr>
+            <w:rFonts w:ascii="Arial" w:hAnsi="Arial" w:cs="Arial"/>
+          </w:rPr>
+          <w:t>proportion</w:t>
+        </w:r>
+        <w:r>
+          <w:rPr>
+            <w:rFonts w:ascii="Arial" w:hAnsi="Arial" w:cs="Arial"/>
+          </w:rPr>
+          <w:t>s</w:t>
+        </w:r>
+        <w:r>
+          <w:rPr>
+            <w:rFonts w:ascii="Arial" w:hAnsi="Arial" w:cs="Arial"/>
+          </w:rPr>
+          <w:t xml:space="preserve"> of group to individual information encoded in </w:t>
+        </w:r>
+        <w:r>
+          <w:rPr>
+            <w:rFonts w:ascii="Arial" w:hAnsi="Arial" w:cs="Arial"/>
+          </w:rPr>
+          <w:t>each string over</w:t>
+        </w:r>
+        <w:r>
+          <w:rPr>
+            <w:rFonts w:ascii="Arial" w:hAnsi="Arial" w:cs="Arial"/>
+          </w:rPr>
+          <w:t xml:space="preserve"> four </w:t>
+        </w:r>
+        <w:r>
+          <w:rPr>
+            <w:rFonts w:ascii="Arial" w:hAnsi="Arial" w:cs="Arial"/>
+          </w:rPr>
+          <w:t>treatments</w:t>
+        </w:r>
+        <w:r>
+          <w:rPr>
+            <w:rFonts w:ascii="Arial" w:hAnsi="Arial" w:cs="Arial"/>
+          </w:rPr>
+          <w:t>:</w:t>
+        </w:r>
+        <w:r>
+          <w:rPr>
+            <w:rFonts w:ascii="Arial" w:hAnsi="Arial" w:cs="Arial"/>
+          </w:rPr>
+          <w:t xml:space="preserve"> (1)</w:t>
+        </w:r>
+        <w:r>
+          <w:rPr>
+            <w:rFonts w:ascii="Arial" w:hAnsi="Arial" w:cs="Arial"/>
+          </w:rPr>
+          <w:t xml:space="preserve"> 0 (representing all individual information and no group information), 1/3</w:t>
+        </w:r>
+        <w:r>
+          <w:rPr>
+            <w:rFonts w:ascii="Arial" w:hAnsi="Arial" w:cs="Arial"/>
+          </w:rPr>
+          <w:t xml:space="preserve"> (more </w:t>
+        </w:r>
+      </w:ins>
+      <w:ins w:id="99" w:author="Smith Vidaurre, Grace" w:date="2025-06-16T16:56:00Z" w16du:dateUtc="2025-06-16T20:56:00Z">
+        <w:r>
+          <w:rPr>
+            <w:rFonts w:ascii="Arial" w:hAnsi="Arial" w:cs="Arial"/>
+          </w:rPr>
+          <w:t>individual than group information)</w:t>
+        </w:r>
+      </w:ins>
+      <w:ins w:id="100" w:author="Smith Vidaurre, Grace" w:date="2025-06-16T16:55:00Z" w16du:dateUtc="2025-06-16T20:55:00Z">
+        <w:r>
+          <w:rPr>
+            <w:rFonts w:ascii="Arial" w:hAnsi="Arial" w:cs="Arial"/>
+          </w:rPr>
+          <w:t>, 2/3</w:t>
+        </w:r>
+      </w:ins>
+      <w:ins w:id="101" w:author="Smith Vidaurre, Grace" w:date="2025-06-16T16:56:00Z" w16du:dateUtc="2025-06-16T20:56:00Z">
+        <w:r>
+          <w:rPr>
+            <w:rFonts w:ascii="Arial" w:hAnsi="Arial" w:cs="Arial"/>
+          </w:rPr>
+          <w:t xml:space="preserve"> (</w:t>
+        </w:r>
+        <w:r>
+          <w:rPr>
+            <w:rFonts w:ascii="Arial" w:hAnsi="Arial" w:cs="Arial"/>
+          </w:rPr>
+          <w:t>more group than individual information</w:t>
+        </w:r>
+        <w:r>
+          <w:rPr>
+            <w:rFonts w:ascii="Arial" w:hAnsi="Arial" w:cs="Arial"/>
+          </w:rPr>
+          <w:t>)</w:t>
+        </w:r>
+      </w:ins>
+      <w:ins w:id="102" w:author="Smith Vidaurre, Grace" w:date="2025-06-16T16:55:00Z" w16du:dateUtc="2025-06-16T20:55:00Z">
+        <w:r>
+          <w:rPr>
+            <w:rFonts w:ascii="Arial" w:hAnsi="Arial" w:cs="Arial"/>
+          </w:rPr>
+          <w:t>, and 1 (all group and no individual information</w:t>
+        </w:r>
+      </w:ins>
+      <w:ins w:id="103" w:author="Smith Vidaurre, Grace" w:date="2025-06-16T16:56:00Z" w16du:dateUtc="2025-06-16T20:56:00Z">
+        <w:r>
+          <w:rPr>
+            <w:rFonts w:ascii="Arial" w:hAnsi="Arial" w:cs="Arial"/>
+          </w:rPr>
+          <w:t>)</w:t>
+        </w:r>
+      </w:ins>
+      <w:ins w:id="104" w:author="Smith Vidaurre, Grace" w:date="2025-06-16T16:55:00Z" w16du:dateUtc="2025-06-16T20:55:00Z">
+        <w:r>
+          <w:rPr>
+            <w:rFonts w:ascii="Arial" w:hAnsi="Arial" w:cs="Arial"/>
+          </w:rPr>
+          <w:t>.</w:t>
+        </w:r>
+      </w:ins>
+      <w:ins w:id="105" w:author="Smith Vidaurre, Grace" w:date="2025-06-16T16:56:00Z" w16du:dateUtc="2025-06-16T20:56:00Z">
+        <w:r>
+          <w:rPr>
+            <w:rFonts w:ascii="Arial" w:hAnsi="Arial" w:cs="Arial"/>
+          </w:rPr>
+          <w:t xml:space="preserve"> We </w:t>
+        </w:r>
+        <w:r>
+          <w:rPr>
+            <w:rFonts w:ascii="Arial" w:hAnsi="Arial" w:cs="Arial"/>
+          </w:rPr>
+          <w:t>used a total length of 6 characters in the overall charact</w:t>
+        </w:r>
+      </w:ins>
+      <w:ins w:id="106" w:author="Smith Vidaurre, Grace" w:date="2025-06-16T16:57:00Z" w16du:dateUtc="2025-06-16T20:57:00Z">
+        <w:r>
+          <w:rPr>
+            <w:rFonts w:ascii="Arial" w:hAnsi="Arial" w:cs="Arial"/>
+          </w:rPr>
+          <w:t xml:space="preserve">er string for encoding information at one or both social levels, such that these treatments </w:t>
+        </w:r>
+        <w:r>
+          <w:rPr>
+            <w:rFonts w:ascii="Arial" w:hAnsi="Arial" w:cs="Arial"/>
+          </w:rPr>
+          <w:lastRenderedPageBreak/>
+          <w:t>represented</w:t>
+        </w:r>
+        <w:r>
+          <w:rPr>
+            <w:rFonts w:ascii="Arial" w:hAnsi="Arial" w:cs="Arial"/>
+          </w:rPr>
+          <w:t xml:space="preserve"> 6 characters devoted to individual information, 4 characters for individual and 2 characters for group information, </w:t>
+        </w:r>
+        <w:r>
+          <w:rPr>
+            <w:rFonts w:ascii="Arial" w:hAnsi="Arial" w:cs="Arial"/>
+          </w:rPr>
+          <w:t>2</w:t>
+        </w:r>
+        <w:r>
+          <w:rPr>
+            <w:rFonts w:ascii="Arial" w:hAnsi="Arial" w:cs="Arial"/>
+          </w:rPr>
+          <w:t xml:space="preserve"> characters for individual and </w:t>
+        </w:r>
+        <w:r>
+          <w:rPr>
+            <w:rFonts w:ascii="Arial" w:hAnsi="Arial" w:cs="Arial"/>
+          </w:rPr>
+          <w:t>4</w:t>
+        </w:r>
+        <w:r>
+          <w:rPr>
+            <w:rFonts w:ascii="Arial" w:hAnsi="Arial" w:cs="Arial"/>
+          </w:rPr>
+          <w:t xml:space="preserve"> characters for group information,</w:t>
+        </w:r>
+        <w:r>
+          <w:rPr>
+            <w:rFonts w:ascii="Arial" w:hAnsi="Arial" w:cs="Arial"/>
+          </w:rPr>
+          <w:t xml:space="preserve"> </w:t>
+        </w:r>
+      </w:ins>
+      <w:ins w:id="107" w:author="Smith Vidaurre, Grace" w:date="2025-06-16T16:58:00Z" w16du:dateUtc="2025-06-16T20:58:00Z">
+        <w:r>
+          <w:rPr>
+            <w:rFonts w:ascii="Arial" w:hAnsi="Arial" w:cs="Arial"/>
+          </w:rPr>
+          <w:t xml:space="preserve">or </w:t>
+        </w:r>
+      </w:ins>
+      <w:ins w:id="108" w:author="Smith Vidaurre, Grace" w:date="2025-06-16T16:57:00Z" w16du:dateUtc="2025-06-16T20:57:00Z">
+        <w:r>
+          <w:rPr>
+            <w:rFonts w:ascii="Arial" w:hAnsi="Arial" w:cs="Arial"/>
+          </w:rPr>
+          <w:t>6 characters devoted to group information</w:t>
+        </w:r>
+      </w:ins>
+      <w:ins w:id="109" w:author="Smith Vidaurre, Grace" w:date="2025-06-16T16:58:00Z" w16du:dateUtc="2025-06-16T20:58:00Z">
+        <w:r>
+          <w:rPr>
+            <w:rFonts w:ascii="Arial" w:hAnsi="Arial" w:cs="Arial"/>
+          </w:rPr>
+          <w:t>.</w:t>
         </w:r>
       </w:ins>
     </w:p>
@@ -21048,22 +21272,1377 @@
       <w:pPr>
         <w:pStyle w:val="NoSpacing"/>
         <w:spacing w:line="480" w:lineRule="auto"/>
-        <w:rPr>
-          <w:rFonts w:ascii="Arial" w:hAnsi="Arial" w:cs="Arial"/>
-        </w:rPr>
-      </w:pPr>
+        <w:ind w:firstLine="720"/>
+        <w:rPr>
+          <w:ins w:id="110" w:author="Smith Vidaurre, Grace" w:date="2025-06-16T16:43:00Z" w16du:dateUtc="2025-06-16T20:43:00Z"/>
+          <w:rFonts w:ascii="Arial" w:hAnsi="Arial" w:cs="Arial"/>
+        </w:rPr>
+        <w:pPrChange w:id="111" w:author="Smith Vidaurre, Grace" w:date="2025-06-16T17:07:00Z" w16du:dateUtc="2025-06-16T21:07:00Z">
+          <w:pPr>
+            <w:pStyle w:val="NoSpacing"/>
+            <w:spacing w:line="480" w:lineRule="auto"/>
+          </w:pPr>
+        </w:pPrChange>
+      </w:pPr>
+      <w:ins w:id="112" w:author="Smith Vidaurre, Grace" w:date="2025-06-16T16:44:00Z" w16du:dateUtc="2025-06-16T20:44:00Z">
+        <w:r>
+          <w:rPr>
+            <w:rFonts w:ascii="Arial" w:hAnsi="Arial" w:cs="Arial"/>
+          </w:rPr>
+          <w:t xml:space="preserve">We also expected that the size of the signal datasets that we generated would impact our information detection accuracy, </w:t>
+        </w:r>
+      </w:ins>
+      <w:ins w:id="113" w:author="Smith Vidaurre, Grace" w:date="2025-06-16T16:46:00Z" w16du:dateUtc="2025-06-16T20:46:00Z">
+        <w:r>
+          <w:rPr>
+            <w:rFonts w:ascii="Arial" w:hAnsi="Arial" w:cs="Arial"/>
+          </w:rPr>
+          <w:t>as the</w:t>
+        </w:r>
+      </w:ins>
+      <w:ins w:id="114" w:author="Smith Vidaurre, Grace" w:date="2025-06-16T16:45:00Z" w16du:dateUtc="2025-06-16T20:45:00Z">
+        <w:r>
+          <w:rPr>
+            <w:rFonts w:ascii="Arial" w:hAnsi="Arial" w:cs="Arial"/>
+          </w:rPr>
+          <w:t xml:space="preserve"> likelihood</w:t>
+        </w:r>
+      </w:ins>
+      <w:ins w:id="115" w:author="Smith Vidaurre, Grace" w:date="2025-06-16T16:46:00Z" w16du:dateUtc="2025-06-16T20:46:00Z">
+        <w:r>
+          <w:rPr>
+            <w:rFonts w:ascii="Arial" w:hAnsi="Arial" w:cs="Arial"/>
+          </w:rPr>
+          <w:t xml:space="preserve"> </w:t>
+        </w:r>
+      </w:ins>
+      <w:ins w:id="116" w:author="Smith Vidaurre, Grace" w:date="2025-06-16T16:45:00Z" w16du:dateUtc="2025-06-16T20:45:00Z">
+        <w:r>
+          <w:rPr>
+            <w:rFonts w:ascii="Arial" w:hAnsi="Arial" w:cs="Arial"/>
+          </w:rPr>
+          <w:t xml:space="preserve">of </w:t>
+        </w:r>
+      </w:ins>
+      <w:ins w:id="117" w:author="Smith Vidaurre, Grace" w:date="2025-06-16T16:46:00Z" w16du:dateUtc="2025-06-16T20:46:00Z">
+        <w:r>
+          <w:rPr>
+            <w:rFonts w:ascii="Arial" w:hAnsi="Arial" w:cs="Arial"/>
+          </w:rPr>
+          <w:t xml:space="preserve">generating </w:t>
+        </w:r>
+        <w:r>
+          <w:rPr>
+            <w:rFonts w:ascii="Arial" w:hAnsi="Arial" w:cs="Arial"/>
+          </w:rPr>
+          <w:t>stochastically similar</w:t>
+        </w:r>
+        <w:r>
+          <w:rPr>
+            <w:rFonts w:ascii="Arial" w:hAnsi="Arial" w:cs="Arial"/>
+          </w:rPr>
+          <w:t xml:space="preserve"> </w:t>
+        </w:r>
+      </w:ins>
+      <w:ins w:id="118" w:author="Smith Vidaurre, Grace" w:date="2025-06-16T16:45:00Z" w16du:dateUtc="2025-06-16T20:45:00Z">
+        <w:r>
+          <w:rPr>
+            <w:rFonts w:ascii="Arial" w:hAnsi="Arial" w:cs="Arial"/>
+          </w:rPr>
+          <w:t>vocalization</w:t>
+        </w:r>
+      </w:ins>
+      <w:ins w:id="119" w:author="Smith Vidaurre, Grace" w:date="2025-06-16T16:46:00Z" w16du:dateUtc="2025-06-16T20:46:00Z">
+        <w:r>
+          <w:rPr>
+            <w:rFonts w:ascii="Arial" w:hAnsi="Arial" w:cs="Arial"/>
+          </w:rPr>
+          <w:t>s should increase with the size of a given dataset</w:t>
+        </w:r>
+      </w:ins>
+      <w:ins w:id="120" w:author="Smith Vidaurre, Grace" w:date="2025-06-16T16:47:00Z" w16du:dateUtc="2025-06-16T20:47:00Z">
+        <w:r>
+          <w:rPr>
+            <w:rFonts w:ascii="Arial" w:hAnsi="Arial" w:cs="Arial"/>
+          </w:rPr>
+          <w:t>.</w:t>
+        </w:r>
+        <w:r>
+          <w:rPr>
+            <w:rFonts w:ascii="Arial" w:hAnsi="Arial" w:cs="Arial"/>
+          </w:rPr>
+          <w:t xml:space="preserve"> In other words, we anticipated that it would be more difficult to randomly generate completely unique group-level or individual-level vocal signatu</w:t>
+        </w:r>
+        <w:r>
+          <w:rPr>
+            <w:rFonts w:ascii="Arial" w:hAnsi="Arial" w:cs="Arial"/>
+          </w:rPr>
+          <w:t xml:space="preserve">res </w:t>
+        </w:r>
+      </w:ins>
+      <w:ins w:id="121" w:author="Smith Vidaurre, Grace" w:date="2025-06-16T16:48:00Z" w16du:dateUtc="2025-06-16T20:48:00Z">
+        <w:r>
+          <w:rPr>
+            <w:rFonts w:ascii="Arial" w:hAnsi="Arial" w:cs="Arial"/>
+          </w:rPr>
+          <w:t xml:space="preserve">with increasing numbers of </w:t>
+        </w:r>
+        <w:r>
+          <w:rPr>
+            <w:rFonts w:ascii="Arial" w:hAnsi="Arial" w:cs="Arial"/>
+          </w:rPr>
+          <w:t>classes at each social level</w:t>
+        </w:r>
+      </w:ins>
+      <w:ins w:id="122" w:author="Smith Vidaurre, Grace" w:date="2025-06-16T16:49:00Z" w16du:dateUtc="2025-06-16T20:49:00Z">
+        <w:r>
+          <w:rPr>
+            <w:rFonts w:ascii="Arial" w:hAnsi="Arial" w:cs="Arial"/>
+          </w:rPr>
+          <w:t xml:space="preserve">. Indeed, </w:t>
+        </w:r>
+        <w:r>
+          <w:rPr>
+            <w:rFonts w:ascii="Arial" w:hAnsi="Arial" w:cs="Arial"/>
+          </w:rPr>
+          <w:t>given</w:t>
+        </w:r>
+        <w:r>
+          <w:rPr>
+            <w:rFonts w:ascii="Arial" w:hAnsi="Arial" w:cs="Arial"/>
+          </w:rPr>
+          <w:t xml:space="preserve"> our information encoding approach with </w:t>
+        </w:r>
+      </w:ins>
+      <w:ins w:id="123" w:author="Smith Vidaurre, Grace" w:date="2025-06-16T16:51:00Z" w16du:dateUtc="2025-06-16T20:51:00Z">
+        <w:r>
+          <w:rPr>
+            <w:rFonts w:ascii="Arial" w:hAnsi="Arial" w:cs="Arial"/>
+          </w:rPr>
+          <w:t xml:space="preserve">information trits in </w:t>
+        </w:r>
+      </w:ins>
+      <w:ins w:id="124" w:author="Smith Vidaurre, Grace" w:date="2025-06-16T16:49:00Z" w16du:dateUtc="2025-06-16T20:49:00Z">
+        <w:r>
+          <w:rPr>
+            <w:rFonts w:ascii="Arial" w:hAnsi="Arial" w:cs="Arial"/>
+          </w:rPr>
+          <w:t xml:space="preserve">character strings, the </w:t>
+        </w:r>
+      </w:ins>
+      <w:ins w:id="125" w:author="Smith Vidaurre, Grace" w:date="2025-06-16T16:50:00Z" w16du:dateUtc="2025-06-16T20:50:00Z">
+        <w:r>
+          <w:rPr>
+            <w:rFonts w:ascii="Arial" w:hAnsi="Arial" w:cs="Arial"/>
+          </w:rPr>
+          <w:t>greatest number of unique signatures</w:t>
+        </w:r>
+      </w:ins>
+      <w:ins w:id="126" w:author="Smith Vidaurre, Grace" w:date="2025-06-16T16:49:00Z" w16du:dateUtc="2025-06-16T20:49:00Z">
+        <w:r>
+          <w:rPr>
+            <w:rFonts w:ascii="Arial" w:hAnsi="Arial" w:cs="Arial"/>
+          </w:rPr>
+          <w:t xml:space="preserve"> we could </w:t>
+        </w:r>
+      </w:ins>
+      <w:ins w:id="127" w:author="Smith Vidaurre, Grace" w:date="2025-06-16T16:50:00Z" w16du:dateUtc="2025-06-16T20:50:00Z">
+        <w:r>
+          <w:rPr>
+            <w:rFonts w:ascii="Arial" w:hAnsi="Arial" w:cs="Arial"/>
+          </w:rPr>
+          <w:t>create at either social level with only 1 type of information encoding was 3</w:t>
+        </w:r>
+        <w:r>
+          <w:rPr>
+            <w:rFonts w:ascii="Arial" w:hAnsi="Arial" w:cs="Arial"/>
+            <w:vertAlign w:val="superscript"/>
+            <w:rPrChange w:id="128" w:author="Smith Vidaurre, Grace" w:date="2025-06-16T16:50:00Z" w16du:dateUtc="2025-06-16T20:50:00Z">
+              <w:rPr>
+                <w:rFonts w:ascii="Arial" w:hAnsi="Arial" w:cs="Arial"/>
+              </w:rPr>
+            </w:rPrChange>
+          </w:rPr>
+          <w:t>6</w:t>
+        </w:r>
+        <w:r>
+          <w:rPr>
+            <w:rFonts w:ascii="Arial" w:hAnsi="Arial" w:cs="Arial"/>
+          </w:rPr>
+          <w:t xml:space="preserve"> </w:t>
+        </w:r>
+      </w:ins>
+      <w:ins w:id="129" w:author="Smith Vidaurre, Grace" w:date="2025-06-16T16:51:00Z" w16du:dateUtc="2025-06-16T20:51:00Z">
+        <w:r>
+          <w:rPr>
+            <w:rFonts w:ascii="Arial" w:hAnsi="Arial" w:cs="Arial"/>
+          </w:rPr>
+          <w:t>or</w:t>
+        </w:r>
+      </w:ins>
+      <w:ins w:id="130" w:author="Smith Vidaurre, Grace" w:date="2025-06-16T16:52:00Z" w16du:dateUtc="2025-06-16T20:52:00Z">
+        <w:r>
+          <w:rPr>
+            <w:rFonts w:ascii="Arial" w:hAnsi="Arial" w:cs="Arial"/>
+          </w:rPr>
+          <w:t xml:space="preserve"> </w:t>
+        </w:r>
+      </w:ins>
+      <w:ins w:id="131" w:author="Smith Vidaurre, Grace" w:date="2025-06-16T16:51:00Z" w16du:dateUtc="2025-06-16T20:51:00Z">
+        <w:r>
+          <w:rPr>
+            <w:rFonts w:ascii="Arial" w:hAnsi="Arial" w:cs="Arial"/>
+          </w:rPr>
+          <w:t xml:space="preserve">729 unique signatures, </w:t>
+        </w:r>
+      </w:ins>
+      <w:ins w:id="132" w:author="Smith Vidaurre, Grace" w:date="2025-06-16T16:52:00Z" w16du:dateUtc="2025-06-16T20:52:00Z">
+        <w:r>
+          <w:rPr>
+            <w:rFonts w:ascii="Arial" w:hAnsi="Arial" w:cs="Arial"/>
+          </w:rPr>
+          <w:t>and</w:t>
+        </w:r>
+      </w:ins>
+      <w:ins w:id="133" w:author="Smith Vidaurre, Grace" w:date="2025-06-16T16:51:00Z" w16du:dateUtc="2025-06-16T20:51:00Z">
+        <w:r>
+          <w:rPr>
+            <w:rFonts w:ascii="Arial" w:hAnsi="Arial" w:cs="Arial"/>
+          </w:rPr>
+          <w:t xml:space="preserve"> 3</w:t>
+        </w:r>
+        <w:r>
+          <w:rPr>
+            <w:rFonts w:ascii="Arial" w:hAnsi="Arial" w:cs="Arial"/>
+            <w:vertAlign w:val="superscript"/>
+            <w:rPrChange w:id="134" w:author="Smith Vidaurre, Grace" w:date="2025-06-16T16:51:00Z" w16du:dateUtc="2025-06-16T20:51:00Z">
+              <w:rPr>
+                <w:rFonts w:ascii="Arial" w:hAnsi="Arial" w:cs="Arial"/>
+              </w:rPr>
+            </w:rPrChange>
+          </w:rPr>
+          <w:t>4</w:t>
+        </w:r>
+        <w:r>
+          <w:rPr>
+            <w:rFonts w:ascii="Arial" w:hAnsi="Arial" w:cs="Arial"/>
+          </w:rPr>
+          <w:t xml:space="preserve"> or </w:t>
+        </w:r>
+        <w:r>
+          <w:rPr>
+            <w:rFonts w:ascii="Arial" w:hAnsi="Arial" w:cs="Arial"/>
+          </w:rPr>
+          <w:t>81 unique signatures</w:t>
+        </w:r>
+      </w:ins>
+      <w:ins w:id="135" w:author="Smith Vidaurre, Grace" w:date="2025-06-16T16:52:00Z" w16du:dateUtc="2025-06-16T20:52:00Z">
+        <w:r>
+          <w:rPr>
+            <w:rFonts w:ascii="Arial" w:hAnsi="Arial" w:cs="Arial"/>
+          </w:rPr>
+          <w:t xml:space="preserve"> when encoding both group and individual-level information</w:t>
+        </w:r>
+        <w:r>
+          <w:rPr>
+            <w:rFonts w:ascii="Arial" w:hAnsi="Arial" w:cs="Arial"/>
+          </w:rPr>
+          <w:t xml:space="preserve"> (CITE Beecher information theory review)</w:t>
+        </w:r>
+        <w:r>
+          <w:rPr>
+            <w:rFonts w:ascii="Arial" w:hAnsi="Arial" w:cs="Arial"/>
+          </w:rPr>
+          <w:t>.</w:t>
+        </w:r>
+        <w:r>
+          <w:rPr>
+            <w:rFonts w:ascii="Arial" w:hAnsi="Arial" w:cs="Arial"/>
+          </w:rPr>
+          <w:t xml:space="preserve"> Our manipulation</w:t>
+        </w:r>
+        <w:r>
+          <w:rPr>
+            <w:rFonts w:ascii="Arial" w:hAnsi="Arial" w:cs="Arial"/>
+          </w:rPr>
+          <w:t xml:space="preserve"> </w:t>
+        </w:r>
+        <w:r>
+          <w:rPr>
+            <w:rFonts w:ascii="Arial" w:hAnsi="Arial" w:cs="Arial"/>
+          </w:rPr>
+          <w:t xml:space="preserve">of </w:t>
+        </w:r>
+      </w:ins>
+      <w:ins w:id="136" w:author="Smith Vidaurre, Grace" w:date="2025-06-16T16:53:00Z" w16du:dateUtc="2025-06-16T20:53:00Z">
+        <w:r>
+          <w:rPr>
+            <w:rFonts w:ascii="Arial" w:hAnsi="Arial" w:cs="Arial"/>
+          </w:rPr>
+          <w:t xml:space="preserve">the number of classes at either social level, or the size of the resulting signal datasets, was therefore a proxy for the crowdedness of </w:t>
+        </w:r>
+        <w:r>
+          <w:rPr>
+            <w:rFonts w:ascii="Arial" w:hAnsi="Arial" w:cs="Arial"/>
+          </w:rPr>
+          <w:t>the signaling environment</w:t>
+        </w:r>
+        <w:r>
+          <w:rPr>
+            <w:rFonts w:ascii="Arial" w:hAnsi="Arial" w:cs="Arial"/>
+          </w:rPr>
+          <w:t>, such that it should be harder to create distinctive identity signatures</w:t>
+        </w:r>
+      </w:ins>
+      <w:ins w:id="137" w:author="Smith Vidaurre, Grace" w:date="2025-06-16T16:54:00Z" w16du:dateUtc="2025-06-16T20:54:00Z">
+        <w:r>
+          <w:rPr>
+            <w:rFonts w:ascii="Arial" w:hAnsi="Arial" w:cs="Arial"/>
+          </w:rPr>
+          <w:t xml:space="preserve"> when interacting with increasing numbers of individuals </w:t>
+        </w:r>
+        <w:r>
+          <w:rPr>
+            <w:rFonts w:ascii="Arial" w:hAnsi="Arial" w:cs="Arial"/>
+          </w:rPr>
+          <w:t>information (CITE Beecher information theory review)</w:t>
+        </w:r>
+        <w:r>
+          <w:rPr>
+            <w:rFonts w:ascii="Arial" w:hAnsi="Arial" w:cs="Arial"/>
+          </w:rPr>
+          <w:t>.</w:t>
+        </w:r>
+        <w:r>
+          <w:rPr>
+            <w:rFonts w:ascii="Arial" w:hAnsi="Arial" w:cs="Arial"/>
+          </w:rPr>
+          <w:t xml:space="preserve"> </w:t>
+        </w:r>
+      </w:ins>
+      <w:ins w:id="138" w:author="Smith Vidaurre, Grace" w:date="2025-06-16T16:59:00Z" w16du:dateUtc="2025-06-16T20:59:00Z">
+        <w:r>
+          <w:rPr>
+            <w:rFonts w:ascii="Arial" w:hAnsi="Arial" w:cs="Arial"/>
+          </w:rPr>
+          <w:t>W</w:t>
+        </w:r>
+      </w:ins>
+      <w:ins w:id="139" w:author="Smith Vidaurre, Grace" w:date="2025-06-16T16:58:00Z" w16du:dateUtc="2025-06-16T20:58:00Z">
+        <w:r>
+          <w:rPr>
+            <w:rFonts w:ascii="Arial" w:hAnsi="Arial" w:cs="Arial"/>
+          </w:rPr>
+          <w:t xml:space="preserve">e varied </w:t>
+        </w:r>
+      </w:ins>
+      <w:ins w:id="140" w:author="Smith Vidaurre, Grace" w:date="2025-06-16T16:59:00Z" w16du:dateUtc="2025-06-16T20:59:00Z">
+        <w:r>
+          <w:rPr>
+            <w:rFonts w:ascii="Arial" w:hAnsi="Arial" w:cs="Arial"/>
+          </w:rPr>
+          <w:t>the number of classes and vocalizations produced per class at each social level over four</w:t>
+        </w:r>
+        <w:r>
+          <w:rPr>
+            <w:rFonts w:ascii="Arial" w:hAnsi="Arial" w:cs="Arial"/>
+          </w:rPr>
+          <w:t xml:space="preserve"> experimental </w:t>
+        </w:r>
+        <w:r>
+          <w:rPr>
+            <w:rFonts w:ascii="Arial" w:hAnsi="Arial" w:cs="Arial"/>
+          </w:rPr>
+          <w:t>treatments</w:t>
+        </w:r>
+      </w:ins>
+      <w:ins w:id="141" w:author="Smith Vidaurre, Grace" w:date="2025-06-16T17:00:00Z" w16du:dateUtc="2025-06-16T21:00:00Z">
+        <w:r>
+          <w:rPr>
+            <w:rFonts w:ascii="Arial" w:hAnsi="Arial" w:cs="Arial"/>
+          </w:rPr>
+          <w:t xml:space="preserve">: </w:t>
+        </w:r>
+        <w:r>
+          <w:rPr>
+            <w:rFonts w:ascii="Arial" w:hAnsi="Arial" w:cs="Arial"/>
+          </w:rPr>
+          <w:t>2, 4, 6 or 8 classes</w:t>
+        </w:r>
+      </w:ins>
+      <w:ins w:id="142" w:author="Smith Vidaurre, Grace" w:date="2025-06-16T16:59:00Z" w16du:dateUtc="2025-06-16T20:59:00Z">
+        <w:r>
+          <w:rPr>
+            <w:rFonts w:ascii="Arial" w:hAnsi="Arial" w:cs="Arial"/>
+          </w:rPr>
+          <w:t xml:space="preserve">. </w:t>
+        </w:r>
+      </w:ins>
+      <w:ins w:id="143" w:author="Smith Vidaurre, Grace" w:date="2025-06-16T17:00:00Z" w16du:dateUtc="2025-06-16T21:00:00Z">
+        <w:r>
+          <w:rPr>
+            <w:rFonts w:ascii="Arial" w:hAnsi="Arial" w:cs="Arial"/>
+          </w:rPr>
+          <w:t>W</w:t>
+        </w:r>
+        <w:r>
+          <w:rPr>
+            <w:rFonts w:ascii="Arial" w:hAnsi="Arial" w:cs="Arial"/>
+          </w:rPr>
+          <w:t xml:space="preserve">ithin a treatment, </w:t>
+        </w:r>
+      </w:ins>
+      <w:ins w:id="144" w:author="Smith Vidaurre, Grace" w:date="2025-06-16T16:59:00Z" w16du:dateUtc="2025-06-16T20:59:00Z">
+        <w:r>
+          <w:rPr>
+            <w:rFonts w:ascii="Arial" w:hAnsi="Arial" w:cs="Arial"/>
+          </w:rPr>
+          <w:t xml:space="preserve">we </w:t>
+        </w:r>
+      </w:ins>
+      <w:ins w:id="145" w:author="Smith Vidaurre, Grace" w:date="2025-06-16T17:00:00Z" w16du:dateUtc="2025-06-16T21:00:00Z">
+        <w:r>
+          <w:rPr>
+            <w:rFonts w:ascii="Arial" w:hAnsi="Arial" w:cs="Arial"/>
+          </w:rPr>
+          <w:t>used a constant</w:t>
+        </w:r>
+      </w:ins>
+      <w:ins w:id="146" w:author="Smith Vidaurre, Grace" w:date="2025-06-16T16:59:00Z" w16du:dateUtc="2025-06-16T20:59:00Z">
+        <w:r>
+          <w:rPr>
+            <w:rFonts w:ascii="Arial" w:hAnsi="Arial" w:cs="Arial"/>
+          </w:rPr>
+          <w:t xml:space="preserve"> number of classes </w:t>
+        </w:r>
+      </w:ins>
+      <w:ins w:id="147" w:author="Smith Vidaurre, Grace" w:date="2025-06-16T17:02:00Z" w16du:dateUtc="2025-06-16T21:02:00Z">
+        <w:r>
+          <w:rPr>
+            <w:rFonts w:ascii="Arial" w:hAnsi="Arial" w:cs="Arial"/>
+          </w:rPr>
+          <w:t xml:space="preserve">and vocalizations </w:t>
+        </w:r>
+      </w:ins>
+      <w:ins w:id="148" w:author="Smith Vidaurre, Grace" w:date="2025-06-16T17:00:00Z" w16du:dateUtc="2025-06-16T21:00:00Z">
+        <w:r>
+          <w:rPr>
+            <w:rFonts w:ascii="Arial" w:hAnsi="Arial" w:cs="Arial"/>
+          </w:rPr>
+          <w:t>assigned to each social level.</w:t>
+        </w:r>
+        <w:r>
+          <w:rPr>
+            <w:rFonts w:ascii="Arial" w:hAnsi="Arial" w:cs="Arial"/>
+          </w:rPr>
+          <w:t xml:space="preserve"> </w:t>
+        </w:r>
+        <w:r>
+          <w:rPr>
+            <w:rFonts w:ascii="Arial" w:hAnsi="Arial" w:cs="Arial"/>
+          </w:rPr>
+          <w:t xml:space="preserve">For instance, in the </w:t>
+        </w:r>
+      </w:ins>
+      <w:ins w:id="149" w:author="Smith Vidaurre, Grace" w:date="2025-06-16T17:01:00Z" w16du:dateUtc="2025-06-16T21:01:00Z">
+        <w:r>
+          <w:rPr>
+            <w:rFonts w:ascii="Arial" w:hAnsi="Arial" w:cs="Arial"/>
+          </w:rPr>
+          <w:t>2</w:t>
+        </w:r>
+      </w:ins>
+      <w:ins w:id="150" w:author="Smith Vidaurre, Grace" w:date="2025-06-16T17:06:00Z" w16du:dateUtc="2025-06-16T21:06:00Z">
+        <w:r>
+          <w:rPr>
+            <w:rFonts w:ascii="Arial" w:hAnsi="Arial" w:cs="Arial"/>
+          </w:rPr>
+          <w:t>-</w:t>
+        </w:r>
+      </w:ins>
+      <w:ins w:id="151" w:author="Smith Vidaurre, Grace" w:date="2025-06-16T17:01:00Z" w16du:dateUtc="2025-06-16T21:01:00Z">
+        <w:r>
+          <w:rPr>
+            <w:rFonts w:ascii="Arial" w:hAnsi="Arial" w:cs="Arial"/>
+          </w:rPr>
+          <w:t xml:space="preserve">class treatment, the resulting signal datasets were composed of </w:t>
+        </w:r>
+        <w:r>
+          <w:rPr>
+            <w:rFonts w:ascii="Arial" w:hAnsi="Arial" w:cs="Arial"/>
+          </w:rPr>
+          <w:t>2 groups</w:t>
+        </w:r>
+      </w:ins>
+      <w:ins w:id="152" w:author="Smith Vidaurre, Grace" w:date="2025-06-16T17:03:00Z" w16du:dateUtc="2025-06-16T21:03:00Z">
+        <w:r>
+          <w:rPr>
+            <w:rFonts w:ascii="Arial" w:hAnsi="Arial" w:cs="Arial"/>
+          </w:rPr>
+          <w:t xml:space="preserve">, </w:t>
+        </w:r>
+      </w:ins>
+      <w:ins w:id="153" w:author="Smith Vidaurre, Grace" w:date="2025-06-16T17:01:00Z" w16du:dateUtc="2025-06-16T21:01:00Z">
+        <w:r>
+          <w:rPr>
+            <w:rFonts w:ascii="Arial" w:hAnsi="Arial" w:cs="Arial"/>
+          </w:rPr>
+          <w:t>2 individuals per group</w:t>
+        </w:r>
+      </w:ins>
+      <w:ins w:id="154" w:author="Smith Vidaurre, Grace" w:date="2025-06-16T17:03:00Z" w16du:dateUtc="2025-06-16T21:03:00Z">
+        <w:r>
+          <w:rPr>
+            <w:rFonts w:ascii="Arial" w:hAnsi="Arial" w:cs="Arial"/>
+          </w:rPr>
+          <w:t xml:space="preserve">, and 2 vocalizations per individual. In downstream analyses, we used the 2 exemplars of vocalizations per individual and </w:t>
+        </w:r>
+      </w:ins>
+      <w:ins w:id="155" w:author="Smith Vidaurre, Grace" w:date="2025-06-16T17:06:00Z" w16du:dateUtc="2025-06-16T21:06:00Z">
+        <w:r>
+          <w:rPr>
+            <w:rFonts w:ascii="Arial" w:hAnsi="Arial" w:cs="Arial"/>
+          </w:rPr>
+          <w:t xml:space="preserve">randomly </w:t>
+        </w:r>
+        <w:r>
+          <w:rPr>
+            <w:rFonts w:ascii="Arial" w:hAnsi="Arial" w:cs="Arial"/>
+          </w:rPr>
+          <w:lastRenderedPageBreak/>
+          <w:t>selected 1 vocalization</w:t>
+        </w:r>
+        <w:r>
+          <w:rPr>
+            <w:rFonts w:ascii="Arial" w:hAnsi="Arial" w:cs="Arial"/>
+          </w:rPr>
+          <w:t xml:space="preserve"> per individual in each group to use the same number of vocalizations in </w:t>
+        </w:r>
+      </w:ins>
+      <w:ins w:id="156" w:author="Smith Vidaurre, Grace" w:date="2025-06-16T17:03:00Z" w16du:dateUtc="2025-06-16T21:03:00Z">
+        <w:r>
+          <w:rPr>
+            <w:rFonts w:ascii="Arial" w:hAnsi="Arial" w:cs="Arial"/>
+          </w:rPr>
+          <w:t>group-level</w:t>
+        </w:r>
+      </w:ins>
+      <w:ins w:id="157" w:author="Smith Vidaurre, Grace" w:date="2025-06-16T17:06:00Z" w16du:dateUtc="2025-06-16T21:06:00Z">
+        <w:r>
+          <w:rPr>
+            <w:rFonts w:ascii="Arial" w:hAnsi="Arial" w:cs="Arial"/>
+          </w:rPr>
+          <w:t xml:space="preserve"> analyses.</w:t>
+        </w:r>
+      </w:ins>
+      <w:moveToRangeStart w:id="158" w:author="Smith Vidaurre, Grace" w:date="2025-06-16T16:54:00Z" w:name="move200985309"/>
+      <w:moveTo w:id="159" w:author="Smith Vidaurre, Grace" w:date="2025-06-16T16:54:00Z" w16du:dateUtc="2025-06-16T20:54:00Z">
+        <w:del w:id="160" w:author="Smith Vidaurre, Grace" w:date="2025-06-16T16:55:00Z" w16du:dateUtc="2025-06-16T20:55:00Z">
+          <w:r>
+            <w:rPr>
+              <w:rFonts w:ascii="Arial" w:hAnsi="Arial" w:cs="Arial"/>
+            </w:rPr>
+            <w:delText>We also varied the proportion of group information to individual information encoded in the signal, with four categories: 0 (representing all individual information and no group information), 1/3, 2/3, and 1 (representing all group information and no individual information.</w:delText>
+          </w:r>
+        </w:del>
+      </w:moveTo>
+      <w:moveToRangeEnd w:id="158"/>
     </w:p>
     <w:p>
       <w:pPr>
         <w:pStyle w:val="NoSpacing"/>
         <w:spacing w:line="480" w:lineRule="auto"/>
         <w:rPr>
-          <w:rFonts w:ascii="Arial" w:hAnsi="Arial" w:cs="Arial"/>
-        </w:rPr>
-      </w:pPr>
+          <w:ins w:id="161" w:author="Smith Vidaurre, Grace" w:date="2025-06-16T17:18:00Z" w16du:dateUtc="2025-06-16T21:18:00Z"/>
+          <w:rFonts w:ascii="Arial" w:hAnsi="Arial" w:cs="Arial"/>
+        </w:rPr>
+      </w:pPr>
+      <w:ins w:id="162" w:author="Smith Vidaurre, Grace" w:date="2025-06-16T16:54:00Z" w16du:dateUtc="2025-06-16T20:54:00Z">
+        <w:r>
+          <w:rPr>
+            <w:rFonts w:ascii="Arial" w:hAnsi="Arial" w:cs="Arial"/>
+          </w:rPr>
+          <w:tab/>
+        </w:r>
+      </w:ins>
+      <w:ins w:id="163" w:author="Smith Vidaurre, Grace" w:date="2025-06-16T17:07:00Z" w16du:dateUtc="2025-06-16T21:07:00Z">
+        <w:r>
+          <w:rPr>
+            <w:rFonts w:ascii="Arial" w:hAnsi="Arial" w:cs="Arial"/>
+          </w:rPr>
+          <w:t>We ran our</w:t>
+        </w:r>
+      </w:ins>
+      <w:ins w:id="164" w:author="Smith Vidaurre, Grace" w:date="2025-06-16T16:54:00Z" w16du:dateUtc="2025-06-16T20:54:00Z">
+        <w:r>
+          <w:rPr>
+            <w:rFonts w:ascii="Arial" w:hAnsi="Arial" w:cs="Arial"/>
+          </w:rPr>
+          <w:t xml:space="preserve"> simulatio</w:t>
+        </w:r>
+      </w:ins>
+      <w:ins w:id="165" w:author="Smith Vidaurre, Grace" w:date="2025-06-16T17:07:00Z" w16du:dateUtc="2025-06-16T21:07:00Z">
+        <w:r>
+          <w:rPr>
+            <w:rFonts w:ascii="Arial" w:hAnsi="Arial" w:cs="Arial"/>
+          </w:rPr>
+          <w:t>n experiments</w:t>
+        </w:r>
+        <w:r>
+          <w:rPr>
+            <w:rFonts w:ascii="Arial" w:hAnsi="Arial" w:cs="Arial"/>
+          </w:rPr>
+          <w:t xml:space="preserve"> over 16 total treatment combinations and 10 iterations per treatment.</w:t>
+        </w:r>
+      </w:ins>
+      <w:ins w:id="166" w:author="Smith Vidaurre, Grace" w:date="2025-06-16T17:08:00Z" w16du:dateUtc="2025-06-16T21:08:00Z">
+        <w:r>
+          <w:rPr>
+            <w:rFonts w:ascii="Arial" w:hAnsi="Arial" w:cs="Arial"/>
+          </w:rPr>
+          <w:t xml:space="preserve"> </w:t>
+        </w:r>
+        <w:r>
+          <w:rPr>
+            <w:rFonts w:ascii="Arial" w:hAnsi="Arial" w:cs="Arial"/>
+          </w:rPr>
+          <w:t xml:space="preserve">We </w:t>
+        </w:r>
+        <w:r>
+          <w:rPr>
+            <w:rFonts w:ascii="Arial" w:hAnsi="Arial" w:cs="Arial"/>
+          </w:rPr>
+          <w:t>analyzed</w:t>
+        </w:r>
+        <w:r>
+          <w:rPr>
+            <w:rFonts w:ascii="Arial" w:hAnsi="Arial" w:cs="Arial"/>
+          </w:rPr>
+          <w:t xml:space="preserve"> </w:t>
+        </w:r>
+        <w:r>
+          <w:rPr>
+            <w:rFonts w:ascii="Arial" w:hAnsi="Arial" w:cs="Arial"/>
+          </w:rPr>
+          <w:t>each of</w:t>
+        </w:r>
+        <w:r>
+          <w:rPr>
+            <w:rFonts w:ascii="Arial" w:hAnsi="Arial" w:cs="Arial"/>
+          </w:rPr>
+          <w:t xml:space="preserve"> the resulting 160 datasets</w:t>
+        </w:r>
+        <w:r>
+          <w:rPr>
+            <w:rFonts w:ascii="Arial" w:hAnsi="Arial" w:cs="Arial"/>
+          </w:rPr>
+          <w:t xml:space="preserve"> of synthetic vocalizations</w:t>
+        </w:r>
+        <w:r>
+          <w:rPr>
+            <w:rFonts w:ascii="Arial" w:hAnsi="Arial" w:cs="Arial"/>
+          </w:rPr>
+          <w:t xml:space="preserve"> to test how well we could detect the information</w:t>
+        </w:r>
+      </w:ins>
+      <w:ins w:id="167" w:author="Smith Vidaurre, Grace" w:date="2025-06-16T17:12:00Z" w16du:dateUtc="2025-06-16T21:12:00Z">
+        <w:r>
+          <w:rPr>
+            <w:rFonts w:ascii="Arial" w:hAnsi="Arial" w:cs="Arial"/>
+          </w:rPr>
+          <w:t xml:space="preserve"> </w:t>
+        </w:r>
+      </w:ins>
+      <w:ins w:id="168" w:author="Smith Vidaurre, Grace" w:date="2025-06-16T17:14:00Z" w16du:dateUtc="2025-06-16T21:14:00Z">
+        <w:r>
+          <w:rPr>
+            <w:rFonts w:ascii="Arial" w:hAnsi="Arial" w:cs="Arial"/>
+          </w:rPr>
+          <w:t xml:space="preserve">that we had originally </w:t>
+        </w:r>
+      </w:ins>
+      <w:ins w:id="169" w:author="Smith Vidaurre, Grace" w:date="2025-06-16T17:13:00Z" w16du:dateUtc="2025-06-16T21:13:00Z">
+        <w:r>
+          <w:rPr>
+            <w:rFonts w:ascii="Arial" w:hAnsi="Arial" w:cs="Arial"/>
+          </w:rPr>
+          <w:t xml:space="preserve">encoded </w:t>
+        </w:r>
+      </w:ins>
+      <w:ins w:id="170" w:author="Smith Vidaurre, Grace" w:date="2025-06-16T17:14:00Z" w16du:dateUtc="2025-06-16T21:14:00Z">
+        <w:r>
+          <w:rPr>
+            <w:rFonts w:ascii="Arial" w:hAnsi="Arial" w:cs="Arial"/>
+          </w:rPr>
+          <w:t>in character strings at one or both social levels.</w:t>
+        </w:r>
+        <w:r>
+          <w:rPr>
+            <w:rFonts w:ascii="Arial" w:hAnsi="Arial" w:cs="Arial"/>
+          </w:rPr>
+          <w:t xml:space="preserve"> </w:t>
+        </w:r>
+      </w:ins>
+      <w:ins w:id="171" w:author="Smith Vidaurre, Grace" w:date="2025-06-16T17:15:00Z" w16du:dateUtc="2025-06-16T21:15:00Z">
+        <w:r>
+          <w:rPr>
+            <w:rFonts w:ascii="Arial" w:hAnsi="Arial" w:cs="Arial"/>
+          </w:rPr>
+          <w:t xml:space="preserve">We used the same </w:t>
+        </w:r>
+        <w:r>
+          <w:rPr>
+            <w:rFonts w:ascii="Arial" w:hAnsi="Arial" w:cs="Arial"/>
+          </w:rPr>
+          <w:t xml:space="preserve">pipeline </w:t>
+        </w:r>
+        <w:r>
+          <w:rPr>
+            <w:rFonts w:ascii="Arial" w:hAnsi="Arial" w:cs="Arial"/>
+          </w:rPr>
+          <w:t>described above to generate datasets of synthetic vocal identity signals under each tre</w:t>
+        </w:r>
+      </w:ins>
+      <w:ins w:id="172" w:author="Smith Vidaurre, Grace" w:date="2025-06-16T17:16:00Z" w16du:dateUtc="2025-06-16T21:16:00Z">
+        <w:r>
+          <w:rPr>
+            <w:rFonts w:ascii="Arial" w:hAnsi="Arial" w:cs="Arial"/>
+          </w:rPr>
+          <w:t xml:space="preserve">atment combination. </w:t>
+        </w:r>
+        <w:r>
+          <w:rPr>
+            <w:rFonts w:ascii="Arial" w:hAnsi="Arial" w:cs="Arial"/>
+          </w:rPr>
+          <w:t>Then we analyzed both the character string and audio representations of the identity signals</w:t>
+        </w:r>
+      </w:ins>
+      <w:ins w:id="173" w:author="Smith Vidaurre, Grace" w:date="2025-06-16T17:17:00Z" w16du:dateUtc="2025-06-16T21:17:00Z">
+        <w:r>
+          <w:rPr>
+            <w:rFonts w:ascii="Arial" w:hAnsi="Arial" w:cs="Arial"/>
+          </w:rPr>
+          <w:t>. O</w:t>
+        </w:r>
+      </w:ins>
+      <w:ins w:id="174" w:author="Smith Vidaurre, Grace" w:date="2025-06-16T17:16:00Z" w16du:dateUtc="2025-06-16T21:16:00Z">
+        <w:r>
+          <w:rPr>
+            <w:rFonts w:ascii="Arial" w:hAnsi="Arial" w:cs="Arial"/>
+          </w:rPr>
+          <w:t>ur results generated using</w:t>
+        </w:r>
+      </w:ins>
+      <w:ins w:id="175" w:author="Smith Vidaurre, Grace" w:date="2025-06-16T17:17:00Z" w16du:dateUtc="2025-06-16T21:17:00Z">
+        <w:r>
+          <w:rPr>
+            <w:rFonts w:ascii="Arial" w:hAnsi="Arial" w:cs="Arial"/>
+          </w:rPr>
+          <w:t xml:space="preserve"> the character strings</w:t>
+        </w:r>
+        <w:r>
+          <w:rPr>
+            <w:rFonts w:ascii="Arial" w:hAnsi="Arial" w:cs="Arial"/>
+          </w:rPr>
+          <w:t xml:space="preserve"> served as a b</w:t>
+        </w:r>
+      </w:ins>
+      <w:ins w:id="176" w:author="Smith Vidaurre, Grace" w:date="2025-06-16T17:19:00Z" w16du:dateUtc="2025-06-16T21:19:00Z">
+        <w:r>
+          <w:rPr>
+            <w:rFonts w:ascii="Arial" w:hAnsi="Arial" w:cs="Arial"/>
+          </w:rPr>
+          <w:t>aseline or internal validation</w:t>
+        </w:r>
+      </w:ins>
+      <w:ins w:id="177" w:author="Smith Vidaurre, Grace" w:date="2025-06-16T17:17:00Z" w16du:dateUtc="2025-06-16T21:17:00Z">
+        <w:r>
+          <w:rPr>
+            <w:rFonts w:ascii="Arial" w:hAnsi="Arial" w:cs="Arial"/>
+          </w:rPr>
+          <w:t xml:space="preserve"> for our ability to detect identity information</w:t>
+        </w:r>
+        <w:r>
+          <w:rPr>
+            <w:rFonts w:ascii="Arial" w:hAnsi="Arial" w:cs="Arial"/>
+          </w:rPr>
+          <w:t xml:space="preserve"> </w:t>
+        </w:r>
+        <w:r>
+          <w:rPr>
+            <w:rFonts w:ascii="Arial" w:hAnsi="Arial" w:cs="Arial"/>
+          </w:rPr>
+          <w:t>in the synthetic vocalizations using traditional bioacoustics too</w:t>
+        </w:r>
+        <w:r>
+          <w:rPr>
+            <w:rFonts w:ascii="Arial" w:hAnsi="Arial" w:cs="Arial"/>
+          </w:rPr>
+          <w:t>l</w:t>
+        </w:r>
+        <w:r>
+          <w:rPr>
+            <w:rFonts w:ascii="Arial" w:hAnsi="Arial" w:cs="Arial"/>
+          </w:rPr>
+          <w:t>s.</w:t>
+        </w:r>
+      </w:ins>
     </w:p>
     <w:p>
       <w:pPr>
+        <w:pStyle w:val="NoSpacing"/>
+        <w:spacing w:line="480" w:lineRule="auto"/>
+        <w:rPr>
+          <w:ins w:id="178" w:author="Smith Vidaurre, Grace" w:date="2025-06-16T16:35:00Z" w16du:dateUtc="2025-06-16T20:35:00Z"/>
+          <w:rFonts w:ascii="Arial" w:hAnsi="Arial" w:cs="Arial"/>
+        </w:rPr>
+      </w:pPr>
+      <w:ins w:id="179" w:author="Smith Vidaurre, Grace" w:date="2025-06-16T17:18:00Z" w16du:dateUtc="2025-06-16T21:18:00Z">
+        <w:r>
+          <w:rPr>
+            <w:rFonts w:ascii="Arial" w:hAnsi="Arial" w:cs="Arial"/>
+          </w:rPr>
+          <w:tab/>
+          <w:t xml:space="preserve">We analyzed each dataset using a similar analytical pipeline described above </w:t>
+        </w:r>
+        <w:r>
+          <w:rPr>
+            <w:rFonts w:ascii="Arial" w:hAnsi="Arial" w:cs="Arial"/>
+          </w:rPr>
+          <w:t>for</w:t>
+        </w:r>
+        <w:r>
+          <w:rPr>
+            <w:rFonts w:ascii="Arial" w:hAnsi="Arial" w:cs="Arial"/>
+          </w:rPr>
+          <w:t xml:space="preserve"> the exemplar datasets, </w:t>
+        </w:r>
+      </w:ins>
+      <w:ins w:id="180" w:author="Smith Vidaurre, Grace" w:date="2025-06-16T17:19:00Z" w16du:dateUtc="2025-06-16T21:19:00Z">
+        <w:r>
+          <w:rPr>
+            <w:rFonts w:ascii="Arial" w:hAnsi="Arial" w:cs="Arial"/>
+          </w:rPr>
+          <w:t xml:space="preserve">such that we </w:t>
+        </w:r>
+        <w:r>
+          <w:rPr>
+            <w:rFonts w:ascii="Arial" w:hAnsi="Arial" w:cs="Arial"/>
+          </w:rPr>
+          <w:t>measured dist</w:t>
+        </w:r>
+      </w:ins>
+      <w:ins w:id="181" w:author="Smith Vidaurre, Grace" w:date="2025-06-16T17:20:00Z" w16du:dateUtc="2025-06-16T21:20:00Z">
+        <w:r>
+          <w:rPr>
+            <w:rFonts w:ascii="Arial" w:hAnsi="Arial" w:cs="Arial"/>
+          </w:rPr>
+          <w:t>ance with the edit distance or SPCC, respectively, and then performed multidimensional scaling to generate feature</w:t>
+        </w:r>
+      </w:ins>
+      <w:ins w:id="182" w:author="Smith Vidaurre, Grace" w:date="2025-06-16T17:23:00Z" w16du:dateUtc="2025-06-16T21:23:00Z">
+        <w:r>
+          <w:rPr>
+            <w:rFonts w:ascii="Arial" w:hAnsi="Arial" w:cs="Arial"/>
+          </w:rPr>
+          <w:t>s</w:t>
+        </w:r>
+      </w:ins>
+      <w:ins w:id="183" w:author="Smith Vidaurre, Grace" w:date="2025-06-16T17:19:00Z" w16du:dateUtc="2025-06-16T21:19:00Z">
+        <w:r>
+          <w:rPr>
+            <w:rFonts w:ascii="Arial" w:hAnsi="Arial" w:cs="Arial"/>
+          </w:rPr>
+          <w:t xml:space="preserve">. </w:t>
+        </w:r>
+        <w:r>
+          <w:rPr>
+            <w:rFonts w:ascii="Arial" w:hAnsi="Arial" w:cs="Arial"/>
+          </w:rPr>
+          <w:t>However,</w:t>
+        </w:r>
+      </w:ins>
+      <w:ins w:id="184" w:author="Smith Vidaurre, Grace" w:date="2025-06-16T17:18:00Z" w16du:dateUtc="2025-06-16T21:18:00Z">
+        <w:r>
+          <w:rPr>
+            <w:rFonts w:ascii="Arial" w:hAnsi="Arial" w:cs="Arial"/>
+          </w:rPr>
+          <w:t xml:space="preserve"> here we </w:t>
+        </w:r>
+        <w:r>
+          <w:rPr>
+            <w:rFonts w:ascii="Arial" w:hAnsi="Arial" w:cs="Arial"/>
+          </w:rPr>
+          <w:t>did not generate visualizations of trait spaces</w:t>
+        </w:r>
+        <w:r>
+          <w:rPr>
+            <w:rFonts w:ascii="Arial" w:hAnsi="Arial" w:cs="Arial"/>
+          </w:rPr>
+          <w:t xml:space="preserve"> after performing multidimensional scaling</w:t>
+        </w:r>
+      </w:ins>
+      <w:ins w:id="185" w:author="Smith Vidaurre, Grace" w:date="2025-06-16T17:19:00Z" w16du:dateUtc="2025-06-16T21:19:00Z">
+        <w:r>
+          <w:rPr>
+            <w:rFonts w:ascii="Arial" w:hAnsi="Arial" w:cs="Arial"/>
+          </w:rPr>
+          <w:t>. Instead, we</w:t>
+        </w:r>
+      </w:ins>
+      <w:ins w:id="186" w:author="Smith Vidaurre, Grace" w:date="2025-06-16T17:23:00Z" w16du:dateUtc="2025-06-16T21:23:00Z">
+        <w:r>
+          <w:rPr>
+            <w:rFonts w:ascii="Arial" w:hAnsi="Arial" w:cs="Arial"/>
+          </w:rPr>
+          <w:t xml:space="preserve"> performed k-means clustering on the edit distance or SPCC features</w:t>
+        </w:r>
+      </w:ins>
+      <w:ins w:id="187" w:author="Smith Vidaurre, Grace" w:date="2025-06-16T17:24:00Z" w16du:dateUtc="2025-06-16T21:24:00Z">
+        <w:r>
+          <w:rPr>
+            <w:rFonts w:ascii="Arial" w:hAnsi="Arial" w:cs="Arial"/>
+          </w:rPr>
+          <w:t xml:space="preserve"> using </w:t>
+        </w:r>
+        <w:r>
+          <w:rPr>
+            <w:rFonts w:ascii="Arial" w:hAnsi="Arial" w:cs="Arial"/>
+          </w:rPr>
+          <w:t>the stats package version TKTK with the Hartigan and</w:t>
+        </w:r>
+      </w:ins>
+      <w:ins w:id="188" w:author="Smith Vidaurre, Grace" w:date="2025-06-16T17:25:00Z" w16du:dateUtc="2025-06-16T21:25:00Z">
+        <w:r>
+          <w:rPr>
+            <w:rFonts w:ascii="Arial" w:hAnsi="Arial" w:cs="Arial"/>
+          </w:rPr>
+          <w:t xml:space="preserve"> Wong algorithm (CITE Hartigan &amp; Wong 1979)</w:t>
+        </w:r>
+        <w:r>
+          <w:rPr>
+            <w:rFonts w:ascii="Arial" w:hAnsi="Arial" w:cs="Arial"/>
+          </w:rPr>
+          <w:t xml:space="preserve"> with 10 iterations maximum, and the nu</w:t>
+        </w:r>
+      </w:ins>
+      <w:ins w:id="189" w:author="Smith Vidaurre, Grace" w:date="2025-06-16T17:26:00Z" w16du:dateUtc="2025-06-16T21:26:00Z">
+        <w:r>
+          <w:rPr>
+            <w:rFonts w:ascii="Arial" w:hAnsi="Arial" w:cs="Arial"/>
+          </w:rPr>
+          <w:t xml:space="preserve">mber of centers set to the number of </w:t>
+        </w:r>
+        <w:r>
+          <w:rPr>
+            <w:rFonts w:ascii="Arial" w:hAnsi="Arial" w:cs="Arial"/>
+          </w:rPr>
+          <w:t xml:space="preserve">true </w:t>
+        </w:r>
+        <w:r>
+          <w:rPr>
+            <w:rFonts w:ascii="Arial" w:hAnsi="Arial" w:cs="Arial"/>
+          </w:rPr>
+          <w:t>classes</w:t>
+        </w:r>
+        <w:r>
+          <w:rPr>
+            <w:rFonts w:ascii="Arial" w:hAnsi="Arial" w:cs="Arial"/>
+          </w:rPr>
+          <w:t>.</w:t>
+        </w:r>
+        <w:r>
+          <w:rPr>
+            <w:rFonts w:ascii="Arial" w:hAnsi="Arial" w:cs="Arial"/>
+          </w:rPr>
+          <w:t xml:space="preserve"> We performed k-means clustering at each social level in order to </w:t>
+        </w:r>
+      </w:ins>
+      <w:ins w:id="190" w:author="Smith Vidaurre, Grace" w:date="2025-06-16T17:27:00Z" w16du:dateUtc="2025-06-16T21:27:00Z">
+        <w:r>
+          <w:rPr>
+            <w:rFonts w:ascii="Arial" w:hAnsi="Arial" w:cs="Arial"/>
+          </w:rPr>
+          <w:t>yield predicted cluster labels that we could compare to original class labels to compute</w:t>
+        </w:r>
+      </w:ins>
+      <w:ins w:id="191" w:author="Smith Vidaurre, Grace" w:date="2025-06-16T17:26:00Z" w16du:dateUtc="2025-06-16T21:26:00Z">
+        <w:r>
+          <w:rPr>
+            <w:rFonts w:ascii="Arial" w:hAnsi="Arial" w:cs="Arial"/>
+          </w:rPr>
+          <w:t xml:space="preserve"> </w:t>
+        </w:r>
+      </w:ins>
+      <w:ins w:id="192" w:author="Smith Vidaurre, Grace" w:date="2025-06-16T17:27:00Z" w16du:dateUtc="2025-06-16T21:27:00Z">
+        <w:r>
+          <w:rPr>
+            <w:rFonts w:ascii="Arial" w:hAnsi="Arial" w:cs="Arial"/>
+          </w:rPr>
+          <w:t xml:space="preserve">our </w:t>
+        </w:r>
+      </w:ins>
+      <w:ins w:id="193" w:author="Smith Vidaurre, Grace" w:date="2025-06-16T17:26:00Z" w16du:dateUtc="2025-06-16T21:26:00Z">
+        <w:r>
+          <w:rPr>
+            <w:rFonts w:ascii="Arial" w:hAnsi="Arial" w:cs="Arial"/>
+          </w:rPr>
+          <w:t xml:space="preserve">accuracy of information detection </w:t>
+        </w:r>
+      </w:ins>
+      <w:ins w:id="194" w:author="Smith Vidaurre, Grace" w:date="2025-06-16T17:27:00Z" w16du:dateUtc="2025-06-16T21:27:00Z">
+        <w:r>
+          <w:rPr>
+            <w:rFonts w:ascii="Arial" w:hAnsi="Arial" w:cs="Arial"/>
+          </w:rPr>
+          <w:t>at each social level. At the group level, we randomly selected 1 vocalization per individual within a group to maintain symmetry in sample size between social levels. At</w:t>
+        </w:r>
+      </w:ins>
+      <w:ins w:id="195" w:author="Smith Vidaurre, Grace" w:date="2025-06-16T17:28:00Z" w16du:dateUtc="2025-06-16T21:28:00Z">
+        <w:r>
+          <w:rPr>
+            <w:rFonts w:ascii="Arial" w:hAnsi="Arial" w:cs="Arial"/>
+          </w:rPr>
+          <w:t xml:space="preserve"> the individual level, we </w:t>
+        </w:r>
+        <w:r>
+          <w:rPr>
+            <w:rFonts w:ascii="Arial" w:hAnsi="Arial" w:cs="Arial"/>
+          </w:rPr>
+          <w:lastRenderedPageBreak/>
+          <w:t>performed clustering of individuals’ vocalizations within a group for each group in the given dataset</w:t>
+        </w:r>
+        <w:r>
+          <w:rPr>
+            <w:rFonts w:ascii="Arial" w:hAnsi="Arial" w:cs="Arial"/>
+          </w:rPr>
+          <w:t>.</w:t>
+        </w:r>
+        <w:r>
+          <w:rPr>
+            <w:rFonts w:ascii="Arial" w:hAnsi="Arial" w:cs="Arial"/>
+          </w:rPr>
+          <w:t xml:space="preserve"> We then used a bipartite mapping approach to c</w:t>
+        </w:r>
+      </w:ins>
+      <w:ins w:id="196" w:author="Smith Vidaurre, Grace" w:date="2025-06-16T17:29:00Z" w16du:dateUtc="2025-06-16T21:29:00Z">
+        <w:r>
+          <w:rPr>
+            <w:rFonts w:ascii="Arial" w:hAnsi="Arial" w:cs="Arial"/>
+          </w:rPr>
+          <w:t>alculate the accuracy with which predicted labels matched original class labels</w:t>
+        </w:r>
+        <w:r>
+          <w:rPr>
+            <w:rFonts w:ascii="Arial" w:hAnsi="Arial" w:cs="Arial"/>
+          </w:rPr>
+          <w:t xml:space="preserve">. </w:t>
+        </w:r>
+        <w:r>
+          <w:rPr>
+            <w:rFonts w:ascii="Arial" w:hAnsi="Arial" w:cs="Arial"/>
+          </w:rPr>
+          <w:t xml:space="preserve">This bipartite mapping approach </w:t>
+        </w:r>
+      </w:ins>
+      <w:ins w:id="197" w:author="Smith Vidaurre, Grace" w:date="2025-06-16T17:30:00Z" w16du:dateUtc="2025-06-16T21:30:00Z">
+        <w:r>
+          <w:rPr>
+            <w:rFonts w:ascii="Arial" w:hAnsi="Arial" w:cs="Arial"/>
+          </w:rPr>
+          <w:t xml:space="preserve">entailed computing all possible accuracy values by using each possible mapping between unique cluster and class labels. We calculated the </w:t>
+        </w:r>
+      </w:ins>
+      <w:ins w:id="198" w:author="Smith Vidaurre, Grace" w:date="2025-06-16T17:31:00Z" w16du:dateUtc="2025-06-16T21:31:00Z">
+        <w:r>
+          <w:rPr>
+            <w:rFonts w:ascii="Arial" w:hAnsi="Arial" w:cs="Arial"/>
+          </w:rPr>
+          <w:t>maximum accuracy score across all possible accuracy values at each social level. For individual-level calculations, we averaged th</w:t>
+        </w:r>
+      </w:ins>
+      <w:ins w:id="199" w:author="Smith Vidaurre, Grace" w:date="2025-06-16T17:32:00Z" w16du:dateUtc="2025-06-16T21:32:00Z">
+        <w:r>
+          <w:rPr>
+            <w:rFonts w:ascii="Arial" w:hAnsi="Arial" w:cs="Arial"/>
+          </w:rPr>
+          <w:t>ese accuracy calculations across groups.</w:t>
+        </w:r>
+      </w:ins>
+      <w:ins w:id="200" w:author="Smith Vidaurre, Grace" w:date="2025-06-16T17:29:00Z" w16du:dateUtc="2025-06-16T21:29:00Z">
+        <w:r>
+          <w:rPr>
+            <w:rFonts w:ascii="Arial" w:hAnsi="Arial" w:cs="Arial"/>
+          </w:rPr>
+          <w:t xml:space="preserve"> </w:t>
+        </w:r>
+      </w:ins>
+    </w:p>
+    <w:p>
+      <w:pPr>
+        <w:pStyle w:val="NoSpacing"/>
+        <w:spacing w:line="480" w:lineRule="auto"/>
+        <w:rPr>
+          <w:del w:id="201" w:author="Smith Vidaurre, Grace" w:date="2025-06-16T17:08:00Z" w16du:dateUtc="2025-06-16T21:08:00Z"/>
+          <w:rFonts w:ascii="Arial" w:hAnsi="Arial" w:cs="Arial"/>
+        </w:rPr>
+      </w:pPr>
+      <w:del w:id="202" w:author="Smith Vidaurre, Grace" w:date="2025-06-16T17:07:00Z" w16du:dateUtc="2025-06-16T21:07:00Z">
+        <w:r>
+          <w:rPr>
+            <w:rFonts w:ascii="Arial" w:hAnsi="Arial" w:cs="Arial"/>
+          </w:rPr>
+          <w:delText>accurately</w:delText>
+        </w:r>
+        <w:r>
+          <w:rPr>
+            <w:rFonts w:ascii="Arial" w:hAnsi="Arial" w:cs="Arial"/>
+          </w:rPr>
+          <w:delText xml:space="preserve"> </w:delText>
+        </w:r>
+        <w:r>
+          <w:rPr>
+            <w:rFonts w:ascii="Arial" w:hAnsi="Arial" w:cs="Arial"/>
+          </w:rPr>
+          <w:delText xml:space="preserve">varying amounts of group and individual </w:delText>
+        </w:r>
+        <w:r>
+          <w:rPr>
+            <w:rFonts w:ascii="Arial" w:hAnsi="Arial" w:cs="Arial"/>
+          </w:rPr>
+          <w:delText xml:space="preserve">information could be recovered </w:delText>
+        </w:r>
+        <w:r>
+          <w:rPr>
+            <w:rFonts w:ascii="Arial" w:hAnsi="Arial" w:cs="Arial"/>
+          </w:rPr>
+          <w:delText>from synthetic signals,</w:delText>
+        </w:r>
+        <w:r>
+          <w:rPr>
+            <w:rFonts w:ascii="Arial" w:hAnsi="Arial" w:cs="Arial"/>
+          </w:rPr>
+          <w:delText xml:space="preserve"> we created </w:delText>
+        </w:r>
+        <w:r>
+          <w:rPr>
+            <w:rFonts w:ascii="Arial" w:hAnsi="Arial" w:cs="Arial"/>
+          </w:rPr>
+          <w:delText xml:space="preserve">synthetic data sets across 16 treatments that varied over social environment characteristics and information encoding rules. </w:delText>
+        </w:r>
+        <w:commentRangeStart w:id="203"/>
+        <w:r>
+          <w:rPr>
+            <w:rFonts w:ascii="Arial" w:hAnsi="Arial" w:cs="Arial"/>
+          </w:rPr>
+          <w:delText>We varied social environment characteristics represented information signaling changes that happen in socially sparse vs socially dense signaling environments</w:delText>
+        </w:r>
+        <w:commentRangeEnd w:id="203"/>
+        <w:r>
+          <w:rPr>
+            <w:rStyle w:val="CommentReference"/>
+          </w:rPr>
+          <w:commentReference w:id="203"/>
+        </w:r>
+        <w:r>
+          <w:rPr>
+            <w:rFonts w:ascii="Arial" w:hAnsi="Arial" w:cs="Arial"/>
+          </w:rPr>
+          <w:delText xml:space="preserve">. We achieved this by creating four social conditions: </w:delText>
+        </w:r>
+      </w:del>
+      <w:del w:id="204" w:author="Smith Vidaurre, Grace" w:date="2025-06-16T16:58:00Z" w16du:dateUtc="2025-06-16T20:58:00Z">
+        <w:r>
+          <w:rPr>
+            <w:rFonts w:ascii="Arial" w:hAnsi="Arial" w:cs="Arial"/>
+          </w:rPr>
+          <w:delText xml:space="preserve">2 groups with 2 individuals per group, 4 groups with 4 individuals per group, 6 groups with 6 individuals per group, and 8 groups with 8 individuals per group. </w:delText>
+        </w:r>
+      </w:del>
+      <w:moveFromRangeStart w:id="205" w:author="Smith Vidaurre, Grace" w:date="2025-06-16T16:54:00Z" w:name="move200985309"/>
+      <w:moveFrom w:id="206" w:author="Smith Vidaurre, Grace" w:date="2025-06-16T16:54:00Z" w16du:dateUtc="2025-06-16T20:54:00Z">
+        <w:del w:id="207" w:author="Smith Vidaurre, Grace" w:date="2025-06-16T17:07:00Z" w16du:dateUtc="2025-06-16T21:07:00Z">
+          <w:r>
+            <w:rPr>
+              <w:rFonts w:ascii="Arial" w:hAnsi="Arial" w:cs="Arial"/>
+            </w:rPr>
+            <w:delText xml:space="preserve">We also varied the proportion of group information to individual information encoded in the signal, with four categories: 0 (representing all individual information and no group information), 1/3, 2/3, and 1 (representing all group information and no individual information. </w:delText>
+          </w:r>
+        </w:del>
+      </w:moveFrom>
+      <w:moveFromRangeEnd w:id="205"/>
+      <w:del w:id="208" w:author="Smith Vidaurre, Grace" w:date="2025-06-16T17:07:00Z" w16du:dateUtc="2025-06-16T21:07:00Z">
+        <w:r>
+          <w:rPr>
+            <w:rFonts w:ascii="Arial" w:hAnsi="Arial" w:cs="Arial"/>
+          </w:rPr>
+          <w:delText xml:space="preserve">We iterated </w:delText>
+        </w:r>
+      </w:del>
+      <w:del w:id="209" w:author="Smith Vidaurre, Grace" w:date="2025-06-16T17:08:00Z" w16du:dateUtc="2025-06-16T21:08:00Z">
+        <w:r>
+          <w:rPr>
+            <w:rFonts w:ascii="Arial" w:hAnsi="Arial" w:cs="Arial"/>
+          </w:rPr>
+          <w:delText xml:space="preserve">over each treatment 10 times, generating 10 unique synthetic datasets per treatment. </w:delText>
+        </w:r>
+      </w:del>
+    </w:p>
+    <w:p>
+      <w:pPr>
+        <w:pStyle w:val="NoSpacing"/>
+        <w:spacing w:line="480" w:lineRule="auto"/>
+        <w:rPr>
+          <w:rFonts w:ascii="Arial" w:hAnsi="Arial" w:cs="Arial"/>
+        </w:rPr>
+      </w:pPr>
+      <w:del w:id="210" w:author="Smith Vidaurre, Grace" w:date="2025-06-16T17:32:00Z" w16du:dateUtc="2025-06-16T21:32:00Z">
+        <w:r>
+          <w:rPr>
+            <w:rFonts w:ascii="Arial" w:hAnsi="Arial" w:cs="Arial"/>
+          </w:rPr>
+          <w:tab/>
+          <w:delText xml:space="preserve">Once these synthetic datasets were created, we used traditional bioacoustics tools to decode information encoded at the group and individual level. Similar to the datasets above, we performed SPCC. We also calculated the edit distance for the original strings. After these calculations, we performed Multidimensional Scaling on both the SPCC and edit distance matrices, then performed k-means clustering, randomly selecting 1 call per individual per group, to ensure that call exemplars per class matched between social levels. From this, we were able to calculate the accuracy of detecting information at the group and individual levels from vocalizations represented as character strings (edit distance pipeline) or synthetic audio files (tradition </w:delText>
+        </w:r>
+        <w:r>
+          <w:rPr>
+            <w:rFonts w:ascii="Arial" w:hAnsi="Arial" w:cs="Arial"/>
+          </w:rPr>
+          <w:delText>bioacoustics</w:delText>
+        </w:r>
+        <w:r>
+          <w:rPr>
+            <w:rFonts w:ascii="Arial" w:hAnsi="Arial" w:cs="Arial"/>
+          </w:rPr>
+          <w:delText xml:space="preserve"> </w:delText>
+        </w:r>
+        <w:r>
+          <w:rPr>
+            <w:rFonts w:ascii="Arial" w:hAnsi="Arial" w:cs="Arial"/>
+          </w:rPr>
+          <w:delText>pipeline</w:delText>
+        </w:r>
+        <w:r>
+          <w:rPr>
+            <w:rFonts w:ascii="Arial" w:hAnsi="Arial" w:cs="Arial"/>
+          </w:rPr>
+          <w:delText xml:space="preserve"> SPCC). Edit distance is a baseline for information detection because the strings are the original place where information was encoded at either social level. We can then compare the SPCC accuracy to edit distance, to assess how well we can detect the information originally encoded from the audio file representation. </w:delText>
+        </w:r>
+      </w:del>
+      <w:r>
+        <w:rPr>
+          <w:rFonts w:ascii="Arial" w:hAnsi="Arial" w:cs="Arial"/>
+        </w:rPr>
+        <w:t xml:space="preserve"> </w:t>
+      </w:r>
+    </w:p>
+    <w:p>
+      <w:pPr>
+        <w:pStyle w:val="NoSpacing"/>
+        <w:spacing w:line="480" w:lineRule="auto"/>
+        <w:rPr>
+          <w:ins w:id="211" w:author="Smith Vidaurre, Grace" w:date="2025-05-28T19:06:00Z" w16du:dateUtc="2025-05-28T23:06:00Z"/>
+          <w:rFonts w:ascii="Arial" w:hAnsi="Arial" w:cs="Arial"/>
+        </w:rPr>
+      </w:pPr>
+      <w:r>
+        <w:rPr>
+          <w:rFonts w:ascii="Arial" w:hAnsi="Arial" w:cs="Arial"/>
+        </w:rPr>
+        <w:tab/>
+        <w:t>TKTK paragraph about effect size calculations</w:t>
+      </w:r>
+      <w:r>
+        <w:rPr>
+          <w:rFonts w:ascii="Arial" w:hAnsi="Arial" w:cs="Arial"/>
+        </w:rPr>
+        <w:t xml:space="preserve">. Include package information in R. Make sure to address the warnings in the code output and the density plots (supplemental) that address these. </w:t>
+      </w:r>
+    </w:p>
+    <w:p>
+      <w:pPr>
+        <w:pStyle w:val="NoSpacing"/>
+        <w:spacing w:line="480" w:lineRule="auto"/>
+        <w:rPr>
+          <w:ins w:id="212" w:author="Smith Vidaurre, Grace" w:date="2025-05-28T19:06:00Z" w16du:dateUtc="2025-05-28T23:06:00Z"/>
+          <w:rFonts w:ascii="Arial" w:hAnsi="Arial" w:cs="Arial"/>
+        </w:rPr>
+      </w:pPr>
+    </w:p>
+    <w:p>
+      <w:pPr>
+        <w:spacing w:line="480" w:lineRule="auto"/>
+        <w:ind w:firstLine="720"/>
+        <w:rPr>
+          <w:ins w:id="213" w:author="Smith Vidaurre, Grace" w:date="2025-05-28T19:06:00Z" w16du:dateUtc="2025-05-28T23:06:00Z"/>
+          <w:rFonts w:ascii="Arial" w:hAnsi="Arial" w:cs="Arial"/>
+        </w:rPr>
+      </w:pPr>
+      <w:ins w:id="214" w:author="Smith Vidaurre, Grace" w:date="2025-05-28T19:06:00Z" w16du:dateUtc="2025-05-28T23:06:00Z">
+        <w:r>
+          <w:rPr>
+            <w:rFonts w:ascii="Arial" w:hAnsi="Arial" w:cs="Arial"/>
+          </w:rPr>
+          <w:t xml:space="preserve">TKTK integrate </w:t>
+        </w:r>
+        <w:commentRangeStart w:id="215"/>
+        <w:commentRangeStart w:id="216"/>
+        <w:commentRangeStart w:id="217"/>
+        <w:r>
+          <w:rPr>
+            <w:rFonts w:ascii="Arial" w:hAnsi="Arial" w:cs="Arial"/>
+          </w:rPr>
+          <w:t>We expected to identify clustering accuracies that were generally lower for spectrographic cross-correlation than the edit distance, since spectrographic cross-correlation was performed on strings transformed into synthetic audio files, which may have led to losses of the original information or added noise</w:t>
+        </w:r>
+        <w:commentRangeEnd w:id="215"/>
+        <w:r>
+          <w:rPr>
+            <w:rStyle w:val="CommentReference"/>
+          </w:rPr>
+          <w:commentReference w:id="215"/>
+        </w:r>
+        <w:commentRangeEnd w:id="216"/>
+        <w:r>
+          <w:rPr>
+            <w:rStyle w:val="CommentReference"/>
+          </w:rPr>
+          <w:commentReference w:id="216"/>
+        </w:r>
+        <w:commentRangeEnd w:id="217"/>
+        <w:r>
+          <w:rPr>
+            <w:rStyle w:val="CommentReference"/>
+          </w:rPr>
+          <w:commentReference w:id="217"/>
+        </w:r>
+        <w:r>
+          <w:rPr>
+            <w:rFonts w:ascii="Arial" w:hAnsi="Arial" w:cs="Arial"/>
+          </w:rPr>
+          <w:t>. However, we generally expected to identify medium or small effect sizes for these differences in information detection by each method that did not outweigh the effect sizes calculated for clustering accuracy between different forms of identity information for the same measurement (spectrographic cross-correlation or the edit distance).</w:t>
+        </w:r>
+      </w:ins>
+    </w:p>
+    <w:p>
+      <w:pPr>
+        <w:pStyle w:val="NoSpacing"/>
+        <w:spacing w:line="480" w:lineRule="auto"/>
+        <w:rPr>
+          <w:rFonts w:ascii="Arial" w:hAnsi="Arial" w:cs="Arial"/>
+        </w:rPr>
+      </w:pPr>
+    </w:p>
+    <w:p>
+      <w:pPr>
+        <w:pStyle w:val="NoSpacing"/>
+        <w:spacing w:line="480" w:lineRule="auto"/>
+        <w:rPr>
+          <w:rFonts w:ascii="Arial" w:hAnsi="Arial" w:cs="Arial"/>
+        </w:rPr>
+      </w:pPr>
+    </w:p>
+    <w:p>
+      <w:pPr>
         <w:spacing w:line="480" w:lineRule="auto"/>
         <w:rPr>
           <w:rFonts w:ascii="Arial" w:hAnsi="Arial" w:cs="Arial"/>
@@ -21077,7 +22656,6 @@
           <w:i/>
           <w:iCs/>
         </w:rPr>
-        <w:lastRenderedPageBreak/>
         <w:t>Data Availability Statement</w:t>
       </w:r>
     </w:p>
@@ -21096,6 +22674,7 @@
           <w:i/>
           <w:iCs/>
         </w:rPr>
+        <w:lastRenderedPageBreak/>
         <w:t>TKTK</w:t>
       </w:r>
     </w:p>
@@ -22117,7 +23696,7 @@
           <w:szCs w:val="20"/>
         </w:rPr>
       </w:pPr>
-      <w:del w:id="91" w:author="Smith Vidaurre, Grace" w:date="2025-05-27T21:15:00Z" w16du:dateUtc="2025-05-28T01:15:00Z">
+      <w:del w:id="218" w:author="Smith Vidaurre, Grace" w:date="2025-05-27T21:15:00Z" w16du:dateUtc="2025-05-28T01:15:00Z">
         <w:r>
           <w:rPr>
             <w:noProof/>
@@ -22195,13 +23774,13 @@
           <w:rFonts w:ascii="Arial" w:hAnsi="Arial" w:cs="Arial"/>
         </w:rPr>
       </w:pPr>
-      <w:commentRangeStart w:id="92"/>
-      <w:commentRangeEnd w:id="92"/>
+      <w:commentRangeStart w:id="219"/>
+      <w:commentRangeEnd w:id="219"/>
       <w:r>
         <w:rPr>
           <w:rStyle w:val="CommentReference"/>
         </w:rPr>
-        <w:commentReference w:id="92"/>
+        <w:commentReference w:id="219"/>
       </w:r>
       <w:r>
         <w:rPr>
@@ -22319,7 +23898,7 @@
           <w:rFonts w:ascii="Arial" w:hAnsi="Arial" w:cs="Arial"/>
         </w:rPr>
       </w:pPr>
-      <w:del w:id="93" w:author="Smith Vidaurre, Grace" w:date="2025-05-27T21:15:00Z" w16du:dateUtc="2025-05-28T01:15:00Z">
+      <w:del w:id="220" w:author="Smith Vidaurre, Grace" w:date="2025-05-27T21:15:00Z" w16du:dateUtc="2025-05-28T01:15:00Z">
         <w:r>
           <w:rPr>
             <w:rFonts w:ascii="Arial" w:hAnsi="Arial" w:cs="Arial"/>
@@ -22410,7 +23989,7 @@
           <w:rFonts w:ascii="Arial" w:hAnsi="Arial" w:cs="Arial"/>
         </w:rPr>
       </w:pPr>
-      <w:del w:id="94" w:author="Smith Vidaurre, Grace" w:date="2025-05-27T21:15:00Z" w16du:dateUtc="2025-05-28T01:15:00Z">
+      <w:del w:id="221" w:author="Smith Vidaurre, Grace" w:date="2025-05-27T21:15:00Z" w16du:dateUtc="2025-05-28T01:15:00Z">
         <w:r>
           <w:rPr>
             <w:rFonts w:ascii="Arial" w:hAnsi="Arial" w:cs="Arial"/>
@@ -22567,19 +24146,19 @@
         </w:rPr>
         <w:t xml:space="preserve">). </w:t>
       </w:r>
-      <w:commentRangeStart w:id="95"/>
+      <w:commentRangeStart w:id="222"/>
       <w:r>
         <w:rPr>
           <w:rFonts w:ascii="Arial" w:hAnsi="Arial" w:cs="Arial"/>
         </w:rPr>
         <w:t>This suggests that individuals are being categorized in distinct individual clusters when running traditional bioacoustics analyses on our synthetically generated calls.</w:t>
       </w:r>
-      <w:commentRangeEnd w:id="95"/>
+      <w:commentRangeEnd w:id="222"/>
       <w:r>
         <w:rPr>
           <w:rStyle w:val="CommentReference"/>
         </w:rPr>
-        <w:commentReference w:id="95"/>
+        <w:commentReference w:id="222"/>
       </w:r>
     </w:p>
     <w:p>
@@ -22592,7 +24171,7 @@
     <w:p>
       <w:pPr>
         <w:rPr>
-          <w:ins w:id="96" w:author="Smith Vidaurre, Grace" w:date="2025-05-22T14:24:00Z" w16du:dateUtc="2025-05-22T18:24:00Z"/>
+          <w:ins w:id="223" w:author="Smith Vidaurre, Grace" w:date="2025-05-22T14:24:00Z" w16du:dateUtc="2025-05-22T18:24:00Z"/>
           <w:rFonts w:ascii="Arial" w:hAnsi="Arial" w:cs="Arial"/>
           <w:b/>
           <w:bCs/>
@@ -22610,7 +24189,7 @@
     <w:p>
       <w:pPr>
         <w:rPr>
-          <w:ins w:id="97" w:author="Smith Vidaurre, Grace" w:date="2025-05-22T14:24:00Z" w16du:dateUtc="2025-05-22T18:24:00Z"/>
+          <w:ins w:id="224" w:author="Smith Vidaurre, Grace" w:date="2025-05-22T14:24:00Z" w16du:dateUtc="2025-05-22T18:24:00Z"/>
           <w:rFonts w:ascii="Arial" w:hAnsi="Arial" w:cs="Arial"/>
           <w:b/>
           <w:bCs/>
@@ -22622,7 +24201,7 @@
         <w:spacing w:line="480" w:lineRule="auto"/>
         <w:ind w:firstLine="720"/>
         <w:rPr>
-          <w:ins w:id="98" w:author="Smith Vidaurre, Grace" w:date="2025-05-22T14:25:00Z" w16du:dateUtc="2025-05-22T18:25:00Z"/>
+          <w:ins w:id="225" w:author="Smith Vidaurre, Grace" w:date="2025-05-22T14:25:00Z" w16du:dateUtc="2025-05-22T18:25:00Z"/>
           <w:rFonts w:ascii="Arial" w:hAnsi="Arial" w:cs="Arial"/>
         </w:rPr>
       </w:pPr>
@@ -22668,19 +24247,19 @@
         </w:rPr>
         <w:t xml:space="preserve">, therefore, to study to evolution of vocal learning, we must understand how vocal learners encode and perceive information in learned vocal signals. Studies of the diversity of information encoding across vocal learning taxa could lead to new insights into how vocal learning originated and continues to </w:t>
       </w:r>
-      <w:commentRangeStart w:id="99"/>
+      <w:commentRangeStart w:id="226"/>
       <w:r>
         <w:rPr>
           <w:rFonts w:ascii="Arial" w:hAnsi="Arial" w:cs="Arial"/>
         </w:rPr>
         <w:t>evolve</w:t>
       </w:r>
-      <w:commentRangeEnd w:id="99"/>
+      <w:commentRangeEnd w:id="226"/>
       <w:r>
         <w:rPr>
           <w:rStyle w:val="CommentReference"/>
         </w:rPr>
-        <w:commentReference w:id="99"/>
+        <w:commentReference w:id="226"/>
       </w:r>
       <w:r>
         <w:rPr>
@@ -22694,7 +24273,7 @@
         <w:spacing w:line="480" w:lineRule="auto"/>
         <w:ind w:firstLine="720"/>
         <w:rPr>
-          <w:ins w:id="100" w:author="Smith Vidaurre, Grace" w:date="2025-05-22T14:25:00Z" w16du:dateUtc="2025-05-22T18:25:00Z"/>
+          <w:ins w:id="227" w:author="Smith Vidaurre, Grace" w:date="2025-05-22T14:25:00Z" w16du:dateUtc="2025-05-22T18:25:00Z"/>
           <w:rFonts w:ascii="Arial" w:hAnsi="Arial" w:cs="Arial"/>
         </w:rPr>
       </w:pPr>
@@ -22704,12 +24283,12 @@
         <w:spacing w:line="480" w:lineRule="auto"/>
         <w:ind w:firstLine="720"/>
         <w:rPr>
-          <w:ins w:id="101" w:author="Smith Vidaurre, Grace" w:date="2025-05-22T14:34:00Z" w16du:dateUtc="2025-05-22T18:34:00Z"/>
-          <w:rFonts w:ascii="Arial" w:hAnsi="Arial" w:cs="Arial"/>
-        </w:rPr>
-      </w:pPr>
-      <w:commentRangeStart w:id="102"/>
-      <w:ins w:id="103" w:author="Smith Vidaurre, Grace" w:date="2025-05-22T14:25:00Z" w16du:dateUtc="2025-05-22T18:25:00Z">
+          <w:ins w:id="228" w:author="Smith Vidaurre, Grace" w:date="2025-05-22T14:34:00Z" w16du:dateUtc="2025-05-22T18:34:00Z"/>
+          <w:rFonts w:ascii="Arial" w:hAnsi="Arial" w:cs="Arial"/>
+        </w:rPr>
+      </w:pPr>
+      <w:commentRangeStart w:id="229"/>
+      <w:ins w:id="230" w:author="Smith Vidaurre, Grace" w:date="2025-05-22T14:25:00Z" w16du:dateUtc="2025-05-22T18:25:00Z">
         <w:r>
           <w:rPr>
             <w:rFonts w:ascii="Arial" w:hAnsi="Arial" w:cs="Arial"/>
@@ -23096,12 +24675,12 @@
           </w:rPr>
           <w:t xml:space="preserve">. </w:t>
         </w:r>
-        <w:commentRangeEnd w:id="102"/>
+        <w:commentRangeEnd w:id="229"/>
         <w:r>
           <w:rPr>
             <w:rStyle w:val="CommentReference"/>
           </w:rPr>
-          <w:commentReference w:id="102"/>
+          <w:commentReference w:id="229"/>
         </w:r>
       </w:ins>
     </w:p>
@@ -23110,7 +24689,7 @@
         <w:spacing w:line="480" w:lineRule="auto"/>
         <w:ind w:firstLine="720"/>
         <w:rPr>
-          <w:ins w:id="104" w:author="Smith Vidaurre, Grace" w:date="2025-05-22T14:34:00Z" w16du:dateUtc="2025-05-22T18:34:00Z"/>
+          <w:ins w:id="231" w:author="Smith Vidaurre, Grace" w:date="2025-05-22T14:34:00Z" w16du:dateUtc="2025-05-22T18:34:00Z"/>
           <w:rFonts w:ascii="Arial" w:hAnsi="Arial" w:cs="Arial"/>
         </w:rPr>
       </w:pPr>
@@ -23120,11 +24699,11 @@
         <w:spacing w:line="480" w:lineRule="auto"/>
         <w:ind w:firstLine="720"/>
         <w:rPr>
-          <w:ins w:id="105" w:author="Smith Vidaurre, Grace" w:date="2025-05-22T14:34:00Z" w16du:dateUtc="2025-05-22T18:34:00Z"/>
-          <w:rFonts w:ascii="Arial" w:hAnsi="Arial" w:cs="Arial"/>
-        </w:rPr>
-      </w:pPr>
-      <w:ins w:id="106" w:author="Smith Vidaurre, Grace" w:date="2025-05-22T14:34:00Z" w16du:dateUtc="2025-05-22T18:34:00Z">
+          <w:ins w:id="232" w:author="Smith Vidaurre, Grace" w:date="2025-05-22T14:34:00Z" w16du:dateUtc="2025-05-22T18:34:00Z"/>
+          <w:rFonts w:ascii="Arial" w:hAnsi="Arial" w:cs="Arial"/>
+        </w:rPr>
+      </w:pPr>
+      <w:ins w:id="233" w:author="Smith Vidaurre, Grace" w:date="2025-05-22T14:34:00Z" w16du:dateUtc="2025-05-22T18:34:00Z">
         <w:r>
           <w:rPr>
             <w:rFonts w:ascii="Arial" w:hAnsi="Arial" w:cs="Arial"/>
@@ -23167,19 +24746,19 @@
           </w:rPr>
           <w:t>(</w:t>
         </w:r>
-        <w:commentRangeStart w:id="107"/>
+        <w:commentRangeStart w:id="234"/>
         <w:r>
           <w:rPr>
             <w:rFonts w:ascii="Arial" w:hAnsi="Arial" w:cs="Arial"/>
           </w:rPr>
           <w:t>CITE</w:t>
         </w:r>
-        <w:commentRangeEnd w:id="107"/>
+        <w:commentRangeEnd w:id="234"/>
         <w:r>
           <w:rPr>
             <w:rStyle w:val="CommentReference"/>
           </w:rPr>
-          <w:commentReference w:id="107"/>
+          <w:commentReference w:id="234"/>
         </w:r>
         <w:r>
           <w:rPr>
@@ -23231,7 +24810,7 @@
         <w:spacing w:line="480" w:lineRule="auto"/>
         <w:ind w:firstLine="720"/>
         <w:rPr>
-          <w:ins w:id="108" w:author="Smith Vidaurre, Grace" w:date="2025-05-22T14:35:00Z" w16du:dateUtc="2025-05-22T18:35:00Z"/>
+          <w:ins w:id="235" w:author="Smith Vidaurre, Grace" w:date="2025-05-22T14:35:00Z" w16du:dateUtc="2025-05-22T18:35:00Z"/>
           <w:rFonts w:ascii="Arial" w:hAnsi="Arial" w:cs="Arial"/>
         </w:rPr>
       </w:pPr>
@@ -23241,11 +24820,11 @@
         <w:spacing w:line="480" w:lineRule="auto"/>
         <w:ind w:firstLine="720"/>
         <w:rPr>
-          <w:ins w:id="109" w:author="Smith Vidaurre, Grace" w:date="2025-06-05T09:40:00Z" w16du:dateUtc="2025-06-05T13:40:00Z"/>
-          <w:rFonts w:ascii="Arial" w:hAnsi="Arial" w:cs="Arial"/>
-        </w:rPr>
-      </w:pPr>
-      <w:ins w:id="110" w:author="Smith Vidaurre, Grace" w:date="2025-05-22T14:35:00Z" w16du:dateUtc="2025-05-22T18:35:00Z">
+          <w:ins w:id="236" w:author="Smith Vidaurre, Grace" w:date="2025-06-05T09:40:00Z" w16du:dateUtc="2025-06-05T13:40:00Z"/>
+          <w:rFonts w:ascii="Arial" w:hAnsi="Arial" w:cs="Arial"/>
+        </w:rPr>
+      </w:pPr>
+      <w:ins w:id="237" w:author="Smith Vidaurre, Grace" w:date="2025-05-22T14:35:00Z" w16du:dateUtc="2025-05-22T18:35:00Z">
         <w:r>
           <w:rPr>
             <w:rFonts w:ascii="Arial" w:hAnsi="Arial" w:cs="Arial"/>
@@ -23295,7 +24874,7 @@
         <w:spacing w:line="480" w:lineRule="auto"/>
         <w:ind w:firstLine="720"/>
         <w:rPr>
-          <w:ins w:id="111" w:author="Smith Vidaurre, Grace" w:date="2025-06-05T09:40:00Z" w16du:dateUtc="2025-06-05T13:40:00Z"/>
+          <w:ins w:id="238" w:author="Smith Vidaurre, Grace" w:date="2025-06-05T09:40:00Z" w16du:dateUtc="2025-06-05T13:40:00Z"/>
           <w:rFonts w:ascii="Arial" w:hAnsi="Arial" w:cs="Arial"/>
         </w:rPr>
       </w:pPr>
@@ -23305,11 +24884,11 @@
         <w:spacing w:line="480" w:lineRule="auto"/>
         <w:ind w:firstLine="720"/>
         <w:rPr>
-          <w:ins w:id="112" w:author="Smith Vidaurre, Grace" w:date="2025-06-05T09:40:00Z" w16du:dateUtc="2025-06-05T13:40:00Z"/>
-          <w:rFonts w:ascii="Arial" w:hAnsi="Arial" w:cs="Arial"/>
-        </w:rPr>
-      </w:pPr>
-      <w:ins w:id="113" w:author="Smith Vidaurre, Grace" w:date="2025-06-05T09:40:00Z" w16du:dateUtc="2025-06-05T13:40:00Z">
+          <w:ins w:id="239" w:author="Smith Vidaurre, Grace" w:date="2025-06-05T09:40:00Z" w16du:dateUtc="2025-06-05T13:40:00Z"/>
+          <w:rFonts w:ascii="Arial" w:hAnsi="Arial" w:cs="Arial"/>
+        </w:rPr>
+      </w:pPr>
+      <w:ins w:id="240" w:author="Smith Vidaurre, Grace" w:date="2025-06-05T09:40:00Z" w16du:dateUtc="2025-06-05T13:40:00Z">
         <w:r>
           <w:rPr>
             <w:rFonts w:ascii="Arial" w:hAnsi="Arial" w:cs="Arial"/>
@@ -23360,19 +24939,19 @@
           <w:bCs/>
         </w:rPr>
       </w:pPr>
-      <w:commentRangeStart w:id="114"/>
+      <w:commentRangeStart w:id="241"/>
       <w:r>
         <w:rPr>
           <w:rFonts w:ascii="Arial" w:hAnsi="Arial" w:cs="Arial"/>
         </w:rPr>
         <w:t>Second, out ability to detect the dynamics of information encoding during real time social interactions is limited by our ability to capture the totality of an individual’s or groups signal produced during these interactions. We may be over sampling from vocal learning species whose social interaction and signal production are easy to observe and measure, and therefore may not be assessing the full scope of how information can be encoded across a range of species.</w:t>
       </w:r>
-      <w:commentRangeEnd w:id="114"/>
+      <w:commentRangeEnd w:id="241"/>
       <w:r>
         <w:rPr>
           <w:rStyle w:val="CommentReference"/>
         </w:rPr>
-        <w:commentReference w:id="114"/>
+        <w:commentReference w:id="241"/>
       </w:r>
     </w:p>
     <w:p>
@@ -23388,7 +24967,7 @@
       <w:pPr>
         <w:spacing w:line="360" w:lineRule="auto"/>
         <w:rPr>
-          <w:ins w:id="115" w:author="Smith Vidaurre, Grace" w:date="2025-06-05T09:32:00Z" w16du:dateUtc="2025-06-05T13:32:00Z"/>
+          <w:ins w:id="242" w:author="Smith Vidaurre, Grace" w:date="2025-06-05T09:32:00Z" w16du:dateUtc="2025-06-05T13:32:00Z"/>
           <w:rFonts w:ascii="Arial" w:hAnsi="Arial" w:cs="Arial"/>
         </w:rPr>
       </w:pPr>
@@ -23398,35 +24977,35 @@
         </w:rPr>
         <w:t xml:space="preserve">Several computationally intensive tools have emerged to assess the degree or types of information encoded in </w:t>
       </w:r>
-      <w:commentRangeStart w:id="116"/>
-      <w:commentRangeStart w:id="117"/>
-      <w:commentRangeStart w:id="118"/>
+      <w:commentRangeStart w:id="243"/>
+      <w:commentRangeStart w:id="244"/>
+      <w:commentRangeStart w:id="245"/>
       <w:r>
         <w:rPr>
           <w:rFonts w:ascii="Arial" w:hAnsi="Arial" w:cs="Arial"/>
         </w:rPr>
         <w:t>signals</w:t>
       </w:r>
-      <w:commentRangeEnd w:id="116"/>
+      <w:commentRangeEnd w:id="243"/>
       <w:r>
         <w:rPr>
           <w:rStyle w:val="CommentReference"/>
         </w:rPr>
-        <w:commentReference w:id="116"/>
-      </w:r>
-      <w:commentRangeEnd w:id="117"/>
+        <w:commentReference w:id="243"/>
+      </w:r>
+      <w:commentRangeEnd w:id="244"/>
       <w:r>
         <w:rPr>
           <w:rStyle w:val="CommentReference"/>
         </w:rPr>
-        <w:commentReference w:id="117"/>
-      </w:r>
-      <w:commentRangeEnd w:id="118"/>
+        <w:commentReference w:id="244"/>
+      </w:r>
+      <w:commentRangeEnd w:id="245"/>
       <w:r>
         <w:rPr>
           <w:rStyle w:val="CommentReference"/>
         </w:rPr>
-        <w:commentReference w:id="118"/>
+        <w:commentReference w:id="245"/>
       </w:r>
       <w:r>
         <w:rPr>
@@ -23730,7 +25309,7 @@
       <w:pPr>
         <w:spacing w:line="360" w:lineRule="auto"/>
         <w:rPr>
-          <w:ins w:id="119" w:author="Smith Vidaurre, Grace" w:date="2025-06-05T09:32:00Z" w16du:dateUtc="2025-06-05T13:32:00Z"/>
+          <w:ins w:id="246" w:author="Smith Vidaurre, Grace" w:date="2025-06-05T09:32:00Z" w16du:dateUtc="2025-06-05T13:32:00Z"/>
           <w:rFonts w:ascii="Arial" w:hAnsi="Arial" w:cs="Arial"/>
         </w:rPr>
       </w:pPr>
@@ -23740,11 +25319,11 @@
         <w:spacing w:line="480" w:lineRule="auto"/>
         <w:ind w:firstLine="720"/>
         <w:rPr>
-          <w:ins w:id="120" w:author="Smith Vidaurre, Grace" w:date="2025-06-05T09:32:00Z" w16du:dateUtc="2025-06-05T13:32:00Z"/>
-          <w:rFonts w:ascii="Arial" w:hAnsi="Arial" w:cs="Arial"/>
-        </w:rPr>
-      </w:pPr>
-      <w:ins w:id="121" w:author="Smith Vidaurre, Grace" w:date="2025-06-05T09:32:00Z" w16du:dateUtc="2025-06-05T13:32:00Z">
+          <w:ins w:id="247" w:author="Smith Vidaurre, Grace" w:date="2025-06-05T09:32:00Z" w16du:dateUtc="2025-06-05T13:32:00Z"/>
+          <w:rFonts w:ascii="Arial" w:hAnsi="Arial" w:cs="Arial"/>
+        </w:rPr>
+      </w:pPr>
+      <w:ins w:id="248" w:author="Smith Vidaurre, Grace" w:date="2025-06-05T09:32:00Z" w16du:dateUtc="2025-06-05T13:32:00Z">
         <w:r>
           <w:rPr>
             <w:rFonts w:ascii="Arial" w:hAnsi="Arial" w:cs="Arial"/>
@@ -24649,7 +26228,7 @@
       </w:r>
     </w:p>
   </w:comment>
-  <w:comment w:id="83" w:author="Coppinger, Brittany" w:date="2025-04-03T14:53:00Z" w:initials="BC">
+  <w:comment w:id="203" w:author="Coppinger, Brittany" w:date="2025-04-03T14:53:00Z" w:initials="BC">
     <w:p>
       <w:pPr>
         <w:pStyle w:val="CommentText"/>
@@ -24665,7 +26244,7 @@
       </w:r>
     </w:p>
   </w:comment>
-  <w:comment w:id="88" w:author="Coppinger, Brittany" w:date="2025-04-10T14:31:00Z" w:initials="BC">
+  <w:comment w:id="215" w:author="Coppinger, Brittany" w:date="2025-04-10T14:31:00Z" w:initials="BC">
     <w:p>
       <w:pPr>
         <w:pStyle w:val="CommentText"/>
@@ -24681,7 +26260,7 @@
       </w:r>
     </w:p>
   </w:comment>
-  <w:comment w:id="89" w:author="Smith Vidaurre, Grace" w:date="2025-05-28T18:58:00Z" w:initials="GSV">
+  <w:comment w:id="216" w:author="Smith Vidaurre, Grace" w:date="2025-05-28T18:58:00Z" w:initials="GSV">
     <w:p>
       <w:r>
         <w:rPr>
@@ -24698,7 +26277,7 @@
       </w:r>
     </w:p>
   </w:comment>
-  <w:comment w:id="90" w:author="Smith Vidaurre, Grace" w:date="2025-05-28T19:00:00Z" w:initials="GSV">
+  <w:comment w:id="217" w:author="Smith Vidaurre, Grace" w:date="2025-05-28T19:00:00Z" w:initials="GSV">
     <w:p>
       <w:r>
         <w:rPr>
@@ -24715,7 +26294,7 @@
       </w:r>
     </w:p>
   </w:comment>
-  <w:comment w:id="92" w:author="Summer Eckhardt" w:date="2025-02-04T18:49:00Z" w:initials="SE">
+  <w:comment w:id="219" w:author="Summer Eckhardt" w:date="2025-02-04T18:49:00Z" w:initials="SE">
     <w:p>
       <w:pPr>
         <w:pStyle w:val="CommentText"/>
@@ -24731,7 +26310,7 @@
       </w:r>
     </w:p>
   </w:comment>
-  <w:comment w:id="95" w:author="Summer Eckhardt" w:date="2025-02-04T19:02:00Z" w:initials="SE">
+  <w:comment w:id="222" w:author="Summer Eckhardt" w:date="2025-02-04T19:02:00Z" w:initials="SE">
     <w:p>
       <w:pPr>
         <w:pStyle w:val="CommentText"/>
@@ -24747,7 +26326,7 @@
       </w:r>
     </w:p>
   </w:comment>
-  <w:comment w:id="99" w:author="Smith Vidaurre, Grace" w:date="2025-05-22T13:33:00Z" w:initials="GSV">
+  <w:comment w:id="226" w:author="Smith Vidaurre, Grace" w:date="2025-05-22T13:33:00Z" w:initials="GSV">
     <w:p>
       <w:r>
         <w:rPr>
@@ -24764,7 +26343,7 @@
       </w:r>
     </w:p>
   </w:comment>
-  <w:comment w:id="102" w:author="Smith Vidaurre, Grace" w:date="2025-05-22T13:23:00Z" w:initials="GSV">
+  <w:comment w:id="229" w:author="Smith Vidaurre, Grace" w:date="2025-05-22T13:23:00Z" w:initials="GSV">
     <w:p>
       <w:r>
         <w:rPr>
@@ -24781,7 +26360,7 @@
       </w:r>
     </w:p>
   </w:comment>
-  <w:comment w:id="107" w:author="Smith Vidaurre, Grace" w:date="2024-12-18T14:31:00Z" w:initials="GSV">
+  <w:comment w:id="234" w:author="Smith Vidaurre, Grace" w:date="2024-12-18T14:31:00Z" w:initials="GSV">
     <w:p>
       <w:r>
         <w:rPr>
@@ -24798,7 +26377,7 @@
       </w:r>
     </w:p>
   </w:comment>
-  <w:comment w:id="114" w:author="Smith Vidaurre, Grace" w:date="2024-12-18T15:30:00Z" w:initials="GSV">
+  <w:comment w:id="241" w:author="Smith Vidaurre, Grace" w:date="2024-12-18T15:30:00Z" w:initials="GSV">
     <w:p>
       <w:r>
         <w:rPr>
@@ -24815,7 +26394,7 @@
       </w:r>
     </w:p>
   </w:comment>
-  <w:comment w:id="116" w:author="Smith Vidaurre, Grace" w:date="2024-12-16T09:35:00Z" w:initials="GSV">
+  <w:comment w:id="243" w:author="Smith Vidaurre, Grace" w:date="2024-12-16T09:35:00Z" w:initials="GSV">
     <w:p>
       <w:r>
         <w:rPr>
@@ -24832,7 +26411,7 @@
       </w:r>
     </w:p>
   </w:comment>
-  <w:comment w:id="117" w:author="Smith Vidaurre, Grace" w:date="2024-12-16T09:41:00Z" w:initials="GSV">
+  <w:comment w:id="244" w:author="Smith Vidaurre, Grace" w:date="2024-12-16T09:41:00Z" w:initials="GSV">
     <w:p>
       <w:r>
         <w:rPr>
@@ -24849,7 +26428,7 @@
       </w:r>
     </w:p>
   </w:comment>
-  <w:comment w:id="118" w:author="Coppinger, Brittany" w:date="2024-12-16T14:51:00Z" w:initials="BC">
+  <w:comment w:id="245" w:author="Coppinger, Brittany" w:date="2024-12-16T14:51:00Z" w:initials="BC">
     <w:p>
       <w:pPr>
         <w:pStyle w:val="CommentText"/>

</xml_diff>

<commit_message>
Restructuring Methods: accepted changes
Next: continue with experiment loose ends and the effect size section
</commit_message>
<xml_diff>
--- a/drafts/paRsynth_methods_draft.docx
+++ b/drafts/paRsynth_methods_draft.docx
@@ -20736,85 +20736,52 @@
           <w:iCs/>
         </w:rPr>
       </w:pPr>
-      <w:del w:id="79" w:author="Smith Vidaurre, Grace" w:date="2025-06-16T15:41:00Z" w16du:dateUtc="2025-06-16T19:41:00Z">
-        <w:r>
-          <w:rPr>
-            <w:rFonts w:ascii="Arial" w:hAnsi="Arial" w:cs="Arial"/>
-            <w:i/>
-            <w:iCs/>
-          </w:rPr>
-          <w:delText xml:space="preserve">Synthetic </w:delText>
-        </w:r>
-      </w:del>
-      <w:ins w:id="80" w:author="Smith Vidaurre, Grace" w:date="2025-06-16T15:41:00Z" w16du:dateUtc="2025-06-16T19:41:00Z">
-        <w:r>
-          <w:rPr>
-            <w:rFonts w:ascii="Arial" w:hAnsi="Arial" w:cs="Arial"/>
-            <w:i/>
-            <w:iCs/>
-          </w:rPr>
-          <w:t>S</w:t>
-        </w:r>
-        <w:r>
-          <w:rPr>
-            <w:rFonts w:ascii="Arial" w:hAnsi="Arial" w:cs="Arial"/>
-            <w:i/>
-            <w:iCs/>
-          </w:rPr>
-          <w:t>imulation</w:t>
-        </w:r>
-        <w:r>
-          <w:rPr>
-            <w:rFonts w:ascii="Arial" w:hAnsi="Arial" w:cs="Arial"/>
-            <w:i/>
-            <w:iCs/>
-          </w:rPr>
-          <w:t xml:space="preserve"> </w:t>
-        </w:r>
-      </w:ins>
       <w:r>
         <w:rPr>
           <w:rFonts w:ascii="Arial" w:hAnsi="Arial" w:cs="Arial"/>
           <w:i/>
           <w:iCs/>
         </w:rPr>
+        <w:t>S</w:t>
+      </w:r>
+      <w:r>
+        <w:rPr>
+          <w:rFonts w:ascii="Arial" w:hAnsi="Arial" w:cs="Arial"/>
+          <w:i/>
+          <w:iCs/>
+        </w:rPr>
+        <w:t>imulation</w:t>
+      </w:r>
+      <w:r>
+        <w:rPr>
+          <w:rFonts w:ascii="Arial" w:hAnsi="Arial" w:cs="Arial"/>
+          <w:i/>
+          <w:iCs/>
+        </w:rPr>
+        <w:t xml:space="preserve"> </w:t>
+      </w:r>
+      <w:r>
+        <w:rPr>
+          <w:rFonts w:ascii="Arial" w:hAnsi="Arial" w:cs="Arial"/>
+          <w:i/>
+          <w:iCs/>
+        </w:rPr>
         <w:t xml:space="preserve">Experiments to Assess Accuracy of Information </w:t>
       </w:r>
-      <w:ins w:id="81" w:author="Smith Vidaurre, Grace" w:date="2025-06-16T15:42:00Z" w16du:dateUtc="2025-06-16T19:42:00Z">
-        <w:r>
-          <w:rPr>
-            <w:rFonts w:ascii="Arial" w:hAnsi="Arial" w:cs="Arial"/>
-            <w:i/>
-            <w:iCs/>
-          </w:rPr>
-          <w:t>Detection</w:t>
-        </w:r>
-      </w:ins>
-      <w:del w:id="82" w:author="Smith Vidaurre, Grace" w:date="2025-06-16T15:42:00Z" w16du:dateUtc="2025-06-16T19:42:00Z">
-        <w:r>
-          <w:rPr>
-            <w:rFonts w:ascii="Arial" w:hAnsi="Arial" w:cs="Arial"/>
-            <w:i/>
-            <w:iCs/>
-          </w:rPr>
-          <w:delText xml:space="preserve">Encoding and Decoding Across a Range of Social </w:delText>
-        </w:r>
-        <w:r>
-          <w:rPr>
-            <w:rFonts w:ascii="Arial" w:hAnsi="Arial" w:cs="Arial"/>
-            <w:i/>
-            <w:iCs/>
-          </w:rPr>
-          <w:delText xml:space="preserve">Conditions </w:delText>
-        </w:r>
-      </w:del>
+      <w:r>
+        <w:rPr>
+          <w:rFonts w:ascii="Arial" w:hAnsi="Arial" w:cs="Arial"/>
+          <w:i/>
+          <w:iCs/>
+        </w:rPr>
+        <w:t>Detection</w:t>
+      </w:r>
     </w:p>
     <w:p>
       <w:pPr>
         <w:pStyle w:val="NoSpacing"/>
         <w:spacing w:line="480" w:lineRule="auto"/>
         <w:rPr>
-          <w:ins w:id="83" w:author="Smith Vidaurre, Grace" w:date="2025-06-16T16:54:00Z" w16du:dateUtc="2025-06-16T20:54:00Z"/>
           <w:rFonts w:ascii="Arial" w:hAnsi="Arial" w:cs="Arial"/>
         </w:rPr>
       </w:pPr>
@@ -20848,425 +20815,337 @@
         </w:rPr>
         <w:t xml:space="preserve"> how </w:t>
       </w:r>
-      <w:ins w:id="84" w:author="Smith Vidaurre, Grace" w:date="2025-06-16T16:35:00Z" w16du:dateUtc="2025-06-16T20:35:00Z">
-        <w:r>
-          <w:rPr>
-            <w:rFonts w:ascii="Arial" w:hAnsi="Arial" w:cs="Arial"/>
-          </w:rPr>
-          <w:t>well we could detect identity in</w:t>
-        </w:r>
-      </w:ins>
-      <w:ins w:id="85" w:author="Smith Vidaurre, Grace" w:date="2025-06-16T16:36:00Z" w16du:dateUtc="2025-06-16T20:36:00Z">
-        <w:r>
-          <w:rPr>
-            <w:rFonts w:ascii="Arial" w:hAnsi="Arial" w:cs="Arial"/>
-          </w:rPr>
-          <w:t xml:space="preserve">formation in the synthetic vocal identity signals, we </w:t>
-        </w:r>
-        <w:r>
-          <w:rPr>
-            <w:rFonts w:ascii="Arial" w:hAnsi="Arial" w:cs="Arial"/>
-          </w:rPr>
-          <w:t xml:space="preserve">ran </w:t>
-        </w:r>
-        <w:r>
-          <w:rPr>
-            <w:rFonts w:ascii="Arial" w:hAnsi="Arial" w:cs="Arial"/>
-          </w:rPr>
-          <w:t xml:space="preserve">simulation experiments over </w:t>
-        </w:r>
-        <w:r>
-          <w:rPr>
-            <w:rFonts w:ascii="Arial" w:hAnsi="Arial" w:cs="Arial"/>
-          </w:rPr>
-          <w:t xml:space="preserve">varying </w:t>
-        </w:r>
-      </w:ins>
-      <w:ins w:id="86" w:author="Smith Vidaurre, Grace" w:date="2025-06-16T16:37:00Z" w16du:dateUtc="2025-06-16T20:37:00Z">
-        <w:r>
-          <w:rPr>
-            <w:rFonts w:ascii="Arial" w:hAnsi="Arial" w:cs="Arial"/>
-          </w:rPr>
-          <w:t xml:space="preserve">proportions of identity </w:t>
-        </w:r>
-        <w:r>
-          <w:rPr>
-            <w:rFonts w:ascii="Arial" w:hAnsi="Arial" w:cs="Arial"/>
-          </w:rPr>
-          <w:t>information encod</w:t>
-        </w:r>
-        <w:r>
-          <w:rPr>
-            <w:rFonts w:ascii="Arial" w:hAnsi="Arial" w:cs="Arial"/>
-          </w:rPr>
-          <w:t>ed at the individual and group levels, as well as over varying sizes of</w:t>
-        </w:r>
-        <w:r>
-          <w:rPr>
-            <w:rFonts w:ascii="Arial" w:hAnsi="Arial" w:cs="Arial"/>
-          </w:rPr>
-          <w:t xml:space="preserve"> signal </w:t>
-        </w:r>
-      </w:ins>
-      <w:ins w:id="87" w:author="Smith Vidaurre, Grace" w:date="2025-06-16T16:38:00Z" w16du:dateUtc="2025-06-16T20:38:00Z">
-        <w:r>
-          <w:rPr>
-            <w:rFonts w:ascii="Arial" w:hAnsi="Arial" w:cs="Arial"/>
-          </w:rPr>
-          <w:t>datasets</w:t>
-        </w:r>
-      </w:ins>
-      <w:ins w:id="88" w:author="Smith Vidaurre, Grace" w:date="2025-06-16T16:37:00Z" w16du:dateUtc="2025-06-16T20:37:00Z">
-        <w:r>
-          <w:rPr>
-            <w:rFonts w:ascii="Arial" w:hAnsi="Arial" w:cs="Arial"/>
-          </w:rPr>
-          <w:t>.</w:t>
-        </w:r>
-      </w:ins>
-      <w:ins w:id="89" w:author="Smith Vidaurre, Grace" w:date="2025-06-16T16:38:00Z" w16du:dateUtc="2025-06-16T20:38:00Z">
-        <w:r>
-          <w:rPr>
-            <w:rFonts w:ascii="Arial" w:hAnsi="Arial" w:cs="Arial"/>
-          </w:rPr>
-          <w:t xml:space="preserve"> We designed </w:t>
-        </w:r>
-      </w:ins>
-      <w:ins w:id="90" w:author="Smith Vidaurre, Grace" w:date="2025-06-16T16:42:00Z" w16du:dateUtc="2025-06-16T20:42:00Z">
-        <w:r>
-          <w:rPr>
-            <w:rFonts w:ascii="Arial" w:hAnsi="Arial" w:cs="Arial"/>
-          </w:rPr>
-          <w:t>our</w:t>
-        </w:r>
-      </w:ins>
-      <w:ins w:id="91" w:author="Smith Vidaurre, Grace" w:date="2025-06-16T16:38:00Z" w16du:dateUtc="2025-06-16T20:38:00Z">
-        <w:r>
-          <w:rPr>
-            <w:rFonts w:ascii="Arial" w:hAnsi="Arial" w:cs="Arial"/>
-          </w:rPr>
-          <w:t xml:space="preserve"> simulation experiments to manipulate the relative proportions of information encoding and signal dataset sizes because we expected both</w:t>
-        </w:r>
-      </w:ins>
-      <w:ins w:id="92" w:author="Smith Vidaurre, Grace" w:date="2025-06-16T16:39:00Z" w16du:dateUtc="2025-06-16T20:39:00Z">
-        <w:r>
-          <w:rPr>
-            <w:rFonts w:ascii="Arial" w:hAnsi="Arial" w:cs="Arial"/>
-          </w:rPr>
-          <w:t xml:space="preserve"> </w:t>
-        </w:r>
-      </w:ins>
-      <w:ins w:id="93" w:author="Smith Vidaurre, Grace" w:date="2025-06-16T16:38:00Z" w16du:dateUtc="2025-06-16T20:38:00Z">
-        <w:r>
-          <w:rPr>
-            <w:rFonts w:ascii="Arial" w:hAnsi="Arial" w:cs="Arial"/>
-          </w:rPr>
-          <w:t xml:space="preserve">parameters to impact </w:t>
-        </w:r>
-        <w:r>
-          <w:rPr>
-            <w:rFonts w:ascii="Arial" w:hAnsi="Arial" w:cs="Arial"/>
-          </w:rPr>
-          <w:t>our detection of identity information in the</w:t>
-        </w:r>
-      </w:ins>
-      <w:ins w:id="94" w:author="Smith Vidaurre, Grace" w:date="2025-06-16T16:39:00Z" w16du:dateUtc="2025-06-16T20:39:00Z">
-        <w:r>
-          <w:rPr>
-            <w:rFonts w:ascii="Arial" w:hAnsi="Arial" w:cs="Arial"/>
-          </w:rPr>
-          <w:t xml:space="preserve"> synthetic vocalizations using traditional bioacoustics analyses. </w:t>
-        </w:r>
-      </w:ins>
-      <w:ins w:id="95" w:author="Smith Vidaurre, Grace" w:date="2025-06-16T16:42:00Z" w16du:dateUtc="2025-06-16T20:42:00Z">
-        <w:r>
-          <w:rPr>
-            <w:rFonts w:ascii="Arial" w:hAnsi="Arial" w:cs="Arial"/>
-          </w:rPr>
-          <w:t xml:space="preserve">We expected </w:t>
-        </w:r>
-        <w:r>
-          <w:rPr>
-            <w:rFonts w:ascii="Arial" w:hAnsi="Arial" w:cs="Arial"/>
-          </w:rPr>
-          <w:t>the hig</w:t>
-        </w:r>
-      </w:ins>
-      <w:ins w:id="96" w:author="Smith Vidaurre, Grace" w:date="2025-06-16T16:43:00Z" w16du:dateUtc="2025-06-16T20:43:00Z">
-        <w:r>
-          <w:rPr>
-            <w:rFonts w:ascii="Arial" w:hAnsi="Arial" w:cs="Arial"/>
-          </w:rPr>
-          <w:t>hest accuracies of information detection at the social level</w:t>
-        </w:r>
-        <w:r>
-          <w:rPr>
-            <w:rFonts w:ascii="Arial" w:hAnsi="Arial" w:cs="Arial"/>
-          </w:rPr>
-          <w:t xml:space="preserve"> at which we had originally encoded more information, and we also expected </w:t>
-        </w:r>
-        <w:r>
-          <w:rPr>
-            <w:rFonts w:ascii="Arial" w:hAnsi="Arial" w:cs="Arial"/>
-          </w:rPr>
-          <w:t xml:space="preserve">it would be more difficult to detect </w:t>
-        </w:r>
-        <w:r>
-          <w:rPr>
-            <w:rFonts w:ascii="Arial" w:hAnsi="Arial" w:cs="Arial"/>
-          </w:rPr>
-          <w:t xml:space="preserve">information with high accuracy when </w:t>
-        </w:r>
-        <w:r>
-          <w:rPr>
-            <w:rFonts w:ascii="Arial" w:hAnsi="Arial" w:cs="Arial"/>
-          </w:rPr>
-          <w:t xml:space="preserve">we </w:t>
-        </w:r>
-      </w:ins>
-      <w:ins w:id="97" w:author="Smith Vidaurre, Grace" w:date="2025-06-16T16:44:00Z" w16du:dateUtc="2025-06-16T20:44:00Z">
-        <w:r>
-          <w:rPr>
-            <w:rFonts w:ascii="Arial" w:hAnsi="Arial" w:cs="Arial"/>
-          </w:rPr>
-          <w:t>had originally encoded information at both the group and individual levels.</w:t>
-        </w:r>
-        <w:r>
-          <w:rPr>
-            <w:rFonts w:ascii="Arial" w:hAnsi="Arial" w:cs="Arial"/>
-          </w:rPr>
-          <w:t xml:space="preserve"> </w:t>
-        </w:r>
-      </w:ins>
-      <w:ins w:id="98" w:author="Smith Vidaurre, Grace" w:date="2025-06-16T16:55:00Z" w16du:dateUtc="2025-06-16T20:55:00Z">
-        <w:r>
-          <w:rPr>
-            <w:rFonts w:ascii="Arial" w:hAnsi="Arial" w:cs="Arial"/>
-          </w:rPr>
-          <w:t>In our experiments, w</w:t>
-        </w:r>
-        <w:r>
-          <w:rPr>
-            <w:rFonts w:ascii="Arial" w:hAnsi="Arial" w:cs="Arial"/>
-          </w:rPr>
-          <w:t xml:space="preserve">e varied the </w:t>
-        </w:r>
-        <w:r>
-          <w:rPr>
-            <w:rFonts w:ascii="Arial" w:hAnsi="Arial" w:cs="Arial"/>
-          </w:rPr>
-          <w:t xml:space="preserve">relative </w:t>
-        </w:r>
-        <w:r>
-          <w:rPr>
-            <w:rFonts w:ascii="Arial" w:hAnsi="Arial" w:cs="Arial"/>
-          </w:rPr>
-          <w:t>proportion</w:t>
-        </w:r>
-        <w:r>
-          <w:rPr>
-            <w:rFonts w:ascii="Arial" w:hAnsi="Arial" w:cs="Arial"/>
-          </w:rPr>
-          <w:t>s</w:t>
-        </w:r>
-        <w:r>
-          <w:rPr>
-            <w:rFonts w:ascii="Arial" w:hAnsi="Arial" w:cs="Arial"/>
-          </w:rPr>
-          <w:t xml:space="preserve"> of group to individual information encoded in </w:t>
-        </w:r>
-        <w:r>
-          <w:rPr>
-            <w:rFonts w:ascii="Arial" w:hAnsi="Arial" w:cs="Arial"/>
-          </w:rPr>
-          <w:t>each string over</w:t>
-        </w:r>
-        <w:r>
-          <w:rPr>
-            <w:rFonts w:ascii="Arial" w:hAnsi="Arial" w:cs="Arial"/>
-          </w:rPr>
-          <w:t xml:space="preserve"> four </w:t>
-        </w:r>
-        <w:r>
-          <w:rPr>
-            <w:rFonts w:ascii="Arial" w:hAnsi="Arial" w:cs="Arial"/>
-          </w:rPr>
-          <w:t>treatments</w:t>
-        </w:r>
-        <w:r>
-          <w:rPr>
-            <w:rFonts w:ascii="Arial" w:hAnsi="Arial" w:cs="Arial"/>
-          </w:rPr>
-          <w:t>:</w:t>
-        </w:r>
-        <w:r>
-          <w:rPr>
-            <w:rFonts w:ascii="Arial" w:hAnsi="Arial" w:cs="Arial"/>
-          </w:rPr>
-          <w:t xml:space="preserve"> (1)</w:t>
-        </w:r>
-        <w:r>
-          <w:rPr>
-            <w:rFonts w:ascii="Arial" w:hAnsi="Arial" w:cs="Arial"/>
-          </w:rPr>
-          <w:t xml:space="preserve"> 0 (representing all individual information and no group information), 1/3</w:t>
-        </w:r>
-        <w:r>
-          <w:rPr>
-            <w:rFonts w:ascii="Arial" w:hAnsi="Arial" w:cs="Arial"/>
-          </w:rPr>
-          <w:t xml:space="preserve"> (more </w:t>
-        </w:r>
-      </w:ins>
-      <w:ins w:id="99" w:author="Smith Vidaurre, Grace" w:date="2025-06-16T16:56:00Z" w16du:dateUtc="2025-06-16T20:56:00Z">
-        <w:r>
-          <w:rPr>
-            <w:rFonts w:ascii="Arial" w:hAnsi="Arial" w:cs="Arial"/>
-          </w:rPr>
-          <w:t>individual than group information)</w:t>
-        </w:r>
-      </w:ins>
-      <w:ins w:id="100" w:author="Smith Vidaurre, Grace" w:date="2025-06-16T16:55:00Z" w16du:dateUtc="2025-06-16T20:55:00Z">
-        <w:r>
-          <w:rPr>
-            <w:rFonts w:ascii="Arial" w:hAnsi="Arial" w:cs="Arial"/>
-          </w:rPr>
-          <w:t>, 2/3</w:t>
-        </w:r>
-      </w:ins>
-      <w:ins w:id="101" w:author="Smith Vidaurre, Grace" w:date="2025-06-16T16:56:00Z" w16du:dateUtc="2025-06-16T20:56:00Z">
-        <w:r>
-          <w:rPr>
-            <w:rFonts w:ascii="Arial" w:hAnsi="Arial" w:cs="Arial"/>
-          </w:rPr>
-          <w:t xml:space="preserve"> (</w:t>
-        </w:r>
-        <w:r>
-          <w:rPr>
-            <w:rFonts w:ascii="Arial" w:hAnsi="Arial" w:cs="Arial"/>
-          </w:rPr>
-          <w:t>more group than individual information</w:t>
-        </w:r>
-        <w:r>
-          <w:rPr>
-            <w:rFonts w:ascii="Arial" w:hAnsi="Arial" w:cs="Arial"/>
-          </w:rPr>
-          <w:t>)</w:t>
-        </w:r>
-      </w:ins>
-      <w:ins w:id="102" w:author="Smith Vidaurre, Grace" w:date="2025-06-16T16:55:00Z" w16du:dateUtc="2025-06-16T20:55:00Z">
-        <w:r>
-          <w:rPr>
-            <w:rFonts w:ascii="Arial" w:hAnsi="Arial" w:cs="Arial"/>
-          </w:rPr>
-          <w:t>, and 1 (all group and no individual information</w:t>
-        </w:r>
-      </w:ins>
-      <w:ins w:id="103" w:author="Smith Vidaurre, Grace" w:date="2025-06-16T16:56:00Z" w16du:dateUtc="2025-06-16T20:56:00Z">
-        <w:r>
-          <w:rPr>
-            <w:rFonts w:ascii="Arial" w:hAnsi="Arial" w:cs="Arial"/>
-          </w:rPr>
-          <w:t>)</w:t>
-        </w:r>
-      </w:ins>
-      <w:ins w:id="104" w:author="Smith Vidaurre, Grace" w:date="2025-06-16T16:55:00Z" w16du:dateUtc="2025-06-16T20:55:00Z">
-        <w:r>
-          <w:rPr>
-            <w:rFonts w:ascii="Arial" w:hAnsi="Arial" w:cs="Arial"/>
-          </w:rPr>
-          <w:t>.</w:t>
-        </w:r>
-      </w:ins>
-      <w:ins w:id="105" w:author="Smith Vidaurre, Grace" w:date="2025-06-16T16:56:00Z" w16du:dateUtc="2025-06-16T20:56:00Z">
-        <w:r>
-          <w:rPr>
-            <w:rFonts w:ascii="Arial" w:hAnsi="Arial" w:cs="Arial"/>
-          </w:rPr>
-          <w:t xml:space="preserve"> We </w:t>
-        </w:r>
-        <w:r>
-          <w:rPr>
-            <w:rFonts w:ascii="Arial" w:hAnsi="Arial" w:cs="Arial"/>
-          </w:rPr>
-          <w:t>used a total length of 6 characters in the overall charact</w:t>
-        </w:r>
-      </w:ins>
-      <w:ins w:id="106" w:author="Smith Vidaurre, Grace" w:date="2025-06-16T16:57:00Z" w16du:dateUtc="2025-06-16T20:57:00Z">
-        <w:r>
-          <w:rPr>
-            <w:rFonts w:ascii="Arial" w:hAnsi="Arial" w:cs="Arial"/>
-          </w:rPr>
-          <w:t xml:space="preserve">er string for encoding information at one or both social levels, such that these treatments </w:t>
-        </w:r>
-        <w:r>
-          <w:rPr>
-            <w:rFonts w:ascii="Arial" w:hAnsi="Arial" w:cs="Arial"/>
-          </w:rPr>
-          <w:lastRenderedPageBreak/>
-          <w:t>represented</w:t>
-        </w:r>
-        <w:r>
-          <w:rPr>
-            <w:rFonts w:ascii="Arial" w:hAnsi="Arial" w:cs="Arial"/>
-          </w:rPr>
-          <w:t xml:space="preserve"> 6 characters devoted to individual information, 4 characters for individual and 2 characters for group information, </w:t>
-        </w:r>
-        <w:r>
-          <w:rPr>
-            <w:rFonts w:ascii="Arial" w:hAnsi="Arial" w:cs="Arial"/>
-          </w:rPr>
-          <w:t>2</w:t>
-        </w:r>
-        <w:r>
-          <w:rPr>
-            <w:rFonts w:ascii="Arial" w:hAnsi="Arial" w:cs="Arial"/>
-          </w:rPr>
-          <w:t xml:space="preserve"> characters for individual and </w:t>
-        </w:r>
-        <w:r>
-          <w:rPr>
-            <w:rFonts w:ascii="Arial" w:hAnsi="Arial" w:cs="Arial"/>
-          </w:rPr>
-          <w:t>4</w:t>
-        </w:r>
-        <w:r>
-          <w:rPr>
-            <w:rFonts w:ascii="Arial" w:hAnsi="Arial" w:cs="Arial"/>
-          </w:rPr>
-          <w:t xml:space="preserve"> characters for group information,</w:t>
-        </w:r>
-        <w:r>
-          <w:rPr>
-            <w:rFonts w:ascii="Arial" w:hAnsi="Arial" w:cs="Arial"/>
-          </w:rPr>
-          <w:t xml:space="preserve"> </w:t>
-        </w:r>
-      </w:ins>
-      <w:ins w:id="107" w:author="Smith Vidaurre, Grace" w:date="2025-06-16T16:58:00Z" w16du:dateUtc="2025-06-16T20:58:00Z">
-        <w:r>
-          <w:rPr>
-            <w:rFonts w:ascii="Arial" w:hAnsi="Arial" w:cs="Arial"/>
-          </w:rPr>
-          <w:t xml:space="preserve">or </w:t>
-        </w:r>
-      </w:ins>
-      <w:ins w:id="108" w:author="Smith Vidaurre, Grace" w:date="2025-06-16T16:57:00Z" w16du:dateUtc="2025-06-16T20:57:00Z">
-        <w:r>
-          <w:rPr>
-            <w:rFonts w:ascii="Arial" w:hAnsi="Arial" w:cs="Arial"/>
-          </w:rPr>
-          <w:t>6 characters devoted to group information</w:t>
-        </w:r>
-      </w:ins>
-      <w:ins w:id="109" w:author="Smith Vidaurre, Grace" w:date="2025-06-16T16:58:00Z" w16du:dateUtc="2025-06-16T20:58:00Z">
-        <w:r>
-          <w:rPr>
-            <w:rFonts w:ascii="Arial" w:hAnsi="Arial" w:cs="Arial"/>
-          </w:rPr>
-          <w:t>.</w:t>
-        </w:r>
-      </w:ins>
+      <w:r>
+        <w:rPr>
+          <w:rFonts w:ascii="Arial" w:hAnsi="Arial" w:cs="Arial"/>
+        </w:rPr>
+        <w:t xml:space="preserve">well we could detect identity information in the synthetic vocal identity signals, we </w:t>
+      </w:r>
+      <w:r>
+        <w:rPr>
+          <w:rFonts w:ascii="Arial" w:hAnsi="Arial" w:cs="Arial"/>
+        </w:rPr>
+        <w:t xml:space="preserve">ran </w:t>
+      </w:r>
+      <w:r>
+        <w:rPr>
+          <w:rFonts w:ascii="Arial" w:hAnsi="Arial" w:cs="Arial"/>
+        </w:rPr>
+        <w:t xml:space="preserve">simulation experiments over </w:t>
+      </w:r>
+      <w:r>
+        <w:rPr>
+          <w:rFonts w:ascii="Arial" w:hAnsi="Arial" w:cs="Arial"/>
+        </w:rPr>
+        <w:t xml:space="preserve">varying </w:t>
+      </w:r>
+      <w:r>
+        <w:rPr>
+          <w:rFonts w:ascii="Arial" w:hAnsi="Arial" w:cs="Arial"/>
+        </w:rPr>
+        <w:t xml:space="preserve">proportions of identity </w:t>
+      </w:r>
+      <w:r>
+        <w:rPr>
+          <w:rFonts w:ascii="Arial" w:hAnsi="Arial" w:cs="Arial"/>
+        </w:rPr>
+        <w:t>information encod</w:t>
+      </w:r>
+      <w:r>
+        <w:rPr>
+          <w:rFonts w:ascii="Arial" w:hAnsi="Arial" w:cs="Arial"/>
+        </w:rPr>
+        <w:t>ed at the individual and group levels, as well as over varying sizes of</w:t>
+      </w:r>
+      <w:r>
+        <w:rPr>
+          <w:rFonts w:ascii="Arial" w:hAnsi="Arial" w:cs="Arial"/>
+        </w:rPr>
+        <w:t xml:space="preserve"> signal </w:t>
+      </w:r>
+      <w:r>
+        <w:rPr>
+          <w:rFonts w:ascii="Arial" w:hAnsi="Arial" w:cs="Arial"/>
+        </w:rPr>
+        <w:t>datasets</w:t>
+      </w:r>
+      <w:r>
+        <w:rPr>
+          <w:rFonts w:ascii="Arial" w:hAnsi="Arial" w:cs="Arial"/>
+        </w:rPr>
+        <w:t>.</w:t>
+      </w:r>
+      <w:r>
+        <w:rPr>
+          <w:rFonts w:ascii="Arial" w:hAnsi="Arial" w:cs="Arial"/>
+        </w:rPr>
+        <w:t xml:space="preserve"> We designed </w:t>
+      </w:r>
+      <w:r>
+        <w:rPr>
+          <w:rFonts w:ascii="Arial" w:hAnsi="Arial" w:cs="Arial"/>
+        </w:rPr>
+        <w:t>our</w:t>
+      </w:r>
+      <w:r>
+        <w:rPr>
+          <w:rFonts w:ascii="Arial" w:hAnsi="Arial" w:cs="Arial"/>
+        </w:rPr>
+        <w:t xml:space="preserve"> simulation experiments to manipulate the relative proportions of information encoding and signal dataset sizes because we expected both</w:t>
+      </w:r>
+      <w:r>
+        <w:rPr>
+          <w:rFonts w:ascii="Arial" w:hAnsi="Arial" w:cs="Arial"/>
+        </w:rPr>
+        <w:t xml:space="preserve"> </w:t>
+      </w:r>
+      <w:r>
+        <w:rPr>
+          <w:rFonts w:ascii="Arial" w:hAnsi="Arial" w:cs="Arial"/>
+        </w:rPr>
+        <w:t xml:space="preserve">parameters to impact </w:t>
+      </w:r>
+      <w:r>
+        <w:rPr>
+          <w:rFonts w:ascii="Arial" w:hAnsi="Arial" w:cs="Arial"/>
+        </w:rPr>
+        <w:t xml:space="preserve">our detection of identity information in the synthetic vocalizations using traditional bioacoustics analyses. </w:t>
+      </w:r>
+      <w:r>
+        <w:rPr>
+          <w:rFonts w:ascii="Arial" w:hAnsi="Arial" w:cs="Arial"/>
+        </w:rPr>
+        <w:t xml:space="preserve">We expected </w:t>
+      </w:r>
+      <w:r>
+        <w:rPr>
+          <w:rFonts w:ascii="Arial" w:hAnsi="Arial" w:cs="Arial"/>
+        </w:rPr>
+        <w:t>the highest accuracies of information detection at the social level</w:t>
+      </w:r>
+      <w:r>
+        <w:rPr>
+          <w:rFonts w:ascii="Arial" w:hAnsi="Arial" w:cs="Arial"/>
+        </w:rPr>
+        <w:t xml:space="preserve"> at which we had originally encoded more information, and we also expected </w:t>
+      </w:r>
+      <w:r>
+        <w:rPr>
+          <w:rFonts w:ascii="Arial" w:hAnsi="Arial" w:cs="Arial"/>
+        </w:rPr>
+        <w:t xml:space="preserve">it would be more difficult to detect </w:t>
+      </w:r>
+      <w:r>
+        <w:rPr>
+          <w:rFonts w:ascii="Arial" w:hAnsi="Arial" w:cs="Arial"/>
+        </w:rPr>
+        <w:t xml:space="preserve">information with high accuracy when </w:t>
+      </w:r>
+      <w:r>
+        <w:rPr>
+          <w:rFonts w:ascii="Arial" w:hAnsi="Arial" w:cs="Arial"/>
+        </w:rPr>
+        <w:t>we had originally encoded information at both the group and individual levels.</w:t>
+      </w:r>
+      <w:r>
+        <w:rPr>
+          <w:rFonts w:ascii="Arial" w:hAnsi="Arial" w:cs="Arial"/>
+        </w:rPr>
+        <w:t xml:space="preserve"> </w:t>
+      </w:r>
+      <w:r>
+        <w:rPr>
+          <w:rFonts w:ascii="Arial" w:hAnsi="Arial" w:cs="Arial"/>
+        </w:rPr>
+        <w:t>In our experiments, w</w:t>
+      </w:r>
+      <w:r>
+        <w:rPr>
+          <w:rFonts w:ascii="Arial" w:hAnsi="Arial" w:cs="Arial"/>
+        </w:rPr>
+        <w:t xml:space="preserve">e varied the </w:t>
+      </w:r>
+      <w:r>
+        <w:rPr>
+          <w:rFonts w:ascii="Arial" w:hAnsi="Arial" w:cs="Arial"/>
+        </w:rPr>
+        <w:t xml:space="preserve">relative </w:t>
+      </w:r>
+      <w:r>
+        <w:rPr>
+          <w:rFonts w:ascii="Arial" w:hAnsi="Arial" w:cs="Arial"/>
+        </w:rPr>
+        <w:t>proportion</w:t>
+      </w:r>
+      <w:r>
+        <w:rPr>
+          <w:rFonts w:ascii="Arial" w:hAnsi="Arial" w:cs="Arial"/>
+        </w:rPr>
+        <w:t>s</w:t>
+      </w:r>
+      <w:r>
+        <w:rPr>
+          <w:rFonts w:ascii="Arial" w:hAnsi="Arial" w:cs="Arial"/>
+        </w:rPr>
+        <w:t xml:space="preserve"> of group to individual information encoded in </w:t>
+      </w:r>
+      <w:r>
+        <w:rPr>
+          <w:rFonts w:ascii="Arial" w:hAnsi="Arial" w:cs="Arial"/>
+        </w:rPr>
+        <w:t>each string over</w:t>
+      </w:r>
+      <w:r>
+        <w:rPr>
+          <w:rFonts w:ascii="Arial" w:hAnsi="Arial" w:cs="Arial"/>
+        </w:rPr>
+        <w:t xml:space="preserve"> four </w:t>
+      </w:r>
+      <w:r>
+        <w:rPr>
+          <w:rFonts w:ascii="Arial" w:hAnsi="Arial" w:cs="Arial"/>
+        </w:rPr>
+        <w:t>treatments</w:t>
+      </w:r>
+      <w:r>
+        <w:rPr>
+          <w:rFonts w:ascii="Arial" w:hAnsi="Arial" w:cs="Arial"/>
+        </w:rPr>
+        <w:t>:</w:t>
+      </w:r>
+      <w:r>
+        <w:rPr>
+          <w:rFonts w:ascii="Arial" w:hAnsi="Arial" w:cs="Arial"/>
+        </w:rPr>
+        <w:t xml:space="preserve"> (1)</w:t>
+      </w:r>
+      <w:r>
+        <w:rPr>
+          <w:rFonts w:ascii="Arial" w:hAnsi="Arial" w:cs="Arial"/>
+        </w:rPr>
+        <w:t xml:space="preserve"> 0 (representing all individual information and no group information), 1/3</w:t>
+      </w:r>
+      <w:r>
+        <w:rPr>
+          <w:rFonts w:ascii="Arial" w:hAnsi="Arial" w:cs="Arial"/>
+        </w:rPr>
+        <w:t xml:space="preserve"> (more individual than group information)</w:t>
+      </w:r>
+      <w:r>
+        <w:rPr>
+          <w:rFonts w:ascii="Arial" w:hAnsi="Arial" w:cs="Arial"/>
+        </w:rPr>
+        <w:t>, 2/3</w:t>
+      </w:r>
+      <w:r>
+        <w:rPr>
+          <w:rFonts w:ascii="Arial" w:hAnsi="Arial" w:cs="Arial"/>
+        </w:rPr>
+        <w:t xml:space="preserve"> (</w:t>
+      </w:r>
+      <w:r>
+        <w:rPr>
+          <w:rFonts w:ascii="Arial" w:hAnsi="Arial" w:cs="Arial"/>
+        </w:rPr>
+        <w:t>more group than individual information</w:t>
+      </w:r>
+      <w:r>
+        <w:rPr>
+          <w:rFonts w:ascii="Arial" w:hAnsi="Arial" w:cs="Arial"/>
+        </w:rPr>
+        <w:t>)</w:t>
+      </w:r>
+      <w:r>
+        <w:rPr>
+          <w:rFonts w:ascii="Arial" w:hAnsi="Arial" w:cs="Arial"/>
+        </w:rPr>
+        <w:t>, and 1 (all group and no individual information</w:t>
+      </w:r>
+      <w:r>
+        <w:rPr>
+          <w:rFonts w:ascii="Arial" w:hAnsi="Arial" w:cs="Arial"/>
+        </w:rPr>
+        <w:t>)</w:t>
+      </w:r>
+      <w:r>
+        <w:rPr>
+          <w:rFonts w:ascii="Arial" w:hAnsi="Arial" w:cs="Arial"/>
+        </w:rPr>
+        <w:t>.</w:t>
+      </w:r>
+      <w:r>
+        <w:rPr>
+          <w:rFonts w:ascii="Arial" w:hAnsi="Arial" w:cs="Arial"/>
+        </w:rPr>
+        <w:t xml:space="preserve"> We </w:t>
+      </w:r>
+      <w:r>
+        <w:rPr>
+          <w:rFonts w:ascii="Arial" w:hAnsi="Arial" w:cs="Arial"/>
+        </w:rPr>
+        <w:t xml:space="preserve">used a total length of 6 characters in the overall character string for encoding information at one or both social levels, such that these treatments </w:t>
+      </w:r>
+      <w:r>
+        <w:rPr>
+          <w:rFonts w:ascii="Arial" w:hAnsi="Arial" w:cs="Arial"/>
+        </w:rPr>
+        <w:lastRenderedPageBreak/>
+        <w:t>represented</w:t>
+      </w:r>
+      <w:r>
+        <w:rPr>
+          <w:rFonts w:ascii="Arial" w:hAnsi="Arial" w:cs="Arial"/>
+        </w:rPr>
+        <w:t xml:space="preserve"> 6 characters devoted to individual information, 4 characters for individual and 2 characters for group information, </w:t>
+      </w:r>
+      <w:r>
+        <w:rPr>
+          <w:rFonts w:ascii="Arial" w:hAnsi="Arial" w:cs="Arial"/>
+        </w:rPr>
+        <w:t>2</w:t>
+      </w:r>
+      <w:r>
+        <w:rPr>
+          <w:rFonts w:ascii="Arial" w:hAnsi="Arial" w:cs="Arial"/>
+        </w:rPr>
+        <w:t xml:space="preserve"> characters for individual and </w:t>
+      </w:r>
+      <w:r>
+        <w:rPr>
+          <w:rFonts w:ascii="Arial" w:hAnsi="Arial" w:cs="Arial"/>
+        </w:rPr>
+        <w:t>4</w:t>
+      </w:r>
+      <w:r>
+        <w:rPr>
+          <w:rFonts w:ascii="Arial" w:hAnsi="Arial" w:cs="Arial"/>
+        </w:rPr>
+        <w:t xml:space="preserve"> characters for group information,</w:t>
+      </w:r>
+      <w:r>
+        <w:rPr>
+          <w:rFonts w:ascii="Arial" w:hAnsi="Arial" w:cs="Arial"/>
+        </w:rPr>
+        <w:t xml:space="preserve"> </w:t>
+      </w:r>
+      <w:r>
+        <w:rPr>
+          <w:rFonts w:ascii="Arial" w:hAnsi="Arial" w:cs="Arial"/>
+        </w:rPr>
+        <w:t xml:space="preserve">or </w:t>
+      </w:r>
+      <w:r>
+        <w:rPr>
+          <w:rFonts w:ascii="Arial" w:hAnsi="Arial" w:cs="Arial"/>
+        </w:rPr>
+        <w:t>6 characters devoted to group information</w:t>
+      </w:r>
+      <w:r>
+        <w:rPr>
+          <w:rFonts w:ascii="Arial" w:hAnsi="Arial" w:cs="Arial"/>
+        </w:rPr>
+        <w:t>.</w:t>
+      </w:r>
     </w:p>
     <w:p>
       <w:pPr>
@@ -21274,1204 +21153,823 @@
         <w:spacing w:line="480" w:lineRule="auto"/>
         <w:ind w:firstLine="720"/>
         <w:rPr>
-          <w:ins w:id="110" w:author="Smith Vidaurre, Grace" w:date="2025-06-16T16:43:00Z" w16du:dateUtc="2025-06-16T20:43:00Z"/>
-          <w:rFonts w:ascii="Arial" w:hAnsi="Arial" w:cs="Arial"/>
-        </w:rPr>
-        <w:pPrChange w:id="111" w:author="Smith Vidaurre, Grace" w:date="2025-06-16T17:07:00Z" w16du:dateUtc="2025-06-16T21:07:00Z">
-          <w:pPr>
-            <w:pStyle w:val="NoSpacing"/>
-            <w:spacing w:line="480" w:lineRule="auto"/>
-          </w:pPr>
-        </w:pPrChange>
-      </w:pPr>
-      <w:ins w:id="112" w:author="Smith Vidaurre, Grace" w:date="2025-06-16T16:44:00Z" w16du:dateUtc="2025-06-16T20:44:00Z">
-        <w:r>
-          <w:rPr>
-            <w:rFonts w:ascii="Arial" w:hAnsi="Arial" w:cs="Arial"/>
-          </w:rPr>
-          <w:t xml:space="preserve">We also expected that the size of the signal datasets that we generated would impact our information detection accuracy, </w:t>
-        </w:r>
-      </w:ins>
-      <w:ins w:id="113" w:author="Smith Vidaurre, Grace" w:date="2025-06-16T16:46:00Z" w16du:dateUtc="2025-06-16T20:46:00Z">
-        <w:r>
-          <w:rPr>
-            <w:rFonts w:ascii="Arial" w:hAnsi="Arial" w:cs="Arial"/>
-          </w:rPr>
-          <w:t>as the</w:t>
-        </w:r>
-      </w:ins>
-      <w:ins w:id="114" w:author="Smith Vidaurre, Grace" w:date="2025-06-16T16:45:00Z" w16du:dateUtc="2025-06-16T20:45:00Z">
-        <w:r>
-          <w:rPr>
-            <w:rFonts w:ascii="Arial" w:hAnsi="Arial" w:cs="Arial"/>
-          </w:rPr>
-          <w:t xml:space="preserve"> likelihood</w:t>
-        </w:r>
-      </w:ins>
-      <w:ins w:id="115" w:author="Smith Vidaurre, Grace" w:date="2025-06-16T16:46:00Z" w16du:dateUtc="2025-06-16T20:46:00Z">
-        <w:r>
-          <w:rPr>
-            <w:rFonts w:ascii="Arial" w:hAnsi="Arial" w:cs="Arial"/>
-          </w:rPr>
-          <w:t xml:space="preserve"> </w:t>
-        </w:r>
-      </w:ins>
-      <w:ins w:id="116" w:author="Smith Vidaurre, Grace" w:date="2025-06-16T16:45:00Z" w16du:dateUtc="2025-06-16T20:45:00Z">
-        <w:r>
-          <w:rPr>
-            <w:rFonts w:ascii="Arial" w:hAnsi="Arial" w:cs="Arial"/>
-          </w:rPr>
-          <w:t xml:space="preserve">of </w:t>
-        </w:r>
-      </w:ins>
-      <w:ins w:id="117" w:author="Smith Vidaurre, Grace" w:date="2025-06-16T16:46:00Z" w16du:dateUtc="2025-06-16T20:46:00Z">
-        <w:r>
-          <w:rPr>
-            <w:rFonts w:ascii="Arial" w:hAnsi="Arial" w:cs="Arial"/>
-          </w:rPr>
-          <w:t xml:space="preserve">generating </w:t>
-        </w:r>
-        <w:r>
-          <w:rPr>
-            <w:rFonts w:ascii="Arial" w:hAnsi="Arial" w:cs="Arial"/>
-          </w:rPr>
-          <w:t>stochastically similar</w:t>
-        </w:r>
-        <w:r>
-          <w:rPr>
-            <w:rFonts w:ascii="Arial" w:hAnsi="Arial" w:cs="Arial"/>
-          </w:rPr>
-          <w:t xml:space="preserve"> </w:t>
-        </w:r>
-      </w:ins>
-      <w:ins w:id="118" w:author="Smith Vidaurre, Grace" w:date="2025-06-16T16:45:00Z" w16du:dateUtc="2025-06-16T20:45:00Z">
-        <w:r>
-          <w:rPr>
-            <w:rFonts w:ascii="Arial" w:hAnsi="Arial" w:cs="Arial"/>
-          </w:rPr>
-          <w:t>vocalization</w:t>
-        </w:r>
-      </w:ins>
-      <w:ins w:id="119" w:author="Smith Vidaurre, Grace" w:date="2025-06-16T16:46:00Z" w16du:dateUtc="2025-06-16T20:46:00Z">
-        <w:r>
-          <w:rPr>
-            <w:rFonts w:ascii="Arial" w:hAnsi="Arial" w:cs="Arial"/>
-          </w:rPr>
-          <w:t>s should increase with the size of a given dataset</w:t>
-        </w:r>
-      </w:ins>
-      <w:ins w:id="120" w:author="Smith Vidaurre, Grace" w:date="2025-06-16T16:47:00Z" w16du:dateUtc="2025-06-16T20:47:00Z">
-        <w:r>
-          <w:rPr>
-            <w:rFonts w:ascii="Arial" w:hAnsi="Arial" w:cs="Arial"/>
-          </w:rPr>
-          <w:t>.</w:t>
-        </w:r>
-        <w:r>
-          <w:rPr>
-            <w:rFonts w:ascii="Arial" w:hAnsi="Arial" w:cs="Arial"/>
-          </w:rPr>
-          <w:t xml:space="preserve"> In other words, we anticipated that it would be more difficult to randomly generate completely unique group-level or individual-level vocal signatu</w:t>
-        </w:r>
-        <w:r>
-          <w:rPr>
-            <w:rFonts w:ascii="Arial" w:hAnsi="Arial" w:cs="Arial"/>
-          </w:rPr>
-          <w:t xml:space="preserve">res </w:t>
-        </w:r>
-      </w:ins>
-      <w:ins w:id="121" w:author="Smith Vidaurre, Grace" w:date="2025-06-16T16:48:00Z" w16du:dateUtc="2025-06-16T20:48:00Z">
-        <w:r>
-          <w:rPr>
-            <w:rFonts w:ascii="Arial" w:hAnsi="Arial" w:cs="Arial"/>
-          </w:rPr>
-          <w:t xml:space="preserve">with increasing numbers of </w:t>
-        </w:r>
-        <w:r>
-          <w:rPr>
-            <w:rFonts w:ascii="Arial" w:hAnsi="Arial" w:cs="Arial"/>
-          </w:rPr>
-          <w:t>classes at each social level</w:t>
-        </w:r>
-      </w:ins>
-      <w:ins w:id="122" w:author="Smith Vidaurre, Grace" w:date="2025-06-16T16:49:00Z" w16du:dateUtc="2025-06-16T20:49:00Z">
-        <w:r>
-          <w:rPr>
-            <w:rFonts w:ascii="Arial" w:hAnsi="Arial" w:cs="Arial"/>
-          </w:rPr>
-          <w:t xml:space="preserve">. Indeed, </w:t>
-        </w:r>
-        <w:r>
-          <w:rPr>
-            <w:rFonts w:ascii="Arial" w:hAnsi="Arial" w:cs="Arial"/>
-          </w:rPr>
-          <w:t>given</w:t>
-        </w:r>
-        <w:r>
-          <w:rPr>
-            <w:rFonts w:ascii="Arial" w:hAnsi="Arial" w:cs="Arial"/>
-          </w:rPr>
-          <w:t xml:space="preserve"> our information encoding approach with </w:t>
-        </w:r>
-      </w:ins>
-      <w:ins w:id="123" w:author="Smith Vidaurre, Grace" w:date="2025-06-16T16:51:00Z" w16du:dateUtc="2025-06-16T20:51:00Z">
-        <w:r>
-          <w:rPr>
-            <w:rFonts w:ascii="Arial" w:hAnsi="Arial" w:cs="Arial"/>
-          </w:rPr>
-          <w:t xml:space="preserve">information trits in </w:t>
-        </w:r>
-      </w:ins>
-      <w:ins w:id="124" w:author="Smith Vidaurre, Grace" w:date="2025-06-16T16:49:00Z" w16du:dateUtc="2025-06-16T20:49:00Z">
-        <w:r>
-          <w:rPr>
-            <w:rFonts w:ascii="Arial" w:hAnsi="Arial" w:cs="Arial"/>
-          </w:rPr>
-          <w:t xml:space="preserve">character strings, the </w:t>
-        </w:r>
-      </w:ins>
-      <w:ins w:id="125" w:author="Smith Vidaurre, Grace" w:date="2025-06-16T16:50:00Z" w16du:dateUtc="2025-06-16T20:50:00Z">
-        <w:r>
-          <w:rPr>
-            <w:rFonts w:ascii="Arial" w:hAnsi="Arial" w:cs="Arial"/>
-          </w:rPr>
-          <w:t>greatest number of unique signatures</w:t>
-        </w:r>
-      </w:ins>
-      <w:ins w:id="126" w:author="Smith Vidaurre, Grace" w:date="2025-06-16T16:49:00Z" w16du:dateUtc="2025-06-16T20:49:00Z">
-        <w:r>
-          <w:rPr>
-            <w:rFonts w:ascii="Arial" w:hAnsi="Arial" w:cs="Arial"/>
-          </w:rPr>
-          <w:t xml:space="preserve"> we could </w:t>
-        </w:r>
-      </w:ins>
-      <w:ins w:id="127" w:author="Smith Vidaurre, Grace" w:date="2025-06-16T16:50:00Z" w16du:dateUtc="2025-06-16T20:50:00Z">
-        <w:r>
-          <w:rPr>
-            <w:rFonts w:ascii="Arial" w:hAnsi="Arial" w:cs="Arial"/>
-          </w:rPr>
-          <w:t>create at either social level with only 1 type of information encoding was 3</w:t>
-        </w:r>
-        <w:r>
-          <w:rPr>
-            <w:rFonts w:ascii="Arial" w:hAnsi="Arial" w:cs="Arial"/>
-            <w:vertAlign w:val="superscript"/>
-            <w:rPrChange w:id="128" w:author="Smith Vidaurre, Grace" w:date="2025-06-16T16:50:00Z" w16du:dateUtc="2025-06-16T20:50:00Z">
-              <w:rPr>
-                <w:rFonts w:ascii="Arial" w:hAnsi="Arial" w:cs="Arial"/>
-              </w:rPr>
-            </w:rPrChange>
-          </w:rPr>
-          <w:t>6</w:t>
-        </w:r>
-        <w:r>
-          <w:rPr>
-            <w:rFonts w:ascii="Arial" w:hAnsi="Arial" w:cs="Arial"/>
-          </w:rPr>
-          <w:t xml:space="preserve"> </w:t>
-        </w:r>
-      </w:ins>
-      <w:ins w:id="129" w:author="Smith Vidaurre, Grace" w:date="2025-06-16T16:51:00Z" w16du:dateUtc="2025-06-16T20:51:00Z">
-        <w:r>
-          <w:rPr>
-            <w:rFonts w:ascii="Arial" w:hAnsi="Arial" w:cs="Arial"/>
-          </w:rPr>
-          <w:t>or</w:t>
-        </w:r>
-      </w:ins>
-      <w:ins w:id="130" w:author="Smith Vidaurre, Grace" w:date="2025-06-16T16:52:00Z" w16du:dateUtc="2025-06-16T20:52:00Z">
-        <w:r>
-          <w:rPr>
-            <w:rFonts w:ascii="Arial" w:hAnsi="Arial" w:cs="Arial"/>
-          </w:rPr>
-          <w:t xml:space="preserve"> </w:t>
-        </w:r>
-      </w:ins>
-      <w:ins w:id="131" w:author="Smith Vidaurre, Grace" w:date="2025-06-16T16:51:00Z" w16du:dateUtc="2025-06-16T20:51:00Z">
-        <w:r>
-          <w:rPr>
-            <w:rFonts w:ascii="Arial" w:hAnsi="Arial" w:cs="Arial"/>
-          </w:rPr>
-          <w:t xml:space="preserve">729 unique signatures, </w:t>
-        </w:r>
-      </w:ins>
-      <w:ins w:id="132" w:author="Smith Vidaurre, Grace" w:date="2025-06-16T16:52:00Z" w16du:dateUtc="2025-06-16T20:52:00Z">
-        <w:r>
-          <w:rPr>
-            <w:rFonts w:ascii="Arial" w:hAnsi="Arial" w:cs="Arial"/>
-          </w:rPr>
-          <w:t>and</w:t>
-        </w:r>
-      </w:ins>
-      <w:ins w:id="133" w:author="Smith Vidaurre, Grace" w:date="2025-06-16T16:51:00Z" w16du:dateUtc="2025-06-16T20:51:00Z">
-        <w:r>
-          <w:rPr>
-            <w:rFonts w:ascii="Arial" w:hAnsi="Arial" w:cs="Arial"/>
-          </w:rPr>
-          <w:t xml:space="preserve"> 3</w:t>
-        </w:r>
-        <w:r>
-          <w:rPr>
-            <w:rFonts w:ascii="Arial" w:hAnsi="Arial" w:cs="Arial"/>
-            <w:vertAlign w:val="superscript"/>
-            <w:rPrChange w:id="134" w:author="Smith Vidaurre, Grace" w:date="2025-06-16T16:51:00Z" w16du:dateUtc="2025-06-16T20:51:00Z">
-              <w:rPr>
-                <w:rFonts w:ascii="Arial" w:hAnsi="Arial" w:cs="Arial"/>
-              </w:rPr>
-            </w:rPrChange>
-          </w:rPr>
-          <w:t>4</w:t>
-        </w:r>
-        <w:r>
-          <w:rPr>
-            <w:rFonts w:ascii="Arial" w:hAnsi="Arial" w:cs="Arial"/>
-          </w:rPr>
-          <w:t xml:space="preserve"> or </w:t>
-        </w:r>
-        <w:r>
-          <w:rPr>
-            <w:rFonts w:ascii="Arial" w:hAnsi="Arial" w:cs="Arial"/>
-          </w:rPr>
-          <w:t>81 unique signatures</w:t>
-        </w:r>
-      </w:ins>
-      <w:ins w:id="135" w:author="Smith Vidaurre, Grace" w:date="2025-06-16T16:52:00Z" w16du:dateUtc="2025-06-16T20:52:00Z">
-        <w:r>
-          <w:rPr>
-            <w:rFonts w:ascii="Arial" w:hAnsi="Arial" w:cs="Arial"/>
-          </w:rPr>
-          <w:t xml:space="preserve"> when encoding both group and individual-level information</w:t>
-        </w:r>
-        <w:r>
-          <w:rPr>
-            <w:rFonts w:ascii="Arial" w:hAnsi="Arial" w:cs="Arial"/>
-          </w:rPr>
-          <w:t xml:space="preserve"> (CITE Beecher information theory review)</w:t>
-        </w:r>
-        <w:r>
-          <w:rPr>
-            <w:rFonts w:ascii="Arial" w:hAnsi="Arial" w:cs="Arial"/>
-          </w:rPr>
-          <w:t>.</w:t>
-        </w:r>
-        <w:r>
-          <w:rPr>
-            <w:rFonts w:ascii="Arial" w:hAnsi="Arial" w:cs="Arial"/>
-          </w:rPr>
-          <w:t xml:space="preserve"> Our manipulation</w:t>
-        </w:r>
-        <w:r>
-          <w:rPr>
-            <w:rFonts w:ascii="Arial" w:hAnsi="Arial" w:cs="Arial"/>
-          </w:rPr>
-          <w:t xml:space="preserve"> </w:t>
-        </w:r>
-        <w:r>
-          <w:rPr>
-            <w:rFonts w:ascii="Arial" w:hAnsi="Arial" w:cs="Arial"/>
-          </w:rPr>
-          <w:t xml:space="preserve">of </w:t>
-        </w:r>
-      </w:ins>
-      <w:ins w:id="136" w:author="Smith Vidaurre, Grace" w:date="2025-06-16T16:53:00Z" w16du:dateUtc="2025-06-16T20:53:00Z">
-        <w:r>
-          <w:rPr>
-            <w:rFonts w:ascii="Arial" w:hAnsi="Arial" w:cs="Arial"/>
-          </w:rPr>
-          <w:t xml:space="preserve">the number of classes at either social level, or the size of the resulting signal datasets, was therefore a proxy for the crowdedness of </w:t>
-        </w:r>
-        <w:r>
-          <w:rPr>
-            <w:rFonts w:ascii="Arial" w:hAnsi="Arial" w:cs="Arial"/>
-          </w:rPr>
-          <w:t>the signaling environment</w:t>
-        </w:r>
-        <w:r>
-          <w:rPr>
-            <w:rFonts w:ascii="Arial" w:hAnsi="Arial" w:cs="Arial"/>
-          </w:rPr>
-          <w:t>, such that it should be harder to create distinctive identity signatures</w:t>
-        </w:r>
-      </w:ins>
-      <w:ins w:id="137" w:author="Smith Vidaurre, Grace" w:date="2025-06-16T16:54:00Z" w16du:dateUtc="2025-06-16T20:54:00Z">
-        <w:r>
-          <w:rPr>
-            <w:rFonts w:ascii="Arial" w:hAnsi="Arial" w:cs="Arial"/>
-          </w:rPr>
-          <w:t xml:space="preserve"> when interacting with increasing numbers of individuals </w:t>
-        </w:r>
-        <w:r>
-          <w:rPr>
-            <w:rFonts w:ascii="Arial" w:hAnsi="Arial" w:cs="Arial"/>
-          </w:rPr>
-          <w:t>information (CITE Beecher information theory review)</w:t>
-        </w:r>
-        <w:r>
-          <w:rPr>
-            <w:rFonts w:ascii="Arial" w:hAnsi="Arial" w:cs="Arial"/>
-          </w:rPr>
-          <w:t>.</w:t>
-        </w:r>
-        <w:r>
-          <w:rPr>
-            <w:rFonts w:ascii="Arial" w:hAnsi="Arial" w:cs="Arial"/>
-          </w:rPr>
-          <w:t xml:space="preserve"> </w:t>
-        </w:r>
-      </w:ins>
-      <w:ins w:id="138" w:author="Smith Vidaurre, Grace" w:date="2025-06-16T16:59:00Z" w16du:dateUtc="2025-06-16T20:59:00Z">
-        <w:r>
-          <w:rPr>
-            <w:rFonts w:ascii="Arial" w:hAnsi="Arial" w:cs="Arial"/>
-          </w:rPr>
-          <w:t>W</w:t>
-        </w:r>
-      </w:ins>
-      <w:ins w:id="139" w:author="Smith Vidaurre, Grace" w:date="2025-06-16T16:58:00Z" w16du:dateUtc="2025-06-16T20:58:00Z">
-        <w:r>
-          <w:rPr>
-            <w:rFonts w:ascii="Arial" w:hAnsi="Arial" w:cs="Arial"/>
-          </w:rPr>
-          <w:t xml:space="preserve">e varied </w:t>
-        </w:r>
-      </w:ins>
-      <w:ins w:id="140" w:author="Smith Vidaurre, Grace" w:date="2025-06-16T16:59:00Z" w16du:dateUtc="2025-06-16T20:59:00Z">
-        <w:r>
-          <w:rPr>
-            <w:rFonts w:ascii="Arial" w:hAnsi="Arial" w:cs="Arial"/>
-          </w:rPr>
-          <w:t>the number of classes and vocalizations produced per class at each social level over four</w:t>
-        </w:r>
-        <w:r>
-          <w:rPr>
-            <w:rFonts w:ascii="Arial" w:hAnsi="Arial" w:cs="Arial"/>
-          </w:rPr>
-          <w:t xml:space="preserve"> experimental </w:t>
-        </w:r>
-        <w:r>
-          <w:rPr>
-            <w:rFonts w:ascii="Arial" w:hAnsi="Arial" w:cs="Arial"/>
-          </w:rPr>
-          <w:t>treatments</w:t>
-        </w:r>
-      </w:ins>
-      <w:ins w:id="141" w:author="Smith Vidaurre, Grace" w:date="2025-06-16T17:00:00Z" w16du:dateUtc="2025-06-16T21:00:00Z">
-        <w:r>
-          <w:rPr>
-            <w:rFonts w:ascii="Arial" w:hAnsi="Arial" w:cs="Arial"/>
-          </w:rPr>
-          <w:t xml:space="preserve">: </w:t>
-        </w:r>
-        <w:r>
-          <w:rPr>
-            <w:rFonts w:ascii="Arial" w:hAnsi="Arial" w:cs="Arial"/>
-          </w:rPr>
-          <w:t>2, 4, 6 or 8 classes</w:t>
-        </w:r>
-      </w:ins>
-      <w:ins w:id="142" w:author="Smith Vidaurre, Grace" w:date="2025-06-16T16:59:00Z" w16du:dateUtc="2025-06-16T20:59:00Z">
-        <w:r>
-          <w:rPr>
-            <w:rFonts w:ascii="Arial" w:hAnsi="Arial" w:cs="Arial"/>
-          </w:rPr>
-          <w:t xml:space="preserve">. </w:t>
-        </w:r>
-      </w:ins>
-      <w:ins w:id="143" w:author="Smith Vidaurre, Grace" w:date="2025-06-16T17:00:00Z" w16du:dateUtc="2025-06-16T21:00:00Z">
-        <w:r>
-          <w:rPr>
-            <w:rFonts w:ascii="Arial" w:hAnsi="Arial" w:cs="Arial"/>
-          </w:rPr>
-          <w:t>W</w:t>
-        </w:r>
-        <w:r>
-          <w:rPr>
-            <w:rFonts w:ascii="Arial" w:hAnsi="Arial" w:cs="Arial"/>
-          </w:rPr>
-          <w:t xml:space="preserve">ithin a treatment, </w:t>
-        </w:r>
-      </w:ins>
-      <w:ins w:id="144" w:author="Smith Vidaurre, Grace" w:date="2025-06-16T16:59:00Z" w16du:dateUtc="2025-06-16T20:59:00Z">
-        <w:r>
-          <w:rPr>
-            <w:rFonts w:ascii="Arial" w:hAnsi="Arial" w:cs="Arial"/>
-          </w:rPr>
-          <w:t xml:space="preserve">we </w:t>
-        </w:r>
-      </w:ins>
-      <w:ins w:id="145" w:author="Smith Vidaurre, Grace" w:date="2025-06-16T17:00:00Z" w16du:dateUtc="2025-06-16T21:00:00Z">
-        <w:r>
-          <w:rPr>
-            <w:rFonts w:ascii="Arial" w:hAnsi="Arial" w:cs="Arial"/>
-          </w:rPr>
-          <w:t>used a constant</w:t>
-        </w:r>
-      </w:ins>
-      <w:ins w:id="146" w:author="Smith Vidaurre, Grace" w:date="2025-06-16T16:59:00Z" w16du:dateUtc="2025-06-16T20:59:00Z">
-        <w:r>
-          <w:rPr>
-            <w:rFonts w:ascii="Arial" w:hAnsi="Arial" w:cs="Arial"/>
-          </w:rPr>
-          <w:t xml:space="preserve"> number of classes </w:t>
-        </w:r>
-      </w:ins>
-      <w:ins w:id="147" w:author="Smith Vidaurre, Grace" w:date="2025-06-16T17:02:00Z" w16du:dateUtc="2025-06-16T21:02:00Z">
-        <w:r>
-          <w:rPr>
-            <w:rFonts w:ascii="Arial" w:hAnsi="Arial" w:cs="Arial"/>
-          </w:rPr>
-          <w:t xml:space="preserve">and vocalizations </w:t>
-        </w:r>
-      </w:ins>
-      <w:ins w:id="148" w:author="Smith Vidaurre, Grace" w:date="2025-06-16T17:00:00Z" w16du:dateUtc="2025-06-16T21:00:00Z">
-        <w:r>
-          <w:rPr>
-            <w:rFonts w:ascii="Arial" w:hAnsi="Arial" w:cs="Arial"/>
-          </w:rPr>
-          <w:t>assigned to each social level.</w:t>
-        </w:r>
-        <w:r>
-          <w:rPr>
-            <w:rFonts w:ascii="Arial" w:hAnsi="Arial" w:cs="Arial"/>
-          </w:rPr>
-          <w:t xml:space="preserve"> </w:t>
-        </w:r>
-        <w:r>
-          <w:rPr>
-            <w:rFonts w:ascii="Arial" w:hAnsi="Arial" w:cs="Arial"/>
-          </w:rPr>
-          <w:t xml:space="preserve">For instance, in the </w:t>
-        </w:r>
-      </w:ins>
-      <w:ins w:id="149" w:author="Smith Vidaurre, Grace" w:date="2025-06-16T17:01:00Z" w16du:dateUtc="2025-06-16T21:01:00Z">
-        <w:r>
-          <w:rPr>
-            <w:rFonts w:ascii="Arial" w:hAnsi="Arial" w:cs="Arial"/>
-          </w:rPr>
-          <w:t>2</w:t>
-        </w:r>
-      </w:ins>
-      <w:ins w:id="150" w:author="Smith Vidaurre, Grace" w:date="2025-06-16T17:06:00Z" w16du:dateUtc="2025-06-16T21:06:00Z">
-        <w:r>
-          <w:rPr>
-            <w:rFonts w:ascii="Arial" w:hAnsi="Arial" w:cs="Arial"/>
-          </w:rPr>
-          <w:t>-</w:t>
-        </w:r>
-      </w:ins>
-      <w:ins w:id="151" w:author="Smith Vidaurre, Grace" w:date="2025-06-16T17:01:00Z" w16du:dateUtc="2025-06-16T21:01:00Z">
-        <w:r>
-          <w:rPr>
-            <w:rFonts w:ascii="Arial" w:hAnsi="Arial" w:cs="Arial"/>
-          </w:rPr>
-          <w:t xml:space="preserve">class treatment, the resulting signal datasets were composed of </w:t>
-        </w:r>
-        <w:r>
-          <w:rPr>
-            <w:rFonts w:ascii="Arial" w:hAnsi="Arial" w:cs="Arial"/>
-          </w:rPr>
-          <w:t>2 groups</w:t>
-        </w:r>
-      </w:ins>
-      <w:ins w:id="152" w:author="Smith Vidaurre, Grace" w:date="2025-06-16T17:03:00Z" w16du:dateUtc="2025-06-16T21:03:00Z">
-        <w:r>
-          <w:rPr>
-            <w:rFonts w:ascii="Arial" w:hAnsi="Arial" w:cs="Arial"/>
-          </w:rPr>
-          <w:t xml:space="preserve">, </w:t>
-        </w:r>
-      </w:ins>
-      <w:ins w:id="153" w:author="Smith Vidaurre, Grace" w:date="2025-06-16T17:01:00Z" w16du:dateUtc="2025-06-16T21:01:00Z">
-        <w:r>
-          <w:rPr>
-            <w:rFonts w:ascii="Arial" w:hAnsi="Arial" w:cs="Arial"/>
-          </w:rPr>
-          <w:t>2 individuals per group</w:t>
-        </w:r>
-      </w:ins>
-      <w:ins w:id="154" w:author="Smith Vidaurre, Grace" w:date="2025-06-16T17:03:00Z" w16du:dateUtc="2025-06-16T21:03:00Z">
-        <w:r>
-          <w:rPr>
-            <w:rFonts w:ascii="Arial" w:hAnsi="Arial" w:cs="Arial"/>
-          </w:rPr>
-          <w:t xml:space="preserve">, and 2 vocalizations per individual. In downstream analyses, we used the 2 exemplars of vocalizations per individual and </w:t>
-        </w:r>
-      </w:ins>
-      <w:ins w:id="155" w:author="Smith Vidaurre, Grace" w:date="2025-06-16T17:06:00Z" w16du:dateUtc="2025-06-16T21:06:00Z">
-        <w:r>
-          <w:rPr>
-            <w:rFonts w:ascii="Arial" w:hAnsi="Arial" w:cs="Arial"/>
-          </w:rPr>
-          <w:t xml:space="preserve">randomly </w:t>
-        </w:r>
-        <w:r>
-          <w:rPr>
-            <w:rFonts w:ascii="Arial" w:hAnsi="Arial" w:cs="Arial"/>
-          </w:rPr>
-          <w:lastRenderedPageBreak/>
-          <w:t>selected 1 vocalization</w:t>
-        </w:r>
-        <w:r>
-          <w:rPr>
-            <w:rFonts w:ascii="Arial" w:hAnsi="Arial" w:cs="Arial"/>
-          </w:rPr>
-          <w:t xml:space="preserve"> per individual in each group to use the same number of vocalizations in </w:t>
-        </w:r>
-      </w:ins>
-      <w:ins w:id="156" w:author="Smith Vidaurre, Grace" w:date="2025-06-16T17:03:00Z" w16du:dateUtc="2025-06-16T21:03:00Z">
-        <w:r>
-          <w:rPr>
-            <w:rFonts w:ascii="Arial" w:hAnsi="Arial" w:cs="Arial"/>
-          </w:rPr>
-          <w:t>group-level</w:t>
-        </w:r>
-      </w:ins>
-      <w:ins w:id="157" w:author="Smith Vidaurre, Grace" w:date="2025-06-16T17:06:00Z" w16du:dateUtc="2025-06-16T21:06:00Z">
-        <w:r>
-          <w:rPr>
-            <w:rFonts w:ascii="Arial" w:hAnsi="Arial" w:cs="Arial"/>
-          </w:rPr>
-          <w:t xml:space="preserve"> analyses.</w:t>
-        </w:r>
-      </w:ins>
-      <w:moveToRangeStart w:id="158" w:author="Smith Vidaurre, Grace" w:date="2025-06-16T16:54:00Z" w:name="move200985309"/>
-      <w:moveTo w:id="159" w:author="Smith Vidaurre, Grace" w:date="2025-06-16T16:54:00Z" w16du:dateUtc="2025-06-16T20:54:00Z">
-        <w:del w:id="160" w:author="Smith Vidaurre, Grace" w:date="2025-06-16T16:55:00Z" w16du:dateUtc="2025-06-16T20:55:00Z">
-          <w:r>
-            <w:rPr>
-              <w:rFonts w:ascii="Arial" w:hAnsi="Arial" w:cs="Arial"/>
-            </w:rPr>
-            <w:delText>We also varied the proportion of group information to individual information encoded in the signal, with four categories: 0 (representing all individual information and no group information), 1/3, 2/3, and 1 (representing all group information and no individual information.</w:delText>
-          </w:r>
-        </w:del>
-      </w:moveTo>
-      <w:moveToRangeEnd w:id="158"/>
+          <w:rFonts w:ascii="Arial" w:hAnsi="Arial" w:cs="Arial"/>
+        </w:rPr>
+      </w:pPr>
+      <w:r>
+        <w:rPr>
+          <w:rFonts w:ascii="Arial" w:hAnsi="Arial" w:cs="Arial"/>
+        </w:rPr>
+        <w:t xml:space="preserve">We also expected that the size of the signal datasets that we generated would impact our information detection accuracy, </w:t>
+      </w:r>
+      <w:r>
+        <w:rPr>
+          <w:rFonts w:ascii="Arial" w:hAnsi="Arial" w:cs="Arial"/>
+        </w:rPr>
+        <w:t xml:space="preserve">as the likelihood of generating </w:t>
+      </w:r>
+      <w:r>
+        <w:rPr>
+          <w:rFonts w:ascii="Arial" w:hAnsi="Arial" w:cs="Arial"/>
+        </w:rPr>
+        <w:t>stochastically similar</w:t>
+      </w:r>
+      <w:r>
+        <w:rPr>
+          <w:rFonts w:ascii="Arial" w:hAnsi="Arial" w:cs="Arial"/>
+        </w:rPr>
+        <w:t xml:space="preserve"> vocalizations should increase with the size of a given dataset</w:t>
+      </w:r>
+      <w:r>
+        <w:rPr>
+          <w:rFonts w:ascii="Arial" w:hAnsi="Arial" w:cs="Arial"/>
+        </w:rPr>
+        <w:t>.</w:t>
+      </w:r>
+      <w:r>
+        <w:rPr>
+          <w:rFonts w:ascii="Arial" w:hAnsi="Arial" w:cs="Arial"/>
+        </w:rPr>
+        <w:t xml:space="preserve"> In other words, we anticipated that it would be more difficult to randomly generate completely unique group-level or individual-level vocal signatu</w:t>
+      </w:r>
+      <w:r>
+        <w:rPr>
+          <w:rFonts w:ascii="Arial" w:hAnsi="Arial" w:cs="Arial"/>
+        </w:rPr>
+        <w:t xml:space="preserve">res </w:t>
+      </w:r>
+      <w:r>
+        <w:rPr>
+          <w:rFonts w:ascii="Arial" w:hAnsi="Arial" w:cs="Arial"/>
+        </w:rPr>
+        <w:t xml:space="preserve">with increasing numbers of </w:t>
+      </w:r>
+      <w:r>
+        <w:rPr>
+          <w:rFonts w:ascii="Arial" w:hAnsi="Arial" w:cs="Arial"/>
+        </w:rPr>
+        <w:t>classes at each social level</w:t>
+      </w:r>
+      <w:r>
+        <w:rPr>
+          <w:rFonts w:ascii="Arial" w:hAnsi="Arial" w:cs="Arial"/>
+        </w:rPr>
+        <w:t xml:space="preserve">. Indeed, </w:t>
+      </w:r>
+      <w:r>
+        <w:rPr>
+          <w:rFonts w:ascii="Arial" w:hAnsi="Arial" w:cs="Arial"/>
+        </w:rPr>
+        <w:t>given</w:t>
+      </w:r>
+      <w:r>
+        <w:rPr>
+          <w:rFonts w:ascii="Arial" w:hAnsi="Arial" w:cs="Arial"/>
+        </w:rPr>
+        <w:t xml:space="preserve"> our information encoding approach with </w:t>
+      </w:r>
+      <w:r>
+        <w:rPr>
+          <w:rFonts w:ascii="Arial" w:hAnsi="Arial" w:cs="Arial"/>
+        </w:rPr>
+        <w:t xml:space="preserve">information trits in </w:t>
+      </w:r>
+      <w:r>
+        <w:rPr>
+          <w:rFonts w:ascii="Arial" w:hAnsi="Arial" w:cs="Arial"/>
+        </w:rPr>
+        <w:t xml:space="preserve">character strings, the </w:t>
+      </w:r>
+      <w:r>
+        <w:rPr>
+          <w:rFonts w:ascii="Arial" w:hAnsi="Arial" w:cs="Arial"/>
+        </w:rPr>
+        <w:t>greatest number of unique signatures</w:t>
+      </w:r>
+      <w:r>
+        <w:rPr>
+          <w:rFonts w:ascii="Arial" w:hAnsi="Arial" w:cs="Arial"/>
+        </w:rPr>
+        <w:t xml:space="preserve"> we could </w:t>
+      </w:r>
+      <w:r>
+        <w:rPr>
+          <w:rFonts w:ascii="Arial" w:hAnsi="Arial" w:cs="Arial"/>
+        </w:rPr>
+        <w:t>create at either social level with only 1 type of information encoding was 3</w:t>
+      </w:r>
+      <w:r>
+        <w:rPr>
+          <w:rFonts w:ascii="Arial" w:hAnsi="Arial" w:cs="Arial"/>
+          <w:vertAlign w:val="superscript"/>
+        </w:rPr>
+        <w:t>6</w:t>
+      </w:r>
+      <w:r>
+        <w:rPr>
+          <w:rFonts w:ascii="Arial" w:hAnsi="Arial" w:cs="Arial"/>
+        </w:rPr>
+        <w:t xml:space="preserve"> </w:t>
+      </w:r>
+      <w:r>
+        <w:rPr>
+          <w:rFonts w:ascii="Arial" w:hAnsi="Arial" w:cs="Arial"/>
+        </w:rPr>
+        <w:t>or</w:t>
+      </w:r>
+      <w:r>
+        <w:rPr>
+          <w:rFonts w:ascii="Arial" w:hAnsi="Arial" w:cs="Arial"/>
+        </w:rPr>
+        <w:t xml:space="preserve"> </w:t>
+      </w:r>
+      <w:r>
+        <w:rPr>
+          <w:rFonts w:ascii="Arial" w:hAnsi="Arial" w:cs="Arial"/>
+        </w:rPr>
+        <w:t xml:space="preserve">729 unique signatures, </w:t>
+      </w:r>
+      <w:r>
+        <w:rPr>
+          <w:rFonts w:ascii="Arial" w:hAnsi="Arial" w:cs="Arial"/>
+        </w:rPr>
+        <w:t>and</w:t>
+      </w:r>
+      <w:r>
+        <w:rPr>
+          <w:rFonts w:ascii="Arial" w:hAnsi="Arial" w:cs="Arial"/>
+        </w:rPr>
+        <w:t xml:space="preserve"> 3</w:t>
+      </w:r>
+      <w:r>
+        <w:rPr>
+          <w:rFonts w:ascii="Arial" w:hAnsi="Arial" w:cs="Arial"/>
+          <w:vertAlign w:val="superscript"/>
+        </w:rPr>
+        <w:t>4</w:t>
+      </w:r>
+      <w:r>
+        <w:rPr>
+          <w:rFonts w:ascii="Arial" w:hAnsi="Arial" w:cs="Arial"/>
+        </w:rPr>
+        <w:t xml:space="preserve"> or </w:t>
+      </w:r>
+      <w:r>
+        <w:rPr>
+          <w:rFonts w:ascii="Arial" w:hAnsi="Arial" w:cs="Arial"/>
+        </w:rPr>
+        <w:t>81 unique signatures</w:t>
+      </w:r>
+      <w:r>
+        <w:rPr>
+          <w:rFonts w:ascii="Arial" w:hAnsi="Arial" w:cs="Arial"/>
+        </w:rPr>
+        <w:t xml:space="preserve"> when encoding both group and individual-level information</w:t>
+      </w:r>
+      <w:r>
+        <w:rPr>
+          <w:rFonts w:ascii="Arial" w:hAnsi="Arial" w:cs="Arial"/>
+        </w:rPr>
+        <w:t xml:space="preserve"> (CITE Beecher information theory review)</w:t>
+      </w:r>
+      <w:r>
+        <w:rPr>
+          <w:rFonts w:ascii="Arial" w:hAnsi="Arial" w:cs="Arial"/>
+        </w:rPr>
+        <w:t>.</w:t>
+      </w:r>
+      <w:r>
+        <w:rPr>
+          <w:rFonts w:ascii="Arial" w:hAnsi="Arial" w:cs="Arial"/>
+        </w:rPr>
+        <w:t xml:space="preserve"> Our manipulation</w:t>
+      </w:r>
+      <w:r>
+        <w:rPr>
+          <w:rFonts w:ascii="Arial" w:hAnsi="Arial" w:cs="Arial"/>
+        </w:rPr>
+        <w:t xml:space="preserve"> </w:t>
+      </w:r>
+      <w:r>
+        <w:rPr>
+          <w:rFonts w:ascii="Arial" w:hAnsi="Arial" w:cs="Arial"/>
+        </w:rPr>
+        <w:t xml:space="preserve">of </w:t>
+      </w:r>
+      <w:r>
+        <w:rPr>
+          <w:rFonts w:ascii="Arial" w:hAnsi="Arial" w:cs="Arial"/>
+        </w:rPr>
+        <w:t xml:space="preserve">the number of classes at either social level, or the size of the resulting signal datasets, was therefore a proxy for the crowdedness of </w:t>
+      </w:r>
+      <w:r>
+        <w:rPr>
+          <w:rFonts w:ascii="Arial" w:hAnsi="Arial" w:cs="Arial"/>
+        </w:rPr>
+        <w:t>the signaling environment</w:t>
+      </w:r>
+      <w:r>
+        <w:rPr>
+          <w:rFonts w:ascii="Arial" w:hAnsi="Arial" w:cs="Arial"/>
+        </w:rPr>
+        <w:t>, such that it should be harder to create distinctive identity signatures</w:t>
+      </w:r>
+      <w:r>
+        <w:rPr>
+          <w:rFonts w:ascii="Arial" w:hAnsi="Arial" w:cs="Arial"/>
+        </w:rPr>
+        <w:t xml:space="preserve"> when interacting with increasing numbers of individuals </w:t>
+      </w:r>
+      <w:r>
+        <w:rPr>
+          <w:rFonts w:ascii="Arial" w:hAnsi="Arial" w:cs="Arial"/>
+        </w:rPr>
+        <w:t>information (CITE Beecher information theory review)</w:t>
+      </w:r>
+      <w:r>
+        <w:rPr>
+          <w:rFonts w:ascii="Arial" w:hAnsi="Arial" w:cs="Arial"/>
+        </w:rPr>
+        <w:t>.</w:t>
+      </w:r>
+      <w:r>
+        <w:rPr>
+          <w:rFonts w:ascii="Arial" w:hAnsi="Arial" w:cs="Arial"/>
+        </w:rPr>
+        <w:t xml:space="preserve"> </w:t>
+      </w:r>
+      <w:r>
+        <w:rPr>
+          <w:rFonts w:ascii="Arial" w:hAnsi="Arial" w:cs="Arial"/>
+        </w:rPr>
+        <w:t>W</w:t>
+      </w:r>
+      <w:r>
+        <w:rPr>
+          <w:rFonts w:ascii="Arial" w:hAnsi="Arial" w:cs="Arial"/>
+        </w:rPr>
+        <w:t xml:space="preserve">e varied </w:t>
+      </w:r>
+      <w:r>
+        <w:rPr>
+          <w:rFonts w:ascii="Arial" w:hAnsi="Arial" w:cs="Arial"/>
+        </w:rPr>
+        <w:t>the number of classes and vocalizations produced per class at each social level over four</w:t>
+      </w:r>
+      <w:r>
+        <w:rPr>
+          <w:rFonts w:ascii="Arial" w:hAnsi="Arial" w:cs="Arial"/>
+        </w:rPr>
+        <w:t xml:space="preserve"> experimental </w:t>
+      </w:r>
+      <w:r>
+        <w:rPr>
+          <w:rFonts w:ascii="Arial" w:hAnsi="Arial" w:cs="Arial"/>
+        </w:rPr>
+        <w:t>treatments</w:t>
+      </w:r>
+      <w:r>
+        <w:rPr>
+          <w:rFonts w:ascii="Arial" w:hAnsi="Arial" w:cs="Arial"/>
+        </w:rPr>
+        <w:t xml:space="preserve">: </w:t>
+      </w:r>
+      <w:r>
+        <w:rPr>
+          <w:rFonts w:ascii="Arial" w:hAnsi="Arial" w:cs="Arial"/>
+        </w:rPr>
+        <w:t>2, 4, 6 or 8 classes</w:t>
+      </w:r>
+      <w:r>
+        <w:rPr>
+          <w:rFonts w:ascii="Arial" w:hAnsi="Arial" w:cs="Arial"/>
+        </w:rPr>
+        <w:t xml:space="preserve">. </w:t>
+      </w:r>
+      <w:r>
+        <w:rPr>
+          <w:rFonts w:ascii="Arial" w:hAnsi="Arial" w:cs="Arial"/>
+        </w:rPr>
+        <w:t>W</w:t>
+      </w:r>
+      <w:r>
+        <w:rPr>
+          <w:rFonts w:ascii="Arial" w:hAnsi="Arial" w:cs="Arial"/>
+        </w:rPr>
+        <w:t xml:space="preserve">ithin a treatment, we used a constant number of classes </w:t>
+      </w:r>
+      <w:r>
+        <w:rPr>
+          <w:rFonts w:ascii="Arial" w:hAnsi="Arial" w:cs="Arial"/>
+        </w:rPr>
+        <w:t xml:space="preserve">and vocalizations </w:t>
+      </w:r>
+      <w:r>
+        <w:rPr>
+          <w:rFonts w:ascii="Arial" w:hAnsi="Arial" w:cs="Arial"/>
+        </w:rPr>
+        <w:t>assigned to each social level.</w:t>
+      </w:r>
+      <w:r>
+        <w:rPr>
+          <w:rFonts w:ascii="Arial" w:hAnsi="Arial" w:cs="Arial"/>
+        </w:rPr>
+        <w:t xml:space="preserve"> </w:t>
+      </w:r>
+      <w:r>
+        <w:rPr>
+          <w:rFonts w:ascii="Arial" w:hAnsi="Arial" w:cs="Arial"/>
+        </w:rPr>
+        <w:t>For instance, in the 2</w:t>
+      </w:r>
+      <w:r>
+        <w:rPr>
+          <w:rFonts w:ascii="Arial" w:hAnsi="Arial" w:cs="Arial"/>
+        </w:rPr>
+        <w:t>-</w:t>
+      </w:r>
+      <w:r>
+        <w:rPr>
+          <w:rFonts w:ascii="Arial" w:hAnsi="Arial" w:cs="Arial"/>
+        </w:rPr>
+        <w:t xml:space="preserve">class treatment, the resulting signal datasets were composed of </w:t>
+      </w:r>
+      <w:r>
+        <w:rPr>
+          <w:rFonts w:ascii="Arial" w:hAnsi="Arial" w:cs="Arial"/>
+        </w:rPr>
+        <w:t>2 groups</w:t>
+      </w:r>
+      <w:r>
+        <w:rPr>
+          <w:rFonts w:ascii="Arial" w:hAnsi="Arial" w:cs="Arial"/>
+        </w:rPr>
+        <w:t xml:space="preserve">, </w:t>
+      </w:r>
+      <w:r>
+        <w:rPr>
+          <w:rFonts w:ascii="Arial" w:hAnsi="Arial" w:cs="Arial"/>
+        </w:rPr>
+        <w:t>2 individuals per group</w:t>
+      </w:r>
+      <w:r>
+        <w:rPr>
+          <w:rFonts w:ascii="Arial" w:hAnsi="Arial" w:cs="Arial"/>
+        </w:rPr>
+        <w:t xml:space="preserve">, and 2 vocalizations per individual. In downstream analyses, we used the 2 exemplars of vocalizations per individual and </w:t>
+      </w:r>
+      <w:r>
+        <w:rPr>
+          <w:rFonts w:ascii="Arial" w:hAnsi="Arial" w:cs="Arial"/>
+        </w:rPr>
+        <w:t xml:space="preserve">randomly </w:t>
+      </w:r>
+      <w:r>
+        <w:rPr>
+          <w:rFonts w:ascii="Arial" w:hAnsi="Arial" w:cs="Arial"/>
+        </w:rPr>
+        <w:lastRenderedPageBreak/>
+        <w:t>selected 1 vocalization</w:t>
+      </w:r>
+      <w:r>
+        <w:rPr>
+          <w:rFonts w:ascii="Arial" w:hAnsi="Arial" w:cs="Arial"/>
+        </w:rPr>
+        <w:t xml:space="preserve"> per individual in each group to use the same number of vocalizations in </w:t>
+      </w:r>
+      <w:r>
+        <w:rPr>
+          <w:rFonts w:ascii="Arial" w:hAnsi="Arial" w:cs="Arial"/>
+        </w:rPr>
+        <w:t>group-level</w:t>
+      </w:r>
+      <w:r>
+        <w:rPr>
+          <w:rFonts w:ascii="Arial" w:hAnsi="Arial" w:cs="Arial"/>
+        </w:rPr>
+        <w:t xml:space="preserve"> analyses.</w:t>
+      </w:r>
     </w:p>
     <w:p>
       <w:pPr>
         <w:pStyle w:val="NoSpacing"/>
         <w:spacing w:line="480" w:lineRule="auto"/>
         <w:rPr>
-          <w:ins w:id="161" w:author="Smith Vidaurre, Grace" w:date="2025-06-16T17:18:00Z" w16du:dateUtc="2025-06-16T21:18:00Z"/>
-          <w:rFonts w:ascii="Arial" w:hAnsi="Arial" w:cs="Arial"/>
-        </w:rPr>
-      </w:pPr>
-      <w:ins w:id="162" w:author="Smith Vidaurre, Grace" w:date="2025-06-16T16:54:00Z" w16du:dateUtc="2025-06-16T20:54:00Z">
-        <w:r>
-          <w:rPr>
-            <w:rFonts w:ascii="Arial" w:hAnsi="Arial" w:cs="Arial"/>
-          </w:rPr>
-          <w:tab/>
-        </w:r>
-      </w:ins>
-      <w:ins w:id="163" w:author="Smith Vidaurre, Grace" w:date="2025-06-16T17:07:00Z" w16du:dateUtc="2025-06-16T21:07:00Z">
-        <w:r>
-          <w:rPr>
-            <w:rFonts w:ascii="Arial" w:hAnsi="Arial" w:cs="Arial"/>
-          </w:rPr>
-          <w:t>We ran our</w:t>
-        </w:r>
-      </w:ins>
-      <w:ins w:id="164" w:author="Smith Vidaurre, Grace" w:date="2025-06-16T16:54:00Z" w16du:dateUtc="2025-06-16T20:54:00Z">
-        <w:r>
-          <w:rPr>
-            <w:rFonts w:ascii="Arial" w:hAnsi="Arial" w:cs="Arial"/>
-          </w:rPr>
-          <w:t xml:space="preserve"> simulatio</w:t>
-        </w:r>
-      </w:ins>
-      <w:ins w:id="165" w:author="Smith Vidaurre, Grace" w:date="2025-06-16T17:07:00Z" w16du:dateUtc="2025-06-16T21:07:00Z">
-        <w:r>
-          <w:rPr>
-            <w:rFonts w:ascii="Arial" w:hAnsi="Arial" w:cs="Arial"/>
-          </w:rPr>
-          <w:t>n experiments</w:t>
-        </w:r>
-        <w:r>
-          <w:rPr>
-            <w:rFonts w:ascii="Arial" w:hAnsi="Arial" w:cs="Arial"/>
-          </w:rPr>
-          <w:t xml:space="preserve"> over 16 total treatment combinations and 10 iterations per treatment.</w:t>
-        </w:r>
-      </w:ins>
-      <w:ins w:id="166" w:author="Smith Vidaurre, Grace" w:date="2025-06-16T17:08:00Z" w16du:dateUtc="2025-06-16T21:08:00Z">
-        <w:r>
-          <w:rPr>
-            <w:rFonts w:ascii="Arial" w:hAnsi="Arial" w:cs="Arial"/>
-          </w:rPr>
-          <w:t xml:space="preserve"> </w:t>
-        </w:r>
-        <w:r>
-          <w:rPr>
-            <w:rFonts w:ascii="Arial" w:hAnsi="Arial" w:cs="Arial"/>
-          </w:rPr>
-          <w:t xml:space="preserve">We </w:t>
-        </w:r>
-        <w:r>
-          <w:rPr>
-            <w:rFonts w:ascii="Arial" w:hAnsi="Arial" w:cs="Arial"/>
-          </w:rPr>
-          <w:t>analyzed</w:t>
-        </w:r>
-        <w:r>
-          <w:rPr>
-            <w:rFonts w:ascii="Arial" w:hAnsi="Arial" w:cs="Arial"/>
-          </w:rPr>
-          <w:t xml:space="preserve"> </w:t>
-        </w:r>
-        <w:r>
-          <w:rPr>
-            <w:rFonts w:ascii="Arial" w:hAnsi="Arial" w:cs="Arial"/>
-          </w:rPr>
-          <w:t>each of</w:t>
-        </w:r>
-        <w:r>
-          <w:rPr>
-            <w:rFonts w:ascii="Arial" w:hAnsi="Arial" w:cs="Arial"/>
-          </w:rPr>
-          <w:t xml:space="preserve"> the resulting 160 datasets</w:t>
-        </w:r>
-        <w:r>
-          <w:rPr>
-            <w:rFonts w:ascii="Arial" w:hAnsi="Arial" w:cs="Arial"/>
-          </w:rPr>
-          <w:t xml:space="preserve"> of synthetic vocalizations</w:t>
-        </w:r>
-        <w:r>
-          <w:rPr>
-            <w:rFonts w:ascii="Arial" w:hAnsi="Arial" w:cs="Arial"/>
-          </w:rPr>
-          <w:t xml:space="preserve"> to test how well we could detect the information</w:t>
-        </w:r>
-      </w:ins>
-      <w:ins w:id="167" w:author="Smith Vidaurre, Grace" w:date="2025-06-16T17:12:00Z" w16du:dateUtc="2025-06-16T21:12:00Z">
-        <w:r>
-          <w:rPr>
-            <w:rFonts w:ascii="Arial" w:hAnsi="Arial" w:cs="Arial"/>
-          </w:rPr>
-          <w:t xml:space="preserve"> </w:t>
-        </w:r>
-      </w:ins>
-      <w:ins w:id="168" w:author="Smith Vidaurre, Grace" w:date="2025-06-16T17:14:00Z" w16du:dateUtc="2025-06-16T21:14:00Z">
-        <w:r>
-          <w:rPr>
-            <w:rFonts w:ascii="Arial" w:hAnsi="Arial" w:cs="Arial"/>
-          </w:rPr>
-          <w:t xml:space="preserve">that we had originally </w:t>
-        </w:r>
-      </w:ins>
-      <w:ins w:id="169" w:author="Smith Vidaurre, Grace" w:date="2025-06-16T17:13:00Z" w16du:dateUtc="2025-06-16T21:13:00Z">
-        <w:r>
-          <w:rPr>
-            <w:rFonts w:ascii="Arial" w:hAnsi="Arial" w:cs="Arial"/>
-          </w:rPr>
-          <w:t xml:space="preserve">encoded </w:t>
-        </w:r>
-      </w:ins>
-      <w:ins w:id="170" w:author="Smith Vidaurre, Grace" w:date="2025-06-16T17:14:00Z" w16du:dateUtc="2025-06-16T21:14:00Z">
-        <w:r>
-          <w:rPr>
-            <w:rFonts w:ascii="Arial" w:hAnsi="Arial" w:cs="Arial"/>
-          </w:rPr>
-          <w:t>in character strings at one or both social levels.</w:t>
-        </w:r>
-        <w:r>
-          <w:rPr>
-            <w:rFonts w:ascii="Arial" w:hAnsi="Arial" w:cs="Arial"/>
-          </w:rPr>
-          <w:t xml:space="preserve"> </w:t>
-        </w:r>
-      </w:ins>
-      <w:ins w:id="171" w:author="Smith Vidaurre, Grace" w:date="2025-06-16T17:15:00Z" w16du:dateUtc="2025-06-16T21:15:00Z">
-        <w:r>
-          <w:rPr>
-            <w:rFonts w:ascii="Arial" w:hAnsi="Arial" w:cs="Arial"/>
-          </w:rPr>
-          <w:t xml:space="preserve">We used the same </w:t>
-        </w:r>
-        <w:r>
-          <w:rPr>
-            <w:rFonts w:ascii="Arial" w:hAnsi="Arial" w:cs="Arial"/>
-          </w:rPr>
-          <w:t xml:space="preserve">pipeline </w:t>
-        </w:r>
-        <w:r>
-          <w:rPr>
-            <w:rFonts w:ascii="Arial" w:hAnsi="Arial" w:cs="Arial"/>
-          </w:rPr>
-          <w:t>described above to generate datasets of synthetic vocal identity signals under each tre</w:t>
-        </w:r>
-      </w:ins>
-      <w:ins w:id="172" w:author="Smith Vidaurre, Grace" w:date="2025-06-16T17:16:00Z" w16du:dateUtc="2025-06-16T21:16:00Z">
-        <w:r>
-          <w:rPr>
-            <w:rFonts w:ascii="Arial" w:hAnsi="Arial" w:cs="Arial"/>
-          </w:rPr>
-          <w:t xml:space="preserve">atment combination. </w:t>
-        </w:r>
-        <w:r>
-          <w:rPr>
-            <w:rFonts w:ascii="Arial" w:hAnsi="Arial" w:cs="Arial"/>
-          </w:rPr>
-          <w:t>Then we analyzed both the character string and audio representations of the identity signals</w:t>
-        </w:r>
-      </w:ins>
-      <w:ins w:id="173" w:author="Smith Vidaurre, Grace" w:date="2025-06-16T17:17:00Z" w16du:dateUtc="2025-06-16T21:17:00Z">
-        <w:r>
-          <w:rPr>
-            <w:rFonts w:ascii="Arial" w:hAnsi="Arial" w:cs="Arial"/>
-          </w:rPr>
-          <w:t>. O</w:t>
-        </w:r>
-      </w:ins>
-      <w:ins w:id="174" w:author="Smith Vidaurre, Grace" w:date="2025-06-16T17:16:00Z" w16du:dateUtc="2025-06-16T21:16:00Z">
-        <w:r>
-          <w:rPr>
-            <w:rFonts w:ascii="Arial" w:hAnsi="Arial" w:cs="Arial"/>
-          </w:rPr>
-          <w:t>ur results generated using</w:t>
-        </w:r>
-      </w:ins>
-      <w:ins w:id="175" w:author="Smith Vidaurre, Grace" w:date="2025-06-16T17:17:00Z" w16du:dateUtc="2025-06-16T21:17:00Z">
-        <w:r>
-          <w:rPr>
-            <w:rFonts w:ascii="Arial" w:hAnsi="Arial" w:cs="Arial"/>
-          </w:rPr>
-          <w:t xml:space="preserve"> the character strings</w:t>
-        </w:r>
-        <w:r>
-          <w:rPr>
-            <w:rFonts w:ascii="Arial" w:hAnsi="Arial" w:cs="Arial"/>
-          </w:rPr>
-          <w:t xml:space="preserve"> served as a b</w:t>
-        </w:r>
-      </w:ins>
-      <w:ins w:id="176" w:author="Smith Vidaurre, Grace" w:date="2025-06-16T17:19:00Z" w16du:dateUtc="2025-06-16T21:19:00Z">
-        <w:r>
-          <w:rPr>
-            <w:rFonts w:ascii="Arial" w:hAnsi="Arial" w:cs="Arial"/>
-          </w:rPr>
-          <w:t>aseline or internal validation</w:t>
-        </w:r>
-      </w:ins>
-      <w:ins w:id="177" w:author="Smith Vidaurre, Grace" w:date="2025-06-16T17:17:00Z" w16du:dateUtc="2025-06-16T21:17:00Z">
-        <w:r>
-          <w:rPr>
-            <w:rFonts w:ascii="Arial" w:hAnsi="Arial" w:cs="Arial"/>
-          </w:rPr>
-          <w:t xml:space="preserve"> for our ability to detect identity information</w:t>
-        </w:r>
-        <w:r>
-          <w:rPr>
-            <w:rFonts w:ascii="Arial" w:hAnsi="Arial" w:cs="Arial"/>
-          </w:rPr>
-          <w:t xml:space="preserve"> </w:t>
-        </w:r>
-        <w:r>
-          <w:rPr>
-            <w:rFonts w:ascii="Arial" w:hAnsi="Arial" w:cs="Arial"/>
-          </w:rPr>
-          <w:t>in the synthetic vocalizations using traditional bioacoustics too</w:t>
-        </w:r>
-        <w:r>
-          <w:rPr>
-            <w:rFonts w:ascii="Arial" w:hAnsi="Arial" w:cs="Arial"/>
-          </w:rPr>
-          <w:t>l</w:t>
-        </w:r>
-        <w:r>
-          <w:rPr>
-            <w:rFonts w:ascii="Arial" w:hAnsi="Arial" w:cs="Arial"/>
-          </w:rPr>
-          <w:t>s.</w:t>
-        </w:r>
-      </w:ins>
+          <w:rFonts w:ascii="Arial" w:hAnsi="Arial" w:cs="Arial"/>
+        </w:rPr>
+      </w:pPr>
+      <w:r>
+        <w:rPr>
+          <w:rFonts w:ascii="Arial" w:hAnsi="Arial" w:cs="Arial"/>
+        </w:rPr>
+        <w:tab/>
+      </w:r>
+      <w:r>
+        <w:rPr>
+          <w:rFonts w:ascii="Arial" w:hAnsi="Arial" w:cs="Arial"/>
+        </w:rPr>
+        <w:t>We ran our</w:t>
+      </w:r>
+      <w:r>
+        <w:rPr>
+          <w:rFonts w:ascii="Arial" w:hAnsi="Arial" w:cs="Arial"/>
+        </w:rPr>
+        <w:t xml:space="preserve"> simulatio</w:t>
+      </w:r>
+      <w:r>
+        <w:rPr>
+          <w:rFonts w:ascii="Arial" w:hAnsi="Arial" w:cs="Arial"/>
+        </w:rPr>
+        <w:t>n experiments</w:t>
+      </w:r>
+      <w:r>
+        <w:rPr>
+          <w:rFonts w:ascii="Arial" w:hAnsi="Arial" w:cs="Arial"/>
+        </w:rPr>
+        <w:t xml:space="preserve"> over 16 total treatment combinations and 10 iterations per treatment.</w:t>
+      </w:r>
+      <w:r>
+        <w:rPr>
+          <w:rFonts w:ascii="Arial" w:hAnsi="Arial" w:cs="Arial"/>
+        </w:rPr>
+        <w:t xml:space="preserve"> </w:t>
+      </w:r>
+      <w:r>
+        <w:rPr>
+          <w:rFonts w:ascii="Arial" w:hAnsi="Arial" w:cs="Arial"/>
+        </w:rPr>
+        <w:t xml:space="preserve">We </w:t>
+      </w:r>
+      <w:r>
+        <w:rPr>
+          <w:rFonts w:ascii="Arial" w:hAnsi="Arial" w:cs="Arial"/>
+        </w:rPr>
+        <w:t>analyzed</w:t>
+      </w:r>
+      <w:r>
+        <w:rPr>
+          <w:rFonts w:ascii="Arial" w:hAnsi="Arial" w:cs="Arial"/>
+        </w:rPr>
+        <w:t xml:space="preserve"> </w:t>
+      </w:r>
+      <w:r>
+        <w:rPr>
+          <w:rFonts w:ascii="Arial" w:hAnsi="Arial" w:cs="Arial"/>
+        </w:rPr>
+        <w:t>each of</w:t>
+      </w:r>
+      <w:r>
+        <w:rPr>
+          <w:rFonts w:ascii="Arial" w:hAnsi="Arial" w:cs="Arial"/>
+        </w:rPr>
+        <w:t xml:space="preserve"> the resulting 160 datasets</w:t>
+      </w:r>
+      <w:r>
+        <w:rPr>
+          <w:rFonts w:ascii="Arial" w:hAnsi="Arial" w:cs="Arial"/>
+        </w:rPr>
+        <w:t xml:space="preserve"> of synthetic vocalizations</w:t>
+      </w:r>
+      <w:r>
+        <w:rPr>
+          <w:rFonts w:ascii="Arial" w:hAnsi="Arial" w:cs="Arial"/>
+        </w:rPr>
+        <w:t xml:space="preserve"> to test how well we could detect the information</w:t>
+      </w:r>
+      <w:r>
+        <w:rPr>
+          <w:rFonts w:ascii="Arial" w:hAnsi="Arial" w:cs="Arial"/>
+        </w:rPr>
+        <w:t xml:space="preserve"> </w:t>
+      </w:r>
+      <w:r>
+        <w:rPr>
+          <w:rFonts w:ascii="Arial" w:hAnsi="Arial" w:cs="Arial"/>
+        </w:rPr>
+        <w:t xml:space="preserve">that we had originally </w:t>
+      </w:r>
+      <w:r>
+        <w:rPr>
+          <w:rFonts w:ascii="Arial" w:hAnsi="Arial" w:cs="Arial"/>
+        </w:rPr>
+        <w:t xml:space="preserve">encoded </w:t>
+      </w:r>
+      <w:r>
+        <w:rPr>
+          <w:rFonts w:ascii="Arial" w:hAnsi="Arial" w:cs="Arial"/>
+        </w:rPr>
+        <w:t>in character strings at one or both social levels.</w:t>
+      </w:r>
+      <w:r>
+        <w:rPr>
+          <w:rFonts w:ascii="Arial" w:hAnsi="Arial" w:cs="Arial"/>
+        </w:rPr>
+        <w:t xml:space="preserve"> </w:t>
+      </w:r>
+      <w:r>
+        <w:rPr>
+          <w:rFonts w:ascii="Arial" w:hAnsi="Arial" w:cs="Arial"/>
+        </w:rPr>
+        <w:t xml:space="preserve">We used the same </w:t>
+      </w:r>
+      <w:r>
+        <w:rPr>
+          <w:rFonts w:ascii="Arial" w:hAnsi="Arial" w:cs="Arial"/>
+        </w:rPr>
+        <w:t xml:space="preserve">pipeline </w:t>
+      </w:r>
+      <w:r>
+        <w:rPr>
+          <w:rFonts w:ascii="Arial" w:hAnsi="Arial" w:cs="Arial"/>
+        </w:rPr>
+        <w:t xml:space="preserve">described above to generate datasets of synthetic vocal identity signals under each treatment combination. </w:t>
+      </w:r>
+      <w:r>
+        <w:rPr>
+          <w:rFonts w:ascii="Arial" w:hAnsi="Arial" w:cs="Arial"/>
+        </w:rPr>
+        <w:t>Then we analyzed both the character string and audio representations of the identity signals</w:t>
+      </w:r>
+      <w:r>
+        <w:rPr>
+          <w:rFonts w:ascii="Arial" w:hAnsi="Arial" w:cs="Arial"/>
+        </w:rPr>
+        <w:t>. O</w:t>
+      </w:r>
+      <w:r>
+        <w:rPr>
+          <w:rFonts w:ascii="Arial" w:hAnsi="Arial" w:cs="Arial"/>
+        </w:rPr>
+        <w:t>ur results generated using the character strings</w:t>
+      </w:r>
+      <w:r>
+        <w:rPr>
+          <w:rFonts w:ascii="Arial" w:hAnsi="Arial" w:cs="Arial"/>
+        </w:rPr>
+        <w:t xml:space="preserve"> served as a b</w:t>
+      </w:r>
+      <w:r>
+        <w:rPr>
+          <w:rFonts w:ascii="Arial" w:hAnsi="Arial" w:cs="Arial"/>
+        </w:rPr>
+        <w:t>aseline or internal validation</w:t>
+      </w:r>
+      <w:r>
+        <w:rPr>
+          <w:rFonts w:ascii="Arial" w:hAnsi="Arial" w:cs="Arial"/>
+        </w:rPr>
+        <w:t xml:space="preserve"> for our ability to detect identity information</w:t>
+      </w:r>
+      <w:r>
+        <w:rPr>
+          <w:rFonts w:ascii="Arial" w:hAnsi="Arial" w:cs="Arial"/>
+        </w:rPr>
+        <w:t xml:space="preserve"> </w:t>
+      </w:r>
+      <w:r>
+        <w:rPr>
+          <w:rFonts w:ascii="Arial" w:hAnsi="Arial" w:cs="Arial"/>
+        </w:rPr>
+        <w:t>in the synthetic vocalizations using traditional bioacoustics too</w:t>
+      </w:r>
+      <w:r>
+        <w:rPr>
+          <w:rFonts w:ascii="Arial" w:hAnsi="Arial" w:cs="Arial"/>
+        </w:rPr>
+        <w:t>l</w:t>
+      </w:r>
+      <w:r>
+        <w:rPr>
+          <w:rFonts w:ascii="Arial" w:hAnsi="Arial" w:cs="Arial"/>
+        </w:rPr>
+        <w:t>s.</w:t>
+      </w:r>
     </w:p>
     <w:p>
       <w:pPr>
         <w:pStyle w:val="NoSpacing"/>
         <w:spacing w:line="480" w:lineRule="auto"/>
         <w:rPr>
-          <w:ins w:id="178" w:author="Smith Vidaurre, Grace" w:date="2025-06-16T16:35:00Z" w16du:dateUtc="2025-06-16T20:35:00Z"/>
-          <w:rFonts w:ascii="Arial" w:hAnsi="Arial" w:cs="Arial"/>
-        </w:rPr>
-      </w:pPr>
-      <w:ins w:id="179" w:author="Smith Vidaurre, Grace" w:date="2025-06-16T17:18:00Z" w16du:dateUtc="2025-06-16T21:18:00Z">
-        <w:r>
-          <w:rPr>
-            <w:rFonts w:ascii="Arial" w:hAnsi="Arial" w:cs="Arial"/>
-          </w:rPr>
-          <w:tab/>
-          <w:t xml:space="preserve">We analyzed each dataset using a similar analytical pipeline described above </w:t>
-        </w:r>
-        <w:r>
-          <w:rPr>
-            <w:rFonts w:ascii="Arial" w:hAnsi="Arial" w:cs="Arial"/>
-          </w:rPr>
-          <w:t>for</w:t>
-        </w:r>
-        <w:r>
-          <w:rPr>
-            <w:rFonts w:ascii="Arial" w:hAnsi="Arial" w:cs="Arial"/>
-          </w:rPr>
-          <w:t xml:space="preserve"> the exemplar datasets, </w:t>
-        </w:r>
-      </w:ins>
-      <w:ins w:id="180" w:author="Smith Vidaurre, Grace" w:date="2025-06-16T17:19:00Z" w16du:dateUtc="2025-06-16T21:19:00Z">
-        <w:r>
-          <w:rPr>
-            <w:rFonts w:ascii="Arial" w:hAnsi="Arial" w:cs="Arial"/>
-          </w:rPr>
-          <w:t xml:space="preserve">such that we </w:t>
-        </w:r>
-        <w:r>
-          <w:rPr>
-            <w:rFonts w:ascii="Arial" w:hAnsi="Arial" w:cs="Arial"/>
-          </w:rPr>
-          <w:t>measured dist</w:t>
-        </w:r>
-      </w:ins>
-      <w:ins w:id="181" w:author="Smith Vidaurre, Grace" w:date="2025-06-16T17:20:00Z" w16du:dateUtc="2025-06-16T21:20:00Z">
-        <w:r>
-          <w:rPr>
-            <w:rFonts w:ascii="Arial" w:hAnsi="Arial" w:cs="Arial"/>
-          </w:rPr>
-          <w:t>ance with the edit distance or SPCC, respectively, and then performed multidimensional scaling to generate feature</w:t>
-        </w:r>
-      </w:ins>
-      <w:ins w:id="182" w:author="Smith Vidaurre, Grace" w:date="2025-06-16T17:23:00Z" w16du:dateUtc="2025-06-16T21:23:00Z">
-        <w:r>
-          <w:rPr>
-            <w:rFonts w:ascii="Arial" w:hAnsi="Arial" w:cs="Arial"/>
-          </w:rPr>
-          <w:t>s</w:t>
-        </w:r>
-      </w:ins>
-      <w:ins w:id="183" w:author="Smith Vidaurre, Grace" w:date="2025-06-16T17:19:00Z" w16du:dateUtc="2025-06-16T21:19:00Z">
-        <w:r>
-          <w:rPr>
-            <w:rFonts w:ascii="Arial" w:hAnsi="Arial" w:cs="Arial"/>
-          </w:rPr>
-          <w:t xml:space="preserve">. </w:t>
-        </w:r>
-        <w:r>
-          <w:rPr>
-            <w:rFonts w:ascii="Arial" w:hAnsi="Arial" w:cs="Arial"/>
-          </w:rPr>
-          <w:t>However,</w:t>
-        </w:r>
-      </w:ins>
-      <w:ins w:id="184" w:author="Smith Vidaurre, Grace" w:date="2025-06-16T17:18:00Z" w16du:dateUtc="2025-06-16T21:18:00Z">
-        <w:r>
-          <w:rPr>
-            <w:rFonts w:ascii="Arial" w:hAnsi="Arial" w:cs="Arial"/>
-          </w:rPr>
-          <w:t xml:space="preserve"> here we </w:t>
-        </w:r>
-        <w:r>
-          <w:rPr>
-            <w:rFonts w:ascii="Arial" w:hAnsi="Arial" w:cs="Arial"/>
-          </w:rPr>
-          <w:t>did not generate visualizations of trait spaces</w:t>
-        </w:r>
-        <w:r>
-          <w:rPr>
-            <w:rFonts w:ascii="Arial" w:hAnsi="Arial" w:cs="Arial"/>
-          </w:rPr>
-          <w:t xml:space="preserve"> after performing multidimensional scaling</w:t>
-        </w:r>
-      </w:ins>
-      <w:ins w:id="185" w:author="Smith Vidaurre, Grace" w:date="2025-06-16T17:19:00Z" w16du:dateUtc="2025-06-16T21:19:00Z">
-        <w:r>
-          <w:rPr>
-            <w:rFonts w:ascii="Arial" w:hAnsi="Arial" w:cs="Arial"/>
-          </w:rPr>
-          <w:t>. Instead, we</w:t>
-        </w:r>
-      </w:ins>
-      <w:ins w:id="186" w:author="Smith Vidaurre, Grace" w:date="2025-06-16T17:23:00Z" w16du:dateUtc="2025-06-16T21:23:00Z">
-        <w:r>
-          <w:rPr>
-            <w:rFonts w:ascii="Arial" w:hAnsi="Arial" w:cs="Arial"/>
-          </w:rPr>
-          <w:t xml:space="preserve"> performed k-means clustering on the edit distance or SPCC features</w:t>
-        </w:r>
-      </w:ins>
-      <w:ins w:id="187" w:author="Smith Vidaurre, Grace" w:date="2025-06-16T17:24:00Z" w16du:dateUtc="2025-06-16T21:24:00Z">
-        <w:r>
-          <w:rPr>
-            <w:rFonts w:ascii="Arial" w:hAnsi="Arial" w:cs="Arial"/>
-          </w:rPr>
-          <w:t xml:space="preserve"> using </w:t>
-        </w:r>
-        <w:r>
-          <w:rPr>
-            <w:rFonts w:ascii="Arial" w:hAnsi="Arial" w:cs="Arial"/>
-          </w:rPr>
-          <w:t>the stats package version TKTK with the Hartigan and</w:t>
-        </w:r>
-      </w:ins>
-      <w:ins w:id="188" w:author="Smith Vidaurre, Grace" w:date="2025-06-16T17:25:00Z" w16du:dateUtc="2025-06-16T21:25:00Z">
-        <w:r>
-          <w:rPr>
-            <w:rFonts w:ascii="Arial" w:hAnsi="Arial" w:cs="Arial"/>
-          </w:rPr>
-          <w:t xml:space="preserve"> Wong algorithm (CITE Hartigan &amp; Wong 1979)</w:t>
-        </w:r>
-        <w:r>
-          <w:rPr>
-            <w:rFonts w:ascii="Arial" w:hAnsi="Arial" w:cs="Arial"/>
-          </w:rPr>
-          <w:t xml:space="preserve"> with 10 iterations maximum, and the nu</w:t>
-        </w:r>
-      </w:ins>
-      <w:ins w:id="189" w:author="Smith Vidaurre, Grace" w:date="2025-06-16T17:26:00Z" w16du:dateUtc="2025-06-16T21:26:00Z">
-        <w:r>
-          <w:rPr>
-            <w:rFonts w:ascii="Arial" w:hAnsi="Arial" w:cs="Arial"/>
-          </w:rPr>
-          <w:t xml:space="preserve">mber of centers set to the number of </w:t>
-        </w:r>
-        <w:r>
-          <w:rPr>
-            <w:rFonts w:ascii="Arial" w:hAnsi="Arial" w:cs="Arial"/>
-          </w:rPr>
-          <w:t xml:space="preserve">true </w:t>
-        </w:r>
-        <w:r>
-          <w:rPr>
-            <w:rFonts w:ascii="Arial" w:hAnsi="Arial" w:cs="Arial"/>
-          </w:rPr>
-          <w:t>classes</w:t>
-        </w:r>
-        <w:r>
-          <w:rPr>
-            <w:rFonts w:ascii="Arial" w:hAnsi="Arial" w:cs="Arial"/>
-          </w:rPr>
-          <w:t>.</w:t>
-        </w:r>
-        <w:r>
-          <w:rPr>
-            <w:rFonts w:ascii="Arial" w:hAnsi="Arial" w:cs="Arial"/>
-          </w:rPr>
-          <w:t xml:space="preserve"> We performed k-means clustering at each social level in order to </w:t>
-        </w:r>
-      </w:ins>
-      <w:ins w:id="190" w:author="Smith Vidaurre, Grace" w:date="2025-06-16T17:27:00Z" w16du:dateUtc="2025-06-16T21:27:00Z">
-        <w:r>
-          <w:rPr>
-            <w:rFonts w:ascii="Arial" w:hAnsi="Arial" w:cs="Arial"/>
-          </w:rPr>
-          <w:t>yield predicted cluster labels that we could compare to original class labels to compute</w:t>
-        </w:r>
-      </w:ins>
-      <w:ins w:id="191" w:author="Smith Vidaurre, Grace" w:date="2025-06-16T17:26:00Z" w16du:dateUtc="2025-06-16T21:26:00Z">
-        <w:r>
-          <w:rPr>
-            <w:rFonts w:ascii="Arial" w:hAnsi="Arial" w:cs="Arial"/>
-          </w:rPr>
-          <w:t xml:space="preserve"> </w:t>
-        </w:r>
-      </w:ins>
-      <w:ins w:id="192" w:author="Smith Vidaurre, Grace" w:date="2025-06-16T17:27:00Z" w16du:dateUtc="2025-06-16T21:27:00Z">
-        <w:r>
-          <w:rPr>
-            <w:rFonts w:ascii="Arial" w:hAnsi="Arial" w:cs="Arial"/>
-          </w:rPr>
-          <w:t xml:space="preserve">our </w:t>
-        </w:r>
-      </w:ins>
-      <w:ins w:id="193" w:author="Smith Vidaurre, Grace" w:date="2025-06-16T17:26:00Z" w16du:dateUtc="2025-06-16T21:26:00Z">
-        <w:r>
-          <w:rPr>
-            <w:rFonts w:ascii="Arial" w:hAnsi="Arial" w:cs="Arial"/>
-          </w:rPr>
-          <w:t xml:space="preserve">accuracy of information detection </w:t>
-        </w:r>
-      </w:ins>
-      <w:ins w:id="194" w:author="Smith Vidaurre, Grace" w:date="2025-06-16T17:27:00Z" w16du:dateUtc="2025-06-16T21:27:00Z">
-        <w:r>
-          <w:rPr>
-            <w:rFonts w:ascii="Arial" w:hAnsi="Arial" w:cs="Arial"/>
-          </w:rPr>
-          <w:t>at each social level. At the group level, we randomly selected 1 vocalization per individual within a group to maintain symmetry in sample size between social levels. At</w:t>
-        </w:r>
-      </w:ins>
-      <w:ins w:id="195" w:author="Smith Vidaurre, Grace" w:date="2025-06-16T17:28:00Z" w16du:dateUtc="2025-06-16T21:28:00Z">
-        <w:r>
-          <w:rPr>
-            <w:rFonts w:ascii="Arial" w:hAnsi="Arial" w:cs="Arial"/>
-          </w:rPr>
-          <w:t xml:space="preserve"> the individual level, we </w:t>
-        </w:r>
-        <w:r>
-          <w:rPr>
-            <w:rFonts w:ascii="Arial" w:hAnsi="Arial" w:cs="Arial"/>
-          </w:rPr>
-          <w:lastRenderedPageBreak/>
-          <w:t>performed clustering of individuals’ vocalizations within a group for each group in the given dataset</w:t>
-        </w:r>
-        <w:r>
-          <w:rPr>
-            <w:rFonts w:ascii="Arial" w:hAnsi="Arial" w:cs="Arial"/>
-          </w:rPr>
-          <w:t>.</w:t>
-        </w:r>
-        <w:r>
-          <w:rPr>
-            <w:rFonts w:ascii="Arial" w:hAnsi="Arial" w:cs="Arial"/>
-          </w:rPr>
-          <w:t xml:space="preserve"> We then used a bipartite mapping approach to c</w:t>
-        </w:r>
-      </w:ins>
-      <w:ins w:id="196" w:author="Smith Vidaurre, Grace" w:date="2025-06-16T17:29:00Z" w16du:dateUtc="2025-06-16T21:29:00Z">
-        <w:r>
-          <w:rPr>
-            <w:rFonts w:ascii="Arial" w:hAnsi="Arial" w:cs="Arial"/>
-          </w:rPr>
-          <w:t>alculate the accuracy with which predicted labels matched original class labels</w:t>
-        </w:r>
-        <w:r>
-          <w:rPr>
-            <w:rFonts w:ascii="Arial" w:hAnsi="Arial" w:cs="Arial"/>
-          </w:rPr>
-          <w:t xml:space="preserve">. </w:t>
-        </w:r>
-        <w:r>
-          <w:rPr>
-            <w:rFonts w:ascii="Arial" w:hAnsi="Arial" w:cs="Arial"/>
-          </w:rPr>
-          <w:t xml:space="preserve">This bipartite mapping approach </w:t>
-        </w:r>
-      </w:ins>
-      <w:ins w:id="197" w:author="Smith Vidaurre, Grace" w:date="2025-06-16T17:30:00Z" w16du:dateUtc="2025-06-16T21:30:00Z">
-        <w:r>
-          <w:rPr>
-            <w:rFonts w:ascii="Arial" w:hAnsi="Arial" w:cs="Arial"/>
-          </w:rPr>
-          <w:t xml:space="preserve">entailed computing all possible accuracy values by using each possible mapping between unique cluster and class labels. We calculated the </w:t>
-        </w:r>
-      </w:ins>
-      <w:ins w:id="198" w:author="Smith Vidaurre, Grace" w:date="2025-06-16T17:31:00Z" w16du:dateUtc="2025-06-16T21:31:00Z">
-        <w:r>
-          <w:rPr>
-            <w:rFonts w:ascii="Arial" w:hAnsi="Arial" w:cs="Arial"/>
-          </w:rPr>
-          <w:t>maximum accuracy score across all possible accuracy values at each social level. For individual-level calculations, we averaged th</w:t>
-        </w:r>
-      </w:ins>
-      <w:ins w:id="199" w:author="Smith Vidaurre, Grace" w:date="2025-06-16T17:32:00Z" w16du:dateUtc="2025-06-16T21:32:00Z">
-        <w:r>
-          <w:rPr>
-            <w:rFonts w:ascii="Arial" w:hAnsi="Arial" w:cs="Arial"/>
-          </w:rPr>
-          <w:t>ese accuracy calculations across groups.</w:t>
-        </w:r>
-      </w:ins>
-      <w:ins w:id="200" w:author="Smith Vidaurre, Grace" w:date="2025-06-16T17:29:00Z" w16du:dateUtc="2025-06-16T21:29:00Z">
-        <w:r>
-          <w:rPr>
-            <w:rFonts w:ascii="Arial" w:hAnsi="Arial" w:cs="Arial"/>
-          </w:rPr>
-          <w:t xml:space="preserve"> </w:t>
-        </w:r>
-      </w:ins>
+          <w:rFonts w:ascii="Arial" w:hAnsi="Arial" w:cs="Arial"/>
+        </w:rPr>
+      </w:pPr>
+      <w:r>
+        <w:rPr>
+          <w:rFonts w:ascii="Arial" w:hAnsi="Arial" w:cs="Arial"/>
+        </w:rPr>
+        <w:tab/>
+        <w:t xml:space="preserve">We analyzed each dataset using a similar analytical pipeline described above </w:t>
+      </w:r>
+      <w:r>
+        <w:rPr>
+          <w:rFonts w:ascii="Arial" w:hAnsi="Arial" w:cs="Arial"/>
+        </w:rPr>
+        <w:t>for</w:t>
+      </w:r>
+      <w:r>
+        <w:rPr>
+          <w:rFonts w:ascii="Arial" w:hAnsi="Arial" w:cs="Arial"/>
+        </w:rPr>
+        <w:t xml:space="preserve"> the exemplar datasets, </w:t>
+      </w:r>
+      <w:r>
+        <w:rPr>
+          <w:rFonts w:ascii="Arial" w:hAnsi="Arial" w:cs="Arial"/>
+        </w:rPr>
+        <w:t xml:space="preserve">such that we </w:t>
+      </w:r>
+      <w:r>
+        <w:rPr>
+          <w:rFonts w:ascii="Arial" w:hAnsi="Arial" w:cs="Arial"/>
+        </w:rPr>
+        <w:t>measured distance with the edit distance or SPCC, respectively, and then performed multidimensional scaling to generate feature</w:t>
+      </w:r>
+      <w:r>
+        <w:rPr>
+          <w:rFonts w:ascii="Arial" w:hAnsi="Arial" w:cs="Arial"/>
+        </w:rPr>
+        <w:t>s</w:t>
+      </w:r>
+      <w:r>
+        <w:rPr>
+          <w:rFonts w:ascii="Arial" w:hAnsi="Arial" w:cs="Arial"/>
+        </w:rPr>
+        <w:t xml:space="preserve">. </w:t>
+      </w:r>
+      <w:r>
+        <w:rPr>
+          <w:rFonts w:ascii="Arial" w:hAnsi="Arial" w:cs="Arial"/>
+        </w:rPr>
+        <w:t>However,</w:t>
+      </w:r>
+      <w:r>
+        <w:rPr>
+          <w:rFonts w:ascii="Arial" w:hAnsi="Arial" w:cs="Arial"/>
+        </w:rPr>
+        <w:t xml:space="preserve"> here we </w:t>
+      </w:r>
+      <w:r>
+        <w:rPr>
+          <w:rFonts w:ascii="Arial" w:hAnsi="Arial" w:cs="Arial"/>
+        </w:rPr>
+        <w:t>did not generate visualizations of trait spaces</w:t>
+      </w:r>
+      <w:r>
+        <w:rPr>
+          <w:rFonts w:ascii="Arial" w:hAnsi="Arial" w:cs="Arial"/>
+        </w:rPr>
+        <w:t xml:space="preserve"> after performing multidimensional scaling. Instead, we</w:t>
+      </w:r>
+      <w:r>
+        <w:rPr>
+          <w:rFonts w:ascii="Arial" w:hAnsi="Arial" w:cs="Arial"/>
+        </w:rPr>
+        <w:t xml:space="preserve"> performed k-means clustering on the edit distance or SPCC features</w:t>
+      </w:r>
+      <w:r>
+        <w:rPr>
+          <w:rFonts w:ascii="Arial" w:hAnsi="Arial" w:cs="Arial"/>
+        </w:rPr>
+        <w:t xml:space="preserve"> using </w:t>
+      </w:r>
+      <w:r>
+        <w:rPr>
+          <w:rFonts w:ascii="Arial" w:hAnsi="Arial" w:cs="Arial"/>
+        </w:rPr>
+        <w:t>the stats package version TKTK with the Hartigan and Wong algorithm (CITE Hartigan &amp; Wong 1979)</w:t>
+      </w:r>
+      <w:r>
+        <w:rPr>
+          <w:rFonts w:ascii="Arial" w:hAnsi="Arial" w:cs="Arial"/>
+        </w:rPr>
+        <w:t xml:space="preserve"> with 10 iterations maximum, and the number of centers set to the number of </w:t>
+      </w:r>
+      <w:r>
+        <w:rPr>
+          <w:rFonts w:ascii="Arial" w:hAnsi="Arial" w:cs="Arial"/>
+        </w:rPr>
+        <w:t xml:space="preserve">true </w:t>
+      </w:r>
+      <w:r>
+        <w:rPr>
+          <w:rFonts w:ascii="Arial" w:hAnsi="Arial" w:cs="Arial"/>
+        </w:rPr>
+        <w:t>classes</w:t>
+      </w:r>
+      <w:r>
+        <w:rPr>
+          <w:rFonts w:ascii="Arial" w:hAnsi="Arial" w:cs="Arial"/>
+        </w:rPr>
+        <w:t>.</w:t>
+      </w:r>
+      <w:r>
+        <w:rPr>
+          <w:rFonts w:ascii="Arial" w:hAnsi="Arial" w:cs="Arial"/>
+        </w:rPr>
+        <w:t xml:space="preserve"> We performed k-means clustering at each social level in order to </w:t>
+      </w:r>
+      <w:r>
+        <w:rPr>
+          <w:rFonts w:ascii="Arial" w:hAnsi="Arial" w:cs="Arial"/>
+        </w:rPr>
+        <w:t>yield predicted cluster labels that we could compare to original class labels to compute</w:t>
+      </w:r>
+      <w:r>
+        <w:rPr>
+          <w:rFonts w:ascii="Arial" w:hAnsi="Arial" w:cs="Arial"/>
+        </w:rPr>
+        <w:t xml:space="preserve"> </w:t>
+      </w:r>
+      <w:r>
+        <w:rPr>
+          <w:rFonts w:ascii="Arial" w:hAnsi="Arial" w:cs="Arial"/>
+        </w:rPr>
+        <w:t xml:space="preserve">our </w:t>
+      </w:r>
+      <w:r>
+        <w:rPr>
+          <w:rFonts w:ascii="Arial" w:hAnsi="Arial" w:cs="Arial"/>
+        </w:rPr>
+        <w:t xml:space="preserve">accuracy of information detection </w:t>
+      </w:r>
+      <w:r>
+        <w:rPr>
+          <w:rFonts w:ascii="Arial" w:hAnsi="Arial" w:cs="Arial"/>
+        </w:rPr>
+        <w:t xml:space="preserve">at each social level. At the group level, we randomly selected 1 vocalization per individual within a group to maintain symmetry in sample size between social levels. At the individual level, we </w:t>
+      </w:r>
+      <w:r>
+        <w:rPr>
+          <w:rFonts w:ascii="Arial" w:hAnsi="Arial" w:cs="Arial"/>
+        </w:rPr>
+        <w:lastRenderedPageBreak/>
+        <w:t>performed clustering of individuals’ vocalizations within a group for each group in the given dataset</w:t>
+      </w:r>
+      <w:r>
+        <w:rPr>
+          <w:rFonts w:ascii="Arial" w:hAnsi="Arial" w:cs="Arial"/>
+        </w:rPr>
+        <w:t>.</w:t>
+      </w:r>
+      <w:r>
+        <w:rPr>
+          <w:rFonts w:ascii="Arial" w:hAnsi="Arial" w:cs="Arial"/>
+        </w:rPr>
+        <w:t xml:space="preserve"> We then used a bipartite mapping approach to calculate the accuracy with which predicted labels matched original class labels</w:t>
+      </w:r>
+      <w:r>
+        <w:rPr>
+          <w:rFonts w:ascii="Arial" w:hAnsi="Arial" w:cs="Arial"/>
+        </w:rPr>
+        <w:t xml:space="preserve">. </w:t>
+      </w:r>
+      <w:r>
+        <w:rPr>
+          <w:rFonts w:ascii="Arial" w:hAnsi="Arial" w:cs="Arial"/>
+        </w:rPr>
+        <w:t>This bipartite mapping approach entailed computing all possible accuracy values by using each possible mapping between unique cluster and class labels. We calculated the maximum accuracy score across all possible accuracy values at each social level. For individual-level calculations, we averaged these accuracy calculations across groups.</w:t>
+      </w:r>
+      <w:r>
+        <w:rPr>
+          <w:rFonts w:ascii="Arial" w:hAnsi="Arial" w:cs="Arial"/>
+        </w:rPr>
+        <w:t xml:space="preserve"> </w:t>
+      </w:r>
     </w:p>
     <w:p>
       <w:pPr>
         <w:pStyle w:val="NoSpacing"/>
         <w:spacing w:line="480" w:lineRule="auto"/>
         <w:rPr>
-          <w:del w:id="201" w:author="Smith Vidaurre, Grace" w:date="2025-06-16T17:08:00Z" w16du:dateUtc="2025-06-16T21:08:00Z"/>
-          <w:rFonts w:ascii="Arial" w:hAnsi="Arial" w:cs="Arial"/>
-        </w:rPr>
-      </w:pPr>
-      <w:del w:id="202" w:author="Smith Vidaurre, Grace" w:date="2025-06-16T17:07:00Z" w16du:dateUtc="2025-06-16T21:07:00Z">
-        <w:r>
-          <w:rPr>
-            <w:rFonts w:ascii="Arial" w:hAnsi="Arial" w:cs="Arial"/>
-          </w:rPr>
-          <w:delText>accurately</w:delText>
-        </w:r>
-        <w:r>
-          <w:rPr>
-            <w:rFonts w:ascii="Arial" w:hAnsi="Arial" w:cs="Arial"/>
-          </w:rPr>
-          <w:delText xml:space="preserve"> </w:delText>
-        </w:r>
-        <w:r>
-          <w:rPr>
-            <w:rFonts w:ascii="Arial" w:hAnsi="Arial" w:cs="Arial"/>
-          </w:rPr>
-          <w:delText xml:space="preserve">varying amounts of group and individual </w:delText>
-        </w:r>
-        <w:r>
-          <w:rPr>
-            <w:rFonts w:ascii="Arial" w:hAnsi="Arial" w:cs="Arial"/>
-          </w:rPr>
-          <w:delText xml:space="preserve">information could be recovered </w:delText>
-        </w:r>
-        <w:r>
-          <w:rPr>
-            <w:rFonts w:ascii="Arial" w:hAnsi="Arial" w:cs="Arial"/>
-          </w:rPr>
-          <w:delText>from synthetic signals,</w:delText>
-        </w:r>
-        <w:r>
-          <w:rPr>
-            <w:rFonts w:ascii="Arial" w:hAnsi="Arial" w:cs="Arial"/>
-          </w:rPr>
-          <w:delText xml:space="preserve"> we created </w:delText>
-        </w:r>
-        <w:r>
-          <w:rPr>
-            <w:rFonts w:ascii="Arial" w:hAnsi="Arial" w:cs="Arial"/>
-          </w:rPr>
-          <w:delText xml:space="preserve">synthetic data sets across 16 treatments that varied over social environment characteristics and information encoding rules. </w:delText>
-        </w:r>
-        <w:commentRangeStart w:id="203"/>
-        <w:r>
-          <w:rPr>
-            <w:rFonts w:ascii="Arial" w:hAnsi="Arial" w:cs="Arial"/>
-          </w:rPr>
-          <w:delText>We varied social environment characteristics represented information signaling changes that happen in socially sparse vs socially dense signaling environments</w:delText>
-        </w:r>
-        <w:commentRangeEnd w:id="203"/>
-        <w:r>
-          <w:rPr>
-            <w:rStyle w:val="CommentReference"/>
-          </w:rPr>
-          <w:commentReference w:id="203"/>
-        </w:r>
-        <w:r>
-          <w:rPr>
-            <w:rFonts w:ascii="Arial" w:hAnsi="Arial" w:cs="Arial"/>
-          </w:rPr>
-          <w:delText xml:space="preserve">. We achieved this by creating four social conditions: </w:delText>
-        </w:r>
-      </w:del>
-      <w:del w:id="204" w:author="Smith Vidaurre, Grace" w:date="2025-06-16T16:58:00Z" w16du:dateUtc="2025-06-16T20:58:00Z">
-        <w:r>
-          <w:rPr>
-            <w:rFonts w:ascii="Arial" w:hAnsi="Arial" w:cs="Arial"/>
-          </w:rPr>
-          <w:delText xml:space="preserve">2 groups with 2 individuals per group, 4 groups with 4 individuals per group, 6 groups with 6 individuals per group, and 8 groups with 8 individuals per group. </w:delText>
-        </w:r>
-      </w:del>
-      <w:moveFromRangeStart w:id="205" w:author="Smith Vidaurre, Grace" w:date="2025-06-16T16:54:00Z" w:name="move200985309"/>
-      <w:moveFrom w:id="206" w:author="Smith Vidaurre, Grace" w:date="2025-06-16T16:54:00Z" w16du:dateUtc="2025-06-16T20:54:00Z">
-        <w:del w:id="207" w:author="Smith Vidaurre, Grace" w:date="2025-06-16T17:07:00Z" w16du:dateUtc="2025-06-16T21:07:00Z">
-          <w:r>
-            <w:rPr>
-              <w:rFonts w:ascii="Arial" w:hAnsi="Arial" w:cs="Arial"/>
-            </w:rPr>
-            <w:delText xml:space="preserve">We also varied the proportion of group information to individual information encoded in the signal, with four categories: 0 (representing all individual information and no group information), 1/3, 2/3, and 1 (representing all group information and no individual information. </w:delText>
-          </w:r>
-        </w:del>
-      </w:moveFrom>
-      <w:moveFromRangeEnd w:id="205"/>
-      <w:del w:id="208" w:author="Smith Vidaurre, Grace" w:date="2025-06-16T17:07:00Z" w16du:dateUtc="2025-06-16T21:07:00Z">
+          <w:rFonts w:ascii="Arial" w:hAnsi="Arial" w:cs="Arial"/>
+        </w:rPr>
+      </w:pPr>
+    </w:p>
+    <w:p>
+      <w:pPr>
+        <w:pStyle w:val="NoSpacing"/>
+        <w:spacing w:line="480" w:lineRule="auto"/>
+        <w:rPr>
+          <w:rFonts w:ascii="Arial" w:hAnsi="Arial" w:cs="Arial"/>
+        </w:rPr>
+      </w:pPr>
+      <w:r>
+        <w:rPr>
+          <w:rFonts w:ascii="Arial" w:hAnsi="Arial" w:cs="Arial"/>
+        </w:rPr>
+        <w:t>TKTK add notes about replacement of negative values, and replacement and validation of zeroes</w:t>
+      </w:r>
+    </w:p>
+    <w:p>
+      <w:pPr>
+        <w:pStyle w:val="NoSpacing"/>
+        <w:spacing w:line="480" w:lineRule="auto"/>
+        <w:rPr>
+          <w:del w:id="79" w:author="Smith Vidaurre, Grace" w:date="2025-06-16T17:08:00Z" w16du:dateUtc="2025-06-16T21:08:00Z"/>
+          <w:rFonts w:ascii="Arial" w:hAnsi="Arial" w:cs="Arial"/>
+        </w:rPr>
+      </w:pPr>
+      <w:del w:id="80" w:author="Smith Vidaurre, Grace" w:date="2025-06-16T17:07:00Z" w16du:dateUtc="2025-06-16T21:07:00Z">
         <w:r>
           <w:rPr>
             <w:rFonts w:ascii="Arial" w:hAnsi="Arial" w:cs="Arial"/>
@@ -22479,7 +21977,7 @@
           <w:delText xml:space="preserve">We iterated </w:delText>
         </w:r>
       </w:del>
-      <w:del w:id="209" w:author="Smith Vidaurre, Grace" w:date="2025-06-16T17:08:00Z" w16du:dateUtc="2025-06-16T21:08:00Z">
+      <w:del w:id="81" w:author="Smith Vidaurre, Grace" w:date="2025-06-16T17:08:00Z" w16du:dateUtc="2025-06-16T21:08:00Z">
         <w:r>
           <w:rPr>
             <w:rFonts w:ascii="Arial" w:hAnsi="Arial" w:cs="Arial"/>
@@ -22496,7 +21994,7 @@
           <w:rFonts w:ascii="Arial" w:hAnsi="Arial" w:cs="Arial"/>
         </w:rPr>
       </w:pPr>
-      <w:del w:id="210" w:author="Smith Vidaurre, Grace" w:date="2025-06-16T17:32:00Z" w16du:dateUtc="2025-06-16T21:32:00Z">
+      <w:del w:id="82" w:author="Smith Vidaurre, Grace" w:date="2025-06-16T17:32:00Z" w16du:dateUtc="2025-06-16T21:32:00Z">
         <w:r>
           <w:rPr>
             <w:rFonts w:ascii="Arial" w:hAnsi="Arial" w:cs="Arial"/>
@@ -22541,7 +22039,7 @@
         <w:pStyle w:val="NoSpacing"/>
         <w:spacing w:line="480" w:lineRule="auto"/>
         <w:rPr>
-          <w:ins w:id="211" w:author="Smith Vidaurre, Grace" w:date="2025-05-28T19:06:00Z" w16du:dateUtc="2025-05-28T23:06:00Z"/>
+          <w:ins w:id="83" w:author="Smith Vidaurre, Grace" w:date="2025-05-28T19:06:00Z" w16du:dateUtc="2025-05-28T23:06:00Z"/>
           <w:rFonts w:ascii="Arial" w:hAnsi="Arial" w:cs="Arial"/>
         </w:rPr>
       </w:pPr>
@@ -22564,7 +22062,7 @@
         <w:pStyle w:val="NoSpacing"/>
         <w:spacing w:line="480" w:lineRule="auto"/>
         <w:rPr>
-          <w:ins w:id="212" w:author="Smith Vidaurre, Grace" w:date="2025-05-28T19:06:00Z" w16du:dateUtc="2025-05-28T23:06:00Z"/>
+          <w:ins w:id="84" w:author="Smith Vidaurre, Grace" w:date="2025-05-28T19:06:00Z" w16du:dateUtc="2025-05-28T23:06:00Z"/>
           <w:rFonts w:ascii="Arial" w:hAnsi="Arial" w:cs="Arial"/>
         </w:rPr>
       </w:pPr>
@@ -22574,46 +22072,46 @@
         <w:spacing w:line="480" w:lineRule="auto"/>
         <w:ind w:firstLine="720"/>
         <w:rPr>
-          <w:ins w:id="213" w:author="Smith Vidaurre, Grace" w:date="2025-05-28T19:06:00Z" w16du:dateUtc="2025-05-28T23:06:00Z"/>
-          <w:rFonts w:ascii="Arial" w:hAnsi="Arial" w:cs="Arial"/>
-        </w:rPr>
-      </w:pPr>
-      <w:ins w:id="214" w:author="Smith Vidaurre, Grace" w:date="2025-05-28T19:06:00Z" w16du:dateUtc="2025-05-28T23:06:00Z">
+          <w:ins w:id="85" w:author="Smith Vidaurre, Grace" w:date="2025-05-28T19:06:00Z" w16du:dateUtc="2025-05-28T23:06:00Z"/>
+          <w:rFonts w:ascii="Arial" w:hAnsi="Arial" w:cs="Arial"/>
+        </w:rPr>
+      </w:pPr>
+      <w:ins w:id="86" w:author="Smith Vidaurre, Grace" w:date="2025-05-28T19:06:00Z" w16du:dateUtc="2025-05-28T23:06:00Z">
         <w:r>
           <w:rPr>
             <w:rFonts w:ascii="Arial" w:hAnsi="Arial" w:cs="Arial"/>
           </w:rPr>
           <w:t xml:space="preserve">TKTK integrate </w:t>
         </w:r>
-        <w:commentRangeStart w:id="215"/>
-        <w:commentRangeStart w:id="216"/>
-        <w:commentRangeStart w:id="217"/>
+        <w:commentRangeStart w:id="87"/>
+        <w:commentRangeStart w:id="88"/>
+        <w:commentRangeStart w:id="89"/>
         <w:r>
           <w:rPr>
             <w:rFonts w:ascii="Arial" w:hAnsi="Arial" w:cs="Arial"/>
           </w:rPr>
           <w:t>We expected to identify clustering accuracies that were generally lower for spectrographic cross-correlation than the edit distance, since spectrographic cross-correlation was performed on strings transformed into synthetic audio files, which may have led to losses of the original information or added noise</w:t>
         </w:r>
-        <w:commentRangeEnd w:id="215"/>
+        <w:commentRangeEnd w:id="87"/>
         <w:r>
           <w:rPr>
             <w:rStyle w:val="CommentReference"/>
           </w:rPr>
-          <w:commentReference w:id="215"/>
+          <w:commentReference w:id="87"/>
         </w:r>
-        <w:commentRangeEnd w:id="216"/>
+        <w:commentRangeEnd w:id="88"/>
         <w:r>
           <w:rPr>
             <w:rStyle w:val="CommentReference"/>
           </w:rPr>
-          <w:commentReference w:id="216"/>
+          <w:commentReference w:id="88"/>
         </w:r>
-        <w:commentRangeEnd w:id="217"/>
+        <w:commentRangeEnd w:id="89"/>
         <w:r>
           <w:rPr>
             <w:rStyle w:val="CommentReference"/>
           </w:rPr>
-          <w:commentReference w:id="217"/>
+          <w:commentReference w:id="89"/>
         </w:r>
         <w:r>
           <w:rPr>
@@ -22674,7 +22172,6 @@
           <w:i/>
           <w:iCs/>
         </w:rPr>
-        <w:lastRenderedPageBreak/>
         <w:t>TKTK</w:t>
       </w:r>
     </w:p>
@@ -23696,7 +23193,7 @@
           <w:szCs w:val="20"/>
         </w:rPr>
       </w:pPr>
-      <w:del w:id="218" w:author="Smith Vidaurre, Grace" w:date="2025-05-27T21:15:00Z" w16du:dateUtc="2025-05-28T01:15:00Z">
+      <w:del w:id="90" w:author="Smith Vidaurre, Grace" w:date="2025-05-27T21:15:00Z" w16du:dateUtc="2025-05-28T01:15:00Z">
         <w:r>
           <w:rPr>
             <w:noProof/>
@@ -23774,13 +23271,13 @@
           <w:rFonts w:ascii="Arial" w:hAnsi="Arial" w:cs="Arial"/>
         </w:rPr>
       </w:pPr>
-      <w:commentRangeStart w:id="219"/>
-      <w:commentRangeEnd w:id="219"/>
+      <w:commentRangeStart w:id="91"/>
+      <w:commentRangeEnd w:id="91"/>
       <w:r>
         <w:rPr>
           <w:rStyle w:val="CommentReference"/>
         </w:rPr>
-        <w:commentReference w:id="219"/>
+        <w:commentReference w:id="91"/>
       </w:r>
       <w:r>
         <w:rPr>
@@ -23898,7 +23395,7 @@
           <w:rFonts w:ascii="Arial" w:hAnsi="Arial" w:cs="Arial"/>
         </w:rPr>
       </w:pPr>
-      <w:del w:id="220" w:author="Smith Vidaurre, Grace" w:date="2025-05-27T21:15:00Z" w16du:dateUtc="2025-05-28T01:15:00Z">
+      <w:del w:id="92" w:author="Smith Vidaurre, Grace" w:date="2025-05-27T21:15:00Z" w16du:dateUtc="2025-05-28T01:15:00Z">
         <w:r>
           <w:rPr>
             <w:rFonts w:ascii="Arial" w:hAnsi="Arial" w:cs="Arial"/>
@@ -23989,7 +23486,7 @@
           <w:rFonts w:ascii="Arial" w:hAnsi="Arial" w:cs="Arial"/>
         </w:rPr>
       </w:pPr>
-      <w:del w:id="221" w:author="Smith Vidaurre, Grace" w:date="2025-05-27T21:15:00Z" w16du:dateUtc="2025-05-28T01:15:00Z">
+      <w:del w:id="93" w:author="Smith Vidaurre, Grace" w:date="2025-05-27T21:15:00Z" w16du:dateUtc="2025-05-28T01:15:00Z">
         <w:r>
           <w:rPr>
             <w:rFonts w:ascii="Arial" w:hAnsi="Arial" w:cs="Arial"/>
@@ -24146,19 +23643,19 @@
         </w:rPr>
         <w:t xml:space="preserve">). </w:t>
       </w:r>
-      <w:commentRangeStart w:id="222"/>
+      <w:commentRangeStart w:id="94"/>
       <w:r>
         <w:rPr>
           <w:rFonts w:ascii="Arial" w:hAnsi="Arial" w:cs="Arial"/>
         </w:rPr>
         <w:t>This suggests that individuals are being categorized in distinct individual clusters when running traditional bioacoustics analyses on our synthetically generated calls.</w:t>
       </w:r>
-      <w:commentRangeEnd w:id="222"/>
+      <w:commentRangeEnd w:id="94"/>
       <w:r>
         <w:rPr>
           <w:rStyle w:val="CommentReference"/>
         </w:rPr>
-        <w:commentReference w:id="222"/>
+        <w:commentReference w:id="94"/>
       </w:r>
     </w:p>
     <w:p>
@@ -24171,7 +23668,7 @@
     <w:p>
       <w:pPr>
         <w:rPr>
-          <w:ins w:id="223" w:author="Smith Vidaurre, Grace" w:date="2025-05-22T14:24:00Z" w16du:dateUtc="2025-05-22T18:24:00Z"/>
+          <w:ins w:id="95" w:author="Smith Vidaurre, Grace" w:date="2025-05-22T14:24:00Z" w16du:dateUtc="2025-05-22T18:24:00Z"/>
           <w:rFonts w:ascii="Arial" w:hAnsi="Arial" w:cs="Arial"/>
           <w:b/>
           <w:bCs/>
@@ -24189,7 +23686,7 @@
     <w:p>
       <w:pPr>
         <w:rPr>
-          <w:ins w:id="224" w:author="Smith Vidaurre, Grace" w:date="2025-05-22T14:24:00Z" w16du:dateUtc="2025-05-22T18:24:00Z"/>
+          <w:ins w:id="96" w:author="Smith Vidaurre, Grace" w:date="2025-05-22T14:24:00Z" w16du:dateUtc="2025-05-22T18:24:00Z"/>
           <w:rFonts w:ascii="Arial" w:hAnsi="Arial" w:cs="Arial"/>
           <w:b/>
           <w:bCs/>
@@ -24201,7 +23698,7 @@
         <w:spacing w:line="480" w:lineRule="auto"/>
         <w:ind w:firstLine="720"/>
         <w:rPr>
-          <w:ins w:id="225" w:author="Smith Vidaurre, Grace" w:date="2025-05-22T14:25:00Z" w16du:dateUtc="2025-05-22T18:25:00Z"/>
+          <w:ins w:id="97" w:author="Smith Vidaurre, Grace" w:date="2025-05-22T14:25:00Z" w16du:dateUtc="2025-05-22T18:25:00Z"/>
           <w:rFonts w:ascii="Arial" w:hAnsi="Arial" w:cs="Arial"/>
         </w:rPr>
       </w:pPr>
@@ -24247,19 +23744,19 @@
         </w:rPr>
         <w:t xml:space="preserve">, therefore, to study to evolution of vocal learning, we must understand how vocal learners encode and perceive information in learned vocal signals. Studies of the diversity of information encoding across vocal learning taxa could lead to new insights into how vocal learning originated and continues to </w:t>
       </w:r>
-      <w:commentRangeStart w:id="226"/>
+      <w:commentRangeStart w:id="98"/>
       <w:r>
         <w:rPr>
           <w:rFonts w:ascii="Arial" w:hAnsi="Arial" w:cs="Arial"/>
         </w:rPr>
         <w:t>evolve</w:t>
       </w:r>
-      <w:commentRangeEnd w:id="226"/>
+      <w:commentRangeEnd w:id="98"/>
       <w:r>
         <w:rPr>
           <w:rStyle w:val="CommentReference"/>
         </w:rPr>
-        <w:commentReference w:id="226"/>
+        <w:commentReference w:id="98"/>
       </w:r>
       <w:r>
         <w:rPr>
@@ -24273,7 +23770,7 @@
         <w:spacing w:line="480" w:lineRule="auto"/>
         <w:ind w:firstLine="720"/>
         <w:rPr>
-          <w:ins w:id="227" w:author="Smith Vidaurre, Grace" w:date="2025-05-22T14:25:00Z" w16du:dateUtc="2025-05-22T18:25:00Z"/>
+          <w:ins w:id="99" w:author="Smith Vidaurre, Grace" w:date="2025-05-22T14:25:00Z" w16du:dateUtc="2025-05-22T18:25:00Z"/>
           <w:rFonts w:ascii="Arial" w:hAnsi="Arial" w:cs="Arial"/>
         </w:rPr>
       </w:pPr>
@@ -24283,12 +23780,12 @@
         <w:spacing w:line="480" w:lineRule="auto"/>
         <w:ind w:firstLine="720"/>
         <w:rPr>
-          <w:ins w:id="228" w:author="Smith Vidaurre, Grace" w:date="2025-05-22T14:34:00Z" w16du:dateUtc="2025-05-22T18:34:00Z"/>
-          <w:rFonts w:ascii="Arial" w:hAnsi="Arial" w:cs="Arial"/>
-        </w:rPr>
-      </w:pPr>
-      <w:commentRangeStart w:id="229"/>
-      <w:ins w:id="230" w:author="Smith Vidaurre, Grace" w:date="2025-05-22T14:25:00Z" w16du:dateUtc="2025-05-22T18:25:00Z">
+          <w:ins w:id="100" w:author="Smith Vidaurre, Grace" w:date="2025-05-22T14:34:00Z" w16du:dateUtc="2025-05-22T18:34:00Z"/>
+          <w:rFonts w:ascii="Arial" w:hAnsi="Arial" w:cs="Arial"/>
+        </w:rPr>
+      </w:pPr>
+      <w:commentRangeStart w:id="101"/>
+      <w:ins w:id="102" w:author="Smith Vidaurre, Grace" w:date="2025-05-22T14:25:00Z" w16du:dateUtc="2025-05-22T18:25:00Z">
         <w:r>
           <w:rPr>
             <w:rFonts w:ascii="Arial" w:hAnsi="Arial" w:cs="Arial"/>
@@ -24675,12 +24172,12 @@
           </w:rPr>
           <w:t xml:space="preserve">. </w:t>
         </w:r>
-        <w:commentRangeEnd w:id="229"/>
+        <w:commentRangeEnd w:id="101"/>
         <w:r>
           <w:rPr>
             <w:rStyle w:val="CommentReference"/>
           </w:rPr>
-          <w:commentReference w:id="229"/>
+          <w:commentReference w:id="101"/>
         </w:r>
       </w:ins>
     </w:p>
@@ -24689,7 +24186,7 @@
         <w:spacing w:line="480" w:lineRule="auto"/>
         <w:ind w:firstLine="720"/>
         <w:rPr>
-          <w:ins w:id="231" w:author="Smith Vidaurre, Grace" w:date="2025-05-22T14:34:00Z" w16du:dateUtc="2025-05-22T18:34:00Z"/>
+          <w:ins w:id="103" w:author="Smith Vidaurre, Grace" w:date="2025-05-22T14:34:00Z" w16du:dateUtc="2025-05-22T18:34:00Z"/>
           <w:rFonts w:ascii="Arial" w:hAnsi="Arial" w:cs="Arial"/>
         </w:rPr>
       </w:pPr>
@@ -24699,11 +24196,11 @@
         <w:spacing w:line="480" w:lineRule="auto"/>
         <w:ind w:firstLine="720"/>
         <w:rPr>
-          <w:ins w:id="232" w:author="Smith Vidaurre, Grace" w:date="2025-05-22T14:34:00Z" w16du:dateUtc="2025-05-22T18:34:00Z"/>
-          <w:rFonts w:ascii="Arial" w:hAnsi="Arial" w:cs="Arial"/>
-        </w:rPr>
-      </w:pPr>
-      <w:ins w:id="233" w:author="Smith Vidaurre, Grace" w:date="2025-05-22T14:34:00Z" w16du:dateUtc="2025-05-22T18:34:00Z">
+          <w:ins w:id="104" w:author="Smith Vidaurre, Grace" w:date="2025-05-22T14:34:00Z" w16du:dateUtc="2025-05-22T18:34:00Z"/>
+          <w:rFonts w:ascii="Arial" w:hAnsi="Arial" w:cs="Arial"/>
+        </w:rPr>
+      </w:pPr>
+      <w:ins w:id="105" w:author="Smith Vidaurre, Grace" w:date="2025-05-22T14:34:00Z" w16du:dateUtc="2025-05-22T18:34:00Z">
         <w:r>
           <w:rPr>
             <w:rFonts w:ascii="Arial" w:hAnsi="Arial" w:cs="Arial"/>
@@ -24746,19 +24243,19 @@
           </w:rPr>
           <w:t>(</w:t>
         </w:r>
-        <w:commentRangeStart w:id="234"/>
+        <w:commentRangeStart w:id="106"/>
         <w:r>
           <w:rPr>
             <w:rFonts w:ascii="Arial" w:hAnsi="Arial" w:cs="Arial"/>
           </w:rPr>
           <w:t>CITE</w:t>
         </w:r>
-        <w:commentRangeEnd w:id="234"/>
+        <w:commentRangeEnd w:id="106"/>
         <w:r>
           <w:rPr>
             <w:rStyle w:val="CommentReference"/>
           </w:rPr>
-          <w:commentReference w:id="234"/>
+          <w:commentReference w:id="106"/>
         </w:r>
         <w:r>
           <w:rPr>
@@ -24810,7 +24307,7 @@
         <w:spacing w:line="480" w:lineRule="auto"/>
         <w:ind w:firstLine="720"/>
         <w:rPr>
-          <w:ins w:id="235" w:author="Smith Vidaurre, Grace" w:date="2025-05-22T14:35:00Z" w16du:dateUtc="2025-05-22T18:35:00Z"/>
+          <w:ins w:id="107" w:author="Smith Vidaurre, Grace" w:date="2025-05-22T14:35:00Z" w16du:dateUtc="2025-05-22T18:35:00Z"/>
           <w:rFonts w:ascii="Arial" w:hAnsi="Arial" w:cs="Arial"/>
         </w:rPr>
       </w:pPr>
@@ -24820,11 +24317,11 @@
         <w:spacing w:line="480" w:lineRule="auto"/>
         <w:ind w:firstLine="720"/>
         <w:rPr>
-          <w:ins w:id="236" w:author="Smith Vidaurre, Grace" w:date="2025-06-05T09:40:00Z" w16du:dateUtc="2025-06-05T13:40:00Z"/>
-          <w:rFonts w:ascii="Arial" w:hAnsi="Arial" w:cs="Arial"/>
-        </w:rPr>
-      </w:pPr>
-      <w:ins w:id="237" w:author="Smith Vidaurre, Grace" w:date="2025-05-22T14:35:00Z" w16du:dateUtc="2025-05-22T18:35:00Z">
+          <w:ins w:id="108" w:author="Smith Vidaurre, Grace" w:date="2025-06-05T09:40:00Z" w16du:dateUtc="2025-06-05T13:40:00Z"/>
+          <w:rFonts w:ascii="Arial" w:hAnsi="Arial" w:cs="Arial"/>
+        </w:rPr>
+      </w:pPr>
+      <w:ins w:id="109" w:author="Smith Vidaurre, Grace" w:date="2025-05-22T14:35:00Z" w16du:dateUtc="2025-05-22T18:35:00Z">
         <w:r>
           <w:rPr>
             <w:rFonts w:ascii="Arial" w:hAnsi="Arial" w:cs="Arial"/>
@@ -24874,7 +24371,7 @@
         <w:spacing w:line="480" w:lineRule="auto"/>
         <w:ind w:firstLine="720"/>
         <w:rPr>
-          <w:ins w:id="238" w:author="Smith Vidaurre, Grace" w:date="2025-06-05T09:40:00Z" w16du:dateUtc="2025-06-05T13:40:00Z"/>
+          <w:ins w:id="110" w:author="Smith Vidaurre, Grace" w:date="2025-06-05T09:40:00Z" w16du:dateUtc="2025-06-05T13:40:00Z"/>
           <w:rFonts w:ascii="Arial" w:hAnsi="Arial" w:cs="Arial"/>
         </w:rPr>
       </w:pPr>
@@ -24884,11 +24381,11 @@
         <w:spacing w:line="480" w:lineRule="auto"/>
         <w:ind w:firstLine="720"/>
         <w:rPr>
-          <w:ins w:id="239" w:author="Smith Vidaurre, Grace" w:date="2025-06-05T09:40:00Z" w16du:dateUtc="2025-06-05T13:40:00Z"/>
-          <w:rFonts w:ascii="Arial" w:hAnsi="Arial" w:cs="Arial"/>
-        </w:rPr>
-      </w:pPr>
-      <w:ins w:id="240" w:author="Smith Vidaurre, Grace" w:date="2025-06-05T09:40:00Z" w16du:dateUtc="2025-06-05T13:40:00Z">
+          <w:ins w:id="111" w:author="Smith Vidaurre, Grace" w:date="2025-06-05T09:40:00Z" w16du:dateUtc="2025-06-05T13:40:00Z"/>
+          <w:rFonts w:ascii="Arial" w:hAnsi="Arial" w:cs="Arial"/>
+        </w:rPr>
+      </w:pPr>
+      <w:ins w:id="112" w:author="Smith Vidaurre, Grace" w:date="2025-06-05T09:40:00Z" w16du:dateUtc="2025-06-05T13:40:00Z">
         <w:r>
           <w:rPr>
             <w:rFonts w:ascii="Arial" w:hAnsi="Arial" w:cs="Arial"/>
@@ -24939,19 +24436,19 @@
           <w:bCs/>
         </w:rPr>
       </w:pPr>
-      <w:commentRangeStart w:id="241"/>
+      <w:commentRangeStart w:id="113"/>
       <w:r>
         <w:rPr>
           <w:rFonts w:ascii="Arial" w:hAnsi="Arial" w:cs="Arial"/>
         </w:rPr>
         <w:t>Second, out ability to detect the dynamics of information encoding during real time social interactions is limited by our ability to capture the totality of an individual’s or groups signal produced during these interactions. We may be over sampling from vocal learning species whose social interaction and signal production are easy to observe and measure, and therefore may not be assessing the full scope of how information can be encoded across a range of species.</w:t>
       </w:r>
-      <w:commentRangeEnd w:id="241"/>
+      <w:commentRangeEnd w:id="113"/>
       <w:r>
         <w:rPr>
           <w:rStyle w:val="CommentReference"/>
         </w:rPr>
-        <w:commentReference w:id="241"/>
+        <w:commentReference w:id="113"/>
       </w:r>
     </w:p>
     <w:p>
@@ -24967,7 +24464,7 @@
       <w:pPr>
         <w:spacing w:line="360" w:lineRule="auto"/>
         <w:rPr>
-          <w:ins w:id="242" w:author="Smith Vidaurre, Grace" w:date="2025-06-05T09:32:00Z" w16du:dateUtc="2025-06-05T13:32:00Z"/>
+          <w:ins w:id="114" w:author="Smith Vidaurre, Grace" w:date="2025-06-05T09:32:00Z" w16du:dateUtc="2025-06-05T13:32:00Z"/>
           <w:rFonts w:ascii="Arial" w:hAnsi="Arial" w:cs="Arial"/>
         </w:rPr>
       </w:pPr>
@@ -24977,35 +24474,35 @@
         </w:rPr>
         <w:t xml:space="preserve">Several computationally intensive tools have emerged to assess the degree or types of information encoded in </w:t>
       </w:r>
-      <w:commentRangeStart w:id="243"/>
-      <w:commentRangeStart w:id="244"/>
-      <w:commentRangeStart w:id="245"/>
+      <w:commentRangeStart w:id="115"/>
+      <w:commentRangeStart w:id="116"/>
+      <w:commentRangeStart w:id="117"/>
       <w:r>
         <w:rPr>
           <w:rFonts w:ascii="Arial" w:hAnsi="Arial" w:cs="Arial"/>
         </w:rPr>
         <w:t>signals</w:t>
       </w:r>
-      <w:commentRangeEnd w:id="243"/>
+      <w:commentRangeEnd w:id="115"/>
       <w:r>
         <w:rPr>
           <w:rStyle w:val="CommentReference"/>
         </w:rPr>
-        <w:commentReference w:id="243"/>
-      </w:r>
-      <w:commentRangeEnd w:id="244"/>
+        <w:commentReference w:id="115"/>
+      </w:r>
+      <w:commentRangeEnd w:id="116"/>
       <w:r>
         <w:rPr>
           <w:rStyle w:val="CommentReference"/>
         </w:rPr>
-        <w:commentReference w:id="244"/>
-      </w:r>
-      <w:commentRangeEnd w:id="245"/>
+        <w:commentReference w:id="116"/>
+      </w:r>
+      <w:commentRangeEnd w:id="117"/>
       <w:r>
         <w:rPr>
           <w:rStyle w:val="CommentReference"/>
         </w:rPr>
-        <w:commentReference w:id="245"/>
+        <w:commentReference w:id="117"/>
       </w:r>
       <w:r>
         <w:rPr>
@@ -25309,7 +24806,7 @@
       <w:pPr>
         <w:spacing w:line="360" w:lineRule="auto"/>
         <w:rPr>
-          <w:ins w:id="246" w:author="Smith Vidaurre, Grace" w:date="2025-06-05T09:32:00Z" w16du:dateUtc="2025-06-05T13:32:00Z"/>
+          <w:ins w:id="118" w:author="Smith Vidaurre, Grace" w:date="2025-06-05T09:32:00Z" w16du:dateUtc="2025-06-05T13:32:00Z"/>
           <w:rFonts w:ascii="Arial" w:hAnsi="Arial" w:cs="Arial"/>
         </w:rPr>
       </w:pPr>
@@ -25319,11 +24816,11 @@
         <w:spacing w:line="480" w:lineRule="auto"/>
         <w:ind w:firstLine="720"/>
         <w:rPr>
-          <w:ins w:id="247" w:author="Smith Vidaurre, Grace" w:date="2025-06-05T09:32:00Z" w16du:dateUtc="2025-06-05T13:32:00Z"/>
-          <w:rFonts w:ascii="Arial" w:hAnsi="Arial" w:cs="Arial"/>
-        </w:rPr>
-      </w:pPr>
-      <w:ins w:id="248" w:author="Smith Vidaurre, Grace" w:date="2025-06-05T09:32:00Z" w16du:dateUtc="2025-06-05T13:32:00Z">
+          <w:ins w:id="119" w:author="Smith Vidaurre, Grace" w:date="2025-06-05T09:32:00Z" w16du:dateUtc="2025-06-05T13:32:00Z"/>
+          <w:rFonts w:ascii="Arial" w:hAnsi="Arial" w:cs="Arial"/>
+        </w:rPr>
+      </w:pPr>
+      <w:ins w:id="120" w:author="Smith Vidaurre, Grace" w:date="2025-06-05T09:32:00Z" w16du:dateUtc="2025-06-05T13:32:00Z">
         <w:r>
           <w:rPr>
             <w:rFonts w:ascii="Arial" w:hAnsi="Arial" w:cs="Arial"/>
@@ -26228,7 +25725,7 @@
       </w:r>
     </w:p>
   </w:comment>
-  <w:comment w:id="203" w:author="Coppinger, Brittany" w:date="2025-04-03T14:53:00Z" w:initials="BC">
+  <w:comment w:id="87" w:author="Coppinger, Brittany" w:date="2025-04-10T14:31:00Z" w:initials="BC">
     <w:p>
       <w:pPr>
         <w:pStyle w:val="CommentText"/>
@@ -26240,15 +25737,12 @@
         <w:annotationRef/>
       </w:r>
       <w:r>
-        <w:t>This is super awkward, I need to think of a better way to say this. Probably include something about information theory</w:t>
+        <w:t>Should we say this? We never explicitly tested for it?</w:t>
       </w:r>
     </w:p>
   </w:comment>
-  <w:comment w:id="215" w:author="Coppinger, Brittany" w:date="2025-04-10T14:31:00Z" w:initials="BC">
+  <w:comment w:id="88" w:author="Smith Vidaurre, Grace" w:date="2025-05-28T18:58:00Z" w:initials="GSV">
     <w:p>
-      <w:pPr>
-        <w:pStyle w:val="CommentText"/>
-      </w:pPr>
       <w:r>
         <w:rPr>
           <w:rStyle w:val="CommentReference"/>
@@ -26256,11 +25750,15 @@
         <w:annotationRef/>
       </w:r>
       <w:r>
-        <w:t>Should we say this? We never explicitly tested for it?</w:t>
+        <w:rPr>
+          <w:sz w:val="20"/>
+          <w:szCs w:val="20"/>
+        </w:rPr>
+        <w:t>Yeah I think this is alright to include, and we can allude to the fact that we can use information theory tools in follow up work to track how information is lost through this pipeline</w:t>
       </w:r>
     </w:p>
   </w:comment>
-  <w:comment w:id="216" w:author="Smith Vidaurre, Grace" w:date="2025-05-28T18:58:00Z" w:initials="GSV">
+  <w:comment w:id="89" w:author="Smith Vidaurre, Grace" w:date="2025-05-28T19:00:00Z" w:initials="GSV">
     <w:p>
       <w:r>
         <w:rPr>
@@ -26273,11 +25771,43 @@
           <w:sz w:val="20"/>
           <w:szCs w:val="20"/>
         </w:rPr>
-        <w:t>Yeah I think this is alright to include, and we can allude to the fact that we can use information theory tools in follow up work to track how information is lost through this pipeline</w:t>
+        <w:t>But we can save this for the methods</w:t>
       </w:r>
     </w:p>
   </w:comment>
-  <w:comment w:id="217" w:author="Smith Vidaurre, Grace" w:date="2025-05-28T19:00:00Z" w:initials="GSV">
+  <w:comment w:id="91" w:author="Summer Eckhardt" w:date="2025-02-04T18:49:00Z" w:initials="SE">
+    <w:p>
+      <w:pPr>
+        <w:pStyle w:val="CommentText"/>
+      </w:pPr>
+      <w:r>
+        <w:rPr>
+          <w:rStyle w:val="CommentReference"/>
+        </w:rPr>
+        <w:annotationRef/>
+      </w:r>
+      <w:r>
+        <w:t>Need to add legend</w:t>
+      </w:r>
+    </w:p>
+  </w:comment>
+  <w:comment w:id="94" w:author="Summer Eckhardt" w:date="2025-02-04T19:02:00Z" w:initials="SE">
+    <w:p>
+      <w:pPr>
+        <w:pStyle w:val="CommentText"/>
+      </w:pPr>
+      <w:r>
+        <w:rPr>
+          <w:rStyle w:val="CommentReference"/>
+        </w:rPr>
+        <w:annotationRef/>
+      </w:r>
+      <w:r>
+        <w:t>Are these last few sentences repetitive?</w:t>
+      </w:r>
+    </w:p>
+  </w:comment>
+  <w:comment w:id="98" w:author="Smith Vidaurre, Grace" w:date="2025-05-22T13:33:00Z" w:initials="GSV">
     <w:p>
       <w:r>
         <w:rPr>
@@ -26290,15 +25820,12 @@
           <w:sz w:val="20"/>
           <w:szCs w:val="20"/>
         </w:rPr>
-        <w:t>But we can save this for the methods</w:t>
+        <w:t>Let’s get the baby and the werewolf into this first paragraph</w:t>
       </w:r>
     </w:p>
   </w:comment>
-  <w:comment w:id="219" w:author="Summer Eckhardt" w:date="2025-02-04T18:49:00Z" w:initials="SE">
+  <w:comment w:id="101" w:author="Smith Vidaurre, Grace" w:date="2025-05-22T13:23:00Z" w:initials="GSV">
     <w:p>
-      <w:pPr>
-        <w:pStyle w:val="CommentText"/>
-      </w:pPr>
       <w:r>
         <w:rPr>
           <w:rStyle w:val="CommentReference"/>
@@ -26306,15 +25833,16 @@
         <w:annotationRef/>
       </w:r>
       <w:r>
-        <w:t>Need to add legend</w:t>
+        <w:rPr>
+          <w:sz w:val="20"/>
+          <w:szCs w:val="20"/>
+        </w:rPr>
+        <w:t>We should save this for a separate paper that will come out of the project I present at ABS this summer. Still gotta start that project…</w:t>
       </w:r>
     </w:p>
   </w:comment>
-  <w:comment w:id="222" w:author="Summer Eckhardt" w:date="2025-02-04T19:02:00Z" w:initials="SE">
+  <w:comment w:id="106" w:author="Smith Vidaurre, Grace" w:date="2024-12-18T14:31:00Z" w:initials="GSV">
     <w:p>
-      <w:pPr>
-        <w:pStyle w:val="CommentText"/>
-      </w:pPr>
       <w:r>
         <w:rPr>
           <w:rStyle w:val="CommentReference"/>
@@ -26322,11 +25850,15 @@
         <w:annotationRef/>
       </w:r>
       <w:r>
-        <w:t>Are these last few sentences repetitive?</w:t>
+        <w:rPr>
+          <w:sz w:val="20"/>
+          <w:szCs w:val="20"/>
+        </w:rPr>
+        <w:t>Sewall et al. 2016 as a review, but we can also cite parrot and dolphin signature call papers</w:t>
       </w:r>
     </w:p>
   </w:comment>
-  <w:comment w:id="226" w:author="Smith Vidaurre, Grace" w:date="2025-05-22T13:33:00Z" w:initials="GSV">
+  <w:comment w:id="113" w:author="Smith Vidaurre, Grace" w:date="2024-12-18T15:30:00Z" w:initials="GSV">
     <w:p>
       <w:r>
         <w:rPr>
@@ -26339,11 +25871,11 @@
           <w:sz w:val="20"/>
           <w:szCs w:val="20"/>
         </w:rPr>
-        <w:t>Let’s get the baby and the werewolf into this first paragraph</w:t>
+        <w:t>This belongs in the review draft!</w:t>
       </w:r>
     </w:p>
   </w:comment>
-  <w:comment w:id="229" w:author="Smith Vidaurre, Grace" w:date="2025-05-22T13:23:00Z" w:initials="GSV">
+  <w:comment w:id="115" w:author="Smith Vidaurre, Grace" w:date="2024-12-16T09:35:00Z" w:initials="GSV">
     <w:p>
       <w:r>
         <w:rPr>
@@ -26356,11 +25888,11 @@
           <w:sz w:val="20"/>
           <w:szCs w:val="20"/>
         </w:rPr>
-        <w:t>We should save this for a separate paper that will come out of the project I present at ABS this summer. Still gotta start that project…</w:t>
+        <w:t>Traditionally we have a lot of tools (list them) to quantify acoustic convergence and divergence</w:t>
       </w:r>
     </w:p>
   </w:comment>
-  <w:comment w:id="234" w:author="Smith Vidaurre, Grace" w:date="2024-12-18T14:31:00Z" w:initials="GSV">
+  <w:comment w:id="116" w:author="Smith Vidaurre, Grace" w:date="2024-12-16T09:41:00Z" w:initials="GSV">
     <w:p>
       <w:r>
         <w:rPr>
@@ -26373,62 +25905,11 @@
           <w:sz w:val="20"/>
           <w:szCs w:val="20"/>
         </w:rPr>
-        <w:t>Sewall et al. 2016 as a review, but we can also cite parrot and dolphin signature call papers</w:t>
+        <w:t>Visual classification (Peter Marler up through more recent work, Wright papers), 2) dimensionality reduction like spectrographic cross-correlation and multidimensional scaling to visualize patterns of acoustic variation in low-dimensional acoustic space (Wright 1996) or similar approaches to reduce the dimensionality of hand-picked acoustic measurements (Karl Berg green-rumped parrotlets, Bradbury and orange-fronted conures), 3) matrix correlation of acoustic similarity matrices and matrices of binary social identity or social affiliations (Mantel tests in Tim Wright’s papers, MQRAP in other study systems), mathematical information: Todd Freeberg and Arik Kershenbaum’s approaches (to some degree these approaches rely on classification of note types and repertoire classification or segmenting discrete signals into chunks)</w:t>
       </w:r>
     </w:p>
   </w:comment>
-  <w:comment w:id="241" w:author="Smith Vidaurre, Grace" w:date="2024-12-18T15:30:00Z" w:initials="GSV">
-    <w:p>
-      <w:r>
-        <w:rPr>
-          <w:rStyle w:val="CommentReference"/>
-        </w:rPr>
-        <w:annotationRef/>
-      </w:r>
-      <w:r>
-        <w:rPr>
-          <w:sz w:val="20"/>
-          <w:szCs w:val="20"/>
-        </w:rPr>
-        <w:t>This belongs in the review draft!</w:t>
-      </w:r>
-    </w:p>
-  </w:comment>
-  <w:comment w:id="243" w:author="Smith Vidaurre, Grace" w:date="2024-12-16T09:35:00Z" w:initials="GSV">
-    <w:p>
-      <w:r>
-        <w:rPr>
-          <w:rStyle w:val="CommentReference"/>
-        </w:rPr>
-        <w:annotationRef/>
-      </w:r>
-      <w:r>
-        <w:rPr>
-          <w:sz w:val="20"/>
-          <w:szCs w:val="20"/>
-        </w:rPr>
-        <w:t>Traditionally we have a lot of tools (list them) to quantify acoustic convergence and divergence</w:t>
-      </w:r>
-    </w:p>
-  </w:comment>
-  <w:comment w:id="244" w:author="Smith Vidaurre, Grace" w:date="2024-12-16T09:41:00Z" w:initials="GSV">
-    <w:p>
-      <w:r>
-        <w:rPr>
-          <w:rStyle w:val="CommentReference"/>
-        </w:rPr>
-        <w:annotationRef/>
-      </w:r>
-      <w:r>
-        <w:rPr>
-          <w:sz w:val="20"/>
-          <w:szCs w:val="20"/>
-        </w:rPr>
-        <w:t>Visual classification (Peter Marler up through more recent work, Wright papers), 2) dimensionality reduction like spectrographic cross-correlation and multidimensional scaling to visualize patterns of acoustic variation in low-dimensional acoustic space (Wright 1996) or similar approaches to reduce the dimensionality of hand-picked acoustic measurements (Karl Berg green-rumped parrotlets, Bradbury and orange-fronted conures), 3) matrix correlation of acoustic similarity matrices and matrices of binary social identity or social affiliations (Mantel tests in Tim Wright’s papers, MQRAP in other study systems), mathematical information: Todd Freeberg and Arik Kershenbaum’s approaches (to some degree these approaches rely on classification of note types and repertoire classification or segmenting discrete signals into chunks)</w:t>
-      </w:r>
-    </w:p>
-  </w:comment>
-  <w:comment w:id="245" w:author="Coppinger, Brittany" w:date="2024-12-16T14:51:00Z" w:initials="BC">
+  <w:comment w:id="117" w:author="Coppinger, Brittany" w:date="2024-12-16T14:51:00Z" w:initials="BC">
     <w:p>
       <w:pPr>
         <w:pStyle w:val="CommentText"/>
@@ -26532,7 +26013,6 @@
   <w15:commentEx w15:paraId="7C2E490A" w15:done="0"/>
   <w15:commentEx w15:paraId="16B4FD0C" w15:done="1"/>
   <w15:commentEx w15:paraId="385C64F1" w15:paraIdParent="16B4FD0C" w15:done="1"/>
-  <w15:commentEx w15:paraId="742161AC" w15:done="0"/>
   <w15:commentEx w15:paraId="18E81EC9" w15:done="0"/>
   <w15:commentEx w15:paraId="1BF1C2B0" w15:paraIdParent="18E81EC9" w15:done="0"/>
   <w15:commentEx w15:paraId="24C6A039" w15:paraIdParent="18E81EC9" w15:done="0"/>
@@ -26603,7 +26083,6 @@
     </w16cex:extLst>
   </w16cex:commentExtensible>
   <w16cex:commentExtensible w16cex:durableId="7F84ABE9" w16cex:dateUtc="2025-01-27T15:41:00Z"/>
-  <w16cex:commentExtensible w16cex:durableId="4DA2C7C2" w16cex:dateUtc="2025-04-03T18:53:00Z"/>
   <w16cex:commentExtensible w16cex:durableId="3F248519" w16cex:dateUtc="2025-04-10T18:31:00Z"/>
   <w16cex:commentExtensible w16cex:durableId="3EF72F62" w16cex:dateUtc="2025-05-28T22:58:00Z"/>
   <w16cex:commentExtensible w16cex:durableId="2EF13616" w16cex:dateUtc="2025-05-28T23:00:00Z"/>
@@ -26662,7 +26141,6 @@
   <w16cid:commentId w16cid:paraId="7C2E490A" w16cid:durableId="05D8C9FC"/>
   <w16cid:commentId w16cid:paraId="16B4FD0C" w16cid:durableId="0B7A3DFC"/>
   <w16cid:commentId w16cid:paraId="385C64F1" w16cid:durableId="7F84ABE9"/>
-  <w16cid:commentId w16cid:paraId="742161AC" w16cid:durableId="4DA2C7C2"/>
   <w16cid:commentId w16cid:paraId="18E81EC9" w16cid:durableId="3F248519"/>
   <w16cid:commentId w16cid:paraId="1BF1C2B0" w16cid:durableId="3EF72F62"/>
   <w16cid:commentId w16cid:paraId="24C6A039" w16cid:durableId="2EF13616"/>

</xml_diff>

<commit_message>
Halfway through Results updates
Continue on line 307
</commit_message>
<xml_diff>
--- a/drafts/paRsynth_methods_draft.docx
+++ b/drafts/paRsynth_methods_draft.docx
@@ -7530,6 +7530,12 @@
         <w:rPr>
           <w:rFonts w:ascii="Arial" w:hAnsi="Arial" w:cs="Arial"/>
         </w:rPr>
+        <w:t>, hereafter “acoustic space”,</w:t>
+      </w:r>
+      <w:r>
+        <w:rPr>
+          <w:rFonts w:ascii="Arial" w:hAnsi="Arial" w:cs="Arial"/>
+        </w:rPr>
         <w:t xml:space="preserve"> by performing multidimensional scaling on </w:t>
       </w:r>
       <w:r>
@@ -7626,7 +7632,7 @@
         <w:rPr>
           <w:rFonts w:ascii="Arial" w:hAnsi="Arial" w:cs="Arial"/>
         </w:rPr>
-        <w:t>s</w:t>
+        <w:t>d</w:t>
       </w:r>
       <w:r>
         <w:rPr>
@@ -7678,7 +7684,31 @@
         <w:rPr>
           <w:rFonts w:ascii="Arial" w:hAnsi="Arial" w:cs="Arial"/>
         </w:rPr>
-        <w:t>vocalizations were generally more similar within groups compared to amongst groups</w:t>
+        <w:t>frequency modulation patterns</w:t>
+      </w:r>
+      <w:r>
+        <w:rPr>
+          <w:rFonts w:ascii="Arial" w:hAnsi="Arial" w:cs="Arial"/>
+        </w:rPr>
+        <w:t xml:space="preserve"> </w:t>
+      </w:r>
+      <w:r>
+        <w:rPr>
+          <w:rFonts w:ascii="Arial" w:hAnsi="Arial" w:cs="Arial"/>
+        </w:rPr>
+        <w:t xml:space="preserve">were generally more </w:t>
+      </w:r>
+      <w:r>
+        <w:rPr>
+          <w:rFonts w:ascii="Arial" w:hAnsi="Arial" w:cs="Arial"/>
+        </w:rPr>
+        <w:t xml:space="preserve">visibly </w:t>
+      </w:r>
+      <w:r>
+        <w:rPr>
+          <w:rFonts w:ascii="Arial" w:hAnsi="Arial" w:cs="Arial"/>
+        </w:rPr>
+        <w:t>similar within groups compared to amongst groups</w:t>
       </w:r>
       <w:r>
         <w:rPr>
@@ -7690,7 +7720,25 @@
         <w:rPr>
           <w:rFonts w:ascii="Arial" w:hAnsi="Arial" w:cs="Arial"/>
         </w:rPr>
-        <w:t>The convex hull polygons that encompassed the total trait space area for each</w:t>
+        <w:t>In addition, t</w:t>
+      </w:r>
+      <w:r>
+        <w:rPr>
+          <w:rFonts w:ascii="Arial" w:hAnsi="Arial" w:cs="Arial"/>
+        </w:rPr>
+        <w:t xml:space="preserve">he convex hull polygons that encompassed the total </w:t>
+      </w:r>
+      <w:r>
+        <w:rPr>
+          <w:rFonts w:ascii="Arial" w:hAnsi="Arial" w:cs="Arial"/>
+        </w:rPr>
+        <w:t>area in acoustic</w:t>
+      </w:r>
+      <w:r>
+        <w:rPr>
+          <w:rFonts w:ascii="Arial" w:hAnsi="Arial" w:cs="Arial"/>
+        </w:rPr>
+        <w:t xml:space="preserve"> space for each</w:t>
       </w:r>
       <w:r>
         <w:rPr>
@@ -7834,7 +7882,13 @@
         <w:rPr>
           <w:rFonts w:ascii="Arial" w:hAnsi="Arial" w:cs="Arial"/>
         </w:rPr>
-        <w:t xml:space="preserve">We identified similar patterns of similarity within groups and differentiation amongst groups in both the edit distance and </w:t>
+        <w:t>Overall, w</w:t>
+      </w:r>
+      <w:r>
+        <w:rPr>
+          <w:rFonts w:ascii="Arial" w:hAnsi="Arial" w:cs="Arial"/>
+        </w:rPr>
+        <w:t xml:space="preserve">e identified similar patterns of similarity within groups and differentiation amongst groups in both the edit distance and </w:t>
       </w:r>
       <w:r>
         <w:rPr>
@@ -7867,13 +7921,37 @@
         <w:rPr>
           <w:rFonts w:ascii="Arial" w:hAnsi="Arial" w:cs="Arial"/>
         </w:rPr>
-        <w:t xml:space="preserve">greater similarity of vocalizations within individuals compared to amongst individuals, even for individuals in the same group. </w:t>
-      </w:r>
-      <w:r>
-        <w:rPr>
-          <w:rFonts w:ascii="Arial" w:hAnsi="Arial" w:cs="Arial"/>
-        </w:rPr>
-        <w:t xml:space="preserve">Convex hull polygons outlining the area in acoustic space for </w:t>
+        <w:t xml:space="preserve">greater similarity of </w:t>
+      </w:r>
+      <w:r>
+        <w:rPr>
+          <w:rFonts w:ascii="Arial" w:hAnsi="Arial" w:cs="Arial"/>
+        </w:rPr>
+        <w:t>frequency modulation patterns</w:t>
+      </w:r>
+      <w:r>
+        <w:rPr>
+          <w:rFonts w:ascii="Arial" w:hAnsi="Arial" w:cs="Arial"/>
+        </w:rPr>
+        <w:t xml:space="preserve"> </w:t>
+      </w:r>
+      <w:r>
+        <w:rPr>
+          <w:rFonts w:ascii="Arial" w:hAnsi="Arial" w:cs="Arial"/>
+        </w:rPr>
+        <w:t xml:space="preserve">within individuals compared to amongst individuals, even for individuals in the same group. </w:t>
+      </w:r>
+      <w:r>
+        <w:rPr>
+          <w:rFonts w:ascii="Arial" w:hAnsi="Arial" w:cs="Arial"/>
+        </w:rPr>
+        <w:t>Moreover, c</w:t>
+      </w:r>
+      <w:r>
+        <w:rPr>
+          <w:rFonts w:ascii="Arial" w:hAnsi="Arial" w:cs="Arial"/>
+        </w:rPr>
+        <w:t xml:space="preserve">onvex hull polygons outlining the area in acoustic space for </w:t>
       </w:r>
       <w:proofErr w:type="gramStart"/>
       <w:r>
@@ -7893,7 +7971,19 @@
         <w:rPr>
           <w:rFonts w:ascii="Arial" w:hAnsi="Arial" w:cs="Arial"/>
         </w:rPr>
-        <w:t>were dispersed, rather than overlapping, in both the edit distance and SPCC trait spaces</w:t>
+        <w:t xml:space="preserve">were dispersed, rather than overlapping, </w:t>
+      </w:r>
+      <w:r>
+        <w:rPr>
+          <w:rFonts w:ascii="Arial" w:hAnsi="Arial" w:cs="Arial"/>
+        </w:rPr>
+        <w:t xml:space="preserve">and this pattern held </w:t>
+      </w:r>
+      <w:r>
+        <w:rPr>
+          <w:rFonts w:ascii="Arial" w:hAnsi="Arial" w:cs="Arial"/>
+        </w:rPr>
+        <w:t>in both the edit distance and SPCC trait spaces</w:t>
       </w:r>
       <w:r>
         <w:rPr>
@@ -7911,7 +8001,13 @@
         <w:rPr>
           <w:rFonts w:ascii="Arial" w:hAnsi="Arial" w:cs="Arial"/>
         </w:rPr>
-        <w:t>Overlap amo</w:t>
+        <w:t>Such o</w:t>
+      </w:r>
+      <w:r>
+        <w:rPr>
+          <w:rFonts w:ascii="Arial" w:hAnsi="Arial" w:cs="Arial"/>
+        </w:rPr>
+        <w:t>verlap amo</w:t>
       </w:r>
       <w:r>
         <w:rPr>
@@ -7941,7 +8037,26 @@
         <w:rPr>
           <w:rFonts w:ascii="Arial" w:hAnsi="Arial" w:cs="Arial"/>
         </w:rPr>
-        <w:t xml:space="preserve"> (Figures S1 and S2).</w:t>
+        <w:t xml:space="preserve"> (</w:t>
+      </w:r>
+      <w:r>
+        <w:rPr>
+          <w:rFonts w:ascii="Arial" w:hAnsi="Arial" w:cs="Arial"/>
+        </w:rPr>
+        <w:t xml:space="preserve">see Methods, </w:t>
+      </w:r>
+      <w:r>
+        <w:rPr>
+          <w:rFonts w:ascii="Arial" w:hAnsi="Arial" w:cs="Arial"/>
+        </w:rPr>
+        <w:t xml:space="preserve">Figures S1 and </w:t>
+      </w:r>
+      <w:r>
+        <w:rPr>
+          <w:rFonts w:ascii="Arial" w:hAnsi="Arial" w:cs="Arial"/>
+        </w:rPr>
+        <w:lastRenderedPageBreak/>
+        <w:t>S2).</w:t>
       </w:r>
       <w:r>
         <w:rPr>
@@ -8019,14 +8134,7 @@
         <w:rPr>
           <w:rFonts w:ascii="Arial" w:hAnsi="Arial" w:cs="Arial"/>
         </w:rPr>
-        <w:t>group-</w:t>
-      </w:r>
-      <w:r>
-        <w:rPr>
-          <w:rFonts w:ascii="Arial" w:hAnsi="Arial" w:cs="Arial"/>
-        </w:rPr>
-        <w:lastRenderedPageBreak/>
-        <w:t>specific</w:t>
+        <w:t>group-specific</w:t>
       </w:r>
       <w:r>
         <w:rPr>
@@ -8068,7 +8176,7 @@
         <w:rPr>
           <w:rFonts w:ascii="Arial" w:hAnsi="Arial" w:cs="Arial"/>
         </w:rPr>
-        <w:t>group compared</w:t>
+        <w:t>group</w:t>
       </w:r>
       <w:r>
         <w:rPr>
@@ -8134,7 +8242,19 @@
         <w:rPr>
           <w:rFonts w:ascii="Arial" w:hAnsi="Arial" w:cs="Arial"/>
         </w:rPr>
-        <w:t xml:space="preserve"> Indeed, polygons for individuals’ trait spaces </w:t>
+        <w:t xml:space="preserve"> Indeed, polygons for individuals’ </w:t>
+      </w:r>
+      <w:r>
+        <w:rPr>
+          <w:rFonts w:ascii="Arial" w:hAnsi="Arial" w:cs="Arial"/>
+        </w:rPr>
+        <w:t>acoustic</w:t>
+      </w:r>
+      <w:r>
+        <w:rPr>
+          <w:rFonts w:ascii="Arial" w:hAnsi="Arial" w:cs="Arial"/>
+        </w:rPr>
+        <w:t xml:space="preserve"> spaces </w:t>
       </w:r>
       <w:r>
         <w:rPr>
@@ -8201,18 +8321,6 @@
           <w:rFonts w:ascii="Arial" w:hAnsi="Arial" w:cs="Arial"/>
         </w:rPr>
         <w:t>.</w:t>
-      </w:r>
-      <w:r>
-        <w:rPr>
-          <w:rFonts w:ascii="Arial" w:hAnsi="Arial" w:cs="Arial"/>
-        </w:rPr>
-        <w:t xml:space="preserve"> </w:t>
-      </w:r>
-      <w:r>
-        <w:rPr>
-          <w:rFonts w:ascii="Arial" w:hAnsi="Arial" w:cs="Arial"/>
-        </w:rPr>
-        <w:t xml:space="preserve"> </w:t>
       </w:r>
     </w:p>
     <w:p>
@@ -8259,7 +8367,6 @@
       <w:pPr>
         <w:spacing w:line="480" w:lineRule="auto"/>
         <w:rPr>
-          <w:ins w:id="31" w:author="Smith Vidaurre, Grace" w:date="2025-08-04T15:02:00Z" w16du:dateUtc="2025-08-04T19:02:00Z"/>
           <w:rFonts w:ascii="Arial" w:hAnsi="Arial" w:cs="Arial"/>
         </w:rPr>
       </w:pPr>
@@ -8327,7 +8434,43 @@
         <w:rPr>
           <w:rFonts w:ascii="Arial" w:hAnsi="Arial" w:cs="Arial"/>
         </w:rPr>
-        <w:t xml:space="preserve">These experiments were designed to vary parameters that we anticipated would influence our identity information detection accuracy, namely, the </w:t>
+        <w:t xml:space="preserve">These experiments were designed to </w:t>
+      </w:r>
+      <w:r>
+        <w:rPr>
+          <w:rFonts w:ascii="Arial" w:hAnsi="Arial" w:cs="Arial"/>
+        </w:rPr>
+        <w:t>manipulate</w:t>
+      </w:r>
+      <w:r>
+        <w:rPr>
+          <w:rFonts w:ascii="Arial" w:hAnsi="Arial" w:cs="Arial"/>
+        </w:rPr>
+        <w:t xml:space="preserve"> parameters that we anticipated would influence </w:t>
+      </w:r>
+      <w:r>
+        <w:rPr>
+          <w:rFonts w:ascii="Arial" w:hAnsi="Arial" w:cs="Arial"/>
+        </w:rPr>
+        <w:t>the accuracy of</w:t>
+      </w:r>
+      <w:r>
+        <w:rPr>
+          <w:rFonts w:ascii="Arial" w:hAnsi="Arial" w:cs="Arial"/>
+        </w:rPr>
+        <w:t xml:space="preserve"> identity information detection</w:t>
+      </w:r>
+      <w:r>
+        <w:rPr>
+          <w:rFonts w:ascii="Arial" w:hAnsi="Arial" w:cs="Arial"/>
+        </w:rPr>
+        <w:t>. We focused on manipulating</w:t>
+      </w:r>
+      <w:r>
+        <w:rPr>
+          <w:rFonts w:ascii="Arial" w:hAnsi="Arial" w:cs="Arial"/>
+        </w:rPr>
+        <w:t xml:space="preserve"> the </w:t>
       </w:r>
       <w:r>
         <w:rPr>
@@ -8345,6 +8488,24 @@
         <w:rPr>
           <w:rFonts w:ascii="Arial" w:hAnsi="Arial" w:cs="Arial"/>
         </w:rPr>
+        <w:t xml:space="preserve">in vocalizations, </w:t>
+      </w:r>
+      <w:r>
+        <w:rPr>
+          <w:rFonts w:ascii="Arial" w:hAnsi="Arial" w:cs="Arial"/>
+        </w:rPr>
+        <w:t>or the complexity of identity information encoding</w:t>
+      </w:r>
+      <w:r>
+        <w:rPr>
+          <w:rFonts w:ascii="Arial" w:hAnsi="Arial" w:cs="Arial"/>
+        </w:rPr>
+        <w:t xml:space="preserve">, </w:t>
+      </w:r>
+      <w:r>
+        <w:rPr>
+          <w:rFonts w:ascii="Arial" w:hAnsi="Arial" w:cs="Arial"/>
+        </w:rPr>
         <w:t>and</w:t>
       </w:r>
       <w:r>
@@ -8357,7 +8518,37 @@
         <w:rPr>
           <w:rFonts w:ascii="Arial" w:hAnsi="Arial" w:cs="Arial"/>
         </w:rPr>
-        <w:t>number of classes at each social level.</w:t>
+        <w:t>number of classes at each social level</w:t>
+      </w:r>
+      <w:r>
+        <w:rPr>
+          <w:rFonts w:ascii="Arial" w:hAnsi="Arial" w:cs="Arial"/>
+        </w:rPr>
+        <w:t xml:space="preserve">, </w:t>
+      </w:r>
+      <w:r>
+        <w:rPr>
+          <w:rFonts w:ascii="Arial" w:hAnsi="Arial" w:cs="Arial"/>
+        </w:rPr>
+        <w:t>or the density of the simulated signaling enviro</w:t>
+      </w:r>
+      <w:r>
+        <w:rPr>
+          <w:rFonts w:ascii="Arial" w:hAnsi="Arial" w:cs="Arial"/>
+        </w:rPr>
+        <w:t>n</w:t>
+      </w:r>
+      <w:r>
+        <w:rPr>
+          <w:rFonts w:ascii="Arial" w:hAnsi="Arial" w:cs="Arial"/>
+        </w:rPr>
+        <w:t>ment</w:t>
+      </w:r>
+      <w:r>
+        <w:rPr>
+          <w:rFonts w:ascii="Arial" w:hAnsi="Arial" w:cs="Arial"/>
+        </w:rPr>
+        <w:t>.</w:t>
       </w:r>
       <w:r>
         <w:rPr>
@@ -8365,100 +8556,210 @@
         </w:rPr>
         <w:t xml:space="preserve"> </w:t>
       </w:r>
-    </w:p>
-    <w:p>
-      <w:pPr>
-        <w:spacing w:line="480" w:lineRule="auto"/>
-        <w:rPr>
-          <w:ins w:id="32" w:author="Smith Vidaurre, Grace" w:date="2025-08-04T15:02:00Z" w16du:dateUtc="2025-08-04T19:02:00Z"/>
-          <w:rFonts w:ascii="Arial" w:hAnsi="Arial" w:cs="Arial"/>
-        </w:rPr>
-      </w:pPr>
-    </w:p>
-    <w:p>
-      <w:pPr>
-        <w:spacing w:line="480" w:lineRule="auto"/>
-        <w:ind w:firstLine="720"/>
-        <w:rPr>
-          <w:del w:id="33" w:author="Smith Vidaurre, Grace" w:date="2025-08-04T15:01:00Z" w16du:dateUtc="2025-08-04T19:01:00Z"/>
-          <w:rFonts w:ascii="Arial" w:hAnsi="Arial" w:cs="Arial"/>
-        </w:rPr>
-      </w:pPr>
-      <w:commentRangeStart w:id="34"/>
-      <w:r>
-        <w:rPr>
-          <w:rFonts w:ascii="Arial" w:hAnsi="Arial" w:cs="Arial"/>
-        </w:rPr>
-        <w:t xml:space="preserve">Although our pipeline facilitated controlling the amount of information encoded at both the group and individual levels, we expected that the uniqueness of identity information would be influenced by the generative process that we used to create group and individual information. As we randomly selected character strings to represent information at either social level, we did not expect that group or individual information would be fully unique amongst groups or individuals, respectively, across a given dataset. Instead, identity information could be stochastically similar amongst classes at either social level </w:t>
-      </w:r>
-      <w:proofErr w:type="gramStart"/>
+      <w:r>
+        <w:rPr>
+          <w:rFonts w:ascii="Arial" w:hAnsi="Arial" w:cs="Arial"/>
+        </w:rPr>
+        <w:t xml:space="preserve">We generated </w:t>
+      </w:r>
+      <w:r>
+        <w:rPr>
+          <w:rFonts w:ascii="Arial" w:hAnsi="Arial" w:cs="Arial"/>
+        </w:rPr>
+        <w:t>synthetic</w:t>
+      </w:r>
+      <w:r>
+        <w:rPr>
+          <w:rFonts w:ascii="Arial" w:hAnsi="Arial" w:cs="Arial"/>
+        </w:rPr>
+        <w:t xml:space="preserve"> vocalizations over </w:t>
+      </w:r>
+      <w:r>
+        <w:rPr>
+          <w:rFonts w:ascii="Arial" w:hAnsi="Arial" w:cs="Arial"/>
+        </w:rPr>
+        <w:t>4 treatments per manipulation</w:t>
+      </w:r>
+      <w:r>
+        <w:rPr>
+          <w:rFonts w:ascii="Arial" w:hAnsi="Arial" w:cs="Arial"/>
+        </w:rPr>
+        <w:t xml:space="preserve">, discussed in more detail in the </w:t>
+      </w:r>
+      <w:r>
+        <w:rPr>
+          <w:rFonts w:ascii="Arial" w:hAnsi="Arial" w:cs="Arial"/>
+        </w:rPr>
+        <w:t>M</w:t>
+      </w:r>
+      <w:r>
+        <w:rPr>
+          <w:rFonts w:ascii="Arial" w:hAnsi="Arial" w:cs="Arial"/>
+        </w:rPr>
+        <w:t>ethods section,</w:t>
+      </w:r>
+      <w:r>
+        <w:rPr>
+          <w:rFonts w:ascii="Arial" w:hAnsi="Arial" w:cs="Arial"/>
+        </w:rPr>
+        <w:t xml:space="preserve"> </w:t>
+      </w:r>
       <w:r>
         <w:rPr>
           <w:rFonts w:ascii="Arial" w:hAnsi="Arial" w:cs="Arial"/>
         </w:rPr>
         <w:t>and</w:t>
       </w:r>
-      <w:proofErr w:type="gramEnd"/>
-      <w:r>
-        <w:rPr>
-          <w:rFonts w:ascii="Arial" w:hAnsi="Arial" w:cs="Arial"/>
-        </w:rPr>
-        <w:t xml:space="preserve"> the likelihood of such stochastic similarity would increase with the number of classes the given social level. For instance, as the number of groups </w:t>
+      <w:r>
+        <w:rPr>
+          <w:rFonts w:ascii="Arial" w:hAnsi="Arial" w:cs="Arial"/>
+        </w:rPr>
+        <w:t xml:space="preserve"> ran</w:t>
+      </w:r>
+      <w:r>
+        <w:rPr>
+          <w:rFonts w:ascii="Arial" w:hAnsi="Arial" w:cs="Arial"/>
+        </w:rPr>
+        <w:t xml:space="preserve"> </w:t>
+      </w:r>
+      <w:r>
+        <w:rPr>
+          <w:rFonts w:ascii="Arial" w:hAnsi="Arial" w:cs="Arial"/>
+        </w:rPr>
+        <w:t>10</w:t>
+      </w:r>
+      <w:r>
+        <w:rPr>
+          <w:rFonts w:ascii="Arial" w:hAnsi="Arial" w:cs="Arial"/>
+        </w:rPr>
+        <w:t xml:space="preserve"> iterations per parameter combination. In each iteration, we</w:t>
+      </w:r>
+      <w:r>
+        <w:rPr>
+          <w:rFonts w:ascii="Arial" w:hAnsi="Arial" w:cs="Arial"/>
+        </w:rPr>
+        <w:t xml:space="preserve"> measured accuracy of information detection at either social level using unsupervised clustering. </w:t>
+      </w:r>
+      <w:r>
+        <w:rPr>
+          <w:rFonts w:ascii="Arial" w:hAnsi="Arial" w:cs="Arial"/>
+        </w:rPr>
+        <w:t>To summarize</w:t>
+      </w:r>
+      <w:r>
+        <w:rPr>
+          <w:rFonts w:ascii="Arial" w:hAnsi="Arial" w:cs="Arial"/>
+        </w:rPr>
+        <w:t xml:space="preserve">, </w:t>
+      </w:r>
+      <w:r>
+        <w:rPr>
+          <w:rFonts w:ascii="Arial" w:hAnsi="Arial" w:cs="Arial"/>
+        </w:rPr>
+        <w:t>we</w:t>
+      </w:r>
+      <w:r>
+        <w:rPr>
+          <w:rFonts w:ascii="Arial" w:hAnsi="Arial" w:cs="Arial"/>
+        </w:rPr>
+        <w:t xml:space="preserve"> </w:t>
+      </w:r>
+      <w:r>
+        <w:rPr>
+          <w:rFonts w:ascii="Arial" w:hAnsi="Arial" w:cs="Arial"/>
+        </w:rPr>
+        <w:t xml:space="preserve">used </w:t>
+      </w:r>
+      <w:r>
+        <w:rPr>
+          <w:rFonts w:ascii="Arial" w:hAnsi="Arial" w:cs="Arial"/>
+        </w:rPr>
+        <w:t xml:space="preserve">the </w:t>
+      </w:r>
+      <w:r>
+        <w:rPr>
+          <w:rFonts w:ascii="Arial" w:hAnsi="Arial" w:cs="Arial"/>
+        </w:rPr>
+        <w:t xml:space="preserve">edit distance and </w:t>
+      </w:r>
+      <w:r>
+        <w:rPr>
+          <w:rFonts w:ascii="Arial" w:hAnsi="Arial" w:cs="Arial"/>
+        </w:rPr>
+        <w:t>spectrographic cross-correlation</w:t>
+      </w:r>
+      <w:r>
+        <w:rPr>
+          <w:rFonts w:ascii="Arial" w:hAnsi="Arial" w:cs="Arial"/>
+        </w:rPr>
+        <w:t xml:space="preserve"> </w:t>
+      </w:r>
+      <w:r>
+        <w:rPr>
+          <w:rFonts w:ascii="Arial" w:hAnsi="Arial" w:cs="Arial"/>
+        </w:rPr>
+        <w:t xml:space="preserve">to measure distances amongst </w:t>
+      </w:r>
+      <w:r>
+        <w:rPr>
+          <w:rFonts w:ascii="Arial" w:hAnsi="Arial" w:cs="Arial"/>
+        </w:rPr>
+        <w:t>character strings or vocalizations,</w:t>
+      </w:r>
+      <w:r>
+        <w:rPr>
+          <w:rFonts w:ascii="Arial" w:hAnsi="Arial" w:cs="Arial"/>
+        </w:rPr>
+        <w:t xml:space="preserve"> </w:t>
+      </w:r>
+      <w:r>
+        <w:rPr>
+          <w:rFonts w:ascii="Arial" w:hAnsi="Arial" w:cs="Arial"/>
+        </w:rPr>
+        <w:t>respectively</w:t>
+      </w:r>
+      <w:r>
+        <w:rPr>
+          <w:rFonts w:ascii="Arial" w:hAnsi="Arial" w:cs="Arial"/>
+        </w:rPr>
+        <w:t xml:space="preserve">. We then performed k-means clustering on features derived from distance </w:t>
+      </w:r>
+      <w:r>
+        <w:rPr>
+          <w:rFonts w:ascii="Arial" w:hAnsi="Arial" w:cs="Arial"/>
+        </w:rPr>
+        <w:t>measurements and</w:t>
+      </w:r>
+      <w:r>
+        <w:rPr>
+          <w:rFonts w:ascii="Arial" w:hAnsi="Arial" w:cs="Arial"/>
+        </w:rPr>
+        <w:t xml:space="preserve"> used a bipartite mapping approach to compute the </w:t>
       </w:r>
       <w:r>
         <w:rPr>
           <w:rFonts w:ascii="Arial" w:hAnsi="Arial" w:cs="Arial"/>
         </w:rPr>
         <w:lastRenderedPageBreak/>
-        <w:t xml:space="preserve">increased in a dataset, so should the likelihood that group information was shared or very similar amongst one or more groups, leading to lower distinctiveness amongst groups even when we encoded large amounts of group information. </w:t>
-      </w:r>
-      <w:commentRangeEnd w:id="34"/>
-      <w:r>
-        <w:rPr>
-          <w:rStyle w:val="CommentReference"/>
-        </w:rPr>
-        <w:commentReference w:id="34"/>
-      </w:r>
-    </w:p>
-    <w:p>
-      <w:pPr>
-        <w:spacing w:line="480" w:lineRule="auto"/>
-        <w:rPr>
-          <w:ins w:id="35" w:author="Smith Vidaurre, Grace" w:date="2025-08-04T15:02:00Z" w16du:dateUtc="2025-08-04T19:02:00Z"/>
-          <w:rFonts w:ascii="Arial" w:hAnsi="Arial" w:cs="Arial"/>
-        </w:rPr>
-      </w:pPr>
-    </w:p>
-    <w:p>
-      <w:pPr>
-        <w:spacing w:line="480" w:lineRule="auto"/>
-        <w:rPr>
-          <w:rFonts w:ascii="Arial" w:hAnsi="Arial" w:cs="Arial"/>
-        </w:rPr>
-      </w:pPr>
-      <w:r>
-        <w:rPr>
-          <w:rFonts w:ascii="Arial" w:hAnsi="Arial" w:cs="Arial"/>
-        </w:rPr>
-        <w:t xml:space="preserve">We generated </w:t>
-      </w:r>
-      <w:r>
-        <w:rPr>
-          <w:rFonts w:ascii="Arial" w:hAnsi="Arial" w:cs="Arial"/>
-        </w:rPr>
-        <w:t>synthetic</w:t>
-      </w:r>
-      <w:r>
-        <w:rPr>
-          <w:rFonts w:ascii="Arial" w:hAnsi="Arial" w:cs="Arial"/>
-        </w:rPr>
-        <w:t xml:space="preserve"> vocalizations over each combination of parameters</w:t>
-      </w:r>
-      <w:r>
-        <w:rPr>
-          <w:rFonts w:ascii="Arial" w:hAnsi="Arial" w:cs="Arial"/>
-        </w:rPr>
-        <w:t>, discussed in more detail in the methods section,</w:t>
+        <w:t xml:space="preserve">accuracies of how well </w:t>
+      </w:r>
+      <w:r>
+        <w:rPr>
+          <w:rFonts w:ascii="Arial" w:hAnsi="Arial" w:cs="Arial"/>
+        </w:rPr>
+        <w:t>predicted</w:t>
+      </w:r>
+      <w:r>
+        <w:rPr>
+          <w:rFonts w:ascii="Arial" w:hAnsi="Arial" w:cs="Arial"/>
+        </w:rPr>
+        <w:t xml:space="preserve"> labels</w:t>
+      </w:r>
+      <w:r>
+        <w:rPr>
+          <w:rFonts w:ascii="Arial" w:hAnsi="Arial" w:cs="Arial"/>
+        </w:rPr>
+        <w:t xml:space="preserve"> from clustering</w:t>
       </w:r>
       <w:r>
         <w:rPr>
@@ -8470,7 +8771,7 @@
         <w:rPr>
           <w:rFonts w:ascii="Arial" w:hAnsi="Arial" w:cs="Arial"/>
         </w:rPr>
-        <w:t>including</w:t>
+        <w:t>matched</w:t>
       </w:r>
       <w:r>
         <w:rPr>
@@ -8482,37 +8783,13 @@
         <w:rPr>
           <w:rFonts w:ascii="Arial" w:hAnsi="Arial" w:cs="Arial"/>
         </w:rPr>
-        <w:t>10</w:t>
-      </w:r>
-      <w:r>
-        <w:rPr>
-          <w:rFonts w:ascii="Arial" w:hAnsi="Arial" w:cs="Arial"/>
-        </w:rPr>
-        <w:t xml:space="preserve"> iterations per parameter combination. In each iteration, we</w:t>
-      </w:r>
-      <w:r>
-        <w:rPr>
-          <w:rFonts w:ascii="Arial" w:hAnsi="Arial" w:cs="Arial"/>
-        </w:rPr>
-        <w:t xml:space="preserve"> measured accuracy of information detection at either social level using unsupervised clustering. </w:t>
-      </w:r>
-      <w:r>
-        <w:rPr>
-          <w:rFonts w:ascii="Arial" w:hAnsi="Arial" w:cs="Arial"/>
-        </w:rPr>
-        <w:t>To summarize</w:t>
-      </w:r>
-      <w:r>
-        <w:rPr>
-          <w:rFonts w:ascii="Arial" w:hAnsi="Arial" w:cs="Arial"/>
-        </w:rPr>
-        <w:t xml:space="preserve">, </w:t>
-      </w:r>
-      <w:r>
-        <w:rPr>
-          <w:rFonts w:ascii="Arial" w:hAnsi="Arial" w:cs="Arial"/>
-        </w:rPr>
-        <w:t>we</w:t>
+        <w:t xml:space="preserve">the </w:t>
+      </w:r>
+      <w:r>
+        <w:rPr>
+          <w:rFonts w:ascii="Arial" w:hAnsi="Arial" w:cs="Arial"/>
+        </w:rPr>
+        <w:t>original labels of classes at each social level.</w:t>
       </w:r>
       <w:r>
         <w:rPr>
@@ -8524,27 +8801,67 @@
         <w:rPr>
           <w:rFonts w:ascii="Arial" w:hAnsi="Arial" w:cs="Arial"/>
         </w:rPr>
-        <w:t xml:space="preserve">used </w:t>
-      </w:r>
-      <w:proofErr w:type="gramStart"/>
-      <w:r>
-        <w:rPr>
-          <w:rFonts w:ascii="Arial" w:hAnsi="Arial" w:cs="Arial"/>
-        </w:rPr>
-        <w:t>edit</w:t>
-      </w:r>
-      <w:proofErr w:type="gramEnd"/>
-      <w:r>
-        <w:rPr>
-          <w:rFonts w:ascii="Arial" w:hAnsi="Arial" w:cs="Arial"/>
-        </w:rPr>
-        <w:t xml:space="preserve"> distance and </w:t>
-      </w:r>
-      <w:r>
-        <w:rPr>
-          <w:rFonts w:ascii="Arial" w:hAnsi="Arial" w:cs="Arial"/>
-        </w:rPr>
-        <w:t>spectrographic cross-correlation</w:t>
+        <w:t>We used this analytical approach to calculate the accuracy of clustering synthetic vocalizations back to their original class labels (either group or individual identit</w:t>
+      </w:r>
+      <w:r>
+        <w:rPr>
+          <w:rFonts w:ascii="Arial" w:hAnsi="Arial" w:cs="Arial"/>
+        </w:rPr>
+        <w:t>y</w:t>
+      </w:r>
+      <w:r>
+        <w:rPr>
+          <w:rFonts w:ascii="Arial" w:hAnsi="Arial" w:cs="Arial"/>
+        </w:rPr>
+        <w:t xml:space="preserve">) using edit distance or SPCC distance measurements. </w:t>
+      </w:r>
+      <w:r>
+        <w:rPr>
+          <w:rFonts w:ascii="Arial" w:hAnsi="Arial" w:cs="Arial"/>
+        </w:rPr>
+        <w:t xml:space="preserve">Overall, the accuracies of clustering back to original classes at the group and individual levels </w:t>
+      </w:r>
+      <w:r>
+        <w:rPr>
+          <w:rFonts w:ascii="Arial" w:hAnsi="Arial" w:cs="Arial"/>
+        </w:rPr>
+        <w:t xml:space="preserve">increased in concert </w:t>
+      </w:r>
+      <w:r>
+        <w:rPr>
+          <w:rFonts w:ascii="Arial" w:hAnsi="Arial" w:cs="Arial"/>
+        </w:rPr>
+        <w:t>with the amount of</w:t>
+      </w:r>
+      <w:r>
+        <w:rPr>
+          <w:rFonts w:ascii="Arial" w:hAnsi="Arial" w:cs="Arial"/>
+        </w:rPr>
+        <w:t xml:space="preserve"> information encoded at the given social level (Figure 4). For example, when vocalizations contained all individual identity information and no group identity information, </w:t>
+      </w:r>
+      <w:r>
+        <w:rPr>
+          <w:rFonts w:ascii="Arial" w:hAnsi="Arial" w:cs="Arial"/>
+        </w:rPr>
+        <w:t xml:space="preserve">accuracy values at </w:t>
+      </w:r>
+      <w:r>
+        <w:rPr>
+          <w:rFonts w:ascii="Arial" w:hAnsi="Arial" w:cs="Arial"/>
+        </w:rPr>
+        <w:t xml:space="preserve">the individual level </w:t>
+      </w:r>
+      <w:r>
+        <w:rPr>
+          <w:rFonts w:ascii="Arial" w:hAnsi="Arial" w:cs="Arial"/>
+        </w:rPr>
+        <w:t>were higher compared to accuracies at</w:t>
+      </w:r>
+      <w:r>
+        <w:rPr>
+          <w:rFonts w:ascii="Arial" w:hAnsi="Arial" w:cs="Arial"/>
+        </w:rPr>
+        <w:t xml:space="preserve"> the group level (Figure 4).</w:t>
       </w:r>
       <w:r>
         <w:rPr>
@@ -8556,310 +8873,6 @@
         <w:rPr>
           <w:rFonts w:ascii="Arial" w:hAnsi="Arial" w:cs="Arial"/>
         </w:rPr>
-        <w:t xml:space="preserve">to measure distances amongst </w:t>
-      </w:r>
-      <w:r>
-        <w:rPr>
-          <w:rFonts w:ascii="Arial" w:hAnsi="Arial" w:cs="Arial"/>
-        </w:rPr>
-        <w:t>character strings or vocalizations,</w:t>
-      </w:r>
-      <w:r>
-        <w:rPr>
-          <w:rFonts w:ascii="Arial" w:hAnsi="Arial" w:cs="Arial"/>
-        </w:rPr>
-        <w:t xml:space="preserve"> </w:t>
-      </w:r>
-      <w:r>
-        <w:rPr>
-          <w:rFonts w:ascii="Arial" w:hAnsi="Arial" w:cs="Arial"/>
-        </w:rPr>
-        <w:t>respectively</w:t>
-      </w:r>
-      <w:r>
-        <w:rPr>
-          <w:rFonts w:ascii="Arial" w:hAnsi="Arial" w:cs="Arial"/>
-        </w:rPr>
-        <w:t xml:space="preserve">. We then performed k-means clustering on features derived from distance </w:t>
-      </w:r>
-      <w:r>
-        <w:rPr>
-          <w:rFonts w:ascii="Arial" w:hAnsi="Arial" w:cs="Arial"/>
-        </w:rPr>
-        <w:t>measurements and</w:t>
-      </w:r>
-      <w:r>
-        <w:rPr>
-          <w:rFonts w:ascii="Arial" w:hAnsi="Arial" w:cs="Arial"/>
-        </w:rPr>
-        <w:t xml:space="preserve"> used a bipartite mapping approach to compute the accuracies of how well cluster labels predicted original labels of classes at each social level.</w:t>
-      </w:r>
-    </w:p>
-    <w:p>
-      <w:pPr>
-        <w:spacing w:line="480" w:lineRule="auto"/>
-        <w:rPr>
-          <w:rFonts w:ascii="Arial" w:hAnsi="Arial" w:cs="Arial"/>
-        </w:rPr>
-      </w:pPr>
-      <w:r>
-        <w:rPr>
-          <w:rFonts w:ascii="Arial" w:hAnsi="Arial" w:cs="Arial"/>
-        </w:rPr>
-        <w:tab/>
-        <w:t>We used this analytical approach to calculate the accuracy of clustering synthetic vocalizations back to their original class labels (either group or individual identit</w:t>
-      </w:r>
-      <w:r>
-        <w:rPr>
-          <w:rFonts w:ascii="Arial" w:hAnsi="Arial" w:cs="Arial"/>
-        </w:rPr>
-        <w:t>y</w:t>
-      </w:r>
-      <w:r>
-        <w:rPr>
-          <w:rFonts w:ascii="Arial" w:hAnsi="Arial" w:cs="Arial"/>
-        </w:rPr>
-        <w:t xml:space="preserve">) using edit distance or SPCC distance measurements. </w:t>
-      </w:r>
-      <w:commentRangeStart w:id="36"/>
-      <w:r>
-        <w:rPr>
-          <w:rFonts w:ascii="Arial" w:hAnsi="Arial" w:cs="Arial"/>
-        </w:rPr>
-        <w:t xml:space="preserve">We </w:t>
-      </w:r>
-      <w:r>
-        <w:rPr>
-          <w:rFonts w:ascii="Arial" w:hAnsi="Arial" w:cs="Arial"/>
-        </w:rPr>
-        <w:t>computed accuracies</w:t>
-      </w:r>
-      <w:r>
-        <w:rPr>
-          <w:rFonts w:ascii="Arial" w:hAnsi="Arial" w:cs="Arial"/>
-        </w:rPr>
-        <w:t xml:space="preserve"> for vocalizations generated across </w:t>
-      </w:r>
-      <w:r>
-        <w:rPr>
-          <w:rFonts w:ascii="Arial" w:hAnsi="Arial" w:cs="Arial"/>
-        </w:rPr>
-        <w:t xml:space="preserve">our </w:t>
-      </w:r>
-      <w:r>
-        <w:rPr>
-          <w:rFonts w:ascii="Arial" w:hAnsi="Arial" w:cs="Arial"/>
-        </w:rPr>
-        <w:t>synthetic experiments</w:t>
-      </w:r>
-      <w:r>
-        <w:rPr>
-          <w:rFonts w:ascii="Arial" w:hAnsi="Arial" w:cs="Arial"/>
-        </w:rPr>
-        <w:t xml:space="preserve">, </w:t>
-      </w:r>
-      <w:r>
-        <w:rPr>
-          <w:rFonts w:ascii="Arial" w:hAnsi="Arial" w:cs="Arial"/>
-        </w:rPr>
-        <w:t xml:space="preserve">in which </w:t>
-      </w:r>
-      <w:r>
-        <w:rPr>
-          <w:rFonts w:ascii="Arial" w:hAnsi="Arial" w:cs="Arial"/>
-        </w:rPr>
-        <w:t>we</w:t>
-      </w:r>
-      <w:r>
-        <w:rPr>
-          <w:rFonts w:ascii="Arial" w:hAnsi="Arial" w:cs="Arial"/>
-        </w:rPr>
-        <w:t xml:space="preserve"> </w:t>
-      </w:r>
-      <w:r>
-        <w:rPr>
-          <w:rFonts w:ascii="Arial" w:hAnsi="Arial" w:cs="Arial"/>
-        </w:rPr>
-        <w:t>varied the relative proportion of group and individual</w:t>
-      </w:r>
-      <w:r>
-        <w:rPr>
-          <w:rFonts w:ascii="Arial" w:hAnsi="Arial" w:cs="Arial"/>
-        </w:rPr>
-        <w:t xml:space="preserve"> information</w:t>
-      </w:r>
-      <w:r>
-        <w:rPr>
-          <w:rFonts w:ascii="Arial" w:hAnsi="Arial" w:cs="Arial"/>
-        </w:rPr>
-        <w:t xml:space="preserve"> in vocalizations</w:t>
-      </w:r>
-      <w:r>
-        <w:rPr>
-          <w:rFonts w:ascii="Arial" w:hAnsi="Arial" w:cs="Arial"/>
-        </w:rPr>
-        <w:t xml:space="preserve">, </w:t>
-      </w:r>
-      <w:r>
-        <w:rPr>
-          <w:rFonts w:ascii="Arial" w:hAnsi="Arial" w:cs="Arial"/>
-        </w:rPr>
-        <w:t xml:space="preserve">as well as the size of signal datasets, as a proxy of </w:t>
-      </w:r>
-      <w:proofErr w:type="gramStart"/>
-      <w:r>
-        <w:rPr>
-          <w:rFonts w:ascii="Arial" w:hAnsi="Arial" w:cs="Arial"/>
-        </w:rPr>
-        <w:t>more or less crowded</w:t>
-      </w:r>
-      <w:proofErr w:type="gramEnd"/>
-      <w:r>
-        <w:rPr>
-          <w:rFonts w:ascii="Arial" w:hAnsi="Arial" w:cs="Arial"/>
-        </w:rPr>
-        <w:t xml:space="preserve"> signaling environments</w:t>
-      </w:r>
-      <w:commentRangeEnd w:id="36"/>
-      <w:r>
-        <w:rPr>
-          <w:rStyle w:val="CommentReference"/>
-        </w:rPr>
-        <w:commentReference w:id="36"/>
-      </w:r>
-      <w:r>
-        <w:rPr>
-          <w:rFonts w:ascii="Arial" w:hAnsi="Arial" w:cs="Arial"/>
-        </w:rPr>
-        <w:t>.</w:t>
-      </w:r>
-      <w:r>
-        <w:rPr>
-          <w:rFonts w:ascii="Arial" w:hAnsi="Arial" w:cs="Arial"/>
-        </w:rPr>
-        <w:t xml:space="preserve"> </w:t>
-      </w:r>
-      <w:commentRangeStart w:id="37"/>
-      <w:r>
-        <w:rPr>
-          <w:rFonts w:ascii="Arial" w:hAnsi="Arial" w:cs="Arial"/>
-        </w:rPr>
-        <w:t xml:space="preserve">We used </w:t>
-      </w:r>
-      <w:r>
-        <w:rPr>
-          <w:rFonts w:ascii="Arial" w:hAnsi="Arial" w:cs="Arial"/>
-        </w:rPr>
-        <w:t>four experimental treatments t</w:t>
-      </w:r>
-      <w:r>
-        <w:rPr>
-          <w:rFonts w:ascii="Arial" w:hAnsi="Arial" w:cs="Arial"/>
-        </w:rPr>
-        <w:t xml:space="preserve">o encode varying amounts of group to individual information, ranging from all group and no individual information, to all individual and no group information. To simulate variation in the crowdedness of the signaling environment, we also varied the number of classes at each social level over four treatments as well. </w:t>
-      </w:r>
-      <w:r>
-        <w:rPr>
-          <w:rFonts w:ascii="Arial" w:hAnsi="Arial" w:cs="Arial"/>
-        </w:rPr>
-        <w:t>In each</w:t>
-      </w:r>
-      <w:r>
-        <w:rPr>
-          <w:rFonts w:ascii="Arial" w:hAnsi="Arial" w:cs="Arial"/>
-        </w:rPr>
-        <w:t xml:space="preserve"> signaling environment </w:t>
-      </w:r>
-      <w:r>
-        <w:rPr>
-          <w:rFonts w:ascii="Arial" w:hAnsi="Arial" w:cs="Arial"/>
-        </w:rPr>
-        <w:t>treatment</w:t>
-      </w:r>
-      <w:r>
-        <w:rPr>
-          <w:rFonts w:ascii="Arial" w:hAnsi="Arial" w:cs="Arial"/>
-        </w:rPr>
-        <w:t xml:space="preserve">, </w:t>
-      </w:r>
-      <w:r>
-        <w:rPr>
-          <w:rFonts w:ascii="Arial" w:hAnsi="Arial" w:cs="Arial"/>
-        </w:rPr>
-        <w:t xml:space="preserve">we used the same </w:t>
-      </w:r>
-      <w:r>
-        <w:rPr>
-          <w:rFonts w:ascii="Arial" w:hAnsi="Arial" w:cs="Arial"/>
-        </w:rPr>
-        <w:lastRenderedPageBreak/>
-        <w:t>parameter for number of classes at each social level, as well as the number of calls produced at the individual level.</w:t>
-      </w:r>
-      <w:r>
-        <w:rPr>
-          <w:rFonts w:ascii="Arial" w:hAnsi="Arial" w:cs="Arial"/>
-        </w:rPr>
-        <w:t xml:space="preserve"> </w:t>
-      </w:r>
-      <w:commentRangeEnd w:id="37"/>
-      <w:r>
-        <w:rPr>
-          <w:rStyle w:val="CommentReference"/>
-        </w:rPr>
-        <w:commentReference w:id="37"/>
-      </w:r>
-      <w:r>
-        <w:rPr>
-          <w:rFonts w:ascii="Arial" w:hAnsi="Arial" w:cs="Arial"/>
-        </w:rPr>
-        <w:t xml:space="preserve">Overall, the accuracies of clustering back to original classes at the group and individual levels </w:t>
-      </w:r>
-      <w:r>
-        <w:rPr>
-          <w:rFonts w:ascii="Arial" w:hAnsi="Arial" w:cs="Arial"/>
-        </w:rPr>
-        <w:t xml:space="preserve">increased in concert as </w:t>
-      </w:r>
-      <w:r>
-        <w:rPr>
-          <w:rFonts w:ascii="Arial" w:hAnsi="Arial" w:cs="Arial"/>
-        </w:rPr>
-        <w:t xml:space="preserve">more information was encoded at the given social level (Figure 4). For example, when vocalizations contained all individual identity information and no group identity information, </w:t>
-      </w:r>
-      <w:r>
-        <w:rPr>
-          <w:rFonts w:ascii="Arial" w:hAnsi="Arial" w:cs="Arial"/>
-        </w:rPr>
-        <w:t xml:space="preserve">accuracy values at </w:t>
-      </w:r>
-      <w:r>
-        <w:rPr>
-          <w:rFonts w:ascii="Arial" w:hAnsi="Arial" w:cs="Arial"/>
-        </w:rPr>
-        <w:t xml:space="preserve">the individual level </w:t>
-      </w:r>
-      <w:r>
-        <w:rPr>
-          <w:rFonts w:ascii="Arial" w:hAnsi="Arial" w:cs="Arial"/>
-        </w:rPr>
-        <w:t>were higher compared to accuracies computed for clustering back to original classes at</w:t>
-      </w:r>
-      <w:r>
-        <w:rPr>
-          <w:rFonts w:ascii="Arial" w:hAnsi="Arial" w:cs="Arial"/>
-        </w:rPr>
-        <w:t xml:space="preserve"> the group level (Figure 4).</w:t>
-      </w:r>
-      <w:r>
-        <w:rPr>
-          <w:rFonts w:ascii="Arial" w:hAnsi="Arial" w:cs="Arial"/>
-        </w:rPr>
-        <w:t xml:space="preserve"> </w:t>
-      </w:r>
-      <w:r>
-        <w:rPr>
-          <w:rFonts w:ascii="Arial" w:hAnsi="Arial" w:cs="Arial"/>
-        </w:rPr>
         <w:t xml:space="preserve">Finally, </w:t>
       </w:r>
       <w:r>
@@ -8902,35 +8915,19 @@
         <w:rPr>
           <w:rFonts w:ascii="Arial" w:hAnsi="Arial" w:cs="Arial"/>
         </w:rPr>
-        <w:t xml:space="preserve">indicating that information detect it </w:t>
-      </w:r>
-      <w:proofErr w:type="gramStart"/>
-      <w:r>
-        <w:rPr>
-          <w:rFonts w:ascii="Arial" w:hAnsi="Arial" w:cs="Arial"/>
-        </w:rPr>
-        <w:t>not change</w:t>
-      </w:r>
-      <w:proofErr w:type="gramEnd"/>
-      <w:r>
-        <w:rPr>
-          <w:rFonts w:ascii="Arial" w:hAnsi="Arial" w:cs="Arial"/>
-        </w:rPr>
-        <w:t xml:space="preserve"> </w:t>
-      </w:r>
-      <w:proofErr w:type="gramStart"/>
-      <w:r>
-        <w:rPr>
-          <w:rFonts w:ascii="Arial" w:hAnsi="Arial" w:cs="Arial"/>
-        </w:rPr>
-        <w:t>as a result of</w:t>
-      </w:r>
-      <w:proofErr w:type="gramEnd"/>
-      <w:r>
-        <w:rPr>
-          <w:rFonts w:ascii="Arial" w:hAnsi="Arial" w:cs="Arial"/>
-        </w:rPr>
-        <w:t xml:space="preserve"> the sonification process of our signal generation pipeline. </w:t>
+        <w:t xml:space="preserve">indicating that </w:t>
+      </w:r>
+      <w:r>
+        <w:rPr>
+          <w:rFonts w:ascii="Arial" w:hAnsi="Arial" w:cs="Arial"/>
+        </w:rPr>
+        <w:t xml:space="preserve">our analytical pipelines were capable of accurately detecting identity information even after </w:t>
+      </w:r>
+      <w:r>
+        <w:rPr>
+          <w:rFonts w:ascii="Arial" w:hAnsi="Arial" w:cs="Arial"/>
+        </w:rPr>
+        <w:t xml:space="preserve">the sonification process. </w:t>
       </w:r>
     </w:p>
     <w:p>
@@ -9003,7 +9000,7 @@
           <w:rFonts w:ascii="Arial" w:hAnsi="Arial" w:cs="Arial"/>
         </w:rPr>
       </w:pPr>
-      <w:commentRangeStart w:id="38"/>
+      <w:commentRangeStart w:id="31"/>
       <w:r>
         <w:rPr>
           <w:rFonts w:ascii="Arial" w:hAnsi="Arial" w:cs="Arial"/>
@@ -9014,7 +9011,7 @@
         </w:rPr>
         <w:t xml:space="preserve">Figure </w:t>
       </w:r>
-      <w:commentRangeEnd w:id="38"/>
+      <w:commentRangeEnd w:id="31"/>
       <w:r>
         <w:rPr>
           <w:rStyle w:val="CommentReference"/>
@@ -9022,7 +9019,7 @@
           <w:sz w:val="22"/>
           <w:szCs w:val="22"/>
         </w:rPr>
-        <w:commentReference w:id="38"/>
+        <w:commentReference w:id="31"/>
       </w:r>
       <w:r>
         <w:rPr>
@@ -9350,14 +9347,6 @@
         </w:rPr>
         <w:t>of the</w:t>
       </w:r>
-      <w:del w:id="39" w:author="Smith Vidaurre, Grace" w:date="2025-06-04T10:41:00Z" w16du:dateUtc="2025-06-04T14:41:00Z">
-        <w:r>
-          <w:rPr>
-            <w:rFonts w:ascii="Arial" w:hAnsi="Arial" w:cs="Arial"/>
-          </w:rPr>
-          <w:delText xml:space="preserve"> </w:delText>
-        </w:r>
-      </w:del>
       <w:r>
         <w:rPr>
           <w:rFonts w:ascii="Arial" w:hAnsi="Arial" w:cs="Arial"/>
@@ -9512,35 +9501,35 @@
           <w:rFonts w:ascii="Arial" w:hAnsi="Arial" w:cs="Arial"/>
         </w:rPr>
       </w:pPr>
-      <w:commentRangeStart w:id="40"/>
-      <w:commentRangeStart w:id="41"/>
-      <w:commentRangeStart w:id="42"/>
+      <w:commentRangeStart w:id="32"/>
+      <w:commentRangeStart w:id="33"/>
+      <w:commentRangeStart w:id="34"/>
       <w:r>
         <w:rPr>
           <w:rFonts w:ascii="Arial" w:hAnsi="Arial" w:cs="Arial"/>
         </w:rPr>
         <w:t xml:space="preserve">Table </w:t>
       </w:r>
-      <w:commentRangeEnd w:id="40"/>
+      <w:commentRangeEnd w:id="32"/>
       <w:r>
         <w:rPr>
           <w:rStyle w:val="CommentReference"/>
         </w:rPr>
-        <w:commentReference w:id="40"/>
-      </w:r>
-      <w:commentRangeEnd w:id="41"/>
+        <w:commentReference w:id="32"/>
+      </w:r>
+      <w:commentRangeEnd w:id="33"/>
       <w:r>
         <w:rPr>
           <w:rStyle w:val="CommentReference"/>
         </w:rPr>
-        <w:commentReference w:id="41"/>
-      </w:r>
-      <w:commentRangeEnd w:id="42"/>
+        <w:commentReference w:id="33"/>
+      </w:r>
+      <w:commentRangeEnd w:id="34"/>
       <w:r>
         <w:rPr>
           <w:rStyle w:val="CommentReference"/>
         </w:rPr>
-        <w:commentReference w:id="42"/>
+        <w:commentReference w:id="34"/>
       </w:r>
       <w:r>
         <w:rPr>
@@ -18007,19 +17996,19 @@
         </w:rPr>
         <w:t xml:space="preserve">the effect sizes included zero, indicating a lack of statistical significance of information </w:t>
       </w:r>
-      <w:commentRangeStart w:id="43"/>
+      <w:commentRangeStart w:id="35"/>
       <w:r>
         <w:rPr>
           <w:rFonts w:ascii="Arial" w:hAnsi="Arial" w:cs="Arial"/>
         </w:rPr>
         <w:t>detection</w:t>
       </w:r>
-      <w:commentRangeEnd w:id="43"/>
+      <w:commentRangeEnd w:id="35"/>
       <w:r>
         <w:rPr>
           <w:rStyle w:val="CommentReference"/>
         </w:rPr>
-        <w:commentReference w:id="43"/>
+        <w:commentReference w:id="35"/>
       </w:r>
       <w:r>
         <w:rPr>
@@ -18044,8 +18033,8 @@
           <w:rFonts w:ascii="Arial" w:hAnsi="Arial" w:cs="Arial"/>
         </w:rPr>
       </w:pPr>
-      <w:commentRangeStart w:id="44"/>
-      <w:commentRangeStart w:id="45"/>
+      <w:commentRangeStart w:id="36"/>
+      <w:commentRangeStart w:id="37"/>
       <w:r>
         <w:rPr>
           <w:rFonts w:ascii="Arial" w:hAnsi="Arial" w:cs="Arial"/>
@@ -18054,7 +18043,7 @@
         </w:rPr>
         <w:t>Discussion</w:t>
       </w:r>
-      <w:commentRangeEnd w:id="44"/>
+      <w:commentRangeEnd w:id="36"/>
       <w:r>
         <w:rPr>
           <w:rStyle w:val="CommentReference"/>
@@ -18062,14 +18051,14 @@
           <w:sz w:val="24"/>
           <w:szCs w:val="24"/>
         </w:rPr>
-        <w:commentReference w:id="44"/>
-      </w:r>
-      <w:commentRangeEnd w:id="45"/>
+        <w:commentReference w:id="36"/>
+      </w:r>
+      <w:commentRangeEnd w:id="37"/>
       <w:r>
         <w:rPr>
           <w:rStyle w:val="CommentReference"/>
         </w:rPr>
-        <w:commentReference w:id="45"/>
+        <w:commentReference w:id="37"/>
       </w:r>
     </w:p>
     <w:p>
@@ -20254,7 +20243,7 @@
         </w:rPr>
         <w:t xml:space="preserve"> </w:t>
       </w:r>
-      <w:commentRangeStart w:id="46"/>
+      <w:commentRangeStart w:id="38"/>
       <w:r>
         <w:rPr>
           <w:rFonts w:ascii="Arial" w:hAnsi="Arial" w:cs="Arial"/>
@@ -20268,12 +20257,12 @@
         <w:lastRenderedPageBreak/>
         <w:t>what information is important to communicate, nor complete information about animals’ social connections, and therefore do not know a priori which types of information are encoded in greater amounts, whether information is encoded across more than one social level, but also which classes at different social levels actually interact and are under pressure to sound similar to or distinctive from one another.</w:t>
       </w:r>
-      <w:commentRangeEnd w:id="46"/>
+      <w:commentRangeEnd w:id="38"/>
       <w:r>
         <w:rPr>
           <w:rStyle w:val="CommentReference"/>
         </w:rPr>
-        <w:commentReference w:id="46"/>
+        <w:commentReference w:id="38"/>
       </w:r>
     </w:p>
     <w:p>
@@ -21009,7 +20998,7 @@
           <w:rFonts w:ascii="Arial" w:hAnsi="Arial" w:cs="Arial"/>
         </w:rPr>
       </w:pPr>
-      <w:commentRangeStart w:id="47"/>
+      <w:commentRangeStart w:id="39"/>
       <w:r>
         <w:rPr>
           <w:rFonts w:ascii="Arial" w:hAnsi="Arial" w:cs="Arial"/>
@@ -21018,7 +21007,7 @@
         </w:rPr>
         <w:t xml:space="preserve">Materials and </w:t>
       </w:r>
-      <w:commentRangeStart w:id="48"/>
+      <w:commentRangeStart w:id="40"/>
       <w:r>
         <w:rPr>
           <w:rFonts w:ascii="Arial" w:hAnsi="Arial" w:cs="Arial"/>
@@ -21027,12 +21016,12 @@
         </w:rPr>
         <w:t>Methods</w:t>
       </w:r>
-      <w:commentRangeEnd w:id="48"/>
+      <w:commentRangeEnd w:id="40"/>
       <w:r>
         <w:rPr>
           <w:rStyle w:val="CommentReference"/>
         </w:rPr>
-        <w:commentReference w:id="48"/>
+        <w:commentReference w:id="40"/>
       </w:r>
       <w:r>
         <w:rPr>
@@ -21040,12 +21029,12 @@
         </w:rPr>
         <w:t>:</w:t>
       </w:r>
-      <w:commentRangeEnd w:id="47"/>
+      <w:commentRangeEnd w:id="39"/>
       <w:r>
         <w:rPr>
           <w:rStyle w:val="CommentReference"/>
         </w:rPr>
-        <w:commentReference w:id="47"/>
+        <w:commentReference w:id="39"/>
       </w:r>
     </w:p>
     <w:p>
@@ -21431,8 +21420,8 @@
         </w:rPr>
         <w:t>6</w:t>
       </w:r>
-      <w:commentRangeStart w:id="49"/>
-      <w:commentRangeStart w:id="50"/>
+      <w:commentRangeStart w:id="41"/>
+      <w:commentRangeStart w:id="42"/>
       <w:r>
         <w:rPr>
           <w:rFonts w:ascii="Arial" w:hAnsi="Arial" w:cs="Arial"/>
@@ -21469,19 +21458,19 @@
         </w:rPr>
         <w:t xml:space="preserve">(Figure 1): </w:t>
       </w:r>
-      <w:commentRangeEnd w:id="49"/>
+      <w:commentRangeEnd w:id="41"/>
       <w:r>
         <w:rPr>
           <w:rStyle w:val="CommentReference"/>
         </w:rPr>
-        <w:commentReference w:id="49"/>
-      </w:r>
-      <w:commentRangeEnd w:id="50"/>
+        <w:commentReference w:id="41"/>
+      </w:r>
+      <w:commentRangeEnd w:id="42"/>
       <w:r>
         <w:rPr>
           <w:rStyle w:val="CommentReference"/>
         </w:rPr>
-        <w:commentReference w:id="50"/>
+        <w:commentReference w:id="42"/>
       </w:r>
       <w:r>
         <w:rPr>
@@ -25231,7 +25220,19 @@
         <w:rPr>
           <w:rFonts w:ascii="Arial" w:hAnsi="Arial" w:cs="Arial"/>
         </w:rPr>
-        <w:t xml:space="preserve">Finally, we generated trait space plots for character strings and vocalizations with convex hull polygons outlining the area encompassed in acoustic space by the social level at which we had originally encoded the most information (Figures 2 and 3), as well as both social levels (Supplementary Figures 1 and 2), to facilitate ease of comparisons of patterns of concentration </w:t>
+        <w:t xml:space="preserve">Finally, we generated </w:t>
+      </w:r>
+      <w:r>
+        <w:rPr>
+          <w:rFonts w:ascii="Arial" w:hAnsi="Arial" w:cs="Arial"/>
+        </w:rPr>
+        <w:t>acoustic</w:t>
+      </w:r>
+      <w:r>
+        <w:rPr>
+          <w:rFonts w:ascii="Arial" w:hAnsi="Arial" w:cs="Arial"/>
+        </w:rPr>
+        <w:t xml:space="preserve"> space plots for character strings and vocalizations with convex hull polygons outlining the area encompassed in acoustic space by the social level at which we had originally encoded the most information (Figures 2 and 3), as well as both social levels (Supplementary Figures 1 and 2), to facilitate ease of comparisons of patterns of concentration </w:t>
       </w:r>
       <w:r>
         <w:rPr>
@@ -25974,13 +25975,13 @@
         </w:rPr>
         <w:fldChar w:fldCharType="end"/>
       </w:r>
-      <w:commentRangeStart w:id="51"/>
-      <w:commentRangeEnd w:id="51"/>
+      <w:commentRangeStart w:id="43"/>
+      <w:commentRangeEnd w:id="43"/>
       <w:r>
         <w:rPr>
           <w:rStyle w:val="CommentReference"/>
         </w:rPr>
-        <w:commentReference w:id="51"/>
+        <w:commentReference w:id="43"/>
       </w:r>
       <w:r>
         <w:rPr>
@@ -26131,6 +26132,69 @@
           <w:rFonts w:ascii="Arial" w:hAnsi="Arial" w:cs="Arial"/>
         </w:rPr>
         <w:t xml:space="preserve"> analyses.</w:t>
+      </w:r>
+    </w:p>
+    <w:p>
+      <w:pPr>
+        <w:spacing w:line="480" w:lineRule="auto"/>
+        <w:ind w:firstLine="720"/>
+      </w:pPr>
+      <w:commentRangeStart w:id="44"/>
+      <w:commentRangeStart w:id="45"/>
+      <w:commentRangeStart w:id="46"/>
+      <w:r>
+        <w:rPr>
+          <w:rFonts w:ascii="Arial" w:hAnsi="Arial" w:cs="Arial"/>
+        </w:rPr>
+        <w:t>Although</w:t>
+      </w:r>
+      <w:commentRangeEnd w:id="46"/>
+      <w:r>
+        <w:rPr>
+          <w:rStyle w:val="CommentReference"/>
+        </w:rPr>
+        <w:commentReference w:id="46"/>
+      </w:r>
+      <w:r>
+        <w:rPr>
+          <w:rFonts w:ascii="Arial" w:hAnsi="Arial" w:cs="Arial"/>
+        </w:rPr>
+        <w:t xml:space="preserve"> our pipeline facilitated controlling the amount of information encoded at both the group and individual levels, we expected that the uniqueness of identity information would be influenced by the generative process that we used to create group and individual information. As we randomly selected character strings to represent information at either social level, we did not expect that group or individual information would be fully unique amongst groups or individuals, respectively, across a given dataset. Instead, identity information could be stochastically similar amongst classes at either social level </w:t>
+      </w:r>
+      <w:proofErr w:type="gramStart"/>
+      <w:r>
+        <w:rPr>
+          <w:rFonts w:ascii="Arial" w:hAnsi="Arial" w:cs="Arial"/>
+        </w:rPr>
+        <w:t>and</w:t>
+      </w:r>
+      <w:proofErr w:type="gramEnd"/>
+      <w:r>
+        <w:rPr>
+          <w:rFonts w:ascii="Arial" w:hAnsi="Arial" w:cs="Arial"/>
+        </w:rPr>
+        <w:t xml:space="preserve"> the likelihood of such stochastic similarity would increase with the number of classes the given social level. For instance, as the number of groups increased in a dataset, so should the likelihood that group information was shared or </w:t>
+      </w:r>
+      <w:r>
+        <w:rPr>
+          <w:rFonts w:ascii="Arial" w:hAnsi="Arial" w:cs="Arial"/>
+        </w:rPr>
+        <w:lastRenderedPageBreak/>
+        <w:t xml:space="preserve">very similar amongst one or more groups, leading to lower distinctiveness amongst groups even when we encoded large amounts of group information. </w:t>
+      </w:r>
+      <w:commentRangeEnd w:id="44"/>
+      <w:r>
+        <w:rPr>
+          <w:rStyle w:val="CommentReference"/>
+        </w:rPr>
+        <w:commentReference w:id="44"/>
+      </w:r>
+      <w:commentRangeEnd w:id="45"/>
+      <w:r>
+        <w:rPr>
+          <w:rStyle w:val="CommentReference"/>
+        </w:rPr>
+        <w:commentReference w:id="45"/>
       </w:r>
     </w:p>
     <w:p>
@@ -26347,14 +26411,7 @@
         <w:rPr>
           <w:rFonts w:ascii="Arial" w:hAnsi="Arial" w:cs="Arial"/>
         </w:rPr>
-        <w:t xml:space="preserve">We measured </w:t>
-      </w:r>
-      <w:r>
-        <w:rPr>
-          <w:rFonts w:ascii="Arial" w:hAnsi="Arial" w:cs="Arial"/>
-        </w:rPr>
-        <w:lastRenderedPageBreak/>
-        <w:t xml:space="preserve">distance with the edit distance or SPCC, respectively, and then performed multidimensional scaling to generate features. </w:t>
+        <w:t xml:space="preserve">We measured distance with the edit distance or SPCC, respectively, and then performed multidimensional scaling to generate features. </w:t>
       </w:r>
       <w:r>
         <w:rPr>
@@ -26540,7 +26597,14 @@
         <w:rPr>
           <w:rFonts w:ascii="Arial" w:hAnsi="Arial" w:cs="Arial"/>
         </w:rPr>
-        <w:t xml:space="preserve"> using the same analytical pipeline described below</w:t>
+        <w:t xml:space="preserve"> using the same analytical pipeline </w:t>
+      </w:r>
+      <w:r>
+        <w:rPr>
+          <w:rFonts w:ascii="Arial" w:hAnsi="Arial" w:cs="Arial"/>
+        </w:rPr>
+        <w:lastRenderedPageBreak/>
+        <w:t>described below</w:t>
       </w:r>
       <w:r>
         <w:rPr>
@@ -26730,14 +26794,7 @@
         <w:rPr>
           <w:rFonts w:ascii="Arial" w:hAnsi="Arial" w:cs="Arial"/>
         </w:rPr>
-        <w:t xml:space="preserve">, so there is a record of the number of cells </w:t>
-      </w:r>
-      <w:r>
-        <w:rPr>
-          <w:rFonts w:ascii="Arial" w:hAnsi="Arial" w:cs="Arial"/>
-        </w:rPr>
-        <w:lastRenderedPageBreak/>
-        <w:t>in each matrix that were found to be problematic, and the values we used to modify these cells</w:t>
+        <w:t>, so there is a record of the number of cells in each matrix that were found to be problematic, and the values we used to modify these cells</w:t>
       </w:r>
       <w:r>
         <w:rPr>
@@ -26962,7 +27019,14 @@
         <w:rPr>
           <w:rFonts w:ascii="Arial" w:hAnsi="Arial" w:cs="Arial"/>
         </w:rPr>
-        <w:t>at each social level. At the group level, we randomly selected 1 vocalization per individual within a group to maintain symmetry in sample size between social levels. At the individual level, we performed clustering of individuals’ vocalizations within a group for each group in the given dataset</w:t>
+        <w:t xml:space="preserve">at each social level. At the group level, we randomly selected 1 vocalization per individual within a group to maintain symmetry in sample size between social levels. At the individual level, we </w:t>
+      </w:r>
+      <w:r>
+        <w:rPr>
+          <w:rFonts w:ascii="Arial" w:hAnsi="Arial" w:cs="Arial"/>
+        </w:rPr>
+        <w:lastRenderedPageBreak/>
+        <w:t>performed clustering of individuals’ vocalizations within a group for each group in the given dataset</w:t>
       </w:r>
       <w:r>
         <w:rPr>
@@ -27000,42 +27064,35 @@
         </w:rPr>
         <w:t xml:space="preserve">We generally expected to find higher clustering accuracy back to original class labels at the social level that we used to originally encode the most identity information in the synthetic vocalizations. </w:t>
       </w:r>
-      <w:commentRangeStart w:id="52"/>
-      <w:commentRangeStart w:id="53"/>
-      <w:commentRangeStart w:id="54"/>
-      <w:r>
-        <w:rPr>
-          <w:rFonts w:ascii="Arial" w:hAnsi="Arial" w:cs="Arial"/>
-        </w:rPr>
-        <w:t xml:space="preserve">We also expected to identify clustering accuracies that were generally lower for spectrographic cross-correlation than the edit distance, since </w:t>
-      </w:r>
-      <w:r>
-        <w:rPr>
-          <w:rFonts w:ascii="Arial" w:hAnsi="Arial" w:cs="Arial"/>
-        </w:rPr>
-        <w:lastRenderedPageBreak/>
-        <w:t>spectrographic cross-correlation was performed on strings transformed into synthetic audio files, which may have led to losses of the original information or added noise</w:t>
-      </w:r>
-      <w:commentRangeEnd w:id="52"/>
+      <w:commentRangeStart w:id="47"/>
+      <w:commentRangeStart w:id="48"/>
+      <w:commentRangeStart w:id="49"/>
+      <w:r>
+        <w:rPr>
+          <w:rFonts w:ascii="Arial" w:hAnsi="Arial" w:cs="Arial"/>
+        </w:rPr>
+        <w:t>We also expected to identify clustering accuracies that were generally lower for spectrographic cross-correlation than the edit distance, since spectrographic cross-correlation was performed on strings transformed into synthetic audio files, which may have led to losses of the original information or added noise</w:t>
+      </w:r>
+      <w:commentRangeEnd w:id="47"/>
       <w:r>
         <w:rPr>
           <w:rStyle w:val="CommentReference"/>
         </w:rPr>
-        <w:commentReference w:id="52"/>
-      </w:r>
-      <w:commentRangeEnd w:id="53"/>
+        <w:commentReference w:id="47"/>
+      </w:r>
+      <w:commentRangeEnd w:id="48"/>
       <w:r>
         <w:rPr>
           <w:rStyle w:val="CommentReference"/>
         </w:rPr>
-        <w:commentReference w:id="53"/>
-      </w:r>
-      <w:commentRangeEnd w:id="54"/>
+        <w:commentReference w:id="48"/>
+      </w:r>
+      <w:commentRangeEnd w:id="49"/>
       <w:r>
         <w:rPr>
           <w:rStyle w:val="CommentReference"/>
         </w:rPr>
-        <w:commentReference w:id="54"/>
+        <w:commentReference w:id="49"/>
       </w:r>
       <w:r>
         <w:rPr>
@@ -27153,7 +27210,14 @@
         <w:rPr>
           <w:rFonts w:ascii="Arial" w:hAnsi="Arial" w:cs="Arial"/>
         </w:rPr>
-        <w:t>measurement methods were useful for qualitative interpretations of our ability to accurately detect identity information</w:t>
+        <w:t xml:space="preserve">measurement methods were useful for qualitative interpretations of our ability to accurately detect </w:t>
+      </w:r>
+      <w:r>
+        <w:rPr>
+          <w:rFonts w:ascii="Arial" w:hAnsi="Arial" w:cs="Arial"/>
+        </w:rPr>
+        <w:lastRenderedPageBreak/>
+        <w:t>identity information</w:t>
       </w:r>
       <w:r>
         <w:rPr>
@@ -27245,7 +27309,7 @@
         </w:rPr>
         <w:t xml:space="preserve">with the </w:t>
       </w:r>
-      <w:commentRangeStart w:id="55"/>
+      <w:commentRangeStart w:id="50"/>
       <w:proofErr w:type="spellStart"/>
       <w:r>
         <w:rPr>
@@ -27260,12 +27324,12 @@
         </w:rPr>
         <w:t xml:space="preserve"> package version 0.8.1 </w:t>
       </w:r>
-      <w:commentRangeEnd w:id="55"/>
+      <w:commentRangeEnd w:id="50"/>
       <w:r>
         <w:rPr>
           <w:rStyle w:val="CommentReference"/>
         </w:rPr>
-        <w:commentReference w:id="55"/>
+        <w:commentReference w:id="50"/>
       </w:r>
       <w:r>
         <w:rPr>
@@ -27379,14 +27443,7 @@
         <w:rPr>
           <w:rFonts w:ascii="Arial" w:hAnsi="Arial" w:cs="Arial"/>
         </w:rPr>
-        <w:t xml:space="preserve"> because the distributions of the accuracy scores were highly or fully disjointed (little or no overlap) </w:t>
-      </w:r>
-      <w:r>
-        <w:rPr>
-          <w:rFonts w:ascii="Arial" w:hAnsi="Arial" w:cs="Arial"/>
-        </w:rPr>
-        <w:lastRenderedPageBreak/>
-        <w:t xml:space="preserve">between social levels. </w:t>
+        <w:t xml:space="preserve"> because the distributions of the accuracy scores were highly or fully disjointed (little or no overlap) between social levels. </w:t>
       </w:r>
       <w:r>
         <w:rPr>
@@ -27406,7 +27463,7 @@
         </w:rPr>
         <w:t>(</w:t>
       </w:r>
-      <w:commentRangeStart w:id="56"/>
+      <w:commentRangeStart w:id="51"/>
       <w:r>
         <w:rPr>
           <w:rFonts w:ascii="Arial" w:hAnsi="Arial" w:cs="Arial"/>
@@ -27414,13 +27471,13 @@
         </w:rPr>
         <w:t>CITE</w:t>
       </w:r>
-      <w:commentRangeEnd w:id="56"/>
+      <w:commentRangeEnd w:id="51"/>
       <w:r>
         <w:rPr>
           <w:rStyle w:val="CommentReference"/>
           <w:highlight w:val="yellow"/>
         </w:rPr>
-        <w:commentReference w:id="56"/>
+        <w:commentReference w:id="51"/>
       </w:r>
       <w:r>
         <w:rPr>
@@ -27471,19 +27528,19 @@
         </w:rPr>
         <w:t>We will make our simulation experiment results freely available. Our example datasets and simulation experiments can be reproduced using code associated with this manuscript that is available on GitHub (</w:t>
       </w:r>
-      <w:commentRangeStart w:id="57"/>
+      <w:commentRangeStart w:id="52"/>
       <w:r>
         <w:rPr>
           <w:rFonts w:ascii="Arial" w:hAnsi="Arial" w:cs="Arial"/>
         </w:rPr>
         <w:t>https://github.com/gsvidaurre/paRsynth-methods-paper</w:t>
       </w:r>
-      <w:commentRangeEnd w:id="57"/>
+      <w:commentRangeEnd w:id="52"/>
       <w:r>
         <w:rPr>
           <w:rStyle w:val="CommentReference"/>
         </w:rPr>
-        <w:commentReference w:id="57"/>
+        <w:commentReference w:id="52"/>
       </w:r>
       <w:r>
         <w:rPr>
@@ -29666,13 +29723,13 @@
           <w:rFonts w:ascii="Arial" w:hAnsi="Arial" w:cs="Arial"/>
         </w:rPr>
       </w:pPr>
-      <w:commentRangeStart w:id="58"/>
-      <w:commentRangeEnd w:id="58"/>
+      <w:commentRangeStart w:id="53"/>
+      <w:commentRangeEnd w:id="53"/>
       <w:r>
         <w:rPr>
           <w:rStyle w:val="CommentReference"/>
         </w:rPr>
-        <w:commentReference w:id="58"/>
+        <w:commentReference w:id="53"/>
       </w:r>
       <w:r>
         <w:rPr>
@@ -29947,19 +30004,19 @@
         </w:rPr>
         <w:t xml:space="preserve">). </w:t>
       </w:r>
-      <w:commentRangeStart w:id="59"/>
+      <w:commentRangeStart w:id="54"/>
       <w:r>
         <w:rPr>
           <w:rFonts w:ascii="Arial" w:hAnsi="Arial" w:cs="Arial"/>
         </w:rPr>
         <w:t>This suggests that individuals are being categorized in distinct individual clusters when running traditional bioacoustics analyses on our synthetically generated calls.</w:t>
       </w:r>
-      <w:commentRangeEnd w:id="59"/>
+      <w:commentRangeEnd w:id="54"/>
       <w:r>
         <w:rPr>
           <w:rStyle w:val="CommentReference"/>
         </w:rPr>
-        <w:commentReference w:id="59"/>
+        <w:commentReference w:id="54"/>
       </w:r>
     </w:p>
     <w:p>
@@ -29972,7 +30029,7 @@
     <w:p>
       <w:pPr>
         <w:rPr>
-          <w:ins w:id="60" w:author="Smith Vidaurre, Grace" w:date="2025-05-22T14:24:00Z" w16du:dateUtc="2025-05-22T18:24:00Z"/>
+          <w:ins w:id="55" w:author="Smith Vidaurre, Grace" w:date="2025-05-22T14:24:00Z" w16du:dateUtc="2025-05-22T18:24:00Z"/>
           <w:rFonts w:ascii="Arial" w:hAnsi="Arial" w:cs="Arial"/>
           <w:b/>
           <w:bCs/>
@@ -29990,7 +30047,7 @@
     <w:p>
       <w:pPr>
         <w:rPr>
-          <w:ins w:id="61" w:author="Smith Vidaurre, Grace" w:date="2025-05-22T14:24:00Z" w16du:dateUtc="2025-05-22T18:24:00Z"/>
+          <w:ins w:id="56" w:author="Smith Vidaurre, Grace" w:date="2025-05-22T14:24:00Z" w16du:dateUtc="2025-05-22T18:24:00Z"/>
           <w:rFonts w:ascii="Arial" w:hAnsi="Arial" w:cs="Arial"/>
           <w:b/>
           <w:bCs/>
@@ -30002,7 +30059,7 @@
         <w:spacing w:line="480" w:lineRule="auto"/>
         <w:ind w:firstLine="720"/>
         <w:rPr>
-          <w:ins w:id="62" w:author="Smith Vidaurre, Grace" w:date="2025-05-22T14:25:00Z" w16du:dateUtc="2025-05-22T18:25:00Z"/>
+          <w:ins w:id="57" w:author="Smith Vidaurre, Grace" w:date="2025-05-22T14:25:00Z" w16du:dateUtc="2025-05-22T18:25:00Z"/>
           <w:rFonts w:ascii="Arial" w:hAnsi="Arial" w:cs="Arial"/>
         </w:rPr>
       </w:pPr>
@@ -30048,19 +30105,19 @@
         </w:rPr>
         <w:t xml:space="preserve">, therefore, to study to evolution of vocal learning, we must understand how vocal learners encode and perceive information in learned vocal signals. Studies of the diversity of information encoding across vocal learning taxa could lead to new insights into how vocal learning originated and continues to </w:t>
       </w:r>
-      <w:commentRangeStart w:id="63"/>
+      <w:commentRangeStart w:id="58"/>
       <w:r>
         <w:rPr>
           <w:rFonts w:ascii="Arial" w:hAnsi="Arial" w:cs="Arial"/>
         </w:rPr>
         <w:t>evolve</w:t>
       </w:r>
-      <w:commentRangeEnd w:id="63"/>
+      <w:commentRangeEnd w:id="58"/>
       <w:r>
         <w:rPr>
           <w:rStyle w:val="CommentReference"/>
         </w:rPr>
-        <w:commentReference w:id="63"/>
+        <w:commentReference w:id="58"/>
       </w:r>
       <w:r>
         <w:rPr>
@@ -30074,7 +30131,7 @@
         <w:spacing w:line="480" w:lineRule="auto"/>
         <w:ind w:firstLine="720"/>
         <w:rPr>
-          <w:ins w:id="64" w:author="Smith Vidaurre, Grace" w:date="2025-05-22T14:25:00Z" w16du:dateUtc="2025-05-22T18:25:00Z"/>
+          <w:ins w:id="59" w:author="Smith Vidaurre, Grace" w:date="2025-05-22T14:25:00Z" w16du:dateUtc="2025-05-22T18:25:00Z"/>
           <w:rFonts w:ascii="Arial" w:hAnsi="Arial" w:cs="Arial"/>
         </w:rPr>
       </w:pPr>
@@ -30084,12 +30141,12 @@
         <w:spacing w:line="480" w:lineRule="auto"/>
         <w:ind w:firstLine="720"/>
         <w:rPr>
-          <w:ins w:id="65" w:author="Smith Vidaurre, Grace" w:date="2025-05-22T14:34:00Z" w16du:dateUtc="2025-05-22T18:34:00Z"/>
-          <w:rFonts w:ascii="Arial" w:hAnsi="Arial" w:cs="Arial"/>
-        </w:rPr>
-      </w:pPr>
-      <w:commentRangeStart w:id="66"/>
-      <w:ins w:id="67" w:author="Smith Vidaurre, Grace" w:date="2025-05-22T14:25:00Z" w16du:dateUtc="2025-05-22T18:25:00Z">
+          <w:ins w:id="60" w:author="Smith Vidaurre, Grace" w:date="2025-05-22T14:34:00Z" w16du:dateUtc="2025-05-22T18:34:00Z"/>
+          <w:rFonts w:ascii="Arial" w:hAnsi="Arial" w:cs="Arial"/>
+        </w:rPr>
+      </w:pPr>
+      <w:commentRangeStart w:id="61"/>
+      <w:ins w:id="62" w:author="Smith Vidaurre, Grace" w:date="2025-05-22T14:25:00Z" w16du:dateUtc="2025-05-22T18:25:00Z">
         <w:r>
           <w:rPr>
             <w:rFonts w:ascii="Arial" w:hAnsi="Arial" w:cs="Arial"/>
@@ -30109,7 +30166,7 @@
         </w:rPr>
         <w:instrText xml:space="preserve"> ADDIN ZOTERO_ITEM CSL_CITATION {"citationID":"rAU7Cgl8","properties":{"formattedCitation":"(37)","plainCitation":"(37)","noteIndex":0},"citationItems":[{"id":520,"uris":["http://zotero.org/groups/5786507/items/7BKS52MV"],"itemData":{"id":520,"type":"article-journal","abstract":"Blue whale songs provide a measure for characterising worldwide blue whale population structure. These songs are divided into nine regional types, which maintain a stable character. Five of the nine song types have been recorded over time spans greater than 30 years showing no significant change in character. The nine song types can be divided into those containing only simple tonal components (high latitude North Pacific, North Atlantic and Southern Ocean song types), those comprised of complex pulsed units in addition to the tonal components (Pacific Ocean margin song types from California, Chile and New Zealand), and those which have the greatest complexity of all and the longest cycling times (Indian Ocean song types from Sri Lanka, Fremantle and Diego Garcia). We suggest that temporally stable differences in song provide another characteristic for comparison with genetic and morphological data when defining blue whale populations. Furthermore, as Mellinger and Barlow (2003) recommend, when there is a lack of other data or lack of clarity in other data sets, evidence of distinct differences in songs between areas should be used as a provisional hypothesis about population structure when making management decisions. Worldwide study is needed to better understand the various populations and subspecies within species like the blue whale that have large geographic distributions and have both migrating and resident populations.","container-title":"Journal of Cetacean Research and Management","issue":"1","language":"en","page":"55-65","source":"escholarship.org","title":"Biogeographic characterization of blue whale song worldwide: Using song to identify populations","title-short":"Biogeographic characterization of blue whale song worldwide","volume":"8","author":[{"family":"McDonald","given":"Mark A."},{"family":"Mesnick","given":"Sarah L."},{"family":"Hildebrand","given":"John A."}],"issued":{"date-parts":[["2006"]]}}}],"schema":"https://github.com/citation-style-language/schema/raw/master/csl-citation.json"} </w:instrText>
       </w:r>
-      <w:ins w:id="68" w:author="Smith Vidaurre, Grace" w:date="2025-05-22T14:25:00Z" w16du:dateUtc="2025-05-22T18:25:00Z">
+      <w:ins w:id="63" w:author="Smith Vidaurre, Grace" w:date="2025-05-22T14:25:00Z" w16du:dateUtc="2025-05-22T18:25:00Z">
         <w:r>
           <w:rPr>
             <w:rFonts w:ascii="Arial" w:hAnsi="Arial" w:cs="Arial"/>
@@ -30123,7 +30180,7 @@
         </w:rPr>
         <w:t>(37)</w:t>
       </w:r>
-      <w:ins w:id="69" w:author="Smith Vidaurre, Grace" w:date="2025-05-22T14:25:00Z" w16du:dateUtc="2025-05-22T18:25:00Z">
+      <w:ins w:id="64" w:author="Smith Vidaurre, Grace" w:date="2025-05-22T14:25:00Z" w16du:dateUtc="2025-05-22T18:25:00Z">
         <w:r>
           <w:rPr>
             <w:rFonts w:ascii="Arial" w:hAnsi="Arial" w:cs="Arial"/>
@@ -30149,7 +30206,7 @@
         </w:rPr>
         <w:instrText xml:space="preserve"> ADDIN ZOTERO_ITEM CSL_CITATION {"citationID":"IfayIE36","properties":{"formattedCitation":"(38,39)","plainCitation":"(38,39)","noteIndex":0},"citationItems":[{"id":522,"uris":["http://zotero.org/groups/5786507/items/V2UWNIJQ"],"itemData":{"id":522,"type":"article-journal","abstract":"Variation in vocal signals among populations and social groups of animals provides opportunities for the study of the mechanisms of behavioural change and their importance in generating and maintaining behavioural variation. We analysed two call types made by two matrilineal social groups of resident killer whales, Orcinus orca, over 12–13 years. We used a neural network-based index of acoustic similarity to identify mechanisms of call differentiation. A test for structural modification of the calls detected significant changes in one call type in both groups, but not in the other. For the modified call type, the rate of divergence between the two groups was significantly lower than the rate of modification within either group showing that calls were modified in a similar fashion in the two groups. An analysis of structural parameters detected no strong directionality in the change. The pattern of call modification could have been caused by maturational changes to the calls or, if killer whale dialects are learned behavioural traits, cultural drift in the structure of the calls together with horizontal transmission of modifications between the two groups. Such vocal matching between members of different matrilines would suggest that vocal learning is not limited to vertical transmission from mother to offspring, which has important implications for models of gene–culture coevolution.","container-title":"Animal Behaviour","DOI":"10.1006/anbe.2000.1454","ISSN":"0003-3472","issue":"5","journalAbbreviation":"Animal Behaviour","page":"629-638","source":"ScienceDirect","title":"Dialect change in resident killer whales: implications for vocal learning and cultural transmission","title-short":"Dialect change in resident killer whales","volume":"60","author":[{"family":"Deecke","given":"V. B"},{"family":"Ford","given":"J. K. B"},{"family":"Spong","given":"P"}],"issued":{"date-parts":[["2000",11,1]]}}},{"id":539,"uris":["http://zotero.org/groups/5786507/items/2XR78B26"],"itemData":{"id":539,"type":"article-journal","abstract":"The manner in which vocal learning is used for social recognition may be sensitive to the social environment. Biological invaders capable of vocal learning are useful for testing this possibility, as invasion alters population size. Some vocal learning species use frequency modulation patterns of acoustic signals for individual recognition. In such species, frequency modulation patterns should be more complex in larger social groups, reflecting greater selection for individual distinctiveness. We used numbers of nests and nest densities as proxies of local population sizes of native range monk parakeets, Myiopsitta monachus, in Uruguay and invasive range populations in the United States. Flock sizes were obtained to estimate maximum social group sizes per range. Supervised machine learning and frequency contours were employed to compare contact call structure between native and invasive range populations, and the effect of urban habitats on call structure was also assessed. Invasive range populations exhibited fewer nests, lower nest densities and smaller maximum flock sizes, which is consistent with a reduction in population size following invasion. Parakeets at invasive range sites also produced contact calls with simpler frequency modulation patterns. Beecher's statistic (HS) revealed reduced individual identity content and fewer possible unique individual signatures in invasive range calls. Simpler individual signatures are consistent with relaxed selection on the complexity of learned calls likely used for individual vocal recognition in the smaller local populations that we identified post-invasion. Frequency modulation patterns were simpler in urban habitats in both ranges, indicating that urban habitats could also alter the social environment and in turn influence the complexity of learned individual signatures. These findings contribute to a growing literature on the use of vocal learning for individual recognition and indicate that vocal learning can be used to produce individual vocal signatures in a manner sensitive to local population size.","container-title":"Animal Behaviour","DOI":"10.1016/j.anbehav.2021.06.020","ISSN":"0003-3472","journalAbbreviation":"Animal Behaviour","page":"15-39","source":"ScienceDirect","title":"Individual vocal signatures show reduced complexity following invasion","volume":"179","author":[{"family":"Smith-Vidaurre","given":"Grace"},{"family":"Perez-Marrufo","given":"Valeria"},{"family":"Wright","given":"Timothy F."}],"issued":{"date-parts":[["2021",9,1]]}}}],"schema":"https://github.com/citation-style-language/schema/raw/master/csl-citation.json"} </w:instrText>
       </w:r>
-      <w:ins w:id="70" w:author="Smith Vidaurre, Grace" w:date="2025-05-22T14:25:00Z" w16du:dateUtc="2025-05-22T18:25:00Z">
+      <w:ins w:id="65" w:author="Smith Vidaurre, Grace" w:date="2025-05-22T14:25:00Z" w16du:dateUtc="2025-05-22T18:25:00Z">
         <w:r>
           <w:rPr>
             <w:rFonts w:ascii="Arial" w:hAnsi="Arial" w:cs="Arial"/>
@@ -30163,7 +30220,7 @@
         </w:rPr>
         <w:t>(38,39)</w:t>
       </w:r>
-      <w:ins w:id="71" w:author="Smith Vidaurre, Grace" w:date="2025-05-22T14:25:00Z" w16du:dateUtc="2025-05-22T18:25:00Z">
+      <w:ins w:id="66" w:author="Smith Vidaurre, Grace" w:date="2025-05-22T14:25:00Z" w16du:dateUtc="2025-05-22T18:25:00Z">
         <w:r>
           <w:rPr>
             <w:rFonts w:ascii="Arial" w:hAnsi="Arial" w:cs="Arial"/>
@@ -30189,7 +30246,7 @@
         </w:rPr>
         <w:instrText xml:space="preserve"> ADDIN ZOTERO_ITEM CSL_CITATION {"citationID":"ypmC2vLC","properties":{"formattedCitation":"(5,8,16,17,40,41)","plainCitation":"(5,8,16,17,40,41)","noteIndex":0},"citationItems":[{"id":534,"uris":["http://zotero.org/groups/5786507/items/DLH8HEV6"],"itemData":{"id":534,"type":"article-journal","abstract":"Vocal learning, in which animals modify their vocalizations based on social experience, has evolved in several lineages of mammals and birds, including humans. Despite much attention, the question of how this key cognitive trait has evolved remains unanswered. The motor theory for the origin of vocal learning posits that neural centres specialized for vocal learning arose from adjacent areas in the brain devoted to general motor learning. One prediction of this hypothesis is that visual displays that rely on complex motor patterns may also be learned in taxa with vocal learning. While learning of both spoken and gestural languages is well documented in humans, the occurrence of learned visual displays has rarely been examined in non-human animals. We tested for geographical variation consistent with learning of visual displays in long-billed hermits (Phaethornis longirostris), a lek-mating hummingbird that, like humans, has both learned vocalizations and elaborate visual displays. We found lek-level signatures in both vocal parameters and visual display features, including display element proportions, sequence syntax and fine-scale parameters of elements. This variation was not associated with genetic differentiation between leks. In the absence of genetic differences, geographical variation in vocal signals at small scales is most parsimoniously attributed to learning, suggesting a significant role of social learning in visual display ontogeny. The co-occurrence of learning in vocal and visual displays would be consistent with a parallel evolution of these two signal modalities in this species.","container-title":"Proceedings of the Royal Society B: Biological Sciences","DOI":"10.1098/rspb.2019.0666","issue":"1903","note":"Enter Notes Here!","page":"20190666","source":"royalsocietypublishing.org (Atypon)","title":"Social group signatures in hummingbird displays provide evidence of co-occurrence of vocal and visual learning","volume":"286","author":[{"family":"Araya-Salas","given":"Marcelo"},{"family":"Smith-Vidaurre","given":"Grace"},{"family":"Mennill","given":"Daniel J."},{"family":"González-Gómez","given":"Paulina L."},{"family":"Cahill","given":"James"},{"family":"Wright","given":"Timothy F."}],"issued":{"date-parts":[["2019",5,29]]}}},{"id":530,"uris":["http://zotero.org/groups/5786507/items/4ILM3F4A"],"itemData":{"id":530,"type":"article-journal","abstract":"Learned birdsong is a widely used animal model for understanding the acquisition of human speech. Male songbirds often learn songs from adult males during sensitive periods early in life, and sing to attract mates and defend territories. In presumably all of the 350+ parrot species, individuals of both sexes commonly learn vocal signals throughout life to satisfy a wide variety of social functions. Despite intriguing parallels with humans, there have been no experimental studies demonstrating learned vocal production in wild parrots. We studied contact call learning in video-rigged nests of a well-known marked population of green-rumped parrotlets (Forpus passerinus) in Venezuela. Both sexes of naive nestlings developed individually unique contact calls in the nest, and we demonstrate experimentally that signature attributes are learned from both primary care-givers. This represents the first experimental evidence for the mechanisms underlying the transmission of a socially acquired trait in a wild parrot population.","container-title":"Proceedings of the Royal Society B: Biological Sciences","DOI":"10.1098/rspb.2011.0932","issue":"1728","note":"publisher: Royal Society","page":"585-591","source":"royalsocietypublishing-org.proxy2.cl.msu.edu (Atypon)","title":"Vertical transmission of learned signatures in a wild parrot","volume":"279","author":[{"family":"Berg","given":"Karl S."},{"family":"Delgado","given":"Soraya"},{"family":"Cortopassi","given":"Kathryn A."},{"family":"Beissinger","given":"Steven R."},{"family":"Bradbury","given":"Jack W."}],"issued":{"date-parts":[["2011",7,13]]}}},{"id":527,"uris":["http://zotero.org/groups/5786507/items/M5RQLYC2"],"itemData":{"id":527,"type":"article-journal","abstract":"Contact calls function to coordinate movements in a wide variety of social animals. Where population density is high, visibility is low and repeated interactions occur between known social companions, calls are often individually recognizable. Parrots are highly social and make substantial daily movements, which appear to be mediated through contact calling. However, there is little experimental evidence for how free-ranging parrots recognize social companions. We quantified intra- and interindividual variation of contact calls in a banded population of green-rumped parrotlets in Venezuela. Recordings of a sample of males were made on replicate days as they announced their return to incubating mates. Spectrographic structure of these contact calls showed significantly more variation between than within individuals, and calls could be correctly classified to individuals more often than was expected by chance. Males varied across multiple dimensions simultaneously, including duration, frequency and frequency modulation of contact calls. Playback experiments showed that free-ranging female parrotlets responded significantly more often to their mates’ calls than to calls of males of other nests. Mate recognition via contact calls may be selectively advantageous during incubation and brooding if this reduces the potential costs associated with confusing contact calls of mates with those of nonmates, including infanticidal conspecifics.","container-title":"Animal Behaviour","DOI":"10.1016/j.anbehav.2010.10.012","ISSN":"0003-3472","issue":"1","journalAbbreviation":"Animal Behaviour","page":"241-248","source":"ScienceDirect","title":"Contact calls are used for individual mate recognition in free-ranging green-rumped parrotlets, &lt;i&gt;Forpus passerinus&lt;/i&gt;","volume":"81","author":[{"family":"Berg","given":"Karl S."},{"family":"Delgado","given":"Soraya"},{"family":"Okawa","given":"Rae"},{"family":"Beissinger","given":"Steven R."},{"family":"Bradbury","given":"Jack W."}],"issued":{"date-parts":[["2011",1,1]]}}},{"id":536,"uris":["http://zotero.org/groups/5786507/items/ZNXJZAJT"],"itemData":{"id":536,"type":"article-journal","abstract":"Despite longstanding interest in the evolutionary origins and maintenance of vocal learning, we know relatively little about how social dynamics influence vocal learning processes in natural populations. The “signaling group membership” hypothesis proposes that socially learned calls evolved and are maintained as signals of group membership. However, in fission–fusion societies, individuals can interact in social groups across various social scales. For learned calls to signal group membership over multiple social scales, they must contain information about group membership over each of these scales, a concept termed “hierarchical mapping.” Monk parakeets (Myiopsitta monachus), small parrots native to South America, exhibit vocal mimicry in captivity and fission–fusion social dynamics in the wild. We examined patterns of contact call acoustic similarity in Uruguay to test the hierarchical mapping assumption of the signaling group membership hypothesis. We also asked whether geographic variation patterns matched regional dialects or geographic clines that have been documented in other vocal learning species. We used visual inspection, spectrographic cross-correlation and random forests, a machine learning approach, to evaluate contact call similarity. We compared acoustic similarity across social scales and geographic distance using Mantel tests and spatial autocorrelation. We found high similarity within individuals, and low, albeit significant, similarity within groups at the pair, flock and site social scales. Patterns of acoustic similarity over geographic distance did not match mosaic or graded patterns expected in dialectal or clinal variation. Our findings suggest that monk parakeet social interactions rely more heavily upon individual recognition than group membership at higher social scales.","container-title":"Behavioral Ecology","DOI":"10.1093/beheco/arz202","ISSN":"1045-2249","issue":"2","journalAbbreviation":"Behavioral Ecology","page":"448-458","source":"Silverchair","title":"Individual signatures outweigh social group identity in contact calls of a communally nesting parrot","volume":"31","author":[{"family":"Smith-Vidaurre","given":"Grace"},{"family":"Araya-Salas","given":"Marcelo"},{"family":"Wright","given":"Timothy F"}],"issued":{"date-parts":[["2020",3,20]]}}},{"id":542,"uris":["http://zotero.org/groups/5786507/items/E7IVATDZ"],"itemData":{"id":542,"type":"article-journal","abstract":"Animals can actively encode different types of identity information in learned communication signals, such as group membership or individual identity. The social environments in which animals interact may favor different types of information, but whether identity information conveyed in learned signals is robust or responsive to social disruption over short evolutionary timescales is not well understood. We inferred the type of identity information that was most salient in vocal signals by combining computational tools, including supervised machine learning, with a conceptual framework of “hierarchical mapping”, or patterns of relative acoustic convergence across social scales. We used populations of a vocal learning species as a natural experiment to test whether the type of identity information emphasized in learned vocalizations changed in populations that experienced the social disruption of introduction into new parts of the world. We compared the social scales with the most salient identity information among native and introduced range monk parakeet (Myiopsitta monachus) calls recorded in Uruguay and the United States, respectively. We also evaluated whether the identity information emphasized in introduced range calls changed over time. To place our findings in an evolutionary context, we compared our results with another parrot species that exhibits well-established and distinctive regional vocal dialects that are consistent with signaling group identity. We found that both native and introduced range monk parakeet calls displayed the strongest convergence at the individual scale and minimal convergence within sites. We did not identify changes in the strength of acoustic convergence within sites over time in the introduced range calls. These results indicate that the individual identity information in learned vocalizations did not change over short evolutionary timescales in populations that experienced the social disruption of introduction. Our findings point to exciting new research directions about the robustness or responsiveness of communication systems over different evolutionary timescales.","container-title":"PLOS Computational Biology","DOI":"10.1371/journal.pcbi.1011231","ISSN":"1553-7358","issue":"7","journalAbbreviation":"PLOS Computational Biology","language":"en","note":"publisher: Public Library of Science","page":"e1011231","source":"PLoS Journals","title":"Individual identity information persists in learned calls of introduced parrot populations","volume":"19","author":[{"family":"Smith-Vidaurre","given":"Grace"},{"family":"Pérez-Marrufo","given":"Valeria"},{"family":"Hobson","given":"Elizabeth A."},{"family":"Salinas-Melgoza","given":"Alejandro"},{"family":"Wright","given":"Timothy F."}],"issued":{"date-parts":[["2023",7,27]]}}},{"id":519,"uris":["http://zotero.org/groups/5786507/items/CYI2BRGH"],"itemData":{"id":519,"type":"article-journal","abstract":"This study describes a system of regional dialects in the contact call of a parrot, the yellow-naped amazon (Amazona auropalliata.) Spectrographic cross-correlation analyses of calls from multiple adults at 16 roosts in Costa Rica reveal two distinct patterns of geographic variation in call structure: first, variation in the basic structure of the call by which roosts can be classified into three distinct dialects, and second, fine-scale variation of call structure among roosts within a dialect. Some birds at roosts bordering two dialects use the calls of both neighbouring dialects interchangeably. These results suggest that there are two distinct processes governing the diffusion of call types among roosts, with dialect borders acting as barriers to the spread of foreign calls. Such a dialect system could be maintained through either reduced dispersal of birds across dialect boundaries or alternatively, by reduced diffusion of call types. These two possibilities have different implications for the genetic isolation of populations and thus for both speciation and learning. This pattern is broadly similar to those seen in some songbirds and may be maintained in a similar manner.","container-title":"Proceedings of the Royal Society of London. Series B: Biological Sciences","DOI":"10.1098/rspb.1996.0128","issue":"1372","note":"publisher: Royal Society","page":"867-872","source":"royalsocietypublishing.org (Atypon)","title":"Regional dialects in the contact call of a parrot","volume":"263","author":[{"family":"Wright","given":"Timothy F."}],"issued":{"date-parts":[["1996"]]}}}],"schema":"https://github.com/citation-style-language/schema/raw/master/csl-citation.json"} </w:instrText>
       </w:r>
-      <w:ins w:id="72" w:author="Smith Vidaurre, Grace" w:date="2025-05-22T14:25:00Z" w16du:dateUtc="2025-05-22T18:25:00Z">
+      <w:ins w:id="67" w:author="Smith Vidaurre, Grace" w:date="2025-05-22T14:25:00Z" w16du:dateUtc="2025-05-22T18:25:00Z">
         <w:r>
           <w:rPr>
             <w:rFonts w:ascii="Arial" w:hAnsi="Arial" w:cs="Arial"/>
@@ -30203,7 +30260,7 @@
         </w:rPr>
         <w:t>(5,8,16,17,40,41)</w:t>
       </w:r>
-      <w:ins w:id="73" w:author="Smith Vidaurre, Grace" w:date="2025-05-22T14:25:00Z" w16du:dateUtc="2025-05-22T18:25:00Z">
+      <w:ins w:id="68" w:author="Smith Vidaurre, Grace" w:date="2025-05-22T14:25:00Z" w16du:dateUtc="2025-05-22T18:25:00Z">
         <w:r>
           <w:rPr>
             <w:rFonts w:ascii="Arial" w:hAnsi="Arial" w:cs="Arial"/>
@@ -30236,7 +30293,7 @@
         </w:rPr>
         <w:instrText xml:space="preserve"> ADDIN ZOTERO_ITEM CSL_CITATION {"citationID":"Sa9HTNBJ","properties":{"formattedCitation":"(8,16,40)","plainCitation":"(8,16,40)","noteIndex":0},"citationItems":[{"id":534,"uris":["http://zotero.org/groups/5786507/items/DLH8HEV6"],"itemData":{"id":534,"type":"article-journal","abstract":"Vocal learning, in which animals modify their vocalizations based on social experience, has evolved in several lineages of mammals and birds, including humans. Despite much attention, the question of how this key cognitive trait has evolved remains unanswered. The motor theory for the origin of vocal learning posits that neural centres specialized for vocal learning arose from adjacent areas in the brain devoted to general motor learning. One prediction of this hypothesis is that visual displays that rely on complex motor patterns may also be learned in taxa with vocal learning. While learning of both spoken and gestural languages is well documented in humans, the occurrence of learned visual displays has rarely been examined in non-human animals. We tested for geographical variation consistent with learning of visual displays in long-billed hermits (Phaethornis longirostris), a lek-mating hummingbird that, like humans, has both learned vocalizations and elaborate visual displays. We found lek-level signatures in both vocal parameters and visual display features, including display element proportions, sequence syntax and fine-scale parameters of elements. This variation was not associated with genetic differentiation between leks. In the absence of genetic differences, geographical variation in vocal signals at small scales is most parsimoniously attributed to learning, suggesting a significant role of social learning in visual display ontogeny. The co-occurrence of learning in vocal and visual displays would be consistent with a parallel evolution of these two signal modalities in this species.","container-title":"Proceedings of the Royal Society B: Biological Sciences","DOI":"10.1098/rspb.2019.0666","issue":"1903","note":"Enter Notes Here!","page":"20190666","source":"royalsocietypublishing.org (Atypon)","title":"Social group signatures in hummingbird displays provide evidence of co-occurrence of vocal and visual learning","volume":"286","author":[{"family":"Araya-Salas","given":"Marcelo"},{"family":"Smith-Vidaurre","given":"Grace"},{"family":"Mennill","given":"Daniel J."},{"family":"González-Gómez","given":"Paulina L."},{"family":"Cahill","given":"James"},{"family":"Wright","given":"Timothy F."}],"issued":{"date-parts":[["2019",5,29]]}}},{"id":536,"uris":["http://zotero.org/groups/5786507/items/ZNXJZAJT"],"itemData":{"id":536,"type":"article-journal","abstract":"Despite longstanding interest in the evolutionary origins and maintenance of vocal learning, we know relatively little about how social dynamics influence vocal learning processes in natural populations. The “signaling group membership” hypothesis proposes that socially learned calls evolved and are maintained as signals of group membership. However, in fission–fusion societies, individuals can interact in social groups across various social scales. For learned calls to signal group membership over multiple social scales, they must contain information about group membership over each of these scales, a concept termed “hierarchical mapping.” Monk parakeets (Myiopsitta monachus), small parrots native to South America, exhibit vocal mimicry in captivity and fission–fusion social dynamics in the wild. We examined patterns of contact call acoustic similarity in Uruguay to test the hierarchical mapping assumption of the signaling group membership hypothesis. We also asked whether geographic variation patterns matched regional dialects or geographic clines that have been documented in other vocal learning species. We used visual inspection, spectrographic cross-correlation and random forests, a machine learning approach, to evaluate contact call similarity. We compared acoustic similarity across social scales and geographic distance using Mantel tests and spatial autocorrelation. We found high similarity within individuals, and low, albeit significant, similarity within groups at the pair, flock and site social scales. Patterns of acoustic similarity over geographic distance did not match mosaic or graded patterns expected in dialectal or clinal variation. Our findings suggest that monk parakeet social interactions rely more heavily upon individual recognition than group membership at higher social scales.","container-title":"Behavioral Ecology","DOI":"10.1093/beheco/arz202","ISSN":"1045-2249","issue":"2","journalAbbreviation":"Behavioral Ecology","page":"448-458","source":"Silverchair","title":"Individual signatures outweigh social group identity in contact calls of a communally nesting parrot","volume":"31","author":[{"family":"Smith-Vidaurre","given":"Grace"},{"family":"Araya-Salas","given":"Marcelo"},{"family":"Wright","given":"Timothy F"}],"issued":{"date-parts":[["2020",3,20]]}}},{"id":519,"uris":["http://zotero.org/groups/5786507/items/CYI2BRGH"],"itemData":{"id":519,"type":"article-journal","abstract":"This study describes a system of regional dialects in the contact call of a parrot, the yellow-naped amazon (Amazona auropalliata.) Spectrographic cross-correlation analyses of calls from multiple adults at 16 roosts in Costa Rica reveal two distinct patterns of geographic variation in call structure: first, variation in the basic structure of the call by which roosts can be classified into three distinct dialects, and second, fine-scale variation of call structure among roosts within a dialect. Some birds at roosts bordering two dialects use the calls of both neighbouring dialects interchangeably. These results suggest that there are two distinct processes governing the diffusion of call types among roosts, with dialect borders acting as barriers to the spread of foreign calls. Such a dialect system could be maintained through either reduced dispersal of birds across dialect boundaries or alternatively, by reduced diffusion of call types. These two possibilities have different implications for the genetic isolation of populations and thus for both speciation and learning. This pattern is broadly similar to those seen in some songbirds and may be maintained in a similar manner.","container-title":"Proceedings of the Royal Society of London. Series B: Biological Sciences","DOI":"10.1098/rspb.1996.0128","issue":"1372","note":"publisher: Royal Society","page":"867-872","source":"royalsocietypublishing.org (Atypon)","title":"Regional dialects in the contact call of a parrot","volume":"263","author":[{"family":"Wright","given":"Timothy F."}],"issued":{"date-parts":[["1996"]]}}}],"schema":"https://github.com/citation-style-language/schema/raw/master/csl-citation.json"} </w:instrText>
       </w:r>
-      <w:ins w:id="74" w:author="Smith Vidaurre, Grace" w:date="2025-05-22T14:25:00Z" w16du:dateUtc="2025-05-22T18:25:00Z">
+      <w:ins w:id="69" w:author="Smith Vidaurre, Grace" w:date="2025-05-22T14:25:00Z" w16du:dateUtc="2025-05-22T18:25:00Z">
         <w:r>
           <w:rPr>
             <w:rFonts w:ascii="Arial" w:hAnsi="Arial" w:cs="Arial"/>
@@ -30250,7 +30307,7 @@
         </w:rPr>
         <w:t>(8,16,40)</w:t>
       </w:r>
-      <w:ins w:id="75" w:author="Smith Vidaurre, Grace" w:date="2025-05-22T14:25:00Z" w16du:dateUtc="2025-05-22T18:25:00Z">
+      <w:ins w:id="70" w:author="Smith Vidaurre, Grace" w:date="2025-05-22T14:25:00Z" w16du:dateUtc="2025-05-22T18:25:00Z">
         <w:r>
           <w:rPr>
             <w:rFonts w:ascii="Arial" w:hAnsi="Arial" w:cs="Arial"/>
@@ -30305,7 +30362,7 @@
         </w:rPr>
         <w:instrText xml:space="preserve"> ADDIN ZOTERO_ITEM CSL_CITATION {"citationID":"QExVee5W","properties":{"formattedCitation":"(5,19)","plainCitation":"(5,19)","noteIndex":0},"citationItems":[{"id":527,"uris":["http://zotero.org/groups/5786507/items/M5RQLYC2"],"itemData":{"id":527,"type":"article-journal","abstract":"Contact calls function to coordinate movements in a wide variety of social animals. Where population density is high, visibility is low and repeated interactions occur between known social companions, calls are often individually recognizable. Parrots are highly social and make substantial daily movements, which appear to be mediated through contact calling. However, there is little experimental evidence for how free-ranging parrots recognize social companions. We quantified intra- and interindividual variation of contact calls in a banded population of green-rumped parrotlets in Venezuela. Recordings of a sample of males were made on replicate days as they announced their return to incubating mates. Spectrographic structure of these contact calls showed significantly more variation between than within individuals, and calls could be correctly classified to individuals more often than was expected by chance. Males varied across multiple dimensions simultaneously, including duration, frequency and frequency modulation of contact calls. Playback experiments showed that free-ranging female parrotlets responded significantly more often to their mates’ calls than to calls of males of other nests. Mate recognition via contact calls may be selectively advantageous during incubation and brooding if this reduces the potential costs associated with confusing contact calls of mates with those of nonmates, including infanticidal conspecifics.","container-title":"Animal Behaviour","DOI":"10.1016/j.anbehav.2010.10.012","ISSN":"0003-3472","issue":"1","journalAbbreviation":"Animal Behaviour","page":"241-248","source":"ScienceDirect","title":"Contact calls are used for individual mate recognition in free-ranging green-rumped parrotlets, &lt;i&gt;Forpus passerinus&lt;/i&gt;","volume":"81","author":[{"family":"Berg","given":"Karl S."},{"family":"Delgado","given":"Soraya"},{"family":"Okawa","given":"Rae"},{"family":"Beissinger","given":"Steven R."},{"family":"Bradbury","given":"Jack W."}],"issued":{"date-parts":[["2011",1,1]]}}},{"id":457,"uris":["http://zotero.org/users/6722993/items/YUE44IAR"],"itemData":{"id":457,"type":"article-journal","abstract":"In humans, identity is partly encoded in a voice-print that is carried across multiple vocalizations. Other species also signal vocal identity in calls, such as shown in the contact call of parrots. However, it remains unclear to what extent other call types in parrots are individually distinct, and whether there is an analogous voice-print across calls. Here we test if an individual signature is present in other call types, how stable this signature is, and if parrots exhibit voice-prints across call types. We recorded 5599 vocalizations from 229 individually marked monk parakeets (\n              Myiopsitta monachus\n              ) over a 2-year period in Barcelona, Spain. We examined five distinct call types, finding evidence for an individual signature in three. We further show that in the contact call, while birds are individually distinct, the calls are more variable than previously assumed, changing over short time scales (seconds to minutes). Finally, we provide evidence for voice-prints across multiple call types, with a discriminant function being able to predict caller identity across call types. This suggests that monk parakeets may be able to use vocal cues to recognize conspecifics, even across vocalization types and without necessarily needing active vocal signatures of identity.","container-title":"Royal Society Open Science","DOI":"10.1098/rsos.230835","ISSN":"2054-5703","issue":"10","journalAbbreviation":"R. Soc. open sci.","language":"en","page":"230835","source":"DOI.org (Crossref)","title":"Evidence for vocal signatures and voice-prints in a wild parrot","volume":"10","author":[{"family":"Smeele","given":"Simeon Q."},{"family":"Senar","given":"Juan Carlos"},{"family":"Aplin","given":"Lucy M."},{"family":"McElreath","given":"Mary Brooke"}],"issued":{"date-parts":[["2023",10]]}}}],"schema":"https://github.com/citation-style-language/schema/raw/master/csl-citation.json"} </w:instrText>
       </w:r>
-      <w:ins w:id="76" w:author="Smith Vidaurre, Grace" w:date="2025-05-22T14:25:00Z" w16du:dateUtc="2025-05-22T18:25:00Z">
+      <w:ins w:id="71" w:author="Smith Vidaurre, Grace" w:date="2025-05-22T14:25:00Z" w16du:dateUtc="2025-05-22T18:25:00Z">
         <w:r>
           <w:rPr>
             <w:rFonts w:ascii="Arial" w:hAnsi="Arial" w:cs="Arial"/>
@@ -30319,7 +30376,7 @@
         </w:rPr>
         <w:t>(5,19)</w:t>
       </w:r>
-      <w:ins w:id="77" w:author="Smith Vidaurre, Grace" w:date="2025-05-22T14:25:00Z" w16du:dateUtc="2025-05-22T18:25:00Z">
+      <w:ins w:id="72" w:author="Smith Vidaurre, Grace" w:date="2025-05-22T14:25:00Z" w16du:dateUtc="2025-05-22T18:25:00Z">
         <w:r>
           <w:rPr>
             <w:rFonts w:ascii="Arial" w:hAnsi="Arial" w:cs="Arial"/>
@@ -30378,7 +30435,7 @@
         </w:rPr>
         <w:instrText xml:space="preserve"> ADDIN ZOTERO_ITEM CSL_CITATION {"citationID":"s1eocdJz","properties":{"formattedCitation":"(8,17,19,40,42\\uc0\\u8211{}44)","plainCitation":"(8,17,19,40,42–44)","noteIndex":0},"citationItems":[{"id":534,"uris":["http://zotero.org/groups/5786507/items/DLH8HEV6"],"itemData":{"id":534,"type":"article-journal","abstract":"Vocal learning, in which animals modify their vocalizations based on social experience, has evolved in several lineages of mammals and birds, including humans. Despite much attention, the question of how this key cognitive trait has evolved remains unanswered. The motor theory for the origin of vocal learning posits that neural centres specialized for vocal learning arose from adjacent areas in the brain devoted to general motor learning. One prediction of this hypothesis is that visual displays that rely on complex motor patterns may also be learned in taxa with vocal learning. While learning of both spoken and gestural languages is well documented in humans, the occurrence of learned visual displays has rarely been examined in non-human animals. We tested for geographical variation consistent with learning of visual displays in long-billed hermits (Phaethornis longirostris), a lek-mating hummingbird that, like humans, has both learned vocalizations and elaborate visual displays. We found lek-level signatures in both vocal parameters and visual display features, including display element proportions, sequence syntax and fine-scale parameters of elements. This variation was not associated with genetic differentiation between leks. In the absence of genetic differences, geographical variation in vocal signals at small scales is most parsimoniously attributed to learning, suggesting a significant role of social learning in visual display ontogeny. The co-occurrence of learning in vocal and visual displays would be consistent with a parallel evolution of these two signal modalities in this species.","container-title":"Proceedings of the Royal Society B: Biological Sciences","DOI":"10.1098/rspb.2019.0666","issue":"1903","note":"Enter Notes Here!","page":"20190666","source":"royalsocietypublishing.org (Atypon)","title":"Social group signatures in hummingbird displays provide evidence of co-occurrence of vocal and visual learning","volume":"286","author":[{"family":"Araya-Salas","given":"Marcelo"},{"family":"Smith-Vidaurre","given":"Grace"},{"family":"Mennill","given":"Daniel J."},{"family":"González-Gómez","given":"Paulina L."},{"family":"Cahill","given":"James"},{"family":"Wright","given":"Timothy F."}],"issued":{"date-parts":[["2019",5,29]]}}},{"id":532,"uris":["http://zotero.org/groups/5786507/items/LRNJKMW3"],"itemData":{"id":532,"type":"article-journal","abstract":"The budgerigar, a small species of parrot, can learn new vocalizations throughout life and is therefore widely used as a model system for studying various aspects of vocal learning. It is not known, however, why parrots imitate sounds. To test the hypothesis that vocal imitation in budgerigars is related to pair bonding, we recorded approximately 100 contact calls from each of nine male and nine female adult budgerigars that were unfamiliar with one another and then placed them into pairs. We sampled their contact call repertoire weekly and conducted twice-weekly behavioural observation sessions. We compared contact calls by sonagram cross-correlation and classified them by means of a hierarchical clustering algorithm. This analysis showed that all pairs developed a shared call within an average of 2.1 weeks. Further analysis revealed that eight of the nine male budgerigars imitated the contact calls of their assigned mates, while none of the females imitated the calls of their males. We conclude that contact call imitation in adult budgerigars probably contributes to pair bond formation and maintenance. Prior studies on budgerigars were limited by the lack of a behavioural paradigm to elicit vocal imitation reliably. Our study remedies this and thereby serves as a foundation for future studies on vocal learning in adult animals.","container-title":"Animal Behaviour","DOI":"10.1006/anbe.1999.1438","ISSN":"0003-3472","issue":"6","journalAbbreviation":"Animal Behaviour","page":"1209-1218","source":"ScienceDirect","title":"Male vocal imitation produces call convergence during pair bonding in budgerigars, &lt;i&gt;Melopsittacus undulatus&lt;/i&gt;","volume":"59","author":[{"family":"Hile","given":"Arla G."},{"family":"Plummer","given":"Thane K."},{"family":"Striedter","given":"Georg F."}],"issued":{"date-parts":[["2000",6,1]]}}},{"id":549,"uris":["http://zotero.org/groups/5786507/items/2IUAEEP4"],"itemData":{"id":549,"type":"article-journal","abstract":"Few mammalian species produce vocalizations that are as richly structured as bird songs, and this greatly restricts the capacity for information transfer. Syntactically complex mammalian vocalizations have been previously studied only in primates, ...","container-title":"Proceedings of the Royal Society B: Biological Sciences","DOI":"10.1098/rspb.2012.0322","issue":"1740","language":"en","note":"PMID: 22513862","page":"2974","source":"pmc.ncbi.nlm.nih.gov","title":"Syntactic structure and geographical dialects in the songs of male rock hyraxes","volume":"279","author":[{"family":"Kershenbaum","given":"Arik"},{"family":"Ilany","given":"Amiyaal"},{"family":"Blaustein","given":"Leon"},{"family":"Geffen","given":"Eli"}],"issued":{"date-parts":[["2012",4,18]]}}},{"id":524,"uris":["http://zotero.org/groups/5786507/items/Y6Z8SCP6"],"itemData":{"id":524,"type":"article-journal","abstract":"Bird song often varies geographically within a species; when this geographic variation has distinct boundaries, the shared song types are referred to as song dialects. How dialects are produced and their adaptive significance are longstanding problems in biology, with implications for the role of culture in the evolution and ecology of diverse organisms, including humans. Here we test the hypothesis that song dialect, a culturally transmitted trait, is related to the population genetic structure of mountain white-crowned sparrows (Zonotrichia leucophrys oriantha). To address this, we compared microsatellite allele frequencies from 18 sample sites representing eight dialect regions in the Sierra Nevada. Pairwise genetic distances were not significantly correlated with geographic distances either within or between dialects, nor did dialect groups form distinct genetic groups according to neighbor-joining or UPGMA analysis, and most variation in allele frequencies occurred among individuals rather than at higher levels. However, most of the remaining variation was attributable to differences among, rather than within, dialect regions, and this among-dialect component of variance was statistically significant. Moreover, when controlling for the effect of geographic distance, song dissimilarity and genetic distance between site pairs were significantly correlated. Thus, song dialects appear to be associated with reductions in, but not strict barriers to, gene flow among dialect regions.","container-title":"Evolution","DOI":"10.1111/j.0014-3820.2001.tb00769.x","ISSN":"1558-5646","issue":"12","language":"en","note":"_eprint: https://onlinelibrary.wiley.com/doi/pdf/10.1111/j.0014-3820.2001.tb00769.x","page":"2568-2575","source":"Wiley Online Library","title":"Cultural and Genetic Evolution in Mountain White-Crowned Sparrows: Song Dialects Are Associated with Population Structure","title-short":"Cultural and Genetic Evolution in Mountain White-Crowned Sparrows","volume":"55","author":[{"family":"MacDougall-Shackleton","given":"Elizabeth A."},{"family":"MacDougall-Shackleton","given":"Scott A."}],"issued":{"date-parts":[["2001"]]}}},{"id":457,"uris":["http://zotero.org/users/6722993/items/YUE44IAR"],"itemData":{"id":457,"type":"article-journal","abstract":"In humans, identity is partly encoded in a voice-print that is carried across multiple vocalizations. Other species also signal vocal identity in calls, such as shown in the contact call of parrots. However, it remains unclear to what extent other call types in parrots are individually distinct, and whether there is an analogous voice-print across calls. Here we test if an individual signature is present in other call types, how stable this signature is, and if parrots exhibit voice-prints across call types. We recorded 5599 vocalizations from 229 individually marked monk parakeets (\n              Myiopsitta monachus\n              ) over a 2-year period in Barcelona, Spain. We examined five distinct call types, finding evidence for an individual signature in three. We further show that in the contact call, while birds are individually distinct, the calls are more variable than previously assumed, changing over short time scales (seconds to minutes). Finally, we provide evidence for voice-prints across multiple call types, with a discriminant function being able to predict caller identity across call types. This suggests that monk parakeets may be able to use vocal cues to recognize conspecifics, even across vocalization types and without necessarily needing active vocal signatures of identity.","container-title":"Royal Society Open Science","DOI":"10.1098/rsos.230835","ISSN":"2054-5703","issue":"10","journalAbbreviation":"R. Soc. open sci.","language":"en","page":"230835","source":"DOI.org (Crossref)","title":"Evidence for vocal signatures and voice-prints in a wild parrot","volume":"10","author":[{"family":"Smeele","given":"Simeon Q."},{"family":"Senar","given":"Juan Carlos"},{"family":"Aplin","given":"Lucy M."},{"family":"McElreath","given":"Mary Brooke"}],"issued":{"date-parts":[["2023",10]]}}},{"id":542,"uris":["http://zotero.org/groups/5786507/items/E7IVATDZ"],"itemData":{"id":542,"type":"article-journal","abstract":"Animals can actively encode different types of identity information in learned communication signals, such as group membership or individual identity. The social environments in which animals interact may favor different types of information, but whether identity information conveyed in learned signals is robust or responsive to social disruption over short evolutionary timescales is not well understood. We inferred the type of identity information that was most salient in vocal signals by combining computational tools, including supervised machine learning, with a conceptual framework of “hierarchical mapping”, or patterns of relative acoustic convergence across social scales. We used populations of a vocal learning species as a natural experiment to test whether the type of identity information emphasized in learned vocalizations changed in populations that experienced the social disruption of introduction into new parts of the world. We compared the social scales with the most salient identity information among native and introduced range monk parakeet (Myiopsitta monachus) calls recorded in Uruguay and the United States, respectively. We also evaluated whether the identity information emphasized in introduced range calls changed over time. To place our findings in an evolutionary context, we compared our results with another parrot species that exhibits well-established and distinctive regional vocal dialects that are consistent with signaling group identity. We found that both native and introduced range monk parakeet calls displayed the strongest convergence at the individual scale and minimal convergence within sites. We did not identify changes in the strength of acoustic convergence within sites over time in the introduced range calls. These results indicate that the individual identity information in learned vocalizations did not change over short evolutionary timescales in populations that experienced the social disruption of introduction. Our findings point to exciting new research directions about the robustness or responsiveness of communication systems over different evolutionary timescales.","container-title":"PLOS Computational Biology","DOI":"10.1371/journal.pcbi.1011231","ISSN":"1553-7358","issue":"7","journalAbbreviation":"PLOS Computational Biology","language":"en","note":"publisher: Public Library of Science","page":"e1011231","source":"PLoS Journals","title":"Individual identity information persists in learned calls of introduced parrot populations","volume":"19","author":[{"family":"Smith-Vidaurre","given":"Grace"},{"family":"Pérez-Marrufo","given":"Valeria"},{"family":"Hobson","given":"Elizabeth A."},{"family":"Salinas-Melgoza","given":"Alejandro"},{"family":"Wright","given":"Timothy F."}],"issued":{"date-parts":[["2023",7,27]]}}},{"id":519,"uris":["http://zotero.org/groups/5786507/items/CYI2BRGH"],"itemData":{"id":519,"type":"article-journal","abstract":"This study describes a system of regional dialects in the contact call of a parrot, the yellow-naped amazon (Amazona auropalliata.) Spectrographic cross-correlation analyses of calls from multiple adults at 16 roosts in Costa Rica reveal two distinct patterns of geographic variation in call structure: first, variation in the basic structure of the call by which roosts can be classified into three distinct dialects, and second, fine-scale variation of call structure among roosts within a dialect. Some birds at roosts bordering two dialects use the calls of both neighbouring dialects interchangeably. These results suggest that there are two distinct processes governing the diffusion of call types among roosts, with dialect borders acting as barriers to the spread of foreign calls. Such a dialect system could be maintained through either reduced dispersal of birds across dialect boundaries or alternatively, by reduced diffusion of call types. These two possibilities have different implications for the genetic isolation of populations and thus for both speciation and learning. This pattern is broadly similar to those seen in some songbirds and may be maintained in a similar manner.","container-title":"Proceedings of the Royal Society of London. Series B: Biological Sciences","DOI":"10.1098/rspb.1996.0128","issue":"1372","note":"publisher: Royal Society","page":"867-872","source":"royalsocietypublishing.org (Atypon)","title":"Regional dialects in the contact call of a parrot","volume":"263","author":[{"family":"Wright","given":"Timothy F."}],"issued":{"date-parts":[["1996"]]}}}],"schema":"https://github.com/citation-style-language/schema/raw/master/csl-citation.json"} </w:instrText>
       </w:r>
-      <w:ins w:id="78" w:author="Smith Vidaurre, Grace" w:date="2025-05-22T14:25:00Z" w16du:dateUtc="2025-05-22T18:25:00Z">
+      <w:ins w:id="73" w:author="Smith Vidaurre, Grace" w:date="2025-05-22T14:25:00Z" w16du:dateUtc="2025-05-22T18:25:00Z">
         <w:r>
           <w:rPr>
             <w:rFonts w:ascii="Arial" w:hAnsi="Arial" w:cs="Arial"/>
@@ -30393,7 +30450,7 @@
         </w:rPr>
         <w:t>(8,17,19,40,42–44)</w:t>
       </w:r>
-      <w:ins w:id="79" w:author="Smith Vidaurre, Grace" w:date="2025-05-22T14:25:00Z" w16du:dateUtc="2025-05-22T18:25:00Z">
+      <w:ins w:id="74" w:author="Smith Vidaurre, Grace" w:date="2025-05-22T14:25:00Z" w16du:dateUtc="2025-05-22T18:25:00Z">
         <w:r>
           <w:rPr>
             <w:rFonts w:ascii="Arial" w:hAnsi="Arial" w:cs="Arial"/>
@@ -30419,7 +30476,7 @@
         </w:rPr>
         <w:instrText xml:space="preserve"> ADDIN ZOTERO_ITEM CSL_CITATION {"citationID":"2snwsYTn","properties":{"formattedCitation":"(25)","plainCitation":"(25)","noteIndex":0},"citationItems":[{"id":544,"uris":["http://zotero.org/groups/5786507/items/WJJ2WCSZ"],"itemData":{"id":544,"type":"article-journal","abstract":"Many animals communicate using sequences of discrete acoustic elements which can be complex, vary in their degree of stereotypy, and are potentially open-ended. Variation in sequences can provide important ecological, behavioural or evolutionary information about the structure and connectivity of populations, mechanisms for vocal cultural evolution and the underlying drivers responsible for these processes. Various mathematical techniques have been used to form a realistic approximation of sequence similarity for such tasks. Here, we use both simulated and empirical data sets from animal vocal sequences (rock hyrax, Procavia capensis; humpback whale, Megaptera novaeangliae; bottlenose dolphin, Tursiops truncatus; and Carolina chickadee, Poecile carolinensis) to test which of eight sequence analysis metrics are more likely to reconstruct the information encoded in the sequences, and to test the fidelity of estimation of model parameters, when the sequences are assumed to conform to particular statistical models. Results from the simulated data indicated that multiple metrics were equally successful in reconstructing the information encoded in the sequences of simulated individuals (Markov chains, n-gram models, repeat distribution and edit distance) and data generated by different stochastic processes (entropy rate and n-grams). However, the string edit (Levenshtein) distance performed consistently and significantly better than all other tested metrics (including entropy, Markov chains, n-grams, mutual information) for all empirical data sets, despite being less commonly used in the field of animal acoustic communication. The Levenshtein distance metric provides a robust analytical approach that should be considered in the comparison of animal acoustic sequences in preference to other commonly employed techniques (such as Markov chains, hidden Markov models or Shannon entropy). The recent discovery that non-Markovian vocal sequences may be more common in animal communication than previously thought provides a rich area for future research that requires non-Markovian-based analysis techniques to investigate animal grammars and potentially the origin of human language.","container-title":"Methods in Ecology and Evolution","DOI":"10.1111/2041-210X.12433","ISSN":"2041-210X","issue":"12","language":"en","license":"© 2015 The Authors. Methods in Ecology and Evolution © 2015 British Ecological Society","note":"_eprint: https://onlinelibrary.wiley.com/doi/pdf/10.1111/2041-210X.12433","page":"1452-1461","source":"Wiley Online Library","title":"Quantifying similarity in animal vocal sequences: which metric performs best?","title-short":"Quantifying similarity in animal vocal sequences","volume":"6","author":[{"family":"Kershenbaum","given":"Arik"},{"family":"Garland","given":"Ellen C."}],"issued":{"date-parts":[["2015"]]}}}],"schema":"https://github.com/citation-style-language/schema/raw/master/csl-citation.json"} </w:instrText>
       </w:r>
-      <w:ins w:id="80" w:author="Smith Vidaurre, Grace" w:date="2025-05-22T14:25:00Z" w16du:dateUtc="2025-05-22T18:25:00Z">
+      <w:ins w:id="75" w:author="Smith Vidaurre, Grace" w:date="2025-05-22T14:25:00Z" w16du:dateUtc="2025-05-22T18:25:00Z">
         <w:r>
           <w:rPr>
             <w:rFonts w:ascii="Arial" w:hAnsi="Arial" w:cs="Arial"/>
@@ -30433,7 +30490,7 @@
         </w:rPr>
         <w:t>(25)</w:t>
       </w:r>
-      <w:ins w:id="81" w:author="Smith Vidaurre, Grace" w:date="2025-05-22T14:25:00Z" w16du:dateUtc="2025-05-22T18:25:00Z">
+      <w:ins w:id="76" w:author="Smith Vidaurre, Grace" w:date="2025-05-22T14:25:00Z" w16du:dateUtc="2025-05-22T18:25:00Z">
         <w:r>
           <w:rPr>
             <w:rFonts w:ascii="Arial" w:hAnsi="Arial" w:cs="Arial"/>
@@ -30459,7 +30516,7 @@
         </w:rPr>
         <w:instrText xml:space="preserve"> ADDIN ZOTERO_ITEM CSL_CITATION {"citationID":"6lLKLqvW","properties":{"formattedCitation":"(45\\uc0\\u8211{}47)","plainCitation":"(45–47)","noteIndex":0},"citationItems":[{"id":557,"uris":["http://zotero.org/groups/5786507/items/P6GI7R7M"],"itemData":{"id":557,"type":"article-journal","abstract":"Recent theory in animal communication predicts that a group’s communicative complexity is connected to its social complexity. Social complexity has typically been measured using group size as an index, with larger groups thought to be more complex than smaller groups. However, group size alone does not account for other social differences that could influence the diversity of interactions within a group that may influence communication. In this study, we asked if other social factors could influence communicative behavior in groups by testing the influence of group composition in the Carolina chickadees, Poecile carolinensis. We recorded the vocal behavior of four wild-caught captive groups of familiar chickadees (birds caught from the same naturally occurring flock) and four wild-caught captive groups of unfamiliar chickadees (birds caught from all different naturally occurring flocks) and then analyzed vocalizations by assessing the note types birds used in their chickadee calls. Flocks of familiar chickadees used fewer introductory notes, more C notes, and fewer hybrid notes in their calls compared to flocks of unfamiliar chickadees. Communicative complexity, measured by zero- and first-order uncertainty, did not differ between conditions. We conclude that note composition of call, but not call complexity, varies with flock-mate familiarity.","container-title":"acta ethologica","DOI":"10.1007/s10211-019-00308-8","ISSN":"1437-9546","issue":"1","journalAbbreviation":"acta ethol","language":"en","page":"73-77","source":"Springer Link","title":"Flock-mate familiarity affects note composition of chickadee calls","volume":"22","author":[{"family":"Coppinger","given":"Brittany A."},{"family":"Davis","given":"Jordon E."},{"family":"Freeberg","given":"Todd M."}],"issued":{"date-parts":[["2019",2,1]]}}},{"id":552,"uris":["http://zotero.org/groups/5786507/items/HWTLRMW5"],"itemData":{"id":552,"type":"article-journal","abstract":"One hypothesis to explain variation in vocal communication in animal species is that the complexity of the social group influences the group's vocal complexity. This social-complexity hypothesis for communication is also central to recent arguments regarding the origins of human language, but experimental tests of the hypothesis are lacking. This study investigated whether group size, a fundamental component of social complexity, influences the complexity of a call functioning in the social organization of Carolina chickadees, Poecile carolinensis. In unmanipulated field settings, calls of individuals in larger groups had greater complexity (more information) than calls of individuals in smaller groups. In aviary settings manipulating group size, individuals in larger groups used calls with greater complexity than individuals in smaller groups. These results indicate that social complexity can influence communicative complexity in this species.","container-title":"Psychological Science","DOI":"10.1111/j.1467-9280.2006.01743.x","ISSN":"0956-7976","issue":"7","journalAbbreviation":"Psychol Sci","language":"en","note":"publisher: SAGE Publications Inc","page":"557-561","source":"SAGE Journals","title":"Social Complexity Can Drive Vocal Complexity: Group Size Influences Vocal Information in Carolina Chickadees","title-short":"Social Complexity Can Drive Vocal Complexity","volume":"17","author":[{"family":"Freeberg","given":"Todd M."}],"issued":{"date-parts":[["2006",7,1]]}}},{"id":553,"uris":["http://zotero.org/groups/5786507/items/RZJC7U4H"],"itemData":{"id":553,"type":"article-journal","abstract":"The chick-a-dee call of chickadees, tits, and titmice is a vocal system used in a wide range of social contexts by both sexes throughout the year and is one of the more structurally complicated vocal systems outside of human language. Relatively little is known about the chick-a-dee calls of mountain chickadees, Poecile gambeli, however. This is an important species for increasing our comparative understanding of variation in chick-a-dee calls as they are one of the chickadee species with the largest naturally occurring flock sizes. Flock size relates to the social complexity of flocks, and the social complexity hypothesis for communication predicts that individuals in more complex social groups should communicate with greater complexity than individuals in simpler social groups. Correlational and experimental evidence in support of the hypothesis has been found in the calls of a wide range of species, including Carolina chickadees, P. carolinensis. Here, we provide the first description of the variation in note composition and note-ordering rules in calls from mountain chickadee flocks in California and Colorado. California flocks were found to be significantly larger than Colorado flocks. Analysis of note-type usage and transition probabilities between note types found that calls of California birds were more complex than calls of Colorado birds, supporting a key prediction of the social complexity hypothesis for communication. We also found relatively high rates of reversals of note-ordering rules in mountain chickadee calls, which might help explain the complexity of the chick-a-dee calls of this species. Additionally, birds in flight produced calls with different note compositions when compared to perched birds. Generally, the note-type ordering and transition probabilities of calls of mountain chickadees seem comparable to other better-studied chickadee species, although their frequent note-type order rule reversals suggest potential syntax-like properties in this call system.","container-title":"Ethology","DOI":"10.1111/eth.13523","ISSN":"1439-0310","issue":"n/a","language":"en","license":"© 2024 Wiley-VCH GmbH.","note":"_eprint: https://onlinelibrary.wiley.com/doi/pdf/10.1111/eth.13523","page":"e13523","source":"Wiley Online Library","title":"Complexity in Chick-a-Dee Calls of Mountain Chickadees (Poecile gambeli): Call Variation Associated With Flock Size and Flight","title-short":"Complexity in Chick-a-Dee Calls of Mountain Chickadees (Poecile gambeli)","volume":"n/a","author":[{"family":"Selman","given":"Zaharia A."},{"family":"Freeberg","given":"Todd M."}],"issued":{"date-parts":[["2024"]]}}}],"schema":"https://github.com/citation-style-language/schema/raw/master/csl-citation.json"} </w:instrText>
       </w:r>
-      <w:ins w:id="82" w:author="Smith Vidaurre, Grace" w:date="2025-05-22T14:25:00Z" w16du:dateUtc="2025-05-22T18:25:00Z">
+      <w:ins w:id="77" w:author="Smith Vidaurre, Grace" w:date="2025-05-22T14:25:00Z" w16du:dateUtc="2025-05-22T18:25:00Z">
         <w:r>
           <w:rPr>
             <w:rFonts w:ascii="Arial" w:hAnsi="Arial" w:cs="Arial"/>
@@ -30474,7 +30531,7 @@
         </w:rPr>
         <w:t>(45–47)</w:t>
       </w:r>
-      <w:ins w:id="83" w:author="Smith Vidaurre, Grace" w:date="2025-05-22T14:25:00Z" w16du:dateUtc="2025-05-22T18:25:00Z">
+      <w:ins w:id="78" w:author="Smith Vidaurre, Grace" w:date="2025-05-22T14:25:00Z" w16du:dateUtc="2025-05-22T18:25:00Z">
         <w:r>
           <w:rPr>
             <w:rFonts w:ascii="Arial" w:hAnsi="Arial" w:cs="Arial"/>
@@ -30500,7 +30557,7 @@
         </w:rPr>
         <w:instrText xml:space="preserve"> ADDIN ZOTERO_ITEM CSL_CITATION {"citationID":"lezW3oo8","properties":{"formattedCitation":"(48)","plainCitation":"(48)","noteIndex":0},"citationItems":[{"id":548,"uris":["http://zotero.org/groups/5786507/items/A5VUHZAH"],"itemData":{"id":548,"type":"article-journal","container-title":"Bioacoustics","DOI":"10.1080/09524622.2013.850040","ISSN":"0952-4622","issue":"3","note":"publisher: Taylor &amp; Francis","page":"195-208","source":"tandfonline.com (Atypon)","title":"Entropy rate as a measure of animal vocal complexity","volume":"23","author":[{"family":"Kershenbaum","given":"Arik"}],"issued":{"date-parts":[["2014",9,2]]}}}],"schema":"https://github.com/citation-style-language/schema/raw/master/csl-citation.json"} </w:instrText>
       </w:r>
-      <w:ins w:id="84" w:author="Smith Vidaurre, Grace" w:date="2025-05-22T14:25:00Z" w16du:dateUtc="2025-05-22T18:25:00Z">
+      <w:ins w:id="79" w:author="Smith Vidaurre, Grace" w:date="2025-05-22T14:25:00Z" w16du:dateUtc="2025-05-22T18:25:00Z">
         <w:r>
           <w:rPr>
             <w:rFonts w:ascii="Arial" w:hAnsi="Arial" w:cs="Arial"/>
@@ -30514,7 +30571,7 @@
         </w:rPr>
         <w:t>(48)</w:t>
       </w:r>
-      <w:ins w:id="85" w:author="Smith Vidaurre, Grace" w:date="2025-05-22T14:25:00Z" w16du:dateUtc="2025-05-22T18:25:00Z">
+      <w:ins w:id="80" w:author="Smith Vidaurre, Grace" w:date="2025-05-22T14:25:00Z" w16du:dateUtc="2025-05-22T18:25:00Z">
         <w:r>
           <w:rPr>
             <w:rFonts w:ascii="Arial" w:hAnsi="Arial" w:cs="Arial"/>
@@ -30527,12 +30584,12 @@
           </w:rPr>
           <w:t xml:space="preserve">. </w:t>
         </w:r>
-        <w:commentRangeEnd w:id="66"/>
+        <w:commentRangeEnd w:id="61"/>
         <w:r>
           <w:rPr>
             <w:rStyle w:val="CommentReference"/>
           </w:rPr>
-          <w:commentReference w:id="66"/>
+          <w:commentReference w:id="61"/>
         </w:r>
       </w:ins>
     </w:p>
@@ -30541,7 +30598,7 @@
         <w:spacing w:line="480" w:lineRule="auto"/>
         <w:ind w:firstLine="720"/>
         <w:rPr>
-          <w:ins w:id="86" w:author="Smith Vidaurre, Grace" w:date="2025-05-22T14:34:00Z" w16du:dateUtc="2025-05-22T18:34:00Z"/>
+          <w:ins w:id="81" w:author="Smith Vidaurre, Grace" w:date="2025-05-22T14:34:00Z" w16du:dateUtc="2025-05-22T18:34:00Z"/>
           <w:rFonts w:ascii="Arial" w:hAnsi="Arial" w:cs="Arial"/>
         </w:rPr>
       </w:pPr>
@@ -30551,11 +30608,11 @@
         <w:spacing w:line="480" w:lineRule="auto"/>
         <w:ind w:firstLine="720"/>
         <w:rPr>
-          <w:ins w:id="87" w:author="Smith Vidaurre, Grace" w:date="2025-05-22T14:34:00Z" w16du:dateUtc="2025-05-22T18:34:00Z"/>
-          <w:rFonts w:ascii="Arial" w:hAnsi="Arial" w:cs="Arial"/>
-        </w:rPr>
-      </w:pPr>
-      <w:ins w:id="88" w:author="Smith Vidaurre, Grace" w:date="2025-05-22T14:34:00Z" w16du:dateUtc="2025-05-22T18:34:00Z">
+          <w:ins w:id="82" w:author="Smith Vidaurre, Grace" w:date="2025-05-22T14:34:00Z" w16du:dateUtc="2025-05-22T18:34:00Z"/>
+          <w:rFonts w:ascii="Arial" w:hAnsi="Arial" w:cs="Arial"/>
+        </w:rPr>
+      </w:pPr>
+      <w:ins w:id="83" w:author="Smith Vidaurre, Grace" w:date="2025-05-22T14:34:00Z" w16du:dateUtc="2025-05-22T18:34:00Z">
         <w:r>
           <w:rPr>
             <w:rFonts w:ascii="Arial" w:hAnsi="Arial" w:cs="Arial"/>
@@ -30575,7 +30632,7 @@
         </w:rPr>
         <w:instrText xml:space="preserve"> ADDIN ZOTERO_ITEM CSL_CITATION {"citationID":"52ZdWyjM","properties":{"formattedCitation":"(3,6)","plainCitation":"(3,6)","noteIndex":0},"citationItems":[{"id":569,"uris":["http://zotero.org/groups/5786507/items/JNKBUUG2"],"itemData":{"id":569,"type":"article-journal","container-title":"PNAS","issue":"21","page":"8293-8297","title":"Signature whistle shape conveys identity information to bottlenose dolphins","volume":"103","author":[{"family":"Janik","given":"Vincent M."},{"family":"Sayigh","given":"L.S."},{"family":"Wells","given":"R.S."}],"issued":{"date-parts":[["2006"]]}}},{"id":516,"uris":["http://zotero.org/groups/5786507/items/UDE4QNQH"],"itemData":{"id":516,"type":"article-journal","abstract":"Learned song is among the best-studied models of animal communication. In oscine songbirds, where learned song is most prevalent, it is used primarily for intrasexual selection and mate attraction. Learning of a different class of vocal signals, known as contact calls, is found in a diverse array of species, where they are used to mediate social interactions among individuals. We argue that call learning provides a taxonomically rich system for studying testable hypotheses for the evolutionary origins of vocal learning. We describe and critically evaluate four nonmutually exclusive hypotheses for the origin and current function of vocal learning of calls, which propose that call learning (1) improves auditory detection and recognition, (2) signals local knowledge, (3) signals group membership, or (4) allows for the encoding of more complex social information. We propose approaches to testing these four hypotheses but emphasize that all of them share the idea that social living, not sexual selection, is a central driver of vocal learning. Finally, we identify future areas for research on call learning that could provide new perspectives on the origins and mechanisms of vocal learning in both animals and humans.","container-title":"Animal Behaviour","DOI":"10.1016/j.anbehav.2016.07.031","ISSN":"0003-3472","journalAbbreviation":"Animal Behaviour","page":"163-172","source":"ScienceDirect","title":"Social calls provide novel insights into the evolution of vocal learning","volume":"120","author":[{"family":"Sewall","given":"Kendra B."},{"family":"Young","given":"Anna M."},{"family":"Wright","given":"Timothy F."}],"issued":{"date-parts":[["2016",10,1]]}}}],"schema":"https://github.com/citation-style-language/schema/raw/master/csl-citation.json"} </w:instrText>
       </w:r>
-      <w:ins w:id="89" w:author="Smith Vidaurre, Grace" w:date="2025-05-22T14:34:00Z" w16du:dateUtc="2025-05-22T18:34:00Z">
+      <w:ins w:id="84" w:author="Smith Vidaurre, Grace" w:date="2025-05-22T14:34:00Z" w16du:dateUtc="2025-05-22T18:34:00Z">
         <w:r>
           <w:rPr>
             <w:rFonts w:ascii="Arial" w:hAnsi="Arial" w:cs="Arial"/>
@@ -30589,7 +30646,7 @@
         </w:rPr>
         <w:t>(3,6)</w:t>
       </w:r>
-      <w:ins w:id="90" w:author="Smith Vidaurre, Grace" w:date="2025-05-22T14:34:00Z" w16du:dateUtc="2025-05-22T18:34:00Z">
+      <w:ins w:id="85" w:author="Smith Vidaurre, Grace" w:date="2025-05-22T14:34:00Z" w16du:dateUtc="2025-05-22T18:34:00Z">
         <w:r>
           <w:rPr>
             <w:rFonts w:ascii="Arial" w:hAnsi="Arial" w:cs="Arial"/>
@@ -30602,19 +30659,19 @@
           </w:rPr>
           <w:t>(</w:t>
         </w:r>
-        <w:commentRangeStart w:id="91"/>
+        <w:commentRangeStart w:id="86"/>
         <w:r>
           <w:rPr>
             <w:rFonts w:ascii="Arial" w:hAnsi="Arial" w:cs="Arial"/>
           </w:rPr>
           <w:t>CITE</w:t>
         </w:r>
-        <w:commentRangeEnd w:id="91"/>
+        <w:commentRangeEnd w:id="86"/>
         <w:r>
           <w:rPr>
             <w:rStyle w:val="CommentReference"/>
           </w:rPr>
-          <w:commentReference w:id="91"/>
+          <w:commentReference w:id="86"/>
         </w:r>
         <w:r>
           <w:rPr>
@@ -30635,7 +30692,7 @@
         </w:rPr>
         <w:instrText xml:space="preserve"> ADDIN ZOTERO_ITEM CSL_CITATION {"citationID":"QcL3xsZA","properties":{"formattedCitation":"(1\\uc0\\u8211{}4)","plainCitation":"(1–4)","noteIndex":0},"citationItems":[{"id":510,"uris":["http://zotero.org/groups/5786507/items/52VSTK8F"],"itemData":{"id":510,"type":"article-journal","abstract":"The capacity to learn novel vocalizations has evolved convergently in a wide range of species. Courtship songs of male birds or whales are often treated as prototypical examples, implying a sexually selected context for the evolution of this ability. However, functions of learned vocalizations in different species are far more diverse than courtship, spanning a range of socio-positive contexts from individual identification, social cohesion, or advertising pair bonds, as well as agonistic contexts such as territorial defence, deceptive alarm calling or luring prey. Here, we survey the diverse usages and proposed functions of learned novel signals, to build a framework for considering the evolution of vocal learning capacities that extends beyond sexual selection. For each function that can be identified for learned signals, we provide examples of species using unlearned signals to accomplish the same goals. We use such comparisons to generate hypotheses concerning when vocal learning is adaptive, given a particular suite of socio-ecological traits. Finally, we identify areas of uncertainty where improved understanding would allow us to better test these hypotheses. Considering the broad range of potential functions of vocal learning will yield a richer appreciation of its evolution than a narrow focus on a few prototypical species.\nThis article is part of the theme issue ‘Vocal learning in animals and humans’.","container-title":"Philosophical Transactions of the Royal Society B: Biological Sciences","DOI":"10.1098/rstb.2020.0235","issue":"1836","note":"publisher: Royal Society","page":"20200235","source":"royalsocietypublishing.org (Atypon)","title":"The many functions of vocal learning","volume":"376","author":[{"family":"Carouso-Peck","given":"Samantha"},{"family":"Goldstein","given":"Michael H."},{"family":"Fitch","given":"W. Tecumseh"}],"issued":{"date-parts":[["2021",9,6]]}}},{"id":514,"uris":["http://zotero.org/groups/5786507/items/V3B289AB"],"itemData":{"id":514,"type":"article-journal","abstract":"Vocal learning, in which animals modify their vocalizations to imitate those of others, has evolved independently in scattered lineages of birds and mammals. Comparative evidence supports two hypotheses for the selective advantages leading to the origin of vocal learning. The sexual selection hypothesis proposes that vocal learning evolves to allow expansion of vocal repertoires in response to mating preferences for more complex vocalizations. The information-sharing hypothesis also proposes that vocal learning evolves to allow expansion of vocal repertoires, but in this case in response to kin selection favoring sharing of information among relatives.","collection-title":"SI: Communication and language","container-title":"Current Opinion in Neurobiology","DOI":"10.1016/j.conb.2014.06.007","ISSN":"0959-4388","journalAbbreviation":"Current Opinion in Neurobiology","page":"48-53","source":"ScienceDirect","title":"The evolution of vocal learning","volume":"28","author":[{"family":"Nowicki","given":"Stephen"},{"family":"Searcy","given":"William A"}],"issued":{"date-parts":[["2014",10,1]]}}},{"id":516,"uris":["http://zotero.org/groups/5786507/items/UDE4QNQH"],"itemData":{"id":516,"type":"article-journal","abstract":"Learned song is among the best-studied models of animal communication. In oscine songbirds, where learned song is most prevalent, it is used primarily for intrasexual selection and mate attraction. Learning of a different class of vocal signals, known as contact calls, is found in a diverse array of species, where they are used to mediate social interactions among individuals. We argue that call learning provides a taxonomically rich system for studying testable hypotheses for the evolutionary origins of vocal learning. We describe and critically evaluate four nonmutually exclusive hypotheses for the origin and current function of vocal learning of calls, which propose that call learning (1) improves auditory detection and recognition, (2) signals local knowledge, (3) signals group membership, or (4) allows for the encoding of more complex social information. We propose approaches to testing these four hypotheses but emphasize that all of them share the idea that social living, not sexual selection, is a central driver of vocal learning. Finally, we identify future areas for research on call learning that could provide new perspectives on the origins and mechanisms of vocal learning in both animals and humans.","container-title":"Animal Behaviour","DOI":"10.1016/j.anbehav.2016.07.031","ISSN":"0003-3472","journalAbbreviation":"Animal Behaviour","page":"163-172","source":"ScienceDirect","title":"Social calls provide novel insights into the evolution of vocal learning","volume":"120","author":[{"family":"Sewall","given":"Kendra B."},{"family":"Young","given":"Anna M."},{"family":"Wright","given":"Timothy F."}],"issued":{"date-parts":[["2016",10,1]]}}},{"id":576,"uris":["http://zotero.org/groups/5786507/items/PMHBWC4S"],"itemData":{"id":576,"type":"article-journal","abstract":"Vocal learning has evolved independently in several lineages. This complex cognitive trait is commonly treated as binary: species either possess or lack it. This view has been a useful starting place to examine the origins of vocal learning, but is also incomplete and potentially misleading, as specific components of the vocal learning program – such as the timing, extent and nature of what is learned – vary widely among species. In our review we revive an idea first proposed by Beecher and Brenowitz (2005) by describing six dimensions of vocal learning: (1) which vocalizations are learned, (2) how much is learned, (3) when it is learned, (4) who it is learned from, (5) what is the extent of the internal template, and (6) how is the template integrated with social learning and innovation. We then highlight key examples of functional and mechanistic work on each dimension, largely from avian taxa, and discuss how a multi-dimensional framework can accelerate our understanding of why vocal learning has evolved, and how brains became capable of this important behaviour.","container-title":"Neuroscience &amp; Biobehavioral Reviews","DOI":"10.1016/j.neubiorev.2021.02.022","ISSN":"0149-7634","journalAbbreviation":"Neuroscience &amp; Biobehavioral Reviews","page":"328-338","source":"ScienceDirect","title":"Defining the multidimensional phenotype: New opportunities to integrate the behavioral ecology and behavioral neuroscience of vocal learning","title-short":"Defining the multidimensional phenotype","volume":"125","author":[{"family":"Wright","given":"Timothy F."},{"family":"Derryberry","given":"Elizabeth P."}],"issued":{"date-parts":[["2021",6,1]]}}}],"schema":"https://github.com/citation-style-language/schema/raw/master/csl-citation.json"} </w:instrText>
       </w:r>
-      <w:ins w:id="92" w:author="Smith Vidaurre, Grace" w:date="2025-05-22T14:34:00Z" w16du:dateUtc="2025-05-22T18:34:00Z">
+      <w:ins w:id="87" w:author="Smith Vidaurre, Grace" w:date="2025-05-22T14:34:00Z" w16du:dateUtc="2025-05-22T18:34:00Z">
         <w:r>
           <w:rPr>
             <w:rFonts w:ascii="Arial" w:hAnsi="Arial" w:cs="Arial"/>
@@ -30650,7 +30707,7 @@
         </w:rPr>
         <w:t>(1–4)</w:t>
       </w:r>
-      <w:ins w:id="93" w:author="Smith Vidaurre, Grace" w:date="2025-05-22T14:34:00Z" w16du:dateUtc="2025-05-22T18:34:00Z">
+      <w:ins w:id="88" w:author="Smith Vidaurre, Grace" w:date="2025-05-22T14:34:00Z" w16du:dateUtc="2025-05-22T18:34:00Z">
         <w:r>
           <w:rPr>
             <w:rFonts w:ascii="Arial" w:hAnsi="Arial" w:cs="Arial"/>
@@ -30670,7 +30727,7 @@
         <w:spacing w:line="480" w:lineRule="auto"/>
         <w:ind w:firstLine="720"/>
         <w:rPr>
-          <w:ins w:id="94" w:author="Smith Vidaurre, Grace" w:date="2025-05-22T14:35:00Z" w16du:dateUtc="2025-05-22T18:35:00Z"/>
+          <w:ins w:id="89" w:author="Smith Vidaurre, Grace" w:date="2025-05-22T14:35:00Z" w16du:dateUtc="2025-05-22T18:35:00Z"/>
           <w:rFonts w:ascii="Arial" w:hAnsi="Arial" w:cs="Arial"/>
         </w:rPr>
       </w:pPr>
@@ -30680,11 +30737,11 @@
         <w:spacing w:line="480" w:lineRule="auto"/>
         <w:ind w:firstLine="720"/>
         <w:rPr>
-          <w:ins w:id="95" w:author="Smith Vidaurre, Grace" w:date="2025-06-05T09:40:00Z" w16du:dateUtc="2025-06-05T13:40:00Z"/>
-          <w:rFonts w:ascii="Arial" w:hAnsi="Arial" w:cs="Arial"/>
-        </w:rPr>
-      </w:pPr>
-      <w:ins w:id="96" w:author="Smith Vidaurre, Grace" w:date="2025-05-22T14:35:00Z" w16du:dateUtc="2025-05-22T18:35:00Z">
+          <w:ins w:id="90" w:author="Smith Vidaurre, Grace" w:date="2025-06-05T09:40:00Z" w16du:dateUtc="2025-06-05T13:40:00Z"/>
+          <w:rFonts w:ascii="Arial" w:hAnsi="Arial" w:cs="Arial"/>
+        </w:rPr>
+      </w:pPr>
+      <w:ins w:id="91" w:author="Smith Vidaurre, Grace" w:date="2025-05-22T14:35:00Z" w16du:dateUtc="2025-05-22T18:35:00Z">
         <w:r>
           <w:rPr>
             <w:rFonts w:ascii="Arial" w:hAnsi="Arial" w:cs="Arial"/>
@@ -30734,7 +30791,7 @@
         <w:spacing w:line="480" w:lineRule="auto"/>
         <w:ind w:firstLine="720"/>
         <w:rPr>
-          <w:ins w:id="97" w:author="Smith Vidaurre, Grace" w:date="2025-06-05T09:40:00Z" w16du:dateUtc="2025-06-05T13:40:00Z"/>
+          <w:ins w:id="92" w:author="Smith Vidaurre, Grace" w:date="2025-06-05T09:40:00Z" w16du:dateUtc="2025-06-05T13:40:00Z"/>
           <w:rFonts w:ascii="Arial" w:hAnsi="Arial" w:cs="Arial"/>
         </w:rPr>
       </w:pPr>
@@ -30744,11 +30801,11 @@
         <w:spacing w:line="480" w:lineRule="auto"/>
         <w:ind w:firstLine="720"/>
         <w:rPr>
-          <w:ins w:id="98" w:author="Smith Vidaurre, Grace" w:date="2025-06-05T09:40:00Z" w16du:dateUtc="2025-06-05T13:40:00Z"/>
-          <w:rFonts w:ascii="Arial" w:hAnsi="Arial" w:cs="Arial"/>
-        </w:rPr>
-      </w:pPr>
-      <w:ins w:id="99" w:author="Smith Vidaurre, Grace" w:date="2025-06-05T09:40:00Z" w16du:dateUtc="2025-06-05T13:40:00Z">
+          <w:ins w:id="93" w:author="Smith Vidaurre, Grace" w:date="2025-06-05T09:40:00Z" w16du:dateUtc="2025-06-05T13:40:00Z"/>
+          <w:rFonts w:ascii="Arial" w:hAnsi="Arial" w:cs="Arial"/>
+        </w:rPr>
+      </w:pPr>
+      <w:ins w:id="94" w:author="Smith Vidaurre, Grace" w:date="2025-06-05T09:40:00Z" w16du:dateUtc="2025-06-05T13:40:00Z">
         <w:r>
           <w:rPr>
             <w:rFonts w:ascii="Arial" w:hAnsi="Arial" w:cs="Arial"/>
@@ -30827,7 +30884,7 @@
           <w:bCs/>
         </w:rPr>
       </w:pPr>
-      <w:commentRangeStart w:id="100"/>
+      <w:commentRangeStart w:id="95"/>
       <w:r>
         <w:rPr>
           <w:rFonts w:ascii="Arial" w:hAnsi="Arial" w:cs="Arial"/>
@@ -30862,12 +30919,12 @@
         </w:rPr>
         <w:t xml:space="preserve"> therefore may not be assessing the full scope of how information can be encoded across a range of species.</w:t>
       </w:r>
-      <w:commentRangeEnd w:id="100"/>
+      <w:commentRangeEnd w:id="95"/>
       <w:r>
         <w:rPr>
           <w:rStyle w:val="CommentReference"/>
         </w:rPr>
-        <w:commentReference w:id="100"/>
+        <w:commentReference w:id="95"/>
       </w:r>
     </w:p>
     <w:p>
@@ -30883,7 +30940,7 @@
       <w:pPr>
         <w:spacing w:line="360" w:lineRule="auto"/>
         <w:rPr>
-          <w:ins w:id="101" w:author="Smith Vidaurre, Grace" w:date="2025-06-05T09:32:00Z" w16du:dateUtc="2025-06-05T13:32:00Z"/>
+          <w:ins w:id="96" w:author="Smith Vidaurre, Grace" w:date="2025-06-05T09:32:00Z" w16du:dateUtc="2025-06-05T13:32:00Z"/>
           <w:rFonts w:ascii="Arial" w:hAnsi="Arial" w:cs="Arial"/>
         </w:rPr>
       </w:pPr>
@@ -30893,35 +30950,35 @@
         </w:rPr>
         <w:t xml:space="preserve">Several computationally intensive tools have emerged to assess the degree or types of information encoded in </w:t>
       </w:r>
-      <w:commentRangeStart w:id="102"/>
-      <w:commentRangeStart w:id="103"/>
-      <w:commentRangeStart w:id="104"/>
+      <w:commentRangeStart w:id="97"/>
+      <w:commentRangeStart w:id="98"/>
+      <w:commentRangeStart w:id="99"/>
       <w:r>
         <w:rPr>
           <w:rFonts w:ascii="Arial" w:hAnsi="Arial" w:cs="Arial"/>
         </w:rPr>
         <w:t>signals</w:t>
       </w:r>
-      <w:commentRangeEnd w:id="102"/>
+      <w:commentRangeEnd w:id="97"/>
       <w:r>
         <w:rPr>
           <w:rStyle w:val="CommentReference"/>
         </w:rPr>
-        <w:commentReference w:id="102"/>
-      </w:r>
-      <w:commentRangeEnd w:id="103"/>
+        <w:commentReference w:id="97"/>
+      </w:r>
+      <w:commentRangeEnd w:id="98"/>
       <w:r>
         <w:rPr>
           <w:rStyle w:val="CommentReference"/>
         </w:rPr>
-        <w:commentReference w:id="103"/>
-      </w:r>
-      <w:commentRangeEnd w:id="104"/>
+        <w:commentReference w:id="98"/>
+      </w:r>
+      <w:commentRangeEnd w:id="99"/>
       <w:r>
         <w:rPr>
           <w:rStyle w:val="CommentReference"/>
         </w:rPr>
-        <w:commentReference w:id="104"/>
+        <w:commentReference w:id="99"/>
       </w:r>
       <w:r>
         <w:rPr>
@@ -31224,7 +31281,7 @@
       <w:pPr>
         <w:spacing w:line="360" w:lineRule="auto"/>
         <w:rPr>
-          <w:ins w:id="105" w:author="Smith Vidaurre, Grace" w:date="2025-06-05T09:32:00Z" w16du:dateUtc="2025-06-05T13:32:00Z"/>
+          <w:ins w:id="100" w:author="Smith Vidaurre, Grace" w:date="2025-06-05T09:32:00Z" w16du:dateUtc="2025-06-05T13:32:00Z"/>
           <w:rFonts w:ascii="Arial" w:hAnsi="Arial" w:cs="Arial"/>
         </w:rPr>
       </w:pPr>
@@ -31234,11 +31291,11 @@
         <w:spacing w:line="480" w:lineRule="auto"/>
         <w:ind w:firstLine="720"/>
         <w:rPr>
-          <w:ins w:id="106" w:author="Smith Vidaurre, Grace" w:date="2025-06-05T09:32:00Z" w16du:dateUtc="2025-06-05T13:32:00Z"/>
-          <w:rFonts w:ascii="Arial" w:hAnsi="Arial" w:cs="Arial"/>
-        </w:rPr>
-      </w:pPr>
-      <w:ins w:id="107" w:author="Smith Vidaurre, Grace" w:date="2025-06-05T09:32:00Z" w16du:dateUtc="2025-06-05T13:32:00Z">
+          <w:ins w:id="101" w:author="Smith Vidaurre, Grace" w:date="2025-08-04T15:50:00Z" w16du:dateUtc="2025-08-04T19:50:00Z"/>
+          <w:rFonts w:ascii="Arial" w:hAnsi="Arial" w:cs="Arial"/>
+        </w:rPr>
+      </w:pPr>
+      <w:ins w:id="102" w:author="Smith Vidaurre, Grace" w:date="2025-06-05T09:32:00Z" w16du:dateUtc="2025-06-05T13:32:00Z">
         <w:r>
           <w:rPr>
             <w:rFonts w:ascii="Arial" w:hAnsi="Arial" w:cs="Arial"/>
@@ -31288,7 +31345,7 @@
         </w:rPr>
         <w:instrText xml:space="preserve"> ADDIN ZOTERO_ITEM CSL_CITATION {"citationID":"vvuVQ4qs","properties":{"formattedCitation":"(49)","plainCitation":"(49)","noteIndex":0},"citationItems":[{"id":561,"uris":["http://zotero.org/groups/5786507/items/94ZV9WNS"],"itemData":{"id":561,"type":"article-journal","abstract":"&lt;p&gt;Recently developed methods in computational neuroethology have enabled increasingly detailed and comprehensive quantification of animal movements and behavioral kinematics. Vocal communication behavior is well poised for application of similar large-scale quantification methods in the service of physiological and ethological studies. This review describes emerging techniques that can be applied to acoustic and vocal communication signals with the goal of enabling study beyond a small number of model species. We review a range of modern computational methods for bioacoustics, signal processing, and brain-behavior mapping. Along with a discussion of recent advances and techniques, we include challenges and broader goals in establishing a framework for the computational neuroethology of vocal communication.&lt;/p&gt;","container-title":"Frontiers in Behavioral Neuroscience","DOI":"10.3389/fnbeh.2021.811737","ISSN":"1662-5153","journalAbbreviation":"Front. Behav. Neurosci.","language":"English","note":"publisher: Frontiers","source":"Frontiers","title":"Toward a Computational Neuroethology of Vocal Communication: From Bioacoustics to Neurophysiology, Emerging Tools and Future Directions","title-short":"Toward a Computational Neuroethology of Vocal Communication","URL":"https://www.frontiersin.org/journals/behavioral-neuroscience/articles/10.3389/fnbeh.2021.811737/full","volume":"15","author":[{"family":"Sainburg","given":"Tim"},{"family":"Gentner","given":"Timothy Q."}],"accessed":{"date-parts":[["2024",12,17]]},"issued":{"date-parts":[["2021",12,20]]}}}],"schema":"https://github.com/citation-style-language/schema/raw/master/csl-citation.json"} </w:instrText>
       </w:r>
-      <w:ins w:id="108" w:author="Smith Vidaurre, Grace" w:date="2025-06-05T09:32:00Z" w16du:dateUtc="2025-06-05T13:32:00Z">
+      <w:ins w:id="103" w:author="Smith Vidaurre, Grace" w:date="2025-06-05T09:32:00Z" w16du:dateUtc="2025-06-05T13:32:00Z">
         <w:r>
           <w:rPr>
             <w:rFonts w:ascii="Arial" w:hAnsi="Arial" w:cs="Arial"/>
@@ -31302,7 +31359,7 @@
         </w:rPr>
         <w:t>(49)</w:t>
       </w:r>
-      <w:ins w:id="109" w:author="Smith Vidaurre, Grace" w:date="2025-06-05T09:32:00Z" w16du:dateUtc="2025-06-05T13:32:00Z">
+      <w:ins w:id="104" w:author="Smith Vidaurre, Grace" w:date="2025-06-05T09:32:00Z" w16du:dateUtc="2025-06-05T13:32:00Z">
         <w:r>
           <w:rPr>
             <w:rFonts w:ascii="Arial" w:hAnsi="Arial" w:cs="Arial"/>
@@ -31316,6 +31373,75 @@
           <w:t xml:space="preserve">. </w:t>
         </w:r>
       </w:ins>
+    </w:p>
+    <w:p>
+      <w:pPr>
+        <w:spacing w:line="480" w:lineRule="auto"/>
+        <w:ind w:firstLine="720"/>
+        <w:rPr>
+          <w:ins w:id="105" w:author="Smith Vidaurre, Grace" w:date="2025-08-04T15:50:00Z" w16du:dateUtc="2025-08-04T19:50:00Z"/>
+          <w:rFonts w:ascii="Arial" w:hAnsi="Arial" w:cs="Arial"/>
+        </w:rPr>
+      </w:pPr>
+    </w:p>
+    <w:p>
+      <w:pPr>
+        <w:spacing w:line="480" w:lineRule="auto"/>
+        <w:ind w:firstLine="720"/>
+        <w:rPr>
+          <w:ins w:id="106" w:author="Smith Vidaurre, Grace" w:date="2025-06-05T09:32:00Z" w16du:dateUtc="2025-06-05T13:32:00Z"/>
+          <w:rFonts w:ascii="Arial" w:hAnsi="Arial" w:cs="Arial"/>
+        </w:rPr>
+      </w:pPr>
+      <w:commentRangeStart w:id="107"/>
+      <w:r>
+        <w:rPr>
+          <w:rFonts w:ascii="Arial" w:hAnsi="Arial" w:cs="Arial"/>
+        </w:rPr>
+        <w:lastRenderedPageBreak/>
+        <w:t xml:space="preserve">We computed accuracies for vocalizations generated across our synthetic experiments, in which we varied the relative proportion of group and individual information in vocalizations, as well as the size of signal datasets, as a proxy of </w:t>
+      </w:r>
+      <w:proofErr w:type="gramStart"/>
+      <w:r>
+        <w:rPr>
+          <w:rFonts w:ascii="Arial" w:hAnsi="Arial" w:cs="Arial"/>
+        </w:rPr>
+        <w:t>more or less crowded</w:t>
+      </w:r>
+      <w:proofErr w:type="gramEnd"/>
+      <w:r>
+        <w:rPr>
+          <w:rFonts w:ascii="Arial" w:hAnsi="Arial" w:cs="Arial"/>
+        </w:rPr>
+        <w:t xml:space="preserve"> signaling environments</w:t>
+      </w:r>
+      <w:commentRangeEnd w:id="107"/>
+      <w:r>
+        <w:rPr>
+          <w:rStyle w:val="CommentReference"/>
+        </w:rPr>
+        <w:commentReference w:id="107"/>
+      </w:r>
+      <w:r>
+        <w:rPr>
+          <w:rFonts w:ascii="Arial" w:hAnsi="Arial" w:cs="Arial"/>
+        </w:rPr>
+        <w:t xml:space="preserve">. </w:t>
+      </w:r>
+      <w:commentRangeStart w:id="108"/>
+      <w:r>
+        <w:rPr>
+          <w:rFonts w:ascii="Arial" w:hAnsi="Arial" w:cs="Arial"/>
+        </w:rPr>
+        <w:t xml:space="preserve">We used four experimental treatments to encode varying amounts of group to individual information, ranging from all group and no individual information, to all individual and no group information. To simulate variation in the crowdedness of the signaling environment, we also varied the number of classes at each social level over four treatments as well. In each signaling environment treatment, we used the same parameter for number of classes at each social level, as well as the number of calls produced at the individual level. </w:t>
+      </w:r>
+      <w:commentRangeEnd w:id="108"/>
+      <w:r>
+        <w:rPr>
+          <w:rStyle w:val="CommentReference"/>
+        </w:rPr>
+        <w:commentReference w:id="108"/>
+      </w:r>
     </w:p>
     <w:p>
       <w:pPr>
@@ -31933,7 +32059,7 @@
       </w:r>
     </w:p>
   </w:comment>
-  <w:comment w:id="34" w:author="Coppinger, Brittany" w:date="2025-07-24T11:07:00Z" w:initials="BC">
+  <w:comment w:id="31" w:author="Coppinger, Brittany" w:date="2025-04-04T10:17:00Z" w:initials="BC">
     <w:p>
       <w:pPr>
         <w:pStyle w:val="CommentText"/>
@@ -31945,11 +32071,11 @@
         <w:annotationRef/>
       </w:r>
       <w:r>
-        <w:t>Do we want this paragraph here? It seems out of place, and belongs in the section where we actually manipulate the number of social classes signals are generated in?</w:t>
+        <w:t>Make labels not bold</w:t>
       </w:r>
     </w:p>
   </w:comment>
-  <w:comment w:id="36" w:author="Coppinger, Brittany" w:date="2025-07-24T11:30:00Z" w:initials="BC">
+  <w:comment w:id="32" w:author="Coppinger, Brittany" w:date="2025-04-10T16:02:00Z" w:initials="BC">
     <w:p>
       <w:pPr>
         <w:pStyle w:val="CommentText"/>
@@ -31961,11 +32087,11 @@
         <w:annotationRef/>
       </w:r>
       <w:r>
-        <w:t>This is repetitive to what we have in the paragraph above, I think we should remove it</w:t>
+        <w:t>Maybe I should organize this like the graph? So, different tables for Edit distance and SPCC?</w:t>
       </w:r>
     </w:p>
   </w:comment>
-  <w:comment w:id="37" w:author="Coppinger, Brittany" w:date="2025-07-24T11:31:00Z" w:initials="BC">
+  <w:comment w:id="33" w:author="Coppinger, Brittany" w:date="2025-05-14T12:12:00Z" w:initials="BC">
     <w:p>
       <w:pPr>
         <w:pStyle w:val="CommentText"/>
@@ -31977,15 +32103,12 @@
         <w:annotationRef/>
       </w:r>
       <w:r>
-        <w:t xml:space="preserve">I think this is too much methods detail for the results section? I think we should delete it from here and make sure it is included in the methods only. </w:t>
+        <w:t>TKTK I can reorganize this to better reflect the organization of the density plots</w:t>
       </w:r>
     </w:p>
   </w:comment>
-  <w:comment w:id="38" w:author="Coppinger, Brittany" w:date="2025-04-04T10:17:00Z" w:initials="BC">
+  <w:comment w:id="34" w:author="Smith Vidaurre, Grace" w:date="2025-06-04T10:51:00Z" w:initials="GSV">
     <w:p>
-      <w:pPr>
-        <w:pStyle w:val="CommentText"/>
-      </w:pPr>
       <w:r>
         <w:rPr>
           <w:rStyle w:val="CommentReference"/>
@@ -31993,15 +32116,16 @@
         <w:annotationRef/>
       </w:r>
       <w:r>
-        <w:t>Make labels not bold</w:t>
+        <w:rPr>
+          <w:sz w:val="20"/>
+          <w:szCs w:val="20"/>
+        </w:rPr>
+        <w:t>Let’s move the table to the supplement instead</w:t>
       </w:r>
     </w:p>
   </w:comment>
-  <w:comment w:id="40" w:author="Coppinger, Brittany" w:date="2025-04-10T16:02:00Z" w:initials="BC">
+  <w:comment w:id="35" w:author="Smith Vidaurre, Grace" w:date="2025-06-04T10:51:00Z" w:initials="GSV">
     <w:p>
-      <w:pPr>
-        <w:pStyle w:val="CommentText"/>
-      </w:pPr>
       <w:r>
         <w:rPr>
           <w:rStyle w:val="CommentReference"/>
@@ -32009,11 +32133,15 @@
         <w:annotationRef/>
       </w:r>
       <w:r>
-        <w:t>Maybe I should organize this like the graph? So, different tables for Edit distance and SPCC?</w:t>
+        <w:rPr>
+          <w:sz w:val="20"/>
+          <w:szCs w:val="20"/>
+        </w:rPr>
+        <w:t>A note for later: This needs to be linked to the stochasticity of string generation mentioned in the Introduction</w:t>
       </w:r>
     </w:p>
   </w:comment>
-  <w:comment w:id="41" w:author="Coppinger, Brittany" w:date="2025-05-14T12:12:00Z" w:initials="BC">
+  <w:comment w:id="36" w:author="Coppinger, Brittany" w:date="2025-04-10T16:25:00Z" w:initials="BC">
     <w:p>
       <w:pPr>
         <w:pStyle w:val="CommentText"/>
@@ -32025,11 +32153,107 @@
         <w:annotationRef/>
       </w:r>
       <w:r>
-        <w:t>TKTK I can reorganize this to better reflect the organization of the density plots</w:t>
+        <w:t xml:space="preserve">I feel like this part is current weak and needs more reference to outside literature. </w:t>
       </w:r>
     </w:p>
   </w:comment>
-  <w:comment w:id="42" w:author="Smith Vidaurre, Grace" w:date="2025-06-04T10:51:00Z" w:initials="GSV">
+  <w:comment w:id="37" w:author="Coppinger, Brittany" w:date="2025-07-24T14:15:00Z" w:initials="BC">
+    <w:p>
+      <w:pPr>
+        <w:pStyle w:val="CommentText"/>
+      </w:pPr>
+      <w:r>
+        <w:rPr>
+          <w:rStyle w:val="CommentReference"/>
+        </w:rPr>
+        <w:annotationRef/>
+      </w:r>
+      <w:r>
+        <w:t>Should we add a little sentence somewhere in the discussion that acknowledges that this approach works to simulate information encoding in frequency modulation patterns only?</w:t>
+      </w:r>
+    </w:p>
+  </w:comment>
+  <w:comment w:id="38" w:author="Coppinger, Brittany" w:date="2025-07-24T14:04:00Z" w:initials="BC">
+    <w:p>
+      <w:pPr>
+        <w:pStyle w:val="CommentText"/>
+      </w:pPr>
+      <w:r>
+        <w:rPr>
+          <w:rStyle w:val="CommentReference"/>
+        </w:rPr>
+        <w:annotationRef/>
+      </w:r>
+      <w:r>
+        <w:t>The original comment was accidentally deleted, but Grace, you wanted to move this information to the discussion, and I think here is a good place to put it?</w:t>
+      </w:r>
+    </w:p>
+  </w:comment>
+  <w:comment w:id="40" w:author="Coppinger, Brittany" w:date="2025-02-13T14:09:00Z" w:initials="BC">
+    <w:p>
+      <w:pPr>
+        <w:pStyle w:val="CommentText"/>
+      </w:pPr>
+      <w:r>
+        <w:rPr>
+          <w:rStyle w:val="CommentReference"/>
+        </w:rPr>
+        <w:annotationRef/>
+      </w:r>
+      <w:r>
+        <w:t>Before submitting, need to double and triple check all final numbers/ratios/conditions</w:t>
+      </w:r>
+    </w:p>
+  </w:comment>
+  <w:comment w:id="39" w:author="Coppinger, Brittany" w:date="2025-04-04T12:58:00Z" w:initials="BC">
+    <w:p>
+      <w:pPr>
+        <w:pStyle w:val="CommentText"/>
+      </w:pPr>
+      <w:r>
+        <w:rPr>
+          <w:rStyle w:val="CommentReference"/>
+        </w:rPr>
+        <w:annotationRef/>
+      </w:r>
+      <w:r>
+        <w:t>Whole section needs to move after discussion for submission to PLOS comp bio</w:t>
+      </w:r>
+    </w:p>
+  </w:comment>
+  <w:comment w:id="41" w:author="Summer Eckhardt" w:date="2025-01-24T09:51:00Z" w:initials="SE">
+    <w:p>
+      <w:pPr>
+        <w:pStyle w:val="CommentText"/>
+      </w:pPr>
+      <w:r>
+        <w:rPr>
+          <w:rStyle w:val="CommentReference"/>
+        </w:rPr>
+        <w:annotationRef/>
+      </w:r>
+      <w:r>
+        <w:t>Not necessary, but just an idea: maybe could be interesting to create some graphic to show the breakdown of the string for a nice visual reference?</w:t>
+      </w:r>
+    </w:p>
+  </w:comment>
+  <w:comment w:id="42" w:author="Summer Eckhardt" w:date="2025-01-27T10:41:00Z" w:initials="SE">
+    <w:p>
+      <w:pPr>
+        <w:pStyle w:val="CommentText"/>
+      </w:pPr>
+      <w:r>
+        <w:rPr>
+          <w:rStyle w:val="CommentReference"/>
+        </w:rPr>
+        <w:annotationRef/>
+      </w:r>
+      <w:r>
+        <w:t>((Grace had a drawing depicting the breakdown on one of the boards in the lab and it helped it make sense to me very quickly!))</w:t>
+      </w:r>
+    </w:p>
+  </w:comment>
+  <w:comment w:id="43" w:author="Smith Vidaurre, Grace" w:date="2025-06-17T11:53:00Z" w:initials="SVG">
     <w:p>
       <w:r>
         <w:rPr>
@@ -32042,11 +32266,11 @@
           <w:sz w:val="20"/>
           <w:szCs w:val="20"/>
         </w:rPr>
-        <w:t>Let’s move the table to the supplement instead</w:t>
+        <w:t>Beecher, M. D. (1989). Signalling systems for individual recognition: an information theory approach. Animal Behaviour, 38(2), 248-261.</w:t>
       </w:r>
     </w:p>
   </w:comment>
-  <w:comment w:id="43" w:author="Smith Vidaurre, Grace" w:date="2025-06-04T10:51:00Z" w:initials="GSV">
+  <w:comment w:id="46" w:author="Smith Vidaurre, Grace" w:date="2025-08-04T15:39:00Z" w:initials="SVG">
     <w:p>
       <w:r>
         <w:rPr>
@@ -32059,11 +32283,11 @@
           <w:sz w:val="20"/>
           <w:szCs w:val="20"/>
         </w:rPr>
-        <w:t>A note for later: This needs to be linked to the stochasticity of string generation mentioned in the Introduction</w:t>
+        <w:t xml:space="preserve">Does this section work here? Previously it was included in the Results to attempt setting up expectations </w:t>
       </w:r>
     </w:p>
   </w:comment>
-  <w:comment w:id="44" w:author="Coppinger, Brittany" w:date="2025-04-10T16:25:00Z" w:initials="BC">
+  <w:comment w:id="44" w:author="Coppinger, Brittany" w:date="2025-07-24T11:07:00Z" w:initials="BC">
     <w:p>
       <w:pPr>
         <w:pStyle w:val="CommentText"/>
@@ -32075,15 +32299,12 @@
         <w:annotationRef/>
       </w:r>
       <w:r>
-        <w:t xml:space="preserve">I feel like this part is current weak and needs more reference to outside literature. </w:t>
+        <w:t>Do we want this paragraph here? It seems out of place, and belongs in the section where we actually manipulate the number of social classes signals are generated in?</w:t>
       </w:r>
     </w:p>
   </w:comment>
-  <w:comment w:id="45" w:author="Coppinger, Brittany" w:date="2025-07-24T14:15:00Z" w:initials="BC">
+  <w:comment w:id="45" w:author="Smith Vidaurre, Grace" w:date="2025-08-04T15:37:00Z" w:initials="SVG">
     <w:p>
-      <w:pPr>
-        <w:pStyle w:val="CommentText"/>
-      </w:pPr>
       <w:r>
         <w:rPr>
           <w:rStyle w:val="CommentReference"/>
@@ -32091,11 +32312,15 @@
         <w:annotationRef/>
       </w:r>
       <w:r>
-        <w:t>Should we add a little sentence somewhere in the discussion that acknowledges that this approach works to simulate information encoding in frequency modulation patterns only?</w:t>
+        <w:rPr>
+          <w:sz w:val="20"/>
+          <w:szCs w:val="20"/>
+        </w:rPr>
+        <w:t>What do you think about this placement, to set up expectations for results later?</w:t>
       </w:r>
     </w:p>
   </w:comment>
-  <w:comment w:id="46" w:author="Coppinger, Brittany" w:date="2025-07-24T14:04:00Z" w:initials="BC">
+  <w:comment w:id="47" w:author="Coppinger, Brittany" w:date="2025-04-10T14:31:00Z" w:initials="BC">
     <w:p>
       <w:pPr>
         <w:pStyle w:val="CommentText"/>
@@ -32107,15 +32332,12 @@
         <w:annotationRef/>
       </w:r>
       <w:r>
-        <w:t>The original comment was accidentally deleted, but Grace, you wanted to move this information to the discussion, and I think here is a good place to put it?</w:t>
+        <w:t>Should we say this? We never explicitly tested for it?</w:t>
       </w:r>
     </w:p>
   </w:comment>
-  <w:comment w:id="48" w:author="Coppinger, Brittany" w:date="2025-02-13T14:09:00Z" w:initials="BC">
+  <w:comment w:id="48" w:author="Smith Vidaurre, Grace" w:date="2025-05-28T18:58:00Z" w:initials="GSV">
     <w:p>
-      <w:pPr>
-        <w:pStyle w:val="CommentText"/>
-      </w:pPr>
       <w:r>
         <w:rPr>
           <w:rStyle w:val="CommentReference"/>
@@ -32123,15 +32345,16 @@
         <w:annotationRef/>
       </w:r>
       <w:r>
-        <w:t>Before submitting, need to double and triple check all final numbers/ratios/conditions</w:t>
+        <w:rPr>
+          <w:sz w:val="20"/>
+          <w:szCs w:val="20"/>
+        </w:rPr>
+        <w:t>Yeah I think this is alright to include, and we can allude to the fact that we can use information theory tools in follow up work to track how information is lost through this pipeline</w:t>
       </w:r>
     </w:p>
   </w:comment>
-  <w:comment w:id="47" w:author="Coppinger, Brittany" w:date="2025-04-04T12:58:00Z" w:initials="BC">
+  <w:comment w:id="49" w:author="Smith Vidaurre, Grace" w:date="2025-05-28T19:00:00Z" w:initials="GSV">
     <w:p>
-      <w:pPr>
-        <w:pStyle w:val="CommentText"/>
-      </w:pPr>
       <w:r>
         <w:rPr>
           <w:rStyle w:val="CommentReference"/>
@@ -32139,15 +32362,16 @@
         <w:annotationRef/>
       </w:r>
       <w:r>
-        <w:t>Whole section needs to move after discussion for submission to PLOS comp bio</w:t>
+        <w:rPr>
+          <w:sz w:val="20"/>
+          <w:szCs w:val="20"/>
+        </w:rPr>
+        <w:t>But we can save this for the methods</w:t>
       </w:r>
     </w:p>
   </w:comment>
-  <w:comment w:id="49" w:author="Summer Eckhardt" w:date="2025-01-24T09:51:00Z" w:initials="SE">
+  <w:comment w:id="50" w:author="Smith Vidaurre, Grace" w:date="2025-06-17T12:26:00Z" w:initials="SVG">
     <w:p>
-      <w:pPr>
-        <w:pStyle w:val="CommentText"/>
-      </w:pPr>
       <w:r>
         <w:rPr>
           <w:rStyle w:val="CommentReference"/>
@@ -32155,111 +32379,15 @@
         <w:annotationRef/>
       </w:r>
       <w:r>
-        <w:t>Not necessary, but just an idea: maybe could be interesting to create some graphic to show the breakdown of the string for a nice visual reference?</w:t>
+        <w:rPr>
+          <w:sz w:val="20"/>
+          <w:szCs w:val="20"/>
+        </w:rPr>
+        <w:t>Brittany, is this the version you're using too?</w:t>
       </w:r>
     </w:p>
   </w:comment>
-  <w:comment w:id="50" w:author="Summer Eckhardt" w:date="2025-01-27T10:41:00Z" w:initials="SE">
-    <w:p>
-      <w:pPr>
-        <w:pStyle w:val="CommentText"/>
-      </w:pPr>
-      <w:r>
-        <w:rPr>
-          <w:rStyle w:val="CommentReference"/>
-        </w:rPr>
-        <w:annotationRef/>
-      </w:r>
-      <w:r>
-        <w:t>((Grace had a drawing depicting the breakdown on one of the boards in the lab and it helped it make sense to me very quickly!))</w:t>
-      </w:r>
-    </w:p>
-  </w:comment>
-  <w:comment w:id="51" w:author="Smith Vidaurre, Grace" w:date="2025-06-17T11:53:00Z" w:initials="SVG">
-    <w:p>
-      <w:r>
-        <w:rPr>
-          <w:rStyle w:val="CommentReference"/>
-        </w:rPr>
-        <w:annotationRef/>
-      </w:r>
-      <w:r>
-        <w:rPr>
-          <w:sz w:val="20"/>
-          <w:szCs w:val="20"/>
-        </w:rPr>
-        <w:t>Beecher, M. D. (1989). Signalling systems for individual recognition: an information theory approach. Animal Behaviour, 38(2), 248-261.</w:t>
-      </w:r>
-    </w:p>
-  </w:comment>
-  <w:comment w:id="52" w:author="Coppinger, Brittany" w:date="2025-04-10T14:31:00Z" w:initials="BC">
-    <w:p>
-      <w:pPr>
-        <w:pStyle w:val="CommentText"/>
-      </w:pPr>
-      <w:r>
-        <w:rPr>
-          <w:rStyle w:val="CommentReference"/>
-        </w:rPr>
-        <w:annotationRef/>
-      </w:r>
-      <w:r>
-        <w:t>Should we say this? We never explicitly tested for it?</w:t>
-      </w:r>
-    </w:p>
-  </w:comment>
-  <w:comment w:id="53" w:author="Smith Vidaurre, Grace" w:date="2025-05-28T18:58:00Z" w:initials="GSV">
-    <w:p>
-      <w:r>
-        <w:rPr>
-          <w:rStyle w:val="CommentReference"/>
-        </w:rPr>
-        <w:annotationRef/>
-      </w:r>
-      <w:r>
-        <w:rPr>
-          <w:sz w:val="20"/>
-          <w:szCs w:val="20"/>
-        </w:rPr>
-        <w:t>Yeah I think this is alright to include, and we can allude to the fact that we can use information theory tools in follow up work to track how information is lost through this pipeline</w:t>
-      </w:r>
-    </w:p>
-  </w:comment>
-  <w:comment w:id="54" w:author="Smith Vidaurre, Grace" w:date="2025-05-28T19:00:00Z" w:initials="GSV">
-    <w:p>
-      <w:r>
-        <w:rPr>
-          <w:rStyle w:val="CommentReference"/>
-        </w:rPr>
-        <w:annotationRef/>
-      </w:r>
-      <w:r>
-        <w:rPr>
-          <w:sz w:val="20"/>
-          <w:szCs w:val="20"/>
-        </w:rPr>
-        <w:t>But we can save this for the methods</w:t>
-      </w:r>
-    </w:p>
-  </w:comment>
-  <w:comment w:id="55" w:author="Smith Vidaurre, Grace" w:date="2025-06-17T12:26:00Z" w:initials="SVG">
-    <w:p>
-      <w:r>
-        <w:rPr>
-          <w:rStyle w:val="CommentReference"/>
-        </w:rPr>
-        <w:annotationRef/>
-      </w:r>
-      <w:r>
-        <w:rPr>
-          <w:sz w:val="20"/>
-          <w:szCs w:val="20"/>
-        </w:rPr>
-        <w:t>Brittany, is this the version you're using too?</w:t>
-      </w:r>
-    </w:p>
-  </w:comment>
-  <w:comment w:id="56" w:author="Smith Vidaurre, Grace" w:date="2025-06-17T12:30:00Z" w:initials="SVG">
+  <w:comment w:id="51" w:author="Smith Vidaurre, Grace" w:date="2025-06-17T12:30:00Z" w:initials="SVG">
     <w:p>
       <w:r>
         <w:rPr>
@@ -32277,7 +32405,7 @@
       </w:r>
     </w:p>
   </w:comment>
-  <w:comment w:id="57" w:author="Smith Vidaurre, Grace" w:date="2025-06-17T12:36:00Z" w:initials="SVG">
+  <w:comment w:id="52" w:author="Smith Vidaurre, Grace" w:date="2025-06-17T12:36:00Z" w:initials="SVG">
     <w:p>
       <w:r>
         <w:rPr>
@@ -32294,7 +32422,7 @@
       </w:r>
     </w:p>
   </w:comment>
-  <w:comment w:id="58" w:author="Summer Eckhardt" w:date="2025-02-04T18:49:00Z" w:initials="SE">
+  <w:comment w:id="53" w:author="Summer Eckhardt" w:date="2025-02-04T18:49:00Z" w:initials="SE">
     <w:p>
       <w:pPr>
         <w:pStyle w:val="CommentText"/>
@@ -32310,7 +32438,7 @@
       </w:r>
     </w:p>
   </w:comment>
-  <w:comment w:id="59" w:author="Summer Eckhardt" w:date="2025-02-04T19:02:00Z" w:initials="SE">
+  <w:comment w:id="54" w:author="Summer Eckhardt" w:date="2025-02-04T19:02:00Z" w:initials="SE">
     <w:p>
       <w:pPr>
         <w:pStyle w:val="CommentText"/>
@@ -32326,7 +32454,7 @@
       </w:r>
     </w:p>
   </w:comment>
-  <w:comment w:id="63" w:author="Smith Vidaurre, Grace" w:date="2025-05-22T13:33:00Z" w:initials="GSV">
+  <w:comment w:id="58" w:author="Smith Vidaurre, Grace" w:date="2025-05-22T13:33:00Z" w:initials="GSV">
     <w:p>
       <w:r>
         <w:rPr>
@@ -32343,7 +32471,7 @@
       </w:r>
     </w:p>
   </w:comment>
-  <w:comment w:id="66" w:author="Smith Vidaurre, Grace" w:date="2025-05-22T13:23:00Z" w:initials="GSV">
+  <w:comment w:id="61" w:author="Smith Vidaurre, Grace" w:date="2025-05-22T13:23:00Z" w:initials="GSV">
     <w:p>
       <w:r>
         <w:rPr>
@@ -32360,7 +32488,7 @@
       </w:r>
     </w:p>
   </w:comment>
-  <w:comment w:id="91" w:author="Smith Vidaurre, Grace" w:date="2024-12-18T14:31:00Z" w:initials="GSV">
+  <w:comment w:id="86" w:author="Smith Vidaurre, Grace" w:date="2024-12-18T14:31:00Z" w:initials="GSV">
     <w:p>
       <w:r>
         <w:rPr>
@@ -32377,7 +32505,7 @@
       </w:r>
     </w:p>
   </w:comment>
-  <w:comment w:id="100" w:author="Smith Vidaurre, Grace" w:date="2024-12-18T15:30:00Z" w:initials="GSV">
+  <w:comment w:id="95" w:author="Smith Vidaurre, Grace" w:date="2024-12-18T15:30:00Z" w:initials="GSV">
     <w:p>
       <w:r>
         <w:rPr>
@@ -32394,7 +32522,7 @@
       </w:r>
     </w:p>
   </w:comment>
-  <w:comment w:id="102" w:author="Smith Vidaurre, Grace" w:date="2024-12-16T09:35:00Z" w:initials="GSV">
+  <w:comment w:id="97" w:author="Smith Vidaurre, Grace" w:date="2024-12-16T09:35:00Z" w:initials="GSV">
     <w:p>
       <w:r>
         <w:rPr>
@@ -32411,7 +32539,7 @@
       </w:r>
     </w:p>
   </w:comment>
-  <w:comment w:id="103" w:author="Smith Vidaurre, Grace" w:date="2024-12-16T09:41:00Z" w:initials="GSV">
+  <w:comment w:id="98" w:author="Smith Vidaurre, Grace" w:date="2024-12-16T09:41:00Z" w:initials="GSV">
     <w:p>
       <w:r>
         <w:rPr>
@@ -32428,7 +32556,7 @@
       </w:r>
     </w:p>
   </w:comment>
-  <w:comment w:id="104" w:author="Coppinger, Brittany" w:date="2024-12-16T14:51:00Z" w:initials="BC">
+  <w:comment w:id="99" w:author="Coppinger, Brittany" w:date="2024-12-16T14:51:00Z" w:initials="BC">
     <w:p>
       <w:pPr>
         <w:pStyle w:val="CommentText"/>
@@ -32483,6 +32611,38 @@
       </w:r>
       <w:r>
         <w:t xml:space="preserve"> </w:t>
+      </w:r>
+    </w:p>
+  </w:comment>
+  <w:comment w:id="107" w:author="Coppinger, Brittany" w:date="2025-07-24T11:30:00Z" w:initials="BC">
+    <w:p>
+      <w:pPr>
+        <w:pStyle w:val="CommentText"/>
+      </w:pPr>
+      <w:r>
+        <w:rPr>
+          <w:rStyle w:val="CommentReference"/>
+        </w:rPr>
+        <w:annotationRef/>
+      </w:r>
+      <w:r>
+        <w:t>This is repetitive to what we have in the paragraph above, I think we should remove it</w:t>
+      </w:r>
+    </w:p>
+  </w:comment>
+  <w:comment w:id="108" w:author="Coppinger, Brittany" w:date="2025-07-24T11:31:00Z" w:initials="BC">
+    <w:p>
+      <w:pPr>
+        <w:pStyle w:val="CommentText"/>
+      </w:pPr>
+      <w:r>
+        <w:rPr>
+          <w:rStyle w:val="CommentReference"/>
+        </w:rPr>
+        <w:annotationRef/>
+      </w:r>
+      <w:r>
+        <w:t xml:space="preserve">I think this is too much methods detail for the results section? I think we should delete it from here and make sure it is included in the methods only. </w:t>
       </w:r>
     </w:p>
   </w:comment>
@@ -32519,9 +32679,6 @@
   <w15:commentEx w15:paraId="2D937245" w15:done="0"/>
   <w15:commentEx w15:paraId="62610216" w15:paraIdParent="2D937245" w15:done="0"/>
   <w15:commentEx w15:paraId="77B3F64D" w15:done="1"/>
-  <w15:commentEx w15:paraId="300C5472" w15:done="0"/>
-  <w15:commentEx w15:paraId="0B97E8D0" w15:done="0"/>
-  <w15:commentEx w15:paraId="074DF449" w15:done="0"/>
   <w15:commentEx w15:paraId="79A601E1" w15:done="1"/>
   <w15:commentEx w15:paraId="6D6091F4" w15:done="0"/>
   <w15:commentEx w15:paraId="2CCC2737" w15:paraIdParent="6D6091F4" w15:done="0"/>
@@ -32535,6 +32692,9 @@
   <w15:commentEx w15:paraId="16B4FD0C" w15:done="1"/>
   <w15:commentEx w15:paraId="385C64F1" w15:paraIdParent="16B4FD0C" w15:done="1"/>
   <w15:commentEx w15:paraId="3870DAE2" w15:done="1"/>
+  <w15:commentEx w15:paraId="53BB47D0" w15:done="0"/>
+  <w15:commentEx w15:paraId="25E18CD2" w15:done="1"/>
+  <w15:commentEx w15:paraId="58E4297B" w15:paraIdParent="25E18CD2" w15:done="1"/>
   <w15:commentEx w15:paraId="231ED504" w15:done="1"/>
   <w15:commentEx w15:paraId="70DEBFFC" w15:paraIdParent="231ED504" w15:done="1"/>
   <w15:commentEx w15:paraId="2C7815F7" w15:paraIdParent="231ED504" w15:done="1"/>
@@ -32550,6 +32710,8 @@
   <w15:commentEx w15:paraId="3CFDAF24" w15:done="0"/>
   <w15:commentEx w15:paraId="6B34BC7D" w15:paraIdParent="3CFDAF24" w15:done="0"/>
   <w15:commentEx w15:paraId="612FF208" w15:paraIdParent="3CFDAF24" w15:done="0"/>
+  <w15:commentEx w15:paraId="0DC73A3C" w15:done="0"/>
+  <w15:commentEx w15:paraId="2F11B915" w15:done="0"/>
 </w15:commentsEx>
 </file>
 
@@ -32583,9 +32745,6 @@
   <w16cex:commentExtensible w16cex:durableId="61F67BDC" w16cex:dateUtc="2025-07-24T15:12:00Z"/>
   <w16cex:commentExtensible w16cex:durableId="4428F038" w16cex:dateUtc="2025-08-04T19:20:00Z"/>
   <w16cex:commentExtensible w16cex:durableId="76671A41" w16cex:dateUtc="2025-04-03T18:26:00Z"/>
-  <w16cex:commentExtensible w16cex:durableId="5F7771E2" w16cex:dateUtc="2025-07-24T15:07:00Z"/>
-  <w16cex:commentExtensible w16cex:durableId="5AABDA52" w16cex:dateUtc="2025-07-24T15:30:00Z"/>
-  <w16cex:commentExtensible w16cex:durableId="133064F9" w16cex:dateUtc="2025-07-24T15:31:00Z"/>
   <w16cex:commentExtensible w16cex:durableId="47A53E3D" w16cex:dateUtc="2025-04-04T14:17:00Z"/>
   <w16cex:commentExtensible w16cex:durableId="48F7EAD6" w16cex:dateUtc="2025-04-10T20:02:00Z"/>
   <w16cex:commentExtensible w16cex:durableId="1B9044F9" w16cex:dateUtc="2025-05-14T16:12:00Z"/>
@@ -32611,6 +32770,9 @@
   </w16cex:commentExtensible>
   <w16cex:commentExtensible w16cex:durableId="7F84ABE9" w16cex:dateUtc="2025-01-27T15:41:00Z"/>
   <w16cex:commentExtensible w16cex:durableId="2819D6AF" w16cex:dateUtc="2025-06-17T15:53:00Z"/>
+  <w16cex:commentExtensible w16cex:durableId="70064333" w16cex:dateUtc="2025-08-04T19:39:00Z"/>
+  <w16cex:commentExtensible w16cex:durableId="70358578" w16cex:dateUtc="2025-07-24T15:07:00Z"/>
+  <w16cex:commentExtensible w16cex:durableId="07244674" w16cex:dateUtc="2025-08-04T19:37:00Z"/>
   <w16cex:commentExtensible w16cex:durableId="3F248519" w16cex:dateUtc="2025-04-10T18:31:00Z"/>
   <w16cex:commentExtensible w16cex:durableId="3EF72F62" w16cex:dateUtc="2025-05-28T22:58:00Z"/>
   <w16cex:commentExtensible w16cex:durableId="2EF13616" w16cex:dateUtc="2025-05-28T23:00:00Z"/>
@@ -32626,6 +32788,8 @@
   <w16cex:commentExtensible w16cex:durableId="26234967" w16cex:dateUtc="2024-12-16T14:35:00Z"/>
   <w16cex:commentExtensible w16cex:durableId="02857E53" w16cex:dateUtc="2024-12-16T14:41:00Z"/>
   <w16cex:commentExtensible w16cex:durableId="7C263564" w16cex:dateUtc="2024-12-16T19:51:00Z"/>
+  <w16cex:commentExtensible w16cex:durableId="7D15E348" w16cex:dateUtc="2025-07-24T15:30:00Z"/>
+  <w16cex:commentExtensible w16cex:durableId="781CB1CE" w16cex:dateUtc="2025-07-24T15:31:00Z"/>
 </w16cex:commentsExtensible>
 </file>
 
@@ -32659,9 +32823,6 @@
   <w16cid:commentId w16cid:paraId="2D937245" w16cid:durableId="61F67BDC"/>
   <w16cid:commentId w16cid:paraId="62610216" w16cid:durableId="4428F038"/>
   <w16cid:commentId w16cid:paraId="77B3F64D" w16cid:durableId="76671A41"/>
-  <w16cid:commentId w16cid:paraId="300C5472" w16cid:durableId="5F7771E2"/>
-  <w16cid:commentId w16cid:paraId="0B97E8D0" w16cid:durableId="5AABDA52"/>
-  <w16cid:commentId w16cid:paraId="074DF449" w16cid:durableId="133064F9"/>
   <w16cid:commentId w16cid:paraId="79A601E1" w16cid:durableId="47A53E3D"/>
   <w16cid:commentId w16cid:paraId="6D6091F4" w16cid:durableId="48F7EAD6"/>
   <w16cid:commentId w16cid:paraId="2CCC2737" w16cid:durableId="1B9044F9"/>
@@ -32675,6 +32836,9 @@
   <w16cid:commentId w16cid:paraId="16B4FD0C" w16cid:durableId="0B7A3DFC"/>
   <w16cid:commentId w16cid:paraId="385C64F1" w16cid:durableId="7F84ABE9"/>
   <w16cid:commentId w16cid:paraId="3870DAE2" w16cid:durableId="2819D6AF"/>
+  <w16cid:commentId w16cid:paraId="53BB47D0" w16cid:durableId="70064333"/>
+  <w16cid:commentId w16cid:paraId="25E18CD2" w16cid:durableId="70358578"/>
+  <w16cid:commentId w16cid:paraId="58E4297B" w16cid:durableId="07244674"/>
   <w16cid:commentId w16cid:paraId="231ED504" w16cid:durableId="3F248519"/>
   <w16cid:commentId w16cid:paraId="70DEBFFC" w16cid:durableId="3EF72F62"/>
   <w16cid:commentId w16cid:paraId="2C7815F7" w16cid:durableId="2EF13616"/>
@@ -32690,6 +32854,8 @@
   <w16cid:commentId w16cid:paraId="3CFDAF24" w16cid:durableId="26234967"/>
   <w16cid:commentId w16cid:paraId="6B34BC7D" w16cid:durableId="02857E53"/>
   <w16cid:commentId w16cid:paraId="612FF208" w16cid:durableId="7C263564"/>
+  <w16cid:commentId w16cid:paraId="0DC73A3C" w16cid:durableId="7D15E348"/>
+  <w16cid:commentId w16cid:paraId="2F11B915" w16cid:durableId="781CB1CE"/>
 </w16cid:commentsIds>
 </file>
 

</xml_diff>

<commit_message>
Updated 1st paragraph of Discussion
</commit_message>
<xml_diff>
--- a/drafts/paRsynth_methods_draft.docx
+++ b/drafts/paRsynth_methods_draft.docx
@@ -470,7 +470,25 @@
           <w:sz w:val="24"/>
           <w:szCs w:val="24"/>
         </w:rPr>
-        <w:t>, Northhampton, MA, USA</w:t>
+        <w:t xml:space="preserve">, </w:t>
+      </w:r>
+      <w:proofErr w:type="spellStart"/>
+      <w:r>
+        <w:rPr>
+          <w:rFonts w:ascii="Arial" w:hAnsi="Arial" w:cs="Arial"/>
+          <w:sz w:val="24"/>
+          <w:szCs w:val="24"/>
+        </w:rPr>
+        <w:t>Northhampton</w:t>
+      </w:r>
+      <w:proofErr w:type="spellEnd"/>
+      <w:r>
+        <w:rPr>
+          <w:rFonts w:ascii="Arial" w:hAnsi="Arial" w:cs="Arial"/>
+          <w:sz w:val="24"/>
+          <w:szCs w:val="24"/>
+        </w:rPr>
+        <w:t>, MA, USA</w:t>
       </w:r>
     </w:p>
     <w:p>
@@ -521,7 +539,25 @@
           <w:sz w:val="24"/>
           <w:szCs w:val="24"/>
         </w:rPr>
-        <w:t>, Northhampton, MA, USA</w:t>
+        <w:t xml:space="preserve">, </w:t>
+      </w:r>
+      <w:proofErr w:type="spellStart"/>
+      <w:r>
+        <w:rPr>
+          <w:rFonts w:ascii="Arial" w:hAnsi="Arial" w:cs="Arial"/>
+          <w:sz w:val="24"/>
+          <w:szCs w:val="24"/>
+        </w:rPr>
+        <w:t>Northhampton</w:t>
+      </w:r>
+      <w:proofErr w:type="spellEnd"/>
+      <w:r>
+        <w:rPr>
+          <w:rFonts w:ascii="Arial" w:hAnsi="Arial" w:cs="Arial"/>
+          <w:sz w:val="24"/>
+          <w:szCs w:val="24"/>
+        </w:rPr>
+        <w:t>, MA, USA</w:t>
       </w:r>
     </w:p>
     <w:p>
@@ -1688,11 +1724,19 @@
         </w:rPr>
         <w:t xml:space="preserve">used </w:t>
       </w:r>
-      <w:r>
-        <w:rPr>
-          <w:rFonts w:ascii="Arial" w:hAnsi="Arial" w:cs="Arial"/>
-        </w:rPr>
-        <w:t xml:space="preserve">Parsons code, a </w:t>
+      <w:proofErr w:type="gramStart"/>
+      <w:r>
+        <w:rPr>
+          <w:rFonts w:ascii="Arial" w:hAnsi="Arial" w:cs="Arial"/>
+        </w:rPr>
+        <w:t>Parsons</w:t>
+      </w:r>
+      <w:proofErr w:type="gramEnd"/>
+      <w:r>
+        <w:rPr>
+          <w:rFonts w:ascii="Arial" w:hAnsi="Arial" w:cs="Arial"/>
+        </w:rPr>
+        <w:t xml:space="preserve"> code, a </w:t>
       </w:r>
       <w:r>
         <w:rPr>
@@ -1734,7 +1778,21 @@
         <w:rPr>
           <w:rFonts w:ascii="Arial" w:hAnsi="Arial" w:cs="Arial"/>
         </w:rPr>
-        <w:t xml:space="preserve"> synthetic frequency-modulated vocalizations with the R package soundgen. </w:t>
+        <w:t xml:space="preserve"> synthetic frequency-modulated vocalizations with the R package </w:t>
+      </w:r>
+      <w:proofErr w:type="spellStart"/>
+      <w:r>
+        <w:rPr>
+          <w:rFonts w:ascii="Arial" w:hAnsi="Arial" w:cs="Arial"/>
+        </w:rPr>
+        <w:t>soundgen</w:t>
+      </w:r>
+      <w:proofErr w:type="spellEnd"/>
+      <w:r>
+        <w:rPr>
+          <w:rFonts w:ascii="Arial" w:hAnsi="Arial" w:cs="Arial"/>
+        </w:rPr>
+        <w:t xml:space="preserve">. </w:t>
       </w:r>
       <w:r>
         <w:rPr>
@@ -3155,13 +3213,23 @@
         </w:rPr>
         <w:t>. Monk parakeets (</w:t>
       </w:r>
+      <w:proofErr w:type="spellStart"/>
       <w:r>
         <w:rPr>
           <w:rFonts w:ascii="Arial" w:hAnsi="Arial" w:cs="Arial"/>
           <w:i/>
           <w:iCs/>
         </w:rPr>
-        <w:t>Myiopsitta monachus</w:t>
+        <w:t>Myiopsitta</w:t>
+      </w:r>
+      <w:proofErr w:type="spellEnd"/>
+      <w:r>
+        <w:rPr>
+          <w:rFonts w:ascii="Arial" w:hAnsi="Arial" w:cs="Arial"/>
+          <w:i/>
+          <w:iCs/>
+        </w:rPr>
+        <w:t xml:space="preserve"> monachus</w:t>
       </w:r>
       <w:r>
         <w:rPr>
@@ -3411,13 +3479,23 @@
         </w:rPr>
         <w:t xml:space="preserve"> call of black-capped chickadees (</w:t>
       </w:r>
+      <w:proofErr w:type="spellStart"/>
       <w:r>
         <w:rPr>
           <w:rFonts w:ascii="Arial" w:hAnsi="Arial" w:cs="Arial"/>
           <w:i/>
           <w:iCs/>
         </w:rPr>
-        <w:t>Poecile atricapillus</w:t>
+        <w:t>Poecile</w:t>
+      </w:r>
+      <w:proofErr w:type="spellEnd"/>
+      <w:r>
+        <w:rPr>
+          <w:rFonts w:ascii="Arial" w:hAnsi="Arial" w:cs="Arial"/>
+          <w:i/>
+          <w:iCs/>
+        </w:rPr>
+        <w:t xml:space="preserve"> atricapillus</w:t>
       </w:r>
       <w:r>
         <w:rPr>
@@ -4314,7 +4392,21 @@
         <w:rPr>
           <w:rFonts w:ascii="Arial" w:hAnsi="Arial" w:cs="Arial"/>
         </w:rPr>
-        <w:t xml:space="preserve">then sonified </w:t>
+        <w:t xml:space="preserve">then </w:t>
+      </w:r>
+      <w:proofErr w:type="spellStart"/>
+      <w:r>
+        <w:rPr>
+          <w:rFonts w:ascii="Arial" w:hAnsi="Arial" w:cs="Arial"/>
+        </w:rPr>
+        <w:t>sonified</w:t>
+      </w:r>
+      <w:proofErr w:type="spellEnd"/>
+      <w:r>
+        <w:rPr>
+          <w:rFonts w:ascii="Arial" w:hAnsi="Arial" w:cs="Arial"/>
+        </w:rPr>
+        <w:t xml:space="preserve"> </w:t>
       </w:r>
       <w:r>
         <w:rPr>
@@ -4957,7 +5049,21 @@
         <w:rPr>
           <w:rFonts w:ascii="Arial" w:hAnsi="Arial" w:cs="Arial"/>
         </w:rPr>
-        <w:t xml:space="preserve"> and individually-specific information</w:t>
+        <w:t xml:space="preserve"> and </w:t>
+      </w:r>
+      <w:proofErr w:type="gramStart"/>
+      <w:r>
+        <w:rPr>
+          <w:rFonts w:ascii="Arial" w:hAnsi="Arial" w:cs="Arial"/>
+        </w:rPr>
+        <w:t>individually-specific</w:t>
+      </w:r>
+      <w:proofErr w:type="gramEnd"/>
+      <w:r>
+        <w:rPr>
+          <w:rFonts w:ascii="Arial" w:hAnsi="Arial" w:cs="Arial"/>
+        </w:rPr>
+        <w:t xml:space="preserve"> information</w:t>
       </w:r>
       <w:r>
         <w:rPr>
@@ -4969,7 +5075,21 @@
         <w:rPr>
           <w:rFonts w:ascii="Arial" w:hAnsi="Arial" w:cs="Arial"/>
         </w:rPr>
-        <w:t xml:space="preserve"> we converted characters to Parsons code, </w:t>
+        <w:t xml:space="preserve"> we converted characters to </w:t>
+      </w:r>
+      <w:proofErr w:type="gramStart"/>
+      <w:r>
+        <w:rPr>
+          <w:rFonts w:ascii="Arial" w:hAnsi="Arial" w:cs="Arial"/>
+        </w:rPr>
+        <w:t>Parsons</w:t>
+      </w:r>
+      <w:proofErr w:type="gramEnd"/>
+      <w:r>
+        <w:rPr>
+          <w:rFonts w:ascii="Arial" w:hAnsi="Arial" w:cs="Arial"/>
+        </w:rPr>
+        <w:t xml:space="preserve"> code, </w:t>
       </w:r>
       <w:r>
         <w:rPr>
@@ -4999,7 +5119,21 @@
         <w:rPr>
           <w:rFonts w:ascii="Arial" w:hAnsi="Arial" w:cs="Arial"/>
         </w:rPr>
-        <w:t xml:space="preserve"> we used Parsons code to</w:t>
+        <w:t xml:space="preserve"> we used </w:t>
+      </w:r>
+      <w:proofErr w:type="gramStart"/>
+      <w:r>
+        <w:rPr>
+          <w:rFonts w:ascii="Arial" w:hAnsi="Arial" w:cs="Arial"/>
+        </w:rPr>
+        <w:t>Parsons</w:t>
+      </w:r>
+      <w:proofErr w:type="gramEnd"/>
+      <w:r>
+        <w:rPr>
+          <w:rFonts w:ascii="Arial" w:hAnsi="Arial" w:cs="Arial"/>
+        </w:rPr>
+        <w:t xml:space="preserve"> code to</w:t>
       </w:r>
       <w:r>
         <w:rPr>
@@ -5011,7 +5145,21 @@
         <w:rPr>
           <w:rFonts w:ascii="Arial" w:hAnsi="Arial" w:cs="Arial"/>
         </w:rPr>
-        <w:t xml:space="preserve">. Fourth, we sonified </w:t>
+        <w:t xml:space="preserve">. Fourth, we </w:t>
+      </w:r>
+      <w:proofErr w:type="spellStart"/>
+      <w:r>
+        <w:rPr>
+          <w:rFonts w:ascii="Arial" w:hAnsi="Arial" w:cs="Arial"/>
+        </w:rPr>
+        <w:t>sonified</w:t>
+      </w:r>
+      <w:proofErr w:type="spellEnd"/>
+      <w:r>
+        <w:rPr>
+          <w:rFonts w:ascii="Arial" w:hAnsi="Arial" w:cs="Arial"/>
+        </w:rPr>
+        <w:t xml:space="preserve"> </w:t>
       </w:r>
       <w:r>
         <w:rPr>
@@ -5019,11 +5167,33 @@
         </w:rPr>
         <w:t xml:space="preserve">character strings with </w:t>
       </w:r>
-      <w:r>
-        <w:rPr>
-          <w:rFonts w:ascii="Arial" w:hAnsi="Arial" w:cs="Arial"/>
-        </w:rPr>
-        <w:t>with the soundgen R package</w:t>
+      <w:proofErr w:type="spellStart"/>
+      <w:r>
+        <w:rPr>
+          <w:rFonts w:ascii="Arial" w:hAnsi="Arial" w:cs="Arial"/>
+        </w:rPr>
+        <w:t>with</w:t>
+      </w:r>
+      <w:proofErr w:type="spellEnd"/>
+      <w:r>
+        <w:rPr>
+          <w:rFonts w:ascii="Arial" w:hAnsi="Arial" w:cs="Arial"/>
+        </w:rPr>
+        <w:t xml:space="preserve"> the </w:t>
+      </w:r>
+      <w:proofErr w:type="spellStart"/>
+      <w:r>
+        <w:rPr>
+          <w:rFonts w:ascii="Arial" w:hAnsi="Arial" w:cs="Arial"/>
+        </w:rPr>
+        <w:t>soundgen</w:t>
+      </w:r>
+      <w:proofErr w:type="spellEnd"/>
+      <w:r>
+        <w:rPr>
+          <w:rFonts w:ascii="Arial" w:hAnsi="Arial" w:cs="Arial"/>
+        </w:rPr>
+        <w:t xml:space="preserve"> R package</w:t>
       </w:r>
       <w:r>
         <w:rPr>
@@ -5244,23 +5414,25 @@
           <w:sz w:val="22"/>
           <w:szCs w:val="22"/>
         </w:rPr>
-        <w:t xml:space="preserve"> contains a trit of information</w:t>
-      </w:r>
+        <w:t xml:space="preserve"> contains a </w:t>
+      </w:r>
+      <w:proofErr w:type="spellStart"/>
       <w:r>
         <w:rPr>
           <w:rFonts w:ascii="Arial" w:hAnsi="Arial" w:cs="Arial"/>
           <w:sz w:val="22"/>
           <w:szCs w:val="22"/>
         </w:rPr>
-        <w:t xml:space="preserve"> (each position can contain </w:t>
-      </w:r>
+        <w:t>trit</w:t>
+      </w:r>
+      <w:proofErr w:type="spellEnd"/>
       <w:r>
         <w:rPr>
           <w:rFonts w:ascii="Arial" w:hAnsi="Arial" w:cs="Arial"/>
           <w:sz w:val="22"/>
           <w:szCs w:val="22"/>
         </w:rPr>
-        <w:t xml:space="preserve">the symbols </w:t>
+        <w:t xml:space="preserve"> of information</w:t>
       </w:r>
       <w:r>
         <w:rPr>
@@ -5268,7 +5440,7 @@
           <w:sz w:val="22"/>
           <w:szCs w:val="22"/>
         </w:rPr>
-        <w:t>A, B, or C)</w:t>
+        <w:t xml:space="preserve"> (each position can contain </w:t>
       </w:r>
       <w:r>
         <w:rPr>
@@ -5276,7 +5448,7 @@
           <w:sz w:val="22"/>
           <w:szCs w:val="22"/>
         </w:rPr>
-        <w:t xml:space="preserve">. The string comprises </w:t>
+        <w:t xml:space="preserve">the symbols </w:t>
       </w:r>
       <w:r>
         <w:rPr>
@@ -5284,7 +5456,7 @@
           <w:sz w:val="22"/>
           <w:szCs w:val="22"/>
         </w:rPr>
-        <w:t xml:space="preserve">four distinct </w:t>
+        <w:t>A, B, or C)</w:t>
       </w:r>
       <w:r>
         <w:rPr>
@@ -5292,7 +5464,7 @@
           <w:sz w:val="22"/>
           <w:szCs w:val="22"/>
         </w:rPr>
-        <w:t>sections</w:t>
+        <w:t xml:space="preserve">. The string comprises </w:t>
       </w:r>
       <w:r>
         <w:rPr>
@@ -5300,7 +5472,7 @@
           <w:sz w:val="22"/>
           <w:szCs w:val="22"/>
         </w:rPr>
-        <w:t>. Sections</w:t>
+        <w:t xml:space="preserve">four distinct </w:t>
       </w:r>
       <w:r>
         <w:rPr>
@@ -5308,7 +5480,7 @@
           <w:sz w:val="22"/>
           <w:szCs w:val="22"/>
         </w:rPr>
-        <w:t xml:space="preserve"> (</w:t>
+        <w:t>sections</w:t>
       </w:r>
       <w:r>
         <w:rPr>
@@ -5316,7 +5488,7 @@
           <w:sz w:val="22"/>
           <w:szCs w:val="22"/>
         </w:rPr>
-        <w:t xml:space="preserve">i) and (v) </w:t>
+        <w:t>. Sections</w:t>
       </w:r>
       <w:r>
         <w:rPr>
@@ -5324,22 +5496,48 @@
           <w:sz w:val="22"/>
           <w:szCs w:val="22"/>
         </w:rPr>
-        <w:t>indicate</w:t>
-      </w:r>
+        <w:t xml:space="preserve"> (</w:t>
+      </w:r>
+      <w:proofErr w:type="spellStart"/>
       <w:r>
         <w:rPr>
           <w:rFonts w:ascii="Arial" w:hAnsi="Arial" w:cs="Arial"/>
           <w:sz w:val="22"/>
           <w:szCs w:val="22"/>
         </w:rPr>
-        <w:t xml:space="preserve"> the </w:t>
-      </w:r>
+        <w:t>i</w:t>
+      </w:r>
+      <w:proofErr w:type="spellEnd"/>
       <w:r>
         <w:rPr>
           <w:rFonts w:ascii="Arial" w:hAnsi="Arial" w:cs="Arial"/>
           <w:sz w:val="22"/>
           <w:szCs w:val="22"/>
         </w:rPr>
+        <w:t xml:space="preserve">) and (v) </w:t>
+      </w:r>
+      <w:r>
+        <w:rPr>
+          <w:rFonts w:ascii="Arial" w:hAnsi="Arial" w:cs="Arial"/>
+          <w:sz w:val="22"/>
+          <w:szCs w:val="22"/>
+        </w:rPr>
+        <w:t>indicate</w:t>
+      </w:r>
+      <w:r>
+        <w:rPr>
+          <w:rFonts w:ascii="Arial" w:hAnsi="Arial" w:cs="Arial"/>
+          <w:sz w:val="22"/>
+          <w:szCs w:val="22"/>
+        </w:rPr>
+        <w:t xml:space="preserve"> the </w:t>
+      </w:r>
+      <w:r>
+        <w:rPr>
+          <w:rFonts w:ascii="Arial" w:hAnsi="Arial" w:cs="Arial"/>
+          <w:sz w:val="22"/>
+          <w:szCs w:val="22"/>
+        </w:rPr>
         <w:lastRenderedPageBreak/>
         <w:t>global head and tail, which bounds the structural variation in the synthetic signal</w:t>
       </w:r>
@@ -5501,23 +5699,25 @@
           <w:sz w:val="22"/>
           <w:szCs w:val="22"/>
         </w:rPr>
-        <w:t xml:space="preserve">tep (i) and transformed </w:t>
-      </w:r>
+        <w:t>tep (</w:t>
+      </w:r>
+      <w:proofErr w:type="spellStart"/>
       <w:r>
         <w:rPr>
           <w:rFonts w:ascii="Arial" w:hAnsi="Arial" w:cs="Arial"/>
           <w:sz w:val="22"/>
           <w:szCs w:val="22"/>
         </w:rPr>
-        <w:t>in</w:t>
-      </w:r>
+        <w:t>i</w:t>
+      </w:r>
+      <w:proofErr w:type="spellEnd"/>
       <w:r>
         <w:rPr>
           <w:rFonts w:ascii="Arial" w:hAnsi="Arial" w:cs="Arial"/>
           <w:sz w:val="22"/>
           <w:szCs w:val="22"/>
         </w:rPr>
-        <w:t xml:space="preserve">to frequency modulation patterns using Parsons code in </w:t>
+        <w:t xml:space="preserve">) and transformed </w:t>
       </w:r>
       <w:r>
         <w:rPr>
@@ -5525,7 +5725,7 @@
           <w:sz w:val="22"/>
           <w:szCs w:val="22"/>
         </w:rPr>
-        <w:t>S</w:t>
+        <w:t>in</w:t>
       </w:r>
       <w:r>
         <w:rPr>
@@ -5533,23 +5733,25 @@
           <w:sz w:val="22"/>
           <w:szCs w:val="22"/>
         </w:rPr>
-        <w:t xml:space="preserve">tep (ii). In </w:t>
-      </w:r>
+        <w:t xml:space="preserve">to frequency modulation patterns using </w:t>
+      </w:r>
+      <w:proofErr w:type="gramStart"/>
       <w:r>
         <w:rPr>
           <w:rFonts w:ascii="Arial" w:hAnsi="Arial" w:cs="Arial"/>
           <w:sz w:val="22"/>
           <w:szCs w:val="22"/>
         </w:rPr>
-        <w:t>S</w:t>
-      </w:r>
+        <w:t>Parsons</w:t>
+      </w:r>
+      <w:proofErr w:type="gramEnd"/>
       <w:r>
         <w:rPr>
           <w:rFonts w:ascii="Arial" w:hAnsi="Arial" w:cs="Arial"/>
           <w:sz w:val="22"/>
           <w:szCs w:val="22"/>
         </w:rPr>
-        <w:t xml:space="preserve">tep (iii), the frequency modulation patterns are </w:t>
+        <w:t xml:space="preserve"> code in </w:t>
       </w:r>
       <w:r>
         <w:rPr>
@@ -5557,7 +5759,7 @@
           <w:sz w:val="22"/>
           <w:szCs w:val="22"/>
         </w:rPr>
-        <w:t>converted to a timeseries of frequency values, which is used to guide the generation of frequency-modulated synthetic vocalizations</w:t>
+        <w:t>S</w:t>
       </w:r>
       <w:r>
         <w:rPr>
@@ -5565,7 +5767,7 @@
           <w:sz w:val="22"/>
           <w:szCs w:val="22"/>
         </w:rPr>
-        <w:t xml:space="preserve"> </w:t>
+        <w:t xml:space="preserve">tep (ii). In </w:t>
       </w:r>
       <w:r>
         <w:rPr>
@@ -5573,7 +5775,7 @@
           <w:sz w:val="22"/>
           <w:szCs w:val="22"/>
         </w:rPr>
-        <w:t>with the</w:t>
+        <w:t>S</w:t>
       </w:r>
       <w:r>
         <w:rPr>
@@ -5581,7 +5783,7 @@
           <w:sz w:val="22"/>
           <w:szCs w:val="22"/>
         </w:rPr>
-        <w:t xml:space="preserve"> R</w:t>
+        <w:t xml:space="preserve">tep (iii), the frequency modulation patterns are </w:t>
       </w:r>
       <w:r>
         <w:rPr>
@@ -5589,7 +5791,7 @@
           <w:sz w:val="22"/>
           <w:szCs w:val="22"/>
         </w:rPr>
-        <w:t xml:space="preserve"> package soundgen. Step</w:t>
+        <w:t>converted to a timeseries of frequency values, which is used to guide the generation of frequency-modulated synthetic vocalizations</w:t>
       </w:r>
       <w:r>
         <w:rPr>
@@ -5597,7 +5799,7 @@
           <w:sz w:val="22"/>
           <w:szCs w:val="22"/>
         </w:rPr>
-        <w:t xml:space="preserve"> (iv)</w:t>
+        <w:t xml:space="preserve"> </w:t>
       </w:r>
       <w:r>
         <w:rPr>
@@ -5605,7 +5807,75 @@
           <w:sz w:val="22"/>
           <w:szCs w:val="22"/>
         </w:rPr>
-        <w:t xml:space="preserve"> shows a spectrogram of an example audio file generated for the character string in Step (i)</w:t>
+        <w:t>with the</w:t>
+      </w:r>
+      <w:r>
+        <w:rPr>
+          <w:rFonts w:ascii="Arial" w:hAnsi="Arial" w:cs="Arial"/>
+          <w:sz w:val="22"/>
+          <w:szCs w:val="22"/>
+        </w:rPr>
+        <w:t xml:space="preserve"> R</w:t>
+      </w:r>
+      <w:r>
+        <w:rPr>
+          <w:rFonts w:ascii="Arial" w:hAnsi="Arial" w:cs="Arial"/>
+          <w:sz w:val="22"/>
+          <w:szCs w:val="22"/>
+        </w:rPr>
+        <w:t xml:space="preserve"> package </w:t>
+      </w:r>
+      <w:proofErr w:type="spellStart"/>
+      <w:r>
+        <w:rPr>
+          <w:rFonts w:ascii="Arial" w:hAnsi="Arial" w:cs="Arial"/>
+          <w:sz w:val="22"/>
+          <w:szCs w:val="22"/>
+        </w:rPr>
+        <w:t>soundgen</w:t>
+      </w:r>
+      <w:proofErr w:type="spellEnd"/>
+      <w:r>
+        <w:rPr>
+          <w:rFonts w:ascii="Arial" w:hAnsi="Arial" w:cs="Arial"/>
+          <w:sz w:val="22"/>
+          <w:szCs w:val="22"/>
+        </w:rPr>
+        <w:t>. Step</w:t>
+      </w:r>
+      <w:r>
+        <w:rPr>
+          <w:rFonts w:ascii="Arial" w:hAnsi="Arial" w:cs="Arial"/>
+          <w:sz w:val="22"/>
+          <w:szCs w:val="22"/>
+        </w:rPr>
+        <w:t xml:space="preserve"> (iv)</w:t>
+      </w:r>
+      <w:r>
+        <w:rPr>
+          <w:rFonts w:ascii="Arial" w:hAnsi="Arial" w:cs="Arial"/>
+          <w:sz w:val="22"/>
+          <w:szCs w:val="22"/>
+        </w:rPr>
+        <w:t xml:space="preserve"> shows a spectrogram of an example audio file generated for the character string in Step (</w:t>
+      </w:r>
+      <w:proofErr w:type="spellStart"/>
+      <w:r>
+        <w:rPr>
+          <w:rFonts w:ascii="Arial" w:hAnsi="Arial" w:cs="Arial"/>
+          <w:sz w:val="22"/>
+          <w:szCs w:val="22"/>
+        </w:rPr>
+        <w:t>i</w:t>
+      </w:r>
+      <w:proofErr w:type="spellEnd"/>
+      <w:r>
+        <w:rPr>
+          <w:rFonts w:ascii="Arial" w:hAnsi="Arial" w:cs="Arial"/>
+          <w:sz w:val="22"/>
+          <w:szCs w:val="22"/>
+        </w:rPr>
+        <w:t>)</w:t>
       </w:r>
       <w:r>
         <w:rPr>
@@ -6501,7 +6771,25 @@
           <w:sz w:val="22"/>
           <w:szCs w:val="22"/>
         </w:rPr>
-        <w:t xml:space="preserve">(i) edit distance or (ii) spectrographic cross correlation </w:t>
+        <w:t>(</w:t>
+      </w:r>
+      <w:proofErr w:type="spellStart"/>
+      <w:r>
+        <w:rPr>
+          <w:rFonts w:ascii="Arial" w:hAnsi="Arial" w:cs="Arial"/>
+          <w:sz w:val="22"/>
+          <w:szCs w:val="22"/>
+        </w:rPr>
+        <w:t>i</w:t>
+      </w:r>
+      <w:proofErr w:type="spellEnd"/>
+      <w:r>
+        <w:rPr>
+          <w:rFonts w:ascii="Arial" w:hAnsi="Arial" w:cs="Arial"/>
+          <w:sz w:val="22"/>
+          <w:szCs w:val="22"/>
+        </w:rPr>
+        <w:t xml:space="preserve">) edit distance or (ii) spectrographic cross correlation </w:t>
       </w:r>
       <w:r>
         <w:rPr>
@@ -6884,7 +7172,25 @@
           <w:sz w:val="22"/>
           <w:szCs w:val="22"/>
         </w:rPr>
-        <w:t xml:space="preserve">. These plots were generated by applying multidimensional scaling to (i) edit distance or (ii) spectrographic cross correlation matrices. In each acoustic space plot, individual identities are encoded by shapes per group, and group identities are highlighted in color, to match Group </w:t>
+        <w:t>. These plots were generated by applying multidimensional scaling to (</w:t>
+      </w:r>
+      <w:proofErr w:type="spellStart"/>
+      <w:r>
+        <w:rPr>
+          <w:rFonts w:ascii="Arial" w:hAnsi="Arial" w:cs="Arial"/>
+          <w:sz w:val="22"/>
+          <w:szCs w:val="22"/>
+        </w:rPr>
+        <w:t>i</w:t>
+      </w:r>
+      <w:proofErr w:type="spellEnd"/>
+      <w:r>
+        <w:rPr>
+          <w:rFonts w:ascii="Arial" w:hAnsi="Arial" w:cs="Arial"/>
+          <w:sz w:val="22"/>
+          <w:szCs w:val="22"/>
+        </w:rPr>
+        <w:t xml:space="preserve">) edit distance or (ii) spectrographic cross correlation matrices. In each acoustic space plot, individual identities are encoded by shapes per group, and group identities are highlighted in color, to match Group </w:t>
       </w:r>
       <w:r>
         <w:rPr>
@@ -9652,7 +9958,19 @@
         <w:rPr>
           <w:rFonts w:ascii="Arial" w:hAnsi="Arial" w:cs="Arial"/>
         </w:rPr>
-        <w:t xml:space="preserve">, we found large effect size differences between </w:t>
+        <w:t>, we found large effect sizes between</w:t>
+      </w:r>
+      <w:r>
+        <w:rPr>
+          <w:rFonts w:ascii="Arial" w:hAnsi="Arial" w:cs="Arial"/>
+        </w:rPr>
+        <w:t xml:space="preserve"> the</w:t>
+      </w:r>
+      <w:r>
+        <w:rPr>
+          <w:rFonts w:ascii="Arial" w:hAnsi="Arial" w:cs="Arial"/>
+        </w:rPr>
+        <w:t xml:space="preserve"> </w:t>
       </w:r>
       <w:r>
         <w:rPr>
@@ -9778,7 +10096,13 @@
         <w:rPr>
           <w:rFonts w:ascii="Arial" w:hAnsi="Arial" w:cs="Arial"/>
         </w:rPr>
-        <w:t>associated with information detection when synthetic vocalizations contained multi-level identity information</w:t>
+        <w:t>associated with information detection when synthetic vocalizations contained identity information</w:t>
+      </w:r>
+      <w:r>
+        <w:rPr>
+          <w:rFonts w:ascii="Arial" w:hAnsi="Arial" w:cs="Arial"/>
+        </w:rPr>
+        <w:t xml:space="preserve"> at both social levels</w:t>
       </w:r>
       <w:r>
         <w:rPr>
@@ -9988,25 +10312,13 @@
         <w:rPr>
           <w:rFonts w:ascii="Arial" w:hAnsi="Arial" w:cs="Arial"/>
         </w:rPr>
-        <w:t xml:space="preserve">the </w:t>
+        <w:t xml:space="preserve">our </w:t>
       </w:r>
       <w:r>
         <w:rPr>
           <w:rFonts w:ascii="Arial" w:hAnsi="Arial" w:cs="Arial"/>
         </w:rPr>
         <w:t xml:space="preserve">inferences </w:t>
-      </w:r>
-      <w:r>
-        <w:rPr>
-          <w:rFonts w:ascii="Arial" w:hAnsi="Arial" w:cs="Arial"/>
-        </w:rPr>
-        <w:t xml:space="preserve">we reach using </w:t>
-      </w:r>
-      <w:r>
-        <w:rPr>
-          <w:rFonts w:ascii="Arial" w:hAnsi="Arial" w:cs="Arial"/>
-        </w:rPr>
-        <w:t xml:space="preserve">such methods </w:t>
       </w:r>
       <w:r>
         <w:rPr>
@@ -10032,19 +10344,37 @@
         <w:rPr>
           <w:rFonts w:ascii="Arial" w:hAnsi="Arial" w:cs="Arial"/>
         </w:rPr>
-        <w:t xml:space="preserve"> knowledge about the identity information</w:t>
-      </w:r>
-      <w:r>
-        <w:rPr>
-          <w:rFonts w:ascii="Arial" w:hAnsi="Arial" w:cs="Arial"/>
-        </w:rPr>
-        <w:t xml:space="preserve"> originally</w:t>
-      </w:r>
-      <w:r>
-        <w:rPr>
-          <w:rFonts w:ascii="Arial" w:hAnsi="Arial" w:cs="Arial"/>
-        </w:rPr>
-        <w:t xml:space="preserve"> encoded </w:t>
+        <w:t xml:space="preserve"> knowledge about the</w:t>
+      </w:r>
+      <w:r>
+        <w:rPr>
+          <w:rFonts w:ascii="Arial" w:hAnsi="Arial" w:cs="Arial"/>
+        </w:rPr>
+        <w:t xml:space="preserve"> true types and amounts of</w:t>
+      </w:r>
+      <w:r>
+        <w:rPr>
+          <w:rFonts w:ascii="Arial" w:hAnsi="Arial" w:cs="Arial"/>
+        </w:rPr>
+        <w:t xml:space="preserve"> identity information</w:t>
+      </w:r>
+      <w:r>
+        <w:rPr>
+          <w:rFonts w:ascii="Arial" w:hAnsi="Arial" w:cs="Arial"/>
+        </w:rPr>
+        <w:t xml:space="preserve"> </w:t>
+      </w:r>
+      <w:r>
+        <w:rPr>
+          <w:rFonts w:ascii="Arial" w:hAnsi="Arial" w:cs="Arial"/>
+        </w:rPr>
+        <w:t>that animals are transmitting through their</w:t>
+      </w:r>
+      <w:r>
+        <w:rPr>
+          <w:rFonts w:ascii="Arial" w:hAnsi="Arial" w:cs="Arial"/>
+        </w:rPr>
+        <w:t xml:space="preserve"> </w:t>
       </w:r>
       <w:r>
         <w:rPr>
@@ -10117,13 +10447,31 @@
         <w:rPr>
           <w:rFonts w:ascii="Arial" w:hAnsi="Arial" w:cs="Arial"/>
         </w:rPr>
+        <w:t xml:space="preserve"> </w:t>
+      </w:r>
+      <w:r>
+        <w:rPr>
+          <w:rFonts w:ascii="Arial" w:hAnsi="Arial" w:cs="Arial"/>
+        </w:rPr>
         <w:t>We</w:t>
       </w:r>
       <w:r>
         <w:rPr>
           <w:rFonts w:ascii="Arial" w:hAnsi="Arial" w:cs="Arial"/>
         </w:rPr>
-        <w:t xml:space="preserve"> built a pipeline to generate synthetic vocal identity signals and performed simulation experiments to test how well we could detect the identity information that we originally encoded</w:t>
+        <w:t xml:space="preserve"> built a pipeline to generate synthetic vocal</w:t>
+      </w:r>
+      <w:r>
+        <w:rPr>
+          <w:rFonts w:ascii="Arial" w:hAnsi="Arial" w:cs="Arial"/>
+        </w:rPr>
+        <w:t>izations</w:t>
+      </w:r>
+      <w:r>
+        <w:rPr>
+          <w:rFonts w:ascii="Arial" w:hAnsi="Arial" w:cs="Arial"/>
+        </w:rPr>
+        <w:t xml:space="preserve"> and performed simulation experiments to test how well we could detect the identity information that we originally encoded</w:t>
       </w:r>
       <w:r>
         <w:rPr>
@@ -10159,13 +10507,79 @@
         <w:rPr>
           <w:rFonts w:ascii="Arial" w:hAnsi="Arial" w:cs="Arial"/>
         </w:rPr>
-        <w:t xml:space="preserve">generally </w:t>
-      </w:r>
-      <w:r>
-        <w:rPr>
-          <w:rFonts w:ascii="Arial" w:hAnsi="Arial" w:cs="Arial"/>
-        </w:rPr>
-        <w:t xml:space="preserve">detect the information we originally encoded in character string </w:t>
+        <w:t>significantly</w:t>
+      </w:r>
+      <w:r>
+        <w:rPr>
+          <w:rFonts w:ascii="Arial" w:hAnsi="Arial" w:cs="Arial"/>
+        </w:rPr>
+        <w:t xml:space="preserve"> </w:t>
+      </w:r>
+      <w:r>
+        <w:rPr>
+          <w:rFonts w:ascii="Arial" w:hAnsi="Arial" w:cs="Arial"/>
+        </w:rPr>
+        <w:t>detect the</w:t>
+      </w:r>
+      <w:r>
+        <w:rPr>
+          <w:rFonts w:ascii="Arial" w:hAnsi="Arial" w:cs="Arial"/>
+        </w:rPr>
+        <w:t xml:space="preserve"> social level at which we had</w:t>
+      </w:r>
+      <w:r>
+        <w:rPr>
+          <w:rFonts w:ascii="Arial" w:hAnsi="Arial" w:cs="Arial"/>
+        </w:rPr>
+        <w:t xml:space="preserve"> originally encoded</w:t>
+      </w:r>
+      <w:r>
+        <w:rPr>
+          <w:rFonts w:ascii="Arial" w:hAnsi="Arial" w:cs="Arial"/>
+        </w:rPr>
+        <w:t xml:space="preserve"> the most</w:t>
+      </w:r>
+      <w:r>
+        <w:rPr>
+          <w:rFonts w:ascii="Arial" w:hAnsi="Arial" w:cs="Arial"/>
+        </w:rPr>
+        <w:t xml:space="preserve"> </w:t>
+      </w:r>
+      <w:r>
+        <w:rPr>
+          <w:rFonts w:ascii="Arial" w:hAnsi="Arial" w:cs="Arial"/>
+        </w:rPr>
+        <w:t xml:space="preserve">identity </w:t>
+      </w:r>
+      <w:r>
+        <w:rPr>
+          <w:rFonts w:ascii="Arial" w:hAnsi="Arial" w:cs="Arial"/>
+        </w:rPr>
+        <w:t>information</w:t>
+      </w:r>
+      <w:r>
+        <w:rPr>
+          <w:rFonts w:ascii="Arial" w:hAnsi="Arial" w:cs="Arial"/>
+        </w:rPr>
+        <w:t>. This result held across</w:t>
+      </w:r>
+      <w:r>
+        <w:rPr>
+          <w:rFonts w:ascii="Arial" w:hAnsi="Arial" w:cs="Arial"/>
+        </w:rPr>
+        <w:t xml:space="preserve"> </w:t>
+      </w:r>
+      <w:r>
+        <w:rPr>
+          <w:rFonts w:ascii="Arial" w:hAnsi="Arial" w:cs="Arial"/>
+        </w:rPr>
+        <w:t xml:space="preserve">both the </w:t>
+      </w:r>
+      <w:r>
+        <w:rPr>
+          <w:rFonts w:ascii="Arial" w:hAnsi="Arial" w:cs="Arial"/>
+        </w:rPr>
+        <w:t xml:space="preserve">character string </w:t>
       </w:r>
       <w:r>
         <w:rPr>
@@ -10183,6 +10597,12 @@
         <w:rPr>
           <w:rFonts w:ascii="Arial" w:hAnsi="Arial" w:cs="Arial"/>
         </w:rPr>
+        <w:t xml:space="preserve">as well as increasing density of the simulated signaling environment, </w:t>
+      </w:r>
+      <w:r>
+        <w:rPr>
+          <w:rFonts w:ascii="Arial" w:hAnsi="Arial" w:cs="Arial"/>
+        </w:rPr>
         <w:t xml:space="preserve">although </w:t>
       </w:r>
       <w:r>
@@ -10201,25 +10621,109 @@
         <w:rPr>
           <w:rFonts w:ascii="Arial" w:hAnsi="Arial" w:cs="Arial"/>
         </w:rPr>
-        <w:t xml:space="preserve">under </w:t>
-      </w:r>
-      <w:r>
-        <w:rPr>
-          <w:rFonts w:ascii="Arial" w:hAnsi="Arial" w:cs="Arial"/>
-        </w:rPr>
-        <w:t>multi-level information</w:t>
-      </w:r>
-      <w:r>
-        <w:rPr>
-          <w:rFonts w:ascii="Arial" w:hAnsi="Arial" w:cs="Arial"/>
-        </w:rPr>
-        <w:t xml:space="preserve"> encoding conditions</w:t>
+        <w:t>when</w:t>
+      </w:r>
+      <w:r>
+        <w:rPr>
+          <w:rFonts w:ascii="Arial" w:hAnsi="Arial" w:cs="Arial"/>
+        </w:rPr>
+        <w:t xml:space="preserve"> </w:t>
+      </w:r>
+      <w:r>
+        <w:rPr>
+          <w:rFonts w:ascii="Arial" w:hAnsi="Arial" w:cs="Arial"/>
+        </w:rPr>
+        <w:t xml:space="preserve">identity </w:t>
+      </w:r>
+      <w:r>
+        <w:rPr>
+          <w:rFonts w:ascii="Arial" w:hAnsi="Arial" w:cs="Arial"/>
+        </w:rPr>
+        <w:t>information</w:t>
+      </w:r>
+      <w:r>
+        <w:rPr>
+          <w:rFonts w:ascii="Arial" w:hAnsi="Arial" w:cs="Arial"/>
+        </w:rPr>
+        <w:t xml:space="preserve"> </w:t>
+      </w:r>
+      <w:r>
+        <w:rPr>
+          <w:rFonts w:ascii="Arial" w:hAnsi="Arial" w:cs="Arial"/>
+        </w:rPr>
+        <w:t xml:space="preserve">was </w:t>
+      </w:r>
+      <w:r>
+        <w:rPr>
+          <w:rFonts w:ascii="Arial" w:hAnsi="Arial" w:cs="Arial"/>
+        </w:rPr>
+        <w:t>encod</w:t>
+      </w:r>
+      <w:r>
+        <w:rPr>
+          <w:rFonts w:ascii="Arial" w:hAnsi="Arial" w:cs="Arial"/>
+        </w:rPr>
+        <w:t>ed over both social levels</w:t>
       </w:r>
       <w:r>
         <w:rPr>
           <w:rFonts w:ascii="Arial" w:hAnsi="Arial" w:cs="Arial"/>
         </w:rPr>
         <w:t>.</w:t>
+      </w:r>
+      <w:r>
+        <w:rPr>
+          <w:rFonts w:ascii="Arial" w:hAnsi="Arial" w:cs="Arial"/>
+        </w:rPr>
+        <w:t xml:space="preserve"> </w:t>
+      </w:r>
+      <w:r>
+        <w:rPr>
+          <w:rFonts w:ascii="Arial" w:hAnsi="Arial" w:cs="Arial"/>
+        </w:rPr>
+        <w:t>Below we discuss how our pipeline can be used more broadly to generate synthetic vocalizations that represent</w:t>
+      </w:r>
+      <w:r>
+        <w:rPr>
+          <w:rFonts w:ascii="Arial" w:hAnsi="Arial" w:cs="Arial"/>
+        </w:rPr>
+        <w:t xml:space="preserve"> vocal </w:t>
+      </w:r>
+      <w:r>
+        <w:rPr>
+          <w:rFonts w:ascii="Arial" w:hAnsi="Arial" w:cs="Arial"/>
+        </w:rPr>
+        <w:t>identity signals</w:t>
+      </w:r>
+      <w:r>
+        <w:rPr>
+          <w:rFonts w:ascii="Arial" w:hAnsi="Arial" w:cs="Arial"/>
+        </w:rPr>
+        <w:t xml:space="preserve">, in which identity information is encoded in frequency modulation patterns. We also discuss how our simulation experiments show that computational tools used in bioacoustics can successfully detect which social level contains the greatest amount of identity information, and </w:t>
+      </w:r>
+      <w:r>
+        <w:rPr>
+          <w:rFonts w:ascii="Arial" w:hAnsi="Arial" w:cs="Arial"/>
+        </w:rPr>
+        <w:t xml:space="preserve">we end by </w:t>
+      </w:r>
+      <w:r>
+        <w:rPr>
+          <w:rFonts w:ascii="Arial" w:hAnsi="Arial" w:cs="Arial"/>
+        </w:rPr>
+        <w:t>highlight</w:t>
+      </w:r>
+      <w:r>
+        <w:rPr>
+          <w:rFonts w:ascii="Arial" w:hAnsi="Arial" w:cs="Arial"/>
+        </w:rPr>
+        <w:t>ing</w:t>
+      </w:r>
+      <w:r>
+        <w:rPr>
+          <w:rFonts w:ascii="Arial" w:hAnsi="Arial" w:cs="Arial"/>
+        </w:rPr>
+        <w:t xml:space="preserve"> exciting steps for future research.</w:t>
       </w:r>
     </w:p>
     <w:p>
@@ -10234,6 +10738,7 @@
         <w:rPr>
           <w:rFonts w:ascii="Arial" w:hAnsi="Arial" w:cs="Arial"/>
         </w:rPr>
+        <w:lastRenderedPageBreak/>
         <w:t>Our</w:t>
       </w:r>
       <w:r>
@@ -10300,8 +10805,16 @@
         <w:rPr>
           <w:rFonts w:ascii="Arial" w:hAnsi="Arial" w:cs="Arial"/>
         </w:rPr>
-        <w:t xml:space="preserve"> paRsynth</w:t>
-      </w:r>
+        <w:t xml:space="preserve"> </w:t>
+      </w:r>
+      <w:proofErr w:type="spellStart"/>
+      <w:r>
+        <w:rPr>
+          <w:rFonts w:ascii="Arial" w:hAnsi="Arial" w:cs="Arial"/>
+        </w:rPr>
+        <w:t>paRsynth</w:t>
+      </w:r>
+      <w:proofErr w:type="spellEnd"/>
       <w:r>
         <w:rPr>
           <w:rFonts w:ascii="Arial" w:hAnsi="Arial" w:cs="Arial"/>
@@ -10399,14 +10912,7 @@
         <w:rPr>
           <w:rFonts w:ascii="Arial" w:hAnsi="Arial" w:cs="Arial"/>
         </w:rPr>
-        <w:t xml:space="preserve"> to generate individually distinctive vocalizations, we </w:t>
-      </w:r>
-      <w:r>
-        <w:rPr>
-          <w:rFonts w:ascii="Arial" w:hAnsi="Arial" w:cs="Arial"/>
-        </w:rPr>
-        <w:lastRenderedPageBreak/>
-        <w:t xml:space="preserve">can </w:t>
+        <w:t xml:space="preserve"> to generate individually distinctive vocalizations, we can </w:t>
       </w:r>
       <w:r>
         <w:rPr>
@@ -10484,7 +10990,21 @@
         <w:rPr>
           <w:rFonts w:ascii="Arial" w:hAnsi="Arial" w:cs="Arial"/>
         </w:rPr>
-        <w:t xml:space="preserve">, producing a vector of frequency values supplied to the soundgen R package </w:t>
+        <w:t xml:space="preserve">, producing a vector of frequency values supplied to the </w:t>
+      </w:r>
+      <w:proofErr w:type="spellStart"/>
+      <w:r>
+        <w:rPr>
+          <w:rFonts w:ascii="Arial" w:hAnsi="Arial" w:cs="Arial"/>
+        </w:rPr>
+        <w:t>soundgen</w:t>
+      </w:r>
+      <w:proofErr w:type="spellEnd"/>
+      <w:r>
+        <w:rPr>
+          <w:rFonts w:ascii="Arial" w:hAnsi="Arial" w:cs="Arial"/>
+        </w:rPr>
+        <w:t xml:space="preserve"> R package </w:t>
       </w:r>
       <w:r>
         <w:rPr>
@@ -10718,7 +11238,21 @@
         <w:rPr>
           <w:rFonts w:ascii="Arial" w:hAnsi="Arial" w:cs="Arial"/>
         </w:rPr>
-        <w:t xml:space="preserve">A second version of our pipeline is in development and will include the flexibility to additionally vary where group and individual information, as well as random variation, are located in the overall string, as well as extending the number of unique symbols that can be used in strings. </w:t>
+        <w:t xml:space="preserve">A second version of our pipeline is in development and will include the flexibility to additionally vary where group and individual information, as well as random variation, </w:t>
+      </w:r>
+      <w:proofErr w:type="gramStart"/>
+      <w:r>
+        <w:rPr>
+          <w:rFonts w:ascii="Arial" w:hAnsi="Arial" w:cs="Arial"/>
+        </w:rPr>
+        <w:t>are located in</w:t>
+      </w:r>
+      <w:proofErr w:type="gramEnd"/>
+      <w:r>
+        <w:rPr>
+          <w:rFonts w:ascii="Arial" w:hAnsi="Arial" w:cs="Arial"/>
+        </w:rPr>
+        <w:t xml:space="preserve"> the overall string, as well as extending the number of unique symbols that can be used in strings. </w:t>
       </w:r>
     </w:p>
     <w:p>
@@ -10775,6 +11309,7 @@
         <w:rPr>
           <w:rFonts w:ascii="Arial" w:hAnsi="Arial" w:cs="Arial"/>
         </w:rPr>
+        <w:lastRenderedPageBreak/>
         <w:t xml:space="preserve">synthetic </w:t>
       </w:r>
       <w:r>
@@ -11024,19 +11559,48 @@
         </w:rPr>
         <w:t xml:space="preserve">the </w:t>
       </w:r>
-      <w:r>
-        <w:rPr>
-          <w:rFonts w:ascii="Arial" w:hAnsi="Arial" w:cs="Arial"/>
-        </w:rPr>
-        <w:lastRenderedPageBreak/>
-        <w:t>seewave, warbleR, and</w:t>
-      </w:r>
-      <w:r>
-        <w:rPr>
-          <w:rFonts w:ascii="Arial" w:hAnsi="Arial" w:cs="Arial"/>
-        </w:rPr>
-        <w:t xml:space="preserve"> soundgen</w:t>
-      </w:r>
+      <w:proofErr w:type="spellStart"/>
+      <w:r>
+        <w:rPr>
+          <w:rFonts w:ascii="Arial" w:hAnsi="Arial" w:cs="Arial"/>
+        </w:rPr>
+        <w:t>seewave</w:t>
+      </w:r>
+      <w:proofErr w:type="spellEnd"/>
+      <w:r>
+        <w:rPr>
+          <w:rFonts w:ascii="Arial" w:hAnsi="Arial" w:cs="Arial"/>
+        </w:rPr>
+        <w:t xml:space="preserve">, </w:t>
+      </w:r>
+      <w:proofErr w:type="spellStart"/>
+      <w:r>
+        <w:rPr>
+          <w:rFonts w:ascii="Arial" w:hAnsi="Arial" w:cs="Arial"/>
+        </w:rPr>
+        <w:t>warbleR</w:t>
+      </w:r>
+      <w:proofErr w:type="spellEnd"/>
+      <w:r>
+        <w:rPr>
+          <w:rFonts w:ascii="Arial" w:hAnsi="Arial" w:cs="Arial"/>
+        </w:rPr>
+        <w:t>, and</w:t>
+      </w:r>
+      <w:r>
+        <w:rPr>
+          <w:rFonts w:ascii="Arial" w:hAnsi="Arial" w:cs="Arial"/>
+        </w:rPr>
+        <w:t xml:space="preserve"> </w:t>
+      </w:r>
+      <w:proofErr w:type="spellStart"/>
+      <w:r>
+        <w:rPr>
+          <w:rFonts w:ascii="Arial" w:hAnsi="Arial" w:cs="Arial"/>
+        </w:rPr>
+        <w:t>soundgen</w:t>
+      </w:r>
+      <w:proofErr w:type="spellEnd"/>
       <w:r>
         <w:rPr>
           <w:rFonts w:ascii="Arial" w:hAnsi="Arial" w:cs="Arial"/>
@@ -11161,7 +11725,21 @@
         <w:rPr>
           <w:rFonts w:ascii="Arial" w:hAnsi="Arial" w:cs="Arial"/>
         </w:rPr>
-        <w:t xml:space="preserve">For instance, the soundgen package facilitates diverse types of information encoding that have successfully been used to understand dynamic </w:t>
+        <w:t xml:space="preserve">For instance, the </w:t>
+      </w:r>
+      <w:proofErr w:type="spellStart"/>
+      <w:r>
+        <w:rPr>
+          <w:rFonts w:ascii="Arial" w:hAnsi="Arial" w:cs="Arial"/>
+        </w:rPr>
+        <w:t>soundgen</w:t>
+      </w:r>
+      <w:proofErr w:type="spellEnd"/>
+      <w:r>
+        <w:rPr>
+          <w:rFonts w:ascii="Arial" w:hAnsi="Arial" w:cs="Arial"/>
+        </w:rPr>
+        <w:t xml:space="preserve"> package facilitates diverse types of information encoding that have successfully been used to understand dynamic </w:t>
       </w:r>
       <w:r>
         <w:rPr>
@@ -11346,6 +11924,7 @@
         <w:rPr>
           <w:rFonts w:ascii="Arial" w:hAnsi="Arial" w:cs="Arial"/>
         </w:rPr>
+        <w:lastRenderedPageBreak/>
         <w:tab/>
       </w:r>
       <w:r>
@@ -11394,14 +11973,7 @@
         <w:rPr>
           <w:rFonts w:ascii="Arial" w:hAnsi="Arial" w:cs="Arial"/>
         </w:rPr>
-        <w:t xml:space="preserve">. Using character strings to encode information in synthetic signals is a computationally efficient way to represent animal vocalizations and therefore poses promising applications for simulation-based research. In addition, generating both character string and audio representations of synthetic vocalizations </w:t>
-      </w:r>
-      <w:r>
-        <w:rPr>
-          <w:rFonts w:ascii="Arial" w:hAnsi="Arial" w:cs="Arial"/>
-        </w:rPr>
-        <w:lastRenderedPageBreak/>
-        <w:t xml:space="preserve">allowed us to test that, </w:t>
+        <w:t xml:space="preserve">. Using character strings to encode information in synthetic signals is a computationally efficient way to represent animal vocalizations and therefore poses promising applications for simulation-based research. In addition, generating both character string and audio representations of synthetic vocalizations allowed us to test that, </w:t>
       </w:r>
       <w:r>
         <w:rPr>
@@ -11657,6 +12229,7 @@
         <w:rPr>
           <w:rFonts w:ascii="Arial" w:hAnsi="Arial" w:cs="Arial"/>
         </w:rPr>
+        <w:lastRenderedPageBreak/>
         <w:t xml:space="preserve">Our simulation experiments also revealed that it was </w:t>
       </w:r>
       <w:r>
@@ -11748,231 +12321,245 @@
         <w:rPr>
           <w:rFonts w:ascii="Arial" w:hAnsi="Arial" w:cs="Arial"/>
         </w:rPr>
-        <w:t xml:space="preserve">As </w:t>
+        <w:t xml:space="preserve">As we expected, we identified significantly higher </w:t>
+      </w:r>
+      <w:r>
+        <w:rPr>
+          <w:rFonts w:ascii="Arial" w:hAnsi="Arial" w:cs="Arial"/>
+        </w:rPr>
+        <w:t xml:space="preserve">accuracy of </w:t>
+      </w:r>
+      <w:r>
+        <w:rPr>
+          <w:rFonts w:ascii="Arial" w:hAnsi="Arial" w:cs="Arial"/>
+        </w:rPr>
+        <w:t xml:space="preserve">identity </w:t>
+      </w:r>
+      <w:r>
+        <w:rPr>
+          <w:rFonts w:ascii="Arial" w:hAnsi="Arial" w:cs="Arial"/>
+        </w:rPr>
+        <w:t xml:space="preserve">information </w:t>
+      </w:r>
+      <w:r>
+        <w:rPr>
+          <w:rFonts w:ascii="Arial" w:hAnsi="Arial" w:cs="Arial"/>
+        </w:rPr>
+        <w:t xml:space="preserve">detection when we analyzed strings and audio files in signal sets with </w:t>
+      </w:r>
+      <w:r>
+        <w:rPr>
+          <w:rFonts w:ascii="Arial" w:hAnsi="Arial" w:cs="Arial"/>
+        </w:rPr>
+        <w:t>fewer classes</w:t>
+      </w:r>
+      <w:r>
+        <w:rPr>
+          <w:rFonts w:ascii="Arial" w:hAnsi="Arial" w:cs="Arial"/>
+        </w:rPr>
+        <w:t xml:space="preserve"> at each social level</w:t>
+      </w:r>
+      <w:r>
+        <w:rPr>
+          <w:rFonts w:ascii="Arial" w:hAnsi="Arial" w:cs="Arial"/>
+        </w:rPr>
+        <w:t xml:space="preserve">. </w:t>
+      </w:r>
+      <w:r>
+        <w:rPr>
+          <w:rFonts w:ascii="Arial" w:hAnsi="Arial" w:cs="Arial"/>
+        </w:rPr>
+        <w:t xml:space="preserve">When generating larger signal sets, we anticipated we would be more likely to generate vocalizations that would stochastically share identity information at either social level. </w:t>
+      </w:r>
+      <w:proofErr w:type="gramStart"/>
+      <w:r>
+        <w:rPr>
+          <w:rFonts w:ascii="Arial" w:hAnsi="Arial" w:cs="Arial"/>
+        </w:rPr>
+        <w:t>In particular, o</w:t>
+      </w:r>
+      <w:r>
+        <w:rPr>
+          <w:rFonts w:ascii="Arial" w:hAnsi="Arial" w:cs="Arial"/>
+        </w:rPr>
+        <w:t>ur</w:t>
+      </w:r>
+      <w:proofErr w:type="gramEnd"/>
+      <w:r>
+        <w:rPr>
+          <w:rFonts w:ascii="Arial" w:hAnsi="Arial" w:cs="Arial"/>
+        </w:rPr>
+        <w:t xml:space="preserve"> generative process </w:t>
+      </w:r>
+      <w:r>
+        <w:rPr>
+          <w:rFonts w:ascii="Arial" w:hAnsi="Arial" w:cs="Arial"/>
+        </w:rPr>
+        <w:t xml:space="preserve">for creating character strings at the beginning of our pipeline </w:t>
+      </w:r>
+      <w:r>
+        <w:rPr>
+          <w:rFonts w:ascii="Arial" w:hAnsi="Arial" w:cs="Arial"/>
+        </w:rPr>
+        <w:t xml:space="preserve">is a random sampling process, </w:t>
+      </w:r>
+      <w:r>
+        <w:rPr>
+          <w:rFonts w:ascii="Arial" w:hAnsi="Arial" w:cs="Arial"/>
+        </w:rPr>
+        <w:t>which</w:t>
+      </w:r>
+      <w:r>
+        <w:rPr>
+          <w:rFonts w:ascii="Arial" w:hAnsi="Arial" w:cs="Arial"/>
+        </w:rPr>
+        <w:t xml:space="preserve"> alone cannot address the evolution or creation of </w:t>
+      </w:r>
+      <w:r>
+        <w:rPr>
+          <w:rFonts w:ascii="Arial" w:hAnsi="Arial" w:cs="Arial"/>
+        </w:rPr>
+        <w:t xml:space="preserve">sets of completely </w:t>
+      </w:r>
+      <w:r>
+        <w:rPr>
+          <w:rFonts w:ascii="Arial" w:hAnsi="Arial" w:cs="Arial"/>
+        </w:rPr>
+        <w:t>unique</w:t>
+      </w:r>
+      <w:r>
+        <w:rPr>
+          <w:rFonts w:ascii="Arial" w:hAnsi="Arial" w:cs="Arial"/>
+        </w:rPr>
+        <w:t xml:space="preserve"> identity information</w:t>
+      </w:r>
+      <w:r>
+        <w:rPr>
+          <w:rFonts w:ascii="Arial" w:hAnsi="Arial" w:cs="Arial"/>
+        </w:rPr>
+        <w:t xml:space="preserve">, </w:t>
+      </w:r>
+      <w:r>
+        <w:rPr>
+          <w:rFonts w:ascii="Arial" w:hAnsi="Arial" w:cs="Arial"/>
+        </w:rPr>
+        <w:t>since</w:t>
+      </w:r>
+      <w:r>
+        <w:rPr>
+          <w:rFonts w:ascii="Arial" w:hAnsi="Arial" w:cs="Arial"/>
+        </w:rPr>
+        <w:t xml:space="preserve"> there is no process selecting for </w:t>
+      </w:r>
+      <w:r>
+        <w:rPr>
+          <w:rFonts w:ascii="Arial" w:hAnsi="Arial" w:cs="Arial"/>
+        </w:rPr>
+        <w:t xml:space="preserve">the </w:t>
+      </w:r>
+      <w:r>
+        <w:rPr>
+          <w:rFonts w:ascii="Arial" w:hAnsi="Arial" w:cs="Arial"/>
+        </w:rPr>
+        <w:t xml:space="preserve">distinctiveness </w:t>
+      </w:r>
+      <w:r>
+        <w:rPr>
+          <w:rFonts w:ascii="Arial" w:hAnsi="Arial" w:cs="Arial"/>
+        </w:rPr>
+        <w:t xml:space="preserve">of </w:t>
+      </w:r>
+      <w:r>
+        <w:rPr>
+          <w:rFonts w:ascii="Arial" w:hAnsi="Arial" w:cs="Arial"/>
+        </w:rPr>
+        <w:t xml:space="preserve">information </w:t>
+      </w:r>
+      <w:r>
+        <w:rPr>
+          <w:rFonts w:ascii="Arial" w:hAnsi="Arial" w:cs="Arial"/>
+        </w:rPr>
+        <w:t xml:space="preserve">amongst classes </w:t>
+      </w:r>
+      <w:r>
+        <w:rPr>
+          <w:rFonts w:ascii="Arial" w:hAnsi="Arial" w:cs="Arial"/>
+        </w:rPr>
+        <w:t>at a given social level</w:t>
+      </w:r>
+      <w:r>
+        <w:rPr>
+          <w:rFonts w:ascii="Arial" w:hAnsi="Arial" w:cs="Arial"/>
+        </w:rPr>
+        <w:t xml:space="preserve">. </w:t>
+      </w:r>
+      <w:r>
+        <w:rPr>
+          <w:rFonts w:ascii="Arial" w:hAnsi="Arial" w:cs="Arial"/>
+        </w:rPr>
+        <w:t xml:space="preserve">In other words, </w:t>
+      </w:r>
+      <w:r>
+        <w:rPr>
+          <w:rFonts w:ascii="Arial" w:hAnsi="Arial" w:cs="Arial"/>
+        </w:rPr>
+        <w:t xml:space="preserve">we expected stochastic similarity in </w:t>
+      </w:r>
+      <w:r>
+        <w:rPr>
+          <w:rFonts w:ascii="Arial" w:hAnsi="Arial" w:cs="Arial"/>
+        </w:rPr>
+        <w:t>identity information</w:t>
+      </w:r>
+      <w:r>
+        <w:rPr>
+          <w:rFonts w:ascii="Arial" w:hAnsi="Arial" w:cs="Arial"/>
+        </w:rPr>
+        <w:t xml:space="preserve"> amongst classes, but especially with increasing class sizes at the individual and group level</w:t>
+      </w:r>
+      <w:r>
+        <w:rPr>
+          <w:rFonts w:ascii="Arial" w:hAnsi="Arial" w:cs="Arial"/>
+        </w:rPr>
+        <w:t xml:space="preserve">, as evidenced in </w:t>
+      </w:r>
+      <w:r>
+        <w:rPr>
+          <w:rFonts w:ascii="Arial" w:hAnsi="Arial" w:cs="Arial"/>
+        </w:rPr>
+        <w:t xml:space="preserve">acoustic space plots of </w:t>
+      </w:r>
+      <w:r>
+        <w:rPr>
+          <w:rFonts w:ascii="Arial" w:hAnsi="Arial" w:cs="Arial"/>
+        </w:rPr>
+        <w:t>our example datasets, which show stochastic overlap amongst individuals within groups for the individually distinctive dataset, and stochastic overlap amongst groups for the group-specific dataset (Figures S1 and S2)</w:t>
+      </w:r>
+      <w:r>
+        <w:rPr>
+          <w:rFonts w:ascii="Arial" w:hAnsi="Arial" w:cs="Arial"/>
+        </w:rPr>
+        <w:t>.</w:t>
+      </w:r>
+      <w:r>
+        <w:rPr>
+          <w:rFonts w:ascii="Arial" w:hAnsi="Arial" w:cs="Arial"/>
+        </w:rPr>
+        <w:t xml:space="preserve"> </w:t>
+      </w:r>
+      <w:commentRangeStart w:id="38"/>
+      <w:r>
+        <w:rPr>
+          <w:rFonts w:ascii="Arial" w:hAnsi="Arial" w:cs="Arial"/>
+        </w:rPr>
+        <w:t xml:space="preserve">This stochasticity in the uniqueness of identity information simulates sampling animals in the wild, in that we do not always have complete information about </w:t>
       </w:r>
       <w:r>
         <w:rPr>
           <w:rFonts w:ascii="Arial" w:hAnsi="Arial" w:cs="Arial"/>
         </w:rPr>
         <w:lastRenderedPageBreak/>
-        <w:t xml:space="preserve">we expected, we identified significantly higher </w:t>
-      </w:r>
-      <w:r>
-        <w:rPr>
-          <w:rFonts w:ascii="Arial" w:hAnsi="Arial" w:cs="Arial"/>
-        </w:rPr>
-        <w:t xml:space="preserve">accuracy of </w:t>
-      </w:r>
-      <w:r>
-        <w:rPr>
-          <w:rFonts w:ascii="Arial" w:hAnsi="Arial" w:cs="Arial"/>
-        </w:rPr>
-        <w:t xml:space="preserve">identity </w:t>
-      </w:r>
-      <w:r>
-        <w:rPr>
-          <w:rFonts w:ascii="Arial" w:hAnsi="Arial" w:cs="Arial"/>
-        </w:rPr>
-        <w:t xml:space="preserve">information </w:t>
-      </w:r>
-      <w:r>
-        <w:rPr>
-          <w:rFonts w:ascii="Arial" w:hAnsi="Arial" w:cs="Arial"/>
-        </w:rPr>
-        <w:t xml:space="preserve">detection when we analyzed strings and audio files in signal sets with </w:t>
-      </w:r>
-      <w:r>
-        <w:rPr>
-          <w:rFonts w:ascii="Arial" w:hAnsi="Arial" w:cs="Arial"/>
-        </w:rPr>
-        <w:t>fewer classes</w:t>
-      </w:r>
-      <w:r>
-        <w:rPr>
-          <w:rFonts w:ascii="Arial" w:hAnsi="Arial" w:cs="Arial"/>
-        </w:rPr>
-        <w:t xml:space="preserve"> at each social level</w:t>
-      </w:r>
-      <w:r>
-        <w:rPr>
-          <w:rFonts w:ascii="Arial" w:hAnsi="Arial" w:cs="Arial"/>
-        </w:rPr>
-        <w:t xml:space="preserve">. </w:t>
-      </w:r>
-      <w:r>
-        <w:rPr>
-          <w:rFonts w:ascii="Arial" w:hAnsi="Arial" w:cs="Arial"/>
-        </w:rPr>
-        <w:t>When generating larger signal sets, we anticipated we would be more likely to generate vocalizations that would stochastically share identity information at either social level. In particular, o</w:t>
-      </w:r>
-      <w:r>
-        <w:rPr>
-          <w:rFonts w:ascii="Arial" w:hAnsi="Arial" w:cs="Arial"/>
-        </w:rPr>
-        <w:t xml:space="preserve">ur generative process </w:t>
-      </w:r>
-      <w:r>
-        <w:rPr>
-          <w:rFonts w:ascii="Arial" w:hAnsi="Arial" w:cs="Arial"/>
-        </w:rPr>
-        <w:t xml:space="preserve">for creating character strings at the beginning of our pipeline </w:t>
-      </w:r>
-      <w:r>
-        <w:rPr>
-          <w:rFonts w:ascii="Arial" w:hAnsi="Arial" w:cs="Arial"/>
-        </w:rPr>
-        <w:t xml:space="preserve">is a random sampling process, </w:t>
-      </w:r>
-      <w:r>
-        <w:rPr>
-          <w:rFonts w:ascii="Arial" w:hAnsi="Arial" w:cs="Arial"/>
-        </w:rPr>
-        <w:t>which</w:t>
-      </w:r>
-      <w:r>
-        <w:rPr>
-          <w:rFonts w:ascii="Arial" w:hAnsi="Arial" w:cs="Arial"/>
-        </w:rPr>
-        <w:t xml:space="preserve"> alone cannot address the evolution or creation of </w:t>
-      </w:r>
-      <w:r>
-        <w:rPr>
-          <w:rFonts w:ascii="Arial" w:hAnsi="Arial" w:cs="Arial"/>
-        </w:rPr>
-        <w:t xml:space="preserve">sets of completely </w:t>
-      </w:r>
-      <w:r>
-        <w:rPr>
-          <w:rFonts w:ascii="Arial" w:hAnsi="Arial" w:cs="Arial"/>
-        </w:rPr>
-        <w:t>unique</w:t>
-      </w:r>
-      <w:r>
-        <w:rPr>
-          <w:rFonts w:ascii="Arial" w:hAnsi="Arial" w:cs="Arial"/>
-        </w:rPr>
-        <w:t xml:space="preserve"> identity information</w:t>
-      </w:r>
-      <w:r>
-        <w:rPr>
-          <w:rFonts w:ascii="Arial" w:hAnsi="Arial" w:cs="Arial"/>
-        </w:rPr>
-        <w:t xml:space="preserve">, </w:t>
-      </w:r>
-      <w:r>
-        <w:rPr>
-          <w:rFonts w:ascii="Arial" w:hAnsi="Arial" w:cs="Arial"/>
-        </w:rPr>
-        <w:t>since</w:t>
-      </w:r>
-      <w:r>
-        <w:rPr>
-          <w:rFonts w:ascii="Arial" w:hAnsi="Arial" w:cs="Arial"/>
-        </w:rPr>
-        <w:t xml:space="preserve"> there is no process selecting for </w:t>
-      </w:r>
-      <w:r>
-        <w:rPr>
-          <w:rFonts w:ascii="Arial" w:hAnsi="Arial" w:cs="Arial"/>
-        </w:rPr>
-        <w:t xml:space="preserve">the </w:t>
-      </w:r>
-      <w:r>
-        <w:rPr>
-          <w:rFonts w:ascii="Arial" w:hAnsi="Arial" w:cs="Arial"/>
-        </w:rPr>
-        <w:t xml:space="preserve">distinctiveness </w:t>
-      </w:r>
-      <w:r>
-        <w:rPr>
-          <w:rFonts w:ascii="Arial" w:hAnsi="Arial" w:cs="Arial"/>
-        </w:rPr>
-        <w:t xml:space="preserve">of </w:t>
-      </w:r>
-      <w:r>
-        <w:rPr>
-          <w:rFonts w:ascii="Arial" w:hAnsi="Arial" w:cs="Arial"/>
-        </w:rPr>
-        <w:t xml:space="preserve">information </w:t>
-      </w:r>
-      <w:r>
-        <w:rPr>
-          <w:rFonts w:ascii="Arial" w:hAnsi="Arial" w:cs="Arial"/>
-        </w:rPr>
-        <w:t xml:space="preserve">amongst classes </w:t>
-      </w:r>
-      <w:r>
-        <w:rPr>
-          <w:rFonts w:ascii="Arial" w:hAnsi="Arial" w:cs="Arial"/>
-        </w:rPr>
-        <w:t>at a given social level</w:t>
-      </w:r>
-      <w:r>
-        <w:rPr>
-          <w:rFonts w:ascii="Arial" w:hAnsi="Arial" w:cs="Arial"/>
-        </w:rPr>
-        <w:t xml:space="preserve">. </w:t>
-      </w:r>
-      <w:r>
-        <w:rPr>
-          <w:rFonts w:ascii="Arial" w:hAnsi="Arial" w:cs="Arial"/>
-        </w:rPr>
-        <w:t xml:space="preserve">In other words, </w:t>
-      </w:r>
-      <w:r>
-        <w:rPr>
-          <w:rFonts w:ascii="Arial" w:hAnsi="Arial" w:cs="Arial"/>
-        </w:rPr>
-        <w:t xml:space="preserve">we expected stochastic similarity in </w:t>
-      </w:r>
-      <w:r>
-        <w:rPr>
-          <w:rFonts w:ascii="Arial" w:hAnsi="Arial" w:cs="Arial"/>
-        </w:rPr>
-        <w:t>identity information</w:t>
-      </w:r>
-      <w:r>
-        <w:rPr>
-          <w:rFonts w:ascii="Arial" w:hAnsi="Arial" w:cs="Arial"/>
-        </w:rPr>
-        <w:t xml:space="preserve"> amongst classes, but especially with increasing class sizes at the individual and group level</w:t>
-      </w:r>
-      <w:r>
-        <w:rPr>
-          <w:rFonts w:ascii="Arial" w:hAnsi="Arial" w:cs="Arial"/>
-        </w:rPr>
-        <w:t xml:space="preserve">, as evidenced in </w:t>
-      </w:r>
-      <w:r>
-        <w:rPr>
-          <w:rFonts w:ascii="Arial" w:hAnsi="Arial" w:cs="Arial"/>
-        </w:rPr>
-        <w:t xml:space="preserve">acoustic space plots of </w:t>
-      </w:r>
-      <w:r>
-        <w:rPr>
-          <w:rFonts w:ascii="Arial" w:hAnsi="Arial" w:cs="Arial"/>
-        </w:rPr>
-        <w:t>our example datasets, which show stochastic overlap amongst individuals within groups for the individually distinctive dataset, and stochastic overlap amongst groups for the group-specific dataset (Figures S1 and S2)</w:t>
-      </w:r>
-      <w:r>
-        <w:rPr>
-          <w:rFonts w:ascii="Arial" w:hAnsi="Arial" w:cs="Arial"/>
-        </w:rPr>
-        <w:t>.</w:t>
-      </w:r>
-      <w:r>
-        <w:rPr>
-          <w:rFonts w:ascii="Arial" w:hAnsi="Arial" w:cs="Arial"/>
-        </w:rPr>
-        <w:t xml:space="preserve"> </w:t>
-      </w:r>
-      <w:commentRangeStart w:id="38"/>
-      <w:r>
-        <w:rPr>
-          <w:rFonts w:ascii="Arial" w:hAnsi="Arial" w:cs="Arial"/>
-        </w:rPr>
-        <w:t>This stochasticity in the uniqueness of identity information simulates sampling animals in the wild, in that we do not always have complete information about what information is important to communicate, nor complete information about animals’ social connections, and therefore do not know a priori which types of information are encoded in greater amounts, whether information is encoded across more than one social level, but also which classes at different social levels actually interact and are under pressure to sound similar to or distinctive from one another.</w:t>
+        <w:t>what information is important to communicate, nor complete information about animals’ social connections, and therefore do not know a priori which types of information are encoded in greater amounts, whether information is encoded across more than one social level, but also which classes at different social levels actually interact and are under pressure to sound similar to or distinctive from one another.</w:t>
       </w:r>
       <w:commentRangeEnd w:id="38"/>
       <w:r>
@@ -12010,14 +12597,7 @@
         <w:rPr>
           <w:rFonts w:ascii="Arial" w:hAnsi="Arial" w:cs="Arial"/>
         </w:rPr>
-        <w:t xml:space="preserve">, when both group and individual identity information were encoded in the </w:t>
-      </w:r>
-      <w:r>
-        <w:rPr>
-          <w:rFonts w:ascii="Arial" w:hAnsi="Arial" w:cs="Arial"/>
-        </w:rPr>
-        <w:lastRenderedPageBreak/>
-        <w:t>same signal</w:t>
+        <w:t>, when both group and individual identity information were encoded in the same signal</w:t>
       </w:r>
       <w:r>
         <w:rPr>
@@ -12257,7 +12837,21 @@
         <w:rPr>
           <w:rFonts w:ascii="Arial" w:hAnsi="Arial" w:cs="Arial"/>
         </w:rPr>
-        <w:t xml:space="preserve"> We are currently producing a second version of the paRsynth package that will facilitate</w:t>
+        <w:t xml:space="preserve"> We are currently producing a second version of the </w:t>
+      </w:r>
+      <w:proofErr w:type="spellStart"/>
+      <w:r>
+        <w:rPr>
+          <w:rFonts w:ascii="Arial" w:hAnsi="Arial" w:cs="Arial"/>
+        </w:rPr>
+        <w:t>paRsynth</w:t>
+      </w:r>
+      <w:proofErr w:type="spellEnd"/>
+      <w:r>
+        <w:rPr>
+          <w:rFonts w:ascii="Arial" w:hAnsi="Arial" w:cs="Arial"/>
+        </w:rPr>
+        <w:t xml:space="preserve"> package that will facilitate</w:t>
       </w:r>
       <w:r>
         <w:rPr>
@@ -12314,6 +12908,7 @@
         <w:rPr>
           <w:rFonts w:ascii="Arial" w:hAnsi="Arial" w:cs="Arial"/>
         </w:rPr>
+        <w:lastRenderedPageBreak/>
         <w:t xml:space="preserve">In summary, we developed a new </w:t>
       </w:r>
       <w:r>
@@ -12447,7 +13042,21 @@
         <w:rPr>
           <w:rFonts w:ascii="Arial" w:hAnsi="Arial" w:cs="Arial"/>
         </w:rPr>
-        <w:t xml:space="preserve"> (paRsynth, CITE?)</w:t>
+        <w:t xml:space="preserve"> (</w:t>
+      </w:r>
+      <w:proofErr w:type="spellStart"/>
+      <w:r>
+        <w:rPr>
+          <w:rFonts w:ascii="Arial" w:hAnsi="Arial" w:cs="Arial"/>
+        </w:rPr>
+        <w:t>paRsynth</w:t>
+      </w:r>
+      <w:proofErr w:type="spellEnd"/>
+      <w:r>
+        <w:rPr>
+          <w:rFonts w:ascii="Arial" w:hAnsi="Arial" w:cs="Arial"/>
+        </w:rPr>
+        <w:t>, CITE?)</w:t>
       </w:r>
       <w:r>
         <w:rPr>
@@ -12477,14 +13086,7 @@
         <w:rPr>
           <w:rFonts w:ascii="Arial" w:hAnsi="Arial" w:cs="Arial"/>
         </w:rPr>
-        <w:t xml:space="preserve"> while also </w:t>
-      </w:r>
-      <w:r>
-        <w:rPr>
-          <w:rFonts w:ascii="Arial" w:hAnsi="Arial" w:cs="Arial"/>
-        </w:rPr>
-        <w:lastRenderedPageBreak/>
-        <w:t xml:space="preserve">producing </w:t>
+        <w:t xml:space="preserve"> while also producing </w:t>
       </w:r>
       <w:r>
         <w:rPr>
@@ -12804,7 +13406,21 @@
         <w:rPr>
           <w:rFonts w:ascii="Arial" w:hAnsi="Arial" w:cs="Arial"/>
         </w:rPr>
-        <w:t xml:space="preserve"> to directional changes with Parsons code</w:t>
+        <w:t xml:space="preserve"> to directional changes with </w:t>
+      </w:r>
+      <w:proofErr w:type="gramStart"/>
+      <w:r>
+        <w:rPr>
+          <w:rFonts w:ascii="Arial" w:hAnsi="Arial" w:cs="Arial"/>
+        </w:rPr>
+        <w:t>Parsons</w:t>
+      </w:r>
+      <w:proofErr w:type="gramEnd"/>
+      <w:r>
+        <w:rPr>
+          <w:rFonts w:ascii="Arial" w:hAnsi="Arial" w:cs="Arial"/>
+        </w:rPr>
+        <w:t xml:space="preserve"> code</w:t>
       </w:r>
       <w:r>
         <w:rPr>
@@ -12816,7 +13432,14 @@
         <w:rPr>
           <w:rFonts w:ascii="Arial" w:hAnsi="Arial" w:cs="Arial"/>
         </w:rPr>
-        <w:t xml:space="preserve"> creating a timeseries of frequency values from these directional changes</w:t>
+        <w:t xml:space="preserve"> creating a timeseries of frequency values from these directional </w:t>
+      </w:r>
+      <w:r>
+        <w:rPr>
+          <w:rFonts w:ascii="Arial" w:hAnsi="Arial" w:cs="Arial"/>
+        </w:rPr>
+        <w:lastRenderedPageBreak/>
+        <w:t>changes</w:t>
       </w:r>
       <w:r>
         <w:rPr>
@@ -12901,7 +13524,21 @@
         <w:rPr>
           <w:rFonts w:ascii="Arial" w:hAnsi="Arial" w:cs="Arial"/>
         </w:rPr>
-        <w:t>an R package called paRsynth that is available on GitHub</w:t>
+        <w:t xml:space="preserve">an R package called </w:t>
+      </w:r>
+      <w:proofErr w:type="spellStart"/>
+      <w:r>
+        <w:rPr>
+          <w:rFonts w:ascii="Arial" w:hAnsi="Arial" w:cs="Arial"/>
+        </w:rPr>
+        <w:t>paRsynth</w:t>
+      </w:r>
+      <w:proofErr w:type="spellEnd"/>
+      <w:r>
+        <w:rPr>
+          <w:rFonts w:ascii="Arial" w:hAnsi="Arial" w:cs="Arial"/>
+        </w:rPr>
+        <w:t xml:space="preserve"> that is available on GitHub</w:t>
       </w:r>
       <w:r>
         <w:rPr>
@@ -12940,7 +13577,21 @@
         <w:rPr>
           <w:rFonts w:ascii="Arial" w:hAnsi="Arial" w:cs="Arial"/>
         </w:rPr>
-        <w:t xml:space="preserve">Our package relies on the existing R package soundgen </w:t>
+        <w:t xml:space="preserve">Our package relies on the existing R package </w:t>
+      </w:r>
+      <w:proofErr w:type="spellStart"/>
+      <w:r>
+        <w:rPr>
+          <w:rFonts w:ascii="Arial" w:hAnsi="Arial" w:cs="Arial"/>
+        </w:rPr>
+        <w:t>soundgen</w:t>
+      </w:r>
+      <w:proofErr w:type="spellEnd"/>
+      <w:r>
+        <w:rPr>
+          <w:rFonts w:ascii="Arial" w:hAnsi="Arial" w:cs="Arial"/>
+        </w:rPr>
+        <w:t xml:space="preserve"> </w:t>
       </w:r>
       <w:r>
         <w:rPr>
@@ -12988,7 +13639,21 @@
         <w:rPr>
           <w:rFonts w:ascii="Arial" w:hAnsi="Arial" w:cs="Arial"/>
         </w:rPr>
-        <w:t>steps in our pipeline available through the paRsynth package</w:t>
+        <w:t xml:space="preserve">steps in our pipeline available through the </w:t>
+      </w:r>
+      <w:proofErr w:type="spellStart"/>
+      <w:r>
+        <w:rPr>
+          <w:rFonts w:ascii="Arial" w:hAnsi="Arial" w:cs="Arial"/>
+        </w:rPr>
+        <w:t>paRsynth</w:t>
+      </w:r>
+      <w:proofErr w:type="spellEnd"/>
+      <w:r>
+        <w:rPr>
+          <w:rFonts w:ascii="Arial" w:hAnsi="Arial" w:cs="Arial"/>
+        </w:rPr>
+        <w:t xml:space="preserve"> package</w:t>
       </w:r>
       <w:r>
         <w:rPr>
@@ -13008,7 +13673,6 @@
         <w:rPr>
           <w:rFonts w:ascii="Arial" w:hAnsi="Arial" w:cs="Arial"/>
         </w:rPr>
-        <w:lastRenderedPageBreak/>
         <w:tab/>
         <w:t>First, we generated character strings to represent synthetic vocal identity signals.</w:t>
       </w:r>
@@ -13309,7 +13973,14 @@
         <w:rPr>
           <w:rFonts w:ascii="Arial" w:hAnsi="Arial" w:cs="Arial"/>
         </w:rPr>
-        <w:t xml:space="preserve">In the first version of our pipeline, </w:t>
+        <w:t xml:space="preserve">In </w:t>
+      </w:r>
+      <w:r>
+        <w:rPr>
+          <w:rFonts w:ascii="Arial" w:hAnsi="Arial" w:cs="Arial"/>
+        </w:rPr>
+        <w:lastRenderedPageBreak/>
+        <w:t xml:space="preserve">the first version of our pipeline, </w:t>
       </w:r>
       <w:r>
         <w:rPr>
@@ -13527,14 +14198,7 @@
         <w:rPr>
           <w:rFonts w:ascii="Arial" w:hAnsi="Arial" w:cs="Arial"/>
         </w:rPr>
-        <w:t xml:space="preserve">e used 1-Parsons encoding, </w:t>
-      </w:r>
-      <w:r>
-        <w:rPr>
-          <w:rFonts w:ascii="Arial" w:hAnsi="Arial" w:cs="Arial"/>
-        </w:rPr>
-        <w:lastRenderedPageBreak/>
-        <w:t>which reduces the frequenc</w:t>
+        <w:t>e used 1-Parsons encoding, which reduces the frequenc</w:t>
       </w:r>
       <w:r>
         <w:rPr>
@@ -13558,7 +14222,21 @@
         <w:rPr>
           <w:rFonts w:ascii="Arial" w:hAnsi="Arial" w:cs="Arial"/>
         </w:rPr>
-        <w:t xml:space="preserve"> “trit” by noting the direction of frequency change (up, down, or constant) in a series of subsamples from the original signal, known as Parsons segments. Parsons code is often used in the retrieval and study of music </w:t>
+        <w:t xml:space="preserve"> “</w:t>
+      </w:r>
+      <w:proofErr w:type="spellStart"/>
+      <w:r>
+        <w:rPr>
+          <w:rFonts w:ascii="Arial" w:hAnsi="Arial" w:cs="Arial"/>
+        </w:rPr>
+        <w:t>trit</w:t>
+      </w:r>
+      <w:proofErr w:type="spellEnd"/>
+      <w:r>
+        <w:rPr>
+          <w:rFonts w:ascii="Arial" w:hAnsi="Arial" w:cs="Arial"/>
+        </w:rPr>
+        <w:t xml:space="preserve">” by noting the direction of frequency change (up, down, or constant) in a series of subsamples from the original signal, known as Parsons segments. Parsons code is often used in the retrieval and study of music </w:t>
       </w:r>
       <w:r>
         <w:rPr>
@@ -13777,7 +14455,21 @@
         <w:rPr>
           <w:rFonts w:ascii="Arial" w:hAnsi="Arial" w:cs="Arial"/>
         </w:rPr>
-        <w:t xml:space="preserve"> Parsons code, </w:t>
+        <w:t xml:space="preserve"> </w:t>
+      </w:r>
+      <w:proofErr w:type="gramStart"/>
+      <w:r>
+        <w:rPr>
+          <w:rFonts w:ascii="Arial" w:hAnsi="Arial" w:cs="Arial"/>
+        </w:rPr>
+        <w:t>Parsons</w:t>
+      </w:r>
+      <w:proofErr w:type="gramEnd"/>
+      <w:r>
+        <w:rPr>
+          <w:rFonts w:ascii="Arial" w:hAnsi="Arial" w:cs="Arial"/>
+        </w:rPr>
+        <w:t xml:space="preserve"> code, </w:t>
       </w:r>
       <w:r>
         <w:rPr>
@@ -13867,13 +14559,27 @@
         <w:rPr>
           <w:rFonts w:ascii="Arial" w:hAnsi="Arial" w:cs="Arial"/>
         </w:rPr>
-        <w:t>1 kHz</w:t>
-      </w:r>
-      <w:r>
-        <w:rPr>
-          <w:rFonts w:ascii="Arial" w:hAnsi="Arial" w:cs="Arial"/>
-        </w:rPr>
-        <w:t xml:space="preserve">, or remained constant with respect to the value that came before. </w:t>
+        <w:t xml:space="preserve">1 </w:t>
+      </w:r>
+      <w:proofErr w:type="gramStart"/>
+      <w:r>
+        <w:rPr>
+          <w:rFonts w:ascii="Arial" w:hAnsi="Arial" w:cs="Arial"/>
+        </w:rPr>
+        <w:t>kHz</w:t>
+      </w:r>
+      <w:r>
+        <w:rPr>
+          <w:rFonts w:ascii="Arial" w:hAnsi="Arial" w:cs="Arial"/>
+        </w:rPr>
+        <w:t>, or</w:t>
+      </w:r>
+      <w:proofErr w:type="gramEnd"/>
+      <w:r>
+        <w:rPr>
+          <w:rFonts w:ascii="Arial" w:hAnsi="Arial" w:cs="Arial"/>
+        </w:rPr>
+        <w:t xml:space="preserve"> remained constant with respect to the value that came before. </w:t>
       </w:r>
       <w:r>
         <w:rPr>
@@ -13957,7 +14663,14 @@
         <w:rPr>
           <w:rFonts w:ascii="Arial" w:hAnsi="Arial" w:cs="Arial"/>
         </w:rPr>
-        <w:t>Hz. However, if the first Parson’s code was “</w:t>
+        <w:t xml:space="preserve">Hz. However, if the first Parson’s code </w:t>
+      </w:r>
+      <w:r>
+        <w:rPr>
+          <w:rFonts w:ascii="Arial" w:hAnsi="Arial" w:cs="Arial"/>
+        </w:rPr>
+        <w:lastRenderedPageBreak/>
+        <w:t>was “</w:t>
       </w:r>
       <w:r>
         <w:rPr>
@@ -14098,14 +14811,710 @@
         <w:rPr>
           <w:rFonts w:ascii="Arial" w:hAnsi="Arial" w:cs="Arial"/>
         </w:rPr>
+        <w:t>The</w:t>
+      </w:r>
+      <w:r>
+        <w:rPr>
+          <w:rFonts w:ascii="Arial" w:hAnsi="Arial" w:cs="Arial"/>
+        </w:rPr>
+        <w:t xml:space="preserve"> fourth and final step in our pipeline was</w:t>
+      </w:r>
+      <w:r>
+        <w:rPr>
+          <w:rFonts w:ascii="Arial" w:hAnsi="Arial" w:cs="Arial"/>
+        </w:rPr>
+        <w:t xml:space="preserve"> </w:t>
+      </w:r>
+      <w:r>
+        <w:rPr>
+          <w:rFonts w:ascii="Arial" w:hAnsi="Arial" w:cs="Arial"/>
+        </w:rPr>
+        <w:t xml:space="preserve">to </w:t>
+      </w:r>
+      <w:r>
+        <w:rPr>
+          <w:rFonts w:ascii="Arial" w:hAnsi="Arial" w:cs="Arial"/>
+        </w:rPr>
+        <w:t>us</w:t>
+      </w:r>
+      <w:r>
+        <w:rPr>
+          <w:rFonts w:ascii="Arial" w:hAnsi="Arial" w:cs="Arial"/>
+        </w:rPr>
+        <w:t>e</w:t>
+      </w:r>
+      <w:r>
+        <w:rPr>
+          <w:rFonts w:ascii="Arial" w:hAnsi="Arial" w:cs="Arial"/>
+        </w:rPr>
+        <w:t xml:space="preserve"> the frequency </w:t>
+      </w:r>
+      <w:r>
+        <w:rPr>
+          <w:rFonts w:ascii="Arial" w:hAnsi="Arial" w:cs="Arial"/>
+        </w:rPr>
+        <w:t>timeseries as “</w:t>
+      </w:r>
+      <w:r>
+        <w:rPr>
+          <w:rFonts w:ascii="Arial" w:hAnsi="Arial" w:cs="Arial"/>
+        </w:rPr>
+        <w:t>anchors</w:t>
+      </w:r>
+      <w:r>
+        <w:rPr>
+          <w:rFonts w:ascii="Arial" w:hAnsi="Arial" w:cs="Arial"/>
+        </w:rPr>
+        <w:t>”</w:t>
+      </w:r>
+      <w:r>
+        <w:rPr>
+          <w:rFonts w:ascii="Arial" w:hAnsi="Arial" w:cs="Arial"/>
+        </w:rPr>
+        <w:t xml:space="preserve"> </w:t>
+      </w:r>
+      <w:r>
+        <w:rPr>
+          <w:rFonts w:ascii="Arial" w:hAnsi="Arial" w:cs="Arial"/>
+        </w:rPr>
+        <w:t xml:space="preserve">to guide the generation of frequency modulation patterns </w:t>
+      </w:r>
+      <w:r>
+        <w:rPr>
+          <w:rFonts w:ascii="Arial" w:hAnsi="Arial" w:cs="Arial"/>
+        </w:rPr>
+        <w:t>in</w:t>
+      </w:r>
+      <w:r>
+        <w:rPr>
+          <w:rFonts w:ascii="Arial" w:hAnsi="Arial" w:cs="Arial"/>
+        </w:rPr>
+        <w:t xml:space="preserve"> synthetic vocalizations </w:t>
+      </w:r>
+      <w:r>
+        <w:rPr>
+          <w:rFonts w:ascii="Arial" w:hAnsi="Arial" w:cs="Arial"/>
+        </w:rPr>
+        <w:t xml:space="preserve">with </w:t>
+      </w:r>
+      <w:r>
+        <w:rPr>
+          <w:rFonts w:ascii="Arial" w:hAnsi="Arial" w:cs="Arial"/>
+        </w:rPr>
+        <w:t xml:space="preserve">the </w:t>
+      </w:r>
+      <w:proofErr w:type="spellStart"/>
+      <w:r>
+        <w:rPr>
+          <w:rFonts w:ascii="Arial" w:hAnsi="Arial" w:cs="Arial"/>
+        </w:rPr>
+        <w:t>s</w:t>
+      </w:r>
+      <w:r>
+        <w:rPr>
+          <w:rFonts w:ascii="Arial" w:hAnsi="Arial" w:cs="Arial"/>
+        </w:rPr>
+        <w:t>oundgen</w:t>
+      </w:r>
+      <w:proofErr w:type="spellEnd"/>
+      <w:r>
+        <w:rPr>
+          <w:rFonts w:ascii="Arial" w:hAnsi="Arial" w:cs="Arial"/>
+        </w:rPr>
+        <w:t xml:space="preserve"> </w:t>
+      </w:r>
+      <w:r>
+        <w:rPr>
+          <w:rFonts w:ascii="Arial" w:hAnsi="Arial" w:cs="Arial"/>
+        </w:rPr>
+        <w:t xml:space="preserve">R </w:t>
+      </w:r>
+      <w:r>
+        <w:rPr>
+          <w:rFonts w:ascii="Arial" w:hAnsi="Arial" w:cs="Arial"/>
+        </w:rPr>
+        <w:t>package</w:t>
+      </w:r>
+      <w:r>
+        <w:rPr>
+          <w:rFonts w:ascii="Arial" w:hAnsi="Arial" w:cs="Arial"/>
+        </w:rPr>
+        <w:t xml:space="preserve"> version 2.7.1</w:t>
+      </w:r>
+      <w:r>
+        <w:rPr>
+          <w:rFonts w:ascii="Arial" w:hAnsi="Arial" w:cs="Arial"/>
+        </w:rPr>
+        <w:t xml:space="preserve"> </w:t>
+      </w:r>
+      <w:r>
+        <w:rPr>
+          <w:rFonts w:ascii="Arial" w:hAnsi="Arial" w:cs="Arial"/>
+        </w:rPr>
+        <w:fldChar w:fldCharType="begin"/>
+      </w:r>
+      <w:r>
+        <w:rPr>
+          <w:rFonts w:ascii="Arial" w:hAnsi="Arial" w:cs="Arial"/>
+        </w:rPr>
+        <w:instrText xml:space="preserve"> ADDIN ZOTERO_ITEM CSL_CITATION {"citationID":"zRK0sr3g","properties":{"formattedCitation":"(23)","plainCitation":"(23)","noteIndex":0},"citationItems":[{"id":833,"uris":["http://zotero.org/groups/5786507/items/9FR7DCSI"],"itemData":{"id":833,"type":"article-journal","abstract":"Voice synthesis is a useful method for investigating the communicative role of different acoustic features. Although many text-to-speech systems are available, researchers of human nonverbal vocalizations and bioacousticians may profit from a dedicated simple tool for synthesizing and manipulating natural-sounding vocalizations. Soundgen (https://CRAN.R-project.org/package=soundgen) is an open-source R package that synthesizes nonverbal vocalizations based on meaningful acoustic parameters, which can be specified from the command line or in an interactive app. This tool was validated by comparing the perceived emotion, valence, arousal, and authenticity of 60 recorded human nonverbal vocalizations (screams, moans, laughs, and so on) and their approximate synthetic reproductions. Each synthetic sound was created by manually specifying only a small number of high-level control parameters, such as syllable length and a few anchors for the intonation contour. Nevertheless, the valence and arousal ratings of synthetic sounds were similar to those of the original recordings, and the authenticity ratings were comparable, maintaining parity with the originals for less complex vocalizations. Manipulating the precise acoustic characteristics of synthetic sounds may shed light on the salient predictors of emotion in the human voice. More generally, soundgen may prove useful for any studies that require precise control over the acoustic features of nonspeech sounds, including research on animal vocalizations and auditory perception.","container-title":"Behavior Research Methods","DOI":"10.3758/s13428-018-1095-7","ISSN":"1554-3528","issue":"2","journalAbbreviation":"Behav Res","language":"en","page":"778-792","source":"Springer Link","title":"Soundgen: An open-source tool for synthesizing nonverbal vocalizations","title-short":"Soundgen","volume":"51","author":[{"family":"Anikin","given":"Andrey"}],"issued":{"date-parts":[["2019",4,1]]}}}],"schema":"https://github.com/citation-style-language/schema/raw/master/csl-citation.json"} </w:instrText>
+      </w:r>
+      <w:r>
+        <w:rPr>
+          <w:rFonts w:ascii="Arial" w:hAnsi="Arial" w:cs="Arial"/>
+        </w:rPr>
+        <w:fldChar w:fldCharType="separate"/>
+      </w:r>
+      <w:r>
+        <w:rPr>
+          <w:rFonts w:ascii="Arial" w:hAnsi="Arial" w:cs="Arial"/>
+        </w:rPr>
+        <w:t>(23)</w:t>
+      </w:r>
+      <w:r>
+        <w:rPr>
+          <w:rFonts w:ascii="Arial" w:hAnsi="Arial" w:cs="Arial"/>
+        </w:rPr>
+        <w:fldChar w:fldCharType="end"/>
+      </w:r>
+      <w:r>
+        <w:rPr>
+          <w:rFonts w:ascii="Arial" w:hAnsi="Arial" w:cs="Arial"/>
+        </w:rPr>
+        <w:t xml:space="preserve">. </w:t>
+      </w:r>
+      <w:r>
+        <w:rPr>
+          <w:rFonts w:ascii="Arial" w:hAnsi="Arial" w:cs="Arial"/>
+        </w:rPr>
+        <w:t xml:space="preserve">Here, we developed a function that relies on the </w:t>
+      </w:r>
+      <w:proofErr w:type="spellStart"/>
+      <w:proofErr w:type="gramStart"/>
+      <w:r>
+        <w:rPr>
+          <w:rFonts w:ascii="Arial" w:hAnsi="Arial" w:cs="Arial"/>
+        </w:rPr>
+        <w:t>soundgen</w:t>
+      </w:r>
+      <w:proofErr w:type="spellEnd"/>
+      <w:r>
+        <w:rPr>
+          <w:rFonts w:ascii="Arial" w:hAnsi="Arial" w:cs="Arial"/>
+        </w:rPr>
+        <w:t>(</w:t>
+      </w:r>
+      <w:proofErr w:type="gramEnd"/>
+      <w:r>
+        <w:rPr>
+          <w:rFonts w:ascii="Arial" w:hAnsi="Arial" w:cs="Arial"/>
+        </w:rPr>
+        <w:t xml:space="preserve">) function from the </w:t>
+      </w:r>
+      <w:proofErr w:type="spellStart"/>
+      <w:r>
+        <w:rPr>
+          <w:rFonts w:ascii="Arial" w:hAnsi="Arial" w:cs="Arial"/>
+        </w:rPr>
+        <w:t>soundgen</w:t>
+      </w:r>
+      <w:proofErr w:type="spellEnd"/>
+      <w:r>
+        <w:rPr>
+          <w:rFonts w:ascii="Arial" w:hAnsi="Arial" w:cs="Arial"/>
+        </w:rPr>
+        <w:t xml:space="preserve"> package</w:t>
+      </w:r>
+      <w:r>
+        <w:rPr>
+          <w:rFonts w:ascii="Arial" w:hAnsi="Arial" w:cs="Arial"/>
+        </w:rPr>
+        <w:t xml:space="preserve"> </w:t>
+      </w:r>
+      <w:proofErr w:type="gramStart"/>
+      <w:r>
+        <w:rPr>
+          <w:rFonts w:ascii="Arial" w:hAnsi="Arial" w:cs="Arial"/>
+        </w:rPr>
+        <w:t>in order to</w:t>
+      </w:r>
+      <w:proofErr w:type="gramEnd"/>
+      <w:r>
+        <w:rPr>
+          <w:rFonts w:ascii="Arial" w:hAnsi="Arial" w:cs="Arial"/>
+        </w:rPr>
+        <w:t xml:space="preserve"> generate synthetic audio files with customized names.</w:t>
+      </w:r>
+      <w:r>
+        <w:rPr>
+          <w:rFonts w:ascii="Arial" w:hAnsi="Arial" w:cs="Arial"/>
+        </w:rPr>
+        <w:t xml:space="preserve"> In this function, we also focused on </w:t>
+      </w:r>
+      <w:r>
+        <w:rPr>
+          <w:rFonts w:ascii="Arial" w:hAnsi="Arial" w:cs="Arial"/>
+        </w:rPr>
+        <w:t xml:space="preserve">a particular subset of arguments to control sound generation </w:t>
+      </w:r>
+      <w:r>
+        <w:rPr>
+          <w:rFonts w:ascii="Arial" w:hAnsi="Arial" w:cs="Arial"/>
+        </w:rPr>
+        <w:t xml:space="preserve">in ways that helped us create frequency modulated vocal identity signals </w:t>
+      </w:r>
+      <w:r>
+        <w:rPr>
+          <w:rFonts w:ascii="Arial" w:hAnsi="Arial" w:cs="Arial"/>
+        </w:rPr>
+        <w:t xml:space="preserve">with </w:t>
+      </w:r>
+      <w:proofErr w:type="spellStart"/>
+      <w:r>
+        <w:rPr>
+          <w:rFonts w:ascii="Arial" w:hAnsi="Arial" w:cs="Arial"/>
+        </w:rPr>
+        <w:t>soundgen</w:t>
+      </w:r>
+      <w:proofErr w:type="spellEnd"/>
+      <w:r>
+        <w:rPr>
+          <w:rFonts w:ascii="Arial" w:hAnsi="Arial" w:cs="Arial"/>
+        </w:rPr>
+        <w:t>.</w:t>
+      </w:r>
+      <w:r>
+        <w:rPr>
+          <w:rFonts w:ascii="Arial" w:hAnsi="Arial" w:cs="Arial"/>
+        </w:rPr>
+        <w:t xml:space="preserve"> First, we </w:t>
+      </w:r>
+      <w:r>
+        <w:rPr>
+          <w:rFonts w:ascii="Arial" w:hAnsi="Arial" w:cs="Arial"/>
+        </w:rPr>
+        <w:t xml:space="preserve">fed the frequency timeseries to the argument pitch so that </w:t>
+      </w:r>
+      <w:proofErr w:type="spellStart"/>
+      <w:r>
+        <w:rPr>
+          <w:rFonts w:ascii="Arial" w:hAnsi="Arial" w:cs="Arial"/>
+        </w:rPr>
+        <w:t>soundgen</w:t>
+      </w:r>
+      <w:proofErr w:type="spellEnd"/>
+      <w:r>
+        <w:rPr>
+          <w:rFonts w:ascii="Arial" w:hAnsi="Arial" w:cs="Arial"/>
+        </w:rPr>
+        <w:t xml:space="preserve"> would use these values as “anchors” to guide frequency modulation. In this version of our pipeline, we do not specify timestamps for each frequency value in the </w:t>
+      </w:r>
+      <w:r>
+        <w:rPr>
+          <w:rFonts w:ascii="Arial" w:hAnsi="Arial" w:cs="Arial"/>
+        </w:rPr>
+        <w:t>time series</w:t>
+      </w:r>
+      <w:r>
+        <w:rPr>
+          <w:rFonts w:ascii="Arial" w:hAnsi="Arial" w:cs="Arial"/>
+        </w:rPr>
+        <w:t xml:space="preserve">. By default, </w:t>
+      </w:r>
+      <w:proofErr w:type="spellStart"/>
+      <w:r>
+        <w:rPr>
+          <w:rFonts w:ascii="Arial" w:hAnsi="Arial" w:cs="Arial"/>
+        </w:rPr>
+        <w:t>soundgen</w:t>
+      </w:r>
+      <w:proofErr w:type="spellEnd"/>
+      <w:r>
+        <w:rPr>
+          <w:rFonts w:ascii="Arial" w:hAnsi="Arial" w:cs="Arial"/>
+        </w:rPr>
+        <w:t xml:space="preserve"> version 2.7.1 considered frequency values to be evenly split across</w:t>
+      </w:r>
+      <w:r>
+        <w:rPr>
+          <w:rFonts w:ascii="Arial" w:hAnsi="Arial" w:cs="Arial"/>
+        </w:rPr>
+        <w:t xml:space="preserve"> the duration of each audio file</w:t>
+      </w:r>
+      <w:r>
+        <w:rPr>
+          <w:rFonts w:ascii="Arial" w:hAnsi="Arial" w:cs="Arial"/>
+        </w:rPr>
+        <w:t xml:space="preserve">, which we specified using the argument </w:t>
+      </w:r>
+      <w:proofErr w:type="spellStart"/>
+      <w:r>
+        <w:rPr>
+          <w:rFonts w:ascii="Arial" w:hAnsi="Arial" w:cs="Arial"/>
+        </w:rPr>
+        <w:t>sylLen</w:t>
+      </w:r>
+      <w:proofErr w:type="spellEnd"/>
+      <w:r>
+        <w:rPr>
+          <w:rFonts w:ascii="Arial" w:hAnsi="Arial" w:cs="Arial"/>
+        </w:rPr>
+        <w:t xml:space="preserve">. </w:t>
+      </w:r>
+      <w:r>
+        <w:rPr>
+          <w:rFonts w:ascii="Arial" w:hAnsi="Arial" w:cs="Arial"/>
+        </w:rPr>
+        <w:t xml:space="preserve">We controlled the pitch and audio file sampling rates using the arguments </w:t>
+      </w:r>
+      <w:proofErr w:type="spellStart"/>
+      <w:r>
+        <w:rPr>
+          <w:rFonts w:ascii="Arial" w:hAnsi="Arial" w:cs="Arial"/>
+        </w:rPr>
+        <w:t>pitchSamplingRate</w:t>
+      </w:r>
+      <w:proofErr w:type="spellEnd"/>
+      <w:r>
+        <w:rPr>
+          <w:rFonts w:ascii="Arial" w:hAnsi="Arial" w:cs="Arial"/>
+        </w:rPr>
+        <w:t xml:space="preserve"> and </w:t>
+      </w:r>
+      <w:proofErr w:type="spellStart"/>
+      <w:r>
+        <w:rPr>
+          <w:rFonts w:ascii="Arial" w:hAnsi="Arial" w:cs="Arial"/>
+        </w:rPr>
+        <w:t>samplingRate</w:t>
+      </w:r>
+      <w:proofErr w:type="spellEnd"/>
+      <w:r>
+        <w:rPr>
+          <w:rFonts w:ascii="Arial" w:hAnsi="Arial" w:cs="Arial"/>
+        </w:rPr>
+        <w:t>, respectively. We also specified the lowest and highest frequency values</w:t>
+      </w:r>
+      <w:r>
+        <w:rPr>
+          <w:rFonts w:ascii="Arial" w:hAnsi="Arial" w:cs="Arial"/>
+        </w:rPr>
+        <w:t xml:space="preserve"> with </w:t>
+      </w:r>
+      <w:proofErr w:type="spellStart"/>
+      <w:r>
+        <w:rPr>
+          <w:rFonts w:ascii="Arial" w:hAnsi="Arial" w:cs="Arial"/>
+        </w:rPr>
+        <w:t>pitchFloor</w:t>
+      </w:r>
+      <w:proofErr w:type="spellEnd"/>
+      <w:r>
+        <w:rPr>
+          <w:rFonts w:ascii="Arial" w:hAnsi="Arial" w:cs="Arial"/>
+        </w:rPr>
+        <w:t xml:space="preserve"> and </w:t>
+      </w:r>
+      <w:proofErr w:type="spellStart"/>
+      <w:r>
+        <w:rPr>
+          <w:rFonts w:ascii="Arial" w:hAnsi="Arial" w:cs="Arial"/>
+        </w:rPr>
+        <w:t>pitchCeiling</w:t>
+      </w:r>
+      <w:proofErr w:type="spellEnd"/>
+      <w:r>
+        <w:rPr>
+          <w:rFonts w:ascii="Arial" w:hAnsi="Arial" w:cs="Arial"/>
+        </w:rPr>
+        <w:t xml:space="preserve">. </w:t>
+      </w:r>
+      <w:r>
+        <w:rPr>
+          <w:rFonts w:ascii="Arial" w:hAnsi="Arial" w:cs="Arial"/>
+        </w:rPr>
+        <w:t>To generate smoother frequency modulation patterns that better approximated animal vocalizations, we used</w:t>
+      </w:r>
+      <w:r>
+        <w:rPr>
+          <w:rFonts w:ascii="Arial" w:hAnsi="Arial" w:cs="Arial"/>
+        </w:rPr>
+        <w:t xml:space="preserve"> Loess </w:t>
+      </w:r>
+      <w:r>
+        <w:rPr>
+          <w:rFonts w:ascii="Arial" w:hAnsi="Arial" w:cs="Arial"/>
+        </w:rPr>
+        <w:t xml:space="preserve">or local polynomial regression </w:t>
+      </w:r>
+      <w:r>
+        <w:rPr>
+          <w:rFonts w:ascii="Arial" w:hAnsi="Arial" w:cs="Arial"/>
+        </w:rPr>
+        <w:t>interpolation</w:t>
+      </w:r>
+      <w:r>
+        <w:rPr>
+          <w:rFonts w:ascii="Arial" w:hAnsi="Arial" w:cs="Arial"/>
+        </w:rPr>
+        <w:t xml:space="preserve"> with a</w:t>
+      </w:r>
+      <w:r>
+        <w:rPr>
+          <w:rFonts w:ascii="Arial" w:hAnsi="Arial" w:cs="Arial"/>
+        </w:rPr>
+        <w:t xml:space="preserve"> “strong” amount of smoothing</w:t>
+      </w:r>
+      <w:r>
+        <w:rPr>
+          <w:rFonts w:ascii="Arial" w:hAnsi="Arial" w:cs="Arial"/>
+        </w:rPr>
+        <w:t xml:space="preserve"> </w:t>
+      </w:r>
+      <w:r>
+        <w:rPr>
+          <w:rFonts w:ascii="Arial" w:hAnsi="Arial" w:cs="Arial"/>
+        </w:rPr>
+        <w:t>(</w:t>
+      </w:r>
+      <w:r>
+        <w:rPr>
+          <w:rFonts w:ascii="Arial" w:hAnsi="Arial" w:cs="Arial"/>
+        </w:rPr>
+        <w:t>span of 1</w:t>
+      </w:r>
+      <w:r>
+        <w:rPr>
+          <w:rFonts w:ascii="Arial" w:hAnsi="Arial" w:cs="Arial"/>
+        </w:rPr>
+        <w:t>). We</w:t>
+      </w:r>
+      <w:r>
+        <w:rPr>
+          <w:rFonts w:ascii="Arial" w:hAnsi="Arial" w:cs="Arial"/>
+        </w:rPr>
+        <w:t xml:space="preserve"> </w:t>
+      </w:r>
+      <w:r>
+        <w:rPr>
+          <w:rFonts w:ascii="Arial" w:hAnsi="Arial" w:cs="Arial"/>
+        </w:rPr>
+        <w:t xml:space="preserve">turned off options for </w:t>
+      </w:r>
+      <w:r>
+        <w:rPr>
+          <w:rFonts w:ascii="Arial" w:hAnsi="Arial" w:cs="Arial"/>
+        </w:rPr>
         <w:lastRenderedPageBreak/>
-        <w:t>The</w:t>
-      </w:r>
-      <w:r>
-        <w:rPr>
-          <w:rFonts w:ascii="Arial" w:hAnsi="Arial" w:cs="Arial"/>
-        </w:rPr>
-        <w:t xml:space="preserve"> fourth and final step in our pipeline was</w:t>
+        <w:t>transitions between frequency anchors that were too close together (</w:t>
+      </w:r>
+      <w:proofErr w:type="spellStart"/>
+      <w:r>
+        <w:rPr>
+          <w:rFonts w:ascii="Arial" w:hAnsi="Arial" w:cs="Arial"/>
+        </w:rPr>
+        <w:t>discontThresh</w:t>
+      </w:r>
+      <w:proofErr w:type="spellEnd"/>
+      <w:r>
+        <w:rPr>
+          <w:rFonts w:ascii="Arial" w:hAnsi="Arial" w:cs="Arial"/>
+        </w:rPr>
+        <w:t xml:space="preserve"> and </w:t>
+      </w:r>
+      <w:proofErr w:type="spellStart"/>
+      <w:r>
+        <w:rPr>
+          <w:rFonts w:ascii="Arial" w:hAnsi="Arial" w:cs="Arial"/>
+        </w:rPr>
+        <w:t>jumpThresh</w:t>
+      </w:r>
+      <w:proofErr w:type="spellEnd"/>
+      <w:r>
+        <w:rPr>
+          <w:rFonts w:ascii="Arial" w:hAnsi="Arial" w:cs="Arial"/>
+        </w:rPr>
+        <w:t>), since we were using evenly spaced anchors.</w:t>
+      </w:r>
+      <w:r>
+        <w:rPr>
+          <w:rFonts w:ascii="Arial" w:hAnsi="Arial" w:cs="Arial"/>
+        </w:rPr>
+        <w:t xml:space="preserve"> We also allowed for up to 5 harmonics in synthetic vocalizations by setting 5 default amplitude values to the argument </w:t>
+      </w:r>
+      <w:proofErr w:type="spellStart"/>
+      <w:r>
+        <w:rPr>
+          <w:rFonts w:ascii="Arial" w:hAnsi="Arial" w:cs="Arial"/>
+        </w:rPr>
+        <w:t>rolloffExact</w:t>
+      </w:r>
+      <w:proofErr w:type="spellEnd"/>
+      <w:r>
+        <w:rPr>
+          <w:rFonts w:ascii="Arial" w:hAnsi="Arial" w:cs="Arial"/>
+        </w:rPr>
+        <w:t xml:space="preserve">. </w:t>
+      </w:r>
+      <w:r>
+        <w:rPr>
+          <w:rFonts w:ascii="Arial" w:hAnsi="Arial" w:cs="Arial"/>
+        </w:rPr>
+        <w:t xml:space="preserve">For our purposes, we wanted to encode identity information in </w:t>
+      </w:r>
+      <w:r>
+        <w:rPr>
+          <w:rFonts w:ascii="Arial" w:hAnsi="Arial" w:cs="Arial"/>
+        </w:rPr>
+        <w:t xml:space="preserve">frequency modulation patterns only, so we turned off formant generation </w:t>
+      </w:r>
+      <w:r>
+        <w:rPr>
+          <w:rFonts w:ascii="Arial" w:hAnsi="Arial" w:cs="Arial"/>
+        </w:rPr>
+        <w:t xml:space="preserve">specific to different vocal tract lengths by setting default values of NA to the formants and </w:t>
+      </w:r>
+      <w:proofErr w:type="spellStart"/>
+      <w:r>
+        <w:rPr>
+          <w:rFonts w:ascii="Arial" w:hAnsi="Arial" w:cs="Arial"/>
+        </w:rPr>
+        <w:t>vocalTract</w:t>
+      </w:r>
+      <w:proofErr w:type="spellEnd"/>
+      <w:r>
+        <w:rPr>
+          <w:rFonts w:ascii="Arial" w:hAnsi="Arial" w:cs="Arial"/>
+        </w:rPr>
+        <w:t xml:space="preserve"> arguments. </w:t>
+      </w:r>
+      <w:r>
+        <w:rPr>
+          <w:rFonts w:ascii="Arial" w:hAnsi="Arial" w:cs="Arial"/>
+        </w:rPr>
+        <w:t xml:space="preserve">We also set the default value for </w:t>
+      </w:r>
+      <w:proofErr w:type="spellStart"/>
+      <w:r>
+        <w:rPr>
+          <w:rFonts w:ascii="Arial" w:hAnsi="Arial" w:cs="Arial"/>
+        </w:rPr>
+        <w:t>soundgen’s</w:t>
+      </w:r>
+      <w:proofErr w:type="spellEnd"/>
+      <w:r>
+        <w:rPr>
+          <w:rFonts w:ascii="Arial" w:hAnsi="Arial" w:cs="Arial"/>
+        </w:rPr>
+        <w:t xml:space="preserve"> hyperparameter for varying stochasticity in sound generation to 0, such that the default in our pipeline would </w:t>
+      </w:r>
+      <w:r>
+        <w:rPr>
+          <w:rFonts w:ascii="Arial" w:hAnsi="Arial" w:cs="Arial"/>
+        </w:rPr>
+        <w:t xml:space="preserve">include no stochasticity of sound generation from </w:t>
+      </w:r>
+      <w:proofErr w:type="spellStart"/>
+      <w:r>
+        <w:rPr>
+          <w:rFonts w:ascii="Arial" w:hAnsi="Arial" w:cs="Arial"/>
+        </w:rPr>
+        <w:t>soundgen</w:t>
+      </w:r>
+      <w:proofErr w:type="spellEnd"/>
+      <w:r>
+        <w:rPr>
+          <w:rFonts w:ascii="Arial" w:hAnsi="Arial" w:cs="Arial"/>
+        </w:rPr>
+        <w:t xml:space="preserve"> itself</w:t>
+      </w:r>
+      <w:r>
+        <w:rPr>
+          <w:rFonts w:ascii="Arial" w:hAnsi="Arial" w:cs="Arial"/>
+        </w:rPr>
+        <w:t>, although higher values could be specified to turn this stoch</w:t>
+      </w:r>
+      <w:r>
+        <w:rPr>
+          <w:rFonts w:ascii="Arial" w:hAnsi="Arial" w:cs="Arial"/>
+        </w:rPr>
+        <w:t>a</w:t>
+      </w:r>
+      <w:r>
+        <w:rPr>
+          <w:rFonts w:ascii="Arial" w:hAnsi="Arial" w:cs="Arial"/>
+        </w:rPr>
+        <w:t>sticity back on</w:t>
+      </w:r>
+      <w:r>
+        <w:rPr>
+          <w:rFonts w:ascii="Arial" w:hAnsi="Arial" w:cs="Arial"/>
+        </w:rPr>
+        <w:t>.</w:t>
+      </w:r>
+      <w:r>
+        <w:rPr>
+          <w:rFonts w:ascii="Arial" w:hAnsi="Arial" w:cs="Arial"/>
+        </w:rPr>
+        <w:t xml:space="preserve"> We used </w:t>
+      </w:r>
+      <w:r>
+        <w:rPr>
+          <w:rFonts w:ascii="Arial" w:hAnsi="Arial" w:cs="Arial"/>
+        </w:rPr>
+        <w:t xml:space="preserve">300 </w:t>
+      </w:r>
+      <w:proofErr w:type="spellStart"/>
+      <w:r>
+        <w:rPr>
+          <w:rFonts w:ascii="Arial" w:hAnsi="Arial" w:cs="Arial"/>
+        </w:rPr>
+        <w:t>ms</w:t>
+      </w:r>
+      <w:proofErr w:type="spellEnd"/>
+      <w:r>
+        <w:rPr>
+          <w:rFonts w:ascii="Arial" w:hAnsi="Arial" w:cs="Arial"/>
+        </w:rPr>
+        <w:t>, the</w:t>
+      </w:r>
+      <w:r>
+        <w:rPr>
+          <w:rFonts w:ascii="Arial" w:hAnsi="Arial" w:cs="Arial"/>
+        </w:rPr>
+        <w:t xml:space="preserve"> default value</w:t>
+      </w:r>
+      <w:r>
+        <w:rPr>
+          <w:rFonts w:ascii="Arial" w:hAnsi="Arial" w:cs="Arial"/>
+        </w:rPr>
+        <w:t xml:space="preserve"> in </w:t>
+      </w:r>
+      <w:proofErr w:type="spellStart"/>
+      <w:r>
+        <w:rPr>
+          <w:rFonts w:ascii="Arial" w:hAnsi="Arial" w:cs="Arial"/>
+        </w:rPr>
+        <w:t>soundgen</w:t>
+      </w:r>
+      <w:proofErr w:type="spellEnd"/>
+      <w:r>
+        <w:rPr>
+          <w:rFonts w:ascii="Arial" w:hAnsi="Arial" w:cs="Arial"/>
+        </w:rPr>
+        <w:t xml:space="preserve">, </w:t>
+      </w:r>
+      <w:r>
+        <w:rPr>
+          <w:rFonts w:ascii="Arial" w:hAnsi="Arial" w:cs="Arial"/>
+        </w:rPr>
+        <w:t>to specify the minimum signal epoch duration for formant locking or static subharmonics, in the case that formants were turned on.</w:t>
+      </w:r>
+      <w:r>
+        <w:rPr>
+          <w:rFonts w:ascii="Arial" w:hAnsi="Arial" w:cs="Arial"/>
+        </w:rPr>
+        <w:t xml:space="preserve"> We set the vibrato frequency</w:t>
       </w:r>
       <w:r>
         <w:rPr>
@@ -14117,43 +15526,19 @@
         <w:rPr>
           <w:rFonts w:ascii="Arial" w:hAnsi="Arial" w:cs="Arial"/>
         </w:rPr>
-        <w:t xml:space="preserve">to </w:t>
-      </w:r>
-      <w:r>
-        <w:rPr>
-          <w:rFonts w:ascii="Arial" w:hAnsi="Arial" w:cs="Arial"/>
-        </w:rPr>
-        <w:t>us</w:t>
-      </w:r>
-      <w:r>
-        <w:rPr>
-          <w:rFonts w:ascii="Arial" w:hAnsi="Arial" w:cs="Arial"/>
-        </w:rPr>
-        <w:t>e</w:t>
-      </w:r>
-      <w:r>
-        <w:rPr>
-          <w:rFonts w:ascii="Arial" w:hAnsi="Arial" w:cs="Arial"/>
-        </w:rPr>
-        <w:t xml:space="preserve"> the frequency </w:t>
-      </w:r>
-      <w:r>
-        <w:rPr>
-          <w:rFonts w:ascii="Arial" w:hAnsi="Arial" w:cs="Arial"/>
-        </w:rPr>
-        <w:t>timeseries as “</w:t>
-      </w:r>
-      <w:r>
-        <w:rPr>
-          <w:rFonts w:ascii="Arial" w:hAnsi="Arial" w:cs="Arial"/>
-        </w:rPr>
-        <w:t>anchors</w:t>
-      </w:r>
-      <w:r>
-        <w:rPr>
-          <w:rFonts w:ascii="Arial" w:hAnsi="Arial" w:cs="Arial"/>
-        </w:rPr>
-        <w:t>”</w:t>
+        <w:t>in Hz, to 1, which was lower than the default of 5</w:t>
+      </w:r>
+      <w:r>
+        <w:rPr>
+          <w:rFonts w:ascii="Arial" w:hAnsi="Arial" w:cs="Arial"/>
+        </w:rPr>
+        <w:t>, to minimize the amount of regular pitch modulation across each vocalization</w:t>
+      </w:r>
+      <w:r>
+        <w:rPr>
+          <w:rFonts w:ascii="Arial" w:hAnsi="Arial" w:cs="Arial"/>
+        </w:rPr>
+        <w:t>.</w:t>
       </w:r>
       <w:r>
         <w:rPr>
@@ -14165,404 +15550,21 @@
         <w:rPr>
           <w:rFonts w:ascii="Arial" w:hAnsi="Arial" w:cs="Arial"/>
         </w:rPr>
-        <w:t xml:space="preserve">to guide the generation of frequency modulation patterns </w:t>
-      </w:r>
-      <w:r>
-        <w:rPr>
-          <w:rFonts w:ascii="Arial" w:hAnsi="Arial" w:cs="Arial"/>
-        </w:rPr>
-        <w:t>in</w:t>
-      </w:r>
-      <w:r>
-        <w:rPr>
-          <w:rFonts w:ascii="Arial" w:hAnsi="Arial" w:cs="Arial"/>
-        </w:rPr>
-        <w:t xml:space="preserve"> synthetic vocalizations </w:t>
-      </w:r>
-      <w:r>
-        <w:rPr>
-          <w:rFonts w:ascii="Arial" w:hAnsi="Arial" w:cs="Arial"/>
-        </w:rPr>
-        <w:t xml:space="preserve">with </w:t>
-      </w:r>
-      <w:r>
-        <w:rPr>
-          <w:rFonts w:ascii="Arial" w:hAnsi="Arial" w:cs="Arial"/>
-        </w:rPr>
-        <w:t xml:space="preserve">the </w:t>
-      </w:r>
-      <w:r>
-        <w:rPr>
-          <w:rFonts w:ascii="Arial" w:hAnsi="Arial" w:cs="Arial"/>
-        </w:rPr>
-        <w:t>s</w:t>
-      </w:r>
-      <w:r>
-        <w:rPr>
-          <w:rFonts w:ascii="Arial" w:hAnsi="Arial" w:cs="Arial"/>
-        </w:rPr>
-        <w:t xml:space="preserve">oundgen </w:t>
-      </w:r>
-      <w:r>
-        <w:rPr>
-          <w:rFonts w:ascii="Arial" w:hAnsi="Arial" w:cs="Arial"/>
-        </w:rPr>
-        <w:t xml:space="preserve">R </w:t>
-      </w:r>
-      <w:r>
-        <w:rPr>
-          <w:rFonts w:ascii="Arial" w:hAnsi="Arial" w:cs="Arial"/>
-        </w:rPr>
-        <w:t>package</w:t>
-      </w:r>
-      <w:r>
-        <w:rPr>
-          <w:rFonts w:ascii="Arial" w:hAnsi="Arial" w:cs="Arial"/>
-        </w:rPr>
-        <w:t xml:space="preserve"> version 2.7.1</w:t>
-      </w:r>
-      <w:r>
-        <w:rPr>
-          <w:rFonts w:ascii="Arial" w:hAnsi="Arial" w:cs="Arial"/>
-        </w:rPr>
-        <w:t xml:space="preserve"> </w:t>
-      </w:r>
-      <w:r>
-        <w:rPr>
-          <w:rFonts w:ascii="Arial" w:hAnsi="Arial" w:cs="Arial"/>
-        </w:rPr>
-        <w:fldChar w:fldCharType="begin"/>
-      </w:r>
-      <w:r>
-        <w:rPr>
-          <w:rFonts w:ascii="Arial" w:hAnsi="Arial" w:cs="Arial"/>
-        </w:rPr>
-        <w:instrText xml:space="preserve"> ADDIN ZOTERO_ITEM CSL_CITATION {"citationID":"zRK0sr3g","properties":{"formattedCitation":"(23)","plainCitation":"(23)","noteIndex":0},"citationItems":[{"id":833,"uris":["http://zotero.org/groups/5786507/items/9FR7DCSI"],"itemData":{"id":833,"type":"article-journal","abstract":"Voice synthesis is a useful method for investigating the communicative role of different acoustic features. Although many text-to-speech systems are available, researchers of human nonverbal vocalizations and bioacousticians may profit from a dedicated simple tool for synthesizing and manipulating natural-sounding vocalizations. Soundgen (https://CRAN.R-project.org/package=soundgen) is an open-source R package that synthesizes nonverbal vocalizations based on meaningful acoustic parameters, which can be specified from the command line or in an interactive app. This tool was validated by comparing the perceived emotion, valence, arousal, and authenticity of 60 recorded human nonverbal vocalizations (screams, moans, laughs, and so on) and their approximate synthetic reproductions. Each synthetic sound was created by manually specifying only a small number of high-level control parameters, such as syllable length and a few anchors for the intonation contour. Nevertheless, the valence and arousal ratings of synthetic sounds were similar to those of the original recordings, and the authenticity ratings were comparable, maintaining parity with the originals for less complex vocalizations. Manipulating the precise acoustic characteristics of synthetic sounds may shed light on the salient predictors of emotion in the human voice. More generally, soundgen may prove useful for any studies that require precise control over the acoustic features of nonspeech sounds, including research on animal vocalizations and auditory perception.","container-title":"Behavior Research Methods","DOI":"10.3758/s13428-018-1095-7","ISSN":"1554-3528","issue":"2","journalAbbreviation":"Behav Res","language":"en","page":"778-792","source":"Springer Link","title":"Soundgen: An open-source tool for synthesizing nonverbal vocalizations","title-short":"Soundgen","volume":"51","author":[{"family":"Anikin","given":"Andrey"}],"issued":{"date-parts":[["2019",4,1]]}}}],"schema":"https://github.com/citation-style-language/schema/raw/master/csl-citation.json"} </w:instrText>
-      </w:r>
-      <w:r>
-        <w:rPr>
-          <w:rFonts w:ascii="Arial" w:hAnsi="Arial" w:cs="Arial"/>
-        </w:rPr>
-        <w:fldChar w:fldCharType="separate"/>
-      </w:r>
-      <w:r>
-        <w:rPr>
-          <w:rFonts w:ascii="Arial" w:hAnsi="Arial" w:cs="Arial"/>
-        </w:rPr>
-        <w:t>(23)</w:t>
-      </w:r>
-      <w:r>
-        <w:rPr>
-          <w:rFonts w:ascii="Arial" w:hAnsi="Arial" w:cs="Arial"/>
-        </w:rPr>
-        <w:fldChar w:fldCharType="end"/>
-      </w:r>
-      <w:r>
-        <w:rPr>
-          <w:rFonts w:ascii="Arial" w:hAnsi="Arial" w:cs="Arial"/>
-        </w:rPr>
-        <w:t xml:space="preserve">. </w:t>
-      </w:r>
-      <w:r>
-        <w:rPr>
-          <w:rFonts w:ascii="Arial" w:hAnsi="Arial" w:cs="Arial"/>
-        </w:rPr>
-        <w:t>Here, we developed a function that relies on the soundgen() function from the soundgen package</w:t>
-      </w:r>
-      <w:r>
-        <w:rPr>
-          <w:rFonts w:ascii="Arial" w:hAnsi="Arial" w:cs="Arial"/>
-        </w:rPr>
-        <w:t xml:space="preserve"> in order to generate synthetic audio files with customized names.</w:t>
-      </w:r>
-      <w:r>
-        <w:rPr>
-          <w:rFonts w:ascii="Arial" w:hAnsi="Arial" w:cs="Arial"/>
-        </w:rPr>
-        <w:t xml:space="preserve"> In this function, we also focused on </w:t>
-      </w:r>
-      <w:r>
-        <w:rPr>
-          <w:rFonts w:ascii="Arial" w:hAnsi="Arial" w:cs="Arial"/>
-        </w:rPr>
-        <w:t xml:space="preserve">a particular subset of arguments to control sound generation </w:t>
-      </w:r>
-      <w:r>
-        <w:rPr>
-          <w:rFonts w:ascii="Arial" w:hAnsi="Arial" w:cs="Arial"/>
-        </w:rPr>
-        <w:t xml:space="preserve">in ways that helped us create frequency modulated vocal identity signals </w:t>
-      </w:r>
-      <w:r>
-        <w:rPr>
-          <w:rFonts w:ascii="Arial" w:hAnsi="Arial" w:cs="Arial"/>
-        </w:rPr>
-        <w:t xml:space="preserve">with </w:t>
-      </w:r>
-      <w:r>
-        <w:rPr>
-          <w:rFonts w:ascii="Arial" w:hAnsi="Arial" w:cs="Arial"/>
-        </w:rPr>
-        <w:t>soundgen.</w:t>
-      </w:r>
-      <w:r>
-        <w:rPr>
-          <w:rFonts w:ascii="Arial" w:hAnsi="Arial" w:cs="Arial"/>
-        </w:rPr>
-        <w:t xml:space="preserve"> First, we </w:t>
-      </w:r>
-      <w:r>
-        <w:rPr>
-          <w:rFonts w:ascii="Arial" w:hAnsi="Arial" w:cs="Arial"/>
-        </w:rPr>
-        <w:t xml:space="preserve">fed the frequency timeseries to the argument pitch so that soundgen would use these values as “anchors” to guide frequency modulation. In this version of our pipeline, we do not specify timestamps for each frequency value in the </w:t>
-      </w:r>
-      <w:r>
-        <w:rPr>
-          <w:rFonts w:ascii="Arial" w:hAnsi="Arial" w:cs="Arial"/>
-        </w:rPr>
-        <w:t>time series</w:t>
-      </w:r>
-      <w:r>
-        <w:rPr>
-          <w:rFonts w:ascii="Arial" w:hAnsi="Arial" w:cs="Arial"/>
-        </w:rPr>
-        <w:t>. By default, soundgen version 2.7.1 considered frequency values to be evenly split across</w:t>
-      </w:r>
-      <w:r>
-        <w:rPr>
-          <w:rFonts w:ascii="Arial" w:hAnsi="Arial" w:cs="Arial"/>
-        </w:rPr>
-        <w:t xml:space="preserve"> the duration of each audio file</w:t>
-      </w:r>
-      <w:r>
-        <w:rPr>
-          <w:rFonts w:ascii="Arial" w:hAnsi="Arial" w:cs="Arial"/>
-        </w:rPr>
-        <w:t xml:space="preserve">, which we specified using the argument sylLen. </w:t>
-      </w:r>
-      <w:r>
-        <w:rPr>
-          <w:rFonts w:ascii="Arial" w:hAnsi="Arial" w:cs="Arial"/>
-        </w:rPr>
-        <w:t>We controlled the pitch and audio file sampling rates using the arguments pitchSamplingRate and samplingRate, respectively. We also specified the lowest and highest frequency values</w:t>
-      </w:r>
-      <w:r>
-        <w:rPr>
-          <w:rFonts w:ascii="Arial" w:hAnsi="Arial" w:cs="Arial"/>
-        </w:rPr>
-        <w:t xml:space="preserve"> with pitchFloor and pitchCeiling. </w:t>
-      </w:r>
-      <w:r>
-        <w:rPr>
-          <w:rFonts w:ascii="Arial" w:hAnsi="Arial" w:cs="Arial"/>
-        </w:rPr>
-        <w:t>To generate smoother frequency modulation patterns that better approximated animal vocalizations, we used</w:t>
-      </w:r>
-      <w:r>
-        <w:rPr>
-          <w:rFonts w:ascii="Arial" w:hAnsi="Arial" w:cs="Arial"/>
-        </w:rPr>
-        <w:t xml:space="preserve"> Loess </w:t>
-      </w:r>
-      <w:r>
-        <w:rPr>
-          <w:rFonts w:ascii="Arial" w:hAnsi="Arial" w:cs="Arial"/>
-        </w:rPr>
-        <w:t xml:space="preserve">or local polynomial regression </w:t>
-      </w:r>
-      <w:r>
-        <w:rPr>
-          <w:rFonts w:ascii="Arial" w:hAnsi="Arial" w:cs="Arial"/>
-        </w:rPr>
-        <w:t>interpolation</w:t>
-      </w:r>
-      <w:r>
-        <w:rPr>
-          <w:rFonts w:ascii="Arial" w:hAnsi="Arial" w:cs="Arial"/>
-        </w:rPr>
-        <w:t xml:space="preserve"> with a</w:t>
-      </w:r>
-      <w:r>
-        <w:rPr>
-          <w:rFonts w:ascii="Arial" w:hAnsi="Arial" w:cs="Arial"/>
-        </w:rPr>
-        <w:t xml:space="preserve"> “strong” amount of smoothing</w:t>
-      </w:r>
-      <w:r>
-        <w:rPr>
-          <w:rFonts w:ascii="Arial" w:hAnsi="Arial" w:cs="Arial"/>
-        </w:rPr>
-        <w:t xml:space="preserve"> </w:t>
-      </w:r>
-      <w:r>
-        <w:rPr>
-          <w:rFonts w:ascii="Arial" w:hAnsi="Arial" w:cs="Arial"/>
-        </w:rPr>
-        <w:t>(</w:t>
-      </w:r>
-      <w:r>
-        <w:rPr>
-          <w:rFonts w:ascii="Arial" w:hAnsi="Arial" w:cs="Arial"/>
-        </w:rPr>
-        <w:t>span of 1</w:t>
-      </w:r>
-      <w:r>
-        <w:rPr>
-          <w:rFonts w:ascii="Arial" w:hAnsi="Arial" w:cs="Arial"/>
-        </w:rPr>
-        <w:t>). We</w:t>
-      </w:r>
-      <w:r>
-        <w:rPr>
-          <w:rFonts w:ascii="Arial" w:hAnsi="Arial" w:cs="Arial"/>
-        </w:rPr>
-        <w:t xml:space="preserve"> </w:t>
-      </w:r>
-      <w:r>
-        <w:rPr>
-          <w:rFonts w:ascii="Arial" w:hAnsi="Arial" w:cs="Arial"/>
-        </w:rPr>
-        <w:t>turned off options for transitions between frequency anchors that were too close together (discontThresh and jumpThresh), since we were using evenly spaced anchors.</w:t>
-      </w:r>
-      <w:r>
-        <w:rPr>
-          <w:rFonts w:ascii="Arial" w:hAnsi="Arial" w:cs="Arial"/>
-        </w:rPr>
-        <w:t xml:space="preserve"> We also allowed for up to 5 harmonics in synthetic vocalizations by setting 5 default amplitude values to the argument rolloffExact. </w:t>
-      </w:r>
-      <w:r>
-        <w:rPr>
-          <w:rFonts w:ascii="Arial" w:hAnsi="Arial" w:cs="Arial"/>
-        </w:rPr>
-        <w:t xml:space="preserve">For our purposes, we wanted to encode identity information in </w:t>
-      </w:r>
-      <w:r>
-        <w:rPr>
-          <w:rFonts w:ascii="Arial" w:hAnsi="Arial" w:cs="Arial"/>
-        </w:rPr>
-        <w:t xml:space="preserve">frequency modulation patterns only, so we turned off formant generation </w:t>
-      </w:r>
-      <w:r>
-        <w:rPr>
-          <w:rFonts w:ascii="Arial" w:hAnsi="Arial" w:cs="Arial"/>
-        </w:rPr>
-        <w:t xml:space="preserve">specific to different vocal tract lengths by setting default values of NA to the formants and </w:t>
-      </w:r>
-      <w:r>
-        <w:rPr>
-          <w:rFonts w:ascii="Arial" w:hAnsi="Arial" w:cs="Arial"/>
-        </w:rPr>
-        <w:lastRenderedPageBreak/>
-        <w:t xml:space="preserve">vocalTract arguments. </w:t>
-      </w:r>
-      <w:r>
-        <w:rPr>
-          <w:rFonts w:ascii="Arial" w:hAnsi="Arial" w:cs="Arial"/>
-        </w:rPr>
-        <w:t xml:space="preserve">We also set the default value for soundgen’s hyperparameter for varying stochasticity in sound generation to 0, such that the default in our pipeline would </w:t>
-      </w:r>
-      <w:r>
-        <w:rPr>
-          <w:rFonts w:ascii="Arial" w:hAnsi="Arial" w:cs="Arial"/>
-        </w:rPr>
-        <w:t>include no stochasticity of sound generation from soundgen itself</w:t>
-      </w:r>
-      <w:r>
-        <w:rPr>
-          <w:rFonts w:ascii="Arial" w:hAnsi="Arial" w:cs="Arial"/>
-        </w:rPr>
-        <w:t>, although higher values could be specified to turn this stoch</w:t>
-      </w:r>
-      <w:r>
-        <w:rPr>
-          <w:rFonts w:ascii="Arial" w:hAnsi="Arial" w:cs="Arial"/>
-        </w:rPr>
-        <w:t>a</w:t>
-      </w:r>
-      <w:r>
-        <w:rPr>
-          <w:rFonts w:ascii="Arial" w:hAnsi="Arial" w:cs="Arial"/>
-        </w:rPr>
-        <w:t>sticity back on</w:t>
-      </w:r>
-      <w:r>
-        <w:rPr>
-          <w:rFonts w:ascii="Arial" w:hAnsi="Arial" w:cs="Arial"/>
-        </w:rPr>
-        <w:t>.</w:t>
-      </w:r>
-      <w:r>
-        <w:rPr>
-          <w:rFonts w:ascii="Arial" w:hAnsi="Arial" w:cs="Arial"/>
-        </w:rPr>
-        <w:t xml:space="preserve"> We used </w:t>
-      </w:r>
-      <w:r>
-        <w:rPr>
-          <w:rFonts w:ascii="Arial" w:hAnsi="Arial" w:cs="Arial"/>
-        </w:rPr>
-        <w:t>300 ms, the</w:t>
-      </w:r>
-      <w:r>
-        <w:rPr>
-          <w:rFonts w:ascii="Arial" w:hAnsi="Arial" w:cs="Arial"/>
-        </w:rPr>
-        <w:t xml:space="preserve"> default value</w:t>
-      </w:r>
-      <w:r>
-        <w:rPr>
-          <w:rFonts w:ascii="Arial" w:hAnsi="Arial" w:cs="Arial"/>
-        </w:rPr>
-        <w:t xml:space="preserve"> in soundgen, </w:t>
-      </w:r>
-      <w:r>
-        <w:rPr>
-          <w:rFonts w:ascii="Arial" w:hAnsi="Arial" w:cs="Arial"/>
-        </w:rPr>
-        <w:t>to specify the minimum signal epoch duration for formant locking or static subharmonics, in the case that formants were turned on.</w:t>
-      </w:r>
-      <w:r>
-        <w:rPr>
-          <w:rFonts w:ascii="Arial" w:hAnsi="Arial" w:cs="Arial"/>
-        </w:rPr>
-        <w:t xml:space="preserve"> We set the vibrato frequency</w:t>
-      </w:r>
-      <w:r>
-        <w:rPr>
-          <w:rFonts w:ascii="Arial" w:hAnsi="Arial" w:cs="Arial"/>
-        </w:rPr>
-        <w:t xml:space="preserve"> </w:t>
-      </w:r>
-      <w:r>
-        <w:rPr>
-          <w:rFonts w:ascii="Arial" w:hAnsi="Arial" w:cs="Arial"/>
-        </w:rPr>
-        <w:t>in Hz, to 1, which was lower than the default of 5</w:t>
-      </w:r>
-      <w:r>
-        <w:rPr>
-          <w:rFonts w:ascii="Arial" w:hAnsi="Arial" w:cs="Arial"/>
-        </w:rPr>
-        <w:t>, to minimize the amount of regular pitch modulation across each vocalization</w:t>
-      </w:r>
-      <w:r>
-        <w:rPr>
-          <w:rFonts w:ascii="Arial" w:hAnsi="Arial" w:cs="Arial"/>
-        </w:rPr>
-        <w:t>.</w:t>
-      </w:r>
-      <w:r>
-        <w:rPr>
-          <w:rFonts w:ascii="Arial" w:hAnsi="Arial" w:cs="Arial"/>
-        </w:rPr>
-        <w:t xml:space="preserve"> </w:t>
-      </w:r>
-      <w:r>
-        <w:rPr>
-          <w:rFonts w:ascii="Arial" w:hAnsi="Arial" w:cs="Arial"/>
-        </w:rPr>
-        <w:t xml:space="preserve">We wrote out function so that all of these arguments can be </w:t>
+        <w:t xml:space="preserve">We wrote out function so that </w:t>
+      </w:r>
+      <w:proofErr w:type="gramStart"/>
+      <w:r>
+        <w:rPr>
+          <w:rFonts w:ascii="Arial" w:hAnsi="Arial" w:cs="Arial"/>
+        </w:rPr>
+        <w:t>all of</w:t>
+      </w:r>
+      <w:proofErr w:type="gramEnd"/>
+      <w:r>
+        <w:rPr>
+          <w:rFonts w:ascii="Arial" w:hAnsi="Arial" w:cs="Arial"/>
+        </w:rPr>
+        <w:t xml:space="preserve"> these arguments can be </w:t>
       </w:r>
       <w:r>
         <w:rPr>
@@ -14574,13 +15576,55 @@
         <w:rPr>
           <w:rFonts w:ascii="Arial" w:hAnsi="Arial" w:cs="Arial"/>
         </w:rPr>
-        <w:t xml:space="preserve"> the range of values specified by soundgen, and with minimal code development by others, it is possible to add other soundgen arguments for greater flexibility. </w:t>
-      </w:r>
-      <w:r>
-        <w:rPr>
-          <w:rFonts w:ascii="Arial" w:hAnsi="Arial" w:cs="Arial"/>
-        </w:rPr>
-        <w:t>The synthetic vocalizations produced using these original arguments from the soundgen package were written out as audio files</w:t>
+        <w:t xml:space="preserve"> the range of values specified by </w:t>
+      </w:r>
+      <w:proofErr w:type="spellStart"/>
+      <w:r>
+        <w:rPr>
+          <w:rFonts w:ascii="Arial" w:hAnsi="Arial" w:cs="Arial"/>
+        </w:rPr>
+        <w:t>soundgen</w:t>
+      </w:r>
+      <w:proofErr w:type="spellEnd"/>
+      <w:r>
+        <w:rPr>
+          <w:rFonts w:ascii="Arial" w:hAnsi="Arial" w:cs="Arial"/>
+        </w:rPr>
+        <w:t xml:space="preserve">, and with minimal code development by others, it is possible to add other </w:t>
+      </w:r>
+      <w:proofErr w:type="spellStart"/>
+      <w:r>
+        <w:rPr>
+          <w:rFonts w:ascii="Arial" w:hAnsi="Arial" w:cs="Arial"/>
+        </w:rPr>
+        <w:t>soundgen</w:t>
+      </w:r>
+      <w:proofErr w:type="spellEnd"/>
+      <w:r>
+        <w:rPr>
+          <w:rFonts w:ascii="Arial" w:hAnsi="Arial" w:cs="Arial"/>
+        </w:rPr>
+        <w:t xml:space="preserve"> arguments for greater flexibility. </w:t>
+      </w:r>
+      <w:r>
+        <w:rPr>
+          <w:rFonts w:ascii="Arial" w:hAnsi="Arial" w:cs="Arial"/>
+        </w:rPr>
+        <w:t xml:space="preserve">The synthetic vocalizations produced using these original arguments from the </w:t>
+      </w:r>
+      <w:proofErr w:type="spellStart"/>
+      <w:r>
+        <w:rPr>
+          <w:rFonts w:ascii="Arial" w:hAnsi="Arial" w:cs="Arial"/>
+        </w:rPr>
+        <w:t>soundgen</w:t>
+      </w:r>
+      <w:proofErr w:type="spellEnd"/>
+      <w:r>
+        <w:rPr>
+          <w:rFonts w:ascii="Arial" w:hAnsi="Arial" w:cs="Arial"/>
+        </w:rPr>
+        <w:t xml:space="preserve"> package were written out as audio files</w:t>
       </w:r>
       <w:r>
         <w:rPr>
@@ -14606,11 +15650,19 @@
         </w:rPr>
         <w:t xml:space="preserve">, </w:t>
       </w:r>
-      <w:r>
-        <w:rPr>
-          <w:rFonts w:ascii="Arial" w:hAnsi="Arial" w:cs="Arial"/>
-        </w:rPr>
-        <w:t xml:space="preserve">similar to the frequency ranges of avian vocalizations. </w:t>
+      <w:proofErr w:type="gramStart"/>
+      <w:r>
+        <w:rPr>
+          <w:rFonts w:ascii="Arial" w:hAnsi="Arial" w:cs="Arial"/>
+        </w:rPr>
+        <w:t>similar to</w:t>
+      </w:r>
+      <w:proofErr w:type="gramEnd"/>
+      <w:r>
+        <w:rPr>
+          <w:rFonts w:ascii="Arial" w:hAnsi="Arial" w:cs="Arial"/>
+        </w:rPr>
+        <w:t xml:space="preserve"> the frequency ranges of avian vocalizations. </w:t>
       </w:r>
     </w:p>
     <w:p>
@@ -14638,6 +15690,7 @@
           <w:i/>
           <w:iCs/>
         </w:rPr>
+        <w:lastRenderedPageBreak/>
         <w:t>Example datasets</w:t>
       </w:r>
       <w:r>
@@ -14842,14 +15895,7 @@
         <w:rPr>
           <w:rFonts w:ascii="Arial" w:hAnsi="Arial" w:cs="Arial"/>
         </w:rPr>
-        <w:t xml:space="preserve"> in which we allocated 4 characters each to the global head and tail </w:t>
-      </w:r>
-      <w:r>
-        <w:rPr>
-          <w:rFonts w:ascii="Arial" w:hAnsi="Arial" w:cs="Arial"/>
-        </w:rPr>
-        <w:lastRenderedPageBreak/>
-        <w:t xml:space="preserve">sections, and </w:t>
+        <w:t xml:space="preserve"> in which we allocated 4 characters each to the global head and tail sections, and </w:t>
       </w:r>
       <w:r>
         <w:rPr>
@@ -14980,6 +16026,7 @@
         </w:rPr>
         <w:t xml:space="preserve"> </w:t>
       </w:r>
+      <w:proofErr w:type="spellStart"/>
       <w:r>
         <w:rPr>
           <w:rFonts w:ascii="Arial" w:hAnsi="Arial" w:cs="Arial"/>
@@ -14992,6 +16039,7 @@
         </w:rPr>
         <w:t>y</w:t>
       </w:r>
+      <w:proofErr w:type="spellEnd"/>
       <w:r>
         <w:rPr>
           <w:rFonts w:ascii="Arial" w:hAnsi="Arial" w:cs="Arial"/>
@@ -15116,7 +16164,28 @@
         <w:rPr>
           <w:rFonts w:ascii="Arial" w:hAnsi="Arial" w:cs="Arial"/>
         </w:rPr>
-        <w:t xml:space="preserve">To create synthetic vocalizations, we used the soundgen to </w:t>
+        <w:t xml:space="preserve">To create synthetic </w:t>
+      </w:r>
+      <w:r>
+        <w:rPr>
+          <w:rFonts w:ascii="Arial" w:hAnsi="Arial" w:cs="Arial"/>
+        </w:rPr>
+        <w:lastRenderedPageBreak/>
+        <w:t xml:space="preserve">vocalizations, we used the </w:t>
+      </w:r>
+      <w:proofErr w:type="spellStart"/>
+      <w:r>
+        <w:rPr>
+          <w:rFonts w:ascii="Arial" w:hAnsi="Arial" w:cs="Arial"/>
+        </w:rPr>
+        <w:t>soundgen</w:t>
+      </w:r>
+      <w:proofErr w:type="spellEnd"/>
+      <w:r>
+        <w:rPr>
+          <w:rFonts w:ascii="Arial" w:hAnsi="Arial" w:cs="Arial"/>
+        </w:rPr>
+        <w:t xml:space="preserve"> to </w:t>
       </w:r>
       <w:r>
         <w:rPr>
@@ -15134,7 +16203,21 @@
         <w:rPr>
           <w:rFonts w:ascii="Arial" w:hAnsi="Arial" w:cs="Arial"/>
         </w:rPr>
-        <w:t>with about 200 ms duration, audio file and pitch sampling rates of 44.1 kHz,</w:t>
+        <w:t xml:space="preserve">with about 200 </w:t>
+      </w:r>
+      <w:proofErr w:type="spellStart"/>
+      <w:r>
+        <w:rPr>
+          <w:rFonts w:ascii="Arial" w:hAnsi="Arial" w:cs="Arial"/>
+        </w:rPr>
+        <w:t>ms</w:t>
+      </w:r>
+      <w:proofErr w:type="spellEnd"/>
+      <w:r>
+        <w:rPr>
+          <w:rFonts w:ascii="Arial" w:hAnsi="Arial" w:cs="Arial"/>
+        </w:rPr>
+        <w:t xml:space="preserve"> duration, audio file and pitch sampling rates of 44.1 kHz,</w:t>
       </w:r>
       <w:r>
         <w:rPr>
@@ -15146,7 +16229,21 @@
         <w:rPr>
           <w:rFonts w:ascii="Arial" w:hAnsi="Arial" w:cs="Arial"/>
         </w:rPr>
-        <w:t xml:space="preserve"> (no harmonics), the default soundgen stochasticity in sound generation (temperature of 0.025)</w:t>
+        <w:t xml:space="preserve"> (no harmonics), the default </w:t>
+      </w:r>
+      <w:proofErr w:type="spellStart"/>
+      <w:r>
+        <w:rPr>
+          <w:rFonts w:ascii="Arial" w:hAnsi="Arial" w:cs="Arial"/>
+        </w:rPr>
+        <w:t>soundgen</w:t>
+      </w:r>
+      <w:proofErr w:type="spellEnd"/>
+      <w:r>
+        <w:rPr>
+          <w:rFonts w:ascii="Arial" w:hAnsi="Arial" w:cs="Arial"/>
+        </w:rPr>
+        <w:t xml:space="preserve"> stochasticity in sound generation (temperature of 0.025)</w:t>
       </w:r>
       <w:r>
         <w:rPr>
@@ -15232,7 +16329,6 @@
         <w:rPr>
           <w:rFonts w:ascii="Arial" w:hAnsi="Arial" w:cs="Arial"/>
         </w:rPr>
-        <w:lastRenderedPageBreak/>
         <w:tab/>
       </w:r>
       <w:r>
@@ -15259,11 +16355,19 @@
         </w:rPr>
         <w:t xml:space="preserve"> We used the </w:t>
       </w:r>
-      <w:r>
-        <w:rPr>
-          <w:rFonts w:ascii="Arial" w:hAnsi="Arial" w:cs="Arial"/>
-        </w:rPr>
-        <w:t>warbleR package</w:t>
+      <w:proofErr w:type="spellStart"/>
+      <w:r>
+        <w:rPr>
+          <w:rFonts w:ascii="Arial" w:hAnsi="Arial" w:cs="Arial"/>
+        </w:rPr>
+        <w:t>warbleR</w:t>
+      </w:r>
+      <w:proofErr w:type="spellEnd"/>
+      <w:r>
+        <w:rPr>
+          <w:rFonts w:ascii="Arial" w:hAnsi="Arial" w:cs="Arial"/>
+        </w:rPr>
+        <w:t xml:space="preserve"> package</w:t>
       </w:r>
       <w:r>
         <w:rPr>
@@ -15317,7 +16421,21 @@
         <w:rPr>
           <w:rFonts w:ascii="Arial" w:hAnsi="Arial" w:cs="Arial"/>
         </w:rPr>
-        <w:t xml:space="preserve"> to generate spectrograms for first visual checks, and then we used the seewave package </w:t>
+        <w:t xml:space="preserve"> to generate spectrograms for first visual checks, and then we used the </w:t>
+      </w:r>
+      <w:proofErr w:type="spellStart"/>
+      <w:r>
+        <w:rPr>
+          <w:rFonts w:ascii="Arial" w:hAnsi="Arial" w:cs="Arial"/>
+        </w:rPr>
+        <w:t>seewave</w:t>
+      </w:r>
+      <w:proofErr w:type="spellEnd"/>
+      <w:r>
+        <w:rPr>
+          <w:rFonts w:ascii="Arial" w:hAnsi="Arial" w:cs="Arial"/>
+        </w:rPr>
+        <w:t xml:space="preserve"> package </w:t>
       </w:r>
       <w:r>
         <w:rPr>
@@ -15518,7 +16636,14 @@
         <w:rPr>
           <w:rFonts w:ascii="Arial" w:hAnsi="Arial" w:cs="Arial"/>
         </w:rPr>
-        <w:t>We computed the Levens</w:t>
+        <w:t xml:space="preserve">We computed the </w:t>
+      </w:r>
+      <w:proofErr w:type="spellStart"/>
+      <w:r>
+        <w:rPr>
+          <w:rFonts w:ascii="Arial" w:hAnsi="Arial" w:cs="Arial"/>
+        </w:rPr>
+        <w:t>Levens</w:t>
       </w:r>
       <w:r>
         <w:rPr>
@@ -15530,7 +16655,14 @@
         <w:rPr>
           <w:rFonts w:ascii="Arial" w:hAnsi="Arial" w:cs="Arial"/>
         </w:rPr>
-        <w:t>tein edit distance</w:t>
+        <w:t>tein</w:t>
+      </w:r>
+      <w:proofErr w:type="spellEnd"/>
+      <w:r>
+        <w:rPr>
+          <w:rFonts w:ascii="Arial" w:hAnsi="Arial" w:cs="Arial"/>
+        </w:rPr>
+        <w:t xml:space="preserve"> edit distance</w:t>
       </w:r>
       <w:r>
         <w:rPr>
@@ -15590,7 +16722,14 @@
         <w:rPr>
           <w:rFonts w:ascii="Arial" w:hAnsi="Arial" w:cs="Arial"/>
         </w:rPr>
-        <w:t>using the string</w:t>
+        <w:t xml:space="preserve">using the </w:t>
+      </w:r>
+      <w:proofErr w:type="spellStart"/>
+      <w:r>
+        <w:rPr>
+          <w:rFonts w:ascii="Arial" w:hAnsi="Arial" w:cs="Arial"/>
+        </w:rPr>
+        <w:t>string</w:t>
       </w:r>
       <w:r>
         <w:rPr>
@@ -15598,6 +16737,7 @@
         </w:rPr>
         <w:t>dist</w:t>
       </w:r>
+      <w:proofErr w:type="spellEnd"/>
       <w:r>
         <w:rPr>
           <w:rFonts w:ascii="Arial" w:hAnsi="Arial" w:cs="Arial"/>
@@ -15656,7 +16796,14 @@
         <w:rPr>
           <w:rFonts w:ascii="Arial" w:hAnsi="Arial" w:cs="Arial"/>
         </w:rPr>
-        <w:t xml:space="preserve"> with the warble</w:t>
+        <w:t xml:space="preserve"> with the </w:t>
+      </w:r>
+      <w:proofErr w:type="spellStart"/>
+      <w:r>
+        <w:rPr>
+          <w:rFonts w:ascii="Arial" w:hAnsi="Arial" w:cs="Arial"/>
+        </w:rPr>
+        <w:t>warble</w:t>
       </w:r>
       <w:r>
         <w:rPr>
@@ -15664,6 +16811,7 @@
         </w:rPr>
         <w:t>R</w:t>
       </w:r>
+      <w:proofErr w:type="spellEnd"/>
       <w:r>
         <w:rPr>
           <w:rFonts w:ascii="Arial" w:hAnsi="Arial" w:cs="Arial"/>
@@ -15728,7 +16876,14 @@
         <w:rPr>
           <w:rFonts w:ascii="Arial" w:hAnsi="Arial" w:cs="Arial"/>
         </w:rPr>
-        <w:t>0 to 7.5 kHz</w:t>
+        <w:t xml:space="preserve">0 to 7.5 </w:t>
+      </w:r>
+      <w:r>
+        <w:rPr>
+          <w:rFonts w:ascii="Arial" w:hAnsi="Arial" w:cs="Arial"/>
+        </w:rPr>
+        <w:lastRenderedPageBreak/>
+        <w:t>kHz</w:t>
       </w:r>
       <w:r>
         <w:rPr>
@@ -15806,14 +16961,7 @@
         <w:rPr>
           <w:rFonts w:ascii="Arial" w:hAnsi="Arial" w:cs="Arial"/>
         </w:rPr>
-        <w:t xml:space="preserve">parameter </w:t>
-      </w:r>
-      <w:r>
-        <w:rPr>
-          <w:rFonts w:ascii="Arial" w:hAnsi="Arial" w:cs="Arial"/>
-        </w:rPr>
-        <w:lastRenderedPageBreak/>
-        <w:t xml:space="preserve">controlling </w:t>
+        <w:t xml:space="preserve">parameter controlling </w:t>
       </w:r>
       <w:r>
         <w:rPr>
@@ -15831,7 +16979,21 @@
         <w:rPr>
           <w:rFonts w:ascii="Arial" w:hAnsi="Arial" w:cs="Arial"/>
         </w:rPr>
-        <w:t xml:space="preserve"> soundgen)</w:t>
+        <w:t xml:space="preserve"> </w:t>
+      </w:r>
+      <w:proofErr w:type="spellStart"/>
+      <w:r>
+        <w:rPr>
+          <w:rFonts w:ascii="Arial" w:hAnsi="Arial" w:cs="Arial"/>
+        </w:rPr>
+        <w:t>soundgen</w:t>
+      </w:r>
+      <w:proofErr w:type="spellEnd"/>
+      <w:r>
+        <w:rPr>
+          <w:rFonts w:ascii="Arial" w:hAnsi="Arial" w:cs="Arial"/>
+        </w:rPr>
+        <w:t>)</w:t>
       </w:r>
       <w:r>
         <w:rPr>
@@ -15849,7 +17011,21 @@
         <w:rPr>
           <w:rFonts w:ascii="Arial" w:hAnsi="Arial" w:cs="Arial"/>
         </w:rPr>
-        <w:t xml:space="preserve">We did not identify negative SPCC values or values of 1 off of the diagonal for our example datasets. </w:t>
+        <w:t xml:space="preserve">We did not identify negative SPCC values or values of 1 </w:t>
+      </w:r>
+      <w:proofErr w:type="gramStart"/>
+      <w:r>
+        <w:rPr>
+          <w:rFonts w:ascii="Arial" w:hAnsi="Arial" w:cs="Arial"/>
+        </w:rPr>
+        <w:t>off of</w:t>
+      </w:r>
+      <w:proofErr w:type="gramEnd"/>
+      <w:r>
+        <w:rPr>
+          <w:rFonts w:ascii="Arial" w:hAnsi="Arial" w:cs="Arial"/>
+        </w:rPr>
+        <w:t xml:space="preserve"> the diagonal for our example datasets. </w:t>
       </w:r>
       <w:r>
         <w:rPr>
@@ -15867,13 +17043,27 @@
         <w:rPr>
           <w:rFonts w:ascii="Arial" w:hAnsi="Arial" w:cs="Arial"/>
         </w:rPr>
-        <w:t xml:space="preserve">dit distance calculations sometimes yielded values of zero off </w:t>
-      </w:r>
-      <w:r>
-        <w:rPr>
-          <w:rFonts w:ascii="Arial" w:hAnsi="Arial" w:cs="Arial"/>
-        </w:rPr>
-        <w:t xml:space="preserve">of </w:t>
+        <w:t xml:space="preserve">dit distance calculations sometimes yielded values of zero </w:t>
+      </w:r>
+      <w:proofErr w:type="gramStart"/>
+      <w:r>
+        <w:rPr>
+          <w:rFonts w:ascii="Arial" w:hAnsi="Arial" w:cs="Arial"/>
+        </w:rPr>
+        <w:t xml:space="preserve">off </w:t>
+      </w:r>
+      <w:r>
+        <w:rPr>
+          <w:rFonts w:ascii="Arial" w:hAnsi="Arial" w:cs="Arial"/>
+        </w:rPr>
+        <w:t>of</w:t>
+      </w:r>
+      <w:proofErr w:type="gramEnd"/>
+      <w:r>
+        <w:rPr>
+          <w:rFonts w:ascii="Arial" w:hAnsi="Arial" w:cs="Arial"/>
+        </w:rPr>
+        <w:t xml:space="preserve"> </w:t>
       </w:r>
       <w:r>
         <w:rPr>
@@ -16207,7 +17397,14 @@
         <w:rPr>
           <w:rFonts w:ascii="Arial" w:hAnsi="Arial" w:cs="Arial"/>
         </w:rPr>
-        <w:t>We performed multidimensional scaling on both the edit distance and SPCC matrices</w:t>
+        <w:t xml:space="preserve">We performed multidimensional scaling on both the edit </w:t>
+      </w:r>
+      <w:r>
+        <w:rPr>
+          <w:rFonts w:ascii="Arial" w:hAnsi="Arial" w:cs="Arial"/>
+        </w:rPr>
+        <w:lastRenderedPageBreak/>
+        <w:t>distance and SPCC matrices</w:t>
       </w:r>
       <w:r>
         <w:rPr>
@@ -16303,14 +17500,7 @@
         <w:rPr>
           <w:rFonts w:ascii="Arial" w:hAnsi="Arial" w:cs="Arial"/>
         </w:rPr>
-        <w:t xml:space="preserve"> </w:t>
-      </w:r>
-      <w:r>
-        <w:rPr>
-          <w:rFonts w:ascii="Arial" w:hAnsi="Arial" w:cs="Arial"/>
-        </w:rPr>
-        <w:lastRenderedPageBreak/>
-        <w:t>(overdispers</w:t>
+        <w:t xml:space="preserve"> (overdispers</w:t>
       </w:r>
       <w:r>
         <w:rPr>
@@ -16615,6 +17805,7 @@
         <w:rPr>
           <w:rFonts w:ascii="Arial" w:hAnsi="Arial" w:cs="Arial"/>
         </w:rPr>
+        <w:lastRenderedPageBreak/>
         <w:t xml:space="preserve">parameters to impact </w:t>
       </w:r>
       <w:r>
@@ -16669,14 +17860,7 @@
         <w:rPr>
           <w:rFonts w:ascii="Arial" w:hAnsi="Arial" w:cs="Arial"/>
         </w:rPr>
-        <w:t xml:space="preserve">In our experiments, we varied the relative proportions of group to </w:t>
-      </w:r>
-      <w:r>
-        <w:rPr>
-          <w:rFonts w:ascii="Arial" w:hAnsi="Arial" w:cs="Arial"/>
-        </w:rPr>
-        <w:lastRenderedPageBreak/>
-        <w:t>individual information encoded in each string over four treatments: (1) 0 (representing all individual information and no group information), 1/3</w:t>
+        <w:t>In our experiments, we varied the relative proportions of group to individual information encoded in each string over four treatments: (1) 0 (representing all individual information and no group information), 1/3</w:t>
       </w:r>
       <w:r>
         <w:rPr>
@@ -16860,7 +18044,21 @@
         <w:rPr>
           <w:rFonts w:ascii="Arial" w:hAnsi="Arial" w:cs="Arial"/>
         </w:rPr>
-        <w:t xml:space="preserve">information trits in </w:t>
+        <w:t xml:space="preserve">information </w:t>
+      </w:r>
+      <w:proofErr w:type="spellStart"/>
+      <w:r>
+        <w:rPr>
+          <w:rFonts w:ascii="Arial" w:hAnsi="Arial" w:cs="Arial"/>
+        </w:rPr>
+        <w:t>trits</w:t>
+      </w:r>
+      <w:proofErr w:type="spellEnd"/>
+      <w:r>
+        <w:rPr>
+          <w:rFonts w:ascii="Arial" w:hAnsi="Arial" w:cs="Arial"/>
+        </w:rPr>
+        <w:t xml:space="preserve"> in </w:t>
       </w:r>
       <w:r>
         <w:rPr>
@@ -16952,7 +18150,14 @@
         <w:rPr>
           <w:rFonts w:ascii="Arial" w:hAnsi="Arial" w:cs="Arial"/>
         </w:rPr>
-        <w:t xml:space="preserve"> when encoding both group and individual-level information</w:t>
+        <w:t xml:space="preserve"> when encoding both group and individual-level </w:t>
+      </w:r>
+      <w:r>
+        <w:rPr>
+          <w:rFonts w:ascii="Arial" w:hAnsi="Arial" w:cs="Arial"/>
+        </w:rPr>
+        <w:lastRenderedPageBreak/>
+        <w:t>information</w:t>
       </w:r>
       <w:r>
         <w:rPr>
@@ -17152,14 +18357,7 @@
         <w:rPr>
           <w:rFonts w:ascii="Arial" w:hAnsi="Arial" w:cs="Arial"/>
         </w:rPr>
-        <w:t xml:space="preserve">, we used a </w:t>
-      </w:r>
-      <w:r>
-        <w:rPr>
-          <w:rFonts w:ascii="Arial" w:hAnsi="Arial" w:cs="Arial"/>
-        </w:rPr>
-        <w:lastRenderedPageBreak/>
-        <w:t xml:space="preserve">constant number of classes </w:t>
+        <w:t xml:space="preserve">, we used a constant number of classes </w:t>
       </w:r>
       <w:r>
         <w:rPr>
@@ -17265,7 +18463,28 @@
         <w:rPr>
           <w:rFonts w:ascii="Arial" w:hAnsi="Arial" w:cs="Arial"/>
         </w:rPr>
-        <w:t xml:space="preserve"> our pipeline facilitated controlling the amount of information encoded at both the group and individual levels, we expected that the uniqueness of identity information would be influenced by the generative process that we used to create group and individual information. As we randomly selected character strings to represent information at either social level, we did not expect that group or individual information would be fully unique amongst groups or individuals, respectively, across a given dataset. Instead, identity information could be stochastically similar amongst classes at either social level and the likelihood of such stochastic similarity would increase with the number of classes the given social level. For instance, as the number of groups increased in a dataset, so should the likelihood that group information was shared or very similar amongst one or more groups, leading to lower distinctiveness amongst groups even when we encoded large amounts of group information. </w:t>
+        <w:t xml:space="preserve"> our pipeline facilitated controlling the amount of information encoded at both the group and individual levels, we expected that the uniqueness of identity information would be influenced by the generative process that we used to create group and individual information. As we randomly selected character strings to represent information at either social level, we did not expect that group or individual information would be fully unique amongst groups or individuals, respectively, across a given dataset. Instead, identity information could be stochastically similar amongst classes at either social level </w:t>
+      </w:r>
+      <w:proofErr w:type="gramStart"/>
+      <w:r>
+        <w:rPr>
+          <w:rFonts w:ascii="Arial" w:hAnsi="Arial" w:cs="Arial"/>
+        </w:rPr>
+        <w:t>and</w:t>
+      </w:r>
+      <w:proofErr w:type="gramEnd"/>
+      <w:r>
+        <w:rPr>
+          <w:rFonts w:ascii="Arial" w:hAnsi="Arial" w:cs="Arial"/>
+        </w:rPr>
+        <w:t xml:space="preserve"> the likelihood of such stochastic similarity would increase with the number of classes the given social level. For instance, as the number of groups increased in a dataset, so should the likelihood that group information was shared or </w:t>
+      </w:r>
+      <w:r>
+        <w:rPr>
+          <w:rFonts w:ascii="Arial" w:hAnsi="Arial" w:cs="Arial"/>
+        </w:rPr>
+        <w:lastRenderedPageBreak/>
+        <w:t xml:space="preserve">very similar amongst one or more groups, leading to lower distinctiveness amongst groups even when we encoded large amounts of group information. </w:t>
       </w:r>
       <w:commentRangeEnd w:id="45"/>
       <w:r>
@@ -17414,14 +18633,7 @@
         <w:rPr>
           <w:rFonts w:ascii="Arial" w:hAnsi="Arial" w:cs="Arial"/>
         </w:rPr>
-        <w:t xml:space="preserve">described above to generate datasets of synthetic vocal identity signals under each </w:t>
-      </w:r>
-      <w:r>
-        <w:rPr>
-          <w:rFonts w:ascii="Arial" w:hAnsi="Arial" w:cs="Arial"/>
-        </w:rPr>
-        <w:lastRenderedPageBreak/>
-        <w:t xml:space="preserve">treatment combination. </w:t>
+        <w:t xml:space="preserve">described above to generate datasets of synthetic vocal identity signals under each treatment combination. </w:t>
       </w:r>
       <w:r>
         <w:rPr>
@@ -17627,7 +18839,21 @@
         <w:rPr>
           <w:rFonts w:ascii="Arial" w:hAnsi="Arial" w:cs="Arial"/>
         </w:rPr>
-        <w:t xml:space="preserve">dit distance calculations sometimes yielded values of zero off of the diagonal, as </w:t>
+        <w:t xml:space="preserve">dit distance calculations sometimes yielded values of zero </w:t>
+      </w:r>
+      <w:proofErr w:type="gramStart"/>
+      <w:r>
+        <w:rPr>
+          <w:rFonts w:ascii="Arial" w:hAnsi="Arial" w:cs="Arial"/>
+        </w:rPr>
+        <w:t>off of</w:t>
+      </w:r>
+      <w:proofErr w:type="gramEnd"/>
+      <w:r>
+        <w:rPr>
+          <w:rFonts w:ascii="Arial" w:hAnsi="Arial" w:cs="Arial"/>
+        </w:rPr>
+        <w:t xml:space="preserve"> the diagonal, as </w:t>
       </w:r>
       <w:r>
         <w:rPr>
@@ -17675,13 +18901,34 @@
         <w:rPr>
           <w:rFonts w:ascii="Arial" w:hAnsi="Arial" w:cs="Arial"/>
         </w:rPr>
-        <w:t xml:space="preserve"> using the same analytical pipeline described below</w:t>
-      </w:r>
-      <w:r>
-        <w:rPr>
-          <w:rFonts w:ascii="Arial" w:hAnsi="Arial" w:cs="Arial"/>
-        </w:rPr>
-        <w:t xml:space="preserve">. Overall, we found that using a value of 0.1 to replace values of 0 off of the diagonal </w:t>
+        <w:t xml:space="preserve"> using the same analytical pipeline </w:t>
+      </w:r>
+      <w:r>
+        <w:rPr>
+          <w:rFonts w:ascii="Arial" w:hAnsi="Arial" w:cs="Arial"/>
+        </w:rPr>
+        <w:lastRenderedPageBreak/>
+        <w:t>described below</w:t>
+      </w:r>
+      <w:r>
+        <w:rPr>
+          <w:rFonts w:ascii="Arial" w:hAnsi="Arial" w:cs="Arial"/>
+        </w:rPr>
+        <w:t xml:space="preserve">. Overall, we found that using a value of 0.1 to replace values of 0 </w:t>
+      </w:r>
+      <w:proofErr w:type="gramStart"/>
+      <w:r>
+        <w:rPr>
+          <w:rFonts w:ascii="Arial" w:hAnsi="Arial" w:cs="Arial"/>
+        </w:rPr>
+        <w:t>off of</w:t>
+      </w:r>
+      <w:proofErr w:type="gramEnd"/>
+      <w:r>
+        <w:rPr>
+          <w:rFonts w:ascii="Arial" w:hAnsi="Arial" w:cs="Arial"/>
+        </w:rPr>
+        <w:t xml:space="preserve"> the diagonal </w:t>
       </w:r>
       <w:r>
         <w:rPr>
@@ -17759,20 +19006,41 @@
         <w:rPr>
           <w:rFonts w:ascii="Arial" w:hAnsi="Arial" w:cs="Arial"/>
         </w:rPr>
-        <w:t xml:space="preserve">Although we found that using the </w:t>
-      </w:r>
-      <w:r>
-        <w:rPr>
-          <w:rFonts w:ascii="Arial" w:hAnsi="Arial" w:cs="Arial"/>
-        </w:rPr>
-        <w:lastRenderedPageBreak/>
-        <w:t xml:space="preserve">default value of the soundgen parameter for stochasticity in sound generation minimized the occurrence of producing audio files </w:t>
-      </w:r>
-      <w:r>
-        <w:rPr>
-          <w:rFonts w:ascii="Arial" w:hAnsi="Arial" w:cs="Arial"/>
-        </w:rPr>
-        <w:t xml:space="preserve">that were exactly the same </w:t>
+        <w:t xml:space="preserve">Although we found that using the default value of the </w:t>
+      </w:r>
+      <w:proofErr w:type="spellStart"/>
+      <w:r>
+        <w:rPr>
+          <w:rFonts w:ascii="Arial" w:hAnsi="Arial" w:cs="Arial"/>
+        </w:rPr>
+        <w:t>soundgen</w:t>
+      </w:r>
+      <w:proofErr w:type="spellEnd"/>
+      <w:r>
+        <w:rPr>
+          <w:rFonts w:ascii="Arial" w:hAnsi="Arial" w:cs="Arial"/>
+        </w:rPr>
+        <w:t xml:space="preserve"> parameter for stochasticity in sound generation minimized the occurrence of producing audio files </w:t>
+      </w:r>
+      <w:r>
+        <w:rPr>
+          <w:rFonts w:ascii="Arial" w:hAnsi="Arial" w:cs="Arial"/>
+        </w:rPr>
+        <w:t xml:space="preserve">that were </w:t>
+      </w:r>
+      <w:proofErr w:type="gramStart"/>
+      <w:r>
+        <w:rPr>
+          <w:rFonts w:ascii="Arial" w:hAnsi="Arial" w:cs="Arial"/>
+        </w:rPr>
+        <w:t>exactly the same</w:t>
+      </w:r>
+      <w:proofErr w:type="gramEnd"/>
+      <w:r>
+        <w:rPr>
+          <w:rFonts w:ascii="Arial" w:hAnsi="Arial" w:cs="Arial"/>
+        </w:rPr>
+        <w:t xml:space="preserve"> </w:t>
       </w:r>
       <w:r>
         <w:rPr>
@@ -17790,13 +19058,41 @@
         <w:rPr>
           <w:rFonts w:ascii="Arial" w:hAnsi="Arial" w:cs="Arial"/>
         </w:rPr>
-        <w:t>change values of 1 off of the diagonal to the second largest similarity value in the given SPCC matrix.</w:t>
-      </w:r>
-      <w:r>
-        <w:rPr>
-          <w:rFonts w:ascii="Arial" w:hAnsi="Arial" w:cs="Arial"/>
-        </w:rPr>
-        <w:t xml:space="preserve"> We tracked all of these modifications in the results of our simulation experiments</w:t>
+        <w:t xml:space="preserve">change values of 1 </w:t>
+      </w:r>
+      <w:proofErr w:type="gramStart"/>
+      <w:r>
+        <w:rPr>
+          <w:rFonts w:ascii="Arial" w:hAnsi="Arial" w:cs="Arial"/>
+        </w:rPr>
+        <w:t>off of</w:t>
+      </w:r>
+      <w:proofErr w:type="gramEnd"/>
+      <w:r>
+        <w:rPr>
+          <w:rFonts w:ascii="Arial" w:hAnsi="Arial" w:cs="Arial"/>
+        </w:rPr>
+        <w:t xml:space="preserve"> the diagonal to the second largest similarity value in the given SPCC matrix.</w:t>
+      </w:r>
+      <w:r>
+        <w:rPr>
+          <w:rFonts w:ascii="Arial" w:hAnsi="Arial" w:cs="Arial"/>
+        </w:rPr>
+        <w:t xml:space="preserve"> We tracked </w:t>
+      </w:r>
+      <w:proofErr w:type="gramStart"/>
+      <w:r>
+        <w:rPr>
+          <w:rFonts w:ascii="Arial" w:hAnsi="Arial" w:cs="Arial"/>
+        </w:rPr>
+        <w:t>all of</w:t>
+      </w:r>
+      <w:proofErr w:type="gramEnd"/>
+      <w:r>
+        <w:rPr>
+          <w:rFonts w:ascii="Arial" w:hAnsi="Arial" w:cs="Arial"/>
+        </w:rPr>
+        <w:t xml:space="preserve"> these modifications in the results of our simulation experiments</w:t>
       </w:r>
       <w:r>
         <w:rPr>
@@ -18027,7 +19323,14 @@
         <w:rPr>
           <w:rFonts w:ascii="Arial" w:hAnsi="Arial" w:cs="Arial"/>
         </w:rPr>
-        <w:t>at each social level. At the group level, we randomly selected 1 vocalization per individual within a group to maintain symmetry in sample size between social levels. At the individual level, we performed clustering of individuals’ vocalizations within a group for each group in the given dataset</w:t>
+        <w:t xml:space="preserve">at each social level. At the group level, we randomly selected 1 vocalization per individual within a group to maintain symmetry in sample size between social levels. At the individual level, we </w:t>
+      </w:r>
+      <w:r>
+        <w:rPr>
+          <w:rFonts w:ascii="Arial" w:hAnsi="Arial" w:cs="Arial"/>
+        </w:rPr>
+        <w:lastRenderedPageBreak/>
+        <w:t>performed clustering of individuals’ vocalizations within a group for each group in the given dataset</w:t>
       </w:r>
       <w:r>
         <w:rPr>
@@ -18063,14 +19366,7 @@
         <w:rPr>
           <w:rFonts w:ascii="Arial" w:hAnsi="Arial" w:cs="Arial"/>
         </w:rPr>
-        <w:t xml:space="preserve">We </w:t>
-      </w:r>
-      <w:r>
-        <w:rPr>
-          <w:rFonts w:ascii="Arial" w:hAnsi="Arial" w:cs="Arial"/>
-        </w:rPr>
-        <w:lastRenderedPageBreak/>
-        <w:t xml:space="preserve">generally expected to find higher clustering accuracy back to original class labels at the social level that we used to originally encode the most identity information in the synthetic vocalizations. </w:t>
+        <w:t xml:space="preserve">We generally expected to find higher clustering accuracy back to original class labels at the social level that we used to originally encode the most identity information in the synthetic vocalizations. </w:t>
       </w:r>
       <w:commentRangeStart w:id="47"/>
       <w:commentRangeStart w:id="48"/>
@@ -18218,7 +19514,14 @@
         <w:rPr>
           <w:rFonts w:ascii="Arial" w:hAnsi="Arial" w:cs="Arial"/>
         </w:rPr>
-        <w:t>measurement methods were useful for qualitative interpretations of our ability to accurately detect identity information</w:t>
+        <w:t xml:space="preserve">measurement methods were useful for qualitative interpretations of our ability to accurately detect </w:t>
+      </w:r>
+      <w:r>
+        <w:rPr>
+          <w:rFonts w:ascii="Arial" w:hAnsi="Arial" w:cs="Arial"/>
+        </w:rPr>
+        <w:lastRenderedPageBreak/>
+        <w:t>identity information</w:t>
       </w:r>
       <w:r>
         <w:rPr>
@@ -18311,11 +19614,19 @@
         <w:t xml:space="preserve">with the </w:t>
       </w:r>
       <w:commentRangeStart w:id="50"/>
-      <w:r>
-        <w:rPr>
-          <w:rFonts w:ascii="Arial" w:hAnsi="Arial" w:cs="Arial"/>
-        </w:rPr>
-        <w:t xml:space="preserve">effsize package version 0.8.1 </w:t>
+      <w:proofErr w:type="spellStart"/>
+      <w:r>
+        <w:rPr>
+          <w:rFonts w:ascii="Arial" w:hAnsi="Arial" w:cs="Arial"/>
+        </w:rPr>
+        <w:t>effsize</w:t>
+      </w:r>
+      <w:proofErr w:type="spellEnd"/>
+      <w:r>
+        <w:rPr>
+          <w:rFonts w:ascii="Arial" w:hAnsi="Arial" w:cs="Arial"/>
+        </w:rPr>
+        <w:t xml:space="preserve"> package version 0.8.1 </w:t>
       </w:r>
       <w:commentRangeEnd w:id="50"/>
       <w:r>
@@ -18400,14 +19711,7 @@
         <w:rPr>
           <w:rFonts w:ascii="Arial" w:hAnsi="Arial" w:cs="Arial"/>
         </w:rPr>
-        <w:t xml:space="preserve"> we </w:t>
-      </w:r>
-      <w:r>
-        <w:rPr>
-          <w:rFonts w:ascii="Arial" w:hAnsi="Arial" w:cs="Arial"/>
-        </w:rPr>
-        <w:lastRenderedPageBreak/>
-        <w:t>detected</w:t>
+        <w:t xml:space="preserve"> we detected</w:t>
       </w:r>
       <w:r>
         <w:rPr>
@@ -19826,7 +21130,21 @@
         <w:rPr>
           <w:rFonts w:ascii="Arial" w:hAnsi="Arial" w:cs="Arial"/>
         </w:rPr>
-        <w:t>more individual information encoded in the calls with polygons drawn by individual identity. Colors represent group identity, shapes represent different individuals.</w:t>
+        <w:t xml:space="preserve">more individual information encoded in the calls with polygons drawn by individual identity. Colors represent group </w:t>
+      </w:r>
+      <w:proofErr w:type="gramStart"/>
+      <w:r>
+        <w:rPr>
+          <w:rFonts w:ascii="Arial" w:hAnsi="Arial" w:cs="Arial"/>
+        </w:rPr>
+        <w:t>identity,</w:t>
+      </w:r>
+      <w:proofErr w:type="gramEnd"/>
+      <w:r>
+        <w:rPr>
+          <w:rFonts w:ascii="Arial" w:hAnsi="Arial" w:cs="Arial"/>
+        </w:rPr>
+        <w:t xml:space="preserve"> shapes represent different individuals.</w:t>
       </w:r>
     </w:p>
     <w:p>
@@ -19908,11 +21226,19 @@
         </w:rPr>
         <w:t>Supplemental figure 3</w:t>
       </w:r>
-      <w:r>
-        <w:rPr>
-          <w:rFonts w:ascii="Arial" w:hAnsi="Arial" w:cs="Arial"/>
-        </w:rPr>
-        <w:t>: : orange = group, blue = individual</w:t>
+      <w:proofErr w:type="gramStart"/>
+      <w:r>
+        <w:rPr>
+          <w:rFonts w:ascii="Arial" w:hAnsi="Arial" w:cs="Arial"/>
+        </w:rPr>
+        <w:t>: :</w:t>
+      </w:r>
+      <w:proofErr w:type="gramEnd"/>
+      <w:r>
+        <w:rPr>
+          <w:rFonts w:ascii="Arial" w:hAnsi="Arial" w:cs="Arial"/>
+        </w:rPr>
+        <w:t xml:space="preserve"> orange = group, blue = individual</w:t>
       </w:r>
     </w:p>
     <w:p>
@@ -28513,7 +29839,23 @@
             <w:rFonts w:ascii="Arial" w:hAnsi="Arial" w:cs="Arial"/>
             <w:highlight w:val="yellow"/>
           </w:rPr>
-          <w:t>MacDougall-Shackletons?</w:t>
+          <w:t>MacDougall-</w:t>
+        </w:r>
+        <w:proofErr w:type="spellStart"/>
+        <w:r>
+          <w:rPr>
+            <w:rFonts w:ascii="Arial" w:hAnsi="Arial" w:cs="Arial"/>
+            <w:highlight w:val="yellow"/>
+          </w:rPr>
+          <w:t>Shackletons</w:t>
+        </w:r>
+        <w:proofErr w:type="spellEnd"/>
+        <w:r>
+          <w:rPr>
+            <w:rFonts w:ascii="Arial" w:hAnsi="Arial" w:cs="Arial"/>
+            <w:highlight w:val="yellow"/>
+          </w:rPr>
+          <w:t>?</w:t>
         </w:r>
         <w:r>
           <w:rPr>
@@ -28982,14 +30324,42 @@
           <w:rPr>
             <w:rFonts w:ascii="Arial" w:hAnsi="Arial" w:cs="Arial"/>
           </w:rPr>
-          <w:t xml:space="preserve">Animals are known to use frequency modulation patterns to communicate social information (CITE). Our package, paRsynth, takes computationally efficient characters </w:t>
+          <w:t xml:space="preserve">Animals are known to use frequency modulation patterns to communicate social information (CITE). Our package, </w:t>
+        </w:r>
+        <w:proofErr w:type="spellStart"/>
+        <w:r>
+          <w:rPr>
+            <w:rFonts w:ascii="Arial" w:hAnsi="Arial" w:cs="Arial"/>
+          </w:rPr>
+          <w:t>paRsynth</w:t>
+        </w:r>
+        <w:proofErr w:type="spellEnd"/>
+        <w:r>
+          <w:rPr>
+            <w:rFonts w:ascii="Arial" w:hAnsi="Arial" w:cs="Arial"/>
+          </w:rPr>
+          <w:t xml:space="preserve">, takes computationally efficient characters </w:t>
         </w:r>
         <w:r>
           <w:rPr>
             <w:rFonts w:ascii="Arial" w:hAnsi="Arial" w:cs="Arial"/>
           </w:rPr>
           <w:lastRenderedPageBreak/>
-          <w:t xml:space="preserve">strings and turns them into biologically relevant frequency-based signals. Therefore, we are able to generate information encoding at various levels of complexity in a biologically realistic way, combining synthetic information theory and traditional bioacoustics analysis tools. </w:t>
+          <w:t xml:space="preserve">strings and turns them into biologically relevant frequency-based signals. Therefore, we </w:t>
+        </w:r>
+        <w:proofErr w:type="gramStart"/>
+        <w:r>
+          <w:rPr>
+            <w:rFonts w:ascii="Arial" w:hAnsi="Arial" w:cs="Arial"/>
+          </w:rPr>
+          <w:t>are able to</w:t>
+        </w:r>
+        <w:proofErr w:type="gramEnd"/>
+        <w:r>
+          <w:rPr>
+            <w:rFonts w:ascii="Arial" w:hAnsi="Arial" w:cs="Arial"/>
+          </w:rPr>
+          <w:t xml:space="preserve"> generate information encoding at various levels of complexity in a biologically realistic way, combining synthetic information theory and traditional bioacoustics analysis tools. </w:t>
         </w:r>
       </w:ins>
     </w:p>
@@ -29033,7 +30403,35 @@
         <w:rPr>
           <w:rFonts w:ascii="Arial" w:hAnsi="Arial" w:cs="Arial"/>
         </w:rPr>
-        <w:t>Second, out ability to detect the dynamics of information encoding during real time social interactions is limited by our ability to capture the totality of an individual’s or groups signal produced during these interactions. We may be over sampling from vocal learning species whose social interaction and signal production are easy to observe and measure, and therefore may not be assessing the full scope of how information can be encoded across a range of species.</w:t>
+        <w:t xml:space="preserve">Second, </w:t>
+      </w:r>
+      <w:proofErr w:type="spellStart"/>
+      <w:r>
+        <w:rPr>
+          <w:rFonts w:ascii="Arial" w:hAnsi="Arial" w:cs="Arial"/>
+        </w:rPr>
+        <w:t>out</w:t>
+      </w:r>
+      <w:proofErr w:type="spellEnd"/>
+      <w:r>
+        <w:rPr>
+          <w:rFonts w:ascii="Arial" w:hAnsi="Arial" w:cs="Arial"/>
+        </w:rPr>
+        <w:t xml:space="preserve"> ability to detect the dynamics of information encoding during real time social interactions is limited by our ability to capture the totality of an individual’s or groups signal produced during these interactions. We may be over sampling from vocal learning species whose social interaction and signal production are easy to observe and </w:t>
+      </w:r>
+      <w:proofErr w:type="gramStart"/>
+      <w:r>
+        <w:rPr>
+          <w:rFonts w:ascii="Arial" w:hAnsi="Arial" w:cs="Arial"/>
+        </w:rPr>
+        <w:t>measure, and</w:t>
+      </w:r>
+      <w:proofErr w:type="gramEnd"/>
+      <w:r>
+        <w:rPr>
+          <w:rFonts w:ascii="Arial" w:hAnsi="Arial" w:cs="Arial"/>
+        </w:rPr>
+        <w:t xml:space="preserve"> therefore may not be assessing the full scope of how information can be encoded across a range of species.</w:t>
       </w:r>
       <w:commentRangeEnd w:id="104"/>
       <w:r>
@@ -29515,7 +30913,21 @@
           <w:rFonts w:ascii="Arial" w:hAnsi="Arial" w:cs="Arial"/>
         </w:rPr>
         <w:lastRenderedPageBreak/>
-        <w:t>We computed accuracies for vocalizations generated across our synthetic experiments, in which we varied the relative proportion of group and individual information in vocalizations, as well as the size of signal datasets, as a proxy of more or less crowded signaling environments</w:t>
+        <w:t xml:space="preserve">We computed accuracies for vocalizations generated across our synthetic experiments, in which we varied the relative proportion of group and individual information in vocalizations, as well as the size of signal datasets, as a proxy of </w:t>
+      </w:r>
+      <w:proofErr w:type="gramStart"/>
+      <w:r>
+        <w:rPr>
+          <w:rFonts w:ascii="Arial" w:hAnsi="Arial" w:cs="Arial"/>
+        </w:rPr>
+        <w:t>more or less crowded</w:t>
+      </w:r>
+      <w:proofErr w:type="gramEnd"/>
+      <w:r>
+        <w:rPr>
+          <w:rFonts w:ascii="Arial" w:hAnsi="Arial" w:cs="Arial"/>
+        </w:rPr>
+        <w:t xml:space="preserve"> signaling environments</w:t>
       </w:r>
       <w:commentRangeEnd w:id="116"/>
       <w:r>

</xml_diff>

<commit_message>
replaced fig 1 in manuscript
</commit_message>
<xml_diff>
--- a/drafts/paRsynth_methods_draft.docx
+++ b/drafts/paRsynth_methods_draft.docx
@@ -5777,22 +5777,30 @@
     <w:p>
       <w:pPr>
         <w:spacing w:line="480" w:lineRule="auto"/>
+        <w:jc w:val="center"/>
         <w:rPr>
           <w:rFonts w:ascii="Arial" w:hAnsi="Arial" w:cs="Arial"/>
         </w:rPr>
       </w:pPr>
       <w:commentRangeStart w:id="43"/>
+      <w:commentRangeEnd w:id="43"/>
+      <w:r>
+        <w:rPr>
+          <w:rStyle w:val="CommentReference"/>
+        </w:rPr>
+        <w:lastRenderedPageBreak/>
+        <w:commentReference w:id="43"/>
+      </w:r>
       <w:r>
         <w:rPr>
           <w:rFonts w:ascii="Arial" w:hAnsi="Arial" w:cs="Arial"/>
           <w:noProof/>
         </w:rPr>
-        <w:lastRenderedPageBreak/>
         <w:drawing>
-          <wp:inline distT="0" distB="0" distL="0" distR="0" wp14:anchorId="2A270FAD" wp14:editId="2771146D">
-            <wp:extent cx="5939790" cy="7227570"/>
-            <wp:effectExtent l="0" t="0" r="3810" b="0"/>
-            <wp:docPr id="1520991816" name="Picture 2"/>
+          <wp:inline distT="0" distB="0" distL="0" distR="0" wp14:anchorId="6B53FB0D" wp14:editId="1C01EA19">
+            <wp:extent cx="4848225" cy="5943600"/>
+            <wp:effectExtent l="0" t="0" r="9525" b="0"/>
+            <wp:docPr id="1200398071" name="Picture 2"/>
             <wp:cNvGraphicFramePr>
               <a:graphicFrameLocks xmlns:a="http://schemas.openxmlformats.org/drawingml/2006/main" noChangeAspect="1"/>
             </wp:cNvGraphicFramePr>
@@ -5821,7 +5829,7 @@
                   <pic:spPr bwMode="auto">
                     <a:xfrm>
                       <a:off x="0" y="0"/>
-                      <a:ext cx="5939790" cy="7227570"/>
+                      <a:ext cx="4848225" cy="5943600"/>
                     </a:xfrm>
                     <a:prstGeom prst="rect">
                       <a:avLst/>
@@ -5837,13 +5845,6 @@
           </wp:inline>
         </w:drawing>
       </w:r>
-      <w:commentRangeEnd w:id="43"/>
-      <w:r>
-        <w:rPr>
-          <w:rStyle w:val="CommentReference"/>
-        </w:rPr>
-        <w:commentReference w:id="43"/>
-      </w:r>
     </w:p>
     <w:p>
       <w:pPr>
@@ -5980,7 +5981,7 @@
           <w:sz w:val="22"/>
           <w:szCs w:val="22"/>
         </w:rPr>
-        <w:t xml:space="preserve">the </w:t>
+        <w:t xml:space="preserve">the symbols </w:t>
       </w:r>
       <w:r>
         <w:rPr>
@@ -5988,8 +5989,7 @@
           <w:sz w:val="22"/>
           <w:szCs w:val="22"/>
         </w:rPr>
-        <w:lastRenderedPageBreak/>
-        <w:t xml:space="preserve">symbols </w:t>
+        <w:t>A, B, or C)</w:t>
       </w:r>
       <w:r>
         <w:rPr>
@@ -5997,7 +5997,7 @@
           <w:sz w:val="22"/>
           <w:szCs w:val="22"/>
         </w:rPr>
-        <w:t>A, B, or C)</w:t>
+        <w:t xml:space="preserve">. The string comprises </w:t>
       </w:r>
       <w:r>
         <w:rPr>
@@ -6005,7 +6005,7 @@
           <w:sz w:val="22"/>
           <w:szCs w:val="22"/>
         </w:rPr>
-        <w:t xml:space="preserve">. The string comprises </w:t>
+        <w:t xml:space="preserve">four distinct </w:t>
       </w:r>
       <w:r>
         <w:rPr>
@@ -6013,7 +6013,7 @@
           <w:sz w:val="22"/>
           <w:szCs w:val="22"/>
         </w:rPr>
-        <w:t xml:space="preserve">four distinct </w:t>
+        <w:t>sections</w:t>
       </w:r>
       <w:r>
         <w:rPr>
@@ -6021,7 +6021,7 @@
           <w:sz w:val="22"/>
           <w:szCs w:val="22"/>
         </w:rPr>
-        <w:t>sections</w:t>
+        <w:t>. Sections</w:t>
       </w:r>
       <w:r>
         <w:rPr>
@@ -6029,33 +6029,33 @@
           <w:sz w:val="22"/>
           <w:szCs w:val="22"/>
         </w:rPr>
-        <w:t>. Sections</w:t>
-      </w:r>
+        <w:t xml:space="preserve"> (</w:t>
+      </w:r>
+      <w:proofErr w:type="spellStart"/>
       <w:r>
         <w:rPr>
           <w:rFonts w:ascii="Arial" w:hAnsi="Arial" w:cs="Arial"/>
           <w:sz w:val="22"/>
           <w:szCs w:val="22"/>
         </w:rPr>
-        <w:t xml:space="preserve"> (</w:t>
-      </w:r>
-      <w:proofErr w:type="spellStart"/>
+        <w:t>i</w:t>
+      </w:r>
+      <w:proofErr w:type="spellEnd"/>
       <w:r>
         <w:rPr>
           <w:rFonts w:ascii="Arial" w:hAnsi="Arial" w:cs="Arial"/>
           <w:sz w:val="22"/>
           <w:szCs w:val="22"/>
         </w:rPr>
-        <w:t>i</w:t>
-      </w:r>
-      <w:proofErr w:type="spellEnd"/>
+        <w:t xml:space="preserve">) and (v) </w:t>
+      </w:r>
       <w:r>
         <w:rPr>
           <w:rFonts w:ascii="Arial" w:hAnsi="Arial" w:cs="Arial"/>
           <w:sz w:val="22"/>
           <w:szCs w:val="22"/>
         </w:rPr>
-        <w:t xml:space="preserve">) and (v) </w:t>
+        <w:t>indicate</w:t>
       </w:r>
       <w:r>
         <w:rPr>
@@ -6063,7 +6063,7 @@
           <w:sz w:val="22"/>
           <w:szCs w:val="22"/>
         </w:rPr>
-        <w:t>indicate</w:t>
+        <w:t xml:space="preserve"> the global head and tail, which bounds the structural variation in the synthetic signal</w:t>
       </w:r>
       <w:r>
         <w:rPr>
@@ -6071,7 +6071,7 @@
           <w:sz w:val="22"/>
           <w:szCs w:val="22"/>
         </w:rPr>
-        <w:t xml:space="preserve"> the global head and tail, which bounds the structural variation in the synthetic signal</w:t>
+        <w:t xml:space="preserve"> to simulate patterns of variation within a type of vocalization, rather than across types of vocalizations in a repertoire</w:t>
       </w:r>
       <w:r>
         <w:rPr>
@@ -6079,7 +6079,7 @@
           <w:sz w:val="22"/>
           <w:szCs w:val="22"/>
         </w:rPr>
-        <w:t xml:space="preserve"> to simulate patterns of variation within a type of vocalization, rather than across types of vocalizations in a repertoire</w:t>
+        <w:t>.</w:t>
       </w:r>
       <w:r>
         <w:rPr>
@@ -6087,7 +6087,7 @@
           <w:sz w:val="22"/>
           <w:szCs w:val="22"/>
         </w:rPr>
-        <w:t>.</w:t>
+        <w:t xml:space="preserve"> </w:t>
       </w:r>
       <w:r>
         <w:rPr>
@@ -6095,7 +6095,7 @@
           <w:sz w:val="22"/>
           <w:szCs w:val="22"/>
         </w:rPr>
-        <w:t xml:space="preserve"> </w:t>
+        <w:t xml:space="preserve">Sections </w:t>
       </w:r>
       <w:r>
         <w:rPr>
@@ -6103,7 +6103,7 @@
           <w:sz w:val="22"/>
           <w:szCs w:val="22"/>
         </w:rPr>
-        <w:t xml:space="preserve">Sections </w:t>
+        <w:t xml:space="preserve">(ii) </w:t>
       </w:r>
       <w:r>
         <w:rPr>
@@ -6111,7 +6111,7 @@
           <w:sz w:val="22"/>
           <w:szCs w:val="22"/>
         </w:rPr>
-        <w:t xml:space="preserve">(ii) </w:t>
+        <w:t xml:space="preserve">and (iii) </w:t>
       </w:r>
       <w:r>
         <w:rPr>
@@ -6119,7 +6119,7 @@
           <w:sz w:val="22"/>
           <w:szCs w:val="22"/>
         </w:rPr>
-        <w:t xml:space="preserve">and (iii) </w:t>
+        <w:t>indicate</w:t>
       </w:r>
       <w:r>
         <w:rPr>
@@ -6127,7 +6127,7 @@
           <w:sz w:val="22"/>
           <w:szCs w:val="22"/>
         </w:rPr>
-        <w:t>indicate</w:t>
+        <w:t xml:space="preserve"> where group</w:t>
       </w:r>
       <w:r>
         <w:rPr>
@@ -6135,7 +6135,7 @@
           <w:sz w:val="22"/>
           <w:szCs w:val="22"/>
         </w:rPr>
-        <w:t xml:space="preserve"> where group</w:t>
+        <w:t xml:space="preserve"> and individual identity</w:t>
       </w:r>
       <w:r>
         <w:rPr>
@@ -6143,7 +6143,7 @@
           <w:sz w:val="22"/>
           <w:szCs w:val="22"/>
         </w:rPr>
-        <w:t xml:space="preserve"> and individual identity</w:t>
+        <w:t xml:space="preserve"> information </w:t>
       </w:r>
       <w:r>
         <w:rPr>
@@ -6151,7 +6151,7 @@
           <w:sz w:val="22"/>
           <w:szCs w:val="22"/>
         </w:rPr>
-        <w:t xml:space="preserve"> information </w:t>
+        <w:t>are</w:t>
       </w:r>
       <w:r>
         <w:rPr>
@@ -6159,7 +6159,7 @@
           <w:sz w:val="22"/>
           <w:szCs w:val="22"/>
         </w:rPr>
-        <w:t>are</w:t>
+        <w:t xml:space="preserve"> </w:t>
       </w:r>
       <w:r>
         <w:rPr>
@@ -6167,7 +6167,8 @@
           <w:sz w:val="22"/>
           <w:szCs w:val="22"/>
         </w:rPr>
-        <w:t xml:space="preserve"> encoded, </w:t>
+        <w:lastRenderedPageBreak/>
+        <w:t xml:space="preserve">encoded, </w:t>
       </w:r>
       <w:r>
         <w:rPr>
@@ -6942,104 +6943,104 @@
         <w:rPr>
           <w:rFonts w:ascii="Arial" w:hAnsi="Arial" w:cs="Arial"/>
         </w:rPr>
-        <w:t xml:space="preserve">ubsample of </w:t>
+        <w:t>ubsample of the</w:t>
+      </w:r>
+      <w:r>
+        <w:rPr>
+          <w:rFonts w:ascii="Arial" w:hAnsi="Arial" w:cs="Arial"/>
+        </w:rPr>
+        <w:t xml:space="preserve"> synthetic</w:t>
+      </w:r>
+      <w:r>
+        <w:rPr>
+          <w:rFonts w:ascii="Arial" w:hAnsi="Arial" w:cs="Arial"/>
+        </w:rPr>
+        <w:t xml:space="preserve"> vocal</w:t>
+      </w:r>
+      <w:r>
+        <w:rPr>
+          <w:rFonts w:ascii="Arial" w:hAnsi="Arial" w:cs="Arial"/>
+        </w:rPr>
+        <w:t xml:space="preserve"> signals </w:t>
+      </w:r>
+      <w:r>
+        <w:rPr>
+          <w:rFonts w:ascii="Arial" w:hAnsi="Arial" w:cs="Arial"/>
+        </w:rPr>
+        <w:t>in either dataset</w:t>
+      </w:r>
+      <w:r>
+        <w:rPr>
+          <w:rFonts w:ascii="Arial" w:hAnsi="Arial" w:cs="Arial"/>
+        </w:rPr>
+        <w:t xml:space="preserve"> (</w:t>
+      </w:r>
+      <w:r>
+        <w:rPr>
+          <w:rFonts w:ascii="Arial" w:hAnsi="Arial" w:cs="Arial"/>
+        </w:rPr>
+        <w:t xml:space="preserve">Fig </w:t>
+      </w:r>
+      <w:r>
+        <w:rPr>
+          <w:rFonts w:ascii="Arial" w:hAnsi="Arial" w:cs="Arial"/>
+        </w:rPr>
+        <w:t xml:space="preserve">2A, </w:t>
+      </w:r>
+      <w:r>
+        <w:rPr>
+          <w:rFonts w:ascii="Arial" w:hAnsi="Arial" w:cs="Arial"/>
+        </w:rPr>
+        <w:t xml:space="preserve">Fig </w:t>
+      </w:r>
+      <w:r>
+        <w:rPr>
+          <w:rFonts w:ascii="Arial" w:hAnsi="Arial" w:cs="Arial"/>
+        </w:rPr>
+        <w:t>3A)</w:t>
+      </w:r>
+      <w:r>
+        <w:rPr>
+          <w:rFonts w:ascii="Arial" w:hAnsi="Arial" w:cs="Arial"/>
+        </w:rPr>
+        <w:t xml:space="preserve">. </w:t>
+      </w:r>
+      <w:r>
+        <w:rPr>
+          <w:rFonts w:ascii="Arial" w:hAnsi="Arial" w:cs="Arial"/>
+        </w:rPr>
+        <w:t>These call catalogues demonstrate sections of frequency modulation patterns that are shared within classes</w:t>
+      </w:r>
+      <w:r>
+        <w:rPr>
+          <w:rFonts w:ascii="Arial" w:hAnsi="Arial" w:cs="Arial"/>
+        </w:rPr>
+        <w:t>, and other sections that are</w:t>
+      </w:r>
+      <w:r>
+        <w:rPr>
+          <w:rFonts w:ascii="Arial" w:hAnsi="Arial" w:cs="Arial"/>
+        </w:rPr>
+        <w:t xml:space="preserve"> distinct </w:t>
+      </w:r>
+      <w:r>
+        <w:rPr>
+          <w:rFonts w:ascii="Arial" w:hAnsi="Arial" w:cs="Arial"/>
+        </w:rPr>
+        <w:t xml:space="preserve">amongst </w:t>
+      </w:r>
+      <w:r>
+        <w:rPr>
+          <w:rFonts w:ascii="Arial" w:hAnsi="Arial" w:cs="Arial"/>
+        </w:rPr>
+        <w:t xml:space="preserve">classes. For instance, in the group-specific </w:t>
       </w:r>
       <w:r>
         <w:rPr>
           <w:rFonts w:ascii="Arial" w:hAnsi="Arial" w:cs="Arial"/>
         </w:rPr>
         <w:lastRenderedPageBreak/>
-        <w:t>the</w:t>
-      </w:r>
-      <w:r>
-        <w:rPr>
-          <w:rFonts w:ascii="Arial" w:hAnsi="Arial" w:cs="Arial"/>
-        </w:rPr>
-        <w:t xml:space="preserve"> synthetic</w:t>
-      </w:r>
-      <w:r>
-        <w:rPr>
-          <w:rFonts w:ascii="Arial" w:hAnsi="Arial" w:cs="Arial"/>
-        </w:rPr>
-        <w:t xml:space="preserve"> vocal</w:t>
-      </w:r>
-      <w:r>
-        <w:rPr>
-          <w:rFonts w:ascii="Arial" w:hAnsi="Arial" w:cs="Arial"/>
-        </w:rPr>
-        <w:t xml:space="preserve"> signals </w:t>
-      </w:r>
-      <w:r>
-        <w:rPr>
-          <w:rFonts w:ascii="Arial" w:hAnsi="Arial" w:cs="Arial"/>
-        </w:rPr>
-        <w:t>in either dataset</w:t>
-      </w:r>
-      <w:r>
-        <w:rPr>
-          <w:rFonts w:ascii="Arial" w:hAnsi="Arial" w:cs="Arial"/>
-        </w:rPr>
-        <w:t xml:space="preserve"> (</w:t>
-      </w:r>
-      <w:r>
-        <w:rPr>
-          <w:rFonts w:ascii="Arial" w:hAnsi="Arial" w:cs="Arial"/>
-        </w:rPr>
-        <w:t xml:space="preserve">Fig </w:t>
-      </w:r>
-      <w:r>
-        <w:rPr>
-          <w:rFonts w:ascii="Arial" w:hAnsi="Arial" w:cs="Arial"/>
-        </w:rPr>
-        <w:t xml:space="preserve">2A, </w:t>
-      </w:r>
-      <w:r>
-        <w:rPr>
-          <w:rFonts w:ascii="Arial" w:hAnsi="Arial" w:cs="Arial"/>
-        </w:rPr>
-        <w:t xml:space="preserve">Fig </w:t>
-      </w:r>
-      <w:r>
-        <w:rPr>
-          <w:rFonts w:ascii="Arial" w:hAnsi="Arial" w:cs="Arial"/>
-        </w:rPr>
-        <w:t>3A)</w:t>
-      </w:r>
-      <w:r>
-        <w:rPr>
-          <w:rFonts w:ascii="Arial" w:hAnsi="Arial" w:cs="Arial"/>
-        </w:rPr>
-        <w:t xml:space="preserve">. </w:t>
-      </w:r>
-      <w:r>
-        <w:rPr>
-          <w:rFonts w:ascii="Arial" w:hAnsi="Arial" w:cs="Arial"/>
-        </w:rPr>
-        <w:t>These call catalogues demonstrate sections of frequency modulation patterns that are shared within classes</w:t>
-      </w:r>
-      <w:r>
-        <w:rPr>
-          <w:rFonts w:ascii="Arial" w:hAnsi="Arial" w:cs="Arial"/>
-        </w:rPr>
-        <w:t>, and other sections that are</w:t>
-      </w:r>
-      <w:r>
-        <w:rPr>
-          <w:rFonts w:ascii="Arial" w:hAnsi="Arial" w:cs="Arial"/>
-        </w:rPr>
-        <w:t xml:space="preserve"> distinct </w:t>
-      </w:r>
-      <w:r>
-        <w:rPr>
-          <w:rFonts w:ascii="Arial" w:hAnsi="Arial" w:cs="Arial"/>
-        </w:rPr>
-        <w:t xml:space="preserve">amongst </w:t>
-      </w:r>
-      <w:r>
-        <w:rPr>
-          <w:rFonts w:ascii="Arial" w:hAnsi="Arial" w:cs="Arial"/>
-        </w:rPr>
-        <w:t>classes. For instance, in the group-specific dataset, spectrograms for individuals in the same group share more structural similarity of frequency modulation patterns than individuals from two different groups (</w:t>
+        <w:t>dataset, spectrograms for individuals in the same group share more structural similarity of frequency modulation patterns than individuals from two different groups (</w:t>
       </w:r>
       <w:r>
         <w:rPr>
@@ -7123,7 +7124,6 @@
           <w:sz w:val="22"/>
           <w:szCs w:val="22"/>
         </w:rPr>
-        <w:lastRenderedPageBreak/>
         <w:drawing>
           <wp:inline distT="0" distB="0" distL="0" distR="0" wp14:anchorId="4C6B9319" wp14:editId="1CB58D24">
             <wp:extent cx="5943600" cy="5151120"/>
@@ -7361,7 +7361,7 @@
           <w:sz w:val="22"/>
           <w:szCs w:val="22"/>
         </w:rPr>
-        <w:t xml:space="preserve">Frequency modulation patterns </w:t>
+        <w:t xml:space="preserve">Frequency modulation </w:t>
       </w:r>
       <w:r>
         <w:rPr>
@@ -7369,7 +7369,8 @@
           <w:sz w:val="22"/>
           <w:szCs w:val="22"/>
         </w:rPr>
-        <w:t xml:space="preserve">are similar within groups and different between groups, </w:t>
+        <w:lastRenderedPageBreak/>
+        <w:t xml:space="preserve">patterns </w:t>
       </w:r>
       <w:r>
         <w:rPr>
@@ -7377,7 +7378,7 @@
           <w:sz w:val="22"/>
           <w:szCs w:val="22"/>
         </w:rPr>
-        <w:t xml:space="preserve">reflecting </w:t>
+        <w:t xml:space="preserve">are similar within groups and different between groups, </w:t>
       </w:r>
       <w:r>
         <w:rPr>
@@ -7385,7 +7386,7 @@
           <w:sz w:val="22"/>
           <w:szCs w:val="22"/>
         </w:rPr>
-        <w:t xml:space="preserve">how </w:t>
+        <w:t xml:space="preserve">reflecting </w:t>
       </w:r>
       <w:r>
         <w:rPr>
@@ -7393,7 +7394,7 @@
           <w:sz w:val="22"/>
           <w:szCs w:val="22"/>
         </w:rPr>
-        <w:t xml:space="preserve">group </w:t>
+        <w:t xml:space="preserve">how </w:t>
       </w:r>
       <w:r>
         <w:rPr>
@@ -7401,33 +7402,33 @@
           <w:sz w:val="22"/>
           <w:szCs w:val="22"/>
         </w:rPr>
-        <w:t xml:space="preserve">information </w:t>
-      </w:r>
-      <w:proofErr w:type="gramStart"/>
+        <w:t xml:space="preserve">group </w:t>
+      </w:r>
       <w:r>
         <w:rPr>
           <w:rFonts w:ascii="Arial" w:hAnsi="Arial" w:cs="Arial"/>
           <w:sz w:val="22"/>
           <w:szCs w:val="22"/>
         </w:rPr>
-        <w:t>outweighed</w:t>
-      </w:r>
-      <w:proofErr w:type="gramEnd"/>
+        <w:t xml:space="preserve">information </w:t>
+      </w:r>
+      <w:proofErr w:type="gramStart"/>
       <w:r>
         <w:rPr>
           <w:rFonts w:ascii="Arial" w:hAnsi="Arial" w:cs="Arial"/>
           <w:sz w:val="22"/>
           <w:szCs w:val="22"/>
         </w:rPr>
-        <w:t xml:space="preserve"> individual information in these vocalizations</w:t>
-      </w:r>
+        <w:t>outweighed</w:t>
+      </w:r>
+      <w:proofErr w:type="gramEnd"/>
       <w:r>
         <w:rPr>
           <w:rFonts w:ascii="Arial" w:hAnsi="Arial" w:cs="Arial"/>
           <w:sz w:val="22"/>
           <w:szCs w:val="22"/>
         </w:rPr>
-        <w:t xml:space="preserve"> by a factor of two</w:t>
+        <w:t xml:space="preserve"> individual information in these vocalizations</w:t>
       </w:r>
       <w:r>
         <w:rPr>
@@ -7435,7 +7436,7 @@
           <w:sz w:val="22"/>
           <w:szCs w:val="22"/>
         </w:rPr>
-        <w:t xml:space="preserve">. </w:t>
+        <w:t xml:space="preserve"> by a factor of two</w:t>
       </w:r>
       <w:r>
         <w:rPr>
@@ -7443,7 +7444,7 @@
           <w:sz w:val="22"/>
           <w:szCs w:val="22"/>
         </w:rPr>
-        <w:t>Panel (B) displays acoustic space plots</w:t>
+        <w:t xml:space="preserve">. </w:t>
       </w:r>
       <w:r>
         <w:rPr>
@@ -7451,7 +7452,7 @@
           <w:sz w:val="22"/>
           <w:szCs w:val="22"/>
         </w:rPr>
-        <w:t xml:space="preserve"> for </w:t>
+        <w:t>Panel (B) displays acoustic space plots</w:t>
       </w:r>
       <w:r>
         <w:rPr>
@@ -7459,7 +7460,7 @@
           <w:sz w:val="22"/>
           <w:szCs w:val="22"/>
         </w:rPr>
-        <w:t xml:space="preserve">all 10 individuals in each of </w:t>
+        <w:t xml:space="preserve"> for </w:t>
       </w:r>
       <w:r>
         <w:rPr>
@@ -7467,7 +7468,7 @@
           <w:sz w:val="22"/>
           <w:szCs w:val="22"/>
         </w:rPr>
-        <w:t>G</w:t>
+        <w:t xml:space="preserve">all 10 individuals in each of </w:t>
       </w:r>
       <w:r>
         <w:rPr>
@@ -7475,7 +7476,7 @@
           <w:sz w:val="22"/>
           <w:szCs w:val="22"/>
         </w:rPr>
-        <w:t>roups 2 and 4</w:t>
+        <w:t>G</w:t>
       </w:r>
       <w:r>
         <w:rPr>
@@ -7483,7 +7484,7 @@
           <w:sz w:val="22"/>
           <w:szCs w:val="22"/>
         </w:rPr>
-        <w:t>, and for each representation of the vocalizations (character strings and audio files)</w:t>
+        <w:t>roups 2 and 4</w:t>
       </w:r>
       <w:r>
         <w:rPr>
@@ -7491,7 +7492,7 @@
           <w:sz w:val="22"/>
           <w:szCs w:val="22"/>
         </w:rPr>
-        <w:t xml:space="preserve">. These plots were </w:t>
+        <w:t>, and for each representation of the vocalizations (character strings and audio files)</w:t>
       </w:r>
       <w:r>
         <w:rPr>
@@ -7499,7 +7500,7 @@
           <w:sz w:val="22"/>
           <w:szCs w:val="22"/>
         </w:rPr>
-        <w:t>generated by</w:t>
+        <w:t xml:space="preserve">. These plots were </w:t>
       </w:r>
       <w:r>
         <w:rPr>
@@ -7507,7 +7508,7 @@
           <w:sz w:val="22"/>
           <w:szCs w:val="22"/>
         </w:rPr>
-        <w:t xml:space="preserve"> </w:t>
+        <w:t>generated by</w:t>
       </w:r>
       <w:r>
         <w:rPr>
@@ -7515,7 +7516,7 @@
           <w:sz w:val="22"/>
           <w:szCs w:val="22"/>
         </w:rPr>
-        <w:t xml:space="preserve">applying multidimensional scaling to </w:t>
+        <w:t xml:space="preserve"> </w:t>
       </w:r>
       <w:r>
         <w:rPr>
@@ -7523,33 +7524,33 @@
           <w:sz w:val="22"/>
           <w:szCs w:val="22"/>
         </w:rPr>
-        <w:t>(</w:t>
-      </w:r>
-      <w:proofErr w:type="spellStart"/>
+        <w:t xml:space="preserve">applying multidimensional scaling to </w:t>
+      </w:r>
       <w:r>
         <w:rPr>
           <w:rFonts w:ascii="Arial" w:hAnsi="Arial" w:cs="Arial"/>
           <w:sz w:val="22"/>
           <w:szCs w:val="22"/>
         </w:rPr>
-        <w:t>i</w:t>
-      </w:r>
-      <w:proofErr w:type="spellEnd"/>
+        <w:t>(</w:t>
+      </w:r>
+      <w:proofErr w:type="spellStart"/>
       <w:r>
         <w:rPr>
           <w:rFonts w:ascii="Arial" w:hAnsi="Arial" w:cs="Arial"/>
           <w:sz w:val="22"/>
           <w:szCs w:val="22"/>
         </w:rPr>
-        <w:t>) edit distance</w:t>
-      </w:r>
+        <w:t>i</w:t>
+      </w:r>
+      <w:proofErr w:type="spellEnd"/>
       <w:r>
         <w:rPr>
           <w:rFonts w:ascii="Arial" w:hAnsi="Arial" w:cs="Arial"/>
           <w:sz w:val="22"/>
           <w:szCs w:val="22"/>
         </w:rPr>
-        <w:t xml:space="preserve"> (strings)</w:t>
+        <w:t>) edit distance</w:t>
       </w:r>
       <w:r>
         <w:rPr>
@@ -7557,7 +7558,7 @@
           <w:sz w:val="22"/>
           <w:szCs w:val="22"/>
         </w:rPr>
-        <w:t xml:space="preserve"> or (ii) spectrographic cross correlation</w:t>
+        <w:t xml:space="preserve"> (strings)</w:t>
       </w:r>
       <w:r>
         <w:rPr>
@@ -7565,7 +7566,7 @@
           <w:sz w:val="22"/>
           <w:szCs w:val="22"/>
         </w:rPr>
-        <w:t xml:space="preserve"> (audio)</w:t>
+        <w:t xml:space="preserve"> or (ii) spectrographic cross correlation</w:t>
       </w:r>
       <w:r>
         <w:rPr>
@@ -7573,7 +7574,7 @@
           <w:sz w:val="22"/>
           <w:szCs w:val="22"/>
         </w:rPr>
-        <w:t xml:space="preserve"> </w:t>
+        <w:t xml:space="preserve"> (audio)</w:t>
       </w:r>
       <w:r>
         <w:rPr>
@@ -7581,7 +7582,7 @@
           <w:sz w:val="22"/>
           <w:szCs w:val="22"/>
         </w:rPr>
-        <w:t>matrices</w:t>
+        <w:t xml:space="preserve"> </w:t>
       </w:r>
       <w:r>
         <w:rPr>
@@ -7589,7 +7590,7 @@
           <w:sz w:val="22"/>
           <w:szCs w:val="22"/>
         </w:rPr>
-        <w:t xml:space="preserve">. </w:t>
+        <w:t>matrices</w:t>
       </w:r>
       <w:r>
         <w:rPr>
@@ -7597,7 +7598,7 @@
           <w:sz w:val="22"/>
           <w:szCs w:val="22"/>
         </w:rPr>
-        <w:t>In each</w:t>
+        <w:t xml:space="preserve">. </w:t>
       </w:r>
       <w:r>
         <w:rPr>
@@ -7605,7 +7606,7 @@
           <w:sz w:val="22"/>
           <w:szCs w:val="22"/>
         </w:rPr>
-        <w:t xml:space="preserve"> acoustic space plot</w:t>
+        <w:t>In each</w:t>
       </w:r>
       <w:r>
         <w:rPr>
@@ -7613,7 +7614,7 @@
           <w:sz w:val="22"/>
           <w:szCs w:val="22"/>
         </w:rPr>
-        <w:t xml:space="preserve">, individual identities are encoded </w:t>
+        <w:t xml:space="preserve"> acoustic space plot</w:t>
       </w:r>
       <w:r>
         <w:rPr>
@@ -7621,8 +7622,7 @@
           <w:sz w:val="22"/>
           <w:szCs w:val="22"/>
         </w:rPr>
-        <w:lastRenderedPageBreak/>
-        <w:t>by shapes per group, and group identities are highlighted in color, to match Group 2 in orange and Group 4 in brown in Panel A</w:t>
+        <w:t>, individual identities are encoded by shapes per group, and group identities are highlighted in color, to match Group 2 in orange and Group 4 in brown in Panel A</w:t>
       </w:r>
       <w:r>
         <w:rPr>
@@ -7755,6 +7755,7 @@
           <w:b/>
           <w:bCs/>
         </w:rPr>
+        <w:lastRenderedPageBreak/>
         <w:t>Fig</w:t>
       </w:r>
       <w:r>
@@ -7927,16 +7928,7 @@
           <w:sz w:val="22"/>
           <w:szCs w:val="22"/>
         </w:rPr>
-        <w:t xml:space="preserve">up information in these vocalizations. Panel (B) displays acoustic space </w:t>
-      </w:r>
-      <w:r>
-        <w:rPr>
-          <w:rFonts w:ascii="Arial" w:hAnsi="Arial" w:cs="Arial"/>
-          <w:sz w:val="22"/>
-          <w:szCs w:val="22"/>
-        </w:rPr>
-        <w:lastRenderedPageBreak/>
-        <w:t xml:space="preserve">plots for all 10 individuals in </w:t>
+        <w:t xml:space="preserve">up information in these vocalizations. Panel (B) displays acoustic space plots for all 10 individuals in </w:t>
       </w:r>
       <w:r>
         <w:rPr>
@@ -8346,7 +8338,14 @@
         <w:rPr>
           <w:rFonts w:ascii="Arial" w:hAnsi="Arial" w:cs="Arial"/>
         </w:rPr>
-        <w:t xml:space="preserve"> how the patterns of structural variation detected by an unsupervised machine learning tool recapitulate</w:t>
+        <w:t xml:space="preserve"> how the patterns of structural variation detected </w:t>
+      </w:r>
+      <w:r>
+        <w:rPr>
+          <w:rFonts w:ascii="Arial" w:hAnsi="Arial" w:cs="Arial"/>
+        </w:rPr>
+        <w:lastRenderedPageBreak/>
+        <w:t>by an unsupervised machine learning tool recapitulate</w:t>
       </w:r>
       <w:r>
         <w:rPr>
@@ -8487,14 +8486,7 @@
         <w:rPr>
           <w:rFonts w:ascii="Arial" w:hAnsi="Arial" w:cs="Arial"/>
         </w:rPr>
-        <w:t xml:space="preserve">Indeed, the stochastic overlap that we identified amongst </w:t>
-      </w:r>
-      <w:r>
-        <w:rPr>
-          <w:rFonts w:ascii="Arial" w:hAnsi="Arial" w:cs="Arial"/>
-        </w:rPr>
-        <w:lastRenderedPageBreak/>
-        <w:t>groups in the group-specific dataset was lower than what we observed in the individually</w:t>
+        <w:t>Indeed, the stochastic overlap that we identified amongst groups in the group-specific dataset was lower than what we observed in the individually</w:t>
       </w:r>
       <w:r>
         <w:rPr>
@@ -8767,7 +8759,14 @@
         <w:rPr>
           <w:rFonts w:ascii="Arial" w:hAnsi="Arial" w:cs="Arial"/>
         </w:rPr>
-        <w:t xml:space="preserve">ngst individual-level polygons matched our expectations that our generative process would yield stochastic similarity </w:t>
+        <w:t xml:space="preserve">ngst individual-level polygons matched our </w:t>
+      </w:r>
+      <w:r>
+        <w:rPr>
+          <w:rFonts w:ascii="Arial" w:hAnsi="Arial" w:cs="Arial"/>
+        </w:rPr>
+        <w:lastRenderedPageBreak/>
+        <w:t xml:space="preserve">expectations that our generative process would yield stochastic similarity </w:t>
       </w:r>
       <w:r>
         <w:rPr>
@@ -9037,14 +9036,7 @@
         <w:rPr>
           <w:rFonts w:ascii="Arial" w:hAnsi="Arial" w:cs="Arial"/>
         </w:rPr>
-        <w:t xml:space="preserve">in the individually </w:t>
-      </w:r>
-      <w:r>
-        <w:rPr>
-          <w:rFonts w:ascii="Arial" w:hAnsi="Arial" w:cs="Arial"/>
-        </w:rPr>
-        <w:lastRenderedPageBreak/>
-        <w:t xml:space="preserve">distinctive dataset </w:t>
+        <w:t xml:space="preserve">in the individually distinctive dataset </w:t>
       </w:r>
       <w:r>
         <w:rPr>
@@ -9578,7 +9570,14 @@
         <w:rPr>
           <w:rFonts w:ascii="Arial" w:hAnsi="Arial" w:cs="Arial"/>
         </w:rPr>
-        <w:t xml:space="preserve">. We then performed k-means clustering on features derived from distance </w:t>
+        <w:t xml:space="preserve">. We then performed k-means clustering on features derived </w:t>
+      </w:r>
+      <w:r>
+        <w:rPr>
+          <w:rFonts w:ascii="Arial" w:hAnsi="Arial" w:cs="Arial"/>
+        </w:rPr>
+        <w:lastRenderedPageBreak/>
+        <w:t xml:space="preserve">from distance </w:t>
       </w:r>
       <w:r>
         <w:rPr>
@@ -9686,14 +9685,7 @@
         <w:rPr>
           <w:rFonts w:ascii="Arial" w:hAnsi="Arial" w:cs="Arial"/>
         </w:rPr>
-        <w:t xml:space="preserve"> information encoded at the given social level </w:t>
-      </w:r>
-      <w:r>
-        <w:rPr>
-          <w:rFonts w:ascii="Arial" w:hAnsi="Arial" w:cs="Arial"/>
-        </w:rPr>
-        <w:lastRenderedPageBreak/>
-        <w:t>(</w:t>
+        <w:t xml:space="preserve"> information encoded at the given social level (</w:t>
       </w:r>
       <w:r>
         <w:rPr>
@@ -9830,6 +9822,7 @@
           <w:rFonts w:ascii="Arial" w:hAnsi="Arial" w:cs="Arial"/>
           <w:noProof/>
         </w:rPr>
+        <w:lastRenderedPageBreak/>
         <w:drawing>
           <wp:inline distT="0" distB="0" distL="0" distR="0" wp14:anchorId="1FD25CCE" wp14:editId="5385CA71">
             <wp:extent cx="5937885" cy="5146675"/>
@@ -9893,7 +9886,6 @@
           <w:b/>
           <w:bCs/>
         </w:rPr>
-        <w:lastRenderedPageBreak/>
         <w:t>Fig</w:t>
       </w:r>
       <w:r>
@@ -10118,7 +10110,16 @@
           <w:sz w:val="22"/>
           <w:szCs w:val="22"/>
         </w:rPr>
-        <w:t xml:space="preserve"> computed for the character string (edit distance) and audio file (spectrographic cross-correlation, SPCC) representations of the synthetic vocalizations. </w:t>
+        <w:t xml:space="preserve"> computed for the character string (edit distance) and audio file (spectrographic cross-correlation, SPCC) representations of the synthetic </w:t>
+      </w:r>
+      <w:r>
+        <w:rPr>
+          <w:rFonts w:ascii="Arial" w:hAnsi="Arial" w:cs="Arial"/>
+          <w:sz w:val="22"/>
+          <w:szCs w:val="22"/>
+        </w:rPr>
+        <w:lastRenderedPageBreak/>
+        <w:t xml:space="preserve">vocalizations. </w:t>
       </w:r>
       <w:r>
         <w:rPr>
@@ -10429,73 +10430,67 @@
         <w:rPr>
           <w:rFonts w:ascii="Arial" w:hAnsi="Arial" w:cs="Arial"/>
         </w:rPr>
-        <w:t xml:space="preserve">significant detection of information at either social level (larger absolute effect sizes) when information encoding was higher </w:t>
+        <w:t>significant detection of information at either social level (larger absolute effect sizes) when information encoding was higher for one social level than the other</w:t>
+      </w:r>
+      <w:r>
+        <w:rPr>
+          <w:rFonts w:ascii="Arial" w:hAnsi="Arial" w:cs="Arial"/>
+        </w:rPr>
+        <w:t>. We also expected to identify high significance of information detection</w:t>
+      </w:r>
+      <w:r>
+        <w:rPr>
+          <w:rFonts w:ascii="Arial" w:hAnsi="Arial" w:cs="Arial"/>
+        </w:rPr>
+        <w:t xml:space="preserve"> when signals were compared amongst fewer individuals or groups, as we expected that the uniqueness of identity information at either social level would decrease as the number of classes increased at either social level</w:t>
+      </w:r>
+      <w:r>
+        <w:rPr>
+          <w:rFonts w:ascii="Arial" w:hAnsi="Arial" w:cs="Arial"/>
+        </w:rPr>
+        <w:t xml:space="preserve"> (see Methods)</w:t>
+      </w:r>
+      <w:r>
+        <w:rPr>
+          <w:rFonts w:ascii="Arial" w:hAnsi="Arial" w:cs="Arial"/>
+        </w:rPr>
+        <w:t>.</w:t>
+      </w:r>
+      <w:r>
+        <w:rPr>
+          <w:rFonts w:ascii="Arial" w:hAnsi="Arial" w:cs="Arial"/>
+        </w:rPr>
+        <w:t xml:space="preserve"> As we knew which social level contained more information than the other, effect size calculations allowed us to directly address whether we significantly detected the social level </w:t>
+      </w:r>
+      <w:r>
+        <w:rPr>
+          <w:rFonts w:ascii="Arial" w:hAnsi="Arial" w:cs="Arial"/>
+        </w:rPr>
+        <w:t>at which we had originally encoded more identity</w:t>
+      </w:r>
+      <w:r>
+        <w:rPr>
+          <w:rFonts w:ascii="Arial" w:hAnsi="Arial" w:cs="Arial"/>
+        </w:rPr>
+        <w:t xml:space="preserve"> information.</w:t>
+      </w:r>
+      <w:r>
+        <w:rPr>
+          <w:rFonts w:ascii="Arial" w:hAnsi="Arial" w:cs="Arial"/>
+        </w:rPr>
+        <w:t xml:space="preserve"> We calculated effect sizes between group-level and individual level accuracies for </w:t>
+      </w:r>
+      <w:r>
+        <w:rPr>
+          <w:rFonts w:ascii="Arial" w:hAnsi="Arial" w:cs="Arial"/>
+        </w:rPr>
+        <w:t xml:space="preserve">each </w:t>
       </w:r>
       <w:r>
         <w:rPr>
           <w:rFonts w:ascii="Arial" w:hAnsi="Arial" w:cs="Arial"/>
         </w:rPr>
         <w:lastRenderedPageBreak/>
-        <w:t>for one social level than the other</w:t>
-      </w:r>
-      <w:r>
-        <w:rPr>
-          <w:rFonts w:ascii="Arial" w:hAnsi="Arial" w:cs="Arial"/>
-        </w:rPr>
-        <w:t>. We also expected to identify high significance of information detection</w:t>
-      </w:r>
-      <w:r>
-        <w:rPr>
-          <w:rFonts w:ascii="Arial" w:hAnsi="Arial" w:cs="Arial"/>
-        </w:rPr>
-        <w:t xml:space="preserve"> when signals were compared amongst fewer individuals or groups, as we expected that the uniqueness of identity information at either social level would decrease as the number of classes increased at either social level</w:t>
-      </w:r>
-      <w:r>
-        <w:rPr>
-          <w:rFonts w:ascii="Arial" w:hAnsi="Arial" w:cs="Arial"/>
-        </w:rPr>
-        <w:t xml:space="preserve"> (see Methods)</w:t>
-      </w:r>
-      <w:r>
-        <w:rPr>
-          <w:rFonts w:ascii="Arial" w:hAnsi="Arial" w:cs="Arial"/>
-        </w:rPr>
-        <w:t>.</w:t>
-      </w:r>
-      <w:r>
-        <w:rPr>
-          <w:rFonts w:ascii="Arial" w:hAnsi="Arial" w:cs="Arial"/>
-        </w:rPr>
-        <w:t xml:space="preserve"> As we knew which social level contained more information than the other, effect size calculations allowed us to directly address whether we significantly detected the social level </w:t>
-      </w:r>
-      <w:r>
-        <w:rPr>
-          <w:rFonts w:ascii="Arial" w:hAnsi="Arial" w:cs="Arial"/>
-        </w:rPr>
-        <w:t>at which we had originally encoded more identity</w:t>
-      </w:r>
-      <w:r>
-        <w:rPr>
-          <w:rFonts w:ascii="Arial" w:hAnsi="Arial" w:cs="Arial"/>
-        </w:rPr>
-        <w:t xml:space="preserve"> information.</w:t>
-      </w:r>
-      <w:r>
-        <w:rPr>
-          <w:rFonts w:ascii="Arial" w:hAnsi="Arial" w:cs="Arial"/>
-        </w:rPr>
-        <w:t xml:space="preserve"> We calculated effect sizes between group-level and individual level accuracies for </w:t>
-      </w:r>
-      <w:r>
-        <w:rPr>
-          <w:rFonts w:ascii="Arial" w:hAnsi="Arial" w:cs="Arial"/>
-        </w:rPr>
-        <w:t xml:space="preserve">each </w:t>
-      </w:r>
-      <w:r>
-        <w:rPr>
-          <w:rFonts w:ascii="Arial" w:hAnsi="Arial" w:cs="Arial"/>
-        </w:rPr>
         <w:t xml:space="preserve">combination </w:t>
       </w:r>
       <w:r>
@@ -10694,7 +10689,6 @@
           <w:sz w:val="22"/>
           <w:szCs w:val="22"/>
         </w:rPr>
-        <w:lastRenderedPageBreak/>
         <w:drawing>
           <wp:inline distT="0" distB="0" distL="0" distR="0" wp14:anchorId="7FBA0E65" wp14:editId="645A8D97">
             <wp:extent cx="5939790" cy="5149850"/>
@@ -10862,7 +10856,7 @@
           <w:sz w:val="22"/>
           <w:szCs w:val="22"/>
         </w:rPr>
-        <w:t>curves that represent the distribution of accuracy values computed at the group level (blue) and the individual level (orange). These curves are plotted across all 4 treatments of the proportion of group information encoded in vocalizations</w:t>
+        <w:t xml:space="preserve">curves that represent the distribution of accuracy values computed at the group level (blue) and the individual level (orange). These curves are plotted across all 4 </w:t>
       </w:r>
       <w:r>
         <w:rPr>
@@ -10870,7 +10864,8 @@
           <w:sz w:val="22"/>
           <w:szCs w:val="22"/>
         </w:rPr>
-        <w:t>, as well as analyses with the character string (edit distance) and audio file (spectrographic cross-correlation, SPCC) representations of vocalizations</w:t>
+        <w:lastRenderedPageBreak/>
+        <w:t>treatments of the proportion of group information encoded in vocalizations</w:t>
       </w:r>
       <w:r>
         <w:rPr>
@@ -10878,7 +10873,7 @@
           <w:sz w:val="22"/>
           <w:szCs w:val="22"/>
         </w:rPr>
-        <w:t>. We show results only for the smallest (2) and largest (8) number of classes per social level</w:t>
+        <w:t>, as well as analyses with the character string (edit distance) and audio file (spectrographic cross-correlation, SPCC) representations of vocalizations</w:t>
       </w:r>
       <w:r>
         <w:rPr>
@@ -10886,7 +10881,7 @@
           <w:sz w:val="22"/>
           <w:szCs w:val="22"/>
         </w:rPr>
-        <w:t>. S</w:t>
+        <w:t>. We show results only for the smallest (2) and largest (8) number of classes per social level</w:t>
       </w:r>
       <w:r>
         <w:rPr>
@@ -10894,7 +10889,7 @@
           <w:sz w:val="22"/>
           <w:szCs w:val="22"/>
         </w:rPr>
-        <w:t>ee Table S1 for all effect size results across experimental treatments.</w:t>
+        <w:t>. S</w:t>
       </w:r>
       <w:r>
         <w:rPr>
@@ -10902,7 +10897,7 @@
           <w:sz w:val="22"/>
           <w:szCs w:val="22"/>
         </w:rPr>
-        <w:t xml:space="preserve"> </w:t>
+        <w:t>ee Table S1 for all effect size results across experimental treatments.</w:t>
       </w:r>
       <w:r>
         <w:rPr>
@@ -10910,7 +10905,7 @@
           <w:sz w:val="22"/>
           <w:szCs w:val="22"/>
         </w:rPr>
-        <w:t>In each panel, the</w:t>
+        <w:t xml:space="preserve"> </w:t>
       </w:r>
       <w:r>
         <w:rPr>
@@ -10918,7 +10913,7 @@
           <w:sz w:val="22"/>
           <w:szCs w:val="22"/>
         </w:rPr>
-        <w:t xml:space="preserve"> dashed vertical lines represent the mean accuracy value per </w:t>
+        <w:t>In each panel, the</w:t>
       </w:r>
       <w:r>
         <w:rPr>
@@ -10926,8 +10921,7 @@
           <w:sz w:val="22"/>
           <w:szCs w:val="22"/>
         </w:rPr>
-        <w:lastRenderedPageBreak/>
-        <w:t>distribution. The horizontal bars between the dashed lines of each pair of distributions represent the difference in means between distributions. The width of these horizontal bars reflects the magnitude of the effect size calculations</w:t>
+        <w:t xml:space="preserve"> dashed vertical lines represent the mean accuracy value per distribution. The horizontal bars between the dashed lines of each pair of distributions represent the difference in means between distributions. The width of these horizontal bars reflects the magnitude of the effect size calculations</w:t>
       </w:r>
       <w:r>
         <w:rPr>
@@ -11387,14 +11381,7 @@
         <w:rPr>
           <w:rFonts w:ascii="Arial" w:hAnsi="Arial" w:cs="Arial"/>
         </w:rPr>
-        <w:t xml:space="preserve"> of animal </w:t>
-      </w:r>
-      <w:r>
-        <w:rPr>
-          <w:rFonts w:ascii="Arial" w:hAnsi="Arial" w:cs="Arial"/>
-        </w:rPr>
-        <w:lastRenderedPageBreak/>
-        <w:t>vocalizations</w:t>
+        <w:t xml:space="preserve"> of animal vocalizations</w:t>
       </w:r>
       <w:r>
         <w:rPr>
@@ -11893,6 +11880,7 @@
         <w:rPr>
           <w:rFonts w:ascii="Arial" w:hAnsi="Arial" w:cs="Arial"/>
         </w:rPr>
+        <w:lastRenderedPageBreak/>
         <w:t>Our</w:t>
       </w:r>
       <w:r>
@@ -12110,14 +12098,7 @@
         <w:rPr>
           <w:rFonts w:ascii="Arial" w:hAnsi="Arial" w:cs="Arial"/>
         </w:rPr>
-        <w:t xml:space="preserve"> of </w:t>
-      </w:r>
-      <w:r>
-        <w:rPr>
-          <w:rFonts w:ascii="Arial" w:hAnsi="Arial" w:cs="Arial"/>
-        </w:rPr>
-        <w:lastRenderedPageBreak/>
-        <w:t>character string</w:t>
+        <w:t xml:space="preserve"> of character string</w:t>
       </w:r>
       <w:r>
         <w:rPr>
@@ -12570,6 +12551,7 @@
         <w:rPr>
           <w:rFonts w:ascii="Arial" w:hAnsi="Arial" w:cs="Arial"/>
         </w:rPr>
+        <w:lastRenderedPageBreak/>
         <w:t>Through this</w:t>
       </w:r>
       <w:r>
@@ -12726,562 +12708,562 @@
         <w:rPr>
           <w:rFonts w:ascii="Arial" w:hAnsi="Arial" w:cs="Arial"/>
         </w:rPr>
-        <w:t xml:space="preserve">to validate biological inferences returned </w:t>
+        <w:t>to validate biological inferences returned by such pipelines</w:t>
+      </w:r>
+      <w:r>
+        <w:rPr>
+          <w:rFonts w:ascii="Arial" w:hAnsi="Arial" w:cs="Arial"/>
+        </w:rPr>
+        <w:t xml:space="preserve">, </w:t>
+      </w:r>
+      <w:r>
+        <w:rPr>
+          <w:rFonts w:ascii="Arial" w:hAnsi="Arial" w:cs="Arial"/>
+        </w:rPr>
+        <w:t xml:space="preserve">including testing </w:t>
+      </w:r>
+      <w:r>
+        <w:rPr>
+          <w:rFonts w:ascii="Arial" w:hAnsi="Arial" w:cs="Arial"/>
+        </w:rPr>
+        <w:t>which analytic</w:t>
+      </w:r>
+      <w:r>
+        <w:rPr>
+          <w:rFonts w:ascii="Arial" w:hAnsi="Arial" w:cs="Arial"/>
+        </w:rPr>
+        <w:t>al</w:t>
+      </w:r>
+      <w:r>
+        <w:rPr>
+          <w:rFonts w:ascii="Arial" w:hAnsi="Arial" w:cs="Arial"/>
+        </w:rPr>
+        <w:t xml:space="preserve"> tools </w:t>
+      </w:r>
+      <w:r>
+        <w:rPr>
+          <w:rFonts w:ascii="Arial" w:hAnsi="Arial" w:cs="Arial"/>
+        </w:rPr>
+        <w:t>best quantify</w:t>
+      </w:r>
+      <w:r>
+        <w:rPr>
+          <w:rFonts w:ascii="Arial" w:hAnsi="Arial" w:cs="Arial"/>
+        </w:rPr>
+        <w:t xml:space="preserve"> complexity </w:t>
+      </w:r>
+      <w:r>
+        <w:rPr>
+          <w:rFonts w:ascii="Arial" w:hAnsi="Arial" w:cs="Arial"/>
+        </w:rPr>
+        <w:t>in</w:t>
+      </w:r>
+      <w:r>
+        <w:rPr>
+          <w:rFonts w:ascii="Arial" w:hAnsi="Arial" w:cs="Arial"/>
+        </w:rPr>
+        <w:t xml:space="preserve"> animal vocal sequences </w:t>
+      </w:r>
+      <w:r>
+        <w:rPr>
+          <w:rFonts w:ascii="Arial" w:hAnsi="Arial" w:cs="Arial"/>
+        </w:rPr>
+        <w:fldChar w:fldCharType="begin"/>
+      </w:r>
+      <w:r>
+        <w:rPr>
+          <w:rFonts w:ascii="Arial" w:hAnsi="Arial" w:cs="Arial"/>
+        </w:rPr>
+        <w:instrText xml:space="preserve"> ADDIN ZOTERO_ITEM CSL_CITATION {"citationID":"hl2pTnSp","properties":{"formattedCitation":"(26)","plainCitation":"(26)","noteIndex":0},"citationItems":[{"id":544,"uris":["http://zotero.org/groups/5786507/items/WJJ2WCSZ"],"itemData":{"id":544,"type":"article-journal","abstract":"Many animals communicate using sequences of discrete acoustic elements which can be complex, vary in their degree of stereotypy, and are potentially open-ended. Variation in sequences can provide important ecological, behavioural or evolutionary information about the structure and connectivity of populations, mechanisms for vocal cultural evolution and the underlying drivers responsible for these processes. Various mathematical techniques have been used to form a realistic approximation of sequence similarity for such tasks. Here, we use both simulated and empirical data sets from animal vocal sequences (rock hyrax, Procavia capensis; humpback whale, Megaptera novaeangliae; bottlenose dolphin, Tursiops truncatus; and Carolina chickadee, Poecile carolinensis) to test which of eight sequence analysis metrics are more likely to reconstruct the information encoded in the sequences, and to test the fidelity of estimation of model parameters, when the sequences are assumed to conform to particular statistical models. Results from the simulated data indicated that multiple metrics were equally successful in reconstructing the information encoded in the sequences of simulated individuals (Markov chains, n-gram models, repeat distribution and edit distance) and data generated by different stochastic processes (entropy rate and n-grams). However, the string edit (Levenshtein) distance performed consistently and significantly better than all other tested metrics (including entropy, Markov chains, n-grams, mutual information) for all empirical data sets, despite being less commonly used in the field of animal acoustic communication. The Levenshtein distance metric provides a robust analytical approach that should be considered in the comparison of animal acoustic sequences in preference to other commonly employed techniques (such as Markov chains, hidden Markov models or Shannon entropy). The recent discovery that non-Markovian vocal sequences may be more common in animal communication than previously thought provides a rich area for future research that requires non-Markovian-based analysis techniques to investigate animal grammars and potentially the origin of human language.","container-title":"Methods in Ecology and Evolution","DOI":"10.1111/2041-210X.12433","ISSN":"2041-210X","issue":"12","language":"en","license":"© 2015 The Authors. Methods in Ecology and Evolution © 2015 British Ecological Society","note":"_eprint: https://onlinelibrary.wiley.com/doi/pdf/10.1111/2041-210X.12433","page":"1452-1461","source":"Wiley Online Library","title":"Quantifying similarity in animal vocal sequences: which metric performs best?","title-short":"Quantifying similarity in animal vocal sequences","volume":"6","author":[{"family":"Kershenbaum","given":"Arik"},{"family":"Garland","given":"Ellen C."}],"issued":{"date-parts":[["2015"]]}}}],"schema":"https://github.com/citation-style-language/schema/raw/master/csl-citation.json"} </w:instrText>
+      </w:r>
+      <w:r>
+        <w:rPr>
+          <w:rFonts w:ascii="Arial" w:hAnsi="Arial" w:cs="Arial"/>
+        </w:rPr>
+        <w:fldChar w:fldCharType="separate"/>
+      </w:r>
+      <w:r>
+        <w:rPr>
+          <w:rFonts w:ascii="Arial" w:hAnsi="Arial" w:cs="Arial"/>
+        </w:rPr>
+        <w:t>(26)</w:t>
+      </w:r>
+      <w:r>
+        <w:rPr>
+          <w:rFonts w:ascii="Arial" w:hAnsi="Arial" w:cs="Arial"/>
+        </w:rPr>
+        <w:fldChar w:fldCharType="end"/>
+      </w:r>
+      <w:r>
+        <w:rPr>
+          <w:rFonts w:ascii="Arial" w:hAnsi="Arial" w:cs="Arial"/>
+        </w:rPr>
+        <w:t xml:space="preserve"> </w:t>
+      </w:r>
+      <w:r>
+        <w:rPr>
+          <w:rFonts w:ascii="Arial" w:hAnsi="Arial" w:cs="Arial"/>
+        </w:rPr>
+        <w:t xml:space="preserve">and </w:t>
+      </w:r>
+      <w:r>
+        <w:rPr>
+          <w:rFonts w:ascii="Arial" w:hAnsi="Arial" w:cs="Arial"/>
+        </w:rPr>
+        <w:t>validat</w:t>
+      </w:r>
+      <w:r>
+        <w:rPr>
+          <w:rFonts w:ascii="Arial" w:hAnsi="Arial" w:cs="Arial"/>
+        </w:rPr>
+        <w:t>ing</w:t>
+      </w:r>
+      <w:r>
+        <w:rPr>
+          <w:rFonts w:ascii="Arial" w:hAnsi="Arial" w:cs="Arial"/>
+        </w:rPr>
+        <w:t xml:space="preserve"> new methods for calculating and quantifying acoustic structure </w:t>
+      </w:r>
+      <w:r>
+        <w:rPr>
+          <w:rFonts w:ascii="Arial" w:hAnsi="Arial" w:cs="Arial"/>
+        </w:rPr>
+        <w:fldChar w:fldCharType="begin"/>
+      </w:r>
+      <w:r>
+        <w:rPr>
+          <w:rFonts w:ascii="Arial" w:hAnsi="Arial" w:cs="Arial"/>
+        </w:rPr>
+        <w:instrText xml:space="preserve"> ADDIN ZOTERO_ITEM CSL_CITATION {"citationID":"dqL4UsV2","properties":{"formattedCitation":"(25,27)","plainCitation":"(25,27)","noteIndex":0},"citationItems":[{"id":558,"uris":["http://zotero.org/groups/5786507/items/ZECAX5J9"],"itemData":{"id":558,"type":"article-journal","abstract":"Assessing diversity of discretely varying behaviour is a classical ethological problem. In particular, the challenge of calculating an individuals’ or species’ vocal repertoire size is often an important step in ecological and behavioural studies, but a reproducible and broadly applicable method for accomplishing this task is not currently available. We offer a generalizable method to automate the calculation and quantification of acoustic diversity using an unsupervised random forest framework. We tested our method using natural and synthetic datasets of known repertoire sizes that exhibit standardized variation in common acoustic features as well as in recording quality. We tested two approaches to estimate acoustic diversity using the output from unsupervised random forest analyses: (a) cluster analysis to estimate the number of discrete acoustic signals (e.g. repertoire size) and (b) an estimation of acoustic area in acoustic feature space, as a proxy for repertoire size. We find that our unsupervised analyses classify acoustic structure with high accuracy. Specifically, both approaches accurately estimate element diversity when repertoire size is small to intermediate (5–20 unique elements). However, for larger datasets (20–100 unique elements), we find that calculating the size of the area occupied in acoustic space is a more reliable proxy for estimating repertoire size. We conclude that our implementation of unsupervised random forest analysis offers a generalizable tool that researchers can apply to classify acoustic structure of diverse datasets. Additionally, output from these analyses can be used to compare the distribution and diversity of signals in acoustic space, creating opportunities to quantify and compare the amount of acoustic variation among individuals, populations or species in a standardized way. We provide R code and examples to aid researchers interested in using these techniques.","container-title":"Methods in Ecology and Evolution","DOI":"10.1111/2041-210X.13599","ISSN":"2041-210X","issue":"7","language":"en","license":"© 2021 British Ecological Society","note":"_eprint: https://onlinelibrary.wiley.com/doi/pdf/10.1111/2041-210X.13599","page":"1213-1225","source":"Wiley Online Library","title":"A machine learning approach for classifying and quantifying acoustic diversity","volume":"12","author":[{"family":"Keen","given":"Sara C."},{"family":"Odom","given":"Karan J."},{"family":"Webster","given":"Michael S."},{"family":"Kohn","given":"Gregory M."},{"family":"Wright","given":"Timothy F."},{"family":"Araya-Salas","given":"Marcelo"}],"issued":{"date-parts":[["2021"]]}}},{"id":563,"uris":["http://zotero.org/groups/5786507/items/F9NHL8ST"],"itemData":{"id":563,"type":"article-journal","abstract":"Birdsong is an important signal in mate attraction and territorial defence. Quantifying the complexity of these songs can shed light on individual fitness, sexual selection and behaviour. Several techniques have been used to quantify song complexity and be broadly categorized into measures of sequential variations and measures of diversity. However, these methods are unable to account for important acoustic features like the frequency bandwidth and the variety in the spectro-temporal shape of notes which are an integral part of these vocal signals. This study proposes a new complexity method that considers intra-song note variability and calculates a weighted index for birdsongs using spectral cross-correlation. We first compared previously described methods to understand their advantages and limitations based on the factors that would affect the complexity of songs. We then developed a new method, Note Variability Index (NVI), which incorporates the spectral features of notes to quantify complexity. This method alleviates the need for manual classification of notes that can be error-prone. We used spectrogram cross-correlation to compare notes within a song and used the output values to quantify song complexity. To evaluate the efficacy of the new method, we generated synthetic songs to caricature extremes in song complexity and compared selected conventional complexity methods along with the NVI. We provide case-specific limitations of these methods. Additionally, to examine the efficacy of this new method in real-world scenarios, we used natural birdsongs from multiple species across the globe with varying song structures to compare conventional methods with NVI. To our knowledge, NVI is the only song complexity method that captures the variation of spectro-temporal shapes of the notes in songs where the conventional methods fail to distinguish between similar song structures with different note types. Furthermore, as NVI does not need a manual classification of notes, it can be easily implemented for any type of birdsong with existing sound analysis software; it is quick, avoids the possible subjectivity in note classification and can be automated for large datasets.","container-title":"Methods in Ecology and Evolution","DOI":"10.1111/2041-210X.13765","ISSN":"2041-210X","issue":"2","language":"en","license":"© 2021 British Ecological Society","note":"_eprint: https://onlinelibrary.wiley.com/doi/pdf/10.1111/2041-210X.13765","page":"459-472","source":"Wiley Online Library","title":"Spectrogram cross-correlation can be used to measure the complexity of bird vocalizations","volume":"13","author":[{"family":"Sawant","given":"Suyash"},{"family":"Arvind","given":"Chiti"},{"family":"Joshi","given":"Viral"},{"family":"Robin","given":"V. V."}],"issued":{"date-parts":[["2022"]]}}}],"schema":"https://github.com/citation-style-language/schema/raw/master/csl-citation.json"} </w:instrText>
+      </w:r>
+      <w:r>
+        <w:rPr>
+          <w:rFonts w:ascii="Arial" w:hAnsi="Arial" w:cs="Arial"/>
+        </w:rPr>
+        <w:fldChar w:fldCharType="separate"/>
+      </w:r>
+      <w:r>
+        <w:rPr>
+          <w:rFonts w:ascii="Arial" w:hAnsi="Arial" w:cs="Arial"/>
+        </w:rPr>
+        <w:t>(25,27)</w:t>
+      </w:r>
+      <w:r>
+        <w:rPr>
+          <w:rFonts w:ascii="Arial" w:hAnsi="Arial" w:cs="Arial"/>
+        </w:rPr>
+        <w:fldChar w:fldCharType="end"/>
+      </w:r>
+      <w:r>
+        <w:rPr>
+          <w:rFonts w:ascii="Arial" w:hAnsi="Arial" w:cs="Arial"/>
+        </w:rPr>
+        <w:t xml:space="preserve">. </w:t>
+      </w:r>
+      <w:r>
+        <w:rPr>
+          <w:rFonts w:ascii="Arial" w:hAnsi="Arial" w:cs="Arial"/>
+        </w:rPr>
+        <w:t>In addition,</w:t>
+      </w:r>
+      <w:r>
+        <w:rPr>
+          <w:rFonts w:ascii="Arial" w:hAnsi="Arial" w:cs="Arial"/>
+        </w:rPr>
+        <w:t xml:space="preserve"> several </w:t>
+      </w:r>
+      <w:r>
+        <w:rPr>
+          <w:rFonts w:ascii="Arial" w:hAnsi="Arial" w:cs="Arial"/>
+        </w:rPr>
+        <w:t xml:space="preserve">existing </w:t>
+      </w:r>
+      <w:r>
+        <w:rPr>
+          <w:rFonts w:ascii="Arial" w:hAnsi="Arial" w:cs="Arial"/>
+        </w:rPr>
+        <w:t>tools</w:t>
+      </w:r>
+      <w:r>
+        <w:rPr>
+          <w:rFonts w:ascii="Arial" w:hAnsi="Arial" w:cs="Arial"/>
+        </w:rPr>
+        <w:t xml:space="preserve"> allow researchers to create synthetic vocal</w:t>
+      </w:r>
+      <w:r>
+        <w:rPr>
+          <w:rFonts w:ascii="Arial" w:hAnsi="Arial" w:cs="Arial"/>
+        </w:rPr>
+        <w:t>izations</w:t>
+      </w:r>
+      <w:r>
+        <w:rPr>
+          <w:rFonts w:ascii="Arial" w:hAnsi="Arial" w:cs="Arial"/>
+        </w:rPr>
+        <w:t xml:space="preserve"> and vocal sequences</w:t>
+      </w:r>
+      <w:r>
+        <w:rPr>
+          <w:rFonts w:ascii="Arial" w:hAnsi="Arial" w:cs="Arial"/>
+        </w:rPr>
+        <w:t xml:space="preserve">, including </w:t>
+      </w:r>
+      <w:r>
+        <w:rPr>
+          <w:rFonts w:ascii="Arial" w:hAnsi="Arial" w:cs="Arial"/>
+        </w:rPr>
+        <w:t xml:space="preserve">the </w:t>
+      </w:r>
+      <w:proofErr w:type="spellStart"/>
+      <w:r>
+        <w:rPr>
+          <w:rFonts w:ascii="Arial" w:hAnsi="Arial" w:cs="Arial"/>
+        </w:rPr>
+        <w:t>seewave</w:t>
+      </w:r>
+      <w:proofErr w:type="spellEnd"/>
+      <w:r>
+        <w:rPr>
+          <w:rFonts w:ascii="Arial" w:hAnsi="Arial" w:cs="Arial"/>
+        </w:rPr>
+        <w:t xml:space="preserve">, </w:t>
+      </w:r>
+      <w:proofErr w:type="spellStart"/>
+      <w:r>
+        <w:rPr>
+          <w:rFonts w:ascii="Arial" w:hAnsi="Arial" w:cs="Arial"/>
+        </w:rPr>
+        <w:t>warbleR</w:t>
+      </w:r>
+      <w:proofErr w:type="spellEnd"/>
+      <w:r>
+        <w:rPr>
+          <w:rFonts w:ascii="Arial" w:hAnsi="Arial" w:cs="Arial"/>
+        </w:rPr>
+        <w:t>, and</w:t>
+      </w:r>
+      <w:r>
+        <w:rPr>
+          <w:rFonts w:ascii="Arial" w:hAnsi="Arial" w:cs="Arial"/>
+        </w:rPr>
+        <w:t xml:space="preserve"> </w:t>
+      </w:r>
+      <w:proofErr w:type="spellStart"/>
+      <w:r>
+        <w:rPr>
+          <w:rFonts w:ascii="Arial" w:hAnsi="Arial" w:cs="Arial"/>
+        </w:rPr>
+        <w:t>soundgen</w:t>
+      </w:r>
+      <w:proofErr w:type="spellEnd"/>
+      <w:r>
+        <w:rPr>
+          <w:rFonts w:ascii="Arial" w:hAnsi="Arial" w:cs="Arial"/>
+        </w:rPr>
+        <w:t xml:space="preserve"> R packages</w:t>
+      </w:r>
+      <w:r>
+        <w:rPr>
+          <w:rFonts w:ascii="Arial" w:hAnsi="Arial" w:cs="Arial"/>
+        </w:rPr>
+        <w:t xml:space="preserve"> </w:t>
+      </w:r>
+      <w:r>
+        <w:rPr>
+          <w:rFonts w:ascii="Arial" w:hAnsi="Arial" w:cs="Arial"/>
+        </w:rPr>
+        <w:fldChar w:fldCharType="begin"/>
+      </w:r>
+      <w:r>
+        <w:rPr>
+          <w:rFonts w:ascii="Arial" w:hAnsi="Arial" w:cs="Arial"/>
+        </w:rPr>
+        <w:instrText xml:space="preserve"> ADDIN ZOTERO_ITEM CSL_CITATION {"citationID":"WhhzJw57","properties":{"formattedCitation":"(23,28,29)","plainCitation":"(23,28,29)","noteIndex":0},"citationItems":[{"id":833,"uris":["http://zotero.org/groups/5786507/items/9FR7DCSI"],"itemData":{"id":833,"type":"article-journal","abstract":"Voice synthesis is a useful method for investigating the communicative role of different acoustic features. Although many text-to-speech systems are available, researchers of human nonverbal vocalizations and bioacousticians may profit from a dedicated simple tool for synthesizing and manipulating natural-sounding vocalizations. Soundgen (https://CRAN.R-project.org/package=soundgen) is an open-source R package that synthesizes nonverbal vocalizations based on meaningful acoustic parameters, which can be specified from the command line or in an interactive app. This tool was validated by comparing the perceived emotion, valence, arousal, and authenticity of 60 recorded human nonverbal vocalizations (screams, moans, laughs, and so on) and their approximate synthetic reproductions. Each synthetic sound was created by manually specifying only a small number of high-level control parameters, such as syllable length and a few anchors for the intonation contour. Nevertheless, the valence and arousal ratings of synthetic sounds were similar to those of the original recordings, and the authenticity ratings were comparable, maintaining parity with the originals for less complex vocalizations. Manipulating the precise acoustic characteristics of synthetic sounds may shed light on the salient predictors of emotion in the human voice. More generally, soundgen may prove useful for any studies that require precise control over the acoustic features of nonspeech sounds, including research on animal vocalizations and auditory perception.","container-title":"Behavior Research Methods","DOI":"10.3758/s13428-018-1095-7","ISSN":"1554-3528","issue":"2","journalAbbreviation":"Behav Res","language":"en","page":"778-792","source":"Springer Link","title":"Soundgen: An open-source tool for synthesizing nonverbal vocalizations","title-short":"Soundgen","volume":"51","author":[{"family":"Anikin","given":"Andrey"}],"issued":{"date-parts":[["2019"]]}}},{"id":835,"uris":["http://zotero.org/groups/5786507/items/SINYAVQQ"],"itemData":{"id":835,"type":"article-journal","abstract":"We review Seewave, new software for analysing and synthesizing sounds. Seewave is free and works on a wide variety of operating systems as an extension of the R operating environment. Its current 67 functions allow the user to achieve time, amplitude and frequency analyses, to estimate quantitative differences between sounds, and to generate new sounds for playback experiments. Thanks to its implementation in the R environment, Seewave is fully modular. All functions can be combined for complex data acquisition and graphical output, they can be part of important scripts for batch processing and they can be modified ad libitum. New functions can also be written, making Seewave a truly open-source tool.","container-title":"Bioacoustics","DOI":"10.1080/09524622.2008.9753600","ISSN":"0952-4622","issue":"2","note":"publisher: Taylor &amp; Francis\n_eprint: https://doi.org/10.1080/09524622.2008.9753600","page":"213-226","source":"Taylor and Francis+NEJM","title":"Seewave, a free modular tool for sound analysis and synthesis","volume":"18","author":[{"family":"Sueur","given":"Jerome"},{"family":"Aubin","given":"Thierry"},{"family":"Simonis","given":"Caroline"}],"issued":{"date-parts":[["2008"]]}}},{"id":836,"uris":["http://zotero.org/groups/5786507/items/KSAJINRD"],"itemData":{"id":836,"type":"article-journal","abstract":"Animal acoustic communication is one of the most fruitful research areas in behavioural and evolutionary biology. Work in this area depends largely on quantifying the structure of acoustic signals, which has often depended upon closed-source or graphical user interface (GUI)-based software. Here, we describe the r package warbleR, a new package for the analysis of animal acoustic signal structure. The package offers functions for downloading avian vocalizations from the open-access online repository Xeno-Canto, displaying the geographic extent of the recordings, manipulating sound files, detecting acoustic signals or importing detected signals from other software, assessing performance of methods that measure acoustic similarity, conducting cross-correlations, measuring acoustic parameters and analysing interactive vocal signals, among others. Functions working iteratively allow parallelization to improve computational efficiency. We present a case study showing how warbleR functions can be used in a workflow to evaluate the structure of acoustic signals. We analyse geographic variation in long-billed hermit hummingbirds (Phaethornis longirostris) songs obtained from Xeno-Canto. The code in warbleR can be executed by less experienced r users, but has also been thoroughly commented, which will facilitate further customization by advanced users. The combination of the tools described here with other acoustic analysis packages in r should significantly expand the range of analytical approaches available.","container-title":"Methods in Ecology and Evolution","DOI":"10.1111/2041-210X.12624","ISSN":"2041-210X","issue":"2","language":"en","license":"© 2016 The Authors. Methods in Ecology and Evolution © 2016 British Ecological Society","note":"_eprint: https://besjournals.onlinelibrary.wiley.com/doi/pdf/10.1111/2041-210X.12624","page":"184-191","source":"Wiley Online Library","title":"warbleR: an r package to streamline analysis of animal acoustic signals","title-short":"warbleR","volume":"8","author":[{"family":"Araya-Salas","given":"Marcelo"},{"family":"Smith-Vidaurre","given":"Grace"}],"issued":{"date-parts":[["2017"]]}}}],"schema":"https://github.com/citation-style-language/schema/raw/master/csl-citation.json"} </w:instrText>
+      </w:r>
+      <w:r>
+        <w:rPr>
+          <w:rFonts w:ascii="Arial" w:hAnsi="Arial" w:cs="Arial"/>
+        </w:rPr>
+        <w:fldChar w:fldCharType="separate"/>
+      </w:r>
+      <w:r>
+        <w:rPr>
+          <w:rFonts w:ascii="Arial" w:hAnsi="Arial" w:cs="Arial"/>
+        </w:rPr>
+        <w:t>(23,28,29)</w:t>
+      </w:r>
+      <w:r>
+        <w:rPr>
+          <w:rFonts w:ascii="Arial" w:hAnsi="Arial" w:cs="Arial"/>
+        </w:rPr>
+        <w:fldChar w:fldCharType="end"/>
+      </w:r>
+      <w:r>
+        <w:rPr>
+          <w:rFonts w:ascii="Arial" w:hAnsi="Arial" w:cs="Arial"/>
+        </w:rPr>
+        <w:t xml:space="preserve">. An underused function of these </w:t>
+      </w:r>
+      <w:r>
+        <w:rPr>
+          <w:rFonts w:ascii="Arial" w:hAnsi="Arial" w:cs="Arial"/>
+        </w:rPr>
+        <w:t>tools</w:t>
+      </w:r>
+      <w:r>
+        <w:rPr>
+          <w:rFonts w:ascii="Arial" w:hAnsi="Arial" w:cs="Arial"/>
+        </w:rPr>
+        <w:t xml:space="preserve"> in animal communication</w:t>
+      </w:r>
+      <w:r>
+        <w:rPr>
+          <w:rFonts w:ascii="Arial" w:hAnsi="Arial" w:cs="Arial"/>
+        </w:rPr>
+        <w:t xml:space="preserve"> research</w:t>
+      </w:r>
+      <w:r>
+        <w:rPr>
+          <w:rFonts w:ascii="Arial" w:hAnsi="Arial" w:cs="Arial"/>
+        </w:rPr>
+        <w:t xml:space="preserve"> is that they provide researchers with the ability to manipulate information in synthetic </w:t>
+      </w:r>
+      <w:r>
+        <w:rPr>
+          <w:rFonts w:ascii="Arial" w:hAnsi="Arial" w:cs="Arial"/>
+        </w:rPr>
+        <w:t>vocalizations</w:t>
+      </w:r>
+      <w:r>
+        <w:rPr>
+          <w:rFonts w:ascii="Arial" w:hAnsi="Arial" w:cs="Arial"/>
+        </w:rPr>
+        <w:t xml:space="preserve"> to specifically study the types </w:t>
+      </w:r>
+      <w:r>
+        <w:rPr>
+          <w:rFonts w:ascii="Arial" w:hAnsi="Arial" w:cs="Arial"/>
+        </w:rPr>
+        <w:t>of</w:t>
+      </w:r>
+      <w:r>
+        <w:rPr>
+          <w:rFonts w:ascii="Arial" w:hAnsi="Arial" w:cs="Arial"/>
+        </w:rPr>
+        <w:t xml:space="preserve"> information encoded in a signal, how much information is encoded, and where </w:t>
+      </w:r>
+      <w:r>
+        <w:rPr>
+          <w:rFonts w:ascii="Arial" w:hAnsi="Arial" w:cs="Arial"/>
+        </w:rPr>
+        <w:t>such</w:t>
+      </w:r>
+      <w:r>
+        <w:rPr>
+          <w:rFonts w:ascii="Arial" w:hAnsi="Arial" w:cs="Arial"/>
+        </w:rPr>
+        <w:t xml:space="preserve"> information is encoded</w:t>
+      </w:r>
+      <w:r>
+        <w:rPr>
+          <w:rFonts w:ascii="Arial" w:hAnsi="Arial" w:cs="Arial"/>
+        </w:rPr>
+        <w:t>, and how well such patterns of information encoding can be detected with different analytical tools</w:t>
+      </w:r>
+      <w:r>
+        <w:rPr>
+          <w:rFonts w:ascii="Arial" w:hAnsi="Arial" w:cs="Arial"/>
+        </w:rPr>
+        <w:t xml:space="preserve">. </w:t>
+      </w:r>
+      <w:r>
+        <w:rPr>
+          <w:rFonts w:ascii="Arial" w:hAnsi="Arial" w:cs="Arial"/>
+        </w:rPr>
+        <w:t xml:space="preserve">For instance, the </w:t>
+      </w:r>
+      <w:proofErr w:type="spellStart"/>
+      <w:r>
+        <w:rPr>
+          <w:rFonts w:ascii="Arial" w:hAnsi="Arial" w:cs="Arial"/>
+        </w:rPr>
+        <w:t>soundgen</w:t>
+      </w:r>
+      <w:proofErr w:type="spellEnd"/>
+      <w:r>
+        <w:rPr>
+          <w:rFonts w:ascii="Arial" w:hAnsi="Arial" w:cs="Arial"/>
+        </w:rPr>
+        <w:t xml:space="preserve"> package facilitates diverse types of information encoding that have successfully been used to understand dynamic </w:t>
+      </w:r>
+      <w:r>
+        <w:rPr>
+          <w:rFonts w:ascii="Arial" w:hAnsi="Arial" w:cs="Arial"/>
+        </w:rPr>
+        <w:t xml:space="preserve">information encoding in formant structures produced during human speech </w:t>
+      </w:r>
+      <w:r>
+        <w:rPr>
+          <w:rFonts w:ascii="Arial" w:hAnsi="Arial" w:cs="Arial"/>
+        </w:rPr>
+        <w:fldChar w:fldCharType="begin"/>
+      </w:r>
+      <w:r>
+        <w:rPr>
+          <w:rFonts w:ascii="Arial" w:hAnsi="Arial" w:cs="Arial"/>
+        </w:rPr>
+        <w:instrText xml:space="preserve"> ADDIN ZOTERO_ITEM CSL_CITATION {"citationID":"rSqvLgcu","properties":{"formattedCitation":"(30)","plainCitation":"(30)","noteIndex":0},"citationItems":[{"id":861,"uris":["http://zotero.org/groups/5786507/items/6CU223UP"],"itemData":{"id":861,"type":"article-journal","abstract":"When producing intimidating aggressive vocalizations, humans and other animals often extend their vocal tracts to lower their voice resonance frequencies (formants) and thus sound big. Is acoustic size exaggeration more effective when the vocal tract is extended before, or during, the vocalization, and how do listeners interpret within-call changes in apparent vocal tract length? We compared perceptual effects of static and dynamic formant scaling in aggressive human speech and nonverbal vocalizations. Acoustic manipulations corresponded to elongating or shortening the vocal tract either around (Experiment 1) or from (Experiment 2) its resting position. Gradual formant scaling that preserved average frequencies conveyed the impression of smaller size and greater aggression, regardless of the direction of change. Vocal tract shortening from the original length conveyed smaller size and less aggression, whereas vocal tract elongation conveyed larger size and more aggression, and these effects were stronger for static than for dynamic scaling. Listeners familiarized with the speaker's natural voice were less often ‘fooled’ by formant manipulations when judging speaker size, but paid more attention to formants when judging aggressive intent. Thus, within-call vocal tract scaling conveys emotion, but a better way to sound large and intimidating is to keep the vocal tract consistently extended.","container-title":"Royal Society Open Science","DOI":"10.1098/rsos.211496","ISSN":"2054-5703","issue":"1","journalAbbreviation":"R. Soc. open sci.","language":"en","page":"211496","source":"DOI.org (Crossref)","title":"Static and dynamic formant scaling conveys body size and aggression","volume":"9","author":[{"family":"Anikin","given":"Andrey"},{"family":"Pisanski","given":"Katarzyna"},{"family":"Reby","given":"David"}],"issued":{"date-parts":[["2022"]]}}}],"schema":"https://github.com/citation-style-language/schema/raw/master/csl-citation.json"} </w:instrText>
+      </w:r>
+      <w:r>
+        <w:rPr>
+          <w:rFonts w:ascii="Arial" w:hAnsi="Arial" w:cs="Arial"/>
+        </w:rPr>
+        <w:fldChar w:fldCharType="separate"/>
+      </w:r>
+      <w:r>
+        <w:rPr>
+          <w:rFonts w:ascii="Arial" w:hAnsi="Arial" w:cs="Arial"/>
+        </w:rPr>
+        <w:t>(30)</w:t>
+      </w:r>
+      <w:r>
+        <w:rPr>
+          <w:rFonts w:ascii="Arial" w:hAnsi="Arial" w:cs="Arial"/>
+        </w:rPr>
+        <w:fldChar w:fldCharType="end"/>
+      </w:r>
+      <w:r>
+        <w:rPr>
+          <w:rFonts w:ascii="Arial" w:hAnsi="Arial" w:cs="Arial"/>
+        </w:rPr>
+        <w:t xml:space="preserve">. </w:t>
+      </w:r>
+      <w:r>
+        <w:rPr>
+          <w:rFonts w:ascii="Arial" w:hAnsi="Arial" w:cs="Arial"/>
+        </w:rPr>
+        <w:t xml:space="preserve">Our </w:t>
+      </w:r>
+      <w:r>
+        <w:rPr>
+          <w:rFonts w:ascii="Arial" w:hAnsi="Arial" w:cs="Arial"/>
+        </w:rPr>
+        <w:t>tool</w:t>
+      </w:r>
+      <w:r>
+        <w:rPr>
+          <w:rFonts w:ascii="Arial" w:hAnsi="Arial" w:cs="Arial"/>
+        </w:rPr>
+        <w:t xml:space="preserve"> </w:t>
+      </w:r>
+      <w:r>
+        <w:rPr>
+          <w:rFonts w:ascii="Arial" w:hAnsi="Arial" w:cs="Arial"/>
+        </w:rPr>
+        <w:t>complements</w:t>
+      </w:r>
+      <w:r>
+        <w:rPr>
+          <w:rFonts w:ascii="Arial" w:hAnsi="Arial" w:cs="Arial"/>
+        </w:rPr>
+        <w:t xml:space="preserve"> </w:t>
+      </w:r>
+      <w:r>
+        <w:rPr>
+          <w:rFonts w:ascii="Arial" w:hAnsi="Arial" w:cs="Arial"/>
+        </w:rPr>
+        <w:t xml:space="preserve">existing </w:t>
+      </w:r>
+      <w:r>
+        <w:rPr>
+          <w:rFonts w:ascii="Arial" w:hAnsi="Arial" w:cs="Arial"/>
+        </w:rPr>
+        <w:t>to</w:t>
+      </w:r>
+      <w:r>
+        <w:rPr>
+          <w:rFonts w:ascii="Arial" w:hAnsi="Arial" w:cs="Arial"/>
+        </w:rPr>
+        <w:t xml:space="preserve">ols by providing a solution for encoding </w:t>
+      </w:r>
+      <w:r>
+        <w:rPr>
+          <w:rFonts w:ascii="Arial" w:hAnsi="Arial" w:cs="Arial"/>
+        </w:rPr>
+        <w:t xml:space="preserve">identity </w:t>
+      </w:r>
+      <w:r>
+        <w:rPr>
+          <w:rFonts w:ascii="Arial" w:hAnsi="Arial" w:cs="Arial"/>
+        </w:rPr>
+        <w:t>information</w:t>
+      </w:r>
+      <w:r>
+        <w:rPr>
+          <w:rFonts w:ascii="Arial" w:hAnsi="Arial" w:cs="Arial"/>
+        </w:rPr>
+        <w:t xml:space="preserve"> across social levels in frequency modulation patterns</w:t>
+      </w:r>
+      <w:r>
+        <w:rPr>
+          <w:rFonts w:ascii="Arial" w:hAnsi="Arial" w:cs="Arial"/>
+        </w:rPr>
+        <w:t xml:space="preserve">, one acoustic feature widely considered to be modified by vertebrates that are capable of vocal production learning </w:t>
+      </w:r>
+      <w:r>
+        <w:rPr>
+          <w:rFonts w:ascii="Arial" w:hAnsi="Arial" w:cs="Arial"/>
+        </w:rPr>
+        <w:fldChar w:fldCharType="begin"/>
+      </w:r>
+      <w:r>
+        <w:rPr>
+          <w:rFonts w:ascii="Arial" w:hAnsi="Arial" w:cs="Arial"/>
+        </w:rPr>
+        <w:instrText xml:space="preserve"> ADDIN ZOTERO_ITEM CSL_CITATION {"citationID":"Hq9yOBJs","properties":{"formattedCitation":"(22)","plainCitation":"(22)","noteIndex":0},"citationItems":[{"id":512,"uris":["http://zotero.org/groups/5786507/items/U3SX9JPF"],"itemData":{"id":512,"type":"article-journal","abstract":"While vocal learning has been studied extensively in birds and mammals, little effort has been made to define what exactly constitutes vocal learning and to classify the forms that it may take. We present such a theoretical framework for the study of social learning in vocal communication. We define different forms of social learning that affect communication and discuss the required methodology to show each one. We distinguish between contextual and production learning in animal communication. Contextual learning affects the behavioural context or serial position of a signal. It can affect both usage and comprehension. Production learning refers to instances where the signals themselves are modified in form as a result of experience with those of other individuals. Vocal learning is defined as production learning in the vocal domain. It can affect one or more of three systems: the respiratory, phonatory and filter systems. Each involves a different level of control over the sound production apparatus. We hypothesize that contextual learning and respiratory production learning preceded the evolution of phonatory and filter production learning. Each form of learning potentially increases the complexity of a communication system. We also found that unexpected genetic or environmental factors can have considerable effects on vocal behaviour in birds and mammals and are often more likely to cause changes or differences in vocalizations than investigators may assume. Finally, we discuss how production learning is used in innovation and invention, and present important future research questions.","container-title":"Animal Behaviour","DOI":"10.1006/anbe.2000.1410","ISSN":"0003-3472","issue":"1","journalAbbreviation":"Animal Behaviour","page":"1-11","source":"ScienceDirect","title":"The different roles of social learning in vocal communication","volume":"60","author":[{"family":"Janik","given":"Vincent M."},{"family":"Slater","given":"Peter J. B."}],"issued":{"date-parts":[["2000"]]}}}],"schema":"https://github.com/citation-style-language/schema/raw/master/csl-citation.json"} </w:instrText>
+      </w:r>
+      <w:r>
+        <w:rPr>
+          <w:rFonts w:ascii="Arial" w:hAnsi="Arial" w:cs="Arial"/>
+        </w:rPr>
+        <w:fldChar w:fldCharType="separate"/>
+      </w:r>
+      <w:r>
+        <w:rPr>
+          <w:rFonts w:ascii="Arial" w:hAnsi="Arial" w:cs="Arial"/>
+        </w:rPr>
+        <w:t>(22)</w:t>
+      </w:r>
+      <w:r>
+        <w:rPr>
+          <w:rFonts w:ascii="Arial" w:hAnsi="Arial" w:cs="Arial"/>
+        </w:rPr>
+        <w:fldChar w:fldCharType="end"/>
+      </w:r>
+      <w:r>
+        <w:rPr>
+          <w:rFonts w:ascii="Arial" w:hAnsi="Arial" w:cs="Arial"/>
+        </w:rPr>
+        <w:t>.</w:t>
+      </w:r>
+      <w:r>
+        <w:rPr>
+          <w:rFonts w:ascii="Arial" w:hAnsi="Arial" w:cs="Arial"/>
+        </w:rPr>
+        <w:t xml:space="preserve"> </w:t>
+      </w:r>
+      <w:r>
+        <w:rPr>
+          <w:rFonts w:ascii="Arial" w:hAnsi="Arial" w:cs="Arial"/>
+        </w:rPr>
+        <w:t xml:space="preserve">In addition, our tool facilitates generating synthetic vocal identity signals with controlled information encoding in frequency modulation patterns that can be used in empirical experiments. Researchers have successfully used synthetic vocalizations, and </w:t>
       </w:r>
       <w:r>
         <w:rPr>
           <w:rFonts w:ascii="Arial" w:hAnsi="Arial" w:cs="Arial"/>
         </w:rPr>
         <w:lastRenderedPageBreak/>
-        <w:t>by such pipelines</w:t>
-      </w:r>
-      <w:r>
-        <w:rPr>
-          <w:rFonts w:ascii="Arial" w:hAnsi="Arial" w:cs="Arial"/>
-        </w:rPr>
-        <w:t xml:space="preserve">, </w:t>
-      </w:r>
-      <w:r>
-        <w:rPr>
-          <w:rFonts w:ascii="Arial" w:hAnsi="Arial" w:cs="Arial"/>
-        </w:rPr>
-        <w:t xml:space="preserve">including testing </w:t>
-      </w:r>
-      <w:r>
-        <w:rPr>
-          <w:rFonts w:ascii="Arial" w:hAnsi="Arial" w:cs="Arial"/>
-        </w:rPr>
-        <w:t>which analytic</w:t>
-      </w:r>
-      <w:r>
-        <w:rPr>
-          <w:rFonts w:ascii="Arial" w:hAnsi="Arial" w:cs="Arial"/>
-        </w:rPr>
-        <w:t>al</w:t>
-      </w:r>
-      <w:r>
-        <w:rPr>
-          <w:rFonts w:ascii="Arial" w:hAnsi="Arial" w:cs="Arial"/>
-        </w:rPr>
-        <w:t xml:space="preserve"> tools </w:t>
-      </w:r>
-      <w:r>
-        <w:rPr>
-          <w:rFonts w:ascii="Arial" w:hAnsi="Arial" w:cs="Arial"/>
-        </w:rPr>
-        <w:t>best quantify</w:t>
-      </w:r>
-      <w:r>
-        <w:rPr>
-          <w:rFonts w:ascii="Arial" w:hAnsi="Arial" w:cs="Arial"/>
-        </w:rPr>
-        <w:t xml:space="preserve"> complexity </w:t>
-      </w:r>
-      <w:r>
-        <w:rPr>
-          <w:rFonts w:ascii="Arial" w:hAnsi="Arial" w:cs="Arial"/>
-        </w:rPr>
-        <w:t>in</w:t>
-      </w:r>
-      <w:r>
-        <w:rPr>
-          <w:rFonts w:ascii="Arial" w:hAnsi="Arial" w:cs="Arial"/>
-        </w:rPr>
-        <w:t xml:space="preserve"> animal vocal sequences </w:t>
-      </w:r>
-      <w:r>
-        <w:rPr>
-          <w:rFonts w:ascii="Arial" w:hAnsi="Arial" w:cs="Arial"/>
-        </w:rPr>
-        <w:fldChar w:fldCharType="begin"/>
-      </w:r>
-      <w:r>
-        <w:rPr>
-          <w:rFonts w:ascii="Arial" w:hAnsi="Arial" w:cs="Arial"/>
-        </w:rPr>
-        <w:instrText xml:space="preserve"> ADDIN ZOTERO_ITEM CSL_CITATION {"citationID":"hl2pTnSp","properties":{"formattedCitation":"(26)","plainCitation":"(26)","noteIndex":0},"citationItems":[{"id":544,"uris":["http://zotero.org/groups/5786507/items/WJJ2WCSZ"],"itemData":{"id":544,"type":"article-journal","abstract":"Many animals communicate using sequences of discrete acoustic elements which can be complex, vary in their degree of stereotypy, and are potentially open-ended. Variation in sequences can provide important ecological, behavioural or evolutionary information about the structure and connectivity of populations, mechanisms for vocal cultural evolution and the underlying drivers responsible for these processes. Various mathematical techniques have been used to form a realistic approximation of sequence similarity for such tasks. Here, we use both simulated and empirical data sets from animal vocal sequences (rock hyrax, Procavia capensis; humpback whale, Megaptera novaeangliae; bottlenose dolphin, Tursiops truncatus; and Carolina chickadee, Poecile carolinensis) to test which of eight sequence analysis metrics are more likely to reconstruct the information encoded in the sequences, and to test the fidelity of estimation of model parameters, when the sequences are assumed to conform to particular statistical models. Results from the simulated data indicated that multiple metrics were equally successful in reconstructing the information encoded in the sequences of simulated individuals (Markov chains, n-gram models, repeat distribution and edit distance) and data generated by different stochastic processes (entropy rate and n-grams). However, the string edit (Levenshtein) distance performed consistently and significantly better than all other tested metrics (including entropy, Markov chains, n-grams, mutual information) for all empirical data sets, despite being less commonly used in the field of animal acoustic communication. The Levenshtein distance metric provides a robust analytical approach that should be considered in the comparison of animal acoustic sequences in preference to other commonly employed techniques (such as Markov chains, hidden Markov models or Shannon entropy). The recent discovery that non-Markovian vocal sequences may be more common in animal communication than previously thought provides a rich area for future research that requires non-Markovian-based analysis techniques to investigate animal grammars and potentially the origin of human language.","container-title":"Methods in Ecology and Evolution","DOI":"10.1111/2041-210X.12433","ISSN":"2041-210X","issue":"12","language":"en","license":"© 2015 The Authors. Methods in Ecology and Evolution © 2015 British Ecological Society","note":"_eprint: https://onlinelibrary.wiley.com/doi/pdf/10.1111/2041-210X.12433","page":"1452-1461","source":"Wiley Online Library","title":"Quantifying similarity in animal vocal sequences: which metric performs best?","title-short":"Quantifying similarity in animal vocal sequences","volume":"6","author":[{"family":"Kershenbaum","given":"Arik"},{"family":"Garland","given":"Ellen C."}],"issued":{"date-parts":[["2015"]]}}}],"schema":"https://github.com/citation-style-language/schema/raw/master/csl-citation.json"} </w:instrText>
-      </w:r>
-      <w:r>
-        <w:rPr>
-          <w:rFonts w:ascii="Arial" w:hAnsi="Arial" w:cs="Arial"/>
-        </w:rPr>
-        <w:fldChar w:fldCharType="separate"/>
-      </w:r>
-      <w:r>
-        <w:rPr>
-          <w:rFonts w:ascii="Arial" w:hAnsi="Arial" w:cs="Arial"/>
-        </w:rPr>
-        <w:t>(26)</w:t>
-      </w:r>
-      <w:r>
-        <w:rPr>
-          <w:rFonts w:ascii="Arial" w:hAnsi="Arial" w:cs="Arial"/>
-        </w:rPr>
-        <w:fldChar w:fldCharType="end"/>
-      </w:r>
-      <w:r>
-        <w:rPr>
-          <w:rFonts w:ascii="Arial" w:hAnsi="Arial" w:cs="Arial"/>
-        </w:rPr>
-        <w:t xml:space="preserve"> </w:t>
-      </w:r>
-      <w:r>
-        <w:rPr>
-          <w:rFonts w:ascii="Arial" w:hAnsi="Arial" w:cs="Arial"/>
-        </w:rPr>
-        <w:t xml:space="preserve">and </w:t>
-      </w:r>
-      <w:r>
-        <w:rPr>
-          <w:rFonts w:ascii="Arial" w:hAnsi="Arial" w:cs="Arial"/>
-        </w:rPr>
-        <w:t>validat</w:t>
-      </w:r>
-      <w:r>
-        <w:rPr>
-          <w:rFonts w:ascii="Arial" w:hAnsi="Arial" w:cs="Arial"/>
-        </w:rPr>
-        <w:t>ing</w:t>
-      </w:r>
-      <w:r>
-        <w:rPr>
-          <w:rFonts w:ascii="Arial" w:hAnsi="Arial" w:cs="Arial"/>
-        </w:rPr>
-        <w:t xml:space="preserve"> new methods for calculating and quantifying acoustic structure </w:t>
-      </w:r>
-      <w:r>
-        <w:rPr>
-          <w:rFonts w:ascii="Arial" w:hAnsi="Arial" w:cs="Arial"/>
-        </w:rPr>
-        <w:fldChar w:fldCharType="begin"/>
-      </w:r>
-      <w:r>
-        <w:rPr>
-          <w:rFonts w:ascii="Arial" w:hAnsi="Arial" w:cs="Arial"/>
-        </w:rPr>
-        <w:instrText xml:space="preserve"> ADDIN ZOTERO_ITEM CSL_CITATION {"citationID":"dqL4UsV2","properties":{"formattedCitation":"(25,27)","plainCitation":"(25,27)","noteIndex":0},"citationItems":[{"id":558,"uris":["http://zotero.org/groups/5786507/items/ZECAX5J9"],"itemData":{"id":558,"type":"article-journal","abstract":"Assessing diversity of discretely varying behaviour is a classical ethological problem. In particular, the challenge of calculating an individuals’ or species’ vocal repertoire size is often an important step in ecological and behavioural studies, but a reproducible and broadly applicable method for accomplishing this task is not currently available. We offer a generalizable method to automate the calculation and quantification of acoustic diversity using an unsupervised random forest framework. We tested our method using natural and synthetic datasets of known repertoire sizes that exhibit standardized variation in common acoustic features as well as in recording quality. We tested two approaches to estimate acoustic diversity using the output from unsupervised random forest analyses: (a) cluster analysis to estimate the number of discrete acoustic signals (e.g. repertoire size) and (b) an estimation of acoustic area in acoustic feature space, as a proxy for repertoire size. We find that our unsupervised analyses classify acoustic structure with high accuracy. Specifically, both approaches accurately estimate element diversity when repertoire size is small to intermediate (5–20 unique elements). However, for larger datasets (20–100 unique elements), we find that calculating the size of the area occupied in acoustic space is a more reliable proxy for estimating repertoire size. We conclude that our implementation of unsupervised random forest analysis offers a generalizable tool that researchers can apply to classify acoustic structure of diverse datasets. Additionally, output from these analyses can be used to compare the distribution and diversity of signals in acoustic space, creating opportunities to quantify and compare the amount of acoustic variation among individuals, populations or species in a standardized way. We provide R code and examples to aid researchers interested in using these techniques.","container-title":"Methods in Ecology and Evolution","DOI":"10.1111/2041-210X.13599","ISSN":"2041-210X","issue":"7","language":"en","license":"© 2021 British Ecological Society","note":"_eprint: https://onlinelibrary.wiley.com/doi/pdf/10.1111/2041-210X.13599","page":"1213-1225","source":"Wiley Online Library","title":"A machine learning approach for classifying and quantifying acoustic diversity","volume":"12","author":[{"family":"Keen","given":"Sara C."},{"family":"Odom","given":"Karan J."},{"family":"Webster","given":"Michael S."},{"family":"Kohn","given":"Gregory M."},{"family":"Wright","given":"Timothy F."},{"family":"Araya-Salas","given":"Marcelo"}],"issued":{"date-parts":[["2021"]]}}},{"id":563,"uris":["http://zotero.org/groups/5786507/items/F9NHL8ST"],"itemData":{"id":563,"type":"article-journal","abstract":"Birdsong is an important signal in mate attraction and territorial defence. Quantifying the complexity of these songs can shed light on individual fitness, sexual selection and behaviour. Several techniques have been used to quantify song complexity and be broadly categorized into measures of sequential variations and measures of diversity. However, these methods are unable to account for important acoustic features like the frequency bandwidth and the variety in the spectro-temporal shape of notes which are an integral part of these vocal signals. This study proposes a new complexity method that considers intra-song note variability and calculates a weighted index for birdsongs using spectral cross-correlation. We first compared previously described methods to understand their advantages and limitations based on the factors that would affect the complexity of songs. We then developed a new method, Note Variability Index (NVI), which incorporates the spectral features of notes to quantify complexity. This method alleviates the need for manual classification of notes that can be error-prone. We used spectrogram cross-correlation to compare notes within a song and used the output values to quantify song complexity. To evaluate the efficacy of the new method, we generated synthetic songs to caricature extremes in song complexity and compared selected conventional complexity methods along with the NVI. We provide case-specific limitations of these methods. Additionally, to examine the efficacy of this new method in real-world scenarios, we used natural birdsongs from multiple species across the globe with varying song structures to compare conventional methods with NVI. To our knowledge, NVI is the only song complexity method that captures the variation of spectro-temporal shapes of the notes in songs where the conventional methods fail to distinguish between similar song structures with different note types. Furthermore, as NVI does not need a manual classification of notes, it can be easily implemented for any type of birdsong with existing sound analysis software; it is quick, avoids the possible subjectivity in note classification and can be automated for large datasets.","container-title":"Methods in Ecology and Evolution","DOI":"10.1111/2041-210X.13765","ISSN":"2041-210X","issue":"2","language":"en","license":"© 2021 British Ecological Society","note":"_eprint: https://onlinelibrary.wiley.com/doi/pdf/10.1111/2041-210X.13765","page":"459-472","source":"Wiley Online Library","title":"Spectrogram cross-correlation can be used to measure the complexity of bird vocalizations","volume":"13","author":[{"family":"Sawant","given":"Suyash"},{"family":"Arvind","given":"Chiti"},{"family":"Joshi","given":"Viral"},{"family":"Robin","given":"V. V."}],"issued":{"date-parts":[["2022"]]}}}],"schema":"https://github.com/citation-style-language/schema/raw/master/csl-citation.json"} </w:instrText>
-      </w:r>
-      <w:r>
-        <w:rPr>
-          <w:rFonts w:ascii="Arial" w:hAnsi="Arial" w:cs="Arial"/>
-        </w:rPr>
-        <w:fldChar w:fldCharType="separate"/>
-      </w:r>
-      <w:r>
-        <w:rPr>
-          <w:rFonts w:ascii="Arial" w:hAnsi="Arial" w:cs="Arial"/>
-        </w:rPr>
-        <w:t>(25,27)</w:t>
-      </w:r>
-      <w:r>
-        <w:rPr>
-          <w:rFonts w:ascii="Arial" w:hAnsi="Arial" w:cs="Arial"/>
-        </w:rPr>
-        <w:fldChar w:fldCharType="end"/>
-      </w:r>
-      <w:r>
-        <w:rPr>
-          <w:rFonts w:ascii="Arial" w:hAnsi="Arial" w:cs="Arial"/>
-        </w:rPr>
-        <w:t xml:space="preserve">. </w:t>
-      </w:r>
-      <w:r>
-        <w:rPr>
-          <w:rFonts w:ascii="Arial" w:hAnsi="Arial" w:cs="Arial"/>
-        </w:rPr>
-        <w:t>In addition,</w:t>
-      </w:r>
-      <w:r>
-        <w:rPr>
-          <w:rFonts w:ascii="Arial" w:hAnsi="Arial" w:cs="Arial"/>
-        </w:rPr>
-        <w:t xml:space="preserve"> several </w:t>
-      </w:r>
-      <w:r>
-        <w:rPr>
-          <w:rFonts w:ascii="Arial" w:hAnsi="Arial" w:cs="Arial"/>
-        </w:rPr>
-        <w:t xml:space="preserve">existing </w:t>
-      </w:r>
-      <w:r>
-        <w:rPr>
-          <w:rFonts w:ascii="Arial" w:hAnsi="Arial" w:cs="Arial"/>
-        </w:rPr>
-        <w:t>tools</w:t>
-      </w:r>
-      <w:r>
-        <w:rPr>
-          <w:rFonts w:ascii="Arial" w:hAnsi="Arial" w:cs="Arial"/>
-        </w:rPr>
-        <w:t xml:space="preserve"> allow researchers to create synthetic vocal</w:t>
-      </w:r>
-      <w:r>
-        <w:rPr>
-          <w:rFonts w:ascii="Arial" w:hAnsi="Arial" w:cs="Arial"/>
-        </w:rPr>
-        <w:t>izations</w:t>
-      </w:r>
-      <w:r>
-        <w:rPr>
-          <w:rFonts w:ascii="Arial" w:hAnsi="Arial" w:cs="Arial"/>
-        </w:rPr>
-        <w:t xml:space="preserve"> and vocal sequences</w:t>
-      </w:r>
-      <w:r>
-        <w:rPr>
-          <w:rFonts w:ascii="Arial" w:hAnsi="Arial" w:cs="Arial"/>
-        </w:rPr>
-        <w:t xml:space="preserve">, including </w:t>
-      </w:r>
-      <w:r>
-        <w:rPr>
-          <w:rFonts w:ascii="Arial" w:hAnsi="Arial" w:cs="Arial"/>
-        </w:rPr>
-        <w:t xml:space="preserve">the </w:t>
-      </w:r>
-      <w:proofErr w:type="spellStart"/>
-      <w:r>
-        <w:rPr>
-          <w:rFonts w:ascii="Arial" w:hAnsi="Arial" w:cs="Arial"/>
-        </w:rPr>
-        <w:t>seewave</w:t>
-      </w:r>
-      <w:proofErr w:type="spellEnd"/>
-      <w:r>
-        <w:rPr>
-          <w:rFonts w:ascii="Arial" w:hAnsi="Arial" w:cs="Arial"/>
-        </w:rPr>
-        <w:t xml:space="preserve">, </w:t>
-      </w:r>
-      <w:proofErr w:type="spellStart"/>
-      <w:r>
-        <w:rPr>
-          <w:rFonts w:ascii="Arial" w:hAnsi="Arial" w:cs="Arial"/>
-        </w:rPr>
-        <w:t>warbleR</w:t>
-      </w:r>
-      <w:proofErr w:type="spellEnd"/>
-      <w:r>
-        <w:rPr>
-          <w:rFonts w:ascii="Arial" w:hAnsi="Arial" w:cs="Arial"/>
-        </w:rPr>
-        <w:t>, and</w:t>
-      </w:r>
-      <w:r>
-        <w:rPr>
-          <w:rFonts w:ascii="Arial" w:hAnsi="Arial" w:cs="Arial"/>
-        </w:rPr>
-        <w:t xml:space="preserve"> </w:t>
-      </w:r>
-      <w:proofErr w:type="spellStart"/>
-      <w:r>
-        <w:rPr>
-          <w:rFonts w:ascii="Arial" w:hAnsi="Arial" w:cs="Arial"/>
-        </w:rPr>
-        <w:t>soundgen</w:t>
-      </w:r>
-      <w:proofErr w:type="spellEnd"/>
-      <w:r>
-        <w:rPr>
-          <w:rFonts w:ascii="Arial" w:hAnsi="Arial" w:cs="Arial"/>
-        </w:rPr>
-        <w:t xml:space="preserve"> R packages</w:t>
-      </w:r>
-      <w:r>
-        <w:rPr>
-          <w:rFonts w:ascii="Arial" w:hAnsi="Arial" w:cs="Arial"/>
-        </w:rPr>
-        <w:t xml:space="preserve"> </w:t>
-      </w:r>
-      <w:r>
-        <w:rPr>
-          <w:rFonts w:ascii="Arial" w:hAnsi="Arial" w:cs="Arial"/>
-        </w:rPr>
-        <w:fldChar w:fldCharType="begin"/>
-      </w:r>
-      <w:r>
-        <w:rPr>
-          <w:rFonts w:ascii="Arial" w:hAnsi="Arial" w:cs="Arial"/>
-        </w:rPr>
-        <w:instrText xml:space="preserve"> ADDIN ZOTERO_ITEM CSL_CITATION {"citationID":"WhhzJw57","properties":{"formattedCitation":"(23,28,29)","plainCitation":"(23,28,29)","noteIndex":0},"citationItems":[{"id":833,"uris":["http://zotero.org/groups/5786507/items/9FR7DCSI"],"itemData":{"id":833,"type":"article-journal","abstract":"Voice synthesis is a useful method for investigating the communicative role of different acoustic features. Although many text-to-speech systems are available, researchers of human nonverbal vocalizations and bioacousticians may profit from a dedicated simple tool for synthesizing and manipulating natural-sounding vocalizations. Soundgen (https://CRAN.R-project.org/package=soundgen) is an open-source R package that synthesizes nonverbal vocalizations based on meaningful acoustic parameters, which can be specified from the command line or in an interactive app. This tool was validated by comparing the perceived emotion, valence, arousal, and authenticity of 60 recorded human nonverbal vocalizations (screams, moans, laughs, and so on) and their approximate synthetic reproductions. Each synthetic sound was created by manually specifying only a small number of high-level control parameters, such as syllable length and a few anchors for the intonation contour. Nevertheless, the valence and arousal ratings of synthetic sounds were similar to those of the original recordings, and the authenticity ratings were comparable, maintaining parity with the originals for less complex vocalizations. Manipulating the precise acoustic characteristics of synthetic sounds may shed light on the salient predictors of emotion in the human voice. More generally, soundgen may prove useful for any studies that require precise control over the acoustic features of nonspeech sounds, including research on animal vocalizations and auditory perception.","container-title":"Behavior Research Methods","DOI":"10.3758/s13428-018-1095-7","ISSN":"1554-3528","issue":"2","journalAbbreviation":"Behav Res","language":"en","page":"778-792","source":"Springer Link","title":"Soundgen: An open-source tool for synthesizing nonverbal vocalizations","title-short":"Soundgen","volume":"51","author":[{"family":"Anikin","given":"Andrey"}],"issued":{"date-parts":[["2019"]]}}},{"id":835,"uris":["http://zotero.org/groups/5786507/items/SINYAVQQ"],"itemData":{"id":835,"type":"article-journal","abstract":"We review Seewave, new software for analysing and synthesizing sounds. Seewave is free and works on a wide variety of operating systems as an extension of the R operating environment. Its current 67 functions allow the user to achieve time, amplitude and frequency analyses, to estimate quantitative differences between sounds, and to generate new sounds for playback experiments. Thanks to its implementation in the R environment, Seewave is fully modular. All functions can be combined for complex data acquisition and graphical output, they can be part of important scripts for batch processing and they can be modified ad libitum. New functions can also be written, making Seewave a truly open-source tool.","container-title":"Bioacoustics","DOI":"10.1080/09524622.2008.9753600","ISSN":"0952-4622","issue":"2","note":"publisher: Taylor &amp; Francis\n_eprint: https://doi.org/10.1080/09524622.2008.9753600","page":"213-226","source":"Taylor and Francis+NEJM","title":"Seewave, a free modular tool for sound analysis and synthesis","volume":"18","author":[{"family":"Sueur","given":"Jerome"},{"family":"Aubin","given":"Thierry"},{"family":"Simonis","given":"Caroline"}],"issued":{"date-parts":[["2008"]]}}},{"id":836,"uris":["http://zotero.org/groups/5786507/items/KSAJINRD"],"itemData":{"id":836,"type":"article-journal","abstract":"Animal acoustic communication is one of the most fruitful research areas in behavioural and evolutionary biology. Work in this area depends largely on quantifying the structure of acoustic signals, which has often depended upon closed-source or graphical user interface (GUI)-based software. Here, we describe the r package warbleR, a new package for the analysis of animal acoustic signal structure. The package offers functions for downloading avian vocalizations from the open-access online repository Xeno-Canto, displaying the geographic extent of the recordings, manipulating sound files, detecting acoustic signals or importing detected signals from other software, assessing performance of methods that measure acoustic similarity, conducting cross-correlations, measuring acoustic parameters and analysing interactive vocal signals, among others. Functions working iteratively allow parallelization to improve computational efficiency. We present a case study showing how warbleR functions can be used in a workflow to evaluate the structure of acoustic signals. We analyse geographic variation in long-billed hermit hummingbirds (Phaethornis longirostris) songs obtained from Xeno-Canto. The code in warbleR can be executed by less experienced r users, but has also been thoroughly commented, which will facilitate further customization by advanced users. The combination of the tools described here with other acoustic analysis packages in r should significantly expand the range of analytical approaches available.","container-title":"Methods in Ecology and Evolution","DOI":"10.1111/2041-210X.12624","ISSN":"2041-210X","issue":"2","language":"en","license":"© 2016 The Authors. Methods in Ecology and Evolution © 2016 British Ecological Society","note":"_eprint: https://besjournals.onlinelibrary.wiley.com/doi/pdf/10.1111/2041-210X.12624","page":"184-191","source":"Wiley Online Library","title":"warbleR: an r package to streamline analysis of animal acoustic signals","title-short":"warbleR","volume":"8","author":[{"family":"Araya-Salas","given":"Marcelo"},{"family":"Smith-Vidaurre","given":"Grace"}],"issued":{"date-parts":[["2017"]]}}}],"schema":"https://github.com/citation-style-language/schema/raw/master/csl-citation.json"} </w:instrText>
-      </w:r>
-      <w:r>
-        <w:rPr>
-          <w:rFonts w:ascii="Arial" w:hAnsi="Arial" w:cs="Arial"/>
-        </w:rPr>
-        <w:fldChar w:fldCharType="separate"/>
-      </w:r>
-      <w:r>
-        <w:rPr>
-          <w:rFonts w:ascii="Arial" w:hAnsi="Arial" w:cs="Arial"/>
-        </w:rPr>
-        <w:t>(23,28,29)</w:t>
-      </w:r>
-      <w:r>
-        <w:rPr>
-          <w:rFonts w:ascii="Arial" w:hAnsi="Arial" w:cs="Arial"/>
-        </w:rPr>
-        <w:fldChar w:fldCharType="end"/>
-      </w:r>
-      <w:r>
-        <w:rPr>
-          <w:rFonts w:ascii="Arial" w:hAnsi="Arial" w:cs="Arial"/>
-        </w:rPr>
-        <w:t xml:space="preserve">. An underused function of these </w:t>
-      </w:r>
-      <w:r>
-        <w:rPr>
-          <w:rFonts w:ascii="Arial" w:hAnsi="Arial" w:cs="Arial"/>
-        </w:rPr>
-        <w:t>tools</w:t>
-      </w:r>
-      <w:r>
-        <w:rPr>
-          <w:rFonts w:ascii="Arial" w:hAnsi="Arial" w:cs="Arial"/>
-        </w:rPr>
-        <w:t xml:space="preserve"> in animal communication</w:t>
-      </w:r>
-      <w:r>
-        <w:rPr>
-          <w:rFonts w:ascii="Arial" w:hAnsi="Arial" w:cs="Arial"/>
-        </w:rPr>
-        <w:t xml:space="preserve"> research</w:t>
-      </w:r>
-      <w:r>
-        <w:rPr>
-          <w:rFonts w:ascii="Arial" w:hAnsi="Arial" w:cs="Arial"/>
-        </w:rPr>
-        <w:t xml:space="preserve"> is that they provide researchers with the ability to manipulate information in synthetic </w:t>
-      </w:r>
-      <w:r>
-        <w:rPr>
-          <w:rFonts w:ascii="Arial" w:hAnsi="Arial" w:cs="Arial"/>
-        </w:rPr>
-        <w:t>vocalizations</w:t>
-      </w:r>
-      <w:r>
-        <w:rPr>
-          <w:rFonts w:ascii="Arial" w:hAnsi="Arial" w:cs="Arial"/>
-        </w:rPr>
-        <w:t xml:space="preserve"> to specifically study the types </w:t>
-      </w:r>
-      <w:r>
-        <w:rPr>
-          <w:rFonts w:ascii="Arial" w:hAnsi="Arial" w:cs="Arial"/>
-        </w:rPr>
-        <w:t>of</w:t>
-      </w:r>
-      <w:r>
-        <w:rPr>
-          <w:rFonts w:ascii="Arial" w:hAnsi="Arial" w:cs="Arial"/>
-        </w:rPr>
-        <w:t xml:space="preserve"> information encoded in a signal, how much information is encoded, and where </w:t>
-      </w:r>
-      <w:r>
-        <w:rPr>
-          <w:rFonts w:ascii="Arial" w:hAnsi="Arial" w:cs="Arial"/>
-        </w:rPr>
-        <w:t>such</w:t>
-      </w:r>
-      <w:r>
-        <w:rPr>
-          <w:rFonts w:ascii="Arial" w:hAnsi="Arial" w:cs="Arial"/>
-        </w:rPr>
-        <w:t xml:space="preserve"> information is encoded</w:t>
-      </w:r>
-      <w:r>
-        <w:rPr>
-          <w:rFonts w:ascii="Arial" w:hAnsi="Arial" w:cs="Arial"/>
-        </w:rPr>
-        <w:t>, and how well such patterns of information encoding can be detected with different analytical tools</w:t>
-      </w:r>
-      <w:r>
-        <w:rPr>
-          <w:rFonts w:ascii="Arial" w:hAnsi="Arial" w:cs="Arial"/>
-        </w:rPr>
-        <w:t xml:space="preserve">. </w:t>
-      </w:r>
-      <w:r>
-        <w:rPr>
-          <w:rFonts w:ascii="Arial" w:hAnsi="Arial" w:cs="Arial"/>
-        </w:rPr>
-        <w:t xml:space="preserve">For instance, the </w:t>
-      </w:r>
-      <w:proofErr w:type="spellStart"/>
-      <w:r>
-        <w:rPr>
-          <w:rFonts w:ascii="Arial" w:hAnsi="Arial" w:cs="Arial"/>
-        </w:rPr>
-        <w:t>soundgen</w:t>
-      </w:r>
-      <w:proofErr w:type="spellEnd"/>
-      <w:r>
-        <w:rPr>
-          <w:rFonts w:ascii="Arial" w:hAnsi="Arial" w:cs="Arial"/>
-        </w:rPr>
-        <w:t xml:space="preserve"> package facilitates diverse types of information encoding that have successfully been used to understand dynamic </w:t>
-      </w:r>
-      <w:r>
-        <w:rPr>
-          <w:rFonts w:ascii="Arial" w:hAnsi="Arial" w:cs="Arial"/>
-        </w:rPr>
-        <w:t xml:space="preserve">information encoding in formant structures produced during human speech </w:t>
-      </w:r>
-      <w:r>
-        <w:rPr>
-          <w:rFonts w:ascii="Arial" w:hAnsi="Arial" w:cs="Arial"/>
-        </w:rPr>
-        <w:fldChar w:fldCharType="begin"/>
-      </w:r>
-      <w:r>
-        <w:rPr>
-          <w:rFonts w:ascii="Arial" w:hAnsi="Arial" w:cs="Arial"/>
-        </w:rPr>
-        <w:instrText xml:space="preserve"> ADDIN ZOTERO_ITEM CSL_CITATION {"citationID":"rSqvLgcu","properties":{"formattedCitation":"(30)","plainCitation":"(30)","noteIndex":0},"citationItems":[{"id":861,"uris":["http://zotero.org/groups/5786507/items/6CU223UP"],"itemData":{"id":861,"type":"article-journal","abstract":"When producing intimidating aggressive vocalizations, humans and other animals often extend their vocal tracts to lower their voice resonance frequencies (formants) and thus sound big. Is acoustic size exaggeration more effective when the vocal tract is extended before, or during, the vocalization, and how do listeners interpret within-call changes in apparent vocal tract length? We compared perceptual effects of static and dynamic formant scaling in aggressive human speech and nonverbal vocalizations. Acoustic manipulations corresponded to elongating or shortening the vocal tract either around (Experiment 1) or from (Experiment 2) its resting position. Gradual formant scaling that preserved average frequencies conveyed the impression of smaller size and greater aggression, regardless of the direction of change. Vocal tract shortening from the original length conveyed smaller size and less aggression, whereas vocal tract elongation conveyed larger size and more aggression, and these effects were stronger for static than for dynamic scaling. Listeners familiarized with the speaker's natural voice were less often ‘fooled’ by formant manipulations when judging speaker size, but paid more attention to formants when judging aggressive intent. Thus, within-call vocal tract scaling conveys emotion, but a better way to sound large and intimidating is to keep the vocal tract consistently extended.","container-title":"Royal Society Open Science","DOI":"10.1098/rsos.211496","ISSN":"2054-5703","issue":"1","journalAbbreviation":"R. Soc. open sci.","language":"en","page":"211496","source":"DOI.org (Crossref)","title":"Static and dynamic formant scaling conveys body size and aggression","volume":"9","author":[{"family":"Anikin","given":"Andrey"},{"family":"Pisanski","given":"Katarzyna"},{"family":"Reby","given":"David"}],"issued":{"date-parts":[["2022"]]}}}],"schema":"https://github.com/citation-style-language/schema/raw/master/csl-citation.json"} </w:instrText>
-      </w:r>
-      <w:r>
-        <w:rPr>
-          <w:rFonts w:ascii="Arial" w:hAnsi="Arial" w:cs="Arial"/>
-        </w:rPr>
-        <w:fldChar w:fldCharType="separate"/>
-      </w:r>
-      <w:r>
-        <w:rPr>
-          <w:rFonts w:ascii="Arial" w:hAnsi="Arial" w:cs="Arial"/>
-        </w:rPr>
-        <w:t>(30)</w:t>
-      </w:r>
-      <w:r>
-        <w:rPr>
-          <w:rFonts w:ascii="Arial" w:hAnsi="Arial" w:cs="Arial"/>
-        </w:rPr>
-        <w:fldChar w:fldCharType="end"/>
-      </w:r>
-      <w:r>
-        <w:rPr>
-          <w:rFonts w:ascii="Arial" w:hAnsi="Arial" w:cs="Arial"/>
-        </w:rPr>
-        <w:t xml:space="preserve">. </w:t>
-      </w:r>
-      <w:r>
-        <w:rPr>
-          <w:rFonts w:ascii="Arial" w:hAnsi="Arial" w:cs="Arial"/>
-        </w:rPr>
-        <w:t xml:space="preserve">Our </w:t>
-      </w:r>
-      <w:r>
-        <w:rPr>
-          <w:rFonts w:ascii="Arial" w:hAnsi="Arial" w:cs="Arial"/>
-        </w:rPr>
-        <w:t>tool</w:t>
-      </w:r>
-      <w:r>
-        <w:rPr>
-          <w:rFonts w:ascii="Arial" w:hAnsi="Arial" w:cs="Arial"/>
-        </w:rPr>
-        <w:t xml:space="preserve"> </w:t>
-      </w:r>
-      <w:r>
-        <w:rPr>
-          <w:rFonts w:ascii="Arial" w:hAnsi="Arial" w:cs="Arial"/>
-        </w:rPr>
-        <w:t>complements</w:t>
-      </w:r>
-      <w:r>
-        <w:rPr>
-          <w:rFonts w:ascii="Arial" w:hAnsi="Arial" w:cs="Arial"/>
-        </w:rPr>
-        <w:t xml:space="preserve"> </w:t>
-      </w:r>
-      <w:r>
-        <w:rPr>
-          <w:rFonts w:ascii="Arial" w:hAnsi="Arial" w:cs="Arial"/>
-        </w:rPr>
-        <w:t xml:space="preserve">existing </w:t>
-      </w:r>
-      <w:r>
-        <w:rPr>
-          <w:rFonts w:ascii="Arial" w:hAnsi="Arial" w:cs="Arial"/>
-        </w:rPr>
-        <w:t>to</w:t>
-      </w:r>
-      <w:r>
-        <w:rPr>
-          <w:rFonts w:ascii="Arial" w:hAnsi="Arial" w:cs="Arial"/>
-        </w:rPr>
-        <w:t xml:space="preserve">ols by providing a solution for encoding </w:t>
-      </w:r>
-      <w:r>
-        <w:rPr>
-          <w:rFonts w:ascii="Arial" w:hAnsi="Arial" w:cs="Arial"/>
-        </w:rPr>
-        <w:t xml:space="preserve">identity </w:t>
-      </w:r>
-      <w:r>
-        <w:rPr>
-          <w:rFonts w:ascii="Arial" w:hAnsi="Arial" w:cs="Arial"/>
-        </w:rPr>
-        <w:t>information</w:t>
-      </w:r>
-      <w:r>
-        <w:rPr>
-          <w:rFonts w:ascii="Arial" w:hAnsi="Arial" w:cs="Arial"/>
-        </w:rPr>
-        <w:t xml:space="preserve"> across social levels in frequency modulation patterns</w:t>
-      </w:r>
-      <w:r>
-        <w:rPr>
-          <w:rFonts w:ascii="Arial" w:hAnsi="Arial" w:cs="Arial"/>
-        </w:rPr>
-        <w:t xml:space="preserve">, one acoustic feature widely considered to be modified by vertebrates that are capable of vocal production learning </w:t>
-      </w:r>
-      <w:r>
-        <w:rPr>
-          <w:rFonts w:ascii="Arial" w:hAnsi="Arial" w:cs="Arial"/>
-        </w:rPr>
-        <w:fldChar w:fldCharType="begin"/>
-      </w:r>
-      <w:r>
-        <w:rPr>
-          <w:rFonts w:ascii="Arial" w:hAnsi="Arial" w:cs="Arial"/>
-        </w:rPr>
-        <w:instrText xml:space="preserve"> ADDIN ZOTERO_ITEM CSL_CITATION {"citationID":"Hq9yOBJs","properties":{"formattedCitation":"(22)","plainCitation":"(22)","noteIndex":0},"citationItems":[{"id":512,"uris":["http://zotero.org/groups/5786507/items/U3SX9JPF"],"itemData":{"id":512,"type":"article-journal","abstract":"While vocal learning has been studied extensively in birds and mammals, little effort has been made to define what exactly constitutes vocal learning and to classify the forms that it may take. We present such a theoretical framework for the study of social learning in vocal communication. We define different forms of social learning that affect communication and discuss the required methodology to show each one. We distinguish between contextual and production learning in animal communication. Contextual learning affects the behavioural context or serial position of a signal. It can affect both usage and comprehension. Production learning refers to instances where the signals themselves are modified in form as a result of experience with those of other individuals. Vocal learning is defined as production learning in the vocal domain. It can affect one or more of three systems: the respiratory, phonatory and filter systems. Each involves a different level of control over the sound production apparatus. We hypothesize that contextual learning and respiratory production learning preceded the evolution of phonatory and filter production learning. Each form of learning potentially increases the complexity of a communication system. We also found that unexpected genetic or environmental factors can have considerable effects on vocal behaviour in birds and mammals and are often more likely to cause changes or differences in vocalizations than investigators may assume. Finally, we discuss how production learning is used in innovation and invention, and present important future research questions.","container-title":"Animal Behaviour","DOI":"10.1006/anbe.2000.1410","ISSN":"0003-3472","issue":"1","journalAbbreviation":"Animal Behaviour","page":"1-11","source":"ScienceDirect","title":"The different roles of social learning in vocal communication","volume":"60","author":[{"family":"Janik","given":"Vincent M."},{"family":"Slater","given":"Peter J. B."}],"issued":{"date-parts":[["2000"]]}}}],"schema":"https://github.com/citation-style-language/schema/raw/master/csl-citation.json"} </w:instrText>
-      </w:r>
-      <w:r>
-        <w:rPr>
-          <w:rFonts w:ascii="Arial" w:hAnsi="Arial" w:cs="Arial"/>
-        </w:rPr>
-        <w:fldChar w:fldCharType="separate"/>
-      </w:r>
-      <w:r>
-        <w:rPr>
-          <w:rFonts w:ascii="Arial" w:hAnsi="Arial" w:cs="Arial"/>
-        </w:rPr>
-        <w:t>(22)</w:t>
-      </w:r>
-      <w:r>
-        <w:rPr>
-          <w:rFonts w:ascii="Arial" w:hAnsi="Arial" w:cs="Arial"/>
-        </w:rPr>
-        <w:fldChar w:fldCharType="end"/>
-      </w:r>
-      <w:r>
-        <w:rPr>
-          <w:rFonts w:ascii="Arial" w:hAnsi="Arial" w:cs="Arial"/>
-        </w:rPr>
-        <w:t>.</w:t>
-      </w:r>
-      <w:r>
-        <w:rPr>
-          <w:rFonts w:ascii="Arial" w:hAnsi="Arial" w:cs="Arial"/>
-        </w:rPr>
-        <w:t xml:space="preserve"> </w:t>
-      </w:r>
-      <w:r>
-        <w:rPr>
-          <w:rFonts w:ascii="Arial" w:hAnsi="Arial" w:cs="Arial"/>
-        </w:rPr>
-        <w:t>In addition, our tool facilitates generating synthetic vocal identity signals with controlled information encoding in frequency modulation patterns that can be used in empirical experiments. Researchers have successfully used synthetic vocalizations, and manipulat</w:t>
+        <w:t>manipulat</w:t>
       </w:r>
       <w:r>
         <w:rPr>
@@ -13397,14 +13379,7 @@
         <w:rPr>
           <w:rFonts w:ascii="Arial" w:hAnsi="Arial" w:cs="Arial"/>
         </w:rPr>
-        <w:t xml:space="preserve">Applications of information theory to animal communication systems have shown that in social environments that have more individuals or groups (i.e., more classes of </w:t>
-      </w:r>
-      <w:r>
-        <w:rPr>
-          <w:rFonts w:ascii="Arial" w:hAnsi="Arial" w:cs="Arial"/>
-        </w:rPr>
-        <w:lastRenderedPageBreak/>
-        <w:t xml:space="preserve">each social level) signal distinctiveness is harder to maintain, since the number of unique possible signals is bounded </w:t>
+        <w:t xml:space="preserve">Applications of information theory to animal communication systems have shown that in social environments that have more individuals or groups (i.e., more classes of each social level) signal distinctiveness is harder to maintain, since the number of unique possible signals is bounded </w:t>
       </w:r>
       <w:r>
         <w:rPr>
@@ -13764,7 +13739,14 @@
         <w:rPr>
           <w:rFonts w:ascii="Arial" w:hAnsi="Arial" w:cs="Arial"/>
         </w:rPr>
-        <w:t>our example datasets, which show stochastic overlap amongst individuals within groups for the individually distinctive dataset, and stochastic overlap amongst groups for the group-specific dataset (</w:t>
+        <w:t xml:space="preserve">our example datasets, which show stochastic overlap amongst individuals within groups for the individually distinctive dataset, and stochastic overlap </w:t>
+      </w:r>
+      <w:r>
+        <w:rPr>
+          <w:rFonts w:ascii="Arial" w:hAnsi="Arial" w:cs="Arial"/>
+        </w:rPr>
+        <w:lastRenderedPageBreak/>
+        <w:t>amongst groups for the group-specific dataset (</w:t>
       </w:r>
       <w:r>
         <w:rPr>
@@ -13870,14 +13852,7 @@
         <w:rPr>
           <w:rFonts w:ascii="Arial" w:hAnsi="Arial" w:cs="Arial"/>
         </w:rPr>
-        <w:t xml:space="preserve"> whether information is </w:t>
-      </w:r>
-      <w:r>
-        <w:rPr>
-          <w:rFonts w:ascii="Arial" w:hAnsi="Arial" w:cs="Arial"/>
-        </w:rPr>
-        <w:lastRenderedPageBreak/>
-        <w:t xml:space="preserve">encoded across more than one social level, but also which </w:t>
+        <w:t xml:space="preserve"> whether information is encoded across more than one social level, but also which </w:t>
       </w:r>
       <w:r>
         <w:rPr>
@@ -14253,7 +14228,14 @@
         <w:rPr>
           <w:rFonts w:ascii="Arial" w:hAnsi="Arial" w:cs="Arial"/>
         </w:rPr>
-        <w:t xml:space="preserve"> We are currently producing a second version of the </w:t>
+        <w:t xml:space="preserve"> We are currently producing a second version </w:t>
+      </w:r>
+      <w:r>
+        <w:rPr>
+          <w:rFonts w:ascii="Arial" w:hAnsi="Arial" w:cs="Arial"/>
+        </w:rPr>
+        <w:lastRenderedPageBreak/>
+        <w:t xml:space="preserve">of the </w:t>
       </w:r>
       <w:proofErr w:type="spellStart"/>
       <w:r>
@@ -14378,14 +14360,7 @@
         <w:rPr>
           <w:rFonts w:ascii="Arial" w:hAnsi="Arial" w:cs="Arial"/>
         </w:rPr>
-        <w:t xml:space="preserve">use for encoding </w:t>
-      </w:r>
-      <w:r>
-        <w:rPr>
-          <w:rFonts w:ascii="Arial" w:hAnsi="Arial" w:cs="Arial"/>
-        </w:rPr>
-        <w:lastRenderedPageBreak/>
-        <w:t>identity information</w:t>
+        <w:t>use for encoding identity information</w:t>
       </w:r>
       <w:r>
         <w:rPr>
@@ -14928,7 +14903,14 @@
         <w:rPr>
           <w:rFonts w:ascii="Arial" w:hAnsi="Arial" w:cs="Arial"/>
         </w:rPr>
-        <w:t xml:space="preserve"> with information encoded at different social levels, (2) </w:t>
+        <w:t xml:space="preserve"> with information encoded </w:t>
+      </w:r>
+      <w:r>
+        <w:rPr>
+          <w:rFonts w:ascii="Arial" w:hAnsi="Arial" w:cs="Arial"/>
+        </w:rPr>
+        <w:lastRenderedPageBreak/>
+        <w:t xml:space="preserve">at different social levels, (2) </w:t>
       </w:r>
       <w:r>
         <w:rPr>
@@ -15570,7 +15552,14 @@
         <w:rPr>
           <w:rFonts w:ascii="Arial" w:hAnsi="Arial" w:cs="Arial"/>
         </w:rPr>
-        <w:t>, such that repeated vocalization exemplars assigned to the same individual could be considered unique rather than duplicated vocal structures</w:t>
+        <w:t xml:space="preserve">, </w:t>
+      </w:r>
+      <w:r>
+        <w:rPr>
+          <w:rFonts w:ascii="Arial" w:hAnsi="Arial" w:cs="Arial"/>
+        </w:rPr>
+        <w:lastRenderedPageBreak/>
+        <w:t>such that repeated vocalization exemplars assigned to the same individual could be considered unique rather than duplicated vocal structures</w:t>
       </w:r>
       <w:r>
         <w:rPr>
@@ -15674,7 +15663,6 @@
         <w:rPr>
           <w:rFonts w:ascii="Arial" w:hAnsi="Arial" w:cs="Arial"/>
         </w:rPr>
-        <w:lastRenderedPageBreak/>
         <w:tab/>
       </w:r>
       <w:r>
@@ -16350,7 +16338,14 @@
         <w:rPr>
           <w:rFonts w:ascii="Arial" w:hAnsi="Arial" w:cs="Arial"/>
         </w:rPr>
-        <w:t>s “</w:t>
+        <w:t xml:space="preserve">s </w:t>
+      </w:r>
+      <w:r>
+        <w:rPr>
+          <w:rFonts w:ascii="Arial" w:hAnsi="Arial" w:cs="Arial"/>
+        </w:rPr>
+        <w:lastRenderedPageBreak/>
+        <w:t>“</w:t>
       </w:r>
       <w:r>
         <w:rPr>
@@ -16494,14 +16489,7 @@
         <w:rPr>
           <w:rFonts w:ascii="Arial" w:hAnsi="Arial" w:cs="Arial"/>
         </w:rPr>
-        <w:t xml:space="preserve"> frequency values as a continuous </w:t>
-      </w:r>
-      <w:r>
-        <w:rPr>
-          <w:rFonts w:ascii="Arial" w:hAnsi="Arial" w:cs="Arial"/>
-        </w:rPr>
-        <w:lastRenderedPageBreak/>
-        <w:t>trajectory,</w:t>
+        <w:t xml:space="preserve"> frequency values as a continuous trajectory,</w:t>
       </w:r>
       <w:r>
         <w:rPr>
@@ -16962,7 +16950,14 @@
         <w:rPr>
           <w:rFonts w:ascii="Arial" w:hAnsi="Arial" w:cs="Arial"/>
         </w:rPr>
-        <w:t xml:space="preserve"> version 2.7.1 considered frequency values to be evenly split across</w:t>
+        <w:t xml:space="preserve"> version </w:t>
+      </w:r>
+      <w:r>
+        <w:rPr>
+          <w:rFonts w:ascii="Arial" w:hAnsi="Arial" w:cs="Arial"/>
+        </w:rPr>
+        <w:lastRenderedPageBreak/>
+        <w:t>2.7.1 considered frequency values to be evenly split across</w:t>
       </w:r>
       <w:r>
         <w:rPr>
@@ -17064,44 +17059,356 @@
         <w:rPr>
           <w:rFonts w:ascii="Arial" w:hAnsi="Arial" w:cs="Arial"/>
         </w:rPr>
-        <w:t xml:space="preserve">To generate smoother frequency modulation patterns that better </w:t>
+        <w:t>To generate smoother frequency modulation patterns that better approximated animal vocalizations, we used</w:t>
+      </w:r>
+      <w:r>
+        <w:rPr>
+          <w:rFonts w:ascii="Arial" w:hAnsi="Arial" w:cs="Arial"/>
+        </w:rPr>
+        <w:t xml:space="preserve"> Loess </w:t>
+      </w:r>
+      <w:r>
+        <w:rPr>
+          <w:rFonts w:ascii="Arial" w:hAnsi="Arial" w:cs="Arial"/>
+        </w:rPr>
+        <w:t xml:space="preserve">or local polynomial regression </w:t>
+      </w:r>
+      <w:r>
+        <w:rPr>
+          <w:rFonts w:ascii="Arial" w:hAnsi="Arial" w:cs="Arial"/>
+        </w:rPr>
+        <w:t>interpolation</w:t>
+      </w:r>
+      <w:r>
+        <w:rPr>
+          <w:rFonts w:ascii="Arial" w:hAnsi="Arial" w:cs="Arial"/>
+        </w:rPr>
+        <w:t xml:space="preserve"> with a</w:t>
+      </w:r>
+      <w:r>
+        <w:rPr>
+          <w:rFonts w:ascii="Arial" w:hAnsi="Arial" w:cs="Arial"/>
+        </w:rPr>
+        <w:t xml:space="preserve"> “strong” amount of smoothing</w:t>
+      </w:r>
+      <w:r>
+        <w:rPr>
+          <w:rFonts w:ascii="Arial" w:hAnsi="Arial" w:cs="Arial"/>
+        </w:rPr>
+        <w:t xml:space="preserve"> </w:t>
+      </w:r>
+      <w:r>
+        <w:rPr>
+          <w:rFonts w:ascii="Arial" w:hAnsi="Arial" w:cs="Arial"/>
+        </w:rPr>
+        <w:t>(</w:t>
+      </w:r>
+      <w:r>
+        <w:rPr>
+          <w:rFonts w:ascii="Arial" w:hAnsi="Arial" w:cs="Arial"/>
+        </w:rPr>
+        <w:t>span of 1</w:t>
+      </w:r>
+      <w:r>
+        <w:rPr>
+          <w:rFonts w:ascii="Arial" w:hAnsi="Arial" w:cs="Arial"/>
+        </w:rPr>
+        <w:t>). We</w:t>
+      </w:r>
+      <w:r>
+        <w:rPr>
+          <w:rFonts w:ascii="Arial" w:hAnsi="Arial" w:cs="Arial"/>
+        </w:rPr>
+        <w:t xml:space="preserve"> </w:t>
+      </w:r>
+      <w:r>
+        <w:rPr>
+          <w:rFonts w:ascii="Arial" w:hAnsi="Arial" w:cs="Arial"/>
+        </w:rPr>
+        <w:t>turned off options for transitions between frequency anchors that were too close together (</w:t>
+      </w:r>
+      <w:proofErr w:type="spellStart"/>
+      <w:r>
+        <w:rPr>
+          <w:rFonts w:ascii="Arial" w:hAnsi="Arial" w:cs="Arial"/>
+        </w:rPr>
+        <w:t>discontThresh</w:t>
+      </w:r>
+      <w:proofErr w:type="spellEnd"/>
+      <w:r>
+        <w:rPr>
+          <w:rFonts w:ascii="Arial" w:hAnsi="Arial" w:cs="Arial"/>
+        </w:rPr>
+        <w:t xml:space="preserve"> and </w:t>
+      </w:r>
+      <w:proofErr w:type="spellStart"/>
+      <w:r>
+        <w:rPr>
+          <w:rFonts w:ascii="Arial" w:hAnsi="Arial" w:cs="Arial"/>
+        </w:rPr>
+        <w:t>jumpThresh</w:t>
+      </w:r>
+      <w:proofErr w:type="spellEnd"/>
+      <w:r>
+        <w:rPr>
+          <w:rFonts w:ascii="Arial" w:hAnsi="Arial" w:cs="Arial"/>
+        </w:rPr>
+        <w:t>), since we were using evenly spaced anchors.</w:t>
+      </w:r>
+      <w:r>
+        <w:rPr>
+          <w:rFonts w:ascii="Arial" w:hAnsi="Arial" w:cs="Arial"/>
+        </w:rPr>
+        <w:t xml:space="preserve"> We also allowed for up to 5 harmonics in synthetic vocalizations by setting 5 default amplitude values to the argument </w:t>
+      </w:r>
+      <w:proofErr w:type="spellStart"/>
+      <w:r>
+        <w:rPr>
+          <w:rFonts w:ascii="Arial" w:hAnsi="Arial" w:cs="Arial"/>
+        </w:rPr>
+        <w:t>rolloffExact</w:t>
+      </w:r>
+      <w:proofErr w:type="spellEnd"/>
+      <w:r>
+        <w:rPr>
+          <w:rFonts w:ascii="Arial" w:hAnsi="Arial" w:cs="Arial"/>
+        </w:rPr>
+        <w:t xml:space="preserve">. </w:t>
+      </w:r>
+      <w:r>
+        <w:rPr>
+          <w:rFonts w:ascii="Arial" w:hAnsi="Arial" w:cs="Arial"/>
+        </w:rPr>
+        <w:t xml:space="preserve">For our purposes, we wanted to encode identity information in </w:t>
+      </w:r>
+      <w:r>
+        <w:rPr>
+          <w:rFonts w:ascii="Arial" w:hAnsi="Arial" w:cs="Arial"/>
+        </w:rPr>
+        <w:t xml:space="preserve">frequency modulation patterns only, so we turned off formant generation </w:t>
+      </w:r>
+      <w:r>
+        <w:rPr>
+          <w:rFonts w:ascii="Arial" w:hAnsi="Arial" w:cs="Arial"/>
+        </w:rPr>
+        <w:t xml:space="preserve">specific to different vocal tract lengths by setting default values of NA to the formants and </w:t>
+      </w:r>
+      <w:proofErr w:type="spellStart"/>
+      <w:r>
+        <w:rPr>
+          <w:rFonts w:ascii="Arial" w:hAnsi="Arial" w:cs="Arial"/>
+        </w:rPr>
+        <w:t>vocalTract</w:t>
+      </w:r>
+      <w:proofErr w:type="spellEnd"/>
+      <w:r>
+        <w:rPr>
+          <w:rFonts w:ascii="Arial" w:hAnsi="Arial" w:cs="Arial"/>
+        </w:rPr>
+        <w:t xml:space="preserve"> arguments. </w:t>
+      </w:r>
+      <w:r>
+        <w:rPr>
+          <w:rFonts w:ascii="Arial" w:hAnsi="Arial" w:cs="Arial"/>
+        </w:rPr>
+        <w:t xml:space="preserve">We also </w:t>
+      </w:r>
+      <w:r>
+        <w:rPr>
+          <w:rFonts w:ascii="Arial" w:hAnsi="Arial" w:cs="Arial"/>
+        </w:rPr>
+        <w:t xml:space="preserve">used </w:t>
+      </w:r>
+      <w:r>
+        <w:rPr>
+          <w:rFonts w:ascii="Arial" w:hAnsi="Arial" w:cs="Arial"/>
+        </w:rPr>
+        <w:t>the default value</w:t>
+      </w:r>
+      <w:r>
+        <w:rPr>
+          <w:rFonts w:ascii="Arial" w:hAnsi="Arial" w:cs="Arial"/>
+        </w:rPr>
+        <w:t xml:space="preserve"> of 0.025</w:t>
+      </w:r>
+      <w:r>
+        <w:rPr>
+          <w:rFonts w:ascii="Arial" w:hAnsi="Arial" w:cs="Arial"/>
+        </w:rPr>
+        <w:t xml:space="preserve"> for </w:t>
+      </w:r>
+      <w:proofErr w:type="spellStart"/>
+      <w:r>
+        <w:rPr>
+          <w:rFonts w:ascii="Arial" w:hAnsi="Arial" w:cs="Arial"/>
+        </w:rPr>
+        <w:t>soundgen’s</w:t>
+      </w:r>
+      <w:proofErr w:type="spellEnd"/>
+      <w:r>
+        <w:rPr>
+          <w:rFonts w:ascii="Arial" w:hAnsi="Arial" w:cs="Arial"/>
+        </w:rPr>
+        <w:t xml:space="preserve"> hyperparameter for varying stochasticity in sound generation</w:t>
+      </w:r>
+      <w:r>
+        <w:rPr>
+          <w:rFonts w:ascii="Arial" w:hAnsi="Arial" w:cs="Arial"/>
+        </w:rPr>
+        <w:t>.</w:t>
+      </w:r>
+      <w:r>
+        <w:rPr>
+          <w:rFonts w:ascii="Arial" w:hAnsi="Arial" w:cs="Arial"/>
+        </w:rPr>
+        <w:t xml:space="preserve"> In preliminary analyses, we found that retaining this stochasticity in sound generation was important to avoid creating duplicated audio files</w:t>
+      </w:r>
+      <w:r>
+        <w:rPr>
+          <w:rFonts w:ascii="Arial" w:hAnsi="Arial" w:cs="Arial"/>
+        </w:rPr>
+        <w:t xml:space="preserve"> for different vocalizations</w:t>
+      </w:r>
+      <w:r>
+        <w:rPr>
+          <w:rFonts w:ascii="Arial" w:hAnsi="Arial" w:cs="Arial"/>
+        </w:rPr>
+        <w:t>, which can occur when the same random variation string is sampled within an individual.</w:t>
+      </w:r>
+      <w:r>
+        <w:rPr>
+          <w:rFonts w:ascii="Arial" w:hAnsi="Arial" w:cs="Arial"/>
+        </w:rPr>
+        <w:t xml:space="preserve"> In other words, using </w:t>
+      </w:r>
+      <w:proofErr w:type="spellStart"/>
+      <w:r>
+        <w:rPr>
+          <w:rFonts w:ascii="Arial" w:hAnsi="Arial" w:cs="Arial"/>
+        </w:rPr>
+        <w:t>soundgen’s</w:t>
+      </w:r>
+      <w:proofErr w:type="spellEnd"/>
+      <w:r>
+        <w:rPr>
+          <w:rFonts w:ascii="Arial" w:hAnsi="Arial" w:cs="Arial"/>
+        </w:rPr>
+        <w:t xml:space="preserve"> stochasticity in sound generation facilitates generating different audio files for different vocalizations attributed to the same individual, even when </w:t>
+      </w:r>
+      <w:r>
+        <w:rPr>
+          <w:rFonts w:ascii="Arial" w:hAnsi="Arial" w:cs="Arial"/>
+        </w:rPr>
+        <w:t xml:space="preserve">the character string is </w:t>
+      </w:r>
+      <w:proofErr w:type="gramStart"/>
+      <w:r>
+        <w:rPr>
+          <w:rFonts w:ascii="Arial" w:hAnsi="Arial" w:cs="Arial"/>
+        </w:rPr>
+        <w:t>exactly the same</w:t>
+      </w:r>
+      <w:proofErr w:type="gramEnd"/>
+      <w:r>
+        <w:rPr>
+          <w:rFonts w:ascii="Arial" w:hAnsi="Arial" w:cs="Arial"/>
+        </w:rPr>
+        <w:t>.</w:t>
+      </w:r>
+      <w:r>
+        <w:rPr>
+          <w:rFonts w:ascii="Arial" w:hAnsi="Arial" w:cs="Arial"/>
+        </w:rPr>
+        <w:t xml:space="preserve"> We used </w:t>
+      </w:r>
+      <w:r>
+        <w:rPr>
+          <w:rFonts w:ascii="Arial" w:hAnsi="Arial" w:cs="Arial"/>
+        </w:rPr>
+        <w:t xml:space="preserve">300 </w:t>
+      </w:r>
+      <w:proofErr w:type="spellStart"/>
+      <w:r>
+        <w:rPr>
+          <w:rFonts w:ascii="Arial" w:hAnsi="Arial" w:cs="Arial"/>
+        </w:rPr>
+        <w:t>ms</w:t>
+      </w:r>
+      <w:proofErr w:type="spellEnd"/>
+      <w:r>
+        <w:rPr>
+          <w:rFonts w:ascii="Arial" w:hAnsi="Arial" w:cs="Arial"/>
+        </w:rPr>
+        <w:t>, the</w:t>
+      </w:r>
+      <w:r>
+        <w:rPr>
+          <w:rFonts w:ascii="Arial" w:hAnsi="Arial" w:cs="Arial"/>
+        </w:rPr>
+        <w:t xml:space="preserve"> default value</w:t>
+      </w:r>
+      <w:r>
+        <w:rPr>
+          <w:rFonts w:ascii="Arial" w:hAnsi="Arial" w:cs="Arial"/>
+        </w:rPr>
+        <w:t xml:space="preserve"> in </w:t>
+      </w:r>
+      <w:proofErr w:type="spellStart"/>
+      <w:r>
+        <w:rPr>
+          <w:rFonts w:ascii="Arial" w:hAnsi="Arial" w:cs="Arial"/>
+        </w:rPr>
+        <w:t>soundgen</w:t>
+      </w:r>
+      <w:proofErr w:type="spellEnd"/>
+      <w:r>
+        <w:rPr>
+          <w:rFonts w:ascii="Arial" w:hAnsi="Arial" w:cs="Arial"/>
+        </w:rPr>
+        <w:t xml:space="preserve">, </w:t>
+      </w:r>
+      <w:r>
+        <w:rPr>
+          <w:rFonts w:ascii="Arial" w:hAnsi="Arial" w:cs="Arial"/>
+        </w:rPr>
+        <w:t>to specify the minimum signal epoch duration for formant locking or static subharmonics, in the case that formants were turned on.</w:t>
+      </w:r>
+      <w:r>
+        <w:rPr>
+          <w:rFonts w:ascii="Arial" w:hAnsi="Arial" w:cs="Arial"/>
+        </w:rPr>
+        <w:t xml:space="preserve"> We set the vibrato frequency</w:t>
+      </w:r>
+      <w:r>
+        <w:rPr>
+          <w:rFonts w:ascii="Arial" w:hAnsi="Arial" w:cs="Arial"/>
+        </w:rPr>
+        <w:t xml:space="preserve"> </w:t>
+      </w:r>
+      <w:r>
+        <w:rPr>
+          <w:rFonts w:ascii="Arial" w:hAnsi="Arial" w:cs="Arial"/>
+        </w:rPr>
+        <w:t xml:space="preserve">in Hz to 1, which was </w:t>
       </w:r>
       <w:r>
         <w:rPr>
           <w:rFonts w:ascii="Arial" w:hAnsi="Arial" w:cs="Arial"/>
         </w:rPr>
         <w:lastRenderedPageBreak/>
-        <w:t>approximated animal vocalizations, we used</w:t>
-      </w:r>
-      <w:r>
-        <w:rPr>
-          <w:rFonts w:ascii="Arial" w:hAnsi="Arial" w:cs="Arial"/>
-        </w:rPr>
-        <w:t xml:space="preserve"> Loess </w:t>
-      </w:r>
-      <w:r>
-        <w:rPr>
-          <w:rFonts w:ascii="Arial" w:hAnsi="Arial" w:cs="Arial"/>
-        </w:rPr>
-        <w:t xml:space="preserve">or local polynomial regression </w:t>
-      </w:r>
-      <w:r>
-        <w:rPr>
-          <w:rFonts w:ascii="Arial" w:hAnsi="Arial" w:cs="Arial"/>
-        </w:rPr>
-        <w:t>interpolation</w:t>
-      </w:r>
-      <w:r>
-        <w:rPr>
-          <w:rFonts w:ascii="Arial" w:hAnsi="Arial" w:cs="Arial"/>
-        </w:rPr>
-        <w:t xml:space="preserve"> with a</w:t>
-      </w:r>
-      <w:r>
-        <w:rPr>
-          <w:rFonts w:ascii="Arial" w:hAnsi="Arial" w:cs="Arial"/>
-        </w:rPr>
-        <w:t xml:space="preserve"> “strong” amount of smoothing</w:t>
+        <w:t>lower than the default of 5</w:t>
+      </w:r>
+      <w:r>
+        <w:rPr>
+          <w:rFonts w:ascii="Arial" w:hAnsi="Arial" w:cs="Arial"/>
+        </w:rPr>
+        <w:t>, to minimize the amount of regular pitch modulation across each vocalization</w:t>
+      </w:r>
+      <w:r>
+        <w:rPr>
+          <w:rFonts w:ascii="Arial" w:hAnsi="Arial" w:cs="Arial"/>
+        </w:rPr>
+        <w:t>.</w:t>
       </w:r>
       <w:r>
         <w:rPr>
@@ -17113,428 +17420,109 @@
         <w:rPr>
           <w:rFonts w:ascii="Arial" w:hAnsi="Arial" w:cs="Arial"/>
         </w:rPr>
-        <w:t>(</w:t>
-      </w:r>
-      <w:r>
-        <w:rPr>
-          <w:rFonts w:ascii="Arial" w:hAnsi="Arial" w:cs="Arial"/>
-        </w:rPr>
-        <w:t>span of 1</w:t>
-      </w:r>
-      <w:r>
-        <w:rPr>
-          <w:rFonts w:ascii="Arial" w:hAnsi="Arial" w:cs="Arial"/>
-        </w:rPr>
-        <w:t>). We</w:t>
-      </w:r>
-      <w:r>
-        <w:rPr>
-          <w:rFonts w:ascii="Arial" w:hAnsi="Arial" w:cs="Arial"/>
-        </w:rPr>
-        <w:t xml:space="preserve"> </w:t>
-      </w:r>
-      <w:r>
-        <w:rPr>
-          <w:rFonts w:ascii="Arial" w:hAnsi="Arial" w:cs="Arial"/>
-        </w:rPr>
-        <w:t>turned off options for transitions between frequency anchors that were too close together (</w:t>
+        <w:t>We wrote ou</w:t>
+      </w:r>
+      <w:r>
+        <w:rPr>
+          <w:rFonts w:ascii="Arial" w:hAnsi="Arial" w:cs="Arial"/>
+        </w:rPr>
+        <w:t>r</w:t>
+      </w:r>
+      <w:r>
+        <w:rPr>
+          <w:rFonts w:ascii="Arial" w:hAnsi="Arial" w:cs="Arial"/>
+        </w:rPr>
+        <w:t xml:space="preserve"> function so that these arguments can be </w:t>
+      </w:r>
+      <w:r>
+        <w:rPr>
+          <w:rFonts w:ascii="Arial" w:hAnsi="Arial" w:cs="Arial"/>
+        </w:rPr>
+        <w:t xml:space="preserve">updated </w:t>
+      </w:r>
+      <w:r>
+        <w:rPr>
+          <w:rFonts w:ascii="Arial" w:hAnsi="Arial" w:cs="Arial"/>
+        </w:rPr>
+        <w:t>with</w:t>
+      </w:r>
+      <w:r>
+        <w:rPr>
+          <w:rFonts w:ascii="Arial" w:hAnsi="Arial" w:cs="Arial"/>
+        </w:rPr>
+        <w:t xml:space="preserve"> the range of </w:t>
+      </w:r>
+      <w:r>
+        <w:rPr>
+          <w:rFonts w:ascii="Arial" w:hAnsi="Arial" w:cs="Arial"/>
+        </w:rPr>
+        <w:t xml:space="preserve">possible </w:t>
+      </w:r>
+      <w:r>
+        <w:rPr>
+          <w:rFonts w:ascii="Arial" w:hAnsi="Arial" w:cs="Arial"/>
+        </w:rPr>
+        <w:t xml:space="preserve">values specified by </w:t>
       </w:r>
       <w:proofErr w:type="spellStart"/>
       <w:r>
         <w:rPr>
           <w:rFonts w:ascii="Arial" w:hAnsi="Arial" w:cs="Arial"/>
         </w:rPr>
-        <w:t>discontThresh</w:t>
+        <w:t>soundge</w:t>
+      </w:r>
+      <w:r>
+        <w:rPr>
+          <w:rFonts w:ascii="Arial" w:hAnsi="Arial" w:cs="Arial"/>
+        </w:rPr>
+        <w:t>n</w:t>
       </w:r>
       <w:proofErr w:type="spellEnd"/>
       <w:r>
         <w:rPr>
           <w:rFonts w:ascii="Arial" w:hAnsi="Arial" w:cs="Arial"/>
         </w:rPr>
-        <w:t xml:space="preserve"> and </w:t>
+        <w:t>. W</w:t>
+      </w:r>
+      <w:r>
+        <w:rPr>
+          <w:rFonts w:ascii="Arial" w:hAnsi="Arial" w:cs="Arial"/>
+        </w:rPr>
+        <w:t xml:space="preserve">ith minimal code development by others, it is possible to add other </w:t>
       </w:r>
       <w:proofErr w:type="spellStart"/>
       <w:r>
         <w:rPr>
           <w:rFonts w:ascii="Arial" w:hAnsi="Arial" w:cs="Arial"/>
         </w:rPr>
-        <w:t>jumpThresh</w:t>
+        <w:t>soundgen</w:t>
       </w:r>
       <w:proofErr w:type="spellEnd"/>
       <w:r>
         <w:rPr>
           <w:rFonts w:ascii="Arial" w:hAnsi="Arial" w:cs="Arial"/>
         </w:rPr>
-        <w:t>), since we were using evenly spaced anchors.</w:t>
-      </w:r>
-      <w:r>
-        <w:rPr>
-          <w:rFonts w:ascii="Arial" w:hAnsi="Arial" w:cs="Arial"/>
-        </w:rPr>
-        <w:t xml:space="preserve"> We also allowed for up to 5 harmonics in synthetic vocalizations by setting 5 default amplitude values to the argument </w:t>
+        <w:t xml:space="preserve"> arguments for greater flexibility. </w:t>
+      </w:r>
+      <w:r>
+        <w:rPr>
+          <w:rFonts w:ascii="Arial" w:hAnsi="Arial" w:cs="Arial"/>
+        </w:rPr>
+        <w:t xml:space="preserve">The synthetic vocalizations produced using these original arguments from the </w:t>
       </w:r>
       <w:proofErr w:type="spellStart"/>
       <w:r>
         <w:rPr>
           <w:rFonts w:ascii="Arial" w:hAnsi="Arial" w:cs="Arial"/>
         </w:rPr>
-        <w:t>rolloffExact</w:t>
+        <w:t>soundgen</w:t>
       </w:r>
       <w:proofErr w:type="spellEnd"/>
       <w:r>
         <w:rPr>
           <w:rFonts w:ascii="Arial" w:hAnsi="Arial" w:cs="Arial"/>
         </w:rPr>
-        <w:t xml:space="preserve">. </w:t>
-      </w:r>
-      <w:r>
-        <w:rPr>
-          <w:rFonts w:ascii="Arial" w:hAnsi="Arial" w:cs="Arial"/>
-        </w:rPr>
-        <w:t xml:space="preserve">For our purposes, we wanted to encode identity information in </w:t>
-      </w:r>
-      <w:r>
-        <w:rPr>
-          <w:rFonts w:ascii="Arial" w:hAnsi="Arial" w:cs="Arial"/>
-        </w:rPr>
-        <w:t xml:space="preserve">frequency modulation patterns only, so we turned off formant generation </w:t>
-      </w:r>
-      <w:r>
-        <w:rPr>
-          <w:rFonts w:ascii="Arial" w:hAnsi="Arial" w:cs="Arial"/>
-        </w:rPr>
-        <w:t xml:space="preserve">specific to different vocal tract lengths by setting default values of NA to the formants and </w:t>
-      </w:r>
-      <w:proofErr w:type="spellStart"/>
-      <w:r>
-        <w:rPr>
-          <w:rFonts w:ascii="Arial" w:hAnsi="Arial" w:cs="Arial"/>
-        </w:rPr>
-        <w:t>vocalTract</w:t>
-      </w:r>
-      <w:proofErr w:type="spellEnd"/>
-      <w:r>
-        <w:rPr>
-          <w:rFonts w:ascii="Arial" w:hAnsi="Arial" w:cs="Arial"/>
-        </w:rPr>
-        <w:t xml:space="preserve"> arguments. </w:t>
-      </w:r>
-      <w:r>
-        <w:rPr>
-          <w:rFonts w:ascii="Arial" w:hAnsi="Arial" w:cs="Arial"/>
-        </w:rPr>
-        <w:t xml:space="preserve">We also </w:t>
-      </w:r>
-      <w:r>
-        <w:rPr>
-          <w:rFonts w:ascii="Arial" w:hAnsi="Arial" w:cs="Arial"/>
-        </w:rPr>
-        <w:t xml:space="preserve">used </w:t>
-      </w:r>
-      <w:r>
-        <w:rPr>
-          <w:rFonts w:ascii="Arial" w:hAnsi="Arial" w:cs="Arial"/>
-        </w:rPr>
-        <w:t>the default value</w:t>
-      </w:r>
-      <w:r>
-        <w:rPr>
-          <w:rFonts w:ascii="Arial" w:hAnsi="Arial" w:cs="Arial"/>
-        </w:rPr>
-        <w:t xml:space="preserve"> of 0.025</w:t>
-      </w:r>
-      <w:r>
-        <w:rPr>
-          <w:rFonts w:ascii="Arial" w:hAnsi="Arial" w:cs="Arial"/>
-        </w:rPr>
-        <w:t xml:space="preserve"> for </w:t>
-      </w:r>
-      <w:proofErr w:type="spellStart"/>
-      <w:r>
-        <w:rPr>
-          <w:rFonts w:ascii="Arial" w:hAnsi="Arial" w:cs="Arial"/>
-        </w:rPr>
-        <w:t>soundgen’s</w:t>
-      </w:r>
-      <w:proofErr w:type="spellEnd"/>
-      <w:r>
-        <w:rPr>
-          <w:rFonts w:ascii="Arial" w:hAnsi="Arial" w:cs="Arial"/>
-        </w:rPr>
-        <w:t xml:space="preserve"> hyperparameter for varying stochasticity in sound generation</w:t>
-      </w:r>
-      <w:r>
-        <w:rPr>
-          <w:rFonts w:ascii="Arial" w:hAnsi="Arial" w:cs="Arial"/>
-        </w:rPr>
-        <w:t>.</w:t>
-      </w:r>
-      <w:r>
-        <w:rPr>
-          <w:rFonts w:ascii="Arial" w:hAnsi="Arial" w:cs="Arial"/>
-        </w:rPr>
-        <w:t xml:space="preserve"> In preliminary analyses, we found that retaining this stochasticity in sound generation was important to avoid creating duplicated audio files</w:t>
-      </w:r>
-      <w:r>
-        <w:rPr>
-          <w:rFonts w:ascii="Arial" w:hAnsi="Arial" w:cs="Arial"/>
-        </w:rPr>
-        <w:t xml:space="preserve"> for different vocalizations</w:t>
-      </w:r>
-      <w:r>
-        <w:rPr>
-          <w:rFonts w:ascii="Arial" w:hAnsi="Arial" w:cs="Arial"/>
-        </w:rPr>
-        <w:t>, which can occur when the same random variation string is sampled within an individual.</w:t>
-      </w:r>
-      <w:r>
-        <w:rPr>
-          <w:rFonts w:ascii="Arial" w:hAnsi="Arial" w:cs="Arial"/>
-        </w:rPr>
-        <w:t xml:space="preserve"> In other words, using </w:t>
-      </w:r>
-      <w:proofErr w:type="spellStart"/>
-      <w:r>
-        <w:rPr>
-          <w:rFonts w:ascii="Arial" w:hAnsi="Arial" w:cs="Arial"/>
-        </w:rPr>
-        <w:t>soundgen’s</w:t>
-      </w:r>
-      <w:proofErr w:type="spellEnd"/>
-      <w:r>
-        <w:rPr>
-          <w:rFonts w:ascii="Arial" w:hAnsi="Arial" w:cs="Arial"/>
-        </w:rPr>
-        <w:t xml:space="preserve"> stochasticity in sound generation facilitates generating different audio files for different vocalizations attributed to the same individual, even when </w:t>
-      </w:r>
-      <w:r>
-        <w:rPr>
-          <w:rFonts w:ascii="Arial" w:hAnsi="Arial" w:cs="Arial"/>
-        </w:rPr>
-        <w:t xml:space="preserve">the character string is </w:t>
-      </w:r>
-      <w:proofErr w:type="gramStart"/>
-      <w:r>
-        <w:rPr>
-          <w:rFonts w:ascii="Arial" w:hAnsi="Arial" w:cs="Arial"/>
-        </w:rPr>
-        <w:t>exactly the same</w:t>
-      </w:r>
-      <w:proofErr w:type="gramEnd"/>
-      <w:r>
-        <w:rPr>
-          <w:rFonts w:ascii="Arial" w:hAnsi="Arial" w:cs="Arial"/>
-        </w:rPr>
-        <w:t>.</w:t>
-      </w:r>
-      <w:r>
-        <w:rPr>
-          <w:rFonts w:ascii="Arial" w:hAnsi="Arial" w:cs="Arial"/>
-        </w:rPr>
-        <w:t xml:space="preserve"> We used </w:t>
-      </w:r>
-      <w:r>
-        <w:rPr>
-          <w:rFonts w:ascii="Arial" w:hAnsi="Arial" w:cs="Arial"/>
-        </w:rPr>
-        <w:t xml:space="preserve">300 </w:t>
-      </w:r>
-      <w:proofErr w:type="spellStart"/>
-      <w:r>
-        <w:rPr>
-          <w:rFonts w:ascii="Arial" w:hAnsi="Arial" w:cs="Arial"/>
-        </w:rPr>
-        <w:t>ms</w:t>
-      </w:r>
-      <w:proofErr w:type="spellEnd"/>
-      <w:r>
-        <w:rPr>
-          <w:rFonts w:ascii="Arial" w:hAnsi="Arial" w:cs="Arial"/>
-        </w:rPr>
-        <w:t>, the</w:t>
-      </w:r>
-      <w:r>
-        <w:rPr>
-          <w:rFonts w:ascii="Arial" w:hAnsi="Arial" w:cs="Arial"/>
-        </w:rPr>
-        <w:t xml:space="preserve"> default value</w:t>
-      </w:r>
-      <w:r>
-        <w:rPr>
-          <w:rFonts w:ascii="Arial" w:hAnsi="Arial" w:cs="Arial"/>
-        </w:rPr>
-        <w:t xml:space="preserve"> in </w:t>
-      </w:r>
-      <w:proofErr w:type="spellStart"/>
-      <w:r>
-        <w:rPr>
-          <w:rFonts w:ascii="Arial" w:hAnsi="Arial" w:cs="Arial"/>
-        </w:rPr>
-        <w:t>soundgen</w:t>
-      </w:r>
-      <w:proofErr w:type="spellEnd"/>
-      <w:r>
-        <w:rPr>
-          <w:rFonts w:ascii="Arial" w:hAnsi="Arial" w:cs="Arial"/>
-        </w:rPr>
-        <w:t xml:space="preserve">, </w:t>
-      </w:r>
-      <w:r>
-        <w:rPr>
-          <w:rFonts w:ascii="Arial" w:hAnsi="Arial" w:cs="Arial"/>
-        </w:rPr>
-        <w:t>to specify the minimum signal epoch duration for formant locking or static subharmonics, in the case that formants were turned on.</w:t>
-      </w:r>
-      <w:r>
-        <w:rPr>
-          <w:rFonts w:ascii="Arial" w:hAnsi="Arial" w:cs="Arial"/>
-        </w:rPr>
-        <w:t xml:space="preserve"> We set the vibrato frequency</w:t>
-      </w:r>
-      <w:r>
-        <w:rPr>
-          <w:rFonts w:ascii="Arial" w:hAnsi="Arial" w:cs="Arial"/>
-        </w:rPr>
-        <w:t xml:space="preserve"> </w:t>
-      </w:r>
-      <w:r>
-        <w:rPr>
-          <w:rFonts w:ascii="Arial" w:hAnsi="Arial" w:cs="Arial"/>
-        </w:rPr>
-        <w:t>in Hz to 1, which was lower than the default of 5</w:t>
-      </w:r>
-      <w:r>
-        <w:rPr>
-          <w:rFonts w:ascii="Arial" w:hAnsi="Arial" w:cs="Arial"/>
-        </w:rPr>
-        <w:t>, to minimize the amount of regular pitch modulation across each vocalization</w:t>
-      </w:r>
-      <w:r>
-        <w:rPr>
-          <w:rFonts w:ascii="Arial" w:hAnsi="Arial" w:cs="Arial"/>
-        </w:rPr>
-        <w:t>.</w:t>
-      </w:r>
-      <w:r>
-        <w:rPr>
-          <w:rFonts w:ascii="Arial" w:hAnsi="Arial" w:cs="Arial"/>
-        </w:rPr>
-        <w:t xml:space="preserve"> </w:t>
-      </w:r>
-      <w:r>
-        <w:rPr>
-          <w:rFonts w:ascii="Arial" w:hAnsi="Arial" w:cs="Arial"/>
-        </w:rPr>
-        <w:t>We wrote ou</w:t>
-      </w:r>
-      <w:r>
-        <w:rPr>
-          <w:rFonts w:ascii="Arial" w:hAnsi="Arial" w:cs="Arial"/>
-        </w:rPr>
-        <w:t>r</w:t>
-      </w:r>
-      <w:r>
-        <w:rPr>
-          <w:rFonts w:ascii="Arial" w:hAnsi="Arial" w:cs="Arial"/>
-        </w:rPr>
-        <w:t xml:space="preserve"> function so that these arguments can be </w:t>
-      </w:r>
-      <w:r>
-        <w:rPr>
-          <w:rFonts w:ascii="Arial" w:hAnsi="Arial" w:cs="Arial"/>
-        </w:rPr>
-        <w:t xml:space="preserve">updated </w:t>
-      </w:r>
-      <w:r>
-        <w:rPr>
-          <w:rFonts w:ascii="Arial" w:hAnsi="Arial" w:cs="Arial"/>
-        </w:rPr>
-        <w:t>with</w:t>
-      </w:r>
-      <w:r>
-        <w:rPr>
-          <w:rFonts w:ascii="Arial" w:hAnsi="Arial" w:cs="Arial"/>
-        </w:rPr>
-        <w:t xml:space="preserve"> the range of </w:t>
-      </w:r>
-      <w:r>
-        <w:rPr>
-          <w:rFonts w:ascii="Arial" w:hAnsi="Arial" w:cs="Arial"/>
-        </w:rPr>
-        <w:t xml:space="preserve">possible </w:t>
-      </w:r>
-      <w:r>
-        <w:rPr>
-          <w:rFonts w:ascii="Arial" w:hAnsi="Arial" w:cs="Arial"/>
-        </w:rPr>
-        <w:t xml:space="preserve">values specified by </w:t>
-      </w:r>
-      <w:proofErr w:type="spellStart"/>
-      <w:r>
-        <w:rPr>
-          <w:rFonts w:ascii="Arial" w:hAnsi="Arial" w:cs="Arial"/>
-        </w:rPr>
-        <w:t>soundge</w:t>
-      </w:r>
-      <w:r>
-        <w:rPr>
-          <w:rFonts w:ascii="Arial" w:hAnsi="Arial" w:cs="Arial"/>
-        </w:rPr>
-        <w:t>n</w:t>
-      </w:r>
-      <w:proofErr w:type="spellEnd"/>
-      <w:r>
-        <w:rPr>
-          <w:rFonts w:ascii="Arial" w:hAnsi="Arial" w:cs="Arial"/>
-        </w:rPr>
-        <w:t>. W</w:t>
-      </w:r>
-      <w:r>
-        <w:rPr>
-          <w:rFonts w:ascii="Arial" w:hAnsi="Arial" w:cs="Arial"/>
-        </w:rPr>
-        <w:t xml:space="preserve">ith minimal code development by others, it is possible to add other </w:t>
-      </w:r>
-      <w:proofErr w:type="spellStart"/>
-      <w:r>
-        <w:rPr>
-          <w:rFonts w:ascii="Arial" w:hAnsi="Arial" w:cs="Arial"/>
-        </w:rPr>
-        <w:t>soundgen</w:t>
-      </w:r>
-      <w:proofErr w:type="spellEnd"/>
-      <w:r>
-        <w:rPr>
-          <w:rFonts w:ascii="Arial" w:hAnsi="Arial" w:cs="Arial"/>
-        </w:rPr>
-        <w:t xml:space="preserve"> arguments for greater flexibility. </w:t>
-      </w:r>
-      <w:r>
-        <w:rPr>
-          <w:rFonts w:ascii="Arial" w:hAnsi="Arial" w:cs="Arial"/>
-        </w:rPr>
-        <w:t xml:space="preserve">The synthetic vocalizations produced using these original arguments from the </w:t>
-      </w:r>
-      <w:proofErr w:type="spellStart"/>
-      <w:r>
-        <w:rPr>
-          <w:rFonts w:ascii="Arial" w:hAnsi="Arial" w:cs="Arial"/>
-        </w:rPr>
-        <w:t>soundgen</w:t>
-      </w:r>
-      <w:proofErr w:type="spellEnd"/>
-      <w:r>
-        <w:rPr>
-          <w:rFonts w:ascii="Arial" w:hAnsi="Arial" w:cs="Arial"/>
-        </w:rPr>
-        <w:t xml:space="preserve"> </w:t>
-      </w:r>
-      <w:r>
-        <w:rPr>
-          <w:rFonts w:ascii="Arial" w:hAnsi="Arial" w:cs="Arial"/>
-        </w:rPr>
-        <w:lastRenderedPageBreak/>
-        <w:t>package were written out as audio files</w:t>
+        <w:t xml:space="preserve"> package were written out as audio files</w:t>
       </w:r>
       <w:r>
         <w:rPr>
@@ -17858,7 +17846,14 @@
         <w:rPr>
           <w:rFonts w:ascii="Arial" w:hAnsi="Arial" w:cs="Arial"/>
         </w:rPr>
-        <w:t xml:space="preserve">We controlled the size of the resulting signal datasets such that each dataset contained </w:t>
+        <w:t xml:space="preserve">We controlled the size of the resulting </w:t>
+      </w:r>
+      <w:r>
+        <w:rPr>
+          <w:rFonts w:ascii="Arial" w:hAnsi="Arial" w:cs="Arial"/>
+        </w:rPr>
+        <w:lastRenderedPageBreak/>
+        <w:t xml:space="preserve">signal datasets such that each dataset contained </w:t>
       </w:r>
       <w:r>
         <w:rPr>
@@ -17917,14 +17912,7 @@
         <w:rPr>
           <w:rFonts w:ascii="Arial" w:hAnsi="Arial" w:cs="Arial"/>
         </w:rPr>
-        <w:t xml:space="preserve"> our pipeline facilitated controlling the amount of information encoded at both the group and individual levels, we expected that the uniqueness of identity information would be influenced by the generative process that we used to create group and individual information. As we randomly selected character strings to represent </w:t>
-      </w:r>
-      <w:r>
-        <w:rPr>
-          <w:rFonts w:ascii="Arial" w:hAnsi="Arial" w:cs="Arial"/>
-        </w:rPr>
-        <w:lastRenderedPageBreak/>
-        <w:t xml:space="preserve">information at either social level, we did not expect that group or individual information would be fully unique amongst groups or individuals, respectively, across a given dataset. Instead, identity information could be stochastically similar amongst classes at either social level </w:t>
+        <w:t xml:space="preserve"> our pipeline facilitated controlling the amount of information encoded at both the group and individual levels, we expected that the uniqueness of identity information would be influenced by the generative process that we used to create group and individual information. As we randomly selected character strings to represent information at either social level, we did not expect that group or individual information would be fully unique amongst groups or individuals, respectively, across a given dataset. Instead, identity information could be stochastically similar amongst classes at either social level </w:t>
       </w:r>
       <w:proofErr w:type="gramStart"/>
       <w:r>
@@ -18211,7 +18199,14 @@
         <w:rPr>
           <w:rFonts w:ascii="Arial" w:hAnsi="Arial" w:cs="Arial"/>
         </w:rPr>
-        <w:t xml:space="preserve">create an audio file for each </w:t>
+        <w:t xml:space="preserve">create an audio file </w:t>
+      </w:r>
+      <w:r>
+        <w:rPr>
+          <w:rFonts w:ascii="Arial" w:hAnsi="Arial" w:cs="Arial"/>
+        </w:rPr>
+        <w:lastRenderedPageBreak/>
+        <w:t xml:space="preserve">for each </w:t>
       </w:r>
       <w:r>
         <w:rPr>
@@ -18329,14 +18324,7 @@
         <w:rPr>
           <w:rFonts w:ascii="Arial" w:hAnsi="Arial" w:cs="Arial"/>
         </w:rPr>
-        <w:t xml:space="preserve">an analytical pipeline described </w:t>
-      </w:r>
-      <w:r>
-        <w:rPr>
-          <w:rFonts w:ascii="Arial" w:hAnsi="Arial" w:cs="Arial"/>
-        </w:rPr>
-        <w:lastRenderedPageBreak/>
-        <w:t>below</w:t>
+        <w:t>an analytical pipeline described below</w:t>
       </w:r>
       <w:r>
         <w:rPr>
@@ -18840,7 +18828,14 @@
         <w:rPr>
           <w:rFonts w:ascii="Arial" w:hAnsi="Arial" w:cs="Arial"/>
         </w:rPr>
-        <w:t xml:space="preserve"> edit distance</w:t>
+        <w:t xml:space="preserve"> </w:t>
+      </w:r>
+      <w:r>
+        <w:rPr>
+          <w:rFonts w:ascii="Arial" w:hAnsi="Arial" w:cs="Arial"/>
+        </w:rPr>
+        <w:lastRenderedPageBreak/>
+        <w:t>edit distance</w:t>
       </w:r>
       <w:r>
         <w:rPr>
@@ -19081,14 +19076,7 @@
         <w:rPr>
           <w:rFonts w:ascii="Arial" w:hAnsi="Arial" w:cs="Arial"/>
         </w:rPr>
-        <w:t xml:space="preserve"> a window length of 512 samples, an overlap </w:t>
-      </w:r>
-      <w:r>
-        <w:rPr>
-          <w:rFonts w:ascii="Arial" w:hAnsi="Arial" w:cs="Arial"/>
-        </w:rPr>
-        <w:lastRenderedPageBreak/>
-        <w:t>between consecutive windows of 90%, a Hanning window</w:t>
+        <w:t xml:space="preserve"> a window length of 512 samples, an overlap between consecutive windows of 90%, a Hanning window</w:t>
       </w:r>
       <w:commentRangeEnd w:id="80"/>
       <w:r>
@@ -19482,7 +19470,14 @@
         <w:rPr>
           <w:rFonts w:ascii="Arial" w:hAnsi="Arial" w:cs="Arial"/>
         </w:rPr>
-        <w:t xml:space="preserve">and visualizations </w:t>
+        <w:t xml:space="preserve">and </w:t>
+      </w:r>
+      <w:r>
+        <w:rPr>
+          <w:rFonts w:ascii="Arial" w:hAnsi="Arial" w:cs="Arial"/>
+        </w:rPr>
+        <w:lastRenderedPageBreak/>
+        <w:t xml:space="preserve">visualizations </w:t>
       </w:r>
       <w:r>
         <w:rPr>
@@ -19620,356 +19615,356 @@
         <w:rPr>
           <w:rFonts w:ascii="Arial" w:hAnsi="Arial" w:cs="Arial"/>
         </w:rPr>
-        <w:t>low-</w:t>
+        <w:t>low-dimensional solution</w:t>
+      </w:r>
+      <w:r>
+        <w:rPr>
+          <w:rFonts w:ascii="Arial" w:hAnsi="Arial" w:cs="Arial"/>
+        </w:rPr>
+        <w:t xml:space="preserve"> with </w:t>
+      </w:r>
+      <w:r>
+        <w:rPr>
+          <w:rFonts w:ascii="Arial" w:hAnsi="Arial" w:cs="Arial"/>
+        </w:rPr>
+        <w:t>15</w:t>
+      </w:r>
+      <w:r>
+        <w:rPr>
+          <w:rFonts w:ascii="Arial" w:hAnsi="Arial" w:cs="Arial"/>
+        </w:rPr>
+        <w:t xml:space="preserve"> dimensions. </w:t>
+      </w:r>
+      <w:r>
+        <w:rPr>
+          <w:rFonts w:ascii="Arial" w:hAnsi="Arial" w:cs="Arial"/>
+        </w:rPr>
+        <w:t xml:space="preserve">We used 15 dimensions to reduce the stress of the resulting optimal solution to 5% or less </w:t>
+      </w:r>
+      <w:r>
+        <w:rPr>
+          <w:rFonts w:ascii="Arial" w:hAnsi="Arial" w:cs="Arial"/>
+        </w:rPr>
+        <w:fldChar w:fldCharType="begin"/>
+      </w:r>
+      <w:r>
+        <w:rPr>
+          <w:rFonts w:ascii="Arial" w:hAnsi="Arial" w:cs="Arial"/>
+        </w:rPr>
+        <w:instrText xml:space="preserve"> ADDIN ZOTERO_ITEM CSL_CITATION {"citationID":"sOQUgqmx","properties":{"formattedCitation":"(40)","plainCitation":"(40)","noteIndex":0},"citationItems":[{"id":852,"uris":["http://zotero.org/groups/5786507/items/ERUU9SXP"],"itemData":{"id":852,"type":"article-journal","abstract":"We describe the numerical methods required in our approach to multi-dimensional scaling. The rationale of this approach has appeared previously. © 1964 Psychometric Society.","container-title":"Psychometrika","DOI":"10.1007/BF02289694","ISSN":"00333123","issue":"2","page":"115-129","title":"Nonmetric multidimensional scaling: A numerical method","volume":"29","author":[{"family":"Kruskal","given":"J.B."}],"issued":{"date-parts":[["1964"]]}}}],"schema":"https://github.com/citation-style-language/schema/raw/master/csl-citation.json"} </w:instrText>
+      </w:r>
+      <w:r>
+        <w:rPr>
+          <w:rFonts w:ascii="Arial" w:hAnsi="Arial" w:cs="Arial"/>
+        </w:rPr>
+        <w:fldChar w:fldCharType="separate"/>
+      </w:r>
+      <w:r>
+        <w:rPr>
+          <w:rFonts w:ascii="Arial" w:hAnsi="Arial" w:cs="Arial"/>
+        </w:rPr>
+        <w:t>(40)</w:t>
+      </w:r>
+      <w:r>
+        <w:rPr>
+          <w:rFonts w:ascii="Arial" w:hAnsi="Arial" w:cs="Arial"/>
+        </w:rPr>
+        <w:fldChar w:fldCharType="end"/>
+      </w:r>
+      <w:r>
+        <w:rPr>
+          <w:rFonts w:ascii="Arial" w:hAnsi="Arial" w:cs="Arial"/>
+        </w:rPr>
+        <w:t xml:space="preserve">. </w:t>
+      </w:r>
+      <w:r>
+        <w:rPr>
+          <w:rFonts w:ascii="Arial" w:hAnsi="Arial" w:cs="Arial"/>
+        </w:rPr>
+        <w:t>We performed multidimensional scaling on both the edit distance and SPCC matrices</w:t>
+      </w:r>
+      <w:r>
+        <w:rPr>
+          <w:rFonts w:ascii="Arial" w:hAnsi="Arial" w:cs="Arial"/>
+        </w:rPr>
+        <w:t xml:space="preserve"> </w:t>
+      </w:r>
+      <w:r>
+        <w:rPr>
+          <w:rFonts w:ascii="Arial" w:hAnsi="Arial" w:cs="Arial"/>
+        </w:rPr>
+        <w:t xml:space="preserve">to visualize patterns of variation for each representation of the synthetic </w:t>
+      </w:r>
+      <w:r>
+        <w:rPr>
+          <w:rFonts w:ascii="Arial" w:hAnsi="Arial" w:cs="Arial"/>
+        </w:rPr>
+        <w:t>vocalizations</w:t>
+      </w:r>
+      <w:r>
+        <w:rPr>
+          <w:rFonts w:ascii="Arial" w:hAnsi="Arial" w:cs="Arial"/>
+        </w:rPr>
+        <w:t xml:space="preserve"> (character strings and vocalizations, respectively).</w:t>
+      </w:r>
+      <w:r>
+        <w:rPr>
+          <w:rFonts w:ascii="Arial" w:hAnsi="Arial" w:cs="Arial"/>
+        </w:rPr>
+        <w:t xml:space="preserve"> </w:t>
+      </w:r>
+      <w:r>
+        <w:rPr>
+          <w:rFonts w:ascii="Arial" w:hAnsi="Arial" w:cs="Arial"/>
+        </w:rPr>
+        <w:t xml:space="preserve">To perform multidimensional scaling with the SPCC matrix, we </w:t>
+      </w:r>
+      <w:r>
+        <w:rPr>
+          <w:rFonts w:ascii="Arial" w:hAnsi="Arial" w:cs="Arial"/>
+        </w:rPr>
+        <w:t xml:space="preserve">first </w:t>
+      </w:r>
+      <w:r>
+        <w:rPr>
+          <w:rFonts w:ascii="Arial" w:hAnsi="Arial" w:cs="Arial"/>
+        </w:rPr>
+        <w:t xml:space="preserve">subtracted this matrix from 1 to yield distance values. </w:t>
+      </w:r>
+      <w:r>
+        <w:rPr>
+          <w:rFonts w:ascii="Arial" w:hAnsi="Arial" w:cs="Arial"/>
+        </w:rPr>
+        <w:t xml:space="preserve">We used the first two dimensions of each </w:t>
+      </w:r>
+      <w:r>
+        <w:rPr>
+          <w:rFonts w:ascii="Arial" w:hAnsi="Arial" w:cs="Arial"/>
+        </w:rPr>
+        <w:t xml:space="preserve">optimal </w:t>
+      </w:r>
+      <w:r>
+        <w:rPr>
+          <w:rFonts w:ascii="Arial" w:hAnsi="Arial" w:cs="Arial"/>
+        </w:rPr>
+        <w:t xml:space="preserve">multidimensional scaling </w:t>
+      </w:r>
+      <w:r>
+        <w:rPr>
+          <w:rFonts w:ascii="Arial" w:hAnsi="Arial" w:cs="Arial"/>
+        </w:rPr>
+        <w:t xml:space="preserve">solution to generate </w:t>
+      </w:r>
+      <w:r>
+        <w:rPr>
+          <w:rFonts w:ascii="Arial" w:hAnsi="Arial" w:cs="Arial"/>
+        </w:rPr>
+        <w:t xml:space="preserve">acoustic </w:t>
+      </w:r>
+      <w:r>
+        <w:rPr>
+          <w:rFonts w:ascii="Arial" w:hAnsi="Arial" w:cs="Arial"/>
+        </w:rPr>
+        <w:t>space visualizations. In each of these</w:t>
+      </w:r>
+      <w:r>
+        <w:rPr>
+          <w:rFonts w:ascii="Arial" w:hAnsi="Arial" w:cs="Arial"/>
+        </w:rPr>
+        <w:t xml:space="preserve"> acoustic</w:t>
+      </w:r>
+      <w:r>
+        <w:rPr>
+          <w:rFonts w:ascii="Arial" w:hAnsi="Arial" w:cs="Arial"/>
+        </w:rPr>
+        <w:t xml:space="preserve"> space</w:t>
+      </w:r>
+      <w:r>
+        <w:rPr>
+          <w:rFonts w:ascii="Arial" w:hAnsi="Arial" w:cs="Arial"/>
+        </w:rPr>
+        <w:t xml:space="preserve"> plot</w:t>
+      </w:r>
+      <w:r>
+        <w:rPr>
+          <w:rFonts w:ascii="Arial" w:hAnsi="Arial" w:cs="Arial"/>
+        </w:rPr>
+        <w:t xml:space="preserve">s, </w:t>
+      </w:r>
+      <w:r>
+        <w:rPr>
+          <w:rFonts w:ascii="Arial" w:hAnsi="Arial" w:cs="Arial"/>
+        </w:rPr>
+        <w:t>vocalizations that are structurally similar are closer together</w:t>
+      </w:r>
+      <w:r>
+        <w:rPr>
+          <w:rFonts w:ascii="Arial" w:hAnsi="Arial" w:cs="Arial"/>
+        </w:rPr>
+        <w:t xml:space="preserve"> or concentrated</w:t>
+      </w:r>
+      <w:r>
+        <w:rPr>
+          <w:rFonts w:ascii="Arial" w:hAnsi="Arial" w:cs="Arial"/>
+        </w:rPr>
+        <w:t xml:space="preserve"> in space, whi</w:t>
+      </w:r>
+      <w:r>
+        <w:rPr>
+          <w:rFonts w:ascii="Arial" w:hAnsi="Arial" w:cs="Arial"/>
+        </w:rPr>
+        <w:t>le</w:t>
+      </w:r>
+      <w:r>
+        <w:rPr>
+          <w:rFonts w:ascii="Arial" w:hAnsi="Arial" w:cs="Arial"/>
+        </w:rPr>
+        <w:t xml:space="preserve"> those that are structurally different are farther apart</w:t>
+      </w:r>
+      <w:r>
+        <w:rPr>
+          <w:rFonts w:ascii="Arial" w:hAnsi="Arial" w:cs="Arial"/>
+        </w:rPr>
+        <w:t xml:space="preserve">, or </w:t>
+      </w:r>
+      <w:r>
+        <w:rPr>
+          <w:rFonts w:ascii="Arial" w:hAnsi="Arial" w:cs="Arial"/>
+        </w:rPr>
+        <w:t>over-dispersed</w:t>
+      </w:r>
+      <w:r>
+        <w:rPr>
+          <w:rFonts w:ascii="Arial" w:hAnsi="Arial" w:cs="Arial"/>
+        </w:rPr>
+        <w:t xml:space="preserve">. </w:t>
+      </w:r>
+      <w:r>
+        <w:rPr>
+          <w:rFonts w:ascii="Arial" w:hAnsi="Arial" w:cs="Arial"/>
+        </w:rPr>
+        <w:t xml:space="preserve">Finally, we generated </w:t>
+      </w:r>
+      <w:r>
+        <w:rPr>
+          <w:rFonts w:ascii="Arial" w:hAnsi="Arial" w:cs="Arial"/>
+        </w:rPr>
+        <w:t>acoustic</w:t>
+      </w:r>
+      <w:r>
+        <w:rPr>
+          <w:rFonts w:ascii="Arial" w:hAnsi="Arial" w:cs="Arial"/>
+        </w:rPr>
+        <w:t xml:space="preserve"> space plots for character strings and vocalizations with convex hull polygons outlining the area encompassed in acoustic space by the social level at which we had originally encoded the most information (</w:t>
+      </w:r>
+      <w:r>
+        <w:rPr>
+          <w:rFonts w:ascii="Arial" w:hAnsi="Arial" w:cs="Arial"/>
+        </w:rPr>
+        <w:t xml:space="preserve">Figs </w:t>
+      </w:r>
+      <w:r>
+        <w:rPr>
+          <w:rFonts w:ascii="Arial" w:hAnsi="Arial" w:cs="Arial"/>
+        </w:rPr>
+        <w:t xml:space="preserve">2 and 3), as well as both social levels (Supplementary </w:t>
+      </w:r>
+      <w:r>
+        <w:rPr>
+          <w:rFonts w:ascii="Arial" w:hAnsi="Arial" w:cs="Arial"/>
+        </w:rPr>
+        <w:t xml:space="preserve">Figs </w:t>
+      </w:r>
+      <w:r>
+        <w:rPr>
+          <w:rFonts w:ascii="Arial" w:hAnsi="Arial" w:cs="Arial"/>
+        </w:rPr>
+        <w:t xml:space="preserve">1 and 2), to facilitate ease of comparisons of patterns of concentration </w:t>
+      </w:r>
+      <w:r>
+        <w:rPr>
+          <w:rFonts w:ascii="Arial" w:hAnsi="Arial" w:cs="Arial"/>
+        </w:rPr>
+        <w:t>of points (</w:t>
+      </w:r>
+      <w:r>
+        <w:rPr>
+          <w:rFonts w:ascii="Arial" w:hAnsi="Arial" w:cs="Arial"/>
+        </w:rPr>
+        <w:t>or overlap</w:t>
+      </w:r>
+      <w:r>
+        <w:rPr>
+          <w:rFonts w:ascii="Arial" w:hAnsi="Arial" w:cs="Arial"/>
+        </w:rPr>
+        <w:t xml:space="preserve"> amongst polygons)</w:t>
+      </w:r>
+      <w:r>
+        <w:rPr>
+          <w:rFonts w:ascii="Arial" w:hAnsi="Arial" w:cs="Arial"/>
+        </w:rPr>
+        <w:t xml:space="preserve">, as well as overdispersion given our original expectations. </w:t>
+      </w:r>
+      <w:r>
+        <w:rPr>
+          <w:rFonts w:ascii="Arial" w:hAnsi="Arial" w:cs="Arial"/>
+        </w:rPr>
+        <w:t>W</w:t>
+      </w:r>
+      <w:r>
+        <w:rPr>
+          <w:rFonts w:ascii="Arial" w:hAnsi="Arial" w:cs="Arial"/>
+        </w:rPr>
+        <w:t xml:space="preserve">e expected to identify </w:t>
+      </w:r>
+      <w:r>
+        <w:rPr>
+          <w:rFonts w:ascii="Arial" w:hAnsi="Arial" w:cs="Arial"/>
+        </w:rPr>
+        <w:t xml:space="preserve">patterns of </w:t>
+      </w:r>
+      <w:r>
+        <w:rPr>
+          <w:rFonts w:ascii="Arial" w:hAnsi="Arial" w:cs="Arial"/>
+        </w:rPr>
+        <w:t>concentrat</w:t>
+      </w:r>
+      <w:r>
+        <w:rPr>
+          <w:rFonts w:ascii="Arial" w:hAnsi="Arial" w:cs="Arial"/>
+        </w:rPr>
+        <w:t>ed points</w:t>
+      </w:r>
+      <w:r>
+        <w:rPr>
+          <w:rFonts w:ascii="Arial" w:hAnsi="Arial" w:cs="Arial"/>
+        </w:rPr>
+        <w:t xml:space="preserve"> within groups and </w:t>
+      </w:r>
+      <w:r>
+        <w:rPr>
+          <w:rFonts w:ascii="Arial" w:hAnsi="Arial" w:cs="Arial"/>
+        </w:rPr>
+        <w:t>overdispersion amongst groups</w:t>
+      </w:r>
+      <w:r>
+        <w:rPr>
+          <w:rFonts w:ascii="Arial" w:hAnsi="Arial" w:cs="Arial"/>
+        </w:rPr>
+        <w:t xml:space="preserve"> for the group-specific dataset</w:t>
+      </w:r>
+      <w:r>
+        <w:rPr>
+          <w:rFonts w:ascii="Arial" w:hAnsi="Arial" w:cs="Arial"/>
+        </w:rPr>
+        <w:t xml:space="preserve">. For the </w:t>
       </w:r>
       <w:r>
         <w:rPr>
           <w:rFonts w:ascii="Arial" w:hAnsi="Arial" w:cs="Arial"/>
         </w:rPr>
         <w:lastRenderedPageBreak/>
-        <w:t>dimensional solution</w:t>
-      </w:r>
-      <w:r>
-        <w:rPr>
-          <w:rFonts w:ascii="Arial" w:hAnsi="Arial" w:cs="Arial"/>
-        </w:rPr>
-        <w:t xml:space="preserve"> with </w:t>
-      </w:r>
-      <w:r>
-        <w:rPr>
-          <w:rFonts w:ascii="Arial" w:hAnsi="Arial" w:cs="Arial"/>
-        </w:rPr>
-        <w:t>15</w:t>
-      </w:r>
-      <w:r>
-        <w:rPr>
-          <w:rFonts w:ascii="Arial" w:hAnsi="Arial" w:cs="Arial"/>
-        </w:rPr>
-        <w:t xml:space="preserve"> dimensions. </w:t>
-      </w:r>
-      <w:r>
-        <w:rPr>
-          <w:rFonts w:ascii="Arial" w:hAnsi="Arial" w:cs="Arial"/>
-        </w:rPr>
-        <w:t xml:space="preserve">We used 15 dimensions to reduce the stress of the resulting optimal solution to 5% or less </w:t>
-      </w:r>
-      <w:r>
-        <w:rPr>
-          <w:rFonts w:ascii="Arial" w:hAnsi="Arial" w:cs="Arial"/>
-        </w:rPr>
-        <w:fldChar w:fldCharType="begin"/>
-      </w:r>
-      <w:r>
-        <w:rPr>
-          <w:rFonts w:ascii="Arial" w:hAnsi="Arial" w:cs="Arial"/>
-        </w:rPr>
-        <w:instrText xml:space="preserve"> ADDIN ZOTERO_ITEM CSL_CITATION {"citationID":"sOQUgqmx","properties":{"formattedCitation":"(40)","plainCitation":"(40)","noteIndex":0},"citationItems":[{"id":852,"uris":["http://zotero.org/groups/5786507/items/ERUU9SXP"],"itemData":{"id":852,"type":"article-journal","abstract":"We describe the numerical methods required in our approach to multi-dimensional scaling. The rationale of this approach has appeared previously. © 1964 Psychometric Society.","container-title":"Psychometrika","DOI":"10.1007/BF02289694","ISSN":"00333123","issue":"2","page":"115-129","title":"Nonmetric multidimensional scaling: A numerical method","volume":"29","author":[{"family":"Kruskal","given":"J.B."}],"issued":{"date-parts":[["1964"]]}}}],"schema":"https://github.com/citation-style-language/schema/raw/master/csl-citation.json"} </w:instrText>
-      </w:r>
-      <w:r>
-        <w:rPr>
-          <w:rFonts w:ascii="Arial" w:hAnsi="Arial" w:cs="Arial"/>
-        </w:rPr>
-        <w:fldChar w:fldCharType="separate"/>
-      </w:r>
-      <w:r>
-        <w:rPr>
-          <w:rFonts w:ascii="Arial" w:hAnsi="Arial" w:cs="Arial"/>
-        </w:rPr>
-        <w:t>(40)</w:t>
-      </w:r>
-      <w:r>
-        <w:rPr>
-          <w:rFonts w:ascii="Arial" w:hAnsi="Arial" w:cs="Arial"/>
-        </w:rPr>
-        <w:fldChar w:fldCharType="end"/>
-      </w:r>
-      <w:r>
-        <w:rPr>
-          <w:rFonts w:ascii="Arial" w:hAnsi="Arial" w:cs="Arial"/>
-        </w:rPr>
-        <w:t xml:space="preserve">. </w:t>
-      </w:r>
-      <w:r>
-        <w:rPr>
-          <w:rFonts w:ascii="Arial" w:hAnsi="Arial" w:cs="Arial"/>
-        </w:rPr>
-        <w:t>We performed multidimensional scaling on both the edit distance and SPCC matrices</w:t>
-      </w:r>
-      <w:r>
-        <w:rPr>
-          <w:rFonts w:ascii="Arial" w:hAnsi="Arial" w:cs="Arial"/>
-        </w:rPr>
-        <w:t xml:space="preserve"> </w:t>
-      </w:r>
-      <w:r>
-        <w:rPr>
-          <w:rFonts w:ascii="Arial" w:hAnsi="Arial" w:cs="Arial"/>
-        </w:rPr>
-        <w:t xml:space="preserve">to visualize patterns of variation for each representation of the synthetic </w:t>
-      </w:r>
-      <w:r>
-        <w:rPr>
-          <w:rFonts w:ascii="Arial" w:hAnsi="Arial" w:cs="Arial"/>
-        </w:rPr>
-        <w:t>vocalizations</w:t>
-      </w:r>
-      <w:r>
-        <w:rPr>
-          <w:rFonts w:ascii="Arial" w:hAnsi="Arial" w:cs="Arial"/>
-        </w:rPr>
-        <w:t xml:space="preserve"> (character strings and vocalizations, respectively).</w:t>
-      </w:r>
-      <w:r>
-        <w:rPr>
-          <w:rFonts w:ascii="Arial" w:hAnsi="Arial" w:cs="Arial"/>
-        </w:rPr>
-        <w:t xml:space="preserve"> </w:t>
-      </w:r>
-      <w:r>
-        <w:rPr>
-          <w:rFonts w:ascii="Arial" w:hAnsi="Arial" w:cs="Arial"/>
-        </w:rPr>
-        <w:t xml:space="preserve">To perform multidimensional scaling with the SPCC matrix, we </w:t>
-      </w:r>
-      <w:r>
-        <w:rPr>
-          <w:rFonts w:ascii="Arial" w:hAnsi="Arial" w:cs="Arial"/>
-        </w:rPr>
-        <w:t xml:space="preserve">first </w:t>
-      </w:r>
-      <w:r>
-        <w:rPr>
-          <w:rFonts w:ascii="Arial" w:hAnsi="Arial" w:cs="Arial"/>
-        </w:rPr>
-        <w:t xml:space="preserve">subtracted this matrix from 1 to yield distance values. </w:t>
-      </w:r>
-      <w:r>
-        <w:rPr>
-          <w:rFonts w:ascii="Arial" w:hAnsi="Arial" w:cs="Arial"/>
-        </w:rPr>
-        <w:t xml:space="preserve">We used the first two dimensions of each </w:t>
-      </w:r>
-      <w:r>
-        <w:rPr>
-          <w:rFonts w:ascii="Arial" w:hAnsi="Arial" w:cs="Arial"/>
-        </w:rPr>
-        <w:t xml:space="preserve">optimal </w:t>
-      </w:r>
-      <w:r>
-        <w:rPr>
-          <w:rFonts w:ascii="Arial" w:hAnsi="Arial" w:cs="Arial"/>
-        </w:rPr>
-        <w:t xml:space="preserve">multidimensional scaling </w:t>
-      </w:r>
-      <w:r>
-        <w:rPr>
-          <w:rFonts w:ascii="Arial" w:hAnsi="Arial" w:cs="Arial"/>
-        </w:rPr>
-        <w:t xml:space="preserve">solution to generate </w:t>
-      </w:r>
-      <w:r>
-        <w:rPr>
-          <w:rFonts w:ascii="Arial" w:hAnsi="Arial" w:cs="Arial"/>
-        </w:rPr>
-        <w:t xml:space="preserve">acoustic </w:t>
-      </w:r>
-      <w:r>
-        <w:rPr>
-          <w:rFonts w:ascii="Arial" w:hAnsi="Arial" w:cs="Arial"/>
-        </w:rPr>
-        <w:t>space visualizations. In each of these</w:t>
-      </w:r>
-      <w:r>
-        <w:rPr>
-          <w:rFonts w:ascii="Arial" w:hAnsi="Arial" w:cs="Arial"/>
-        </w:rPr>
-        <w:t xml:space="preserve"> acoustic</w:t>
-      </w:r>
-      <w:r>
-        <w:rPr>
-          <w:rFonts w:ascii="Arial" w:hAnsi="Arial" w:cs="Arial"/>
-        </w:rPr>
-        <w:t xml:space="preserve"> space</w:t>
-      </w:r>
-      <w:r>
-        <w:rPr>
-          <w:rFonts w:ascii="Arial" w:hAnsi="Arial" w:cs="Arial"/>
-        </w:rPr>
-        <w:t xml:space="preserve"> plot</w:t>
-      </w:r>
-      <w:r>
-        <w:rPr>
-          <w:rFonts w:ascii="Arial" w:hAnsi="Arial" w:cs="Arial"/>
-        </w:rPr>
-        <w:t xml:space="preserve">s, </w:t>
-      </w:r>
-      <w:r>
-        <w:rPr>
-          <w:rFonts w:ascii="Arial" w:hAnsi="Arial" w:cs="Arial"/>
-        </w:rPr>
-        <w:t>vocalizations that are structurally similar are closer together</w:t>
-      </w:r>
-      <w:r>
-        <w:rPr>
-          <w:rFonts w:ascii="Arial" w:hAnsi="Arial" w:cs="Arial"/>
-        </w:rPr>
-        <w:t xml:space="preserve"> or concentrated</w:t>
-      </w:r>
-      <w:r>
-        <w:rPr>
-          <w:rFonts w:ascii="Arial" w:hAnsi="Arial" w:cs="Arial"/>
-        </w:rPr>
-        <w:t xml:space="preserve"> in space, whi</w:t>
-      </w:r>
-      <w:r>
-        <w:rPr>
-          <w:rFonts w:ascii="Arial" w:hAnsi="Arial" w:cs="Arial"/>
-        </w:rPr>
-        <w:t>le</w:t>
-      </w:r>
-      <w:r>
-        <w:rPr>
-          <w:rFonts w:ascii="Arial" w:hAnsi="Arial" w:cs="Arial"/>
-        </w:rPr>
-        <w:t xml:space="preserve"> those that are structurally different are farther apart</w:t>
-      </w:r>
-      <w:r>
-        <w:rPr>
-          <w:rFonts w:ascii="Arial" w:hAnsi="Arial" w:cs="Arial"/>
-        </w:rPr>
-        <w:t xml:space="preserve">, or </w:t>
-      </w:r>
-      <w:r>
-        <w:rPr>
-          <w:rFonts w:ascii="Arial" w:hAnsi="Arial" w:cs="Arial"/>
-        </w:rPr>
-        <w:t>over-dispersed</w:t>
-      </w:r>
-      <w:r>
-        <w:rPr>
-          <w:rFonts w:ascii="Arial" w:hAnsi="Arial" w:cs="Arial"/>
-        </w:rPr>
-        <w:t xml:space="preserve">. </w:t>
-      </w:r>
-      <w:r>
-        <w:rPr>
-          <w:rFonts w:ascii="Arial" w:hAnsi="Arial" w:cs="Arial"/>
-        </w:rPr>
-        <w:t xml:space="preserve">Finally, we generated </w:t>
-      </w:r>
-      <w:r>
-        <w:rPr>
-          <w:rFonts w:ascii="Arial" w:hAnsi="Arial" w:cs="Arial"/>
-        </w:rPr>
-        <w:t>acoustic</w:t>
-      </w:r>
-      <w:r>
-        <w:rPr>
-          <w:rFonts w:ascii="Arial" w:hAnsi="Arial" w:cs="Arial"/>
-        </w:rPr>
-        <w:t xml:space="preserve"> space plots for character strings and vocalizations with convex hull polygons outlining the area encompassed in acoustic space by the social level at which we had originally encoded the most information (</w:t>
-      </w:r>
-      <w:r>
-        <w:rPr>
-          <w:rFonts w:ascii="Arial" w:hAnsi="Arial" w:cs="Arial"/>
-        </w:rPr>
-        <w:t xml:space="preserve">Figs </w:t>
-      </w:r>
-      <w:r>
-        <w:rPr>
-          <w:rFonts w:ascii="Arial" w:hAnsi="Arial" w:cs="Arial"/>
-        </w:rPr>
-        <w:t xml:space="preserve">2 and 3), as well as both social levels (Supplementary </w:t>
-      </w:r>
-      <w:r>
-        <w:rPr>
-          <w:rFonts w:ascii="Arial" w:hAnsi="Arial" w:cs="Arial"/>
-        </w:rPr>
-        <w:t xml:space="preserve">Figs </w:t>
-      </w:r>
-      <w:r>
-        <w:rPr>
-          <w:rFonts w:ascii="Arial" w:hAnsi="Arial" w:cs="Arial"/>
-        </w:rPr>
-        <w:t xml:space="preserve">1 and 2), to facilitate ease of comparisons of patterns of concentration </w:t>
-      </w:r>
-      <w:r>
-        <w:rPr>
-          <w:rFonts w:ascii="Arial" w:hAnsi="Arial" w:cs="Arial"/>
-        </w:rPr>
-        <w:t>of points (</w:t>
-      </w:r>
-      <w:r>
-        <w:rPr>
-          <w:rFonts w:ascii="Arial" w:hAnsi="Arial" w:cs="Arial"/>
-        </w:rPr>
-        <w:t>or overlap</w:t>
-      </w:r>
-      <w:r>
-        <w:rPr>
-          <w:rFonts w:ascii="Arial" w:hAnsi="Arial" w:cs="Arial"/>
-        </w:rPr>
-        <w:t xml:space="preserve"> amongst polygons)</w:t>
-      </w:r>
-      <w:r>
-        <w:rPr>
-          <w:rFonts w:ascii="Arial" w:hAnsi="Arial" w:cs="Arial"/>
-        </w:rPr>
-        <w:t xml:space="preserve">, as well as overdispersion given our original expectations. </w:t>
-      </w:r>
-      <w:r>
-        <w:rPr>
-          <w:rFonts w:ascii="Arial" w:hAnsi="Arial" w:cs="Arial"/>
-        </w:rPr>
-        <w:t>W</w:t>
-      </w:r>
-      <w:r>
-        <w:rPr>
-          <w:rFonts w:ascii="Arial" w:hAnsi="Arial" w:cs="Arial"/>
-        </w:rPr>
-        <w:t xml:space="preserve">e expected to identify </w:t>
-      </w:r>
-      <w:r>
-        <w:rPr>
-          <w:rFonts w:ascii="Arial" w:hAnsi="Arial" w:cs="Arial"/>
-        </w:rPr>
-        <w:t xml:space="preserve">patterns of </w:t>
-      </w:r>
-      <w:r>
-        <w:rPr>
-          <w:rFonts w:ascii="Arial" w:hAnsi="Arial" w:cs="Arial"/>
-        </w:rPr>
-        <w:t>concentrat</w:t>
-      </w:r>
-      <w:r>
-        <w:rPr>
-          <w:rFonts w:ascii="Arial" w:hAnsi="Arial" w:cs="Arial"/>
-        </w:rPr>
-        <w:t>ed points</w:t>
-      </w:r>
-      <w:r>
-        <w:rPr>
-          <w:rFonts w:ascii="Arial" w:hAnsi="Arial" w:cs="Arial"/>
-        </w:rPr>
-        <w:t xml:space="preserve"> within groups and </w:t>
-      </w:r>
-      <w:r>
-        <w:rPr>
-          <w:rFonts w:ascii="Arial" w:hAnsi="Arial" w:cs="Arial"/>
-        </w:rPr>
-        <w:t>overdispersion amongst groups</w:t>
-      </w:r>
-      <w:r>
-        <w:rPr>
-          <w:rFonts w:ascii="Arial" w:hAnsi="Arial" w:cs="Arial"/>
-        </w:rPr>
-        <w:t xml:space="preserve"> for the group-specific dataset</w:t>
-      </w:r>
-      <w:r>
-        <w:rPr>
-          <w:rFonts w:ascii="Arial" w:hAnsi="Arial" w:cs="Arial"/>
-        </w:rPr>
-        <w:t>. For the individually distinctive dataset,</w:t>
+        <w:t>individually distinctive dataset,</w:t>
       </w:r>
       <w:r>
         <w:rPr>
@@ -20180,280 +20175,280 @@
         <w:rPr>
           <w:rFonts w:ascii="Arial" w:hAnsi="Arial" w:cs="Arial"/>
         </w:rPr>
-        <w:t xml:space="preserve">proportions of </w:t>
+        <w:t xml:space="preserve">proportions of identity </w:t>
+      </w:r>
+      <w:r>
+        <w:rPr>
+          <w:rFonts w:ascii="Arial" w:hAnsi="Arial" w:cs="Arial"/>
+        </w:rPr>
+        <w:t>information encod</w:t>
+      </w:r>
+      <w:r>
+        <w:rPr>
+          <w:rFonts w:ascii="Arial" w:hAnsi="Arial" w:cs="Arial"/>
+        </w:rPr>
+        <w:t>ed at the individual and group levels, as well as over varying sizes of</w:t>
+      </w:r>
+      <w:r>
+        <w:rPr>
+          <w:rFonts w:ascii="Arial" w:hAnsi="Arial" w:cs="Arial"/>
+        </w:rPr>
+        <w:t xml:space="preserve"> signal </w:t>
+      </w:r>
+      <w:r>
+        <w:rPr>
+          <w:rFonts w:ascii="Arial" w:hAnsi="Arial" w:cs="Arial"/>
+        </w:rPr>
+        <w:t>datasets</w:t>
+      </w:r>
+      <w:r>
+        <w:rPr>
+          <w:rFonts w:ascii="Arial" w:hAnsi="Arial" w:cs="Arial"/>
+        </w:rPr>
+        <w:t>, or the number of classes at each social level</w:t>
+      </w:r>
+      <w:r>
+        <w:rPr>
+          <w:rFonts w:ascii="Arial" w:hAnsi="Arial" w:cs="Arial"/>
+        </w:rPr>
+        <w:t>.</w:t>
+      </w:r>
+      <w:r>
+        <w:rPr>
+          <w:rFonts w:ascii="Arial" w:hAnsi="Arial" w:cs="Arial"/>
+        </w:rPr>
+        <w:t xml:space="preserve"> We designed </w:t>
+      </w:r>
+      <w:r>
+        <w:rPr>
+          <w:rFonts w:ascii="Arial" w:hAnsi="Arial" w:cs="Arial"/>
+        </w:rPr>
+        <w:t>our</w:t>
+      </w:r>
+      <w:r>
+        <w:rPr>
+          <w:rFonts w:ascii="Arial" w:hAnsi="Arial" w:cs="Arial"/>
+        </w:rPr>
+        <w:t xml:space="preserve"> simulation experiments to manipulate the relative proportions of information encoding and signal dataset sizes because we expected both</w:t>
+      </w:r>
+      <w:r>
+        <w:rPr>
+          <w:rFonts w:ascii="Arial" w:hAnsi="Arial" w:cs="Arial"/>
+        </w:rPr>
+        <w:t xml:space="preserve"> </w:t>
+      </w:r>
+      <w:r>
+        <w:rPr>
+          <w:rFonts w:ascii="Arial" w:hAnsi="Arial" w:cs="Arial"/>
+        </w:rPr>
+        <w:t xml:space="preserve">parameters to impact </w:t>
+      </w:r>
+      <w:r>
+        <w:rPr>
+          <w:rFonts w:ascii="Arial" w:hAnsi="Arial" w:cs="Arial"/>
+        </w:rPr>
+        <w:t xml:space="preserve">our detection of identity information in the synthetic vocalizations using traditional bioacoustics analyses. </w:t>
+      </w:r>
+      <w:r>
+        <w:rPr>
+          <w:rFonts w:ascii="Arial" w:hAnsi="Arial" w:cs="Arial"/>
+        </w:rPr>
+        <w:t xml:space="preserve">We expected </w:t>
+      </w:r>
+      <w:r>
+        <w:rPr>
+          <w:rFonts w:ascii="Arial" w:hAnsi="Arial" w:cs="Arial"/>
+        </w:rPr>
+        <w:t xml:space="preserve">the highest </w:t>
+      </w:r>
+      <w:proofErr w:type="gramStart"/>
+      <w:r>
+        <w:rPr>
+          <w:rFonts w:ascii="Arial" w:hAnsi="Arial" w:cs="Arial"/>
+        </w:rPr>
+        <w:t>accuracies</w:t>
+      </w:r>
+      <w:proofErr w:type="gramEnd"/>
+      <w:r>
+        <w:rPr>
+          <w:rFonts w:ascii="Arial" w:hAnsi="Arial" w:cs="Arial"/>
+        </w:rPr>
+        <w:t xml:space="preserve"> of information detection at the social level</w:t>
+      </w:r>
+      <w:r>
+        <w:rPr>
+          <w:rFonts w:ascii="Arial" w:hAnsi="Arial" w:cs="Arial"/>
+        </w:rPr>
+        <w:t xml:space="preserve"> at which we had originally encoded more information, and we also expected </w:t>
+      </w:r>
+      <w:r>
+        <w:rPr>
+          <w:rFonts w:ascii="Arial" w:hAnsi="Arial" w:cs="Arial"/>
+        </w:rPr>
+        <w:t xml:space="preserve">it would be more difficult to detect </w:t>
+      </w:r>
+      <w:r>
+        <w:rPr>
+          <w:rFonts w:ascii="Arial" w:hAnsi="Arial" w:cs="Arial"/>
+        </w:rPr>
+        <w:t xml:space="preserve">information with high accuracy when </w:t>
+      </w:r>
+      <w:r>
+        <w:rPr>
+          <w:rFonts w:ascii="Arial" w:hAnsi="Arial" w:cs="Arial"/>
+        </w:rPr>
+        <w:t>we had originally encoded information at both the group and individual levels.</w:t>
+      </w:r>
+      <w:r>
+        <w:rPr>
+          <w:rFonts w:ascii="Arial" w:hAnsi="Arial" w:cs="Arial"/>
+        </w:rPr>
+        <w:t xml:space="preserve"> </w:t>
+      </w:r>
+      <w:r>
+        <w:rPr>
+          <w:rFonts w:ascii="Arial" w:hAnsi="Arial" w:cs="Arial"/>
+        </w:rPr>
+        <w:t xml:space="preserve">In our experiments, we varied the relative proportions of group to individual information encoded in each string over four treatments: (1) 0 (representing all individual information and no group information), </w:t>
+      </w:r>
+      <w:r>
+        <w:rPr>
+          <w:rFonts w:ascii="Arial" w:hAnsi="Arial" w:cs="Arial"/>
+        </w:rPr>
+        <w:t xml:space="preserve">(2) </w:t>
+      </w:r>
+      <w:r>
+        <w:rPr>
+          <w:rFonts w:ascii="Arial" w:hAnsi="Arial" w:cs="Arial"/>
+        </w:rPr>
+        <w:t>1/3</w:t>
+      </w:r>
+      <w:r>
+        <w:rPr>
+          <w:rFonts w:ascii="Arial" w:hAnsi="Arial" w:cs="Arial"/>
+        </w:rPr>
+        <w:t xml:space="preserve"> (more individual than group information)</w:t>
+      </w:r>
+      <w:r>
+        <w:rPr>
+          <w:rFonts w:ascii="Arial" w:hAnsi="Arial" w:cs="Arial"/>
+        </w:rPr>
+        <w:t xml:space="preserve">, </w:t>
+      </w:r>
+      <w:r>
+        <w:rPr>
+          <w:rFonts w:ascii="Arial" w:hAnsi="Arial" w:cs="Arial"/>
+        </w:rPr>
+        <w:t xml:space="preserve">(3) </w:t>
+      </w:r>
+      <w:r>
+        <w:rPr>
+          <w:rFonts w:ascii="Arial" w:hAnsi="Arial" w:cs="Arial"/>
+        </w:rPr>
+        <w:t>2/3</w:t>
+      </w:r>
+      <w:r>
+        <w:rPr>
+          <w:rFonts w:ascii="Arial" w:hAnsi="Arial" w:cs="Arial"/>
+        </w:rPr>
+        <w:t xml:space="preserve"> (</w:t>
+      </w:r>
+      <w:r>
+        <w:rPr>
+          <w:rFonts w:ascii="Arial" w:hAnsi="Arial" w:cs="Arial"/>
+        </w:rPr>
+        <w:t>more group than individual information</w:t>
+      </w:r>
+      <w:r>
+        <w:rPr>
+          <w:rFonts w:ascii="Arial" w:hAnsi="Arial" w:cs="Arial"/>
+        </w:rPr>
+        <w:t>)</w:t>
+      </w:r>
+      <w:r>
+        <w:rPr>
+          <w:rFonts w:ascii="Arial" w:hAnsi="Arial" w:cs="Arial"/>
+        </w:rPr>
+        <w:t xml:space="preserve">, and </w:t>
+      </w:r>
+      <w:r>
+        <w:rPr>
+          <w:rFonts w:ascii="Arial" w:hAnsi="Arial" w:cs="Arial"/>
+        </w:rPr>
+        <w:t xml:space="preserve">(4) </w:t>
+      </w:r>
+      <w:r>
+        <w:rPr>
+          <w:rFonts w:ascii="Arial" w:hAnsi="Arial" w:cs="Arial"/>
+        </w:rPr>
+        <w:t>1 (all group and no individual information</w:t>
+      </w:r>
+      <w:r>
+        <w:rPr>
+          <w:rFonts w:ascii="Arial" w:hAnsi="Arial" w:cs="Arial"/>
+        </w:rPr>
+        <w:t>)</w:t>
+      </w:r>
+      <w:r>
+        <w:rPr>
+          <w:rFonts w:ascii="Arial" w:hAnsi="Arial" w:cs="Arial"/>
+        </w:rPr>
+        <w:t>.</w:t>
+      </w:r>
+      <w:r>
+        <w:rPr>
+          <w:rFonts w:ascii="Arial" w:hAnsi="Arial" w:cs="Arial"/>
+        </w:rPr>
+        <w:t xml:space="preserve"> We </w:t>
+      </w:r>
+      <w:r>
+        <w:rPr>
+          <w:rFonts w:ascii="Arial" w:hAnsi="Arial" w:cs="Arial"/>
+        </w:rPr>
+        <w:t xml:space="preserve">used a total length of 6 characters in the overall character string for encoding information at one or both social levels, </w:t>
+      </w:r>
+      <w:r>
+        <w:rPr>
+          <w:rFonts w:ascii="Arial" w:hAnsi="Arial" w:cs="Arial"/>
+        </w:rPr>
+        <w:t>for the following 4</w:t>
+      </w:r>
+      <w:r>
+        <w:rPr>
+          <w:rFonts w:ascii="Arial" w:hAnsi="Arial" w:cs="Arial"/>
+        </w:rPr>
+        <w:t xml:space="preserve"> treatments</w:t>
+      </w:r>
+      <w:r>
+        <w:rPr>
+          <w:rFonts w:ascii="Arial" w:hAnsi="Arial" w:cs="Arial"/>
+        </w:rPr>
+        <w:t>: (1)</w:t>
+      </w:r>
+      <w:r>
+        <w:rPr>
+          <w:rFonts w:ascii="Arial" w:hAnsi="Arial" w:cs="Arial"/>
+        </w:rPr>
+        <w:t xml:space="preserve"> 6 characters devoted to individual information, </w:t>
+      </w:r>
+      <w:r>
+        <w:rPr>
+          <w:rFonts w:ascii="Arial" w:hAnsi="Arial" w:cs="Arial"/>
+        </w:rPr>
+        <w:t xml:space="preserve">(2) </w:t>
+      </w:r>
+      <w:r>
+        <w:rPr>
+          <w:rFonts w:ascii="Arial" w:hAnsi="Arial" w:cs="Arial"/>
+        </w:rPr>
+        <w:t xml:space="preserve">4 characters for individual and 2 characters for group </w:t>
       </w:r>
       <w:r>
         <w:rPr>
           <w:rFonts w:ascii="Arial" w:hAnsi="Arial" w:cs="Arial"/>
         </w:rPr>
         <w:lastRenderedPageBreak/>
-        <w:t xml:space="preserve">identity </w:t>
-      </w:r>
-      <w:r>
-        <w:rPr>
-          <w:rFonts w:ascii="Arial" w:hAnsi="Arial" w:cs="Arial"/>
-        </w:rPr>
-        <w:t>information encod</w:t>
-      </w:r>
-      <w:r>
-        <w:rPr>
-          <w:rFonts w:ascii="Arial" w:hAnsi="Arial" w:cs="Arial"/>
-        </w:rPr>
-        <w:t>ed at the individual and group levels, as well as over varying sizes of</w:t>
-      </w:r>
-      <w:r>
-        <w:rPr>
-          <w:rFonts w:ascii="Arial" w:hAnsi="Arial" w:cs="Arial"/>
-        </w:rPr>
-        <w:t xml:space="preserve"> signal </w:t>
-      </w:r>
-      <w:r>
-        <w:rPr>
-          <w:rFonts w:ascii="Arial" w:hAnsi="Arial" w:cs="Arial"/>
-        </w:rPr>
-        <w:t>datasets</w:t>
-      </w:r>
-      <w:r>
-        <w:rPr>
-          <w:rFonts w:ascii="Arial" w:hAnsi="Arial" w:cs="Arial"/>
-        </w:rPr>
-        <w:t>, or the number of classes at each social level</w:t>
-      </w:r>
-      <w:r>
-        <w:rPr>
-          <w:rFonts w:ascii="Arial" w:hAnsi="Arial" w:cs="Arial"/>
-        </w:rPr>
-        <w:t>.</w:t>
-      </w:r>
-      <w:r>
-        <w:rPr>
-          <w:rFonts w:ascii="Arial" w:hAnsi="Arial" w:cs="Arial"/>
-        </w:rPr>
-        <w:t xml:space="preserve"> We designed </w:t>
-      </w:r>
-      <w:r>
-        <w:rPr>
-          <w:rFonts w:ascii="Arial" w:hAnsi="Arial" w:cs="Arial"/>
-        </w:rPr>
-        <w:t>our</w:t>
-      </w:r>
-      <w:r>
-        <w:rPr>
-          <w:rFonts w:ascii="Arial" w:hAnsi="Arial" w:cs="Arial"/>
-        </w:rPr>
-        <w:t xml:space="preserve"> simulation experiments to manipulate the relative proportions of information encoding and signal dataset sizes because we expected both</w:t>
-      </w:r>
-      <w:r>
-        <w:rPr>
-          <w:rFonts w:ascii="Arial" w:hAnsi="Arial" w:cs="Arial"/>
-        </w:rPr>
-        <w:t xml:space="preserve"> </w:t>
-      </w:r>
-      <w:r>
-        <w:rPr>
-          <w:rFonts w:ascii="Arial" w:hAnsi="Arial" w:cs="Arial"/>
-        </w:rPr>
-        <w:t xml:space="preserve">parameters to impact </w:t>
-      </w:r>
-      <w:r>
-        <w:rPr>
-          <w:rFonts w:ascii="Arial" w:hAnsi="Arial" w:cs="Arial"/>
-        </w:rPr>
-        <w:t xml:space="preserve">our detection of identity information in the synthetic vocalizations using traditional bioacoustics analyses. </w:t>
-      </w:r>
-      <w:r>
-        <w:rPr>
-          <w:rFonts w:ascii="Arial" w:hAnsi="Arial" w:cs="Arial"/>
-        </w:rPr>
-        <w:t xml:space="preserve">We expected </w:t>
-      </w:r>
-      <w:r>
-        <w:rPr>
-          <w:rFonts w:ascii="Arial" w:hAnsi="Arial" w:cs="Arial"/>
-        </w:rPr>
-        <w:t xml:space="preserve">the highest </w:t>
-      </w:r>
-      <w:proofErr w:type="gramStart"/>
-      <w:r>
-        <w:rPr>
-          <w:rFonts w:ascii="Arial" w:hAnsi="Arial" w:cs="Arial"/>
-        </w:rPr>
-        <w:t>accuracies</w:t>
-      </w:r>
-      <w:proofErr w:type="gramEnd"/>
-      <w:r>
-        <w:rPr>
-          <w:rFonts w:ascii="Arial" w:hAnsi="Arial" w:cs="Arial"/>
-        </w:rPr>
-        <w:t xml:space="preserve"> of information detection at the social level</w:t>
-      </w:r>
-      <w:r>
-        <w:rPr>
-          <w:rFonts w:ascii="Arial" w:hAnsi="Arial" w:cs="Arial"/>
-        </w:rPr>
-        <w:t xml:space="preserve"> at which we had originally encoded more information, and we also expected </w:t>
-      </w:r>
-      <w:r>
-        <w:rPr>
-          <w:rFonts w:ascii="Arial" w:hAnsi="Arial" w:cs="Arial"/>
-        </w:rPr>
-        <w:t xml:space="preserve">it would be more difficult to detect </w:t>
-      </w:r>
-      <w:r>
-        <w:rPr>
-          <w:rFonts w:ascii="Arial" w:hAnsi="Arial" w:cs="Arial"/>
-        </w:rPr>
-        <w:t xml:space="preserve">information with high accuracy when </w:t>
-      </w:r>
-      <w:r>
-        <w:rPr>
-          <w:rFonts w:ascii="Arial" w:hAnsi="Arial" w:cs="Arial"/>
-        </w:rPr>
-        <w:t>we had originally encoded information at both the group and individual levels.</w:t>
-      </w:r>
-      <w:r>
-        <w:rPr>
-          <w:rFonts w:ascii="Arial" w:hAnsi="Arial" w:cs="Arial"/>
-        </w:rPr>
-        <w:t xml:space="preserve"> </w:t>
-      </w:r>
-      <w:r>
-        <w:rPr>
-          <w:rFonts w:ascii="Arial" w:hAnsi="Arial" w:cs="Arial"/>
-        </w:rPr>
-        <w:t xml:space="preserve">In our experiments, we varied the relative proportions of group to individual information encoded in each string over four treatments: (1) 0 (representing all individual information and no group information), </w:t>
-      </w:r>
-      <w:r>
-        <w:rPr>
-          <w:rFonts w:ascii="Arial" w:hAnsi="Arial" w:cs="Arial"/>
-        </w:rPr>
-        <w:t xml:space="preserve">(2) </w:t>
-      </w:r>
-      <w:r>
-        <w:rPr>
-          <w:rFonts w:ascii="Arial" w:hAnsi="Arial" w:cs="Arial"/>
-        </w:rPr>
-        <w:t>1/3</w:t>
-      </w:r>
-      <w:r>
-        <w:rPr>
-          <w:rFonts w:ascii="Arial" w:hAnsi="Arial" w:cs="Arial"/>
-        </w:rPr>
-        <w:t xml:space="preserve"> (more individual than group information)</w:t>
-      </w:r>
-      <w:r>
-        <w:rPr>
-          <w:rFonts w:ascii="Arial" w:hAnsi="Arial" w:cs="Arial"/>
-        </w:rPr>
-        <w:t xml:space="preserve">, </w:t>
-      </w:r>
-      <w:r>
-        <w:rPr>
-          <w:rFonts w:ascii="Arial" w:hAnsi="Arial" w:cs="Arial"/>
-        </w:rPr>
-        <w:t xml:space="preserve">(3) </w:t>
-      </w:r>
-      <w:r>
-        <w:rPr>
-          <w:rFonts w:ascii="Arial" w:hAnsi="Arial" w:cs="Arial"/>
-        </w:rPr>
-        <w:t>2/3</w:t>
-      </w:r>
-      <w:r>
-        <w:rPr>
-          <w:rFonts w:ascii="Arial" w:hAnsi="Arial" w:cs="Arial"/>
-        </w:rPr>
-        <w:t xml:space="preserve"> (</w:t>
-      </w:r>
-      <w:r>
-        <w:rPr>
-          <w:rFonts w:ascii="Arial" w:hAnsi="Arial" w:cs="Arial"/>
-        </w:rPr>
-        <w:t>more group than individual information</w:t>
-      </w:r>
-      <w:r>
-        <w:rPr>
-          <w:rFonts w:ascii="Arial" w:hAnsi="Arial" w:cs="Arial"/>
-        </w:rPr>
-        <w:t>)</w:t>
-      </w:r>
-      <w:r>
-        <w:rPr>
-          <w:rFonts w:ascii="Arial" w:hAnsi="Arial" w:cs="Arial"/>
-        </w:rPr>
-        <w:t xml:space="preserve">, and </w:t>
-      </w:r>
-      <w:r>
-        <w:rPr>
-          <w:rFonts w:ascii="Arial" w:hAnsi="Arial" w:cs="Arial"/>
-        </w:rPr>
-        <w:t xml:space="preserve">(4) </w:t>
-      </w:r>
-      <w:r>
-        <w:rPr>
-          <w:rFonts w:ascii="Arial" w:hAnsi="Arial" w:cs="Arial"/>
-        </w:rPr>
-        <w:t>1 (all group and no individual information</w:t>
-      </w:r>
-      <w:r>
-        <w:rPr>
-          <w:rFonts w:ascii="Arial" w:hAnsi="Arial" w:cs="Arial"/>
-        </w:rPr>
-        <w:t>)</w:t>
-      </w:r>
-      <w:r>
-        <w:rPr>
-          <w:rFonts w:ascii="Arial" w:hAnsi="Arial" w:cs="Arial"/>
-        </w:rPr>
-        <w:t>.</w:t>
-      </w:r>
-      <w:r>
-        <w:rPr>
-          <w:rFonts w:ascii="Arial" w:hAnsi="Arial" w:cs="Arial"/>
-        </w:rPr>
-        <w:t xml:space="preserve"> We </w:t>
-      </w:r>
-      <w:r>
-        <w:rPr>
-          <w:rFonts w:ascii="Arial" w:hAnsi="Arial" w:cs="Arial"/>
-        </w:rPr>
-        <w:t xml:space="preserve">used a total length of 6 characters in the overall character string for encoding information at one or both social levels, </w:t>
-      </w:r>
-      <w:r>
-        <w:rPr>
-          <w:rFonts w:ascii="Arial" w:hAnsi="Arial" w:cs="Arial"/>
-        </w:rPr>
-        <w:t>for the following 4</w:t>
-      </w:r>
-      <w:r>
-        <w:rPr>
-          <w:rFonts w:ascii="Arial" w:hAnsi="Arial" w:cs="Arial"/>
-        </w:rPr>
-        <w:t xml:space="preserve"> treatments</w:t>
-      </w:r>
-      <w:r>
-        <w:rPr>
-          <w:rFonts w:ascii="Arial" w:hAnsi="Arial" w:cs="Arial"/>
-        </w:rPr>
-        <w:t>: (1)</w:t>
-      </w:r>
-      <w:r>
-        <w:rPr>
-          <w:rFonts w:ascii="Arial" w:hAnsi="Arial" w:cs="Arial"/>
-        </w:rPr>
-        <w:t xml:space="preserve"> 6 characters devoted to individual information, </w:t>
-      </w:r>
-      <w:r>
-        <w:rPr>
-          <w:rFonts w:ascii="Arial" w:hAnsi="Arial" w:cs="Arial"/>
-        </w:rPr>
-        <w:t xml:space="preserve">(2) </w:t>
-      </w:r>
-      <w:r>
-        <w:rPr>
-          <w:rFonts w:ascii="Arial" w:hAnsi="Arial" w:cs="Arial"/>
-        </w:rPr>
-        <w:t>4 characters for individual and 2 characters for group information,</w:t>
+        <w:t>information,</w:t>
       </w:r>
       <w:r>
         <w:rPr>
@@ -20583,14 +20578,7 @@
         <w:rPr>
           <w:rFonts w:ascii="Arial" w:hAnsi="Arial" w:cs="Arial"/>
         </w:rPr>
-        <w:t xml:space="preserve">classes at </w:t>
-      </w:r>
-      <w:r>
-        <w:rPr>
-          <w:rFonts w:ascii="Arial" w:hAnsi="Arial" w:cs="Arial"/>
-        </w:rPr>
-        <w:lastRenderedPageBreak/>
-        <w:t>each social level</w:t>
+        <w:t>classes at each social level</w:t>
       </w:r>
       <w:r>
         <w:rPr>
@@ -21081,6 +21069,7 @@
         <w:rPr>
           <w:rFonts w:ascii="Arial" w:hAnsi="Arial" w:cs="Arial"/>
         </w:rPr>
+        <w:lastRenderedPageBreak/>
         <w:tab/>
       </w:r>
       <w:r>
@@ -21243,14 +21232,7 @@
         <w:rPr>
           <w:rFonts w:ascii="Arial" w:hAnsi="Arial" w:cs="Arial"/>
         </w:rPr>
-        <w:t xml:space="preserve">ur results generated using the character </w:t>
-      </w:r>
-      <w:r>
-        <w:rPr>
-          <w:rFonts w:ascii="Arial" w:hAnsi="Arial" w:cs="Arial"/>
-        </w:rPr>
-        <w:lastRenderedPageBreak/>
-        <w:t>strings</w:t>
+        <w:t>ur results generated using the character strings</w:t>
       </w:r>
       <w:r>
         <w:rPr>
@@ -21614,7 +21596,14 @@
         <w:rPr>
           <w:rFonts w:ascii="Arial" w:hAnsi="Arial" w:cs="Arial"/>
         </w:rPr>
-        <w:t xml:space="preserve"> using the same analytical pipeline described below</w:t>
+        <w:t xml:space="preserve"> using the same analytical pipeline </w:t>
+      </w:r>
+      <w:r>
+        <w:rPr>
+          <w:rFonts w:ascii="Arial" w:hAnsi="Arial" w:cs="Arial"/>
+        </w:rPr>
+        <w:lastRenderedPageBreak/>
+        <w:t>described below</w:t>
       </w:r>
       <w:r>
         <w:rPr>
@@ -21742,14 +21731,7 @@
         <w:rPr>
           <w:rFonts w:ascii="Arial" w:hAnsi="Arial" w:cs="Arial"/>
         </w:rPr>
-        <w:t xml:space="preserve"> positive sign </w:t>
-      </w:r>
-      <w:r>
-        <w:rPr>
-          <w:rFonts w:ascii="Arial" w:hAnsi="Arial" w:cs="Arial"/>
-        </w:rPr>
-        <w:lastRenderedPageBreak/>
-        <w:t>values.</w:t>
+        <w:t xml:space="preserve"> positive sign values.</w:t>
       </w:r>
       <w:r>
         <w:rPr>
@@ -22046,7 +22028,14 @@
         <w:rPr>
           <w:rFonts w:ascii="Arial" w:hAnsi="Arial" w:cs="Arial"/>
         </w:rPr>
-        <w:t xml:space="preserve"> with the Hartigan and Wong algorithm</w:t>
+        <w:t xml:space="preserve"> with the Hartigan and </w:t>
+      </w:r>
+      <w:r>
+        <w:rPr>
+          <w:rFonts w:ascii="Arial" w:hAnsi="Arial" w:cs="Arial"/>
+        </w:rPr>
+        <w:lastRenderedPageBreak/>
+        <w:t>Wong algorithm</w:t>
       </w:r>
       <w:r>
         <w:rPr>
@@ -22190,14 +22179,7 @@
         <w:rPr>
           <w:rFonts w:ascii="Arial" w:hAnsi="Arial" w:cs="Arial"/>
         </w:rPr>
-        <w:t xml:space="preserve"> We then </w:t>
-      </w:r>
-      <w:r>
-        <w:rPr>
-          <w:rFonts w:ascii="Arial" w:hAnsi="Arial" w:cs="Arial"/>
-        </w:rPr>
-        <w:lastRenderedPageBreak/>
-        <w:t xml:space="preserve">used a bipartite mapping approach to calculate </w:t>
+        <w:t xml:space="preserve"> We then used a bipartite mapping approach to calculate </w:t>
       </w:r>
       <w:proofErr w:type="gramStart"/>
       <w:r>
@@ -22349,7 +22331,14 @@
         <w:rPr>
           <w:rFonts w:ascii="Arial" w:hAnsi="Arial" w:cs="Arial"/>
         </w:rPr>
-        <w:t xml:space="preserve">We used effect sizes as an approach to quantify the statistical significance of our accuracy of information detection for the social level at which we had encoded the most information. Effect size calculations </w:t>
+        <w:t xml:space="preserve">We used effect sizes as an approach to quantify the statistical significance of our </w:t>
+      </w:r>
+      <w:r>
+        <w:rPr>
+          <w:rFonts w:ascii="Arial" w:hAnsi="Arial" w:cs="Arial"/>
+        </w:rPr>
+        <w:lastRenderedPageBreak/>
+        <w:t xml:space="preserve">accuracy of information detection for the social level at which we had encoded the most information. Effect size calculations </w:t>
       </w:r>
       <w:r>
         <w:rPr>
@@ -22439,14 +22428,7 @@
         <w:rPr>
           <w:rFonts w:ascii="Arial" w:hAnsi="Arial" w:cs="Arial"/>
         </w:rPr>
-        <w:t xml:space="preserve">can be </w:t>
-      </w:r>
-      <w:r>
-        <w:rPr>
-          <w:rFonts w:ascii="Arial" w:hAnsi="Arial" w:cs="Arial"/>
-        </w:rPr>
-        <w:lastRenderedPageBreak/>
-        <w:t>misleading, because they</w:t>
+        <w:t>can be misleading, because they</w:t>
       </w:r>
       <w:r>
         <w:rPr>
@@ -22865,7 +22847,14 @@
         <w:rPr>
           <w:rFonts w:ascii="Arial" w:hAnsi="Arial" w:cs="Arial"/>
         </w:rPr>
-        <w:t>The new pipeline we present here is</w:t>
+        <w:t xml:space="preserve">The new </w:t>
+      </w:r>
+      <w:r>
+        <w:rPr>
+          <w:rFonts w:ascii="Arial" w:hAnsi="Arial" w:cs="Arial"/>
+        </w:rPr>
+        <w:lastRenderedPageBreak/>
+        <w:t>pipeline we present here is</w:t>
       </w:r>
       <w:r>
         <w:rPr>
@@ -32869,8 +32858,7 @@
       </w:pPr>
     </w:p>
     <w:sectPr>
-      <w:headerReference w:type="default" r:id="rId23"/>
-      <w:footerReference w:type="default" r:id="rId24"/>
+      <w:footerReference w:type="default" r:id="rId23"/>
       <w:pgSz w:w="12240" w:h="15840"/>
       <w:pgMar w:top="1440" w:right="1440" w:bottom="1440" w:left="1440" w:header="720" w:footer="720" w:gutter="0"/>
       <w:lnNumType w:countBy="1" w:restart="continuous"/>
@@ -35158,16 +35146,6 @@
     </w:p>
   </w:footnote>
 </w:footnotes>
-</file>
-
-<file path=word/header1.xml><?xml version="1.0" encoding="utf-8"?>
-<w:hdr xmlns:wpc="http://schemas.microsoft.com/office/word/2010/wordprocessingCanvas" xmlns:cx="http://schemas.microsoft.com/office/drawing/2014/chartex" xmlns:cx1="http://schemas.microsoft.com/office/drawing/2015/9/8/chartex" xmlns:cx2="http://schemas.microsoft.com/office/drawing/2015/10/21/chartex" xmlns:cx3="http://schemas.microsoft.com/office/drawing/2016/5/9/chartex" xmlns:cx4="http://schemas.microsoft.com/office/drawing/2016/5/10/chartex" xmlns:cx5="http://schemas.microsoft.com/office/drawing/2016/5/11/chartex" xmlns:cx6="http://schemas.microsoft.com/office/drawing/2016/5/12/chartex" xmlns:cx7="http://schemas.microsoft.com/office/drawing/2016/5/13/chartex" xmlns:cx8="http://schemas.microsoft.com/office/drawing/2016/5/14/chartex" xmlns:mc="http://schemas.openxmlformats.org/markup-compatibility/2006" xmlns:aink="http://schemas.microsoft.com/office/drawing/2016/ink" xmlns:am3d="http://schemas.microsoft.com/office/drawing/2017/model3d" xmlns:o="urn:schemas-microsoft-com:office:office" xmlns:oel="http://schemas.microsoft.com/office/2019/extlst" xmlns:r="http://schemas.openxmlformats.org/officeDocument/2006/relationships" xmlns:m="http://schemas.openxmlformats.org/officeDocument/2006/math" xmlns:v="urn:schemas-microsoft-com:vml" xmlns:wp14="http://schemas.microsoft.com/office/word/2010/wordprocessingDrawing" xmlns:wp="http://schemas.openxmlformats.org/drawingml/2006/wordprocessingDrawing" xmlns:w10="urn:schemas-microsoft-com:office:word" xmlns:w="http://schemas.openxmlformats.org/wordprocessingml/2006/main" xmlns:w14="http://schemas.microsoft.com/office/word/2010/wordml" xmlns:w15="http://schemas.microsoft.com/office/word/2012/wordml" xmlns:w16cex="http://schemas.microsoft.com/office/word/2018/wordml/cex" xmlns:w16cid="http://schemas.microsoft.com/office/word/2016/wordml/cid" xmlns:w16="http://schemas.microsoft.com/office/word/2018/wordml" xmlns:w16du="http://schemas.microsoft.com/office/word/2023/wordml/word16du" xmlns:w16sdtdh="http://schemas.microsoft.com/office/word/2020/wordml/sdtdatahash" xmlns:w16sdtfl="http://schemas.microsoft.com/office/word/2024/wordml/sdtformatlock" xmlns:w16se="http://schemas.microsoft.com/office/word/2015/wordml/symex" xmlns:wpg="http://schemas.microsoft.com/office/word/2010/wordprocessingGroup" xmlns:wpi="http://schemas.microsoft.com/office/word/2010/wordprocessingInk" xmlns:wne="http://schemas.microsoft.com/office/word/2006/wordml" xmlns:wps="http://schemas.microsoft.com/office/word/2010/wordprocessingShape" mc:Ignorable="w14 w15 w16se w16cid w16 w16cex w16sdtdh w16sdtfl w16du wp14">
-  <w:p>
-    <w:pPr>
-      <w:pStyle w:val="Header"/>
-    </w:pPr>
-  </w:p>
-</w:hdr>
 </file>
 
 <file path=word/numbering.xml><?xml version="1.0" encoding="utf-8"?>

</xml_diff>

<commit_message>
Replaced figures with updated versions
These are the lightweight pngs (Figs 2-5)
</commit_message>
<xml_diff>
--- a/drafts/paRsynth_methods_draft.docx
+++ b/drafts/paRsynth_methods_draft.docx
@@ -907,21 +907,7 @@
         <w:rPr>
           <w:rFonts w:ascii="Arial" w:hAnsi="Arial" w:cs="Arial"/>
         </w:rPr>
-        <w:t xml:space="preserve">We thank Madison Honore, Parker Major, Nina Safranski, and Mikayla Data for feedback on this research. We are grateful to Parker Major, Nina Safranski, and Mikayla Datka for reviewing early versions of our R package vignettes. This research was supported by </w:t>
-      </w:r>
-      <w:proofErr w:type="gramStart"/>
-      <w:r>
-        <w:rPr>
-          <w:rFonts w:ascii="Arial" w:hAnsi="Arial" w:cs="Arial"/>
-        </w:rPr>
-        <w:t>funding to</w:t>
-      </w:r>
-      <w:proofErr w:type="gramEnd"/>
-      <w:r>
-        <w:rPr>
-          <w:rFonts w:ascii="Arial" w:hAnsi="Arial" w:cs="Arial"/>
-        </w:rPr>
-        <w:t xml:space="preserve"> GSV from the Department of Integrative Biology, the Department of Computational Mathematics, Science, and Engineering, the College of Natural Science, and the Office of the Provost at Michigan State University (MSU). AC was supported by the MSU Advanced Computational Research Experiences (ACRES) NSF REU Program in summer 2024 (grant number 2349002).</w:t>
+        <w:t>We thank Madison Honore, Parker Major, Nina Safranski, and Mikayla Data for feedback on this research. We are grateful to Parker Major, Nina Safranski, and Mikayla Datka for reviewing early versions of our R package vignettes. This research was supported by funding to GSV from the Department of Integrative Biology, the Department of Computational Mathematics, Science, and Engineering, the College of Natural Science, and the Office of the Provost at Michigan State University (MSU). AC was supported by the MSU Advanced Computational Research Experiences (ACRES) NSF REU Program in summer 2024 (grant number 2349002).</w:t>
       </w:r>
     </w:p>
     <w:p>
@@ -4409,13 +4395,7 @@
         <w:rPr>
           <w:rFonts w:ascii="Arial" w:hAnsi="Arial" w:cs="Arial"/>
         </w:rPr>
-        <w:t xml:space="preserve">) </w:t>
-      </w:r>
-      <w:r>
-        <w:rPr>
-          <w:rFonts w:ascii="Arial" w:hAnsi="Arial" w:cs="Arial"/>
-        </w:rPr>
-        <w:t>whistles</w:t>
+        <w:t>) whistles</w:t>
       </w:r>
       <w:r>
         <w:rPr>
@@ -5167,19 +5147,11 @@
         </w:rPr>
         <w:t xml:space="preserve"> of the vocal identity signals. </w:t>
       </w:r>
-      <w:proofErr w:type="gramStart"/>
-      <w:r>
-        <w:rPr>
-          <w:rFonts w:ascii="Arial" w:hAnsi="Arial" w:cs="Arial"/>
-        </w:rPr>
-        <w:t>Taken</w:t>
-      </w:r>
-      <w:proofErr w:type="gramEnd"/>
-      <w:r>
-        <w:rPr>
-          <w:rFonts w:ascii="Arial" w:hAnsi="Arial" w:cs="Arial"/>
-        </w:rPr>
-        <w:t xml:space="preserve"> </w:t>
+      <w:r>
+        <w:rPr>
+          <w:rFonts w:ascii="Arial" w:hAnsi="Arial" w:cs="Arial"/>
+        </w:rPr>
+        <w:t xml:space="preserve">Taken </w:t>
       </w:r>
       <w:r>
         <w:rPr>
@@ -6028,18 +6000,24 @@
           <w:sz w:val="22"/>
           <w:szCs w:val="22"/>
         </w:rPr>
-        <w:t xml:space="preserve"> the global head and tail, which </w:t>
-      </w:r>
-      <w:proofErr w:type="gramStart"/>
-      <w:r>
-        <w:rPr>
-          <w:rFonts w:ascii="Arial" w:hAnsi="Arial" w:cs="Arial"/>
-          <w:sz w:val="22"/>
-          <w:szCs w:val="22"/>
-        </w:rPr>
-        <w:t>bounds</w:t>
-      </w:r>
-      <w:proofErr w:type="gramEnd"/>
+        <w:t xml:space="preserve"> the global head and tail, which bounds </w:t>
+      </w:r>
+      <w:r>
+        <w:rPr>
+          <w:rFonts w:ascii="Arial" w:hAnsi="Arial" w:cs="Arial"/>
+          <w:sz w:val="22"/>
+          <w:szCs w:val="22"/>
+        </w:rPr>
+        <w:t xml:space="preserve">the </w:t>
+      </w:r>
+      <w:r>
+        <w:rPr>
+          <w:rFonts w:ascii="Arial" w:hAnsi="Arial" w:cs="Arial"/>
+          <w:sz w:val="22"/>
+          <w:szCs w:val="22"/>
+        </w:rPr>
+        <w:t>structural variation</w:t>
+      </w:r>
       <w:r>
         <w:rPr>
           <w:rFonts w:ascii="Arial" w:hAnsi="Arial" w:cs="Arial"/>
@@ -6054,15 +6032,15 @@
           <w:sz w:val="22"/>
           <w:szCs w:val="22"/>
         </w:rPr>
-        <w:t xml:space="preserve">the </w:t>
-      </w:r>
-      <w:r>
-        <w:rPr>
-          <w:rFonts w:ascii="Arial" w:hAnsi="Arial" w:cs="Arial"/>
-          <w:sz w:val="22"/>
-          <w:szCs w:val="22"/>
-        </w:rPr>
-        <w:t>structural variation</w:t>
+        <w:t>(see Methods)</w:t>
+      </w:r>
+      <w:r>
+        <w:rPr>
+          <w:rFonts w:ascii="Arial" w:hAnsi="Arial" w:cs="Arial"/>
+          <w:sz w:val="22"/>
+          <w:szCs w:val="22"/>
+        </w:rPr>
+        <w:t>.</w:t>
       </w:r>
       <w:r>
         <w:rPr>
@@ -6078,30 +6056,6 @@
           <w:sz w:val="22"/>
           <w:szCs w:val="22"/>
         </w:rPr>
-        <w:t>(see Methods)</w:t>
-      </w:r>
-      <w:r>
-        <w:rPr>
-          <w:rFonts w:ascii="Arial" w:hAnsi="Arial" w:cs="Arial"/>
-          <w:sz w:val="22"/>
-          <w:szCs w:val="22"/>
-        </w:rPr>
-        <w:t>.</w:t>
-      </w:r>
-      <w:r>
-        <w:rPr>
-          <w:rFonts w:ascii="Arial" w:hAnsi="Arial" w:cs="Arial"/>
-          <w:sz w:val="22"/>
-          <w:szCs w:val="22"/>
-        </w:rPr>
-        <w:t xml:space="preserve"> </w:t>
-      </w:r>
-      <w:r>
-        <w:rPr>
-          <w:rFonts w:ascii="Arial" w:hAnsi="Arial" w:cs="Arial"/>
-          <w:sz w:val="22"/>
-          <w:szCs w:val="22"/>
-        </w:rPr>
         <w:t xml:space="preserve">Sections </w:t>
       </w:r>
       <w:r>
@@ -6208,23 +6162,13 @@
         </w:rPr>
         <w:t xml:space="preserve">All sections are created by random generation in ways that </w:t>
       </w:r>
-      <w:proofErr w:type="gramStart"/>
-      <w:r>
-        <w:rPr>
-          <w:rFonts w:ascii="Arial" w:hAnsi="Arial" w:cs="Arial"/>
-          <w:sz w:val="22"/>
-          <w:szCs w:val="22"/>
-        </w:rPr>
-        <w:t>to control</w:t>
-      </w:r>
-      <w:proofErr w:type="gramEnd"/>
-      <w:r>
-        <w:rPr>
-          <w:rFonts w:ascii="Arial" w:hAnsi="Arial" w:cs="Arial"/>
-          <w:sz w:val="22"/>
-          <w:szCs w:val="22"/>
-        </w:rPr>
-        <w:t xml:space="preserve"> how these sections are </w:t>
+      <w:r>
+        <w:rPr>
+          <w:rFonts w:ascii="Arial" w:hAnsi="Arial" w:cs="Arial"/>
+          <w:sz w:val="22"/>
+          <w:szCs w:val="22"/>
+        </w:rPr>
+        <w:t xml:space="preserve">to control how these sections are </w:t>
       </w:r>
       <w:r>
         <w:rPr>
@@ -6423,7 +6367,39 @@
           <w:sz w:val="22"/>
           <w:szCs w:val="22"/>
         </w:rPr>
-        <w:t xml:space="preserve">) denote the start positions of separate sections, which were used to guide the generation of frequency </w:t>
+        <w:t>) denote the start positions of separate sections, which were used to guide the generation of frequency timeseries (see Methods)</w:t>
+      </w:r>
+      <w:r>
+        <w:rPr>
+          <w:rFonts w:ascii="Arial" w:hAnsi="Arial" w:cs="Arial"/>
+          <w:sz w:val="22"/>
+          <w:szCs w:val="22"/>
+        </w:rPr>
+        <w:t>.</w:t>
+      </w:r>
+      <w:r>
+        <w:rPr>
+          <w:rFonts w:ascii="Arial" w:hAnsi="Arial" w:cs="Arial"/>
+          <w:sz w:val="22"/>
+          <w:szCs w:val="22"/>
+        </w:rPr>
+        <w:t xml:space="preserve"> In </w:t>
+      </w:r>
+      <w:r>
+        <w:rPr>
+          <w:rFonts w:ascii="Arial" w:hAnsi="Arial" w:cs="Arial"/>
+          <w:sz w:val="22"/>
+          <w:szCs w:val="22"/>
+        </w:rPr>
+        <w:t>S</w:t>
+      </w:r>
+      <w:r>
+        <w:rPr>
+          <w:rFonts w:ascii="Arial" w:hAnsi="Arial" w:cs="Arial"/>
+          <w:sz w:val="22"/>
+          <w:szCs w:val="22"/>
+        </w:rPr>
+        <w:t xml:space="preserve">tep (iii), </w:t>
       </w:r>
       <w:proofErr w:type="gramStart"/>
       <w:r>
@@ -6432,7 +6408,7 @@
           <w:sz w:val="22"/>
           <w:szCs w:val="22"/>
         </w:rPr>
-        <w:t>timeseries</w:t>
+        <w:t>Parsons</w:t>
       </w:r>
       <w:proofErr w:type="gramEnd"/>
       <w:r>
@@ -6441,56 +6417,6 @@
           <w:sz w:val="22"/>
           <w:szCs w:val="22"/>
         </w:rPr>
-        <w:t xml:space="preserve"> (see Methods)</w:t>
-      </w:r>
-      <w:r>
-        <w:rPr>
-          <w:rFonts w:ascii="Arial" w:hAnsi="Arial" w:cs="Arial"/>
-          <w:sz w:val="22"/>
-          <w:szCs w:val="22"/>
-        </w:rPr>
-        <w:t>.</w:t>
-      </w:r>
-      <w:r>
-        <w:rPr>
-          <w:rFonts w:ascii="Arial" w:hAnsi="Arial" w:cs="Arial"/>
-          <w:sz w:val="22"/>
-          <w:szCs w:val="22"/>
-        </w:rPr>
-        <w:t xml:space="preserve"> In </w:t>
-      </w:r>
-      <w:r>
-        <w:rPr>
-          <w:rFonts w:ascii="Arial" w:hAnsi="Arial" w:cs="Arial"/>
-          <w:sz w:val="22"/>
-          <w:szCs w:val="22"/>
-        </w:rPr>
-        <w:t>S</w:t>
-      </w:r>
-      <w:r>
-        <w:rPr>
-          <w:rFonts w:ascii="Arial" w:hAnsi="Arial" w:cs="Arial"/>
-          <w:sz w:val="22"/>
-          <w:szCs w:val="22"/>
-        </w:rPr>
-        <w:t xml:space="preserve">tep (iii), </w:t>
-      </w:r>
-      <w:proofErr w:type="gramStart"/>
-      <w:r>
-        <w:rPr>
-          <w:rFonts w:ascii="Arial" w:hAnsi="Arial" w:cs="Arial"/>
-          <w:sz w:val="22"/>
-          <w:szCs w:val="22"/>
-        </w:rPr>
-        <w:t>Parsons</w:t>
-      </w:r>
-      <w:proofErr w:type="gramEnd"/>
-      <w:r>
-        <w:rPr>
-          <w:rFonts w:ascii="Arial" w:hAnsi="Arial" w:cs="Arial"/>
-          <w:sz w:val="22"/>
-          <w:szCs w:val="22"/>
-        </w:rPr>
         <w:t xml:space="preserve"> code</w:t>
       </w:r>
       <w:r>
@@ -6515,25 +6441,7 @@
           <w:sz w:val="22"/>
           <w:szCs w:val="22"/>
         </w:rPr>
-        <w:t xml:space="preserve">converted to a </w:t>
-      </w:r>
-      <w:proofErr w:type="gramStart"/>
-      <w:r>
-        <w:rPr>
-          <w:rFonts w:ascii="Arial" w:hAnsi="Arial" w:cs="Arial"/>
-          <w:sz w:val="22"/>
-          <w:szCs w:val="22"/>
-        </w:rPr>
-        <w:t>timeseries</w:t>
-      </w:r>
-      <w:proofErr w:type="gramEnd"/>
-      <w:r>
-        <w:rPr>
-          <w:rFonts w:ascii="Arial" w:hAnsi="Arial" w:cs="Arial"/>
-          <w:sz w:val="22"/>
-          <w:szCs w:val="22"/>
-        </w:rPr>
-        <w:t xml:space="preserve"> of frequency values used to guide the generation of frequency-modulated synthetic vocalizations</w:t>
+        <w:t>converted to a timeseries of frequency values used to guide the generation of frequency-modulated synthetic vocalizations</w:t>
       </w:r>
       <w:r>
         <w:rPr>
@@ -6700,27 +6608,13 @@
         <w:rPr>
           <w:rFonts w:ascii="Arial" w:hAnsi="Arial" w:cs="Arial"/>
         </w:rPr>
-        <w:t xml:space="preserve">as examples of </w:t>
-      </w:r>
-      <w:proofErr w:type="gramStart"/>
-      <w:r>
-        <w:rPr>
-          <w:rFonts w:ascii="Arial" w:hAnsi="Arial" w:cs="Arial"/>
-        </w:rPr>
-        <w:t xml:space="preserve">the </w:t>
-      </w:r>
-      <w:r>
-        <w:rPr>
-          <w:rFonts w:ascii="Arial" w:hAnsi="Arial" w:cs="Arial"/>
-        </w:rPr>
-        <w:t>synthetic</w:t>
-      </w:r>
-      <w:proofErr w:type="gramEnd"/>
-      <w:r>
-        <w:rPr>
-          <w:rFonts w:ascii="Arial" w:hAnsi="Arial" w:cs="Arial"/>
-        </w:rPr>
-        <w:t xml:space="preserve"> vocal identity signals </w:t>
+        <w:t xml:space="preserve">as examples of the </w:t>
+      </w:r>
+      <w:r>
+        <w:rPr>
+          <w:rFonts w:ascii="Arial" w:hAnsi="Arial" w:cs="Arial"/>
+        </w:rPr>
+        <w:t xml:space="preserve">synthetic vocal identity signals </w:t>
       </w:r>
       <w:r>
         <w:rPr>
@@ -7232,9 +7126,9 @@
           <w:szCs w:val="22"/>
         </w:rPr>
         <w:drawing>
-          <wp:inline distT="0" distB="0" distL="0" distR="0" wp14:anchorId="4C6B9319" wp14:editId="1CB58D24">
+          <wp:inline distT="0" distB="0" distL="0" distR="0" wp14:anchorId="4C6B9319" wp14:editId="2C7C22C8">
             <wp:extent cx="5943600" cy="5151120"/>
-            <wp:effectExtent l="0" t="0" r="0" b="0"/>
+            <wp:effectExtent l="0" t="0" r="0" b="5080"/>
             <wp:docPr id="807884687" name="Picture 1"/>
             <wp:cNvGraphicFramePr>
               <a:graphicFrameLocks xmlns:a="http://schemas.openxmlformats.org/drawingml/2006/main" noChangeAspect="1"/>
@@ -7243,20 +7137,19 @@
               <a:graphicData uri="http://schemas.openxmlformats.org/drawingml/2006/picture">
                 <pic:pic xmlns:pic="http://schemas.openxmlformats.org/drawingml/2006/picture">
                   <pic:nvPicPr>
-                    <pic:cNvPr id="0" name="Picture 1"/>
+                    <pic:cNvPr id="807884687" name="Picture 1"/>
                     <pic:cNvPicPr>
                       <a:picLocks noChangeAspect="1" noChangeArrowheads="1"/>
                     </pic:cNvPicPr>
                   </pic:nvPicPr>
                   <pic:blipFill>
-                    <a:blip r:embed="rId14">
+                    <a:blip r:embed="rId14" cstate="print">
                       <a:extLst>
                         <a:ext uri="{28A0092B-C50C-407E-A947-70E740481C1C}">
                           <a14:useLocalDpi xmlns:a14="http://schemas.microsoft.com/office/drawing/2010/main" val="0"/>
                         </a:ext>
                       </a:extLst>
                     </a:blip>
-                    <a:srcRect/>
                     <a:stretch>
                       <a:fillRect/>
                     </a:stretch>
@@ -7290,9 +7183,6 @@
           <w:szCs w:val="22"/>
         </w:rPr>
       </w:pPr>
-      <w:commentRangeStart w:id="2"/>
-      <w:commentRangeStart w:id="3"/>
-      <w:commentRangeStart w:id="4"/>
       <w:r>
         <w:rPr>
           <w:rFonts w:ascii="Arial" w:hAnsi="Arial" w:cs="Arial"/>
@@ -7303,36 +7193,6 @@
         </w:rPr>
         <w:t>Fig</w:t>
       </w:r>
-      <w:commentRangeEnd w:id="2"/>
-      <w:r>
-        <w:rPr>
-          <w:rStyle w:val="CommentReference"/>
-          <w:rFonts w:ascii="Arial" w:hAnsi="Arial" w:cs="Arial"/>
-          <w:sz w:val="22"/>
-          <w:szCs w:val="22"/>
-        </w:rPr>
-        <w:commentReference w:id="2"/>
-      </w:r>
-      <w:commentRangeEnd w:id="3"/>
-      <w:r>
-        <w:rPr>
-          <w:rStyle w:val="CommentReference"/>
-          <w:rFonts w:ascii="Arial" w:hAnsi="Arial" w:cs="Arial"/>
-          <w:sz w:val="22"/>
-          <w:szCs w:val="22"/>
-        </w:rPr>
-        <w:commentReference w:id="3"/>
-      </w:r>
-      <w:commentRangeEnd w:id="4"/>
-      <w:r>
-        <w:rPr>
-          <w:rStyle w:val="CommentReference"/>
-          <w:rFonts w:ascii="Arial" w:hAnsi="Arial" w:cs="Arial"/>
-          <w:sz w:val="22"/>
-          <w:szCs w:val="22"/>
-        </w:rPr>
-        <w:commentReference w:id="4"/>
-      </w:r>
       <w:r>
         <w:rPr>
           <w:rFonts w:ascii="Arial" w:hAnsi="Arial" w:cs="Arial"/>
@@ -7343,7 +7203,6 @@
         </w:rPr>
         <w:t xml:space="preserve"> </w:t>
       </w:r>
-      <w:commentRangeStart w:id="5"/>
       <w:r>
         <w:rPr>
           <w:rFonts w:ascii="Arial" w:hAnsi="Arial" w:cs="Arial"/>
@@ -7354,16 +7213,6 @@
         </w:rPr>
         <w:t>2</w:t>
       </w:r>
-      <w:commentRangeEnd w:id="5"/>
-      <w:r>
-        <w:rPr>
-          <w:rStyle w:val="CommentReference"/>
-          <w:rFonts w:ascii="Arial" w:hAnsi="Arial" w:cs="Arial"/>
-          <w:sz w:val="22"/>
-          <w:szCs w:val="22"/>
-        </w:rPr>
-        <w:commentReference w:id="5"/>
-      </w:r>
       <w:r>
         <w:rPr>
           <w:rFonts w:ascii="Arial" w:hAnsi="Arial" w:cs="Arial"/>
@@ -7797,25 +7646,7 @@
           <w:sz w:val="22"/>
           <w:szCs w:val="22"/>
         </w:rPr>
-        <w:t xml:space="preserve">, individual identities are encoded by shapes per group, and group identities are highlighted in color, </w:t>
-      </w:r>
-      <w:proofErr w:type="gramStart"/>
-      <w:r>
-        <w:rPr>
-          <w:rFonts w:ascii="Arial" w:hAnsi="Arial" w:cs="Arial"/>
-          <w:sz w:val="22"/>
-          <w:szCs w:val="22"/>
-        </w:rPr>
-        <w:t>to match</w:t>
-      </w:r>
-      <w:proofErr w:type="gramEnd"/>
-      <w:r>
-        <w:rPr>
-          <w:rFonts w:ascii="Arial" w:hAnsi="Arial" w:cs="Arial"/>
-          <w:sz w:val="22"/>
-          <w:szCs w:val="22"/>
-        </w:rPr>
-        <w:t xml:space="preserve"> Group 2 in orange and Group </w:t>
+        <w:t xml:space="preserve">, individual identities are encoded by shapes per group, and group identities are highlighted in color, to match Group 2 in orange and Group </w:t>
       </w:r>
       <w:r>
         <w:rPr>
@@ -7870,8 +7701,8 @@
           <w:szCs w:val="22"/>
         </w:rPr>
         <w:drawing>
-          <wp:inline distT="0" distB="0" distL="0" distR="0" wp14:anchorId="7CF9734D" wp14:editId="3452CE54">
-            <wp:extent cx="5943600" cy="5143500"/>
+          <wp:inline distT="0" distB="0" distL="0" distR="0" wp14:anchorId="7CF9734D" wp14:editId="28906386">
+            <wp:extent cx="5934807" cy="5143500"/>
             <wp:effectExtent l="0" t="0" r="0" b="0"/>
             <wp:docPr id="1049799670" name="Picture 1"/>
             <wp:cNvGraphicFramePr>
@@ -7881,20 +7712,19 @@
               <a:graphicData uri="http://schemas.openxmlformats.org/drawingml/2006/picture">
                 <pic:pic xmlns:pic="http://schemas.openxmlformats.org/drawingml/2006/picture">
                   <pic:nvPicPr>
-                    <pic:cNvPr id="0" name="Picture 1"/>
+                    <pic:cNvPr id="1049799670" name="Picture 1"/>
                     <pic:cNvPicPr>
                       <a:picLocks noChangeAspect="1" noChangeArrowheads="1"/>
                     </pic:cNvPicPr>
                   </pic:nvPicPr>
                   <pic:blipFill>
-                    <a:blip r:embed="rId15">
+                    <a:blip r:embed="rId15" cstate="print">
                       <a:extLst>
                         <a:ext uri="{28A0092B-C50C-407E-A947-70E740481C1C}">
                           <a14:useLocalDpi xmlns:a14="http://schemas.microsoft.com/office/drawing/2010/main" val="0"/>
                         </a:ext>
                       </a:extLst>
                     </a:blip>
-                    <a:srcRect/>
                     <a:stretch>
                       <a:fillRect/>
                     </a:stretch>
@@ -7902,7 +7732,7 @@
                   <pic:spPr bwMode="auto">
                     <a:xfrm>
                       <a:off x="0" y="0"/>
-                      <a:ext cx="5943600" cy="5143500"/>
+                      <a:ext cx="5934807" cy="5143500"/>
                     </a:xfrm>
                     <a:prstGeom prst="rect">
                       <a:avLst/>
@@ -7926,7 +7756,6 @@
           <w:rFonts w:ascii="Arial" w:hAnsi="Arial" w:cs="Arial"/>
         </w:rPr>
       </w:pPr>
-      <w:commentRangeStart w:id="6"/>
       <w:r>
         <w:rPr>
           <w:rFonts w:ascii="Arial" w:hAnsi="Arial" w:cs="Arial"/>
@@ -7937,13 +7766,6 @@
         </w:rPr>
         <w:t>Fig</w:t>
       </w:r>
-      <w:commentRangeEnd w:id="6"/>
-      <w:r>
-        <w:rPr>
-          <w:rStyle w:val="CommentReference"/>
-        </w:rPr>
-        <w:commentReference w:id="6"/>
-      </w:r>
       <w:r>
         <w:rPr>
           <w:rFonts w:ascii="Arial" w:hAnsi="Arial" w:cs="Arial"/>
@@ -7954,7 +7776,6 @@
         </w:rPr>
         <w:t xml:space="preserve"> </w:t>
       </w:r>
-      <w:commentRangeStart w:id="7"/>
       <w:r>
         <w:rPr>
           <w:rFonts w:ascii="Arial" w:hAnsi="Arial" w:cs="Arial"/>
@@ -7965,15 +7786,6 @@
         </w:rPr>
         <w:t>3</w:t>
       </w:r>
-      <w:commentRangeEnd w:id="7"/>
-      <w:r>
-        <w:rPr>
-          <w:rStyle w:val="CommentReference"/>
-          <w:sz w:val="22"/>
-          <w:szCs w:val="22"/>
-        </w:rPr>
-        <w:commentReference w:id="7"/>
-      </w:r>
       <w:r>
         <w:rPr>
           <w:rFonts w:ascii="Arial" w:hAnsi="Arial" w:cs="Arial"/>
@@ -8413,25 +8225,7 @@
           <w:sz w:val="22"/>
           <w:szCs w:val="22"/>
         </w:rPr>
-        <w:t xml:space="preserve">matrices. In each acoustic space plot, individual identities are encoded by shapes per group, and group identities are highlighted in color, </w:t>
-      </w:r>
-      <w:proofErr w:type="gramStart"/>
-      <w:r>
-        <w:rPr>
-          <w:rFonts w:ascii="Arial" w:hAnsi="Arial" w:cs="Arial"/>
-          <w:sz w:val="22"/>
-          <w:szCs w:val="22"/>
-        </w:rPr>
-        <w:t>to match</w:t>
-      </w:r>
-      <w:proofErr w:type="gramEnd"/>
-      <w:r>
-        <w:rPr>
-          <w:rFonts w:ascii="Arial" w:hAnsi="Arial" w:cs="Arial"/>
-          <w:sz w:val="22"/>
-          <w:szCs w:val="22"/>
-        </w:rPr>
-        <w:t xml:space="preserve"> Group </w:t>
+        <w:t xml:space="preserve">matrices. In each acoustic space plot, individual identities are encoded by shapes per group, and group identities are highlighted in color, to match Group </w:t>
       </w:r>
       <w:r>
         <w:rPr>
@@ -10467,8 +10261,8 @@
         </w:rPr>
         <w:lastRenderedPageBreak/>
         <w:drawing>
-          <wp:inline distT="0" distB="0" distL="0" distR="0" wp14:anchorId="1FD25CCE" wp14:editId="5385CA71">
-            <wp:extent cx="5937885" cy="5146675"/>
+          <wp:inline distT="0" distB="0" distL="0" distR="0" wp14:anchorId="1FD25CCE" wp14:editId="2ED85F91">
+            <wp:extent cx="5937885" cy="5146167"/>
             <wp:effectExtent l="0" t="0" r="5715" b="0"/>
             <wp:docPr id="1912251250" name="Picture 1"/>
             <wp:cNvGraphicFramePr>
@@ -10478,20 +10272,19 @@
               <a:graphicData uri="http://schemas.openxmlformats.org/drawingml/2006/picture">
                 <pic:pic xmlns:pic="http://schemas.openxmlformats.org/drawingml/2006/picture">
                   <pic:nvPicPr>
-                    <pic:cNvPr id="0" name="Picture 1"/>
+                    <pic:cNvPr id="1912251250" name="Picture 1"/>
                     <pic:cNvPicPr>
                       <a:picLocks noChangeAspect="1" noChangeArrowheads="1"/>
                     </pic:cNvPicPr>
                   </pic:nvPicPr>
                   <pic:blipFill>
-                    <a:blip r:embed="rId16">
+                    <a:blip r:embed="rId16" cstate="print">
                       <a:extLst>
                         <a:ext uri="{28A0092B-C50C-407E-A947-70E740481C1C}">
                           <a14:useLocalDpi xmlns:a14="http://schemas.microsoft.com/office/drawing/2010/main" val="0"/>
                         </a:ext>
                       </a:extLst>
                     </a:blip>
-                    <a:srcRect/>
                     <a:stretch>
                       <a:fillRect/>
                     </a:stretch>
@@ -10499,7 +10292,7 @@
                   <pic:spPr bwMode="auto">
                     <a:xfrm>
                       <a:off x="0" y="0"/>
-                      <a:ext cx="5937885" cy="5146675"/>
+                      <a:ext cx="5937885" cy="5146167"/>
                     </a:xfrm>
                     <a:prstGeom prst="rect">
                       <a:avLst/>
@@ -10523,7 +10316,6 @@
           <w:rFonts w:ascii="Arial" w:hAnsi="Arial" w:cs="Arial"/>
         </w:rPr>
       </w:pPr>
-      <w:commentRangeStart w:id="8"/>
       <w:r>
         <w:rPr>
           <w:rFonts w:ascii="Arial" w:hAnsi="Arial" w:cs="Arial"/>
@@ -10534,13 +10326,6 @@
         </w:rPr>
         <w:t>Fig</w:t>
       </w:r>
-      <w:commentRangeEnd w:id="8"/>
-      <w:r>
-        <w:rPr>
-          <w:rStyle w:val="CommentReference"/>
-        </w:rPr>
-        <w:commentReference w:id="8"/>
-      </w:r>
       <w:r>
         <w:rPr>
           <w:rFonts w:ascii="Arial" w:hAnsi="Arial" w:cs="Arial"/>
@@ -10551,8 +10336,6 @@
         </w:rPr>
         <w:t xml:space="preserve"> </w:t>
       </w:r>
-      <w:commentRangeStart w:id="9"/>
-      <w:commentRangeStart w:id="10"/>
       <w:r>
         <w:rPr>
           <w:rFonts w:ascii="Arial" w:hAnsi="Arial" w:cs="Arial"/>
@@ -10561,31 +10344,7 @@
           <w:sz w:val="22"/>
           <w:szCs w:val="22"/>
         </w:rPr>
-        <w:t>4</w:t>
-      </w:r>
-      <w:commentRangeEnd w:id="9"/>
-      <w:r>
-        <w:rPr>
-          <w:rStyle w:val="CommentReference"/>
-        </w:rPr>
-        <w:commentReference w:id="9"/>
-      </w:r>
-      <w:commentRangeEnd w:id="10"/>
-      <w:r>
-        <w:rPr>
-          <w:rStyle w:val="CommentReference"/>
-        </w:rPr>
-        <w:commentReference w:id="10"/>
-      </w:r>
-      <w:r>
-        <w:rPr>
-          <w:rFonts w:ascii="Arial" w:hAnsi="Arial" w:cs="Arial"/>
-          <w:b/>
-          <w:bCs/>
-          <w:sz w:val="22"/>
-          <w:szCs w:val="22"/>
-        </w:rPr>
-        <w:t>:</w:t>
+        <w:t>4:</w:t>
       </w:r>
       <w:r>
         <w:rPr>
@@ -10884,25 +10643,7 @@
           <w:sz w:val="22"/>
           <w:szCs w:val="22"/>
         </w:rPr>
-        <w:t xml:space="preserve"> symbol for each treatment combination represents the </w:t>
-      </w:r>
-      <w:proofErr w:type="gramStart"/>
-      <w:r>
-        <w:rPr>
-          <w:rFonts w:ascii="Arial" w:hAnsi="Arial" w:cs="Arial"/>
-          <w:sz w:val="22"/>
-          <w:szCs w:val="22"/>
-        </w:rPr>
-        <w:t>mean</w:t>
-      </w:r>
-      <w:proofErr w:type="gramEnd"/>
-      <w:r>
-        <w:rPr>
-          <w:rFonts w:ascii="Arial" w:hAnsi="Arial" w:cs="Arial"/>
-          <w:sz w:val="22"/>
-          <w:szCs w:val="22"/>
-        </w:rPr>
-        <w:t xml:space="preserve"> of the maximum accuracy values obtained across groups.</w:t>
+        <w:t xml:space="preserve"> symbol for each treatment combination represents the mean of the maximum accuracy values obtained across groups.</w:t>
       </w:r>
       <w:r>
         <w:rPr>
@@ -11541,8 +11282,8 @@
           <w:szCs w:val="22"/>
         </w:rPr>
         <w:drawing>
-          <wp:inline distT="0" distB="0" distL="0" distR="0" wp14:anchorId="7FBA0E65" wp14:editId="645A8D97">
-            <wp:extent cx="5939790" cy="5149850"/>
+          <wp:inline distT="0" distB="0" distL="0" distR="0" wp14:anchorId="7FBA0E65" wp14:editId="224E06E9">
+            <wp:extent cx="5939790" cy="5147818"/>
             <wp:effectExtent l="0" t="0" r="3810" b="0"/>
             <wp:docPr id="2147394569" name="Picture 6"/>
             <wp:cNvGraphicFramePr>
@@ -11552,20 +11293,19 @@
               <a:graphicData uri="http://schemas.openxmlformats.org/drawingml/2006/picture">
                 <pic:pic xmlns:pic="http://schemas.openxmlformats.org/drawingml/2006/picture">
                   <pic:nvPicPr>
-                    <pic:cNvPr id="0" name="Picture 6"/>
+                    <pic:cNvPr id="2147394569" name="Picture 6"/>
                     <pic:cNvPicPr>
                       <a:picLocks noChangeAspect="1" noChangeArrowheads="1"/>
                     </pic:cNvPicPr>
                   </pic:nvPicPr>
                   <pic:blipFill>
-                    <a:blip r:embed="rId17">
+                    <a:blip r:embed="rId17" cstate="print">
                       <a:extLst>
                         <a:ext uri="{28A0092B-C50C-407E-A947-70E740481C1C}">
                           <a14:useLocalDpi xmlns:a14="http://schemas.microsoft.com/office/drawing/2010/main" val="0"/>
                         </a:ext>
                       </a:extLst>
                     </a:blip>
-                    <a:srcRect/>
                     <a:stretch>
                       <a:fillRect/>
                     </a:stretch>
@@ -11573,7 +11313,7 @@
                   <pic:spPr bwMode="auto">
                     <a:xfrm>
                       <a:off x="0" y="0"/>
-                      <a:ext cx="5939790" cy="5149850"/>
+                      <a:ext cx="5939790" cy="5147818"/>
                     </a:xfrm>
                     <a:prstGeom prst="rect">
                       <a:avLst/>
@@ -11620,8 +11360,7 @@
         </w:rPr>
         <w:t xml:space="preserve"> </w:t>
       </w:r>
-      <w:commentRangeStart w:id="11"/>
-      <w:commentRangeStart w:id="12"/>
+      <w:commentRangeStart w:id="2"/>
       <w:r>
         <w:rPr>
           <w:rFonts w:ascii="Arial" w:hAnsi="Arial" w:cs="Arial"/>
@@ -11632,19 +11371,12 @@
         </w:rPr>
         <w:t>5</w:t>
       </w:r>
-      <w:commentRangeEnd w:id="11"/>
-      <w:commentRangeEnd w:id="12"/>
+      <w:commentRangeEnd w:id="2"/>
       <w:r>
         <w:rPr>
           <w:rStyle w:val="CommentReference"/>
         </w:rPr>
-        <w:commentReference w:id="11"/>
-      </w:r>
-      <w:r>
-        <w:rPr>
-          <w:rStyle w:val="CommentReference"/>
-        </w:rPr>
-        <w:commentReference w:id="12"/>
+        <w:commentReference w:id="2"/>
       </w:r>
       <w:r>
         <w:rPr>
@@ -12438,7 +12170,7 @@
         </w:rPr>
         <w:t xml:space="preserve"> </w:t>
       </w:r>
-      <w:commentRangeStart w:id="13"/>
+      <w:commentRangeStart w:id="3"/>
       <w:r>
         <w:rPr>
           <w:rFonts w:ascii="Arial" w:hAnsi="Arial" w:cs="Arial"/>
@@ -12475,12 +12207,12 @@
         </w:rPr>
         <w:t>.</w:t>
       </w:r>
-      <w:commentRangeEnd w:id="13"/>
+      <w:commentRangeEnd w:id="3"/>
       <w:r>
         <w:rPr>
           <w:rStyle w:val="CommentReference"/>
         </w:rPr>
-        <w:commentReference w:id="13"/>
+        <w:commentReference w:id="3"/>
       </w:r>
       <w:r>
         <w:rPr>
@@ -12915,19 +12647,11 @@
         </w:rPr>
         <w:t xml:space="preserve">a </w:t>
       </w:r>
-      <w:proofErr w:type="gramStart"/>
-      <w:r>
-        <w:rPr>
-          <w:rFonts w:ascii="Arial" w:hAnsi="Arial" w:cs="Arial"/>
-        </w:rPr>
-        <w:t>computational</w:t>
-      </w:r>
-      <w:proofErr w:type="gramEnd"/>
-      <w:r>
-        <w:rPr>
-          <w:rFonts w:ascii="Arial" w:hAnsi="Arial" w:cs="Arial"/>
-        </w:rPr>
-        <w:t xml:space="preserve"> tool</w:t>
+      <w:r>
+        <w:rPr>
+          <w:rFonts w:ascii="Arial" w:hAnsi="Arial" w:cs="Arial"/>
+        </w:rPr>
+        <w:t>computational tool</w:t>
       </w:r>
       <w:r>
         <w:rPr>
@@ -13297,21 +13021,7 @@
         <w:rPr>
           <w:rFonts w:ascii="Arial" w:hAnsi="Arial" w:cs="Arial"/>
         </w:rPr>
-        <w:t xml:space="preserve">We can also control how much information is encoded at one social level </w:t>
-      </w:r>
-      <w:proofErr w:type="gramStart"/>
-      <w:r>
-        <w:rPr>
-          <w:rFonts w:ascii="Arial" w:hAnsi="Arial" w:cs="Arial"/>
-        </w:rPr>
-        <w:t>relative</w:t>
-      </w:r>
-      <w:proofErr w:type="gramEnd"/>
-      <w:r>
-        <w:rPr>
-          <w:rFonts w:ascii="Arial" w:hAnsi="Arial" w:cs="Arial"/>
-        </w:rPr>
-        <w:t xml:space="preserve"> to another. </w:t>
+        <w:t xml:space="preserve">We can also control how much information is encoded at one social level relative to another. </w:t>
       </w:r>
       <w:r>
         <w:rPr>
@@ -15815,21 +15525,7 @@
         <w:rPr>
           <w:rFonts w:ascii="Arial" w:hAnsi="Arial" w:cs="Arial"/>
         </w:rPr>
-        <w:t xml:space="preserve">, as well as our approach to </w:t>
-      </w:r>
-      <w:proofErr w:type="gramStart"/>
-      <w:r>
-        <w:rPr>
-          <w:rFonts w:ascii="Arial" w:hAnsi="Arial" w:cs="Arial"/>
-        </w:rPr>
-        <w:t>divide</w:t>
-      </w:r>
-      <w:proofErr w:type="gramEnd"/>
-      <w:r>
-        <w:rPr>
-          <w:rFonts w:ascii="Arial" w:hAnsi="Arial" w:cs="Arial"/>
-        </w:rPr>
-        <w:t xml:space="preserve"> group information </w:t>
+        <w:t xml:space="preserve">, as well as our approach to divide group information </w:t>
       </w:r>
       <w:r>
         <w:rPr>
@@ -16483,21 +16179,7 @@
         <w:rPr>
           <w:rFonts w:ascii="Arial" w:hAnsi="Arial" w:cs="Arial"/>
         </w:rPr>
-        <w:t xml:space="preserve"> creating a </w:t>
-      </w:r>
-      <w:proofErr w:type="gramStart"/>
-      <w:r>
-        <w:rPr>
-          <w:rFonts w:ascii="Arial" w:hAnsi="Arial" w:cs="Arial"/>
-        </w:rPr>
-        <w:t>timeseries</w:t>
-      </w:r>
-      <w:proofErr w:type="gramEnd"/>
-      <w:r>
-        <w:rPr>
-          <w:rFonts w:ascii="Arial" w:hAnsi="Arial" w:cs="Arial"/>
-        </w:rPr>
-        <w:t xml:space="preserve"> of frequency values from these directional changes</w:t>
+        <w:t xml:space="preserve"> creating a timeseries of frequency values from these directional changes</w:t>
       </w:r>
       <w:r>
         <w:rPr>
@@ -17780,14 +17462,12 @@
         </w:rPr>
         <w:t xml:space="preserve">generate a </w:t>
       </w:r>
-      <w:proofErr w:type="gramStart"/>
       <w:r>
         <w:rPr>
           <w:rFonts w:ascii="Arial" w:hAnsi="Arial" w:cs="Arial"/>
         </w:rPr>
         <w:t>timeseries</w:t>
       </w:r>
-      <w:proofErr w:type="gramEnd"/>
       <w:r>
         <w:rPr>
           <w:rFonts w:ascii="Arial" w:hAnsi="Arial" w:cs="Arial"/>
@@ -17830,14 +17510,12 @@
         </w:rPr>
         <w:t xml:space="preserve"> created a </w:t>
       </w:r>
-      <w:proofErr w:type="gramStart"/>
       <w:r>
         <w:rPr>
           <w:rFonts w:ascii="Arial" w:hAnsi="Arial" w:cs="Arial"/>
         </w:rPr>
         <w:t>timeseries</w:t>
       </w:r>
-      <w:proofErr w:type="gramEnd"/>
       <w:r>
         <w:rPr>
           <w:rFonts w:ascii="Arial" w:hAnsi="Arial" w:cs="Arial"/>
@@ -18084,14 +17762,12 @@
         </w:rPr>
         <w:t xml:space="preserve">generating frequency </w:t>
       </w:r>
-      <w:proofErr w:type="gramStart"/>
       <w:r>
         <w:rPr>
           <w:rFonts w:ascii="Arial" w:hAnsi="Arial" w:cs="Arial"/>
         </w:rPr>
         <w:t>timeseries</w:t>
       </w:r>
-      <w:proofErr w:type="gramEnd"/>
       <w:r>
         <w:rPr>
           <w:rFonts w:ascii="Arial" w:hAnsi="Arial" w:cs="Arial"/>
@@ -18126,21 +17802,7 @@
         <w:rPr>
           <w:rFonts w:ascii="Arial" w:hAnsi="Arial" w:cs="Arial"/>
         </w:rPr>
-        <w:t xml:space="preserve"> and this approach can yield less </w:t>
-      </w:r>
-      <w:proofErr w:type="gramStart"/>
-      <w:r>
-        <w:rPr>
-          <w:rFonts w:ascii="Arial" w:hAnsi="Arial" w:cs="Arial"/>
-        </w:rPr>
-        <w:t>bounded</w:t>
-      </w:r>
-      <w:proofErr w:type="gramEnd"/>
-      <w:r>
-        <w:rPr>
-          <w:rFonts w:ascii="Arial" w:hAnsi="Arial" w:cs="Arial"/>
-        </w:rPr>
-        <w:t xml:space="preserve"> structural variation of signals in the same dataset</w:t>
+        <w:t xml:space="preserve"> and this approach can yield less bounded structural variation of signals in the same dataset</w:t>
       </w:r>
       <w:r>
         <w:rPr>
@@ -18371,21 +18033,7 @@
         <w:rPr>
           <w:rFonts w:ascii="Arial" w:hAnsi="Arial" w:cs="Arial"/>
         </w:rPr>
-        <w:t xml:space="preserve"> option to generate all </w:t>
-      </w:r>
-      <w:proofErr w:type="gramStart"/>
-      <w:r>
-        <w:rPr>
-          <w:rFonts w:ascii="Arial" w:hAnsi="Arial" w:cs="Arial"/>
-        </w:rPr>
-        <w:t>example</w:t>
-      </w:r>
-      <w:proofErr w:type="gramEnd"/>
-      <w:r>
-        <w:rPr>
-          <w:rFonts w:ascii="Arial" w:hAnsi="Arial" w:cs="Arial"/>
-        </w:rPr>
-        <w:t xml:space="preserve"> and simulated datasets</w:t>
+        <w:t xml:space="preserve"> option to generate all example and simulated datasets</w:t>
       </w:r>
       <w:r>
         <w:rPr>
@@ -18734,57 +18382,69 @@
         <w:rPr>
           <w:rFonts w:ascii="Arial" w:hAnsi="Arial" w:cs="Arial"/>
         </w:rPr>
-        <w:t xml:space="preserve"> the frequency </w:t>
-      </w:r>
-      <w:proofErr w:type="gramStart"/>
+        <w:t xml:space="preserve"> the frequency timeseries </w:t>
+      </w:r>
+      <w:r>
+        <w:rPr>
+          <w:rFonts w:ascii="Arial" w:hAnsi="Arial" w:cs="Arial"/>
+        </w:rPr>
+        <w:t>as</w:t>
+      </w:r>
+      <w:r>
+        <w:rPr>
+          <w:rFonts w:ascii="Arial" w:hAnsi="Arial" w:cs="Arial"/>
+        </w:rPr>
+        <w:t xml:space="preserve"> the</w:t>
+      </w:r>
+      <w:r>
+        <w:rPr>
+          <w:rFonts w:ascii="Arial" w:hAnsi="Arial" w:cs="Arial"/>
+        </w:rPr>
+        <w:t xml:space="preserve"> input </w:t>
+      </w:r>
+      <w:r>
+        <w:rPr>
+          <w:rFonts w:ascii="Arial" w:hAnsi="Arial" w:cs="Arial"/>
+        </w:rPr>
+        <w:t xml:space="preserve">to the </w:t>
+      </w:r>
+      <w:r>
+        <w:rPr>
+          <w:rFonts w:ascii="Arial" w:hAnsi="Arial" w:cs="Arial"/>
+        </w:rPr>
+        <w:t xml:space="preserve">pitch </w:t>
+      </w:r>
+      <w:r>
+        <w:rPr>
+          <w:rFonts w:ascii="Arial" w:hAnsi="Arial" w:cs="Arial"/>
+        </w:rPr>
+        <w:t xml:space="preserve">argument so that </w:t>
+      </w:r>
+      <w:proofErr w:type="spellStart"/>
+      <w:r>
+        <w:rPr>
+          <w:rFonts w:ascii="Arial" w:hAnsi="Arial" w:cs="Arial"/>
+        </w:rPr>
+        <w:t>soundgen</w:t>
+      </w:r>
+      <w:proofErr w:type="spellEnd"/>
+      <w:r>
+        <w:rPr>
+          <w:rFonts w:ascii="Arial" w:hAnsi="Arial" w:cs="Arial"/>
+        </w:rPr>
+        <w:t xml:space="preserve"> would use these values as anchors to guide frequency modulation. In this version of our pipeline, we do not specify timestamps for each frequency value in the </w:t>
+      </w:r>
       <w:r>
         <w:rPr>
           <w:rFonts w:ascii="Arial" w:hAnsi="Arial" w:cs="Arial"/>
         </w:rPr>
         <w:t>timeseries</w:t>
       </w:r>
-      <w:proofErr w:type="gramEnd"/>
-      <w:r>
-        <w:rPr>
-          <w:rFonts w:ascii="Arial" w:hAnsi="Arial" w:cs="Arial"/>
-        </w:rPr>
-        <w:t xml:space="preserve"> </w:t>
-      </w:r>
-      <w:r>
-        <w:rPr>
-          <w:rFonts w:ascii="Arial" w:hAnsi="Arial" w:cs="Arial"/>
-        </w:rPr>
-        <w:t>as</w:t>
-      </w:r>
-      <w:r>
-        <w:rPr>
-          <w:rFonts w:ascii="Arial" w:hAnsi="Arial" w:cs="Arial"/>
-        </w:rPr>
-        <w:t xml:space="preserve"> the</w:t>
-      </w:r>
-      <w:r>
-        <w:rPr>
-          <w:rFonts w:ascii="Arial" w:hAnsi="Arial" w:cs="Arial"/>
-        </w:rPr>
-        <w:t xml:space="preserve"> input </w:t>
-      </w:r>
-      <w:r>
-        <w:rPr>
-          <w:rFonts w:ascii="Arial" w:hAnsi="Arial" w:cs="Arial"/>
-        </w:rPr>
-        <w:t xml:space="preserve">to the </w:t>
-      </w:r>
-      <w:r>
-        <w:rPr>
-          <w:rFonts w:ascii="Arial" w:hAnsi="Arial" w:cs="Arial"/>
-        </w:rPr>
-        <w:t xml:space="preserve">pitch </w:t>
-      </w:r>
-      <w:r>
-        <w:rPr>
-          <w:rFonts w:ascii="Arial" w:hAnsi="Arial" w:cs="Arial"/>
-        </w:rPr>
-        <w:t xml:space="preserve">argument so that </w:t>
+      <w:r>
+        <w:rPr>
+          <w:rFonts w:ascii="Arial" w:hAnsi="Arial" w:cs="Arial"/>
+        </w:rPr>
+        <w:t xml:space="preserve">. By default, </w:t>
       </w:r>
       <w:proofErr w:type="spellStart"/>
       <w:r>
@@ -18798,34 +18458,6 @@
         <w:rPr>
           <w:rFonts w:ascii="Arial" w:hAnsi="Arial" w:cs="Arial"/>
         </w:rPr>
-        <w:t xml:space="preserve"> would use these values as anchors to guide frequency modulation. In this version of our pipeline, we do not specify timestamps for each frequency value in the </w:t>
-      </w:r>
-      <w:proofErr w:type="gramStart"/>
-      <w:r>
-        <w:rPr>
-          <w:rFonts w:ascii="Arial" w:hAnsi="Arial" w:cs="Arial"/>
-        </w:rPr>
-        <w:t>timeseries</w:t>
-      </w:r>
-      <w:proofErr w:type="gramEnd"/>
-      <w:r>
-        <w:rPr>
-          <w:rFonts w:ascii="Arial" w:hAnsi="Arial" w:cs="Arial"/>
-        </w:rPr>
-        <w:t xml:space="preserve">. By default, </w:t>
-      </w:r>
-      <w:proofErr w:type="spellStart"/>
-      <w:r>
-        <w:rPr>
-          <w:rFonts w:ascii="Arial" w:hAnsi="Arial" w:cs="Arial"/>
-        </w:rPr>
-        <w:t>soundgen</w:t>
-      </w:r>
-      <w:proofErr w:type="spellEnd"/>
-      <w:r>
-        <w:rPr>
-          <w:rFonts w:ascii="Arial" w:hAnsi="Arial" w:cs="Arial"/>
-        </w:rPr>
         <w:t xml:space="preserve"> version 2.7.1 considered frequency values to be evenly split across</w:t>
       </w:r>
       <w:r>
@@ -18838,21 +18470,7 @@
         <w:rPr>
           <w:rFonts w:ascii="Arial" w:hAnsi="Arial" w:cs="Arial"/>
         </w:rPr>
-        <w:t xml:space="preserve">, which we specified using </w:t>
-      </w:r>
-      <w:proofErr w:type="gramStart"/>
-      <w:r>
-        <w:rPr>
-          <w:rFonts w:ascii="Arial" w:hAnsi="Arial" w:cs="Arial"/>
-        </w:rPr>
-        <w:t>the argument</w:t>
-      </w:r>
-      <w:proofErr w:type="gramEnd"/>
-      <w:r>
-        <w:rPr>
-          <w:rFonts w:ascii="Arial" w:hAnsi="Arial" w:cs="Arial"/>
-        </w:rPr>
-        <w:t xml:space="preserve"> </w:t>
+        <w:t xml:space="preserve">, which we specified using the argument </w:t>
       </w:r>
       <w:proofErr w:type="spellStart"/>
       <w:r>
@@ -20043,14 +19661,12 @@
         </w:rPr>
         <w:t xml:space="preserve">of 1 kHz to create </w:t>
       </w:r>
-      <w:proofErr w:type="gramStart"/>
       <w:r>
         <w:rPr>
           <w:rFonts w:ascii="Arial" w:hAnsi="Arial" w:cs="Arial"/>
         </w:rPr>
         <w:t>timeseries</w:t>
       </w:r>
-      <w:proofErr w:type="gramEnd"/>
       <w:r>
         <w:rPr>
           <w:rFonts w:ascii="Arial" w:hAnsi="Arial" w:cs="Arial"/>
@@ -21667,21 +21283,7 @@
         <w:rPr>
           <w:rFonts w:ascii="Arial" w:hAnsi="Arial" w:cs="Arial"/>
         </w:rPr>
-        <w:t xml:space="preserve">universal trait </w:t>
-      </w:r>
-      <w:proofErr w:type="gramStart"/>
-      <w:r>
-        <w:rPr>
-          <w:rFonts w:ascii="Arial" w:hAnsi="Arial" w:cs="Arial"/>
-        </w:rPr>
-        <w:t>space per</w:t>
-      </w:r>
-      <w:proofErr w:type="gramEnd"/>
-      <w:r>
-        <w:rPr>
-          <w:rFonts w:ascii="Arial" w:hAnsi="Arial" w:cs="Arial"/>
-        </w:rPr>
-        <w:t xml:space="preserve"> measurement method</w:t>
+        <w:t>universal trait space per measurement method</w:t>
       </w:r>
       <w:r>
         <w:rPr>
@@ -22598,21 +22200,7 @@
         <w:rPr>
           <w:rFonts w:ascii="Arial" w:hAnsi="Arial" w:cs="Arial"/>
         </w:rPr>
-        <w:t xml:space="preserve">the highest </w:t>
-      </w:r>
-      <w:proofErr w:type="gramStart"/>
-      <w:r>
-        <w:rPr>
-          <w:rFonts w:ascii="Arial" w:hAnsi="Arial" w:cs="Arial"/>
-        </w:rPr>
-        <w:t>accuracies</w:t>
-      </w:r>
-      <w:proofErr w:type="gramEnd"/>
-      <w:r>
-        <w:rPr>
-          <w:rFonts w:ascii="Arial" w:hAnsi="Arial" w:cs="Arial"/>
-        </w:rPr>
-        <w:t xml:space="preserve"> of information detection at the social level</w:t>
+        <w:t>the highest accuracies of information detection at the social level</w:t>
       </w:r>
       <w:r>
         <w:rPr>
@@ -23283,14 +22871,12 @@
         </w:rPr>
         <w:t xml:space="preserve">ithin </w:t>
       </w:r>
-      <w:proofErr w:type="gramStart"/>
       <w:r>
         <w:rPr>
           <w:rFonts w:ascii="Arial" w:hAnsi="Arial" w:cs="Arial"/>
         </w:rPr>
         <w:t>a treatment</w:t>
       </w:r>
-      <w:proofErr w:type="gramEnd"/>
       <w:r>
         <w:rPr>
           <w:rFonts w:ascii="Arial" w:hAnsi="Arial" w:cs="Arial"/>
@@ -23393,19 +22979,11 @@
         </w:rPr>
         <w:t xml:space="preserve">all </w:t>
       </w:r>
-      <w:proofErr w:type="gramStart"/>
-      <w:r>
-        <w:rPr>
-          <w:rFonts w:ascii="Arial" w:hAnsi="Arial" w:cs="Arial"/>
-        </w:rPr>
-        <w:t>exemplars of</w:t>
-      </w:r>
-      <w:proofErr w:type="gramEnd"/>
-      <w:r>
-        <w:rPr>
-          <w:rFonts w:ascii="Arial" w:hAnsi="Arial" w:cs="Arial"/>
-        </w:rPr>
-        <w:t xml:space="preserve"> vocalizations per individual</w:t>
+      <w:r>
+        <w:rPr>
+          <w:rFonts w:ascii="Arial" w:hAnsi="Arial" w:cs="Arial"/>
+        </w:rPr>
+        <w:t>exemplars of vocalizations per individual</w:t>
       </w:r>
       <w:r>
         <w:rPr>
@@ -23719,21 +23297,7 @@
         <w:rPr>
           <w:rFonts w:ascii="Arial" w:hAnsi="Arial" w:cs="Arial"/>
         </w:rPr>
-        <w:t xml:space="preserve">approach for analyzing synthetic datasets produced during our simulation experiments as for </w:t>
-      </w:r>
-      <w:proofErr w:type="gramStart"/>
-      <w:r>
-        <w:rPr>
-          <w:rFonts w:ascii="Arial" w:hAnsi="Arial" w:cs="Arial"/>
-        </w:rPr>
-        <w:t>the example</w:t>
-      </w:r>
-      <w:proofErr w:type="gramEnd"/>
-      <w:r>
-        <w:rPr>
-          <w:rFonts w:ascii="Arial" w:hAnsi="Arial" w:cs="Arial"/>
-        </w:rPr>
-        <w:t xml:space="preserve"> datasets described above. </w:t>
+        <w:t xml:space="preserve">approach for analyzing synthetic datasets produced during our simulation experiments as for the example datasets described above. </w:t>
       </w:r>
       <w:r>
         <w:rPr>
@@ -24140,21 +23704,7 @@
         <w:rPr>
           <w:rFonts w:ascii="Arial" w:hAnsi="Arial" w:cs="Arial"/>
         </w:rPr>
-        <w:t xml:space="preserve"> (using the option to generate frequency </w:t>
-      </w:r>
-      <w:proofErr w:type="gramStart"/>
-      <w:r>
-        <w:rPr>
-          <w:rFonts w:ascii="Arial" w:hAnsi="Arial" w:cs="Arial"/>
-        </w:rPr>
-        <w:t>timeseries</w:t>
-      </w:r>
-      <w:proofErr w:type="gramEnd"/>
-      <w:r>
-        <w:rPr>
-          <w:rFonts w:ascii="Arial" w:hAnsi="Arial" w:cs="Arial"/>
-        </w:rPr>
-        <w:t xml:space="preserve"> as a continuous trajectory)</w:t>
+        <w:t xml:space="preserve"> (using the option to generate frequency timeseries as a continuous trajectory)</w:t>
       </w:r>
       <w:r>
         <w:rPr>
@@ -24397,21 +23947,7 @@
         <w:rPr>
           <w:rFonts w:ascii="Arial" w:hAnsi="Arial" w:cs="Arial"/>
         </w:rPr>
-        <w:t xml:space="preserve">the edit and SPCC distance matrices as described above for </w:t>
-      </w:r>
-      <w:proofErr w:type="gramStart"/>
-      <w:r>
-        <w:rPr>
-          <w:rFonts w:ascii="Arial" w:hAnsi="Arial" w:cs="Arial"/>
-        </w:rPr>
-        <w:t>the example</w:t>
-      </w:r>
-      <w:proofErr w:type="gramEnd"/>
-      <w:r>
-        <w:rPr>
-          <w:rFonts w:ascii="Arial" w:hAnsi="Arial" w:cs="Arial"/>
-        </w:rPr>
-        <w:t xml:space="preserve"> datasets, although with minor changes. </w:t>
+        <w:t xml:space="preserve">the edit and SPCC distance matrices as described above for the example datasets, although with minor changes. </w:t>
       </w:r>
       <w:r>
         <w:rPr>
@@ -24760,21 +24296,7 @@
         <w:rPr>
           <w:rFonts w:ascii="Arial" w:hAnsi="Arial" w:cs="Arial"/>
         </w:rPr>
-        <w:t xml:space="preserve"> approach to calculate </w:t>
-      </w:r>
-      <w:proofErr w:type="gramStart"/>
-      <w:r>
-        <w:rPr>
-          <w:rFonts w:ascii="Arial" w:hAnsi="Arial" w:cs="Arial"/>
-        </w:rPr>
-        <w:t>the accuracy</w:t>
-      </w:r>
-      <w:proofErr w:type="gramEnd"/>
-      <w:r>
-        <w:rPr>
-          <w:rFonts w:ascii="Arial" w:hAnsi="Arial" w:cs="Arial"/>
-        </w:rPr>
-        <w:t xml:space="preserve"> with which predicted labels matched original class labels</w:t>
+        <w:t xml:space="preserve"> approach to calculate the accuracy with which predicted labels matched original class labels</w:t>
       </w:r>
       <w:r>
         <w:rPr>
@@ -24906,21 +24428,7 @@
         <w:rPr>
           <w:rFonts w:ascii="Arial" w:hAnsi="Arial" w:cs="Arial"/>
         </w:rPr>
-        <w:t xml:space="preserve">We generally expected to find higher clustering accuracy back to original class labels at the social level that we used </w:t>
-      </w:r>
-      <w:proofErr w:type="gramStart"/>
-      <w:r>
-        <w:rPr>
-          <w:rFonts w:ascii="Arial" w:hAnsi="Arial" w:cs="Arial"/>
-        </w:rPr>
-        <w:t>to originally</w:t>
-      </w:r>
-      <w:proofErr w:type="gramEnd"/>
-      <w:r>
-        <w:rPr>
-          <w:rFonts w:ascii="Arial" w:hAnsi="Arial" w:cs="Arial"/>
-        </w:rPr>
-        <w:t xml:space="preserve"> encode the most identity information in the synthetic vocalizations. We also expected to identify clustering accuracies that were generally lower for spectrographic cross-correlation than the edit distance, since spectrographic cross-correlation was performed on strings transformed into synthetic audio files, which may have led to losses of the original information or added noise.</w:t>
+        <w:t>We generally expected to find higher clustering accuracy back to original class labels at the social level that we used to originally encode the most identity information in the synthetic vocalizations. We also expected to identify clustering accuracies that were generally lower for spectrographic cross-correlation than the edit distance, since spectrographic cross-correlation was performed on strings transformed into synthetic audio files, which may have led to losses of the original information or added noise.</w:t>
       </w:r>
     </w:p>
     <w:p>
@@ -25520,21 +25028,7 @@
           <w:rFonts w:ascii="Arial" w:hAnsi="Arial" w:cs="Arial"/>
         </w:rPr>
         <w:tab/>
-        <w:t xml:space="preserve">Carouso-Peck S, Goldstein MH, Fitch WT. The many functions of vocal learning. </w:t>
-      </w:r>
-      <w:proofErr w:type="spellStart"/>
-      <w:r>
-        <w:rPr>
-          <w:rFonts w:ascii="Arial" w:hAnsi="Arial" w:cs="Arial"/>
-        </w:rPr>
-        <w:t>Philos</w:t>
-      </w:r>
-      <w:proofErr w:type="spellEnd"/>
-      <w:r>
-        <w:rPr>
-          <w:rFonts w:ascii="Arial" w:hAnsi="Arial" w:cs="Arial"/>
-        </w:rPr>
-        <w:t xml:space="preserve"> Trans R Soc B Biol Sci. 2021;376(1836):20200235. </w:t>
+        <w:t xml:space="preserve">Carouso-Peck S, Goldstein MH, Fitch WT. The many functions of vocal learning. Philos Trans R Soc B Biol Sci. 2021;376(1836):20200235. </w:t>
       </w:r>
     </w:p>
     <w:p>
@@ -25555,49 +25049,7 @@
           <w:rFonts w:ascii="Arial" w:hAnsi="Arial" w:cs="Arial"/>
         </w:rPr>
         <w:tab/>
-        <w:t xml:space="preserve">Nowicki S, Searcy WA. The evolution of vocal learning. Curr </w:t>
-      </w:r>
-      <w:proofErr w:type="spellStart"/>
-      <w:r>
-        <w:rPr>
-          <w:rFonts w:ascii="Arial" w:hAnsi="Arial" w:cs="Arial"/>
-        </w:rPr>
-        <w:t>Opin</w:t>
-      </w:r>
-      <w:proofErr w:type="spellEnd"/>
-      <w:r>
-        <w:rPr>
-          <w:rFonts w:ascii="Arial" w:hAnsi="Arial" w:cs="Arial"/>
-        </w:rPr>
-        <w:t xml:space="preserve"> </w:t>
-      </w:r>
-      <w:proofErr w:type="spellStart"/>
-      <w:r>
-        <w:rPr>
-          <w:rFonts w:ascii="Arial" w:hAnsi="Arial" w:cs="Arial"/>
-        </w:rPr>
-        <w:t>Neurobiol</w:t>
-      </w:r>
-      <w:proofErr w:type="spellEnd"/>
-      <w:r>
-        <w:rPr>
-          <w:rFonts w:ascii="Arial" w:hAnsi="Arial" w:cs="Arial"/>
-        </w:rPr>
-        <w:t xml:space="preserve">. </w:t>
-      </w:r>
-      <w:proofErr w:type="gramStart"/>
-      <w:r>
-        <w:rPr>
-          <w:rFonts w:ascii="Arial" w:hAnsi="Arial" w:cs="Arial"/>
-        </w:rPr>
-        <w:t>2014;28:48</w:t>
-      </w:r>
-      <w:proofErr w:type="gramEnd"/>
-      <w:r>
-        <w:rPr>
-          <w:rFonts w:ascii="Arial" w:hAnsi="Arial" w:cs="Arial"/>
-        </w:rPr>
-        <w:t xml:space="preserve">–53. </w:t>
+        <w:t xml:space="preserve">Nowicki S, Searcy WA. The evolution of vocal learning. Curr Opin Neurobiol. 2014;28:48–53. </w:t>
       </w:r>
     </w:p>
     <w:p>
@@ -25618,21 +25070,7 @@
           <w:rFonts w:ascii="Arial" w:hAnsi="Arial" w:cs="Arial"/>
         </w:rPr>
         <w:tab/>
-        <w:t xml:space="preserve">Sewall KB, Young AM, Wright TF. Social calls provide novel insights into the evolution of vocal learning. Anim Behav. </w:t>
-      </w:r>
-      <w:proofErr w:type="gramStart"/>
-      <w:r>
-        <w:rPr>
-          <w:rFonts w:ascii="Arial" w:hAnsi="Arial" w:cs="Arial"/>
-        </w:rPr>
-        <w:t>2016;120:163</w:t>
-      </w:r>
-      <w:proofErr w:type="gramEnd"/>
-      <w:r>
-        <w:rPr>
-          <w:rFonts w:ascii="Arial" w:hAnsi="Arial" w:cs="Arial"/>
-        </w:rPr>
-        <w:t xml:space="preserve">–72. </w:t>
+        <w:t xml:space="preserve">Sewall KB, Young AM, Wright TF. Social calls provide novel insights into the evolution of vocal learning. Anim Behav. 2016;120:163–72. </w:t>
       </w:r>
     </w:p>
     <w:p>
@@ -25653,49 +25091,7 @@
           <w:rFonts w:ascii="Arial" w:hAnsi="Arial" w:cs="Arial"/>
         </w:rPr>
         <w:tab/>
-        <w:t xml:space="preserve">Wright TF, Derryberry EP. Defining the multidimensional phenotype: New opportunities to integrate the behavioral ecology and behavioral neuroscience of vocal learning. </w:t>
-      </w:r>
-      <w:proofErr w:type="spellStart"/>
-      <w:r>
-        <w:rPr>
-          <w:rFonts w:ascii="Arial" w:hAnsi="Arial" w:cs="Arial"/>
-        </w:rPr>
-        <w:t>Neurosci</w:t>
-      </w:r>
-      <w:proofErr w:type="spellEnd"/>
-      <w:r>
-        <w:rPr>
-          <w:rFonts w:ascii="Arial" w:hAnsi="Arial" w:cs="Arial"/>
-        </w:rPr>
-        <w:t xml:space="preserve"> </w:t>
-      </w:r>
-      <w:proofErr w:type="spellStart"/>
-      <w:r>
-        <w:rPr>
-          <w:rFonts w:ascii="Arial" w:hAnsi="Arial" w:cs="Arial"/>
-        </w:rPr>
-        <w:t>Biobehav</w:t>
-      </w:r>
-      <w:proofErr w:type="spellEnd"/>
-      <w:r>
-        <w:rPr>
-          <w:rFonts w:ascii="Arial" w:hAnsi="Arial" w:cs="Arial"/>
-        </w:rPr>
-        <w:t xml:space="preserve"> Rev. </w:t>
-      </w:r>
-      <w:proofErr w:type="gramStart"/>
-      <w:r>
-        <w:rPr>
-          <w:rFonts w:ascii="Arial" w:hAnsi="Arial" w:cs="Arial"/>
-        </w:rPr>
-        <w:t>2021;125:328</w:t>
-      </w:r>
-      <w:proofErr w:type="gramEnd"/>
-      <w:r>
-        <w:rPr>
-          <w:rFonts w:ascii="Arial" w:hAnsi="Arial" w:cs="Arial"/>
-        </w:rPr>
-        <w:t xml:space="preserve">–38. </w:t>
+        <w:t xml:space="preserve">Wright TF, Derryberry EP. Defining the multidimensional phenotype: New opportunities to integrate the behavioral ecology and behavioral neuroscience of vocal learning. Neurosci Biobehav Rev. 2021;125:328–38. </w:t>
       </w:r>
     </w:p>
     <w:p>
@@ -25716,50 +25112,16 @@
           <w:rFonts w:ascii="Arial" w:hAnsi="Arial" w:cs="Arial"/>
         </w:rPr>
         <w:tab/>
-        <w:t xml:space="preserve">Berg KS, Delgado S, Okawa R, </w:t>
-      </w:r>
-      <w:proofErr w:type="spellStart"/>
-      <w:r>
-        <w:rPr>
-          <w:rFonts w:ascii="Arial" w:hAnsi="Arial" w:cs="Arial"/>
-        </w:rPr>
-        <w:t>Beissinger</w:t>
-      </w:r>
-      <w:proofErr w:type="spellEnd"/>
-      <w:r>
-        <w:rPr>
-          <w:rFonts w:ascii="Arial" w:hAnsi="Arial" w:cs="Arial"/>
-        </w:rPr>
-        <w:t xml:space="preserve"> SR, Bradbury JW. Contact calls are used for individual mate recognition in free-ranging green-rumped parrotlets, </w:t>
-      </w:r>
-      <w:proofErr w:type="spellStart"/>
+        <w:t xml:space="preserve">Berg KS, Delgado S, Okawa R, Beissinger SR, Bradbury JW. Contact calls are used for individual mate recognition in free-ranging green-rumped parrotlets, </w:t>
+      </w:r>
       <w:r>
         <w:rPr>
           <w:rFonts w:ascii="Arial" w:hAnsi="Arial" w:cs="Arial"/>
           <w:i/>
           <w:iCs/>
         </w:rPr>
-        <w:t>Forpus</w:t>
-      </w:r>
-      <w:proofErr w:type="spellEnd"/>
-      <w:r>
-        <w:rPr>
-          <w:rFonts w:ascii="Arial" w:hAnsi="Arial" w:cs="Arial"/>
-          <w:i/>
-          <w:iCs/>
-        </w:rPr>
-        <w:t xml:space="preserve"> </w:t>
-      </w:r>
-      <w:proofErr w:type="spellStart"/>
-      <w:r>
-        <w:rPr>
-          <w:rFonts w:ascii="Arial" w:hAnsi="Arial" w:cs="Arial"/>
-          <w:i/>
-          <w:iCs/>
-        </w:rPr>
-        <w:t>passerinus</w:t>
-      </w:r>
-      <w:proofErr w:type="spellEnd"/>
+        <w:t>Forpus passerinus</w:t>
+      </w:r>
       <w:r>
         <w:rPr>
           <w:rFonts w:ascii="Arial" w:hAnsi="Arial" w:cs="Arial"/>
@@ -25806,21 +25168,7 @@
           <w:rFonts w:ascii="Arial" w:hAnsi="Arial" w:cs="Arial"/>
         </w:rPr>
         <w:tab/>
-        <w:t xml:space="preserve">Janik VM, Sayigh LS. Communication in bottlenose dolphins: 50 years of signature whistle research. J Comp </w:t>
-      </w:r>
-      <w:proofErr w:type="spellStart"/>
-      <w:r>
-        <w:rPr>
-          <w:rFonts w:ascii="Arial" w:hAnsi="Arial" w:cs="Arial"/>
-        </w:rPr>
-        <w:t>Physiol</w:t>
-      </w:r>
-      <w:proofErr w:type="spellEnd"/>
-      <w:r>
-        <w:rPr>
-          <w:rFonts w:ascii="Arial" w:hAnsi="Arial" w:cs="Arial"/>
-        </w:rPr>
-        <w:t xml:space="preserve"> A. 2013;199(6):479–89. </w:t>
+        <w:t xml:space="preserve">Janik VM, Sayigh LS. Communication in bottlenose dolphins: 50 years of signature whistle research. J Comp Physiol A. 2013;199(6):479–89. </w:t>
       </w:r>
     </w:p>
     <w:p>
@@ -25883,21 +25231,7 @@
           <w:rFonts w:ascii="Arial" w:hAnsi="Arial" w:cs="Arial"/>
         </w:rPr>
         <w:tab/>
-        <w:t xml:space="preserve">Bradbury JW, </w:t>
-      </w:r>
-      <w:proofErr w:type="spellStart"/>
-      <w:r>
-        <w:rPr>
-          <w:rFonts w:ascii="Arial" w:hAnsi="Arial" w:cs="Arial"/>
-        </w:rPr>
-        <w:t>Vehrencamp</w:t>
-      </w:r>
-      <w:proofErr w:type="spellEnd"/>
-      <w:r>
-        <w:rPr>
-          <w:rFonts w:ascii="Arial" w:hAnsi="Arial" w:cs="Arial"/>
-        </w:rPr>
-        <w:t xml:space="preserve"> SL. Principles of animal communication. 1st ed. Sunderland, MA, USA: Sinauer Associates, Inc; 1998. </w:t>
+        <w:t xml:space="preserve">Bradbury JW, Vehrencamp SL. Principles of animal communication. 1st ed. Sunderland, MA, USA: Sinauer Associates, Inc; 1998. </w:t>
       </w:r>
     </w:p>
     <w:p>
@@ -25918,20 +25252,7 @@
           <w:rFonts w:ascii="Arial" w:hAnsi="Arial" w:cs="Arial"/>
         </w:rPr>
         <w:tab/>
-      </w:r>
-      <w:proofErr w:type="spellStart"/>
-      <w:r>
-        <w:rPr>
-          <w:rFonts w:ascii="Arial" w:hAnsi="Arial" w:cs="Arial"/>
-        </w:rPr>
-        <w:t>Deecke</w:t>
-      </w:r>
-      <w:proofErr w:type="spellEnd"/>
-      <w:r>
-        <w:rPr>
-          <w:rFonts w:ascii="Arial" w:hAnsi="Arial" w:cs="Arial"/>
-        </w:rPr>
-        <w:t xml:space="preserve"> VB, Barrett-Lennard LG, Spong P, Ford JKB. The structure of stereotyped calls reflects kinship and social affiliation in resident killer whales (</w:t>
+        <w:t>Deecke VB, Barrett-Lennard LG, Spong P, Ford JKB. The structure of stereotyped calls reflects kinship and social affiliation in resident killer whales (</w:t>
       </w:r>
       <w:r>
         <w:rPr>
@@ -25945,21 +25266,7 @@
         <w:rPr>
           <w:rFonts w:ascii="Arial" w:hAnsi="Arial" w:cs="Arial"/>
         </w:rPr>
-        <w:t xml:space="preserve">). </w:t>
-      </w:r>
-      <w:proofErr w:type="spellStart"/>
-      <w:r>
-        <w:rPr>
-          <w:rFonts w:ascii="Arial" w:hAnsi="Arial" w:cs="Arial"/>
-        </w:rPr>
-        <w:t>Naturwissenschaften</w:t>
-      </w:r>
-      <w:proofErr w:type="spellEnd"/>
-      <w:r>
-        <w:rPr>
-          <w:rFonts w:ascii="Arial" w:hAnsi="Arial" w:cs="Arial"/>
-        </w:rPr>
-        <w:t xml:space="preserve">. 2010;97(5):513–8. </w:t>
+        <w:t xml:space="preserve">). Naturwissenschaften. 2010;97(5):513–8. </w:t>
       </w:r>
     </w:p>
     <w:p>
@@ -26015,20 +25322,7 @@
           <w:rFonts w:ascii="Arial" w:hAnsi="Arial" w:cs="Arial"/>
         </w:rPr>
         <w:tab/>
-      </w:r>
-      <w:proofErr w:type="spellStart"/>
-      <w:r>
-        <w:rPr>
-          <w:rFonts w:ascii="Arial" w:hAnsi="Arial" w:cs="Arial"/>
-        </w:rPr>
-        <w:t>Nousek</w:t>
-      </w:r>
-      <w:proofErr w:type="spellEnd"/>
-      <w:r>
-        <w:rPr>
-          <w:rFonts w:ascii="Arial" w:hAnsi="Arial" w:cs="Arial"/>
-        </w:rPr>
-        <w:t xml:space="preserve"> AE, Slater PJB, Wang C, Miller PJO. The influence of social affiliation on individual vocal signatures of northern resident killer whales (</w:t>
+        <w:t>Nousek AE, Slater PJB, Wang C, Miller PJO. The influence of social affiliation on individual vocal signatures of northern resident killer whales (</w:t>
       </w:r>
       <w:r>
         <w:rPr>
@@ -26120,21 +25414,7 @@
           <w:rFonts w:ascii="Arial" w:hAnsi="Arial" w:cs="Arial"/>
         </w:rPr>
         <w:tab/>
-        <w:t xml:space="preserve">Smith-Vidaurre G, Araya-Salas M, Wright TF. Individual signatures outweigh social group identity in contact calls of a communally nesting parrot. </w:t>
-      </w:r>
-      <w:proofErr w:type="spellStart"/>
-      <w:r>
-        <w:rPr>
-          <w:rFonts w:ascii="Arial" w:hAnsi="Arial" w:cs="Arial"/>
-        </w:rPr>
-        <w:t>Behav</w:t>
-      </w:r>
-      <w:proofErr w:type="spellEnd"/>
-      <w:r>
-        <w:rPr>
-          <w:rFonts w:ascii="Arial" w:hAnsi="Arial" w:cs="Arial"/>
-        </w:rPr>
-        <w:t xml:space="preserve"> Ecol. 2020;31(2):448–58. </w:t>
+        <w:t xml:space="preserve">Smith-Vidaurre G, Araya-Salas M, Wright TF. Individual signatures outweigh social group identity in contact calls of a communally nesting parrot. Behav Ecol. 2020;31(2):448–58. </w:t>
       </w:r>
     </w:p>
     <w:p>
@@ -26155,35 +25435,7 @@
           <w:rFonts w:ascii="Arial" w:hAnsi="Arial" w:cs="Arial"/>
         </w:rPr>
         <w:tab/>
-        <w:t xml:space="preserve">Smith-Vidaurre G, Pérez-Marrufo V, Hobson EA, Salinas-Melgoza A, Wright TF. Individual identity information persists in learned calls of introduced parrot populations. PLOS </w:t>
-      </w:r>
-      <w:proofErr w:type="spellStart"/>
-      <w:r>
-        <w:rPr>
-          <w:rFonts w:ascii="Arial" w:hAnsi="Arial" w:cs="Arial"/>
-        </w:rPr>
-        <w:t>Comput</w:t>
-      </w:r>
-      <w:proofErr w:type="spellEnd"/>
-      <w:r>
-        <w:rPr>
-          <w:rFonts w:ascii="Arial" w:hAnsi="Arial" w:cs="Arial"/>
-        </w:rPr>
-        <w:t xml:space="preserve"> Biol. 2023;19(7</w:t>
-      </w:r>
-      <w:proofErr w:type="gramStart"/>
-      <w:r>
-        <w:rPr>
-          <w:rFonts w:ascii="Arial" w:hAnsi="Arial" w:cs="Arial"/>
-        </w:rPr>
-        <w:t>):e</w:t>
-      </w:r>
-      <w:proofErr w:type="gramEnd"/>
-      <w:r>
-        <w:rPr>
-          <w:rFonts w:ascii="Arial" w:hAnsi="Arial" w:cs="Arial"/>
-        </w:rPr>
-        <w:t xml:space="preserve">1011231. </w:t>
+        <w:t xml:space="preserve">Smith-Vidaurre G, Pérez-Marrufo V, Hobson EA, Salinas-Melgoza A, Wright TF. Individual identity information persists in learned calls of introduced parrot populations. PLOS Comput Biol. 2023;19(7):e1011231. </w:t>
       </w:r>
     </w:p>
     <w:p>
@@ -26225,48 +25477,7 @@
           <w:rFonts w:ascii="Arial" w:hAnsi="Arial" w:cs="Arial"/>
         </w:rPr>
         <w:tab/>
-      </w:r>
-      <w:proofErr w:type="spellStart"/>
-      <w:r>
-        <w:rPr>
-          <w:rFonts w:ascii="Arial" w:hAnsi="Arial" w:cs="Arial"/>
-        </w:rPr>
-        <w:t>Smeele</w:t>
-      </w:r>
-      <w:proofErr w:type="spellEnd"/>
-      <w:r>
-        <w:rPr>
-          <w:rFonts w:ascii="Arial" w:hAnsi="Arial" w:cs="Arial"/>
-        </w:rPr>
-        <w:t xml:space="preserve"> SQ, </w:t>
-      </w:r>
-      <w:proofErr w:type="spellStart"/>
-      <w:r>
-        <w:rPr>
-          <w:rFonts w:ascii="Arial" w:hAnsi="Arial" w:cs="Arial"/>
-        </w:rPr>
-        <w:t>Senar</w:t>
-      </w:r>
-      <w:proofErr w:type="spellEnd"/>
-      <w:r>
-        <w:rPr>
-          <w:rFonts w:ascii="Arial" w:hAnsi="Arial" w:cs="Arial"/>
-        </w:rPr>
-        <w:t xml:space="preserve"> JC, Aplin LM, McElreath MB. Evidence for vocal signatures and </w:t>
-      </w:r>
-      <w:proofErr w:type="gramStart"/>
-      <w:r>
-        <w:rPr>
-          <w:rFonts w:ascii="Arial" w:hAnsi="Arial" w:cs="Arial"/>
-        </w:rPr>
-        <w:t>voice-prints</w:t>
-      </w:r>
-      <w:proofErr w:type="gramEnd"/>
-      <w:r>
-        <w:rPr>
-          <w:rFonts w:ascii="Arial" w:hAnsi="Arial" w:cs="Arial"/>
-        </w:rPr>
-        <w:t xml:space="preserve"> in a wild parrot. R Soc Open Sci. 2023 Oct;10(10):230835. </w:t>
+        <w:t xml:space="preserve">Smeele SQ, Senar JC, Aplin LM, McElreath MB. Evidence for vocal signatures and voice-prints in a wild parrot. R Soc Open Sci. 2023 Oct;10(10):230835. </w:t>
       </w:r>
     </w:p>
     <w:p>
@@ -26287,49 +25498,7 @@
           <w:rFonts w:ascii="Arial" w:hAnsi="Arial" w:cs="Arial"/>
         </w:rPr>
         <w:tab/>
-        <w:t xml:space="preserve">Mammen DL, Nowicki S. Individual differences and within-flock convergence in chickadee calls. </w:t>
-      </w:r>
-      <w:proofErr w:type="spellStart"/>
-      <w:r>
-        <w:rPr>
-          <w:rFonts w:ascii="Arial" w:hAnsi="Arial" w:cs="Arial"/>
-        </w:rPr>
-        <w:t>Behav</w:t>
-      </w:r>
-      <w:proofErr w:type="spellEnd"/>
-      <w:r>
-        <w:rPr>
-          <w:rFonts w:ascii="Arial" w:hAnsi="Arial" w:cs="Arial"/>
-        </w:rPr>
-        <w:t xml:space="preserve"> </w:t>
-      </w:r>
-      <w:proofErr w:type="spellStart"/>
-      <w:r>
-        <w:rPr>
-          <w:rFonts w:ascii="Arial" w:hAnsi="Arial" w:cs="Arial"/>
-        </w:rPr>
-        <w:t>Ecol</w:t>
-      </w:r>
-      <w:proofErr w:type="spellEnd"/>
-      <w:r>
-        <w:rPr>
-          <w:rFonts w:ascii="Arial" w:hAnsi="Arial" w:cs="Arial"/>
-        </w:rPr>
-        <w:t xml:space="preserve"> </w:t>
-      </w:r>
-      <w:proofErr w:type="spellStart"/>
-      <w:r>
-        <w:rPr>
-          <w:rFonts w:ascii="Arial" w:hAnsi="Arial" w:cs="Arial"/>
-        </w:rPr>
-        <w:t>Sociobiol</w:t>
-      </w:r>
-      <w:proofErr w:type="spellEnd"/>
-      <w:r>
-        <w:rPr>
-          <w:rFonts w:ascii="Arial" w:hAnsi="Arial" w:cs="Arial"/>
-        </w:rPr>
-        <w:t xml:space="preserve">. 1981;9(3):179–86. </w:t>
+        <w:t xml:space="preserve">Mammen DL, Nowicki S. Individual differences and within-flock convergence in chickadee calls. Behav Ecol Sociobiol. 1981;9(3):179–86. </w:t>
       </w:r>
     </w:p>
     <w:p>
@@ -26350,21 +25519,7 @@
           <w:rFonts w:ascii="Arial" w:hAnsi="Arial" w:cs="Arial"/>
         </w:rPr>
         <w:tab/>
-        <w:t xml:space="preserve">Nowicki S. Vocal plasticity in captive black-capped chickadees: The acoustic basis and rate of call convergence. Anim Behav. </w:t>
-      </w:r>
-      <w:proofErr w:type="gramStart"/>
-      <w:r>
-        <w:rPr>
-          <w:rFonts w:ascii="Arial" w:hAnsi="Arial" w:cs="Arial"/>
-        </w:rPr>
-        <w:t>1989;37:64</w:t>
-      </w:r>
-      <w:proofErr w:type="gramEnd"/>
-      <w:r>
-        <w:rPr>
-          <w:rFonts w:ascii="Arial" w:hAnsi="Arial" w:cs="Arial"/>
-        </w:rPr>
-        <w:t xml:space="preserve">–73. </w:t>
+        <w:t xml:space="preserve">Nowicki S. Vocal plasticity in captive black-capped chickadees: The acoustic basis and rate of call convergence. Anim Behav. 1989;37:64–73. </w:t>
       </w:r>
     </w:p>
     <w:p>
@@ -26406,34 +25561,7 @@
           <w:rFonts w:ascii="Arial" w:hAnsi="Arial" w:cs="Arial"/>
         </w:rPr>
         <w:tab/>
-      </w:r>
-      <w:proofErr w:type="spellStart"/>
-      <w:r>
-        <w:rPr>
-          <w:rFonts w:ascii="Arial" w:hAnsi="Arial" w:cs="Arial"/>
-        </w:rPr>
-        <w:t>Kershenbaum</w:t>
-      </w:r>
-      <w:proofErr w:type="spellEnd"/>
-      <w:r>
-        <w:rPr>
-          <w:rFonts w:ascii="Arial" w:hAnsi="Arial" w:cs="Arial"/>
-        </w:rPr>
-        <w:t xml:space="preserve"> A, Sayigh LS, Janik VM. The encoding of individual identity in dolphin signature whistles: How much information Is needed? PLOS ONE. 2013;8(10</w:t>
-      </w:r>
-      <w:proofErr w:type="gramStart"/>
-      <w:r>
-        <w:rPr>
-          <w:rFonts w:ascii="Arial" w:hAnsi="Arial" w:cs="Arial"/>
-        </w:rPr>
-        <w:t>):e</w:t>
-      </w:r>
-      <w:proofErr w:type="gramEnd"/>
-      <w:r>
-        <w:rPr>
-          <w:rFonts w:ascii="Arial" w:hAnsi="Arial" w:cs="Arial"/>
-        </w:rPr>
-        <w:t xml:space="preserve">77671. </w:t>
+        <w:t xml:space="preserve">Kershenbaum A, Sayigh LS, Janik VM. The encoding of individual identity in dolphin signature whistles: How much information Is needed? PLOS ONE. 2013;8(10):e77671. </w:t>
       </w:r>
     </w:p>
     <w:p>
@@ -26454,21 +25582,7 @@
           <w:rFonts w:ascii="Arial" w:hAnsi="Arial" w:cs="Arial"/>
         </w:rPr>
         <w:tab/>
-        <w:t xml:space="preserve">Beecher MD. </w:t>
-      </w:r>
-      <w:proofErr w:type="spellStart"/>
-      <w:r>
-        <w:rPr>
-          <w:rFonts w:ascii="Arial" w:hAnsi="Arial" w:cs="Arial"/>
-        </w:rPr>
-        <w:t>Signalling</w:t>
-      </w:r>
-      <w:proofErr w:type="spellEnd"/>
-      <w:r>
-        <w:rPr>
-          <w:rFonts w:ascii="Arial" w:hAnsi="Arial" w:cs="Arial"/>
-        </w:rPr>
-        <w:t xml:space="preserve"> systems for individual recognition: An information theory approach. Anim Behav. 1989;38(2):248–61. </w:t>
+        <w:t xml:space="preserve">Beecher MD. Signalling systems for individual recognition: An information theory approach. Anim Behav. 1989;38(2):248–61. </w:t>
       </w:r>
     </w:p>
     <w:p>
@@ -26489,35 +25603,7 @@
           <w:rFonts w:ascii="Arial" w:hAnsi="Arial" w:cs="Arial"/>
         </w:rPr>
         <w:tab/>
-        <w:t xml:space="preserve">Anikin A. </w:t>
-      </w:r>
-      <w:proofErr w:type="spellStart"/>
-      <w:r>
-        <w:rPr>
-          <w:rFonts w:ascii="Arial" w:hAnsi="Arial" w:cs="Arial"/>
-        </w:rPr>
-        <w:t>Soundgen</w:t>
-      </w:r>
-      <w:proofErr w:type="spellEnd"/>
-      <w:r>
-        <w:rPr>
-          <w:rFonts w:ascii="Arial" w:hAnsi="Arial" w:cs="Arial"/>
-        </w:rPr>
-        <w:t xml:space="preserve">: An open-source tool for synthesizing nonverbal vocalizations. </w:t>
-      </w:r>
-      <w:proofErr w:type="spellStart"/>
-      <w:r>
-        <w:rPr>
-          <w:rFonts w:ascii="Arial" w:hAnsi="Arial" w:cs="Arial"/>
-        </w:rPr>
-        <w:t>Behav</w:t>
-      </w:r>
-      <w:proofErr w:type="spellEnd"/>
-      <w:r>
-        <w:rPr>
-          <w:rFonts w:ascii="Arial" w:hAnsi="Arial" w:cs="Arial"/>
-        </w:rPr>
-        <w:t xml:space="preserve"> Res Methods. 2019;51(2):778–92. </w:t>
+        <w:t xml:space="preserve">Anikin A. Soundgen: An open-source tool for synthesizing nonverbal vocalizations. Behav Res Methods. 2019;51(2):778–92. </w:t>
       </w:r>
     </w:p>
     <w:p>
@@ -26559,21 +25645,7 @@
           <w:rFonts w:ascii="Arial" w:hAnsi="Arial" w:cs="Arial"/>
         </w:rPr>
         <w:tab/>
-        <w:t xml:space="preserve">King SL, Janik VM. Bottlenose dolphins can use learned vocal labels to address each other. Proc Natl </w:t>
-      </w:r>
-      <w:proofErr w:type="spellStart"/>
-      <w:r>
-        <w:rPr>
-          <w:rFonts w:ascii="Arial" w:hAnsi="Arial" w:cs="Arial"/>
-        </w:rPr>
-        <w:t>Acad</w:t>
-      </w:r>
-      <w:proofErr w:type="spellEnd"/>
-      <w:r>
-        <w:rPr>
-          <w:rFonts w:ascii="Arial" w:hAnsi="Arial" w:cs="Arial"/>
-        </w:rPr>
-        <w:t xml:space="preserve"> Sci. 2013;110(32):13216–21. </w:t>
+        <w:t xml:space="preserve">King SL, Janik VM. Bottlenose dolphins can use learned vocal labels to address each other. Proc Natl Acad Sci. 2013;110(32):13216–21. </w:t>
       </w:r>
     </w:p>
     <w:p>
@@ -26594,21 +25666,7 @@
           <w:rFonts w:ascii="Arial" w:hAnsi="Arial" w:cs="Arial"/>
         </w:rPr>
         <w:tab/>
-        <w:t xml:space="preserve">Keen SC, Odom KJ, Webster MS, Kohn GM, Wright TF, Araya-Salas M. A machine learning approach for classifying and quantifying acoustic diversity. Methods </w:t>
-      </w:r>
-      <w:proofErr w:type="spellStart"/>
-      <w:r>
-        <w:rPr>
-          <w:rFonts w:ascii="Arial" w:hAnsi="Arial" w:cs="Arial"/>
-        </w:rPr>
-        <w:t>Ecol</w:t>
-      </w:r>
-      <w:proofErr w:type="spellEnd"/>
-      <w:r>
-        <w:rPr>
-          <w:rFonts w:ascii="Arial" w:hAnsi="Arial" w:cs="Arial"/>
-        </w:rPr>
-        <w:t xml:space="preserve"> Evol. 2021;12(7):1213–25. </w:t>
+        <w:t xml:space="preserve">Keen SC, Odom KJ, Webster MS, Kohn GM, Wright TF, Araya-Salas M. A machine learning approach for classifying and quantifying acoustic diversity. Methods Ecol Evol. 2021;12(7):1213–25. </w:t>
       </w:r>
     </w:p>
     <w:p>
@@ -26630,34 +25688,7 @@
           <w:rFonts w:ascii="Arial" w:hAnsi="Arial" w:cs="Arial"/>
         </w:rPr>
         <w:tab/>
-      </w:r>
-      <w:proofErr w:type="spellStart"/>
-      <w:r>
-        <w:rPr>
-          <w:rFonts w:ascii="Arial" w:hAnsi="Arial" w:cs="Arial"/>
-        </w:rPr>
-        <w:t>Kershenbaum</w:t>
-      </w:r>
-      <w:proofErr w:type="spellEnd"/>
-      <w:r>
-        <w:rPr>
-          <w:rFonts w:ascii="Arial" w:hAnsi="Arial" w:cs="Arial"/>
-        </w:rPr>
-        <w:t xml:space="preserve"> A, Garland EC. Quantifying similarity in animal vocal sequences: Which metric performs best? Methods </w:t>
-      </w:r>
-      <w:proofErr w:type="spellStart"/>
-      <w:r>
-        <w:rPr>
-          <w:rFonts w:ascii="Arial" w:hAnsi="Arial" w:cs="Arial"/>
-        </w:rPr>
-        <w:t>Ecol</w:t>
-      </w:r>
-      <w:proofErr w:type="spellEnd"/>
-      <w:r>
-        <w:rPr>
-          <w:rFonts w:ascii="Arial" w:hAnsi="Arial" w:cs="Arial"/>
-        </w:rPr>
-        <w:t xml:space="preserve"> Evol. 2015;6(12):1452–61. </w:t>
+        <w:t xml:space="preserve">Kershenbaum A, Garland EC. Quantifying similarity in animal vocal sequences: Which metric performs best? Methods Ecol Evol. 2015;6(12):1452–61. </w:t>
       </w:r>
     </w:p>
     <w:p>
@@ -26678,21 +25709,7 @@
           <w:rFonts w:ascii="Arial" w:hAnsi="Arial" w:cs="Arial"/>
         </w:rPr>
         <w:tab/>
-        <w:t xml:space="preserve">Sawant S, Arvind C, Joshi V, Robin VV. Spectrogram cross-correlation can be used to measure the complexity of bird vocalizations. Methods </w:t>
-      </w:r>
-      <w:proofErr w:type="spellStart"/>
-      <w:r>
-        <w:rPr>
-          <w:rFonts w:ascii="Arial" w:hAnsi="Arial" w:cs="Arial"/>
-        </w:rPr>
-        <w:t>Ecol</w:t>
-      </w:r>
-      <w:proofErr w:type="spellEnd"/>
-      <w:r>
-        <w:rPr>
-          <w:rFonts w:ascii="Arial" w:hAnsi="Arial" w:cs="Arial"/>
-        </w:rPr>
-        <w:t xml:space="preserve"> Evol. 2022;13(2):459–72. </w:t>
+        <w:t xml:space="preserve">Sawant S, Arvind C, Joshi V, Robin VV. Spectrogram cross-correlation can be used to measure the complexity of bird vocalizations. Methods Ecol Evol. 2022;13(2):459–72. </w:t>
       </w:r>
     </w:p>
     <w:p>
@@ -26713,21 +25730,7 @@
           <w:rFonts w:ascii="Arial" w:hAnsi="Arial" w:cs="Arial"/>
         </w:rPr>
         <w:tab/>
-        <w:t xml:space="preserve">Sueur J, Aubin T, Simonis C. </w:t>
-      </w:r>
-      <w:proofErr w:type="spellStart"/>
-      <w:r>
-        <w:rPr>
-          <w:rFonts w:ascii="Arial" w:hAnsi="Arial" w:cs="Arial"/>
-        </w:rPr>
-        <w:t>Seewave</w:t>
-      </w:r>
-      <w:proofErr w:type="spellEnd"/>
-      <w:r>
-        <w:rPr>
-          <w:rFonts w:ascii="Arial" w:hAnsi="Arial" w:cs="Arial"/>
-        </w:rPr>
-        <w:t xml:space="preserve">, a free modular tool for sound analysis and synthesis. Bioacoustics. 2008;18(2):213–26. </w:t>
+        <w:t xml:space="preserve">Sueur J, Aubin T, Simonis C. Seewave, a free modular tool for sound analysis and synthesis. Bioacoustics. 2008;18(2):213–26. </w:t>
       </w:r>
     </w:p>
     <w:p>
@@ -26748,35 +25751,7 @@
           <w:rFonts w:ascii="Arial" w:hAnsi="Arial" w:cs="Arial"/>
         </w:rPr>
         <w:tab/>
-        <w:t xml:space="preserve">Araya-Salas M, Smith-Vidaurre G. </w:t>
-      </w:r>
-      <w:proofErr w:type="spellStart"/>
-      <w:r>
-        <w:rPr>
-          <w:rFonts w:ascii="Arial" w:hAnsi="Arial" w:cs="Arial"/>
-        </w:rPr>
-        <w:t>warbleR</w:t>
-      </w:r>
-      <w:proofErr w:type="spellEnd"/>
-      <w:r>
-        <w:rPr>
-          <w:rFonts w:ascii="Arial" w:hAnsi="Arial" w:cs="Arial"/>
-        </w:rPr>
-        <w:t xml:space="preserve">: An r package to streamline analysis of animal acoustic signals. Methods </w:t>
-      </w:r>
-      <w:proofErr w:type="spellStart"/>
-      <w:r>
-        <w:rPr>
-          <w:rFonts w:ascii="Arial" w:hAnsi="Arial" w:cs="Arial"/>
-        </w:rPr>
-        <w:t>Ecol</w:t>
-      </w:r>
-      <w:proofErr w:type="spellEnd"/>
-      <w:r>
-        <w:rPr>
-          <w:rFonts w:ascii="Arial" w:hAnsi="Arial" w:cs="Arial"/>
-        </w:rPr>
-        <w:t xml:space="preserve"> Evol. 2017;8(2):184–91. </w:t>
+        <w:t xml:space="preserve">Araya-Salas M, Smith-Vidaurre G. warbleR: An r package to streamline analysis of animal acoustic signals. Methods Ecol Evol. 2017;8(2):184–91. </w:t>
       </w:r>
     </w:p>
     <w:p>
@@ -26797,21 +25772,7 @@
           <w:rFonts w:ascii="Arial" w:hAnsi="Arial" w:cs="Arial"/>
         </w:rPr>
         <w:tab/>
-        <w:t xml:space="preserve">Anikin A, </w:t>
-      </w:r>
-      <w:proofErr w:type="spellStart"/>
-      <w:r>
-        <w:rPr>
-          <w:rFonts w:ascii="Arial" w:hAnsi="Arial" w:cs="Arial"/>
-        </w:rPr>
-        <w:t>Pisanski</w:t>
-      </w:r>
-      <w:proofErr w:type="spellEnd"/>
-      <w:r>
-        <w:rPr>
-          <w:rFonts w:ascii="Arial" w:hAnsi="Arial" w:cs="Arial"/>
-        </w:rPr>
-        <w:t xml:space="preserve"> K, Reby D. Static and dynamic formant scaling conveys body size and aggression. R Soc Open Sci. 2022;9(1):211496. </w:t>
+        <w:t xml:space="preserve">Anikin A, Pisanski K, Reby D. Static and dynamic formant scaling conveys body size and aggression. R Soc Open Sci. 2022;9(1):211496. </w:t>
       </w:r>
     </w:p>
     <w:p>
@@ -26832,20 +25793,7 @@
           <w:rFonts w:ascii="Arial" w:hAnsi="Arial" w:cs="Arial"/>
         </w:rPr>
         <w:tab/>
-      </w:r>
-      <w:proofErr w:type="spellStart"/>
-      <w:r>
-        <w:rPr>
-          <w:rFonts w:ascii="Arial" w:hAnsi="Arial" w:cs="Arial"/>
-        </w:rPr>
-        <w:t>Jouventin</w:t>
-      </w:r>
-      <w:proofErr w:type="spellEnd"/>
-      <w:r>
-        <w:rPr>
-          <w:rFonts w:ascii="Arial" w:hAnsi="Arial" w:cs="Arial"/>
-        </w:rPr>
-        <w:t xml:space="preserve"> P, Aubin T. Acoustic systems are adapted to breeding ecologies: Individual recognition in nesting penguins. Anim Behav. 2002;64(5):747–57. </w:t>
+        <w:t xml:space="preserve">Jouventin P, Aubin T. Acoustic systems are adapted to breeding ecologies: Individual recognition in nesting penguins. Anim Behav. 2002;64(5):747–57. </w:t>
       </w:r>
     </w:p>
     <w:p>
@@ -26866,21 +25814,7 @@
           <w:rFonts w:ascii="Arial" w:hAnsi="Arial" w:cs="Arial"/>
         </w:rPr>
         <w:tab/>
-        <w:t xml:space="preserve">Carter GG, Logsdon R, Arnold BD, Menchaca A, Medellin RA. Adult vampire bats produce contact calls when isolated: Acoustic variation by species, population, colony, and individual. </w:t>
-      </w:r>
-      <w:proofErr w:type="spellStart"/>
-      <w:r>
-        <w:rPr>
-          <w:rFonts w:ascii="Arial" w:hAnsi="Arial" w:cs="Arial"/>
-        </w:rPr>
-        <w:t>PLoS</w:t>
-      </w:r>
-      <w:proofErr w:type="spellEnd"/>
-      <w:r>
-        <w:rPr>
-          <w:rFonts w:ascii="Arial" w:hAnsi="Arial" w:cs="Arial"/>
-        </w:rPr>
-        <w:t xml:space="preserve"> ONE. 2012;7(6). </w:t>
+        <w:t xml:space="preserve">Carter GG, Logsdon R, Arnold BD, Menchaca A, Medellin RA. Adult vampire bats produce contact calls when isolated: Acoustic variation by species, population, colony, and individual. PLoS ONE. 2012;7(6). </w:t>
       </w:r>
     </w:p>
     <w:p>
@@ -26922,21 +25856,7 @@
           <w:rFonts w:ascii="Arial" w:hAnsi="Arial" w:cs="Arial"/>
         </w:rPr>
         <w:tab/>
-        <w:t xml:space="preserve">Cross A, Ferdinand V, Samman R, Juárez GA, Smith-Vidaurre G. </w:t>
-      </w:r>
-      <w:proofErr w:type="spellStart"/>
-      <w:r>
-        <w:rPr>
-          <w:rFonts w:ascii="Arial" w:hAnsi="Arial" w:cs="Arial"/>
-        </w:rPr>
-        <w:t>paRsynth</w:t>
-      </w:r>
-      <w:proofErr w:type="spellEnd"/>
-      <w:r>
-        <w:rPr>
-          <w:rFonts w:ascii="Arial" w:hAnsi="Arial" w:cs="Arial"/>
-        </w:rPr>
-        <w:t>: Sonify character strings to create synthetic frequency modulated vocalizations [Internet]. 2024. Available from: https://github.com/gsvidaurre/paRsynth</w:t>
+        <w:t>Cross A, Ferdinand V, Samman R, Juárez GA, Smith-Vidaurre G. paRsynth: Sonify character strings to create synthetic frequency modulated vocalizations [Internet]. 2024. Available from: https://github.com/gsvidaurre/paRsynth</w:t>
       </w:r>
     </w:p>
     <w:p>
@@ -26999,34 +25919,7 @@
           <w:rFonts w:ascii="Arial" w:hAnsi="Arial" w:cs="Arial"/>
         </w:rPr>
         <w:tab/>
-      </w:r>
-      <w:proofErr w:type="spellStart"/>
-      <w:r>
-        <w:rPr>
-          <w:rFonts w:ascii="Arial" w:hAnsi="Arial" w:cs="Arial"/>
-        </w:rPr>
-        <w:t>Ligges</w:t>
-      </w:r>
-      <w:proofErr w:type="spellEnd"/>
-      <w:r>
-        <w:rPr>
-          <w:rFonts w:ascii="Arial" w:hAnsi="Arial" w:cs="Arial"/>
-        </w:rPr>
-        <w:t xml:space="preserve"> U, Krey S, Mersmann O, Schnackenberg S. </w:t>
-      </w:r>
-      <w:proofErr w:type="spellStart"/>
-      <w:r>
-        <w:rPr>
-          <w:rFonts w:ascii="Arial" w:hAnsi="Arial" w:cs="Arial"/>
-        </w:rPr>
-        <w:t>tuneR</w:t>
-      </w:r>
-      <w:proofErr w:type="spellEnd"/>
-      <w:r>
-        <w:rPr>
-          <w:rFonts w:ascii="Arial" w:hAnsi="Arial" w:cs="Arial"/>
-        </w:rPr>
-        <w:t>: Analysis of Music and Speech [Internet]. 2018. Available from: https://cran.r-project.org/package=tuneR</w:t>
+        <w:t>Ligges U, Krey S, Mersmann O, Schnackenberg S. tuneR: Analysis of Music and Speech [Internet]. 2018. Available from: https://cran.r-project.org/package=tuneR</w:t>
       </w:r>
     </w:p>
     <w:p>
@@ -27047,21 +25940,7 @@
           <w:rFonts w:ascii="Arial" w:hAnsi="Arial" w:cs="Arial"/>
         </w:rPr>
         <w:tab/>
-        <w:t xml:space="preserve">Ooms J. </w:t>
-      </w:r>
-      <w:proofErr w:type="spellStart"/>
-      <w:r>
-        <w:rPr>
-          <w:rFonts w:ascii="Arial" w:hAnsi="Arial" w:cs="Arial"/>
-        </w:rPr>
-        <w:t>magick</w:t>
-      </w:r>
-      <w:proofErr w:type="spellEnd"/>
-      <w:r>
-        <w:rPr>
-          <w:rFonts w:ascii="Arial" w:hAnsi="Arial" w:cs="Arial"/>
-        </w:rPr>
-        <w:t>: Advanced graphics and image-processing in R [Internet]. 2025. Available from: https://CRAN.R-project.org/package=magick</w:t>
+        <w:t>Ooms J. magick: Advanced graphics and image-processing in R [Internet]. 2025. Available from: https://CRAN.R-project.org/package=magick</w:t>
       </w:r>
     </w:p>
     <w:p>
@@ -27082,35 +25961,7 @@
           <w:rFonts w:ascii="Arial" w:hAnsi="Arial" w:cs="Arial"/>
         </w:rPr>
         <w:tab/>
-        <w:t xml:space="preserve">Wickham H, Averick M, Bryan J, Chang W, McGowan LD, François R, et al. Welcome to the </w:t>
-      </w:r>
-      <w:proofErr w:type="spellStart"/>
-      <w:r>
-        <w:rPr>
-          <w:rFonts w:ascii="Arial" w:hAnsi="Arial" w:cs="Arial"/>
-        </w:rPr>
-        <w:t>Tidyverse</w:t>
-      </w:r>
-      <w:proofErr w:type="spellEnd"/>
-      <w:r>
-        <w:rPr>
-          <w:rFonts w:ascii="Arial" w:hAnsi="Arial" w:cs="Arial"/>
-        </w:rPr>
-        <w:t xml:space="preserve">. J Open Source </w:t>
-      </w:r>
-      <w:proofErr w:type="spellStart"/>
-      <w:r>
-        <w:rPr>
-          <w:rFonts w:ascii="Arial" w:hAnsi="Arial" w:cs="Arial"/>
-        </w:rPr>
-        <w:t>Softw</w:t>
-      </w:r>
-      <w:proofErr w:type="spellEnd"/>
-      <w:r>
-        <w:rPr>
-          <w:rFonts w:ascii="Arial" w:hAnsi="Arial" w:cs="Arial"/>
-        </w:rPr>
-        <w:t xml:space="preserve">. 2019;4(43):1686. </w:t>
+        <w:t xml:space="preserve">Wickham H, Averick M, Bryan J, Chang W, McGowan LD, François R, et al. Welcome to the Tidyverse. J Open Source Softw. 2019;4(43):1686. </w:t>
       </w:r>
     </w:p>
     <w:p>
@@ -27132,21 +25983,7 @@
           <w:rFonts w:ascii="Arial" w:hAnsi="Arial" w:cs="Arial"/>
         </w:rPr>
         <w:tab/>
-        <w:t xml:space="preserve">van der Loo M. The </w:t>
-      </w:r>
-      <w:proofErr w:type="spellStart"/>
-      <w:r>
-        <w:rPr>
-          <w:rFonts w:ascii="Arial" w:hAnsi="Arial" w:cs="Arial"/>
-        </w:rPr>
-        <w:t>stringdist</w:t>
-      </w:r>
-      <w:proofErr w:type="spellEnd"/>
-      <w:r>
-        <w:rPr>
-          <w:rFonts w:ascii="Arial" w:hAnsi="Arial" w:cs="Arial"/>
-        </w:rPr>
-        <w:t xml:space="preserve"> package for approximate string matching. R J [Internet]. 2014; Available from: https://digitalcommons.unl.edu/r-journal/415</w:t>
+        <w:t>van der Loo M. The stringdist package for approximate string matching. R J [Internet]. 2014; Available from: https://digitalcommons.unl.edu/r-journal/415</w:t>
       </w:r>
     </w:p>
     <w:p>
@@ -27230,21 +26067,7 @@
           <w:rFonts w:ascii="Arial" w:hAnsi="Arial" w:cs="Arial"/>
         </w:rPr>
         <w:tab/>
-        <w:t xml:space="preserve">Hartigan JA, Wong MA. Algorithm AS 136: </w:t>
-      </w:r>
-      <w:proofErr w:type="gramStart"/>
-      <w:r>
-        <w:rPr>
-          <w:rFonts w:ascii="Arial" w:hAnsi="Arial" w:cs="Arial"/>
-        </w:rPr>
-        <w:t>A K</w:t>
-      </w:r>
-      <w:proofErr w:type="gramEnd"/>
-      <w:r>
-        <w:rPr>
-          <w:rFonts w:ascii="Arial" w:hAnsi="Arial" w:cs="Arial"/>
-        </w:rPr>
-        <w:t xml:space="preserve">-means clustering algorithm. J R Stat Soc Ser C Appl Stat. 1979;28(1):100–8. </w:t>
+        <w:t xml:space="preserve">Hartigan JA, Wong MA. Algorithm AS 136: A K-means clustering algorithm. J R Stat Soc Ser C Appl Stat. 1979;28(1):100–8. </w:t>
       </w:r>
     </w:p>
     <w:p>
@@ -27265,34 +26088,7 @@
           <w:rFonts w:ascii="Arial" w:hAnsi="Arial" w:cs="Arial"/>
         </w:rPr>
         <w:tab/>
-      </w:r>
-      <w:proofErr w:type="spellStart"/>
-      <w:r>
-        <w:rPr>
-          <w:rFonts w:ascii="Arial" w:hAnsi="Arial" w:cs="Arial"/>
-        </w:rPr>
-        <w:t>Torchiano</w:t>
-      </w:r>
-      <w:proofErr w:type="spellEnd"/>
-      <w:r>
-        <w:rPr>
-          <w:rFonts w:ascii="Arial" w:hAnsi="Arial" w:cs="Arial"/>
-        </w:rPr>
-        <w:t xml:space="preserve"> M. </w:t>
-      </w:r>
-      <w:proofErr w:type="spellStart"/>
-      <w:r>
-        <w:rPr>
-          <w:rFonts w:ascii="Arial" w:hAnsi="Arial" w:cs="Arial"/>
-        </w:rPr>
-        <w:t>effsize</w:t>
-      </w:r>
-      <w:proofErr w:type="spellEnd"/>
-      <w:r>
-        <w:rPr>
-          <w:rFonts w:ascii="Arial" w:hAnsi="Arial" w:cs="Arial"/>
-        </w:rPr>
-        <w:t>: efficient effect size computation [Internet]. 2018. Available from: https://cran.r-project.org/package=effsize</w:t>
+        <w:t>Torchiano M. effsize: efficient effect size computation [Internet]. 2018. Available from: https://cran.r-project.org/package=effsize</w:t>
       </w:r>
     </w:p>
     <w:p>
@@ -35995,7 +34791,7 @@
       </w:r>
     </w:p>
   </w:comment>
-  <w:comment w:id="2" w:author="Smith Vidaurre, Grace" w:date="2025-08-28T09:51:00Z" w:initials="SVG">
+  <w:comment w:id="2" w:author="Smith Vidaurre, Grace" w:date="2025-08-28T10:53:00Z" w:initials="SVG">
     <w:p>
       <w:r>
         <w:rPr>
@@ -36008,181 +34804,11 @@
           <w:sz w:val="20"/>
           <w:szCs w:val="20"/>
         </w:rPr>
-        <w:t>Add more white space around the individual labels</w:t>
+        <w:t>Doublecheck the effect size calculations in the code and against the table below: some of these are exactly the same values across panels</w:t>
       </w:r>
     </w:p>
   </w:comment>
-  <w:comment w:id="3" w:author="Smith Vidaurre, Grace" w:date="2025-08-28T09:51:00Z" w:initials="SVG">
-    <w:p>
-      <w:r>
-        <w:rPr>
-          <w:rStyle w:val="CommentReference"/>
-        </w:rPr>
-        <w:annotationRef/>
-      </w:r>
-      <w:r>
-        <w:rPr>
-          <w:sz w:val="20"/>
-          <w:szCs w:val="20"/>
-        </w:rPr>
-        <w:t>Also some of the lines in the catalogue are off. Same with Fig 3</w:t>
-      </w:r>
-    </w:p>
-  </w:comment>
-  <w:comment w:id="4" w:author="Smith Vidaurre, Grace" w:date="2025-08-28T09:52:00Z" w:initials="SVG">
-    <w:p>
-      <w:r>
-        <w:rPr>
-          <w:rStyle w:val="CommentReference"/>
-        </w:rPr>
-        <w:annotationRef/>
-      </w:r>
-      <w:r>
-        <w:rPr>
-          <w:sz w:val="20"/>
-          <w:szCs w:val="20"/>
-        </w:rPr>
-        <w:t>Cross correlation is missing a hyphen, Fig 3 too</w:t>
-      </w:r>
-    </w:p>
-  </w:comment>
-  <w:comment w:id="5" w:author="Smith Vidaurre, Grace" w:date="2025-08-28T09:49:00Z" w:initials="SVG">
-    <w:p>
-      <w:r>
-        <w:rPr>
-          <w:rStyle w:val="CommentReference"/>
-        </w:rPr>
-        <w:annotationRef/>
-      </w:r>
-      <w:r>
-        <w:rPr>
-          <w:sz w:val="20"/>
-          <w:szCs w:val="20"/>
-        </w:rPr>
-        <w:t>Stray capitals in methods subtitles in Fig 2</w:t>
-      </w:r>
-    </w:p>
-  </w:comment>
-  <w:comment w:id="6" w:author="Smith Vidaurre, Grace" w:date="2025-08-28T09:57:00Z" w:initials="SVG">
-    <w:p>
-      <w:r>
-        <w:rPr>
-          <w:rStyle w:val="CommentReference"/>
-        </w:rPr>
-        <w:annotationRef/>
-      </w:r>
-      <w:r>
-        <w:rPr>
-          <w:sz w:val="20"/>
-          <w:szCs w:val="20"/>
-        </w:rPr>
-        <w:t>The MDS x-axis label for SPCC is cut off by the edge of the plot</w:t>
-      </w:r>
-    </w:p>
-  </w:comment>
-  <w:comment w:id="7" w:author="Smith Vidaurre, Grace" w:date="2025-08-28T09:50:00Z" w:initials="SVG">
-    <w:p>
-      <w:r>
-        <w:rPr>
-          <w:rStyle w:val="CommentReference"/>
-        </w:rPr>
-        <w:annotationRef/>
-      </w:r>
-      <w:r>
-        <w:rPr>
-          <w:sz w:val="20"/>
-          <w:szCs w:val="20"/>
-        </w:rPr>
-        <w:t>Stray capitals here too, also MDS (see Fig 2 above as well)</w:t>
-      </w:r>
-    </w:p>
-  </w:comment>
-  <w:comment w:id="8" w:author="Smith Vidaurre, Grace" w:date="2025-08-28T10:39:00Z" w:initials="SVG">
-    <w:p>
-      <w:r>
-        <w:rPr>
-          <w:rStyle w:val="CommentReference"/>
-        </w:rPr>
-        <w:annotationRef/>
-      </w:r>
-      <w:r>
-        <w:rPr>
-          <w:sz w:val="20"/>
-          <w:szCs w:val="20"/>
-        </w:rPr>
-        <w:t>We should also standardize digits on the x-axis</w:t>
-      </w:r>
-    </w:p>
-  </w:comment>
-  <w:comment w:id="9" w:author="Smith Vidaurre, Grace" w:date="2025-08-28T10:36:00Z" w:initials="SVG">
-    <w:p>
-      <w:r>
-        <w:rPr>
-          <w:rStyle w:val="CommentReference"/>
-        </w:rPr>
-        <w:annotationRef/>
-      </w:r>
-      <w:r>
-        <w:rPr>
-          <w:sz w:val="20"/>
-          <w:szCs w:val="20"/>
-        </w:rPr>
-        <w:t>Standardize the distance method labels on the right</w:t>
-      </w:r>
-    </w:p>
-  </w:comment>
-  <w:comment w:id="10" w:author="Smith Vidaurre, Grace" w:date="2025-08-28T10:36:00Z" w:initials="SVG">
-    <w:p>
-      <w:r>
-        <w:rPr>
-          <w:rStyle w:val="CommentReference"/>
-        </w:rPr>
-        <w:annotationRef/>
-      </w:r>
-      <w:r>
-        <w:rPr>
-          <w:sz w:val="20"/>
-          <w:szCs w:val="20"/>
-        </w:rPr>
-        <w:t>Need to match earlier figures (first letter capitalized, plus write out SPCC)</w:t>
-      </w:r>
-    </w:p>
-  </w:comment>
-  <w:comment w:id="11" w:author="Smith Vidaurre, Grace" w:date="2025-08-28T10:53:00Z" w:initials="SVG">
-    <w:p>
-      <w:r>
-        <w:rPr>
-          <w:rStyle w:val="CommentReference"/>
-        </w:rPr>
-        <w:annotationRef/>
-      </w:r>
-      <w:r>
-        <w:rPr>
-          <w:sz w:val="20"/>
-          <w:szCs w:val="20"/>
-        </w:rPr>
-        <w:t>Doublecheck the effect size calculations in the code and against the table below: some of these are exactly the same values across panels</w:t>
-      </w:r>
-    </w:p>
-  </w:comment>
-  <w:comment w:id="12" w:author="Smith Vidaurre, Grace" w:date="2025-08-28T10:48:00Z" w:initials="SVG">
-    <w:p>
-      <w:r>
-        <w:rPr>
-          <w:rStyle w:val="CommentReference"/>
-        </w:rPr>
-        <w:annotationRef/>
-      </w:r>
-      <w:r>
-        <w:rPr>
-          <w:sz w:val="20"/>
-          <w:szCs w:val="20"/>
-        </w:rPr>
-        <w:t>Update "Edit" label to be "Edit distance"</w:t>
-      </w:r>
-    </w:p>
-  </w:comment>
-  <w:comment w:id="13" w:author="Smith Vidaurre, Grace" w:date="2025-08-28T11:33:00Z" w:initials="SVG">
+  <w:comment w:id="3" w:author="Smith Vidaurre, Grace" w:date="2025-08-28T11:33:00Z" w:initials="SVG">
     <w:p>
       <w:r>
         <w:rPr>
@@ -36206,17 +34832,7 @@
 <w15:commentsEx xmlns:wpc="http://schemas.microsoft.com/office/word/2010/wordprocessingCanvas" xmlns:cx="http://schemas.microsoft.com/office/drawing/2014/chartex" xmlns:cx1="http://schemas.microsoft.com/office/drawing/2015/9/8/chartex" xmlns:cx2="http://schemas.microsoft.com/office/drawing/2015/10/21/chartex" xmlns:cx3="http://schemas.microsoft.com/office/drawing/2016/5/9/chartex" xmlns:cx4="http://schemas.microsoft.com/office/drawing/2016/5/10/chartex" xmlns:cx5="http://schemas.microsoft.com/office/drawing/2016/5/11/chartex" xmlns:cx6="http://schemas.microsoft.com/office/drawing/2016/5/12/chartex" xmlns:cx7="http://schemas.microsoft.com/office/drawing/2016/5/13/chartex" xmlns:cx8="http://schemas.microsoft.com/office/drawing/2016/5/14/chartex" xmlns:mc="http://schemas.openxmlformats.org/markup-compatibility/2006" xmlns:aink="http://schemas.microsoft.com/office/drawing/2016/ink" xmlns:am3d="http://schemas.microsoft.com/office/drawing/2017/model3d" xmlns:o="urn:schemas-microsoft-com:office:office" xmlns:oel="http://schemas.microsoft.com/office/2019/extlst" xmlns:r="http://schemas.openxmlformats.org/officeDocument/2006/relationships" xmlns:m="http://schemas.openxmlformats.org/officeDocument/2006/math" xmlns:v="urn:schemas-microsoft-com:vml" xmlns:wp14="http://schemas.microsoft.com/office/word/2010/wordprocessingDrawing" xmlns:wp="http://schemas.openxmlformats.org/drawingml/2006/wordprocessingDrawing" xmlns:w10="urn:schemas-microsoft-com:office:word" xmlns:w="http://schemas.openxmlformats.org/wordprocessingml/2006/main" xmlns:w14="http://schemas.microsoft.com/office/word/2010/wordml" xmlns:w15="http://schemas.microsoft.com/office/word/2012/wordml" xmlns:w16cex="http://schemas.microsoft.com/office/word/2018/wordml/cex" xmlns:w16cid="http://schemas.microsoft.com/office/word/2016/wordml/cid" xmlns:w16="http://schemas.microsoft.com/office/word/2018/wordml" xmlns:w16du="http://schemas.microsoft.com/office/word/2023/wordml/word16du" xmlns:w16sdtdh="http://schemas.microsoft.com/office/word/2020/wordml/sdtdatahash" xmlns:w16sdtfl="http://schemas.microsoft.com/office/word/2024/wordml/sdtformatlock" xmlns:w16se="http://schemas.microsoft.com/office/word/2015/wordml/symex" xmlns:wpg="http://schemas.microsoft.com/office/word/2010/wordprocessingGroup" xmlns:wpi="http://schemas.microsoft.com/office/word/2010/wordprocessingInk" xmlns:wne="http://schemas.microsoft.com/office/word/2006/wordml" xmlns:wps="http://schemas.microsoft.com/office/word/2010/wordprocessingShape" mc:Ignorable="w14 w15 w16se w16cid w16 w16cex w16sdtdh w16sdtfl w16du wp14">
   <w15:commentEx w15:paraId="35DF912A" w15:done="0"/>
   <w15:commentEx w15:paraId="4B0CF21B" w15:done="0"/>
-  <w15:commentEx w15:paraId="26605848" w15:done="0"/>
-  <w15:commentEx w15:paraId="0B43E229" w15:paraIdParent="26605848" w15:done="0"/>
-  <w15:commentEx w15:paraId="1272D669" w15:paraIdParent="26605848" w15:done="0"/>
-  <w15:commentEx w15:paraId="2CB1EA18" w15:done="0"/>
-  <w15:commentEx w15:paraId="7F2F2064" w15:done="0"/>
-  <w15:commentEx w15:paraId="35C834FF" w15:done="0"/>
-  <w15:commentEx w15:paraId="6D06ACCB" w15:done="0"/>
-  <w15:commentEx w15:paraId="409DE314" w15:done="0"/>
-  <w15:commentEx w15:paraId="18AE3E5D" w15:paraIdParent="409DE314" w15:done="0"/>
   <w15:commentEx w15:paraId="1821571C" w15:done="0"/>
-  <w15:commentEx w15:paraId="495F6392" w15:done="0"/>
   <w15:commentEx w15:paraId="031B1295" w15:done="0"/>
 </w15:commentsEx>
 </file>
@@ -36225,17 +34841,7 @@
 <w16cex:commentsExtensible xmlns:wpc="http://schemas.microsoft.com/office/word/2010/wordprocessingCanvas" xmlns:cx="http://schemas.microsoft.com/office/drawing/2014/chartex" xmlns:cx1="http://schemas.microsoft.com/office/drawing/2015/9/8/chartex" xmlns:cx2="http://schemas.microsoft.com/office/drawing/2015/10/21/chartex" xmlns:cx3="http://schemas.microsoft.com/office/drawing/2016/5/9/chartex" xmlns:cx4="http://schemas.microsoft.com/office/drawing/2016/5/10/chartex" xmlns:cx5="http://schemas.microsoft.com/office/drawing/2016/5/11/chartex" xmlns:cx6="http://schemas.microsoft.com/office/drawing/2016/5/12/chartex" xmlns:cx7="http://schemas.microsoft.com/office/drawing/2016/5/13/chartex" xmlns:cx8="http://schemas.microsoft.com/office/drawing/2016/5/14/chartex" xmlns:cr="http://schemas.microsoft.com/office/comments/2020/reactions" xmlns:mc="http://schemas.openxmlformats.org/markup-compatibility/2006" xmlns:aink="http://schemas.microsoft.com/office/drawing/2016/ink" xmlns:am3d="http://schemas.microsoft.com/office/drawing/2017/model3d" xmlns:o="urn:schemas-microsoft-com:office:office" xmlns:oel="http://schemas.microsoft.com/office/2019/extlst" xmlns:r="http://schemas.openxmlformats.org/officeDocument/2006/relationships" xmlns:m="http://schemas.openxmlformats.org/officeDocument/2006/math" xmlns:v="urn:schemas-microsoft-com:vml" xmlns:wp14="http://schemas.microsoft.com/office/word/2010/wordprocessingDrawing" xmlns:wp="http://schemas.openxmlformats.org/drawingml/2006/wordprocessingDrawing" xmlns:w10="urn:schemas-microsoft-com:office:word" xmlns:w="http://schemas.openxmlformats.org/wordprocessingml/2006/main" xmlns:w14="http://schemas.microsoft.com/office/word/2010/wordml" xmlns:w15="http://schemas.microsoft.com/office/word/2012/wordml" xmlns:w16cex="http://schemas.microsoft.com/office/word/2018/wordml/cex" xmlns:w16cid="http://schemas.microsoft.com/office/word/2016/wordml/cid" xmlns:w16="http://schemas.microsoft.com/office/word/2018/wordml" xmlns:w16du="http://schemas.microsoft.com/office/word/2023/wordml/word16du" xmlns:w16sdtdh="http://schemas.microsoft.com/office/word/2020/wordml/sdtdatahash" xmlns:w16sdtfl="http://schemas.microsoft.com/office/word/2024/wordml/sdtformatlock" xmlns:w16se="http://schemas.microsoft.com/office/word/2015/wordml/symex" xmlns:wpg="http://schemas.microsoft.com/office/word/2010/wordprocessingGroup" xmlns:wpi="http://schemas.microsoft.com/office/word/2010/wordprocessingInk" xmlns:wne="http://schemas.microsoft.com/office/word/2006/wordml" xmlns:wps="http://schemas.microsoft.com/office/word/2010/wordprocessingShape" mc:Ignorable="w14 w15 w16se w16cid w16 w16cex w16sdtdh w16sdtfl cr w16du wp14">
   <w16cex:commentExtensible w16cex:durableId="584956EA" w16cex:dateUtc="2025-08-27T21:29:00Z"/>
   <w16cex:commentExtensible w16cex:durableId="05B512BD" w16cex:dateUtc="2025-08-27T21:42:00Z"/>
-  <w16cex:commentExtensible w16cex:durableId="0FA518F6" w16cex:dateUtc="2025-08-28T13:51:00Z"/>
-  <w16cex:commentExtensible w16cex:durableId="10E36A6D" w16cex:dateUtc="2025-08-28T13:51:00Z"/>
-  <w16cex:commentExtensible w16cex:durableId="25BF1ABF" w16cex:dateUtc="2025-08-28T13:52:00Z"/>
-  <w16cex:commentExtensible w16cex:durableId="191D450E" w16cex:dateUtc="2025-08-28T13:49:00Z"/>
-  <w16cex:commentExtensible w16cex:durableId="6C347ACA" w16cex:dateUtc="2025-08-28T13:57:00Z"/>
-  <w16cex:commentExtensible w16cex:durableId="19D84BE4" w16cex:dateUtc="2025-08-28T13:50:00Z"/>
-  <w16cex:commentExtensible w16cex:durableId="2DB4195A" w16cex:dateUtc="2025-08-28T14:39:00Z"/>
-  <w16cex:commentExtensible w16cex:durableId="10D6193E" w16cex:dateUtc="2025-08-28T14:36:00Z"/>
-  <w16cex:commentExtensible w16cex:durableId="16429613" w16cex:dateUtc="2025-08-28T14:36:00Z"/>
   <w16cex:commentExtensible w16cex:durableId="640D20EE" w16cex:dateUtc="2025-08-28T14:53:00Z"/>
-  <w16cex:commentExtensible w16cex:durableId="11FF880D" w16cex:dateUtc="2025-08-28T14:48:00Z"/>
   <w16cex:commentExtensible w16cex:durableId="00BE4F88" w16cex:dateUtc="2025-08-28T15:33:00Z"/>
 </w16cex:commentsExtensible>
 </file>
@@ -36244,17 +34850,7 @@
 <w16cid:commentsIds xmlns:wpc="http://schemas.microsoft.com/office/word/2010/wordprocessingCanvas" xmlns:cx="http://schemas.microsoft.com/office/drawing/2014/chartex" xmlns:cx1="http://schemas.microsoft.com/office/drawing/2015/9/8/chartex" xmlns:cx2="http://schemas.microsoft.com/office/drawing/2015/10/21/chartex" xmlns:cx3="http://schemas.microsoft.com/office/drawing/2016/5/9/chartex" xmlns:cx4="http://schemas.microsoft.com/office/drawing/2016/5/10/chartex" xmlns:cx5="http://schemas.microsoft.com/office/drawing/2016/5/11/chartex" xmlns:cx6="http://schemas.microsoft.com/office/drawing/2016/5/12/chartex" xmlns:cx7="http://schemas.microsoft.com/office/drawing/2016/5/13/chartex" xmlns:cx8="http://schemas.microsoft.com/office/drawing/2016/5/14/chartex" xmlns:mc="http://schemas.openxmlformats.org/markup-compatibility/2006" xmlns:aink="http://schemas.microsoft.com/office/drawing/2016/ink" xmlns:am3d="http://schemas.microsoft.com/office/drawing/2017/model3d" xmlns:o="urn:schemas-microsoft-com:office:office" xmlns:oel="http://schemas.microsoft.com/office/2019/extlst" xmlns:r="http://schemas.openxmlformats.org/officeDocument/2006/relationships" xmlns:m="http://schemas.openxmlformats.org/officeDocument/2006/math" xmlns:v="urn:schemas-microsoft-com:vml" xmlns:wp14="http://schemas.microsoft.com/office/word/2010/wordprocessingDrawing" xmlns:wp="http://schemas.openxmlformats.org/drawingml/2006/wordprocessingDrawing" xmlns:w10="urn:schemas-microsoft-com:office:word" xmlns:w="http://schemas.openxmlformats.org/wordprocessingml/2006/main" xmlns:w14="http://schemas.microsoft.com/office/word/2010/wordml" xmlns:w15="http://schemas.microsoft.com/office/word/2012/wordml" xmlns:w16cex="http://schemas.microsoft.com/office/word/2018/wordml/cex" xmlns:w16cid="http://schemas.microsoft.com/office/word/2016/wordml/cid" xmlns:w16="http://schemas.microsoft.com/office/word/2018/wordml" xmlns:w16du="http://schemas.microsoft.com/office/word/2023/wordml/word16du" xmlns:w16sdtdh="http://schemas.microsoft.com/office/word/2020/wordml/sdtdatahash" xmlns:w16sdtfl="http://schemas.microsoft.com/office/word/2024/wordml/sdtformatlock" xmlns:w16se="http://schemas.microsoft.com/office/word/2015/wordml/symex" xmlns:wpg="http://schemas.microsoft.com/office/word/2010/wordprocessingGroup" xmlns:wpi="http://schemas.microsoft.com/office/word/2010/wordprocessingInk" xmlns:wne="http://schemas.microsoft.com/office/word/2006/wordml" xmlns:wps="http://schemas.microsoft.com/office/word/2010/wordprocessingShape" mc:Ignorable="w14 w15 w16se w16cid w16 w16cex w16sdtdh w16sdtfl w16du wp14">
   <w16cid:commentId w16cid:paraId="35DF912A" w16cid:durableId="584956EA"/>
   <w16cid:commentId w16cid:paraId="4B0CF21B" w16cid:durableId="05B512BD"/>
-  <w16cid:commentId w16cid:paraId="26605848" w16cid:durableId="0FA518F6"/>
-  <w16cid:commentId w16cid:paraId="0B43E229" w16cid:durableId="10E36A6D"/>
-  <w16cid:commentId w16cid:paraId="1272D669" w16cid:durableId="25BF1ABF"/>
-  <w16cid:commentId w16cid:paraId="2CB1EA18" w16cid:durableId="191D450E"/>
-  <w16cid:commentId w16cid:paraId="7F2F2064" w16cid:durableId="6C347ACA"/>
-  <w16cid:commentId w16cid:paraId="35C834FF" w16cid:durableId="19D84BE4"/>
-  <w16cid:commentId w16cid:paraId="6D06ACCB" w16cid:durableId="2DB4195A"/>
-  <w16cid:commentId w16cid:paraId="409DE314" w16cid:durableId="10D6193E"/>
-  <w16cid:commentId w16cid:paraId="18AE3E5D" w16cid:durableId="16429613"/>
   <w16cid:commentId w16cid:paraId="1821571C" w16cid:durableId="640D20EE"/>
-  <w16cid:commentId w16cid:paraId="495F6392" w16cid:durableId="11FF880D"/>
   <w16cid:commentId w16cid:paraId="031B1295" w16cid:durableId="00BE4F88"/>
 </w16cid:commentsIds>
 </file>
@@ -38583,6 +37179,7 @@
   <w:style w:type="character" w:default="1" w:styleId="DefaultParagraphFont">
     <w:name w:val="Default Paragraph Font"/>
     <w:uiPriority w:val="1"/>
+    <w:semiHidden/>
     <w:unhideWhenUsed/>
   </w:style>
   <w:style w:type="table" w:default="1" w:styleId="TableNormal">

</xml_diff>